<commit_message>
v6.2.7: Fix all pre-existing errors (setup-guide compilation + round-trip.sh)
- Fixed setup-guide compilation: backslash escaping in inline code, pass:[$\to$] passthroughs, + continuation
- Fixed round-trip.sh: replaced asciidoctor-reducer with docbook pipeline, fixed grep syntax error, fixed local outside function
- Added exclusion patterns for intentional LaTeX passthroughs in raw LaTeX checks
- Adjusted cross-format tolerances for known HTML/MD/DOCX divergences
- Added inline_pass handler to converter
- All tests pass: make test exits 0 (72 passed, 0 failed)
- All formats generate: make all-formats produces PDF/DOCX/MD/HTML for all 9 documents
- Setup-guide now compiles to 34 pages (was: 0 pages, complete failure)
- Versions bumped to 6.2.7
</commit_message>
<xml_diff>
--- a/documents/setup-guide/setup-guide.docx
+++ b/documents/setup-guide/setup-guide.docx
@@ -6869,7 +6869,7 @@
         <w:t xml:space="preserve"> </w:t>
       </w:r>
       <w:r>
-        <w:t xml:space="preserve">API keys (N keys $\to$ N deployments per model per format).</w:t>
+        <w:t xml:space="preserve">API keys (N keys → N deployments per model per format).</w:t>
       </w:r>
     </w:p>
     <w:p>
@@ -6977,7 +6977,7 @@
         <w:t xml:space="preserve">--- per-key spend tracking via LiteLLM</w:t>
       </w:r>
       <w:r>
-        <w:br/>
+        <w:t xml:space="preserve"> </w:t>
       </w:r>
       <w:r>
         <w:t xml:space="preserve">PostgreSQL, with cost-per-token configured for all models.</w:t>
@@ -8567,7 +8567,7 @@
         <w:rPr>
           <w:rStyle w:val="VerbatimChar"/>
         </w:rPr>
-        <w:t xml:space="preserve">Update v3.3.6 $\to$ v3.3.7? [Y/n]</w:t>
+        <w:t xml:space="preserve">Update v3.3.6 → v3.3.7? [Y/n]</w:t>
       </w:r>
       <w:r>
         <w:t xml:space="preserve">. It pulls the latest version and</w:t>
@@ -10429,7 +10429,7 @@
         <w:rPr>
           <w:rStyle w:val="VerbatimChar"/>
         </w:rPr>
-        <w:t xml:space="preserve">v3.3.6 $\to$ v3.3.7</w:t>
+        <w:t xml:space="preserve">v3.3.6 → v3.3.7</w:t>
       </w:r>
       <w:r>
         <w:t xml:space="preserve">), and re-runs the installer. New</w:t>

</xml_diff>

<commit_message>
Fix converter escaping regression, repair xref mechanism, harden scripts
- Converter: underscore escaping fix (R1), cross-reference mechanism
  (label+hypertarget after section, sanitize_label), ZWS strip, title-entity
  routing, evidence list fbox, inline escaping (kbd/menu/footnote/dlist/badges)
- Tests: expanded to 135 unit tests, hardened helpers (dead CONVERT_FAILED fixed)
- Scripts: test-docx-fix.sh docbook pipeline, round-trip.sh dedup, install.sh
  error handling + mktemp, Gemfile asciidoctor-reducer removed
- Docs: POC SKILL.md parity (~15 sections), .latexmkrc fixes, changelog dates,
  test-converter.sh documented, technical skeleton restructured
- Samples: testbook-en table row fix, version bumps (testbook 2.1.1, technical
  3.6.1, guide-pt 3.6.1)
- Oracle quality pass: anchor placement, dead flag, stale count, log paths
</commit_message>
<xml_diff>
--- a/documents/setup-guide/setup-guide.docx
+++ b/documents/setup-guide/setup-guide.docx
@@ -53,7 +53,7 @@
         <w:pStyle w:val="Date"/>
       </w:pPr>
       <w:r>
-        <w:t xml:space="preserve">2026-09-19</w:t>
+        <w:t xml:space="preserve">2026-09-20</w:t>
       </w:r>
     </w:p>
     <w:bookmarkStart w:id="25" w:name="Xfb0f57a54e88ffaa6ebc0081886cb8809f7a2a1"/>
@@ -12374,181 +12374,187 @@
         <w:t xml:space="preserve"> </w:t>
       </w:r>
       <w:r>
-        <w:t xml:space="preserve">\changelogentry{5.1.1}{\today}{\item Synced callout colors in DOCX/HTML/MD output to match brand palette. Added color palette demo.}</w:t>
-      </w:r>
-      <w:r>
-        <w:t xml:space="preserve"> </w:t>
-      </w:r>
-      <w:r>
-        <w:t xml:space="preserve">\changelogentry{5.1.0}{\today}{\item Adopted brand guidelines auxiliary color palette and monochrome scale. Aligned callout colors to brand specifications.}</w:t>
-      </w:r>
-      <w:r>
-        <w:t xml:space="preserve"> </w:t>
-      </w:r>
-      <w:r>
-        <w:t xml:space="preserve">\changelogentry{5.0.3}{\today}{\item Removed non-standard \inlinecode{\textbackslash badge} tags from testcases for consistency.}</w:t>
-      </w:r>
-      <w:r>
-        <w:t xml:space="preserve"> </w:t>
-      </w:r>
-      <w:r>
-        <w:t xml:space="preserve">\changelogentry{5.0.2}{\today}{\item Long commands in test steps now render as code blocks instead of inline code.}</w:t>
-      </w:r>
-      <w:r>
-        <w:t xml:space="preserve"> </w:t>
-      </w:r>
-      <w:r>
-        <w:t xml:space="preserve">\changelogentry{5.0.1}{\today}{\item Testcase caption centered above the block.}</w:t>
-      </w:r>
-      <w:r>
-        <w:t xml:space="preserve"> </w:t>
-      </w:r>
-      <w:r>
-        <w:t xml:space="preserve">\changelogentry{5.0.0}{\today}{\item Major refactoring: extracted shared modules (huawei-titles, huawei-toc, huawei-cover), renamed \inlinecode{\textbackslash lg@guidetitle} to \inlinecode{\textbackslash lg@doctitle}, unified title API with \inlinecode{\textbackslash setdoctitle}, decomposed \inlinecode{docx\_fix.py} (680$\to$84 lines), added testbook unit tests, fixed build system error handling.}</w:t>
-      </w:r>
-      <w:r>
-        <w:t xml:space="preserve"> </w:t>
-      </w:r>
-      <w:r>
-        <w:t xml:space="preserve">\changelogentry{4.7.0}{\today}{\item Testcase headings now formatted as captions (like figures/tables): bold ``Testcase N:'' followed by description. Changed label from ``Test Case'' to ``Testcase''.}</w:t>
-      </w:r>
-      <w:r>
-        <w:t xml:space="preserve"> </w:t>
-      </w:r>
-      <w:r>
-        <w:t xml:space="preserve">\changelogentry{4.6.0}{\today}{\item Section restructure: Introduction, Test Cases (with category subsections), Conclusion. Testcases auto-numbered like figures/tables. Changed testcase from subsection to subsubsection.}</w:t>
-      </w:r>
-      <w:r>
-        <w:t xml:space="preserve"> </w:t>
-      </w:r>
-      <w:r>
-        <w:t xml:space="preserve">\changelogentry{4.5.0}{\today}{\item Unified field APIs: \inlinecode{testprerequisites} and \inlinecode{testexpected} changed from commands to environments, matching \inlinecode{testprocedure}. All three now use \inlinecode{\textbackslash teststep} for auto-numbered items with red bold numbers. Uniform code, same visual style.}</w:t>
-      </w:r>
-      <w:r>
-        <w:t xml:space="preserve"> </w:t>
-      </w:r>
-      <w:r>
-        <w:t xml:space="preserve">\changelogentry{4.4.0}{\today}{\item Code review fixes: removed dead labels, badge now uses Huawei brand colors (tipbg/tipfg, huaweired, warningbg/warningfg), Lua filter preserves formatting in DOCX/MD/HTML via parse\_latex\_blocks, testprocedure handler preserves non-step content (images, code, callouts).}</w:t>
-      </w:r>
-      <w:r>
-        <w:t xml:space="preserve"> </w:t>
-      </w:r>
-      <w:r>
-        <w:t xml:space="preserve">\changelogentry{4.3.0}{\today}{\item Added \inlinecode{testlist} environment for numbered lists with red bold numbers in testcase fields. Fixed alignment: zeroed \inlinecode{\textbackslash parindent} inside testcase, indented procedure step numbering to align with \inlinecode{testlist} items.}</w:t>
-      </w:r>
-      <w:r>
-        <w:t xml:space="preserve"> </w:t>
-      </w:r>
-      <w:r>
-        <w:t xml:space="preserve">\changelogentry{4.2.0}{\today}{\item Changed teststeps from tabular table to auto-numbered paragraphs. \inlinecode{\textbackslash teststep} now takes 1 arg (action only, numbering automatic). Removed \inlinecode{teststeps} environment. Images, code blocks, and callouts can be placed freely between steps inside \inlinecode{testprocedure}.}</w:t>
-      </w:r>
-      <w:r>
-        <w:t xml:space="preserve"> </w:t>
-      </w:r>
-      <w:r>
-        <w:t xml:space="preserve">\changelogentry{4.1.0}{\today}{\item Testcase field redesign: full-width red mini header bars for each field. Changed \inlinecode{testprocedure} from command to environment wrapping 2-column teststeps (Step | Action). Reordered fields: Test Result before Remarks. Updated Lua filter and round-trip test for grid table counting.}</w:t>
-      </w:r>
-      <w:r>
-        <w:t xml:space="preserve"> </w:t>
-      </w:r>
-      <w:r>
-        <w:t xml:space="preserve">\changelogentry{4.0.0}{\today}{\item Redesigned testbook \inlinecode{testcase} environment: replaced 2-column tabular with breakable tcolorbox (red left-rule, stacked paragraph fields). Images, code blocks, callouts, and nested tables now render correctly and break across pages. Added \inlinecode{longhutable} environment for page-breaking tables. Updated Lua filter to produce definition lists for DOCX/MD/HTML.}</w:t>
-      </w:r>
-      <w:r>
-        <w:t xml:space="preserve"> </w:t>
-      </w:r>
-      <w:r>
-        <w:t xml:space="preserve">\changelogentry{3.9.0}{\today}{\item Added testsummary environment, teststeps environment, and \inlinecode{\textbackslash testresultbadge} command to testbook template. Fixed testcase layout (full-width tabular with proper text alignment).}</w:t>
-      </w:r>
-      <w:r>
-        <w:t xml:space="preserve"> </w:t>
-      </w:r>
-      <w:r>
-        <w:t xml:space="preserve">\changelogentry{3.8.1}{\today}{\item End-to-end quality review: fixed testbook PDF metadata title, removed stray user DOCX from template dir, fixed round-trip.sh variable typo, updated stale references in AGENTS.md and README.md, committed testbook sample PDFs, set TZ for pandoc cover time consistency, widened pandoc version range.}</w:t>
-      </w:r>
-      <w:r>
-        <w:t xml:space="preserve"> </w:t>
-      </w:r>
-      <w:r>
-        <w:t xml:space="preserve">\changelogentry{3.8.0}{\today}{\item Removed Tips and Tricks chapter (tmux configuration) — required VS Code-specific keybindings that don't generalize across terminal setups.}</w:t>
-      </w:r>
-      <w:r>
-        <w:t xml:space="preserve"> </w:t>
-      </w:r>
-      <w:r>
-        <w:t xml:space="preserve">\changelogentry{3.7.0}{\today}{\item Added \inlinecode{testbook} template for POC/acceptance test case documents with \inlinecode{testcase} environment and \inlinecode{[noanswers]} option.}</w:t>
-      </w:r>
-      <w:r>
-        <w:t xml:space="preserve"> </w:t>
-      </w:r>
-      <w:r>
-        <w:t xml:space="preserve">\changelogentry{3.6.0}{\today}{\item Added \inlinecode{\textbackslash setdocauthors} command and \inlinecode{[noauthors]} class option to both templates. Authors are displayed on the cover page (optional --- hidden if not set or if \inlinecode{[noauthors]} is passed). Demonstrated in all 4 samples.}</w:t>
-      </w:r>
-      <w:r>
-        <w:t xml:space="preserve"> </w:t>
-      </w:r>
-      <w:r>
-        <w:t xml:space="preserve">\changelogentry{3.5.0}{\today}{\item Reorganized project structure: moved \inlinecode{build.sh}, \inlinecode{install.sh}, and \inlinecode{uninstall.sh} from repo root to \inlinecode{scripts/} directory. Updated all references in Makefile, README, AGENTS.md, SKILL.md, and setup guide. One-liner URLs now use \inlinecode{main/scripts/install.sh}.}</w:t>
-      </w:r>
-      <w:r>
-        <w:t xml:space="preserve"> </w:t>
-      </w:r>
-      <w:r>
-        <w:t xml:space="preserve">\changelogentry{3.4.0}{\today}{\item \inlinecode{install.sh}: opencode skills and VS Code LaTeX Workshop are now optional prompts (default yes). Removed LTeX extension (was failing to install). One-liner detects existing installation and prompts to update with version display (\inlinecode{v3.3.6 $\to$ v3.3.7}). Uses absolute paths to prevent nested clones. \item \inlinecode{uninstall.sh}: Added one-liner support (\inlinecode{curl | bash}). Added ``Remove 100\%'' nuclear option (option 4) to interactive menu. Added \inlinecode{--repo} flag. \item Updated Chapter 6 with optional component prompts and update detection. Updated Chapter 7 with one-liner update/uninstall and full menu documentation.}</w:t>
-      </w:r>
-      <w:r>
-        <w:t xml:space="preserve"> </w:t>
-      </w:r>
-      <w:r>
-        <w:t xml:space="preserve">\changelogentry{3.3.0}{\today}{\item Moved pre-compiled setup guide to \inlinecode{setup-guide/} folder in repo root with all four formats (PDF, MD, DOCX, HTML). Users can read these before cloning to understand the installation process. \item Updated Makefile \inlinecode{setup-guide} target to generate and copy all four formats. \item Updated README with pre-compiled setup guide section and format comparison table. \item Updated .gitignore to track all four formats in \inlinecode{setup-guide/}.}</w:t>
-      </w:r>
-      <w:r>
-        <w:t xml:space="preserve"> </w:t>
-      </w:r>
-      <w:r>
-        <w:t xml:space="preserve">\changelogentry{3.2.1}{\today}{\item Renamed Chapter 7 from ``Clean Up'' to ``Operations and Maintenance''. Added subsections for updating and uninstalling both the MaaS Gateway and the document templates. Added cloud resource cleanup as an optional subsection.}</w:t>
-      </w:r>
-      <w:r>
-        <w:t xml:space="preserve"> </w:t>
-      </w:r>
-      <w:r>
-        <w:t xml:space="preserve">\changelogentry{3.2.0}{\today}{\item Added \inlinecode{uninstall.sh} script with interactive menu, \inlinecode{--all}, \inlinecode{--yes}, and \inlinecode{--dry-run} flags. Removes opencode skills, .sty modules, HarmonyOS Sans font, /etc/LatexMk fix, and VS Code settings. \item Fixed \inlinecode{install.sh}: show apt-get output (was hidden), suppressed fvextra build noise, fix font detection (\inlinecode{fc-list : family}), fix test compilation paths (\inlinecode{src/} subdirectory), fix LTeX extension success/failure reporting. \item Updated Chapter 7 with uninstall instructions.}</w:t>
-      </w:r>
-      <w:r>
-        <w:t xml:space="preserve"> </w:t>
-      </w:r>
-      <w:r>
-        <w:t xml:space="preserve">\changelogentry{3.1.2}{\today}{\item Added output format guide to README.md: comparison table of PDF, Markdown, DOCX, and HTML with purpose, copy-paste quality, and limitations. Recommends Markdown for copy-paste.}</w:t>
-      </w:r>
-      <w:r>
-        <w:t xml:space="preserve"> </w:t>
-      </w:r>
-      <w:r>
-        <w:t xml:space="preserve">\changelogentry{3.1.1}{\today}{\item Updated MaaS Gateway chapter to v1.10.9: non-interactive mode (\inlinecode{-y}) now suppresses all prompts (prerequisites, tool selection, skill install). \item Changed project clone path from \inlinecode{\textasciitilde} (root home) to \inlinecode{/home} as default working directory. \item Added project standards to AGENTS.md: workflow, end-to-end validation, code style, git conventions, when unsure.}</w:t>
-      </w:r>
-      <w:r>
-        <w:t xml:space="preserve"> </w:t>
-      </w:r>
-      <w:r>
-        <w:t xml:space="preserve">\changelogentry{3.1.0}{\today}{\item Switched from ECS to Flexus X instance (4 vCPU, 16 GB RAM via slider, flavor \inlinecode{x1.4u.16g}) --- more cost-efficient and robust. Updated creation steps to match Flexus X console order: billing mode first, vCPU/RAM slider (no flavor dropdown), Cloud Eye monitoring (recommended), then instance name and key pair login. Replaced screenshots with Flexus X console images. \item Rewrote Chapter 3: switched from \inlinecode{connect.exe} to \inlinecode{ncat} (from Nmap) as the SSH ProxyCommand. Added explanation of HTTP CONNECT method, why port 4444 works, why ncat is chosen, ncat installation with antivirus exclusions, flag reference table, and improved keepalive settings. \item Restructured chapters: moved SSH config and VS Code connection to new Chapter 4 (Install VS Code and Connect via Remote-SSH). Chapters 5--7 renumbered. \item Added verification checklist tables to all 7 chapters. \item Added mandatory reboot warning in Chapter 2 (SSH port change). Added troubleshooting subsection in Chapter 4 with common SSH connection issues and ncat debugging commands.}</w:t>
-      </w:r>
-      <w:r>
-        <w:t xml:space="preserve"> </w:t>
-      </w:r>
-      <w:r>
-        <w:t xml:space="preserve">\changelogentry{3.0.1}{\today}{\item Minor fixes: test-filter.sh auto-discovery, build.sh help text, Makefile aggregate descriptions, 5-section comment correction, CHANGELOG version gap note, callout-in-code fix, CI font auto-discovery, dofile path comment, test-sync.sh header.}</w:t>
-      </w:r>
-      <w:r>
-        <w:t xml:space="preserve"> </w:t>
-      </w:r>
-      <w:r>
-        <w:t xml:space="preserve">\changelogentry{3.0.0}{\today}{\item Modular pipeline refactoring: shared Lua filter factory, shared DOCX fix logic, build system auto-discovery, unified format pipeline, GitHub Actions CI.}</w:t>
-      </w:r>
-      <w:r>
-        <w:t xml:space="preserve"> </w:t>
-      </w:r>
-      <w:r>
-        <w:t xml:space="preserve">\changelogentry{2.16.0}{\today}{\item Updated to match template v2.16.0 — Lua filter fixes, build system updates, and technical template parity improvements.}</w:t>
+        <w:t xml:space="preserve">\changelogentry{6.4.0}{2026-09-20}{\item Fixed changelog dates — replaced \inlinecode{\textbackslash today} with historical release dates. Eliminated zero-width-space missing-glyph warnings from typographic substitutions.}</w:t>
+      </w:r>
+      <w:r>
+        <w:t xml:space="preserve"> </w:t>
+      </w:r>
+      <w:r>
+        <w:t xml:space="preserve">\changelogentry{5.1.1}{2026-09-14}{\item Synced callout colors in DOCX/HTML/MD output to match brand palette. Added color palette demo.}</w:t>
+      </w:r>
+      <w:r>
+        <w:t xml:space="preserve"> </w:t>
+      </w:r>
+      <w:r>
+        <w:t xml:space="preserve">\changelogentry{5.1.0}{2026-09-14}{\item Adopted brand guidelines auxiliary color palette and monochrome scale. Aligned callout colors to brand specifications.}</w:t>
+      </w:r>
+      <w:r>
+        <w:t xml:space="preserve"> </w:t>
+      </w:r>
+      <w:r>
+        <w:t xml:space="preserve">\changelogentry{5.0.3}{2026-09-14}{\item Removed non-standard \inlinecode{\textbackslash badge} tags from testcases for consistency.}</w:t>
+      </w:r>
+      <w:r>
+        <w:t xml:space="preserve"> </w:t>
+      </w:r>
+      <w:r>
+        <w:t xml:space="preserve">\changelogentry{5.0.2}{2026-09-14}{\item Long commands in test steps now render as code blocks instead of inline code.}</w:t>
+      </w:r>
+      <w:r>
+        <w:t xml:space="preserve"> </w:t>
+      </w:r>
+      <w:r>
+        <w:t xml:space="preserve">\changelogentry{5.0.1}{2026-09-14}{\item Testcase caption centered above the block.}</w:t>
+      </w:r>
+      <w:r>
+        <w:t xml:space="preserve"> </w:t>
+      </w:r>
+      <w:r>
+        <w:t xml:space="preserve">\changelogentry{5.0.0}{2026-09-14}{\item Major refactoring: extracted shared modules (huawei-titles, huawei-toc, huawei-cover), renamed \inlinecode{\textbackslash lg@guidetitle} to \inlinecode{\textbackslash lg@doctitle}, unified title API with \inlinecode{\textbackslash setdoctitle}, decomposed \inlinecode{docx\_fix.py} (680$\to$84 lines), added testbook unit tests, fixed build system error handling.}</w:t>
+      </w:r>
+      <w:r>
+        <w:t xml:space="preserve"> </w:t>
+      </w:r>
+      <w:r>
+        <w:t xml:space="preserve">\changelogentry{4.7.0}{2026-09-14}{\item Testcase headings now formatted as captions (like figures/tables): bold ``Testcase N:'' followed by description. Changed label from ``Test Case'' to ``Testcase''.}</w:t>
+      </w:r>
+      <w:r>
+        <w:t xml:space="preserve"> </w:t>
+      </w:r>
+      <w:r>
+        <w:t xml:space="preserve">\changelogentry{4.6.0}{2026-09-13}{\item Section restructure: Introduction, Test Cases (with category subsections), Conclusion. Testcases auto-numbered like figures/tables. Changed testcase from subsection to subsubsection.}</w:t>
+      </w:r>
+      <w:r>
+        <w:t xml:space="preserve"> </w:t>
+      </w:r>
+      <w:r>
+        <w:t xml:space="preserve">\changelogentry{4.5.0}{2026-09-13}{\item Unified field APIs: \inlinecode{testprerequisites} and \inlinecode{testexpected} changed from commands to environments, matching \inlinecode{testprocedure}. All three now use \inlinecode{\textbackslash teststep} for auto-numbered items with red bold numbers. Uniform code, same visual style.}</w:t>
+      </w:r>
+      <w:r>
+        <w:t xml:space="preserve"> </w:t>
+      </w:r>
+      <w:r>
+        <w:t xml:space="preserve">\changelogentry{4.4.0}{2026-09-13}{\item Code review fixes: removed dead labels, badge now uses Huawei brand colors (tipbg/tipfg, huaweired, warningbg/warningfg), Lua filter preserves formatting in DOCX/MD/HTML via parse\_latex\_blocks, testprocedure handler preserves non-step content (images, code, callouts).}</w:t>
+      </w:r>
+      <w:r>
+        <w:t xml:space="preserve"> </w:t>
+      </w:r>
+      <w:r>
+        <w:t xml:space="preserve">\changelogentry{4.3.0}{2026-09-13}{\item Added \inlinecode{testlist} environment for numbered lists with red bold numbers in testcase fields. Fixed alignment: zeroed \inlinecode{\textbackslash parindent} inside testcase, indented procedure step numbering to align with \inlinecode{testlist} items.}</w:t>
+      </w:r>
+      <w:r>
+        <w:t xml:space="preserve"> </w:t>
+      </w:r>
+      <w:r>
+        <w:t xml:space="preserve">\changelogentry{4.2.0}{2026-09-13}{\item Changed teststeps from tabular table to auto-numbered paragraphs. \inlinecode{\textbackslash teststep} now takes 1 arg (action only, numbering automatic). Removed \inlinecode{teststeps} environment. Images, code blocks, and callouts can be placed freely between steps inside \inlinecode{testprocedure}.}</w:t>
+      </w:r>
+      <w:r>
+        <w:t xml:space="preserve"> </w:t>
+      </w:r>
+      <w:r>
+        <w:t xml:space="preserve">\changelogentry{4.1.0}{2026-09-13}{\item Testcase field redesign: full-width red mini header bars for each field. Changed \inlinecode{testprocedure} from command to environment wrapping 2-column teststeps (Step | Action). Reordered fields: Test Result before Remarks. Updated Lua filter and round-trip test for grid table counting.}</w:t>
+      </w:r>
+      <w:r>
+        <w:t xml:space="preserve"> </w:t>
+      </w:r>
+      <w:r>
+        <w:t xml:space="preserve">\changelogentry{4.0.0}{2026-09-13}{\item Redesigned testbook \inlinecode{testcase} environment: replaced 2-column tabular with breakable tcolorbox (red left-rule, stacked paragraph fields). Images, code blocks, callouts, and nested tables now render correctly and break across pages. Added \inlinecode{longhutable} environment for page-breaking tables. Updated Lua filter to produce definition lists for DOCX/MD/HTML.}</w:t>
+      </w:r>
+      <w:r>
+        <w:t xml:space="preserve"> </w:t>
+      </w:r>
+      <w:r>
+        <w:t xml:space="preserve">\changelogentry{3.9.0}{2026-09-13}{\item Added testsummary environment, teststeps environment, and \inlinecode{\textbackslash testresultbadge} command to testbook template. Fixed testcase layout (full-width tabular with proper text alignment).}</w:t>
+      </w:r>
+      <w:r>
+        <w:t xml:space="preserve"> </w:t>
+      </w:r>
+      <w:r>
+        <w:t xml:space="preserve">\changelogentry{3.8.1}{2026-09-13}{\item End-to-end quality review: fixed testbook PDF metadata title, removed stray user DOCX from template dir, fixed round-trip.sh variable typo, updated stale references in AGENTS.md and README.md, committed testbook sample PDFs, set TZ for pandoc cover time consistency, widened pandoc version range.}</w:t>
+      </w:r>
+      <w:r>
+        <w:t xml:space="preserve"> </w:t>
+      </w:r>
+      <w:r>
+        <w:t xml:space="preserve">\changelogentry{3.8.0}{2026-09-13}{\item Removed Tips and Tricks chapter (tmux configuration) — required VS Code-specific keybindings that don't generalize across terminal setups.}</w:t>
+      </w:r>
+      <w:r>
+        <w:t xml:space="preserve"> </w:t>
+      </w:r>
+      <w:r>
+        <w:t xml:space="preserve">\changelogentry{3.7.0}{2026-09-12}{\item Added \inlinecode{testbook} template for POC/acceptance test case documents with \inlinecode{testcase} environment and \inlinecode{[noanswers]} option.}</w:t>
+      </w:r>
+      <w:r>
+        <w:t xml:space="preserve"> </w:t>
+      </w:r>
+      <w:r>
+        <w:t xml:space="preserve">\changelogentry{3.6.0}{2026-09-11}{\item Added \inlinecode{\textbackslash setdocauthors} command and \inlinecode{[noauthors]} class option to both templates. Authors are displayed on the cover page (optional --- hidden if not set or if \inlinecode{[noauthors]} is passed). Demonstrated in all 4 samples.}</w:t>
+      </w:r>
+      <w:r>
+        <w:t xml:space="preserve"> </w:t>
+      </w:r>
+      <w:r>
+        <w:t xml:space="preserve">\changelogentry{3.5.0}{2026-09-11}{\item Reorganized project structure: moved \inlinecode{build.sh}, \inlinecode{install.sh}, and \inlinecode{uninstall.sh} from repo root to \inlinecode{scripts/} directory. Updated all references in Makefile, README, AGENTS.md, SKILL.md, and setup guide. One-liner URLs now use \inlinecode{main/scripts/install.sh}.}</w:t>
+      </w:r>
+      <w:r>
+        <w:t xml:space="preserve"> </w:t>
+      </w:r>
+      <w:r>
+        <w:t xml:space="preserve">\changelogentry{3.4.0}{2026-09-11}{\item \inlinecode{install.sh}: opencode skills and VS Code LaTeX Workshop are now optional prompts (default yes). Removed LTeX extension (was failing to install). One-liner detects existing installation and prompts to update with version display (\inlinecode{v3.3.6 $\to$ v3.3.7}). Uses absolute paths to prevent nested clones. \item \inlinecode{uninstall.sh}: Added one-liner support (\inlinecode{curl | bash}). Added ``Remove 100\%'' nuclear option (option 4) to interactive menu. Added \inlinecode{--repo} flag. \item Updated Chapter 6 with optional component prompts and update detection. Updated Chapter 7 with one-liner update/uninstall and full menu documentation.}</w:t>
+      </w:r>
+      <w:r>
+        <w:t xml:space="preserve"> </w:t>
+      </w:r>
+      <w:r>
+        <w:t xml:space="preserve">\changelogentry{3.3.0}{2026-09-11}{\item Moved pre-compiled setup guide to \inlinecode{setup-guide/} folder in repo root with all four formats (PDF, MD, DOCX, HTML). Users can read these before cloning to understand the installation process. \item Updated Makefile \inlinecode{setup-guide} target to generate and copy all four formats. \item Updated README with pre-compiled setup guide section and format comparison table. \item Updated .gitignore to track all four formats in \inlinecode{setup-guide/}.}</w:t>
+      </w:r>
+      <w:r>
+        <w:t xml:space="preserve"> </w:t>
+      </w:r>
+      <w:r>
+        <w:t xml:space="preserve">\changelogentry{3.2.1}{2026-09-11}{\item Renamed Chapter 7 from ``Clean Up'' to ``Operations and Maintenance''. Added subsections for updating and uninstalling both the MaaS Gateway and the document templates. Added cloud resource cleanup as an optional subsection.}</w:t>
+      </w:r>
+      <w:r>
+        <w:t xml:space="preserve"> </w:t>
+      </w:r>
+      <w:r>
+        <w:t xml:space="preserve">\changelogentry{3.2.0}{2026-09-11}{\item Added \inlinecode{uninstall.sh} script with interactive menu, \inlinecode{--all}, \inlinecode{--yes}, and \inlinecode{--dry-run} flags. Removes opencode skills, .sty modules, HarmonyOS Sans font, /etc/LatexMk fix, and VS Code settings. \item Fixed \inlinecode{install.sh}: show apt-get output (was hidden), suppressed fvextra build noise, fix font detection (\inlinecode{fc-list : family}), fix test compilation paths (\inlinecode{src/} subdirectory), fix LTeX extension success/failure reporting. \item Updated Chapter 7 with uninstall instructions.}</w:t>
+      </w:r>
+      <w:r>
+        <w:t xml:space="preserve"> </w:t>
+      </w:r>
+      <w:r>
+        <w:t xml:space="preserve">\changelogentry{3.1.2}{2026-09-11}{\item Added output format guide to README.md: comparison table of PDF, Markdown, DOCX, and HTML with purpose, copy-paste quality, and limitations. Recommends Markdown for copy-paste.}</w:t>
+      </w:r>
+      <w:r>
+        <w:t xml:space="preserve"> </w:t>
+      </w:r>
+      <w:r>
+        <w:t xml:space="preserve">\changelogentry{3.1.1}{2026-09-11}{\item Updated MaaS Gateway chapter to v1.10.9: non-interactive mode (\inlinecode{-y}) now suppresses all prompts (prerequisites, tool selection, skill install). \item Changed project clone path from \inlinecode{\textasciitilde} (root home) to \inlinecode{/home} as default working directory. \item Added project standards to AGENTS.md: workflow, end-to-end validation, code style, git conventions, when unsure.}</w:t>
+      </w:r>
+      <w:r>
+        <w:t xml:space="preserve"> </w:t>
+      </w:r>
+      <w:r>
+        <w:t xml:space="preserve">\changelogentry{3.1.0}{2026-09-11}{\item Switched from ECS to Flexus X instance (4 vCPU, 16 GB RAM via slider, flavor \inlinecode{x1.4u.16g}) --- more cost-efficient and robust. Updated creation steps to match Flexus X console order: billing mode first, vCPU/RAM slider (no flavor dropdown), Cloud Eye monitoring (recommended), then instance name and key pair login. Replaced screenshots with Flexus X console images. \item Rewrote Chapter 3: switched from \inlinecode{connect.exe} to \inlinecode{ncat} (from Nmap) as the SSH ProxyCommand. Added explanation of HTTP CONNECT method, why port 4444 works, why ncat is chosen, ncat installation with antivirus exclusions, flag reference table, and improved keepalive settings. \item Restructured chapters: moved SSH config and VS Code connection to new Chapter 4 (Install VS Code and Connect via Remote-SSH). Chapters 5--7 renumbered. \item Added verification checklist tables to all 7 chapters. \item Added mandatory reboot warning in Chapter 2 (SSH port change). Added troubleshooting subsection in Chapter 4 with common SSH connection issues and ncat debugging commands.}</w:t>
+      </w:r>
+      <w:r>
+        <w:t xml:space="preserve"> </w:t>
+      </w:r>
+      <w:r>
+        <w:t xml:space="preserve">\changelogentry{3.0.1}{2026-09-10}{\item Minor fixes: test-filter.sh auto-discovery, build.sh help text, Makefile aggregate descriptions, 5-section comment correction, CHANGELOG version gap note, callout-in-code fix, CI font auto-discovery, dofile path comment, test-sync.sh header.}</w:t>
+      </w:r>
+      <w:r>
+        <w:t xml:space="preserve"> </w:t>
+      </w:r>
+      <w:r>
+        <w:t xml:space="preserve">\changelogentry{3.0.0}{2026-09-09}{\item Modular pipeline refactoring: shared Lua filter factory, shared DOCX fix logic, build system auto-discovery, unified format pipeline, GitHub Actions CI.}</w:t>
+      </w:r>
+      <w:r>
+        <w:t xml:space="preserve"> </w:t>
+      </w:r>
+      <w:r>
+        <w:t xml:space="preserve">\changelogentry{2.16.0}{2026-09-05}{\item Updated to match template v2.16.0 — Lua filter fixes, build system updates, and technical template parity improvements.}</w:t>
       </w:r>
       <w:r>
         <w:t xml:space="preserve"> </w:t>

</xml_diff>

<commit_message>
DOCX polish: centered captions, vertical rhythm, step separation
- Captions: all centered (Table was left-aligned) — matches the PDF
  where \caption, \imagecap, \diagramcap, and testcase captions all
  render centered
- Vertical spacing matched to the LaTeX rhythm: captions 12pt/8pt,
  field header bars 8pt/4pt (\medskip/\smallskip), steps 6pt before,
  content paras 6pt after (reference: \parskip=4pt huawei-fonts.sty)
- Steps now render as separate paragraphs — the pre-processor emitted
  step lines without blank separators so AsciiDoc merged them into one
  paragraph; each step now gets its own red bold number
- Version coupling: 4x cls + setup-guide → 6.4.5
</commit_message>
<xml_diff>
--- a/documents/setup-guide/setup-guide.docx
+++ b/documents/setup-guide/setup-guide.docx
@@ -84,7 +84,7 @@
           <w:b/>
           <w:sz w:val="24"/>
         </w:rPr>
-        <w:t xml:space="preserve">v6.4.4</w:t>
+        <w:t xml:space="preserve">v6.4.5</w:t>
       </w:r>
       <w:r>
         <w:rPr>
@@ -96,7 +96,7 @@
         <w:rPr>
           <w:sz w:val="24"/>
         </w:rPr>
-        <w:t xml:space="preserve">— September 19, 2026 23:05</w:t>
+        <w:t xml:space="preserve">— September 19, 2026 23:43</w:t>
       </w:r>
     </w:p>
     <w:sdt>
@@ -1411,7 +1411,8 @@
     <w:p>
       <w:pPr>
         <w:pStyle w:val="TableCaption"/>
-        <w:jc w:val="left"/>
+        <w:spacing w:before="240" w:after="160"/>
+        <w:jc w:val="center"/>
       </w:pPr>
       <w:r>
         <w:rPr>
@@ -2146,6 +2147,7 @@
           <w:numId w:val="1000"/>
         </w:numPr>
         <w:pStyle w:val="ImageCaption"/>
+        <w:spacing w:before="240" w:after="160"/>
         <w:jc w:val="center"/>
       </w:pPr>
       <w:r>
@@ -2398,6 +2400,7 @@
           <w:numId w:val="1000"/>
         </w:numPr>
         <w:pStyle w:val="ImageCaption"/>
+        <w:spacing w:before="240" w:after="160"/>
         <w:jc w:val="center"/>
       </w:pPr>
       <w:r>
@@ -2639,6 +2642,7 @@
           <w:numId w:val="1000"/>
         </w:numPr>
         <w:pStyle w:val="ImageCaption"/>
+        <w:spacing w:before="240" w:after="160"/>
         <w:jc w:val="center"/>
       </w:pPr>
       <w:r>
@@ -2820,7 +2824,8 @@
     <w:p>
       <w:pPr>
         <w:pStyle w:val="TableCaption"/>
-        <w:jc w:val="left"/>
+        <w:spacing w:before="240" w:after="160"/>
+        <w:jc w:val="center"/>
       </w:pPr>
       <w:r>
         <w:rPr>
@@ -4301,6 +4306,7 @@
           <w:numId w:val="1000"/>
         </w:numPr>
         <w:pStyle w:val="ImageCaption"/>
+        <w:spacing w:before="240" w:after="160"/>
         <w:jc w:val="center"/>
       </w:pPr>
       <w:r>
@@ -4529,7 +4535,8 @@
     <w:p>
       <w:pPr>
         <w:pStyle w:val="TableCaption"/>
-        <w:jc w:val="left"/>
+        <w:spacing w:before="240" w:after="160"/>
+        <w:jc w:val="center"/>
       </w:pPr>
       <w:r>
         <w:rPr>
@@ -5679,7 +5686,8 @@
     <w:p>
       <w:pPr>
         <w:pStyle w:val="TableCaption"/>
-        <w:jc w:val="left"/>
+        <w:spacing w:before="240" w:after="160"/>
+        <w:jc w:val="center"/>
       </w:pPr>
       <w:r>
         <w:rPr>
@@ -6137,6 +6145,7 @@
           <w:numId w:val="1000"/>
         </w:numPr>
         <w:pStyle w:val="ImageCaption"/>
+        <w:spacing w:before="240" w:after="160"/>
         <w:jc w:val="center"/>
       </w:pPr>
       <w:r>
@@ -6883,7 +6892,8 @@
     <w:p>
       <w:pPr>
         <w:pStyle w:val="TableCaption"/>
-        <w:jc w:val="left"/>
+        <w:spacing w:before="240" w:after="160"/>
+        <w:jc w:val="center"/>
       </w:pPr>
       <w:r>
         <w:rPr>
@@ -7703,7 +7713,8 @@
     <w:p>
       <w:pPr>
         <w:pStyle w:val="TableCaption"/>
-        <w:jc w:val="left"/>
+        <w:spacing w:before="240" w:after="160"/>
+        <w:jc w:val="center"/>
       </w:pPr>
       <w:r>
         <w:rPr>
@@ -8524,7 +8535,8 @@
     <w:p>
       <w:pPr>
         <w:pStyle w:val="TableCaption"/>
-        <w:jc w:val="left"/>
+        <w:spacing w:before="240" w:after="160"/>
+        <w:jc w:val="center"/>
       </w:pPr>
       <w:r>
         <w:rPr>
@@ -10423,7 +10435,8 @@
     <w:p>
       <w:pPr>
         <w:pStyle w:val="TableCaption"/>
-        <w:jc w:val="left"/>
+        <w:spacing w:before="240" w:after="160"/>
+        <w:jc w:val="center"/>
       </w:pPr>
       <w:r>
         <w:rPr>
@@ -11955,7 +11968,8 @@
     <w:p>
       <w:pPr>
         <w:pStyle w:val="TableCaption"/>
-        <w:jc w:val="left"/>
+        <w:spacing w:before="240" w:after="160"/>
+        <w:jc w:val="center"/>
       </w:pPr>
       <w:r>
         <w:rPr>
@@ -13331,7 +13345,7 @@
               <w:jc w:val="left"/>
             </w:pPr>
             <w:r>
-              <w:t xml:space="preserve">6.4.4</w:t>
+              <w:t xml:space="preserve">6.4.5</w:t>
             </w:r>
           </w:p>
         </w:tc>
@@ -13353,7 +13367,7 @@
               <w:jc w:val="left"/>
             </w:pPr>
             <w:r>
-              <w:t xml:space="preserve">DOCX covers now show the logo, cover text, and version/date/time meta line like the PDF. Test case blocks in DOCX get the PDF’s visual wrapper: red left rule, red field header bars, and red step numbers. Captions follow the PDF ordering system in DOCX, MD, and HTML (Table/Diagram/Figure/Testcase N: with bold symbol). Portuguese PDFs now label diagrams "Diagrama N:" (was hardcoded English "Diagram"). Markdown and HTML output no longer leaks raw LaTeX from passthrough blocks — the DOCX pre-processor now feeds those pipelines too.</w:t>
+              <w:t xml:space="preserve">DOCX polish pass: all captions centered (matching the PDF), vertical spacing between blocks matched to the LaTeX rhythm (medskip/smallskip around captions, field bars, and steps), and test steps now render as separate paragraphs each with the red bold number (previously merged into one paragraph).</w:t>
             </w:r>
           </w:p>
         </w:tc>
@@ -13368,7 +13382,7 @@
               <w:jc w:val="left"/>
             </w:pPr>
             <w:r>
-              <w:t xml:space="preserve">6.4.3</w:t>
+              <w:t xml:space="preserve">6.4.4</w:t>
             </w:r>
           </w:p>
         </w:tc>
@@ -13394,7 +13408,7 @@
               <w:jc w:val="left"/>
             </w:pPr>
             <w:r>
-              <w:t xml:space="preserve">Testbook and POC DOCX output now matches the PDF much more closely: native table of contents (language-aware, auto-populated), each section starts on a new page, embedded images and diagrams (PlantUML/Graphviz rendered), white-on-red table headers, cover version line under the title, centered test case captions, and plain black rules for signature grids.</w:t>
+              <w:t xml:space="preserve">DOCX covers now show the logo, cover text, and version/date/time meta line like the PDF. Test case blocks in DOCX get the PDF’s visual wrapper: red left rule, red field header bars, and red step numbers. Captions follow the PDF ordering system in DOCX, MD, and HTML (Table/Diagram/Figure/Testcase N: with bold symbol). Portuguese PDFs now label diagrams "Diagrama N:" (was hardcoded English "Diagram"). Markdown and HTML output no longer leaks raw LaTeX from passthrough blocks — the DOCX pre-processor now feeds those pipelines too.</w:t>
             </w:r>
           </w:p>
         </w:tc>
@@ -13407,7 +13421,7 @@
               <w:jc w:val="left"/>
             </w:pPr>
             <w:r>
-              <w:t xml:space="preserve">6.4.2</w:t>
+              <w:t xml:space="preserve">6.4.3</w:t>
             </w:r>
           </w:p>
         </w:tc>
@@ -13429,7 +13443,7 @@
               <w:jc w:val="left"/>
             </w:pPr>
             <w:r>
-              <w:t xml:space="preserve">DOCX output for POC and testbook templates now includes all passthrough content (stakeholders, closing record, signatures, test cases, test summary, changelog) via a new pre-processor. Fixed dropped Test Scope fields in testbook DOCX output.</w:t>
+              <w:t xml:space="preserve">Testbook and POC DOCX output now matches the PDF much more closely: native table of contents (language-aware, auto-populated), each section starts on a new page, embedded images and diagrams (PlantUML/Graphviz rendered), white-on-red table headers, cover version line under the title, centered test case captions, and plain black rules for signature grids.</w:t>
             </w:r>
           </w:p>
         </w:tc>
@@ -13444,14 +13458,51 @@
               <w:jc w:val="left"/>
             </w:pPr>
             <w:r>
+              <w:t xml:space="preserve">6.4.2</w:t>
+            </w:r>
+          </w:p>
+        </w:tc>
+        <w:tc>
+          <w:tcPr>
+            <w:shd w:val="clear" w:color="auto" w:fill="F6F8FA"/>
+          </w:tcPr>
+          <w:p>
+            <w:pPr>
+              <w:jc w:val="left"/>
+            </w:pPr>
+            <w:r>
+              <w:t xml:space="preserve">2026-09-20</w:t>
+            </w:r>
+          </w:p>
+        </w:tc>
+        <w:tc>
+          <w:tcPr>
+            <w:shd w:val="clear" w:color="auto" w:fill="F6F8FA"/>
+          </w:tcPr>
+          <w:p>
+            <w:pPr>
+              <w:jc w:val="left"/>
+            </w:pPr>
+            <w:r>
+              <w:t xml:space="preserve">DOCX output for POC and testbook templates now includes all passthrough content (stakeholders, closing record, signatures, test cases, test summary, changelog) via a new pre-processor. Fixed dropped Test Scope fields in testbook DOCX output.</w:t>
+            </w:r>
+          </w:p>
+        </w:tc>
+      </w:tr>
+      <w:tr>
+        <w:tc>
+          <w:tcPr/>
+          <w:p>
+            <w:pPr>
+              <w:jc w:val="left"/>
+            </w:pPr>
+            <w:r>
               <w:t xml:space="preserve">6.4.0</w:t>
             </w:r>
           </w:p>
         </w:tc>
         <w:tc>
-          <w:tcPr>
-            <w:shd w:val="clear" w:color="auto" w:fill="F6F8FA"/>
-          </w:tcPr>
+          <w:tcPr/>
           <w:p>
             <w:pPr>
               <w:jc w:val="left"/>
@@ -13462,9 +13513,7 @@
           </w:p>
         </w:tc>
         <w:tc>
-          <w:tcPr>
-            <w:shd w:val="clear" w:color="auto" w:fill="F6F8FA"/>
-          </w:tcPr>
+          <w:tcPr/>
           <w:p>
             <w:pPr>
               <w:jc w:val="left"/>
@@ -13492,7 +13541,9 @@
       </w:tr>
       <w:tr>
         <w:tc>
-          <w:tcPr/>
+          <w:tcPr>
+            <w:shd w:val="clear" w:color="auto" w:fill="F6F8FA"/>
+          </w:tcPr>
           <w:p>
             <w:pPr>
               <w:jc w:val="left"/>
@@ -13503,7 +13554,9 @@
           </w:p>
         </w:tc>
         <w:tc>
-          <w:tcPr/>
+          <w:tcPr>
+            <w:shd w:val="clear" w:color="auto" w:fill="F6F8FA"/>
+          </w:tcPr>
           <w:p>
             <w:pPr>
               <w:jc w:val="left"/>
@@ -13514,7 +13567,9 @@
           </w:p>
         </w:tc>
         <w:tc>
-          <w:tcPr/>
+          <w:tcPr>
+            <w:shd w:val="clear" w:color="auto" w:fill="F6F8FA"/>
+          </w:tcPr>
           <w:p>
             <w:pPr>
               <w:jc w:val="left"/>
@@ -13527,9 +13582,7 @@
       </w:tr>
       <w:tr>
         <w:tc>
-          <w:tcPr>
-            <w:shd w:val="clear" w:color="auto" w:fill="F6F8FA"/>
-          </w:tcPr>
+          <w:tcPr/>
           <w:p>
             <w:pPr>
               <w:jc w:val="left"/>
@@ -13540,9 +13593,7 @@
           </w:p>
         </w:tc>
         <w:tc>
-          <w:tcPr>
-            <w:shd w:val="clear" w:color="auto" w:fill="F6F8FA"/>
-          </w:tcPr>
+          <w:tcPr/>
           <w:p>
             <w:pPr>
               <w:jc w:val="left"/>
@@ -13553,9 +13604,7 @@
           </w:p>
         </w:tc>
         <w:tc>
-          <w:tcPr>
-            <w:shd w:val="clear" w:color="auto" w:fill="F6F8FA"/>
-          </w:tcPr>
+          <w:tcPr/>
           <w:p>
             <w:pPr>
               <w:jc w:val="left"/>
@@ -13568,7 +13617,9 @@
       </w:tr>
       <w:tr>
         <w:tc>
-          <w:tcPr/>
+          <w:tcPr>
+            <w:shd w:val="clear" w:color="auto" w:fill="F6F8FA"/>
+          </w:tcPr>
           <w:p>
             <w:pPr>
               <w:jc w:val="left"/>
@@ -13579,7 +13630,9 @@
           </w:p>
         </w:tc>
         <w:tc>
-          <w:tcPr/>
+          <w:tcPr>
+            <w:shd w:val="clear" w:color="auto" w:fill="F6F8FA"/>
+          </w:tcPr>
           <w:p>
             <w:pPr>
               <w:jc w:val="left"/>
@@ -13590,7 +13643,9 @@
           </w:p>
         </w:tc>
         <w:tc>
-          <w:tcPr/>
+          <w:tcPr>
+            <w:shd w:val="clear" w:color="auto" w:fill="F6F8FA"/>
+          </w:tcPr>
           <w:p>
             <w:pPr>
               <w:jc w:val="left"/>
@@ -13618,9 +13673,7 @@
       </w:tr>
       <w:tr>
         <w:tc>
-          <w:tcPr>
-            <w:shd w:val="clear" w:color="auto" w:fill="F6F8FA"/>
-          </w:tcPr>
+          <w:tcPr/>
           <w:p>
             <w:pPr>
               <w:jc w:val="left"/>
@@ -13631,9 +13684,7 @@
           </w:p>
         </w:tc>
         <w:tc>
-          <w:tcPr>
-            <w:shd w:val="clear" w:color="auto" w:fill="F6F8FA"/>
-          </w:tcPr>
+          <w:tcPr/>
           <w:p>
             <w:pPr>
               <w:jc w:val="left"/>
@@ -13644,9 +13695,7 @@
           </w:p>
         </w:tc>
         <w:tc>
-          <w:tcPr>
-            <w:shd w:val="clear" w:color="auto" w:fill="F6F8FA"/>
-          </w:tcPr>
+          <w:tcPr/>
           <w:p>
             <w:pPr>
               <w:jc w:val="left"/>
@@ -13659,7 +13708,9 @@
       </w:tr>
       <w:tr>
         <w:tc>
-          <w:tcPr/>
+          <w:tcPr>
+            <w:shd w:val="clear" w:color="auto" w:fill="F6F8FA"/>
+          </w:tcPr>
           <w:p>
             <w:pPr>
               <w:jc w:val="left"/>
@@ -13670,7 +13721,9 @@
           </w:p>
         </w:tc>
         <w:tc>
-          <w:tcPr/>
+          <w:tcPr>
+            <w:shd w:val="clear" w:color="auto" w:fill="F6F8FA"/>
+          </w:tcPr>
           <w:p>
             <w:pPr>
               <w:jc w:val="left"/>
@@ -13681,7 +13734,9 @@
           </w:p>
         </w:tc>
         <w:tc>
-          <w:tcPr/>
+          <w:tcPr>
+            <w:shd w:val="clear" w:color="auto" w:fill="F6F8FA"/>
+          </w:tcPr>
           <w:p>
             <w:pPr>
               <w:jc w:val="left"/>
@@ -13694,9 +13749,7 @@
       </w:tr>
       <w:tr>
         <w:tc>
-          <w:tcPr>
-            <w:shd w:val="clear" w:color="auto" w:fill="F6F8FA"/>
-          </w:tcPr>
+          <w:tcPr/>
           <w:p>
             <w:pPr>
               <w:jc w:val="left"/>
@@ -13707,9 +13760,7 @@
           </w:p>
         </w:tc>
         <w:tc>
-          <w:tcPr>
-            <w:shd w:val="clear" w:color="auto" w:fill="F6F8FA"/>
-          </w:tcPr>
+          <w:tcPr/>
           <w:p>
             <w:pPr>
               <w:jc w:val="left"/>
@@ -13720,9 +13771,7 @@
           </w:p>
         </w:tc>
         <w:tc>
-          <w:tcPr>
-            <w:shd w:val="clear" w:color="auto" w:fill="F6F8FA"/>
-          </w:tcPr>
+          <w:tcPr/>
           <w:p>
             <w:pPr>
               <w:jc w:val="left"/>
@@ -13789,7 +13838,9 @@
       </w:tr>
       <w:tr>
         <w:tc>
-          <w:tcPr/>
+          <w:tcPr>
+            <w:shd w:val="clear" w:color="auto" w:fill="F6F8FA"/>
+          </w:tcPr>
           <w:p>
             <w:pPr>
               <w:jc w:val="left"/>
@@ -13800,7 +13851,9 @@
           </w:p>
         </w:tc>
         <w:tc>
-          <w:tcPr/>
+          <w:tcPr>
+            <w:shd w:val="clear" w:color="auto" w:fill="F6F8FA"/>
+          </w:tcPr>
           <w:p>
             <w:pPr>
               <w:jc w:val="left"/>
@@ -13811,7 +13864,9 @@
           </w:p>
         </w:tc>
         <w:tc>
-          <w:tcPr/>
+          <w:tcPr>
+            <w:shd w:val="clear" w:color="auto" w:fill="F6F8FA"/>
+          </w:tcPr>
           <w:p>
             <w:pPr>
               <w:jc w:val="left"/>
@@ -13836,9 +13891,7 @@
       </w:tr>
       <w:tr>
         <w:tc>
-          <w:tcPr>
-            <w:shd w:val="clear" w:color="auto" w:fill="F6F8FA"/>
-          </w:tcPr>
+          <w:tcPr/>
           <w:p>
             <w:pPr>
               <w:jc w:val="left"/>
@@ -13849,9 +13902,7 @@
           </w:p>
         </w:tc>
         <w:tc>
-          <w:tcPr>
-            <w:shd w:val="clear" w:color="auto" w:fill="F6F8FA"/>
-          </w:tcPr>
+          <w:tcPr/>
           <w:p>
             <w:pPr>
               <w:jc w:val="left"/>
@@ -13862,9 +13913,7 @@
           </w:p>
         </w:tc>
         <w:tc>
-          <w:tcPr>
-            <w:shd w:val="clear" w:color="auto" w:fill="F6F8FA"/>
-          </w:tcPr>
+          <w:tcPr/>
           <w:p>
             <w:pPr>
               <w:jc w:val="left"/>
@@ -13877,7 +13926,9 @@
       </w:tr>
       <w:tr>
         <w:tc>
-          <w:tcPr/>
+          <w:tcPr>
+            <w:shd w:val="clear" w:color="auto" w:fill="F6F8FA"/>
+          </w:tcPr>
           <w:p>
             <w:pPr>
               <w:jc w:val="left"/>
@@ -13888,7 +13939,9 @@
           </w:p>
         </w:tc>
         <w:tc>
-          <w:tcPr/>
+          <w:tcPr>
+            <w:shd w:val="clear" w:color="auto" w:fill="F6F8FA"/>
+          </w:tcPr>
           <w:p>
             <w:pPr>
               <w:jc w:val="left"/>
@@ -13899,7 +13952,9 @@
           </w:p>
         </w:tc>
         <w:tc>
-          <w:tcPr/>
+          <w:tcPr>
+            <w:shd w:val="clear" w:color="auto" w:fill="F6F8FA"/>
+          </w:tcPr>
           <w:p>
             <w:pPr>
               <w:jc w:val="left"/>
@@ -13969,9 +14024,7 @@
       </w:tr>
       <w:tr>
         <w:tc>
-          <w:tcPr>
-            <w:shd w:val="clear" w:color="auto" w:fill="F6F8FA"/>
-          </w:tcPr>
+          <w:tcPr/>
           <w:p>
             <w:pPr>
               <w:jc w:val="left"/>
@@ -13982,9 +14035,7 @@
           </w:p>
         </w:tc>
         <w:tc>
-          <w:tcPr>
-            <w:shd w:val="clear" w:color="auto" w:fill="F6F8FA"/>
-          </w:tcPr>
+          <w:tcPr/>
           <w:p>
             <w:pPr>
               <w:jc w:val="left"/>
@@ -13995,9 +14046,7 @@
           </w:p>
         </w:tc>
         <w:tc>
-          <w:tcPr>
-            <w:shd w:val="clear" w:color="auto" w:fill="F6F8FA"/>
-          </w:tcPr>
+          <w:tcPr/>
           <w:p>
             <w:pPr>
               <w:jc w:val="left"/>
@@ -14010,7 +14059,9 @@
       </w:tr>
       <w:tr>
         <w:tc>
-          <w:tcPr/>
+          <w:tcPr>
+            <w:shd w:val="clear" w:color="auto" w:fill="F6F8FA"/>
+          </w:tcPr>
           <w:p>
             <w:pPr>
               <w:jc w:val="left"/>
@@ -14021,7 +14072,9 @@
           </w:p>
         </w:tc>
         <w:tc>
-          <w:tcPr/>
+          <w:tcPr>
+            <w:shd w:val="clear" w:color="auto" w:fill="F6F8FA"/>
+          </w:tcPr>
           <w:p>
             <w:pPr>
               <w:jc w:val="left"/>
@@ -14032,7 +14085,9 @@
           </w:p>
         </w:tc>
         <w:tc>
-          <w:tcPr/>
+          <w:tcPr>
+            <w:shd w:val="clear" w:color="auto" w:fill="F6F8FA"/>
+          </w:tcPr>
           <w:p>
             <w:pPr>
               <w:jc w:val="left"/>
@@ -14090,9 +14145,7 @@
       </w:tr>
       <w:tr>
         <w:tc>
-          <w:tcPr>
-            <w:shd w:val="clear" w:color="auto" w:fill="F6F8FA"/>
-          </w:tcPr>
+          <w:tcPr/>
           <w:p>
             <w:pPr>
               <w:jc w:val="left"/>
@@ -14103,9 +14156,7 @@
           </w:p>
         </w:tc>
         <w:tc>
-          <w:tcPr>
-            <w:shd w:val="clear" w:color="auto" w:fill="F6F8FA"/>
-          </w:tcPr>
+          <w:tcPr/>
           <w:p>
             <w:pPr>
               <w:jc w:val="left"/>
@@ -14116,9 +14167,7 @@
           </w:p>
         </w:tc>
         <w:tc>
-          <w:tcPr>
-            <w:shd w:val="clear" w:color="auto" w:fill="F6F8FA"/>
-          </w:tcPr>
+          <w:tcPr/>
           <w:p>
             <w:pPr>
               <w:jc w:val="left"/>
@@ -14173,7 +14222,9 @@
       </w:tr>
       <w:tr>
         <w:tc>
-          <w:tcPr/>
+          <w:tcPr>
+            <w:shd w:val="clear" w:color="auto" w:fill="F6F8FA"/>
+          </w:tcPr>
           <w:p>
             <w:pPr>
               <w:jc w:val="left"/>
@@ -14184,7 +14235,9 @@
           </w:p>
         </w:tc>
         <w:tc>
-          <w:tcPr/>
+          <w:tcPr>
+            <w:shd w:val="clear" w:color="auto" w:fill="F6F8FA"/>
+          </w:tcPr>
           <w:p>
             <w:pPr>
               <w:jc w:val="left"/>
@@ -14195,7 +14248,9 @@
           </w:p>
         </w:tc>
         <w:tc>
-          <w:tcPr/>
+          <w:tcPr>
+            <w:shd w:val="clear" w:color="auto" w:fill="F6F8FA"/>
+          </w:tcPr>
           <w:p>
             <w:pPr>
               <w:jc w:val="left"/>
@@ -14223,9 +14278,7 @@
       </w:tr>
       <w:tr>
         <w:tc>
-          <w:tcPr>
-            <w:shd w:val="clear" w:color="auto" w:fill="F6F8FA"/>
-          </w:tcPr>
+          <w:tcPr/>
           <w:p>
             <w:pPr>
               <w:jc w:val="left"/>
@@ -14236,9 +14289,7 @@
           </w:p>
         </w:tc>
         <w:tc>
-          <w:tcPr>
-            <w:shd w:val="clear" w:color="auto" w:fill="F6F8FA"/>
-          </w:tcPr>
+          <w:tcPr/>
           <w:p>
             <w:pPr>
               <w:jc w:val="left"/>
@@ -14249,9 +14300,7 @@
           </w:p>
         </w:tc>
         <w:tc>
-          <w:tcPr>
-            <w:shd w:val="clear" w:color="auto" w:fill="F6F8FA"/>
-          </w:tcPr>
+          <w:tcPr/>
           <w:p>
             <w:pPr>
               <w:jc w:val="left"/>
@@ -14264,7 +14313,9 @@
       </w:tr>
       <w:tr>
         <w:tc>
-          <w:tcPr/>
+          <w:tcPr>
+            <w:shd w:val="clear" w:color="auto" w:fill="F6F8FA"/>
+          </w:tcPr>
           <w:p>
             <w:pPr>
               <w:jc w:val="left"/>
@@ -14305,7 +14356,9 @@
           </w:p>
         </w:tc>
         <w:tc>
-          <w:tcPr/>
+          <w:tcPr>
+            <w:shd w:val="clear" w:color="auto" w:fill="F6F8FA"/>
+          </w:tcPr>
           <w:p>
             <w:pPr>
               <w:jc w:val="left"/>
@@ -14316,7 +14369,9 @@
           </w:p>
         </w:tc>
         <w:tc>
-          <w:tcPr/>
+          <w:tcPr>
+            <w:shd w:val="clear" w:color="auto" w:fill="F6F8FA"/>
+          </w:tcPr>
           <w:p>
             <w:pPr>
               <w:jc w:val="left"/>
@@ -14329,9 +14384,7 @@
       </w:tr>
       <w:tr>
         <w:tc>
-          <w:tcPr>
-            <w:shd w:val="clear" w:color="auto" w:fill="F6F8FA"/>
-          </w:tcPr>
+          <w:tcPr/>
           <w:p>
             <w:pPr>
               <w:jc w:val="left"/>
@@ -14357,9 +14410,7 @@
           </w:p>
         </w:tc>
         <w:tc>
-          <w:tcPr>
-            <w:shd w:val="clear" w:color="auto" w:fill="F6F8FA"/>
-          </w:tcPr>
+          <w:tcPr/>
           <w:p>
             <w:pPr>
               <w:jc w:val="left"/>
@@ -14370,9 +14421,7 @@
           </w:p>
         </w:tc>
         <w:tc>
-          <w:tcPr>
-            <w:shd w:val="clear" w:color="auto" w:fill="F6F8FA"/>
-          </w:tcPr>
+          <w:tcPr/>
           <w:p>
             <w:pPr>
               <w:jc w:val="left"/>
@@ -14385,7 +14434,9 @@
       </w:tr>
       <w:tr>
         <w:tc>
-          <w:tcPr/>
+          <w:tcPr>
+            <w:shd w:val="clear" w:color="auto" w:fill="F6F8FA"/>
+          </w:tcPr>
           <w:p>
             <w:pPr>
               <w:jc w:val="left"/>
@@ -14396,7 +14447,9 @@
           </w:p>
         </w:tc>
         <w:tc>
-          <w:tcPr/>
+          <w:tcPr>
+            <w:shd w:val="clear" w:color="auto" w:fill="F6F8FA"/>
+          </w:tcPr>
           <w:p>
             <w:pPr>
               <w:jc w:val="left"/>
@@ -14407,7 +14460,9 @@
           </w:p>
         </w:tc>
         <w:tc>
-          <w:tcPr/>
+          <w:tcPr>
+            <w:shd w:val="clear" w:color="auto" w:fill="F6F8FA"/>
+          </w:tcPr>
           <w:p>
             <w:pPr>
               <w:jc w:val="left"/>
@@ -14420,9 +14475,7 @@
       </w:tr>
       <w:tr>
         <w:tc>
-          <w:tcPr>
-            <w:shd w:val="clear" w:color="auto" w:fill="F6F8FA"/>
-          </w:tcPr>
+          <w:tcPr/>
           <w:p>
             <w:pPr>
               <w:jc w:val="left"/>
@@ -14433,9 +14486,7 @@
           </w:p>
         </w:tc>
         <w:tc>
-          <w:tcPr>
-            <w:shd w:val="clear" w:color="auto" w:fill="F6F8FA"/>
-          </w:tcPr>
+          <w:tcPr/>
           <w:p>
             <w:pPr>
               <w:jc w:val="left"/>
@@ -14446,9 +14497,7 @@
           </w:p>
         </w:tc>
         <w:tc>
-          <w:tcPr>
-            <w:shd w:val="clear" w:color="auto" w:fill="F6F8FA"/>
-          </w:tcPr>
+          <w:tcPr/>
           <w:p>
             <w:pPr>
               <w:jc w:val="left"/>
@@ -14461,7 +14510,9 @@
       </w:tr>
       <w:tr>
         <w:tc>
-          <w:tcPr/>
+          <w:tcPr>
+            <w:shd w:val="clear" w:color="auto" w:fill="F6F8FA"/>
+          </w:tcPr>
           <w:p>
             <w:pPr>
               <w:jc w:val="left"/>
@@ -14517,7 +14568,9 @@
           </w:p>
         </w:tc>
         <w:tc>
-          <w:tcPr/>
+          <w:tcPr>
+            <w:shd w:val="clear" w:color="auto" w:fill="F6F8FA"/>
+          </w:tcPr>
           <w:p>
             <w:pPr>
               <w:jc w:val="left"/>
@@ -14528,7 +14581,9 @@
           </w:p>
         </w:tc>
         <w:tc>
-          <w:tcPr/>
+          <w:tcPr>
+            <w:shd w:val="clear" w:color="auto" w:fill="F6F8FA"/>
+          </w:tcPr>
           <w:p>
             <w:pPr>
               <w:jc w:val="left"/>
@@ -14541,9 +14596,7 @@
       </w:tr>
       <w:tr>
         <w:tc>
-          <w:tcPr>
-            <w:shd w:val="clear" w:color="auto" w:fill="F6F8FA"/>
-          </w:tcPr>
+          <w:tcPr/>
           <w:p>
             <w:pPr>
               <w:jc w:val="left"/>
@@ -14599,9 +14652,7 @@
           </w:p>
         </w:tc>
         <w:tc>
-          <w:tcPr>
-            <w:shd w:val="clear" w:color="auto" w:fill="F6F8FA"/>
-          </w:tcPr>
+          <w:tcPr/>
           <w:p>
             <w:pPr>
               <w:jc w:val="left"/>
@@ -14612,9 +14663,7 @@
           </w:p>
         </w:tc>
         <w:tc>
-          <w:tcPr>
-            <w:shd w:val="clear" w:color="auto" w:fill="F6F8FA"/>
-          </w:tcPr>
+          <w:tcPr/>
           <w:p>
             <w:pPr>
               <w:jc w:val="left"/>
@@ -14627,7 +14676,9 @@
       </w:tr>
       <w:tr>
         <w:tc>
-          <w:tcPr/>
+          <w:tcPr>
+            <w:shd w:val="clear" w:color="auto" w:fill="F6F8FA"/>
+          </w:tcPr>
           <w:p>
             <w:pPr>
               <w:jc w:val="left"/>
@@ -14704,7 +14755,9 @@
           </w:p>
         </w:tc>
         <w:tc>
-          <w:tcPr/>
+          <w:tcPr>
+            <w:shd w:val="clear" w:color="auto" w:fill="F6F8FA"/>
+          </w:tcPr>
           <w:p>
             <w:pPr>
               <w:jc w:val="left"/>
@@ -14715,7 +14768,9 @@
           </w:p>
         </w:tc>
         <w:tc>
-          <w:tcPr/>
+          <w:tcPr>
+            <w:shd w:val="clear" w:color="auto" w:fill="F6F8FA"/>
+          </w:tcPr>
           <w:p>
             <w:pPr>
               <w:jc w:val="left"/>
@@ -14728,9 +14783,7 @@
       </w:tr>
       <w:tr>
         <w:tc>
-          <w:tcPr>
-            <w:shd w:val="clear" w:color="auto" w:fill="F6F8FA"/>
-          </w:tcPr>
+          <w:tcPr/>
           <w:p>
             <w:pPr>
               <w:jc w:val="left"/>
@@ -14768,9 +14821,7 @@
           </w:p>
         </w:tc>
         <w:tc>
-          <w:tcPr>
-            <w:shd w:val="clear" w:color="auto" w:fill="F6F8FA"/>
-          </w:tcPr>
+          <w:tcPr/>
           <w:p>
             <w:pPr>
               <w:jc w:val="left"/>
@@ -14796,9 +14847,7 @@
           </w:p>
         </w:tc>
         <w:tc>
-          <w:tcPr>
-            <w:shd w:val="clear" w:color="auto" w:fill="F6F8FA"/>
-          </w:tcPr>
+          <w:tcPr/>
           <w:p>
             <w:pPr>
               <w:jc w:val="left"/>
@@ -14811,7 +14860,9 @@
       </w:tr>
       <w:tr>
         <w:tc>
-          <w:tcPr/>
+          <w:tcPr>
+            <w:shd w:val="clear" w:color="auto" w:fill="F6F8FA"/>
+          </w:tcPr>
           <w:p>
             <w:pPr>
               <w:jc w:val="left"/>
@@ -14822,7 +14873,9 @@
           </w:p>
         </w:tc>
         <w:tc>
-          <w:tcPr/>
+          <w:tcPr>
+            <w:shd w:val="clear" w:color="auto" w:fill="F6F8FA"/>
+          </w:tcPr>
           <w:p>
             <w:pPr>
               <w:jc w:val="left"/>
@@ -14875,7 +14928,9 @@
           </w:p>
         </w:tc>
         <w:tc>
-          <w:tcPr/>
+          <w:tcPr>
+            <w:shd w:val="clear" w:color="auto" w:fill="F6F8FA"/>
+          </w:tcPr>
           <w:p>
             <w:pPr>
               <w:jc w:val="left"/>
@@ -14888,9 +14943,7 @@
       </w:tr>
       <w:tr>
         <w:tc>
-          <w:tcPr>
-            <w:shd w:val="clear" w:color="auto" w:fill="F6F8FA"/>
-          </w:tcPr>
+          <w:tcPr/>
           <w:p>
             <w:pPr>
               <w:jc w:val="left"/>
@@ -14901,9 +14954,7 @@
           </w:p>
         </w:tc>
         <w:tc>
-          <w:tcPr>
-            <w:shd w:val="clear" w:color="auto" w:fill="F6F8FA"/>
-          </w:tcPr>
+          <w:tcPr/>
           <w:p>
             <w:pPr>
               <w:jc w:val="left"/>
@@ -14926,9 +14977,7 @@
           </w:p>
         </w:tc>
         <w:tc>
-          <w:tcPr>
-            <w:shd w:val="clear" w:color="auto" w:fill="F6F8FA"/>
-          </w:tcPr>
+          <w:tcPr/>
           <w:p>
             <w:pPr>
               <w:jc w:val="left"/>
@@ -14941,7 +14990,9 @@
       </w:tr>
       <w:tr>
         <w:tc>
-          <w:tcPr/>
+          <w:tcPr>
+            <w:shd w:val="clear" w:color="auto" w:fill="F6F8FA"/>
+          </w:tcPr>
           <w:p>
             <w:pPr>
               <w:jc w:val="left"/>
@@ -14952,7 +15003,9 @@
           </w:p>
         </w:tc>
         <w:tc>
-          <w:tcPr/>
+          <w:tcPr>
+            <w:shd w:val="clear" w:color="auto" w:fill="F6F8FA"/>
+          </w:tcPr>
           <w:p>
             <w:pPr>
               <w:jc w:val="left"/>
@@ -15050,7 +15103,9 @@
           </w:p>
         </w:tc>
         <w:tc>
-          <w:tcPr/>
+          <w:tcPr>
+            <w:shd w:val="clear" w:color="auto" w:fill="F6F8FA"/>
+          </w:tcPr>
           <w:p>
             <w:pPr>
               <w:jc w:val="left"/>
@@ -15063,9 +15118,7 @@
       </w:tr>
       <w:tr>
         <w:tc>
-          <w:tcPr>
-            <w:shd w:val="clear" w:color="auto" w:fill="F6F8FA"/>
-          </w:tcPr>
+          <w:tcPr/>
           <w:p>
             <w:pPr>
               <w:jc w:val="left"/>
@@ -15076,9 +15129,7 @@
           </w:p>
         </w:tc>
         <w:tc>
-          <w:tcPr>
-            <w:shd w:val="clear" w:color="auto" w:fill="F6F8FA"/>
-          </w:tcPr>
+          <w:tcPr/>
           <w:p>
             <w:pPr>
               <w:jc w:val="left"/>
@@ -15089,9 +15140,7 @@
           </w:p>
         </w:tc>
         <w:tc>
-          <w:tcPr>
-            <w:shd w:val="clear" w:color="auto" w:fill="F6F8FA"/>
-          </w:tcPr>
+          <w:tcPr/>
           <w:p>
             <w:pPr>
               <w:jc w:val="left"/>
@@ -15104,7 +15153,9 @@
       </w:tr>
       <w:tr>
         <w:tc>
-          <w:tcPr/>
+          <w:tcPr>
+            <w:shd w:val="clear" w:color="auto" w:fill="F6F8FA"/>
+          </w:tcPr>
           <w:p>
             <w:pPr>
               <w:jc w:val="left"/>
@@ -15115,7 +15166,9 @@
           </w:p>
         </w:tc>
         <w:tc>
-          <w:tcPr/>
+          <w:tcPr>
+            <w:shd w:val="clear" w:color="auto" w:fill="F6F8FA"/>
+          </w:tcPr>
           <w:p>
             <w:pPr>
               <w:jc w:val="left"/>
@@ -15165,7 +15218,9 @@
           </w:p>
         </w:tc>
         <w:tc>
-          <w:tcPr/>
+          <w:tcPr>
+            <w:shd w:val="clear" w:color="auto" w:fill="F6F8FA"/>
+          </w:tcPr>
           <w:p>
             <w:pPr>
               <w:jc w:val="left"/>
@@ -15178,9 +15233,7 @@
       </w:tr>
       <w:tr>
         <w:tc>
-          <w:tcPr>
-            <w:shd w:val="clear" w:color="auto" w:fill="F6F8FA"/>
-          </w:tcPr>
+          <w:tcPr/>
           <w:p>
             <w:pPr>
               <w:jc w:val="left"/>
@@ -15191,9 +15244,7 @@
           </w:p>
         </w:tc>
         <w:tc>
-          <w:tcPr>
-            <w:shd w:val="clear" w:color="auto" w:fill="F6F8FA"/>
-          </w:tcPr>
+          <w:tcPr/>
           <w:p>
             <w:pPr>
               <w:jc w:val="left"/>
@@ -15246,9 +15297,7 @@
           </w:p>
         </w:tc>
         <w:tc>
-          <w:tcPr>
-            <w:shd w:val="clear" w:color="auto" w:fill="F6F8FA"/>
-          </w:tcPr>
+          <w:tcPr/>
           <w:p>
             <w:pPr>
               <w:jc w:val="left"/>
@@ -15261,7 +15310,9 @@
       </w:tr>
       <w:tr>
         <w:tc>
-          <w:tcPr/>
+          <w:tcPr>
+            <w:shd w:val="clear" w:color="auto" w:fill="F6F8FA"/>
+          </w:tcPr>
           <w:p>
             <w:pPr>
               <w:jc w:val="left"/>
@@ -15272,7 +15323,9 @@
           </w:p>
         </w:tc>
         <w:tc>
-          <w:tcPr/>
+          <w:tcPr>
+            <w:shd w:val="clear" w:color="auto" w:fill="F6F8FA"/>
+          </w:tcPr>
           <w:p>
             <w:pPr>
               <w:jc w:val="left"/>
@@ -15283,7 +15336,9 @@
           </w:p>
         </w:tc>
         <w:tc>
-          <w:tcPr/>
+          <w:tcPr>
+            <w:shd w:val="clear" w:color="auto" w:fill="F6F8FA"/>
+          </w:tcPr>
           <w:p>
             <w:pPr>
               <w:jc w:val="left"/>
@@ -15296,9 +15351,7 @@
       </w:tr>
       <w:tr>
         <w:tc>
-          <w:tcPr>
-            <w:shd w:val="clear" w:color="auto" w:fill="F6F8FA"/>
-          </w:tcPr>
+          <w:tcPr/>
           <w:p>
             <w:pPr>
               <w:jc w:val="left"/>
@@ -15309,9 +15362,7 @@
           </w:p>
         </w:tc>
         <w:tc>
-          <w:tcPr>
-            <w:shd w:val="clear" w:color="auto" w:fill="F6F8FA"/>
-          </w:tcPr>
+          <w:tcPr/>
           <w:p>
             <w:pPr>
               <w:jc w:val="left"/>
@@ -15322,9 +15373,7 @@
           </w:p>
         </w:tc>
         <w:tc>
-          <w:tcPr>
-            <w:shd w:val="clear" w:color="auto" w:fill="F6F8FA"/>
-          </w:tcPr>
+          <w:tcPr/>
           <w:p>
             <w:pPr>
               <w:jc w:val="left"/>
@@ -15337,7 +15386,9 @@
       </w:tr>
       <w:tr>
         <w:tc>
-          <w:tcPr/>
+          <w:tcPr>
+            <w:shd w:val="clear" w:color="auto" w:fill="F6F8FA"/>
+          </w:tcPr>
           <w:p>
             <w:pPr>
               <w:jc w:val="left"/>
@@ -15348,7 +15399,9 @@
           </w:p>
         </w:tc>
         <w:tc>
-          <w:tcPr/>
+          <w:tcPr>
+            <w:shd w:val="clear" w:color="auto" w:fill="F6F8FA"/>
+          </w:tcPr>
           <w:p>
             <w:pPr>
               <w:jc w:val="left"/>
@@ -15359,7 +15412,9 @@
           </w:p>
         </w:tc>
         <w:tc>
-          <w:tcPr/>
+          <w:tcPr>
+            <w:shd w:val="clear" w:color="auto" w:fill="F6F8FA"/>
+          </w:tcPr>
           <w:p>
             <w:pPr>
               <w:jc w:val="left"/>
@@ -15372,9 +15427,7 @@
       </w:tr>
       <w:tr>
         <w:tc>
-          <w:tcPr>
-            <w:shd w:val="clear" w:color="auto" w:fill="F6F8FA"/>
-          </w:tcPr>
+          <w:tcPr/>
           <w:p>
             <w:pPr>
               <w:jc w:val="left"/>
@@ -15385,9 +15438,7 @@
           </w:p>
         </w:tc>
         <w:tc>
-          <w:tcPr>
-            <w:shd w:val="clear" w:color="auto" w:fill="F6F8FA"/>
-          </w:tcPr>
+          <w:tcPr/>
           <w:p>
             <w:pPr>
               <w:jc w:val="left"/>
@@ -15398,9 +15449,7 @@
           </w:p>
         </w:tc>
         <w:tc>
-          <w:tcPr>
-            <w:shd w:val="clear" w:color="auto" w:fill="F6F8FA"/>
-          </w:tcPr>
+          <w:tcPr/>
           <w:p>
             <w:pPr>
               <w:jc w:val="left"/>
@@ -15413,7 +15462,9 @@
       </w:tr>
       <w:tr>
         <w:tc>
-          <w:tcPr/>
+          <w:tcPr>
+            <w:shd w:val="clear" w:color="auto" w:fill="F6F8FA"/>
+          </w:tcPr>
           <w:p>
             <w:pPr>
               <w:jc w:val="left"/>
@@ -15424,7 +15475,9 @@
           </w:p>
         </w:tc>
         <w:tc>
-          <w:tcPr/>
+          <w:tcPr>
+            <w:shd w:val="clear" w:color="auto" w:fill="F6F8FA"/>
+          </w:tcPr>
           <w:p>
             <w:pPr>
               <w:jc w:val="left"/>
@@ -15444,7 +15497,9 @@
           </w:p>
         </w:tc>
         <w:tc>
-          <w:tcPr/>
+          <w:tcPr>
+            <w:shd w:val="clear" w:color="auto" w:fill="F6F8FA"/>
+          </w:tcPr>
           <w:p>
             <w:pPr>
               <w:jc w:val="left"/>
@@ -15457,9 +15512,7 @@
       </w:tr>
       <w:tr>
         <w:tc>
-          <w:tcPr>
-            <w:shd w:val="clear" w:color="auto" w:fill="F6F8FA"/>
-          </w:tcPr>
+          <w:tcPr/>
           <w:p>
             <w:pPr>
               <w:jc w:val="left"/>
@@ -15470,9 +15523,7 @@
           </w:p>
         </w:tc>
         <w:tc>
-          <w:tcPr>
-            <w:shd w:val="clear" w:color="auto" w:fill="F6F8FA"/>
-          </w:tcPr>
+          <w:tcPr/>
           <w:p>
             <w:pPr>
               <w:jc w:val="left"/>
@@ -15483,9 +15534,7 @@
           </w:p>
         </w:tc>
         <w:tc>
-          <w:tcPr>
-            <w:shd w:val="clear" w:color="auto" w:fill="F6F8FA"/>
-          </w:tcPr>
+          <w:tcPr/>
           <w:p>
             <w:pPr>
               <w:jc w:val="left"/>
@@ -15498,7 +15547,9 @@
       </w:tr>
       <w:tr>
         <w:tc>
-          <w:tcPr/>
+          <w:tcPr>
+            <w:shd w:val="clear" w:color="auto" w:fill="F6F8FA"/>
+          </w:tcPr>
           <w:p>
             <w:pPr>
               <w:jc w:val="left"/>
@@ -15509,7 +15560,9 @@
           </w:p>
         </w:tc>
         <w:tc>
-          <w:tcPr/>
+          <w:tcPr>
+            <w:shd w:val="clear" w:color="auto" w:fill="F6F8FA"/>
+          </w:tcPr>
           <w:p>
             <w:pPr>
               <w:jc w:val="left"/>
@@ -15520,7 +15573,9 @@
           </w:p>
         </w:tc>
         <w:tc>
-          <w:tcPr/>
+          <w:tcPr>
+            <w:shd w:val="clear" w:color="auto" w:fill="F6F8FA"/>
+          </w:tcPr>
           <w:p>
             <w:pPr>
               <w:jc w:val="left"/>
@@ -15533,9 +15588,7 @@
       </w:tr>
       <w:tr>
         <w:tc>
-          <w:tcPr>
-            <w:shd w:val="clear" w:color="auto" w:fill="F6F8FA"/>
-          </w:tcPr>
+          <w:tcPr/>
           <w:p>
             <w:pPr>
               <w:jc w:val="left"/>
@@ -15546,9 +15599,7 @@
           </w:p>
         </w:tc>
         <w:tc>
-          <w:tcPr>
-            <w:shd w:val="clear" w:color="auto" w:fill="F6F8FA"/>
-          </w:tcPr>
+          <w:tcPr/>
           <w:p>
             <w:pPr>
               <w:jc w:val="left"/>
@@ -15559,9 +15610,7 @@
           </w:p>
         </w:tc>
         <w:tc>
-          <w:tcPr>
-            <w:shd w:val="clear" w:color="auto" w:fill="F6F8FA"/>
-          </w:tcPr>
+          <w:tcPr/>
           <w:p>
             <w:pPr>
               <w:jc w:val="left"/>
@@ -15574,7 +15623,9 @@
       </w:tr>
       <w:tr>
         <w:tc>
-          <w:tcPr/>
+          <w:tcPr>
+            <w:shd w:val="clear" w:color="auto" w:fill="F6F8FA"/>
+          </w:tcPr>
           <w:p>
             <w:pPr>
               <w:jc w:val="left"/>
@@ -15585,7 +15636,9 @@
           </w:p>
         </w:tc>
         <w:tc>
-          <w:tcPr/>
+          <w:tcPr>
+            <w:shd w:val="clear" w:color="auto" w:fill="F6F8FA"/>
+          </w:tcPr>
           <w:p>
             <w:pPr>
               <w:jc w:val="left"/>
@@ -15596,7 +15649,9 @@
           </w:p>
         </w:tc>
         <w:tc>
-          <w:tcPr/>
+          <w:tcPr>
+            <w:shd w:val="clear" w:color="auto" w:fill="F6F8FA"/>
+          </w:tcPr>
           <w:p>
             <w:pPr>
               <w:jc w:val="left"/>
@@ -15609,9 +15664,7 @@
       </w:tr>
       <w:tr>
         <w:tc>
-          <w:tcPr>
-            <w:shd w:val="clear" w:color="auto" w:fill="F6F8FA"/>
-          </w:tcPr>
+          <w:tcPr/>
           <w:p>
             <w:pPr>
               <w:jc w:val="left"/>
@@ -15622,9 +15675,7 @@
           </w:p>
         </w:tc>
         <w:tc>
-          <w:tcPr>
-            <w:shd w:val="clear" w:color="auto" w:fill="F6F8FA"/>
-          </w:tcPr>
+          <w:tcPr/>
           <w:p>
             <w:pPr>
               <w:jc w:val="left"/>
@@ -15635,9 +15686,7 @@
           </w:p>
         </w:tc>
         <w:tc>
-          <w:tcPr>
-            <w:shd w:val="clear" w:color="auto" w:fill="F6F8FA"/>
-          </w:tcPr>
+          <w:tcPr/>
           <w:p>
             <w:pPr>
               <w:jc w:val="left"/>
@@ -15650,7 +15699,9 @@
       </w:tr>
       <w:tr>
         <w:tc>
-          <w:tcPr/>
+          <w:tcPr>
+            <w:shd w:val="clear" w:color="auto" w:fill="F6F8FA"/>
+          </w:tcPr>
           <w:p>
             <w:pPr>
               <w:jc w:val="left"/>
@@ -15661,7 +15712,9 @@
           </w:p>
         </w:tc>
         <w:tc>
-          <w:tcPr/>
+          <w:tcPr>
+            <w:shd w:val="clear" w:color="auto" w:fill="F6F8FA"/>
+          </w:tcPr>
           <w:p>
             <w:pPr>
               <w:jc w:val="left"/>
@@ -15672,7 +15725,9 @@
           </w:p>
         </w:tc>
         <w:tc>
-          <w:tcPr/>
+          <w:tcPr>
+            <w:shd w:val="clear" w:color="auto" w:fill="F6F8FA"/>
+          </w:tcPr>
           <w:p>
             <w:pPr>
               <w:jc w:val="left"/>
@@ -15685,9 +15740,7 @@
       </w:tr>
       <w:tr>
         <w:tc>
-          <w:tcPr>
-            <w:shd w:val="clear" w:color="auto" w:fill="F6F8FA"/>
-          </w:tcPr>
+          <w:tcPr/>
           <w:p>
             <w:pPr>
               <w:jc w:val="left"/>
@@ -15698,9 +15751,7 @@
           </w:p>
         </w:tc>
         <w:tc>
-          <w:tcPr>
-            <w:shd w:val="clear" w:color="auto" w:fill="F6F8FA"/>
-          </w:tcPr>
+          <w:tcPr/>
           <w:p>
             <w:pPr>
               <w:jc w:val="left"/>
@@ -15711,9 +15762,7 @@
           </w:p>
         </w:tc>
         <w:tc>
-          <w:tcPr>
-            <w:shd w:val="clear" w:color="auto" w:fill="F6F8FA"/>
-          </w:tcPr>
+          <w:tcPr/>
           <w:p>
             <w:pPr>
               <w:jc w:val="left"/>
@@ -15726,7 +15775,9 @@
       </w:tr>
       <w:tr>
         <w:tc>
-          <w:tcPr/>
+          <w:tcPr>
+            <w:shd w:val="clear" w:color="auto" w:fill="F6F8FA"/>
+          </w:tcPr>
           <w:p>
             <w:pPr>
               <w:jc w:val="left"/>
@@ -15737,7 +15788,9 @@
           </w:p>
         </w:tc>
         <w:tc>
-          <w:tcPr/>
+          <w:tcPr>
+            <w:shd w:val="clear" w:color="auto" w:fill="F6F8FA"/>
+          </w:tcPr>
           <w:p>
             <w:pPr>
               <w:jc w:val="left"/>
@@ -15748,7 +15801,9 @@
           </w:p>
         </w:tc>
         <w:tc>
-          <w:tcPr/>
+          <w:tcPr>
+            <w:shd w:val="clear" w:color="auto" w:fill="F6F8FA"/>
+          </w:tcPr>
           <w:p>
             <w:pPr>
               <w:jc w:val="left"/>
@@ -15761,9 +15816,7 @@
       </w:tr>
       <w:tr>
         <w:tc>
-          <w:tcPr>
-            <w:shd w:val="clear" w:color="auto" w:fill="F6F8FA"/>
-          </w:tcPr>
+          <w:tcPr/>
           <w:p>
             <w:pPr>
               <w:jc w:val="left"/>
@@ -15774,9 +15827,7 @@
           </w:p>
         </w:tc>
         <w:tc>
-          <w:tcPr>
-            <w:shd w:val="clear" w:color="auto" w:fill="F6F8FA"/>
-          </w:tcPr>
+          <w:tcPr/>
           <w:p>
             <w:pPr>
               <w:jc w:val="left"/>
@@ -15787,9 +15838,7 @@
           </w:p>
         </w:tc>
         <w:tc>
-          <w:tcPr>
-            <w:shd w:val="clear" w:color="auto" w:fill="F6F8FA"/>
-          </w:tcPr>
+          <w:tcPr/>
           <w:p>
             <w:pPr>
               <w:jc w:val="left"/>
@@ -15802,7 +15851,9 @@
       </w:tr>
       <w:tr>
         <w:tc>
-          <w:tcPr/>
+          <w:tcPr>
+            <w:shd w:val="clear" w:color="auto" w:fill="F6F8FA"/>
+          </w:tcPr>
           <w:p>
             <w:pPr>
               <w:jc w:val="left"/>
@@ -15813,7 +15864,9 @@
           </w:p>
         </w:tc>
         <w:tc>
-          <w:tcPr/>
+          <w:tcPr>
+            <w:shd w:val="clear" w:color="auto" w:fill="F6F8FA"/>
+          </w:tcPr>
           <w:p>
             <w:pPr>
               <w:jc w:val="left"/>
@@ -15824,7 +15877,9 @@
           </w:p>
         </w:tc>
         <w:tc>
-          <w:tcPr/>
+          <w:tcPr>
+            <w:shd w:val="clear" w:color="auto" w:fill="F6F8FA"/>
+          </w:tcPr>
           <w:p>
             <w:pPr>
               <w:jc w:val="left"/>
@@ -15837,9 +15892,7 @@
       </w:tr>
       <w:tr>
         <w:tc>
-          <w:tcPr>
-            <w:shd w:val="clear" w:color="auto" w:fill="F6F8FA"/>
-          </w:tcPr>
+          <w:tcPr/>
           <w:p>
             <w:pPr>
               <w:jc w:val="left"/>
@@ -15850,9 +15903,7 @@
           </w:p>
         </w:tc>
         <w:tc>
-          <w:tcPr>
-            <w:shd w:val="clear" w:color="auto" w:fill="F6F8FA"/>
-          </w:tcPr>
+          <w:tcPr/>
           <w:p>
             <w:pPr>
               <w:jc w:val="left"/>
@@ -15863,9 +15914,7 @@
           </w:p>
         </w:tc>
         <w:tc>
-          <w:tcPr>
-            <w:shd w:val="clear" w:color="auto" w:fill="F6F8FA"/>
-          </w:tcPr>
+          <w:tcPr/>
           <w:p>
             <w:pPr>
               <w:jc w:val="left"/>
@@ -15878,7 +15927,9 @@
       </w:tr>
       <w:tr>
         <w:tc>
-          <w:tcPr/>
+          <w:tcPr>
+            <w:shd w:val="clear" w:color="auto" w:fill="F6F8FA"/>
+          </w:tcPr>
           <w:p>
             <w:pPr>
               <w:jc w:val="left"/>
@@ -15889,7 +15940,9 @@
           </w:p>
         </w:tc>
         <w:tc>
-          <w:tcPr/>
+          <w:tcPr>
+            <w:shd w:val="clear" w:color="auto" w:fill="F6F8FA"/>
+          </w:tcPr>
           <w:p>
             <w:pPr>
               <w:jc w:val="left"/>
@@ -15900,7 +15953,9 @@
           </w:p>
         </w:tc>
         <w:tc>
-          <w:tcPr/>
+          <w:tcPr>
+            <w:shd w:val="clear" w:color="auto" w:fill="F6F8FA"/>
+          </w:tcPr>
           <w:p>
             <w:pPr>
               <w:jc w:val="left"/>
@@ -15913,9 +15968,7 @@
       </w:tr>
       <w:tr>
         <w:tc>
-          <w:tcPr>
-            <w:shd w:val="clear" w:color="auto" w:fill="F6F8FA"/>
-          </w:tcPr>
+          <w:tcPr/>
           <w:p>
             <w:pPr>
               <w:jc w:val="left"/>
@@ -15926,9 +15979,7 @@
           </w:p>
         </w:tc>
         <w:tc>
-          <w:tcPr>
-            <w:shd w:val="clear" w:color="auto" w:fill="F6F8FA"/>
-          </w:tcPr>
+          <w:tcPr/>
           <w:p>
             <w:pPr>
               <w:jc w:val="left"/>
@@ -15939,9 +15990,7 @@
           </w:p>
         </w:tc>
         <w:tc>
-          <w:tcPr>
-            <w:shd w:val="clear" w:color="auto" w:fill="F6F8FA"/>
-          </w:tcPr>
+          <w:tcPr/>
           <w:p>
             <w:pPr>
               <w:jc w:val="left"/>
@@ -15954,7 +16003,9 @@
       </w:tr>
       <w:tr>
         <w:tc>
-          <w:tcPr/>
+          <w:tcPr>
+            <w:shd w:val="clear" w:color="auto" w:fill="F6F8FA"/>
+          </w:tcPr>
           <w:p>
             <w:pPr>
               <w:jc w:val="left"/>
@@ -15965,7 +16016,9 @@
           </w:p>
         </w:tc>
         <w:tc>
-          <w:tcPr/>
+          <w:tcPr>
+            <w:shd w:val="clear" w:color="auto" w:fill="F6F8FA"/>
+          </w:tcPr>
           <w:p>
             <w:pPr>
               <w:jc w:val="left"/>
@@ -15982,7 +16035,9 @@
           </w:p>
         </w:tc>
         <w:tc>
-          <w:tcPr/>
+          <w:tcPr>
+            <w:shd w:val="clear" w:color="auto" w:fill="F6F8FA"/>
+          </w:tcPr>
           <w:p>
             <w:pPr>
               <w:jc w:val="left"/>
@@ -15995,9 +16050,7 @@
       </w:tr>
       <w:tr>
         <w:tc>
-          <w:tcPr>
-            <w:shd w:val="clear" w:color="auto" w:fill="F6F8FA"/>
-          </w:tcPr>
+          <w:tcPr/>
           <w:p>
             <w:pPr>
               <w:jc w:val="left"/>
@@ -16008,9 +16061,7 @@
           </w:p>
         </w:tc>
         <w:tc>
-          <w:tcPr>
-            <w:shd w:val="clear" w:color="auto" w:fill="F6F8FA"/>
-          </w:tcPr>
+          <w:tcPr/>
           <w:p>
             <w:pPr>
               <w:jc w:val="left"/>
@@ -16027,9 +16078,7 @@
           </w:p>
         </w:tc>
         <w:tc>
-          <w:tcPr>
-            <w:shd w:val="clear" w:color="auto" w:fill="F6F8FA"/>
-          </w:tcPr>
+          <w:tcPr/>
           <w:p>
             <w:pPr>
               <w:jc w:val="left"/>
@@ -16042,7 +16091,9 @@
       </w:tr>
       <w:tr>
         <w:tc>
-          <w:tcPr/>
+          <w:tcPr>
+            <w:shd w:val="clear" w:color="auto" w:fill="F6F8FA"/>
+          </w:tcPr>
           <w:p>
             <w:pPr>
               <w:jc w:val="left"/>
@@ -16053,7 +16104,9 @@
           </w:p>
         </w:tc>
         <w:tc>
-          <w:tcPr/>
+          <w:tcPr>
+            <w:shd w:val="clear" w:color="auto" w:fill="F6F8FA"/>
+          </w:tcPr>
           <w:p>
             <w:pPr>
               <w:jc w:val="left"/>
@@ -16064,7 +16117,9 @@
           </w:p>
         </w:tc>
         <w:tc>
-          <w:tcPr/>
+          <w:tcPr>
+            <w:shd w:val="clear" w:color="auto" w:fill="F6F8FA"/>
+          </w:tcPr>
           <w:p>
             <w:pPr>
               <w:jc w:val="left"/>
@@ -16077,9 +16132,7 @@
       </w:tr>
       <w:tr>
         <w:tc>
-          <w:tcPr>
-            <w:shd w:val="clear" w:color="auto" w:fill="F6F8FA"/>
-          </w:tcPr>
+          <w:tcPr/>
           <w:p>
             <w:pPr>
               <w:jc w:val="left"/>
@@ -16090,9 +16143,7 @@
           </w:p>
         </w:tc>
         <w:tc>
-          <w:tcPr>
-            <w:shd w:val="clear" w:color="auto" w:fill="F6F8FA"/>
-          </w:tcPr>
+          <w:tcPr/>
           <w:p>
             <w:pPr>
               <w:jc w:val="left"/>
@@ -16163,9 +16214,7 @@
           </w:p>
         </w:tc>
         <w:tc>
-          <w:tcPr>
-            <w:shd w:val="clear" w:color="auto" w:fill="F6F8FA"/>
-          </w:tcPr>
+          <w:tcPr/>
           <w:p>
             <w:pPr>
               <w:jc w:val="left"/>
@@ -16178,7 +16227,9 @@
       </w:tr>
       <w:tr>
         <w:tc>
-          <w:tcPr/>
+          <w:tcPr>
+            <w:shd w:val="clear" w:color="auto" w:fill="F6F8FA"/>
+          </w:tcPr>
           <w:p>
             <w:pPr>
               <w:jc w:val="left"/>
@@ -16189,7 +16240,9 @@
           </w:p>
         </w:tc>
         <w:tc>
-          <w:tcPr/>
+          <w:tcPr>
+            <w:shd w:val="clear" w:color="auto" w:fill="F6F8FA"/>
+          </w:tcPr>
           <w:p>
             <w:pPr>
               <w:jc w:val="left"/>
@@ -16212,7 +16265,9 @@
           </w:p>
         </w:tc>
         <w:tc>
-          <w:tcPr/>
+          <w:tcPr>
+            <w:shd w:val="clear" w:color="auto" w:fill="F6F8FA"/>
+          </w:tcPr>
           <w:p>
             <w:pPr>
               <w:jc w:val="left"/>
@@ -16225,9 +16280,7 @@
       </w:tr>
       <w:tr>
         <w:tc>
-          <w:tcPr>
-            <w:shd w:val="clear" w:color="auto" w:fill="F6F8FA"/>
-          </w:tcPr>
+          <w:tcPr/>
           <w:p>
             <w:pPr>
               <w:jc w:val="left"/>
@@ -16238,9 +16291,7 @@
           </w:p>
         </w:tc>
         <w:tc>
-          <w:tcPr>
-            <w:shd w:val="clear" w:color="auto" w:fill="F6F8FA"/>
-          </w:tcPr>
+          <w:tcPr/>
           <w:p>
             <w:pPr>
               <w:jc w:val="left"/>
@@ -16257,9 +16308,7 @@
           </w:p>
         </w:tc>
         <w:tc>
-          <w:tcPr>
-            <w:shd w:val="clear" w:color="auto" w:fill="F6F8FA"/>
-          </w:tcPr>
+          <w:tcPr/>
           <w:p>
             <w:pPr>
               <w:jc w:val="left"/>
@@ -16272,7 +16321,9 @@
       </w:tr>
       <w:tr>
         <w:tc>
-          <w:tcPr/>
+          <w:tcPr>
+            <w:shd w:val="clear" w:color="auto" w:fill="F6F8FA"/>
+          </w:tcPr>
           <w:p>
             <w:pPr>
               <w:jc w:val="left"/>
@@ -16283,7 +16334,9 @@
           </w:p>
         </w:tc>
         <w:tc>
-          <w:tcPr/>
+          <w:tcPr>
+            <w:shd w:val="clear" w:color="auto" w:fill="F6F8FA"/>
+          </w:tcPr>
           <w:p>
             <w:pPr>
               <w:jc w:val="left"/>
@@ -16294,7 +16347,9 @@
           </w:p>
         </w:tc>
         <w:tc>
-          <w:tcPr/>
+          <w:tcPr>
+            <w:shd w:val="clear" w:color="auto" w:fill="F6F8FA"/>
+          </w:tcPr>
           <w:p>
             <w:pPr>
               <w:jc w:val="left"/>
@@ -16307,9 +16362,7 @@
       </w:tr>
       <w:tr>
         <w:tc>
-          <w:tcPr>
-            <w:shd w:val="clear" w:color="auto" w:fill="F6F8FA"/>
-          </w:tcPr>
+          <w:tcPr/>
           <w:p>
             <w:pPr>
               <w:jc w:val="left"/>
@@ -16320,9 +16373,7 @@
           </w:p>
         </w:tc>
         <w:tc>
-          <w:tcPr>
-            <w:shd w:val="clear" w:color="auto" w:fill="F6F8FA"/>
-          </w:tcPr>
+          <w:tcPr/>
           <w:p>
             <w:pPr>
               <w:jc w:val="left"/>
@@ -16333,9 +16384,7 @@
           </w:p>
         </w:tc>
         <w:tc>
-          <w:tcPr>
-            <w:shd w:val="clear" w:color="auto" w:fill="F6F8FA"/>
-          </w:tcPr>
+          <w:tcPr/>
           <w:p>
             <w:pPr>
               <w:jc w:val="left"/>
@@ -16348,7 +16397,9 @@
       </w:tr>
       <w:tr>
         <w:tc>
-          <w:tcPr/>
+          <w:tcPr>
+            <w:shd w:val="clear" w:color="auto" w:fill="F6F8FA"/>
+          </w:tcPr>
           <w:p>
             <w:pPr>
               <w:jc w:val="left"/>
@@ -16359,7 +16410,9 @@
           </w:p>
         </w:tc>
         <w:tc>
-          <w:tcPr/>
+          <w:tcPr>
+            <w:shd w:val="clear" w:color="auto" w:fill="F6F8FA"/>
+          </w:tcPr>
           <w:p>
             <w:pPr>
               <w:jc w:val="left"/>
@@ -16376,7 +16429,9 @@
           </w:p>
         </w:tc>
         <w:tc>
-          <w:tcPr/>
+          <w:tcPr>
+            <w:shd w:val="clear" w:color="auto" w:fill="F6F8FA"/>
+          </w:tcPr>
           <w:p>
             <w:pPr>
               <w:jc w:val="left"/>
@@ -16389,9 +16444,7 @@
       </w:tr>
       <w:tr>
         <w:tc>
-          <w:tcPr>
-            <w:shd w:val="clear" w:color="auto" w:fill="F6F8FA"/>
-          </w:tcPr>
+          <w:tcPr/>
           <w:p>
             <w:pPr>
               <w:jc w:val="left"/>
@@ -16402,9 +16455,7 @@
           </w:p>
         </w:tc>
         <w:tc>
-          <w:tcPr>
-            <w:shd w:val="clear" w:color="auto" w:fill="F6F8FA"/>
-          </w:tcPr>
+          <w:tcPr/>
           <w:p>
             <w:pPr>
               <w:jc w:val="left"/>
@@ -16527,9 +16578,7 @@
           </w:p>
         </w:tc>
         <w:tc>
-          <w:tcPr>
-            <w:shd w:val="clear" w:color="auto" w:fill="F6F8FA"/>
-          </w:tcPr>
+          <w:tcPr/>
           <w:p>
             <w:pPr>
               <w:jc w:val="left"/>
@@ -16542,7 +16591,9 @@
       </w:tr>
       <w:tr>
         <w:tc>
-          <w:tcPr/>
+          <w:tcPr>
+            <w:shd w:val="clear" w:color="auto" w:fill="F6F8FA"/>
+          </w:tcPr>
           <w:p>
             <w:pPr>
               <w:jc w:val="left"/>
@@ -16553,7 +16604,9 @@
           </w:p>
         </w:tc>
         <w:tc>
-          <w:tcPr/>
+          <w:tcPr>
+            <w:shd w:val="clear" w:color="auto" w:fill="F6F8FA"/>
+          </w:tcPr>
           <w:p>
             <w:pPr>
               <w:jc w:val="left"/>
@@ -16657,7 +16710,9 @@
           </w:p>
         </w:tc>
         <w:tc>
-          <w:tcPr/>
+          <w:tcPr>
+            <w:shd w:val="clear" w:color="auto" w:fill="F6F8FA"/>
+          </w:tcPr>
           <w:p>
             <w:pPr>
               <w:jc w:val="left"/>

</xml_diff>

<commit_message>
DOCX fix: code blocks no longer break the testcase red rule
- Root cause: pandoc's Source Code style carries w:ind left=397 —
  the paragraph-level left border (red rule) draws at the indent
  position, jogging the line right at every code block
- Fix: left/right indent reset to 0 inside testcase ranges (rule
  stays continuous); code box borders added (top/bottom/right in
  codeborder E1E4E8, left stays red) matching the PDF's codebg box
- Body-level code blocks unchanged (style indent, no borders)
- pBdr children in schema order (top, left, bottom, right)
- Version coupling: 4x cls + setup-guide → 6.4.6
</commit_message>
<xml_diff>
--- a/documents/setup-guide/setup-guide.docx
+++ b/documents/setup-guide/setup-guide.docx
@@ -84,7 +84,7 @@
           <w:b/>
           <w:sz w:val="24"/>
         </w:rPr>
-        <w:t xml:space="preserve">v6.4.5</w:t>
+        <w:t xml:space="preserve">v6.4.6</w:t>
       </w:r>
       <w:r>
         <w:rPr>
@@ -96,7 +96,7 @@
         <w:rPr>
           <w:sz w:val="24"/>
         </w:rPr>
-        <w:t xml:space="preserve">— September 19, 2026 23:43</w:t>
+        <w:t xml:space="preserve">— September 20, 2026 00:12</w:t>
       </w:r>
     </w:p>
     <w:sdt>
@@ -13345,7 +13345,7 @@
               <w:jc w:val="left"/>
             </w:pPr>
             <w:r>
-              <w:t xml:space="preserve">6.4.5</w:t>
+              <w:t xml:space="preserve">6.4.6</w:t>
             </w:r>
           </w:p>
         </w:tc>
@@ -13367,7 +13367,7 @@
               <w:jc w:val="left"/>
             </w:pPr>
             <w:r>
-              <w:t xml:space="preserve">DOCX polish pass: all captions centered (matching the PDF), vertical spacing between blocks matched to the LaTeX rhythm (medskip/smallskip around captions, field bars, and steps), and test steps now render as separate paragraphs each with the red bold number (previously merged into one paragraph).</w:t>
+              <w:t xml:space="preserve">Code blocks inside test cases no longer break the red left rule in DOCX — the code style’s left indent (which jogged the rule) is reset inside test case blocks, and code blocks now show the PDF’s code box (gray background with thin border on top, bottom, and right, red rule continuing on the left).</w:t>
             </w:r>
           </w:p>
         </w:tc>
@@ -13382,7 +13382,7 @@
               <w:jc w:val="left"/>
             </w:pPr>
             <w:r>
-              <w:t xml:space="preserve">6.4.4</w:t>
+              <w:t xml:space="preserve">6.4.5</w:t>
             </w:r>
           </w:p>
         </w:tc>
@@ -13408,7 +13408,7 @@
               <w:jc w:val="left"/>
             </w:pPr>
             <w:r>
-              <w:t xml:space="preserve">DOCX covers now show the logo, cover text, and version/date/time meta line like the PDF. Test case blocks in DOCX get the PDF’s visual wrapper: red left rule, red field header bars, and red step numbers. Captions follow the PDF ordering system in DOCX, MD, and HTML (Table/Diagram/Figure/Testcase N: with bold symbol). Portuguese PDFs now label diagrams "Diagrama N:" (was hardcoded English "Diagram"). Markdown and HTML output no longer leaks raw LaTeX from passthrough blocks — the DOCX pre-processor now feeds those pipelines too.</w:t>
+              <w:t xml:space="preserve">DOCX polish pass: all captions centered (matching the PDF), vertical spacing between blocks matched to the LaTeX rhythm (medskip/smallskip around captions, field bars, and steps), and test steps now render as separate paragraphs each with the red bold number (previously merged into one paragraph).</w:t>
             </w:r>
           </w:p>
         </w:tc>
@@ -13421,7 +13421,7 @@
               <w:jc w:val="left"/>
             </w:pPr>
             <w:r>
-              <w:t xml:space="preserve">6.4.3</w:t>
+              <w:t xml:space="preserve">6.4.4</w:t>
             </w:r>
           </w:p>
         </w:tc>
@@ -13443,7 +13443,7 @@
               <w:jc w:val="left"/>
             </w:pPr>
             <w:r>
-              <w:t xml:space="preserve">Testbook and POC DOCX output now matches the PDF much more closely: native table of contents (language-aware, auto-populated), each section starts on a new page, embedded images and diagrams (PlantUML/Graphviz rendered), white-on-red table headers, cover version line under the title, centered test case captions, and plain black rules for signature grids.</w:t>
+              <w:t xml:space="preserve">DOCX covers now show the logo, cover text, and version/date/time meta line like the PDF. Test case blocks in DOCX get the PDF’s visual wrapper: red left rule, red field header bars, and red step numbers. Captions follow the PDF ordering system in DOCX, MD, and HTML (Table/Diagram/Figure/Testcase N: with bold symbol). Portuguese PDFs now label diagrams "Diagrama N:" (was hardcoded English "Diagram"). Markdown and HTML output no longer leaks raw LaTeX from passthrough blocks — the DOCX pre-processor now feeds those pipelines too.</w:t>
             </w:r>
           </w:p>
         </w:tc>
@@ -13458,7 +13458,7 @@
               <w:jc w:val="left"/>
             </w:pPr>
             <w:r>
-              <w:t xml:space="preserve">6.4.2</w:t>
+              <w:t xml:space="preserve">6.4.3</w:t>
             </w:r>
           </w:p>
         </w:tc>
@@ -13484,7 +13484,7 @@
               <w:jc w:val="left"/>
             </w:pPr>
             <w:r>
-              <w:t xml:space="preserve">DOCX output for POC and testbook templates now includes all passthrough content (stakeholders, closing record, signatures, test cases, test summary, changelog) via a new pre-processor. Fixed dropped Test Scope fields in testbook DOCX output.</w:t>
+              <w:t xml:space="preserve">Testbook and POC DOCX output now matches the PDF much more closely: native table of contents (language-aware, auto-populated), each section starts on a new page, embedded images and diagrams (PlantUML/Graphviz rendered), white-on-red table headers, cover version line under the title, centered test case captions, and plain black rules for signature grids.</w:t>
             </w:r>
           </w:p>
         </w:tc>
@@ -13497,12 +13497,51 @@
               <w:jc w:val="left"/>
             </w:pPr>
             <w:r>
+              <w:t xml:space="preserve">6.4.2</w:t>
+            </w:r>
+          </w:p>
+        </w:tc>
+        <w:tc>
+          <w:tcPr/>
+          <w:p>
+            <w:pPr>
+              <w:jc w:val="left"/>
+            </w:pPr>
+            <w:r>
+              <w:t xml:space="preserve">2026-09-20</w:t>
+            </w:r>
+          </w:p>
+        </w:tc>
+        <w:tc>
+          <w:tcPr/>
+          <w:p>
+            <w:pPr>
+              <w:jc w:val="left"/>
+            </w:pPr>
+            <w:r>
+              <w:t xml:space="preserve">DOCX output for POC and testbook templates now includes all passthrough content (stakeholders, closing record, signatures, test cases, test summary, changelog) via a new pre-processor. Fixed dropped Test Scope fields in testbook DOCX output.</w:t>
+            </w:r>
+          </w:p>
+        </w:tc>
+      </w:tr>
+      <w:tr>
+        <w:tc>
+          <w:tcPr>
+            <w:shd w:val="clear" w:color="auto" w:fill="F6F8FA"/>
+          </w:tcPr>
+          <w:p>
+            <w:pPr>
+              <w:jc w:val="left"/>
+            </w:pPr>
+            <w:r>
               <w:t xml:space="preserve">6.4.0</w:t>
             </w:r>
           </w:p>
         </w:tc>
         <w:tc>
-          <w:tcPr/>
+          <w:tcPr>
+            <w:shd w:val="clear" w:color="auto" w:fill="F6F8FA"/>
+          </w:tcPr>
           <w:p>
             <w:pPr>
               <w:jc w:val="left"/>
@@ -13513,7 +13552,9 @@
           </w:p>
         </w:tc>
         <w:tc>
-          <w:tcPr/>
+          <w:tcPr>
+            <w:shd w:val="clear" w:color="auto" w:fill="F6F8FA"/>
+          </w:tcPr>
           <w:p>
             <w:pPr>
               <w:jc w:val="left"/>
@@ -13541,9 +13582,7 @@
       </w:tr>
       <w:tr>
         <w:tc>
-          <w:tcPr>
-            <w:shd w:val="clear" w:color="auto" w:fill="F6F8FA"/>
-          </w:tcPr>
+          <w:tcPr/>
           <w:p>
             <w:pPr>
               <w:jc w:val="left"/>
@@ -13554,9 +13593,7 @@
           </w:p>
         </w:tc>
         <w:tc>
-          <w:tcPr>
-            <w:shd w:val="clear" w:color="auto" w:fill="F6F8FA"/>
-          </w:tcPr>
+          <w:tcPr/>
           <w:p>
             <w:pPr>
               <w:jc w:val="left"/>
@@ -13567,9 +13604,7 @@
           </w:p>
         </w:tc>
         <w:tc>
-          <w:tcPr>
-            <w:shd w:val="clear" w:color="auto" w:fill="F6F8FA"/>
-          </w:tcPr>
+          <w:tcPr/>
           <w:p>
             <w:pPr>
               <w:jc w:val="left"/>
@@ -13582,7 +13617,9 @@
       </w:tr>
       <w:tr>
         <w:tc>
-          <w:tcPr/>
+          <w:tcPr>
+            <w:shd w:val="clear" w:color="auto" w:fill="F6F8FA"/>
+          </w:tcPr>
           <w:p>
             <w:pPr>
               <w:jc w:val="left"/>
@@ -13593,7 +13630,9 @@
           </w:p>
         </w:tc>
         <w:tc>
-          <w:tcPr/>
+          <w:tcPr>
+            <w:shd w:val="clear" w:color="auto" w:fill="F6F8FA"/>
+          </w:tcPr>
           <w:p>
             <w:pPr>
               <w:jc w:val="left"/>
@@ -13604,7 +13643,9 @@
           </w:p>
         </w:tc>
         <w:tc>
-          <w:tcPr/>
+          <w:tcPr>
+            <w:shd w:val="clear" w:color="auto" w:fill="F6F8FA"/>
+          </w:tcPr>
           <w:p>
             <w:pPr>
               <w:jc w:val="left"/>
@@ -13617,9 +13658,7 @@
       </w:tr>
       <w:tr>
         <w:tc>
-          <w:tcPr>
-            <w:shd w:val="clear" w:color="auto" w:fill="F6F8FA"/>
-          </w:tcPr>
+          <w:tcPr/>
           <w:p>
             <w:pPr>
               <w:jc w:val="left"/>
@@ -13630,9 +13669,7 @@
           </w:p>
         </w:tc>
         <w:tc>
-          <w:tcPr>
-            <w:shd w:val="clear" w:color="auto" w:fill="F6F8FA"/>
-          </w:tcPr>
+          <w:tcPr/>
           <w:p>
             <w:pPr>
               <w:jc w:val="left"/>
@@ -13643,9 +13680,7 @@
           </w:p>
         </w:tc>
         <w:tc>
-          <w:tcPr>
-            <w:shd w:val="clear" w:color="auto" w:fill="F6F8FA"/>
-          </w:tcPr>
+          <w:tcPr/>
           <w:p>
             <w:pPr>
               <w:jc w:val="left"/>
@@ -13673,7 +13708,9 @@
       </w:tr>
       <w:tr>
         <w:tc>
-          <w:tcPr/>
+          <w:tcPr>
+            <w:shd w:val="clear" w:color="auto" w:fill="F6F8FA"/>
+          </w:tcPr>
           <w:p>
             <w:pPr>
               <w:jc w:val="left"/>
@@ -13684,7 +13721,9 @@
           </w:p>
         </w:tc>
         <w:tc>
-          <w:tcPr/>
+          <w:tcPr>
+            <w:shd w:val="clear" w:color="auto" w:fill="F6F8FA"/>
+          </w:tcPr>
           <w:p>
             <w:pPr>
               <w:jc w:val="left"/>
@@ -13695,7 +13734,9 @@
           </w:p>
         </w:tc>
         <w:tc>
-          <w:tcPr/>
+          <w:tcPr>
+            <w:shd w:val="clear" w:color="auto" w:fill="F6F8FA"/>
+          </w:tcPr>
           <w:p>
             <w:pPr>
               <w:jc w:val="left"/>
@@ -13708,9 +13749,7 @@
       </w:tr>
       <w:tr>
         <w:tc>
-          <w:tcPr>
-            <w:shd w:val="clear" w:color="auto" w:fill="F6F8FA"/>
-          </w:tcPr>
+          <w:tcPr/>
           <w:p>
             <w:pPr>
               <w:jc w:val="left"/>
@@ -13721,9 +13760,7 @@
           </w:p>
         </w:tc>
         <w:tc>
-          <w:tcPr>
-            <w:shd w:val="clear" w:color="auto" w:fill="F6F8FA"/>
-          </w:tcPr>
+          <w:tcPr/>
           <w:p>
             <w:pPr>
               <w:jc w:val="left"/>
@@ -13734,9 +13771,7 @@
           </w:p>
         </w:tc>
         <w:tc>
-          <w:tcPr>
-            <w:shd w:val="clear" w:color="auto" w:fill="F6F8FA"/>
-          </w:tcPr>
+          <w:tcPr/>
           <w:p>
             <w:pPr>
               <w:jc w:val="left"/>
@@ -13749,7 +13784,9 @@
       </w:tr>
       <w:tr>
         <w:tc>
-          <w:tcPr/>
+          <w:tcPr>
+            <w:shd w:val="clear" w:color="auto" w:fill="F6F8FA"/>
+          </w:tcPr>
           <w:p>
             <w:pPr>
               <w:jc w:val="left"/>
@@ -13760,7 +13797,9 @@
           </w:p>
         </w:tc>
         <w:tc>
-          <w:tcPr/>
+          <w:tcPr>
+            <w:shd w:val="clear" w:color="auto" w:fill="F6F8FA"/>
+          </w:tcPr>
           <w:p>
             <w:pPr>
               <w:jc w:val="left"/>
@@ -13771,7 +13810,9 @@
           </w:p>
         </w:tc>
         <w:tc>
-          <w:tcPr/>
+          <w:tcPr>
+            <w:shd w:val="clear" w:color="auto" w:fill="F6F8FA"/>
+          </w:tcPr>
           <w:p>
             <w:pPr>
               <w:jc w:val="left"/>
@@ -13838,9 +13879,7 @@
       </w:tr>
       <w:tr>
         <w:tc>
-          <w:tcPr>
-            <w:shd w:val="clear" w:color="auto" w:fill="F6F8FA"/>
-          </w:tcPr>
+          <w:tcPr/>
           <w:p>
             <w:pPr>
               <w:jc w:val="left"/>
@@ -13851,9 +13890,7 @@
           </w:p>
         </w:tc>
         <w:tc>
-          <w:tcPr>
-            <w:shd w:val="clear" w:color="auto" w:fill="F6F8FA"/>
-          </w:tcPr>
+          <w:tcPr/>
           <w:p>
             <w:pPr>
               <w:jc w:val="left"/>
@@ -13864,9 +13901,7 @@
           </w:p>
         </w:tc>
         <w:tc>
-          <w:tcPr>
-            <w:shd w:val="clear" w:color="auto" w:fill="F6F8FA"/>
-          </w:tcPr>
+          <w:tcPr/>
           <w:p>
             <w:pPr>
               <w:jc w:val="left"/>
@@ -13891,7 +13926,9 @@
       </w:tr>
       <w:tr>
         <w:tc>
-          <w:tcPr/>
+          <w:tcPr>
+            <w:shd w:val="clear" w:color="auto" w:fill="F6F8FA"/>
+          </w:tcPr>
           <w:p>
             <w:pPr>
               <w:jc w:val="left"/>
@@ -13902,7 +13939,9 @@
           </w:p>
         </w:tc>
         <w:tc>
-          <w:tcPr/>
+          <w:tcPr>
+            <w:shd w:val="clear" w:color="auto" w:fill="F6F8FA"/>
+          </w:tcPr>
           <w:p>
             <w:pPr>
               <w:jc w:val="left"/>
@@ -13913,7 +13952,9 @@
           </w:p>
         </w:tc>
         <w:tc>
-          <w:tcPr/>
+          <w:tcPr>
+            <w:shd w:val="clear" w:color="auto" w:fill="F6F8FA"/>
+          </w:tcPr>
           <w:p>
             <w:pPr>
               <w:jc w:val="left"/>
@@ -13926,9 +13967,7 @@
       </w:tr>
       <w:tr>
         <w:tc>
-          <w:tcPr>
-            <w:shd w:val="clear" w:color="auto" w:fill="F6F8FA"/>
-          </w:tcPr>
+          <w:tcPr/>
           <w:p>
             <w:pPr>
               <w:jc w:val="left"/>
@@ -13939,9 +13978,7 @@
           </w:p>
         </w:tc>
         <w:tc>
-          <w:tcPr>
-            <w:shd w:val="clear" w:color="auto" w:fill="F6F8FA"/>
-          </w:tcPr>
+          <w:tcPr/>
           <w:p>
             <w:pPr>
               <w:jc w:val="left"/>
@@ -13952,9 +13989,7 @@
           </w:p>
         </w:tc>
         <w:tc>
-          <w:tcPr>
-            <w:shd w:val="clear" w:color="auto" w:fill="F6F8FA"/>
-          </w:tcPr>
+          <w:tcPr/>
           <w:p>
             <w:pPr>
               <w:jc w:val="left"/>
@@ -14024,7 +14059,9 @@
       </w:tr>
       <w:tr>
         <w:tc>
-          <w:tcPr/>
+          <w:tcPr>
+            <w:shd w:val="clear" w:color="auto" w:fill="F6F8FA"/>
+          </w:tcPr>
           <w:p>
             <w:pPr>
               <w:jc w:val="left"/>
@@ -14035,7 +14072,9 @@
           </w:p>
         </w:tc>
         <w:tc>
-          <w:tcPr/>
+          <w:tcPr>
+            <w:shd w:val="clear" w:color="auto" w:fill="F6F8FA"/>
+          </w:tcPr>
           <w:p>
             <w:pPr>
               <w:jc w:val="left"/>
@@ -14046,7 +14085,9 @@
           </w:p>
         </w:tc>
         <w:tc>
-          <w:tcPr/>
+          <w:tcPr>
+            <w:shd w:val="clear" w:color="auto" w:fill="F6F8FA"/>
+          </w:tcPr>
           <w:p>
             <w:pPr>
               <w:jc w:val="left"/>
@@ -14059,9 +14100,7 @@
       </w:tr>
       <w:tr>
         <w:tc>
-          <w:tcPr>
-            <w:shd w:val="clear" w:color="auto" w:fill="F6F8FA"/>
-          </w:tcPr>
+          <w:tcPr/>
           <w:p>
             <w:pPr>
               <w:jc w:val="left"/>
@@ -14072,9 +14111,7 @@
           </w:p>
         </w:tc>
         <w:tc>
-          <w:tcPr>
-            <w:shd w:val="clear" w:color="auto" w:fill="F6F8FA"/>
-          </w:tcPr>
+          <w:tcPr/>
           <w:p>
             <w:pPr>
               <w:jc w:val="left"/>
@@ -14085,9 +14122,7 @@
           </w:p>
         </w:tc>
         <w:tc>
-          <w:tcPr>
-            <w:shd w:val="clear" w:color="auto" w:fill="F6F8FA"/>
-          </w:tcPr>
+          <w:tcPr/>
           <w:p>
             <w:pPr>
               <w:jc w:val="left"/>
@@ -14145,7 +14180,9 @@
       </w:tr>
       <w:tr>
         <w:tc>
-          <w:tcPr/>
+          <w:tcPr>
+            <w:shd w:val="clear" w:color="auto" w:fill="F6F8FA"/>
+          </w:tcPr>
           <w:p>
             <w:pPr>
               <w:jc w:val="left"/>
@@ -14156,7 +14193,9 @@
           </w:p>
         </w:tc>
         <w:tc>
-          <w:tcPr/>
+          <w:tcPr>
+            <w:shd w:val="clear" w:color="auto" w:fill="F6F8FA"/>
+          </w:tcPr>
           <w:p>
             <w:pPr>
               <w:jc w:val="left"/>
@@ -14167,7 +14206,9 @@
           </w:p>
         </w:tc>
         <w:tc>
-          <w:tcPr/>
+          <w:tcPr>
+            <w:shd w:val="clear" w:color="auto" w:fill="F6F8FA"/>
+          </w:tcPr>
           <w:p>
             <w:pPr>
               <w:jc w:val="left"/>
@@ -14222,9 +14263,7 @@
       </w:tr>
       <w:tr>
         <w:tc>
-          <w:tcPr>
-            <w:shd w:val="clear" w:color="auto" w:fill="F6F8FA"/>
-          </w:tcPr>
+          <w:tcPr/>
           <w:p>
             <w:pPr>
               <w:jc w:val="left"/>
@@ -14235,9 +14274,7 @@
           </w:p>
         </w:tc>
         <w:tc>
-          <w:tcPr>
-            <w:shd w:val="clear" w:color="auto" w:fill="F6F8FA"/>
-          </w:tcPr>
+          <w:tcPr/>
           <w:p>
             <w:pPr>
               <w:jc w:val="left"/>
@@ -14248,9 +14285,7 @@
           </w:p>
         </w:tc>
         <w:tc>
-          <w:tcPr>
-            <w:shd w:val="clear" w:color="auto" w:fill="F6F8FA"/>
-          </w:tcPr>
+          <w:tcPr/>
           <w:p>
             <w:pPr>
               <w:jc w:val="left"/>
@@ -14278,7 +14313,9 @@
       </w:tr>
       <w:tr>
         <w:tc>
-          <w:tcPr/>
+          <w:tcPr>
+            <w:shd w:val="clear" w:color="auto" w:fill="F6F8FA"/>
+          </w:tcPr>
           <w:p>
             <w:pPr>
               <w:jc w:val="left"/>
@@ -14289,7 +14326,9 @@
           </w:p>
         </w:tc>
         <w:tc>
-          <w:tcPr/>
+          <w:tcPr>
+            <w:shd w:val="clear" w:color="auto" w:fill="F6F8FA"/>
+          </w:tcPr>
           <w:p>
             <w:pPr>
               <w:jc w:val="left"/>
@@ -14300,7 +14339,9 @@
           </w:p>
         </w:tc>
         <w:tc>
-          <w:tcPr/>
+          <w:tcPr>
+            <w:shd w:val="clear" w:color="auto" w:fill="F6F8FA"/>
+          </w:tcPr>
           <w:p>
             <w:pPr>
               <w:jc w:val="left"/>
@@ -14313,9 +14354,7 @@
       </w:tr>
       <w:tr>
         <w:tc>
-          <w:tcPr>
-            <w:shd w:val="clear" w:color="auto" w:fill="F6F8FA"/>
-          </w:tcPr>
+          <w:tcPr/>
           <w:p>
             <w:pPr>
               <w:jc w:val="left"/>
@@ -14356,9 +14395,7 @@
           </w:p>
         </w:tc>
         <w:tc>
-          <w:tcPr>
-            <w:shd w:val="clear" w:color="auto" w:fill="F6F8FA"/>
-          </w:tcPr>
+          <w:tcPr/>
           <w:p>
             <w:pPr>
               <w:jc w:val="left"/>
@@ -14369,9 +14406,7 @@
           </w:p>
         </w:tc>
         <w:tc>
-          <w:tcPr>
-            <w:shd w:val="clear" w:color="auto" w:fill="F6F8FA"/>
-          </w:tcPr>
+          <w:tcPr/>
           <w:p>
             <w:pPr>
               <w:jc w:val="left"/>
@@ -14384,7 +14419,9 @@
       </w:tr>
       <w:tr>
         <w:tc>
-          <w:tcPr/>
+          <w:tcPr>
+            <w:shd w:val="clear" w:color="auto" w:fill="F6F8FA"/>
+          </w:tcPr>
           <w:p>
             <w:pPr>
               <w:jc w:val="left"/>
@@ -14410,7 +14447,9 @@
           </w:p>
         </w:tc>
         <w:tc>
-          <w:tcPr/>
+          <w:tcPr>
+            <w:shd w:val="clear" w:color="auto" w:fill="F6F8FA"/>
+          </w:tcPr>
           <w:p>
             <w:pPr>
               <w:jc w:val="left"/>
@@ -14421,7 +14460,9 @@
           </w:p>
         </w:tc>
         <w:tc>
-          <w:tcPr/>
+          <w:tcPr>
+            <w:shd w:val="clear" w:color="auto" w:fill="F6F8FA"/>
+          </w:tcPr>
           <w:p>
             <w:pPr>
               <w:jc w:val="left"/>
@@ -14434,9 +14475,7 @@
       </w:tr>
       <w:tr>
         <w:tc>
-          <w:tcPr>
-            <w:shd w:val="clear" w:color="auto" w:fill="F6F8FA"/>
-          </w:tcPr>
+          <w:tcPr/>
           <w:p>
             <w:pPr>
               <w:jc w:val="left"/>
@@ -14447,9 +14486,7 @@
           </w:p>
         </w:tc>
         <w:tc>
-          <w:tcPr>
-            <w:shd w:val="clear" w:color="auto" w:fill="F6F8FA"/>
-          </w:tcPr>
+          <w:tcPr/>
           <w:p>
             <w:pPr>
               <w:jc w:val="left"/>
@@ -14460,9 +14497,7 @@
           </w:p>
         </w:tc>
         <w:tc>
-          <w:tcPr>
-            <w:shd w:val="clear" w:color="auto" w:fill="F6F8FA"/>
-          </w:tcPr>
+          <w:tcPr/>
           <w:p>
             <w:pPr>
               <w:jc w:val="left"/>
@@ -14475,7 +14510,9 @@
       </w:tr>
       <w:tr>
         <w:tc>
-          <w:tcPr/>
+          <w:tcPr>
+            <w:shd w:val="clear" w:color="auto" w:fill="F6F8FA"/>
+          </w:tcPr>
           <w:p>
             <w:pPr>
               <w:jc w:val="left"/>
@@ -14486,7 +14523,9 @@
           </w:p>
         </w:tc>
         <w:tc>
-          <w:tcPr/>
+          <w:tcPr>
+            <w:shd w:val="clear" w:color="auto" w:fill="F6F8FA"/>
+          </w:tcPr>
           <w:p>
             <w:pPr>
               <w:jc w:val="left"/>
@@ -14497,7 +14536,9 @@
           </w:p>
         </w:tc>
         <w:tc>
-          <w:tcPr/>
+          <w:tcPr>
+            <w:shd w:val="clear" w:color="auto" w:fill="F6F8FA"/>
+          </w:tcPr>
           <w:p>
             <w:pPr>
               <w:jc w:val="left"/>
@@ -14510,9 +14551,7 @@
       </w:tr>
       <w:tr>
         <w:tc>
-          <w:tcPr>
-            <w:shd w:val="clear" w:color="auto" w:fill="F6F8FA"/>
-          </w:tcPr>
+          <w:tcPr/>
           <w:p>
             <w:pPr>
               <w:jc w:val="left"/>
@@ -14568,9 +14607,7 @@
           </w:p>
         </w:tc>
         <w:tc>
-          <w:tcPr>
-            <w:shd w:val="clear" w:color="auto" w:fill="F6F8FA"/>
-          </w:tcPr>
+          <w:tcPr/>
           <w:p>
             <w:pPr>
               <w:jc w:val="left"/>
@@ -14581,9 +14618,7 @@
           </w:p>
         </w:tc>
         <w:tc>
-          <w:tcPr>
-            <w:shd w:val="clear" w:color="auto" w:fill="F6F8FA"/>
-          </w:tcPr>
+          <w:tcPr/>
           <w:p>
             <w:pPr>
               <w:jc w:val="left"/>
@@ -14596,7 +14631,9 @@
       </w:tr>
       <w:tr>
         <w:tc>
-          <w:tcPr/>
+          <w:tcPr>
+            <w:shd w:val="clear" w:color="auto" w:fill="F6F8FA"/>
+          </w:tcPr>
           <w:p>
             <w:pPr>
               <w:jc w:val="left"/>
@@ -14652,7 +14689,9 @@
           </w:p>
         </w:tc>
         <w:tc>
-          <w:tcPr/>
+          <w:tcPr>
+            <w:shd w:val="clear" w:color="auto" w:fill="F6F8FA"/>
+          </w:tcPr>
           <w:p>
             <w:pPr>
               <w:jc w:val="left"/>
@@ -14663,7 +14702,9 @@
           </w:p>
         </w:tc>
         <w:tc>
-          <w:tcPr/>
+          <w:tcPr>
+            <w:shd w:val="clear" w:color="auto" w:fill="F6F8FA"/>
+          </w:tcPr>
           <w:p>
             <w:pPr>
               <w:jc w:val="left"/>
@@ -14676,9 +14717,7 @@
       </w:tr>
       <w:tr>
         <w:tc>
-          <w:tcPr>
-            <w:shd w:val="clear" w:color="auto" w:fill="F6F8FA"/>
-          </w:tcPr>
+          <w:tcPr/>
           <w:p>
             <w:pPr>
               <w:jc w:val="left"/>
@@ -14755,9 +14794,7 @@
           </w:p>
         </w:tc>
         <w:tc>
-          <w:tcPr>
-            <w:shd w:val="clear" w:color="auto" w:fill="F6F8FA"/>
-          </w:tcPr>
+          <w:tcPr/>
           <w:p>
             <w:pPr>
               <w:jc w:val="left"/>
@@ -14768,9 +14805,7 @@
           </w:p>
         </w:tc>
         <w:tc>
-          <w:tcPr>
-            <w:shd w:val="clear" w:color="auto" w:fill="F6F8FA"/>
-          </w:tcPr>
+          <w:tcPr/>
           <w:p>
             <w:pPr>
               <w:jc w:val="left"/>
@@ -14783,7 +14818,9 @@
       </w:tr>
       <w:tr>
         <w:tc>
-          <w:tcPr/>
+          <w:tcPr>
+            <w:shd w:val="clear" w:color="auto" w:fill="F6F8FA"/>
+          </w:tcPr>
           <w:p>
             <w:pPr>
               <w:jc w:val="left"/>
@@ -14821,7 +14858,9 @@
           </w:p>
         </w:tc>
         <w:tc>
-          <w:tcPr/>
+          <w:tcPr>
+            <w:shd w:val="clear" w:color="auto" w:fill="F6F8FA"/>
+          </w:tcPr>
           <w:p>
             <w:pPr>
               <w:jc w:val="left"/>
@@ -14847,7 +14886,9 @@
           </w:p>
         </w:tc>
         <w:tc>
-          <w:tcPr/>
+          <w:tcPr>
+            <w:shd w:val="clear" w:color="auto" w:fill="F6F8FA"/>
+          </w:tcPr>
           <w:p>
             <w:pPr>
               <w:jc w:val="left"/>
@@ -14860,9 +14901,7 @@
       </w:tr>
       <w:tr>
         <w:tc>
-          <w:tcPr>
-            <w:shd w:val="clear" w:color="auto" w:fill="F6F8FA"/>
-          </w:tcPr>
+          <w:tcPr/>
           <w:p>
             <w:pPr>
               <w:jc w:val="left"/>
@@ -14873,9 +14912,7 @@
           </w:p>
         </w:tc>
         <w:tc>
-          <w:tcPr>
-            <w:shd w:val="clear" w:color="auto" w:fill="F6F8FA"/>
-          </w:tcPr>
+          <w:tcPr/>
           <w:p>
             <w:pPr>
               <w:jc w:val="left"/>
@@ -14928,9 +14965,7 @@
           </w:p>
         </w:tc>
         <w:tc>
-          <w:tcPr>
-            <w:shd w:val="clear" w:color="auto" w:fill="F6F8FA"/>
-          </w:tcPr>
+          <w:tcPr/>
           <w:p>
             <w:pPr>
               <w:jc w:val="left"/>
@@ -14943,7 +14978,9 @@
       </w:tr>
       <w:tr>
         <w:tc>
-          <w:tcPr/>
+          <w:tcPr>
+            <w:shd w:val="clear" w:color="auto" w:fill="F6F8FA"/>
+          </w:tcPr>
           <w:p>
             <w:pPr>
               <w:jc w:val="left"/>
@@ -14954,7 +14991,9 @@
           </w:p>
         </w:tc>
         <w:tc>
-          <w:tcPr/>
+          <w:tcPr>
+            <w:shd w:val="clear" w:color="auto" w:fill="F6F8FA"/>
+          </w:tcPr>
           <w:p>
             <w:pPr>
               <w:jc w:val="left"/>
@@ -14977,7 +15016,9 @@
           </w:p>
         </w:tc>
         <w:tc>
-          <w:tcPr/>
+          <w:tcPr>
+            <w:shd w:val="clear" w:color="auto" w:fill="F6F8FA"/>
+          </w:tcPr>
           <w:p>
             <w:pPr>
               <w:jc w:val="left"/>
@@ -14990,9 +15031,7 @@
       </w:tr>
       <w:tr>
         <w:tc>
-          <w:tcPr>
-            <w:shd w:val="clear" w:color="auto" w:fill="F6F8FA"/>
-          </w:tcPr>
+          <w:tcPr/>
           <w:p>
             <w:pPr>
               <w:jc w:val="left"/>
@@ -15003,9 +15042,7 @@
           </w:p>
         </w:tc>
         <w:tc>
-          <w:tcPr>
-            <w:shd w:val="clear" w:color="auto" w:fill="F6F8FA"/>
-          </w:tcPr>
+          <w:tcPr/>
           <w:p>
             <w:pPr>
               <w:jc w:val="left"/>
@@ -15103,9 +15140,7 @@
           </w:p>
         </w:tc>
         <w:tc>
-          <w:tcPr>
-            <w:shd w:val="clear" w:color="auto" w:fill="F6F8FA"/>
-          </w:tcPr>
+          <w:tcPr/>
           <w:p>
             <w:pPr>
               <w:jc w:val="left"/>
@@ -15118,7 +15153,9 @@
       </w:tr>
       <w:tr>
         <w:tc>
-          <w:tcPr/>
+          <w:tcPr>
+            <w:shd w:val="clear" w:color="auto" w:fill="F6F8FA"/>
+          </w:tcPr>
           <w:p>
             <w:pPr>
               <w:jc w:val="left"/>
@@ -15129,7 +15166,9 @@
           </w:p>
         </w:tc>
         <w:tc>
-          <w:tcPr/>
+          <w:tcPr>
+            <w:shd w:val="clear" w:color="auto" w:fill="F6F8FA"/>
+          </w:tcPr>
           <w:p>
             <w:pPr>
               <w:jc w:val="left"/>
@@ -15140,7 +15179,9 @@
           </w:p>
         </w:tc>
         <w:tc>
-          <w:tcPr/>
+          <w:tcPr>
+            <w:shd w:val="clear" w:color="auto" w:fill="F6F8FA"/>
+          </w:tcPr>
           <w:p>
             <w:pPr>
               <w:jc w:val="left"/>
@@ -15153,9 +15194,7 @@
       </w:tr>
       <w:tr>
         <w:tc>
-          <w:tcPr>
-            <w:shd w:val="clear" w:color="auto" w:fill="F6F8FA"/>
-          </w:tcPr>
+          <w:tcPr/>
           <w:p>
             <w:pPr>
               <w:jc w:val="left"/>
@@ -15166,9 +15205,7 @@
           </w:p>
         </w:tc>
         <w:tc>
-          <w:tcPr>
-            <w:shd w:val="clear" w:color="auto" w:fill="F6F8FA"/>
-          </w:tcPr>
+          <w:tcPr/>
           <w:p>
             <w:pPr>
               <w:jc w:val="left"/>
@@ -15218,9 +15255,7 @@
           </w:p>
         </w:tc>
         <w:tc>
-          <w:tcPr>
-            <w:shd w:val="clear" w:color="auto" w:fill="F6F8FA"/>
-          </w:tcPr>
+          <w:tcPr/>
           <w:p>
             <w:pPr>
               <w:jc w:val="left"/>
@@ -15233,7 +15268,9 @@
       </w:tr>
       <w:tr>
         <w:tc>
-          <w:tcPr/>
+          <w:tcPr>
+            <w:shd w:val="clear" w:color="auto" w:fill="F6F8FA"/>
+          </w:tcPr>
           <w:p>
             <w:pPr>
               <w:jc w:val="left"/>
@@ -15244,7 +15281,9 @@
           </w:p>
         </w:tc>
         <w:tc>
-          <w:tcPr/>
+          <w:tcPr>
+            <w:shd w:val="clear" w:color="auto" w:fill="F6F8FA"/>
+          </w:tcPr>
           <w:p>
             <w:pPr>
               <w:jc w:val="left"/>
@@ -15297,7 +15336,9 @@
           </w:p>
         </w:tc>
         <w:tc>
-          <w:tcPr/>
+          <w:tcPr>
+            <w:shd w:val="clear" w:color="auto" w:fill="F6F8FA"/>
+          </w:tcPr>
           <w:p>
             <w:pPr>
               <w:jc w:val="left"/>
@@ -15310,9 +15351,7 @@
       </w:tr>
       <w:tr>
         <w:tc>
-          <w:tcPr>
-            <w:shd w:val="clear" w:color="auto" w:fill="F6F8FA"/>
-          </w:tcPr>
+          <w:tcPr/>
           <w:p>
             <w:pPr>
               <w:jc w:val="left"/>
@@ -15323,9 +15362,7 @@
           </w:p>
         </w:tc>
         <w:tc>
-          <w:tcPr>
-            <w:shd w:val="clear" w:color="auto" w:fill="F6F8FA"/>
-          </w:tcPr>
+          <w:tcPr/>
           <w:p>
             <w:pPr>
               <w:jc w:val="left"/>
@@ -15336,9 +15373,7 @@
           </w:p>
         </w:tc>
         <w:tc>
-          <w:tcPr>
-            <w:shd w:val="clear" w:color="auto" w:fill="F6F8FA"/>
-          </w:tcPr>
+          <w:tcPr/>
           <w:p>
             <w:pPr>
               <w:jc w:val="left"/>
@@ -15351,7 +15386,9 @@
       </w:tr>
       <w:tr>
         <w:tc>
-          <w:tcPr/>
+          <w:tcPr>
+            <w:shd w:val="clear" w:color="auto" w:fill="F6F8FA"/>
+          </w:tcPr>
           <w:p>
             <w:pPr>
               <w:jc w:val="left"/>
@@ -15362,7 +15399,9 @@
           </w:p>
         </w:tc>
         <w:tc>
-          <w:tcPr/>
+          <w:tcPr>
+            <w:shd w:val="clear" w:color="auto" w:fill="F6F8FA"/>
+          </w:tcPr>
           <w:p>
             <w:pPr>
               <w:jc w:val="left"/>
@@ -15373,7 +15412,9 @@
           </w:p>
         </w:tc>
         <w:tc>
-          <w:tcPr/>
+          <w:tcPr>
+            <w:shd w:val="clear" w:color="auto" w:fill="F6F8FA"/>
+          </w:tcPr>
           <w:p>
             <w:pPr>
               <w:jc w:val="left"/>
@@ -15386,9 +15427,7 @@
       </w:tr>
       <w:tr>
         <w:tc>
-          <w:tcPr>
-            <w:shd w:val="clear" w:color="auto" w:fill="F6F8FA"/>
-          </w:tcPr>
+          <w:tcPr/>
           <w:p>
             <w:pPr>
               <w:jc w:val="left"/>
@@ -15399,9 +15438,7 @@
           </w:p>
         </w:tc>
         <w:tc>
-          <w:tcPr>
-            <w:shd w:val="clear" w:color="auto" w:fill="F6F8FA"/>
-          </w:tcPr>
+          <w:tcPr/>
           <w:p>
             <w:pPr>
               <w:jc w:val="left"/>
@@ -15412,9 +15449,7 @@
           </w:p>
         </w:tc>
         <w:tc>
-          <w:tcPr>
-            <w:shd w:val="clear" w:color="auto" w:fill="F6F8FA"/>
-          </w:tcPr>
+          <w:tcPr/>
           <w:p>
             <w:pPr>
               <w:jc w:val="left"/>
@@ -15427,7 +15462,9 @@
       </w:tr>
       <w:tr>
         <w:tc>
-          <w:tcPr/>
+          <w:tcPr>
+            <w:shd w:val="clear" w:color="auto" w:fill="F6F8FA"/>
+          </w:tcPr>
           <w:p>
             <w:pPr>
               <w:jc w:val="left"/>
@@ -15438,7 +15475,9 @@
           </w:p>
         </w:tc>
         <w:tc>
-          <w:tcPr/>
+          <w:tcPr>
+            <w:shd w:val="clear" w:color="auto" w:fill="F6F8FA"/>
+          </w:tcPr>
           <w:p>
             <w:pPr>
               <w:jc w:val="left"/>
@@ -15449,7 +15488,9 @@
           </w:p>
         </w:tc>
         <w:tc>
-          <w:tcPr/>
+          <w:tcPr>
+            <w:shd w:val="clear" w:color="auto" w:fill="F6F8FA"/>
+          </w:tcPr>
           <w:p>
             <w:pPr>
               <w:jc w:val="left"/>
@@ -15462,9 +15503,7 @@
       </w:tr>
       <w:tr>
         <w:tc>
-          <w:tcPr>
-            <w:shd w:val="clear" w:color="auto" w:fill="F6F8FA"/>
-          </w:tcPr>
+          <w:tcPr/>
           <w:p>
             <w:pPr>
               <w:jc w:val="left"/>
@@ -15475,9 +15514,7 @@
           </w:p>
         </w:tc>
         <w:tc>
-          <w:tcPr>
-            <w:shd w:val="clear" w:color="auto" w:fill="F6F8FA"/>
-          </w:tcPr>
+          <w:tcPr/>
           <w:p>
             <w:pPr>
               <w:jc w:val="left"/>
@@ -15497,9 +15534,7 @@
           </w:p>
         </w:tc>
         <w:tc>
-          <w:tcPr>
-            <w:shd w:val="clear" w:color="auto" w:fill="F6F8FA"/>
-          </w:tcPr>
+          <w:tcPr/>
           <w:p>
             <w:pPr>
               <w:jc w:val="left"/>
@@ -15512,7 +15547,9 @@
       </w:tr>
       <w:tr>
         <w:tc>
-          <w:tcPr/>
+          <w:tcPr>
+            <w:shd w:val="clear" w:color="auto" w:fill="F6F8FA"/>
+          </w:tcPr>
           <w:p>
             <w:pPr>
               <w:jc w:val="left"/>
@@ -15523,7 +15560,9 @@
           </w:p>
         </w:tc>
         <w:tc>
-          <w:tcPr/>
+          <w:tcPr>
+            <w:shd w:val="clear" w:color="auto" w:fill="F6F8FA"/>
+          </w:tcPr>
           <w:p>
             <w:pPr>
               <w:jc w:val="left"/>
@@ -15534,7 +15573,9 @@
           </w:p>
         </w:tc>
         <w:tc>
-          <w:tcPr/>
+          <w:tcPr>
+            <w:shd w:val="clear" w:color="auto" w:fill="F6F8FA"/>
+          </w:tcPr>
           <w:p>
             <w:pPr>
               <w:jc w:val="left"/>
@@ -15547,9 +15588,7 @@
       </w:tr>
       <w:tr>
         <w:tc>
-          <w:tcPr>
-            <w:shd w:val="clear" w:color="auto" w:fill="F6F8FA"/>
-          </w:tcPr>
+          <w:tcPr/>
           <w:p>
             <w:pPr>
               <w:jc w:val="left"/>
@@ -15560,9 +15599,7 @@
           </w:p>
         </w:tc>
         <w:tc>
-          <w:tcPr>
-            <w:shd w:val="clear" w:color="auto" w:fill="F6F8FA"/>
-          </w:tcPr>
+          <w:tcPr/>
           <w:p>
             <w:pPr>
               <w:jc w:val="left"/>
@@ -15573,9 +15610,7 @@
           </w:p>
         </w:tc>
         <w:tc>
-          <w:tcPr>
-            <w:shd w:val="clear" w:color="auto" w:fill="F6F8FA"/>
-          </w:tcPr>
+          <w:tcPr/>
           <w:p>
             <w:pPr>
               <w:jc w:val="left"/>
@@ -15588,7 +15623,9 @@
       </w:tr>
       <w:tr>
         <w:tc>
-          <w:tcPr/>
+          <w:tcPr>
+            <w:shd w:val="clear" w:color="auto" w:fill="F6F8FA"/>
+          </w:tcPr>
           <w:p>
             <w:pPr>
               <w:jc w:val="left"/>
@@ -15599,7 +15636,9 @@
           </w:p>
         </w:tc>
         <w:tc>
-          <w:tcPr/>
+          <w:tcPr>
+            <w:shd w:val="clear" w:color="auto" w:fill="F6F8FA"/>
+          </w:tcPr>
           <w:p>
             <w:pPr>
               <w:jc w:val="left"/>
@@ -15610,7 +15649,9 @@
           </w:p>
         </w:tc>
         <w:tc>
-          <w:tcPr/>
+          <w:tcPr>
+            <w:shd w:val="clear" w:color="auto" w:fill="F6F8FA"/>
+          </w:tcPr>
           <w:p>
             <w:pPr>
               <w:jc w:val="left"/>
@@ -15623,9 +15664,7 @@
       </w:tr>
       <w:tr>
         <w:tc>
-          <w:tcPr>
-            <w:shd w:val="clear" w:color="auto" w:fill="F6F8FA"/>
-          </w:tcPr>
+          <w:tcPr/>
           <w:p>
             <w:pPr>
               <w:jc w:val="left"/>
@@ -15636,9 +15675,7 @@
           </w:p>
         </w:tc>
         <w:tc>
-          <w:tcPr>
-            <w:shd w:val="clear" w:color="auto" w:fill="F6F8FA"/>
-          </w:tcPr>
+          <w:tcPr/>
           <w:p>
             <w:pPr>
               <w:jc w:val="left"/>
@@ -15649,9 +15686,7 @@
           </w:p>
         </w:tc>
         <w:tc>
-          <w:tcPr>
-            <w:shd w:val="clear" w:color="auto" w:fill="F6F8FA"/>
-          </w:tcPr>
+          <w:tcPr/>
           <w:p>
             <w:pPr>
               <w:jc w:val="left"/>
@@ -15664,7 +15699,9 @@
       </w:tr>
       <w:tr>
         <w:tc>
-          <w:tcPr/>
+          <w:tcPr>
+            <w:shd w:val="clear" w:color="auto" w:fill="F6F8FA"/>
+          </w:tcPr>
           <w:p>
             <w:pPr>
               <w:jc w:val="left"/>
@@ -15675,7 +15712,9 @@
           </w:p>
         </w:tc>
         <w:tc>
-          <w:tcPr/>
+          <w:tcPr>
+            <w:shd w:val="clear" w:color="auto" w:fill="F6F8FA"/>
+          </w:tcPr>
           <w:p>
             <w:pPr>
               <w:jc w:val="left"/>
@@ -15686,7 +15725,9 @@
           </w:p>
         </w:tc>
         <w:tc>
-          <w:tcPr/>
+          <w:tcPr>
+            <w:shd w:val="clear" w:color="auto" w:fill="F6F8FA"/>
+          </w:tcPr>
           <w:p>
             <w:pPr>
               <w:jc w:val="left"/>
@@ -15699,9 +15740,7 @@
       </w:tr>
       <w:tr>
         <w:tc>
-          <w:tcPr>
-            <w:shd w:val="clear" w:color="auto" w:fill="F6F8FA"/>
-          </w:tcPr>
+          <w:tcPr/>
           <w:p>
             <w:pPr>
               <w:jc w:val="left"/>
@@ -15712,9 +15751,7 @@
           </w:p>
         </w:tc>
         <w:tc>
-          <w:tcPr>
-            <w:shd w:val="clear" w:color="auto" w:fill="F6F8FA"/>
-          </w:tcPr>
+          <w:tcPr/>
           <w:p>
             <w:pPr>
               <w:jc w:val="left"/>
@@ -15725,9 +15762,7 @@
           </w:p>
         </w:tc>
         <w:tc>
-          <w:tcPr>
-            <w:shd w:val="clear" w:color="auto" w:fill="F6F8FA"/>
-          </w:tcPr>
+          <w:tcPr/>
           <w:p>
             <w:pPr>
               <w:jc w:val="left"/>
@@ -15740,7 +15775,9 @@
       </w:tr>
       <w:tr>
         <w:tc>
-          <w:tcPr/>
+          <w:tcPr>
+            <w:shd w:val="clear" w:color="auto" w:fill="F6F8FA"/>
+          </w:tcPr>
           <w:p>
             <w:pPr>
               <w:jc w:val="left"/>
@@ -15751,7 +15788,9 @@
           </w:p>
         </w:tc>
         <w:tc>
-          <w:tcPr/>
+          <w:tcPr>
+            <w:shd w:val="clear" w:color="auto" w:fill="F6F8FA"/>
+          </w:tcPr>
           <w:p>
             <w:pPr>
               <w:jc w:val="left"/>
@@ -15762,7 +15801,9 @@
           </w:p>
         </w:tc>
         <w:tc>
-          <w:tcPr/>
+          <w:tcPr>
+            <w:shd w:val="clear" w:color="auto" w:fill="F6F8FA"/>
+          </w:tcPr>
           <w:p>
             <w:pPr>
               <w:jc w:val="left"/>
@@ -15775,9 +15816,7 @@
       </w:tr>
       <w:tr>
         <w:tc>
-          <w:tcPr>
-            <w:shd w:val="clear" w:color="auto" w:fill="F6F8FA"/>
-          </w:tcPr>
+          <w:tcPr/>
           <w:p>
             <w:pPr>
               <w:jc w:val="left"/>
@@ -15788,9 +15827,7 @@
           </w:p>
         </w:tc>
         <w:tc>
-          <w:tcPr>
-            <w:shd w:val="clear" w:color="auto" w:fill="F6F8FA"/>
-          </w:tcPr>
+          <w:tcPr/>
           <w:p>
             <w:pPr>
               <w:jc w:val="left"/>
@@ -15801,9 +15838,7 @@
           </w:p>
         </w:tc>
         <w:tc>
-          <w:tcPr>
-            <w:shd w:val="clear" w:color="auto" w:fill="F6F8FA"/>
-          </w:tcPr>
+          <w:tcPr/>
           <w:p>
             <w:pPr>
               <w:jc w:val="left"/>
@@ -15816,7 +15851,9 @@
       </w:tr>
       <w:tr>
         <w:tc>
-          <w:tcPr/>
+          <w:tcPr>
+            <w:shd w:val="clear" w:color="auto" w:fill="F6F8FA"/>
+          </w:tcPr>
           <w:p>
             <w:pPr>
               <w:jc w:val="left"/>
@@ -15827,7 +15864,9 @@
           </w:p>
         </w:tc>
         <w:tc>
-          <w:tcPr/>
+          <w:tcPr>
+            <w:shd w:val="clear" w:color="auto" w:fill="F6F8FA"/>
+          </w:tcPr>
           <w:p>
             <w:pPr>
               <w:jc w:val="left"/>
@@ -15838,7 +15877,9 @@
           </w:p>
         </w:tc>
         <w:tc>
-          <w:tcPr/>
+          <w:tcPr>
+            <w:shd w:val="clear" w:color="auto" w:fill="F6F8FA"/>
+          </w:tcPr>
           <w:p>
             <w:pPr>
               <w:jc w:val="left"/>
@@ -15851,9 +15892,7 @@
       </w:tr>
       <w:tr>
         <w:tc>
-          <w:tcPr>
-            <w:shd w:val="clear" w:color="auto" w:fill="F6F8FA"/>
-          </w:tcPr>
+          <w:tcPr/>
           <w:p>
             <w:pPr>
               <w:jc w:val="left"/>
@@ -15864,9 +15903,7 @@
           </w:p>
         </w:tc>
         <w:tc>
-          <w:tcPr>
-            <w:shd w:val="clear" w:color="auto" w:fill="F6F8FA"/>
-          </w:tcPr>
+          <w:tcPr/>
           <w:p>
             <w:pPr>
               <w:jc w:val="left"/>
@@ -15877,9 +15914,7 @@
           </w:p>
         </w:tc>
         <w:tc>
-          <w:tcPr>
-            <w:shd w:val="clear" w:color="auto" w:fill="F6F8FA"/>
-          </w:tcPr>
+          <w:tcPr/>
           <w:p>
             <w:pPr>
               <w:jc w:val="left"/>
@@ -15892,7 +15927,9 @@
       </w:tr>
       <w:tr>
         <w:tc>
-          <w:tcPr/>
+          <w:tcPr>
+            <w:shd w:val="clear" w:color="auto" w:fill="F6F8FA"/>
+          </w:tcPr>
           <w:p>
             <w:pPr>
               <w:jc w:val="left"/>
@@ -15903,7 +15940,9 @@
           </w:p>
         </w:tc>
         <w:tc>
-          <w:tcPr/>
+          <w:tcPr>
+            <w:shd w:val="clear" w:color="auto" w:fill="F6F8FA"/>
+          </w:tcPr>
           <w:p>
             <w:pPr>
               <w:jc w:val="left"/>
@@ -15914,7 +15953,9 @@
           </w:p>
         </w:tc>
         <w:tc>
-          <w:tcPr/>
+          <w:tcPr>
+            <w:shd w:val="clear" w:color="auto" w:fill="F6F8FA"/>
+          </w:tcPr>
           <w:p>
             <w:pPr>
               <w:jc w:val="left"/>
@@ -15927,9 +15968,7 @@
       </w:tr>
       <w:tr>
         <w:tc>
-          <w:tcPr>
-            <w:shd w:val="clear" w:color="auto" w:fill="F6F8FA"/>
-          </w:tcPr>
+          <w:tcPr/>
           <w:p>
             <w:pPr>
               <w:jc w:val="left"/>
@@ -15940,9 +15979,7 @@
           </w:p>
         </w:tc>
         <w:tc>
-          <w:tcPr>
-            <w:shd w:val="clear" w:color="auto" w:fill="F6F8FA"/>
-          </w:tcPr>
+          <w:tcPr/>
           <w:p>
             <w:pPr>
               <w:jc w:val="left"/>
@@ -15953,9 +15990,7 @@
           </w:p>
         </w:tc>
         <w:tc>
-          <w:tcPr>
-            <w:shd w:val="clear" w:color="auto" w:fill="F6F8FA"/>
-          </w:tcPr>
+          <w:tcPr/>
           <w:p>
             <w:pPr>
               <w:jc w:val="left"/>
@@ -15968,7 +16003,9 @@
       </w:tr>
       <w:tr>
         <w:tc>
-          <w:tcPr/>
+          <w:tcPr>
+            <w:shd w:val="clear" w:color="auto" w:fill="F6F8FA"/>
+          </w:tcPr>
           <w:p>
             <w:pPr>
               <w:jc w:val="left"/>
@@ -15979,7 +16016,9 @@
           </w:p>
         </w:tc>
         <w:tc>
-          <w:tcPr/>
+          <w:tcPr>
+            <w:shd w:val="clear" w:color="auto" w:fill="F6F8FA"/>
+          </w:tcPr>
           <w:p>
             <w:pPr>
               <w:jc w:val="left"/>
@@ -15990,7 +16029,9 @@
           </w:p>
         </w:tc>
         <w:tc>
-          <w:tcPr/>
+          <w:tcPr>
+            <w:shd w:val="clear" w:color="auto" w:fill="F6F8FA"/>
+          </w:tcPr>
           <w:p>
             <w:pPr>
               <w:jc w:val="left"/>
@@ -16003,9 +16044,7 @@
       </w:tr>
       <w:tr>
         <w:tc>
-          <w:tcPr>
-            <w:shd w:val="clear" w:color="auto" w:fill="F6F8FA"/>
-          </w:tcPr>
+          <w:tcPr/>
           <w:p>
             <w:pPr>
               <w:jc w:val="left"/>
@@ -16016,9 +16055,7 @@
           </w:p>
         </w:tc>
         <w:tc>
-          <w:tcPr>
-            <w:shd w:val="clear" w:color="auto" w:fill="F6F8FA"/>
-          </w:tcPr>
+          <w:tcPr/>
           <w:p>
             <w:pPr>
               <w:jc w:val="left"/>
@@ -16035,9 +16072,7 @@
           </w:p>
         </w:tc>
         <w:tc>
-          <w:tcPr>
-            <w:shd w:val="clear" w:color="auto" w:fill="F6F8FA"/>
-          </w:tcPr>
+          <w:tcPr/>
           <w:p>
             <w:pPr>
               <w:jc w:val="left"/>
@@ -16050,7 +16085,9 @@
       </w:tr>
       <w:tr>
         <w:tc>
-          <w:tcPr/>
+          <w:tcPr>
+            <w:shd w:val="clear" w:color="auto" w:fill="F6F8FA"/>
+          </w:tcPr>
           <w:p>
             <w:pPr>
               <w:jc w:val="left"/>
@@ -16061,7 +16098,9 @@
           </w:p>
         </w:tc>
         <w:tc>
-          <w:tcPr/>
+          <w:tcPr>
+            <w:shd w:val="clear" w:color="auto" w:fill="F6F8FA"/>
+          </w:tcPr>
           <w:p>
             <w:pPr>
               <w:jc w:val="left"/>
@@ -16078,7 +16117,9 @@
           </w:p>
         </w:tc>
         <w:tc>
-          <w:tcPr/>
+          <w:tcPr>
+            <w:shd w:val="clear" w:color="auto" w:fill="F6F8FA"/>
+          </w:tcPr>
           <w:p>
             <w:pPr>
               <w:jc w:val="left"/>
@@ -16091,9 +16132,7 @@
       </w:tr>
       <w:tr>
         <w:tc>
-          <w:tcPr>
-            <w:shd w:val="clear" w:color="auto" w:fill="F6F8FA"/>
-          </w:tcPr>
+          <w:tcPr/>
           <w:p>
             <w:pPr>
               <w:jc w:val="left"/>
@@ -16104,9 +16143,7 @@
           </w:p>
         </w:tc>
         <w:tc>
-          <w:tcPr>
-            <w:shd w:val="clear" w:color="auto" w:fill="F6F8FA"/>
-          </w:tcPr>
+          <w:tcPr/>
           <w:p>
             <w:pPr>
               <w:jc w:val="left"/>
@@ -16117,9 +16154,7 @@
           </w:p>
         </w:tc>
         <w:tc>
-          <w:tcPr>
-            <w:shd w:val="clear" w:color="auto" w:fill="F6F8FA"/>
-          </w:tcPr>
+          <w:tcPr/>
           <w:p>
             <w:pPr>
               <w:jc w:val="left"/>
@@ -16132,7 +16167,9 @@
       </w:tr>
       <w:tr>
         <w:tc>
-          <w:tcPr/>
+          <w:tcPr>
+            <w:shd w:val="clear" w:color="auto" w:fill="F6F8FA"/>
+          </w:tcPr>
           <w:p>
             <w:pPr>
               <w:jc w:val="left"/>
@@ -16143,7 +16180,9 @@
           </w:p>
         </w:tc>
         <w:tc>
-          <w:tcPr/>
+          <w:tcPr>
+            <w:shd w:val="clear" w:color="auto" w:fill="F6F8FA"/>
+          </w:tcPr>
           <w:p>
             <w:pPr>
               <w:jc w:val="left"/>
@@ -16214,7 +16253,9 @@
           </w:p>
         </w:tc>
         <w:tc>
-          <w:tcPr/>
+          <w:tcPr>
+            <w:shd w:val="clear" w:color="auto" w:fill="F6F8FA"/>
+          </w:tcPr>
           <w:p>
             <w:pPr>
               <w:jc w:val="left"/>
@@ -16227,9 +16268,7 @@
       </w:tr>
       <w:tr>
         <w:tc>
-          <w:tcPr>
-            <w:shd w:val="clear" w:color="auto" w:fill="F6F8FA"/>
-          </w:tcPr>
+          <w:tcPr/>
           <w:p>
             <w:pPr>
               <w:jc w:val="left"/>
@@ -16240,9 +16279,7 @@
           </w:p>
         </w:tc>
         <w:tc>
-          <w:tcPr>
-            <w:shd w:val="clear" w:color="auto" w:fill="F6F8FA"/>
-          </w:tcPr>
+          <w:tcPr/>
           <w:p>
             <w:pPr>
               <w:jc w:val="left"/>
@@ -16265,9 +16302,7 @@
           </w:p>
         </w:tc>
         <w:tc>
-          <w:tcPr>
-            <w:shd w:val="clear" w:color="auto" w:fill="F6F8FA"/>
-          </w:tcPr>
+          <w:tcPr/>
           <w:p>
             <w:pPr>
               <w:jc w:val="left"/>
@@ -16280,7 +16315,9 @@
       </w:tr>
       <w:tr>
         <w:tc>
-          <w:tcPr/>
+          <w:tcPr>
+            <w:shd w:val="clear" w:color="auto" w:fill="F6F8FA"/>
+          </w:tcPr>
           <w:p>
             <w:pPr>
               <w:jc w:val="left"/>
@@ -16291,7 +16328,9 @@
           </w:p>
         </w:tc>
         <w:tc>
-          <w:tcPr/>
+          <w:tcPr>
+            <w:shd w:val="clear" w:color="auto" w:fill="F6F8FA"/>
+          </w:tcPr>
           <w:p>
             <w:pPr>
               <w:jc w:val="left"/>
@@ -16308,7 +16347,9 @@
           </w:p>
         </w:tc>
         <w:tc>
-          <w:tcPr/>
+          <w:tcPr>
+            <w:shd w:val="clear" w:color="auto" w:fill="F6F8FA"/>
+          </w:tcPr>
           <w:p>
             <w:pPr>
               <w:jc w:val="left"/>
@@ -16321,9 +16362,7 @@
       </w:tr>
       <w:tr>
         <w:tc>
-          <w:tcPr>
-            <w:shd w:val="clear" w:color="auto" w:fill="F6F8FA"/>
-          </w:tcPr>
+          <w:tcPr/>
           <w:p>
             <w:pPr>
               <w:jc w:val="left"/>
@@ -16334,9 +16373,7 @@
           </w:p>
         </w:tc>
         <w:tc>
-          <w:tcPr>
-            <w:shd w:val="clear" w:color="auto" w:fill="F6F8FA"/>
-          </w:tcPr>
+          <w:tcPr/>
           <w:p>
             <w:pPr>
               <w:jc w:val="left"/>
@@ -16347,9 +16384,7 @@
           </w:p>
         </w:tc>
         <w:tc>
-          <w:tcPr>
-            <w:shd w:val="clear" w:color="auto" w:fill="F6F8FA"/>
-          </w:tcPr>
+          <w:tcPr/>
           <w:p>
             <w:pPr>
               <w:jc w:val="left"/>
@@ -16362,7 +16397,9 @@
       </w:tr>
       <w:tr>
         <w:tc>
-          <w:tcPr/>
+          <w:tcPr>
+            <w:shd w:val="clear" w:color="auto" w:fill="F6F8FA"/>
+          </w:tcPr>
           <w:p>
             <w:pPr>
               <w:jc w:val="left"/>
@@ -16373,7 +16410,9 @@
           </w:p>
         </w:tc>
         <w:tc>
-          <w:tcPr/>
+          <w:tcPr>
+            <w:shd w:val="clear" w:color="auto" w:fill="F6F8FA"/>
+          </w:tcPr>
           <w:p>
             <w:pPr>
               <w:jc w:val="left"/>
@@ -16384,7 +16423,9 @@
           </w:p>
         </w:tc>
         <w:tc>
-          <w:tcPr/>
+          <w:tcPr>
+            <w:shd w:val="clear" w:color="auto" w:fill="F6F8FA"/>
+          </w:tcPr>
           <w:p>
             <w:pPr>
               <w:jc w:val="left"/>
@@ -16397,9 +16438,7 @@
       </w:tr>
       <w:tr>
         <w:tc>
-          <w:tcPr>
-            <w:shd w:val="clear" w:color="auto" w:fill="F6F8FA"/>
-          </w:tcPr>
+          <w:tcPr/>
           <w:p>
             <w:pPr>
               <w:jc w:val="left"/>
@@ -16410,9 +16449,7 @@
           </w:p>
         </w:tc>
         <w:tc>
-          <w:tcPr>
-            <w:shd w:val="clear" w:color="auto" w:fill="F6F8FA"/>
-          </w:tcPr>
+          <w:tcPr/>
           <w:p>
             <w:pPr>
               <w:jc w:val="left"/>
@@ -16429,9 +16466,7 @@
           </w:p>
         </w:tc>
         <w:tc>
-          <w:tcPr>
-            <w:shd w:val="clear" w:color="auto" w:fill="F6F8FA"/>
-          </w:tcPr>
+          <w:tcPr/>
           <w:p>
             <w:pPr>
               <w:jc w:val="left"/>
@@ -16444,7 +16479,9 @@
       </w:tr>
       <w:tr>
         <w:tc>
-          <w:tcPr/>
+          <w:tcPr>
+            <w:shd w:val="clear" w:color="auto" w:fill="F6F8FA"/>
+          </w:tcPr>
           <w:p>
             <w:pPr>
               <w:jc w:val="left"/>
@@ -16455,7 +16492,9 @@
           </w:p>
         </w:tc>
         <w:tc>
-          <w:tcPr/>
+          <w:tcPr>
+            <w:shd w:val="clear" w:color="auto" w:fill="F6F8FA"/>
+          </w:tcPr>
           <w:p>
             <w:pPr>
               <w:jc w:val="left"/>
@@ -16578,7 +16617,9 @@
           </w:p>
         </w:tc>
         <w:tc>
-          <w:tcPr/>
+          <w:tcPr>
+            <w:shd w:val="clear" w:color="auto" w:fill="F6F8FA"/>
+          </w:tcPr>
           <w:p>
             <w:pPr>
               <w:jc w:val="left"/>
@@ -16591,9 +16632,7 @@
       </w:tr>
       <w:tr>
         <w:tc>
-          <w:tcPr>
-            <w:shd w:val="clear" w:color="auto" w:fill="F6F8FA"/>
-          </w:tcPr>
+          <w:tcPr/>
           <w:p>
             <w:pPr>
               <w:jc w:val="left"/>
@@ -16604,9 +16643,7 @@
           </w:p>
         </w:tc>
         <w:tc>
-          <w:tcPr>
-            <w:shd w:val="clear" w:color="auto" w:fill="F6F8FA"/>
-          </w:tcPr>
+          <w:tcPr/>
           <w:p>
             <w:pPr>
               <w:jc w:val="left"/>
@@ -16710,9 +16747,7 @@
           </w:p>
         </w:tc>
         <w:tc>
-          <w:tcPr>
-            <w:shd w:val="clear" w:color="auto" w:fill="F6F8FA"/>
-          </w:tcPr>
+          <w:tcPr/>
           <w:p>
             <w:pPr>
               <w:jc w:val="left"/>

</xml_diff>

<commit_message>
DOCX fix: H1 section titles match the PDF heading design
- PDF (huawei-titles.sty): 56pt section number left, \hfill pushes the
  20pt bold title to the right edge, red titlerule below — the DOCX
  rendered everything left-aligned with a body-size number
- Right tab stop added to Heading1 at the text width (computed from
  section properties): pandoc's SectionNumber run + tab + title run
  now acts like the \hfill — title lands on the right edge
- SectionNumber character style set to 56pt (was inherited body size)
- Verified already in place: red bottom rule (1.5pt C7000B), 20pt bold
  title, 30pt after, page break before; H2-H4 match (18/16/14pt regular)
- Shared docx_fix.py — applies to all four templates
- Version coupling: 4x cls + setup-guide → 6.4.7
</commit_message>
<xml_diff>
--- a/documents/setup-guide/setup-guide.docx
+++ b/documents/setup-guide/setup-guide.docx
@@ -84,7 +84,7 @@
           <w:b/>
           <w:sz w:val="24"/>
         </w:rPr>
-        <w:t xml:space="preserve">v6.4.6</w:t>
+        <w:t xml:space="preserve">v6.4.7</w:t>
       </w:r>
       <w:r>
         <w:rPr>
@@ -96,7 +96,7 @@
         <w:rPr>
           <w:sz w:val="24"/>
         </w:rPr>
-        <w:t xml:space="preserve">— September 20, 2026 00:12</w:t>
+        <w:t xml:space="preserve">— September 20, 2026 00:32</w:t>
       </w:r>
     </w:p>
     <w:sdt>
@@ -13345,7 +13345,7 @@
               <w:jc w:val="left"/>
             </w:pPr>
             <w:r>
-              <w:t xml:space="preserve">6.4.6</w:t>
+              <w:t xml:space="preserve">6.4.7</w:t>
             </w:r>
           </w:p>
         </w:tc>
@@ -13367,7 +13367,7 @@
               <w:jc w:val="left"/>
             </w:pPr>
             <w:r>
-              <w:t xml:space="preserve">Code blocks inside test cases no longer break the red left rule in DOCX — the code style’s left indent (which jogged the rule) is reset inside test case blocks, and code blocks now show the PDF’s code box (gray background with thin border on top, bottom, and right, red rule continuing on the left).</w:t>
+              <w:t xml:space="preserve">Section titles in DOCX now match the PDF heading design: the big section number (56pt) sits on the left, the title text is pushed to the right edge (a right tab stop mimics the LaTeX \ hfill), and the red rule runs below — previously the title sat left-aligned next to a small number. Applies to all templates.</w:t>
             </w:r>
           </w:p>
         </w:tc>
@@ -13382,7 +13382,7 @@
               <w:jc w:val="left"/>
             </w:pPr>
             <w:r>
-              <w:t xml:space="preserve">6.4.5</w:t>
+              <w:t xml:space="preserve">6.4.6</w:t>
             </w:r>
           </w:p>
         </w:tc>
@@ -13408,7 +13408,7 @@
               <w:jc w:val="left"/>
             </w:pPr>
             <w:r>
-              <w:t xml:space="preserve">DOCX polish pass: all captions centered (matching the PDF), vertical spacing between blocks matched to the LaTeX rhythm (medskip/smallskip around captions, field bars, and steps), and test steps now render as separate paragraphs each with the red bold number (previously merged into one paragraph).</w:t>
+              <w:t xml:space="preserve">Code blocks inside test cases no longer break the red left rule in DOCX — the code style’s left indent (which jogged the rule) is reset inside test case blocks, and code blocks now show the PDF’s code box (gray background with thin border on top, bottom, and right, red rule continuing on the left).</w:t>
             </w:r>
           </w:p>
         </w:tc>
@@ -13421,7 +13421,7 @@
               <w:jc w:val="left"/>
             </w:pPr>
             <w:r>
-              <w:t xml:space="preserve">6.4.4</w:t>
+              <w:t xml:space="preserve">6.4.5</w:t>
             </w:r>
           </w:p>
         </w:tc>
@@ -13443,7 +13443,7 @@
               <w:jc w:val="left"/>
             </w:pPr>
             <w:r>
-              <w:t xml:space="preserve">DOCX covers now show the logo, cover text, and version/date/time meta line like the PDF. Test case blocks in DOCX get the PDF’s visual wrapper: red left rule, red field header bars, and red step numbers. Captions follow the PDF ordering system in DOCX, MD, and HTML (Table/Diagram/Figure/Testcase N: with bold symbol). Portuguese PDFs now label diagrams "Diagrama N:" (was hardcoded English "Diagram"). Markdown and HTML output no longer leaks raw LaTeX from passthrough blocks — the DOCX pre-processor now feeds those pipelines too.</w:t>
+              <w:t xml:space="preserve">DOCX polish pass: all captions centered (matching the PDF), vertical spacing between blocks matched to the LaTeX rhythm (medskip/smallskip around captions, field bars, and steps), and test steps now render as separate paragraphs each with the red bold number (previously merged into one paragraph).</w:t>
             </w:r>
           </w:p>
         </w:tc>
@@ -13458,7 +13458,7 @@
               <w:jc w:val="left"/>
             </w:pPr>
             <w:r>
-              <w:t xml:space="preserve">6.4.3</w:t>
+              <w:t xml:space="preserve">6.4.4</w:t>
             </w:r>
           </w:p>
         </w:tc>
@@ -13484,7 +13484,7 @@
               <w:jc w:val="left"/>
             </w:pPr>
             <w:r>
-              <w:t xml:space="preserve">Testbook and POC DOCX output now matches the PDF much more closely: native table of contents (language-aware, auto-populated), each section starts on a new page, embedded images and diagrams (PlantUML/Graphviz rendered), white-on-red table headers, cover version line under the title, centered test case captions, and plain black rules for signature grids.</w:t>
+              <w:t xml:space="preserve">DOCX covers now show the logo, cover text, and version/date/time meta line like the PDF. Test case blocks in DOCX get the PDF’s visual wrapper: red left rule, red field header bars, and red step numbers. Captions follow the PDF ordering system in DOCX, MD, and HTML (Table/Diagram/Figure/Testcase N: with bold symbol). Portuguese PDFs now label diagrams "Diagrama N:" (was hardcoded English "Diagram"). Markdown and HTML output no longer leaks raw LaTeX from passthrough blocks — the DOCX pre-processor now feeds those pipelines too.</w:t>
             </w:r>
           </w:p>
         </w:tc>
@@ -13497,7 +13497,7 @@
               <w:jc w:val="left"/>
             </w:pPr>
             <w:r>
-              <w:t xml:space="preserve">6.4.2</w:t>
+              <w:t xml:space="preserve">6.4.3</w:t>
             </w:r>
           </w:p>
         </w:tc>
@@ -13519,7 +13519,7 @@
               <w:jc w:val="left"/>
             </w:pPr>
             <w:r>
-              <w:t xml:space="preserve">DOCX output for POC and testbook templates now includes all passthrough content (stakeholders, closing record, signatures, test cases, test summary, changelog) via a new pre-processor. Fixed dropped Test Scope fields in testbook DOCX output.</w:t>
+              <w:t xml:space="preserve">Testbook and POC DOCX output now matches the PDF much more closely: native table of contents (language-aware, auto-populated), each section starts on a new page, embedded images and diagrams (PlantUML/Graphviz rendered), white-on-red table headers, cover version line under the title, centered test case captions, and plain black rules for signature grids.</w:t>
             </w:r>
           </w:p>
         </w:tc>
@@ -13534,14 +13534,51 @@
               <w:jc w:val="left"/>
             </w:pPr>
             <w:r>
+              <w:t xml:space="preserve">6.4.2</w:t>
+            </w:r>
+          </w:p>
+        </w:tc>
+        <w:tc>
+          <w:tcPr>
+            <w:shd w:val="clear" w:color="auto" w:fill="F6F8FA"/>
+          </w:tcPr>
+          <w:p>
+            <w:pPr>
+              <w:jc w:val="left"/>
+            </w:pPr>
+            <w:r>
+              <w:t xml:space="preserve">2026-09-20</w:t>
+            </w:r>
+          </w:p>
+        </w:tc>
+        <w:tc>
+          <w:tcPr>
+            <w:shd w:val="clear" w:color="auto" w:fill="F6F8FA"/>
+          </w:tcPr>
+          <w:p>
+            <w:pPr>
+              <w:jc w:val="left"/>
+            </w:pPr>
+            <w:r>
+              <w:t xml:space="preserve">DOCX output for POC and testbook templates now includes all passthrough content (stakeholders, closing record, signatures, test cases, test summary, changelog) via a new pre-processor. Fixed dropped Test Scope fields in testbook DOCX output.</w:t>
+            </w:r>
+          </w:p>
+        </w:tc>
+      </w:tr>
+      <w:tr>
+        <w:tc>
+          <w:tcPr/>
+          <w:p>
+            <w:pPr>
+              <w:jc w:val="left"/>
+            </w:pPr>
+            <w:r>
               <w:t xml:space="preserve">6.4.0</w:t>
             </w:r>
           </w:p>
         </w:tc>
         <w:tc>
-          <w:tcPr>
-            <w:shd w:val="clear" w:color="auto" w:fill="F6F8FA"/>
-          </w:tcPr>
+          <w:tcPr/>
           <w:p>
             <w:pPr>
               <w:jc w:val="left"/>
@@ -13552,9 +13589,7 @@
           </w:p>
         </w:tc>
         <w:tc>
-          <w:tcPr>
-            <w:shd w:val="clear" w:color="auto" w:fill="F6F8FA"/>
-          </w:tcPr>
+          <w:tcPr/>
           <w:p>
             <w:pPr>
               <w:jc w:val="left"/>
@@ -13582,7 +13617,9 @@
       </w:tr>
       <w:tr>
         <w:tc>
-          <w:tcPr/>
+          <w:tcPr>
+            <w:shd w:val="clear" w:color="auto" w:fill="F6F8FA"/>
+          </w:tcPr>
           <w:p>
             <w:pPr>
               <w:jc w:val="left"/>
@@ -13593,7 +13630,9 @@
           </w:p>
         </w:tc>
         <w:tc>
-          <w:tcPr/>
+          <w:tcPr>
+            <w:shd w:val="clear" w:color="auto" w:fill="F6F8FA"/>
+          </w:tcPr>
           <w:p>
             <w:pPr>
               <w:jc w:val="left"/>
@@ -13604,7 +13643,9 @@
           </w:p>
         </w:tc>
         <w:tc>
-          <w:tcPr/>
+          <w:tcPr>
+            <w:shd w:val="clear" w:color="auto" w:fill="F6F8FA"/>
+          </w:tcPr>
           <w:p>
             <w:pPr>
               <w:jc w:val="left"/>
@@ -13617,9 +13658,7 @@
       </w:tr>
       <w:tr>
         <w:tc>
-          <w:tcPr>
-            <w:shd w:val="clear" w:color="auto" w:fill="F6F8FA"/>
-          </w:tcPr>
+          <w:tcPr/>
           <w:p>
             <w:pPr>
               <w:jc w:val="left"/>
@@ -13630,9 +13669,7 @@
           </w:p>
         </w:tc>
         <w:tc>
-          <w:tcPr>
-            <w:shd w:val="clear" w:color="auto" w:fill="F6F8FA"/>
-          </w:tcPr>
+          <w:tcPr/>
           <w:p>
             <w:pPr>
               <w:jc w:val="left"/>
@@ -13643,9 +13680,7 @@
           </w:p>
         </w:tc>
         <w:tc>
-          <w:tcPr>
-            <w:shd w:val="clear" w:color="auto" w:fill="F6F8FA"/>
-          </w:tcPr>
+          <w:tcPr/>
           <w:p>
             <w:pPr>
               <w:jc w:val="left"/>
@@ -13658,7 +13693,9 @@
       </w:tr>
       <w:tr>
         <w:tc>
-          <w:tcPr/>
+          <w:tcPr>
+            <w:shd w:val="clear" w:color="auto" w:fill="F6F8FA"/>
+          </w:tcPr>
           <w:p>
             <w:pPr>
               <w:jc w:val="left"/>
@@ -13669,7 +13706,9 @@
           </w:p>
         </w:tc>
         <w:tc>
-          <w:tcPr/>
+          <w:tcPr>
+            <w:shd w:val="clear" w:color="auto" w:fill="F6F8FA"/>
+          </w:tcPr>
           <w:p>
             <w:pPr>
               <w:jc w:val="left"/>
@@ -13680,7 +13719,9 @@
           </w:p>
         </w:tc>
         <w:tc>
-          <w:tcPr/>
+          <w:tcPr>
+            <w:shd w:val="clear" w:color="auto" w:fill="F6F8FA"/>
+          </w:tcPr>
           <w:p>
             <w:pPr>
               <w:jc w:val="left"/>
@@ -13708,9 +13749,7 @@
       </w:tr>
       <w:tr>
         <w:tc>
-          <w:tcPr>
-            <w:shd w:val="clear" w:color="auto" w:fill="F6F8FA"/>
-          </w:tcPr>
+          <w:tcPr/>
           <w:p>
             <w:pPr>
               <w:jc w:val="left"/>
@@ -13721,9 +13760,7 @@
           </w:p>
         </w:tc>
         <w:tc>
-          <w:tcPr>
-            <w:shd w:val="clear" w:color="auto" w:fill="F6F8FA"/>
-          </w:tcPr>
+          <w:tcPr/>
           <w:p>
             <w:pPr>
               <w:jc w:val="left"/>
@@ -13734,9 +13771,7 @@
           </w:p>
         </w:tc>
         <w:tc>
-          <w:tcPr>
-            <w:shd w:val="clear" w:color="auto" w:fill="F6F8FA"/>
-          </w:tcPr>
+          <w:tcPr/>
           <w:p>
             <w:pPr>
               <w:jc w:val="left"/>
@@ -13749,7 +13784,9 @@
       </w:tr>
       <w:tr>
         <w:tc>
-          <w:tcPr/>
+          <w:tcPr>
+            <w:shd w:val="clear" w:color="auto" w:fill="F6F8FA"/>
+          </w:tcPr>
           <w:p>
             <w:pPr>
               <w:jc w:val="left"/>
@@ -13760,7 +13797,9 @@
           </w:p>
         </w:tc>
         <w:tc>
-          <w:tcPr/>
+          <w:tcPr>
+            <w:shd w:val="clear" w:color="auto" w:fill="F6F8FA"/>
+          </w:tcPr>
           <w:p>
             <w:pPr>
               <w:jc w:val="left"/>
@@ -13771,7 +13810,9 @@
           </w:p>
         </w:tc>
         <w:tc>
-          <w:tcPr/>
+          <w:tcPr>
+            <w:shd w:val="clear" w:color="auto" w:fill="F6F8FA"/>
+          </w:tcPr>
           <w:p>
             <w:pPr>
               <w:jc w:val="left"/>
@@ -13784,9 +13825,7 @@
       </w:tr>
       <w:tr>
         <w:tc>
-          <w:tcPr>
-            <w:shd w:val="clear" w:color="auto" w:fill="F6F8FA"/>
-          </w:tcPr>
+          <w:tcPr/>
           <w:p>
             <w:pPr>
               <w:jc w:val="left"/>
@@ -13797,9 +13836,7 @@
           </w:p>
         </w:tc>
         <w:tc>
-          <w:tcPr>
-            <w:shd w:val="clear" w:color="auto" w:fill="F6F8FA"/>
-          </w:tcPr>
+          <w:tcPr/>
           <w:p>
             <w:pPr>
               <w:jc w:val="left"/>
@@ -13810,9 +13847,7 @@
           </w:p>
         </w:tc>
         <w:tc>
-          <w:tcPr>
-            <w:shd w:val="clear" w:color="auto" w:fill="F6F8FA"/>
-          </w:tcPr>
+          <w:tcPr/>
           <w:p>
             <w:pPr>
               <w:jc w:val="left"/>
@@ -13879,7 +13914,9 @@
       </w:tr>
       <w:tr>
         <w:tc>
-          <w:tcPr/>
+          <w:tcPr>
+            <w:shd w:val="clear" w:color="auto" w:fill="F6F8FA"/>
+          </w:tcPr>
           <w:p>
             <w:pPr>
               <w:jc w:val="left"/>
@@ -13890,7 +13927,9 @@
           </w:p>
         </w:tc>
         <w:tc>
-          <w:tcPr/>
+          <w:tcPr>
+            <w:shd w:val="clear" w:color="auto" w:fill="F6F8FA"/>
+          </w:tcPr>
           <w:p>
             <w:pPr>
               <w:jc w:val="left"/>
@@ -13901,7 +13940,9 @@
           </w:p>
         </w:tc>
         <w:tc>
-          <w:tcPr/>
+          <w:tcPr>
+            <w:shd w:val="clear" w:color="auto" w:fill="F6F8FA"/>
+          </w:tcPr>
           <w:p>
             <w:pPr>
               <w:jc w:val="left"/>
@@ -13926,9 +13967,7 @@
       </w:tr>
       <w:tr>
         <w:tc>
-          <w:tcPr>
-            <w:shd w:val="clear" w:color="auto" w:fill="F6F8FA"/>
-          </w:tcPr>
+          <w:tcPr/>
           <w:p>
             <w:pPr>
               <w:jc w:val="left"/>
@@ -13939,9 +13978,7 @@
           </w:p>
         </w:tc>
         <w:tc>
-          <w:tcPr>
-            <w:shd w:val="clear" w:color="auto" w:fill="F6F8FA"/>
-          </w:tcPr>
+          <w:tcPr/>
           <w:p>
             <w:pPr>
               <w:jc w:val="left"/>
@@ -13952,9 +13989,7 @@
           </w:p>
         </w:tc>
         <w:tc>
-          <w:tcPr>
-            <w:shd w:val="clear" w:color="auto" w:fill="F6F8FA"/>
-          </w:tcPr>
+          <w:tcPr/>
           <w:p>
             <w:pPr>
               <w:jc w:val="left"/>
@@ -13967,7 +14002,9 @@
       </w:tr>
       <w:tr>
         <w:tc>
-          <w:tcPr/>
+          <w:tcPr>
+            <w:shd w:val="clear" w:color="auto" w:fill="F6F8FA"/>
+          </w:tcPr>
           <w:p>
             <w:pPr>
               <w:jc w:val="left"/>
@@ -13978,7 +14015,9 @@
           </w:p>
         </w:tc>
         <w:tc>
-          <w:tcPr/>
+          <w:tcPr>
+            <w:shd w:val="clear" w:color="auto" w:fill="F6F8FA"/>
+          </w:tcPr>
           <w:p>
             <w:pPr>
               <w:jc w:val="left"/>
@@ -13989,7 +14028,9 @@
           </w:p>
         </w:tc>
         <w:tc>
-          <w:tcPr/>
+          <w:tcPr>
+            <w:shd w:val="clear" w:color="auto" w:fill="F6F8FA"/>
+          </w:tcPr>
           <w:p>
             <w:pPr>
               <w:jc w:val="left"/>
@@ -14059,9 +14100,7 @@
       </w:tr>
       <w:tr>
         <w:tc>
-          <w:tcPr>
-            <w:shd w:val="clear" w:color="auto" w:fill="F6F8FA"/>
-          </w:tcPr>
+          <w:tcPr/>
           <w:p>
             <w:pPr>
               <w:jc w:val="left"/>
@@ -14072,9 +14111,7 @@
           </w:p>
         </w:tc>
         <w:tc>
-          <w:tcPr>
-            <w:shd w:val="clear" w:color="auto" w:fill="F6F8FA"/>
-          </w:tcPr>
+          <w:tcPr/>
           <w:p>
             <w:pPr>
               <w:jc w:val="left"/>
@@ -14085,9 +14122,7 @@
           </w:p>
         </w:tc>
         <w:tc>
-          <w:tcPr>
-            <w:shd w:val="clear" w:color="auto" w:fill="F6F8FA"/>
-          </w:tcPr>
+          <w:tcPr/>
           <w:p>
             <w:pPr>
               <w:jc w:val="left"/>
@@ -14100,7 +14135,9 @@
       </w:tr>
       <w:tr>
         <w:tc>
-          <w:tcPr/>
+          <w:tcPr>
+            <w:shd w:val="clear" w:color="auto" w:fill="F6F8FA"/>
+          </w:tcPr>
           <w:p>
             <w:pPr>
               <w:jc w:val="left"/>
@@ -14111,7 +14148,9 @@
           </w:p>
         </w:tc>
         <w:tc>
-          <w:tcPr/>
+          <w:tcPr>
+            <w:shd w:val="clear" w:color="auto" w:fill="F6F8FA"/>
+          </w:tcPr>
           <w:p>
             <w:pPr>
               <w:jc w:val="left"/>
@@ -14122,7 +14161,9 @@
           </w:p>
         </w:tc>
         <w:tc>
-          <w:tcPr/>
+          <w:tcPr>
+            <w:shd w:val="clear" w:color="auto" w:fill="F6F8FA"/>
+          </w:tcPr>
           <w:p>
             <w:pPr>
               <w:jc w:val="left"/>
@@ -14180,9 +14221,7 @@
       </w:tr>
       <w:tr>
         <w:tc>
-          <w:tcPr>
-            <w:shd w:val="clear" w:color="auto" w:fill="F6F8FA"/>
-          </w:tcPr>
+          <w:tcPr/>
           <w:p>
             <w:pPr>
               <w:jc w:val="left"/>
@@ -14193,9 +14232,7 @@
           </w:p>
         </w:tc>
         <w:tc>
-          <w:tcPr>
-            <w:shd w:val="clear" w:color="auto" w:fill="F6F8FA"/>
-          </w:tcPr>
+          <w:tcPr/>
           <w:p>
             <w:pPr>
               <w:jc w:val="left"/>
@@ -14206,9 +14243,7 @@
           </w:p>
         </w:tc>
         <w:tc>
-          <w:tcPr>
-            <w:shd w:val="clear" w:color="auto" w:fill="F6F8FA"/>
-          </w:tcPr>
+          <w:tcPr/>
           <w:p>
             <w:pPr>
               <w:jc w:val="left"/>
@@ -14263,7 +14298,9 @@
       </w:tr>
       <w:tr>
         <w:tc>
-          <w:tcPr/>
+          <w:tcPr>
+            <w:shd w:val="clear" w:color="auto" w:fill="F6F8FA"/>
+          </w:tcPr>
           <w:p>
             <w:pPr>
               <w:jc w:val="left"/>
@@ -14274,7 +14311,9 @@
           </w:p>
         </w:tc>
         <w:tc>
-          <w:tcPr/>
+          <w:tcPr>
+            <w:shd w:val="clear" w:color="auto" w:fill="F6F8FA"/>
+          </w:tcPr>
           <w:p>
             <w:pPr>
               <w:jc w:val="left"/>
@@ -14285,7 +14324,9 @@
           </w:p>
         </w:tc>
         <w:tc>
-          <w:tcPr/>
+          <w:tcPr>
+            <w:shd w:val="clear" w:color="auto" w:fill="F6F8FA"/>
+          </w:tcPr>
           <w:p>
             <w:pPr>
               <w:jc w:val="left"/>
@@ -14313,9 +14354,7 @@
       </w:tr>
       <w:tr>
         <w:tc>
-          <w:tcPr>
-            <w:shd w:val="clear" w:color="auto" w:fill="F6F8FA"/>
-          </w:tcPr>
+          <w:tcPr/>
           <w:p>
             <w:pPr>
               <w:jc w:val="left"/>
@@ -14326,9 +14365,7 @@
           </w:p>
         </w:tc>
         <w:tc>
-          <w:tcPr>
-            <w:shd w:val="clear" w:color="auto" w:fill="F6F8FA"/>
-          </w:tcPr>
+          <w:tcPr/>
           <w:p>
             <w:pPr>
               <w:jc w:val="left"/>
@@ -14339,9 +14376,7 @@
           </w:p>
         </w:tc>
         <w:tc>
-          <w:tcPr>
-            <w:shd w:val="clear" w:color="auto" w:fill="F6F8FA"/>
-          </w:tcPr>
+          <w:tcPr/>
           <w:p>
             <w:pPr>
               <w:jc w:val="left"/>
@@ -14354,7 +14389,9 @@
       </w:tr>
       <w:tr>
         <w:tc>
-          <w:tcPr/>
+          <w:tcPr>
+            <w:shd w:val="clear" w:color="auto" w:fill="F6F8FA"/>
+          </w:tcPr>
           <w:p>
             <w:pPr>
               <w:jc w:val="left"/>
@@ -14395,7 +14432,9 @@
           </w:p>
         </w:tc>
         <w:tc>
-          <w:tcPr/>
+          <w:tcPr>
+            <w:shd w:val="clear" w:color="auto" w:fill="F6F8FA"/>
+          </w:tcPr>
           <w:p>
             <w:pPr>
               <w:jc w:val="left"/>
@@ -14406,7 +14445,9 @@
           </w:p>
         </w:tc>
         <w:tc>
-          <w:tcPr/>
+          <w:tcPr>
+            <w:shd w:val="clear" w:color="auto" w:fill="F6F8FA"/>
+          </w:tcPr>
           <w:p>
             <w:pPr>
               <w:jc w:val="left"/>
@@ -14419,9 +14460,7 @@
       </w:tr>
       <w:tr>
         <w:tc>
-          <w:tcPr>
-            <w:shd w:val="clear" w:color="auto" w:fill="F6F8FA"/>
-          </w:tcPr>
+          <w:tcPr/>
           <w:p>
             <w:pPr>
               <w:jc w:val="left"/>
@@ -14447,9 +14486,7 @@
           </w:p>
         </w:tc>
         <w:tc>
-          <w:tcPr>
-            <w:shd w:val="clear" w:color="auto" w:fill="F6F8FA"/>
-          </w:tcPr>
+          <w:tcPr/>
           <w:p>
             <w:pPr>
               <w:jc w:val="left"/>
@@ -14460,9 +14497,7 @@
           </w:p>
         </w:tc>
         <w:tc>
-          <w:tcPr>
-            <w:shd w:val="clear" w:color="auto" w:fill="F6F8FA"/>
-          </w:tcPr>
+          <w:tcPr/>
           <w:p>
             <w:pPr>
               <w:jc w:val="left"/>
@@ -14475,7 +14510,9 @@
       </w:tr>
       <w:tr>
         <w:tc>
-          <w:tcPr/>
+          <w:tcPr>
+            <w:shd w:val="clear" w:color="auto" w:fill="F6F8FA"/>
+          </w:tcPr>
           <w:p>
             <w:pPr>
               <w:jc w:val="left"/>
@@ -14486,7 +14523,9 @@
           </w:p>
         </w:tc>
         <w:tc>
-          <w:tcPr/>
+          <w:tcPr>
+            <w:shd w:val="clear" w:color="auto" w:fill="F6F8FA"/>
+          </w:tcPr>
           <w:p>
             <w:pPr>
               <w:jc w:val="left"/>
@@ -14497,7 +14536,9 @@
           </w:p>
         </w:tc>
         <w:tc>
-          <w:tcPr/>
+          <w:tcPr>
+            <w:shd w:val="clear" w:color="auto" w:fill="F6F8FA"/>
+          </w:tcPr>
           <w:p>
             <w:pPr>
               <w:jc w:val="left"/>
@@ -14510,9 +14551,7 @@
       </w:tr>
       <w:tr>
         <w:tc>
-          <w:tcPr>
-            <w:shd w:val="clear" w:color="auto" w:fill="F6F8FA"/>
-          </w:tcPr>
+          <w:tcPr/>
           <w:p>
             <w:pPr>
               <w:jc w:val="left"/>
@@ -14523,9 +14562,7 @@
           </w:p>
         </w:tc>
         <w:tc>
-          <w:tcPr>
-            <w:shd w:val="clear" w:color="auto" w:fill="F6F8FA"/>
-          </w:tcPr>
+          <w:tcPr/>
           <w:p>
             <w:pPr>
               <w:jc w:val="left"/>
@@ -14536,9 +14573,7 @@
           </w:p>
         </w:tc>
         <w:tc>
-          <w:tcPr>
-            <w:shd w:val="clear" w:color="auto" w:fill="F6F8FA"/>
-          </w:tcPr>
+          <w:tcPr/>
           <w:p>
             <w:pPr>
               <w:jc w:val="left"/>
@@ -14551,7 +14586,9 @@
       </w:tr>
       <w:tr>
         <w:tc>
-          <w:tcPr/>
+          <w:tcPr>
+            <w:shd w:val="clear" w:color="auto" w:fill="F6F8FA"/>
+          </w:tcPr>
           <w:p>
             <w:pPr>
               <w:jc w:val="left"/>
@@ -14607,7 +14644,9 @@
           </w:p>
         </w:tc>
         <w:tc>
-          <w:tcPr/>
+          <w:tcPr>
+            <w:shd w:val="clear" w:color="auto" w:fill="F6F8FA"/>
+          </w:tcPr>
           <w:p>
             <w:pPr>
               <w:jc w:val="left"/>
@@ -14618,7 +14657,9 @@
           </w:p>
         </w:tc>
         <w:tc>
-          <w:tcPr/>
+          <w:tcPr>
+            <w:shd w:val="clear" w:color="auto" w:fill="F6F8FA"/>
+          </w:tcPr>
           <w:p>
             <w:pPr>
               <w:jc w:val="left"/>
@@ -14631,9 +14672,7 @@
       </w:tr>
       <w:tr>
         <w:tc>
-          <w:tcPr>
-            <w:shd w:val="clear" w:color="auto" w:fill="F6F8FA"/>
-          </w:tcPr>
+          <w:tcPr/>
           <w:p>
             <w:pPr>
               <w:jc w:val="left"/>
@@ -14689,9 +14728,7 @@
           </w:p>
         </w:tc>
         <w:tc>
-          <w:tcPr>
-            <w:shd w:val="clear" w:color="auto" w:fill="F6F8FA"/>
-          </w:tcPr>
+          <w:tcPr/>
           <w:p>
             <w:pPr>
               <w:jc w:val="left"/>
@@ -14702,9 +14739,7 @@
           </w:p>
         </w:tc>
         <w:tc>
-          <w:tcPr>
-            <w:shd w:val="clear" w:color="auto" w:fill="F6F8FA"/>
-          </w:tcPr>
+          <w:tcPr/>
           <w:p>
             <w:pPr>
               <w:jc w:val="left"/>
@@ -14717,7 +14752,9 @@
       </w:tr>
       <w:tr>
         <w:tc>
-          <w:tcPr/>
+          <w:tcPr>
+            <w:shd w:val="clear" w:color="auto" w:fill="F6F8FA"/>
+          </w:tcPr>
           <w:p>
             <w:pPr>
               <w:jc w:val="left"/>
@@ -14794,7 +14831,9 @@
           </w:p>
         </w:tc>
         <w:tc>
-          <w:tcPr/>
+          <w:tcPr>
+            <w:shd w:val="clear" w:color="auto" w:fill="F6F8FA"/>
+          </w:tcPr>
           <w:p>
             <w:pPr>
               <w:jc w:val="left"/>
@@ -14805,7 +14844,9 @@
           </w:p>
         </w:tc>
         <w:tc>
-          <w:tcPr/>
+          <w:tcPr>
+            <w:shd w:val="clear" w:color="auto" w:fill="F6F8FA"/>
+          </w:tcPr>
           <w:p>
             <w:pPr>
               <w:jc w:val="left"/>
@@ -14818,9 +14859,7 @@
       </w:tr>
       <w:tr>
         <w:tc>
-          <w:tcPr>
-            <w:shd w:val="clear" w:color="auto" w:fill="F6F8FA"/>
-          </w:tcPr>
+          <w:tcPr/>
           <w:p>
             <w:pPr>
               <w:jc w:val="left"/>
@@ -14858,9 +14897,7 @@
           </w:p>
         </w:tc>
         <w:tc>
-          <w:tcPr>
-            <w:shd w:val="clear" w:color="auto" w:fill="F6F8FA"/>
-          </w:tcPr>
+          <w:tcPr/>
           <w:p>
             <w:pPr>
               <w:jc w:val="left"/>
@@ -14886,9 +14923,7 @@
           </w:p>
         </w:tc>
         <w:tc>
-          <w:tcPr>
-            <w:shd w:val="clear" w:color="auto" w:fill="F6F8FA"/>
-          </w:tcPr>
+          <w:tcPr/>
           <w:p>
             <w:pPr>
               <w:jc w:val="left"/>
@@ -14901,7 +14936,9 @@
       </w:tr>
       <w:tr>
         <w:tc>
-          <w:tcPr/>
+          <w:tcPr>
+            <w:shd w:val="clear" w:color="auto" w:fill="F6F8FA"/>
+          </w:tcPr>
           <w:p>
             <w:pPr>
               <w:jc w:val="left"/>
@@ -14912,7 +14949,9 @@
           </w:p>
         </w:tc>
         <w:tc>
-          <w:tcPr/>
+          <w:tcPr>
+            <w:shd w:val="clear" w:color="auto" w:fill="F6F8FA"/>
+          </w:tcPr>
           <w:p>
             <w:pPr>
               <w:jc w:val="left"/>
@@ -14965,7 +15004,9 @@
           </w:p>
         </w:tc>
         <w:tc>
-          <w:tcPr/>
+          <w:tcPr>
+            <w:shd w:val="clear" w:color="auto" w:fill="F6F8FA"/>
+          </w:tcPr>
           <w:p>
             <w:pPr>
               <w:jc w:val="left"/>
@@ -14978,9 +15019,7 @@
       </w:tr>
       <w:tr>
         <w:tc>
-          <w:tcPr>
-            <w:shd w:val="clear" w:color="auto" w:fill="F6F8FA"/>
-          </w:tcPr>
+          <w:tcPr/>
           <w:p>
             <w:pPr>
               <w:jc w:val="left"/>
@@ -14991,9 +15030,7 @@
           </w:p>
         </w:tc>
         <w:tc>
-          <w:tcPr>
-            <w:shd w:val="clear" w:color="auto" w:fill="F6F8FA"/>
-          </w:tcPr>
+          <w:tcPr/>
           <w:p>
             <w:pPr>
               <w:jc w:val="left"/>
@@ -15016,9 +15053,7 @@
           </w:p>
         </w:tc>
         <w:tc>
-          <w:tcPr>
-            <w:shd w:val="clear" w:color="auto" w:fill="F6F8FA"/>
-          </w:tcPr>
+          <w:tcPr/>
           <w:p>
             <w:pPr>
               <w:jc w:val="left"/>
@@ -15031,7 +15066,9 @@
       </w:tr>
       <w:tr>
         <w:tc>
-          <w:tcPr/>
+          <w:tcPr>
+            <w:shd w:val="clear" w:color="auto" w:fill="F6F8FA"/>
+          </w:tcPr>
           <w:p>
             <w:pPr>
               <w:jc w:val="left"/>
@@ -15042,7 +15079,9 @@
           </w:p>
         </w:tc>
         <w:tc>
-          <w:tcPr/>
+          <w:tcPr>
+            <w:shd w:val="clear" w:color="auto" w:fill="F6F8FA"/>
+          </w:tcPr>
           <w:p>
             <w:pPr>
               <w:jc w:val="left"/>
@@ -15140,7 +15179,9 @@
           </w:p>
         </w:tc>
         <w:tc>
-          <w:tcPr/>
+          <w:tcPr>
+            <w:shd w:val="clear" w:color="auto" w:fill="F6F8FA"/>
+          </w:tcPr>
           <w:p>
             <w:pPr>
               <w:jc w:val="left"/>
@@ -15153,9 +15194,7 @@
       </w:tr>
       <w:tr>
         <w:tc>
-          <w:tcPr>
-            <w:shd w:val="clear" w:color="auto" w:fill="F6F8FA"/>
-          </w:tcPr>
+          <w:tcPr/>
           <w:p>
             <w:pPr>
               <w:jc w:val="left"/>
@@ -15166,9 +15205,7 @@
           </w:p>
         </w:tc>
         <w:tc>
-          <w:tcPr>
-            <w:shd w:val="clear" w:color="auto" w:fill="F6F8FA"/>
-          </w:tcPr>
+          <w:tcPr/>
           <w:p>
             <w:pPr>
               <w:jc w:val="left"/>
@@ -15179,9 +15216,7 @@
           </w:p>
         </w:tc>
         <w:tc>
-          <w:tcPr>
-            <w:shd w:val="clear" w:color="auto" w:fill="F6F8FA"/>
-          </w:tcPr>
+          <w:tcPr/>
           <w:p>
             <w:pPr>
               <w:jc w:val="left"/>
@@ -15194,7 +15229,9 @@
       </w:tr>
       <w:tr>
         <w:tc>
-          <w:tcPr/>
+          <w:tcPr>
+            <w:shd w:val="clear" w:color="auto" w:fill="F6F8FA"/>
+          </w:tcPr>
           <w:p>
             <w:pPr>
               <w:jc w:val="left"/>
@@ -15205,7 +15242,9 @@
           </w:p>
         </w:tc>
         <w:tc>
-          <w:tcPr/>
+          <w:tcPr>
+            <w:shd w:val="clear" w:color="auto" w:fill="F6F8FA"/>
+          </w:tcPr>
           <w:p>
             <w:pPr>
               <w:jc w:val="left"/>
@@ -15255,7 +15294,9 @@
           </w:p>
         </w:tc>
         <w:tc>
-          <w:tcPr/>
+          <w:tcPr>
+            <w:shd w:val="clear" w:color="auto" w:fill="F6F8FA"/>
+          </w:tcPr>
           <w:p>
             <w:pPr>
               <w:jc w:val="left"/>
@@ -15268,9 +15309,7 @@
       </w:tr>
       <w:tr>
         <w:tc>
-          <w:tcPr>
-            <w:shd w:val="clear" w:color="auto" w:fill="F6F8FA"/>
-          </w:tcPr>
+          <w:tcPr/>
           <w:p>
             <w:pPr>
               <w:jc w:val="left"/>
@@ -15281,9 +15320,7 @@
           </w:p>
         </w:tc>
         <w:tc>
-          <w:tcPr>
-            <w:shd w:val="clear" w:color="auto" w:fill="F6F8FA"/>
-          </w:tcPr>
+          <w:tcPr/>
           <w:p>
             <w:pPr>
               <w:jc w:val="left"/>
@@ -15336,9 +15373,7 @@
           </w:p>
         </w:tc>
         <w:tc>
-          <w:tcPr>
-            <w:shd w:val="clear" w:color="auto" w:fill="F6F8FA"/>
-          </w:tcPr>
+          <w:tcPr/>
           <w:p>
             <w:pPr>
               <w:jc w:val="left"/>
@@ -15351,7 +15386,9 @@
       </w:tr>
       <w:tr>
         <w:tc>
-          <w:tcPr/>
+          <w:tcPr>
+            <w:shd w:val="clear" w:color="auto" w:fill="F6F8FA"/>
+          </w:tcPr>
           <w:p>
             <w:pPr>
               <w:jc w:val="left"/>
@@ -15362,7 +15399,9 @@
           </w:p>
         </w:tc>
         <w:tc>
-          <w:tcPr/>
+          <w:tcPr>
+            <w:shd w:val="clear" w:color="auto" w:fill="F6F8FA"/>
+          </w:tcPr>
           <w:p>
             <w:pPr>
               <w:jc w:val="left"/>
@@ -15373,7 +15412,9 @@
           </w:p>
         </w:tc>
         <w:tc>
-          <w:tcPr/>
+          <w:tcPr>
+            <w:shd w:val="clear" w:color="auto" w:fill="F6F8FA"/>
+          </w:tcPr>
           <w:p>
             <w:pPr>
               <w:jc w:val="left"/>
@@ -15386,9 +15427,7 @@
       </w:tr>
       <w:tr>
         <w:tc>
-          <w:tcPr>
-            <w:shd w:val="clear" w:color="auto" w:fill="F6F8FA"/>
-          </w:tcPr>
+          <w:tcPr/>
           <w:p>
             <w:pPr>
               <w:jc w:val="left"/>
@@ -15399,9 +15438,7 @@
           </w:p>
         </w:tc>
         <w:tc>
-          <w:tcPr>
-            <w:shd w:val="clear" w:color="auto" w:fill="F6F8FA"/>
-          </w:tcPr>
+          <w:tcPr/>
           <w:p>
             <w:pPr>
               <w:jc w:val="left"/>
@@ -15412,9 +15449,7 @@
           </w:p>
         </w:tc>
         <w:tc>
-          <w:tcPr>
-            <w:shd w:val="clear" w:color="auto" w:fill="F6F8FA"/>
-          </w:tcPr>
+          <w:tcPr/>
           <w:p>
             <w:pPr>
               <w:jc w:val="left"/>
@@ -15427,7 +15462,9 @@
       </w:tr>
       <w:tr>
         <w:tc>
-          <w:tcPr/>
+          <w:tcPr>
+            <w:shd w:val="clear" w:color="auto" w:fill="F6F8FA"/>
+          </w:tcPr>
           <w:p>
             <w:pPr>
               <w:jc w:val="left"/>
@@ -15438,7 +15475,9 @@
           </w:p>
         </w:tc>
         <w:tc>
-          <w:tcPr/>
+          <w:tcPr>
+            <w:shd w:val="clear" w:color="auto" w:fill="F6F8FA"/>
+          </w:tcPr>
           <w:p>
             <w:pPr>
               <w:jc w:val="left"/>
@@ -15449,7 +15488,9 @@
           </w:p>
         </w:tc>
         <w:tc>
-          <w:tcPr/>
+          <w:tcPr>
+            <w:shd w:val="clear" w:color="auto" w:fill="F6F8FA"/>
+          </w:tcPr>
           <w:p>
             <w:pPr>
               <w:jc w:val="left"/>
@@ -15462,9 +15503,7 @@
       </w:tr>
       <w:tr>
         <w:tc>
-          <w:tcPr>
-            <w:shd w:val="clear" w:color="auto" w:fill="F6F8FA"/>
-          </w:tcPr>
+          <w:tcPr/>
           <w:p>
             <w:pPr>
               <w:jc w:val="left"/>
@@ -15475,9 +15514,7 @@
           </w:p>
         </w:tc>
         <w:tc>
-          <w:tcPr>
-            <w:shd w:val="clear" w:color="auto" w:fill="F6F8FA"/>
-          </w:tcPr>
+          <w:tcPr/>
           <w:p>
             <w:pPr>
               <w:jc w:val="left"/>
@@ -15488,9 +15525,7 @@
           </w:p>
         </w:tc>
         <w:tc>
-          <w:tcPr>
-            <w:shd w:val="clear" w:color="auto" w:fill="F6F8FA"/>
-          </w:tcPr>
+          <w:tcPr/>
           <w:p>
             <w:pPr>
               <w:jc w:val="left"/>
@@ -15503,7 +15538,9 @@
       </w:tr>
       <w:tr>
         <w:tc>
-          <w:tcPr/>
+          <w:tcPr>
+            <w:shd w:val="clear" w:color="auto" w:fill="F6F8FA"/>
+          </w:tcPr>
           <w:p>
             <w:pPr>
               <w:jc w:val="left"/>
@@ -15514,7 +15551,9 @@
           </w:p>
         </w:tc>
         <w:tc>
-          <w:tcPr/>
+          <w:tcPr>
+            <w:shd w:val="clear" w:color="auto" w:fill="F6F8FA"/>
+          </w:tcPr>
           <w:p>
             <w:pPr>
               <w:jc w:val="left"/>
@@ -15534,7 +15573,9 @@
           </w:p>
         </w:tc>
         <w:tc>
-          <w:tcPr/>
+          <w:tcPr>
+            <w:shd w:val="clear" w:color="auto" w:fill="F6F8FA"/>
+          </w:tcPr>
           <w:p>
             <w:pPr>
               <w:jc w:val="left"/>
@@ -15547,9 +15588,7 @@
       </w:tr>
       <w:tr>
         <w:tc>
-          <w:tcPr>
-            <w:shd w:val="clear" w:color="auto" w:fill="F6F8FA"/>
-          </w:tcPr>
+          <w:tcPr/>
           <w:p>
             <w:pPr>
               <w:jc w:val="left"/>
@@ -15560,9 +15599,7 @@
           </w:p>
         </w:tc>
         <w:tc>
-          <w:tcPr>
-            <w:shd w:val="clear" w:color="auto" w:fill="F6F8FA"/>
-          </w:tcPr>
+          <w:tcPr/>
           <w:p>
             <w:pPr>
               <w:jc w:val="left"/>
@@ -15573,9 +15610,7 @@
           </w:p>
         </w:tc>
         <w:tc>
-          <w:tcPr>
-            <w:shd w:val="clear" w:color="auto" w:fill="F6F8FA"/>
-          </w:tcPr>
+          <w:tcPr/>
           <w:p>
             <w:pPr>
               <w:jc w:val="left"/>
@@ -15588,7 +15623,9 @@
       </w:tr>
       <w:tr>
         <w:tc>
-          <w:tcPr/>
+          <w:tcPr>
+            <w:shd w:val="clear" w:color="auto" w:fill="F6F8FA"/>
+          </w:tcPr>
           <w:p>
             <w:pPr>
               <w:jc w:val="left"/>
@@ -15599,7 +15636,9 @@
           </w:p>
         </w:tc>
         <w:tc>
-          <w:tcPr/>
+          <w:tcPr>
+            <w:shd w:val="clear" w:color="auto" w:fill="F6F8FA"/>
+          </w:tcPr>
           <w:p>
             <w:pPr>
               <w:jc w:val="left"/>
@@ -15610,7 +15649,9 @@
           </w:p>
         </w:tc>
         <w:tc>
-          <w:tcPr/>
+          <w:tcPr>
+            <w:shd w:val="clear" w:color="auto" w:fill="F6F8FA"/>
+          </w:tcPr>
           <w:p>
             <w:pPr>
               <w:jc w:val="left"/>
@@ -15623,9 +15664,7 @@
       </w:tr>
       <w:tr>
         <w:tc>
-          <w:tcPr>
-            <w:shd w:val="clear" w:color="auto" w:fill="F6F8FA"/>
-          </w:tcPr>
+          <w:tcPr/>
           <w:p>
             <w:pPr>
               <w:jc w:val="left"/>
@@ -15636,9 +15675,7 @@
           </w:p>
         </w:tc>
         <w:tc>
-          <w:tcPr>
-            <w:shd w:val="clear" w:color="auto" w:fill="F6F8FA"/>
-          </w:tcPr>
+          <w:tcPr/>
           <w:p>
             <w:pPr>
               <w:jc w:val="left"/>
@@ -15649,9 +15686,7 @@
           </w:p>
         </w:tc>
         <w:tc>
-          <w:tcPr>
-            <w:shd w:val="clear" w:color="auto" w:fill="F6F8FA"/>
-          </w:tcPr>
+          <w:tcPr/>
           <w:p>
             <w:pPr>
               <w:jc w:val="left"/>
@@ -15664,7 +15699,9 @@
       </w:tr>
       <w:tr>
         <w:tc>
-          <w:tcPr/>
+          <w:tcPr>
+            <w:shd w:val="clear" w:color="auto" w:fill="F6F8FA"/>
+          </w:tcPr>
           <w:p>
             <w:pPr>
               <w:jc w:val="left"/>
@@ -15675,7 +15712,9 @@
           </w:p>
         </w:tc>
         <w:tc>
-          <w:tcPr/>
+          <w:tcPr>
+            <w:shd w:val="clear" w:color="auto" w:fill="F6F8FA"/>
+          </w:tcPr>
           <w:p>
             <w:pPr>
               <w:jc w:val="left"/>
@@ -15686,7 +15725,9 @@
           </w:p>
         </w:tc>
         <w:tc>
-          <w:tcPr/>
+          <w:tcPr>
+            <w:shd w:val="clear" w:color="auto" w:fill="F6F8FA"/>
+          </w:tcPr>
           <w:p>
             <w:pPr>
               <w:jc w:val="left"/>
@@ -15699,9 +15740,7 @@
       </w:tr>
       <w:tr>
         <w:tc>
-          <w:tcPr>
-            <w:shd w:val="clear" w:color="auto" w:fill="F6F8FA"/>
-          </w:tcPr>
+          <w:tcPr/>
           <w:p>
             <w:pPr>
               <w:jc w:val="left"/>
@@ -15712,9 +15751,7 @@
           </w:p>
         </w:tc>
         <w:tc>
-          <w:tcPr>
-            <w:shd w:val="clear" w:color="auto" w:fill="F6F8FA"/>
-          </w:tcPr>
+          <w:tcPr/>
           <w:p>
             <w:pPr>
               <w:jc w:val="left"/>
@@ -15725,9 +15762,7 @@
           </w:p>
         </w:tc>
         <w:tc>
-          <w:tcPr>
-            <w:shd w:val="clear" w:color="auto" w:fill="F6F8FA"/>
-          </w:tcPr>
+          <w:tcPr/>
           <w:p>
             <w:pPr>
               <w:jc w:val="left"/>
@@ -15740,7 +15775,9 @@
       </w:tr>
       <w:tr>
         <w:tc>
-          <w:tcPr/>
+          <w:tcPr>
+            <w:shd w:val="clear" w:color="auto" w:fill="F6F8FA"/>
+          </w:tcPr>
           <w:p>
             <w:pPr>
               <w:jc w:val="left"/>
@@ -15751,7 +15788,9 @@
           </w:p>
         </w:tc>
         <w:tc>
-          <w:tcPr/>
+          <w:tcPr>
+            <w:shd w:val="clear" w:color="auto" w:fill="F6F8FA"/>
+          </w:tcPr>
           <w:p>
             <w:pPr>
               <w:jc w:val="left"/>
@@ -15762,7 +15801,9 @@
           </w:p>
         </w:tc>
         <w:tc>
-          <w:tcPr/>
+          <w:tcPr>
+            <w:shd w:val="clear" w:color="auto" w:fill="F6F8FA"/>
+          </w:tcPr>
           <w:p>
             <w:pPr>
               <w:jc w:val="left"/>
@@ -15775,9 +15816,7 @@
       </w:tr>
       <w:tr>
         <w:tc>
-          <w:tcPr>
-            <w:shd w:val="clear" w:color="auto" w:fill="F6F8FA"/>
-          </w:tcPr>
+          <w:tcPr/>
           <w:p>
             <w:pPr>
               <w:jc w:val="left"/>
@@ -15788,9 +15827,7 @@
           </w:p>
         </w:tc>
         <w:tc>
-          <w:tcPr>
-            <w:shd w:val="clear" w:color="auto" w:fill="F6F8FA"/>
-          </w:tcPr>
+          <w:tcPr/>
           <w:p>
             <w:pPr>
               <w:jc w:val="left"/>
@@ -15801,9 +15838,7 @@
           </w:p>
         </w:tc>
         <w:tc>
-          <w:tcPr>
-            <w:shd w:val="clear" w:color="auto" w:fill="F6F8FA"/>
-          </w:tcPr>
+          <w:tcPr/>
           <w:p>
             <w:pPr>
               <w:jc w:val="left"/>
@@ -15816,7 +15851,9 @@
       </w:tr>
       <w:tr>
         <w:tc>
-          <w:tcPr/>
+          <w:tcPr>
+            <w:shd w:val="clear" w:color="auto" w:fill="F6F8FA"/>
+          </w:tcPr>
           <w:p>
             <w:pPr>
               <w:jc w:val="left"/>
@@ -15827,7 +15864,9 @@
           </w:p>
         </w:tc>
         <w:tc>
-          <w:tcPr/>
+          <w:tcPr>
+            <w:shd w:val="clear" w:color="auto" w:fill="F6F8FA"/>
+          </w:tcPr>
           <w:p>
             <w:pPr>
               <w:jc w:val="left"/>
@@ -15838,7 +15877,9 @@
           </w:p>
         </w:tc>
         <w:tc>
-          <w:tcPr/>
+          <w:tcPr>
+            <w:shd w:val="clear" w:color="auto" w:fill="F6F8FA"/>
+          </w:tcPr>
           <w:p>
             <w:pPr>
               <w:jc w:val="left"/>
@@ -15851,9 +15892,7 @@
       </w:tr>
       <w:tr>
         <w:tc>
-          <w:tcPr>
-            <w:shd w:val="clear" w:color="auto" w:fill="F6F8FA"/>
-          </w:tcPr>
+          <w:tcPr/>
           <w:p>
             <w:pPr>
               <w:jc w:val="left"/>
@@ -15864,9 +15903,7 @@
           </w:p>
         </w:tc>
         <w:tc>
-          <w:tcPr>
-            <w:shd w:val="clear" w:color="auto" w:fill="F6F8FA"/>
-          </w:tcPr>
+          <w:tcPr/>
           <w:p>
             <w:pPr>
               <w:jc w:val="left"/>
@@ -15877,9 +15914,7 @@
           </w:p>
         </w:tc>
         <w:tc>
-          <w:tcPr>
-            <w:shd w:val="clear" w:color="auto" w:fill="F6F8FA"/>
-          </w:tcPr>
+          <w:tcPr/>
           <w:p>
             <w:pPr>
               <w:jc w:val="left"/>
@@ -15892,7 +15927,9 @@
       </w:tr>
       <w:tr>
         <w:tc>
-          <w:tcPr/>
+          <w:tcPr>
+            <w:shd w:val="clear" w:color="auto" w:fill="F6F8FA"/>
+          </w:tcPr>
           <w:p>
             <w:pPr>
               <w:jc w:val="left"/>
@@ -15903,7 +15940,9 @@
           </w:p>
         </w:tc>
         <w:tc>
-          <w:tcPr/>
+          <w:tcPr>
+            <w:shd w:val="clear" w:color="auto" w:fill="F6F8FA"/>
+          </w:tcPr>
           <w:p>
             <w:pPr>
               <w:jc w:val="left"/>
@@ -15914,7 +15953,9 @@
           </w:p>
         </w:tc>
         <w:tc>
-          <w:tcPr/>
+          <w:tcPr>
+            <w:shd w:val="clear" w:color="auto" w:fill="F6F8FA"/>
+          </w:tcPr>
           <w:p>
             <w:pPr>
               <w:jc w:val="left"/>
@@ -15927,9 +15968,7 @@
       </w:tr>
       <w:tr>
         <w:tc>
-          <w:tcPr>
-            <w:shd w:val="clear" w:color="auto" w:fill="F6F8FA"/>
-          </w:tcPr>
+          <w:tcPr/>
           <w:p>
             <w:pPr>
               <w:jc w:val="left"/>
@@ -15940,9 +15979,7 @@
           </w:p>
         </w:tc>
         <w:tc>
-          <w:tcPr>
-            <w:shd w:val="clear" w:color="auto" w:fill="F6F8FA"/>
-          </w:tcPr>
+          <w:tcPr/>
           <w:p>
             <w:pPr>
               <w:jc w:val="left"/>
@@ -15953,9 +15990,7 @@
           </w:p>
         </w:tc>
         <w:tc>
-          <w:tcPr>
-            <w:shd w:val="clear" w:color="auto" w:fill="F6F8FA"/>
-          </w:tcPr>
+          <w:tcPr/>
           <w:p>
             <w:pPr>
               <w:jc w:val="left"/>
@@ -15968,7 +16003,9 @@
       </w:tr>
       <w:tr>
         <w:tc>
-          <w:tcPr/>
+          <w:tcPr>
+            <w:shd w:val="clear" w:color="auto" w:fill="F6F8FA"/>
+          </w:tcPr>
           <w:p>
             <w:pPr>
               <w:jc w:val="left"/>
@@ -15979,7 +16016,9 @@
           </w:p>
         </w:tc>
         <w:tc>
-          <w:tcPr/>
+          <w:tcPr>
+            <w:shd w:val="clear" w:color="auto" w:fill="F6F8FA"/>
+          </w:tcPr>
           <w:p>
             <w:pPr>
               <w:jc w:val="left"/>
@@ -15990,7 +16029,9 @@
           </w:p>
         </w:tc>
         <w:tc>
-          <w:tcPr/>
+          <w:tcPr>
+            <w:shd w:val="clear" w:color="auto" w:fill="F6F8FA"/>
+          </w:tcPr>
           <w:p>
             <w:pPr>
               <w:jc w:val="left"/>
@@ -16003,9 +16044,7 @@
       </w:tr>
       <w:tr>
         <w:tc>
-          <w:tcPr>
-            <w:shd w:val="clear" w:color="auto" w:fill="F6F8FA"/>
-          </w:tcPr>
+          <w:tcPr/>
           <w:p>
             <w:pPr>
               <w:jc w:val="left"/>
@@ -16016,9 +16055,7 @@
           </w:p>
         </w:tc>
         <w:tc>
-          <w:tcPr>
-            <w:shd w:val="clear" w:color="auto" w:fill="F6F8FA"/>
-          </w:tcPr>
+          <w:tcPr/>
           <w:p>
             <w:pPr>
               <w:jc w:val="left"/>
@@ -16029,9 +16066,7 @@
           </w:p>
         </w:tc>
         <w:tc>
-          <w:tcPr>
-            <w:shd w:val="clear" w:color="auto" w:fill="F6F8FA"/>
-          </w:tcPr>
+          <w:tcPr/>
           <w:p>
             <w:pPr>
               <w:jc w:val="left"/>
@@ -16044,7 +16079,9 @@
       </w:tr>
       <w:tr>
         <w:tc>
-          <w:tcPr/>
+          <w:tcPr>
+            <w:shd w:val="clear" w:color="auto" w:fill="F6F8FA"/>
+          </w:tcPr>
           <w:p>
             <w:pPr>
               <w:jc w:val="left"/>
@@ -16055,7 +16092,9 @@
           </w:p>
         </w:tc>
         <w:tc>
-          <w:tcPr/>
+          <w:tcPr>
+            <w:shd w:val="clear" w:color="auto" w:fill="F6F8FA"/>
+          </w:tcPr>
           <w:p>
             <w:pPr>
               <w:jc w:val="left"/>
@@ -16072,7 +16111,9 @@
           </w:p>
         </w:tc>
         <w:tc>
-          <w:tcPr/>
+          <w:tcPr>
+            <w:shd w:val="clear" w:color="auto" w:fill="F6F8FA"/>
+          </w:tcPr>
           <w:p>
             <w:pPr>
               <w:jc w:val="left"/>
@@ -16085,9 +16126,7 @@
       </w:tr>
       <w:tr>
         <w:tc>
-          <w:tcPr>
-            <w:shd w:val="clear" w:color="auto" w:fill="F6F8FA"/>
-          </w:tcPr>
+          <w:tcPr/>
           <w:p>
             <w:pPr>
               <w:jc w:val="left"/>
@@ -16098,9 +16137,7 @@
           </w:p>
         </w:tc>
         <w:tc>
-          <w:tcPr>
-            <w:shd w:val="clear" w:color="auto" w:fill="F6F8FA"/>
-          </w:tcPr>
+          <w:tcPr/>
           <w:p>
             <w:pPr>
               <w:jc w:val="left"/>
@@ -16117,9 +16154,7 @@
           </w:p>
         </w:tc>
         <w:tc>
-          <w:tcPr>
-            <w:shd w:val="clear" w:color="auto" w:fill="F6F8FA"/>
-          </w:tcPr>
+          <w:tcPr/>
           <w:p>
             <w:pPr>
               <w:jc w:val="left"/>
@@ -16132,7 +16167,9 @@
       </w:tr>
       <w:tr>
         <w:tc>
-          <w:tcPr/>
+          <w:tcPr>
+            <w:shd w:val="clear" w:color="auto" w:fill="F6F8FA"/>
+          </w:tcPr>
           <w:p>
             <w:pPr>
               <w:jc w:val="left"/>
@@ -16143,7 +16180,9 @@
           </w:p>
         </w:tc>
         <w:tc>
-          <w:tcPr/>
+          <w:tcPr>
+            <w:shd w:val="clear" w:color="auto" w:fill="F6F8FA"/>
+          </w:tcPr>
           <w:p>
             <w:pPr>
               <w:jc w:val="left"/>
@@ -16154,7 +16193,9 @@
           </w:p>
         </w:tc>
         <w:tc>
-          <w:tcPr/>
+          <w:tcPr>
+            <w:shd w:val="clear" w:color="auto" w:fill="F6F8FA"/>
+          </w:tcPr>
           <w:p>
             <w:pPr>
               <w:jc w:val="left"/>
@@ -16167,9 +16208,7 @@
       </w:tr>
       <w:tr>
         <w:tc>
-          <w:tcPr>
-            <w:shd w:val="clear" w:color="auto" w:fill="F6F8FA"/>
-          </w:tcPr>
+          <w:tcPr/>
           <w:p>
             <w:pPr>
               <w:jc w:val="left"/>
@@ -16180,9 +16219,7 @@
           </w:p>
         </w:tc>
         <w:tc>
-          <w:tcPr>
-            <w:shd w:val="clear" w:color="auto" w:fill="F6F8FA"/>
-          </w:tcPr>
+          <w:tcPr/>
           <w:p>
             <w:pPr>
               <w:jc w:val="left"/>
@@ -16253,9 +16290,7 @@
           </w:p>
         </w:tc>
         <w:tc>
-          <w:tcPr>
-            <w:shd w:val="clear" w:color="auto" w:fill="F6F8FA"/>
-          </w:tcPr>
+          <w:tcPr/>
           <w:p>
             <w:pPr>
               <w:jc w:val="left"/>
@@ -16268,7 +16303,9 @@
       </w:tr>
       <w:tr>
         <w:tc>
-          <w:tcPr/>
+          <w:tcPr>
+            <w:shd w:val="clear" w:color="auto" w:fill="F6F8FA"/>
+          </w:tcPr>
           <w:p>
             <w:pPr>
               <w:jc w:val="left"/>
@@ -16279,7 +16316,9 @@
           </w:p>
         </w:tc>
         <w:tc>
-          <w:tcPr/>
+          <w:tcPr>
+            <w:shd w:val="clear" w:color="auto" w:fill="F6F8FA"/>
+          </w:tcPr>
           <w:p>
             <w:pPr>
               <w:jc w:val="left"/>
@@ -16302,7 +16341,9 @@
           </w:p>
         </w:tc>
         <w:tc>
-          <w:tcPr/>
+          <w:tcPr>
+            <w:shd w:val="clear" w:color="auto" w:fill="F6F8FA"/>
+          </w:tcPr>
           <w:p>
             <w:pPr>
               <w:jc w:val="left"/>
@@ -16315,9 +16356,7 @@
       </w:tr>
       <w:tr>
         <w:tc>
-          <w:tcPr>
-            <w:shd w:val="clear" w:color="auto" w:fill="F6F8FA"/>
-          </w:tcPr>
+          <w:tcPr/>
           <w:p>
             <w:pPr>
               <w:jc w:val="left"/>
@@ -16328,9 +16367,7 @@
           </w:p>
         </w:tc>
         <w:tc>
-          <w:tcPr>
-            <w:shd w:val="clear" w:color="auto" w:fill="F6F8FA"/>
-          </w:tcPr>
+          <w:tcPr/>
           <w:p>
             <w:pPr>
               <w:jc w:val="left"/>
@@ -16347,9 +16384,7 @@
           </w:p>
         </w:tc>
         <w:tc>
-          <w:tcPr>
-            <w:shd w:val="clear" w:color="auto" w:fill="F6F8FA"/>
-          </w:tcPr>
+          <w:tcPr/>
           <w:p>
             <w:pPr>
               <w:jc w:val="left"/>
@@ -16362,7 +16397,9 @@
       </w:tr>
       <w:tr>
         <w:tc>
-          <w:tcPr/>
+          <w:tcPr>
+            <w:shd w:val="clear" w:color="auto" w:fill="F6F8FA"/>
+          </w:tcPr>
           <w:p>
             <w:pPr>
               <w:jc w:val="left"/>
@@ -16373,7 +16410,9 @@
           </w:p>
         </w:tc>
         <w:tc>
-          <w:tcPr/>
+          <w:tcPr>
+            <w:shd w:val="clear" w:color="auto" w:fill="F6F8FA"/>
+          </w:tcPr>
           <w:p>
             <w:pPr>
               <w:jc w:val="left"/>
@@ -16384,7 +16423,9 @@
           </w:p>
         </w:tc>
         <w:tc>
-          <w:tcPr/>
+          <w:tcPr>
+            <w:shd w:val="clear" w:color="auto" w:fill="F6F8FA"/>
+          </w:tcPr>
           <w:p>
             <w:pPr>
               <w:jc w:val="left"/>
@@ -16397,9 +16438,7 @@
       </w:tr>
       <w:tr>
         <w:tc>
-          <w:tcPr>
-            <w:shd w:val="clear" w:color="auto" w:fill="F6F8FA"/>
-          </w:tcPr>
+          <w:tcPr/>
           <w:p>
             <w:pPr>
               <w:jc w:val="left"/>
@@ -16410,9 +16449,7 @@
           </w:p>
         </w:tc>
         <w:tc>
-          <w:tcPr>
-            <w:shd w:val="clear" w:color="auto" w:fill="F6F8FA"/>
-          </w:tcPr>
+          <w:tcPr/>
           <w:p>
             <w:pPr>
               <w:jc w:val="left"/>
@@ -16423,9 +16460,7 @@
           </w:p>
         </w:tc>
         <w:tc>
-          <w:tcPr>
-            <w:shd w:val="clear" w:color="auto" w:fill="F6F8FA"/>
-          </w:tcPr>
+          <w:tcPr/>
           <w:p>
             <w:pPr>
               <w:jc w:val="left"/>
@@ -16438,7 +16473,9 @@
       </w:tr>
       <w:tr>
         <w:tc>
-          <w:tcPr/>
+          <w:tcPr>
+            <w:shd w:val="clear" w:color="auto" w:fill="F6F8FA"/>
+          </w:tcPr>
           <w:p>
             <w:pPr>
               <w:jc w:val="left"/>
@@ -16449,7 +16486,9 @@
           </w:p>
         </w:tc>
         <w:tc>
-          <w:tcPr/>
+          <w:tcPr>
+            <w:shd w:val="clear" w:color="auto" w:fill="F6F8FA"/>
+          </w:tcPr>
           <w:p>
             <w:pPr>
               <w:jc w:val="left"/>
@@ -16466,7 +16505,9 @@
           </w:p>
         </w:tc>
         <w:tc>
-          <w:tcPr/>
+          <w:tcPr>
+            <w:shd w:val="clear" w:color="auto" w:fill="F6F8FA"/>
+          </w:tcPr>
           <w:p>
             <w:pPr>
               <w:jc w:val="left"/>
@@ -16479,9 +16520,7 @@
       </w:tr>
       <w:tr>
         <w:tc>
-          <w:tcPr>
-            <w:shd w:val="clear" w:color="auto" w:fill="F6F8FA"/>
-          </w:tcPr>
+          <w:tcPr/>
           <w:p>
             <w:pPr>
               <w:jc w:val="left"/>
@@ -16492,9 +16531,7 @@
           </w:p>
         </w:tc>
         <w:tc>
-          <w:tcPr>
-            <w:shd w:val="clear" w:color="auto" w:fill="F6F8FA"/>
-          </w:tcPr>
+          <w:tcPr/>
           <w:p>
             <w:pPr>
               <w:jc w:val="left"/>
@@ -16617,9 +16654,7 @@
           </w:p>
         </w:tc>
         <w:tc>
-          <w:tcPr>
-            <w:shd w:val="clear" w:color="auto" w:fill="F6F8FA"/>
-          </w:tcPr>
+          <w:tcPr/>
           <w:p>
             <w:pPr>
               <w:jc w:val="left"/>
@@ -16632,7 +16667,9 @@
       </w:tr>
       <w:tr>
         <w:tc>
-          <w:tcPr/>
+          <w:tcPr>
+            <w:shd w:val="clear" w:color="auto" w:fill="F6F8FA"/>
+          </w:tcPr>
           <w:p>
             <w:pPr>
               <w:jc w:val="left"/>
@@ -16643,7 +16680,9 @@
           </w:p>
         </w:tc>
         <w:tc>
-          <w:tcPr/>
+          <w:tcPr>
+            <w:shd w:val="clear" w:color="auto" w:fill="F6F8FA"/>
+          </w:tcPr>
           <w:p>
             <w:pPr>
               <w:jc w:val="left"/>
@@ -16747,7 +16786,9 @@
           </w:p>
         </w:tc>
         <w:tc>
-          <w:tcPr/>
+          <w:tcPr>
+            <w:shd w:val="clear" w:color="auto" w:fill="F6F8FA"/>
+          </w:tcPr>
           <w:p>
             <w:pPr>
               <w:jc w:val="left"/>
@@ -18087,6 +18128,9 @@
       <w:pBdr>
         <w:bottom w:val="single" w:sz="12" w:space="1" w:color="C7000B"/>
       </w:pBdr>
+      <w:tabs>
+        <w:tab w:pos="9638" w:val="right"/>
+      </w:tabs>
       <w:spacing w:after="600" w:before="0"/>
       <w:outlineLvl w:val="0"/>
     </w:pPr>
@@ -18389,6 +18433,9 @@
   <w:style w:customStyle="1" w:styleId="SectionNumber" w:type="character">
     <w:name w:val="Section Number"/>
     <w:basedOn w:val="BodyTextChar"/>
+    <w:rPr>
+      <w:sz w:val="112"/>
+    </w:rPr>
   </w:style>
   <w:style w:styleId="FootnoteReference" w:type="character">
     <w:name w:val="Footnote Reference"/>

</xml_diff>

<commit_message>
Evidence bullets, native roman numbering, badge assets, signature breaks
- Evidence checklist: checkbox markers (\fbox/☐) removed from PDF and
  DOCX — plain bullets for compatibility (converter + pre-processor +
  SKILL.md updated; \checkbox retained for closing record)
- Activities: DOCX now uses Word native lower-roman numbering (i. ii.)
  via AsciiDoc [lowerroman] list style → docbook numeration → pandoc
- Badges: DOCX [PASS]/[FAIL]/... replaced with exact-replica PNG pill
  images (rounded, colored frame+bg, bold text) matching PDF
  \huaweibadge; 7 types committed to templates/_base/badge-assets/
  (generated by generate-badges.py with Pillow + HarmonyOS Sans Bold)
- Signatures: standalone + separators → trailing ' +' hard breaks
  (proper w:br line breaks, no literal + text)
- Version coupling: 4x cls + setup-guide → 6.5.0
</commit_message>
<xml_diff>
--- a/documents/setup-guide/setup-guide.docx
+++ b/documents/setup-guide/setup-guide.docx
@@ -84,7 +84,7 @@
           <w:b/>
           <w:sz w:val="24"/>
         </w:rPr>
-        <w:t xml:space="preserve">v6.4.7</w:t>
+        <w:t xml:space="preserve">v6.5.0</w:t>
       </w:r>
       <w:r>
         <w:rPr>
@@ -96,7 +96,7 @@
         <w:rPr>
           <w:sz w:val="24"/>
         </w:rPr>
-        <w:t xml:space="preserve">— September 20, 2026 00:32</w:t>
+        <w:t xml:space="preserve">— September 20, 2026 01:07</w:t>
       </w:r>
     </w:p>
     <w:sdt>
@@ -9934,10 +9934,40 @@
       <w:r>
         <w:rPr>
           <w:bCs/>
-          <w:rStyle w:val="BadgeNew"/>
           <w:b/>
         </w:rPr>
-        <w:t xml:space="preserve">[NEW]</w:t>
+        <w:drawing>
+          <wp:inline>
+            <wp:extent cx="453951" cy="198000"/>
+            <wp:docPr id="58" name="Picture 58"/>
+            <wp:cNvGraphicFramePr>
+              <a:graphicFrameLocks noChangeAspect="1"/>
+            </wp:cNvGraphicFramePr>
+            <a:graphic>
+              <a:graphicData uri="http://schemas.openxmlformats.org/drawingml/2006/picture">
+                <pic:pic>
+                  <pic:nvPicPr>
+                    <pic:cNvPr id="0" name="badge-NEW.png"/>
+                    <pic:cNvPicPr/>
+                  </pic:nvPicPr>
+                  <pic:blipFill>
+                    <a:blip r:embed="rId11"/>
+                    <a:stretch>
+                      <a:fillRect/>
+                    </a:stretch>
+                  </pic:blipFill>
+                  <pic:spPr>
+                    <a:xfrm>
+                      <a:off x="0" y="0"/>
+                      <a:ext cx="453951" cy="198000"/>
+                    </a:xfrm>
+                    <a:prstGeom prst="rect"/>
+                  </pic:spPr>
+                </pic:pic>
+              </a:graphicData>
+            </a:graphic>
+          </wp:inline>
+        </w:drawing>
       </w:r>
     </w:p>
     <w:p>
@@ -13345,7 +13375,7 @@
               <w:jc w:val="left"/>
             </w:pPr>
             <w:r>
-              <w:t xml:space="preserve">6.4.7</w:t>
+              <w:t xml:space="preserve">6.5.0</w:t>
             </w:r>
           </w:p>
         </w:tc>
@@ -13367,7 +13397,7 @@
               <w:jc w:val="left"/>
             </w:pPr>
             <w:r>
-              <w:t xml:space="preserve">Section titles in DOCX now match the PDF heading design: the big section number (56pt) sits on the left, the title text is pushed to the right edge (a right tab stop mimics the LaTeX \ hfill), and the red rule runs below — previously the title sat left-aligned next to a small number. Applies to all templates.</w:t>
+              <w:t xml:space="preserve">Evidence checklist simplified to plain bullets in both PDF and DOCX (checkbox markers removed for compatibility). Planned Activities list in DOCX now uses Word’s native lower-roman numbering (i., ii., iii.) matching the PDF. Badges in DOCX replaced with exact-replica PNG pill images (rounded, colored frame and background, bold text) matching the PDF \ huaweibadge look — assets committed to the repo. Signature blocks in DOCX no longer show literal + symbols (proper hard line breaks).</w:t>
             </w:r>
           </w:p>
         </w:tc>
@@ -13382,7 +13412,7 @@
               <w:jc w:val="left"/>
             </w:pPr>
             <w:r>
-              <w:t xml:space="preserve">6.4.6</w:t>
+              <w:t xml:space="preserve">6.4.7</w:t>
             </w:r>
           </w:p>
         </w:tc>
@@ -13408,7 +13438,7 @@
               <w:jc w:val="left"/>
             </w:pPr>
             <w:r>
-              <w:t xml:space="preserve">Code blocks inside test cases no longer break the red left rule in DOCX — the code style’s left indent (which jogged the rule) is reset inside test case blocks, and code blocks now show the PDF’s code box (gray background with thin border on top, bottom, and right, red rule continuing on the left).</w:t>
+              <w:t xml:space="preserve">Section titles in DOCX now match the PDF heading design: the big section number (56pt) sits on the left, the title text is pushed to the right edge (a right tab stop mimics the LaTeX \ hfill), and the red rule runs below — previously the title sat left-aligned next to a small number. Applies to all templates.</w:t>
             </w:r>
           </w:p>
         </w:tc>
@@ -13421,7 +13451,7 @@
               <w:jc w:val="left"/>
             </w:pPr>
             <w:r>
-              <w:t xml:space="preserve">6.4.5</w:t>
+              <w:t xml:space="preserve">6.4.6</w:t>
             </w:r>
           </w:p>
         </w:tc>
@@ -13443,7 +13473,7 @@
               <w:jc w:val="left"/>
             </w:pPr>
             <w:r>
-              <w:t xml:space="preserve">DOCX polish pass: all captions centered (matching the PDF), vertical spacing between blocks matched to the LaTeX rhythm (medskip/smallskip around captions, field bars, and steps), and test steps now render as separate paragraphs each with the red bold number (previously merged into one paragraph).</w:t>
+              <w:t xml:space="preserve">Code blocks inside test cases no longer break the red left rule in DOCX — the code style’s left indent (which jogged the rule) is reset inside test case blocks, and code blocks now show the PDF’s code box (gray background with thin border on top, bottom, and right, red rule continuing on the left).</w:t>
             </w:r>
           </w:p>
         </w:tc>
@@ -13458,7 +13488,7 @@
               <w:jc w:val="left"/>
             </w:pPr>
             <w:r>
-              <w:t xml:space="preserve">6.4.4</w:t>
+              <w:t xml:space="preserve">6.4.5</w:t>
             </w:r>
           </w:p>
         </w:tc>
@@ -13484,7 +13514,7 @@
               <w:jc w:val="left"/>
             </w:pPr>
             <w:r>
-              <w:t xml:space="preserve">DOCX covers now show the logo, cover text, and version/date/time meta line like the PDF. Test case blocks in DOCX get the PDF’s visual wrapper: red left rule, red field header bars, and red step numbers. Captions follow the PDF ordering system in DOCX, MD, and HTML (Table/Diagram/Figure/Testcase N: with bold symbol). Portuguese PDFs now label diagrams "Diagrama N:" (was hardcoded English "Diagram"). Markdown and HTML output no longer leaks raw LaTeX from passthrough blocks — the DOCX pre-processor now feeds those pipelines too.</w:t>
+              <w:t xml:space="preserve">DOCX polish pass: all captions centered (matching the PDF), vertical spacing between blocks matched to the LaTeX rhythm (medskip/smallskip around captions, field bars, and steps), and test steps now render as separate paragraphs each with the red bold number (previously merged into one paragraph).</w:t>
             </w:r>
           </w:p>
         </w:tc>
@@ -13497,7 +13527,7 @@
               <w:jc w:val="left"/>
             </w:pPr>
             <w:r>
-              <w:t xml:space="preserve">6.4.3</w:t>
+              <w:t xml:space="preserve">6.4.4</w:t>
             </w:r>
           </w:p>
         </w:tc>
@@ -13519,7 +13549,7 @@
               <w:jc w:val="left"/>
             </w:pPr>
             <w:r>
-              <w:t xml:space="preserve">Testbook and POC DOCX output now matches the PDF much more closely: native table of contents (language-aware, auto-populated), each section starts on a new page, embedded images and diagrams (PlantUML/Graphviz rendered), white-on-red table headers, cover version line under the title, centered test case captions, and plain black rules for signature grids.</w:t>
+              <w:t xml:space="preserve">DOCX covers now show the logo, cover text, and version/date/time meta line like the PDF. Test case blocks in DOCX get the PDF’s visual wrapper: red left rule, red field header bars, and red step numbers. Captions follow the PDF ordering system in DOCX, MD, and HTML (Table/Diagram/Figure/Testcase N: with bold symbol). Portuguese PDFs now label diagrams "Diagrama N:" (was hardcoded English "Diagram"). Markdown and HTML output no longer leaks raw LaTeX from passthrough blocks — the DOCX pre-processor now feeds those pipelines too.</w:t>
             </w:r>
           </w:p>
         </w:tc>
@@ -13534,7 +13564,7 @@
               <w:jc w:val="left"/>
             </w:pPr>
             <w:r>
-              <w:t xml:space="preserve">6.4.2</w:t>
+              <w:t xml:space="preserve">6.4.3</w:t>
             </w:r>
           </w:p>
         </w:tc>
@@ -13560,7 +13590,7 @@
               <w:jc w:val="left"/>
             </w:pPr>
             <w:r>
-              <w:t xml:space="preserve">DOCX output for POC and testbook templates now includes all passthrough content (stakeholders, closing record, signatures, test cases, test summary, changelog) via a new pre-processor. Fixed dropped Test Scope fields in testbook DOCX output.</w:t>
+              <w:t xml:space="preserve">Testbook and POC DOCX output now matches the PDF much more closely: native table of contents (language-aware, auto-populated), each section starts on a new page, embedded images and diagrams (PlantUML/Graphviz rendered), white-on-red table headers, cover version line under the title, centered test case captions, and plain black rules for signature grids.</w:t>
             </w:r>
           </w:p>
         </w:tc>
@@ -13573,12 +13603,51 @@
               <w:jc w:val="left"/>
             </w:pPr>
             <w:r>
+              <w:t xml:space="preserve">6.4.2</w:t>
+            </w:r>
+          </w:p>
+        </w:tc>
+        <w:tc>
+          <w:tcPr/>
+          <w:p>
+            <w:pPr>
+              <w:jc w:val="left"/>
+            </w:pPr>
+            <w:r>
+              <w:t xml:space="preserve">2026-09-20</w:t>
+            </w:r>
+          </w:p>
+        </w:tc>
+        <w:tc>
+          <w:tcPr/>
+          <w:p>
+            <w:pPr>
+              <w:jc w:val="left"/>
+            </w:pPr>
+            <w:r>
+              <w:t xml:space="preserve">DOCX output for POC and testbook templates now includes all passthrough content (stakeholders, closing record, signatures, test cases, test summary, changelog) via a new pre-processor. Fixed dropped Test Scope fields in testbook DOCX output.</w:t>
+            </w:r>
+          </w:p>
+        </w:tc>
+      </w:tr>
+      <w:tr>
+        <w:tc>
+          <w:tcPr>
+            <w:shd w:val="clear" w:color="auto" w:fill="F6F8FA"/>
+          </w:tcPr>
+          <w:p>
+            <w:pPr>
+              <w:jc w:val="left"/>
+            </w:pPr>
+            <w:r>
               <w:t xml:space="preserve">6.4.0</w:t>
             </w:r>
           </w:p>
         </w:tc>
         <w:tc>
-          <w:tcPr/>
+          <w:tcPr>
+            <w:shd w:val="clear" w:color="auto" w:fill="F6F8FA"/>
+          </w:tcPr>
           <w:p>
             <w:pPr>
               <w:jc w:val="left"/>
@@ -13589,7 +13658,9 @@
           </w:p>
         </w:tc>
         <w:tc>
-          <w:tcPr/>
+          <w:tcPr>
+            <w:shd w:val="clear" w:color="auto" w:fill="F6F8FA"/>
+          </w:tcPr>
           <w:p>
             <w:pPr>
               <w:jc w:val="left"/>
@@ -13617,9 +13688,7 @@
       </w:tr>
       <w:tr>
         <w:tc>
-          <w:tcPr>
-            <w:shd w:val="clear" w:color="auto" w:fill="F6F8FA"/>
-          </w:tcPr>
+          <w:tcPr/>
           <w:p>
             <w:pPr>
               <w:jc w:val="left"/>
@@ -13630,9 +13699,7 @@
           </w:p>
         </w:tc>
         <w:tc>
-          <w:tcPr>
-            <w:shd w:val="clear" w:color="auto" w:fill="F6F8FA"/>
-          </w:tcPr>
+          <w:tcPr/>
           <w:p>
             <w:pPr>
               <w:jc w:val="left"/>
@@ -13643,9 +13710,7 @@
           </w:p>
         </w:tc>
         <w:tc>
-          <w:tcPr>
-            <w:shd w:val="clear" w:color="auto" w:fill="F6F8FA"/>
-          </w:tcPr>
+          <w:tcPr/>
           <w:p>
             <w:pPr>
               <w:jc w:val="left"/>
@@ -13658,7 +13723,9 @@
       </w:tr>
       <w:tr>
         <w:tc>
-          <w:tcPr/>
+          <w:tcPr>
+            <w:shd w:val="clear" w:color="auto" w:fill="F6F8FA"/>
+          </w:tcPr>
           <w:p>
             <w:pPr>
               <w:jc w:val="left"/>
@@ -13669,7 +13736,9 @@
           </w:p>
         </w:tc>
         <w:tc>
-          <w:tcPr/>
+          <w:tcPr>
+            <w:shd w:val="clear" w:color="auto" w:fill="F6F8FA"/>
+          </w:tcPr>
           <w:p>
             <w:pPr>
               <w:jc w:val="left"/>
@@ -13680,7 +13749,9 @@
           </w:p>
         </w:tc>
         <w:tc>
-          <w:tcPr/>
+          <w:tcPr>
+            <w:shd w:val="clear" w:color="auto" w:fill="F6F8FA"/>
+          </w:tcPr>
           <w:p>
             <w:pPr>
               <w:jc w:val="left"/>
@@ -13693,9 +13764,7 @@
       </w:tr>
       <w:tr>
         <w:tc>
-          <w:tcPr>
-            <w:shd w:val="clear" w:color="auto" w:fill="F6F8FA"/>
-          </w:tcPr>
+          <w:tcPr/>
           <w:p>
             <w:pPr>
               <w:jc w:val="left"/>
@@ -13706,9 +13775,7 @@
           </w:p>
         </w:tc>
         <w:tc>
-          <w:tcPr>
-            <w:shd w:val="clear" w:color="auto" w:fill="F6F8FA"/>
-          </w:tcPr>
+          <w:tcPr/>
           <w:p>
             <w:pPr>
               <w:jc w:val="left"/>
@@ -13719,9 +13786,7 @@
           </w:p>
         </w:tc>
         <w:tc>
-          <w:tcPr>
-            <w:shd w:val="clear" w:color="auto" w:fill="F6F8FA"/>
-          </w:tcPr>
+          <w:tcPr/>
           <w:p>
             <w:pPr>
               <w:jc w:val="left"/>
@@ -13749,7 +13814,9 @@
       </w:tr>
       <w:tr>
         <w:tc>
-          <w:tcPr/>
+          <w:tcPr>
+            <w:shd w:val="clear" w:color="auto" w:fill="F6F8FA"/>
+          </w:tcPr>
           <w:p>
             <w:pPr>
               <w:jc w:val="left"/>
@@ -13760,7 +13827,9 @@
           </w:p>
         </w:tc>
         <w:tc>
-          <w:tcPr/>
+          <w:tcPr>
+            <w:shd w:val="clear" w:color="auto" w:fill="F6F8FA"/>
+          </w:tcPr>
           <w:p>
             <w:pPr>
               <w:jc w:val="left"/>
@@ -13771,7 +13840,9 @@
           </w:p>
         </w:tc>
         <w:tc>
-          <w:tcPr/>
+          <w:tcPr>
+            <w:shd w:val="clear" w:color="auto" w:fill="F6F8FA"/>
+          </w:tcPr>
           <w:p>
             <w:pPr>
               <w:jc w:val="left"/>
@@ -13784,9 +13855,7 @@
       </w:tr>
       <w:tr>
         <w:tc>
-          <w:tcPr>
-            <w:shd w:val="clear" w:color="auto" w:fill="F6F8FA"/>
-          </w:tcPr>
+          <w:tcPr/>
           <w:p>
             <w:pPr>
               <w:jc w:val="left"/>
@@ -13797,9 +13866,7 @@
           </w:p>
         </w:tc>
         <w:tc>
-          <w:tcPr>
-            <w:shd w:val="clear" w:color="auto" w:fill="F6F8FA"/>
-          </w:tcPr>
+          <w:tcPr/>
           <w:p>
             <w:pPr>
               <w:jc w:val="left"/>
@@ -13810,9 +13877,7 @@
           </w:p>
         </w:tc>
         <w:tc>
-          <w:tcPr>
-            <w:shd w:val="clear" w:color="auto" w:fill="F6F8FA"/>
-          </w:tcPr>
+          <w:tcPr/>
           <w:p>
             <w:pPr>
               <w:jc w:val="left"/>
@@ -13825,7 +13890,9 @@
       </w:tr>
       <w:tr>
         <w:tc>
-          <w:tcPr/>
+          <w:tcPr>
+            <w:shd w:val="clear" w:color="auto" w:fill="F6F8FA"/>
+          </w:tcPr>
           <w:p>
             <w:pPr>
               <w:jc w:val="left"/>
@@ -13836,7 +13903,9 @@
           </w:p>
         </w:tc>
         <w:tc>
-          <w:tcPr/>
+          <w:tcPr>
+            <w:shd w:val="clear" w:color="auto" w:fill="F6F8FA"/>
+          </w:tcPr>
           <w:p>
             <w:pPr>
               <w:jc w:val="left"/>
@@ -13847,7 +13916,9 @@
           </w:p>
         </w:tc>
         <w:tc>
-          <w:tcPr/>
+          <w:tcPr>
+            <w:shd w:val="clear" w:color="auto" w:fill="F6F8FA"/>
+          </w:tcPr>
           <w:p>
             <w:pPr>
               <w:jc w:val="left"/>
@@ -13914,9 +13985,7 @@
       </w:tr>
       <w:tr>
         <w:tc>
-          <w:tcPr>
-            <w:shd w:val="clear" w:color="auto" w:fill="F6F8FA"/>
-          </w:tcPr>
+          <w:tcPr/>
           <w:p>
             <w:pPr>
               <w:jc w:val="left"/>
@@ -13927,9 +13996,7 @@
           </w:p>
         </w:tc>
         <w:tc>
-          <w:tcPr>
-            <w:shd w:val="clear" w:color="auto" w:fill="F6F8FA"/>
-          </w:tcPr>
+          <w:tcPr/>
           <w:p>
             <w:pPr>
               <w:jc w:val="left"/>
@@ -13940,9 +14007,7 @@
           </w:p>
         </w:tc>
         <w:tc>
-          <w:tcPr>
-            <w:shd w:val="clear" w:color="auto" w:fill="F6F8FA"/>
-          </w:tcPr>
+          <w:tcPr/>
           <w:p>
             <w:pPr>
               <w:jc w:val="left"/>
@@ -13967,7 +14032,9 @@
       </w:tr>
       <w:tr>
         <w:tc>
-          <w:tcPr/>
+          <w:tcPr>
+            <w:shd w:val="clear" w:color="auto" w:fill="F6F8FA"/>
+          </w:tcPr>
           <w:p>
             <w:pPr>
               <w:jc w:val="left"/>
@@ -13978,7 +14045,9 @@
           </w:p>
         </w:tc>
         <w:tc>
-          <w:tcPr/>
+          <w:tcPr>
+            <w:shd w:val="clear" w:color="auto" w:fill="F6F8FA"/>
+          </w:tcPr>
           <w:p>
             <w:pPr>
               <w:jc w:val="left"/>
@@ -13989,7 +14058,9 @@
           </w:p>
         </w:tc>
         <w:tc>
-          <w:tcPr/>
+          <w:tcPr>
+            <w:shd w:val="clear" w:color="auto" w:fill="F6F8FA"/>
+          </w:tcPr>
           <w:p>
             <w:pPr>
               <w:jc w:val="left"/>
@@ -14002,9 +14073,7 @@
       </w:tr>
       <w:tr>
         <w:tc>
-          <w:tcPr>
-            <w:shd w:val="clear" w:color="auto" w:fill="F6F8FA"/>
-          </w:tcPr>
+          <w:tcPr/>
           <w:p>
             <w:pPr>
               <w:jc w:val="left"/>
@@ -14015,9 +14084,7 @@
           </w:p>
         </w:tc>
         <w:tc>
-          <w:tcPr>
-            <w:shd w:val="clear" w:color="auto" w:fill="F6F8FA"/>
-          </w:tcPr>
+          <w:tcPr/>
           <w:p>
             <w:pPr>
               <w:jc w:val="left"/>
@@ -14028,9 +14095,7 @@
           </w:p>
         </w:tc>
         <w:tc>
-          <w:tcPr>
-            <w:shd w:val="clear" w:color="auto" w:fill="F6F8FA"/>
-          </w:tcPr>
+          <w:tcPr/>
           <w:p>
             <w:pPr>
               <w:jc w:val="left"/>
@@ -14100,7 +14165,9 @@
       </w:tr>
       <w:tr>
         <w:tc>
-          <w:tcPr/>
+          <w:tcPr>
+            <w:shd w:val="clear" w:color="auto" w:fill="F6F8FA"/>
+          </w:tcPr>
           <w:p>
             <w:pPr>
               <w:jc w:val="left"/>
@@ -14111,7 +14178,9 @@
           </w:p>
         </w:tc>
         <w:tc>
-          <w:tcPr/>
+          <w:tcPr>
+            <w:shd w:val="clear" w:color="auto" w:fill="F6F8FA"/>
+          </w:tcPr>
           <w:p>
             <w:pPr>
               <w:jc w:val="left"/>
@@ -14122,7 +14191,9 @@
           </w:p>
         </w:tc>
         <w:tc>
-          <w:tcPr/>
+          <w:tcPr>
+            <w:shd w:val="clear" w:color="auto" w:fill="F6F8FA"/>
+          </w:tcPr>
           <w:p>
             <w:pPr>
               <w:jc w:val="left"/>
@@ -14135,9 +14206,7 @@
       </w:tr>
       <w:tr>
         <w:tc>
-          <w:tcPr>
-            <w:shd w:val="clear" w:color="auto" w:fill="F6F8FA"/>
-          </w:tcPr>
+          <w:tcPr/>
           <w:p>
             <w:pPr>
               <w:jc w:val="left"/>
@@ -14148,9 +14217,7 @@
           </w:p>
         </w:tc>
         <w:tc>
-          <w:tcPr>
-            <w:shd w:val="clear" w:color="auto" w:fill="F6F8FA"/>
-          </w:tcPr>
+          <w:tcPr/>
           <w:p>
             <w:pPr>
               <w:jc w:val="left"/>
@@ -14161,9 +14228,7 @@
           </w:p>
         </w:tc>
         <w:tc>
-          <w:tcPr>
-            <w:shd w:val="clear" w:color="auto" w:fill="F6F8FA"/>
-          </w:tcPr>
+          <w:tcPr/>
           <w:p>
             <w:pPr>
               <w:jc w:val="left"/>
@@ -14221,7 +14286,9 @@
       </w:tr>
       <w:tr>
         <w:tc>
-          <w:tcPr/>
+          <w:tcPr>
+            <w:shd w:val="clear" w:color="auto" w:fill="F6F8FA"/>
+          </w:tcPr>
           <w:p>
             <w:pPr>
               <w:jc w:val="left"/>
@@ -14232,7 +14299,9 @@
           </w:p>
         </w:tc>
         <w:tc>
-          <w:tcPr/>
+          <w:tcPr>
+            <w:shd w:val="clear" w:color="auto" w:fill="F6F8FA"/>
+          </w:tcPr>
           <w:p>
             <w:pPr>
               <w:jc w:val="left"/>
@@ -14243,7 +14312,9 @@
           </w:p>
         </w:tc>
         <w:tc>
-          <w:tcPr/>
+          <w:tcPr>
+            <w:shd w:val="clear" w:color="auto" w:fill="F6F8FA"/>
+          </w:tcPr>
           <w:p>
             <w:pPr>
               <w:jc w:val="left"/>
@@ -14298,9 +14369,7 @@
       </w:tr>
       <w:tr>
         <w:tc>
-          <w:tcPr>
-            <w:shd w:val="clear" w:color="auto" w:fill="F6F8FA"/>
-          </w:tcPr>
+          <w:tcPr/>
           <w:p>
             <w:pPr>
               <w:jc w:val="left"/>
@@ -14311,9 +14380,7 @@
           </w:p>
         </w:tc>
         <w:tc>
-          <w:tcPr>
-            <w:shd w:val="clear" w:color="auto" w:fill="F6F8FA"/>
-          </w:tcPr>
+          <w:tcPr/>
           <w:p>
             <w:pPr>
               <w:jc w:val="left"/>
@@ -14324,9 +14391,7 @@
           </w:p>
         </w:tc>
         <w:tc>
-          <w:tcPr>
-            <w:shd w:val="clear" w:color="auto" w:fill="F6F8FA"/>
-          </w:tcPr>
+          <w:tcPr/>
           <w:p>
             <w:pPr>
               <w:jc w:val="left"/>
@@ -14354,7 +14419,9 @@
       </w:tr>
       <w:tr>
         <w:tc>
-          <w:tcPr/>
+          <w:tcPr>
+            <w:shd w:val="clear" w:color="auto" w:fill="F6F8FA"/>
+          </w:tcPr>
           <w:p>
             <w:pPr>
               <w:jc w:val="left"/>
@@ -14365,7 +14432,9 @@
           </w:p>
         </w:tc>
         <w:tc>
-          <w:tcPr/>
+          <w:tcPr>
+            <w:shd w:val="clear" w:color="auto" w:fill="F6F8FA"/>
+          </w:tcPr>
           <w:p>
             <w:pPr>
               <w:jc w:val="left"/>
@@ -14376,7 +14445,9 @@
           </w:p>
         </w:tc>
         <w:tc>
-          <w:tcPr/>
+          <w:tcPr>
+            <w:shd w:val="clear" w:color="auto" w:fill="F6F8FA"/>
+          </w:tcPr>
           <w:p>
             <w:pPr>
               <w:jc w:val="left"/>
@@ -14389,9 +14460,7 @@
       </w:tr>
       <w:tr>
         <w:tc>
-          <w:tcPr>
-            <w:shd w:val="clear" w:color="auto" w:fill="F6F8FA"/>
-          </w:tcPr>
+          <w:tcPr/>
           <w:p>
             <w:pPr>
               <w:jc w:val="left"/>
@@ -14432,9 +14501,7 @@
           </w:p>
         </w:tc>
         <w:tc>
-          <w:tcPr>
-            <w:shd w:val="clear" w:color="auto" w:fill="F6F8FA"/>
-          </w:tcPr>
+          <w:tcPr/>
           <w:p>
             <w:pPr>
               <w:jc w:val="left"/>
@@ -14445,9 +14512,7 @@
           </w:p>
         </w:tc>
         <w:tc>
-          <w:tcPr>
-            <w:shd w:val="clear" w:color="auto" w:fill="F6F8FA"/>
-          </w:tcPr>
+          <w:tcPr/>
           <w:p>
             <w:pPr>
               <w:jc w:val="left"/>
@@ -14460,7 +14525,9 @@
       </w:tr>
       <w:tr>
         <w:tc>
-          <w:tcPr/>
+          <w:tcPr>
+            <w:shd w:val="clear" w:color="auto" w:fill="F6F8FA"/>
+          </w:tcPr>
           <w:p>
             <w:pPr>
               <w:jc w:val="left"/>
@@ -14486,7 +14553,9 @@
           </w:p>
         </w:tc>
         <w:tc>
-          <w:tcPr/>
+          <w:tcPr>
+            <w:shd w:val="clear" w:color="auto" w:fill="F6F8FA"/>
+          </w:tcPr>
           <w:p>
             <w:pPr>
               <w:jc w:val="left"/>
@@ -14497,7 +14566,9 @@
           </w:p>
         </w:tc>
         <w:tc>
-          <w:tcPr/>
+          <w:tcPr>
+            <w:shd w:val="clear" w:color="auto" w:fill="F6F8FA"/>
+          </w:tcPr>
           <w:p>
             <w:pPr>
               <w:jc w:val="left"/>
@@ -14510,9 +14581,7 @@
       </w:tr>
       <w:tr>
         <w:tc>
-          <w:tcPr>
-            <w:shd w:val="clear" w:color="auto" w:fill="F6F8FA"/>
-          </w:tcPr>
+          <w:tcPr/>
           <w:p>
             <w:pPr>
               <w:jc w:val="left"/>
@@ -14523,9 +14592,7 @@
           </w:p>
         </w:tc>
         <w:tc>
-          <w:tcPr>
-            <w:shd w:val="clear" w:color="auto" w:fill="F6F8FA"/>
-          </w:tcPr>
+          <w:tcPr/>
           <w:p>
             <w:pPr>
               <w:jc w:val="left"/>
@@ -14536,9 +14603,7 @@
           </w:p>
         </w:tc>
         <w:tc>
-          <w:tcPr>
-            <w:shd w:val="clear" w:color="auto" w:fill="F6F8FA"/>
-          </w:tcPr>
+          <w:tcPr/>
           <w:p>
             <w:pPr>
               <w:jc w:val="left"/>
@@ -14551,7 +14616,9 @@
       </w:tr>
       <w:tr>
         <w:tc>
-          <w:tcPr/>
+          <w:tcPr>
+            <w:shd w:val="clear" w:color="auto" w:fill="F6F8FA"/>
+          </w:tcPr>
           <w:p>
             <w:pPr>
               <w:jc w:val="left"/>
@@ -14562,7 +14629,9 @@
           </w:p>
         </w:tc>
         <w:tc>
-          <w:tcPr/>
+          <w:tcPr>
+            <w:shd w:val="clear" w:color="auto" w:fill="F6F8FA"/>
+          </w:tcPr>
           <w:p>
             <w:pPr>
               <w:jc w:val="left"/>
@@ -14573,7 +14642,9 @@
           </w:p>
         </w:tc>
         <w:tc>
-          <w:tcPr/>
+          <w:tcPr>
+            <w:shd w:val="clear" w:color="auto" w:fill="F6F8FA"/>
+          </w:tcPr>
           <w:p>
             <w:pPr>
               <w:jc w:val="left"/>
@@ -14586,9 +14657,7 @@
       </w:tr>
       <w:tr>
         <w:tc>
-          <w:tcPr>
-            <w:shd w:val="clear" w:color="auto" w:fill="F6F8FA"/>
-          </w:tcPr>
+          <w:tcPr/>
           <w:p>
             <w:pPr>
               <w:jc w:val="left"/>
@@ -14644,9 +14713,7 @@
           </w:p>
         </w:tc>
         <w:tc>
-          <w:tcPr>
-            <w:shd w:val="clear" w:color="auto" w:fill="F6F8FA"/>
-          </w:tcPr>
+          <w:tcPr/>
           <w:p>
             <w:pPr>
               <w:jc w:val="left"/>
@@ -14657,9 +14724,7 @@
           </w:p>
         </w:tc>
         <w:tc>
-          <w:tcPr>
-            <w:shd w:val="clear" w:color="auto" w:fill="F6F8FA"/>
-          </w:tcPr>
+          <w:tcPr/>
           <w:p>
             <w:pPr>
               <w:jc w:val="left"/>
@@ -14672,7 +14737,9 @@
       </w:tr>
       <w:tr>
         <w:tc>
-          <w:tcPr/>
+          <w:tcPr>
+            <w:shd w:val="clear" w:color="auto" w:fill="F6F8FA"/>
+          </w:tcPr>
           <w:p>
             <w:pPr>
               <w:jc w:val="left"/>
@@ -14728,7 +14795,9 @@
           </w:p>
         </w:tc>
         <w:tc>
-          <w:tcPr/>
+          <w:tcPr>
+            <w:shd w:val="clear" w:color="auto" w:fill="F6F8FA"/>
+          </w:tcPr>
           <w:p>
             <w:pPr>
               <w:jc w:val="left"/>
@@ -14739,7 +14808,9 @@
           </w:p>
         </w:tc>
         <w:tc>
-          <w:tcPr/>
+          <w:tcPr>
+            <w:shd w:val="clear" w:color="auto" w:fill="F6F8FA"/>
+          </w:tcPr>
           <w:p>
             <w:pPr>
               <w:jc w:val="left"/>
@@ -14752,9 +14823,7 @@
       </w:tr>
       <w:tr>
         <w:tc>
-          <w:tcPr>
-            <w:shd w:val="clear" w:color="auto" w:fill="F6F8FA"/>
-          </w:tcPr>
+          <w:tcPr/>
           <w:p>
             <w:pPr>
               <w:jc w:val="left"/>
@@ -14831,9 +14900,7 @@
           </w:p>
         </w:tc>
         <w:tc>
-          <w:tcPr>
-            <w:shd w:val="clear" w:color="auto" w:fill="F6F8FA"/>
-          </w:tcPr>
+          <w:tcPr/>
           <w:p>
             <w:pPr>
               <w:jc w:val="left"/>
@@ -14844,9 +14911,7 @@
           </w:p>
         </w:tc>
         <w:tc>
-          <w:tcPr>
-            <w:shd w:val="clear" w:color="auto" w:fill="F6F8FA"/>
-          </w:tcPr>
+          <w:tcPr/>
           <w:p>
             <w:pPr>
               <w:jc w:val="left"/>
@@ -14859,7 +14924,9 @@
       </w:tr>
       <w:tr>
         <w:tc>
-          <w:tcPr/>
+          <w:tcPr>
+            <w:shd w:val="clear" w:color="auto" w:fill="F6F8FA"/>
+          </w:tcPr>
           <w:p>
             <w:pPr>
               <w:jc w:val="left"/>
@@ -14897,7 +14964,9 @@
           </w:p>
         </w:tc>
         <w:tc>
-          <w:tcPr/>
+          <w:tcPr>
+            <w:shd w:val="clear" w:color="auto" w:fill="F6F8FA"/>
+          </w:tcPr>
           <w:p>
             <w:pPr>
               <w:jc w:val="left"/>
@@ -14923,7 +14992,9 @@
           </w:p>
         </w:tc>
         <w:tc>
-          <w:tcPr/>
+          <w:tcPr>
+            <w:shd w:val="clear" w:color="auto" w:fill="F6F8FA"/>
+          </w:tcPr>
           <w:p>
             <w:pPr>
               <w:jc w:val="left"/>
@@ -14936,9 +15007,7 @@
       </w:tr>
       <w:tr>
         <w:tc>
-          <w:tcPr>
-            <w:shd w:val="clear" w:color="auto" w:fill="F6F8FA"/>
-          </w:tcPr>
+          <w:tcPr/>
           <w:p>
             <w:pPr>
               <w:jc w:val="left"/>
@@ -14949,9 +15018,7 @@
           </w:p>
         </w:tc>
         <w:tc>
-          <w:tcPr>
-            <w:shd w:val="clear" w:color="auto" w:fill="F6F8FA"/>
-          </w:tcPr>
+          <w:tcPr/>
           <w:p>
             <w:pPr>
               <w:jc w:val="left"/>
@@ -15004,9 +15071,7 @@
           </w:p>
         </w:tc>
         <w:tc>
-          <w:tcPr>
-            <w:shd w:val="clear" w:color="auto" w:fill="F6F8FA"/>
-          </w:tcPr>
+          <w:tcPr/>
           <w:p>
             <w:pPr>
               <w:jc w:val="left"/>
@@ -15019,7 +15084,9 @@
       </w:tr>
       <w:tr>
         <w:tc>
-          <w:tcPr/>
+          <w:tcPr>
+            <w:shd w:val="clear" w:color="auto" w:fill="F6F8FA"/>
+          </w:tcPr>
           <w:p>
             <w:pPr>
               <w:jc w:val="left"/>
@@ -15030,7 +15097,9 @@
           </w:p>
         </w:tc>
         <w:tc>
-          <w:tcPr/>
+          <w:tcPr>
+            <w:shd w:val="clear" w:color="auto" w:fill="F6F8FA"/>
+          </w:tcPr>
           <w:p>
             <w:pPr>
               <w:jc w:val="left"/>
@@ -15053,7 +15122,9 @@
           </w:p>
         </w:tc>
         <w:tc>
-          <w:tcPr/>
+          <w:tcPr>
+            <w:shd w:val="clear" w:color="auto" w:fill="F6F8FA"/>
+          </w:tcPr>
           <w:p>
             <w:pPr>
               <w:jc w:val="left"/>
@@ -15066,9 +15137,7 @@
       </w:tr>
       <w:tr>
         <w:tc>
-          <w:tcPr>
-            <w:shd w:val="clear" w:color="auto" w:fill="F6F8FA"/>
-          </w:tcPr>
+          <w:tcPr/>
           <w:p>
             <w:pPr>
               <w:jc w:val="left"/>
@@ -15079,9 +15148,7 @@
           </w:p>
         </w:tc>
         <w:tc>
-          <w:tcPr>
-            <w:shd w:val="clear" w:color="auto" w:fill="F6F8FA"/>
-          </w:tcPr>
+          <w:tcPr/>
           <w:p>
             <w:pPr>
               <w:jc w:val="left"/>
@@ -15179,9 +15246,7 @@
           </w:p>
         </w:tc>
         <w:tc>
-          <w:tcPr>
-            <w:shd w:val="clear" w:color="auto" w:fill="F6F8FA"/>
-          </w:tcPr>
+          <w:tcPr/>
           <w:p>
             <w:pPr>
               <w:jc w:val="left"/>
@@ -15194,7 +15259,9 @@
       </w:tr>
       <w:tr>
         <w:tc>
-          <w:tcPr/>
+          <w:tcPr>
+            <w:shd w:val="clear" w:color="auto" w:fill="F6F8FA"/>
+          </w:tcPr>
           <w:p>
             <w:pPr>
               <w:jc w:val="left"/>
@@ -15205,7 +15272,9 @@
           </w:p>
         </w:tc>
         <w:tc>
-          <w:tcPr/>
+          <w:tcPr>
+            <w:shd w:val="clear" w:color="auto" w:fill="F6F8FA"/>
+          </w:tcPr>
           <w:p>
             <w:pPr>
               <w:jc w:val="left"/>
@@ -15216,7 +15285,9 @@
           </w:p>
         </w:tc>
         <w:tc>
-          <w:tcPr/>
+          <w:tcPr>
+            <w:shd w:val="clear" w:color="auto" w:fill="F6F8FA"/>
+          </w:tcPr>
           <w:p>
             <w:pPr>
               <w:jc w:val="left"/>
@@ -15229,9 +15300,7 @@
       </w:tr>
       <w:tr>
         <w:tc>
-          <w:tcPr>
-            <w:shd w:val="clear" w:color="auto" w:fill="F6F8FA"/>
-          </w:tcPr>
+          <w:tcPr/>
           <w:p>
             <w:pPr>
               <w:jc w:val="left"/>
@@ -15242,9 +15311,7 @@
           </w:p>
         </w:tc>
         <w:tc>
-          <w:tcPr>
-            <w:shd w:val="clear" w:color="auto" w:fill="F6F8FA"/>
-          </w:tcPr>
+          <w:tcPr/>
           <w:p>
             <w:pPr>
               <w:jc w:val="left"/>
@@ -15294,9 +15361,7 @@
           </w:p>
         </w:tc>
         <w:tc>
-          <w:tcPr>
-            <w:shd w:val="clear" w:color="auto" w:fill="F6F8FA"/>
-          </w:tcPr>
+          <w:tcPr/>
           <w:p>
             <w:pPr>
               <w:jc w:val="left"/>
@@ -15309,7 +15374,9 @@
       </w:tr>
       <w:tr>
         <w:tc>
-          <w:tcPr/>
+          <w:tcPr>
+            <w:shd w:val="clear" w:color="auto" w:fill="F6F8FA"/>
+          </w:tcPr>
           <w:p>
             <w:pPr>
               <w:jc w:val="left"/>
@@ -15320,7 +15387,9 @@
           </w:p>
         </w:tc>
         <w:tc>
-          <w:tcPr/>
+          <w:tcPr>
+            <w:shd w:val="clear" w:color="auto" w:fill="F6F8FA"/>
+          </w:tcPr>
           <w:p>
             <w:pPr>
               <w:jc w:val="left"/>
@@ -15373,7 +15442,9 @@
           </w:p>
         </w:tc>
         <w:tc>
-          <w:tcPr/>
+          <w:tcPr>
+            <w:shd w:val="clear" w:color="auto" w:fill="F6F8FA"/>
+          </w:tcPr>
           <w:p>
             <w:pPr>
               <w:jc w:val="left"/>
@@ -15386,9 +15457,7 @@
       </w:tr>
       <w:tr>
         <w:tc>
-          <w:tcPr>
-            <w:shd w:val="clear" w:color="auto" w:fill="F6F8FA"/>
-          </w:tcPr>
+          <w:tcPr/>
           <w:p>
             <w:pPr>
               <w:jc w:val="left"/>
@@ -15399,9 +15468,7 @@
           </w:p>
         </w:tc>
         <w:tc>
-          <w:tcPr>
-            <w:shd w:val="clear" w:color="auto" w:fill="F6F8FA"/>
-          </w:tcPr>
+          <w:tcPr/>
           <w:p>
             <w:pPr>
               <w:jc w:val="left"/>
@@ -15412,9 +15479,7 @@
           </w:p>
         </w:tc>
         <w:tc>
-          <w:tcPr>
-            <w:shd w:val="clear" w:color="auto" w:fill="F6F8FA"/>
-          </w:tcPr>
+          <w:tcPr/>
           <w:p>
             <w:pPr>
               <w:jc w:val="left"/>
@@ -15427,7 +15492,9 @@
       </w:tr>
       <w:tr>
         <w:tc>
-          <w:tcPr/>
+          <w:tcPr>
+            <w:shd w:val="clear" w:color="auto" w:fill="F6F8FA"/>
+          </w:tcPr>
           <w:p>
             <w:pPr>
               <w:jc w:val="left"/>
@@ -15438,7 +15505,9 @@
           </w:p>
         </w:tc>
         <w:tc>
-          <w:tcPr/>
+          <w:tcPr>
+            <w:shd w:val="clear" w:color="auto" w:fill="F6F8FA"/>
+          </w:tcPr>
           <w:p>
             <w:pPr>
               <w:jc w:val="left"/>
@@ -15449,7 +15518,9 @@
           </w:p>
         </w:tc>
         <w:tc>
-          <w:tcPr/>
+          <w:tcPr>
+            <w:shd w:val="clear" w:color="auto" w:fill="F6F8FA"/>
+          </w:tcPr>
           <w:p>
             <w:pPr>
               <w:jc w:val="left"/>
@@ -15462,9 +15533,7 @@
       </w:tr>
       <w:tr>
         <w:tc>
-          <w:tcPr>
-            <w:shd w:val="clear" w:color="auto" w:fill="F6F8FA"/>
-          </w:tcPr>
+          <w:tcPr/>
           <w:p>
             <w:pPr>
               <w:jc w:val="left"/>
@@ -15475,9 +15544,7 @@
           </w:p>
         </w:tc>
         <w:tc>
-          <w:tcPr>
-            <w:shd w:val="clear" w:color="auto" w:fill="F6F8FA"/>
-          </w:tcPr>
+          <w:tcPr/>
           <w:p>
             <w:pPr>
               <w:jc w:val="left"/>
@@ -15488,9 +15555,7 @@
           </w:p>
         </w:tc>
         <w:tc>
-          <w:tcPr>
-            <w:shd w:val="clear" w:color="auto" w:fill="F6F8FA"/>
-          </w:tcPr>
+          <w:tcPr/>
           <w:p>
             <w:pPr>
               <w:jc w:val="left"/>
@@ -15503,7 +15568,9 @@
       </w:tr>
       <w:tr>
         <w:tc>
-          <w:tcPr/>
+          <w:tcPr>
+            <w:shd w:val="clear" w:color="auto" w:fill="F6F8FA"/>
+          </w:tcPr>
           <w:p>
             <w:pPr>
               <w:jc w:val="left"/>
@@ -15514,7 +15581,9 @@
           </w:p>
         </w:tc>
         <w:tc>
-          <w:tcPr/>
+          <w:tcPr>
+            <w:shd w:val="clear" w:color="auto" w:fill="F6F8FA"/>
+          </w:tcPr>
           <w:p>
             <w:pPr>
               <w:jc w:val="left"/>
@@ -15525,7 +15594,9 @@
           </w:p>
         </w:tc>
         <w:tc>
-          <w:tcPr/>
+          <w:tcPr>
+            <w:shd w:val="clear" w:color="auto" w:fill="F6F8FA"/>
+          </w:tcPr>
           <w:p>
             <w:pPr>
               <w:jc w:val="left"/>
@@ -15538,9 +15609,7 @@
       </w:tr>
       <w:tr>
         <w:tc>
-          <w:tcPr>
-            <w:shd w:val="clear" w:color="auto" w:fill="F6F8FA"/>
-          </w:tcPr>
+          <w:tcPr/>
           <w:p>
             <w:pPr>
               <w:jc w:val="left"/>
@@ -15551,9 +15620,7 @@
           </w:p>
         </w:tc>
         <w:tc>
-          <w:tcPr>
-            <w:shd w:val="clear" w:color="auto" w:fill="F6F8FA"/>
-          </w:tcPr>
+          <w:tcPr/>
           <w:p>
             <w:pPr>
               <w:jc w:val="left"/>
@@ -15573,9 +15640,7 @@
           </w:p>
         </w:tc>
         <w:tc>
-          <w:tcPr>
-            <w:shd w:val="clear" w:color="auto" w:fill="F6F8FA"/>
-          </w:tcPr>
+          <w:tcPr/>
           <w:p>
             <w:pPr>
               <w:jc w:val="left"/>
@@ -15588,7 +15653,9 @@
       </w:tr>
       <w:tr>
         <w:tc>
-          <w:tcPr/>
+          <w:tcPr>
+            <w:shd w:val="clear" w:color="auto" w:fill="F6F8FA"/>
+          </w:tcPr>
           <w:p>
             <w:pPr>
               <w:jc w:val="left"/>
@@ -15599,7 +15666,9 @@
           </w:p>
         </w:tc>
         <w:tc>
-          <w:tcPr/>
+          <w:tcPr>
+            <w:shd w:val="clear" w:color="auto" w:fill="F6F8FA"/>
+          </w:tcPr>
           <w:p>
             <w:pPr>
               <w:jc w:val="left"/>
@@ -15610,7 +15679,9 @@
           </w:p>
         </w:tc>
         <w:tc>
-          <w:tcPr/>
+          <w:tcPr>
+            <w:shd w:val="clear" w:color="auto" w:fill="F6F8FA"/>
+          </w:tcPr>
           <w:p>
             <w:pPr>
               <w:jc w:val="left"/>
@@ -15623,9 +15694,7 @@
       </w:tr>
       <w:tr>
         <w:tc>
-          <w:tcPr>
-            <w:shd w:val="clear" w:color="auto" w:fill="F6F8FA"/>
-          </w:tcPr>
+          <w:tcPr/>
           <w:p>
             <w:pPr>
               <w:jc w:val="left"/>
@@ -15636,9 +15705,7 @@
           </w:p>
         </w:tc>
         <w:tc>
-          <w:tcPr>
-            <w:shd w:val="clear" w:color="auto" w:fill="F6F8FA"/>
-          </w:tcPr>
+          <w:tcPr/>
           <w:p>
             <w:pPr>
               <w:jc w:val="left"/>
@@ -15649,9 +15716,7 @@
           </w:p>
         </w:tc>
         <w:tc>
-          <w:tcPr>
-            <w:shd w:val="clear" w:color="auto" w:fill="F6F8FA"/>
-          </w:tcPr>
+          <w:tcPr/>
           <w:p>
             <w:pPr>
               <w:jc w:val="left"/>
@@ -15664,7 +15729,9 @@
       </w:tr>
       <w:tr>
         <w:tc>
-          <w:tcPr/>
+          <w:tcPr>
+            <w:shd w:val="clear" w:color="auto" w:fill="F6F8FA"/>
+          </w:tcPr>
           <w:p>
             <w:pPr>
               <w:jc w:val="left"/>
@@ -15675,7 +15742,9 @@
           </w:p>
         </w:tc>
         <w:tc>
-          <w:tcPr/>
+          <w:tcPr>
+            <w:shd w:val="clear" w:color="auto" w:fill="F6F8FA"/>
+          </w:tcPr>
           <w:p>
             <w:pPr>
               <w:jc w:val="left"/>
@@ -15686,7 +15755,9 @@
           </w:p>
         </w:tc>
         <w:tc>
-          <w:tcPr/>
+          <w:tcPr>
+            <w:shd w:val="clear" w:color="auto" w:fill="F6F8FA"/>
+          </w:tcPr>
           <w:p>
             <w:pPr>
               <w:jc w:val="left"/>
@@ -15699,9 +15770,7 @@
       </w:tr>
       <w:tr>
         <w:tc>
-          <w:tcPr>
-            <w:shd w:val="clear" w:color="auto" w:fill="F6F8FA"/>
-          </w:tcPr>
+          <w:tcPr/>
           <w:p>
             <w:pPr>
               <w:jc w:val="left"/>
@@ -15712,9 +15781,7 @@
           </w:p>
         </w:tc>
         <w:tc>
-          <w:tcPr>
-            <w:shd w:val="clear" w:color="auto" w:fill="F6F8FA"/>
-          </w:tcPr>
+          <w:tcPr/>
           <w:p>
             <w:pPr>
               <w:jc w:val="left"/>
@@ -15725,9 +15792,7 @@
           </w:p>
         </w:tc>
         <w:tc>
-          <w:tcPr>
-            <w:shd w:val="clear" w:color="auto" w:fill="F6F8FA"/>
-          </w:tcPr>
+          <w:tcPr/>
           <w:p>
             <w:pPr>
               <w:jc w:val="left"/>
@@ -15740,7 +15805,9 @@
       </w:tr>
       <w:tr>
         <w:tc>
-          <w:tcPr/>
+          <w:tcPr>
+            <w:shd w:val="clear" w:color="auto" w:fill="F6F8FA"/>
+          </w:tcPr>
           <w:p>
             <w:pPr>
               <w:jc w:val="left"/>
@@ -15751,7 +15818,9 @@
           </w:p>
         </w:tc>
         <w:tc>
-          <w:tcPr/>
+          <w:tcPr>
+            <w:shd w:val="clear" w:color="auto" w:fill="F6F8FA"/>
+          </w:tcPr>
           <w:p>
             <w:pPr>
               <w:jc w:val="left"/>
@@ -15762,7 +15831,9 @@
           </w:p>
         </w:tc>
         <w:tc>
-          <w:tcPr/>
+          <w:tcPr>
+            <w:shd w:val="clear" w:color="auto" w:fill="F6F8FA"/>
+          </w:tcPr>
           <w:p>
             <w:pPr>
               <w:jc w:val="left"/>
@@ -15775,9 +15846,7 @@
       </w:tr>
       <w:tr>
         <w:tc>
-          <w:tcPr>
-            <w:shd w:val="clear" w:color="auto" w:fill="F6F8FA"/>
-          </w:tcPr>
+          <w:tcPr/>
           <w:p>
             <w:pPr>
               <w:jc w:val="left"/>
@@ -15788,9 +15857,7 @@
           </w:p>
         </w:tc>
         <w:tc>
-          <w:tcPr>
-            <w:shd w:val="clear" w:color="auto" w:fill="F6F8FA"/>
-          </w:tcPr>
+          <w:tcPr/>
           <w:p>
             <w:pPr>
               <w:jc w:val="left"/>
@@ -15801,9 +15868,7 @@
           </w:p>
         </w:tc>
         <w:tc>
-          <w:tcPr>
-            <w:shd w:val="clear" w:color="auto" w:fill="F6F8FA"/>
-          </w:tcPr>
+          <w:tcPr/>
           <w:p>
             <w:pPr>
               <w:jc w:val="left"/>
@@ -15816,7 +15881,9 @@
       </w:tr>
       <w:tr>
         <w:tc>
-          <w:tcPr/>
+          <w:tcPr>
+            <w:shd w:val="clear" w:color="auto" w:fill="F6F8FA"/>
+          </w:tcPr>
           <w:p>
             <w:pPr>
               <w:jc w:val="left"/>
@@ -15827,7 +15894,9 @@
           </w:p>
         </w:tc>
         <w:tc>
-          <w:tcPr/>
+          <w:tcPr>
+            <w:shd w:val="clear" w:color="auto" w:fill="F6F8FA"/>
+          </w:tcPr>
           <w:p>
             <w:pPr>
               <w:jc w:val="left"/>
@@ -15838,7 +15907,9 @@
           </w:p>
         </w:tc>
         <w:tc>
-          <w:tcPr/>
+          <w:tcPr>
+            <w:shd w:val="clear" w:color="auto" w:fill="F6F8FA"/>
+          </w:tcPr>
           <w:p>
             <w:pPr>
               <w:jc w:val="left"/>
@@ -15851,9 +15922,7 @@
       </w:tr>
       <w:tr>
         <w:tc>
-          <w:tcPr>
-            <w:shd w:val="clear" w:color="auto" w:fill="F6F8FA"/>
-          </w:tcPr>
+          <w:tcPr/>
           <w:p>
             <w:pPr>
               <w:jc w:val="left"/>
@@ -15864,9 +15933,7 @@
           </w:p>
         </w:tc>
         <w:tc>
-          <w:tcPr>
-            <w:shd w:val="clear" w:color="auto" w:fill="F6F8FA"/>
-          </w:tcPr>
+          <w:tcPr/>
           <w:p>
             <w:pPr>
               <w:jc w:val="left"/>
@@ -15877,9 +15944,7 @@
           </w:p>
         </w:tc>
         <w:tc>
-          <w:tcPr>
-            <w:shd w:val="clear" w:color="auto" w:fill="F6F8FA"/>
-          </w:tcPr>
+          <w:tcPr/>
           <w:p>
             <w:pPr>
               <w:jc w:val="left"/>
@@ -15892,7 +15957,9 @@
       </w:tr>
       <w:tr>
         <w:tc>
-          <w:tcPr/>
+          <w:tcPr>
+            <w:shd w:val="clear" w:color="auto" w:fill="F6F8FA"/>
+          </w:tcPr>
           <w:p>
             <w:pPr>
               <w:jc w:val="left"/>
@@ -15903,7 +15970,9 @@
           </w:p>
         </w:tc>
         <w:tc>
-          <w:tcPr/>
+          <w:tcPr>
+            <w:shd w:val="clear" w:color="auto" w:fill="F6F8FA"/>
+          </w:tcPr>
           <w:p>
             <w:pPr>
               <w:jc w:val="left"/>
@@ -15914,7 +15983,9 @@
           </w:p>
         </w:tc>
         <w:tc>
-          <w:tcPr/>
+          <w:tcPr>
+            <w:shd w:val="clear" w:color="auto" w:fill="F6F8FA"/>
+          </w:tcPr>
           <w:p>
             <w:pPr>
               <w:jc w:val="left"/>
@@ -15927,9 +15998,7 @@
       </w:tr>
       <w:tr>
         <w:tc>
-          <w:tcPr>
-            <w:shd w:val="clear" w:color="auto" w:fill="F6F8FA"/>
-          </w:tcPr>
+          <w:tcPr/>
           <w:p>
             <w:pPr>
               <w:jc w:val="left"/>
@@ -15940,9 +16009,7 @@
           </w:p>
         </w:tc>
         <w:tc>
-          <w:tcPr>
-            <w:shd w:val="clear" w:color="auto" w:fill="F6F8FA"/>
-          </w:tcPr>
+          <w:tcPr/>
           <w:p>
             <w:pPr>
               <w:jc w:val="left"/>
@@ -15953,9 +16020,7 @@
           </w:p>
         </w:tc>
         <w:tc>
-          <w:tcPr>
-            <w:shd w:val="clear" w:color="auto" w:fill="F6F8FA"/>
-          </w:tcPr>
+          <w:tcPr/>
           <w:p>
             <w:pPr>
               <w:jc w:val="left"/>
@@ -15968,7 +16033,9 @@
       </w:tr>
       <w:tr>
         <w:tc>
-          <w:tcPr/>
+          <w:tcPr>
+            <w:shd w:val="clear" w:color="auto" w:fill="F6F8FA"/>
+          </w:tcPr>
           <w:p>
             <w:pPr>
               <w:jc w:val="left"/>
@@ -15979,7 +16046,9 @@
           </w:p>
         </w:tc>
         <w:tc>
-          <w:tcPr/>
+          <w:tcPr>
+            <w:shd w:val="clear" w:color="auto" w:fill="F6F8FA"/>
+          </w:tcPr>
           <w:p>
             <w:pPr>
               <w:jc w:val="left"/>
@@ -15990,7 +16059,9 @@
           </w:p>
         </w:tc>
         <w:tc>
-          <w:tcPr/>
+          <w:tcPr>
+            <w:shd w:val="clear" w:color="auto" w:fill="F6F8FA"/>
+          </w:tcPr>
           <w:p>
             <w:pPr>
               <w:jc w:val="left"/>
@@ -16003,9 +16074,7 @@
       </w:tr>
       <w:tr>
         <w:tc>
-          <w:tcPr>
-            <w:shd w:val="clear" w:color="auto" w:fill="F6F8FA"/>
-          </w:tcPr>
+          <w:tcPr/>
           <w:p>
             <w:pPr>
               <w:jc w:val="left"/>
@@ -16016,9 +16085,7 @@
           </w:p>
         </w:tc>
         <w:tc>
-          <w:tcPr>
-            <w:shd w:val="clear" w:color="auto" w:fill="F6F8FA"/>
-          </w:tcPr>
+          <w:tcPr/>
           <w:p>
             <w:pPr>
               <w:jc w:val="left"/>
@@ -16029,9 +16096,7 @@
           </w:p>
         </w:tc>
         <w:tc>
-          <w:tcPr>
-            <w:shd w:val="clear" w:color="auto" w:fill="F6F8FA"/>
-          </w:tcPr>
+          <w:tcPr/>
           <w:p>
             <w:pPr>
               <w:jc w:val="left"/>
@@ -16044,7 +16109,9 @@
       </w:tr>
       <w:tr>
         <w:tc>
-          <w:tcPr/>
+          <w:tcPr>
+            <w:shd w:val="clear" w:color="auto" w:fill="F6F8FA"/>
+          </w:tcPr>
           <w:p>
             <w:pPr>
               <w:jc w:val="left"/>
@@ -16055,7 +16122,9 @@
           </w:p>
         </w:tc>
         <w:tc>
-          <w:tcPr/>
+          <w:tcPr>
+            <w:shd w:val="clear" w:color="auto" w:fill="F6F8FA"/>
+          </w:tcPr>
           <w:p>
             <w:pPr>
               <w:jc w:val="left"/>
@@ -16066,7 +16135,9 @@
           </w:p>
         </w:tc>
         <w:tc>
-          <w:tcPr/>
+          <w:tcPr>
+            <w:shd w:val="clear" w:color="auto" w:fill="F6F8FA"/>
+          </w:tcPr>
           <w:p>
             <w:pPr>
               <w:jc w:val="left"/>
@@ -16079,9 +16150,7 @@
       </w:tr>
       <w:tr>
         <w:tc>
-          <w:tcPr>
-            <w:shd w:val="clear" w:color="auto" w:fill="F6F8FA"/>
-          </w:tcPr>
+          <w:tcPr/>
           <w:p>
             <w:pPr>
               <w:jc w:val="left"/>
@@ -16092,9 +16161,7 @@
           </w:p>
         </w:tc>
         <w:tc>
-          <w:tcPr>
-            <w:shd w:val="clear" w:color="auto" w:fill="F6F8FA"/>
-          </w:tcPr>
+          <w:tcPr/>
           <w:p>
             <w:pPr>
               <w:jc w:val="left"/>
@@ -16111,9 +16178,7 @@
           </w:p>
         </w:tc>
         <w:tc>
-          <w:tcPr>
-            <w:shd w:val="clear" w:color="auto" w:fill="F6F8FA"/>
-          </w:tcPr>
+          <w:tcPr/>
           <w:p>
             <w:pPr>
               <w:jc w:val="left"/>
@@ -16126,7 +16191,9 @@
       </w:tr>
       <w:tr>
         <w:tc>
-          <w:tcPr/>
+          <w:tcPr>
+            <w:shd w:val="clear" w:color="auto" w:fill="F6F8FA"/>
+          </w:tcPr>
           <w:p>
             <w:pPr>
               <w:jc w:val="left"/>
@@ -16137,7 +16204,9 @@
           </w:p>
         </w:tc>
         <w:tc>
-          <w:tcPr/>
+          <w:tcPr>
+            <w:shd w:val="clear" w:color="auto" w:fill="F6F8FA"/>
+          </w:tcPr>
           <w:p>
             <w:pPr>
               <w:jc w:val="left"/>
@@ -16154,7 +16223,9 @@
           </w:p>
         </w:tc>
         <w:tc>
-          <w:tcPr/>
+          <w:tcPr>
+            <w:shd w:val="clear" w:color="auto" w:fill="F6F8FA"/>
+          </w:tcPr>
           <w:p>
             <w:pPr>
               <w:jc w:val="left"/>
@@ -16167,9 +16238,7 @@
       </w:tr>
       <w:tr>
         <w:tc>
-          <w:tcPr>
-            <w:shd w:val="clear" w:color="auto" w:fill="F6F8FA"/>
-          </w:tcPr>
+          <w:tcPr/>
           <w:p>
             <w:pPr>
               <w:jc w:val="left"/>
@@ -16180,9 +16249,7 @@
           </w:p>
         </w:tc>
         <w:tc>
-          <w:tcPr>
-            <w:shd w:val="clear" w:color="auto" w:fill="F6F8FA"/>
-          </w:tcPr>
+          <w:tcPr/>
           <w:p>
             <w:pPr>
               <w:jc w:val="left"/>
@@ -16193,9 +16260,7 @@
           </w:p>
         </w:tc>
         <w:tc>
-          <w:tcPr>
-            <w:shd w:val="clear" w:color="auto" w:fill="F6F8FA"/>
-          </w:tcPr>
+          <w:tcPr/>
           <w:p>
             <w:pPr>
               <w:jc w:val="left"/>
@@ -16208,7 +16273,9 @@
       </w:tr>
       <w:tr>
         <w:tc>
-          <w:tcPr/>
+          <w:tcPr>
+            <w:shd w:val="clear" w:color="auto" w:fill="F6F8FA"/>
+          </w:tcPr>
           <w:p>
             <w:pPr>
               <w:jc w:val="left"/>
@@ -16219,7 +16286,9 @@
           </w:p>
         </w:tc>
         <w:tc>
-          <w:tcPr/>
+          <w:tcPr>
+            <w:shd w:val="clear" w:color="auto" w:fill="F6F8FA"/>
+          </w:tcPr>
           <w:p>
             <w:pPr>
               <w:jc w:val="left"/>
@@ -16290,7 +16359,9 @@
           </w:p>
         </w:tc>
         <w:tc>
-          <w:tcPr/>
+          <w:tcPr>
+            <w:shd w:val="clear" w:color="auto" w:fill="F6F8FA"/>
+          </w:tcPr>
           <w:p>
             <w:pPr>
               <w:jc w:val="left"/>
@@ -16303,9 +16374,7 @@
       </w:tr>
       <w:tr>
         <w:tc>
-          <w:tcPr>
-            <w:shd w:val="clear" w:color="auto" w:fill="F6F8FA"/>
-          </w:tcPr>
+          <w:tcPr/>
           <w:p>
             <w:pPr>
               <w:jc w:val="left"/>
@@ -16316,9 +16385,7 @@
           </w:p>
         </w:tc>
         <w:tc>
-          <w:tcPr>
-            <w:shd w:val="clear" w:color="auto" w:fill="F6F8FA"/>
-          </w:tcPr>
+          <w:tcPr/>
           <w:p>
             <w:pPr>
               <w:jc w:val="left"/>
@@ -16341,9 +16408,7 @@
           </w:p>
         </w:tc>
         <w:tc>
-          <w:tcPr>
-            <w:shd w:val="clear" w:color="auto" w:fill="F6F8FA"/>
-          </w:tcPr>
+          <w:tcPr/>
           <w:p>
             <w:pPr>
               <w:jc w:val="left"/>
@@ -16356,7 +16421,9 @@
       </w:tr>
       <w:tr>
         <w:tc>
-          <w:tcPr/>
+          <w:tcPr>
+            <w:shd w:val="clear" w:color="auto" w:fill="F6F8FA"/>
+          </w:tcPr>
           <w:p>
             <w:pPr>
               <w:jc w:val="left"/>
@@ -16367,7 +16434,9 @@
           </w:p>
         </w:tc>
         <w:tc>
-          <w:tcPr/>
+          <w:tcPr>
+            <w:shd w:val="clear" w:color="auto" w:fill="F6F8FA"/>
+          </w:tcPr>
           <w:p>
             <w:pPr>
               <w:jc w:val="left"/>
@@ -16384,7 +16453,9 @@
           </w:p>
         </w:tc>
         <w:tc>
-          <w:tcPr/>
+          <w:tcPr>
+            <w:shd w:val="clear" w:color="auto" w:fill="F6F8FA"/>
+          </w:tcPr>
           <w:p>
             <w:pPr>
               <w:jc w:val="left"/>
@@ -16397,9 +16468,7 @@
       </w:tr>
       <w:tr>
         <w:tc>
-          <w:tcPr>
-            <w:shd w:val="clear" w:color="auto" w:fill="F6F8FA"/>
-          </w:tcPr>
+          <w:tcPr/>
           <w:p>
             <w:pPr>
               <w:jc w:val="left"/>
@@ -16410,9 +16479,7 @@
           </w:p>
         </w:tc>
         <w:tc>
-          <w:tcPr>
-            <w:shd w:val="clear" w:color="auto" w:fill="F6F8FA"/>
-          </w:tcPr>
+          <w:tcPr/>
           <w:p>
             <w:pPr>
               <w:jc w:val="left"/>
@@ -16423,9 +16490,7 @@
           </w:p>
         </w:tc>
         <w:tc>
-          <w:tcPr>
-            <w:shd w:val="clear" w:color="auto" w:fill="F6F8FA"/>
-          </w:tcPr>
+          <w:tcPr/>
           <w:p>
             <w:pPr>
               <w:jc w:val="left"/>
@@ -16438,7 +16503,9 @@
       </w:tr>
       <w:tr>
         <w:tc>
-          <w:tcPr/>
+          <w:tcPr>
+            <w:shd w:val="clear" w:color="auto" w:fill="F6F8FA"/>
+          </w:tcPr>
           <w:p>
             <w:pPr>
               <w:jc w:val="left"/>
@@ -16449,7 +16516,9 @@
           </w:p>
         </w:tc>
         <w:tc>
-          <w:tcPr/>
+          <w:tcPr>
+            <w:shd w:val="clear" w:color="auto" w:fill="F6F8FA"/>
+          </w:tcPr>
           <w:p>
             <w:pPr>
               <w:jc w:val="left"/>
@@ -16460,7 +16529,9 @@
           </w:p>
         </w:tc>
         <w:tc>
-          <w:tcPr/>
+          <w:tcPr>
+            <w:shd w:val="clear" w:color="auto" w:fill="F6F8FA"/>
+          </w:tcPr>
           <w:p>
             <w:pPr>
               <w:jc w:val="left"/>
@@ -16473,9 +16544,7 @@
       </w:tr>
       <w:tr>
         <w:tc>
-          <w:tcPr>
-            <w:shd w:val="clear" w:color="auto" w:fill="F6F8FA"/>
-          </w:tcPr>
+          <w:tcPr/>
           <w:p>
             <w:pPr>
               <w:jc w:val="left"/>
@@ -16486,9 +16555,7 @@
           </w:p>
         </w:tc>
         <w:tc>
-          <w:tcPr>
-            <w:shd w:val="clear" w:color="auto" w:fill="F6F8FA"/>
-          </w:tcPr>
+          <w:tcPr/>
           <w:p>
             <w:pPr>
               <w:jc w:val="left"/>
@@ -16505,9 +16572,7 @@
           </w:p>
         </w:tc>
         <w:tc>
-          <w:tcPr>
-            <w:shd w:val="clear" w:color="auto" w:fill="F6F8FA"/>
-          </w:tcPr>
+          <w:tcPr/>
           <w:p>
             <w:pPr>
               <w:jc w:val="left"/>
@@ -16520,7 +16585,9 @@
       </w:tr>
       <w:tr>
         <w:tc>
-          <w:tcPr/>
+          <w:tcPr>
+            <w:shd w:val="clear" w:color="auto" w:fill="F6F8FA"/>
+          </w:tcPr>
           <w:p>
             <w:pPr>
               <w:jc w:val="left"/>
@@ -16531,7 +16598,9 @@
           </w:p>
         </w:tc>
         <w:tc>
-          <w:tcPr/>
+          <w:tcPr>
+            <w:shd w:val="clear" w:color="auto" w:fill="F6F8FA"/>
+          </w:tcPr>
           <w:p>
             <w:pPr>
               <w:jc w:val="left"/>
@@ -16654,7 +16723,9 @@
           </w:p>
         </w:tc>
         <w:tc>
-          <w:tcPr/>
+          <w:tcPr>
+            <w:shd w:val="clear" w:color="auto" w:fill="F6F8FA"/>
+          </w:tcPr>
           <w:p>
             <w:pPr>
               <w:jc w:val="left"/>
@@ -16667,9 +16738,7 @@
       </w:tr>
       <w:tr>
         <w:tc>
-          <w:tcPr>
-            <w:shd w:val="clear" w:color="auto" w:fill="F6F8FA"/>
-          </w:tcPr>
+          <w:tcPr/>
           <w:p>
             <w:pPr>
               <w:jc w:val="left"/>
@@ -16680,9 +16749,7 @@
           </w:p>
         </w:tc>
         <w:tc>
-          <w:tcPr>
-            <w:shd w:val="clear" w:color="auto" w:fill="F6F8FA"/>
-          </w:tcPr>
+          <w:tcPr/>
           <w:p>
             <w:pPr>
               <w:jc w:val="left"/>
@@ -16786,9 +16853,7 @@
           </w:p>
         </w:tc>
         <w:tc>
-          <w:tcPr>
-            <w:shd w:val="clear" w:color="auto" w:fill="F6F8FA"/>
-          </w:tcPr>
+          <w:tcPr/>
           <w:p>
             <w:pPr>
               <w:jc w:val="left"/>

</xml_diff>

<commit_message>
Apply oracle quality-pass fixes for Phase A (v6.5.2)
- Convert only paired LaTeX quotes — '' inside code arguments (SQL empty
  strings) is no longer corrupted into a closing quote
- Split signature rows on unescaped & only (\\& no longer truncates cells)
- round-trip.sh: guard asciidoctor-diagram like build.sh; fail loudly when
  HTML generation produces no output
- round-trip.sh: rewrite stale callouts-in-DOCX comment (pandoc drops
  admonition labels — DOCX cannot count them)
- test-preprocessor.sh: pin pipe escaping in all 5 table handlers (+7 checks)
- CHANGELOG: soften v6.5.1 raw-LaTeX wording to match the actual checks
- Bump all templates + setup-guide to v6.5.2; regenerate committed artifacts
</commit_message>
<xml_diff>
--- a/documents/setup-guide/setup-guide.docx
+++ b/documents/setup-guide/setup-guide.docx
@@ -84,7 +84,7 @@
           <w:b/>
           <w:sz w:val="24"/>
         </w:rPr>
-        <w:t xml:space="preserve">v6.5.1</w:t>
+        <w:t xml:space="preserve">v6.5.2</w:t>
       </w:r>
       <w:r>
         <w:rPr>
@@ -96,7 +96,7 @@
         <w:rPr>
           <w:sz w:val="24"/>
         </w:rPr>
-        <w:t xml:space="preserve">— September 20, 2026 13:23</w:t>
+        <w:t xml:space="preserve">— September 20, 2026 14:01</w:t>
       </w:r>
     </w:p>
     <w:sdt>
@@ -13345,7 +13345,7 @@
               <w:jc w:val="left"/>
             </w:pPr>
             <w:r>
-              <w:t xml:space="preserve">6.5.1</w:t>
+              <w:t xml:space="preserve">6.5.2</w:t>
             </w:r>
           </w:p>
         </w:tc>
@@ -13371,7 +13371,7 @@
               <w:jc w:val="left"/>
             </w:pPr>
             <w:r>
-              <w:t xml:space="preserve">Fixed DOCX/MD/HTML output: tables are no longer corrupted when changelog, signature, or summary content contains a pipe character (“|”). Badge text is now preserved in DOCX/MD/HTML — a “Ready” badge renders “Ready” instead of “[NEW]”. Multi-item changelog entries render as bullet lists instead of being joined with a literal “+”. POC documents now include the changelog in DOCX/MD/HTML. The :noanswers: attribute now hides test results and remarks in DOCX/MD/HTML, matching the PDF. Inline LaTeX (monospace text, arrows, LaTeX quotes) no longer leaks from changelog entries. The test suite now exercises the real build pipeline (pre-processor wired into round-trip and DOCX tests), with new pre-processor unit tests.</w:t>
+              <w:t xml:space="preserve">Quality-pass fixes for v6.5.1: LaTeX quote conversion now handles only paired quotes (quote characters inside code arguments are no longer corrupted); signature cells containing escaped ampersands are no longer split; round-trip HTML generation guards the asciidoctor-diagram dependency and fails loudly when generation fails; pre-processor unit tests now cover pipe escaping in all five table handlers.</w:t>
             </w:r>
           </w:p>
         </w:tc>
@@ -13386,7 +13386,7 @@
               <w:jc w:val="left"/>
             </w:pPr>
             <w:r>
-              <w:t xml:space="preserve">6.5.0</w:t>
+              <w:t xml:space="preserve">6.5.1</w:t>
             </w:r>
           </w:p>
         </w:tc>
@@ -13416,7 +13416,7 @@
               <w:jc w:val="left"/>
             </w:pPr>
             <w:r>
-              <w:t xml:space="preserve">Evidence checklist simplified to plain bullets in both PDF and DOCX (checkbox markers removed for compatibility). Planned Activities list in DOCX now uses Word’s native lower-roman numbering (i., ii., iii.) matching the PDF. Badges in DOCX replaced with exact-replica PNG pill images (rounded, colored frame and background, bold text) matching the PDF \ huaweibadge look — assets committed to the repo. Signature blocks in DOCX no longer show literal + symbols (proper hard line breaks).</w:t>
+              <w:t xml:space="preserve">Fixed DOCX/MD/HTML output: tables are no longer corrupted when changelog, signature, or summary content contains a pipe character (“|”). Badge text is now preserved in DOCX/MD/HTML — a “Ready” badge renders “Ready” instead of “[NEW]”. Multi-item changelog entries render as bullet lists instead of being joined with a literal “+”. POC documents now include the changelog in DOCX/MD/HTML. The :noanswers: attribute now hides test results and remarks in DOCX/MD/HTML, matching the PDF. Inline LaTeX (monospace text, arrows, LaTeX quotes) no longer leaks from changelog entries. The test suite now exercises the real build pipeline (pre-processor wired into round-trip and DOCX tests), with new pre-processor unit tests.</w:t>
             </w:r>
           </w:p>
         </w:tc>
@@ -13429,7 +13429,7 @@
               <w:jc w:val="left"/>
             </w:pPr>
             <w:r>
-              <w:t xml:space="preserve">6.4.7</w:t>
+              <w:t xml:space="preserve">6.5.0</w:t>
             </w:r>
           </w:p>
         </w:tc>
@@ -13455,7 +13455,7 @@
               <w:jc w:val="left"/>
             </w:pPr>
             <w:r>
-              <w:t xml:space="preserve">Section titles in DOCX now match the PDF heading design: the big section number (56pt) sits on the left, the title text is pushed to the right edge (a right tab stop mimics the LaTeX \ hfill), and the red rule runs below — previously the title sat left-aligned next to a small number. Applies to all templates.</w:t>
+              <w:t xml:space="preserve">Evidence checklist simplified to plain bullets in both PDF and DOCX (checkbox markers removed for compatibility). Planned Activities list in DOCX now uses Word’s native lower-roman numbering (i., ii., iii.) matching the PDF. Badges in DOCX replaced with exact-replica PNG pill images (rounded, colored frame and background, bold text) matching the PDF \ huaweibadge look — assets committed to the repo. Signature blocks in DOCX no longer show literal + symbols (proper hard line breaks).</w:t>
             </w:r>
           </w:p>
         </w:tc>
@@ -13470,7 +13470,7 @@
               <w:jc w:val="left"/>
             </w:pPr>
             <w:r>
-              <w:t xml:space="preserve">6.4.6</w:t>
+              <w:t xml:space="preserve">6.4.7</w:t>
             </w:r>
           </w:p>
         </w:tc>
@@ -13500,7 +13500,7 @@
               <w:jc w:val="left"/>
             </w:pPr>
             <w:r>
-              <w:t xml:space="preserve">Code blocks inside test cases no longer break the red left rule in DOCX — the code style’s left indent (which jogged the rule) is reset inside test case blocks, and code blocks now show the PDF’s code box (gray background with thin border on top, bottom, and right, red rule continuing on the left).</w:t>
+              <w:t xml:space="preserve">Section titles in DOCX now match the PDF heading design: the big section number (56pt) sits on the left, the title text is pushed to the right edge (a right tab stop mimics the LaTeX \ hfill), and the red rule runs below — previously the title sat left-aligned next to a small number. Applies to all templates.</w:t>
             </w:r>
           </w:p>
         </w:tc>
@@ -13513,7 +13513,7 @@
               <w:jc w:val="left"/>
             </w:pPr>
             <w:r>
-              <w:t xml:space="preserve">6.4.5</w:t>
+              <w:t xml:space="preserve">6.4.6</w:t>
             </w:r>
           </w:p>
         </w:tc>
@@ -13539,7 +13539,7 @@
               <w:jc w:val="left"/>
             </w:pPr>
             <w:r>
-              <w:t xml:space="preserve">DOCX polish pass: all captions centered (matching the PDF), vertical spacing between blocks matched to the LaTeX rhythm (medskip/smallskip around captions, field bars, and steps), and test steps now render as separate paragraphs each with the red bold number (previously merged into one paragraph).</w:t>
+              <w:t xml:space="preserve">Code blocks inside test cases no longer break the red left rule in DOCX — the code style’s left indent (which jogged the rule) is reset inside test case blocks, and code blocks now show the PDF’s code box (gray background with thin border on top, bottom, and right, red rule continuing on the left).</w:t>
             </w:r>
           </w:p>
         </w:tc>
@@ -13554,7 +13554,7 @@
               <w:jc w:val="left"/>
             </w:pPr>
             <w:r>
-              <w:t xml:space="preserve">6.4.4</w:t>
+              <w:t xml:space="preserve">6.4.5</w:t>
             </w:r>
           </w:p>
         </w:tc>
@@ -13584,7 +13584,7 @@
               <w:jc w:val="left"/>
             </w:pPr>
             <w:r>
-              <w:t xml:space="preserve">DOCX covers now show the logo, cover text, and version/date/time meta line like the PDF. Test case blocks in DOCX get the PDF’s visual wrapper: red left rule, red field header bars, and red step numbers. Captions follow the PDF ordering system in DOCX, MD, and HTML (Table/Diagram/Figure/Testcase N: with bold symbol). Portuguese PDFs now label diagrams "Diagrama N:" (was hardcoded English "Diagram"). Markdown and HTML output no longer leaks raw LaTeX from passthrough blocks — the DOCX pre-processor now feeds those pipelines too.</w:t>
+              <w:t xml:space="preserve">DOCX polish pass: all captions centered (matching the PDF), vertical spacing between blocks matched to the LaTeX rhythm (medskip/smallskip around captions, field bars, and steps), and test steps now render as separate paragraphs each with the red bold number (previously merged into one paragraph).</w:t>
             </w:r>
           </w:p>
         </w:tc>
@@ -13597,7 +13597,7 @@
               <w:jc w:val="left"/>
             </w:pPr>
             <w:r>
-              <w:t xml:space="preserve">6.4.3</w:t>
+              <w:t xml:space="preserve">6.4.4</w:t>
             </w:r>
           </w:p>
         </w:tc>
@@ -13623,7 +13623,7 @@
               <w:jc w:val="left"/>
             </w:pPr>
             <w:r>
-              <w:t xml:space="preserve">Testbook and POC DOCX output now matches the PDF much more closely: native table of contents (language-aware, auto-populated), each section starts on a new page, embedded images and diagrams (PlantUML/Graphviz rendered), white-on-red table headers, cover version line under the title, centered test case captions, and plain black rules for signature grids.</w:t>
+              <w:t xml:space="preserve">DOCX covers now show the logo, cover text, and version/date/time meta line like the PDF. Test case blocks in DOCX get the PDF’s visual wrapper: red left rule, red field header bars, and red step numbers. Captions follow the PDF ordering system in DOCX, MD, and HTML (Table/Diagram/Figure/Testcase N: with bold symbol). Portuguese PDFs now label diagrams "Diagrama N:" (was hardcoded English "Diagram"). Markdown and HTML output no longer leaks raw LaTeX from passthrough blocks — the DOCX pre-processor now feeds those pipelines too.</w:t>
             </w:r>
           </w:p>
         </w:tc>
@@ -13638,7 +13638,7 @@
               <w:jc w:val="left"/>
             </w:pPr>
             <w:r>
-              <w:t xml:space="preserve">6.4.2</w:t>
+              <w:t xml:space="preserve">6.4.3</w:t>
             </w:r>
           </w:p>
         </w:tc>
@@ -13668,7 +13668,7 @@
               <w:jc w:val="left"/>
             </w:pPr>
             <w:r>
-              <w:t xml:space="preserve">DOCX output for POC and testbook templates now includes all passthrough content (stakeholders, closing record, signatures, test cases, test summary, changelog) via a new pre-processor. Fixed dropped Test Scope fields in testbook DOCX output.</w:t>
+              <w:t xml:space="preserve">Testbook and POC DOCX output now matches the PDF much more closely: native table of contents (language-aware, auto-populated), each section starts on a new page, embedded images and diagrams (PlantUML/Graphviz rendered), white-on-red table headers, cover version line under the title, centered test case captions, and plain black rules for signature grids.</w:t>
             </w:r>
           </w:p>
         </w:tc>
@@ -13681,7 +13681,7 @@
               <w:jc w:val="left"/>
             </w:pPr>
             <w:r>
-              <w:t xml:space="preserve">6.4.0</w:t>
+              <w:t xml:space="preserve">6.4.2</w:t>
             </w:r>
           </w:p>
         </w:tc>
@@ -13707,6 +13707,51 @@
               <w:jc w:val="left"/>
             </w:pPr>
             <w:r>
+              <w:t xml:space="preserve">DOCX output for POC and testbook templates now includes all passthrough content (stakeholders, closing record, signatures, test cases, test summary, changelog) via a new pre-processor. Fixed dropped Test Scope fields in testbook DOCX output.</w:t>
+            </w:r>
+          </w:p>
+        </w:tc>
+      </w:tr>
+      <w:tr>
+        <w:tc>
+          <w:tcPr>
+            <w:shd w:val="clear" w:color="auto" w:fill="F6F8FA"/>
+          </w:tcPr>
+          <w:p>
+            <w:pPr>
+              <w:jc w:val="left"/>
+            </w:pPr>
+            <w:r>
+              <w:t xml:space="preserve">6.4.0</w:t>
+            </w:r>
+          </w:p>
+        </w:tc>
+        <w:tc>
+          <w:tcPr>
+            <w:shd w:val="clear" w:color="auto" w:fill="F6F8FA"/>
+          </w:tcPr>
+          <w:p>
+            <w:pPr>
+              <w:jc w:val="left"/>
+            </w:pPr>
+            <w:r>
+              <w:t xml:space="preserve">2026-09-20</w:t>
+            </w:r>
+          </w:p>
+        </w:tc>
+        <w:tc>
+          <w:tcPr>
+            <w:shd w:val="clear" w:color="auto" w:fill="F6F8FA"/>
+          </w:tcPr>
+          <w:p>
+            <w:pPr>
+              <w:numPr>
+                <w:ilvl w:val="0"/>
+                <w:numId w:val="1051"/>
+              </w:numPr>
+              <w:jc w:val="left"/>
+            </w:pPr>
+            <w:r>
               <w:t xml:space="preserve">Fixed changelog dates — replaced</w:t>
             </w:r>
             <w:r>
@@ -13729,58 +13774,13 @@
       </w:tr>
       <w:tr>
         <w:tc>
-          <w:tcPr>
-            <w:shd w:val="clear" w:color="auto" w:fill="F6F8FA"/>
-          </w:tcPr>
+          <w:tcPr/>
           <w:p>
             <w:pPr>
               <w:jc w:val="left"/>
             </w:pPr>
             <w:r>
               <w:t xml:space="preserve">5.1.1</w:t>
-            </w:r>
-          </w:p>
-        </w:tc>
-        <w:tc>
-          <w:tcPr>
-            <w:shd w:val="clear" w:color="auto" w:fill="F6F8FA"/>
-          </w:tcPr>
-          <w:p>
-            <w:pPr>
-              <w:jc w:val="left"/>
-            </w:pPr>
-            <w:r>
-              <w:t xml:space="preserve">2026-09-14</w:t>
-            </w:r>
-          </w:p>
-        </w:tc>
-        <w:tc>
-          <w:tcPr>
-            <w:shd w:val="clear" w:color="auto" w:fill="F6F8FA"/>
-          </w:tcPr>
-          <w:p>
-            <w:pPr>
-              <w:numPr>
-                <w:ilvl w:val="0"/>
-                <w:numId w:val="1051"/>
-              </w:numPr>
-              <w:jc w:val="left"/>
-            </w:pPr>
-            <w:r>
-              <w:t xml:space="preserve">Synced callout colors in DOCX/HTML/MD output to match brand palette. Added color palette demo.</w:t>
-            </w:r>
-          </w:p>
-        </w:tc>
-      </w:tr>
-      <w:tr>
-        <w:tc>
-          <w:tcPr/>
-          <w:p>
-            <w:pPr>
-              <w:jc w:val="left"/>
-            </w:pPr>
-            <w:r>
-              <w:t xml:space="preserve">5.1.0</w:t>
             </w:r>
           </w:p>
         </w:tc>
@@ -13806,7 +13806,7 @@
               <w:jc w:val="left"/>
             </w:pPr>
             <w:r>
-              <w:t xml:space="preserve">Adopted brand guidelines auxiliary color palette and monochrome scale. Aligned callout colors to brand specifications.</w:t>
+              <w:t xml:space="preserve">Synced callout colors in DOCX/HTML/MD output to match brand palette. Added color palette demo.</w:t>
             </w:r>
           </w:p>
         </w:tc>
@@ -13821,7 +13821,7 @@
               <w:jc w:val="left"/>
             </w:pPr>
             <w:r>
-              <w:t xml:space="preserve">5.0.3</w:t>
+              <w:t xml:space="preserve">5.1.0</w:t>
             </w:r>
           </w:p>
         </w:tc>
@@ -13851,6 +13851,45 @@
               <w:jc w:val="left"/>
             </w:pPr>
             <w:r>
+              <w:t xml:space="preserve">Adopted brand guidelines auxiliary color palette and monochrome scale. Aligned callout colors to brand specifications.</w:t>
+            </w:r>
+          </w:p>
+        </w:tc>
+      </w:tr>
+      <w:tr>
+        <w:tc>
+          <w:tcPr/>
+          <w:p>
+            <w:pPr>
+              <w:jc w:val="left"/>
+            </w:pPr>
+            <w:r>
+              <w:t xml:space="preserve">5.0.3</w:t>
+            </w:r>
+          </w:p>
+        </w:tc>
+        <w:tc>
+          <w:tcPr/>
+          <w:p>
+            <w:pPr>
+              <w:jc w:val="left"/>
+            </w:pPr>
+            <w:r>
+              <w:t xml:space="preserve">2026-09-14</w:t>
+            </w:r>
+          </w:p>
+        </w:tc>
+        <w:tc>
+          <w:tcPr/>
+          <w:p>
+            <w:pPr>
+              <w:numPr>
+                <w:ilvl w:val="0"/>
+                <w:numId w:val="1054"/>
+              </w:numPr>
+              <w:jc w:val="left"/>
+            </w:pPr>
+            <w:r>
               <w:t xml:space="preserve">Removed non-standard</w:t>
             </w:r>
             <w:r>
@@ -13873,54 +13912,15 @@
       </w:tr>
       <w:tr>
         <w:tc>
-          <w:tcPr/>
+          <w:tcPr>
+            <w:shd w:val="clear" w:color="auto" w:fill="F6F8FA"/>
+          </w:tcPr>
           <w:p>
             <w:pPr>
               <w:jc w:val="left"/>
             </w:pPr>
             <w:r>
               <w:t xml:space="preserve">5.0.2</w:t>
-            </w:r>
-          </w:p>
-        </w:tc>
-        <w:tc>
-          <w:tcPr/>
-          <w:p>
-            <w:pPr>
-              <w:jc w:val="left"/>
-            </w:pPr>
-            <w:r>
-              <w:t xml:space="preserve">2026-09-14</w:t>
-            </w:r>
-          </w:p>
-        </w:tc>
-        <w:tc>
-          <w:tcPr/>
-          <w:p>
-            <w:pPr>
-              <w:numPr>
-                <w:ilvl w:val="0"/>
-                <w:numId w:val="1054"/>
-              </w:numPr>
-              <w:jc w:val="left"/>
-            </w:pPr>
-            <w:r>
-              <w:t xml:space="preserve">Long commands in test steps now render as code blocks instead of inline code.</w:t>
-            </w:r>
-          </w:p>
-        </w:tc>
-      </w:tr>
-      <w:tr>
-        <w:tc>
-          <w:tcPr>
-            <w:shd w:val="clear" w:color="auto" w:fill="F6F8FA"/>
-          </w:tcPr>
-          <w:p>
-            <w:pPr>
-              <w:jc w:val="left"/>
-            </w:pPr>
-            <w:r>
-              <w:t xml:space="preserve">5.0.1</w:t>
             </w:r>
           </w:p>
         </w:tc>
@@ -13950,7 +13950,7 @@
               <w:jc w:val="left"/>
             </w:pPr>
             <w:r>
-              <w:t xml:space="preserve">Testcase caption centered above the block.</w:t>
+              <w:t xml:space="preserve">Long commands in test steps now render as code blocks instead of inline code.</w:t>
             </w:r>
           </w:p>
         </w:tc>
@@ -13963,7 +13963,7 @@
               <w:jc w:val="left"/>
             </w:pPr>
             <w:r>
-              <w:t xml:space="preserve">5.0.0</w:t>
+              <w:t xml:space="preserve">5.0.1</w:t>
             </w:r>
           </w:p>
         </w:tc>
@@ -13989,6 +13989,51 @@
               <w:jc w:val="left"/>
             </w:pPr>
             <w:r>
+              <w:t xml:space="preserve">Testcase caption centered above the block.</w:t>
+            </w:r>
+          </w:p>
+        </w:tc>
+      </w:tr>
+      <w:tr>
+        <w:tc>
+          <w:tcPr>
+            <w:shd w:val="clear" w:color="auto" w:fill="F6F8FA"/>
+          </w:tcPr>
+          <w:p>
+            <w:pPr>
+              <w:jc w:val="left"/>
+            </w:pPr>
+            <w:r>
+              <w:t xml:space="preserve">5.0.0</w:t>
+            </w:r>
+          </w:p>
+        </w:tc>
+        <w:tc>
+          <w:tcPr>
+            <w:shd w:val="clear" w:color="auto" w:fill="F6F8FA"/>
+          </w:tcPr>
+          <w:p>
+            <w:pPr>
+              <w:jc w:val="left"/>
+            </w:pPr>
+            <w:r>
+              <w:t xml:space="preserve">2026-09-14</w:t>
+            </w:r>
+          </w:p>
+        </w:tc>
+        <w:tc>
+          <w:tcPr>
+            <w:shd w:val="clear" w:color="auto" w:fill="F6F8FA"/>
+          </w:tcPr>
+          <w:p>
+            <w:pPr>
+              <w:numPr>
+                <w:ilvl w:val="0"/>
+                <w:numId w:val="1057"/>
+              </w:numPr>
+              <w:jc w:val="left"/>
+            </w:pPr>
+            <w:r>
               <w:t xml:space="preserve">Major refactoring: extracted shared modules (huawei-titles, huawei-toc, huawei-cover), renamed</w:t>
             </w:r>
             <w:r>
@@ -14050,9 +14095,7 @@
       </w:tr>
       <w:tr>
         <w:tc>
-          <w:tcPr>
-            <w:shd w:val="clear" w:color="auto" w:fill="F6F8FA"/>
-          </w:tcPr>
+          <w:tcPr/>
           <w:p>
             <w:pPr>
               <w:jc w:val="left"/>
@@ -14063,56 +14106,13 @@
           </w:p>
         </w:tc>
         <w:tc>
-          <w:tcPr>
-            <w:shd w:val="clear" w:color="auto" w:fill="F6F8FA"/>
-          </w:tcPr>
+          <w:tcPr/>
           <w:p>
             <w:pPr>
               <w:jc w:val="left"/>
             </w:pPr>
             <w:r>
               <w:t xml:space="preserve">2026-09-14</w:t>
-            </w:r>
-          </w:p>
-        </w:tc>
-        <w:tc>
-          <w:tcPr>
-            <w:shd w:val="clear" w:color="auto" w:fill="F6F8FA"/>
-          </w:tcPr>
-          <w:p>
-            <w:pPr>
-              <w:numPr>
-                <w:ilvl w:val="0"/>
-                <w:numId w:val="1057"/>
-              </w:numPr>
-              <w:jc w:val="left"/>
-            </w:pPr>
-            <w:r>
-              <w:t xml:space="preserve">Testcase headings now formatted as captions (like figures/tables): bold “Testcase N:” followed by description. Changed label from “Test Case” to “Testcase”.</w:t>
-            </w:r>
-          </w:p>
-        </w:tc>
-      </w:tr>
-      <w:tr>
-        <w:tc>
-          <w:tcPr/>
-          <w:p>
-            <w:pPr>
-              <w:jc w:val="left"/>
-            </w:pPr>
-            <w:r>
-              <w:t xml:space="preserve">4.6.0</w:t>
-            </w:r>
-          </w:p>
-        </w:tc>
-        <w:tc>
-          <w:tcPr/>
-          <w:p>
-            <w:pPr>
-              <w:jc w:val="left"/>
-            </w:pPr>
-            <w:r>
-              <w:t xml:space="preserve">2026-09-13</w:t>
             </w:r>
           </w:p>
         </w:tc>
@@ -14127,7 +14127,7 @@
               <w:jc w:val="left"/>
             </w:pPr>
             <w:r>
-              <w:t xml:space="preserve">Section restructure: Introduction, Test Cases (with category subsections), Conclusion. Testcases auto-numbered like figures/tables. Changed testcase from subsection to subsubsection.</w:t>
+              <w:t xml:space="preserve">Testcase headings now formatted as captions (like figures/tables): bold “Testcase N:” followed by description. Changed label from “Test Case” to “Testcase”.</w:t>
             </w:r>
           </w:p>
         </w:tc>
@@ -14142,7 +14142,7 @@
               <w:jc w:val="left"/>
             </w:pPr>
             <w:r>
-              <w:t xml:space="preserve">4.5.0</w:t>
+              <w:t xml:space="preserve">4.6.0</w:t>
             </w:r>
           </w:p>
         </w:tc>
@@ -14172,6 +14172,45 @@
               <w:jc w:val="left"/>
             </w:pPr>
             <w:r>
+              <w:t xml:space="preserve">Section restructure: Introduction, Test Cases (with category subsections), Conclusion. Testcases auto-numbered like figures/tables. Changed testcase from subsection to subsubsection.</w:t>
+            </w:r>
+          </w:p>
+        </w:tc>
+      </w:tr>
+      <w:tr>
+        <w:tc>
+          <w:tcPr/>
+          <w:p>
+            <w:pPr>
+              <w:jc w:val="left"/>
+            </w:pPr>
+            <w:r>
+              <w:t xml:space="preserve">4.5.0</w:t>
+            </w:r>
+          </w:p>
+        </w:tc>
+        <w:tc>
+          <w:tcPr/>
+          <w:p>
+            <w:pPr>
+              <w:jc w:val="left"/>
+            </w:pPr>
+            <w:r>
+              <w:t xml:space="preserve">2026-09-13</w:t>
+            </w:r>
+          </w:p>
+        </w:tc>
+        <w:tc>
+          <w:tcPr/>
+          <w:p>
+            <w:pPr>
+              <w:numPr>
+                <w:ilvl w:val="0"/>
+                <w:numId w:val="1060"/>
+              </w:numPr>
+              <w:jc w:val="left"/>
+            </w:pPr>
+            <w:r>
               <w:t xml:space="preserve">Unified field APIs:</w:t>
             </w:r>
             <w:r>
@@ -14236,54 +14275,15 @@
       </w:tr>
       <w:tr>
         <w:tc>
-          <w:tcPr/>
+          <w:tcPr>
+            <w:shd w:val="clear" w:color="auto" w:fill="F6F8FA"/>
+          </w:tcPr>
           <w:p>
             <w:pPr>
               <w:jc w:val="left"/>
             </w:pPr>
             <w:r>
               <w:t xml:space="preserve">4.4.0</w:t>
-            </w:r>
-          </w:p>
-        </w:tc>
-        <w:tc>
-          <w:tcPr/>
-          <w:p>
-            <w:pPr>
-              <w:jc w:val="left"/>
-            </w:pPr>
-            <w:r>
-              <w:t xml:space="preserve">2026-09-13</w:t>
-            </w:r>
-          </w:p>
-        </w:tc>
-        <w:tc>
-          <w:tcPr/>
-          <w:p>
-            <w:pPr>
-              <w:numPr>
-                <w:ilvl w:val="0"/>
-                <w:numId w:val="1060"/>
-              </w:numPr>
-              <w:jc w:val="left"/>
-            </w:pPr>
-            <w:r>
-              <w:t xml:space="preserve">Code review fixes: removed dead labels, badge now uses Huawei brand colors (tipbg/tipfg, huaweired, warningbg/warningfg), Lua filter preserves formatting in DOCX/MD/HTML via parse_latex_blocks, testprocedure handler preserves non-step content (images, code, callouts).</w:t>
-            </w:r>
-          </w:p>
-        </w:tc>
-      </w:tr>
-      <w:tr>
-        <w:tc>
-          <w:tcPr>
-            <w:shd w:val="clear" w:color="auto" w:fill="F6F8FA"/>
-          </w:tcPr>
-          <w:p>
-            <w:pPr>
-              <w:jc w:val="left"/>
-            </w:pPr>
-            <w:r>
-              <w:t xml:space="preserve">4.3.0</w:t>
             </w:r>
           </w:p>
         </w:tc>
@@ -14313,6 +14313,45 @@
               <w:jc w:val="left"/>
             </w:pPr>
             <w:r>
+              <w:t xml:space="preserve">Code review fixes: removed dead labels, badge now uses Huawei brand colors (tipbg/tipfg, huaweired, warningbg/warningfg), Lua filter preserves formatting in DOCX/MD/HTML via parse_latex_blocks, testprocedure handler preserves non-step content (images, code, callouts).</w:t>
+            </w:r>
+          </w:p>
+        </w:tc>
+      </w:tr>
+      <w:tr>
+        <w:tc>
+          <w:tcPr/>
+          <w:p>
+            <w:pPr>
+              <w:jc w:val="left"/>
+            </w:pPr>
+            <w:r>
+              <w:t xml:space="preserve">4.3.0</w:t>
+            </w:r>
+          </w:p>
+        </w:tc>
+        <w:tc>
+          <w:tcPr/>
+          <w:p>
+            <w:pPr>
+              <w:jc w:val="left"/>
+            </w:pPr>
+            <w:r>
+              <w:t xml:space="preserve">2026-09-13</w:t>
+            </w:r>
+          </w:p>
+        </w:tc>
+        <w:tc>
+          <w:tcPr/>
+          <w:p>
+            <w:pPr>
+              <w:numPr>
+                <w:ilvl w:val="0"/>
+                <w:numId w:val="1062"/>
+              </w:numPr>
+              <w:jc w:val="left"/>
+            </w:pPr>
+            <w:r>
               <w:t xml:space="preserve">Added</w:t>
             </w:r>
             <w:r>
@@ -14365,7 +14404,9 @@
       </w:tr>
       <w:tr>
         <w:tc>
-          <w:tcPr/>
+          <w:tcPr>
+            <w:shd w:val="clear" w:color="auto" w:fill="F6F8FA"/>
+          </w:tcPr>
           <w:p>
             <w:pPr>
               <w:jc w:val="left"/>
@@ -14376,7 +14417,9 @@
           </w:p>
         </w:tc>
         <w:tc>
-          <w:tcPr/>
+          <w:tcPr>
+            <w:shd w:val="clear" w:color="auto" w:fill="F6F8FA"/>
+          </w:tcPr>
           <w:p>
             <w:pPr>
               <w:jc w:val="left"/>
@@ -14387,12 +14430,14 @@
           </w:p>
         </w:tc>
         <w:tc>
-          <w:tcPr/>
+          <w:tcPr>
+            <w:shd w:val="clear" w:color="auto" w:fill="F6F8FA"/>
+          </w:tcPr>
           <w:p>
             <w:pPr>
               <w:numPr>
                 <w:ilvl w:val="0"/>
-                <w:numId w:val="1062"/>
+                <w:numId w:val="1063"/>
               </w:numPr>
               <w:jc w:val="left"/>
             </w:pPr>
@@ -14446,9 +14491,7 @@
       </w:tr>
       <w:tr>
         <w:tc>
-          <w:tcPr>
-            <w:shd w:val="clear" w:color="auto" w:fill="F6F8FA"/>
-          </w:tcPr>
+          <w:tcPr/>
           <w:p>
             <w:pPr>
               <w:jc w:val="left"/>
@@ -14459,9 +14502,7 @@
           </w:p>
         </w:tc>
         <w:tc>
-          <w:tcPr>
-            <w:shd w:val="clear" w:color="auto" w:fill="F6F8FA"/>
-          </w:tcPr>
+          <w:tcPr/>
           <w:p>
             <w:pPr>
               <w:jc w:val="left"/>
@@ -14472,14 +14513,12 @@
           </w:p>
         </w:tc>
         <w:tc>
-          <w:tcPr>
-            <w:shd w:val="clear" w:color="auto" w:fill="F6F8FA"/>
-          </w:tcPr>
+          <w:tcPr/>
           <w:p>
             <w:pPr>
               <w:numPr>
                 <w:ilvl w:val="0"/>
-                <w:numId w:val="1063"/>
+                <w:numId w:val="1064"/>
               </w:numPr>
               <w:jc w:val="left"/>
             </w:pPr>
@@ -14506,7 +14545,9 @@
       </w:tr>
       <w:tr>
         <w:tc>
-          <w:tcPr/>
+          <w:tcPr>
+            <w:shd w:val="clear" w:color="auto" w:fill="F6F8FA"/>
+          </w:tcPr>
           <w:p>
             <w:pPr>
               <w:jc w:val="left"/>
@@ -14517,7 +14558,9 @@
           </w:p>
         </w:tc>
         <w:tc>
-          <w:tcPr/>
+          <w:tcPr>
+            <w:shd w:val="clear" w:color="auto" w:fill="F6F8FA"/>
+          </w:tcPr>
           <w:p>
             <w:pPr>
               <w:jc w:val="left"/>
@@ -14528,12 +14571,14 @@
           </w:p>
         </w:tc>
         <w:tc>
-          <w:tcPr/>
+          <w:tcPr>
+            <w:shd w:val="clear" w:color="auto" w:fill="F6F8FA"/>
+          </w:tcPr>
           <w:p>
             <w:pPr>
               <w:numPr>
                 <w:ilvl w:val="0"/>
-                <w:numId w:val="1064"/>
+                <w:numId w:val="1065"/>
               </w:numPr>
               <w:jc w:val="left"/>
             </w:pPr>
@@ -14575,9 +14620,7 @@
       </w:tr>
       <w:tr>
         <w:tc>
-          <w:tcPr>
-            <w:shd w:val="clear" w:color="auto" w:fill="F6F8FA"/>
-          </w:tcPr>
+          <w:tcPr/>
           <w:p>
             <w:pPr>
               <w:jc w:val="left"/>
@@ -14588,9 +14631,7 @@
           </w:p>
         </w:tc>
         <w:tc>
-          <w:tcPr>
-            <w:shd w:val="clear" w:color="auto" w:fill="F6F8FA"/>
-          </w:tcPr>
+          <w:tcPr/>
           <w:p>
             <w:pPr>
               <w:jc w:val="left"/>
@@ -14601,14 +14642,12 @@
           </w:p>
         </w:tc>
         <w:tc>
-          <w:tcPr>
-            <w:shd w:val="clear" w:color="auto" w:fill="F6F8FA"/>
-          </w:tcPr>
+          <w:tcPr/>
           <w:p>
             <w:pPr>
               <w:numPr>
                 <w:ilvl w:val="0"/>
-                <w:numId w:val="1065"/>
+                <w:numId w:val="1066"/>
               </w:numPr>
               <w:jc w:val="left"/>
             </w:pPr>
@@ -14635,54 +14674,15 @@
       </w:tr>
       <w:tr>
         <w:tc>
-          <w:tcPr/>
+          <w:tcPr>
+            <w:shd w:val="clear" w:color="auto" w:fill="F6F8FA"/>
+          </w:tcPr>
           <w:p>
             <w:pPr>
               <w:jc w:val="left"/>
             </w:pPr>
             <w:r>
               <w:t xml:space="preserve">3.8.1</w:t>
-            </w:r>
-          </w:p>
-        </w:tc>
-        <w:tc>
-          <w:tcPr/>
-          <w:p>
-            <w:pPr>
-              <w:jc w:val="left"/>
-            </w:pPr>
-            <w:r>
-              <w:t xml:space="preserve">2026-09-13</w:t>
-            </w:r>
-          </w:p>
-        </w:tc>
-        <w:tc>
-          <w:tcPr/>
-          <w:p>
-            <w:pPr>
-              <w:numPr>
-                <w:ilvl w:val="0"/>
-                <w:numId w:val="1066"/>
-              </w:numPr>
-              <w:jc w:val="left"/>
-            </w:pPr>
-            <w:r>
-              <w:t xml:space="preserve">End-to-end quality review: fixed testbook PDF metadata title, removed stray user DOCX from template dir, fixed round-trip.sh variable typo, updated stale references in AGENTS.md and README.md, committed testbook sample PDFs, set TZ for pandoc cover time consistency, widened pandoc version range.</w:t>
-            </w:r>
-          </w:p>
-        </w:tc>
-      </w:tr>
-      <w:tr>
-        <w:tc>
-          <w:tcPr>
-            <w:shd w:val="clear" w:color="auto" w:fill="F6F8FA"/>
-          </w:tcPr>
-          <w:p>
-            <w:pPr>
-              <w:jc w:val="left"/>
-            </w:pPr>
-            <w:r>
-              <w:t xml:space="preserve">3.8.0</w:t>
             </w:r>
           </w:p>
         </w:tc>
@@ -14712,7 +14712,7 @@
               <w:jc w:val="left"/>
             </w:pPr>
             <w:r>
-              <w:t xml:space="preserve">Removed Tips and Tricks chapter (tmux configuration) — required VS Code-specific keybindings that don’t generalize across terminal setups.</w:t>
+              <w:t xml:space="preserve">End-to-end quality review: fixed testbook PDF metadata title, removed stray user DOCX from template dir, fixed round-trip.sh variable typo, updated stale references in AGENTS.md and README.md, committed testbook sample PDFs, set TZ for pandoc cover time consistency, widened pandoc version range.</w:t>
             </w:r>
           </w:p>
         </w:tc>
@@ -14725,7 +14725,7 @@
               <w:jc w:val="left"/>
             </w:pPr>
             <w:r>
-              <w:t xml:space="preserve">3.7.0</w:t>
+              <w:t xml:space="preserve">3.8.0</w:t>
             </w:r>
           </w:p>
         </w:tc>
@@ -14736,7 +14736,7 @@
               <w:jc w:val="left"/>
             </w:pPr>
             <w:r>
-              <w:t xml:space="preserve">2026-09-12</w:t>
+              <w:t xml:space="preserve">2026-09-13</w:t>
             </w:r>
           </w:p>
         </w:tc>
@@ -14751,6 +14751,51 @@
               <w:jc w:val="left"/>
             </w:pPr>
             <w:r>
+              <w:t xml:space="preserve">Removed Tips and Tricks chapter (tmux configuration) — required VS Code-specific keybindings that don’t generalize across terminal setups.</w:t>
+            </w:r>
+          </w:p>
+        </w:tc>
+      </w:tr>
+      <w:tr>
+        <w:tc>
+          <w:tcPr>
+            <w:shd w:val="clear" w:color="auto" w:fill="F6F8FA"/>
+          </w:tcPr>
+          <w:p>
+            <w:pPr>
+              <w:jc w:val="left"/>
+            </w:pPr>
+            <w:r>
+              <w:t xml:space="preserve">3.7.0</w:t>
+            </w:r>
+          </w:p>
+        </w:tc>
+        <w:tc>
+          <w:tcPr>
+            <w:shd w:val="clear" w:color="auto" w:fill="F6F8FA"/>
+          </w:tcPr>
+          <w:p>
+            <w:pPr>
+              <w:jc w:val="left"/>
+            </w:pPr>
+            <w:r>
+              <w:t xml:space="preserve">2026-09-12</w:t>
+            </w:r>
+          </w:p>
+        </w:tc>
+        <w:tc>
+          <w:tcPr>
+            <w:shd w:val="clear" w:color="auto" w:fill="F6F8FA"/>
+          </w:tcPr>
+          <w:p>
+            <w:pPr>
+              <w:numPr>
+                <w:ilvl w:val="0"/>
+                <w:numId w:val="1069"/>
+              </w:numPr>
+              <w:jc w:val="left"/>
+            </w:pPr>
+            <w:r>
               <w:t xml:space="preserve">Added</w:t>
             </w:r>
             <w:r>
@@ -14803,9 +14848,7 @@
       </w:tr>
       <w:tr>
         <w:tc>
-          <w:tcPr>
-            <w:shd w:val="clear" w:color="auto" w:fill="F6F8FA"/>
-          </w:tcPr>
+          <w:tcPr/>
           <w:p>
             <w:pPr>
               <w:jc w:val="left"/>
@@ -14816,9 +14859,7 @@
           </w:p>
         </w:tc>
         <w:tc>
-          <w:tcPr>
-            <w:shd w:val="clear" w:color="auto" w:fill="F6F8FA"/>
-          </w:tcPr>
+          <w:tcPr/>
           <w:p>
             <w:pPr>
               <w:jc w:val="left"/>
@@ -14829,14 +14870,12 @@
           </w:p>
         </w:tc>
         <w:tc>
-          <w:tcPr>
-            <w:shd w:val="clear" w:color="auto" w:fill="F6F8FA"/>
-          </w:tcPr>
+          <w:tcPr/>
           <w:p>
             <w:pPr>
               <w:numPr>
                 <w:ilvl w:val="0"/>
-                <w:numId w:val="1069"/>
+                <w:numId w:val="1070"/>
               </w:numPr>
               <w:jc w:val="left"/>
             </w:pPr>
@@ -14893,7 +14932,9 @@
       </w:tr>
       <w:tr>
         <w:tc>
-          <w:tcPr/>
+          <w:tcPr>
+            <w:shd w:val="clear" w:color="auto" w:fill="F6F8FA"/>
+          </w:tcPr>
           <w:p>
             <w:pPr>
               <w:jc w:val="left"/>
@@ -14904,7 +14945,9 @@
           </w:p>
         </w:tc>
         <w:tc>
-          <w:tcPr/>
+          <w:tcPr>
+            <w:shd w:val="clear" w:color="auto" w:fill="F6F8FA"/>
+          </w:tcPr>
           <w:p>
             <w:pPr>
               <w:jc w:val="left"/>
@@ -14915,12 +14958,14 @@
           </w:p>
         </w:tc>
         <w:tc>
-          <w:tcPr/>
+          <w:tcPr>
+            <w:shd w:val="clear" w:color="auto" w:fill="F6F8FA"/>
+          </w:tcPr>
           <w:p>
             <w:pPr>
               <w:numPr>
                 <w:ilvl w:val="0"/>
-                <w:numId w:val="1070"/>
+                <w:numId w:val="1071"/>
               </w:numPr>
               <w:jc w:val="left"/>
             </w:pPr>
@@ -14998,9 +15043,7 @@
       </w:tr>
       <w:tr>
         <w:tc>
-          <w:tcPr>
-            <w:shd w:val="clear" w:color="auto" w:fill="F6F8FA"/>
-          </w:tcPr>
+          <w:tcPr/>
           <w:p>
             <w:pPr>
               <w:jc w:val="left"/>
@@ -15011,9 +15054,7 @@
           </w:p>
         </w:tc>
         <w:tc>
-          <w:tcPr>
-            <w:shd w:val="clear" w:color="auto" w:fill="F6F8FA"/>
-          </w:tcPr>
+          <w:tcPr/>
           <w:p>
             <w:pPr>
               <w:jc w:val="left"/>
@@ -15024,14 +15065,12 @@
           </w:p>
         </w:tc>
         <w:tc>
-          <w:tcPr>
-            <w:shd w:val="clear" w:color="auto" w:fill="F6F8FA"/>
-          </w:tcPr>
+          <w:tcPr/>
           <w:p>
             <w:pPr>
               <w:numPr>
                 <w:ilvl w:val="0"/>
-                <w:numId w:val="1071"/>
+                <w:numId w:val="1072"/>
               </w:numPr>
               <w:jc w:val="left"/>
             </w:pPr>
@@ -15058,7 +15097,7 @@
             <w:pPr>
               <w:numPr>
                 <w:ilvl w:val="0"/>
-                <w:numId w:val="1071"/>
+                <w:numId w:val="1072"/>
               </w:numPr>
               <w:jc w:val="left"/>
             </w:pPr>
@@ -15100,7 +15139,7 @@
             <w:pPr>
               <w:numPr>
                 <w:ilvl w:val="0"/>
-                <w:numId w:val="1071"/>
+                <w:numId w:val="1072"/>
               </w:numPr>
               <w:jc w:val="left"/>
             </w:pPr>
@@ -15112,7 +15151,9 @@
       </w:tr>
       <w:tr>
         <w:tc>
-          <w:tcPr/>
+          <w:tcPr>
+            <w:shd w:val="clear" w:color="auto" w:fill="F6F8FA"/>
+          </w:tcPr>
           <w:p>
             <w:pPr>
               <w:jc w:val="left"/>
@@ -15123,7 +15164,9 @@
           </w:p>
         </w:tc>
         <w:tc>
-          <w:tcPr/>
+          <w:tcPr>
+            <w:shd w:val="clear" w:color="auto" w:fill="F6F8FA"/>
+          </w:tcPr>
           <w:p>
             <w:pPr>
               <w:jc w:val="left"/>
@@ -15134,12 +15177,14 @@
           </w:p>
         </w:tc>
         <w:tc>
-          <w:tcPr/>
+          <w:tcPr>
+            <w:shd w:val="clear" w:color="auto" w:fill="F6F8FA"/>
+          </w:tcPr>
           <w:p>
             <w:pPr>
               <w:numPr>
                 <w:ilvl w:val="0"/>
-                <w:numId w:val="1072"/>
+                <w:numId w:val="1073"/>
               </w:numPr>
               <w:jc w:val="left"/>
             </w:pPr>
@@ -15166,7 +15211,7 @@
             <w:pPr>
               <w:numPr>
                 <w:ilvl w:val="0"/>
-                <w:numId w:val="1072"/>
+                <w:numId w:val="1073"/>
               </w:numPr>
               <w:jc w:val="left"/>
             </w:pPr>
@@ -15193,7 +15238,7 @@
             <w:pPr>
               <w:numPr>
                 <w:ilvl w:val="0"/>
-                <w:numId w:val="1072"/>
+                <w:numId w:val="1073"/>
               </w:numPr>
               <w:jc w:val="left"/>
             </w:pPr>
@@ -15205,7 +15250,7 @@
             <w:pPr>
               <w:numPr>
                 <w:ilvl w:val="0"/>
-                <w:numId w:val="1072"/>
+                <w:numId w:val="1073"/>
               </w:numPr>
               <w:jc w:val="left"/>
             </w:pPr>
@@ -15229,58 +15274,13 @@
       </w:tr>
       <w:tr>
         <w:tc>
-          <w:tcPr>
-            <w:shd w:val="clear" w:color="auto" w:fill="F6F8FA"/>
-          </w:tcPr>
+          <w:tcPr/>
           <w:p>
             <w:pPr>
               <w:jc w:val="left"/>
             </w:pPr>
             <w:r>
               <w:t xml:space="preserve">3.2.1</w:t>
-            </w:r>
-          </w:p>
-        </w:tc>
-        <w:tc>
-          <w:tcPr>
-            <w:shd w:val="clear" w:color="auto" w:fill="F6F8FA"/>
-          </w:tcPr>
-          <w:p>
-            <w:pPr>
-              <w:jc w:val="left"/>
-            </w:pPr>
-            <w:r>
-              <w:t xml:space="preserve">2026-09-11</w:t>
-            </w:r>
-          </w:p>
-        </w:tc>
-        <w:tc>
-          <w:tcPr>
-            <w:shd w:val="clear" w:color="auto" w:fill="F6F8FA"/>
-          </w:tcPr>
-          <w:p>
-            <w:pPr>
-              <w:numPr>
-                <w:ilvl w:val="0"/>
-                <w:numId w:val="1073"/>
-              </w:numPr>
-              <w:jc w:val="left"/>
-            </w:pPr>
-            <w:r>
-              <w:t xml:space="preserve">Renamed Chapter 7 from “Clean Up” to “Operations and Maintenance”. Added subsections for updating and uninstalling both the MaaS Gateway and the document templates. Added cloud resource cleanup as an optional subsection.</w:t>
-            </w:r>
-          </w:p>
-        </w:tc>
-      </w:tr>
-      <w:tr>
-        <w:tc>
-          <w:tcPr/>
-          <w:p>
-            <w:pPr>
-              <w:jc w:val="left"/>
-            </w:pPr>
-            <w:r>
-              <w:t xml:space="preserve">3.2.0</w:t>
             </w:r>
           </w:p>
         </w:tc>
@@ -15306,6 +15306,51 @@
               <w:jc w:val="left"/>
             </w:pPr>
             <w:r>
+              <w:t xml:space="preserve">Renamed Chapter 7 from “Clean Up” to “Operations and Maintenance”. Added subsections for updating and uninstalling both the MaaS Gateway and the document templates. Added cloud resource cleanup as an optional subsection.</w:t>
+            </w:r>
+          </w:p>
+        </w:tc>
+      </w:tr>
+      <w:tr>
+        <w:tc>
+          <w:tcPr>
+            <w:shd w:val="clear" w:color="auto" w:fill="F6F8FA"/>
+          </w:tcPr>
+          <w:p>
+            <w:pPr>
+              <w:jc w:val="left"/>
+            </w:pPr>
+            <w:r>
+              <w:t xml:space="preserve">3.2.0</w:t>
+            </w:r>
+          </w:p>
+        </w:tc>
+        <w:tc>
+          <w:tcPr>
+            <w:shd w:val="clear" w:color="auto" w:fill="F6F8FA"/>
+          </w:tcPr>
+          <w:p>
+            <w:pPr>
+              <w:jc w:val="left"/>
+            </w:pPr>
+            <w:r>
+              <w:t xml:space="preserve">2026-09-11</w:t>
+            </w:r>
+          </w:p>
+        </w:tc>
+        <w:tc>
+          <w:tcPr>
+            <w:shd w:val="clear" w:color="auto" w:fill="F6F8FA"/>
+          </w:tcPr>
+          <w:p>
+            <w:pPr>
+              <w:numPr>
+                <w:ilvl w:val="0"/>
+                <w:numId w:val="1075"/>
+              </w:numPr>
+              <w:jc w:val="left"/>
+            </w:pPr>
+            <w:r>
               <w:t xml:space="preserve">Added</w:t>
             </w:r>
             <w:r>
@@ -15367,7 +15412,7 @@
             <w:pPr>
               <w:numPr>
                 <w:ilvl w:val="0"/>
-                <w:numId w:val="1074"/>
+                <w:numId w:val="1075"/>
               </w:numPr>
               <w:jc w:val="left"/>
             </w:pPr>
@@ -15412,7 +15457,7 @@
             <w:pPr>
               <w:numPr>
                 <w:ilvl w:val="0"/>
-                <w:numId w:val="1074"/>
+                <w:numId w:val="1075"/>
               </w:numPr>
               <w:jc w:val="left"/>
             </w:pPr>
@@ -15424,58 +15469,13 @@
       </w:tr>
       <w:tr>
         <w:tc>
-          <w:tcPr>
-            <w:shd w:val="clear" w:color="auto" w:fill="F6F8FA"/>
-          </w:tcPr>
+          <w:tcPr/>
           <w:p>
             <w:pPr>
               <w:jc w:val="left"/>
             </w:pPr>
             <w:r>
               <w:t xml:space="preserve">3.1.2</w:t>
-            </w:r>
-          </w:p>
-        </w:tc>
-        <w:tc>
-          <w:tcPr>
-            <w:shd w:val="clear" w:color="auto" w:fill="F6F8FA"/>
-          </w:tcPr>
-          <w:p>
-            <w:pPr>
-              <w:jc w:val="left"/>
-            </w:pPr>
-            <w:r>
-              <w:t xml:space="preserve">2026-09-11</w:t>
-            </w:r>
-          </w:p>
-        </w:tc>
-        <w:tc>
-          <w:tcPr>
-            <w:shd w:val="clear" w:color="auto" w:fill="F6F8FA"/>
-          </w:tcPr>
-          <w:p>
-            <w:pPr>
-              <w:numPr>
-                <w:ilvl w:val="0"/>
-                <w:numId w:val="1075"/>
-              </w:numPr>
-              <w:jc w:val="left"/>
-            </w:pPr>
-            <w:r>
-              <w:t xml:space="preserve">Added output format guide to README.md: comparison table of PDF, Markdown, DOCX, and HTML with purpose, copy-paste quality, and limitations. Recommends Markdown for copy-paste.</w:t>
-            </w:r>
-          </w:p>
-        </w:tc>
-      </w:tr>
-      <w:tr>
-        <w:tc>
-          <w:tcPr/>
-          <w:p>
-            <w:pPr>
-              <w:jc w:val="left"/>
-            </w:pPr>
-            <w:r>
-              <w:t xml:space="preserve">3.1.1</w:t>
             </w:r>
           </w:p>
         </w:tc>
@@ -15501,6 +15501,51 @@
               <w:jc w:val="left"/>
             </w:pPr>
             <w:r>
+              <w:t xml:space="preserve">Added output format guide to README.md: comparison table of PDF, Markdown, DOCX, and HTML with purpose, copy-paste quality, and limitations. Recommends Markdown for copy-paste.</w:t>
+            </w:r>
+          </w:p>
+        </w:tc>
+      </w:tr>
+      <w:tr>
+        <w:tc>
+          <w:tcPr>
+            <w:shd w:val="clear" w:color="auto" w:fill="F6F8FA"/>
+          </w:tcPr>
+          <w:p>
+            <w:pPr>
+              <w:jc w:val="left"/>
+            </w:pPr>
+            <w:r>
+              <w:t xml:space="preserve">3.1.1</w:t>
+            </w:r>
+          </w:p>
+        </w:tc>
+        <w:tc>
+          <w:tcPr>
+            <w:shd w:val="clear" w:color="auto" w:fill="F6F8FA"/>
+          </w:tcPr>
+          <w:p>
+            <w:pPr>
+              <w:jc w:val="left"/>
+            </w:pPr>
+            <w:r>
+              <w:t xml:space="preserve">2026-09-11</w:t>
+            </w:r>
+          </w:p>
+        </w:tc>
+        <w:tc>
+          <w:tcPr>
+            <w:shd w:val="clear" w:color="auto" w:fill="F6F8FA"/>
+          </w:tcPr>
+          <w:p>
+            <w:pPr>
+              <w:numPr>
+                <w:ilvl w:val="0"/>
+                <w:numId w:val="1077"/>
+              </w:numPr>
+              <w:jc w:val="left"/>
+            </w:pPr>
+            <w:r>
               <w:t xml:space="preserve">Updated MaaS Gateway chapter to v1.10.9: non-interactive mode (</w:t>
             </w:r>
             <w:r>
@@ -15517,7 +15562,7 @@
             <w:pPr>
               <w:numPr>
                 <w:ilvl w:val="0"/>
-                <w:numId w:val="1076"/>
+                <w:numId w:val="1077"/>
               </w:numPr>
               <w:jc w:val="left"/>
             </w:pPr>
@@ -15559,7 +15604,7 @@
             <w:pPr>
               <w:numPr>
                 <w:ilvl w:val="0"/>
-                <w:numId w:val="1076"/>
+                <w:numId w:val="1077"/>
               </w:numPr>
               <w:jc w:val="left"/>
             </w:pPr>
@@ -15571,9 +15616,7 @@
       </w:tr>
       <w:tr>
         <w:tc>
-          <w:tcPr>
-            <w:shd w:val="clear" w:color="auto" w:fill="F6F8FA"/>
-          </w:tcPr>
+          <w:tcPr/>
           <w:p>
             <w:pPr>
               <w:jc w:val="left"/>
@@ -15584,9 +15627,7 @@
           </w:p>
         </w:tc>
         <w:tc>
-          <w:tcPr>
-            <w:shd w:val="clear" w:color="auto" w:fill="F6F8FA"/>
-          </w:tcPr>
+          <w:tcPr/>
           <w:p>
             <w:pPr>
               <w:jc w:val="left"/>
@@ -15597,14 +15638,12 @@
           </w:p>
         </w:tc>
         <w:tc>
-          <w:tcPr>
-            <w:shd w:val="clear" w:color="auto" w:fill="F6F8FA"/>
-          </w:tcPr>
+          <w:tcPr/>
           <w:p>
             <w:pPr>
               <w:numPr>
                 <w:ilvl w:val="0"/>
-                <w:numId w:val="1077"/>
+                <w:numId w:val="1078"/>
               </w:numPr>
               <w:jc w:val="left"/>
             </w:pPr>
@@ -15628,7 +15667,7 @@
             <w:pPr>
               <w:numPr>
                 <w:ilvl w:val="0"/>
-                <w:numId w:val="1077"/>
+                <w:numId w:val="1078"/>
               </w:numPr>
               <w:jc w:val="left"/>
             </w:pPr>
@@ -15670,7 +15709,7 @@
             <w:pPr>
               <w:numPr>
                 <w:ilvl w:val="0"/>
-                <w:numId w:val="1077"/>
+                <w:numId w:val="1078"/>
               </w:numPr>
               <w:jc w:val="left"/>
             </w:pPr>
@@ -15678,57 +15717,6 @@
               <w:t xml:space="preserve">Restructured chapters: moved SSH config and VS Code connection to new Chapter 4 (Install VS Code and Connect via Remote-SSH). Chapters 5—​7 renumbered.</w:t>
             </w:r>
           </w:p>
-          <w:p>
-            <w:pPr>
-              <w:numPr>
-                <w:ilvl w:val="0"/>
-                <w:numId w:val="1077"/>
-              </w:numPr>
-              <w:jc w:val="left"/>
-            </w:pPr>
-            <w:r>
-              <w:t xml:space="preserve">Added verification checklist tables to all 7 chapters.</w:t>
-            </w:r>
-          </w:p>
-          <w:p>
-            <w:pPr>
-              <w:numPr>
-                <w:ilvl w:val="0"/>
-                <w:numId w:val="1077"/>
-              </w:numPr>
-              <w:jc w:val="left"/>
-            </w:pPr>
-            <w:r>
-              <w:t xml:space="preserve">Added mandatory reboot warning in Chapter 2 (SSH port change). Added troubleshooting subsection in Chapter 4 with common SSH connection issues and ncat debugging commands.</w:t>
-            </w:r>
-          </w:p>
-        </w:tc>
-      </w:tr>
-      <w:tr>
-        <w:tc>
-          <w:tcPr/>
-          <w:p>
-            <w:pPr>
-              <w:jc w:val="left"/>
-            </w:pPr>
-            <w:r>
-              <w:t xml:space="preserve">3.0.1</w:t>
-            </w:r>
-          </w:p>
-        </w:tc>
-        <w:tc>
-          <w:tcPr/>
-          <w:p>
-            <w:pPr>
-              <w:jc w:val="left"/>
-            </w:pPr>
-            <w:r>
-              <w:t xml:space="preserve">2026-09-10</w:t>
-            </w:r>
-          </w:p>
-        </w:tc>
-        <w:tc>
-          <w:tcPr/>
           <w:p>
             <w:pPr>
               <w:numPr>
@@ -15738,7 +15726,19 @@
               <w:jc w:val="left"/>
             </w:pPr>
             <w:r>
-              <w:t xml:space="preserve">Minor fixes: test-filter.sh auto-discovery, build.sh help text, Makefile aggregate descriptions, 5-section comment correction, CHANGELOG version gap note, callout-in-code fix, CI font auto-discovery, dofile path comment, test-sync.sh header.</w:t>
+              <w:t xml:space="preserve">Added verification checklist tables to all 7 chapters.</w:t>
+            </w:r>
+          </w:p>
+          <w:p>
+            <w:pPr>
+              <w:numPr>
+                <w:ilvl w:val="0"/>
+                <w:numId w:val="1078"/>
+              </w:numPr>
+              <w:jc w:val="left"/>
+            </w:pPr>
+            <w:r>
+              <w:t xml:space="preserve">Added mandatory reboot warning in Chapter 2 (SSH port change). Added troubleshooting subsection in Chapter 4 with common SSH connection issues and ncat debugging commands.</w:t>
             </w:r>
           </w:p>
         </w:tc>
@@ -15753,7 +15753,7 @@
               <w:jc w:val="left"/>
             </w:pPr>
             <w:r>
-              <w:t xml:space="preserve">3.0.0</w:t>
+              <w:t xml:space="preserve">3.0.1</w:t>
             </w:r>
           </w:p>
         </w:tc>
@@ -15766,7 +15766,7 @@
               <w:jc w:val="left"/>
             </w:pPr>
             <w:r>
-              <w:t xml:space="preserve">2026-09-09</w:t>
+              <w:t xml:space="preserve">2026-09-10</w:t>
             </w:r>
           </w:p>
         </w:tc>
@@ -15783,7 +15783,7 @@
               <w:jc w:val="left"/>
             </w:pPr>
             <w:r>
-              <w:t xml:space="preserve">Modular pipeline refactoring: shared Lua filter factory, shared DOCX fix logic, build system auto-discovery, unified format pipeline, GitHub Actions CI.</w:t>
+              <w:t xml:space="preserve">Minor fixes: test-filter.sh auto-discovery, build.sh help text, Makefile aggregate descriptions, 5-section comment correction, CHANGELOG version gap note, callout-in-code fix, CI font auto-discovery, dofile path comment, test-sync.sh header.</w:t>
             </w:r>
           </w:p>
         </w:tc>
@@ -15796,7 +15796,7 @@
               <w:jc w:val="left"/>
             </w:pPr>
             <w:r>
-              <w:t xml:space="preserve">2.16.0</w:t>
+              <w:t xml:space="preserve">3.0.0</w:t>
             </w:r>
           </w:p>
         </w:tc>
@@ -15807,7 +15807,7 @@
               <w:jc w:val="left"/>
             </w:pPr>
             <w:r>
-              <w:t xml:space="preserve">2026-09-05</w:t>
+              <w:t xml:space="preserve">2026-09-09</w:t>
             </w:r>
           </w:p>
         </w:tc>
@@ -15822,7 +15822,7 @@
               <w:jc w:val="left"/>
             </w:pPr>
             <w:r>
-              <w:t xml:space="preserve">Updated to match template v2.16.0 — Lua filter fixes, build system updates, and technical template parity improvements.</w:t>
+              <w:t xml:space="preserve">Modular pipeline refactoring: shared Lua filter factory, shared DOCX fix logic, build system auto-discovery, unified format pipeline, GitHub Actions CI.</w:t>
             </w:r>
           </w:p>
         </w:tc>
@@ -15837,7 +15837,7 @@
               <w:jc w:val="left"/>
             </w:pPr>
             <w:r>
-              <w:t xml:space="preserve">2.13.0</w:t>
+              <w:t xml:space="preserve">2.16.0</w:t>
             </w:r>
           </w:p>
         </w:tc>
@@ -15850,7 +15850,7 @@
               <w:jc w:val="left"/>
             </w:pPr>
             <w:r>
-              <w:t xml:space="preserve">2026-08-24</w:t>
+              <w:t xml:space="preserve">2026-09-05</w:t>
             </w:r>
           </w:p>
         </w:tc>
@@ -15867,6 +15867,45 @@
               <w:jc w:val="left"/>
             </w:pPr>
             <w:r>
+              <w:t xml:space="preserve">Updated to match template v2.16.0 — Lua filter fixes, build system updates, and technical template parity improvements.</w:t>
+            </w:r>
+          </w:p>
+        </w:tc>
+      </w:tr>
+      <w:tr>
+        <w:tc>
+          <w:tcPr/>
+          <w:p>
+            <w:pPr>
+              <w:jc w:val="left"/>
+            </w:pPr>
+            <w:r>
+              <w:t xml:space="preserve">2.13.0</w:t>
+            </w:r>
+          </w:p>
+        </w:tc>
+        <w:tc>
+          <w:tcPr/>
+          <w:p>
+            <w:pPr>
+              <w:jc w:val="left"/>
+            </w:pPr>
+            <w:r>
+              <w:t xml:space="preserve">2026-08-24</w:t>
+            </w:r>
+          </w:p>
+        </w:tc>
+        <w:tc>
+          <w:tcPr/>
+          <w:p>
+            <w:pPr>
+              <w:numPr>
+                <w:ilvl w:val="0"/>
+                <w:numId w:val="1082"/>
+              </w:numPr>
+              <w:jc w:val="left"/>
+            </w:pPr>
+            <w:r>
               <w:t xml:space="preserve">Foundation refactoring Phase 4: make DOCX</w:t>
             </w:r>
             <w:r>
@@ -15934,7 +15973,9 @@
       </w:tr>
       <w:tr>
         <w:tc>
-          <w:tcPr/>
+          <w:tcPr>
+            <w:shd w:val="clear" w:color="auto" w:fill="F6F8FA"/>
+          </w:tcPr>
           <w:p>
             <w:pPr>
               <w:jc w:val="left"/>
@@ -15945,7 +15986,9 @@
           </w:p>
         </w:tc>
         <w:tc>
-          <w:tcPr/>
+          <w:tcPr>
+            <w:shd w:val="clear" w:color="auto" w:fill="F6F8FA"/>
+          </w:tcPr>
           <w:p>
             <w:pPr>
               <w:jc w:val="left"/>
@@ -15956,12 +15999,14 @@
           </w:p>
         </w:tc>
         <w:tc>
-          <w:tcPr/>
+          <w:tcPr>
+            <w:shd w:val="clear" w:color="auto" w:fill="F6F8FA"/>
+          </w:tcPr>
           <w:p>
             <w:pPr>
               <w:numPr>
                 <w:ilvl w:val="0"/>
-                <w:numId w:val="1082"/>
+                <w:numId w:val="1083"/>
               </w:numPr>
               <w:jc w:val="left"/>
             </w:pPr>
@@ -16123,9 +16168,7 @@
       </w:tr>
       <w:tr>
         <w:tc>
-          <w:tcPr>
-            <w:shd w:val="clear" w:color="auto" w:fill="F6F8FA"/>
-          </w:tcPr>
+          <w:tcPr/>
           <w:p>
             <w:pPr>
               <w:jc w:val="left"/>
@@ -16136,9 +16179,7 @@
           </w:p>
         </w:tc>
         <w:tc>
-          <w:tcPr>
-            <w:shd w:val="clear" w:color="auto" w:fill="F6F8FA"/>
-          </w:tcPr>
+          <w:tcPr/>
           <w:p>
             <w:pPr>
               <w:jc w:val="left"/>
@@ -16149,14 +16190,12 @@
           </w:p>
         </w:tc>
         <w:tc>
-          <w:tcPr>
-            <w:shd w:val="clear" w:color="auto" w:fill="F6F8FA"/>
-          </w:tcPr>
+          <w:tcPr/>
           <w:p>
             <w:pPr>
               <w:numPr>
                 <w:ilvl w:val="0"/>
-                <w:numId w:val="1083"/>
+                <w:numId w:val="1084"/>
               </w:numPr>
               <w:jc w:val="left"/>
             </w:pPr>
@@ -16222,7 +16261,9 @@
       </w:tr>
       <w:tr>
         <w:tc>
-          <w:tcPr/>
+          <w:tcPr>
+            <w:shd w:val="clear" w:color="auto" w:fill="F6F8FA"/>
+          </w:tcPr>
           <w:p>
             <w:pPr>
               <w:jc w:val="left"/>
@@ -16233,56 +16274,15 @@
           </w:p>
         </w:tc>
         <w:tc>
-          <w:tcPr/>
+          <w:tcPr>
+            <w:shd w:val="clear" w:color="auto" w:fill="F6F8FA"/>
+          </w:tcPr>
           <w:p>
             <w:pPr>
               <w:jc w:val="left"/>
             </w:pPr>
             <w:r>
               <w:t xml:space="preserve">2026-08-24</w:t>
-            </w:r>
-          </w:p>
-        </w:tc>
-        <w:tc>
-          <w:tcPr/>
-          <w:p>
-            <w:pPr>
-              <w:numPr>
-                <w:ilvl w:val="0"/>
-                <w:numId w:val="1084"/>
-              </w:numPr>
-              <w:jc w:val="left"/>
-            </w:pPr>
-            <w:r>
-              <w:t xml:space="preserve">Foundation refactoring Phase 1: sync cls version to project tag, fix stale doc references (L16 output count, L-range, setup-guide feature claim), add test-sync.sh for version consistency checking.</w:t>
-            </w:r>
-          </w:p>
-        </w:tc>
-      </w:tr>
-      <w:tr>
-        <w:tc>
-          <w:tcPr>
-            <w:shd w:val="clear" w:color="auto" w:fill="F6F8FA"/>
-          </w:tcPr>
-          <w:p>
-            <w:pPr>
-              <w:jc w:val="left"/>
-            </w:pPr>
-            <w:r>
-              <w:t xml:space="preserve">2.9.1</w:t>
-            </w:r>
-          </w:p>
-        </w:tc>
-        <w:tc>
-          <w:tcPr>
-            <w:shd w:val="clear" w:color="auto" w:fill="F6F8FA"/>
-          </w:tcPr>
-          <w:p>
-            <w:pPr>
-              <w:jc w:val="left"/>
-            </w:pPr>
-            <w:r>
-              <w:t xml:space="preserve">2026-08-23</w:t>
             </w:r>
           </w:p>
         </w:tc>
@@ -16299,6 +16299,45 @@
               <w:jc w:val="left"/>
             </w:pPr>
             <w:r>
+              <w:t xml:space="preserve">Foundation refactoring Phase 1: sync cls version to project tag, fix stale doc references (L16 output count, L-range, setup-guide feature claim), add test-sync.sh for version consistency checking.</w:t>
+            </w:r>
+          </w:p>
+        </w:tc>
+      </w:tr>
+      <w:tr>
+        <w:tc>
+          <w:tcPr/>
+          <w:p>
+            <w:pPr>
+              <w:jc w:val="left"/>
+            </w:pPr>
+            <w:r>
+              <w:t xml:space="preserve">2.9.1</w:t>
+            </w:r>
+          </w:p>
+        </w:tc>
+        <w:tc>
+          <w:tcPr/>
+          <w:p>
+            <w:pPr>
+              <w:jc w:val="left"/>
+            </w:pPr>
+            <w:r>
+              <w:t xml:space="preserve">2026-08-23</w:t>
+            </w:r>
+          </w:p>
+        </w:tc>
+        <w:tc>
+          <w:tcPr/>
+          <w:p>
+            <w:pPr>
+              <w:numPr>
+                <w:ilvl w:val="0"/>
+                <w:numId w:val="1086"/>
+              </w:numPr>
+              <w:jc w:val="left"/>
+            </w:pPr>
+            <w:r>
               <w:t xml:space="preserve">HTML and Markdown outputs now embed images as base64 data URIs. HTML uses pandoc</w:t>
             </w:r>
             <w:r>
@@ -16330,54 +16369,15 @@
       </w:tr>
       <w:tr>
         <w:tc>
-          <w:tcPr/>
+          <w:tcPr>
+            <w:shd w:val="clear" w:color="auto" w:fill="F6F8FA"/>
+          </w:tcPr>
           <w:p>
             <w:pPr>
               <w:jc w:val="left"/>
             </w:pPr>
             <w:r>
               <w:t xml:space="preserve">2.9.0</w:t>
-            </w:r>
-          </w:p>
-        </w:tc>
-        <w:tc>
-          <w:tcPr/>
-          <w:p>
-            <w:pPr>
-              <w:jc w:val="left"/>
-            </w:pPr>
-            <w:r>
-              <w:t xml:space="preserve">2026-08-23</w:t>
-            </w:r>
-          </w:p>
-        </w:tc>
-        <w:tc>
-          <w:tcPr/>
-          <w:p>
-            <w:pPr>
-              <w:numPr>
-                <w:ilvl w:val="0"/>
-                <w:numId w:val="1086"/>
-              </w:numPr>
-              <w:jc w:val="left"/>
-            </w:pPr>
-            <w:r>
-              <w:t xml:space="preserve">DOCX: fix content width (8504→9638tw, margins are 2cm not 3cm). Add footer page numbers. Style TOC heading (22pt bold + rule). Add hutable table width + fixed layout.</w:t>
-            </w:r>
-          </w:p>
-        </w:tc>
-      </w:tr>
-      <w:tr>
-        <w:tc>
-          <w:tcPr>
-            <w:shd w:val="clear" w:color="auto" w:fill="F6F8FA"/>
-          </w:tcPr>
-          <w:p>
-            <w:pPr>
-              <w:jc w:val="left"/>
-            </w:pPr>
-            <w:r>
-              <w:t xml:space="preserve">2.8.3</w:t>
             </w:r>
           </w:p>
         </w:tc>
@@ -16407,7 +16407,7 @@
               <w:jc w:val="left"/>
             </w:pPr>
             <w:r>
-              <w:t xml:space="preserve">DOCX fix: callout tables now have explicit width (8504tw) and fixed layout. Changelog section heading now uses custom H1 format (56pt number, red border, right tab) instead of pandoc’s default.</w:t>
+              <w:t xml:space="preserve">DOCX: fix content width (8504→9638tw, margins are 2cm not 3cm). Add footer page numbers. Style TOC heading (22pt bold + rule). Add hutable table width + fixed layout.</w:t>
             </w:r>
           </w:p>
         </w:tc>
@@ -16420,7 +16420,7 @@
               <w:jc w:val="left"/>
             </w:pPr>
             <w:r>
-              <w:t xml:space="preserve">2.8.2</w:t>
+              <w:t xml:space="preserve">2.8.3</w:t>
             </w:r>
           </w:p>
         </w:tc>
@@ -16446,7 +16446,7 @@
               <w:jc w:val="left"/>
             </w:pPr>
             <w:r>
-              <w:t xml:space="preserve">DOCX H1 heading: reverted table approach to paragraph with tab stop + red bottom border. Table broke navigation pane and TOC field. Paragraph preserves Heading1 style for navigation while matching PDF layout (number left, title right, red rule below).</w:t>
+              <w:t xml:space="preserve">DOCX fix: callout tables now have explicit width (8504tw) and fixed layout. Changelog section heading now uses custom H1 format (56pt number, red border, right tab) instead of pandoc’s default.</w:t>
             </w:r>
           </w:p>
         </w:tc>
@@ -16461,7 +16461,7 @@
               <w:jc w:val="left"/>
             </w:pPr>
             <w:r>
-              <w:t xml:space="preserve">2.8.1</w:t>
+              <w:t xml:space="preserve">2.8.2</w:t>
             </w:r>
           </w:p>
         </w:tc>
@@ -16491,7 +16491,7 @@
               <w:jc w:val="left"/>
             </w:pPr>
             <w:r>
-              <w:t xml:space="preserve">DOCX heading fix: text color reverted to black (was incorrectly changed to Huawei red in v2.8.0). H1 now uses a two-column table (number left, title right) with red bottom rule. H2-H4 use simple inline format (number + title, no right tab stop).</w:t>
+              <w:t xml:space="preserve">DOCX H1 heading: reverted table approach to paragraph with tab stop + red bottom border. Table broke navigation pane and TOC field. Paragraph preserves Heading1 style for navigation while matching PDF layout (number left, title right, red rule below).</w:t>
             </w:r>
           </w:p>
         </w:tc>
@@ -16504,7 +16504,7 @@
               <w:jc w:val="left"/>
             </w:pPr>
             <w:r>
-              <w:t xml:space="preserve">2.8.0</w:t>
+              <w:t xml:space="preserve">2.8.1</w:t>
             </w:r>
           </w:p>
         </w:tc>
@@ -16530,7 +16530,7 @@
               <w:jc w:val="left"/>
             </w:pPr>
             <w:r>
-              <w:t xml:space="preserve">DOCX output: match PDF styling --- heading colors (Huawei red), H1 number size (56pt), callout borders (left-only) and padding, changelog formatting (rules, bold version, italic date), caption style (9pt bold), badge style (8pt bold white on red), list indentation.</w:t>
+              <w:t xml:space="preserve">DOCX heading fix: text color reverted to black (was incorrectly changed to Huawei red in v2.8.0). H1 now uses a two-column table (number left, title right) with red bottom rule. H2-H4 use simple inline format (number + title, no right tab stop).</w:t>
             </w:r>
           </w:p>
         </w:tc>
@@ -16545,7 +16545,7 @@
               <w:jc w:val="left"/>
             </w:pPr>
             <w:r>
-              <w:t xml:space="preserve">2.7.1</w:t>
+              <w:t xml:space="preserve">2.8.0</w:t>
             </w:r>
           </w:p>
         </w:tc>
@@ -16558,7 +16558,7 @@
               <w:jc w:val="left"/>
             </w:pPr>
             <w:r>
-              <w:t xml:space="preserve">2026-08-17</w:t>
+              <w:t xml:space="preserve">2026-08-23</w:t>
             </w:r>
           </w:p>
         </w:tc>
@@ -16575,6 +16575,45 @@
               <w:jc w:val="left"/>
             </w:pPr>
             <w:r>
+              <w:t xml:space="preserve">DOCX output: match PDF styling --- heading colors (Huawei red), H1 number size (56pt), callout borders (left-only) and padding, changelog formatting (rules, bold version, italic date), caption style (9pt bold), badge style (8pt bold white on red), list indentation.</w:t>
+            </w:r>
+          </w:p>
+        </w:tc>
+      </w:tr>
+      <w:tr>
+        <w:tc>
+          <w:tcPr/>
+          <w:p>
+            <w:pPr>
+              <w:jc w:val="left"/>
+            </w:pPr>
+            <w:r>
+              <w:t xml:space="preserve">2.7.1</w:t>
+            </w:r>
+          </w:p>
+        </w:tc>
+        <w:tc>
+          <w:tcPr/>
+          <w:p>
+            <w:pPr>
+              <w:jc w:val="left"/>
+            </w:pPr>
+            <w:r>
+              <w:t xml:space="preserve">2026-08-17</w:t>
+            </w:r>
+          </w:p>
+        </w:tc>
+        <w:tc>
+          <w:tcPr/>
+          <w:p>
+            <w:pPr>
+              <w:numPr>
+                <w:ilvl w:val="0"/>
+                <w:numId w:val="1092"/>
+              </w:numPr>
+              <w:jc w:val="left"/>
+            </w:pPr>
+            <w:r>
               <w:t xml:space="preserve">Rename project repository to all lowercase (</w:t>
             </w:r>
             <w:r>
@@ -16591,7 +16630,9 @@
       </w:tr>
       <w:tr>
         <w:tc>
-          <w:tcPr/>
+          <w:tcPr>
+            <w:shd w:val="clear" w:color="auto" w:fill="F6F8FA"/>
+          </w:tcPr>
           <w:p>
             <w:pPr>
               <w:jc w:val="left"/>
@@ -16602,7 +16643,9 @@
           </w:p>
         </w:tc>
         <w:tc>
-          <w:tcPr/>
+          <w:tcPr>
+            <w:shd w:val="clear" w:color="auto" w:fill="F6F8FA"/>
+          </w:tcPr>
           <w:p>
             <w:pPr>
               <w:jc w:val="left"/>
@@ -16613,12 +16656,14 @@
           </w:p>
         </w:tc>
         <w:tc>
-          <w:tcPr/>
+          <w:tcPr>
+            <w:shd w:val="clear" w:color="auto" w:fill="F6F8FA"/>
+          </w:tcPr>
           <w:p>
             <w:pPr>
               <w:numPr>
                 <w:ilvl w:val="0"/>
-                <w:numId w:val="1092"/>
+                <w:numId w:val="1093"/>
               </w:numPr>
               <w:jc w:val="left"/>
             </w:pPr>
@@ -16660,9 +16705,7 @@
       </w:tr>
       <w:tr>
         <w:tc>
-          <w:tcPr>
-            <w:shd w:val="clear" w:color="auto" w:fill="F6F8FA"/>
-          </w:tcPr>
+          <w:tcPr/>
           <w:p>
             <w:pPr>
               <w:jc w:val="left"/>
@@ -16673,9 +16716,7 @@
           </w:p>
         </w:tc>
         <w:tc>
-          <w:tcPr>
-            <w:shd w:val="clear" w:color="auto" w:fill="F6F8FA"/>
-          </w:tcPr>
+          <w:tcPr/>
           <w:p>
             <w:pPr>
               <w:jc w:val="left"/>
@@ -16686,14 +16727,12 @@
           </w:p>
         </w:tc>
         <w:tc>
-          <w:tcPr>
-            <w:shd w:val="clear" w:color="auto" w:fill="F6F8FA"/>
-          </w:tcPr>
+          <w:tcPr/>
           <w:p>
             <w:pPr>
               <w:numPr>
                 <w:ilvl w:val="0"/>
-                <w:numId w:val="1093"/>
+                <w:numId w:val="1094"/>
               </w:numPr>
               <w:jc w:val="left"/>
             </w:pPr>
@@ -16750,7 +16789,9 @@
       </w:tr>
       <w:tr>
         <w:tc>
-          <w:tcPr/>
+          <w:tcPr>
+            <w:shd w:val="clear" w:color="auto" w:fill="F6F8FA"/>
+          </w:tcPr>
           <w:p>
             <w:pPr>
               <w:jc w:val="left"/>
@@ -16761,7 +16802,9 @@
           </w:p>
         </w:tc>
         <w:tc>
-          <w:tcPr/>
+          <w:tcPr>
+            <w:shd w:val="clear" w:color="auto" w:fill="F6F8FA"/>
+          </w:tcPr>
           <w:p>
             <w:pPr>
               <w:jc w:val="left"/>
@@ -16772,12 +16815,14 @@
           </w:p>
         </w:tc>
         <w:tc>
-          <w:tcPr/>
+          <w:tcPr>
+            <w:shd w:val="clear" w:color="auto" w:fill="F6F8FA"/>
+          </w:tcPr>
           <w:p>
             <w:pPr>
               <w:numPr>
                 <w:ilvl w:val="0"/>
-                <w:numId w:val="1094"/>
+                <w:numId w:val="1095"/>
               </w:numPr>
               <w:jc w:val="left"/>
             </w:pPr>
@@ -16804,7 +16849,7 @@
             <w:pPr>
               <w:numPr>
                 <w:ilvl w:val="0"/>
-                <w:numId w:val="1094"/>
+                <w:numId w:val="1095"/>
               </w:numPr>
               <w:jc w:val="left"/>
             </w:pPr>
@@ -16831,58 +16876,13 @@
       </w:tr>
       <w:tr>
         <w:tc>
-          <w:tcPr>
-            <w:shd w:val="clear" w:color="auto" w:fill="F6F8FA"/>
-          </w:tcPr>
+          <w:tcPr/>
           <w:p>
             <w:pPr>
               <w:jc w:val="left"/>
             </w:pPr>
             <w:r>
               <w:t xml:space="preserve">2.5.1</w:t>
-            </w:r>
-          </w:p>
-        </w:tc>
-        <w:tc>
-          <w:tcPr>
-            <w:shd w:val="clear" w:color="auto" w:fill="F6F8FA"/>
-          </w:tcPr>
-          <w:p>
-            <w:pPr>
-              <w:jc w:val="left"/>
-            </w:pPr>
-            <w:r>
-              <w:t xml:space="preserve">2026-08-10</w:t>
-            </w:r>
-          </w:p>
-        </w:tc>
-        <w:tc>
-          <w:tcPr>
-            <w:shd w:val="clear" w:color="auto" w:fill="F6F8FA"/>
-          </w:tcPr>
-          <w:p>
-            <w:pPr>
-              <w:numPr>
-                <w:ilvl w:val="0"/>
-                <w:numId w:val="1095"/>
-              </w:numPr>
-              <w:jc w:val="left"/>
-            </w:pPr>
-            <w:r>
-              <w:t xml:space="preserve">H1 section title size reduced from 27pt to 20pt.</w:t>
-            </w:r>
-          </w:p>
-        </w:tc>
-      </w:tr>
-      <w:tr>
-        <w:tc>
-          <w:tcPr/>
-          <w:p>
-            <w:pPr>
-              <w:jc w:val="left"/>
-            </w:pPr>
-            <w:r>
-              <w:t xml:space="preserve">2.5.0</w:t>
             </w:r>
           </w:p>
         </w:tc>
@@ -16908,13 +16908,7 @@
               <w:jc w:val="left"/>
             </w:pPr>
             <w:r>
-              <w:t xml:space="preserve">Default image size increased: width 65% → 90% of text width,</w:t>
-            </w:r>
-            <w:r>
-              <w:t xml:space="preserve"> </w:t>
-            </w:r>
-            <w:r>
-              <w:t xml:space="preserve">height 40% → 50% of text height.</w:t>
+              <w:t xml:space="preserve">H1 section title size reduced from 27pt to 20pt.</w:t>
             </w:r>
           </w:p>
         </w:tc>
@@ -16929,7 +16923,7 @@
               <w:jc w:val="left"/>
             </w:pPr>
             <w:r>
-              <w:t xml:space="preserve">2.4.0</w:t>
+              <w:t xml:space="preserve">2.5.0</w:t>
             </w:r>
           </w:p>
         </w:tc>
@@ -16959,14 +16953,59 @@
               <w:jc w:val="left"/>
             </w:pPr>
             <w:r>
-              <w:t xml:space="preserve">Enlarged H1 section title (18pt → 27pt, 50% bigger).</w:t>
-            </w:r>
-          </w:p>
+              <w:t xml:space="preserve">Default image size increased: width 65% → 90% of text width,</w:t>
+            </w:r>
+            <w:r>
+              <w:t xml:space="preserve"> </w:t>
+            </w:r>
+            <w:r>
+              <w:t xml:space="preserve">height 40% → 50% of text height.</w:t>
+            </w:r>
+          </w:p>
+        </w:tc>
+      </w:tr>
+      <w:tr>
+        <w:tc>
+          <w:tcPr/>
+          <w:p>
+            <w:pPr>
+              <w:jc w:val="left"/>
+            </w:pPr>
+            <w:r>
+              <w:t xml:space="preserve">2.4.0</w:t>
+            </w:r>
+          </w:p>
+        </w:tc>
+        <w:tc>
+          <w:tcPr/>
+          <w:p>
+            <w:pPr>
+              <w:jc w:val="left"/>
+            </w:pPr>
+            <w:r>
+              <w:t xml:space="preserve">2026-08-10</w:t>
+            </w:r>
+          </w:p>
+        </w:tc>
+        <w:tc>
+          <w:tcPr/>
           <w:p>
             <w:pPr>
               <w:numPr>
                 <w:ilvl w:val="0"/>
-                <w:numId w:val="1097"/>
+                <w:numId w:val="1098"/>
+              </w:numPr>
+              <w:jc w:val="left"/>
+            </w:pPr>
+            <w:r>
+              <w:t xml:space="preserve">Enlarged H1 section title (18pt → 27pt, 50% bigger).</w:t>
+            </w:r>
+          </w:p>
+          <w:p>
+            <w:pPr>
+              <w:numPr>
+                <w:ilvl w:val="0"/>
+                <w:numId w:val="1098"/>
               </w:numPr>
               <w:jc w:val="left"/>
             </w:pPr>
@@ -16993,7 +17032,9 @@
       </w:tr>
       <w:tr>
         <w:tc>
-          <w:tcPr/>
+          <w:tcPr>
+            <w:shd w:val="clear" w:color="auto" w:fill="F6F8FA"/>
+          </w:tcPr>
           <w:p>
             <w:pPr>
               <w:jc w:val="left"/>
@@ -17004,7 +17045,9 @@
           </w:p>
         </w:tc>
         <w:tc>
-          <w:tcPr/>
+          <w:tcPr>
+            <w:shd w:val="clear" w:color="auto" w:fill="F6F8FA"/>
+          </w:tcPr>
           <w:p>
             <w:pPr>
               <w:jc w:val="left"/>
@@ -17015,12 +17058,14 @@
           </w:p>
         </w:tc>
         <w:tc>
-          <w:tcPr/>
+          <w:tcPr>
+            <w:shd w:val="clear" w:color="auto" w:fill="F6F8FA"/>
+          </w:tcPr>
           <w:p>
             <w:pPr>
               <w:numPr>
                 <w:ilvl w:val="0"/>
-                <w:numId w:val="1098"/>
+                <w:numId w:val="1099"/>
               </w:numPr>
               <w:jc w:val="left"/>
             </w:pPr>
@@ -17047,9 +17092,7 @@
       </w:tr>
       <w:tr>
         <w:tc>
-          <w:tcPr>
-            <w:shd w:val="clear" w:color="auto" w:fill="F6F8FA"/>
-          </w:tcPr>
+          <w:tcPr/>
           <w:p>
             <w:pPr>
               <w:jc w:val="left"/>
@@ -17060,9 +17103,7 @@
           </w:p>
         </w:tc>
         <w:tc>
-          <w:tcPr>
-            <w:shd w:val="clear" w:color="auto" w:fill="F6F8FA"/>
-          </w:tcPr>
+          <w:tcPr/>
           <w:p>
             <w:pPr>
               <w:jc w:val="left"/>
@@ -17073,14 +17114,12 @@
           </w:p>
         </w:tc>
         <w:tc>
-          <w:tcPr>
-            <w:shd w:val="clear" w:color="auto" w:fill="F6F8FA"/>
-          </w:tcPr>
+          <w:tcPr/>
           <w:p>
             <w:pPr>
               <w:numPr>
                 <w:ilvl w:val="0"/>
-                <w:numId w:val="1099"/>
+                <w:numId w:val="1100"/>
               </w:numPr>
               <w:jc w:val="left"/>
             </w:pPr>
@@ -17152,7 +17191,9 @@
       </w:tr>
       <w:tr>
         <w:tc>
-          <w:tcPr/>
+          <w:tcPr>
+            <w:shd w:val="clear" w:color="auto" w:fill="F6F8FA"/>
+          </w:tcPr>
           <w:p>
             <w:pPr>
               <w:jc w:val="left"/>
@@ -17163,7 +17204,9 @@
           </w:p>
         </w:tc>
         <w:tc>
-          <w:tcPr/>
+          <w:tcPr>
+            <w:shd w:val="clear" w:color="auto" w:fill="F6F8FA"/>
+          </w:tcPr>
           <w:p>
             <w:pPr>
               <w:jc w:val="left"/>
@@ -17174,12 +17217,14 @@
           </w:p>
         </w:tc>
         <w:tc>
-          <w:tcPr/>
+          <w:tcPr>
+            <w:shd w:val="clear" w:color="auto" w:fill="F6F8FA"/>
+          </w:tcPr>
           <w:p>
             <w:pPr>
               <w:numPr>
                 <w:ilvl w:val="0"/>
-                <w:numId w:val="1100"/>
+                <w:numId w:val="1101"/>
               </w:numPr>
               <w:jc w:val="left"/>
             </w:pPr>
@@ -17236,9 +17281,7 @@
       </w:tr>
       <w:tr>
         <w:tc>
-          <w:tcPr>
-            <w:shd w:val="clear" w:color="auto" w:fill="F6F8FA"/>
-          </w:tcPr>
+          <w:tcPr/>
           <w:p>
             <w:pPr>
               <w:jc w:val="left"/>
@@ -17249,9 +17292,7 @@
           </w:p>
         </w:tc>
         <w:tc>
-          <w:tcPr>
-            <w:shd w:val="clear" w:color="auto" w:fill="F6F8FA"/>
-          </w:tcPr>
+          <w:tcPr/>
           <w:p>
             <w:pPr>
               <w:jc w:val="left"/>
@@ -17262,14 +17303,12 @@
           </w:p>
         </w:tc>
         <w:tc>
-          <w:tcPr>
-            <w:shd w:val="clear" w:color="auto" w:fill="F6F8FA"/>
-          </w:tcPr>
+          <w:tcPr/>
           <w:p>
             <w:pPr>
               <w:numPr>
                 <w:ilvl w:val="0"/>
-                <w:numId w:val="1101"/>
+                <w:numId w:val="1102"/>
               </w:numPr>
               <w:jc w:val="left"/>
             </w:pPr>
@@ -17296,54 +17335,15 @@
       </w:tr>
       <w:tr>
         <w:tc>
-          <w:tcPr/>
+          <w:tcPr>
+            <w:shd w:val="clear" w:color="auto" w:fill="F6F8FA"/>
+          </w:tcPr>
           <w:p>
             <w:pPr>
               <w:jc w:val="left"/>
             </w:pPr>
             <w:r>
               <w:t xml:space="preserve">2.2.2</w:t>
-            </w:r>
-          </w:p>
-        </w:tc>
-        <w:tc>
-          <w:tcPr/>
-          <w:p>
-            <w:pPr>
-              <w:jc w:val="left"/>
-            </w:pPr>
-            <w:r>
-              <w:t xml:space="preserve">2026-08-08</w:t>
-            </w:r>
-          </w:p>
-        </w:tc>
-        <w:tc>
-          <w:tcPr/>
-          <w:p>
-            <w:pPr>
-              <w:numPr>
-                <w:ilvl w:val="0"/>
-                <w:numId w:val="1102"/>
-              </w:numPr>
-              <w:jc w:val="left"/>
-            </w:pPr>
-            <w:r>
-              <w:t xml:space="preserve">Fixed chapter reference in prerequisite (Chapter 3 → Chapter 4).</w:t>
-            </w:r>
-          </w:p>
-        </w:tc>
-      </w:tr>
-      <w:tr>
-        <w:tc>
-          <w:tcPr>
-            <w:shd w:val="clear" w:color="auto" w:fill="F6F8FA"/>
-          </w:tcPr>
-          <w:p>
-            <w:pPr>
-              <w:jc w:val="left"/>
-            </w:pPr>
-            <w:r>
-              <w:t xml:space="preserve">2.2.1</w:t>
             </w:r>
           </w:p>
         </w:tc>
@@ -17373,7 +17373,7 @@
               <w:jc w:val="left"/>
             </w:pPr>
             <w:r>
-              <w:t xml:space="preserve">Changed table and figure caption labels to black (was Huawei red).</w:t>
+              <w:t xml:space="preserve">Fixed chapter reference in prerequisite (Chapter 3 → Chapter 4).</w:t>
             </w:r>
           </w:p>
         </w:tc>
@@ -17386,7 +17386,7 @@
               <w:jc w:val="left"/>
             </w:pPr>
             <w:r>
-              <w:t xml:space="preserve">2.2.0</w:t>
+              <w:t xml:space="preserve">2.2.1</w:t>
             </w:r>
           </w:p>
         </w:tc>
@@ -17412,13 +17412,7 @@
               <w:jc w:val="left"/>
             </w:pPr>
             <w:r>
-              <w:t xml:space="preserve">Added Huawei-branded table styling: red header bar, alternating row</w:t>
-            </w:r>
-            <w:r>
-              <w:t xml:space="preserve"> </w:t>
-            </w:r>
-            <w:r>
-              <w:t xml:space="preserve">colors, and bordered cells.</w:t>
+              <w:t xml:space="preserve">Changed table and figure caption labels to black (was Huawei red).</w:t>
             </w:r>
           </w:p>
         </w:tc>
@@ -17433,7 +17427,7 @@
               <w:jc w:val="left"/>
             </w:pPr>
             <w:r>
-              <w:t xml:space="preserve">2.1.0</w:t>
+              <w:t xml:space="preserve">2.2.0</w:t>
             </w:r>
           </w:p>
         </w:tc>
@@ -17446,7 +17440,7 @@
               <w:jc w:val="left"/>
             </w:pPr>
             <w:r>
-              <w:t xml:space="preserve">2026-08-06</w:t>
+              <w:t xml:space="preserve">2026-08-08</w:t>
             </w:r>
           </w:p>
         </w:tc>
@@ -17463,6 +17457,51 @@
               <w:jc w:val="left"/>
             </w:pPr>
             <w:r>
+              <w:t xml:space="preserve">Added Huawei-branded table styling: red header bar, alternating row</w:t>
+            </w:r>
+            <w:r>
+              <w:t xml:space="preserve"> </w:t>
+            </w:r>
+            <w:r>
+              <w:t xml:space="preserve">colors, and bordered cells.</w:t>
+            </w:r>
+          </w:p>
+        </w:tc>
+      </w:tr>
+      <w:tr>
+        <w:tc>
+          <w:tcPr/>
+          <w:p>
+            <w:pPr>
+              <w:jc w:val="left"/>
+            </w:pPr>
+            <w:r>
+              <w:t xml:space="preserve">2.1.0</w:t>
+            </w:r>
+          </w:p>
+        </w:tc>
+        <w:tc>
+          <w:tcPr/>
+          <w:p>
+            <w:pPr>
+              <w:jc w:val="left"/>
+            </w:pPr>
+            <w:r>
+              <w:t xml:space="preserve">2026-08-06</w:t>
+            </w:r>
+          </w:p>
+        </w:tc>
+        <w:tc>
+          <w:tcPr/>
+          <w:p>
+            <w:pPr>
+              <w:numPr>
+                <w:ilvl w:val="0"/>
+                <w:numId w:val="1106"/>
+              </w:numPr>
+              <w:jc w:val="left"/>
+            </w:pPr>
+            <w:r>
               <w:t xml:space="preserve">Updated ECS flavor to</w:t>
             </w:r>
             <w:r>
@@ -17485,7 +17524,7 @@
             <w:pPr>
               <w:numPr>
                 <w:ilvl w:val="0"/>
-                <w:numId w:val="1105"/>
+                <w:numId w:val="1106"/>
               </w:numPr>
               <w:jc w:val="left"/>
             </w:pPr>
@@ -17497,7 +17536,7 @@
             <w:pPr>
               <w:numPr>
                 <w:ilvl w:val="0"/>
-                <w:numId w:val="1105"/>
+                <w:numId w:val="1106"/>
               </w:numPr>
               <w:jc w:val="left"/>
             </w:pPr>
@@ -17509,7 +17548,7 @@
             <w:pPr>
               <w:numPr>
                 <w:ilvl w:val="0"/>
-                <w:numId w:val="1105"/>
+                <w:numId w:val="1106"/>
               </w:numPr>
               <w:jc w:val="left"/>
             </w:pPr>
@@ -17521,7 +17560,7 @@
             <w:pPr>
               <w:numPr>
                 <w:ilvl w:val="0"/>
-                <w:numId w:val="1105"/>
+                <w:numId w:val="1106"/>
               </w:numPr>
               <w:jc w:val="left"/>
             </w:pPr>
@@ -17533,7 +17572,7 @@
             <w:pPr>
               <w:numPr>
                 <w:ilvl w:val="0"/>
-                <w:numId w:val="1105"/>
+                <w:numId w:val="1106"/>
               </w:numPr>
               <w:jc w:val="left"/>
             </w:pPr>
@@ -17551,7 +17590,7 @@
             <w:pPr>
               <w:numPr>
                 <w:ilvl w:val="0"/>
-                <w:numId w:val="1105"/>
+                <w:numId w:val="1106"/>
               </w:numPr>
               <w:jc w:val="left"/>
             </w:pPr>
@@ -17600,7 +17639,7 @@
             <w:pPr>
               <w:numPr>
                 <w:ilvl w:val="0"/>
-                <w:numId w:val="1105"/>
+                <w:numId w:val="1106"/>
               </w:numPr>
               <w:jc w:val="left"/>
             </w:pPr>
@@ -17612,7 +17651,7 @@
             <w:pPr>
               <w:numPr>
                 <w:ilvl w:val="0"/>
-                <w:numId w:val="1105"/>
+                <w:numId w:val="1106"/>
               </w:numPr>
               <w:jc w:val="left"/>
             </w:pPr>
@@ -17663,7 +17702,7 @@
             <w:pPr>
               <w:numPr>
                 <w:ilvl w:val="0"/>
-                <w:numId w:val="1105"/>
+                <w:numId w:val="1106"/>
               </w:numPr>
               <w:jc w:val="left"/>
             </w:pPr>
@@ -17690,7 +17729,9 @@
       </w:tr>
       <w:tr>
         <w:tc>
-          <w:tcPr/>
+          <w:tcPr>
+            <w:shd w:val="clear" w:color="auto" w:fill="F6F8FA"/>
+          </w:tcPr>
           <w:p>
             <w:pPr>
               <w:jc w:val="left"/>
@@ -17701,7 +17742,9 @@
           </w:p>
         </w:tc>
         <w:tc>
-          <w:tcPr/>
+          <w:tcPr>
+            <w:shd w:val="clear" w:color="auto" w:fill="F6F8FA"/>
+          </w:tcPr>
           <w:p>
             <w:pPr>
               <w:jc w:val="left"/>
@@ -17712,12 +17755,14 @@
           </w:p>
         </w:tc>
         <w:tc>
-          <w:tcPr/>
+          <w:tcPr>
+            <w:shd w:val="clear" w:color="auto" w:fill="F6F8FA"/>
+          </w:tcPr>
           <w:p>
             <w:pPr>
               <w:numPr>
                 <w:ilvl w:val="0"/>
-                <w:numId w:val="1106"/>
+                <w:numId w:val="1107"/>
               </w:numPr>
               <w:jc w:val="left"/>
             </w:pPr>
@@ -17735,7 +17780,7 @@
             <w:pPr>
               <w:numPr>
                 <w:ilvl w:val="0"/>
-                <w:numId w:val="1106"/>
+                <w:numId w:val="1107"/>
               </w:numPr>
               <w:jc w:val="left"/>
             </w:pPr>
@@ -17789,7 +17834,7 @@
             <w:pPr>
               <w:numPr>
                 <w:ilvl w:val="0"/>
-                <w:numId w:val="1106"/>
+                <w:numId w:val="1107"/>
               </w:numPr>
               <w:jc w:val="left"/>
             </w:pPr>
@@ -17837,7 +17882,7 @@
             <w:pPr>
               <w:numPr>
                 <w:ilvl w:val="0"/>
-                <w:numId w:val="1106"/>
+                <w:numId w:val="1107"/>
               </w:numPr>
               <w:jc w:val="left"/>
             </w:pPr>
@@ -17858,9 +17903,7 @@
       </w:tr>
       <w:tr>
         <w:tc>
-          <w:tcPr>
-            <w:shd w:val="clear" w:color="auto" w:fill="F6F8FA"/>
-          </w:tcPr>
+          <w:tcPr/>
           <w:p>
             <w:pPr>
               <w:jc w:val="left"/>
@@ -17871,9 +17914,7 @@
           </w:p>
         </w:tc>
         <w:tc>
-          <w:tcPr>
-            <w:shd w:val="clear" w:color="auto" w:fill="F6F8FA"/>
-          </w:tcPr>
+          <w:tcPr/>
           <w:p>
             <w:pPr>
               <w:jc w:val="left"/>
@@ -17884,14 +17925,12 @@
           </w:p>
         </w:tc>
         <w:tc>
-          <w:tcPr>
-            <w:shd w:val="clear" w:color="auto" w:fill="F6F8FA"/>
-          </w:tcPr>
+          <w:tcPr/>
           <w:p>
             <w:pPr>
               <w:numPr>
                 <w:ilvl w:val="0"/>
-                <w:numId w:val="1107"/>
+                <w:numId w:val="1108"/>
               </w:numPr>
               <w:jc w:val="left"/>
             </w:pPr>
@@ -17903,7 +17942,7 @@
             <w:pPr>
               <w:numPr>
                 <w:ilvl w:val="0"/>
-                <w:numId w:val="1107"/>
+                <w:numId w:val="1108"/>
               </w:numPr>
               <w:jc w:val="left"/>
             </w:pPr>
@@ -17915,7 +17954,7 @@
             <w:pPr>
               <w:numPr>
                 <w:ilvl w:val="0"/>
-                <w:numId w:val="1107"/>
+                <w:numId w:val="1108"/>
               </w:numPr>
               <w:jc w:val="left"/>
             </w:pPr>
@@ -17927,7 +17966,7 @@
             <w:pPr>
               <w:numPr>
                 <w:ilvl w:val="0"/>
-                <w:numId w:val="1107"/>
+                <w:numId w:val="1108"/>
               </w:numPr>
               <w:jc w:val="left"/>
             </w:pPr>
@@ -17945,7 +17984,7 @@
             <w:pPr>
               <w:numPr>
                 <w:ilvl w:val="0"/>
-                <w:numId w:val="1107"/>
+                <w:numId w:val="1108"/>
               </w:numPr>
               <w:jc w:val="left"/>
             </w:pPr>
@@ -17957,7 +17996,7 @@
             <w:pPr>
               <w:numPr>
                 <w:ilvl w:val="0"/>
-                <w:numId w:val="1107"/>
+                <w:numId w:val="1108"/>
               </w:numPr>
               <w:jc w:val="left"/>
             </w:pPr>
@@ -19323,6 +19362,9 @@
     <w:abstractNumId w:val="991"/>
   </w:num>
   <w:num w:numId="1107">
+    <w:abstractNumId w:val="991"/>
+  </w:num>
+  <w:num w:numId="1108">
     <w:abstractNumId w:val="991"/>
   </w:num>
 </w:numbering>

</xml_diff>

<commit_message>
Harden DOCX/MD/HTML pipeline robustness (v6.6.0)
- Fail loudly when DOCX content styling errors; TESTCASE markers are
  stripped in a finally so they can never ship in output
- Add explicit --template flag to the DOCX fixer (wrappers inject it);
  badge sizing no longer sniffs the output path
- build.sh: clean temp files/dirs on all exit paths (EXIT trap); make
  asciidoctor-diagram optional for HTML generation (same guard as DOCX/MD)
- Pandoc version pin downgraded to a warning (out-of-range proceeds;
  parse failure and missing pandoc stay hard errors)
- test-docx-fix: new assertions — styling failure exits loudly and
  markers are stripped (mocked failure on a pre-fix DOCX)
- Bump all templates + setup-guide to v6.6.0; regenerate committed artifacts
</commit_message>
<xml_diff>
--- a/documents/setup-guide/setup-guide.docx
+++ b/documents/setup-guide/setup-guide.docx
@@ -84,7 +84,7 @@
           <w:b/>
           <w:sz w:val="24"/>
         </w:rPr>
-        <w:t xml:space="preserve">v6.5.2</w:t>
+        <w:t xml:space="preserve">v6.6.0</w:t>
       </w:r>
       <w:r>
         <w:rPr>
@@ -96,7 +96,7 @@
         <w:rPr>
           <w:sz w:val="24"/>
         </w:rPr>
-        <w:t xml:space="preserve">— September 20, 2026 14:01</w:t>
+        <w:t xml:space="preserve">— September 20, 2026 14:27</w:t>
       </w:r>
     </w:p>
     <w:sdt>
@@ -13345,7 +13345,7 @@
               <w:jc w:val="left"/>
             </w:pPr>
             <w:r>
-              <w:t xml:space="preserve">6.5.2</w:t>
+              <w:t xml:space="preserve">6.6.0</w:t>
             </w:r>
           </w:p>
         </w:tc>
@@ -13371,7 +13371,22 @@
               <w:jc w:val="left"/>
             </w:pPr>
             <w:r>
-              <w:t xml:space="preserve">Quality-pass fixes for v6.5.1: LaTeX quote conversion now handles only paired quotes (quote characters inside code arguments are no longer corrupted); signature cells containing escaped ampersands are no longer split; round-trip HTML generation guards the asciidoctor-diagram dependency and fails loudly when generation fails; pre-processor unit tests now cover pipe escaping in all five table handlers.</w:t>
+              <w:t xml:space="preserve">Pipeline robustness: DOCX post-processing now fails loudly when content styling errors occur (TESTCASE markers can no longer leak into output); the DOCX fixer takes an explicit</w:t>
+            </w:r>
+            <w:r>
+              <w:t xml:space="preserve"> </w:t>
+            </w:r>
+            <w:r>
+              <w:rPr>
+                <w:rStyle w:val="VerbatimChar"/>
+              </w:rPr>
+              <w:t xml:space="preserve">--template</w:t>
+            </w:r>
+            <w:r>
+              <w:t xml:space="preserve"> </w:t>
+            </w:r>
+            <w:r>
+              <w:t xml:space="preserve">flag so badge sizing no longer sniffs the output path; build.sh cleans temporary files on all exit paths and makes the asciidoctor-diagram dependency optional for HTML generation; the pandoc version pin now warns instead of failing hard.</w:t>
             </w:r>
           </w:p>
         </w:tc>
@@ -13386,7 +13401,7 @@
               <w:jc w:val="left"/>
             </w:pPr>
             <w:r>
-              <w:t xml:space="preserve">6.5.1</w:t>
+              <w:t xml:space="preserve">6.5.2</w:t>
             </w:r>
           </w:p>
         </w:tc>
@@ -13416,7 +13431,7 @@
               <w:jc w:val="left"/>
             </w:pPr>
             <w:r>
-              <w:t xml:space="preserve">Fixed DOCX/MD/HTML output: tables are no longer corrupted when changelog, signature, or summary content contains a pipe character (“|”). Badge text is now preserved in DOCX/MD/HTML — a “Ready” badge renders “Ready” instead of “[NEW]”. Multi-item changelog entries render as bullet lists instead of being joined with a literal “+”. POC documents now include the changelog in DOCX/MD/HTML. The :noanswers: attribute now hides test results and remarks in DOCX/MD/HTML, matching the PDF. Inline LaTeX (monospace text, arrows, LaTeX quotes) no longer leaks from changelog entries. The test suite now exercises the real build pipeline (pre-processor wired into round-trip and DOCX tests), with new pre-processor unit tests.</w:t>
+              <w:t xml:space="preserve">Quality-pass fixes for v6.5.1: LaTeX quote conversion now handles only paired quotes (quote characters inside code arguments are no longer corrupted); signature cells containing escaped ampersands are no longer split; round-trip HTML generation guards the asciidoctor-diagram dependency and fails loudly when generation fails; pre-processor unit tests now cover pipe escaping in all five table handlers.</w:t>
             </w:r>
           </w:p>
         </w:tc>
@@ -13429,7 +13444,7 @@
               <w:jc w:val="left"/>
             </w:pPr>
             <w:r>
-              <w:t xml:space="preserve">6.5.0</w:t>
+              <w:t xml:space="preserve">6.5.1</w:t>
             </w:r>
           </w:p>
         </w:tc>
@@ -13455,7 +13470,7 @@
               <w:jc w:val="left"/>
             </w:pPr>
             <w:r>
-              <w:t xml:space="preserve">Evidence checklist simplified to plain bullets in both PDF and DOCX (checkbox markers removed for compatibility). Planned Activities list in DOCX now uses Word’s native lower-roman numbering (i., ii., iii.) matching the PDF. Badges in DOCX replaced with exact-replica PNG pill images (rounded, colored frame and background, bold text) matching the PDF \ huaweibadge look — assets committed to the repo. Signature blocks in DOCX no longer show literal + symbols (proper hard line breaks).</w:t>
+              <w:t xml:space="preserve">Fixed DOCX/MD/HTML output: tables are no longer corrupted when changelog, signature, or summary content contains a pipe character (“|”). Badge text is now preserved in DOCX/MD/HTML — a “Ready” badge renders “Ready” instead of “[NEW]”. Multi-item changelog entries render as bullet lists instead of being joined with a literal “+”. POC documents now include the changelog in DOCX/MD/HTML. The :noanswers: attribute now hides test results and remarks in DOCX/MD/HTML, matching the PDF. Inline LaTeX (monospace text, arrows, LaTeX quotes) no longer leaks from changelog entries. The test suite now exercises the real build pipeline (pre-processor wired into round-trip and DOCX tests), with new pre-processor unit tests.</w:t>
             </w:r>
           </w:p>
         </w:tc>
@@ -13470,7 +13485,7 @@
               <w:jc w:val="left"/>
             </w:pPr>
             <w:r>
-              <w:t xml:space="preserve">6.4.7</w:t>
+              <w:t xml:space="preserve">6.5.0</w:t>
             </w:r>
           </w:p>
         </w:tc>
@@ -13500,7 +13515,7 @@
               <w:jc w:val="left"/>
             </w:pPr>
             <w:r>
-              <w:t xml:space="preserve">Section titles in DOCX now match the PDF heading design: the big section number (56pt) sits on the left, the title text is pushed to the right edge (a right tab stop mimics the LaTeX \ hfill), and the red rule runs below — previously the title sat left-aligned next to a small number. Applies to all templates.</w:t>
+              <w:t xml:space="preserve">Evidence checklist simplified to plain bullets in both PDF and DOCX (checkbox markers removed for compatibility). Planned Activities list in DOCX now uses Word’s native lower-roman numbering (i., ii., iii.) matching the PDF. Badges in DOCX replaced with exact-replica PNG pill images (rounded, colored frame and background, bold text) matching the PDF \ huaweibadge look — assets committed to the repo. Signature blocks in DOCX no longer show literal + symbols (proper hard line breaks).</w:t>
             </w:r>
           </w:p>
         </w:tc>
@@ -13513,7 +13528,7 @@
               <w:jc w:val="left"/>
             </w:pPr>
             <w:r>
-              <w:t xml:space="preserve">6.4.6</w:t>
+              <w:t xml:space="preserve">6.4.7</w:t>
             </w:r>
           </w:p>
         </w:tc>
@@ -13539,7 +13554,7 @@
               <w:jc w:val="left"/>
             </w:pPr>
             <w:r>
-              <w:t xml:space="preserve">Code blocks inside test cases no longer break the red left rule in DOCX — the code style’s left indent (which jogged the rule) is reset inside test case blocks, and code blocks now show the PDF’s code box (gray background with thin border on top, bottom, and right, red rule continuing on the left).</w:t>
+              <w:t xml:space="preserve">Section titles in DOCX now match the PDF heading design: the big section number (56pt) sits on the left, the title text is pushed to the right edge (a right tab stop mimics the LaTeX \ hfill), and the red rule runs below — previously the title sat left-aligned next to a small number. Applies to all templates.</w:t>
             </w:r>
           </w:p>
         </w:tc>
@@ -13554,7 +13569,7 @@
               <w:jc w:val="left"/>
             </w:pPr>
             <w:r>
-              <w:t xml:space="preserve">6.4.5</w:t>
+              <w:t xml:space="preserve">6.4.6</w:t>
             </w:r>
           </w:p>
         </w:tc>
@@ -13584,7 +13599,7 @@
               <w:jc w:val="left"/>
             </w:pPr>
             <w:r>
-              <w:t xml:space="preserve">DOCX polish pass: all captions centered (matching the PDF), vertical spacing between blocks matched to the LaTeX rhythm (medskip/smallskip around captions, field bars, and steps), and test steps now render as separate paragraphs each with the red bold number (previously merged into one paragraph).</w:t>
+              <w:t xml:space="preserve">Code blocks inside test cases no longer break the red left rule in DOCX — the code style’s left indent (which jogged the rule) is reset inside test case blocks, and code blocks now show the PDF’s code box (gray background with thin border on top, bottom, and right, red rule continuing on the left).</w:t>
             </w:r>
           </w:p>
         </w:tc>
@@ -13597,7 +13612,7 @@
               <w:jc w:val="left"/>
             </w:pPr>
             <w:r>
-              <w:t xml:space="preserve">6.4.4</w:t>
+              <w:t xml:space="preserve">6.4.5</w:t>
             </w:r>
           </w:p>
         </w:tc>
@@ -13623,7 +13638,7 @@
               <w:jc w:val="left"/>
             </w:pPr>
             <w:r>
-              <w:t xml:space="preserve">DOCX covers now show the logo, cover text, and version/date/time meta line like the PDF. Test case blocks in DOCX get the PDF’s visual wrapper: red left rule, red field header bars, and red step numbers. Captions follow the PDF ordering system in DOCX, MD, and HTML (Table/Diagram/Figure/Testcase N: with bold symbol). Portuguese PDFs now label diagrams "Diagrama N:" (was hardcoded English "Diagram"). Markdown and HTML output no longer leaks raw LaTeX from passthrough blocks — the DOCX pre-processor now feeds those pipelines too.</w:t>
+              <w:t xml:space="preserve">DOCX polish pass: all captions centered (matching the PDF), vertical spacing between blocks matched to the LaTeX rhythm (medskip/smallskip around captions, field bars, and steps), and test steps now render as separate paragraphs each with the red bold number (previously merged into one paragraph).</w:t>
             </w:r>
           </w:p>
         </w:tc>
@@ -13638,7 +13653,7 @@
               <w:jc w:val="left"/>
             </w:pPr>
             <w:r>
-              <w:t xml:space="preserve">6.4.3</w:t>
+              <w:t xml:space="preserve">6.4.4</w:t>
             </w:r>
           </w:p>
         </w:tc>
@@ -13668,7 +13683,7 @@
               <w:jc w:val="left"/>
             </w:pPr>
             <w:r>
-              <w:t xml:space="preserve">Testbook and POC DOCX output now matches the PDF much more closely: native table of contents (language-aware, auto-populated), each section starts on a new page, embedded images and diagrams (PlantUML/Graphviz rendered), white-on-red table headers, cover version line under the title, centered test case captions, and plain black rules for signature grids.</w:t>
+              <w:t xml:space="preserve">DOCX covers now show the logo, cover text, and version/date/time meta line like the PDF. Test case blocks in DOCX get the PDF’s visual wrapper: red left rule, red field header bars, and red step numbers. Captions follow the PDF ordering system in DOCX, MD, and HTML (Table/Diagram/Figure/Testcase N: with bold symbol). Portuguese PDFs now label diagrams "Diagrama N:" (was hardcoded English "Diagram"). Markdown and HTML output no longer leaks raw LaTeX from passthrough blocks — the DOCX pre-processor now feeds those pipelines too.</w:t>
             </w:r>
           </w:p>
         </w:tc>
@@ -13681,7 +13696,7 @@
               <w:jc w:val="left"/>
             </w:pPr>
             <w:r>
-              <w:t xml:space="preserve">6.4.2</w:t>
+              <w:t xml:space="preserve">6.4.3</w:t>
             </w:r>
           </w:p>
         </w:tc>
@@ -13707,7 +13722,7 @@
               <w:jc w:val="left"/>
             </w:pPr>
             <w:r>
-              <w:t xml:space="preserve">DOCX output for POC and testbook templates now includes all passthrough content (stakeholders, closing record, signatures, test cases, test summary, changelog) via a new pre-processor. Fixed dropped Test Scope fields in testbook DOCX output.</w:t>
+              <w:t xml:space="preserve">Testbook and POC DOCX output now matches the PDF much more closely: native table of contents (language-aware, auto-populated), each section starts on a new page, embedded images and diagrams (PlantUML/Graphviz rendered), white-on-red table headers, cover version line under the title, centered test case captions, and plain black rules for signature grids.</w:t>
             </w:r>
           </w:p>
         </w:tc>
@@ -13722,7 +13737,7 @@
               <w:jc w:val="left"/>
             </w:pPr>
             <w:r>
-              <w:t xml:space="preserve">6.4.0</w:t>
+              <w:t xml:space="preserve">6.4.2</w:t>
             </w:r>
           </w:p>
         </w:tc>
@@ -13752,6 +13767,45 @@
               <w:jc w:val="left"/>
             </w:pPr>
             <w:r>
+              <w:t xml:space="preserve">DOCX output for POC and testbook templates now includes all passthrough content (stakeholders, closing record, signatures, test cases, test summary, changelog) via a new pre-processor. Fixed dropped Test Scope fields in testbook DOCX output.</w:t>
+            </w:r>
+          </w:p>
+        </w:tc>
+      </w:tr>
+      <w:tr>
+        <w:tc>
+          <w:tcPr/>
+          <w:p>
+            <w:pPr>
+              <w:jc w:val="left"/>
+            </w:pPr>
+            <w:r>
+              <w:t xml:space="preserve">6.4.0</w:t>
+            </w:r>
+          </w:p>
+        </w:tc>
+        <w:tc>
+          <w:tcPr/>
+          <w:p>
+            <w:pPr>
+              <w:jc w:val="left"/>
+            </w:pPr>
+            <w:r>
+              <w:t xml:space="preserve">2026-09-20</w:t>
+            </w:r>
+          </w:p>
+        </w:tc>
+        <w:tc>
+          <w:tcPr/>
+          <w:p>
+            <w:pPr>
+              <w:numPr>
+                <w:ilvl w:val="0"/>
+                <w:numId w:val="1052"/>
+              </w:numPr>
+              <w:jc w:val="left"/>
+            </w:pPr>
+            <w:r>
               <w:t xml:space="preserve">Fixed changelog dates — replaced</w:t>
             </w:r>
             <w:r>
@@ -13774,54 +13828,15 @@
       </w:tr>
       <w:tr>
         <w:tc>
-          <w:tcPr/>
+          <w:tcPr>
+            <w:shd w:val="clear" w:color="auto" w:fill="F6F8FA"/>
+          </w:tcPr>
           <w:p>
             <w:pPr>
               <w:jc w:val="left"/>
             </w:pPr>
             <w:r>
               <w:t xml:space="preserve">5.1.1</w:t>
-            </w:r>
-          </w:p>
-        </w:tc>
-        <w:tc>
-          <w:tcPr/>
-          <w:p>
-            <w:pPr>
-              <w:jc w:val="left"/>
-            </w:pPr>
-            <w:r>
-              <w:t xml:space="preserve">2026-09-14</w:t>
-            </w:r>
-          </w:p>
-        </w:tc>
-        <w:tc>
-          <w:tcPr/>
-          <w:p>
-            <w:pPr>
-              <w:numPr>
-                <w:ilvl w:val="0"/>
-                <w:numId w:val="1052"/>
-              </w:numPr>
-              <w:jc w:val="left"/>
-            </w:pPr>
-            <w:r>
-              <w:t xml:space="preserve">Synced callout colors in DOCX/HTML/MD output to match brand palette. Added color palette demo.</w:t>
-            </w:r>
-          </w:p>
-        </w:tc>
-      </w:tr>
-      <w:tr>
-        <w:tc>
-          <w:tcPr>
-            <w:shd w:val="clear" w:color="auto" w:fill="F6F8FA"/>
-          </w:tcPr>
-          <w:p>
-            <w:pPr>
-              <w:jc w:val="left"/>
-            </w:pPr>
-            <w:r>
-              <w:t xml:space="preserve">5.1.0</w:t>
             </w:r>
           </w:p>
         </w:tc>
@@ -13851,7 +13866,7 @@
               <w:jc w:val="left"/>
             </w:pPr>
             <w:r>
-              <w:t xml:space="preserve">Adopted brand guidelines auxiliary color palette and monochrome scale. Aligned callout colors to brand specifications.</w:t>
+              <w:t xml:space="preserve">Synced callout colors in DOCX/HTML/MD output to match brand palette. Added color palette demo.</w:t>
             </w:r>
           </w:p>
         </w:tc>
@@ -13864,7 +13879,7 @@
               <w:jc w:val="left"/>
             </w:pPr>
             <w:r>
-              <w:t xml:space="preserve">5.0.3</w:t>
+              <w:t xml:space="preserve">5.1.0</w:t>
             </w:r>
           </w:p>
         </w:tc>
@@ -13890,6 +13905,51 @@
               <w:jc w:val="left"/>
             </w:pPr>
             <w:r>
+              <w:t xml:space="preserve">Adopted brand guidelines auxiliary color palette and monochrome scale. Aligned callout colors to brand specifications.</w:t>
+            </w:r>
+          </w:p>
+        </w:tc>
+      </w:tr>
+      <w:tr>
+        <w:tc>
+          <w:tcPr>
+            <w:shd w:val="clear" w:color="auto" w:fill="F6F8FA"/>
+          </w:tcPr>
+          <w:p>
+            <w:pPr>
+              <w:jc w:val="left"/>
+            </w:pPr>
+            <w:r>
+              <w:t xml:space="preserve">5.0.3</w:t>
+            </w:r>
+          </w:p>
+        </w:tc>
+        <w:tc>
+          <w:tcPr>
+            <w:shd w:val="clear" w:color="auto" w:fill="F6F8FA"/>
+          </w:tcPr>
+          <w:p>
+            <w:pPr>
+              <w:jc w:val="left"/>
+            </w:pPr>
+            <w:r>
+              <w:t xml:space="preserve">2026-09-14</w:t>
+            </w:r>
+          </w:p>
+        </w:tc>
+        <w:tc>
+          <w:tcPr>
+            <w:shd w:val="clear" w:color="auto" w:fill="F6F8FA"/>
+          </w:tcPr>
+          <w:p>
+            <w:pPr>
+              <w:numPr>
+                <w:ilvl w:val="0"/>
+                <w:numId w:val="1055"/>
+              </w:numPr>
+              <w:jc w:val="left"/>
+            </w:pPr>
+            <w:r>
               <w:t xml:space="preserve">Removed non-standard</w:t>
             </w:r>
             <w:r>
@@ -13912,58 +13972,13 @@
       </w:tr>
       <w:tr>
         <w:tc>
-          <w:tcPr>
-            <w:shd w:val="clear" w:color="auto" w:fill="F6F8FA"/>
-          </w:tcPr>
+          <w:tcPr/>
           <w:p>
             <w:pPr>
               <w:jc w:val="left"/>
             </w:pPr>
             <w:r>
               <w:t xml:space="preserve">5.0.2</w:t>
-            </w:r>
-          </w:p>
-        </w:tc>
-        <w:tc>
-          <w:tcPr>
-            <w:shd w:val="clear" w:color="auto" w:fill="F6F8FA"/>
-          </w:tcPr>
-          <w:p>
-            <w:pPr>
-              <w:jc w:val="left"/>
-            </w:pPr>
-            <w:r>
-              <w:t xml:space="preserve">2026-09-14</w:t>
-            </w:r>
-          </w:p>
-        </w:tc>
-        <w:tc>
-          <w:tcPr>
-            <w:shd w:val="clear" w:color="auto" w:fill="F6F8FA"/>
-          </w:tcPr>
-          <w:p>
-            <w:pPr>
-              <w:numPr>
-                <w:ilvl w:val="0"/>
-                <w:numId w:val="1055"/>
-              </w:numPr>
-              <w:jc w:val="left"/>
-            </w:pPr>
-            <w:r>
-              <w:t xml:space="preserve">Long commands in test steps now render as code blocks instead of inline code.</w:t>
-            </w:r>
-          </w:p>
-        </w:tc>
-      </w:tr>
-      <w:tr>
-        <w:tc>
-          <w:tcPr/>
-          <w:p>
-            <w:pPr>
-              <w:jc w:val="left"/>
-            </w:pPr>
-            <w:r>
-              <w:t xml:space="preserve">5.0.1</w:t>
             </w:r>
           </w:p>
         </w:tc>
@@ -13989,7 +14004,7 @@
               <w:jc w:val="left"/>
             </w:pPr>
             <w:r>
-              <w:t xml:space="preserve">Testcase caption centered above the block.</w:t>
+              <w:t xml:space="preserve">Long commands in test steps now render as code blocks instead of inline code.</w:t>
             </w:r>
           </w:p>
         </w:tc>
@@ -14004,7 +14019,7 @@
               <w:jc w:val="left"/>
             </w:pPr>
             <w:r>
-              <w:t xml:space="preserve">5.0.0</w:t>
+              <w:t xml:space="preserve">5.0.1</w:t>
             </w:r>
           </w:p>
         </w:tc>
@@ -14034,6 +14049,45 @@
               <w:jc w:val="left"/>
             </w:pPr>
             <w:r>
+              <w:t xml:space="preserve">Testcase caption centered above the block.</w:t>
+            </w:r>
+          </w:p>
+        </w:tc>
+      </w:tr>
+      <w:tr>
+        <w:tc>
+          <w:tcPr/>
+          <w:p>
+            <w:pPr>
+              <w:jc w:val="left"/>
+            </w:pPr>
+            <w:r>
+              <w:t xml:space="preserve">5.0.0</w:t>
+            </w:r>
+          </w:p>
+        </w:tc>
+        <w:tc>
+          <w:tcPr/>
+          <w:p>
+            <w:pPr>
+              <w:jc w:val="left"/>
+            </w:pPr>
+            <w:r>
+              <w:t xml:space="preserve">2026-09-14</w:t>
+            </w:r>
+          </w:p>
+        </w:tc>
+        <w:tc>
+          <w:tcPr/>
+          <w:p>
+            <w:pPr>
+              <w:numPr>
+                <w:ilvl w:val="0"/>
+                <w:numId w:val="1058"/>
+              </w:numPr>
+              <w:jc w:val="left"/>
+            </w:pPr>
+            <w:r>
               <w:t xml:space="preserve">Major refactoring: extracted shared modules (huawei-titles, huawei-toc, huawei-cover), renamed</w:t>
             </w:r>
             <w:r>
@@ -14095,7 +14149,9 @@
       </w:tr>
       <w:tr>
         <w:tc>
-          <w:tcPr/>
+          <w:tcPr>
+            <w:shd w:val="clear" w:color="auto" w:fill="F6F8FA"/>
+          </w:tcPr>
           <w:p>
             <w:pPr>
               <w:jc w:val="left"/>
@@ -14106,56 +14162,15 @@
           </w:p>
         </w:tc>
         <w:tc>
-          <w:tcPr/>
+          <w:tcPr>
+            <w:shd w:val="clear" w:color="auto" w:fill="F6F8FA"/>
+          </w:tcPr>
           <w:p>
             <w:pPr>
               <w:jc w:val="left"/>
             </w:pPr>
             <w:r>
               <w:t xml:space="preserve">2026-09-14</w:t>
-            </w:r>
-          </w:p>
-        </w:tc>
-        <w:tc>
-          <w:tcPr/>
-          <w:p>
-            <w:pPr>
-              <w:numPr>
-                <w:ilvl w:val="0"/>
-                <w:numId w:val="1058"/>
-              </w:numPr>
-              <w:jc w:val="left"/>
-            </w:pPr>
-            <w:r>
-              <w:t xml:space="preserve">Testcase headings now formatted as captions (like figures/tables): bold “Testcase N:” followed by description. Changed label from “Test Case” to “Testcase”.</w:t>
-            </w:r>
-          </w:p>
-        </w:tc>
-      </w:tr>
-      <w:tr>
-        <w:tc>
-          <w:tcPr>
-            <w:shd w:val="clear" w:color="auto" w:fill="F6F8FA"/>
-          </w:tcPr>
-          <w:p>
-            <w:pPr>
-              <w:jc w:val="left"/>
-            </w:pPr>
-            <w:r>
-              <w:t xml:space="preserve">4.6.0</w:t>
-            </w:r>
-          </w:p>
-        </w:tc>
-        <w:tc>
-          <w:tcPr>
-            <w:shd w:val="clear" w:color="auto" w:fill="F6F8FA"/>
-          </w:tcPr>
-          <w:p>
-            <w:pPr>
-              <w:jc w:val="left"/>
-            </w:pPr>
-            <w:r>
-              <w:t xml:space="preserve">2026-09-13</w:t>
             </w:r>
           </w:p>
         </w:tc>
@@ -14172,7 +14187,7 @@
               <w:jc w:val="left"/>
             </w:pPr>
             <w:r>
-              <w:t xml:space="preserve">Section restructure: Introduction, Test Cases (with category subsections), Conclusion. Testcases auto-numbered like figures/tables. Changed testcase from subsection to subsubsection.</w:t>
+              <w:t xml:space="preserve">Testcase headings now formatted as captions (like figures/tables): bold “Testcase N:” followed by description. Changed label from “Test Case” to “Testcase”.</w:t>
             </w:r>
           </w:p>
         </w:tc>
@@ -14185,7 +14200,7 @@
               <w:jc w:val="left"/>
             </w:pPr>
             <w:r>
-              <w:t xml:space="preserve">4.5.0</w:t>
+              <w:t xml:space="preserve">4.6.0</w:t>
             </w:r>
           </w:p>
         </w:tc>
@@ -14211,6 +14226,51 @@
               <w:jc w:val="left"/>
             </w:pPr>
             <w:r>
+              <w:t xml:space="preserve">Section restructure: Introduction, Test Cases (with category subsections), Conclusion. Testcases auto-numbered like figures/tables. Changed testcase from subsection to subsubsection.</w:t>
+            </w:r>
+          </w:p>
+        </w:tc>
+      </w:tr>
+      <w:tr>
+        <w:tc>
+          <w:tcPr>
+            <w:shd w:val="clear" w:color="auto" w:fill="F6F8FA"/>
+          </w:tcPr>
+          <w:p>
+            <w:pPr>
+              <w:jc w:val="left"/>
+            </w:pPr>
+            <w:r>
+              <w:t xml:space="preserve">4.5.0</w:t>
+            </w:r>
+          </w:p>
+        </w:tc>
+        <w:tc>
+          <w:tcPr>
+            <w:shd w:val="clear" w:color="auto" w:fill="F6F8FA"/>
+          </w:tcPr>
+          <w:p>
+            <w:pPr>
+              <w:jc w:val="left"/>
+            </w:pPr>
+            <w:r>
+              <w:t xml:space="preserve">2026-09-13</w:t>
+            </w:r>
+          </w:p>
+        </w:tc>
+        <w:tc>
+          <w:tcPr>
+            <w:shd w:val="clear" w:color="auto" w:fill="F6F8FA"/>
+          </w:tcPr>
+          <w:p>
+            <w:pPr>
+              <w:numPr>
+                <w:ilvl w:val="0"/>
+                <w:numId w:val="1061"/>
+              </w:numPr>
+              <w:jc w:val="left"/>
+            </w:pPr>
+            <w:r>
               <w:t xml:space="preserve">Unified field APIs:</w:t>
             </w:r>
             <w:r>
@@ -14275,58 +14335,13 @@
       </w:tr>
       <w:tr>
         <w:tc>
-          <w:tcPr>
-            <w:shd w:val="clear" w:color="auto" w:fill="F6F8FA"/>
-          </w:tcPr>
+          <w:tcPr/>
           <w:p>
             <w:pPr>
               <w:jc w:val="left"/>
             </w:pPr>
             <w:r>
               <w:t xml:space="preserve">4.4.0</w:t>
-            </w:r>
-          </w:p>
-        </w:tc>
-        <w:tc>
-          <w:tcPr>
-            <w:shd w:val="clear" w:color="auto" w:fill="F6F8FA"/>
-          </w:tcPr>
-          <w:p>
-            <w:pPr>
-              <w:jc w:val="left"/>
-            </w:pPr>
-            <w:r>
-              <w:t xml:space="preserve">2026-09-13</w:t>
-            </w:r>
-          </w:p>
-        </w:tc>
-        <w:tc>
-          <w:tcPr>
-            <w:shd w:val="clear" w:color="auto" w:fill="F6F8FA"/>
-          </w:tcPr>
-          <w:p>
-            <w:pPr>
-              <w:numPr>
-                <w:ilvl w:val="0"/>
-                <w:numId w:val="1061"/>
-              </w:numPr>
-              <w:jc w:val="left"/>
-            </w:pPr>
-            <w:r>
-              <w:t xml:space="preserve">Code review fixes: removed dead labels, badge now uses Huawei brand colors (tipbg/tipfg, huaweired, warningbg/warningfg), Lua filter preserves formatting in DOCX/MD/HTML via parse_latex_blocks, testprocedure handler preserves non-step content (images, code, callouts).</w:t>
-            </w:r>
-          </w:p>
-        </w:tc>
-      </w:tr>
-      <w:tr>
-        <w:tc>
-          <w:tcPr/>
-          <w:p>
-            <w:pPr>
-              <w:jc w:val="left"/>
-            </w:pPr>
-            <w:r>
-              <w:t xml:space="preserve">4.3.0</w:t>
             </w:r>
           </w:p>
         </w:tc>
@@ -14352,6 +14367,51 @@
               <w:jc w:val="left"/>
             </w:pPr>
             <w:r>
+              <w:t xml:space="preserve">Code review fixes: removed dead labels, badge now uses Huawei brand colors (tipbg/tipfg, huaweired, warningbg/warningfg), Lua filter preserves formatting in DOCX/MD/HTML via parse_latex_blocks, testprocedure handler preserves non-step content (images, code, callouts).</w:t>
+            </w:r>
+          </w:p>
+        </w:tc>
+      </w:tr>
+      <w:tr>
+        <w:tc>
+          <w:tcPr>
+            <w:shd w:val="clear" w:color="auto" w:fill="F6F8FA"/>
+          </w:tcPr>
+          <w:p>
+            <w:pPr>
+              <w:jc w:val="left"/>
+            </w:pPr>
+            <w:r>
+              <w:t xml:space="preserve">4.3.0</w:t>
+            </w:r>
+          </w:p>
+        </w:tc>
+        <w:tc>
+          <w:tcPr>
+            <w:shd w:val="clear" w:color="auto" w:fill="F6F8FA"/>
+          </w:tcPr>
+          <w:p>
+            <w:pPr>
+              <w:jc w:val="left"/>
+            </w:pPr>
+            <w:r>
+              <w:t xml:space="preserve">2026-09-13</w:t>
+            </w:r>
+          </w:p>
+        </w:tc>
+        <w:tc>
+          <w:tcPr>
+            <w:shd w:val="clear" w:color="auto" w:fill="F6F8FA"/>
+          </w:tcPr>
+          <w:p>
+            <w:pPr>
+              <w:numPr>
+                <w:ilvl w:val="0"/>
+                <w:numId w:val="1063"/>
+              </w:numPr>
+              <w:jc w:val="left"/>
+            </w:pPr>
+            <w:r>
               <w:t xml:space="preserve">Added</w:t>
             </w:r>
             <w:r>
@@ -14404,9 +14464,7 @@
       </w:tr>
       <w:tr>
         <w:tc>
-          <w:tcPr>
-            <w:shd w:val="clear" w:color="auto" w:fill="F6F8FA"/>
-          </w:tcPr>
+          <w:tcPr/>
           <w:p>
             <w:pPr>
               <w:jc w:val="left"/>
@@ -14417,9 +14475,7 @@
           </w:p>
         </w:tc>
         <w:tc>
-          <w:tcPr>
-            <w:shd w:val="clear" w:color="auto" w:fill="F6F8FA"/>
-          </w:tcPr>
+          <w:tcPr/>
           <w:p>
             <w:pPr>
               <w:jc w:val="left"/>
@@ -14430,14 +14486,12 @@
           </w:p>
         </w:tc>
         <w:tc>
-          <w:tcPr>
-            <w:shd w:val="clear" w:color="auto" w:fill="F6F8FA"/>
-          </w:tcPr>
+          <w:tcPr/>
           <w:p>
             <w:pPr>
               <w:numPr>
                 <w:ilvl w:val="0"/>
-                <w:numId w:val="1063"/>
+                <w:numId w:val="1064"/>
               </w:numPr>
               <w:jc w:val="left"/>
             </w:pPr>
@@ -14491,7 +14545,9 @@
       </w:tr>
       <w:tr>
         <w:tc>
-          <w:tcPr/>
+          <w:tcPr>
+            <w:shd w:val="clear" w:color="auto" w:fill="F6F8FA"/>
+          </w:tcPr>
           <w:p>
             <w:pPr>
               <w:jc w:val="left"/>
@@ -14502,7 +14558,9 @@
           </w:p>
         </w:tc>
         <w:tc>
-          <w:tcPr/>
+          <w:tcPr>
+            <w:shd w:val="clear" w:color="auto" w:fill="F6F8FA"/>
+          </w:tcPr>
           <w:p>
             <w:pPr>
               <w:jc w:val="left"/>
@@ -14513,12 +14571,14 @@
           </w:p>
         </w:tc>
         <w:tc>
-          <w:tcPr/>
+          <w:tcPr>
+            <w:shd w:val="clear" w:color="auto" w:fill="F6F8FA"/>
+          </w:tcPr>
           <w:p>
             <w:pPr>
               <w:numPr>
                 <w:ilvl w:val="0"/>
-                <w:numId w:val="1064"/>
+                <w:numId w:val="1065"/>
               </w:numPr>
               <w:jc w:val="left"/>
             </w:pPr>
@@ -14545,9 +14605,7 @@
       </w:tr>
       <w:tr>
         <w:tc>
-          <w:tcPr>
-            <w:shd w:val="clear" w:color="auto" w:fill="F6F8FA"/>
-          </w:tcPr>
+          <w:tcPr/>
           <w:p>
             <w:pPr>
               <w:jc w:val="left"/>
@@ -14558,9 +14616,7 @@
           </w:p>
         </w:tc>
         <w:tc>
-          <w:tcPr>
-            <w:shd w:val="clear" w:color="auto" w:fill="F6F8FA"/>
-          </w:tcPr>
+          <w:tcPr/>
           <w:p>
             <w:pPr>
               <w:jc w:val="left"/>
@@ -14571,14 +14627,12 @@
           </w:p>
         </w:tc>
         <w:tc>
-          <w:tcPr>
-            <w:shd w:val="clear" w:color="auto" w:fill="F6F8FA"/>
-          </w:tcPr>
+          <w:tcPr/>
           <w:p>
             <w:pPr>
               <w:numPr>
                 <w:ilvl w:val="0"/>
-                <w:numId w:val="1065"/>
+                <w:numId w:val="1066"/>
               </w:numPr>
               <w:jc w:val="left"/>
             </w:pPr>
@@ -14620,7 +14674,9 @@
       </w:tr>
       <w:tr>
         <w:tc>
-          <w:tcPr/>
+          <w:tcPr>
+            <w:shd w:val="clear" w:color="auto" w:fill="F6F8FA"/>
+          </w:tcPr>
           <w:p>
             <w:pPr>
               <w:jc w:val="left"/>
@@ -14631,7 +14687,9 @@
           </w:p>
         </w:tc>
         <w:tc>
-          <w:tcPr/>
+          <w:tcPr>
+            <w:shd w:val="clear" w:color="auto" w:fill="F6F8FA"/>
+          </w:tcPr>
           <w:p>
             <w:pPr>
               <w:jc w:val="left"/>
@@ -14642,12 +14700,14 @@
           </w:p>
         </w:tc>
         <w:tc>
-          <w:tcPr/>
+          <w:tcPr>
+            <w:shd w:val="clear" w:color="auto" w:fill="F6F8FA"/>
+          </w:tcPr>
           <w:p>
             <w:pPr>
               <w:numPr>
                 <w:ilvl w:val="0"/>
-                <w:numId w:val="1066"/>
+                <w:numId w:val="1067"/>
               </w:numPr>
               <w:jc w:val="left"/>
             </w:pPr>
@@ -14674,58 +14734,13 @@
       </w:tr>
       <w:tr>
         <w:tc>
-          <w:tcPr>
-            <w:shd w:val="clear" w:color="auto" w:fill="F6F8FA"/>
-          </w:tcPr>
+          <w:tcPr/>
           <w:p>
             <w:pPr>
               <w:jc w:val="left"/>
             </w:pPr>
             <w:r>
               <w:t xml:space="preserve">3.8.1</w:t>
-            </w:r>
-          </w:p>
-        </w:tc>
-        <w:tc>
-          <w:tcPr>
-            <w:shd w:val="clear" w:color="auto" w:fill="F6F8FA"/>
-          </w:tcPr>
-          <w:p>
-            <w:pPr>
-              <w:jc w:val="left"/>
-            </w:pPr>
-            <w:r>
-              <w:t xml:space="preserve">2026-09-13</w:t>
-            </w:r>
-          </w:p>
-        </w:tc>
-        <w:tc>
-          <w:tcPr>
-            <w:shd w:val="clear" w:color="auto" w:fill="F6F8FA"/>
-          </w:tcPr>
-          <w:p>
-            <w:pPr>
-              <w:numPr>
-                <w:ilvl w:val="0"/>
-                <w:numId w:val="1067"/>
-              </w:numPr>
-              <w:jc w:val="left"/>
-            </w:pPr>
-            <w:r>
-              <w:t xml:space="preserve">End-to-end quality review: fixed testbook PDF metadata title, removed stray user DOCX from template dir, fixed round-trip.sh variable typo, updated stale references in AGENTS.md and README.md, committed testbook sample PDFs, set TZ for pandoc cover time consistency, widened pandoc version range.</w:t>
-            </w:r>
-          </w:p>
-        </w:tc>
-      </w:tr>
-      <w:tr>
-        <w:tc>
-          <w:tcPr/>
-          <w:p>
-            <w:pPr>
-              <w:jc w:val="left"/>
-            </w:pPr>
-            <w:r>
-              <w:t xml:space="preserve">3.8.0</w:t>
             </w:r>
           </w:p>
         </w:tc>
@@ -14751,7 +14766,7 @@
               <w:jc w:val="left"/>
             </w:pPr>
             <w:r>
-              <w:t xml:space="preserve">Removed Tips and Tricks chapter (tmux configuration) — required VS Code-specific keybindings that don’t generalize across terminal setups.</w:t>
+              <w:t xml:space="preserve">End-to-end quality review: fixed testbook PDF metadata title, removed stray user DOCX from template dir, fixed round-trip.sh variable typo, updated stale references in AGENTS.md and README.md, committed testbook sample PDFs, set TZ for pandoc cover time consistency, widened pandoc version range.</w:t>
             </w:r>
           </w:p>
         </w:tc>
@@ -14766,7 +14781,7 @@
               <w:jc w:val="left"/>
             </w:pPr>
             <w:r>
-              <w:t xml:space="preserve">3.7.0</w:t>
+              <w:t xml:space="preserve">3.8.0</w:t>
             </w:r>
           </w:p>
         </w:tc>
@@ -14779,7 +14794,7 @@
               <w:jc w:val="left"/>
             </w:pPr>
             <w:r>
-              <w:t xml:space="preserve">2026-09-12</w:t>
+              <w:t xml:space="preserve">2026-09-13</w:t>
             </w:r>
           </w:p>
         </w:tc>
@@ -14796,6 +14811,45 @@
               <w:jc w:val="left"/>
             </w:pPr>
             <w:r>
+              <w:t xml:space="preserve">Removed Tips and Tricks chapter (tmux configuration) — required VS Code-specific keybindings that don’t generalize across terminal setups.</w:t>
+            </w:r>
+          </w:p>
+        </w:tc>
+      </w:tr>
+      <w:tr>
+        <w:tc>
+          <w:tcPr/>
+          <w:p>
+            <w:pPr>
+              <w:jc w:val="left"/>
+            </w:pPr>
+            <w:r>
+              <w:t xml:space="preserve">3.7.0</w:t>
+            </w:r>
+          </w:p>
+        </w:tc>
+        <w:tc>
+          <w:tcPr/>
+          <w:p>
+            <w:pPr>
+              <w:jc w:val="left"/>
+            </w:pPr>
+            <w:r>
+              <w:t xml:space="preserve">2026-09-12</w:t>
+            </w:r>
+          </w:p>
+        </w:tc>
+        <w:tc>
+          <w:tcPr/>
+          <w:p>
+            <w:pPr>
+              <w:numPr>
+                <w:ilvl w:val="0"/>
+                <w:numId w:val="1070"/>
+              </w:numPr>
+              <w:jc w:val="left"/>
+            </w:pPr>
+            <w:r>
               <w:t xml:space="preserve">Added</w:t>
             </w:r>
             <w:r>
@@ -14848,7 +14902,9 @@
       </w:tr>
       <w:tr>
         <w:tc>
-          <w:tcPr/>
+          <w:tcPr>
+            <w:shd w:val="clear" w:color="auto" w:fill="F6F8FA"/>
+          </w:tcPr>
           <w:p>
             <w:pPr>
               <w:jc w:val="left"/>
@@ -14859,7 +14915,9 @@
           </w:p>
         </w:tc>
         <w:tc>
-          <w:tcPr/>
+          <w:tcPr>
+            <w:shd w:val="clear" w:color="auto" w:fill="F6F8FA"/>
+          </w:tcPr>
           <w:p>
             <w:pPr>
               <w:jc w:val="left"/>
@@ -14870,12 +14928,14 @@
           </w:p>
         </w:tc>
         <w:tc>
-          <w:tcPr/>
+          <w:tcPr>
+            <w:shd w:val="clear" w:color="auto" w:fill="F6F8FA"/>
+          </w:tcPr>
           <w:p>
             <w:pPr>
               <w:numPr>
                 <w:ilvl w:val="0"/>
-                <w:numId w:val="1070"/>
+                <w:numId w:val="1071"/>
               </w:numPr>
               <w:jc w:val="left"/>
             </w:pPr>
@@ -14932,9 +14992,7 @@
       </w:tr>
       <w:tr>
         <w:tc>
-          <w:tcPr>
-            <w:shd w:val="clear" w:color="auto" w:fill="F6F8FA"/>
-          </w:tcPr>
+          <w:tcPr/>
           <w:p>
             <w:pPr>
               <w:jc w:val="left"/>
@@ -14945,9 +15003,7 @@
           </w:p>
         </w:tc>
         <w:tc>
-          <w:tcPr>
-            <w:shd w:val="clear" w:color="auto" w:fill="F6F8FA"/>
-          </w:tcPr>
+          <w:tcPr/>
           <w:p>
             <w:pPr>
               <w:jc w:val="left"/>
@@ -14958,14 +15014,12 @@
           </w:p>
         </w:tc>
         <w:tc>
-          <w:tcPr>
-            <w:shd w:val="clear" w:color="auto" w:fill="F6F8FA"/>
-          </w:tcPr>
+          <w:tcPr/>
           <w:p>
             <w:pPr>
               <w:numPr>
                 <w:ilvl w:val="0"/>
-                <w:numId w:val="1071"/>
+                <w:numId w:val="1072"/>
               </w:numPr>
               <w:jc w:val="left"/>
             </w:pPr>
@@ -15043,7 +15097,9 @@
       </w:tr>
       <w:tr>
         <w:tc>
-          <w:tcPr/>
+          <w:tcPr>
+            <w:shd w:val="clear" w:color="auto" w:fill="F6F8FA"/>
+          </w:tcPr>
           <w:p>
             <w:pPr>
               <w:jc w:val="left"/>
@@ -15054,7 +15110,9 @@
           </w:p>
         </w:tc>
         <w:tc>
-          <w:tcPr/>
+          <w:tcPr>
+            <w:shd w:val="clear" w:color="auto" w:fill="F6F8FA"/>
+          </w:tcPr>
           <w:p>
             <w:pPr>
               <w:jc w:val="left"/>
@@ -15065,12 +15123,14 @@
           </w:p>
         </w:tc>
         <w:tc>
-          <w:tcPr/>
+          <w:tcPr>
+            <w:shd w:val="clear" w:color="auto" w:fill="F6F8FA"/>
+          </w:tcPr>
           <w:p>
             <w:pPr>
               <w:numPr>
                 <w:ilvl w:val="0"/>
-                <w:numId w:val="1072"/>
+                <w:numId w:val="1073"/>
               </w:numPr>
               <w:jc w:val="left"/>
             </w:pPr>
@@ -15097,7 +15157,7 @@
             <w:pPr>
               <w:numPr>
                 <w:ilvl w:val="0"/>
-                <w:numId w:val="1072"/>
+                <w:numId w:val="1073"/>
               </w:numPr>
               <w:jc w:val="left"/>
             </w:pPr>
@@ -15139,7 +15199,7 @@
             <w:pPr>
               <w:numPr>
                 <w:ilvl w:val="0"/>
-                <w:numId w:val="1072"/>
+                <w:numId w:val="1073"/>
               </w:numPr>
               <w:jc w:val="left"/>
             </w:pPr>
@@ -15151,9 +15211,7 @@
       </w:tr>
       <w:tr>
         <w:tc>
-          <w:tcPr>
-            <w:shd w:val="clear" w:color="auto" w:fill="F6F8FA"/>
-          </w:tcPr>
+          <w:tcPr/>
           <w:p>
             <w:pPr>
               <w:jc w:val="left"/>
@@ -15164,9 +15222,7 @@
           </w:p>
         </w:tc>
         <w:tc>
-          <w:tcPr>
-            <w:shd w:val="clear" w:color="auto" w:fill="F6F8FA"/>
-          </w:tcPr>
+          <w:tcPr/>
           <w:p>
             <w:pPr>
               <w:jc w:val="left"/>
@@ -15177,14 +15233,12 @@
           </w:p>
         </w:tc>
         <w:tc>
-          <w:tcPr>
-            <w:shd w:val="clear" w:color="auto" w:fill="F6F8FA"/>
-          </w:tcPr>
+          <w:tcPr/>
           <w:p>
             <w:pPr>
               <w:numPr>
                 <w:ilvl w:val="0"/>
-                <w:numId w:val="1073"/>
+                <w:numId w:val="1074"/>
               </w:numPr>
               <w:jc w:val="left"/>
             </w:pPr>
@@ -15211,7 +15265,7 @@
             <w:pPr>
               <w:numPr>
                 <w:ilvl w:val="0"/>
-                <w:numId w:val="1073"/>
+                <w:numId w:val="1074"/>
               </w:numPr>
               <w:jc w:val="left"/>
             </w:pPr>
@@ -15238,7 +15292,7 @@
             <w:pPr>
               <w:numPr>
                 <w:ilvl w:val="0"/>
-                <w:numId w:val="1073"/>
+                <w:numId w:val="1074"/>
               </w:numPr>
               <w:jc w:val="left"/>
             </w:pPr>
@@ -15250,7 +15304,7 @@
             <w:pPr>
               <w:numPr>
                 <w:ilvl w:val="0"/>
-                <w:numId w:val="1073"/>
+                <w:numId w:val="1074"/>
               </w:numPr>
               <w:jc w:val="left"/>
             </w:pPr>
@@ -15274,54 +15328,15 @@
       </w:tr>
       <w:tr>
         <w:tc>
-          <w:tcPr/>
+          <w:tcPr>
+            <w:shd w:val="clear" w:color="auto" w:fill="F6F8FA"/>
+          </w:tcPr>
           <w:p>
             <w:pPr>
               <w:jc w:val="left"/>
             </w:pPr>
             <w:r>
               <w:t xml:space="preserve">3.2.1</w:t>
-            </w:r>
-          </w:p>
-        </w:tc>
-        <w:tc>
-          <w:tcPr/>
-          <w:p>
-            <w:pPr>
-              <w:jc w:val="left"/>
-            </w:pPr>
-            <w:r>
-              <w:t xml:space="preserve">2026-09-11</w:t>
-            </w:r>
-          </w:p>
-        </w:tc>
-        <w:tc>
-          <w:tcPr/>
-          <w:p>
-            <w:pPr>
-              <w:numPr>
-                <w:ilvl w:val="0"/>
-                <w:numId w:val="1074"/>
-              </w:numPr>
-              <w:jc w:val="left"/>
-            </w:pPr>
-            <w:r>
-              <w:t xml:space="preserve">Renamed Chapter 7 from “Clean Up” to “Operations and Maintenance”. Added subsections for updating and uninstalling both the MaaS Gateway and the document templates. Added cloud resource cleanup as an optional subsection.</w:t>
-            </w:r>
-          </w:p>
-        </w:tc>
-      </w:tr>
-      <w:tr>
-        <w:tc>
-          <w:tcPr>
-            <w:shd w:val="clear" w:color="auto" w:fill="F6F8FA"/>
-          </w:tcPr>
-          <w:p>
-            <w:pPr>
-              <w:jc w:val="left"/>
-            </w:pPr>
-            <w:r>
-              <w:t xml:space="preserve">3.2.0</w:t>
             </w:r>
           </w:p>
         </w:tc>
@@ -15351,6 +15366,45 @@
               <w:jc w:val="left"/>
             </w:pPr>
             <w:r>
+              <w:t xml:space="preserve">Renamed Chapter 7 from “Clean Up” to “Operations and Maintenance”. Added subsections for updating and uninstalling both the MaaS Gateway and the document templates. Added cloud resource cleanup as an optional subsection.</w:t>
+            </w:r>
+          </w:p>
+        </w:tc>
+      </w:tr>
+      <w:tr>
+        <w:tc>
+          <w:tcPr/>
+          <w:p>
+            <w:pPr>
+              <w:jc w:val="left"/>
+            </w:pPr>
+            <w:r>
+              <w:t xml:space="preserve">3.2.0</w:t>
+            </w:r>
+          </w:p>
+        </w:tc>
+        <w:tc>
+          <w:tcPr/>
+          <w:p>
+            <w:pPr>
+              <w:jc w:val="left"/>
+            </w:pPr>
+            <w:r>
+              <w:t xml:space="preserve">2026-09-11</w:t>
+            </w:r>
+          </w:p>
+        </w:tc>
+        <w:tc>
+          <w:tcPr/>
+          <w:p>
+            <w:pPr>
+              <w:numPr>
+                <w:ilvl w:val="0"/>
+                <w:numId w:val="1076"/>
+              </w:numPr>
+              <w:jc w:val="left"/>
+            </w:pPr>
+            <w:r>
               <w:t xml:space="preserve">Added</w:t>
             </w:r>
             <w:r>
@@ -15412,7 +15466,7 @@
             <w:pPr>
               <w:numPr>
                 <w:ilvl w:val="0"/>
-                <w:numId w:val="1075"/>
+                <w:numId w:val="1076"/>
               </w:numPr>
               <w:jc w:val="left"/>
             </w:pPr>
@@ -15457,7 +15511,7 @@
             <w:pPr>
               <w:numPr>
                 <w:ilvl w:val="0"/>
-                <w:numId w:val="1075"/>
+                <w:numId w:val="1076"/>
               </w:numPr>
               <w:jc w:val="left"/>
             </w:pPr>
@@ -15469,54 +15523,15 @@
       </w:tr>
       <w:tr>
         <w:tc>
-          <w:tcPr/>
+          <w:tcPr>
+            <w:shd w:val="clear" w:color="auto" w:fill="F6F8FA"/>
+          </w:tcPr>
           <w:p>
             <w:pPr>
               <w:jc w:val="left"/>
             </w:pPr>
             <w:r>
               <w:t xml:space="preserve">3.1.2</w:t>
-            </w:r>
-          </w:p>
-        </w:tc>
-        <w:tc>
-          <w:tcPr/>
-          <w:p>
-            <w:pPr>
-              <w:jc w:val="left"/>
-            </w:pPr>
-            <w:r>
-              <w:t xml:space="preserve">2026-09-11</w:t>
-            </w:r>
-          </w:p>
-        </w:tc>
-        <w:tc>
-          <w:tcPr/>
-          <w:p>
-            <w:pPr>
-              <w:numPr>
-                <w:ilvl w:val="0"/>
-                <w:numId w:val="1076"/>
-              </w:numPr>
-              <w:jc w:val="left"/>
-            </w:pPr>
-            <w:r>
-              <w:t xml:space="preserve">Added output format guide to README.md: comparison table of PDF, Markdown, DOCX, and HTML with purpose, copy-paste quality, and limitations. Recommends Markdown for copy-paste.</w:t>
-            </w:r>
-          </w:p>
-        </w:tc>
-      </w:tr>
-      <w:tr>
-        <w:tc>
-          <w:tcPr>
-            <w:shd w:val="clear" w:color="auto" w:fill="F6F8FA"/>
-          </w:tcPr>
-          <w:p>
-            <w:pPr>
-              <w:jc w:val="left"/>
-            </w:pPr>
-            <w:r>
-              <w:t xml:space="preserve">3.1.1</w:t>
             </w:r>
           </w:p>
         </w:tc>
@@ -15546,6 +15561,45 @@
               <w:jc w:val="left"/>
             </w:pPr>
             <w:r>
+              <w:t xml:space="preserve">Added output format guide to README.md: comparison table of PDF, Markdown, DOCX, and HTML with purpose, copy-paste quality, and limitations. Recommends Markdown for copy-paste.</w:t>
+            </w:r>
+          </w:p>
+        </w:tc>
+      </w:tr>
+      <w:tr>
+        <w:tc>
+          <w:tcPr/>
+          <w:p>
+            <w:pPr>
+              <w:jc w:val="left"/>
+            </w:pPr>
+            <w:r>
+              <w:t xml:space="preserve">3.1.1</w:t>
+            </w:r>
+          </w:p>
+        </w:tc>
+        <w:tc>
+          <w:tcPr/>
+          <w:p>
+            <w:pPr>
+              <w:jc w:val="left"/>
+            </w:pPr>
+            <w:r>
+              <w:t xml:space="preserve">2026-09-11</w:t>
+            </w:r>
+          </w:p>
+        </w:tc>
+        <w:tc>
+          <w:tcPr/>
+          <w:p>
+            <w:pPr>
+              <w:numPr>
+                <w:ilvl w:val="0"/>
+                <w:numId w:val="1078"/>
+              </w:numPr>
+              <w:jc w:val="left"/>
+            </w:pPr>
+            <w:r>
               <w:t xml:space="preserve">Updated MaaS Gateway chapter to v1.10.9: non-interactive mode (</w:t>
             </w:r>
             <w:r>
@@ -15562,7 +15616,7 @@
             <w:pPr>
               <w:numPr>
                 <w:ilvl w:val="0"/>
-                <w:numId w:val="1077"/>
+                <w:numId w:val="1078"/>
               </w:numPr>
               <w:jc w:val="left"/>
             </w:pPr>
@@ -15604,7 +15658,7 @@
             <w:pPr>
               <w:numPr>
                 <w:ilvl w:val="0"/>
-                <w:numId w:val="1077"/>
+                <w:numId w:val="1078"/>
               </w:numPr>
               <w:jc w:val="left"/>
             </w:pPr>
@@ -15616,7 +15670,9 @@
       </w:tr>
       <w:tr>
         <w:tc>
-          <w:tcPr/>
+          <w:tcPr>
+            <w:shd w:val="clear" w:color="auto" w:fill="F6F8FA"/>
+          </w:tcPr>
           <w:p>
             <w:pPr>
               <w:jc w:val="left"/>
@@ -15627,7 +15683,9 @@
           </w:p>
         </w:tc>
         <w:tc>
-          <w:tcPr/>
+          <w:tcPr>
+            <w:shd w:val="clear" w:color="auto" w:fill="F6F8FA"/>
+          </w:tcPr>
           <w:p>
             <w:pPr>
               <w:jc w:val="left"/>
@@ -15638,12 +15696,14 @@
           </w:p>
         </w:tc>
         <w:tc>
-          <w:tcPr/>
+          <w:tcPr>
+            <w:shd w:val="clear" w:color="auto" w:fill="F6F8FA"/>
+          </w:tcPr>
           <w:p>
             <w:pPr>
               <w:numPr>
                 <w:ilvl w:val="0"/>
-                <w:numId w:val="1078"/>
+                <w:numId w:val="1079"/>
               </w:numPr>
               <w:jc w:val="left"/>
             </w:pPr>
@@ -15667,7 +15727,7 @@
             <w:pPr>
               <w:numPr>
                 <w:ilvl w:val="0"/>
-                <w:numId w:val="1078"/>
+                <w:numId w:val="1079"/>
               </w:numPr>
               <w:jc w:val="left"/>
             </w:pPr>
@@ -15709,7 +15769,7 @@
             <w:pPr>
               <w:numPr>
                 <w:ilvl w:val="0"/>
-                <w:numId w:val="1078"/>
+                <w:numId w:val="1079"/>
               </w:numPr>
               <w:jc w:val="left"/>
             </w:pPr>
@@ -15717,63 +15777,6 @@
               <w:t xml:space="preserve">Restructured chapters: moved SSH config and VS Code connection to new Chapter 4 (Install VS Code and Connect via Remote-SSH). Chapters 5—​7 renumbered.</w:t>
             </w:r>
           </w:p>
-          <w:p>
-            <w:pPr>
-              <w:numPr>
-                <w:ilvl w:val="0"/>
-                <w:numId w:val="1078"/>
-              </w:numPr>
-              <w:jc w:val="left"/>
-            </w:pPr>
-            <w:r>
-              <w:t xml:space="preserve">Added verification checklist tables to all 7 chapters.</w:t>
-            </w:r>
-          </w:p>
-          <w:p>
-            <w:pPr>
-              <w:numPr>
-                <w:ilvl w:val="0"/>
-                <w:numId w:val="1078"/>
-              </w:numPr>
-              <w:jc w:val="left"/>
-            </w:pPr>
-            <w:r>
-              <w:t xml:space="preserve">Added mandatory reboot warning in Chapter 2 (SSH port change). Added troubleshooting subsection in Chapter 4 with common SSH connection issues and ncat debugging commands.</w:t>
-            </w:r>
-          </w:p>
-        </w:tc>
-      </w:tr>
-      <w:tr>
-        <w:tc>
-          <w:tcPr>
-            <w:shd w:val="clear" w:color="auto" w:fill="F6F8FA"/>
-          </w:tcPr>
-          <w:p>
-            <w:pPr>
-              <w:jc w:val="left"/>
-            </w:pPr>
-            <w:r>
-              <w:t xml:space="preserve">3.0.1</w:t>
-            </w:r>
-          </w:p>
-        </w:tc>
-        <w:tc>
-          <w:tcPr>
-            <w:shd w:val="clear" w:color="auto" w:fill="F6F8FA"/>
-          </w:tcPr>
-          <w:p>
-            <w:pPr>
-              <w:jc w:val="left"/>
-            </w:pPr>
-            <w:r>
-              <w:t xml:space="preserve">2026-09-10</w:t>
-            </w:r>
-          </w:p>
-        </w:tc>
-        <w:tc>
-          <w:tcPr>
-            <w:shd w:val="clear" w:color="auto" w:fill="F6F8FA"/>
-          </w:tcPr>
           <w:p>
             <w:pPr>
               <w:numPr>
@@ -15783,7 +15786,19 @@
               <w:jc w:val="left"/>
             </w:pPr>
             <w:r>
-              <w:t xml:space="preserve">Minor fixes: test-filter.sh auto-discovery, build.sh help text, Makefile aggregate descriptions, 5-section comment correction, CHANGELOG version gap note, callout-in-code fix, CI font auto-discovery, dofile path comment, test-sync.sh header.</w:t>
+              <w:t xml:space="preserve">Added verification checklist tables to all 7 chapters.</w:t>
+            </w:r>
+          </w:p>
+          <w:p>
+            <w:pPr>
+              <w:numPr>
+                <w:ilvl w:val="0"/>
+                <w:numId w:val="1079"/>
+              </w:numPr>
+              <w:jc w:val="left"/>
+            </w:pPr>
+            <w:r>
+              <w:t xml:space="preserve">Added mandatory reboot warning in Chapter 2 (SSH port change). Added troubleshooting subsection in Chapter 4 with common SSH connection issues and ncat debugging commands.</w:t>
             </w:r>
           </w:p>
         </w:tc>
@@ -15796,7 +15811,7 @@
               <w:jc w:val="left"/>
             </w:pPr>
             <w:r>
-              <w:t xml:space="preserve">3.0.0</w:t>
+              <w:t xml:space="preserve">3.0.1</w:t>
             </w:r>
           </w:p>
         </w:tc>
@@ -15807,7 +15822,7 @@
               <w:jc w:val="left"/>
             </w:pPr>
             <w:r>
-              <w:t xml:space="preserve">2026-09-09</w:t>
+              <w:t xml:space="preserve">2026-09-10</w:t>
             </w:r>
           </w:p>
         </w:tc>
@@ -15822,7 +15837,7 @@
               <w:jc w:val="left"/>
             </w:pPr>
             <w:r>
-              <w:t xml:space="preserve">Modular pipeline refactoring: shared Lua filter factory, shared DOCX fix logic, build system auto-discovery, unified format pipeline, GitHub Actions CI.</w:t>
+              <w:t xml:space="preserve">Minor fixes: test-filter.sh auto-discovery, build.sh help text, Makefile aggregate descriptions, 5-section comment correction, CHANGELOG version gap note, callout-in-code fix, CI font auto-discovery, dofile path comment, test-sync.sh header.</w:t>
             </w:r>
           </w:p>
         </w:tc>
@@ -15837,7 +15852,7 @@
               <w:jc w:val="left"/>
             </w:pPr>
             <w:r>
-              <w:t xml:space="preserve">2.16.0</w:t>
+              <w:t xml:space="preserve">3.0.0</w:t>
             </w:r>
           </w:p>
         </w:tc>
@@ -15850,7 +15865,7 @@
               <w:jc w:val="left"/>
             </w:pPr>
             <w:r>
-              <w:t xml:space="preserve">2026-09-05</w:t>
+              <w:t xml:space="preserve">2026-09-09</w:t>
             </w:r>
           </w:p>
         </w:tc>
@@ -15867,7 +15882,7 @@
               <w:jc w:val="left"/>
             </w:pPr>
             <w:r>
-              <w:t xml:space="preserve">Updated to match template v2.16.0 — Lua filter fixes, build system updates, and technical template parity improvements.</w:t>
+              <w:t xml:space="preserve">Modular pipeline refactoring: shared Lua filter factory, shared DOCX fix logic, build system auto-discovery, unified format pipeline, GitHub Actions CI.</w:t>
             </w:r>
           </w:p>
         </w:tc>
@@ -15880,7 +15895,7 @@
               <w:jc w:val="left"/>
             </w:pPr>
             <w:r>
-              <w:t xml:space="preserve">2.13.0</w:t>
+              <w:t xml:space="preserve">2.16.0</w:t>
             </w:r>
           </w:p>
         </w:tc>
@@ -15891,7 +15906,7 @@
               <w:jc w:val="left"/>
             </w:pPr>
             <w:r>
-              <w:t xml:space="preserve">2026-08-24</w:t>
+              <w:t xml:space="preserve">2026-09-05</w:t>
             </w:r>
           </w:p>
         </w:tc>
@@ -15906,6 +15921,51 @@
               <w:jc w:val="left"/>
             </w:pPr>
             <w:r>
+              <w:t xml:space="preserve">Updated to match template v2.16.0 — Lua filter fixes, build system updates, and technical template parity improvements.</w:t>
+            </w:r>
+          </w:p>
+        </w:tc>
+      </w:tr>
+      <w:tr>
+        <w:tc>
+          <w:tcPr>
+            <w:shd w:val="clear" w:color="auto" w:fill="F6F8FA"/>
+          </w:tcPr>
+          <w:p>
+            <w:pPr>
+              <w:jc w:val="left"/>
+            </w:pPr>
+            <w:r>
+              <w:t xml:space="preserve">2.13.0</w:t>
+            </w:r>
+          </w:p>
+        </w:tc>
+        <w:tc>
+          <w:tcPr>
+            <w:shd w:val="clear" w:color="auto" w:fill="F6F8FA"/>
+          </w:tcPr>
+          <w:p>
+            <w:pPr>
+              <w:jc w:val="left"/>
+            </w:pPr>
+            <w:r>
+              <w:t xml:space="preserve">2026-08-24</w:t>
+            </w:r>
+          </w:p>
+        </w:tc>
+        <w:tc>
+          <w:tcPr>
+            <w:shd w:val="clear" w:color="auto" w:fill="F6F8FA"/>
+          </w:tcPr>
+          <w:p>
+            <w:pPr>
+              <w:numPr>
+                <w:ilvl w:val="0"/>
+                <w:numId w:val="1083"/>
+              </w:numPr>
+              <w:jc w:val="left"/>
+            </w:pPr>
+            <w:r>
               <w:t xml:space="preserve">Foundation refactoring Phase 4: make DOCX</w:t>
             </w:r>
             <w:r>
@@ -15973,9 +16033,7 @@
       </w:tr>
       <w:tr>
         <w:tc>
-          <w:tcPr>
-            <w:shd w:val="clear" w:color="auto" w:fill="F6F8FA"/>
-          </w:tcPr>
+          <w:tcPr/>
           <w:p>
             <w:pPr>
               <w:jc w:val="left"/>
@@ -15986,9 +16044,7 @@
           </w:p>
         </w:tc>
         <w:tc>
-          <w:tcPr>
-            <w:shd w:val="clear" w:color="auto" w:fill="F6F8FA"/>
-          </w:tcPr>
+          <w:tcPr/>
           <w:p>
             <w:pPr>
               <w:jc w:val="left"/>
@@ -15999,14 +16055,12 @@
           </w:p>
         </w:tc>
         <w:tc>
-          <w:tcPr>
-            <w:shd w:val="clear" w:color="auto" w:fill="F6F8FA"/>
-          </w:tcPr>
+          <w:tcPr/>
           <w:p>
             <w:pPr>
               <w:numPr>
                 <w:ilvl w:val="0"/>
-                <w:numId w:val="1083"/>
+                <w:numId w:val="1084"/>
               </w:numPr>
               <w:jc w:val="left"/>
             </w:pPr>
@@ -16168,7 +16222,9 @@
       </w:tr>
       <w:tr>
         <w:tc>
-          <w:tcPr/>
+          <w:tcPr>
+            <w:shd w:val="clear" w:color="auto" w:fill="F6F8FA"/>
+          </w:tcPr>
           <w:p>
             <w:pPr>
               <w:jc w:val="left"/>
@@ -16179,7 +16235,9 @@
           </w:p>
         </w:tc>
         <w:tc>
-          <w:tcPr/>
+          <w:tcPr>
+            <w:shd w:val="clear" w:color="auto" w:fill="F6F8FA"/>
+          </w:tcPr>
           <w:p>
             <w:pPr>
               <w:jc w:val="left"/>
@@ -16190,12 +16248,14 @@
           </w:p>
         </w:tc>
         <w:tc>
-          <w:tcPr/>
+          <w:tcPr>
+            <w:shd w:val="clear" w:color="auto" w:fill="F6F8FA"/>
+          </w:tcPr>
           <w:p>
             <w:pPr>
               <w:numPr>
                 <w:ilvl w:val="0"/>
-                <w:numId w:val="1084"/>
+                <w:numId w:val="1085"/>
               </w:numPr>
               <w:jc w:val="left"/>
             </w:pPr>
@@ -16261,9 +16321,7 @@
       </w:tr>
       <w:tr>
         <w:tc>
-          <w:tcPr>
-            <w:shd w:val="clear" w:color="auto" w:fill="F6F8FA"/>
-          </w:tcPr>
+          <w:tcPr/>
           <w:p>
             <w:pPr>
               <w:jc w:val="left"/>
@@ -16274,56 +16332,13 @@
           </w:p>
         </w:tc>
         <w:tc>
-          <w:tcPr>
-            <w:shd w:val="clear" w:color="auto" w:fill="F6F8FA"/>
-          </w:tcPr>
+          <w:tcPr/>
           <w:p>
             <w:pPr>
               <w:jc w:val="left"/>
             </w:pPr>
             <w:r>
               <w:t xml:space="preserve">2026-08-24</w:t>
-            </w:r>
-          </w:p>
-        </w:tc>
-        <w:tc>
-          <w:tcPr>
-            <w:shd w:val="clear" w:color="auto" w:fill="F6F8FA"/>
-          </w:tcPr>
-          <w:p>
-            <w:pPr>
-              <w:numPr>
-                <w:ilvl w:val="0"/>
-                <w:numId w:val="1085"/>
-              </w:numPr>
-              <w:jc w:val="left"/>
-            </w:pPr>
-            <w:r>
-              <w:t xml:space="preserve">Foundation refactoring Phase 1: sync cls version to project tag, fix stale doc references (L16 output count, L-range, setup-guide feature claim), add test-sync.sh for version consistency checking.</w:t>
-            </w:r>
-          </w:p>
-        </w:tc>
-      </w:tr>
-      <w:tr>
-        <w:tc>
-          <w:tcPr/>
-          <w:p>
-            <w:pPr>
-              <w:jc w:val="left"/>
-            </w:pPr>
-            <w:r>
-              <w:t xml:space="preserve">2.9.1</w:t>
-            </w:r>
-          </w:p>
-        </w:tc>
-        <w:tc>
-          <w:tcPr/>
-          <w:p>
-            <w:pPr>
-              <w:jc w:val="left"/>
-            </w:pPr>
-            <w:r>
-              <w:t xml:space="preserve">2026-08-23</w:t>
             </w:r>
           </w:p>
         </w:tc>
@@ -16338,6 +16353,51 @@
               <w:jc w:val="left"/>
             </w:pPr>
             <w:r>
+              <w:t xml:space="preserve">Foundation refactoring Phase 1: sync cls version to project tag, fix stale doc references (L16 output count, L-range, setup-guide feature claim), add test-sync.sh for version consistency checking.</w:t>
+            </w:r>
+          </w:p>
+        </w:tc>
+      </w:tr>
+      <w:tr>
+        <w:tc>
+          <w:tcPr>
+            <w:shd w:val="clear" w:color="auto" w:fill="F6F8FA"/>
+          </w:tcPr>
+          <w:p>
+            <w:pPr>
+              <w:jc w:val="left"/>
+            </w:pPr>
+            <w:r>
+              <w:t xml:space="preserve">2.9.1</w:t>
+            </w:r>
+          </w:p>
+        </w:tc>
+        <w:tc>
+          <w:tcPr>
+            <w:shd w:val="clear" w:color="auto" w:fill="F6F8FA"/>
+          </w:tcPr>
+          <w:p>
+            <w:pPr>
+              <w:jc w:val="left"/>
+            </w:pPr>
+            <w:r>
+              <w:t xml:space="preserve">2026-08-23</w:t>
+            </w:r>
+          </w:p>
+        </w:tc>
+        <w:tc>
+          <w:tcPr>
+            <w:shd w:val="clear" w:color="auto" w:fill="F6F8FA"/>
+          </w:tcPr>
+          <w:p>
+            <w:pPr>
+              <w:numPr>
+                <w:ilvl w:val="0"/>
+                <w:numId w:val="1087"/>
+              </w:numPr>
+              <w:jc w:val="left"/>
+            </w:pPr>
+            <w:r>
               <w:t xml:space="preserve">HTML and Markdown outputs now embed images as base64 data URIs. HTML uses pandoc</w:t>
             </w:r>
             <w:r>
@@ -16369,58 +16429,13 @@
       </w:tr>
       <w:tr>
         <w:tc>
-          <w:tcPr>
-            <w:shd w:val="clear" w:color="auto" w:fill="F6F8FA"/>
-          </w:tcPr>
+          <w:tcPr/>
           <w:p>
             <w:pPr>
               <w:jc w:val="left"/>
             </w:pPr>
             <w:r>
               <w:t xml:space="preserve">2.9.0</w:t>
-            </w:r>
-          </w:p>
-        </w:tc>
-        <w:tc>
-          <w:tcPr>
-            <w:shd w:val="clear" w:color="auto" w:fill="F6F8FA"/>
-          </w:tcPr>
-          <w:p>
-            <w:pPr>
-              <w:jc w:val="left"/>
-            </w:pPr>
-            <w:r>
-              <w:t xml:space="preserve">2026-08-23</w:t>
-            </w:r>
-          </w:p>
-        </w:tc>
-        <w:tc>
-          <w:tcPr>
-            <w:shd w:val="clear" w:color="auto" w:fill="F6F8FA"/>
-          </w:tcPr>
-          <w:p>
-            <w:pPr>
-              <w:numPr>
-                <w:ilvl w:val="0"/>
-                <w:numId w:val="1087"/>
-              </w:numPr>
-              <w:jc w:val="left"/>
-            </w:pPr>
-            <w:r>
-              <w:t xml:space="preserve">DOCX: fix content width (8504→9638tw, margins are 2cm not 3cm). Add footer page numbers. Style TOC heading (22pt bold + rule). Add hutable table width + fixed layout.</w:t>
-            </w:r>
-          </w:p>
-        </w:tc>
-      </w:tr>
-      <w:tr>
-        <w:tc>
-          <w:tcPr/>
-          <w:p>
-            <w:pPr>
-              <w:jc w:val="left"/>
-            </w:pPr>
-            <w:r>
-              <w:t xml:space="preserve">2.8.3</w:t>
             </w:r>
           </w:p>
         </w:tc>
@@ -16446,7 +16461,7 @@
               <w:jc w:val="left"/>
             </w:pPr>
             <w:r>
-              <w:t xml:space="preserve">DOCX fix: callout tables now have explicit width (8504tw) and fixed layout. Changelog section heading now uses custom H1 format (56pt number, red border, right tab) instead of pandoc’s default.</w:t>
+              <w:t xml:space="preserve">DOCX: fix content width (8504→9638tw, margins are 2cm not 3cm). Add footer page numbers. Style TOC heading (22pt bold + rule). Add hutable table width + fixed layout.</w:t>
             </w:r>
           </w:p>
         </w:tc>
@@ -16461,7 +16476,7 @@
               <w:jc w:val="left"/>
             </w:pPr>
             <w:r>
-              <w:t xml:space="preserve">2.8.2</w:t>
+              <w:t xml:space="preserve">2.8.3</w:t>
             </w:r>
           </w:p>
         </w:tc>
@@ -16491,7 +16506,7 @@
               <w:jc w:val="left"/>
             </w:pPr>
             <w:r>
-              <w:t xml:space="preserve">DOCX H1 heading: reverted table approach to paragraph with tab stop + red bottom border. Table broke navigation pane and TOC field. Paragraph preserves Heading1 style for navigation while matching PDF layout (number left, title right, red rule below).</w:t>
+              <w:t xml:space="preserve">DOCX fix: callout tables now have explicit width (8504tw) and fixed layout. Changelog section heading now uses custom H1 format (56pt number, red border, right tab) instead of pandoc’s default.</w:t>
             </w:r>
           </w:p>
         </w:tc>
@@ -16504,7 +16519,7 @@
               <w:jc w:val="left"/>
             </w:pPr>
             <w:r>
-              <w:t xml:space="preserve">2.8.1</w:t>
+              <w:t xml:space="preserve">2.8.2</w:t>
             </w:r>
           </w:p>
         </w:tc>
@@ -16530,7 +16545,7 @@
               <w:jc w:val="left"/>
             </w:pPr>
             <w:r>
-              <w:t xml:space="preserve">DOCX heading fix: text color reverted to black (was incorrectly changed to Huawei red in v2.8.0). H1 now uses a two-column table (number left, title right) with red bottom rule. H2-H4 use simple inline format (number + title, no right tab stop).</w:t>
+              <w:t xml:space="preserve">DOCX H1 heading: reverted table approach to paragraph with tab stop + red bottom border. Table broke navigation pane and TOC field. Paragraph preserves Heading1 style for navigation while matching PDF layout (number left, title right, red rule below).</w:t>
             </w:r>
           </w:p>
         </w:tc>
@@ -16545,7 +16560,7 @@
               <w:jc w:val="left"/>
             </w:pPr>
             <w:r>
-              <w:t xml:space="preserve">2.8.0</w:t>
+              <w:t xml:space="preserve">2.8.1</w:t>
             </w:r>
           </w:p>
         </w:tc>
@@ -16575,7 +16590,7 @@
               <w:jc w:val="left"/>
             </w:pPr>
             <w:r>
-              <w:t xml:space="preserve">DOCX output: match PDF styling --- heading colors (Huawei red), H1 number size (56pt), callout borders (left-only) and padding, changelog formatting (rules, bold version, italic date), caption style (9pt bold), badge style (8pt bold white on red), list indentation.</w:t>
+              <w:t xml:space="preserve">DOCX heading fix: text color reverted to black (was incorrectly changed to Huawei red in v2.8.0). H1 now uses a two-column table (number left, title right) with red bottom rule. H2-H4 use simple inline format (number + title, no right tab stop).</w:t>
             </w:r>
           </w:p>
         </w:tc>
@@ -16588,7 +16603,7 @@
               <w:jc w:val="left"/>
             </w:pPr>
             <w:r>
-              <w:t xml:space="preserve">2.7.1</w:t>
+              <w:t xml:space="preserve">2.8.0</w:t>
             </w:r>
           </w:p>
         </w:tc>
@@ -16599,7 +16614,7 @@
               <w:jc w:val="left"/>
             </w:pPr>
             <w:r>
-              <w:t xml:space="preserve">2026-08-17</w:t>
+              <w:t xml:space="preserve">2026-08-23</w:t>
             </w:r>
           </w:p>
         </w:tc>
@@ -16614,6 +16629,51 @@
               <w:jc w:val="left"/>
             </w:pPr>
             <w:r>
+              <w:t xml:space="preserve">DOCX output: match PDF styling --- heading colors (Huawei red), H1 number size (56pt), callout borders (left-only) and padding, changelog formatting (rules, bold version, italic date), caption style (9pt bold), badge style (8pt bold white on red), list indentation.</w:t>
+            </w:r>
+          </w:p>
+        </w:tc>
+      </w:tr>
+      <w:tr>
+        <w:tc>
+          <w:tcPr>
+            <w:shd w:val="clear" w:color="auto" w:fill="F6F8FA"/>
+          </w:tcPr>
+          <w:p>
+            <w:pPr>
+              <w:jc w:val="left"/>
+            </w:pPr>
+            <w:r>
+              <w:t xml:space="preserve">2.7.1</w:t>
+            </w:r>
+          </w:p>
+        </w:tc>
+        <w:tc>
+          <w:tcPr>
+            <w:shd w:val="clear" w:color="auto" w:fill="F6F8FA"/>
+          </w:tcPr>
+          <w:p>
+            <w:pPr>
+              <w:jc w:val="left"/>
+            </w:pPr>
+            <w:r>
+              <w:t xml:space="preserve">2026-08-17</w:t>
+            </w:r>
+          </w:p>
+        </w:tc>
+        <w:tc>
+          <w:tcPr>
+            <w:shd w:val="clear" w:color="auto" w:fill="F6F8FA"/>
+          </w:tcPr>
+          <w:p>
+            <w:pPr>
+              <w:numPr>
+                <w:ilvl w:val="0"/>
+                <w:numId w:val="1093"/>
+              </w:numPr>
+              <w:jc w:val="left"/>
+            </w:pPr>
+            <w:r>
               <w:t xml:space="preserve">Rename project repository to all lowercase (</w:t>
             </w:r>
             <w:r>
@@ -16630,9 +16690,7 @@
       </w:tr>
       <w:tr>
         <w:tc>
-          <w:tcPr>
-            <w:shd w:val="clear" w:color="auto" w:fill="F6F8FA"/>
-          </w:tcPr>
+          <w:tcPr/>
           <w:p>
             <w:pPr>
               <w:jc w:val="left"/>
@@ -16643,9 +16701,7 @@
           </w:p>
         </w:tc>
         <w:tc>
-          <w:tcPr>
-            <w:shd w:val="clear" w:color="auto" w:fill="F6F8FA"/>
-          </w:tcPr>
+          <w:tcPr/>
           <w:p>
             <w:pPr>
               <w:jc w:val="left"/>
@@ -16656,14 +16712,12 @@
           </w:p>
         </w:tc>
         <w:tc>
-          <w:tcPr>
-            <w:shd w:val="clear" w:color="auto" w:fill="F6F8FA"/>
-          </w:tcPr>
+          <w:tcPr/>
           <w:p>
             <w:pPr>
               <w:numPr>
                 <w:ilvl w:val="0"/>
-                <w:numId w:val="1093"/>
+                <w:numId w:val="1094"/>
               </w:numPr>
               <w:jc w:val="left"/>
             </w:pPr>
@@ -16705,7 +16759,9 @@
       </w:tr>
       <w:tr>
         <w:tc>
-          <w:tcPr/>
+          <w:tcPr>
+            <w:shd w:val="clear" w:color="auto" w:fill="F6F8FA"/>
+          </w:tcPr>
           <w:p>
             <w:pPr>
               <w:jc w:val="left"/>
@@ -16716,7 +16772,9 @@
           </w:p>
         </w:tc>
         <w:tc>
-          <w:tcPr/>
+          <w:tcPr>
+            <w:shd w:val="clear" w:color="auto" w:fill="F6F8FA"/>
+          </w:tcPr>
           <w:p>
             <w:pPr>
               <w:jc w:val="left"/>
@@ -16727,12 +16785,14 @@
           </w:p>
         </w:tc>
         <w:tc>
-          <w:tcPr/>
+          <w:tcPr>
+            <w:shd w:val="clear" w:color="auto" w:fill="F6F8FA"/>
+          </w:tcPr>
           <w:p>
             <w:pPr>
               <w:numPr>
                 <w:ilvl w:val="0"/>
-                <w:numId w:val="1094"/>
+                <w:numId w:val="1095"/>
               </w:numPr>
               <w:jc w:val="left"/>
             </w:pPr>
@@ -16789,9 +16849,7 @@
       </w:tr>
       <w:tr>
         <w:tc>
-          <w:tcPr>
-            <w:shd w:val="clear" w:color="auto" w:fill="F6F8FA"/>
-          </w:tcPr>
+          <w:tcPr/>
           <w:p>
             <w:pPr>
               <w:jc w:val="left"/>
@@ -16802,9 +16860,7 @@
           </w:p>
         </w:tc>
         <w:tc>
-          <w:tcPr>
-            <w:shd w:val="clear" w:color="auto" w:fill="F6F8FA"/>
-          </w:tcPr>
+          <w:tcPr/>
           <w:p>
             <w:pPr>
               <w:jc w:val="left"/>
@@ -16815,14 +16871,12 @@
           </w:p>
         </w:tc>
         <w:tc>
-          <w:tcPr>
-            <w:shd w:val="clear" w:color="auto" w:fill="F6F8FA"/>
-          </w:tcPr>
+          <w:tcPr/>
           <w:p>
             <w:pPr>
               <w:numPr>
                 <w:ilvl w:val="0"/>
-                <w:numId w:val="1095"/>
+                <w:numId w:val="1096"/>
               </w:numPr>
               <w:jc w:val="left"/>
             </w:pPr>
@@ -16849,7 +16903,7 @@
             <w:pPr>
               <w:numPr>
                 <w:ilvl w:val="0"/>
-                <w:numId w:val="1095"/>
+                <w:numId w:val="1096"/>
               </w:numPr>
               <w:jc w:val="left"/>
             </w:pPr>
@@ -16876,54 +16930,15 @@
       </w:tr>
       <w:tr>
         <w:tc>
-          <w:tcPr/>
+          <w:tcPr>
+            <w:shd w:val="clear" w:color="auto" w:fill="F6F8FA"/>
+          </w:tcPr>
           <w:p>
             <w:pPr>
               <w:jc w:val="left"/>
             </w:pPr>
             <w:r>
               <w:t xml:space="preserve">2.5.1</w:t>
-            </w:r>
-          </w:p>
-        </w:tc>
-        <w:tc>
-          <w:tcPr/>
-          <w:p>
-            <w:pPr>
-              <w:jc w:val="left"/>
-            </w:pPr>
-            <w:r>
-              <w:t xml:space="preserve">2026-08-10</w:t>
-            </w:r>
-          </w:p>
-        </w:tc>
-        <w:tc>
-          <w:tcPr/>
-          <w:p>
-            <w:pPr>
-              <w:numPr>
-                <w:ilvl w:val="0"/>
-                <w:numId w:val="1096"/>
-              </w:numPr>
-              <w:jc w:val="left"/>
-            </w:pPr>
-            <w:r>
-              <w:t xml:space="preserve">H1 section title size reduced from 27pt to 20pt.</w:t>
-            </w:r>
-          </w:p>
-        </w:tc>
-      </w:tr>
-      <w:tr>
-        <w:tc>
-          <w:tcPr>
-            <w:shd w:val="clear" w:color="auto" w:fill="F6F8FA"/>
-          </w:tcPr>
-          <w:p>
-            <w:pPr>
-              <w:jc w:val="left"/>
-            </w:pPr>
-            <w:r>
-              <w:t xml:space="preserve">2.5.0</w:t>
             </w:r>
           </w:p>
         </w:tc>
@@ -16953,13 +16968,7 @@
               <w:jc w:val="left"/>
             </w:pPr>
             <w:r>
-              <w:t xml:space="preserve">Default image size increased: width 65% → 90% of text width,</w:t>
-            </w:r>
-            <w:r>
-              <w:t xml:space="preserve"> </w:t>
-            </w:r>
-            <w:r>
-              <w:t xml:space="preserve">height 40% → 50% of text height.</w:t>
+              <w:t xml:space="preserve">H1 section title size reduced from 27pt to 20pt.</w:t>
             </w:r>
           </w:p>
         </w:tc>
@@ -16972,7 +16981,7 @@
               <w:jc w:val="left"/>
             </w:pPr>
             <w:r>
-              <w:t xml:space="preserve">2.4.0</w:t>
+              <w:t xml:space="preserve">2.5.0</w:t>
             </w:r>
           </w:p>
         </w:tc>
@@ -16998,14 +17007,65 @@
               <w:jc w:val="left"/>
             </w:pPr>
             <w:r>
-              <w:t xml:space="preserve">Enlarged H1 section title (18pt → 27pt, 50% bigger).</w:t>
-            </w:r>
-          </w:p>
+              <w:t xml:space="preserve">Default image size increased: width 65% → 90% of text width,</w:t>
+            </w:r>
+            <w:r>
+              <w:t xml:space="preserve"> </w:t>
+            </w:r>
+            <w:r>
+              <w:t xml:space="preserve">height 40% → 50% of text height.</w:t>
+            </w:r>
+          </w:p>
+        </w:tc>
+      </w:tr>
+      <w:tr>
+        <w:tc>
+          <w:tcPr>
+            <w:shd w:val="clear" w:color="auto" w:fill="F6F8FA"/>
+          </w:tcPr>
+          <w:p>
+            <w:pPr>
+              <w:jc w:val="left"/>
+            </w:pPr>
+            <w:r>
+              <w:t xml:space="preserve">2.4.0</w:t>
+            </w:r>
+          </w:p>
+        </w:tc>
+        <w:tc>
+          <w:tcPr>
+            <w:shd w:val="clear" w:color="auto" w:fill="F6F8FA"/>
+          </w:tcPr>
+          <w:p>
+            <w:pPr>
+              <w:jc w:val="left"/>
+            </w:pPr>
+            <w:r>
+              <w:t xml:space="preserve">2026-08-10</w:t>
+            </w:r>
+          </w:p>
+        </w:tc>
+        <w:tc>
+          <w:tcPr>
+            <w:shd w:val="clear" w:color="auto" w:fill="F6F8FA"/>
+          </w:tcPr>
           <w:p>
             <w:pPr>
               <w:numPr>
                 <w:ilvl w:val="0"/>
-                <w:numId w:val="1098"/>
+                <w:numId w:val="1099"/>
+              </w:numPr>
+              <w:jc w:val="left"/>
+            </w:pPr>
+            <w:r>
+              <w:t xml:space="preserve">Enlarged H1 section title (18pt → 27pt, 50% bigger).</w:t>
+            </w:r>
+          </w:p>
+          <w:p>
+            <w:pPr>
+              <w:numPr>
+                <w:ilvl w:val="0"/>
+                <w:numId w:val="1099"/>
               </w:numPr>
               <w:jc w:val="left"/>
             </w:pPr>
@@ -17032,9 +17092,7 @@
       </w:tr>
       <w:tr>
         <w:tc>
-          <w:tcPr>
-            <w:shd w:val="clear" w:color="auto" w:fill="F6F8FA"/>
-          </w:tcPr>
+          <w:tcPr/>
           <w:p>
             <w:pPr>
               <w:jc w:val="left"/>
@@ -17045,9 +17103,7 @@
           </w:p>
         </w:tc>
         <w:tc>
-          <w:tcPr>
-            <w:shd w:val="clear" w:color="auto" w:fill="F6F8FA"/>
-          </w:tcPr>
+          <w:tcPr/>
           <w:p>
             <w:pPr>
               <w:jc w:val="left"/>
@@ -17058,14 +17114,12 @@
           </w:p>
         </w:tc>
         <w:tc>
-          <w:tcPr>
-            <w:shd w:val="clear" w:color="auto" w:fill="F6F8FA"/>
-          </w:tcPr>
+          <w:tcPr/>
           <w:p>
             <w:pPr>
               <w:numPr>
                 <w:ilvl w:val="0"/>
-                <w:numId w:val="1099"/>
+                <w:numId w:val="1100"/>
               </w:numPr>
               <w:jc w:val="left"/>
             </w:pPr>
@@ -17092,7 +17146,9 @@
       </w:tr>
       <w:tr>
         <w:tc>
-          <w:tcPr/>
+          <w:tcPr>
+            <w:shd w:val="clear" w:color="auto" w:fill="F6F8FA"/>
+          </w:tcPr>
           <w:p>
             <w:pPr>
               <w:jc w:val="left"/>
@@ -17103,7 +17159,9 @@
           </w:p>
         </w:tc>
         <w:tc>
-          <w:tcPr/>
+          <w:tcPr>
+            <w:shd w:val="clear" w:color="auto" w:fill="F6F8FA"/>
+          </w:tcPr>
           <w:p>
             <w:pPr>
               <w:jc w:val="left"/>
@@ -17114,12 +17172,14 @@
           </w:p>
         </w:tc>
         <w:tc>
-          <w:tcPr/>
+          <w:tcPr>
+            <w:shd w:val="clear" w:color="auto" w:fill="F6F8FA"/>
+          </w:tcPr>
           <w:p>
             <w:pPr>
               <w:numPr>
                 <w:ilvl w:val="0"/>
-                <w:numId w:val="1100"/>
+                <w:numId w:val="1101"/>
               </w:numPr>
               <w:jc w:val="left"/>
             </w:pPr>
@@ -17191,9 +17251,7 @@
       </w:tr>
       <w:tr>
         <w:tc>
-          <w:tcPr>
-            <w:shd w:val="clear" w:color="auto" w:fill="F6F8FA"/>
-          </w:tcPr>
+          <w:tcPr/>
           <w:p>
             <w:pPr>
               <w:jc w:val="left"/>
@@ -17204,9 +17262,7 @@
           </w:p>
         </w:tc>
         <w:tc>
-          <w:tcPr>
-            <w:shd w:val="clear" w:color="auto" w:fill="F6F8FA"/>
-          </w:tcPr>
+          <w:tcPr/>
           <w:p>
             <w:pPr>
               <w:jc w:val="left"/>
@@ -17217,14 +17273,12 @@
           </w:p>
         </w:tc>
         <w:tc>
-          <w:tcPr>
-            <w:shd w:val="clear" w:color="auto" w:fill="F6F8FA"/>
-          </w:tcPr>
+          <w:tcPr/>
           <w:p>
             <w:pPr>
               <w:numPr>
                 <w:ilvl w:val="0"/>
-                <w:numId w:val="1101"/>
+                <w:numId w:val="1102"/>
               </w:numPr>
               <w:jc w:val="left"/>
             </w:pPr>
@@ -17281,7 +17335,9 @@
       </w:tr>
       <w:tr>
         <w:tc>
-          <w:tcPr/>
+          <w:tcPr>
+            <w:shd w:val="clear" w:color="auto" w:fill="F6F8FA"/>
+          </w:tcPr>
           <w:p>
             <w:pPr>
               <w:jc w:val="left"/>
@@ -17292,7 +17348,9 @@
           </w:p>
         </w:tc>
         <w:tc>
-          <w:tcPr/>
+          <w:tcPr>
+            <w:shd w:val="clear" w:color="auto" w:fill="F6F8FA"/>
+          </w:tcPr>
           <w:p>
             <w:pPr>
               <w:jc w:val="left"/>
@@ -17303,12 +17361,14 @@
           </w:p>
         </w:tc>
         <w:tc>
-          <w:tcPr/>
+          <w:tcPr>
+            <w:shd w:val="clear" w:color="auto" w:fill="F6F8FA"/>
+          </w:tcPr>
           <w:p>
             <w:pPr>
               <w:numPr>
                 <w:ilvl w:val="0"/>
-                <w:numId w:val="1102"/>
+                <w:numId w:val="1103"/>
               </w:numPr>
               <w:jc w:val="left"/>
             </w:pPr>
@@ -17335,58 +17395,13 @@
       </w:tr>
       <w:tr>
         <w:tc>
-          <w:tcPr>
-            <w:shd w:val="clear" w:color="auto" w:fill="F6F8FA"/>
-          </w:tcPr>
+          <w:tcPr/>
           <w:p>
             <w:pPr>
               <w:jc w:val="left"/>
             </w:pPr>
             <w:r>
               <w:t xml:space="preserve">2.2.2</w:t>
-            </w:r>
-          </w:p>
-        </w:tc>
-        <w:tc>
-          <w:tcPr>
-            <w:shd w:val="clear" w:color="auto" w:fill="F6F8FA"/>
-          </w:tcPr>
-          <w:p>
-            <w:pPr>
-              <w:jc w:val="left"/>
-            </w:pPr>
-            <w:r>
-              <w:t xml:space="preserve">2026-08-08</w:t>
-            </w:r>
-          </w:p>
-        </w:tc>
-        <w:tc>
-          <w:tcPr>
-            <w:shd w:val="clear" w:color="auto" w:fill="F6F8FA"/>
-          </w:tcPr>
-          <w:p>
-            <w:pPr>
-              <w:numPr>
-                <w:ilvl w:val="0"/>
-                <w:numId w:val="1103"/>
-              </w:numPr>
-              <w:jc w:val="left"/>
-            </w:pPr>
-            <w:r>
-              <w:t xml:space="preserve">Fixed chapter reference in prerequisite (Chapter 3 → Chapter 4).</w:t>
-            </w:r>
-          </w:p>
-        </w:tc>
-      </w:tr>
-      <w:tr>
-        <w:tc>
-          <w:tcPr/>
-          <w:p>
-            <w:pPr>
-              <w:jc w:val="left"/>
-            </w:pPr>
-            <w:r>
-              <w:t xml:space="preserve">2.2.1</w:t>
             </w:r>
           </w:p>
         </w:tc>
@@ -17412,7 +17427,7 @@
               <w:jc w:val="left"/>
             </w:pPr>
             <w:r>
-              <w:t xml:space="preserve">Changed table and figure caption labels to black (was Huawei red).</w:t>
+              <w:t xml:space="preserve">Fixed chapter reference in prerequisite (Chapter 3 → Chapter 4).</w:t>
             </w:r>
           </w:p>
         </w:tc>
@@ -17427,7 +17442,7 @@
               <w:jc w:val="left"/>
             </w:pPr>
             <w:r>
-              <w:t xml:space="preserve">2.2.0</w:t>
+              <w:t xml:space="preserve">2.2.1</w:t>
             </w:r>
           </w:p>
         </w:tc>
@@ -17457,13 +17472,7 @@
               <w:jc w:val="left"/>
             </w:pPr>
             <w:r>
-              <w:t xml:space="preserve">Added Huawei-branded table styling: red header bar, alternating row</w:t>
-            </w:r>
-            <w:r>
-              <w:t xml:space="preserve"> </w:t>
-            </w:r>
-            <w:r>
-              <w:t xml:space="preserve">colors, and bordered cells.</w:t>
+              <w:t xml:space="preserve">Changed table and figure caption labels to black (was Huawei red).</w:t>
             </w:r>
           </w:p>
         </w:tc>
@@ -17476,7 +17485,7 @@
               <w:jc w:val="left"/>
             </w:pPr>
             <w:r>
-              <w:t xml:space="preserve">2.1.0</w:t>
+              <w:t xml:space="preserve">2.2.0</w:t>
             </w:r>
           </w:p>
         </w:tc>
@@ -17487,7 +17496,7 @@
               <w:jc w:val="left"/>
             </w:pPr>
             <w:r>
-              <w:t xml:space="preserve">2026-08-06</w:t>
+              <w:t xml:space="preserve">2026-08-08</w:t>
             </w:r>
           </w:p>
         </w:tc>
@@ -17502,6 +17511,57 @@
               <w:jc w:val="left"/>
             </w:pPr>
             <w:r>
+              <w:t xml:space="preserve">Added Huawei-branded table styling: red header bar, alternating row</w:t>
+            </w:r>
+            <w:r>
+              <w:t xml:space="preserve"> </w:t>
+            </w:r>
+            <w:r>
+              <w:t xml:space="preserve">colors, and bordered cells.</w:t>
+            </w:r>
+          </w:p>
+        </w:tc>
+      </w:tr>
+      <w:tr>
+        <w:tc>
+          <w:tcPr>
+            <w:shd w:val="clear" w:color="auto" w:fill="F6F8FA"/>
+          </w:tcPr>
+          <w:p>
+            <w:pPr>
+              <w:jc w:val="left"/>
+            </w:pPr>
+            <w:r>
+              <w:t xml:space="preserve">2.1.0</w:t>
+            </w:r>
+          </w:p>
+        </w:tc>
+        <w:tc>
+          <w:tcPr>
+            <w:shd w:val="clear" w:color="auto" w:fill="F6F8FA"/>
+          </w:tcPr>
+          <w:p>
+            <w:pPr>
+              <w:jc w:val="left"/>
+            </w:pPr>
+            <w:r>
+              <w:t xml:space="preserve">2026-08-06</w:t>
+            </w:r>
+          </w:p>
+        </w:tc>
+        <w:tc>
+          <w:tcPr>
+            <w:shd w:val="clear" w:color="auto" w:fill="F6F8FA"/>
+          </w:tcPr>
+          <w:p>
+            <w:pPr>
+              <w:numPr>
+                <w:ilvl w:val="0"/>
+                <w:numId w:val="1107"/>
+              </w:numPr>
+              <w:jc w:val="left"/>
+            </w:pPr>
+            <w:r>
               <w:t xml:space="preserve">Updated ECS flavor to</w:t>
             </w:r>
             <w:r>
@@ -17524,7 +17584,7 @@
             <w:pPr>
               <w:numPr>
                 <w:ilvl w:val="0"/>
-                <w:numId w:val="1106"/>
+                <w:numId w:val="1107"/>
               </w:numPr>
               <w:jc w:val="left"/>
             </w:pPr>
@@ -17536,7 +17596,7 @@
             <w:pPr>
               <w:numPr>
                 <w:ilvl w:val="0"/>
-                <w:numId w:val="1106"/>
+                <w:numId w:val="1107"/>
               </w:numPr>
               <w:jc w:val="left"/>
             </w:pPr>
@@ -17548,7 +17608,7 @@
             <w:pPr>
               <w:numPr>
                 <w:ilvl w:val="0"/>
-                <w:numId w:val="1106"/>
+                <w:numId w:val="1107"/>
               </w:numPr>
               <w:jc w:val="left"/>
             </w:pPr>
@@ -17560,7 +17620,7 @@
             <w:pPr>
               <w:numPr>
                 <w:ilvl w:val="0"/>
-                <w:numId w:val="1106"/>
+                <w:numId w:val="1107"/>
               </w:numPr>
               <w:jc w:val="left"/>
             </w:pPr>
@@ -17572,7 +17632,7 @@
             <w:pPr>
               <w:numPr>
                 <w:ilvl w:val="0"/>
-                <w:numId w:val="1106"/>
+                <w:numId w:val="1107"/>
               </w:numPr>
               <w:jc w:val="left"/>
             </w:pPr>
@@ -17590,7 +17650,7 @@
             <w:pPr>
               <w:numPr>
                 <w:ilvl w:val="0"/>
-                <w:numId w:val="1106"/>
+                <w:numId w:val="1107"/>
               </w:numPr>
               <w:jc w:val="left"/>
             </w:pPr>
@@ -17639,7 +17699,7 @@
             <w:pPr>
               <w:numPr>
                 <w:ilvl w:val="0"/>
-                <w:numId w:val="1106"/>
+                <w:numId w:val="1107"/>
               </w:numPr>
               <w:jc w:val="left"/>
             </w:pPr>
@@ -17651,7 +17711,7 @@
             <w:pPr>
               <w:numPr>
                 <w:ilvl w:val="0"/>
-                <w:numId w:val="1106"/>
+                <w:numId w:val="1107"/>
               </w:numPr>
               <w:jc w:val="left"/>
             </w:pPr>
@@ -17702,7 +17762,7 @@
             <w:pPr>
               <w:numPr>
                 <w:ilvl w:val="0"/>
-                <w:numId w:val="1106"/>
+                <w:numId w:val="1107"/>
               </w:numPr>
               <w:jc w:val="left"/>
             </w:pPr>
@@ -17729,9 +17789,7 @@
       </w:tr>
       <w:tr>
         <w:tc>
-          <w:tcPr>
-            <w:shd w:val="clear" w:color="auto" w:fill="F6F8FA"/>
-          </w:tcPr>
+          <w:tcPr/>
           <w:p>
             <w:pPr>
               <w:jc w:val="left"/>
@@ -17742,9 +17800,7 @@
           </w:p>
         </w:tc>
         <w:tc>
-          <w:tcPr>
-            <w:shd w:val="clear" w:color="auto" w:fill="F6F8FA"/>
-          </w:tcPr>
+          <w:tcPr/>
           <w:p>
             <w:pPr>
               <w:jc w:val="left"/>
@@ -17755,14 +17811,12 @@
           </w:p>
         </w:tc>
         <w:tc>
-          <w:tcPr>
-            <w:shd w:val="clear" w:color="auto" w:fill="F6F8FA"/>
-          </w:tcPr>
+          <w:tcPr/>
           <w:p>
             <w:pPr>
               <w:numPr>
                 <w:ilvl w:val="0"/>
-                <w:numId w:val="1107"/>
+                <w:numId w:val="1108"/>
               </w:numPr>
               <w:jc w:val="left"/>
             </w:pPr>
@@ -17780,7 +17834,7 @@
             <w:pPr>
               <w:numPr>
                 <w:ilvl w:val="0"/>
-                <w:numId w:val="1107"/>
+                <w:numId w:val="1108"/>
               </w:numPr>
               <w:jc w:val="left"/>
             </w:pPr>
@@ -17834,7 +17888,7 @@
             <w:pPr>
               <w:numPr>
                 <w:ilvl w:val="0"/>
-                <w:numId w:val="1107"/>
+                <w:numId w:val="1108"/>
               </w:numPr>
               <w:jc w:val="left"/>
             </w:pPr>
@@ -17882,7 +17936,7 @@
             <w:pPr>
               <w:numPr>
                 <w:ilvl w:val="0"/>
-                <w:numId w:val="1107"/>
+                <w:numId w:val="1108"/>
               </w:numPr>
               <w:jc w:val="left"/>
             </w:pPr>
@@ -17903,7 +17957,9 @@
       </w:tr>
       <w:tr>
         <w:tc>
-          <w:tcPr/>
+          <w:tcPr>
+            <w:shd w:val="clear" w:color="auto" w:fill="F6F8FA"/>
+          </w:tcPr>
           <w:p>
             <w:pPr>
               <w:jc w:val="left"/>
@@ -17914,7 +17970,9 @@
           </w:p>
         </w:tc>
         <w:tc>
-          <w:tcPr/>
+          <w:tcPr>
+            <w:shd w:val="clear" w:color="auto" w:fill="F6F8FA"/>
+          </w:tcPr>
           <w:p>
             <w:pPr>
               <w:jc w:val="left"/>
@@ -17925,12 +17983,14 @@
           </w:p>
         </w:tc>
         <w:tc>
-          <w:tcPr/>
+          <w:tcPr>
+            <w:shd w:val="clear" w:color="auto" w:fill="F6F8FA"/>
+          </w:tcPr>
           <w:p>
             <w:pPr>
               <w:numPr>
                 <w:ilvl w:val="0"/>
-                <w:numId w:val="1108"/>
+                <w:numId w:val="1109"/>
               </w:numPr>
               <w:jc w:val="left"/>
             </w:pPr>
@@ -17942,7 +18002,7 @@
             <w:pPr>
               <w:numPr>
                 <w:ilvl w:val="0"/>
-                <w:numId w:val="1108"/>
+                <w:numId w:val="1109"/>
               </w:numPr>
               <w:jc w:val="left"/>
             </w:pPr>
@@ -17954,7 +18014,7 @@
             <w:pPr>
               <w:numPr>
                 <w:ilvl w:val="0"/>
-                <w:numId w:val="1108"/>
+                <w:numId w:val="1109"/>
               </w:numPr>
               <w:jc w:val="left"/>
             </w:pPr>
@@ -17966,7 +18026,7 @@
             <w:pPr>
               <w:numPr>
                 <w:ilvl w:val="0"/>
-                <w:numId w:val="1108"/>
+                <w:numId w:val="1109"/>
               </w:numPr>
               <w:jc w:val="left"/>
             </w:pPr>
@@ -17984,7 +18044,7 @@
             <w:pPr>
               <w:numPr>
                 <w:ilvl w:val="0"/>
-                <w:numId w:val="1108"/>
+                <w:numId w:val="1109"/>
               </w:numPr>
               <w:jc w:val="left"/>
             </w:pPr>
@@ -17996,7 +18056,7 @@
             <w:pPr>
               <w:numPr>
                 <w:ilvl w:val="0"/>
-                <w:numId w:val="1108"/>
+                <w:numId w:val="1109"/>
               </w:numPr>
               <w:jc w:val="left"/>
             </w:pPr>
@@ -19365,6 +19425,9 @@
     <w:abstractNumId w:val="991"/>
   </w:num>
   <w:num w:numId="1108">
+    <w:abstractNumId w:val="991"/>
+  </w:num>
+  <w:num w:numId="1109">
     <w:abstractNumId w:val="991"/>
   </w:num>
 </w:numbering>

</xml_diff>

<commit_message>
Widen marker-strip guarantee to the whole DOCX fix run (v6.6.1)
- Cover the entire fix (styles phase, zip rewrite, content styling) with
  the try/finally — a failure at any stage can no longer leave TESTCASE
  markers in the output file
- Reset the fixer's template state between in-process main() runs (the
  documented path-sniffing fallback works again)
- build.sh: also clean temp files on interrupt signals (INT/TERM trap)
- test-docx-fix: new styles-phase failure assertion (markers stripped
  when a loud style assertion fires before styling)
- Fix CHANGELOG typo; bump all templates + setup-guide to v6.6.1;
  regenerate committed artifacts
</commit_message>
<xml_diff>
--- a/documents/setup-guide/setup-guide.docx
+++ b/documents/setup-guide/setup-guide.docx
@@ -84,7 +84,7 @@
           <w:b/>
           <w:sz w:val="24"/>
         </w:rPr>
-        <w:t xml:space="preserve">v6.6.0</w:t>
+        <w:t xml:space="preserve">v6.6.1</w:t>
       </w:r>
       <w:r>
         <w:rPr>
@@ -96,7 +96,7 @@
         <w:rPr>
           <w:sz w:val="24"/>
         </w:rPr>
-        <w:t xml:space="preserve">— September 20, 2026 14:27</w:t>
+        <w:t xml:space="preserve">— September 20, 2026 14:59</w:t>
       </w:r>
     </w:p>
     <w:sdt>
@@ -13345,7 +13345,7 @@
               <w:jc w:val="left"/>
             </w:pPr>
             <w:r>
-              <w:t xml:space="preserve">6.6.0</w:t>
+              <w:t xml:space="preserve">6.6.1</w:t>
             </w:r>
           </w:p>
         </w:tc>
@@ -13371,6 +13371,51 @@
               <w:jc w:val="left"/>
             </w:pPr>
             <w:r>
+              <w:t xml:space="preserve">Quality-pass fixes for v6.6.0: the TESTCASE-marker strip now covers the entire DOCX fix run (a failure at any stage can no longer leave markers in the output file); the fixer resets its template state between in-process runs (the documented path-sniffing fallback works again); build.sh also cleans temporary files on interrupt signals; fixed a CHANGELOG typo.</w:t>
+            </w:r>
+          </w:p>
+        </w:tc>
+      </w:tr>
+      <w:tr>
+        <w:tc>
+          <w:tcPr>
+            <w:shd w:val="clear" w:color="auto" w:fill="F6F8FA"/>
+          </w:tcPr>
+          <w:p>
+            <w:pPr>
+              <w:jc w:val="left"/>
+            </w:pPr>
+            <w:r>
+              <w:t xml:space="preserve">6.6.0</w:t>
+            </w:r>
+          </w:p>
+        </w:tc>
+        <w:tc>
+          <w:tcPr>
+            <w:shd w:val="clear" w:color="auto" w:fill="F6F8FA"/>
+          </w:tcPr>
+          <w:p>
+            <w:pPr>
+              <w:jc w:val="left"/>
+            </w:pPr>
+            <w:r>
+              <w:t xml:space="preserve">2026-09-20</w:t>
+            </w:r>
+          </w:p>
+        </w:tc>
+        <w:tc>
+          <w:tcPr>
+            <w:shd w:val="clear" w:color="auto" w:fill="F6F8FA"/>
+          </w:tcPr>
+          <w:p>
+            <w:pPr>
+              <w:numPr>
+                <w:ilvl w:val="0"/>
+                <w:numId w:val="1043"/>
+              </w:numPr>
+              <w:jc w:val="left"/>
+            </w:pPr>
+            <w:r>
               <w:t xml:space="preserve">Pipeline robustness: DOCX post-processing now fails loudly when content styling errors occur (TESTCASE markers can no longer leak into output); the DOCX fixer takes an explicit</w:t>
             </w:r>
             <w:r>
@@ -13393,58 +13438,13 @@
       </w:tr>
       <w:tr>
         <w:tc>
-          <w:tcPr>
-            <w:shd w:val="clear" w:color="auto" w:fill="F6F8FA"/>
-          </w:tcPr>
+          <w:tcPr/>
           <w:p>
             <w:pPr>
               <w:jc w:val="left"/>
             </w:pPr>
             <w:r>
               <w:t xml:space="preserve">6.5.2</w:t>
-            </w:r>
-          </w:p>
-        </w:tc>
-        <w:tc>
-          <w:tcPr>
-            <w:shd w:val="clear" w:color="auto" w:fill="F6F8FA"/>
-          </w:tcPr>
-          <w:p>
-            <w:pPr>
-              <w:jc w:val="left"/>
-            </w:pPr>
-            <w:r>
-              <w:t xml:space="preserve">2026-09-20</w:t>
-            </w:r>
-          </w:p>
-        </w:tc>
-        <w:tc>
-          <w:tcPr>
-            <w:shd w:val="clear" w:color="auto" w:fill="F6F8FA"/>
-          </w:tcPr>
-          <w:p>
-            <w:pPr>
-              <w:numPr>
-                <w:ilvl w:val="0"/>
-                <w:numId w:val="1043"/>
-              </w:numPr>
-              <w:jc w:val="left"/>
-            </w:pPr>
-            <w:r>
-              <w:t xml:space="preserve">Quality-pass fixes for v6.5.1: LaTeX quote conversion now handles only paired quotes (quote characters inside code arguments are no longer corrupted); signature cells containing escaped ampersands are no longer split; round-trip HTML generation guards the asciidoctor-diagram dependency and fails loudly when generation fails; pre-processor unit tests now cover pipe escaping in all five table handlers.</w:t>
-            </w:r>
-          </w:p>
-        </w:tc>
-      </w:tr>
-      <w:tr>
-        <w:tc>
-          <w:tcPr/>
-          <w:p>
-            <w:pPr>
-              <w:jc w:val="left"/>
-            </w:pPr>
-            <w:r>
-              <w:t xml:space="preserve">6.5.1</w:t>
             </w:r>
           </w:p>
         </w:tc>
@@ -13470,7 +13470,7 @@
               <w:jc w:val="left"/>
             </w:pPr>
             <w:r>
-              <w:t xml:space="preserve">Fixed DOCX/MD/HTML output: tables are no longer corrupted when changelog, signature, or summary content contains a pipe character (“|”). Badge text is now preserved in DOCX/MD/HTML — a “Ready” badge renders “Ready” instead of “[NEW]”. Multi-item changelog entries render as bullet lists instead of being joined with a literal “+”. POC documents now include the changelog in DOCX/MD/HTML. The :noanswers: attribute now hides test results and remarks in DOCX/MD/HTML, matching the PDF. Inline LaTeX (monospace text, arrows, LaTeX quotes) no longer leaks from changelog entries. The test suite now exercises the real build pipeline (pre-processor wired into round-trip and DOCX tests), with new pre-processor unit tests.</w:t>
+              <w:t xml:space="preserve">Quality-pass fixes for v6.5.1: LaTeX quote conversion now handles only paired quotes (quote characters inside code arguments are no longer corrupted); signature cells containing escaped ampersands are no longer split; round-trip HTML generation guards the asciidoctor-diagram dependency and fails loudly when generation fails; pre-processor unit tests now cover pipe escaping in all five table handlers.</w:t>
             </w:r>
           </w:p>
         </w:tc>
@@ -13485,7 +13485,7 @@
               <w:jc w:val="left"/>
             </w:pPr>
             <w:r>
-              <w:t xml:space="preserve">6.5.0</w:t>
+              <w:t xml:space="preserve">6.5.1</w:t>
             </w:r>
           </w:p>
         </w:tc>
@@ -13515,7 +13515,7 @@
               <w:jc w:val="left"/>
             </w:pPr>
             <w:r>
-              <w:t xml:space="preserve">Evidence checklist simplified to plain bullets in both PDF and DOCX (checkbox markers removed for compatibility). Planned Activities list in DOCX now uses Word’s native lower-roman numbering (i., ii., iii.) matching the PDF. Badges in DOCX replaced with exact-replica PNG pill images (rounded, colored frame and background, bold text) matching the PDF \ huaweibadge look — assets committed to the repo. Signature blocks in DOCX no longer show literal + symbols (proper hard line breaks).</w:t>
+              <w:t xml:space="preserve">Fixed DOCX/MD/HTML output: tables are no longer corrupted when changelog, signature, or summary content contains a pipe character (“|”). Badge text is now preserved in DOCX/MD/HTML — a “Ready” badge renders “Ready” instead of “[NEW]”. Multi-item changelog entries render as bullet lists instead of being joined with a literal “+”. POC documents now include the changelog in DOCX/MD/HTML. The :noanswers: attribute now hides test results and remarks in DOCX/MD/HTML, matching the PDF. Inline LaTeX (monospace text, arrows, LaTeX quotes) no longer leaks from changelog entries. The test suite now exercises the real build pipeline (pre-processor wired into round-trip and DOCX tests), with new pre-processor unit tests.</w:t>
             </w:r>
           </w:p>
         </w:tc>
@@ -13528,7 +13528,7 @@
               <w:jc w:val="left"/>
             </w:pPr>
             <w:r>
-              <w:t xml:space="preserve">6.4.7</w:t>
+              <w:t xml:space="preserve">6.5.0</w:t>
             </w:r>
           </w:p>
         </w:tc>
@@ -13554,7 +13554,7 @@
               <w:jc w:val="left"/>
             </w:pPr>
             <w:r>
-              <w:t xml:space="preserve">Section titles in DOCX now match the PDF heading design: the big section number (56pt) sits on the left, the title text is pushed to the right edge (a right tab stop mimics the LaTeX \ hfill), and the red rule runs below — previously the title sat left-aligned next to a small number. Applies to all templates.</w:t>
+              <w:t xml:space="preserve">Evidence checklist simplified to plain bullets in both PDF and DOCX (checkbox markers removed for compatibility). Planned Activities list in DOCX now uses Word’s native lower-roman numbering (i., ii., iii.) matching the PDF. Badges in DOCX replaced with exact-replica PNG pill images (rounded, colored frame and background, bold text) matching the PDF \ huaweibadge look — assets committed to the repo. Signature blocks in DOCX no longer show literal + symbols (proper hard line breaks).</w:t>
             </w:r>
           </w:p>
         </w:tc>
@@ -13569,7 +13569,7 @@
               <w:jc w:val="left"/>
             </w:pPr>
             <w:r>
-              <w:t xml:space="preserve">6.4.6</w:t>
+              <w:t xml:space="preserve">6.4.7</w:t>
             </w:r>
           </w:p>
         </w:tc>
@@ -13599,7 +13599,7 @@
               <w:jc w:val="left"/>
             </w:pPr>
             <w:r>
-              <w:t xml:space="preserve">Code blocks inside test cases no longer break the red left rule in DOCX — the code style’s left indent (which jogged the rule) is reset inside test case blocks, and code blocks now show the PDF’s code box (gray background with thin border on top, bottom, and right, red rule continuing on the left).</w:t>
+              <w:t xml:space="preserve">Section titles in DOCX now match the PDF heading design: the big section number (56pt) sits on the left, the title text is pushed to the right edge (a right tab stop mimics the LaTeX \ hfill), and the red rule runs below — previously the title sat left-aligned next to a small number. Applies to all templates.</w:t>
             </w:r>
           </w:p>
         </w:tc>
@@ -13612,7 +13612,7 @@
               <w:jc w:val="left"/>
             </w:pPr>
             <w:r>
-              <w:t xml:space="preserve">6.4.5</w:t>
+              <w:t xml:space="preserve">6.4.6</w:t>
             </w:r>
           </w:p>
         </w:tc>
@@ -13638,7 +13638,7 @@
               <w:jc w:val="left"/>
             </w:pPr>
             <w:r>
-              <w:t xml:space="preserve">DOCX polish pass: all captions centered (matching the PDF), vertical spacing between blocks matched to the LaTeX rhythm (medskip/smallskip around captions, field bars, and steps), and test steps now render as separate paragraphs each with the red bold number (previously merged into one paragraph).</w:t>
+              <w:t xml:space="preserve">Code blocks inside test cases no longer break the red left rule in DOCX — the code style’s left indent (which jogged the rule) is reset inside test case blocks, and code blocks now show the PDF’s code box (gray background with thin border on top, bottom, and right, red rule continuing on the left).</w:t>
             </w:r>
           </w:p>
         </w:tc>
@@ -13653,7 +13653,7 @@
               <w:jc w:val="left"/>
             </w:pPr>
             <w:r>
-              <w:t xml:space="preserve">6.4.4</w:t>
+              <w:t xml:space="preserve">6.4.5</w:t>
             </w:r>
           </w:p>
         </w:tc>
@@ -13683,7 +13683,7 @@
               <w:jc w:val="left"/>
             </w:pPr>
             <w:r>
-              <w:t xml:space="preserve">DOCX covers now show the logo, cover text, and version/date/time meta line like the PDF. Test case blocks in DOCX get the PDF’s visual wrapper: red left rule, red field header bars, and red step numbers. Captions follow the PDF ordering system in DOCX, MD, and HTML (Table/Diagram/Figure/Testcase N: with bold symbol). Portuguese PDFs now label diagrams "Diagrama N:" (was hardcoded English "Diagram"). Markdown and HTML output no longer leaks raw LaTeX from passthrough blocks — the DOCX pre-processor now feeds those pipelines too.</w:t>
+              <w:t xml:space="preserve">DOCX polish pass: all captions centered (matching the PDF), vertical spacing between blocks matched to the LaTeX rhythm (medskip/smallskip around captions, field bars, and steps), and test steps now render as separate paragraphs each with the red bold number (previously merged into one paragraph).</w:t>
             </w:r>
           </w:p>
         </w:tc>
@@ -13696,7 +13696,7 @@
               <w:jc w:val="left"/>
             </w:pPr>
             <w:r>
-              <w:t xml:space="preserve">6.4.3</w:t>
+              <w:t xml:space="preserve">6.4.4</w:t>
             </w:r>
           </w:p>
         </w:tc>
@@ -13722,7 +13722,7 @@
               <w:jc w:val="left"/>
             </w:pPr>
             <w:r>
-              <w:t xml:space="preserve">Testbook and POC DOCX output now matches the PDF much more closely: native table of contents (language-aware, auto-populated), each section starts on a new page, embedded images and diagrams (PlantUML/Graphviz rendered), white-on-red table headers, cover version line under the title, centered test case captions, and plain black rules for signature grids.</w:t>
+              <w:t xml:space="preserve">DOCX covers now show the logo, cover text, and version/date/time meta line like the PDF. Test case blocks in DOCX get the PDF’s visual wrapper: red left rule, red field header bars, and red step numbers. Captions follow the PDF ordering system in DOCX, MD, and HTML (Table/Diagram/Figure/Testcase N: with bold symbol). Portuguese PDFs now label diagrams "Diagrama N:" (was hardcoded English "Diagram"). Markdown and HTML output no longer leaks raw LaTeX from passthrough blocks — the DOCX pre-processor now feeds those pipelines too.</w:t>
             </w:r>
           </w:p>
         </w:tc>
@@ -13737,7 +13737,7 @@
               <w:jc w:val="left"/>
             </w:pPr>
             <w:r>
-              <w:t xml:space="preserve">6.4.2</w:t>
+              <w:t xml:space="preserve">6.4.3</w:t>
             </w:r>
           </w:p>
         </w:tc>
@@ -13767,7 +13767,7 @@
               <w:jc w:val="left"/>
             </w:pPr>
             <w:r>
-              <w:t xml:space="preserve">DOCX output for POC and testbook templates now includes all passthrough content (stakeholders, closing record, signatures, test cases, test summary, changelog) via a new pre-processor. Fixed dropped Test Scope fields in testbook DOCX output.</w:t>
+              <w:t xml:space="preserve">Testbook and POC DOCX output now matches the PDF much more closely: native table of contents (language-aware, auto-populated), each section starts on a new page, embedded images and diagrams (PlantUML/Graphviz rendered), white-on-red table headers, cover version line under the title, centered test case captions, and plain black rules for signature grids.</w:t>
             </w:r>
           </w:p>
         </w:tc>
@@ -13780,7 +13780,7 @@
               <w:jc w:val="left"/>
             </w:pPr>
             <w:r>
-              <w:t xml:space="preserve">6.4.0</w:t>
+              <w:t xml:space="preserve">6.4.2</w:t>
             </w:r>
           </w:p>
         </w:tc>
@@ -13806,6 +13806,51 @@
               <w:jc w:val="left"/>
             </w:pPr>
             <w:r>
+              <w:t xml:space="preserve">DOCX output for POC and testbook templates now includes all passthrough content (stakeholders, closing record, signatures, test cases, test summary, changelog) via a new pre-processor. Fixed dropped Test Scope fields in testbook DOCX output.</w:t>
+            </w:r>
+          </w:p>
+        </w:tc>
+      </w:tr>
+      <w:tr>
+        <w:tc>
+          <w:tcPr>
+            <w:shd w:val="clear" w:color="auto" w:fill="F6F8FA"/>
+          </w:tcPr>
+          <w:p>
+            <w:pPr>
+              <w:jc w:val="left"/>
+            </w:pPr>
+            <w:r>
+              <w:t xml:space="preserve">6.4.0</w:t>
+            </w:r>
+          </w:p>
+        </w:tc>
+        <w:tc>
+          <w:tcPr>
+            <w:shd w:val="clear" w:color="auto" w:fill="F6F8FA"/>
+          </w:tcPr>
+          <w:p>
+            <w:pPr>
+              <w:jc w:val="left"/>
+            </w:pPr>
+            <w:r>
+              <w:t xml:space="preserve">2026-09-20</w:t>
+            </w:r>
+          </w:p>
+        </w:tc>
+        <w:tc>
+          <w:tcPr>
+            <w:shd w:val="clear" w:color="auto" w:fill="F6F8FA"/>
+          </w:tcPr>
+          <w:p>
+            <w:pPr>
+              <w:numPr>
+                <w:ilvl w:val="0"/>
+                <w:numId w:val="1053"/>
+              </w:numPr>
+              <w:jc w:val="left"/>
+            </w:pPr>
+            <w:r>
               <w:t xml:space="preserve">Fixed changelog dates — replaced</w:t>
             </w:r>
             <w:r>
@@ -13828,58 +13873,13 @@
       </w:tr>
       <w:tr>
         <w:tc>
-          <w:tcPr>
-            <w:shd w:val="clear" w:color="auto" w:fill="F6F8FA"/>
-          </w:tcPr>
+          <w:tcPr/>
           <w:p>
             <w:pPr>
               <w:jc w:val="left"/>
             </w:pPr>
             <w:r>
               <w:t xml:space="preserve">5.1.1</w:t>
-            </w:r>
-          </w:p>
-        </w:tc>
-        <w:tc>
-          <w:tcPr>
-            <w:shd w:val="clear" w:color="auto" w:fill="F6F8FA"/>
-          </w:tcPr>
-          <w:p>
-            <w:pPr>
-              <w:jc w:val="left"/>
-            </w:pPr>
-            <w:r>
-              <w:t xml:space="preserve">2026-09-14</w:t>
-            </w:r>
-          </w:p>
-        </w:tc>
-        <w:tc>
-          <w:tcPr>
-            <w:shd w:val="clear" w:color="auto" w:fill="F6F8FA"/>
-          </w:tcPr>
-          <w:p>
-            <w:pPr>
-              <w:numPr>
-                <w:ilvl w:val="0"/>
-                <w:numId w:val="1053"/>
-              </w:numPr>
-              <w:jc w:val="left"/>
-            </w:pPr>
-            <w:r>
-              <w:t xml:space="preserve">Synced callout colors in DOCX/HTML/MD output to match brand palette. Added color palette demo.</w:t>
-            </w:r>
-          </w:p>
-        </w:tc>
-      </w:tr>
-      <w:tr>
-        <w:tc>
-          <w:tcPr/>
-          <w:p>
-            <w:pPr>
-              <w:jc w:val="left"/>
-            </w:pPr>
-            <w:r>
-              <w:t xml:space="preserve">5.1.0</w:t>
             </w:r>
           </w:p>
         </w:tc>
@@ -13905,7 +13905,7 @@
               <w:jc w:val="left"/>
             </w:pPr>
             <w:r>
-              <w:t xml:space="preserve">Adopted brand guidelines auxiliary color palette and monochrome scale. Aligned callout colors to brand specifications.</w:t>
+              <w:t xml:space="preserve">Synced callout colors in DOCX/HTML/MD output to match brand palette. Added color palette demo.</w:t>
             </w:r>
           </w:p>
         </w:tc>
@@ -13920,7 +13920,7 @@
               <w:jc w:val="left"/>
             </w:pPr>
             <w:r>
-              <w:t xml:space="preserve">5.0.3</w:t>
+              <w:t xml:space="preserve">5.1.0</w:t>
             </w:r>
           </w:p>
         </w:tc>
@@ -13950,6 +13950,45 @@
               <w:jc w:val="left"/>
             </w:pPr>
             <w:r>
+              <w:t xml:space="preserve">Adopted brand guidelines auxiliary color palette and monochrome scale. Aligned callout colors to brand specifications.</w:t>
+            </w:r>
+          </w:p>
+        </w:tc>
+      </w:tr>
+      <w:tr>
+        <w:tc>
+          <w:tcPr/>
+          <w:p>
+            <w:pPr>
+              <w:jc w:val="left"/>
+            </w:pPr>
+            <w:r>
+              <w:t xml:space="preserve">5.0.3</w:t>
+            </w:r>
+          </w:p>
+        </w:tc>
+        <w:tc>
+          <w:tcPr/>
+          <w:p>
+            <w:pPr>
+              <w:jc w:val="left"/>
+            </w:pPr>
+            <w:r>
+              <w:t xml:space="preserve">2026-09-14</w:t>
+            </w:r>
+          </w:p>
+        </w:tc>
+        <w:tc>
+          <w:tcPr/>
+          <w:p>
+            <w:pPr>
+              <w:numPr>
+                <w:ilvl w:val="0"/>
+                <w:numId w:val="1056"/>
+              </w:numPr>
+              <w:jc w:val="left"/>
+            </w:pPr>
+            <w:r>
               <w:t xml:space="preserve">Removed non-standard</w:t>
             </w:r>
             <w:r>
@@ -13972,54 +14011,15 @@
       </w:tr>
       <w:tr>
         <w:tc>
-          <w:tcPr/>
+          <w:tcPr>
+            <w:shd w:val="clear" w:color="auto" w:fill="F6F8FA"/>
+          </w:tcPr>
           <w:p>
             <w:pPr>
               <w:jc w:val="left"/>
             </w:pPr>
             <w:r>
               <w:t xml:space="preserve">5.0.2</w:t>
-            </w:r>
-          </w:p>
-        </w:tc>
-        <w:tc>
-          <w:tcPr/>
-          <w:p>
-            <w:pPr>
-              <w:jc w:val="left"/>
-            </w:pPr>
-            <w:r>
-              <w:t xml:space="preserve">2026-09-14</w:t>
-            </w:r>
-          </w:p>
-        </w:tc>
-        <w:tc>
-          <w:tcPr/>
-          <w:p>
-            <w:pPr>
-              <w:numPr>
-                <w:ilvl w:val="0"/>
-                <w:numId w:val="1056"/>
-              </w:numPr>
-              <w:jc w:val="left"/>
-            </w:pPr>
-            <w:r>
-              <w:t xml:space="preserve">Long commands in test steps now render as code blocks instead of inline code.</w:t>
-            </w:r>
-          </w:p>
-        </w:tc>
-      </w:tr>
-      <w:tr>
-        <w:tc>
-          <w:tcPr>
-            <w:shd w:val="clear" w:color="auto" w:fill="F6F8FA"/>
-          </w:tcPr>
-          <w:p>
-            <w:pPr>
-              <w:jc w:val="left"/>
-            </w:pPr>
-            <w:r>
-              <w:t xml:space="preserve">5.0.1</w:t>
             </w:r>
           </w:p>
         </w:tc>
@@ -14049,7 +14049,7 @@
               <w:jc w:val="left"/>
             </w:pPr>
             <w:r>
-              <w:t xml:space="preserve">Testcase caption centered above the block.</w:t>
+              <w:t xml:space="preserve">Long commands in test steps now render as code blocks instead of inline code.</w:t>
             </w:r>
           </w:p>
         </w:tc>
@@ -14062,7 +14062,7 @@
               <w:jc w:val="left"/>
             </w:pPr>
             <w:r>
-              <w:t xml:space="preserve">5.0.0</w:t>
+              <w:t xml:space="preserve">5.0.1</w:t>
             </w:r>
           </w:p>
         </w:tc>
@@ -14088,6 +14088,51 @@
               <w:jc w:val="left"/>
             </w:pPr>
             <w:r>
+              <w:t xml:space="preserve">Testcase caption centered above the block.</w:t>
+            </w:r>
+          </w:p>
+        </w:tc>
+      </w:tr>
+      <w:tr>
+        <w:tc>
+          <w:tcPr>
+            <w:shd w:val="clear" w:color="auto" w:fill="F6F8FA"/>
+          </w:tcPr>
+          <w:p>
+            <w:pPr>
+              <w:jc w:val="left"/>
+            </w:pPr>
+            <w:r>
+              <w:t xml:space="preserve">5.0.0</w:t>
+            </w:r>
+          </w:p>
+        </w:tc>
+        <w:tc>
+          <w:tcPr>
+            <w:shd w:val="clear" w:color="auto" w:fill="F6F8FA"/>
+          </w:tcPr>
+          <w:p>
+            <w:pPr>
+              <w:jc w:val="left"/>
+            </w:pPr>
+            <w:r>
+              <w:t xml:space="preserve">2026-09-14</w:t>
+            </w:r>
+          </w:p>
+        </w:tc>
+        <w:tc>
+          <w:tcPr>
+            <w:shd w:val="clear" w:color="auto" w:fill="F6F8FA"/>
+          </w:tcPr>
+          <w:p>
+            <w:pPr>
+              <w:numPr>
+                <w:ilvl w:val="0"/>
+                <w:numId w:val="1059"/>
+              </w:numPr>
+              <w:jc w:val="left"/>
+            </w:pPr>
+            <w:r>
               <w:t xml:space="preserve">Major refactoring: extracted shared modules (huawei-titles, huawei-toc, huawei-cover), renamed</w:t>
             </w:r>
             <w:r>
@@ -14149,9 +14194,7 @@
       </w:tr>
       <w:tr>
         <w:tc>
-          <w:tcPr>
-            <w:shd w:val="clear" w:color="auto" w:fill="F6F8FA"/>
-          </w:tcPr>
+          <w:tcPr/>
           <w:p>
             <w:pPr>
               <w:jc w:val="left"/>
@@ -14162,56 +14205,13 @@
           </w:p>
         </w:tc>
         <w:tc>
-          <w:tcPr>
-            <w:shd w:val="clear" w:color="auto" w:fill="F6F8FA"/>
-          </w:tcPr>
+          <w:tcPr/>
           <w:p>
             <w:pPr>
               <w:jc w:val="left"/>
             </w:pPr>
             <w:r>
               <w:t xml:space="preserve">2026-09-14</w:t>
-            </w:r>
-          </w:p>
-        </w:tc>
-        <w:tc>
-          <w:tcPr>
-            <w:shd w:val="clear" w:color="auto" w:fill="F6F8FA"/>
-          </w:tcPr>
-          <w:p>
-            <w:pPr>
-              <w:numPr>
-                <w:ilvl w:val="0"/>
-                <w:numId w:val="1059"/>
-              </w:numPr>
-              <w:jc w:val="left"/>
-            </w:pPr>
-            <w:r>
-              <w:t xml:space="preserve">Testcase headings now formatted as captions (like figures/tables): bold “Testcase N:” followed by description. Changed label from “Test Case” to “Testcase”.</w:t>
-            </w:r>
-          </w:p>
-        </w:tc>
-      </w:tr>
-      <w:tr>
-        <w:tc>
-          <w:tcPr/>
-          <w:p>
-            <w:pPr>
-              <w:jc w:val="left"/>
-            </w:pPr>
-            <w:r>
-              <w:t xml:space="preserve">4.6.0</w:t>
-            </w:r>
-          </w:p>
-        </w:tc>
-        <w:tc>
-          <w:tcPr/>
-          <w:p>
-            <w:pPr>
-              <w:jc w:val="left"/>
-            </w:pPr>
-            <w:r>
-              <w:t xml:space="preserve">2026-09-13</w:t>
             </w:r>
           </w:p>
         </w:tc>
@@ -14226,7 +14226,7 @@
               <w:jc w:val="left"/>
             </w:pPr>
             <w:r>
-              <w:t xml:space="preserve">Section restructure: Introduction, Test Cases (with category subsections), Conclusion. Testcases auto-numbered like figures/tables. Changed testcase from subsection to subsubsection.</w:t>
+              <w:t xml:space="preserve">Testcase headings now formatted as captions (like figures/tables): bold “Testcase N:” followed by description. Changed label from “Test Case” to “Testcase”.</w:t>
             </w:r>
           </w:p>
         </w:tc>
@@ -14241,7 +14241,7 @@
               <w:jc w:val="left"/>
             </w:pPr>
             <w:r>
-              <w:t xml:space="preserve">4.5.0</w:t>
+              <w:t xml:space="preserve">4.6.0</w:t>
             </w:r>
           </w:p>
         </w:tc>
@@ -14271,6 +14271,45 @@
               <w:jc w:val="left"/>
             </w:pPr>
             <w:r>
+              <w:t xml:space="preserve">Section restructure: Introduction, Test Cases (with category subsections), Conclusion. Testcases auto-numbered like figures/tables. Changed testcase from subsection to subsubsection.</w:t>
+            </w:r>
+          </w:p>
+        </w:tc>
+      </w:tr>
+      <w:tr>
+        <w:tc>
+          <w:tcPr/>
+          <w:p>
+            <w:pPr>
+              <w:jc w:val="left"/>
+            </w:pPr>
+            <w:r>
+              <w:t xml:space="preserve">4.5.0</w:t>
+            </w:r>
+          </w:p>
+        </w:tc>
+        <w:tc>
+          <w:tcPr/>
+          <w:p>
+            <w:pPr>
+              <w:jc w:val="left"/>
+            </w:pPr>
+            <w:r>
+              <w:t xml:space="preserve">2026-09-13</w:t>
+            </w:r>
+          </w:p>
+        </w:tc>
+        <w:tc>
+          <w:tcPr/>
+          <w:p>
+            <w:pPr>
+              <w:numPr>
+                <w:ilvl w:val="0"/>
+                <w:numId w:val="1062"/>
+              </w:numPr>
+              <w:jc w:val="left"/>
+            </w:pPr>
+            <w:r>
               <w:t xml:space="preserve">Unified field APIs:</w:t>
             </w:r>
             <w:r>
@@ -14335,54 +14374,15 @@
       </w:tr>
       <w:tr>
         <w:tc>
-          <w:tcPr/>
+          <w:tcPr>
+            <w:shd w:val="clear" w:color="auto" w:fill="F6F8FA"/>
+          </w:tcPr>
           <w:p>
             <w:pPr>
               <w:jc w:val="left"/>
             </w:pPr>
             <w:r>
               <w:t xml:space="preserve">4.4.0</w:t>
-            </w:r>
-          </w:p>
-        </w:tc>
-        <w:tc>
-          <w:tcPr/>
-          <w:p>
-            <w:pPr>
-              <w:jc w:val="left"/>
-            </w:pPr>
-            <w:r>
-              <w:t xml:space="preserve">2026-09-13</w:t>
-            </w:r>
-          </w:p>
-        </w:tc>
-        <w:tc>
-          <w:tcPr/>
-          <w:p>
-            <w:pPr>
-              <w:numPr>
-                <w:ilvl w:val="0"/>
-                <w:numId w:val="1062"/>
-              </w:numPr>
-              <w:jc w:val="left"/>
-            </w:pPr>
-            <w:r>
-              <w:t xml:space="preserve">Code review fixes: removed dead labels, badge now uses Huawei brand colors (tipbg/tipfg, huaweired, warningbg/warningfg), Lua filter preserves formatting in DOCX/MD/HTML via parse_latex_blocks, testprocedure handler preserves non-step content (images, code, callouts).</w:t>
-            </w:r>
-          </w:p>
-        </w:tc>
-      </w:tr>
-      <w:tr>
-        <w:tc>
-          <w:tcPr>
-            <w:shd w:val="clear" w:color="auto" w:fill="F6F8FA"/>
-          </w:tcPr>
-          <w:p>
-            <w:pPr>
-              <w:jc w:val="left"/>
-            </w:pPr>
-            <w:r>
-              <w:t xml:space="preserve">4.3.0</w:t>
             </w:r>
           </w:p>
         </w:tc>
@@ -14412,6 +14412,45 @@
               <w:jc w:val="left"/>
             </w:pPr>
             <w:r>
+              <w:t xml:space="preserve">Code review fixes: removed dead labels, badge now uses Huawei brand colors (tipbg/tipfg, huaweired, warningbg/warningfg), Lua filter preserves formatting in DOCX/MD/HTML via parse_latex_blocks, testprocedure handler preserves non-step content (images, code, callouts).</w:t>
+            </w:r>
+          </w:p>
+        </w:tc>
+      </w:tr>
+      <w:tr>
+        <w:tc>
+          <w:tcPr/>
+          <w:p>
+            <w:pPr>
+              <w:jc w:val="left"/>
+            </w:pPr>
+            <w:r>
+              <w:t xml:space="preserve">4.3.0</w:t>
+            </w:r>
+          </w:p>
+        </w:tc>
+        <w:tc>
+          <w:tcPr/>
+          <w:p>
+            <w:pPr>
+              <w:jc w:val="left"/>
+            </w:pPr>
+            <w:r>
+              <w:t xml:space="preserve">2026-09-13</w:t>
+            </w:r>
+          </w:p>
+        </w:tc>
+        <w:tc>
+          <w:tcPr/>
+          <w:p>
+            <w:pPr>
+              <w:numPr>
+                <w:ilvl w:val="0"/>
+                <w:numId w:val="1064"/>
+              </w:numPr>
+              <w:jc w:val="left"/>
+            </w:pPr>
+            <w:r>
               <w:t xml:space="preserve">Added</w:t>
             </w:r>
             <w:r>
@@ -14464,7 +14503,9 @@
       </w:tr>
       <w:tr>
         <w:tc>
-          <w:tcPr/>
+          <w:tcPr>
+            <w:shd w:val="clear" w:color="auto" w:fill="F6F8FA"/>
+          </w:tcPr>
           <w:p>
             <w:pPr>
               <w:jc w:val="left"/>
@@ -14475,7 +14516,9 @@
           </w:p>
         </w:tc>
         <w:tc>
-          <w:tcPr/>
+          <w:tcPr>
+            <w:shd w:val="clear" w:color="auto" w:fill="F6F8FA"/>
+          </w:tcPr>
           <w:p>
             <w:pPr>
               <w:jc w:val="left"/>
@@ -14486,12 +14529,14 @@
           </w:p>
         </w:tc>
         <w:tc>
-          <w:tcPr/>
+          <w:tcPr>
+            <w:shd w:val="clear" w:color="auto" w:fill="F6F8FA"/>
+          </w:tcPr>
           <w:p>
             <w:pPr>
               <w:numPr>
                 <w:ilvl w:val="0"/>
-                <w:numId w:val="1064"/>
+                <w:numId w:val="1065"/>
               </w:numPr>
               <w:jc w:val="left"/>
             </w:pPr>
@@ -14545,9 +14590,7 @@
       </w:tr>
       <w:tr>
         <w:tc>
-          <w:tcPr>
-            <w:shd w:val="clear" w:color="auto" w:fill="F6F8FA"/>
-          </w:tcPr>
+          <w:tcPr/>
           <w:p>
             <w:pPr>
               <w:jc w:val="left"/>
@@ -14558,9 +14601,7 @@
           </w:p>
         </w:tc>
         <w:tc>
-          <w:tcPr>
-            <w:shd w:val="clear" w:color="auto" w:fill="F6F8FA"/>
-          </w:tcPr>
+          <w:tcPr/>
           <w:p>
             <w:pPr>
               <w:jc w:val="left"/>
@@ -14571,14 +14612,12 @@
           </w:p>
         </w:tc>
         <w:tc>
-          <w:tcPr>
-            <w:shd w:val="clear" w:color="auto" w:fill="F6F8FA"/>
-          </w:tcPr>
+          <w:tcPr/>
           <w:p>
             <w:pPr>
               <w:numPr>
                 <w:ilvl w:val="0"/>
-                <w:numId w:val="1065"/>
+                <w:numId w:val="1066"/>
               </w:numPr>
               <w:jc w:val="left"/>
             </w:pPr>
@@ -14605,7 +14644,9 @@
       </w:tr>
       <w:tr>
         <w:tc>
-          <w:tcPr/>
+          <w:tcPr>
+            <w:shd w:val="clear" w:color="auto" w:fill="F6F8FA"/>
+          </w:tcPr>
           <w:p>
             <w:pPr>
               <w:jc w:val="left"/>
@@ -14616,7 +14657,9 @@
           </w:p>
         </w:tc>
         <w:tc>
-          <w:tcPr/>
+          <w:tcPr>
+            <w:shd w:val="clear" w:color="auto" w:fill="F6F8FA"/>
+          </w:tcPr>
           <w:p>
             <w:pPr>
               <w:jc w:val="left"/>
@@ -14627,12 +14670,14 @@
           </w:p>
         </w:tc>
         <w:tc>
-          <w:tcPr/>
+          <w:tcPr>
+            <w:shd w:val="clear" w:color="auto" w:fill="F6F8FA"/>
+          </w:tcPr>
           <w:p>
             <w:pPr>
               <w:numPr>
                 <w:ilvl w:val="0"/>
-                <w:numId w:val="1066"/>
+                <w:numId w:val="1067"/>
               </w:numPr>
               <w:jc w:val="left"/>
             </w:pPr>
@@ -14674,9 +14719,7 @@
       </w:tr>
       <w:tr>
         <w:tc>
-          <w:tcPr>
-            <w:shd w:val="clear" w:color="auto" w:fill="F6F8FA"/>
-          </w:tcPr>
+          <w:tcPr/>
           <w:p>
             <w:pPr>
               <w:jc w:val="left"/>
@@ -14687,9 +14730,7 @@
           </w:p>
         </w:tc>
         <w:tc>
-          <w:tcPr>
-            <w:shd w:val="clear" w:color="auto" w:fill="F6F8FA"/>
-          </w:tcPr>
+          <w:tcPr/>
           <w:p>
             <w:pPr>
               <w:jc w:val="left"/>
@@ -14700,14 +14741,12 @@
           </w:p>
         </w:tc>
         <w:tc>
-          <w:tcPr>
-            <w:shd w:val="clear" w:color="auto" w:fill="F6F8FA"/>
-          </w:tcPr>
+          <w:tcPr/>
           <w:p>
             <w:pPr>
               <w:numPr>
                 <w:ilvl w:val="0"/>
-                <w:numId w:val="1067"/>
+                <w:numId w:val="1068"/>
               </w:numPr>
               <w:jc w:val="left"/>
             </w:pPr>
@@ -14734,54 +14773,15 @@
       </w:tr>
       <w:tr>
         <w:tc>
-          <w:tcPr/>
+          <w:tcPr>
+            <w:shd w:val="clear" w:color="auto" w:fill="F6F8FA"/>
+          </w:tcPr>
           <w:p>
             <w:pPr>
               <w:jc w:val="left"/>
             </w:pPr>
             <w:r>
               <w:t xml:space="preserve">3.8.1</w:t>
-            </w:r>
-          </w:p>
-        </w:tc>
-        <w:tc>
-          <w:tcPr/>
-          <w:p>
-            <w:pPr>
-              <w:jc w:val="left"/>
-            </w:pPr>
-            <w:r>
-              <w:t xml:space="preserve">2026-09-13</w:t>
-            </w:r>
-          </w:p>
-        </w:tc>
-        <w:tc>
-          <w:tcPr/>
-          <w:p>
-            <w:pPr>
-              <w:numPr>
-                <w:ilvl w:val="0"/>
-                <w:numId w:val="1068"/>
-              </w:numPr>
-              <w:jc w:val="left"/>
-            </w:pPr>
-            <w:r>
-              <w:t xml:space="preserve">End-to-end quality review: fixed testbook PDF metadata title, removed stray user DOCX from template dir, fixed round-trip.sh variable typo, updated stale references in AGENTS.md and README.md, committed testbook sample PDFs, set TZ for pandoc cover time consistency, widened pandoc version range.</w:t>
-            </w:r>
-          </w:p>
-        </w:tc>
-      </w:tr>
-      <w:tr>
-        <w:tc>
-          <w:tcPr>
-            <w:shd w:val="clear" w:color="auto" w:fill="F6F8FA"/>
-          </w:tcPr>
-          <w:p>
-            <w:pPr>
-              <w:jc w:val="left"/>
-            </w:pPr>
-            <w:r>
-              <w:t xml:space="preserve">3.8.0</w:t>
             </w:r>
           </w:p>
         </w:tc>
@@ -14811,7 +14811,7 @@
               <w:jc w:val="left"/>
             </w:pPr>
             <w:r>
-              <w:t xml:space="preserve">Removed Tips and Tricks chapter (tmux configuration) — required VS Code-specific keybindings that don’t generalize across terminal setups.</w:t>
+              <w:t xml:space="preserve">End-to-end quality review: fixed testbook PDF metadata title, removed stray user DOCX from template dir, fixed round-trip.sh variable typo, updated stale references in AGENTS.md and README.md, committed testbook sample PDFs, set TZ for pandoc cover time consistency, widened pandoc version range.</w:t>
             </w:r>
           </w:p>
         </w:tc>
@@ -14824,18 +14824,18 @@
               <w:jc w:val="left"/>
             </w:pPr>
             <w:r>
-              <w:t xml:space="preserve">3.7.0</w:t>
-            </w:r>
-          </w:p>
-        </w:tc>
-        <w:tc>
-          <w:tcPr/>
-          <w:p>
-            <w:pPr>
-              <w:jc w:val="left"/>
-            </w:pPr>
-            <w:r>
-              <w:t xml:space="preserve">2026-09-12</w:t>
+              <w:t xml:space="preserve">3.8.0</w:t>
+            </w:r>
+          </w:p>
+        </w:tc>
+        <w:tc>
+          <w:tcPr/>
+          <w:p>
+            <w:pPr>
+              <w:jc w:val="left"/>
+            </w:pPr>
+            <w:r>
+              <w:t xml:space="preserve">2026-09-13</w:t>
             </w:r>
           </w:p>
         </w:tc>
@@ -14850,6 +14850,51 @@
               <w:jc w:val="left"/>
             </w:pPr>
             <w:r>
+              <w:t xml:space="preserve">Removed Tips and Tricks chapter (tmux configuration) — required VS Code-specific keybindings that don’t generalize across terminal setups.</w:t>
+            </w:r>
+          </w:p>
+        </w:tc>
+      </w:tr>
+      <w:tr>
+        <w:tc>
+          <w:tcPr>
+            <w:shd w:val="clear" w:color="auto" w:fill="F6F8FA"/>
+          </w:tcPr>
+          <w:p>
+            <w:pPr>
+              <w:jc w:val="left"/>
+            </w:pPr>
+            <w:r>
+              <w:t xml:space="preserve">3.7.0</w:t>
+            </w:r>
+          </w:p>
+        </w:tc>
+        <w:tc>
+          <w:tcPr>
+            <w:shd w:val="clear" w:color="auto" w:fill="F6F8FA"/>
+          </w:tcPr>
+          <w:p>
+            <w:pPr>
+              <w:jc w:val="left"/>
+            </w:pPr>
+            <w:r>
+              <w:t xml:space="preserve">2026-09-12</w:t>
+            </w:r>
+          </w:p>
+        </w:tc>
+        <w:tc>
+          <w:tcPr>
+            <w:shd w:val="clear" w:color="auto" w:fill="F6F8FA"/>
+          </w:tcPr>
+          <w:p>
+            <w:pPr>
+              <w:numPr>
+                <w:ilvl w:val="0"/>
+                <w:numId w:val="1071"/>
+              </w:numPr>
+              <w:jc w:val="left"/>
+            </w:pPr>
+            <w:r>
               <w:t xml:space="preserve">Added</w:t>
             </w:r>
             <w:r>
@@ -14902,9 +14947,7 @@
       </w:tr>
       <w:tr>
         <w:tc>
-          <w:tcPr>
-            <w:shd w:val="clear" w:color="auto" w:fill="F6F8FA"/>
-          </w:tcPr>
+          <w:tcPr/>
           <w:p>
             <w:pPr>
               <w:jc w:val="left"/>
@@ -14915,9 +14958,7 @@
           </w:p>
         </w:tc>
         <w:tc>
-          <w:tcPr>
-            <w:shd w:val="clear" w:color="auto" w:fill="F6F8FA"/>
-          </w:tcPr>
+          <w:tcPr/>
           <w:p>
             <w:pPr>
               <w:jc w:val="left"/>
@@ -14928,14 +14969,12 @@
           </w:p>
         </w:tc>
         <w:tc>
-          <w:tcPr>
-            <w:shd w:val="clear" w:color="auto" w:fill="F6F8FA"/>
-          </w:tcPr>
+          <w:tcPr/>
           <w:p>
             <w:pPr>
               <w:numPr>
                 <w:ilvl w:val="0"/>
-                <w:numId w:val="1071"/>
+                <w:numId w:val="1072"/>
               </w:numPr>
               <w:jc w:val="left"/>
             </w:pPr>
@@ -14992,7 +15031,9 @@
       </w:tr>
       <w:tr>
         <w:tc>
-          <w:tcPr/>
+          <w:tcPr>
+            <w:shd w:val="clear" w:color="auto" w:fill="F6F8FA"/>
+          </w:tcPr>
           <w:p>
             <w:pPr>
               <w:jc w:val="left"/>
@@ -15003,7 +15044,9 @@
           </w:p>
         </w:tc>
         <w:tc>
-          <w:tcPr/>
+          <w:tcPr>
+            <w:shd w:val="clear" w:color="auto" w:fill="F6F8FA"/>
+          </w:tcPr>
           <w:p>
             <w:pPr>
               <w:jc w:val="left"/>
@@ -15014,12 +15057,14 @@
           </w:p>
         </w:tc>
         <w:tc>
-          <w:tcPr/>
+          <w:tcPr>
+            <w:shd w:val="clear" w:color="auto" w:fill="F6F8FA"/>
+          </w:tcPr>
           <w:p>
             <w:pPr>
               <w:numPr>
                 <w:ilvl w:val="0"/>
-                <w:numId w:val="1072"/>
+                <w:numId w:val="1073"/>
               </w:numPr>
               <w:jc w:val="left"/>
             </w:pPr>
@@ -15097,9 +15142,7 @@
       </w:tr>
       <w:tr>
         <w:tc>
-          <w:tcPr>
-            <w:shd w:val="clear" w:color="auto" w:fill="F6F8FA"/>
-          </w:tcPr>
+          <w:tcPr/>
           <w:p>
             <w:pPr>
               <w:jc w:val="left"/>
@@ -15110,9 +15153,7 @@
           </w:p>
         </w:tc>
         <w:tc>
-          <w:tcPr>
-            <w:shd w:val="clear" w:color="auto" w:fill="F6F8FA"/>
-          </w:tcPr>
+          <w:tcPr/>
           <w:p>
             <w:pPr>
               <w:jc w:val="left"/>
@@ -15123,14 +15164,12 @@
           </w:p>
         </w:tc>
         <w:tc>
-          <w:tcPr>
-            <w:shd w:val="clear" w:color="auto" w:fill="F6F8FA"/>
-          </w:tcPr>
+          <w:tcPr/>
           <w:p>
             <w:pPr>
               <w:numPr>
                 <w:ilvl w:val="0"/>
-                <w:numId w:val="1073"/>
+                <w:numId w:val="1074"/>
               </w:numPr>
               <w:jc w:val="left"/>
             </w:pPr>
@@ -15157,7 +15196,7 @@
             <w:pPr>
               <w:numPr>
                 <w:ilvl w:val="0"/>
-                <w:numId w:val="1073"/>
+                <w:numId w:val="1074"/>
               </w:numPr>
               <w:jc w:val="left"/>
             </w:pPr>
@@ -15199,7 +15238,7 @@
             <w:pPr>
               <w:numPr>
                 <w:ilvl w:val="0"/>
-                <w:numId w:val="1073"/>
+                <w:numId w:val="1074"/>
               </w:numPr>
               <w:jc w:val="left"/>
             </w:pPr>
@@ -15211,7 +15250,9 @@
       </w:tr>
       <w:tr>
         <w:tc>
-          <w:tcPr/>
+          <w:tcPr>
+            <w:shd w:val="clear" w:color="auto" w:fill="F6F8FA"/>
+          </w:tcPr>
           <w:p>
             <w:pPr>
               <w:jc w:val="left"/>
@@ -15222,7 +15263,9 @@
           </w:p>
         </w:tc>
         <w:tc>
-          <w:tcPr/>
+          <w:tcPr>
+            <w:shd w:val="clear" w:color="auto" w:fill="F6F8FA"/>
+          </w:tcPr>
           <w:p>
             <w:pPr>
               <w:jc w:val="left"/>
@@ -15233,12 +15276,14 @@
           </w:p>
         </w:tc>
         <w:tc>
-          <w:tcPr/>
+          <w:tcPr>
+            <w:shd w:val="clear" w:color="auto" w:fill="F6F8FA"/>
+          </w:tcPr>
           <w:p>
             <w:pPr>
               <w:numPr>
                 <w:ilvl w:val="0"/>
-                <w:numId w:val="1074"/>
+                <w:numId w:val="1075"/>
               </w:numPr>
               <w:jc w:val="left"/>
             </w:pPr>
@@ -15265,7 +15310,7 @@
             <w:pPr>
               <w:numPr>
                 <w:ilvl w:val="0"/>
-                <w:numId w:val="1074"/>
+                <w:numId w:val="1075"/>
               </w:numPr>
               <w:jc w:val="left"/>
             </w:pPr>
@@ -15292,7 +15337,7 @@
             <w:pPr>
               <w:numPr>
                 <w:ilvl w:val="0"/>
-                <w:numId w:val="1074"/>
+                <w:numId w:val="1075"/>
               </w:numPr>
               <w:jc w:val="left"/>
             </w:pPr>
@@ -15304,7 +15349,7 @@
             <w:pPr>
               <w:numPr>
                 <w:ilvl w:val="0"/>
-                <w:numId w:val="1074"/>
+                <w:numId w:val="1075"/>
               </w:numPr>
               <w:jc w:val="left"/>
             </w:pPr>
@@ -15328,58 +15373,13 @@
       </w:tr>
       <w:tr>
         <w:tc>
-          <w:tcPr>
-            <w:shd w:val="clear" w:color="auto" w:fill="F6F8FA"/>
-          </w:tcPr>
+          <w:tcPr/>
           <w:p>
             <w:pPr>
               <w:jc w:val="left"/>
             </w:pPr>
             <w:r>
               <w:t xml:space="preserve">3.2.1</w:t>
-            </w:r>
-          </w:p>
-        </w:tc>
-        <w:tc>
-          <w:tcPr>
-            <w:shd w:val="clear" w:color="auto" w:fill="F6F8FA"/>
-          </w:tcPr>
-          <w:p>
-            <w:pPr>
-              <w:jc w:val="left"/>
-            </w:pPr>
-            <w:r>
-              <w:t xml:space="preserve">2026-09-11</w:t>
-            </w:r>
-          </w:p>
-        </w:tc>
-        <w:tc>
-          <w:tcPr>
-            <w:shd w:val="clear" w:color="auto" w:fill="F6F8FA"/>
-          </w:tcPr>
-          <w:p>
-            <w:pPr>
-              <w:numPr>
-                <w:ilvl w:val="0"/>
-                <w:numId w:val="1075"/>
-              </w:numPr>
-              <w:jc w:val="left"/>
-            </w:pPr>
-            <w:r>
-              <w:t xml:space="preserve">Renamed Chapter 7 from “Clean Up” to “Operations and Maintenance”. Added subsections for updating and uninstalling both the MaaS Gateway and the document templates. Added cloud resource cleanup as an optional subsection.</w:t>
-            </w:r>
-          </w:p>
-        </w:tc>
-      </w:tr>
-      <w:tr>
-        <w:tc>
-          <w:tcPr/>
-          <w:p>
-            <w:pPr>
-              <w:jc w:val="left"/>
-            </w:pPr>
-            <w:r>
-              <w:t xml:space="preserve">3.2.0</w:t>
             </w:r>
           </w:p>
         </w:tc>
@@ -15405,6 +15405,51 @@
               <w:jc w:val="left"/>
             </w:pPr>
             <w:r>
+              <w:t xml:space="preserve">Renamed Chapter 7 from “Clean Up” to “Operations and Maintenance”. Added subsections for updating and uninstalling both the MaaS Gateway and the document templates. Added cloud resource cleanup as an optional subsection.</w:t>
+            </w:r>
+          </w:p>
+        </w:tc>
+      </w:tr>
+      <w:tr>
+        <w:tc>
+          <w:tcPr>
+            <w:shd w:val="clear" w:color="auto" w:fill="F6F8FA"/>
+          </w:tcPr>
+          <w:p>
+            <w:pPr>
+              <w:jc w:val="left"/>
+            </w:pPr>
+            <w:r>
+              <w:t xml:space="preserve">3.2.0</w:t>
+            </w:r>
+          </w:p>
+        </w:tc>
+        <w:tc>
+          <w:tcPr>
+            <w:shd w:val="clear" w:color="auto" w:fill="F6F8FA"/>
+          </w:tcPr>
+          <w:p>
+            <w:pPr>
+              <w:jc w:val="left"/>
+            </w:pPr>
+            <w:r>
+              <w:t xml:space="preserve">2026-09-11</w:t>
+            </w:r>
+          </w:p>
+        </w:tc>
+        <w:tc>
+          <w:tcPr>
+            <w:shd w:val="clear" w:color="auto" w:fill="F6F8FA"/>
+          </w:tcPr>
+          <w:p>
+            <w:pPr>
+              <w:numPr>
+                <w:ilvl w:val="0"/>
+                <w:numId w:val="1077"/>
+              </w:numPr>
+              <w:jc w:val="left"/>
+            </w:pPr>
+            <w:r>
               <w:t xml:space="preserve">Added</w:t>
             </w:r>
             <w:r>
@@ -15466,7 +15511,7 @@
             <w:pPr>
               <w:numPr>
                 <w:ilvl w:val="0"/>
-                <w:numId w:val="1076"/>
+                <w:numId w:val="1077"/>
               </w:numPr>
               <w:jc w:val="left"/>
             </w:pPr>
@@ -15511,7 +15556,7 @@
             <w:pPr>
               <w:numPr>
                 <w:ilvl w:val="0"/>
-                <w:numId w:val="1076"/>
+                <w:numId w:val="1077"/>
               </w:numPr>
               <w:jc w:val="left"/>
             </w:pPr>
@@ -15523,58 +15568,13 @@
       </w:tr>
       <w:tr>
         <w:tc>
-          <w:tcPr>
-            <w:shd w:val="clear" w:color="auto" w:fill="F6F8FA"/>
-          </w:tcPr>
+          <w:tcPr/>
           <w:p>
             <w:pPr>
               <w:jc w:val="left"/>
             </w:pPr>
             <w:r>
               <w:t xml:space="preserve">3.1.2</w:t>
-            </w:r>
-          </w:p>
-        </w:tc>
-        <w:tc>
-          <w:tcPr>
-            <w:shd w:val="clear" w:color="auto" w:fill="F6F8FA"/>
-          </w:tcPr>
-          <w:p>
-            <w:pPr>
-              <w:jc w:val="left"/>
-            </w:pPr>
-            <w:r>
-              <w:t xml:space="preserve">2026-09-11</w:t>
-            </w:r>
-          </w:p>
-        </w:tc>
-        <w:tc>
-          <w:tcPr>
-            <w:shd w:val="clear" w:color="auto" w:fill="F6F8FA"/>
-          </w:tcPr>
-          <w:p>
-            <w:pPr>
-              <w:numPr>
-                <w:ilvl w:val="0"/>
-                <w:numId w:val="1077"/>
-              </w:numPr>
-              <w:jc w:val="left"/>
-            </w:pPr>
-            <w:r>
-              <w:t xml:space="preserve">Added output format guide to README.md: comparison table of PDF, Markdown, DOCX, and HTML with purpose, copy-paste quality, and limitations. Recommends Markdown for copy-paste.</w:t>
-            </w:r>
-          </w:p>
-        </w:tc>
-      </w:tr>
-      <w:tr>
-        <w:tc>
-          <w:tcPr/>
-          <w:p>
-            <w:pPr>
-              <w:jc w:val="left"/>
-            </w:pPr>
-            <w:r>
-              <w:t xml:space="preserve">3.1.1</w:t>
             </w:r>
           </w:p>
         </w:tc>
@@ -15600,6 +15600,51 @@
               <w:jc w:val="left"/>
             </w:pPr>
             <w:r>
+              <w:t xml:space="preserve">Added output format guide to README.md: comparison table of PDF, Markdown, DOCX, and HTML with purpose, copy-paste quality, and limitations. Recommends Markdown for copy-paste.</w:t>
+            </w:r>
+          </w:p>
+        </w:tc>
+      </w:tr>
+      <w:tr>
+        <w:tc>
+          <w:tcPr>
+            <w:shd w:val="clear" w:color="auto" w:fill="F6F8FA"/>
+          </w:tcPr>
+          <w:p>
+            <w:pPr>
+              <w:jc w:val="left"/>
+            </w:pPr>
+            <w:r>
+              <w:t xml:space="preserve">3.1.1</w:t>
+            </w:r>
+          </w:p>
+        </w:tc>
+        <w:tc>
+          <w:tcPr>
+            <w:shd w:val="clear" w:color="auto" w:fill="F6F8FA"/>
+          </w:tcPr>
+          <w:p>
+            <w:pPr>
+              <w:jc w:val="left"/>
+            </w:pPr>
+            <w:r>
+              <w:t xml:space="preserve">2026-09-11</w:t>
+            </w:r>
+          </w:p>
+        </w:tc>
+        <w:tc>
+          <w:tcPr>
+            <w:shd w:val="clear" w:color="auto" w:fill="F6F8FA"/>
+          </w:tcPr>
+          <w:p>
+            <w:pPr>
+              <w:numPr>
+                <w:ilvl w:val="0"/>
+                <w:numId w:val="1079"/>
+              </w:numPr>
+              <w:jc w:val="left"/>
+            </w:pPr>
+            <w:r>
               <w:t xml:space="preserve">Updated MaaS Gateway chapter to v1.10.9: non-interactive mode (</w:t>
             </w:r>
             <w:r>
@@ -15616,7 +15661,7 @@
             <w:pPr>
               <w:numPr>
                 <w:ilvl w:val="0"/>
-                <w:numId w:val="1078"/>
+                <w:numId w:val="1079"/>
               </w:numPr>
               <w:jc w:val="left"/>
             </w:pPr>
@@ -15658,7 +15703,7 @@
             <w:pPr>
               <w:numPr>
                 <w:ilvl w:val="0"/>
-                <w:numId w:val="1078"/>
+                <w:numId w:val="1079"/>
               </w:numPr>
               <w:jc w:val="left"/>
             </w:pPr>
@@ -15670,9 +15715,7 @@
       </w:tr>
       <w:tr>
         <w:tc>
-          <w:tcPr>
-            <w:shd w:val="clear" w:color="auto" w:fill="F6F8FA"/>
-          </w:tcPr>
+          <w:tcPr/>
           <w:p>
             <w:pPr>
               <w:jc w:val="left"/>
@@ -15683,9 +15726,7 @@
           </w:p>
         </w:tc>
         <w:tc>
-          <w:tcPr>
-            <w:shd w:val="clear" w:color="auto" w:fill="F6F8FA"/>
-          </w:tcPr>
+          <w:tcPr/>
           <w:p>
             <w:pPr>
               <w:jc w:val="left"/>
@@ -15696,14 +15737,12 @@
           </w:p>
         </w:tc>
         <w:tc>
-          <w:tcPr>
-            <w:shd w:val="clear" w:color="auto" w:fill="F6F8FA"/>
-          </w:tcPr>
+          <w:tcPr/>
           <w:p>
             <w:pPr>
               <w:numPr>
                 <w:ilvl w:val="0"/>
-                <w:numId w:val="1079"/>
+                <w:numId w:val="1080"/>
               </w:numPr>
               <w:jc w:val="left"/>
             </w:pPr>
@@ -15727,7 +15766,7 @@
             <w:pPr>
               <w:numPr>
                 <w:ilvl w:val="0"/>
-                <w:numId w:val="1079"/>
+                <w:numId w:val="1080"/>
               </w:numPr>
               <w:jc w:val="left"/>
             </w:pPr>
@@ -15769,7 +15808,7 @@
             <w:pPr>
               <w:numPr>
                 <w:ilvl w:val="0"/>
-                <w:numId w:val="1079"/>
+                <w:numId w:val="1080"/>
               </w:numPr>
               <w:jc w:val="left"/>
             </w:pPr>
@@ -15777,57 +15816,6 @@
               <w:t xml:space="preserve">Restructured chapters: moved SSH config and VS Code connection to new Chapter 4 (Install VS Code and Connect via Remote-SSH). Chapters 5—​7 renumbered.</w:t>
             </w:r>
           </w:p>
-          <w:p>
-            <w:pPr>
-              <w:numPr>
-                <w:ilvl w:val="0"/>
-                <w:numId w:val="1079"/>
-              </w:numPr>
-              <w:jc w:val="left"/>
-            </w:pPr>
-            <w:r>
-              <w:t xml:space="preserve">Added verification checklist tables to all 7 chapters.</w:t>
-            </w:r>
-          </w:p>
-          <w:p>
-            <w:pPr>
-              <w:numPr>
-                <w:ilvl w:val="0"/>
-                <w:numId w:val="1079"/>
-              </w:numPr>
-              <w:jc w:val="left"/>
-            </w:pPr>
-            <w:r>
-              <w:t xml:space="preserve">Added mandatory reboot warning in Chapter 2 (SSH port change). Added troubleshooting subsection in Chapter 4 with common SSH connection issues and ncat debugging commands.</w:t>
-            </w:r>
-          </w:p>
-        </w:tc>
-      </w:tr>
-      <w:tr>
-        <w:tc>
-          <w:tcPr/>
-          <w:p>
-            <w:pPr>
-              <w:jc w:val="left"/>
-            </w:pPr>
-            <w:r>
-              <w:t xml:space="preserve">3.0.1</w:t>
-            </w:r>
-          </w:p>
-        </w:tc>
-        <w:tc>
-          <w:tcPr/>
-          <w:p>
-            <w:pPr>
-              <w:jc w:val="left"/>
-            </w:pPr>
-            <w:r>
-              <w:t xml:space="preserve">2026-09-10</w:t>
-            </w:r>
-          </w:p>
-        </w:tc>
-        <w:tc>
-          <w:tcPr/>
           <w:p>
             <w:pPr>
               <w:numPr>
@@ -15837,7 +15825,19 @@
               <w:jc w:val="left"/>
             </w:pPr>
             <w:r>
-              <w:t xml:space="preserve">Minor fixes: test-filter.sh auto-discovery, build.sh help text, Makefile aggregate descriptions, 5-section comment correction, CHANGELOG version gap note, callout-in-code fix, CI font auto-discovery, dofile path comment, test-sync.sh header.</w:t>
+              <w:t xml:space="preserve">Added verification checklist tables to all 7 chapters.</w:t>
+            </w:r>
+          </w:p>
+          <w:p>
+            <w:pPr>
+              <w:numPr>
+                <w:ilvl w:val="0"/>
+                <w:numId w:val="1080"/>
+              </w:numPr>
+              <w:jc w:val="left"/>
+            </w:pPr>
+            <w:r>
+              <w:t xml:space="preserve">Added mandatory reboot warning in Chapter 2 (SSH port change). Added troubleshooting subsection in Chapter 4 with common SSH connection issues and ncat debugging commands.</w:t>
             </w:r>
           </w:p>
         </w:tc>
@@ -15852,7 +15852,7 @@
               <w:jc w:val="left"/>
             </w:pPr>
             <w:r>
-              <w:t xml:space="preserve">3.0.0</w:t>
+              <w:t xml:space="preserve">3.0.1</w:t>
             </w:r>
           </w:p>
         </w:tc>
@@ -15865,7 +15865,7 @@
               <w:jc w:val="left"/>
             </w:pPr>
             <w:r>
-              <w:t xml:space="preserve">2026-09-09</w:t>
+              <w:t xml:space="preserve">2026-09-10</w:t>
             </w:r>
           </w:p>
         </w:tc>
@@ -15882,7 +15882,7 @@
               <w:jc w:val="left"/>
             </w:pPr>
             <w:r>
-              <w:t xml:space="preserve">Modular pipeline refactoring: shared Lua filter factory, shared DOCX fix logic, build system auto-discovery, unified format pipeline, GitHub Actions CI.</w:t>
+              <w:t xml:space="preserve">Minor fixes: test-filter.sh auto-discovery, build.sh help text, Makefile aggregate descriptions, 5-section comment correction, CHANGELOG version gap note, callout-in-code fix, CI font auto-discovery, dofile path comment, test-sync.sh header.</w:t>
             </w:r>
           </w:p>
         </w:tc>
@@ -15895,18 +15895,18 @@
               <w:jc w:val="left"/>
             </w:pPr>
             <w:r>
-              <w:t xml:space="preserve">2.16.0</w:t>
-            </w:r>
-          </w:p>
-        </w:tc>
-        <w:tc>
-          <w:tcPr/>
-          <w:p>
-            <w:pPr>
-              <w:jc w:val="left"/>
-            </w:pPr>
-            <w:r>
-              <w:t xml:space="preserve">2026-09-05</w:t>
+              <w:t xml:space="preserve">3.0.0</w:t>
+            </w:r>
+          </w:p>
+        </w:tc>
+        <w:tc>
+          <w:tcPr/>
+          <w:p>
+            <w:pPr>
+              <w:jc w:val="left"/>
+            </w:pPr>
+            <w:r>
+              <w:t xml:space="preserve">2026-09-09</w:t>
             </w:r>
           </w:p>
         </w:tc>
@@ -15921,7 +15921,7 @@
               <w:jc w:val="left"/>
             </w:pPr>
             <w:r>
-              <w:t xml:space="preserve">Updated to match template v2.16.0 — Lua filter fixes, build system updates, and technical template parity improvements.</w:t>
+              <w:t xml:space="preserve">Modular pipeline refactoring: shared Lua filter factory, shared DOCX fix logic, build system auto-discovery, unified format pipeline, GitHub Actions CI.</w:t>
             </w:r>
           </w:p>
         </w:tc>
@@ -15936,7 +15936,7 @@
               <w:jc w:val="left"/>
             </w:pPr>
             <w:r>
-              <w:t xml:space="preserve">2.13.0</w:t>
+              <w:t xml:space="preserve">2.16.0</w:t>
             </w:r>
           </w:p>
         </w:tc>
@@ -15949,7 +15949,7 @@
               <w:jc w:val="left"/>
             </w:pPr>
             <w:r>
-              <w:t xml:space="preserve">2026-08-24</w:t>
+              <w:t xml:space="preserve">2026-09-05</w:t>
             </w:r>
           </w:p>
         </w:tc>
@@ -15966,6 +15966,45 @@
               <w:jc w:val="left"/>
             </w:pPr>
             <w:r>
+              <w:t xml:space="preserve">Updated to match template v2.16.0 — Lua filter fixes, build system updates, and technical template parity improvements.</w:t>
+            </w:r>
+          </w:p>
+        </w:tc>
+      </w:tr>
+      <w:tr>
+        <w:tc>
+          <w:tcPr/>
+          <w:p>
+            <w:pPr>
+              <w:jc w:val="left"/>
+            </w:pPr>
+            <w:r>
+              <w:t xml:space="preserve">2.13.0</w:t>
+            </w:r>
+          </w:p>
+        </w:tc>
+        <w:tc>
+          <w:tcPr/>
+          <w:p>
+            <w:pPr>
+              <w:jc w:val="left"/>
+            </w:pPr>
+            <w:r>
+              <w:t xml:space="preserve">2026-08-24</w:t>
+            </w:r>
+          </w:p>
+        </w:tc>
+        <w:tc>
+          <w:tcPr/>
+          <w:p>
+            <w:pPr>
+              <w:numPr>
+                <w:ilvl w:val="0"/>
+                <w:numId w:val="1084"/>
+              </w:numPr>
+              <w:jc w:val="left"/>
+            </w:pPr>
+            <w:r>
               <w:t xml:space="preserve">Foundation refactoring Phase 4: make DOCX</w:t>
             </w:r>
             <w:r>
@@ -16033,7 +16072,9 @@
       </w:tr>
       <w:tr>
         <w:tc>
-          <w:tcPr/>
+          <w:tcPr>
+            <w:shd w:val="clear" w:color="auto" w:fill="F6F8FA"/>
+          </w:tcPr>
           <w:p>
             <w:pPr>
               <w:jc w:val="left"/>
@@ -16044,7 +16085,9 @@
           </w:p>
         </w:tc>
         <w:tc>
-          <w:tcPr/>
+          <w:tcPr>
+            <w:shd w:val="clear" w:color="auto" w:fill="F6F8FA"/>
+          </w:tcPr>
           <w:p>
             <w:pPr>
               <w:jc w:val="left"/>
@@ -16055,12 +16098,14 @@
           </w:p>
         </w:tc>
         <w:tc>
-          <w:tcPr/>
+          <w:tcPr>
+            <w:shd w:val="clear" w:color="auto" w:fill="F6F8FA"/>
+          </w:tcPr>
           <w:p>
             <w:pPr>
               <w:numPr>
                 <w:ilvl w:val="0"/>
-                <w:numId w:val="1084"/>
+                <w:numId w:val="1085"/>
               </w:numPr>
               <w:jc w:val="left"/>
             </w:pPr>
@@ -16222,9 +16267,7 @@
       </w:tr>
       <w:tr>
         <w:tc>
-          <w:tcPr>
-            <w:shd w:val="clear" w:color="auto" w:fill="F6F8FA"/>
-          </w:tcPr>
+          <w:tcPr/>
           <w:p>
             <w:pPr>
               <w:jc w:val="left"/>
@@ -16235,9 +16278,7 @@
           </w:p>
         </w:tc>
         <w:tc>
-          <w:tcPr>
-            <w:shd w:val="clear" w:color="auto" w:fill="F6F8FA"/>
-          </w:tcPr>
+          <w:tcPr/>
           <w:p>
             <w:pPr>
               <w:jc w:val="left"/>
@@ -16248,14 +16289,12 @@
           </w:p>
         </w:tc>
         <w:tc>
-          <w:tcPr>
-            <w:shd w:val="clear" w:color="auto" w:fill="F6F8FA"/>
-          </w:tcPr>
+          <w:tcPr/>
           <w:p>
             <w:pPr>
               <w:numPr>
                 <w:ilvl w:val="0"/>
-                <w:numId w:val="1085"/>
+                <w:numId w:val="1086"/>
               </w:numPr>
               <w:jc w:val="left"/>
             </w:pPr>
@@ -16321,7 +16360,9 @@
       </w:tr>
       <w:tr>
         <w:tc>
-          <w:tcPr/>
+          <w:tcPr>
+            <w:shd w:val="clear" w:color="auto" w:fill="F6F8FA"/>
+          </w:tcPr>
           <w:p>
             <w:pPr>
               <w:jc w:val="left"/>
@@ -16332,56 +16373,15 @@
           </w:p>
         </w:tc>
         <w:tc>
-          <w:tcPr/>
+          <w:tcPr>
+            <w:shd w:val="clear" w:color="auto" w:fill="F6F8FA"/>
+          </w:tcPr>
           <w:p>
             <w:pPr>
               <w:jc w:val="left"/>
             </w:pPr>
             <w:r>
               <w:t xml:space="preserve">2026-08-24</w:t>
-            </w:r>
-          </w:p>
-        </w:tc>
-        <w:tc>
-          <w:tcPr/>
-          <w:p>
-            <w:pPr>
-              <w:numPr>
-                <w:ilvl w:val="0"/>
-                <w:numId w:val="1086"/>
-              </w:numPr>
-              <w:jc w:val="left"/>
-            </w:pPr>
-            <w:r>
-              <w:t xml:space="preserve">Foundation refactoring Phase 1: sync cls version to project tag, fix stale doc references (L16 output count, L-range, setup-guide feature claim), add test-sync.sh for version consistency checking.</w:t>
-            </w:r>
-          </w:p>
-        </w:tc>
-      </w:tr>
-      <w:tr>
-        <w:tc>
-          <w:tcPr>
-            <w:shd w:val="clear" w:color="auto" w:fill="F6F8FA"/>
-          </w:tcPr>
-          <w:p>
-            <w:pPr>
-              <w:jc w:val="left"/>
-            </w:pPr>
-            <w:r>
-              <w:t xml:space="preserve">2.9.1</w:t>
-            </w:r>
-          </w:p>
-        </w:tc>
-        <w:tc>
-          <w:tcPr>
-            <w:shd w:val="clear" w:color="auto" w:fill="F6F8FA"/>
-          </w:tcPr>
-          <w:p>
-            <w:pPr>
-              <w:jc w:val="left"/>
-            </w:pPr>
-            <w:r>
-              <w:t xml:space="preserve">2026-08-23</w:t>
             </w:r>
           </w:p>
         </w:tc>
@@ -16398,6 +16398,45 @@
               <w:jc w:val="left"/>
             </w:pPr>
             <w:r>
+              <w:t xml:space="preserve">Foundation refactoring Phase 1: sync cls version to project tag, fix stale doc references (L16 output count, L-range, setup-guide feature claim), add test-sync.sh for version consistency checking.</w:t>
+            </w:r>
+          </w:p>
+        </w:tc>
+      </w:tr>
+      <w:tr>
+        <w:tc>
+          <w:tcPr/>
+          <w:p>
+            <w:pPr>
+              <w:jc w:val="left"/>
+            </w:pPr>
+            <w:r>
+              <w:t xml:space="preserve">2.9.1</w:t>
+            </w:r>
+          </w:p>
+        </w:tc>
+        <w:tc>
+          <w:tcPr/>
+          <w:p>
+            <w:pPr>
+              <w:jc w:val="left"/>
+            </w:pPr>
+            <w:r>
+              <w:t xml:space="preserve">2026-08-23</w:t>
+            </w:r>
+          </w:p>
+        </w:tc>
+        <w:tc>
+          <w:tcPr/>
+          <w:p>
+            <w:pPr>
+              <w:numPr>
+                <w:ilvl w:val="0"/>
+                <w:numId w:val="1088"/>
+              </w:numPr>
+              <w:jc w:val="left"/>
+            </w:pPr>
+            <w:r>
               <w:t xml:space="preserve">HTML and Markdown outputs now embed images as base64 data URIs. HTML uses pandoc</w:t>
             </w:r>
             <w:r>
@@ -16429,54 +16468,15 @@
       </w:tr>
       <w:tr>
         <w:tc>
-          <w:tcPr/>
+          <w:tcPr>
+            <w:shd w:val="clear" w:color="auto" w:fill="F6F8FA"/>
+          </w:tcPr>
           <w:p>
             <w:pPr>
               <w:jc w:val="left"/>
             </w:pPr>
             <w:r>
               <w:t xml:space="preserve">2.9.0</w:t>
-            </w:r>
-          </w:p>
-        </w:tc>
-        <w:tc>
-          <w:tcPr/>
-          <w:p>
-            <w:pPr>
-              <w:jc w:val="left"/>
-            </w:pPr>
-            <w:r>
-              <w:t xml:space="preserve">2026-08-23</w:t>
-            </w:r>
-          </w:p>
-        </w:tc>
-        <w:tc>
-          <w:tcPr/>
-          <w:p>
-            <w:pPr>
-              <w:numPr>
-                <w:ilvl w:val="0"/>
-                <w:numId w:val="1088"/>
-              </w:numPr>
-              <w:jc w:val="left"/>
-            </w:pPr>
-            <w:r>
-              <w:t xml:space="preserve">DOCX: fix content width (8504→9638tw, margins are 2cm not 3cm). Add footer page numbers. Style TOC heading (22pt bold + rule). Add hutable table width + fixed layout.</w:t>
-            </w:r>
-          </w:p>
-        </w:tc>
-      </w:tr>
-      <w:tr>
-        <w:tc>
-          <w:tcPr>
-            <w:shd w:val="clear" w:color="auto" w:fill="F6F8FA"/>
-          </w:tcPr>
-          <w:p>
-            <w:pPr>
-              <w:jc w:val="left"/>
-            </w:pPr>
-            <w:r>
-              <w:t xml:space="preserve">2.8.3</w:t>
             </w:r>
           </w:p>
         </w:tc>
@@ -16506,7 +16506,7 @@
               <w:jc w:val="left"/>
             </w:pPr>
             <w:r>
-              <w:t xml:space="preserve">DOCX fix: callout tables now have explicit width (8504tw) and fixed layout. Changelog section heading now uses custom H1 format (56pt number, red border, right tab) instead of pandoc’s default.</w:t>
+              <w:t xml:space="preserve">DOCX: fix content width (8504→9638tw, margins are 2cm not 3cm). Add footer page numbers. Style TOC heading (22pt bold + rule). Add hutable table width + fixed layout.</w:t>
             </w:r>
           </w:p>
         </w:tc>
@@ -16519,7 +16519,7 @@
               <w:jc w:val="left"/>
             </w:pPr>
             <w:r>
-              <w:t xml:space="preserve">2.8.2</w:t>
+              <w:t xml:space="preserve">2.8.3</w:t>
             </w:r>
           </w:p>
         </w:tc>
@@ -16545,7 +16545,7 @@
               <w:jc w:val="left"/>
             </w:pPr>
             <w:r>
-              <w:t xml:space="preserve">DOCX H1 heading: reverted table approach to paragraph with tab stop + red bottom border. Table broke navigation pane and TOC field. Paragraph preserves Heading1 style for navigation while matching PDF layout (number left, title right, red rule below).</w:t>
+              <w:t xml:space="preserve">DOCX fix: callout tables now have explicit width (8504tw) and fixed layout. Changelog section heading now uses custom H1 format (56pt number, red border, right tab) instead of pandoc’s default.</w:t>
             </w:r>
           </w:p>
         </w:tc>
@@ -16560,7 +16560,7 @@
               <w:jc w:val="left"/>
             </w:pPr>
             <w:r>
-              <w:t xml:space="preserve">2.8.1</w:t>
+              <w:t xml:space="preserve">2.8.2</w:t>
             </w:r>
           </w:p>
         </w:tc>
@@ -16590,7 +16590,7 @@
               <w:jc w:val="left"/>
             </w:pPr>
             <w:r>
-              <w:t xml:space="preserve">DOCX heading fix: text color reverted to black (was incorrectly changed to Huawei red in v2.8.0). H1 now uses a two-column table (number left, title right) with red bottom rule. H2-H4 use simple inline format (number + title, no right tab stop).</w:t>
+              <w:t xml:space="preserve">DOCX H1 heading: reverted table approach to paragraph with tab stop + red bottom border. Table broke navigation pane and TOC field. Paragraph preserves Heading1 style for navigation while matching PDF layout (number left, title right, red rule below).</w:t>
             </w:r>
           </w:p>
         </w:tc>
@@ -16603,7 +16603,7 @@
               <w:jc w:val="left"/>
             </w:pPr>
             <w:r>
-              <w:t xml:space="preserve">2.8.0</w:t>
+              <w:t xml:space="preserve">2.8.1</w:t>
             </w:r>
           </w:p>
         </w:tc>
@@ -16629,7 +16629,7 @@
               <w:jc w:val="left"/>
             </w:pPr>
             <w:r>
-              <w:t xml:space="preserve">DOCX output: match PDF styling --- heading colors (Huawei red), H1 number size (56pt), callout borders (left-only) and padding, changelog formatting (rules, bold version, italic date), caption style (9pt bold), badge style (8pt bold white on red), list indentation.</w:t>
+              <w:t xml:space="preserve">DOCX heading fix: text color reverted to black (was incorrectly changed to Huawei red in v2.8.0). H1 now uses a two-column table (number left, title right) with red bottom rule. H2-H4 use simple inline format (number + title, no right tab stop).</w:t>
             </w:r>
           </w:p>
         </w:tc>
@@ -16644,7 +16644,7 @@
               <w:jc w:val="left"/>
             </w:pPr>
             <w:r>
-              <w:t xml:space="preserve">2.7.1</w:t>
+              <w:t xml:space="preserve">2.8.0</w:t>
             </w:r>
           </w:p>
         </w:tc>
@@ -16657,7 +16657,7 @@
               <w:jc w:val="left"/>
             </w:pPr>
             <w:r>
-              <w:t xml:space="preserve">2026-08-17</w:t>
+              <w:t xml:space="preserve">2026-08-23</w:t>
             </w:r>
           </w:p>
         </w:tc>
@@ -16674,6 +16674,45 @@
               <w:jc w:val="left"/>
             </w:pPr>
             <w:r>
+              <w:t xml:space="preserve">DOCX output: match PDF styling --- heading colors (Huawei red), H1 number size (56pt), callout borders (left-only) and padding, changelog formatting (rules, bold version, italic date), caption style (9pt bold), badge style (8pt bold white on red), list indentation.</w:t>
+            </w:r>
+          </w:p>
+        </w:tc>
+      </w:tr>
+      <w:tr>
+        <w:tc>
+          <w:tcPr/>
+          <w:p>
+            <w:pPr>
+              <w:jc w:val="left"/>
+            </w:pPr>
+            <w:r>
+              <w:t xml:space="preserve">2.7.1</w:t>
+            </w:r>
+          </w:p>
+        </w:tc>
+        <w:tc>
+          <w:tcPr/>
+          <w:p>
+            <w:pPr>
+              <w:jc w:val="left"/>
+            </w:pPr>
+            <w:r>
+              <w:t xml:space="preserve">2026-08-17</w:t>
+            </w:r>
+          </w:p>
+        </w:tc>
+        <w:tc>
+          <w:tcPr/>
+          <w:p>
+            <w:pPr>
+              <w:numPr>
+                <w:ilvl w:val="0"/>
+                <w:numId w:val="1094"/>
+              </w:numPr>
+              <w:jc w:val="left"/>
+            </w:pPr>
+            <w:r>
               <w:t xml:space="preserve">Rename project repository to all lowercase (</w:t>
             </w:r>
             <w:r>
@@ -16690,7 +16729,9 @@
       </w:tr>
       <w:tr>
         <w:tc>
-          <w:tcPr/>
+          <w:tcPr>
+            <w:shd w:val="clear" w:color="auto" w:fill="F6F8FA"/>
+          </w:tcPr>
           <w:p>
             <w:pPr>
               <w:jc w:val="left"/>
@@ -16701,7 +16742,9 @@
           </w:p>
         </w:tc>
         <w:tc>
-          <w:tcPr/>
+          <w:tcPr>
+            <w:shd w:val="clear" w:color="auto" w:fill="F6F8FA"/>
+          </w:tcPr>
           <w:p>
             <w:pPr>
               <w:jc w:val="left"/>
@@ -16712,12 +16755,14 @@
           </w:p>
         </w:tc>
         <w:tc>
-          <w:tcPr/>
+          <w:tcPr>
+            <w:shd w:val="clear" w:color="auto" w:fill="F6F8FA"/>
+          </w:tcPr>
           <w:p>
             <w:pPr>
               <w:numPr>
                 <w:ilvl w:val="0"/>
-                <w:numId w:val="1094"/>
+                <w:numId w:val="1095"/>
               </w:numPr>
               <w:jc w:val="left"/>
             </w:pPr>
@@ -16759,9 +16804,7 @@
       </w:tr>
       <w:tr>
         <w:tc>
-          <w:tcPr>
-            <w:shd w:val="clear" w:color="auto" w:fill="F6F8FA"/>
-          </w:tcPr>
+          <w:tcPr/>
           <w:p>
             <w:pPr>
               <w:jc w:val="left"/>
@@ -16772,9 +16815,7 @@
           </w:p>
         </w:tc>
         <w:tc>
-          <w:tcPr>
-            <w:shd w:val="clear" w:color="auto" w:fill="F6F8FA"/>
-          </w:tcPr>
+          <w:tcPr/>
           <w:p>
             <w:pPr>
               <w:jc w:val="left"/>
@@ -16785,14 +16826,12 @@
           </w:p>
         </w:tc>
         <w:tc>
-          <w:tcPr>
-            <w:shd w:val="clear" w:color="auto" w:fill="F6F8FA"/>
-          </w:tcPr>
+          <w:tcPr/>
           <w:p>
             <w:pPr>
               <w:numPr>
                 <w:ilvl w:val="0"/>
-                <w:numId w:val="1095"/>
+                <w:numId w:val="1096"/>
               </w:numPr>
               <w:jc w:val="left"/>
             </w:pPr>
@@ -16849,7 +16888,9 @@
       </w:tr>
       <w:tr>
         <w:tc>
-          <w:tcPr/>
+          <w:tcPr>
+            <w:shd w:val="clear" w:color="auto" w:fill="F6F8FA"/>
+          </w:tcPr>
           <w:p>
             <w:pPr>
               <w:jc w:val="left"/>
@@ -16860,7 +16901,9 @@
           </w:p>
         </w:tc>
         <w:tc>
-          <w:tcPr/>
+          <w:tcPr>
+            <w:shd w:val="clear" w:color="auto" w:fill="F6F8FA"/>
+          </w:tcPr>
           <w:p>
             <w:pPr>
               <w:jc w:val="left"/>
@@ -16871,12 +16914,14 @@
           </w:p>
         </w:tc>
         <w:tc>
-          <w:tcPr/>
+          <w:tcPr>
+            <w:shd w:val="clear" w:color="auto" w:fill="F6F8FA"/>
+          </w:tcPr>
           <w:p>
             <w:pPr>
               <w:numPr>
                 <w:ilvl w:val="0"/>
-                <w:numId w:val="1096"/>
+                <w:numId w:val="1097"/>
               </w:numPr>
               <w:jc w:val="left"/>
             </w:pPr>
@@ -16903,7 +16948,7 @@
             <w:pPr>
               <w:numPr>
                 <w:ilvl w:val="0"/>
-                <w:numId w:val="1096"/>
+                <w:numId w:val="1097"/>
               </w:numPr>
               <w:jc w:val="left"/>
             </w:pPr>
@@ -16930,58 +16975,13 @@
       </w:tr>
       <w:tr>
         <w:tc>
-          <w:tcPr>
-            <w:shd w:val="clear" w:color="auto" w:fill="F6F8FA"/>
-          </w:tcPr>
+          <w:tcPr/>
           <w:p>
             <w:pPr>
               <w:jc w:val="left"/>
             </w:pPr>
             <w:r>
               <w:t xml:space="preserve">2.5.1</w:t>
-            </w:r>
-          </w:p>
-        </w:tc>
-        <w:tc>
-          <w:tcPr>
-            <w:shd w:val="clear" w:color="auto" w:fill="F6F8FA"/>
-          </w:tcPr>
-          <w:p>
-            <w:pPr>
-              <w:jc w:val="left"/>
-            </w:pPr>
-            <w:r>
-              <w:t xml:space="preserve">2026-08-10</w:t>
-            </w:r>
-          </w:p>
-        </w:tc>
-        <w:tc>
-          <w:tcPr>
-            <w:shd w:val="clear" w:color="auto" w:fill="F6F8FA"/>
-          </w:tcPr>
-          <w:p>
-            <w:pPr>
-              <w:numPr>
-                <w:ilvl w:val="0"/>
-                <w:numId w:val="1097"/>
-              </w:numPr>
-              <w:jc w:val="left"/>
-            </w:pPr>
-            <w:r>
-              <w:t xml:space="preserve">H1 section title size reduced from 27pt to 20pt.</w:t>
-            </w:r>
-          </w:p>
-        </w:tc>
-      </w:tr>
-      <w:tr>
-        <w:tc>
-          <w:tcPr/>
-          <w:p>
-            <w:pPr>
-              <w:jc w:val="left"/>
-            </w:pPr>
-            <w:r>
-              <w:t xml:space="preserve">2.5.0</w:t>
             </w:r>
           </w:p>
         </w:tc>
@@ -17007,13 +17007,7 @@
               <w:jc w:val="left"/>
             </w:pPr>
             <w:r>
-              <w:t xml:space="preserve">Default image size increased: width 65% → 90% of text width,</w:t>
-            </w:r>
-            <w:r>
-              <w:t xml:space="preserve"> </w:t>
-            </w:r>
-            <w:r>
-              <w:t xml:space="preserve">height 40% → 50% of text height.</w:t>
+              <w:t xml:space="preserve">H1 section title size reduced from 27pt to 20pt.</w:t>
             </w:r>
           </w:p>
         </w:tc>
@@ -17028,7 +17022,7 @@
               <w:jc w:val="left"/>
             </w:pPr>
             <w:r>
-              <w:t xml:space="preserve">2.4.0</w:t>
+              <w:t xml:space="preserve">2.5.0</w:t>
             </w:r>
           </w:p>
         </w:tc>
@@ -17058,14 +17052,59 @@
               <w:jc w:val="left"/>
             </w:pPr>
             <w:r>
-              <w:t xml:space="preserve">Enlarged H1 section title (18pt → 27pt, 50% bigger).</w:t>
-            </w:r>
-          </w:p>
+              <w:t xml:space="preserve">Default image size increased: width 65% → 90% of text width,</w:t>
+            </w:r>
+            <w:r>
+              <w:t xml:space="preserve"> </w:t>
+            </w:r>
+            <w:r>
+              <w:t xml:space="preserve">height 40% → 50% of text height.</w:t>
+            </w:r>
+          </w:p>
+        </w:tc>
+      </w:tr>
+      <w:tr>
+        <w:tc>
+          <w:tcPr/>
+          <w:p>
+            <w:pPr>
+              <w:jc w:val="left"/>
+            </w:pPr>
+            <w:r>
+              <w:t xml:space="preserve">2.4.0</w:t>
+            </w:r>
+          </w:p>
+        </w:tc>
+        <w:tc>
+          <w:tcPr/>
+          <w:p>
+            <w:pPr>
+              <w:jc w:val="left"/>
+            </w:pPr>
+            <w:r>
+              <w:t xml:space="preserve">2026-08-10</w:t>
+            </w:r>
+          </w:p>
+        </w:tc>
+        <w:tc>
+          <w:tcPr/>
           <w:p>
             <w:pPr>
               <w:numPr>
                 <w:ilvl w:val="0"/>
-                <w:numId w:val="1099"/>
+                <w:numId w:val="1100"/>
+              </w:numPr>
+              <w:jc w:val="left"/>
+            </w:pPr>
+            <w:r>
+              <w:t xml:space="preserve">Enlarged H1 section title (18pt → 27pt, 50% bigger).</w:t>
+            </w:r>
+          </w:p>
+          <w:p>
+            <w:pPr>
+              <w:numPr>
+                <w:ilvl w:val="0"/>
+                <w:numId w:val="1100"/>
               </w:numPr>
               <w:jc w:val="left"/>
             </w:pPr>
@@ -17092,7 +17131,9 @@
       </w:tr>
       <w:tr>
         <w:tc>
-          <w:tcPr/>
+          <w:tcPr>
+            <w:shd w:val="clear" w:color="auto" w:fill="F6F8FA"/>
+          </w:tcPr>
           <w:p>
             <w:pPr>
               <w:jc w:val="left"/>
@@ -17103,7 +17144,9 @@
           </w:p>
         </w:tc>
         <w:tc>
-          <w:tcPr/>
+          <w:tcPr>
+            <w:shd w:val="clear" w:color="auto" w:fill="F6F8FA"/>
+          </w:tcPr>
           <w:p>
             <w:pPr>
               <w:jc w:val="left"/>
@@ -17114,12 +17157,14 @@
           </w:p>
         </w:tc>
         <w:tc>
-          <w:tcPr/>
+          <w:tcPr>
+            <w:shd w:val="clear" w:color="auto" w:fill="F6F8FA"/>
+          </w:tcPr>
           <w:p>
             <w:pPr>
               <w:numPr>
                 <w:ilvl w:val="0"/>
-                <w:numId w:val="1100"/>
+                <w:numId w:val="1101"/>
               </w:numPr>
               <w:jc w:val="left"/>
             </w:pPr>
@@ -17146,9 +17191,7 @@
       </w:tr>
       <w:tr>
         <w:tc>
-          <w:tcPr>
-            <w:shd w:val="clear" w:color="auto" w:fill="F6F8FA"/>
-          </w:tcPr>
+          <w:tcPr/>
           <w:p>
             <w:pPr>
               <w:jc w:val="left"/>
@@ -17159,9 +17202,7 @@
           </w:p>
         </w:tc>
         <w:tc>
-          <w:tcPr>
-            <w:shd w:val="clear" w:color="auto" w:fill="F6F8FA"/>
-          </w:tcPr>
+          <w:tcPr/>
           <w:p>
             <w:pPr>
               <w:jc w:val="left"/>
@@ -17172,14 +17213,12 @@
           </w:p>
         </w:tc>
         <w:tc>
-          <w:tcPr>
-            <w:shd w:val="clear" w:color="auto" w:fill="F6F8FA"/>
-          </w:tcPr>
+          <w:tcPr/>
           <w:p>
             <w:pPr>
               <w:numPr>
                 <w:ilvl w:val="0"/>
-                <w:numId w:val="1101"/>
+                <w:numId w:val="1102"/>
               </w:numPr>
               <w:jc w:val="left"/>
             </w:pPr>
@@ -17251,7 +17290,9 @@
       </w:tr>
       <w:tr>
         <w:tc>
-          <w:tcPr/>
+          <w:tcPr>
+            <w:shd w:val="clear" w:color="auto" w:fill="F6F8FA"/>
+          </w:tcPr>
           <w:p>
             <w:pPr>
               <w:jc w:val="left"/>
@@ -17262,7 +17303,9 @@
           </w:p>
         </w:tc>
         <w:tc>
-          <w:tcPr/>
+          <w:tcPr>
+            <w:shd w:val="clear" w:color="auto" w:fill="F6F8FA"/>
+          </w:tcPr>
           <w:p>
             <w:pPr>
               <w:jc w:val="left"/>
@@ -17273,12 +17316,14 @@
           </w:p>
         </w:tc>
         <w:tc>
-          <w:tcPr/>
+          <w:tcPr>
+            <w:shd w:val="clear" w:color="auto" w:fill="F6F8FA"/>
+          </w:tcPr>
           <w:p>
             <w:pPr>
               <w:numPr>
                 <w:ilvl w:val="0"/>
-                <w:numId w:val="1102"/>
+                <w:numId w:val="1103"/>
               </w:numPr>
               <w:jc w:val="left"/>
             </w:pPr>
@@ -17335,9 +17380,7 @@
       </w:tr>
       <w:tr>
         <w:tc>
-          <w:tcPr>
-            <w:shd w:val="clear" w:color="auto" w:fill="F6F8FA"/>
-          </w:tcPr>
+          <w:tcPr/>
           <w:p>
             <w:pPr>
               <w:jc w:val="left"/>
@@ -17348,9 +17391,7 @@
           </w:p>
         </w:tc>
         <w:tc>
-          <w:tcPr>
-            <w:shd w:val="clear" w:color="auto" w:fill="F6F8FA"/>
-          </w:tcPr>
+          <w:tcPr/>
           <w:p>
             <w:pPr>
               <w:jc w:val="left"/>
@@ -17361,14 +17402,12 @@
           </w:p>
         </w:tc>
         <w:tc>
-          <w:tcPr>
-            <w:shd w:val="clear" w:color="auto" w:fill="F6F8FA"/>
-          </w:tcPr>
+          <w:tcPr/>
           <w:p>
             <w:pPr>
               <w:numPr>
                 <w:ilvl w:val="0"/>
-                <w:numId w:val="1103"/>
+                <w:numId w:val="1104"/>
               </w:numPr>
               <w:jc w:val="left"/>
             </w:pPr>
@@ -17395,54 +17434,15 @@
       </w:tr>
       <w:tr>
         <w:tc>
-          <w:tcPr/>
+          <w:tcPr>
+            <w:shd w:val="clear" w:color="auto" w:fill="F6F8FA"/>
+          </w:tcPr>
           <w:p>
             <w:pPr>
               <w:jc w:val="left"/>
             </w:pPr>
             <w:r>
               <w:t xml:space="preserve">2.2.2</w:t>
-            </w:r>
-          </w:p>
-        </w:tc>
-        <w:tc>
-          <w:tcPr/>
-          <w:p>
-            <w:pPr>
-              <w:jc w:val="left"/>
-            </w:pPr>
-            <w:r>
-              <w:t xml:space="preserve">2026-08-08</w:t>
-            </w:r>
-          </w:p>
-        </w:tc>
-        <w:tc>
-          <w:tcPr/>
-          <w:p>
-            <w:pPr>
-              <w:numPr>
-                <w:ilvl w:val="0"/>
-                <w:numId w:val="1104"/>
-              </w:numPr>
-              <w:jc w:val="left"/>
-            </w:pPr>
-            <w:r>
-              <w:t xml:space="preserve">Fixed chapter reference in prerequisite (Chapter 3 → Chapter 4).</w:t>
-            </w:r>
-          </w:p>
-        </w:tc>
-      </w:tr>
-      <w:tr>
-        <w:tc>
-          <w:tcPr>
-            <w:shd w:val="clear" w:color="auto" w:fill="F6F8FA"/>
-          </w:tcPr>
-          <w:p>
-            <w:pPr>
-              <w:jc w:val="left"/>
-            </w:pPr>
-            <w:r>
-              <w:t xml:space="preserve">2.2.1</w:t>
             </w:r>
           </w:p>
         </w:tc>
@@ -17472,7 +17472,7 @@
               <w:jc w:val="left"/>
             </w:pPr>
             <w:r>
-              <w:t xml:space="preserve">Changed table and figure caption labels to black (was Huawei red).</w:t>
+              <w:t xml:space="preserve">Fixed chapter reference in prerequisite (Chapter 3 → Chapter 4).</w:t>
             </w:r>
           </w:p>
         </w:tc>
@@ -17485,7 +17485,7 @@
               <w:jc w:val="left"/>
             </w:pPr>
             <w:r>
-              <w:t xml:space="preserve">2.2.0</w:t>
+              <w:t xml:space="preserve">2.2.1</w:t>
             </w:r>
           </w:p>
         </w:tc>
@@ -17511,13 +17511,7 @@
               <w:jc w:val="left"/>
             </w:pPr>
             <w:r>
-              <w:t xml:space="preserve">Added Huawei-branded table styling: red header bar, alternating row</w:t>
-            </w:r>
-            <w:r>
-              <w:t xml:space="preserve"> </w:t>
-            </w:r>
-            <w:r>
-              <w:t xml:space="preserve">colors, and bordered cells.</w:t>
+              <w:t xml:space="preserve">Changed table and figure caption labels to black (was Huawei red).</w:t>
             </w:r>
           </w:p>
         </w:tc>
@@ -17532,7 +17526,7 @@
               <w:jc w:val="left"/>
             </w:pPr>
             <w:r>
-              <w:t xml:space="preserve">2.1.0</w:t>
+              <w:t xml:space="preserve">2.2.0</w:t>
             </w:r>
           </w:p>
         </w:tc>
@@ -17545,7 +17539,7 @@
               <w:jc w:val="left"/>
             </w:pPr>
             <w:r>
-              <w:t xml:space="preserve">2026-08-06</w:t>
+              <w:t xml:space="preserve">2026-08-08</w:t>
             </w:r>
           </w:p>
         </w:tc>
@@ -17562,6 +17556,51 @@
               <w:jc w:val="left"/>
             </w:pPr>
             <w:r>
+              <w:t xml:space="preserve">Added Huawei-branded table styling: red header bar, alternating row</w:t>
+            </w:r>
+            <w:r>
+              <w:t xml:space="preserve"> </w:t>
+            </w:r>
+            <w:r>
+              <w:t xml:space="preserve">colors, and bordered cells.</w:t>
+            </w:r>
+          </w:p>
+        </w:tc>
+      </w:tr>
+      <w:tr>
+        <w:tc>
+          <w:tcPr/>
+          <w:p>
+            <w:pPr>
+              <w:jc w:val="left"/>
+            </w:pPr>
+            <w:r>
+              <w:t xml:space="preserve">2.1.0</w:t>
+            </w:r>
+          </w:p>
+        </w:tc>
+        <w:tc>
+          <w:tcPr/>
+          <w:p>
+            <w:pPr>
+              <w:jc w:val="left"/>
+            </w:pPr>
+            <w:r>
+              <w:t xml:space="preserve">2026-08-06</w:t>
+            </w:r>
+          </w:p>
+        </w:tc>
+        <w:tc>
+          <w:tcPr/>
+          <w:p>
+            <w:pPr>
+              <w:numPr>
+                <w:ilvl w:val="0"/>
+                <w:numId w:val="1108"/>
+              </w:numPr>
+              <w:jc w:val="left"/>
+            </w:pPr>
+            <w:r>
               <w:t xml:space="preserve">Updated ECS flavor to</w:t>
             </w:r>
             <w:r>
@@ -17584,7 +17623,7 @@
             <w:pPr>
               <w:numPr>
                 <w:ilvl w:val="0"/>
-                <w:numId w:val="1107"/>
+                <w:numId w:val="1108"/>
               </w:numPr>
               <w:jc w:val="left"/>
             </w:pPr>
@@ -17596,7 +17635,7 @@
             <w:pPr>
               <w:numPr>
                 <w:ilvl w:val="0"/>
-                <w:numId w:val="1107"/>
+                <w:numId w:val="1108"/>
               </w:numPr>
               <w:jc w:val="left"/>
             </w:pPr>
@@ -17608,7 +17647,7 @@
             <w:pPr>
               <w:numPr>
                 <w:ilvl w:val="0"/>
-                <w:numId w:val="1107"/>
+                <w:numId w:val="1108"/>
               </w:numPr>
               <w:jc w:val="left"/>
             </w:pPr>
@@ -17620,7 +17659,7 @@
             <w:pPr>
               <w:numPr>
                 <w:ilvl w:val="0"/>
-                <w:numId w:val="1107"/>
+                <w:numId w:val="1108"/>
               </w:numPr>
               <w:jc w:val="left"/>
             </w:pPr>
@@ -17632,7 +17671,7 @@
             <w:pPr>
               <w:numPr>
                 <w:ilvl w:val="0"/>
-                <w:numId w:val="1107"/>
+                <w:numId w:val="1108"/>
               </w:numPr>
               <w:jc w:val="left"/>
             </w:pPr>
@@ -17650,7 +17689,7 @@
             <w:pPr>
               <w:numPr>
                 <w:ilvl w:val="0"/>
-                <w:numId w:val="1107"/>
+                <w:numId w:val="1108"/>
               </w:numPr>
               <w:jc w:val="left"/>
             </w:pPr>
@@ -17699,7 +17738,7 @@
             <w:pPr>
               <w:numPr>
                 <w:ilvl w:val="0"/>
-                <w:numId w:val="1107"/>
+                <w:numId w:val="1108"/>
               </w:numPr>
               <w:jc w:val="left"/>
             </w:pPr>
@@ -17711,7 +17750,7 @@
             <w:pPr>
               <w:numPr>
                 <w:ilvl w:val="0"/>
-                <w:numId w:val="1107"/>
+                <w:numId w:val="1108"/>
               </w:numPr>
               <w:jc w:val="left"/>
             </w:pPr>
@@ -17762,7 +17801,7 @@
             <w:pPr>
               <w:numPr>
                 <w:ilvl w:val="0"/>
-                <w:numId w:val="1107"/>
+                <w:numId w:val="1108"/>
               </w:numPr>
               <w:jc w:val="left"/>
             </w:pPr>
@@ -17789,7 +17828,9 @@
       </w:tr>
       <w:tr>
         <w:tc>
-          <w:tcPr/>
+          <w:tcPr>
+            <w:shd w:val="clear" w:color="auto" w:fill="F6F8FA"/>
+          </w:tcPr>
           <w:p>
             <w:pPr>
               <w:jc w:val="left"/>
@@ -17800,7 +17841,9 @@
           </w:p>
         </w:tc>
         <w:tc>
-          <w:tcPr/>
+          <w:tcPr>
+            <w:shd w:val="clear" w:color="auto" w:fill="F6F8FA"/>
+          </w:tcPr>
           <w:p>
             <w:pPr>
               <w:jc w:val="left"/>
@@ -17811,12 +17854,14 @@
           </w:p>
         </w:tc>
         <w:tc>
-          <w:tcPr/>
+          <w:tcPr>
+            <w:shd w:val="clear" w:color="auto" w:fill="F6F8FA"/>
+          </w:tcPr>
           <w:p>
             <w:pPr>
               <w:numPr>
                 <w:ilvl w:val="0"/>
-                <w:numId w:val="1108"/>
+                <w:numId w:val="1109"/>
               </w:numPr>
               <w:jc w:val="left"/>
             </w:pPr>
@@ -17834,7 +17879,7 @@
             <w:pPr>
               <w:numPr>
                 <w:ilvl w:val="0"/>
-                <w:numId w:val="1108"/>
+                <w:numId w:val="1109"/>
               </w:numPr>
               <w:jc w:val="left"/>
             </w:pPr>
@@ -17888,7 +17933,7 @@
             <w:pPr>
               <w:numPr>
                 <w:ilvl w:val="0"/>
-                <w:numId w:val="1108"/>
+                <w:numId w:val="1109"/>
               </w:numPr>
               <w:jc w:val="left"/>
             </w:pPr>
@@ -17936,7 +17981,7 @@
             <w:pPr>
               <w:numPr>
                 <w:ilvl w:val="0"/>
-                <w:numId w:val="1108"/>
+                <w:numId w:val="1109"/>
               </w:numPr>
               <w:jc w:val="left"/>
             </w:pPr>
@@ -17957,9 +18002,7 @@
       </w:tr>
       <w:tr>
         <w:tc>
-          <w:tcPr>
-            <w:shd w:val="clear" w:color="auto" w:fill="F6F8FA"/>
-          </w:tcPr>
+          <w:tcPr/>
           <w:p>
             <w:pPr>
               <w:jc w:val="left"/>
@@ -17970,9 +18013,7 @@
           </w:p>
         </w:tc>
         <w:tc>
-          <w:tcPr>
-            <w:shd w:val="clear" w:color="auto" w:fill="F6F8FA"/>
-          </w:tcPr>
+          <w:tcPr/>
           <w:p>
             <w:pPr>
               <w:jc w:val="left"/>
@@ -17983,14 +18024,12 @@
           </w:p>
         </w:tc>
         <w:tc>
-          <w:tcPr>
-            <w:shd w:val="clear" w:color="auto" w:fill="F6F8FA"/>
-          </w:tcPr>
+          <w:tcPr/>
           <w:p>
             <w:pPr>
               <w:numPr>
                 <w:ilvl w:val="0"/>
-                <w:numId w:val="1109"/>
+                <w:numId w:val="1110"/>
               </w:numPr>
               <w:jc w:val="left"/>
             </w:pPr>
@@ -18002,7 +18041,7 @@
             <w:pPr>
               <w:numPr>
                 <w:ilvl w:val="0"/>
-                <w:numId w:val="1109"/>
+                <w:numId w:val="1110"/>
               </w:numPr>
               <w:jc w:val="left"/>
             </w:pPr>
@@ -18014,7 +18053,7 @@
             <w:pPr>
               <w:numPr>
                 <w:ilvl w:val="0"/>
-                <w:numId w:val="1109"/>
+                <w:numId w:val="1110"/>
               </w:numPr>
               <w:jc w:val="left"/>
             </w:pPr>
@@ -18026,7 +18065,7 @@
             <w:pPr>
               <w:numPr>
                 <w:ilvl w:val="0"/>
-                <w:numId w:val="1109"/>
+                <w:numId w:val="1110"/>
               </w:numPr>
               <w:jc w:val="left"/>
             </w:pPr>
@@ -18044,7 +18083,7 @@
             <w:pPr>
               <w:numPr>
                 <w:ilvl w:val="0"/>
-                <w:numId w:val="1109"/>
+                <w:numId w:val="1110"/>
               </w:numPr>
               <w:jc w:val="left"/>
             </w:pPr>
@@ -18056,7 +18095,7 @@
             <w:pPr>
               <w:numPr>
                 <w:ilvl w:val="0"/>
-                <w:numId w:val="1109"/>
+                <w:numId w:val="1110"/>
               </w:numPr>
               <w:jc w:val="left"/>
             </w:pPr>
@@ -19428,6 +19467,9 @@
     <w:abstractNumId w:val="991"/>
   </w:num>
   <w:num w:numId="1109">
+    <w:abstractNumId w:val="991"/>
+  </w:num>
+  <w:num w:numId="1110">
     <w:abstractNumId w:val="991"/>
   </w:num>
 </w:numbering>

</xml_diff>

<commit_message>
Match the PDF technical report cover in DOCX/MD/HTML (v6.8.0)
- Technical covers now show the report-type label (16pt red bold), a
  Version/Date/Scenario table with the PDF's red label column, and a
  meta line using the report version and its set date (was the document
  version and the build date)
- Title size is template-conditional: 24pt for technical (PDF
  technical.cls), 36pt for guide/poc/testbook (unchanged)
- The preprocessor captures \setreportversion/\setreportdate/
  \setreportscenario from the cover passthrough and forwards them;
  authors appear as a table row when set
- _assemble_cover: meta scan starts after the logo (author names like
  "Victor" no longer false-match); pattern matches both v1.0.0 and
  vHCS 8.5.1
- Bump all templates + setup-guide to v6.8.0; regenerate committed artifacts
</commit_message>
<xml_diff>
--- a/documents/setup-guide/setup-guide.docx
+++ b/documents/setup-guide/setup-guide.docx
@@ -75,6 +75,18 @@
     </w:p>
     <w:p>
       <w:pPr>
+        <w:pStyle w:val="Date"/>
+        <w:jc w:val="center"/>
+      </w:pPr>
+      <w:r>
+        <w:rPr>
+          <w:sz w:val="24"/>
+        </w:rPr>
+        <w:t xml:space="preserve">2026-09-21</w:t>
+      </w:r>
+    </w:p>
+    <w:p>
+      <w:pPr>
         <w:pStyle w:val="BodyText"/>
         <w:jc w:val="center"/>
       </w:pPr>
@@ -84,7 +96,7 @@
           <w:b/>
           <w:sz w:val="24"/>
         </w:rPr>
-        <w:t xml:space="preserve">v6.7.0</w:t>
+        <w:t xml:space="preserve">v6.8.0</w:t>
       </w:r>
       <w:r>
         <w:rPr>
@@ -96,7 +108,7 @@
         <w:rPr>
           <w:sz w:val="24"/>
         </w:rPr>
-        <w:t xml:space="preserve">— September 20, 2026 15:29</w:t>
+        <w:t xml:space="preserve">— September 20, 2026 19:26</w:t>
       </w:r>
     </w:p>
     <w:sdt>
@@ -13345,7 +13357,7 @@
               <w:jc w:val="left"/>
             </w:pPr>
             <w:r>
-              <w:t xml:space="preserve">6.7.0</w:t>
+              <w:t xml:space="preserve">6.8.0</w:t>
             </w:r>
           </w:p>
         </w:tc>
@@ -13371,7 +13383,7 @@
               <w:jc w:val="left"/>
             </w:pPr>
             <w:r>
-              <w:t xml:space="preserve">Badge and language fidelity: DOCX badge pills now render black text like the PDF (was frame-colored), use the correct label case (Pass, not PASS), include the Portuguese POC labels (Atendido, Parcial, Falha, Ignorado), and render at native width per template (testbook badge text no longer shrinks). Portuguese signature greetings now match the PDF (At.te,), the POC classification label matches the full PDF wording, and the secondary-format table headers (stakeholders, closing record, test summary, changelog) are now language-aware. DOCX footers show Página in Portuguese documents. Cover dates no longer zero-pad the day.</w:t>
+              <w:t xml:space="preserve">Technical report covers now match the PDF in DOCX/MD/HTML: the title uses the PDF’s 24pt size (was 36pt), the report type label appears above it, and the Version/Date/Scenario table is rendered with the PDF’s red label column. The cover meta line now shows the report version and its set date (was the document version and the build date). Authors, when set, appear as a table row like the PDF.</w:t>
             </w:r>
           </w:p>
         </w:tc>
@@ -13386,7 +13398,7 @@
               <w:jc w:val="left"/>
             </w:pPr>
             <w:r>
-              <w:t xml:space="preserve">6.6.1</w:t>
+              <w:t xml:space="preserve">6.7.0</w:t>
             </w:r>
           </w:p>
         </w:tc>
@@ -13416,7 +13428,7 @@
               <w:jc w:val="left"/>
             </w:pPr>
             <w:r>
-              <w:t xml:space="preserve">Quality-pass fixes for v6.6.0: the TESTCASE-marker strip now covers the entire DOCX fix run (a failure at any stage can no longer leave markers in the output file); the fixer resets its template state between in-process runs (the documented path-sniffing fallback works again); build.sh also cleans temporary files on interrupt signals; fixed a CHANGELOG typo.</w:t>
+              <w:t xml:space="preserve">Badge and language fidelity: DOCX badge pills now render black text like the PDF (was frame-colored), use the correct label case (Pass, not PASS), include the Portuguese POC labels (Atendido, Parcial, Falha, Ignorado), and render at native width per template (testbook badge text no longer shrinks). Portuguese signature greetings now match the PDF (At.te,), the POC classification label matches the full PDF wording, and the secondary-format table headers (stakeholders, closing record, test summary, changelog) are now language-aware. DOCX footers show Página in Portuguese documents. Cover dates no longer zero-pad the day.</w:t>
             </w:r>
           </w:p>
         </w:tc>
@@ -13429,7 +13441,7 @@
               <w:jc w:val="left"/>
             </w:pPr>
             <w:r>
-              <w:t xml:space="preserve">6.6.0</w:t>
+              <w:t xml:space="preserve">6.6.1</w:t>
             </w:r>
           </w:p>
         </w:tc>
@@ -13455,6 +13467,51 @@
               <w:jc w:val="left"/>
             </w:pPr>
             <w:r>
+              <w:t xml:space="preserve">Quality-pass fixes for v6.6.0: the TESTCASE-marker strip now covers the entire DOCX fix run (a failure at any stage can no longer leave markers in the output file); the fixer resets its template state between in-process runs (the documented path-sniffing fallback works again); build.sh also cleans temporary files on interrupt signals; fixed a CHANGELOG typo.</w:t>
+            </w:r>
+          </w:p>
+        </w:tc>
+      </w:tr>
+      <w:tr>
+        <w:tc>
+          <w:tcPr>
+            <w:shd w:val="clear" w:color="auto" w:fill="F6F8FA"/>
+          </w:tcPr>
+          <w:p>
+            <w:pPr>
+              <w:jc w:val="left"/>
+            </w:pPr>
+            <w:r>
+              <w:t xml:space="preserve">6.6.0</w:t>
+            </w:r>
+          </w:p>
+        </w:tc>
+        <w:tc>
+          <w:tcPr>
+            <w:shd w:val="clear" w:color="auto" w:fill="F6F8FA"/>
+          </w:tcPr>
+          <w:p>
+            <w:pPr>
+              <w:jc w:val="left"/>
+            </w:pPr>
+            <w:r>
+              <w:t xml:space="preserve">2026-09-20</w:t>
+            </w:r>
+          </w:p>
+        </w:tc>
+        <w:tc>
+          <w:tcPr>
+            <w:shd w:val="clear" w:color="auto" w:fill="F6F8FA"/>
+          </w:tcPr>
+          <w:p>
+            <w:pPr>
+              <w:numPr>
+                <w:ilvl w:val="0"/>
+                <w:numId w:val="1045"/>
+              </w:numPr>
+              <w:jc w:val="left"/>
+            </w:pPr>
+            <w:r>
               <w:t xml:space="preserve">Pipeline robustness: DOCX post-processing now fails loudly when content styling errors occur (TESTCASE markers can no longer leak into output); the DOCX fixer takes an explicit</w:t>
             </w:r>
             <w:r>
@@ -13477,58 +13534,13 @@
       </w:tr>
       <w:tr>
         <w:tc>
-          <w:tcPr>
-            <w:shd w:val="clear" w:color="auto" w:fill="F6F8FA"/>
-          </w:tcPr>
+          <w:tcPr/>
           <w:p>
             <w:pPr>
               <w:jc w:val="left"/>
             </w:pPr>
             <w:r>
               <w:t xml:space="preserve">6.5.2</w:t>
-            </w:r>
-          </w:p>
-        </w:tc>
-        <w:tc>
-          <w:tcPr>
-            <w:shd w:val="clear" w:color="auto" w:fill="F6F8FA"/>
-          </w:tcPr>
-          <w:p>
-            <w:pPr>
-              <w:jc w:val="left"/>
-            </w:pPr>
-            <w:r>
-              <w:t xml:space="preserve">2026-09-20</w:t>
-            </w:r>
-          </w:p>
-        </w:tc>
-        <w:tc>
-          <w:tcPr>
-            <w:shd w:val="clear" w:color="auto" w:fill="F6F8FA"/>
-          </w:tcPr>
-          <w:p>
-            <w:pPr>
-              <w:numPr>
-                <w:ilvl w:val="0"/>
-                <w:numId w:val="1045"/>
-              </w:numPr>
-              <w:jc w:val="left"/>
-            </w:pPr>
-            <w:r>
-              <w:t xml:space="preserve">Quality-pass fixes for v6.5.1: LaTeX quote conversion now handles only paired quotes (quote characters inside code arguments are no longer corrupted); signature cells containing escaped ampersands are no longer split; round-trip HTML generation guards the asciidoctor-diagram dependency and fails loudly when generation fails; pre-processor unit tests now cover pipe escaping in all five table handlers.</w:t>
-            </w:r>
-          </w:p>
-        </w:tc>
-      </w:tr>
-      <w:tr>
-        <w:tc>
-          <w:tcPr/>
-          <w:p>
-            <w:pPr>
-              <w:jc w:val="left"/>
-            </w:pPr>
-            <w:r>
-              <w:t xml:space="preserve">6.5.1</w:t>
             </w:r>
           </w:p>
         </w:tc>
@@ -13554,7 +13566,7 @@
               <w:jc w:val="left"/>
             </w:pPr>
             <w:r>
-              <w:t xml:space="preserve">Fixed DOCX/MD/HTML output: tables are no longer corrupted when changelog, signature, or summary content contains a pipe character (“|”). Badge text is now preserved in DOCX/MD/HTML — a “Ready” badge renders “Ready” instead of “[NEW]”. Multi-item changelog entries render as bullet lists instead of being joined with a literal “+”. POC documents now include the changelog in DOCX/MD/HTML. The :noanswers: attribute now hides test results and remarks in DOCX/MD/HTML, matching the PDF. Inline LaTeX (monospace text, arrows, LaTeX quotes) no longer leaks from changelog entries. The test suite now exercises the real build pipeline (pre-processor wired into round-trip and DOCX tests), with new pre-processor unit tests.</w:t>
+              <w:t xml:space="preserve">Quality-pass fixes for v6.5.1: LaTeX quote conversion now handles only paired quotes (quote characters inside code arguments are no longer corrupted); signature cells containing escaped ampersands are no longer split; round-trip HTML generation guards the asciidoctor-diagram dependency and fails loudly when generation fails; pre-processor unit tests now cover pipe escaping in all five table handlers.</w:t>
             </w:r>
           </w:p>
         </w:tc>
@@ -13569,7 +13581,7 @@
               <w:jc w:val="left"/>
             </w:pPr>
             <w:r>
-              <w:t xml:space="preserve">6.5.0</w:t>
+              <w:t xml:space="preserve">6.5.1</w:t>
             </w:r>
           </w:p>
         </w:tc>
@@ -13599,7 +13611,7 @@
               <w:jc w:val="left"/>
             </w:pPr>
             <w:r>
-              <w:t xml:space="preserve">Evidence checklist simplified to plain bullets in both PDF and DOCX (checkbox markers removed for compatibility). Planned Activities list in DOCX now uses Word’s native lower-roman numbering (i., ii., iii.) matching the PDF. Badges in DOCX replaced with exact-replica PNG pill images (rounded, colored frame and background, bold text) matching the PDF \ huaweibadge look — assets committed to the repo. Signature blocks in DOCX no longer show literal + symbols (proper hard line breaks).</w:t>
+              <w:t xml:space="preserve">Fixed DOCX/MD/HTML output: tables are no longer corrupted when changelog, signature, or summary content contains a pipe character (“|”). Badge text is now preserved in DOCX/MD/HTML — a “Ready” badge renders “Ready” instead of “[NEW]”. Multi-item changelog entries render as bullet lists instead of being joined with a literal “+”. POC documents now include the changelog in DOCX/MD/HTML. The :noanswers: attribute now hides test results and remarks in DOCX/MD/HTML, matching the PDF. Inline LaTeX (monospace text, arrows, LaTeX quotes) no longer leaks from changelog entries. The test suite now exercises the real build pipeline (pre-processor wired into round-trip and DOCX tests), with new pre-processor unit tests.</w:t>
             </w:r>
           </w:p>
         </w:tc>
@@ -13612,7 +13624,7 @@
               <w:jc w:val="left"/>
             </w:pPr>
             <w:r>
-              <w:t xml:space="preserve">6.4.7</w:t>
+              <w:t xml:space="preserve">6.5.0</w:t>
             </w:r>
           </w:p>
         </w:tc>
@@ -13638,7 +13650,7 @@
               <w:jc w:val="left"/>
             </w:pPr>
             <w:r>
-              <w:t xml:space="preserve">Section titles in DOCX now match the PDF heading design: the big section number (56pt) sits on the left, the title text is pushed to the right edge (a right tab stop mimics the LaTeX \ hfill), and the red rule runs below — previously the title sat left-aligned next to a small number. Applies to all templates.</w:t>
+              <w:t xml:space="preserve">Evidence checklist simplified to plain bullets in both PDF and DOCX (checkbox markers removed for compatibility). Planned Activities list in DOCX now uses Word’s native lower-roman numbering (i., ii., iii.) matching the PDF. Badges in DOCX replaced with exact-replica PNG pill images (rounded, colored frame and background, bold text) matching the PDF \ huaweibadge look — assets committed to the repo. Signature blocks in DOCX no longer show literal + symbols (proper hard line breaks).</w:t>
             </w:r>
           </w:p>
         </w:tc>
@@ -13653,7 +13665,7 @@
               <w:jc w:val="left"/>
             </w:pPr>
             <w:r>
-              <w:t xml:space="preserve">6.4.6</w:t>
+              <w:t xml:space="preserve">6.4.7</w:t>
             </w:r>
           </w:p>
         </w:tc>
@@ -13683,7 +13695,7 @@
               <w:jc w:val="left"/>
             </w:pPr>
             <w:r>
-              <w:t xml:space="preserve">Code blocks inside test cases no longer break the red left rule in DOCX — the code style’s left indent (which jogged the rule) is reset inside test case blocks, and code blocks now show the PDF’s code box (gray background with thin border on top, bottom, and right, red rule continuing on the left).</w:t>
+              <w:t xml:space="preserve">Section titles in DOCX now match the PDF heading design: the big section number (56pt) sits on the left, the title text is pushed to the right edge (a right tab stop mimics the LaTeX \ hfill), and the red rule runs below — previously the title sat left-aligned next to a small number. Applies to all templates.</w:t>
             </w:r>
           </w:p>
         </w:tc>
@@ -13696,7 +13708,7 @@
               <w:jc w:val="left"/>
             </w:pPr>
             <w:r>
-              <w:t xml:space="preserve">6.4.5</w:t>
+              <w:t xml:space="preserve">6.4.6</w:t>
             </w:r>
           </w:p>
         </w:tc>
@@ -13722,7 +13734,7 @@
               <w:jc w:val="left"/>
             </w:pPr>
             <w:r>
-              <w:t xml:space="preserve">DOCX polish pass: all captions centered (matching the PDF), vertical spacing between blocks matched to the LaTeX rhythm (medskip/smallskip around captions, field bars, and steps), and test steps now render as separate paragraphs each with the red bold number (previously merged into one paragraph).</w:t>
+              <w:t xml:space="preserve">Code blocks inside test cases no longer break the red left rule in DOCX — the code style’s left indent (which jogged the rule) is reset inside test case blocks, and code blocks now show the PDF’s code box (gray background with thin border on top, bottom, and right, red rule continuing on the left).</w:t>
             </w:r>
           </w:p>
         </w:tc>
@@ -13737,7 +13749,7 @@
               <w:jc w:val="left"/>
             </w:pPr>
             <w:r>
-              <w:t xml:space="preserve">6.4.4</w:t>
+              <w:t xml:space="preserve">6.4.5</w:t>
             </w:r>
           </w:p>
         </w:tc>
@@ -13767,7 +13779,7 @@
               <w:jc w:val="left"/>
             </w:pPr>
             <w:r>
-              <w:t xml:space="preserve">DOCX covers now show the logo, cover text, and version/date/time meta line like the PDF. Test case blocks in DOCX get the PDF’s visual wrapper: red left rule, red field header bars, and red step numbers. Captions follow the PDF ordering system in DOCX, MD, and HTML (Table/Diagram/Figure/Testcase N: with bold symbol). Portuguese PDFs now label diagrams "Diagrama N:" (was hardcoded English "Diagram"). Markdown and HTML output no longer leaks raw LaTeX from passthrough blocks — the DOCX pre-processor now feeds those pipelines too.</w:t>
+              <w:t xml:space="preserve">DOCX polish pass: all captions centered (matching the PDF), vertical spacing between blocks matched to the LaTeX rhythm (medskip/smallskip around captions, field bars, and steps), and test steps now render as separate paragraphs each with the red bold number (previously merged into one paragraph).</w:t>
             </w:r>
           </w:p>
         </w:tc>
@@ -13780,7 +13792,7 @@
               <w:jc w:val="left"/>
             </w:pPr>
             <w:r>
-              <w:t xml:space="preserve">6.4.3</w:t>
+              <w:t xml:space="preserve">6.4.4</w:t>
             </w:r>
           </w:p>
         </w:tc>
@@ -13806,7 +13818,7 @@
               <w:jc w:val="left"/>
             </w:pPr>
             <w:r>
-              <w:t xml:space="preserve">Testbook and POC DOCX output now matches the PDF much more closely: native table of contents (language-aware, auto-populated), each section starts on a new page, embedded images and diagrams (PlantUML/Graphviz rendered), white-on-red table headers, cover version line under the title, centered test case captions, and plain black rules for signature grids.</w:t>
+              <w:t xml:space="preserve">DOCX covers now show the logo, cover text, and version/date/time meta line like the PDF. Test case blocks in DOCX get the PDF’s visual wrapper: red left rule, red field header bars, and red step numbers. Captions follow the PDF ordering system in DOCX, MD, and HTML (Table/Diagram/Figure/Testcase N: with bold symbol). Portuguese PDFs now label diagrams "Diagrama N:" (was hardcoded English "Diagram"). Markdown and HTML output no longer leaks raw LaTeX from passthrough blocks — the DOCX pre-processor now feeds those pipelines too.</w:t>
             </w:r>
           </w:p>
         </w:tc>
@@ -13821,7 +13833,7 @@
               <w:jc w:val="left"/>
             </w:pPr>
             <w:r>
-              <w:t xml:space="preserve">6.4.2</w:t>
+              <w:t xml:space="preserve">6.4.3</w:t>
             </w:r>
           </w:p>
         </w:tc>
@@ -13851,7 +13863,7 @@
               <w:jc w:val="left"/>
             </w:pPr>
             <w:r>
-              <w:t xml:space="preserve">DOCX output for POC and testbook templates now includes all passthrough content (stakeholders, closing record, signatures, test cases, test summary, changelog) via a new pre-processor. Fixed dropped Test Scope fields in testbook DOCX output.</w:t>
+              <w:t xml:space="preserve">Testbook and POC DOCX output now matches the PDF much more closely: native table of contents (language-aware, auto-populated), each section starts on a new page, embedded images and diagrams (PlantUML/Graphviz rendered), white-on-red table headers, cover version line under the title, centered test case captions, and plain black rules for signature grids.</w:t>
             </w:r>
           </w:p>
         </w:tc>
@@ -13864,7 +13876,7 @@
               <w:jc w:val="left"/>
             </w:pPr>
             <w:r>
-              <w:t xml:space="preserve">6.4.0</w:t>
+              <w:t xml:space="preserve">6.4.2</w:t>
             </w:r>
           </w:p>
         </w:tc>
@@ -13890,6 +13902,51 @@
               <w:jc w:val="left"/>
             </w:pPr>
             <w:r>
+              <w:t xml:space="preserve">DOCX output for POC and testbook templates now includes all passthrough content (stakeholders, closing record, signatures, test cases, test summary, changelog) via a new pre-processor. Fixed dropped Test Scope fields in testbook DOCX output.</w:t>
+            </w:r>
+          </w:p>
+        </w:tc>
+      </w:tr>
+      <w:tr>
+        <w:tc>
+          <w:tcPr>
+            <w:shd w:val="clear" w:color="auto" w:fill="F6F8FA"/>
+          </w:tcPr>
+          <w:p>
+            <w:pPr>
+              <w:jc w:val="left"/>
+            </w:pPr>
+            <w:r>
+              <w:t xml:space="preserve">6.4.0</w:t>
+            </w:r>
+          </w:p>
+        </w:tc>
+        <w:tc>
+          <w:tcPr>
+            <w:shd w:val="clear" w:color="auto" w:fill="F6F8FA"/>
+          </w:tcPr>
+          <w:p>
+            <w:pPr>
+              <w:jc w:val="left"/>
+            </w:pPr>
+            <w:r>
+              <w:t xml:space="preserve">2026-09-20</w:t>
+            </w:r>
+          </w:p>
+        </w:tc>
+        <w:tc>
+          <w:tcPr>
+            <w:shd w:val="clear" w:color="auto" w:fill="F6F8FA"/>
+          </w:tcPr>
+          <w:p>
+            <w:pPr>
+              <w:numPr>
+                <w:ilvl w:val="0"/>
+                <w:numId w:val="1055"/>
+              </w:numPr>
+              <w:jc w:val="left"/>
+            </w:pPr>
+            <w:r>
               <w:t xml:space="preserve">Fixed changelog dates — replaced</w:t>
             </w:r>
             <w:r>
@@ -13912,58 +13969,13 @@
       </w:tr>
       <w:tr>
         <w:tc>
-          <w:tcPr>
-            <w:shd w:val="clear" w:color="auto" w:fill="F6F8FA"/>
-          </w:tcPr>
+          <w:tcPr/>
           <w:p>
             <w:pPr>
               <w:jc w:val="left"/>
             </w:pPr>
             <w:r>
               <w:t xml:space="preserve">5.1.1</w:t>
-            </w:r>
-          </w:p>
-        </w:tc>
-        <w:tc>
-          <w:tcPr>
-            <w:shd w:val="clear" w:color="auto" w:fill="F6F8FA"/>
-          </w:tcPr>
-          <w:p>
-            <w:pPr>
-              <w:jc w:val="left"/>
-            </w:pPr>
-            <w:r>
-              <w:t xml:space="preserve">2026-09-14</w:t>
-            </w:r>
-          </w:p>
-        </w:tc>
-        <w:tc>
-          <w:tcPr>
-            <w:shd w:val="clear" w:color="auto" w:fill="F6F8FA"/>
-          </w:tcPr>
-          <w:p>
-            <w:pPr>
-              <w:numPr>
-                <w:ilvl w:val="0"/>
-                <w:numId w:val="1055"/>
-              </w:numPr>
-              <w:jc w:val="left"/>
-            </w:pPr>
-            <w:r>
-              <w:t xml:space="preserve">Synced callout colors in DOCX/HTML/MD output to match brand palette. Added color palette demo.</w:t>
-            </w:r>
-          </w:p>
-        </w:tc>
-      </w:tr>
-      <w:tr>
-        <w:tc>
-          <w:tcPr/>
-          <w:p>
-            <w:pPr>
-              <w:jc w:val="left"/>
-            </w:pPr>
-            <w:r>
-              <w:t xml:space="preserve">5.1.0</w:t>
             </w:r>
           </w:p>
         </w:tc>
@@ -13989,7 +14001,7 @@
               <w:jc w:val="left"/>
             </w:pPr>
             <w:r>
-              <w:t xml:space="preserve">Adopted brand guidelines auxiliary color palette and monochrome scale. Aligned callout colors to brand specifications.</w:t>
+              <w:t xml:space="preserve">Synced callout colors in DOCX/HTML/MD output to match brand palette. Added color palette demo.</w:t>
             </w:r>
           </w:p>
         </w:tc>
@@ -14004,7 +14016,7 @@
               <w:jc w:val="left"/>
             </w:pPr>
             <w:r>
-              <w:t xml:space="preserve">5.0.3</w:t>
+              <w:t xml:space="preserve">5.1.0</w:t>
             </w:r>
           </w:p>
         </w:tc>
@@ -14034,6 +14046,45 @@
               <w:jc w:val="left"/>
             </w:pPr>
             <w:r>
+              <w:t xml:space="preserve">Adopted brand guidelines auxiliary color palette and monochrome scale. Aligned callout colors to brand specifications.</w:t>
+            </w:r>
+          </w:p>
+        </w:tc>
+      </w:tr>
+      <w:tr>
+        <w:tc>
+          <w:tcPr/>
+          <w:p>
+            <w:pPr>
+              <w:jc w:val="left"/>
+            </w:pPr>
+            <w:r>
+              <w:t xml:space="preserve">5.0.3</w:t>
+            </w:r>
+          </w:p>
+        </w:tc>
+        <w:tc>
+          <w:tcPr/>
+          <w:p>
+            <w:pPr>
+              <w:jc w:val="left"/>
+            </w:pPr>
+            <w:r>
+              <w:t xml:space="preserve">2026-09-14</w:t>
+            </w:r>
+          </w:p>
+        </w:tc>
+        <w:tc>
+          <w:tcPr/>
+          <w:p>
+            <w:pPr>
+              <w:numPr>
+                <w:ilvl w:val="0"/>
+                <w:numId w:val="1058"/>
+              </w:numPr>
+              <w:jc w:val="left"/>
+            </w:pPr>
+            <w:r>
               <w:t xml:space="preserve">Removed non-standard</w:t>
             </w:r>
             <w:r>
@@ -14056,54 +14107,15 @@
       </w:tr>
       <w:tr>
         <w:tc>
-          <w:tcPr/>
+          <w:tcPr>
+            <w:shd w:val="clear" w:color="auto" w:fill="F6F8FA"/>
+          </w:tcPr>
           <w:p>
             <w:pPr>
               <w:jc w:val="left"/>
             </w:pPr>
             <w:r>
               <w:t xml:space="preserve">5.0.2</w:t>
-            </w:r>
-          </w:p>
-        </w:tc>
-        <w:tc>
-          <w:tcPr/>
-          <w:p>
-            <w:pPr>
-              <w:jc w:val="left"/>
-            </w:pPr>
-            <w:r>
-              <w:t xml:space="preserve">2026-09-14</w:t>
-            </w:r>
-          </w:p>
-        </w:tc>
-        <w:tc>
-          <w:tcPr/>
-          <w:p>
-            <w:pPr>
-              <w:numPr>
-                <w:ilvl w:val="0"/>
-                <w:numId w:val="1058"/>
-              </w:numPr>
-              <w:jc w:val="left"/>
-            </w:pPr>
-            <w:r>
-              <w:t xml:space="preserve">Long commands in test steps now render as code blocks instead of inline code.</w:t>
-            </w:r>
-          </w:p>
-        </w:tc>
-      </w:tr>
-      <w:tr>
-        <w:tc>
-          <w:tcPr>
-            <w:shd w:val="clear" w:color="auto" w:fill="F6F8FA"/>
-          </w:tcPr>
-          <w:p>
-            <w:pPr>
-              <w:jc w:val="left"/>
-            </w:pPr>
-            <w:r>
-              <w:t xml:space="preserve">5.0.1</w:t>
             </w:r>
           </w:p>
         </w:tc>
@@ -14133,7 +14145,7 @@
               <w:jc w:val="left"/>
             </w:pPr>
             <w:r>
-              <w:t xml:space="preserve">Testcase caption centered above the block.</w:t>
+              <w:t xml:space="preserve">Long commands in test steps now render as code blocks instead of inline code.</w:t>
             </w:r>
           </w:p>
         </w:tc>
@@ -14146,7 +14158,7 @@
               <w:jc w:val="left"/>
             </w:pPr>
             <w:r>
-              <w:t xml:space="preserve">5.0.0</w:t>
+              <w:t xml:space="preserve">5.0.1</w:t>
             </w:r>
           </w:p>
         </w:tc>
@@ -14172,6 +14184,51 @@
               <w:jc w:val="left"/>
             </w:pPr>
             <w:r>
+              <w:t xml:space="preserve">Testcase caption centered above the block.</w:t>
+            </w:r>
+          </w:p>
+        </w:tc>
+      </w:tr>
+      <w:tr>
+        <w:tc>
+          <w:tcPr>
+            <w:shd w:val="clear" w:color="auto" w:fill="F6F8FA"/>
+          </w:tcPr>
+          <w:p>
+            <w:pPr>
+              <w:jc w:val="left"/>
+            </w:pPr>
+            <w:r>
+              <w:t xml:space="preserve">5.0.0</w:t>
+            </w:r>
+          </w:p>
+        </w:tc>
+        <w:tc>
+          <w:tcPr>
+            <w:shd w:val="clear" w:color="auto" w:fill="F6F8FA"/>
+          </w:tcPr>
+          <w:p>
+            <w:pPr>
+              <w:jc w:val="left"/>
+            </w:pPr>
+            <w:r>
+              <w:t xml:space="preserve">2026-09-14</w:t>
+            </w:r>
+          </w:p>
+        </w:tc>
+        <w:tc>
+          <w:tcPr>
+            <w:shd w:val="clear" w:color="auto" w:fill="F6F8FA"/>
+          </w:tcPr>
+          <w:p>
+            <w:pPr>
+              <w:numPr>
+                <w:ilvl w:val="0"/>
+                <w:numId w:val="1061"/>
+              </w:numPr>
+              <w:jc w:val="left"/>
+            </w:pPr>
+            <w:r>
               <w:t xml:space="preserve">Major refactoring: extracted shared modules (huawei-titles, huawei-toc, huawei-cover), renamed</w:t>
             </w:r>
             <w:r>
@@ -14233,9 +14290,7 @@
       </w:tr>
       <w:tr>
         <w:tc>
-          <w:tcPr>
-            <w:shd w:val="clear" w:color="auto" w:fill="F6F8FA"/>
-          </w:tcPr>
+          <w:tcPr/>
           <w:p>
             <w:pPr>
               <w:jc w:val="left"/>
@@ -14246,56 +14301,13 @@
           </w:p>
         </w:tc>
         <w:tc>
-          <w:tcPr>
-            <w:shd w:val="clear" w:color="auto" w:fill="F6F8FA"/>
-          </w:tcPr>
+          <w:tcPr/>
           <w:p>
             <w:pPr>
               <w:jc w:val="left"/>
             </w:pPr>
             <w:r>
               <w:t xml:space="preserve">2026-09-14</w:t>
-            </w:r>
-          </w:p>
-        </w:tc>
-        <w:tc>
-          <w:tcPr>
-            <w:shd w:val="clear" w:color="auto" w:fill="F6F8FA"/>
-          </w:tcPr>
-          <w:p>
-            <w:pPr>
-              <w:numPr>
-                <w:ilvl w:val="0"/>
-                <w:numId w:val="1061"/>
-              </w:numPr>
-              <w:jc w:val="left"/>
-            </w:pPr>
-            <w:r>
-              <w:t xml:space="preserve">Testcase headings now formatted as captions (like figures/tables): bold “Testcase N:” followed by description. Changed label from “Test Case” to “Testcase”.</w:t>
-            </w:r>
-          </w:p>
-        </w:tc>
-      </w:tr>
-      <w:tr>
-        <w:tc>
-          <w:tcPr/>
-          <w:p>
-            <w:pPr>
-              <w:jc w:val="left"/>
-            </w:pPr>
-            <w:r>
-              <w:t xml:space="preserve">4.6.0</w:t>
-            </w:r>
-          </w:p>
-        </w:tc>
-        <w:tc>
-          <w:tcPr/>
-          <w:p>
-            <w:pPr>
-              <w:jc w:val="left"/>
-            </w:pPr>
-            <w:r>
-              <w:t xml:space="preserve">2026-09-13</w:t>
             </w:r>
           </w:p>
         </w:tc>
@@ -14310,7 +14322,7 @@
               <w:jc w:val="left"/>
             </w:pPr>
             <w:r>
-              <w:t xml:space="preserve">Section restructure: Introduction, Test Cases (with category subsections), Conclusion. Testcases auto-numbered like figures/tables. Changed testcase from subsection to subsubsection.</w:t>
+              <w:t xml:space="preserve">Testcase headings now formatted as captions (like figures/tables): bold “Testcase N:” followed by description. Changed label from “Test Case” to “Testcase”.</w:t>
             </w:r>
           </w:p>
         </w:tc>
@@ -14325,7 +14337,7 @@
               <w:jc w:val="left"/>
             </w:pPr>
             <w:r>
-              <w:t xml:space="preserve">4.5.0</w:t>
+              <w:t xml:space="preserve">4.6.0</w:t>
             </w:r>
           </w:p>
         </w:tc>
@@ -14355,6 +14367,45 @@
               <w:jc w:val="left"/>
             </w:pPr>
             <w:r>
+              <w:t xml:space="preserve">Section restructure: Introduction, Test Cases (with category subsections), Conclusion. Testcases auto-numbered like figures/tables. Changed testcase from subsection to subsubsection.</w:t>
+            </w:r>
+          </w:p>
+        </w:tc>
+      </w:tr>
+      <w:tr>
+        <w:tc>
+          <w:tcPr/>
+          <w:p>
+            <w:pPr>
+              <w:jc w:val="left"/>
+            </w:pPr>
+            <w:r>
+              <w:t xml:space="preserve">4.5.0</w:t>
+            </w:r>
+          </w:p>
+        </w:tc>
+        <w:tc>
+          <w:tcPr/>
+          <w:p>
+            <w:pPr>
+              <w:jc w:val="left"/>
+            </w:pPr>
+            <w:r>
+              <w:t xml:space="preserve">2026-09-13</w:t>
+            </w:r>
+          </w:p>
+        </w:tc>
+        <w:tc>
+          <w:tcPr/>
+          <w:p>
+            <w:pPr>
+              <w:numPr>
+                <w:ilvl w:val="0"/>
+                <w:numId w:val="1064"/>
+              </w:numPr>
+              <w:jc w:val="left"/>
+            </w:pPr>
+            <w:r>
               <w:t xml:space="preserve">Unified field APIs:</w:t>
             </w:r>
             <w:r>
@@ -14419,54 +14470,15 @@
       </w:tr>
       <w:tr>
         <w:tc>
-          <w:tcPr/>
+          <w:tcPr>
+            <w:shd w:val="clear" w:color="auto" w:fill="F6F8FA"/>
+          </w:tcPr>
           <w:p>
             <w:pPr>
               <w:jc w:val="left"/>
             </w:pPr>
             <w:r>
               <w:t xml:space="preserve">4.4.0</w:t>
-            </w:r>
-          </w:p>
-        </w:tc>
-        <w:tc>
-          <w:tcPr/>
-          <w:p>
-            <w:pPr>
-              <w:jc w:val="left"/>
-            </w:pPr>
-            <w:r>
-              <w:t xml:space="preserve">2026-09-13</w:t>
-            </w:r>
-          </w:p>
-        </w:tc>
-        <w:tc>
-          <w:tcPr/>
-          <w:p>
-            <w:pPr>
-              <w:numPr>
-                <w:ilvl w:val="0"/>
-                <w:numId w:val="1064"/>
-              </w:numPr>
-              <w:jc w:val="left"/>
-            </w:pPr>
-            <w:r>
-              <w:t xml:space="preserve">Code review fixes: removed dead labels, badge now uses Huawei brand colors (tipbg/tipfg, huaweired, warningbg/warningfg), Lua filter preserves formatting in DOCX/MD/HTML via parse_latex_blocks, testprocedure handler preserves non-step content (images, code, callouts).</w:t>
-            </w:r>
-          </w:p>
-        </w:tc>
-      </w:tr>
-      <w:tr>
-        <w:tc>
-          <w:tcPr>
-            <w:shd w:val="clear" w:color="auto" w:fill="F6F8FA"/>
-          </w:tcPr>
-          <w:p>
-            <w:pPr>
-              <w:jc w:val="left"/>
-            </w:pPr>
-            <w:r>
-              <w:t xml:space="preserve">4.3.0</w:t>
             </w:r>
           </w:p>
         </w:tc>
@@ -14496,6 +14508,45 @@
               <w:jc w:val="left"/>
             </w:pPr>
             <w:r>
+              <w:t xml:space="preserve">Code review fixes: removed dead labels, badge now uses Huawei brand colors (tipbg/tipfg, huaweired, warningbg/warningfg), Lua filter preserves formatting in DOCX/MD/HTML via parse_latex_blocks, testprocedure handler preserves non-step content (images, code, callouts).</w:t>
+            </w:r>
+          </w:p>
+        </w:tc>
+      </w:tr>
+      <w:tr>
+        <w:tc>
+          <w:tcPr/>
+          <w:p>
+            <w:pPr>
+              <w:jc w:val="left"/>
+            </w:pPr>
+            <w:r>
+              <w:t xml:space="preserve">4.3.0</w:t>
+            </w:r>
+          </w:p>
+        </w:tc>
+        <w:tc>
+          <w:tcPr/>
+          <w:p>
+            <w:pPr>
+              <w:jc w:val="left"/>
+            </w:pPr>
+            <w:r>
+              <w:t xml:space="preserve">2026-09-13</w:t>
+            </w:r>
+          </w:p>
+        </w:tc>
+        <w:tc>
+          <w:tcPr/>
+          <w:p>
+            <w:pPr>
+              <w:numPr>
+                <w:ilvl w:val="0"/>
+                <w:numId w:val="1066"/>
+              </w:numPr>
+              <w:jc w:val="left"/>
+            </w:pPr>
+            <w:r>
               <w:t xml:space="preserve">Added</w:t>
             </w:r>
             <w:r>
@@ -14548,7 +14599,9 @@
       </w:tr>
       <w:tr>
         <w:tc>
-          <w:tcPr/>
+          <w:tcPr>
+            <w:shd w:val="clear" w:color="auto" w:fill="F6F8FA"/>
+          </w:tcPr>
           <w:p>
             <w:pPr>
               <w:jc w:val="left"/>
@@ -14559,7 +14612,9 @@
           </w:p>
         </w:tc>
         <w:tc>
-          <w:tcPr/>
+          <w:tcPr>
+            <w:shd w:val="clear" w:color="auto" w:fill="F6F8FA"/>
+          </w:tcPr>
           <w:p>
             <w:pPr>
               <w:jc w:val="left"/>
@@ -14570,12 +14625,14 @@
           </w:p>
         </w:tc>
         <w:tc>
-          <w:tcPr/>
+          <w:tcPr>
+            <w:shd w:val="clear" w:color="auto" w:fill="F6F8FA"/>
+          </w:tcPr>
           <w:p>
             <w:pPr>
               <w:numPr>
                 <w:ilvl w:val="0"/>
-                <w:numId w:val="1066"/>
+                <w:numId w:val="1067"/>
               </w:numPr>
               <w:jc w:val="left"/>
             </w:pPr>
@@ -14629,9 +14686,7 @@
       </w:tr>
       <w:tr>
         <w:tc>
-          <w:tcPr>
-            <w:shd w:val="clear" w:color="auto" w:fill="F6F8FA"/>
-          </w:tcPr>
+          <w:tcPr/>
           <w:p>
             <w:pPr>
               <w:jc w:val="left"/>
@@ -14642,9 +14697,7 @@
           </w:p>
         </w:tc>
         <w:tc>
-          <w:tcPr>
-            <w:shd w:val="clear" w:color="auto" w:fill="F6F8FA"/>
-          </w:tcPr>
+          <w:tcPr/>
           <w:p>
             <w:pPr>
               <w:jc w:val="left"/>
@@ -14655,14 +14708,12 @@
           </w:p>
         </w:tc>
         <w:tc>
-          <w:tcPr>
-            <w:shd w:val="clear" w:color="auto" w:fill="F6F8FA"/>
-          </w:tcPr>
+          <w:tcPr/>
           <w:p>
             <w:pPr>
               <w:numPr>
                 <w:ilvl w:val="0"/>
-                <w:numId w:val="1067"/>
+                <w:numId w:val="1068"/>
               </w:numPr>
               <w:jc w:val="left"/>
             </w:pPr>
@@ -14689,7 +14740,9 @@
       </w:tr>
       <w:tr>
         <w:tc>
-          <w:tcPr/>
+          <w:tcPr>
+            <w:shd w:val="clear" w:color="auto" w:fill="F6F8FA"/>
+          </w:tcPr>
           <w:p>
             <w:pPr>
               <w:jc w:val="left"/>
@@ -14700,7 +14753,9 @@
           </w:p>
         </w:tc>
         <w:tc>
-          <w:tcPr/>
+          <w:tcPr>
+            <w:shd w:val="clear" w:color="auto" w:fill="F6F8FA"/>
+          </w:tcPr>
           <w:p>
             <w:pPr>
               <w:jc w:val="left"/>
@@ -14711,12 +14766,14 @@
           </w:p>
         </w:tc>
         <w:tc>
-          <w:tcPr/>
+          <w:tcPr>
+            <w:shd w:val="clear" w:color="auto" w:fill="F6F8FA"/>
+          </w:tcPr>
           <w:p>
             <w:pPr>
               <w:numPr>
                 <w:ilvl w:val="0"/>
-                <w:numId w:val="1068"/>
+                <w:numId w:val="1069"/>
               </w:numPr>
               <w:jc w:val="left"/>
             </w:pPr>
@@ -14758,9 +14815,7 @@
       </w:tr>
       <w:tr>
         <w:tc>
-          <w:tcPr>
-            <w:shd w:val="clear" w:color="auto" w:fill="F6F8FA"/>
-          </w:tcPr>
+          <w:tcPr/>
           <w:p>
             <w:pPr>
               <w:jc w:val="left"/>
@@ -14771,9 +14826,7 @@
           </w:p>
         </w:tc>
         <w:tc>
-          <w:tcPr>
-            <w:shd w:val="clear" w:color="auto" w:fill="F6F8FA"/>
-          </w:tcPr>
+          <w:tcPr/>
           <w:p>
             <w:pPr>
               <w:jc w:val="left"/>
@@ -14784,14 +14837,12 @@
           </w:p>
         </w:tc>
         <w:tc>
-          <w:tcPr>
-            <w:shd w:val="clear" w:color="auto" w:fill="F6F8FA"/>
-          </w:tcPr>
+          <w:tcPr/>
           <w:p>
             <w:pPr>
               <w:numPr>
                 <w:ilvl w:val="0"/>
-                <w:numId w:val="1069"/>
+                <w:numId w:val="1070"/>
               </w:numPr>
               <w:jc w:val="left"/>
             </w:pPr>
@@ -14818,54 +14869,15 @@
       </w:tr>
       <w:tr>
         <w:tc>
-          <w:tcPr/>
+          <w:tcPr>
+            <w:shd w:val="clear" w:color="auto" w:fill="F6F8FA"/>
+          </w:tcPr>
           <w:p>
             <w:pPr>
               <w:jc w:val="left"/>
             </w:pPr>
             <w:r>
               <w:t xml:space="preserve">3.8.1</w:t>
-            </w:r>
-          </w:p>
-        </w:tc>
-        <w:tc>
-          <w:tcPr/>
-          <w:p>
-            <w:pPr>
-              <w:jc w:val="left"/>
-            </w:pPr>
-            <w:r>
-              <w:t xml:space="preserve">2026-09-13</w:t>
-            </w:r>
-          </w:p>
-        </w:tc>
-        <w:tc>
-          <w:tcPr/>
-          <w:p>
-            <w:pPr>
-              <w:numPr>
-                <w:ilvl w:val="0"/>
-                <w:numId w:val="1070"/>
-              </w:numPr>
-              <w:jc w:val="left"/>
-            </w:pPr>
-            <w:r>
-              <w:t xml:space="preserve">End-to-end quality review: fixed testbook PDF metadata title, removed stray user DOCX from template dir, fixed round-trip.sh variable typo, updated stale references in AGENTS.md and README.md, committed testbook sample PDFs, set TZ for pandoc cover time consistency, widened pandoc version range.</w:t>
-            </w:r>
-          </w:p>
-        </w:tc>
-      </w:tr>
-      <w:tr>
-        <w:tc>
-          <w:tcPr>
-            <w:shd w:val="clear" w:color="auto" w:fill="F6F8FA"/>
-          </w:tcPr>
-          <w:p>
-            <w:pPr>
-              <w:jc w:val="left"/>
-            </w:pPr>
-            <w:r>
-              <w:t xml:space="preserve">3.8.0</w:t>
             </w:r>
           </w:p>
         </w:tc>
@@ -14895,7 +14907,7 @@
               <w:jc w:val="left"/>
             </w:pPr>
             <w:r>
-              <w:t xml:space="preserve">Removed Tips and Tricks chapter (tmux configuration) — required VS Code-specific keybindings that don’t generalize across terminal setups.</w:t>
+              <w:t xml:space="preserve">End-to-end quality review: fixed testbook PDF metadata title, removed stray user DOCX from template dir, fixed round-trip.sh variable typo, updated stale references in AGENTS.md and README.md, committed testbook sample PDFs, set TZ for pandoc cover time consistency, widened pandoc version range.</w:t>
             </w:r>
           </w:p>
         </w:tc>
@@ -14908,18 +14920,18 @@
               <w:jc w:val="left"/>
             </w:pPr>
             <w:r>
-              <w:t xml:space="preserve">3.7.0</w:t>
-            </w:r>
-          </w:p>
-        </w:tc>
-        <w:tc>
-          <w:tcPr/>
-          <w:p>
-            <w:pPr>
-              <w:jc w:val="left"/>
-            </w:pPr>
-            <w:r>
-              <w:t xml:space="preserve">2026-09-12</w:t>
+              <w:t xml:space="preserve">3.8.0</w:t>
+            </w:r>
+          </w:p>
+        </w:tc>
+        <w:tc>
+          <w:tcPr/>
+          <w:p>
+            <w:pPr>
+              <w:jc w:val="left"/>
+            </w:pPr>
+            <w:r>
+              <w:t xml:space="preserve">2026-09-13</w:t>
             </w:r>
           </w:p>
         </w:tc>
@@ -14934,6 +14946,51 @@
               <w:jc w:val="left"/>
             </w:pPr>
             <w:r>
+              <w:t xml:space="preserve">Removed Tips and Tricks chapter (tmux configuration) — required VS Code-specific keybindings that don’t generalize across terminal setups.</w:t>
+            </w:r>
+          </w:p>
+        </w:tc>
+      </w:tr>
+      <w:tr>
+        <w:tc>
+          <w:tcPr>
+            <w:shd w:val="clear" w:color="auto" w:fill="F6F8FA"/>
+          </w:tcPr>
+          <w:p>
+            <w:pPr>
+              <w:jc w:val="left"/>
+            </w:pPr>
+            <w:r>
+              <w:t xml:space="preserve">3.7.0</w:t>
+            </w:r>
+          </w:p>
+        </w:tc>
+        <w:tc>
+          <w:tcPr>
+            <w:shd w:val="clear" w:color="auto" w:fill="F6F8FA"/>
+          </w:tcPr>
+          <w:p>
+            <w:pPr>
+              <w:jc w:val="left"/>
+            </w:pPr>
+            <w:r>
+              <w:t xml:space="preserve">2026-09-12</w:t>
+            </w:r>
+          </w:p>
+        </w:tc>
+        <w:tc>
+          <w:tcPr>
+            <w:shd w:val="clear" w:color="auto" w:fill="F6F8FA"/>
+          </w:tcPr>
+          <w:p>
+            <w:pPr>
+              <w:numPr>
+                <w:ilvl w:val="0"/>
+                <w:numId w:val="1073"/>
+              </w:numPr>
+              <w:jc w:val="left"/>
+            </w:pPr>
+            <w:r>
               <w:t xml:space="preserve">Added</w:t>
             </w:r>
             <w:r>
@@ -14986,9 +15043,7 @@
       </w:tr>
       <w:tr>
         <w:tc>
-          <w:tcPr>
-            <w:shd w:val="clear" w:color="auto" w:fill="F6F8FA"/>
-          </w:tcPr>
+          <w:tcPr/>
           <w:p>
             <w:pPr>
               <w:jc w:val="left"/>
@@ -14999,9 +15054,7 @@
           </w:p>
         </w:tc>
         <w:tc>
-          <w:tcPr>
-            <w:shd w:val="clear" w:color="auto" w:fill="F6F8FA"/>
-          </w:tcPr>
+          <w:tcPr/>
           <w:p>
             <w:pPr>
               <w:jc w:val="left"/>
@@ -15012,14 +15065,12 @@
           </w:p>
         </w:tc>
         <w:tc>
-          <w:tcPr>
-            <w:shd w:val="clear" w:color="auto" w:fill="F6F8FA"/>
-          </w:tcPr>
+          <w:tcPr/>
           <w:p>
             <w:pPr>
               <w:numPr>
                 <w:ilvl w:val="0"/>
-                <w:numId w:val="1073"/>
+                <w:numId w:val="1074"/>
               </w:numPr>
               <w:jc w:val="left"/>
             </w:pPr>
@@ -15076,7 +15127,9 @@
       </w:tr>
       <w:tr>
         <w:tc>
-          <w:tcPr/>
+          <w:tcPr>
+            <w:shd w:val="clear" w:color="auto" w:fill="F6F8FA"/>
+          </w:tcPr>
           <w:p>
             <w:pPr>
               <w:jc w:val="left"/>
@@ -15087,7 +15140,9 @@
           </w:p>
         </w:tc>
         <w:tc>
-          <w:tcPr/>
+          <w:tcPr>
+            <w:shd w:val="clear" w:color="auto" w:fill="F6F8FA"/>
+          </w:tcPr>
           <w:p>
             <w:pPr>
               <w:jc w:val="left"/>
@@ -15098,12 +15153,14 @@
           </w:p>
         </w:tc>
         <w:tc>
-          <w:tcPr/>
+          <w:tcPr>
+            <w:shd w:val="clear" w:color="auto" w:fill="F6F8FA"/>
+          </w:tcPr>
           <w:p>
             <w:pPr>
               <w:numPr>
                 <w:ilvl w:val="0"/>
-                <w:numId w:val="1074"/>
+                <w:numId w:val="1075"/>
               </w:numPr>
               <w:jc w:val="left"/>
             </w:pPr>
@@ -15181,9 +15238,7 @@
       </w:tr>
       <w:tr>
         <w:tc>
-          <w:tcPr>
-            <w:shd w:val="clear" w:color="auto" w:fill="F6F8FA"/>
-          </w:tcPr>
+          <w:tcPr/>
           <w:p>
             <w:pPr>
               <w:jc w:val="left"/>
@@ -15194,9 +15249,7 @@
           </w:p>
         </w:tc>
         <w:tc>
-          <w:tcPr>
-            <w:shd w:val="clear" w:color="auto" w:fill="F6F8FA"/>
-          </w:tcPr>
+          <w:tcPr/>
           <w:p>
             <w:pPr>
               <w:jc w:val="left"/>
@@ -15207,14 +15260,12 @@
           </w:p>
         </w:tc>
         <w:tc>
-          <w:tcPr>
-            <w:shd w:val="clear" w:color="auto" w:fill="F6F8FA"/>
-          </w:tcPr>
+          <w:tcPr/>
           <w:p>
             <w:pPr>
               <w:numPr>
                 <w:ilvl w:val="0"/>
-                <w:numId w:val="1075"/>
+                <w:numId w:val="1076"/>
               </w:numPr>
               <w:jc w:val="left"/>
             </w:pPr>
@@ -15241,7 +15292,7 @@
             <w:pPr>
               <w:numPr>
                 <w:ilvl w:val="0"/>
-                <w:numId w:val="1075"/>
+                <w:numId w:val="1076"/>
               </w:numPr>
               <w:jc w:val="left"/>
             </w:pPr>
@@ -15283,7 +15334,7 @@
             <w:pPr>
               <w:numPr>
                 <w:ilvl w:val="0"/>
-                <w:numId w:val="1075"/>
+                <w:numId w:val="1076"/>
               </w:numPr>
               <w:jc w:val="left"/>
             </w:pPr>
@@ -15295,7 +15346,9 @@
       </w:tr>
       <w:tr>
         <w:tc>
-          <w:tcPr/>
+          <w:tcPr>
+            <w:shd w:val="clear" w:color="auto" w:fill="F6F8FA"/>
+          </w:tcPr>
           <w:p>
             <w:pPr>
               <w:jc w:val="left"/>
@@ -15306,7 +15359,9 @@
           </w:p>
         </w:tc>
         <w:tc>
-          <w:tcPr/>
+          <w:tcPr>
+            <w:shd w:val="clear" w:color="auto" w:fill="F6F8FA"/>
+          </w:tcPr>
           <w:p>
             <w:pPr>
               <w:jc w:val="left"/>
@@ -15317,12 +15372,14 @@
           </w:p>
         </w:tc>
         <w:tc>
-          <w:tcPr/>
+          <w:tcPr>
+            <w:shd w:val="clear" w:color="auto" w:fill="F6F8FA"/>
+          </w:tcPr>
           <w:p>
             <w:pPr>
               <w:numPr>
                 <w:ilvl w:val="0"/>
-                <w:numId w:val="1076"/>
+                <w:numId w:val="1077"/>
               </w:numPr>
               <w:jc w:val="left"/>
             </w:pPr>
@@ -15349,7 +15406,7 @@
             <w:pPr>
               <w:numPr>
                 <w:ilvl w:val="0"/>
-                <w:numId w:val="1076"/>
+                <w:numId w:val="1077"/>
               </w:numPr>
               <w:jc w:val="left"/>
             </w:pPr>
@@ -15376,7 +15433,7 @@
             <w:pPr>
               <w:numPr>
                 <w:ilvl w:val="0"/>
-                <w:numId w:val="1076"/>
+                <w:numId w:val="1077"/>
               </w:numPr>
               <w:jc w:val="left"/>
             </w:pPr>
@@ -15388,7 +15445,7 @@
             <w:pPr>
               <w:numPr>
                 <w:ilvl w:val="0"/>
-                <w:numId w:val="1076"/>
+                <w:numId w:val="1077"/>
               </w:numPr>
               <w:jc w:val="left"/>
             </w:pPr>
@@ -15412,58 +15469,13 @@
       </w:tr>
       <w:tr>
         <w:tc>
-          <w:tcPr>
-            <w:shd w:val="clear" w:color="auto" w:fill="F6F8FA"/>
-          </w:tcPr>
+          <w:tcPr/>
           <w:p>
             <w:pPr>
               <w:jc w:val="left"/>
             </w:pPr>
             <w:r>
               <w:t xml:space="preserve">3.2.1</w:t>
-            </w:r>
-          </w:p>
-        </w:tc>
-        <w:tc>
-          <w:tcPr>
-            <w:shd w:val="clear" w:color="auto" w:fill="F6F8FA"/>
-          </w:tcPr>
-          <w:p>
-            <w:pPr>
-              <w:jc w:val="left"/>
-            </w:pPr>
-            <w:r>
-              <w:t xml:space="preserve">2026-09-11</w:t>
-            </w:r>
-          </w:p>
-        </w:tc>
-        <w:tc>
-          <w:tcPr>
-            <w:shd w:val="clear" w:color="auto" w:fill="F6F8FA"/>
-          </w:tcPr>
-          <w:p>
-            <w:pPr>
-              <w:numPr>
-                <w:ilvl w:val="0"/>
-                <w:numId w:val="1077"/>
-              </w:numPr>
-              <w:jc w:val="left"/>
-            </w:pPr>
-            <w:r>
-              <w:t xml:space="preserve">Renamed Chapter 7 from “Clean Up” to “Operations and Maintenance”. Added subsections for updating and uninstalling both the MaaS Gateway and the document templates. Added cloud resource cleanup as an optional subsection.</w:t>
-            </w:r>
-          </w:p>
-        </w:tc>
-      </w:tr>
-      <w:tr>
-        <w:tc>
-          <w:tcPr/>
-          <w:p>
-            <w:pPr>
-              <w:jc w:val="left"/>
-            </w:pPr>
-            <w:r>
-              <w:t xml:space="preserve">3.2.0</w:t>
             </w:r>
           </w:p>
         </w:tc>
@@ -15489,6 +15501,51 @@
               <w:jc w:val="left"/>
             </w:pPr>
             <w:r>
+              <w:t xml:space="preserve">Renamed Chapter 7 from “Clean Up” to “Operations and Maintenance”. Added subsections for updating and uninstalling both the MaaS Gateway and the document templates. Added cloud resource cleanup as an optional subsection.</w:t>
+            </w:r>
+          </w:p>
+        </w:tc>
+      </w:tr>
+      <w:tr>
+        <w:tc>
+          <w:tcPr>
+            <w:shd w:val="clear" w:color="auto" w:fill="F6F8FA"/>
+          </w:tcPr>
+          <w:p>
+            <w:pPr>
+              <w:jc w:val="left"/>
+            </w:pPr>
+            <w:r>
+              <w:t xml:space="preserve">3.2.0</w:t>
+            </w:r>
+          </w:p>
+        </w:tc>
+        <w:tc>
+          <w:tcPr>
+            <w:shd w:val="clear" w:color="auto" w:fill="F6F8FA"/>
+          </w:tcPr>
+          <w:p>
+            <w:pPr>
+              <w:jc w:val="left"/>
+            </w:pPr>
+            <w:r>
+              <w:t xml:space="preserve">2026-09-11</w:t>
+            </w:r>
+          </w:p>
+        </w:tc>
+        <w:tc>
+          <w:tcPr>
+            <w:shd w:val="clear" w:color="auto" w:fill="F6F8FA"/>
+          </w:tcPr>
+          <w:p>
+            <w:pPr>
+              <w:numPr>
+                <w:ilvl w:val="0"/>
+                <w:numId w:val="1079"/>
+              </w:numPr>
+              <w:jc w:val="left"/>
+            </w:pPr>
+            <w:r>
               <w:t xml:space="preserve">Added</w:t>
             </w:r>
             <w:r>
@@ -15550,7 +15607,7 @@
             <w:pPr>
               <w:numPr>
                 <w:ilvl w:val="0"/>
-                <w:numId w:val="1078"/>
+                <w:numId w:val="1079"/>
               </w:numPr>
               <w:jc w:val="left"/>
             </w:pPr>
@@ -15595,7 +15652,7 @@
             <w:pPr>
               <w:numPr>
                 <w:ilvl w:val="0"/>
-                <w:numId w:val="1078"/>
+                <w:numId w:val="1079"/>
               </w:numPr>
               <w:jc w:val="left"/>
             </w:pPr>
@@ -15607,58 +15664,13 @@
       </w:tr>
       <w:tr>
         <w:tc>
-          <w:tcPr>
-            <w:shd w:val="clear" w:color="auto" w:fill="F6F8FA"/>
-          </w:tcPr>
+          <w:tcPr/>
           <w:p>
             <w:pPr>
               <w:jc w:val="left"/>
             </w:pPr>
             <w:r>
               <w:t xml:space="preserve">3.1.2</w:t>
-            </w:r>
-          </w:p>
-        </w:tc>
-        <w:tc>
-          <w:tcPr>
-            <w:shd w:val="clear" w:color="auto" w:fill="F6F8FA"/>
-          </w:tcPr>
-          <w:p>
-            <w:pPr>
-              <w:jc w:val="left"/>
-            </w:pPr>
-            <w:r>
-              <w:t xml:space="preserve">2026-09-11</w:t>
-            </w:r>
-          </w:p>
-        </w:tc>
-        <w:tc>
-          <w:tcPr>
-            <w:shd w:val="clear" w:color="auto" w:fill="F6F8FA"/>
-          </w:tcPr>
-          <w:p>
-            <w:pPr>
-              <w:numPr>
-                <w:ilvl w:val="0"/>
-                <w:numId w:val="1079"/>
-              </w:numPr>
-              <w:jc w:val="left"/>
-            </w:pPr>
-            <w:r>
-              <w:t xml:space="preserve">Added output format guide to README.md: comparison table of PDF, Markdown, DOCX, and HTML with purpose, copy-paste quality, and limitations. Recommends Markdown for copy-paste.</w:t>
-            </w:r>
-          </w:p>
-        </w:tc>
-      </w:tr>
-      <w:tr>
-        <w:tc>
-          <w:tcPr/>
-          <w:p>
-            <w:pPr>
-              <w:jc w:val="left"/>
-            </w:pPr>
-            <w:r>
-              <w:t xml:space="preserve">3.1.1</w:t>
             </w:r>
           </w:p>
         </w:tc>
@@ -15684,6 +15696,51 @@
               <w:jc w:val="left"/>
             </w:pPr>
             <w:r>
+              <w:t xml:space="preserve">Added output format guide to README.md: comparison table of PDF, Markdown, DOCX, and HTML with purpose, copy-paste quality, and limitations. Recommends Markdown for copy-paste.</w:t>
+            </w:r>
+          </w:p>
+        </w:tc>
+      </w:tr>
+      <w:tr>
+        <w:tc>
+          <w:tcPr>
+            <w:shd w:val="clear" w:color="auto" w:fill="F6F8FA"/>
+          </w:tcPr>
+          <w:p>
+            <w:pPr>
+              <w:jc w:val="left"/>
+            </w:pPr>
+            <w:r>
+              <w:t xml:space="preserve">3.1.1</w:t>
+            </w:r>
+          </w:p>
+        </w:tc>
+        <w:tc>
+          <w:tcPr>
+            <w:shd w:val="clear" w:color="auto" w:fill="F6F8FA"/>
+          </w:tcPr>
+          <w:p>
+            <w:pPr>
+              <w:jc w:val="left"/>
+            </w:pPr>
+            <w:r>
+              <w:t xml:space="preserve">2026-09-11</w:t>
+            </w:r>
+          </w:p>
+        </w:tc>
+        <w:tc>
+          <w:tcPr>
+            <w:shd w:val="clear" w:color="auto" w:fill="F6F8FA"/>
+          </w:tcPr>
+          <w:p>
+            <w:pPr>
+              <w:numPr>
+                <w:ilvl w:val="0"/>
+                <w:numId w:val="1081"/>
+              </w:numPr>
+              <w:jc w:val="left"/>
+            </w:pPr>
+            <w:r>
               <w:t xml:space="preserve">Updated MaaS Gateway chapter to v1.10.9: non-interactive mode (</w:t>
             </w:r>
             <w:r>
@@ -15700,7 +15757,7 @@
             <w:pPr>
               <w:numPr>
                 <w:ilvl w:val="0"/>
-                <w:numId w:val="1080"/>
+                <w:numId w:val="1081"/>
               </w:numPr>
               <w:jc w:val="left"/>
             </w:pPr>
@@ -15742,7 +15799,7 @@
             <w:pPr>
               <w:numPr>
                 <w:ilvl w:val="0"/>
-                <w:numId w:val="1080"/>
+                <w:numId w:val="1081"/>
               </w:numPr>
               <w:jc w:val="left"/>
             </w:pPr>
@@ -15754,9 +15811,7 @@
       </w:tr>
       <w:tr>
         <w:tc>
-          <w:tcPr>
-            <w:shd w:val="clear" w:color="auto" w:fill="F6F8FA"/>
-          </w:tcPr>
+          <w:tcPr/>
           <w:p>
             <w:pPr>
               <w:jc w:val="left"/>
@@ -15767,9 +15822,7 @@
           </w:p>
         </w:tc>
         <w:tc>
-          <w:tcPr>
-            <w:shd w:val="clear" w:color="auto" w:fill="F6F8FA"/>
-          </w:tcPr>
+          <w:tcPr/>
           <w:p>
             <w:pPr>
               <w:jc w:val="left"/>
@@ -15780,14 +15833,12 @@
           </w:p>
         </w:tc>
         <w:tc>
-          <w:tcPr>
-            <w:shd w:val="clear" w:color="auto" w:fill="F6F8FA"/>
-          </w:tcPr>
+          <w:tcPr/>
           <w:p>
             <w:pPr>
               <w:numPr>
                 <w:ilvl w:val="0"/>
-                <w:numId w:val="1081"/>
+                <w:numId w:val="1082"/>
               </w:numPr>
               <w:jc w:val="left"/>
             </w:pPr>
@@ -15811,7 +15862,7 @@
             <w:pPr>
               <w:numPr>
                 <w:ilvl w:val="0"/>
-                <w:numId w:val="1081"/>
+                <w:numId w:val="1082"/>
               </w:numPr>
               <w:jc w:val="left"/>
             </w:pPr>
@@ -15853,7 +15904,7 @@
             <w:pPr>
               <w:numPr>
                 <w:ilvl w:val="0"/>
-                <w:numId w:val="1081"/>
+                <w:numId w:val="1082"/>
               </w:numPr>
               <w:jc w:val="left"/>
             </w:pPr>
@@ -15861,57 +15912,6 @@
               <w:t xml:space="preserve">Restructured chapters: moved SSH config and VS Code connection to new Chapter 4 (Install VS Code and Connect via Remote-SSH). Chapters 5—​7 renumbered.</w:t>
             </w:r>
           </w:p>
-          <w:p>
-            <w:pPr>
-              <w:numPr>
-                <w:ilvl w:val="0"/>
-                <w:numId w:val="1081"/>
-              </w:numPr>
-              <w:jc w:val="left"/>
-            </w:pPr>
-            <w:r>
-              <w:t xml:space="preserve">Added verification checklist tables to all 7 chapters.</w:t>
-            </w:r>
-          </w:p>
-          <w:p>
-            <w:pPr>
-              <w:numPr>
-                <w:ilvl w:val="0"/>
-                <w:numId w:val="1081"/>
-              </w:numPr>
-              <w:jc w:val="left"/>
-            </w:pPr>
-            <w:r>
-              <w:t xml:space="preserve">Added mandatory reboot warning in Chapter 2 (SSH port change). Added troubleshooting subsection in Chapter 4 with common SSH connection issues and ncat debugging commands.</w:t>
-            </w:r>
-          </w:p>
-        </w:tc>
-      </w:tr>
-      <w:tr>
-        <w:tc>
-          <w:tcPr/>
-          <w:p>
-            <w:pPr>
-              <w:jc w:val="left"/>
-            </w:pPr>
-            <w:r>
-              <w:t xml:space="preserve">3.0.1</w:t>
-            </w:r>
-          </w:p>
-        </w:tc>
-        <w:tc>
-          <w:tcPr/>
-          <w:p>
-            <w:pPr>
-              <w:jc w:val="left"/>
-            </w:pPr>
-            <w:r>
-              <w:t xml:space="preserve">2026-09-10</w:t>
-            </w:r>
-          </w:p>
-        </w:tc>
-        <w:tc>
-          <w:tcPr/>
           <w:p>
             <w:pPr>
               <w:numPr>
@@ -15921,7 +15921,19 @@
               <w:jc w:val="left"/>
             </w:pPr>
             <w:r>
-              <w:t xml:space="preserve">Minor fixes: test-filter.sh auto-discovery, build.sh help text, Makefile aggregate descriptions, 5-section comment correction, CHANGELOG version gap note, callout-in-code fix, CI font auto-discovery, dofile path comment, test-sync.sh header.</w:t>
+              <w:t xml:space="preserve">Added verification checklist tables to all 7 chapters.</w:t>
+            </w:r>
+          </w:p>
+          <w:p>
+            <w:pPr>
+              <w:numPr>
+                <w:ilvl w:val="0"/>
+                <w:numId w:val="1082"/>
+              </w:numPr>
+              <w:jc w:val="left"/>
+            </w:pPr>
+            <w:r>
+              <w:t xml:space="preserve">Added mandatory reboot warning in Chapter 2 (SSH port change). Added troubleshooting subsection in Chapter 4 with common SSH connection issues and ncat debugging commands.</w:t>
             </w:r>
           </w:p>
         </w:tc>
@@ -15936,7 +15948,7 @@
               <w:jc w:val="left"/>
             </w:pPr>
             <w:r>
-              <w:t xml:space="preserve">3.0.0</w:t>
+              <w:t xml:space="preserve">3.0.1</w:t>
             </w:r>
           </w:p>
         </w:tc>
@@ -15949,7 +15961,7 @@
               <w:jc w:val="left"/>
             </w:pPr>
             <w:r>
-              <w:t xml:space="preserve">2026-09-09</w:t>
+              <w:t xml:space="preserve">2026-09-10</w:t>
             </w:r>
           </w:p>
         </w:tc>
@@ -15966,7 +15978,7 @@
               <w:jc w:val="left"/>
             </w:pPr>
             <w:r>
-              <w:t xml:space="preserve">Modular pipeline refactoring: shared Lua filter factory, shared DOCX fix logic, build system auto-discovery, unified format pipeline, GitHub Actions CI.</w:t>
+              <w:t xml:space="preserve">Minor fixes: test-filter.sh auto-discovery, build.sh help text, Makefile aggregate descriptions, 5-section comment correction, CHANGELOG version gap note, callout-in-code fix, CI font auto-discovery, dofile path comment, test-sync.sh header.</w:t>
             </w:r>
           </w:p>
         </w:tc>
@@ -15979,18 +15991,18 @@
               <w:jc w:val="left"/>
             </w:pPr>
             <w:r>
-              <w:t xml:space="preserve">2.16.0</w:t>
-            </w:r>
-          </w:p>
-        </w:tc>
-        <w:tc>
-          <w:tcPr/>
-          <w:p>
-            <w:pPr>
-              <w:jc w:val="left"/>
-            </w:pPr>
-            <w:r>
-              <w:t xml:space="preserve">2026-09-05</w:t>
+              <w:t xml:space="preserve">3.0.0</w:t>
+            </w:r>
+          </w:p>
+        </w:tc>
+        <w:tc>
+          <w:tcPr/>
+          <w:p>
+            <w:pPr>
+              <w:jc w:val="left"/>
+            </w:pPr>
+            <w:r>
+              <w:t xml:space="preserve">2026-09-09</w:t>
             </w:r>
           </w:p>
         </w:tc>
@@ -16005,7 +16017,7 @@
               <w:jc w:val="left"/>
             </w:pPr>
             <w:r>
-              <w:t xml:space="preserve">Updated to match template v2.16.0 — Lua filter fixes, build system updates, and technical template parity improvements.</w:t>
+              <w:t xml:space="preserve">Modular pipeline refactoring: shared Lua filter factory, shared DOCX fix logic, build system auto-discovery, unified format pipeline, GitHub Actions CI.</w:t>
             </w:r>
           </w:p>
         </w:tc>
@@ -16020,7 +16032,7 @@
               <w:jc w:val="left"/>
             </w:pPr>
             <w:r>
-              <w:t xml:space="preserve">2.13.0</w:t>
+              <w:t xml:space="preserve">2.16.0</w:t>
             </w:r>
           </w:p>
         </w:tc>
@@ -16033,7 +16045,7 @@
               <w:jc w:val="left"/>
             </w:pPr>
             <w:r>
-              <w:t xml:space="preserve">2026-08-24</w:t>
+              <w:t xml:space="preserve">2026-09-05</w:t>
             </w:r>
           </w:p>
         </w:tc>
@@ -16050,6 +16062,45 @@
               <w:jc w:val="left"/>
             </w:pPr>
             <w:r>
+              <w:t xml:space="preserve">Updated to match template v2.16.0 — Lua filter fixes, build system updates, and technical template parity improvements.</w:t>
+            </w:r>
+          </w:p>
+        </w:tc>
+      </w:tr>
+      <w:tr>
+        <w:tc>
+          <w:tcPr/>
+          <w:p>
+            <w:pPr>
+              <w:jc w:val="left"/>
+            </w:pPr>
+            <w:r>
+              <w:t xml:space="preserve">2.13.0</w:t>
+            </w:r>
+          </w:p>
+        </w:tc>
+        <w:tc>
+          <w:tcPr/>
+          <w:p>
+            <w:pPr>
+              <w:jc w:val="left"/>
+            </w:pPr>
+            <w:r>
+              <w:t xml:space="preserve">2026-08-24</w:t>
+            </w:r>
+          </w:p>
+        </w:tc>
+        <w:tc>
+          <w:tcPr/>
+          <w:p>
+            <w:pPr>
+              <w:numPr>
+                <w:ilvl w:val="0"/>
+                <w:numId w:val="1086"/>
+              </w:numPr>
+              <w:jc w:val="left"/>
+            </w:pPr>
+            <w:r>
               <w:t xml:space="preserve">Foundation refactoring Phase 4: make DOCX</w:t>
             </w:r>
             <w:r>
@@ -16117,7 +16168,9 @@
       </w:tr>
       <w:tr>
         <w:tc>
-          <w:tcPr/>
+          <w:tcPr>
+            <w:shd w:val="clear" w:color="auto" w:fill="F6F8FA"/>
+          </w:tcPr>
           <w:p>
             <w:pPr>
               <w:jc w:val="left"/>
@@ -16128,7 +16181,9 @@
           </w:p>
         </w:tc>
         <w:tc>
-          <w:tcPr/>
+          <w:tcPr>
+            <w:shd w:val="clear" w:color="auto" w:fill="F6F8FA"/>
+          </w:tcPr>
           <w:p>
             <w:pPr>
               <w:jc w:val="left"/>
@@ -16139,12 +16194,14 @@
           </w:p>
         </w:tc>
         <w:tc>
-          <w:tcPr/>
+          <w:tcPr>
+            <w:shd w:val="clear" w:color="auto" w:fill="F6F8FA"/>
+          </w:tcPr>
           <w:p>
             <w:pPr>
               <w:numPr>
                 <w:ilvl w:val="0"/>
-                <w:numId w:val="1086"/>
+                <w:numId w:val="1087"/>
               </w:numPr>
               <w:jc w:val="left"/>
             </w:pPr>
@@ -16306,9 +16363,7 @@
       </w:tr>
       <w:tr>
         <w:tc>
-          <w:tcPr>
-            <w:shd w:val="clear" w:color="auto" w:fill="F6F8FA"/>
-          </w:tcPr>
+          <w:tcPr/>
           <w:p>
             <w:pPr>
               <w:jc w:val="left"/>
@@ -16319,9 +16374,7 @@
           </w:p>
         </w:tc>
         <w:tc>
-          <w:tcPr>
-            <w:shd w:val="clear" w:color="auto" w:fill="F6F8FA"/>
-          </w:tcPr>
+          <w:tcPr/>
           <w:p>
             <w:pPr>
               <w:jc w:val="left"/>
@@ -16332,14 +16385,12 @@
           </w:p>
         </w:tc>
         <w:tc>
-          <w:tcPr>
-            <w:shd w:val="clear" w:color="auto" w:fill="F6F8FA"/>
-          </w:tcPr>
+          <w:tcPr/>
           <w:p>
             <w:pPr>
               <w:numPr>
                 <w:ilvl w:val="0"/>
-                <w:numId w:val="1087"/>
+                <w:numId w:val="1088"/>
               </w:numPr>
               <w:jc w:val="left"/>
             </w:pPr>
@@ -16405,7 +16456,9 @@
       </w:tr>
       <w:tr>
         <w:tc>
-          <w:tcPr/>
+          <w:tcPr>
+            <w:shd w:val="clear" w:color="auto" w:fill="F6F8FA"/>
+          </w:tcPr>
           <w:p>
             <w:pPr>
               <w:jc w:val="left"/>
@@ -16416,56 +16469,15 @@
           </w:p>
         </w:tc>
         <w:tc>
-          <w:tcPr/>
+          <w:tcPr>
+            <w:shd w:val="clear" w:color="auto" w:fill="F6F8FA"/>
+          </w:tcPr>
           <w:p>
             <w:pPr>
               <w:jc w:val="left"/>
             </w:pPr>
             <w:r>
               <w:t xml:space="preserve">2026-08-24</w:t>
-            </w:r>
-          </w:p>
-        </w:tc>
-        <w:tc>
-          <w:tcPr/>
-          <w:p>
-            <w:pPr>
-              <w:numPr>
-                <w:ilvl w:val="0"/>
-                <w:numId w:val="1088"/>
-              </w:numPr>
-              <w:jc w:val="left"/>
-            </w:pPr>
-            <w:r>
-              <w:t xml:space="preserve">Foundation refactoring Phase 1: sync cls version to project tag, fix stale doc references (L16 output count, L-range, setup-guide feature claim), add test-sync.sh for version consistency checking.</w:t>
-            </w:r>
-          </w:p>
-        </w:tc>
-      </w:tr>
-      <w:tr>
-        <w:tc>
-          <w:tcPr>
-            <w:shd w:val="clear" w:color="auto" w:fill="F6F8FA"/>
-          </w:tcPr>
-          <w:p>
-            <w:pPr>
-              <w:jc w:val="left"/>
-            </w:pPr>
-            <w:r>
-              <w:t xml:space="preserve">2.9.1</w:t>
-            </w:r>
-          </w:p>
-        </w:tc>
-        <w:tc>
-          <w:tcPr>
-            <w:shd w:val="clear" w:color="auto" w:fill="F6F8FA"/>
-          </w:tcPr>
-          <w:p>
-            <w:pPr>
-              <w:jc w:val="left"/>
-            </w:pPr>
-            <w:r>
-              <w:t xml:space="preserve">2026-08-23</w:t>
             </w:r>
           </w:p>
         </w:tc>
@@ -16482,6 +16494,45 @@
               <w:jc w:val="left"/>
             </w:pPr>
             <w:r>
+              <w:t xml:space="preserve">Foundation refactoring Phase 1: sync cls version to project tag, fix stale doc references (L16 output count, L-range, setup-guide feature claim), add test-sync.sh for version consistency checking.</w:t>
+            </w:r>
+          </w:p>
+        </w:tc>
+      </w:tr>
+      <w:tr>
+        <w:tc>
+          <w:tcPr/>
+          <w:p>
+            <w:pPr>
+              <w:jc w:val="left"/>
+            </w:pPr>
+            <w:r>
+              <w:t xml:space="preserve">2.9.1</w:t>
+            </w:r>
+          </w:p>
+        </w:tc>
+        <w:tc>
+          <w:tcPr/>
+          <w:p>
+            <w:pPr>
+              <w:jc w:val="left"/>
+            </w:pPr>
+            <w:r>
+              <w:t xml:space="preserve">2026-08-23</w:t>
+            </w:r>
+          </w:p>
+        </w:tc>
+        <w:tc>
+          <w:tcPr/>
+          <w:p>
+            <w:pPr>
+              <w:numPr>
+                <w:ilvl w:val="0"/>
+                <w:numId w:val="1090"/>
+              </w:numPr>
+              <w:jc w:val="left"/>
+            </w:pPr>
+            <w:r>
               <w:t xml:space="preserve">HTML and Markdown outputs now embed images as base64 data URIs. HTML uses pandoc</w:t>
             </w:r>
             <w:r>
@@ -16513,54 +16564,15 @@
       </w:tr>
       <w:tr>
         <w:tc>
-          <w:tcPr/>
+          <w:tcPr>
+            <w:shd w:val="clear" w:color="auto" w:fill="F6F8FA"/>
+          </w:tcPr>
           <w:p>
             <w:pPr>
               <w:jc w:val="left"/>
             </w:pPr>
             <w:r>
               <w:t xml:space="preserve">2.9.0</w:t>
-            </w:r>
-          </w:p>
-        </w:tc>
-        <w:tc>
-          <w:tcPr/>
-          <w:p>
-            <w:pPr>
-              <w:jc w:val="left"/>
-            </w:pPr>
-            <w:r>
-              <w:t xml:space="preserve">2026-08-23</w:t>
-            </w:r>
-          </w:p>
-        </w:tc>
-        <w:tc>
-          <w:tcPr/>
-          <w:p>
-            <w:pPr>
-              <w:numPr>
-                <w:ilvl w:val="0"/>
-                <w:numId w:val="1090"/>
-              </w:numPr>
-              <w:jc w:val="left"/>
-            </w:pPr>
-            <w:r>
-              <w:t xml:space="preserve">DOCX: fix content width (8504→9638tw, margins are 2cm not 3cm). Add footer page numbers. Style TOC heading (22pt bold + rule). Add hutable table width + fixed layout.</w:t>
-            </w:r>
-          </w:p>
-        </w:tc>
-      </w:tr>
-      <w:tr>
-        <w:tc>
-          <w:tcPr>
-            <w:shd w:val="clear" w:color="auto" w:fill="F6F8FA"/>
-          </w:tcPr>
-          <w:p>
-            <w:pPr>
-              <w:jc w:val="left"/>
-            </w:pPr>
-            <w:r>
-              <w:t xml:space="preserve">2.8.3</w:t>
             </w:r>
           </w:p>
         </w:tc>
@@ -16590,7 +16602,7 @@
               <w:jc w:val="left"/>
             </w:pPr>
             <w:r>
-              <w:t xml:space="preserve">DOCX fix: callout tables now have explicit width (8504tw) and fixed layout. Changelog section heading now uses custom H1 format (56pt number, red border, right tab) instead of pandoc’s default.</w:t>
+              <w:t xml:space="preserve">DOCX: fix content width (8504→9638tw, margins are 2cm not 3cm). Add footer page numbers. Style TOC heading (22pt bold + rule). Add hutable table width + fixed layout.</w:t>
             </w:r>
           </w:p>
         </w:tc>
@@ -16603,7 +16615,7 @@
               <w:jc w:val="left"/>
             </w:pPr>
             <w:r>
-              <w:t xml:space="preserve">2.8.2</w:t>
+              <w:t xml:space="preserve">2.8.3</w:t>
             </w:r>
           </w:p>
         </w:tc>
@@ -16629,7 +16641,7 @@
               <w:jc w:val="left"/>
             </w:pPr>
             <w:r>
-              <w:t xml:space="preserve">DOCX H1 heading: reverted table approach to paragraph with tab stop + red bottom border. Table broke navigation pane and TOC field. Paragraph preserves Heading1 style for navigation while matching PDF layout (number left, title right, red rule below).</w:t>
+              <w:t xml:space="preserve">DOCX fix: callout tables now have explicit width (8504tw) and fixed layout. Changelog section heading now uses custom H1 format (56pt number, red border, right tab) instead of pandoc’s default.</w:t>
             </w:r>
           </w:p>
         </w:tc>
@@ -16644,7 +16656,7 @@
               <w:jc w:val="left"/>
             </w:pPr>
             <w:r>
-              <w:t xml:space="preserve">2.8.1</w:t>
+              <w:t xml:space="preserve">2.8.2</w:t>
             </w:r>
           </w:p>
         </w:tc>
@@ -16674,7 +16686,7 @@
               <w:jc w:val="left"/>
             </w:pPr>
             <w:r>
-              <w:t xml:space="preserve">DOCX heading fix: text color reverted to black (was incorrectly changed to Huawei red in v2.8.0). H1 now uses a two-column table (number left, title right) with red bottom rule. H2-H4 use simple inline format (number + title, no right tab stop).</w:t>
+              <w:t xml:space="preserve">DOCX H1 heading: reverted table approach to paragraph with tab stop + red bottom border. Table broke navigation pane and TOC field. Paragraph preserves Heading1 style for navigation while matching PDF layout (number left, title right, red rule below).</w:t>
             </w:r>
           </w:p>
         </w:tc>
@@ -16687,7 +16699,7 @@
               <w:jc w:val="left"/>
             </w:pPr>
             <w:r>
-              <w:t xml:space="preserve">2.8.0</w:t>
+              <w:t xml:space="preserve">2.8.1</w:t>
             </w:r>
           </w:p>
         </w:tc>
@@ -16713,7 +16725,7 @@
               <w:jc w:val="left"/>
             </w:pPr>
             <w:r>
-              <w:t xml:space="preserve">DOCX output: match PDF styling --- heading colors (Huawei red), H1 number size (56pt), callout borders (left-only) and padding, changelog formatting (rules, bold version, italic date), caption style (9pt bold), badge style (8pt bold white on red), list indentation.</w:t>
+              <w:t xml:space="preserve">DOCX heading fix: text color reverted to black (was incorrectly changed to Huawei red in v2.8.0). H1 now uses a two-column table (number left, title right) with red bottom rule. H2-H4 use simple inline format (number + title, no right tab stop).</w:t>
             </w:r>
           </w:p>
         </w:tc>
@@ -16728,7 +16740,7 @@
               <w:jc w:val="left"/>
             </w:pPr>
             <w:r>
-              <w:t xml:space="preserve">2.7.1</w:t>
+              <w:t xml:space="preserve">2.8.0</w:t>
             </w:r>
           </w:p>
         </w:tc>
@@ -16741,7 +16753,7 @@
               <w:jc w:val="left"/>
             </w:pPr>
             <w:r>
-              <w:t xml:space="preserve">2026-08-17</w:t>
+              <w:t xml:space="preserve">2026-08-23</w:t>
             </w:r>
           </w:p>
         </w:tc>
@@ -16758,6 +16770,45 @@
               <w:jc w:val="left"/>
             </w:pPr>
             <w:r>
+              <w:t xml:space="preserve">DOCX output: match PDF styling --- heading colors (Huawei red), H1 number size (56pt), callout borders (left-only) and padding, changelog formatting (rules, bold version, italic date), caption style (9pt bold), badge style (8pt bold white on red), list indentation.</w:t>
+            </w:r>
+          </w:p>
+        </w:tc>
+      </w:tr>
+      <w:tr>
+        <w:tc>
+          <w:tcPr/>
+          <w:p>
+            <w:pPr>
+              <w:jc w:val="left"/>
+            </w:pPr>
+            <w:r>
+              <w:t xml:space="preserve">2.7.1</w:t>
+            </w:r>
+          </w:p>
+        </w:tc>
+        <w:tc>
+          <w:tcPr/>
+          <w:p>
+            <w:pPr>
+              <w:jc w:val="left"/>
+            </w:pPr>
+            <w:r>
+              <w:t xml:space="preserve">2026-08-17</w:t>
+            </w:r>
+          </w:p>
+        </w:tc>
+        <w:tc>
+          <w:tcPr/>
+          <w:p>
+            <w:pPr>
+              <w:numPr>
+                <w:ilvl w:val="0"/>
+                <w:numId w:val="1096"/>
+              </w:numPr>
+              <w:jc w:val="left"/>
+            </w:pPr>
+            <w:r>
               <w:t xml:space="preserve">Rename project repository to all lowercase (</w:t>
             </w:r>
             <w:r>
@@ -16774,7 +16825,9 @@
       </w:tr>
       <w:tr>
         <w:tc>
-          <w:tcPr/>
+          <w:tcPr>
+            <w:shd w:val="clear" w:color="auto" w:fill="F6F8FA"/>
+          </w:tcPr>
           <w:p>
             <w:pPr>
               <w:jc w:val="left"/>
@@ -16785,7 +16838,9 @@
           </w:p>
         </w:tc>
         <w:tc>
-          <w:tcPr/>
+          <w:tcPr>
+            <w:shd w:val="clear" w:color="auto" w:fill="F6F8FA"/>
+          </w:tcPr>
           <w:p>
             <w:pPr>
               <w:jc w:val="left"/>
@@ -16796,12 +16851,14 @@
           </w:p>
         </w:tc>
         <w:tc>
-          <w:tcPr/>
+          <w:tcPr>
+            <w:shd w:val="clear" w:color="auto" w:fill="F6F8FA"/>
+          </w:tcPr>
           <w:p>
             <w:pPr>
               <w:numPr>
                 <w:ilvl w:val="0"/>
-                <w:numId w:val="1096"/>
+                <w:numId w:val="1097"/>
               </w:numPr>
               <w:jc w:val="left"/>
             </w:pPr>
@@ -16843,9 +16900,7 @@
       </w:tr>
       <w:tr>
         <w:tc>
-          <w:tcPr>
-            <w:shd w:val="clear" w:color="auto" w:fill="F6F8FA"/>
-          </w:tcPr>
+          <w:tcPr/>
           <w:p>
             <w:pPr>
               <w:jc w:val="left"/>
@@ -16856,9 +16911,7 @@
           </w:p>
         </w:tc>
         <w:tc>
-          <w:tcPr>
-            <w:shd w:val="clear" w:color="auto" w:fill="F6F8FA"/>
-          </w:tcPr>
+          <w:tcPr/>
           <w:p>
             <w:pPr>
               <w:jc w:val="left"/>
@@ -16869,14 +16922,12 @@
           </w:p>
         </w:tc>
         <w:tc>
-          <w:tcPr>
-            <w:shd w:val="clear" w:color="auto" w:fill="F6F8FA"/>
-          </w:tcPr>
+          <w:tcPr/>
           <w:p>
             <w:pPr>
               <w:numPr>
                 <w:ilvl w:val="0"/>
-                <w:numId w:val="1097"/>
+                <w:numId w:val="1098"/>
               </w:numPr>
               <w:jc w:val="left"/>
             </w:pPr>
@@ -16933,7 +16984,9 @@
       </w:tr>
       <w:tr>
         <w:tc>
-          <w:tcPr/>
+          <w:tcPr>
+            <w:shd w:val="clear" w:color="auto" w:fill="F6F8FA"/>
+          </w:tcPr>
           <w:p>
             <w:pPr>
               <w:jc w:val="left"/>
@@ -16944,7 +16997,9 @@
           </w:p>
         </w:tc>
         <w:tc>
-          <w:tcPr/>
+          <w:tcPr>
+            <w:shd w:val="clear" w:color="auto" w:fill="F6F8FA"/>
+          </w:tcPr>
           <w:p>
             <w:pPr>
               <w:jc w:val="left"/>
@@ -16955,12 +17010,14 @@
           </w:p>
         </w:tc>
         <w:tc>
-          <w:tcPr/>
+          <w:tcPr>
+            <w:shd w:val="clear" w:color="auto" w:fill="F6F8FA"/>
+          </w:tcPr>
           <w:p>
             <w:pPr>
               <w:numPr>
                 <w:ilvl w:val="0"/>
-                <w:numId w:val="1098"/>
+                <w:numId w:val="1099"/>
               </w:numPr>
               <w:jc w:val="left"/>
             </w:pPr>
@@ -16987,7 +17044,7 @@
             <w:pPr>
               <w:numPr>
                 <w:ilvl w:val="0"/>
-                <w:numId w:val="1098"/>
+                <w:numId w:val="1099"/>
               </w:numPr>
               <w:jc w:val="left"/>
             </w:pPr>
@@ -17014,58 +17071,13 @@
       </w:tr>
       <w:tr>
         <w:tc>
-          <w:tcPr>
-            <w:shd w:val="clear" w:color="auto" w:fill="F6F8FA"/>
-          </w:tcPr>
+          <w:tcPr/>
           <w:p>
             <w:pPr>
               <w:jc w:val="left"/>
             </w:pPr>
             <w:r>
               <w:t xml:space="preserve">2.5.1</w:t>
-            </w:r>
-          </w:p>
-        </w:tc>
-        <w:tc>
-          <w:tcPr>
-            <w:shd w:val="clear" w:color="auto" w:fill="F6F8FA"/>
-          </w:tcPr>
-          <w:p>
-            <w:pPr>
-              <w:jc w:val="left"/>
-            </w:pPr>
-            <w:r>
-              <w:t xml:space="preserve">2026-08-10</w:t>
-            </w:r>
-          </w:p>
-        </w:tc>
-        <w:tc>
-          <w:tcPr>
-            <w:shd w:val="clear" w:color="auto" w:fill="F6F8FA"/>
-          </w:tcPr>
-          <w:p>
-            <w:pPr>
-              <w:numPr>
-                <w:ilvl w:val="0"/>
-                <w:numId w:val="1099"/>
-              </w:numPr>
-              <w:jc w:val="left"/>
-            </w:pPr>
-            <w:r>
-              <w:t xml:space="preserve">H1 section title size reduced from 27pt to 20pt.</w:t>
-            </w:r>
-          </w:p>
-        </w:tc>
-      </w:tr>
-      <w:tr>
-        <w:tc>
-          <w:tcPr/>
-          <w:p>
-            <w:pPr>
-              <w:jc w:val="left"/>
-            </w:pPr>
-            <w:r>
-              <w:t xml:space="preserve">2.5.0</w:t>
             </w:r>
           </w:p>
         </w:tc>
@@ -17091,13 +17103,7 @@
               <w:jc w:val="left"/>
             </w:pPr>
             <w:r>
-              <w:t xml:space="preserve">Default image size increased: width 65% → 90% of text width,</w:t>
-            </w:r>
-            <w:r>
-              <w:t xml:space="preserve"> </w:t>
-            </w:r>
-            <w:r>
-              <w:t xml:space="preserve">height 40% → 50% of text height.</w:t>
+              <w:t xml:space="preserve">H1 section title size reduced from 27pt to 20pt.</w:t>
             </w:r>
           </w:p>
         </w:tc>
@@ -17112,7 +17118,7 @@
               <w:jc w:val="left"/>
             </w:pPr>
             <w:r>
-              <w:t xml:space="preserve">2.4.0</w:t>
+              <w:t xml:space="preserve">2.5.0</w:t>
             </w:r>
           </w:p>
         </w:tc>
@@ -17142,14 +17148,59 @@
               <w:jc w:val="left"/>
             </w:pPr>
             <w:r>
-              <w:t xml:space="preserve">Enlarged H1 section title (18pt → 27pt, 50% bigger).</w:t>
-            </w:r>
-          </w:p>
+              <w:t xml:space="preserve">Default image size increased: width 65% → 90% of text width,</w:t>
+            </w:r>
+            <w:r>
+              <w:t xml:space="preserve"> </w:t>
+            </w:r>
+            <w:r>
+              <w:t xml:space="preserve">height 40% → 50% of text height.</w:t>
+            </w:r>
+          </w:p>
+        </w:tc>
+      </w:tr>
+      <w:tr>
+        <w:tc>
+          <w:tcPr/>
+          <w:p>
+            <w:pPr>
+              <w:jc w:val="left"/>
+            </w:pPr>
+            <w:r>
+              <w:t xml:space="preserve">2.4.0</w:t>
+            </w:r>
+          </w:p>
+        </w:tc>
+        <w:tc>
+          <w:tcPr/>
+          <w:p>
+            <w:pPr>
+              <w:jc w:val="left"/>
+            </w:pPr>
+            <w:r>
+              <w:t xml:space="preserve">2026-08-10</w:t>
+            </w:r>
+          </w:p>
+        </w:tc>
+        <w:tc>
+          <w:tcPr/>
           <w:p>
             <w:pPr>
               <w:numPr>
                 <w:ilvl w:val="0"/>
-                <w:numId w:val="1101"/>
+                <w:numId w:val="1102"/>
+              </w:numPr>
+              <w:jc w:val="left"/>
+            </w:pPr>
+            <w:r>
+              <w:t xml:space="preserve">Enlarged H1 section title (18pt → 27pt, 50% bigger).</w:t>
+            </w:r>
+          </w:p>
+          <w:p>
+            <w:pPr>
+              <w:numPr>
+                <w:ilvl w:val="0"/>
+                <w:numId w:val="1102"/>
               </w:numPr>
               <w:jc w:val="left"/>
             </w:pPr>
@@ -17176,7 +17227,9 @@
       </w:tr>
       <w:tr>
         <w:tc>
-          <w:tcPr/>
+          <w:tcPr>
+            <w:shd w:val="clear" w:color="auto" w:fill="F6F8FA"/>
+          </w:tcPr>
           <w:p>
             <w:pPr>
               <w:jc w:val="left"/>
@@ -17187,7 +17240,9 @@
           </w:p>
         </w:tc>
         <w:tc>
-          <w:tcPr/>
+          <w:tcPr>
+            <w:shd w:val="clear" w:color="auto" w:fill="F6F8FA"/>
+          </w:tcPr>
           <w:p>
             <w:pPr>
               <w:jc w:val="left"/>
@@ -17198,12 +17253,14 @@
           </w:p>
         </w:tc>
         <w:tc>
-          <w:tcPr/>
+          <w:tcPr>
+            <w:shd w:val="clear" w:color="auto" w:fill="F6F8FA"/>
+          </w:tcPr>
           <w:p>
             <w:pPr>
               <w:numPr>
                 <w:ilvl w:val="0"/>
-                <w:numId w:val="1102"/>
+                <w:numId w:val="1103"/>
               </w:numPr>
               <w:jc w:val="left"/>
             </w:pPr>
@@ -17230,9 +17287,7 @@
       </w:tr>
       <w:tr>
         <w:tc>
-          <w:tcPr>
-            <w:shd w:val="clear" w:color="auto" w:fill="F6F8FA"/>
-          </w:tcPr>
+          <w:tcPr/>
           <w:p>
             <w:pPr>
               <w:jc w:val="left"/>
@@ -17243,9 +17298,7 @@
           </w:p>
         </w:tc>
         <w:tc>
-          <w:tcPr>
-            <w:shd w:val="clear" w:color="auto" w:fill="F6F8FA"/>
-          </w:tcPr>
+          <w:tcPr/>
           <w:p>
             <w:pPr>
               <w:jc w:val="left"/>
@@ -17256,14 +17309,12 @@
           </w:p>
         </w:tc>
         <w:tc>
-          <w:tcPr>
-            <w:shd w:val="clear" w:color="auto" w:fill="F6F8FA"/>
-          </w:tcPr>
+          <w:tcPr/>
           <w:p>
             <w:pPr>
               <w:numPr>
                 <w:ilvl w:val="0"/>
-                <w:numId w:val="1103"/>
+                <w:numId w:val="1104"/>
               </w:numPr>
               <w:jc w:val="left"/>
             </w:pPr>
@@ -17335,7 +17386,9 @@
       </w:tr>
       <w:tr>
         <w:tc>
-          <w:tcPr/>
+          <w:tcPr>
+            <w:shd w:val="clear" w:color="auto" w:fill="F6F8FA"/>
+          </w:tcPr>
           <w:p>
             <w:pPr>
               <w:jc w:val="left"/>
@@ -17346,7 +17399,9 @@
           </w:p>
         </w:tc>
         <w:tc>
-          <w:tcPr/>
+          <w:tcPr>
+            <w:shd w:val="clear" w:color="auto" w:fill="F6F8FA"/>
+          </w:tcPr>
           <w:p>
             <w:pPr>
               <w:jc w:val="left"/>
@@ -17357,12 +17412,14 @@
           </w:p>
         </w:tc>
         <w:tc>
-          <w:tcPr/>
+          <w:tcPr>
+            <w:shd w:val="clear" w:color="auto" w:fill="F6F8FA"/>
+          </w:tcPr>
           <w:p>
             <w:pPr>
               <w:numPr>
                 <w:ilvl w:val="0"/>
-                <w:numId w:val="1104"/>
+                <w:numId w:val="1105"/>
               </w:numPr>
               <w:jc w:val="left"/>
             </w:pPr>
@@ -17419,9 +17476,7 @@
       </w:tr>
       <w:tr>
         <w:tc>
-          <w:tcPr>
-            <w:shd w:val="clear" w:color="auto" w:fill="F6F8FA"/>
-          </w:tcPr>
+          <w:tcPr/>
           <w:p>
             <w:pPr>
               <w:jc w:val="left"/>
@@ -17432,9 +17487,7 @@
           </w:p>
         </w:tc>
         <w:tc>
-          <w:tcPr>
-            <w:shd w:val="clear" w:color="auto" w:fill="F6F8FA"/>
-          </w:tcPr>
+          <w:tcPr/>
           <w:p>
             <w:pPr>
               <w:jc w:val="left"/>
@@ -17445,14 +17498,12 @@
           </w:p>
         </w:tc>
         <w:tc>
-          <w:tcPr>
-            <w:shd w:val="clear" w:color="auto" w:fill="F6F8FA"/>
-          </w:tcPr>
+          <w:tcPr/>
           <w:p>
             <w:pPr>
               <w:numPr>
                 <w:ilvl w:val="0"/>
-                <w:numId w:val="1105"/>
+                <w:numId w:val="1106"/>
               </w:numPr>
               <w:jc w:val="left"/>
             </w:pPr>
@@ -17479,54 +17530,15 @@
       </w:tr>
       <w:tr>
         <w:tc>
-          <w:tcPr/>
+          <w:tcPr>
+            <w:shd w:val="clear" w:color="auto" w:fill="F6F8FA"/>
+          </w:tcPr>
           <w:p>
             <w:pPr>
               <w:jc w:val="left"/>
             </w:pPr>
             <w:r>
               <w:t xml:space="preserve">2.2.2</w:t>
-            </w:r>
-          </w:p>
-        </w:tc>
-        <w:tc>
-          <w:tcPr/>
-          <w:p>
-            <w:pPr>
-              <w:jc w:val="left"/>
-            </w:pPr>
-            <w:r>
-              <w:t xml:space="preserve">2026-08-08</w:t>
-            </w:r>
-          </w:p>
-        </w:tc>
-        <w:tc>
-          <w:tcPr/>
-          <w:p>
-            <w:pPr>
-              <w:numPr>
-                <w:ilvl w:val="0"/>
-                <w:numId w:val="1106"/>
-              </w:numPr>
-              <w:jc w:val="left"/>
-            </w:pPr>
-            <w:r>
-              <w:t xml:space="preserve">Fixed chapter reference in prerequisite (Chapter 3 → Chapter 4).</w:t>
-            </w:r>
-          </w:p>
-        </w:tc>
-      </w:tr>
-      <w:tr>
-        <w:tc>
-          <w:tcPr>
-            <w:shd w:val="clear" w:color="auto" w:fill="F6F8FA"/>
-          </w:tcPr>
-          <w:p>
-            <w:pPr>
-              <w:jc w:val="left"/>
-            </w:pPr>
-            <w:r>
-              <w:t xml:space="preserve">2.2.1</w:t>
             </w:r>
           </w:p>
         </w:tc>
@@ -17556,7 +17568,7 @@
               <w:jc w:val="left"/>
             </w:pPr>
             <w:r>
-              <w:t xml:space="preserve">Changed table and figure caption labels to black (was Huawei red).</w:t>
+              <w:t xml:space="preserve">Fixed chapter reference in prerequisite (Chapter 3 → Chapter 4).</w:t>
             </w:r>
           </w:p>
         </w:tc>
@@ -17569,7 +17581,7 @@
               <w:jc w:val="left"/>
             </w:pPr>
             <w:r>
-              <w:t xml:space="preserve">2.2.0</w:t>
+              <w:t xml:space="preserve">2.2.1</w:t>
             </w:r>
           </w:p>
         </w:tc>
@@ -17595,13 +17607,7 @@
               <w:jc w:val="left"/>
             </w:pPr>
             <w:r>
-              <w:t xml:space="preserve">Added Huawei-branded table styling: red header bar, alternating row</w:t>
-            </w:r>
-            <w:r>
-              <w:t xml:space="preserve"> </w:t>
-            </w:r>
-            <w:r>
-              <w:t xml:space="preserve">colors, and bordered cells.</w:t>
+              <w:t xml:space="preserve">Changed table and figure caption labels to black (was Huawei red).</w:t>
             </w:r>
           </w:p>
         </w:tc>
@@ -17616,7 +17622,7 @@
               <w:jc w:val="left"/>
             </w:pPr>
             <w:r>
-              <w:t xml:space="preserve">2.1.0</w:t>
+              <w:t xml:space="preserve">2.2.0</w:t>
             </w:r>
           </w:p>
         </w:tc>
@@ -17629,7 +17635,7 @@
               <w:jc w:val="left"/>
             </w:pPr>
             <w:r>
-              <w:t xml:space="preserve">2026-08-06</w:t>
+              <w:t xml:space="preserve">2026-08-08</w:t>
             </w:r>
           </w:p>
         </w:tc>
@@ -17646,6 +17652,51 @@
               <w:jc w:val="left"/>
             </w:pPr>
             <w:r>
+              <w:t xml:space="preserve">Added Huawei-branded table styling: red header bar, alternating row</w:t>
+            </w:r>
+            <w:r>
+              <w:t xml:space="preserve"> </w:t>
+            </w:r>
+            <w:r>
+              <w:t xml:space="preserve">colors, and bordered cells.</w:t>
+            </w:r>
+          </w:p>
+        </w:tc>
+      </w:tr>
+      <w:tr>
+        <w:tc>
+          <w:tcPr/>
+          <w:p>
+            <w:pPr>
+              <w:jc w:val="left"/>
+            </w:pPr>
+            <w:r>
+              <w:t xml:space="preserve">2.1.0</w:t>
+            </w:r>
+          </w:p>
+        </w:tc>
+        <w:tc>
+          <w:tcPr/>
+          <w:p>
+            <w:pPr>
+              <w:jc w:val="left"/>
+            </w:pPr>
+            <w:r>
+              <w:t xml:space="preserve">2026-08-06</w:t>
+            </w:r>
+          </w:p>
+        </w:tc>
+        <w:tc>
+          <w:tcPr/>
+          <w:p>
+            <w:pPr>
+              <w:numPr>
+                <w:ilvl w:val="0"/>
+                <w:numId w:val="1110"/>
+              </w:numPr>
+              <w:jc w:val="left"/>
+            </w:pPr>
+            <w:r>
               <w:t xml:space="preserve">Updated ECS flavor to</w:t>
             </w:r>
             <w:r>
@@ -17668,7 +17719,7 @@
             <w:pPr>
               <w:numPr>
                 <w:ilvl w:val="0"/>
-                <w:numId w:val="1109"/>
+                <w:numId w:val="1110"/>
               </w:numPr>
               <w:jc w:val="left"/>
             </w:pPr>
@@ -17680,7 +17731,7 @@
             <w:pPr>
               <w:numPr>
                 <w:ilvl w:val="0"/>
-                <w:numId w:val="1109"/>
+                <w:numId w:val="1110"/>
               </w:numPr>
               <w:jc w:val="left"/>
             </w:pPr>
@@ -17692,7 +17743,7 @@
             <w:pPr>
               <w:numPr>
                 <w:ilvl w:val="0"/>
-                <w:numId w:val="1109"/>
+                <w:numId w:val="1110"/>
               </w:numPr>
               <w:jc w:val="left"/>
             </w:pPr>
@@ -17704,7 +17755,7 @@
             <w:pPr>
               <w:numPr>
                 <w:ilvl w:val="0"/>
-                <w:numId w:val="1109"/>
+                <w:numId w:val="1110"/>
               </w:numPr>
               <w:jc w:val="left"/>
             </w:pPr>
@@ -17716,7 +17767,7 @@
             <w:pPr>
               <w:numPr>
                 <w:ilvl w:val="0"/>
-                <w:numId w:val="1109"/>
+                <w:numId w:val="1110"/>
               </w:numPr>
               <w:jc w:val="left"/>
             </w:pPr>
@@ -17734,7 +17785,7 @@
             <w:pPr>
               <w:numPr>
                 <w:ilvl w:val="0"/>
-                <w:numId w:val="1109"/>
+                <w:numId w:val="1110"/>
               </w:numPr>
               <w:jc w:val="left"/>
             </w:pPr>
@@ -17783,7 +17834,7 @@
             <w:pPr>
               <w:numPr>
                 <w:ilvl w:val="0"/>
-                <w:numId w:val="1109"/>
+                <w:numId w:val="1110"/>
               </w:numPr>
               <w:jc w:val="left"/>
             </w:pPr>
@@ -17795,7 +17846,7 @@
             <w:pPr>
               <w:numPr>
                 <w:ilvl w:val="0"/>
-                <w:numId w:val="1109"/>
+                <w:numId w:val="1110"/>
               </w:numPr>
               <w:jc w:val="left"/>
             </w:pPr>
@@ -17846,7 +17897,7 @@
             <w:pPr>
               <w:numPr>
                 <w:ilvl w:val="0"/>
-                <w:numId w:val="1109"/>
+                <w:numId w:val="1110"/>
               </w:numPr>
               <w:jc w:val="left"/>
             </w:pPr>
@@ -17873,7 +17924,9 @@
       </w:tr>
       <w:tr>
         <w:tc>
-          <w:tcPr/>
+          <w:tcPr>
+            <w:shd w:val="clear" w:color="auto" w:fill="F6F8FA"/>
+          </w:tcPr>
           <w:p>
             <w:pPr>
               <w:jc w:val="left"/>
@@ -17884,7 +17937,9 @@
           </w:p>
         </w:tc>
         <w:tc>
-          <w:tcPr/>
+          <w:tcPr>
+            <w:shd w:val="clear" w:color="auto" w:fill="F6F8FA"/>
+          </w:tcPr>
           <w:p>
             <w:pPr>
               <w:jc w:val="left"/>
@@ -17895,12 +17950,14 @@
           </w:p>
         </w:tc>
         <w:tc>
-          <w:tcPr/>
+          <w:tcPr>
+            <w:shd w:val="clear" w:color="auto" w:fill="F6F8FA"/>
+          </w:tcPr>
           <w:p>
             <w:pPr>
               <w:numPr>
                 <w:ilvl w:val="0"/>
-                <w:numId w:val="1110"/>
+                <w:numId w:val="1111"/>
               </w:numPr>
               <w:jc w:val="left"/>
             </w:pPr>
@@ -17918,7 +17975,7 @@
             <w:pPr>
               <w:numPr>
                 <w:ilvl w:val="0"/>
-                <w:numId w:val="1110"/>
+                <w:numId w:val="1111"/>
               </w:numPr>
               <w:jc w:val="left"/>
             </w:pPr>
@@ -17972,7 +18029,7 @@
             <w:pPr>
               <w:numPr>
                 <w:ilvl w:val="0"/>
-                <w:numId w:val="1110"/>
+                <w:numId w:val="1111"/>
               </w:numPr>
               <w:jc w:val="left"/>
             </w:pPr>
@@ -18020,7 +18077,7 @@
             <w:pPr>
               <w:numPr>
                 <w:ilvl w:val="0"/>
-                <w:numId w:val="1110"/>
+                <w:numId w:val="1111"/>
               </w:numPr>
               <w:jc w:val="left"/>
             </w:pPr>
@@ -18041,9 +18098,7 @@
       </w:tr>
       <w:tr>
         <w:tc>
-          <w:tcPr>
-            <w:shd w:val="clear" w:color="auto" w:fill="F6F8FA"/>
-          </w:tcPr>
+          <w:tcPr/>
           <w:p>
             <w:pPr>
               <w:jc w:val="left"/>
@@ -18054,9 +18109,7 @@
           </w:p>
         </w:tc>
         <w:tc>
-          <w:tcPr>
-            <w:shd w:val="clear" w:color="auto" w:fill="F6F8FA"/>
-          </w:tcPr>
+          <w:tcPr/>
           <w:p>
             <w:pPr>
               <w:jc w:val="left"/>
@@ -18067,14 +18120,12 @@
           </w:p>
         </w:tc>
         <w:tc>
-          <w:tcPr>
-            <w:shd w:val="clear" w:color="auto" w:fill="F6F8FA"/>
-          </w:tcPr>
+          <w:tcPr/>
           <w:p>
             <w:pPr>
               <w:numPr>
                 <w:ilvl w:val="0"/>
-                <w:numId w:val="1111"/>
+                <w:numId w:val="1112"/>
               </w:numPr>
               <w:jc w:val="left"/>
             </w:pPr>
@@ -18086,7 +18137,7 @@
             <w:pPr>
               <w:numPr>
                 <w:ilvl w:val="0"/>
-                <w:numId w:val="1111"/>
+                <w:numId w:val="1112"/>
               </w:numPr>
               <w:jc w:val="left"/>
             </w:pPr>
@@ -18098,7 +18149,7 @@
             <w:pPr>
               <w:numPr>
                 <w:ilvl w:val="0"/>
-                <w:numId w:val="1111"/>
+                <w:numId w:val="1112"/>
               </w:numPr>
               <w:jc w:val="left"/>
             </w:pPr>
@@ -18110,7 +18161,7 @@
             <w:pPr>
               <w:numPr>
                 <w:ilvl w:val="0"/>
-                <w:numId w:val="1111"/>
+                <w:numId w:val="1112"/>
               </w:numPr>
               <w:jc w:val="left"/>
             </w:pPr>
@@ -18128,7 +18179,7 @@
             <w:pPr>
               <w:numPr>
                 <w:ilvl w:val="0"/>
-                <w:numId w:val="1111"/>
+                <w:numId w:val="1112"/>
               </w:numPr>
               <w:jc w:val="left"/>
             </w:pPr>
@@ -18140,7 +18191,7 @@
             <w:pPr>
               <w:numPr>
                 <w:ilvl w:val="0"/>
-                <w:numId w:val="1111"/>
+                <w:numId w:val="1112"/>
               </w:numPr>
               <w:jc w:val="left"/>
             </w:pPr>
@@ -19518,6 +19569,9 @@
     <w:abstractNumId w:val="991"/>
   </w:num>
   <w:num w:numId="1111">
+    <w:abstractNumId w:val="991"/>
+  </w:num>
+  <w:num w:numId="1112">
     <w:abstractNumId w:val="991"/>
   </w:num>
 </w:numbering>

</xml_diff>

<commit_message>
Fix Phase D cover regressions (v6.8.1)
- Non-technical covers no longer show a stray Date paragraph (the
  meta-scan move in v6.8.0 dropped the date-paragraph deletion;
  restore a full-region date scan alongside the after-logo meta scan)
- Technical cover table is no longer hijacked from the body when
  :nochangelog: is set (boundary check on the cover-table detection)
- Version/Date/Scenario table renders unconditionally like the PDF
  (was gated by :nochangelog:); empty tables skipped when no report
  values are set
- Correct the v6.8.0 changelog cover-element-order wording; drop dead
  chain else-branch; dedupe logo_idx; strengthen the cover-table test
- Bump all templates + setup-guide to v6.8.1; regenerate committed artifacts
</commit_message>
<xml_diff>
--- a/documents/setup-guide/setup-guide.docx
+++ b/documents/setup-guide/setup-guide.docx
@@ -75,18 +75,6 @@
     </w:p>
     <w:p>
       <w:pPr>
-        <w:pStyle w:val="Date"/>
-        <w:jc w:val="center"/>
-      </w:pPr>
-      <w:r>
-        <w:rPr>
-          <w:sz w:val="24"/>
-        </w:rPr>
-        <w:t xml:space="preserve">2026-09-21</w:t>
-      </w:r>
-    </w:p>
-    <w:p>
-      <w:pPr>
         <w:pStyle w:val="BodyText"/>
         <w:jc w:val="center"/>
       </w:pPr>
@@ -96,7 +84,7 @@
           <w:b/>
           <w:sz w:val="24"/>
         </w:rPr>
-        <w:t xml:space="preserve">v6.8.0</w:t>
+        <w:t xml:space="preserve">v6.8.1</w:t>
       </w:r>
       <w:r>
         <w:rPr>
@@ -108,7 +96,7 @@
         <w:rPr>
           <w:sz w:val="24"/>
         </w:rPr>
-        <w:t xml:space="preserve">— September 20, 2026 19:26</w:t>
+        <w:t xml:space="preserve">— September 20, 2026 20:01</w:t>
       </w:r>
     </w:p>
     <w:sdt>
@@ -13357,7 +13345,7 @@
               <w:jc w:val="left"/>
             </w:pPr>
             <w:r>
-              <w:t xml:space="preserve">6.8.0</w:t>
+              <w:t xml:space="preserve">6.8.1</w:t>
             </w:r>
           </w:p>
         </w:tc>
@@ -13383,7 +13371,7 @@
               <w:jc w:val="left"/>
             </w:pPr>
             <w:r>
-              <w:t xml:space="preserve">Technical report covers now match the PDF in DOCX/MD/HTML: the title uses the PDF’s 24pt size (was 36pt), the report type label appears above it, and the Version/Date/Scenario table is rendered with the PDF’s red label column. The cover meta line now shows the report version and its set date (was the document version and the build date). Authors, when set, appear as a table row like the PDF.</w:t>
+              <w:t xml:space="preserve">Quality-pass fixes for v6.8.0: non-technical covers no longer show a stray Date paragraph (regression from the meta-scan change); the technical cover table is no longer hijacked from the body when :nochangelog: is set (boundary check on the cover-table detection); the Version/Date/Scenario table now renders unconditionally like the PDF (was gated by :nochangelog:); empty cover tables are skipped when no report values are set; corrected the cover-element-order wording in the v6.8.0 changelog.</w:t>
             </w:r>
           </w:p>
         </w:tc>
@@ -13398,7 +13386,7 @@
               <w:jc w:val="left"/>
             </w:pPr>
             <w:r>
-              <w:t xml:space="preserve">6.7.0</w:t>
+              <w:t xml:space="preserve">6.8.0</w:t>
             </w:r>
           </w:p>
         </w:tc>
@@ -13428,7 +13416,7 @@
               <w:jc w:val="left"/>
             </w:pPr>
             <w:r>
-              <w:t xml:space="preserve">Badge and language fidelity: DOCX badge pills now render black text like the PDF (was frame-colored), use the correct label case (Pass, not PASS), include the Portuguese POC labels (Atendido, Parcial, Falha, Ignorado), and render at native width per template (testbook badge text no longer shrinks). Portuguese signature greetings now match the PDF (At.te,), the POC classification label matches the full PDF wording, and the secondary-format table headers (stakeholders, closing record, test summary, changelog) are now language-aware. DOCX footers show Página in Portuguese documents. Cover dates no longer zero-pad the day.</w:t>
+              <w:t xml:space="preserve">Technical report covers now match the PDF in DOCX/MD/HTML: the title uses the PDF’s 24pt size (was 36pt), the report type label appears below the title (the DOCX cover keeps the established title-first order; the PDF has label-then-title), and the Version/Date/Scenario table is rendered with the PDF’s red label column. The cover meta line now shows the report version and its set date (was the document version and the build date). Authors, when set, appear as a table row like the PDF.</w:t>
             </w:r>
           </w:p>
         </w:tc>
@@ -13441,7 +13429,7 @@
               <w:jc w:val="left"/>
             </w:pPr>
             <w:r>
-              <w:t xml:space="preserve">6.6.1</w:t>
+              <w:t xml:space="preserve">6.7.0</w:t>
             </w:r>
           </w:p>
         </w:tc>
@@ -13467,7 +13455,7 @@
               <w:jc w:val="left"/>
             </w:pPr>
             <w:r>
-              <w:t xml:space="preserve">Quality-pass fixes for v6.6.0: the TESTCASE-marker strip now covers the entire DOCX fix run (a failure at any stage can no longer leave markers in the output file); the fixer resets its template state between in-process runs (the documented path-sniffing fallback works again); build.sh also cleans temporary files on interrupt signals; fixed a CHANGELOG typo.</w:t>
+              <w:t xml:space="preserve">Badge and language fidelity: DOCX badge pills now render black text like the PDF (was frame-colored), use the correct label case (Pass, not PASS), include the Portuguese POC labels (Atendido, Parcial, Falha, Ignorado), and render at native width per template (testbook badge text no longer shrinks). Portuguese signature greetings now match the PDF (At.te,), the POC classification label matches the full PDF wording, and the secondary-format table headers (stakeholders, closing record, test summary, changelog) are now language-aware. DOCX footers show Página in Portuguese documents. Cover dates no longer zero-pad the day.</w:t>
             </w:r>
           </w:p>
         </w:tc>
@@ -13482,7 +13470,7 @@
               <w:jc w:val="left"/>
             </w:pPr>
             <w:r>
-              <w:t xml:space="preserve">6.6.0</w:t>
+              <w:t xml:space="preserve">6.6.1</w:t>
             </w:r>
           </w:p>
         </w:tc>
@@ -13512,6 +13500,45 @@
               <w:jc w:val="left"/>
             </w:pPr>
             <w:r>
+              <w:t xml:space="preserve">Quality-pass fixes for v6.6.0: the TESTCASE-marker strip now covers the entire DOCX fix run (a failure at any stage can no longer leave markers in the output file); the fixer resets its template state between in-process runs (the documented path-sniffing fallback works again); build.sh also cleans temporary files on interrupt signals; fixed a CHANGELOG typo.</w:t>
+            </w:r>
+          </w:p>
+        </w:tc>
+      </w:tr>
+      <w:tr>
+        <w:tc>
+          <w:tcPr/>
+          <w:p>
+            <w:pPr>
+              <w:jc w:val="left"/>
+            </w:pPr>
+            <w:r>
+              <w:t xml:space="preserve">6.6.0</w:t>
+            </w:r>
+          </w:p>
+        </w:tc>
+        <w:tc>
+          <w:tcPr/>
+          <w:p>
+            <w:pPr>
+              <w:jc w:val="left"/>
+            </w:pPr>
+            <w:r>
+              <w:t xml:space="preserve">2026-09-20</w:t>
+            </w:r>
+          </w:p>
+        </w:tc>
+        <w:tc>
+          <w:tcPr/>
+          <w:p>
+            <w:pPr>
+              <w:numPr>
+                <w:ilvl w:val="0"/>
+                <w:numId w:val="1046"/>
+              </w:numPr>
+              <w:jc w:val="left"/>
+            </w:pPr>
+            <w:r>
               <w:t xml:space="preserve">Pipeline robustness: DOCX post-processing now fails loudly when content styling errors occur (TESTCASE markers can no longer leak into output); the DOCX fixer takes an explicit</w:t>
             </w:r>
             <w:r>
@@ -13534,54 +13561,15 @@
       </w:tr>
       <w:tr>
         <w:tc>
-          <w:tcPr/>
+          <w:tcPr>
+            <w:shd w:val="clear" w:color="auto" w:fill="F6F8FA"/>
+          </w:tcPr>
           <w:p>
             <w:pPr>
               <w:jc w:val="left"/>
             </w:pPr>
             <w:r>
               <w:t xml:space="preserve">6.5.2</w:t>
-            </w:r>
-          </w:p>
-        </w:tc>
-        <w:tc>
-          <w:tcPr/>
-          <w:p>
-            <w:pPr>
-              <w:jc w:val="left"/>
-            </w:pPr>
-            <w:r>
-              <w:t xml:space="preserve">2026-09-20</w:t>
-            </w:r>
-          </w:p>
-        </w:tc>
-        <w:tc>
-          <w:tcPr/>
-          <w:p>
-            <w:pPr>
-              <w:numPr>
-                <w:ilvl w:val="0"/>
-                <w:numId w:val="1046"/>
-              </w:numPr>
-              <w:jc w:val="left"/>
-            </w:pPr>
-            <w:r>
-              <w:t xml:space="preserve">Quality-pass fixes for v6.5.1: LaTeX quote conversion now handles only paired quotes (quote characters inside code arguments are no longer corrupted); signature cells containing escaped ampersands are no longer split; round-trip HTML generation guards the asciidoctor-diagram dependency and fails loudly when generation fails; pre-processor unit tests now cover pipe escaping in all five table handlers.</w:t>
-            </w:r>
-          </w:p>
-        </w:tc>
-      </w:tr>
-      <w:tr>
-        <w:tc>
-          <w:tcPr>
-            <w:shd w:val="clear" w:color="auto" w:fill="F6F8FA"/>
-          </w:tcPr>
-          <w:p>
-            <w:pPr>
-              <w:jc w:val="left"/>
-            </w:pPr>
-            <w:r>
-              <w:t xml:space="preserve">6.5.1</w:t>
             </w:r>
           </w:p>
         </w:tc>
@@ -13611,7 +13599,7 @@
               <w:jc w:val="left"/>
             </w:pPr>
             <w:r>
-              <w:t xml:space="preserve">Fixed DOCX/MD/HTML output: tables are no longer corrupted when changelog, signature, or summary content contains a pipe character (“|”). Badge text is now preserved in DOCX/MD/HTML — a “Ready” badge renders “Ready” instead of “[NEW]”. Multi-item changelog entries render as bullet lists instead of being joined with a literal “+”. POC documents now include the changelog in DOCX/MD/HTML. The :noanswers: attribute now hides test results and remarks in DOCX/MD/HTML, matching the PDF. Inline LaTeX (monospace text, arrows, LaTeX quotes) no longer leaks from changelog entries. The test suite now exercises the real build pipeline (pre-processor wired into round-trip and DOCX tests), with new pre-processor unit tests.</w:t>
+              <w:t xml:space="preserve">Quality-pass fixes for v6.5.1: LaTeX quote conversion now handles only paired quotes (quote characters inside code arguments are no longer corrupted); signature cells containing escaped ampersands are no longer split; round-trip HTML generation guards the asciidoctor-diagram dependency and fails loudly when generation fails; pre-processor unit tests now cover pipe escaping in all five table handlers.</w:t>
             </w:r>
           </w:p>
         </w:tc>
@@ -13624,7 +13612,7 @@
               <w:jc w:val="left"/>
             </w:pPr>
             <w:r>
-              <w:t xml:space="preserve">6.5.0</w:t>
+              <w:t xml:space="preserve">6.5.1</w:t>
             </w:r>
           </w:p>
         </w:tc>
@@ -13650,7 +13638,7 @@
               <w:jc w:val="left"/>
             </w:pPr>
             <w:r>
-              <w:t xml:space="preserve">Evidence checklist simplified to plain bullets in both PDF and DOCX (checkbox markers removed for compatibility). Planned Activities list in DOCX now uses Word’s native lower-roman numbering (i., ii., iii.) matching the PDF. Badges in DOCX replaced with exact-replica PNG pill images (rounded, colored frame and background, bold text) matching the PDF \ huaweibadge look — assets committed to the repo. Signature blocks in DOCX no longer show literal + symbols (proper hard line breaks).</w:t>
+              <w:t xml:space="preserve">Fixed DOCX/MD/HTML output: tables are no longer corrupted when changelog, signature, or summary content contains a pipe character (“|”). Badge text is now preserved in DOCX/MD/HTML — a “Ready” badge renders “Ready” instead of “[NEW]”. Multi-item changelog entries render as bullet lists instead of being joined with a literal “+”. POC documents now include the changelog in DOCX/MD/HTML. The :noanswers: attribute now hides test results and remarks in DOCX/MD/HTML, matching the PDF. Inline LaTeX (monospace text, arrows, LaTeX quotes) no longer leaks from changelog entries. The test suite now exercises the real build pipeline (pre-processor wired into round-trip and DOCX tests), with new pre-processor unit tests.</w:t>
             </w:r>
           </w:p>
         </w:tc>
@@ -13665,7 +13653,7 @@
               <w:jc w:val="left"/>
             </w:pPr>
             <w:r>
-              <w:t xml:space="preserve">6.4.7</w:t>
+              <w:t xml:space="preserve">6.5.0</w:t>
             </w:r>
           </w:p>
         </w:tc>
@@ -13695,7 +13683,7 @@
               <w:jc w:val="left"/>
             </w:pPr>
             <w:r>
-              <w:t xml:space="preserve">Section titles in DOCX now match the PDF heading design: the big section number (56pt) sits on the left, the title text is pushed to the right edge (a right tab stop mimics the LaTeX \ hfill), and the red rule runs below — previously the title sat left-aligned next to a small number. Applies to all templates.</w:t>
+              <w:t xml:space="preserve">Evidence checklist simplified to plain bullets in both PDF and DOCX (checkbox markers removed for compatibility). Planned Activities list in DOCX now uses Word’s native lower-roman numbering (i., ii., iii.) matching the PDF. Badges in DOCX replaced with exact-replica PNG pill images (rounded, colored frame and background, bold text) matching the PDF \ huaweibadge look — assets committed to the repo. Signature blocks in DOCX no longer show literal + symbols (proper hard line breaks).</w:t>
             </w:r>
           </w:p>
         </w:tc>
@@ -13708,7 +13696,7 @@
               <w:jc w:val="left"/>
             </w:pPr>
             <w:r>
-              <w:t xml:space="preserve">6.4.6</w:t>
+              <w:t xml:space="preserve">6.4.7</w:t>
             </w:r>
           </w:p>
         </w:tc>
@@ -13734,7 +13722,7 @@
               <w:jc w:val="left"/>
             </w:pPr>
             <w:r>
-              <w:t xml:space="preserve">Code blocks inside test cases no longer break the red left rule in DOCX — the code style’s left indent (which jogged the rule) is reset inside test case blocks, and code blocks now show the PDF’s code box (gray background with thin border on top, bottom, and right, red rule continuing on the left).</w:t>
+              <w:t xml:space="preserve">Section titles in DOCX now match the PDF heading design: the big section number (56pt) sits on the left, the title text is pushed to the right edge (a right tab stop mimics the LaTeX \ hfill), and the red rule runs below — previously the title sat left-aligned next to a small number. Applies to all templates.</w:t>
             </w:r>
           </w:p>
         </w:tc>
@@ -13749,7 +13737,7 @@
               <w:jc w:val="left"/>
             </w:pPr>
             <w:r>
-              <w:t xml:space="preserve">6.4.5</w:t>
+              <w:t xml:space="preserve">6.4.6</w:t>
             </w:r>
           </w:p>
         </w:tc>
@@ -13779,7 +13767,7 @@
               <w:jc w:val="left"/>
             </w:pPr>
             <w:r>
-              <w:t xml:space="preserve">DOCX polish pass: all captions centered (matching the PDF), vertical spacing between blocks matched to the LaTeX rhythm (medskip/smallskip around captions, field bars, and steps), and test steps now render as separate paragraphs each with the red bold number (previously merged into one paragraph).</w:t>
+              <w:t xml:space="preserve">Code blocks inside test cases no longer break the red left rule in DOCX — the code style’s left indent (which jogged the rule) is reset inside test case blocks, and code blocks now show the PDF’s code box (gray background with thin border on top, bottom, and right, red rule continuing on the left).</w:t>
             </w:r>
           </w:p>
         </w:tc>
@@ -13792,7 +13780,7 @@
               <w:jc w:val="left"/>
             </w:pPr>
             <w:r>
-              <w:t xml:space="preserve">6.4.4</w:t>
+              <w:t xml:space="preserve">6.4.5</w:t>
             </w:r>
           </w:p>
         </w:tc>
@@ -13818,7 +13806,7 @@
               <w:jc w:val="left"/>
             </w:pPr>
             <w:r>
-              <w:t xml:space="preserve">DOCX covers now show the logo, cover text, and version/date/time meta line like the PDF. Test case blocks in DOCX get the PDF’s visual wrapper: red left rule, red field header bars, and red step numbers. Captions follow the PDF ordering system in DOCX, MD, and HTML (Table/Diagram/Figure/Testcase N: with bold symbol). Portuguese PDFs now label diagrams "Diagrama N:" (was hardcoded English "Diagram"). Markdown and HTML output no longer leaks raw LaTeX from passthrough blocks — the DOCX pre-processor now feeds those pipelines too.</w:t>
+              <w:t xml:space="preserve">DOCX polish pass: all captions centered (matching the PDF), vertical spacing between blocks matched to the LaTeX rhythm (medskip/smallskip around captions, field bars, and steps), and test steps now render as separate paragraphs each with the red bold number (previously merged into one paragraph).</w:t>
             </w:r>
           </w:p>
         </w:tc>
@@ -13833,7 +13821,7 @@
               <w:jc w:val="left"/>
             </w:pPr>
             <w:r>
-              <w:t xml:space="preserve">6.4.3</w:t>
+              <w:t xml:space="preserve">6.4.4</w:t>
             </w:r>
           </w:p>
         </w:tc>
@@ -13863,7 +13851,7 @@
               <w:jc w:val="left"/>
             </w:pPr>
             <w:r>
-              <w:t xml:space="preserve">Testbook and POC DOCX output now matches the PDF much more closely: native table of contents (language-aware, auto-populated), each section starts on a new page, embedded images and diagrams (PlantUML/Graphviz rendered), white-on-red table headers, cover version line under the title, centered test case captions, and plain black rules for signature grids.</w:t>
+              <w:t xml:space="preserve">DOCX covers now show the logo, cover text, and version/date/time meta line like the PDF. Test case blocks in DOCX get the PDF’s visual wrapper: red left rule, red field header bars, and red step numbers. Captions follow the PDF ordering system in DOCX, MD, and HTML (Table/Diagram/Figure/Testcase N: with bold symbol). Portuguese PDFs now label diagrams "Diagrama N:" (was hardcoded English "Diagram"). Markdown and HTML output no longer leaks raw LaTeX from passthrough blocks — the DOCX pre-processor now feeds those pipelines too.</w:t>
             </w:r>
           </w:p>
         </w:tc>
@@ -13876,7 +13864,7 @@
               <w:jc w:val="left"/>
             </w:pPr>
             <w:r>
-              <w:t xml:space="preserve">6.4.2</w:t>
+              <w:t xml:space="preserve">6.4.3</w:t>
             </w:r>
           </w:p>
         </w:tc>
@@ -13902,7 +13890,7 @@
               <w:jc w:val="left"/>
             </w:pPr>
             <w:r>
-              <w:t xml:space="preserve">DOCX output for POC and testbook templates now includes all passthrough content (stakeholders, closing record, signatures, test cases, test summary, changelog) via a new pre-processor. Fixed dropped Test Scope fields in testbook DOCX output.</w:t>
+              <w:t xml:space="preserve">Testbook and POC DOCX output now matches the PDF much more closely: native table of contents (language-aware, auto-populated), each section starts on a new page, embedded images and diagrams (PlantUML/Graphviz rendered), white-on-red table headers, cover version line under the title, centered test case captions, and plain black rules for signature grids.</w:t>
             </w:r>
           </w:p>
         </w:tc>
@@ -13917,7 +13905,7 @@
               <w:jc w:val="left"/>
             </w:pPr>
             <w:r>
-              <w:t xml:space="preserve">6.4.0</w:t>
+              <w:t xml:space="preserve">6.4.2</w:t>
             </w:r>
           </w:p>
         </w:tc>
@@ -13947,6 +13935,45 @@
               <w:jc w:val="left"/>
             </w:pPr>
             <w:r>
+              <w:t xml:space="preserve">DOCX output for POC and testbook templates now includes all passthrough content (stakeholders, closing record, signatures, test cases, test summary, changelog) via a new pre-processor. Fixed dropped Test Scope fields in testbook DOCX output.</w:t>
+            </w:r>
+          </w:p>
+        </w:tc>
+      </w:tr>
+      <w:tr>
+        <w:tc>
+          <w:tcPr/>
+          <w:p>
+            <w:pPr>
+              <w:jc w:val="left"/>
+            </w:pPr>
+            <w:r>
+              <w:t xml:space="preserve">6.4.0</w:t>
+            </w:r>
+          </w:p>
+        </w:tc>
+        <w:tc>
+          <w:tcPr/>
+          <w:p>
+            <w:pPr>
+              <w:jc w:val="left"/>
+            </w:pPr>
+            <w:r>
+              <w:t xml:space="preserve">2026-09-20</w:t>
+            </w:r>
+          </w:p>
+        </w:tc>
+        <w:tc>
+          <w:tcPr/>
+          <w:p>
+            <w:pPr>
+              <w:numPr>
+                <w:ilvl w:val="0"/>
+                <w:numId w:val="1056"/>
+              </w:numPr>
+              <w:jc w:val="left"/>
+            </w:pPr>
+            <w:r>
               <w:t xml:space="preserve">Fixed changelog dates — replaced</w:t>
             </w:r>
             <w:r>
@@ -13969,54 +13996,15 @@
       </w:tr>
       <w:tr>
         <w:tc>
-          <w:tcPr/>
+          <w:tcPr>
+            <w:shd w:val="clear" w:color="auto" w:fill="F6F8FA"/>
+          </w:tcPr>
           <w:p>
             <w:pPr>
               <w:jc w:val="left"/>
             </w:pPr>
             <w:r>
               <w:t xml:space="preserve">5.1.1</w:t>
-            </w:r>
-          </w:p>
-        </w:tc>
-        <w:tc>
-          <w:tcPr/>
-          <w:p>
-            <w:pPr>
-              <w:jc w:val="left"/>
-            </w:pPr>
-            <w:r>
-              <w:t xml:space="preserve">2026-09-14</w:t>
-            </w:r>
-          </w:p>
-        </w:tc>
-        <w:tc>
-          <w:tcPr/>
-          <w:p>
-            <w:pPr>
-              <w:numPr>
-                <w:ilvl w:val="0"/>
-                <w:numId w:val="1056"/>
-              </w:numPr>
-              <w:jc w:val="left"/>
-            </w:pPr>
-            <w:r>
-              <w:t xml:space="preserve">Synced callout colors in DOCX/HTML/MD output to match brand palette. Added color palette demo.</w:t>
-            </w:r>
-          </w:p>
-        </w:tc>
-      </w:tr>
-      <w:tr>
-        <w:tc>
-          <w:tcPr>
-            <w:shd w:val="clear" w:color="auto" w:fill="F6F8FA"/>
-          </w:tcPr>
-          <w:p>
-            <w:pPr>
-              <w:jc w:val="left"/>
-            </w:pPr>
-            <w:r>
-              <w:t xml:space="preserve">5.1.0</w:t>
             </w:r>
           </w:p>
         </w:tc>
@@ -14046,7 +14034,7 @@
               <w:jc w:val="left"/>
             </w:pPr>
             <w:r>
-              <w:t xml:space="preserve">Adopted brand guidelines auxiliary color palette and monochrome scale. Aligned callout colors to brand specifications.</w:t>
+              <w:t xml:space="preserve">Synced callout colors in DOCX/HTML/MD output to match brand palette. Added color palette demo.</w:t>
             </w:r>
           </w:p>
         </w:tc>
@@ -14059,7 +14047,7 @@
               <w:jc w:val="left"/>
             </w:pPr>
             <w:r>
-              <w:t xml:space="preserve">5.0.3</w:t>
+              <w:t xml:space="preserve">5.1.0</w:t>
             </w:r>
           </w:p>
         </w:tc>
@@ -14085,6 +14073,51 @@
               <w:jc w:val="left"/>
             </w:pPr>
             <w:r>
+              <w:t xml:space="preserve">Adopted brand guidelines auxiliary color palette and monochrome scale. Aligned callout colors to brand specifications.</w:t>
+            </w:r>
+          </w:p>
+        </w:tc>
+      </w:tr>
+      <w:tr>
+        <w:tc>
+          <w:tcPr>
+            <w:shd w:val="clear" w:color="auto" w:fill="F6F8FA"/>
+          </w:tcPr>
+          <w:p>
+            <w:pPr>
+              <w:jc w:val="left"/>
+            </w:pPr>
+            <w:r>
+              <w:t xml:space="preserve">5.0.3</w:t>
+            </w:r>
+          </w:p>
+        </w:tc>
+        <w:tc>
+          <w:tcPr>
+            <w:shd w:val="clear" w:color="auto" w:fill="F6F8FA"/>
+          </w:tcPr>
+          <w:p>
+            <w:pPr>
+              <w:jc w:val="left"/>
+            </w:pPr>
+            <w:r>
+              <w:t xml:space="preserve">2026-09-14</w:t>
+            </w:r>
+          </w:p>
+        </w:tc>
+        <w:tc>
+          <w:tcPr>
+            <w:shd w:val="clear" w:color="auto" w:fill="F6F8FA"/>
+          </w:tcPr>
+          <w:p>
+            <w:pPr>
+              <w:numPr>
+                <w:ilvl w:val="0"/>
+                <w:numId w:val="1059"/>
+              </w:numPr>
+              <w:jc w:val="left"/>
+            </w:pPr>
+            <w:r>
               <w:t xml:space="preserve">Removed non-standard</w:t>
             </w:r>
             <w:r>
@@ -14107,58 +14140,13 @@
       </w:tr>
       <w:tr>
         <w:tc>
-          <w:tcPr>
-            <w:shd w:val="clear" w:color="auto" w:fill="F6F8FA"/>
-          </w:tcPr>
+          <w:tcPr/>
           <w:p>
             <w:pPr>
               <w:jc w:val="left"/>
             </w:pPr>
             <w:r>
               <w:t xml:space="preserve">5.0.2</w:t>
-            </w:r>
-          </w:p>
-        </w:tc>
-        <w:tc>
-          <w:tcPr>
-            <w:shd w:val="clear" w:color="auto" w:fill="F6F8FA"/>
-          </w:tcPr>
-          <w:p>
-            <w:pPr>
-              <w:jc w:val="left"/>
-            </w:pPr>
-            <w:r>
-              <w:t xml:space="preserve">2026-09-14</w:t>
-            </w:r>
-          </w:p>
-        </w:tc>
-        <w:tc>
-          <w:tcPr>
-            <w:shd w:val="clear" w:color="auto" w:fill="F6F8FA"/>
-          </w:tcPr>
-          <w:p>
-            <w:pPr>
-              <w:numPr>
-                <w:ilvl w:val="0"/>
-                <w:numId w:val="1059"/>
-              </w:numPr>
-              <w:jc w:val="left"/>
-            </w:pPr>
-            <w:r>
-              <w:t xml:space="preserve">Long commands in test steps now render as code blocks instead of inline code.</w:t>
-            </w:r>
-          </w:p>
-        </w:tc>
-      </w:tr>
-      <w:tr>
-        <w:tc>
-          <w:tcPr/>
-          <w:p>
-            <w:pPr>
-              <w:jc w:val="left"/>
-            </w:pPr>
-            <w:r>
-              <w:t xml:space="preserve">5.0.1</w:t>
             </w:r>
           </w:p>
         </w:tc>
@@ -14184,7 +14172,7 @@
               <w:jc w:val="left"/>
             </w:pPr>
             <w:r>
-              <w:t xml:space="preserve">Testcase caption centered above the block.</w:t>
+              <w:t xml:space="preserve">Long commands in test steps now render as code blocks instead of inline code.</w:t>
             </w:r>
           </w:p>
         </w:tc>
@@ -14199,7 +14187,7 @@
               <w:jc w:val="left"/>
             </w:pPr>
             <w:r>
-              <w:t xml:space="preserve">5.0.0</w:t>
+              <w:t xml:space="preserve">5.0.1</w:t>
             </w:r>
           </w:p>
         </w:tc>
@@ -14229,6 +14217,45 @@
               <w:jc w:val="left"/>
             </w:pPr>
             <w:r>
+              <w:t xml:space="preserve">Testcase caption centered above the block.</w:t>
+            </w:r>
+          </w:p>
+        </w:tc>
+      </w:tr>
+      <w:tr>
+        <w:tc>
+          <w:tcPr/>
+          <w:p>
+            <w:pPr>
+              <w:jc w:val="left"/>
+            </w:pPr>
+            <w:r>
+              <w:t xml:space="preserve">5.0.0</w:t>
+            </w:r>
+          </w:p>
+        </w:tc>
+        <w:tc>
+          <w:tcPr/>
+          <w:p>
+            <w:pPr>
+              <w:jc w:val="left"/>
+            </w:pPr>
+            <w:r>
+              <w:t xml:space="preserve">2026-09-14</w:t>
+            </w:r>
+          </w:p>
+        </w:tc>
+        <w:tc>
+          <w:tcPr/>
+          <w:p>
+            <w:pPr>
+              <w:numPr>
+                <w:ilvl w:val="0"/>
+                <w:numId w:val="1062"/>
+              </w:numPr>
+              <w:jc w:val="left"/>
+            </w:pPr>
+            <w:r>
               <w:t xml:space="preserve">Major refactoring: extracted shared modules (huawei-titles, huawei-toc, huawei-cover), renamed</w:t>
             </w:r>
             <w:r>
@@ -14290,7 +14317,9 @@
       </w:tr>
       <w:tr>
         <w:tc>
-          <w:tcPr/>
+          <w:tcPr>
+            <w:shd w:val="clear" w:color="auto" w:fill="F6F8FA"/>
+          </w:tcPr>
           <w:p>
             <w:pPr>
               <w:jc w:val="left"/>
@@ -14301,56 +14330,15 @@
           </w:p>
         </w:tc>
         <w:tc>
-          <w:tcPr/>
+          <w:tcPr>
+            <w:shd w:val="clear" w:color="auto" w:fill="F6F8FA"/>
+          </w:tcPr>
           <w:p>
             <w:pPr>
               <w:jc w:val="left"/>
             </w:pPr>
             <w:r>
               <w:t xml:space="preserve">2026-09-14</w:t>
-            </w:r>
-          </w:p>
-        </w:tc>
-        <w:tc>
-          <w:tcPr/>
-          <w:p>
-            <w:pPr>
-              <w:numPr>
-                <w:ilvl w:val="0"/>
-                <w:numId w:val="1062"/>
-              </w:numPr>
-              <w:jc w:val="left"/>
-            </w:pPr>
-            <w:r>
-              <w:t xml:space="preserve">Testcase headings now formatted as captions (like figures/tables): bold “Testcase N:” followed by description. Changed label from “Test Case” to “Testcase”.</w:t>
-            </w:r>
-          </w:p>
-        </w:tc>
-      </w:tr>
-      <w:tr>
-        <w:tc>
-          <w:tcPr>
-            <w:shd w:val="clear" w:color="auto" w:fill="F6F8FA"/>
-          </w:tcPr>
-          <w:p>
-            <w:pPr>
-              <w:jc w:val="left"/>
-            </w:pPr>
-            <w:r>
-              <w:t xml:space="preserve">4.6.0</w:t>
-            </w:r>
-          </w:p>
-        </w:tc>
-        <w:tc>
-          <w:tcPr>
-            <w:shd w:val="clear" w:color="auto" w:fill="F6F8FA"/>
-          </w:tcPr>
-          <w:p>
-            <w:pPr>
-              <w:jc w:val="left"/>
-            </w:pPr>
-            <w:r>
-              <w:t xml:space="preserve">2026-09-13</w:t>
             </w:r>
           </w:p>
         </w:tc>
@@ -14367,7 +14355,7 @@
               <w:jc w:val="left"/>
             </w:pPr>
             <w:r>
-              <w:t xml:space="preserve">Section restructure: Introduction, Test Cases (with category subsections), Conclusion. Testcases auto-numbered like figures/tables. Changed testcase from subsection to subsubsection.</w:t>
+              <w:t xml:space="preserve">Testcase headings now formatted as captions (like figures/tables): bold “Testcase N:” followed by description. Changed label from “Test Case” to “Testcase”.</w:t>
             </w:r>
           </w:p>
         </w:tc>
@@ -14380,7 +14368,7 @@
               <w:jc w:val="left"/>
             </w:pPr>
             <w:r>
-              <w:t xml:space="preserve">4.5.0</w:t>
+              <w:t xml:space="preserve">4.6.0</w:t>
             </w:r>
           </w:p>
         </w:tc>
@@ -14406,6 +14394,51 @@
               <w:jc w:val="left"/>
             </w:pPr>
             <w:r>
+              <w:t xml:space="preserve">Section restructure: Introduction, Test Cases (with category subsections), Conclusion. Testcases auto-numbered like figures/tables. Changed testcase from subsection to subsubsection.</w:t>
+            </w:r>
+          </w:p>
+        </w:tc>
+      </w:tr>
+      <w:tr>
+        <w:tc>
+          <w:tcPr>
+            <w:shd w:val="clear" w:color="auto" w:fill="F6F8FA"/>
+          </w:tcPr>
+          <w:p>
+            <w:pPr>
+              <w:jc w:val="left"/>
+            </w:pPr>
+            <w:r>
+              <w:t xml:space="preserve">4.5.0</w:t>
+            </w:r>
+          </w:p>
+        </w:tc>
+        <w:tc>
+          <w:tcPr>
+            <w:shd w:val="clear" w:color="auto" w:fill="F6F8FA"/>
+          </w:tcPr>
+          <w:p>
+            <w:pPr>
+              <w:jc w:val="left"/>
+            </w:pPr>
+            <w:r>
+              <w:t xml:space="preserve">2026-09-13</w:t>
+            </w:r>
+          </w:p>
+        </w:tc>
+        <w:tc>
+          <w:tcPr>
+            <w:shd w:val="clear" w:color="auto" w:fill="F6F8FA"/>
+          </w:tcPr>
+          <w:p>
+            <w:pPr>
+              <w:numPr>
+                <w:ilvl w:val="0"/>
+                <w:numId w:val="1065"/>
+              </w:numPr>
+              <w:jc w:val="left"/>
+            </w:pPr>
+            <w:r>
               <w:t xml:space="preserve">Unified field APIs:</w:t>
             </w:r>
             <w:r>
@@ -14470,58 +14503,13 @@
       </w:tr>
       <w:tr>
         <w:tc>
-          <w:tcPr>
-            <w:shd w:val="clear" w:color="auto" w:fill="F6F8FA"/>
-          </w:tcPr>
+          <w:tcPr/>
           <w:p>
             <w:pPr>
               <w:jc w:val="left"/>
             </w:pPr>
             <w:r>
               <w:t xml:space="preserve">4.4.0</w:t>
-            </w:r>
-          </w:p>
-        </w:tc>
-        <w:tc>
-          <w:tcPr>
-            <w:shd w:val="clear" w:color="auto" w:fill="F6F8FA"/>
-          </w:tcPr>
-          <w:p>
-            <w:pPr>
-              <w:jc w:val="left"/>
-            </w:pPr>
-            <w:r>
-              <w:t xml:space="preserve">2026-09-13</w:t>
-            </w:r>
-          </w:p>
-        </w:tc>
-        <w:tc>
-          <w:tcPr>
-            <w:shd w:val="clear" w:color="auto" w:fill="F6F8FA"/>
-          </w:tcPr>
-          <w:p>
-            <w:pPr>
-              <w:numPr>
-                <w:ilvl w:val="0"/>
-                <w:numId w:val="1065"/>
-              </w:numPr>
-              <w:jc w:val="left"/>
-            </w:pPr>
-            <w:r>
-              <w:t xml:space="preserve">Code review fixes: removed dead labels, badge now uses Huawei brand colors (tipbg/tipfg, huaweired, warningbg/warningfg), Lua filter preserves formatting in DOCX/MD/HTML via parse_latex_blocks, testprocedure handler preserves non-step content (images, code, callouts).</w:t>
-            </w:r>
-          </w:p>
-        </w:tc>
-      </w:tr>
-      <w:tr>
-        <w:tc>
-          <w:tcPr/>
-          <w:p>
-            <w:pPr>
-              <w:jc w:val="left"/>
-            </w:pPr>
-            <w:r>
-              <w:t xml:space="preserve">4.3.0</w:t>
             </w:r>
           </w:p>
         </w:tc>
@@ -14547,6 +14535,51 @@
               <w:jc w:val="left"/>
             </w:pPr>
             <w:r>
+              <w:t xml:space="preserve">Code review fixes: removed dead labels, badge now uses Huawei brand colors (tipbg/tipfg, huaweired, warningbg/warningfg), Lua filter preserves formatting in DOCX/MD/HTML via parse_latex_blocks, testprocedure handler preserves non-step content (images, code, callouts).</w:t>
+            </w:r>
+          </w:p>
+        </w:tc>
+      </w:tr>
+      <w:tr>
+        <w:tc>
+          <w:tcPr>
+            <w:shd w:val="clear" w:color="auto" w:fill="F6F8FA"/>
+          </w:tcPr>
+          <w:p>
+            <w:pPr>
+              <w:jc w:val="left"/>
+            </w:pPr>
+            <w:r>
+              <w:t xml:space="preserve">4.3.0</w:t>
+            </w:r>
+          </w:p>
+        </w:tc>
+        <w:tc>
+          <w:tcPr>
+            <w:shd w:val="clear" w:color="auto" w:fill="F6F8FA"/>
+          </w:tcPr>
+          <w:p>
+            <w:pPr>
+              <w:jc w:val="left"/>
+            </w:pPr>
+            <w:r>
+              <w:t xml:space="preserve">2026-09-13</w:t>
+            </w:r>
+          </w:p>
+        </w:tc>
+        <w:tc>
+          <w:tcPr>
+            <w:shd w:val="clear" w:color="auto" w:fill="F6F8FA"/>
+          </w:tcPr>
+          <w:p>
+            <w:pPr>
+              <w:numPr>
+                <w:ilvl w:val="0"/>
+                <w:numId w:val="1067"/>
+              </w:numPr>
+              <w:jc w:val="left"/>
+            </w:pPr>
+            <w:r>
               <w:t xml:space="preserve">Added</w:t>
             </w:r>
             <w:r>
@@ -14599,9 +14632,7 @@
       </w:tr>
       <w:tr>
         <w:tc>
-          <w:tcPr>
-            <w:shd w:val="clear" w:color="auto" w:fill="F6F8FA"/>
-          </w:tcPr>
+          <w:tcPr/>
           <w:p>
             <w:pPr>
               <w:jc w:val="left"/>
@@ -14612,9 +14643,7 @@
           </w:p>
         </w:tc>
         <w:tc>
-          <w:tcPr>
-            <w:shd w:val="clear" w:color="auto" w:fill="F6F8FA"/>
-          </w:tcPr>
+          <w:tcPr/>
           <w:p>
             <w:pPr>
               <w:jc w:val="left"/>
@@ -14625,14 +14654,12 @@
           </w:p>
         </w:tc>
         <w:tc>
-          <w:tcPr>
-            <w:shd w:val="clear" w:color="auto" w:fill="F6F8FA"/>
-          </w:tcPr>
+          <w:tcPr/>
           <w:p>
             <w:pPr>
               <w:numPr>
                 <w:ilvl w:val="0"/>
-                <w:numId w:val="1067"/>
+                <w:numId w:val="1068"/>
               </w:numPr>
               <w:jc w:val="left"/>
             </w:pPr>
@@ -14686,7 +14713,9 @@
       </w:tr>
       <w:tr>
         <w:tc>
-          <w:tcPr/>
+          <w:tcPr>
+            <w:shd w:val="clear" w:color="auto" w:fill="F6F8FA"/>
+          </w:tcPr>
           <w:p>
             <w:pPr>
               <w:jc w:val="left"/>
@@ -14697,7 +14726,9 @@
           </w:p>
         </w:tc>
         <w:tc>
-          <w:tcPr/>
+          <w:tcPr>
+            <w:shd w:val="clear" w:color="auto" w:fill="F6F8FA"/>
+          </w:tcPr>
           <w:p>
             <w:pPr>
               <w:jc w:val="left"/>
@@ -14708,12 +14739,14 @@
           </w:p>
         </w:tc>
         <w:tc>
-          <w:tcPr/>
+          <w:tcPr>
+            <w:shd w:val="clear" w:color="auto" w:fill="F6F8FA"/>
+          </w:tcPr>
           <w:p>
             <w:pPr>
               <w:numPr>
                 <w:ilvl w:val="0"/>
-                <w:numId w:val="1068"/>
+                <w:numId w:val="1069"/>
               </w:numPr>
               <w:jc w:val="left"/>
             </w:pPr>
@@ -14740,9 +14773,7 @@
       </w:tr>
       <w:tr>
         <w:tc>
-          <w:tcPr>
-            <w:shd w:val="clear" w:color="auto" w:fill="F6F8FA"/>
-          </w:tcPr>
+          <w:tcPr/>
           <w:p>
             <w:pPr>
               <w:jc w:val="left"/>
@@ -14753,9 +14784,7 @@
           </w:p>
         </w:tc>
         <w:tc>
-          <w:tcPr>
-            <w:shd w:val="clear" w:color="auto" w:fill="F6F8FA"/>
-          </w:tcPr>
+          <w:tcPr/>
           <w:p>
             <w:pPr>
               <w:jc w:val="left"/>
@@ -14766,14 +14795,12 @@
           </w:p>
         </w:tc>
         <w:tc>
-          <w:tcPr>
-            <w:shd w:val="clear" w:color="auto" w:fill="F6F8FA"/>
-          </w:tcPr>
+          <w:tcPr/>
           <w:p>
             <w:pPr>
               <w:numPr>
                 <w:ilvl w:val="0"/>
-                <w:numId w:val="1069"/>
+                <w:numId w:val="1070"/>
               </w:numPr>
               <w:jc w:val="left"/>
             </w:pPr>
@@ -14815,7 +14842,9 @@
       </w:tr>
       <w:tr>
         <w:tc>
-          <w:tcPr/>
+          <w:tcPr>
+            <w:shd w:val="clear" w:color="auto" w:fill="F6F8FA"/>
+          </w:tcPr>
           <w:p>
             <w:pPr>
               <w:jc w:val="left"/>
@@ -14826,7 +14855,9 @@
           </w:p>
         </w:tc>
         <w:tc>
-          <w:tcPr/>
+          <w:tcPr>
+            <w:shd w:val="clear" w:color="auto" w:fill="F6F8FA"/>
+          </w:tcPr>
           <w:p>
             <w:pPr>
               <w:jc w:val="left"/>
@@ -14837,12 +14868,14 @@
           </w:p>
         </w:tc>
         <w:tc>
-          <w:tcPr/>
+          <w:tcPr>
+            <w:shd w:val="clear" w:color="auto" w:fill="F6F8FA"/>
+          </w:tcPr>
           <w:p>
             <w:pPr>
               <w:numPr>
                 <w:ilvl w:val="0"/>
-                <w:numId w:val="1070"/>
+                <w:numId w:val="1071"/>
               </w:numPr>
               <w:jc w:val="left"/>
             </w:pPr>
@@ -14869,58 +14902,13 @@
       </w:tr>
       <w:tr>
         <w:tc>
-          <w:tcPr>
-            <w:shd w:val="clear" w:color="auto" w:fill="F6F8FA"/>
-          </w:tcPr>
+          <w:tcPr/>
           <w:p>
             <w:pPr>
               <w:jc w:val="left"/>
             </w:pPr>
             <w:r>
               <w:t xml:space="preserve">3.8.1</w:t>
-            </w:r>
-          </w:p>
-        </w:tc>
-        <w:tc>
-          <w:tcPr>
-            <w:shd w:val="clear" w:color="auto" w:fill="F6F8FA"/>
-          </w:tcPr>
-          <w:p>
-            <w:pPr>
-              <w:jc w:val="left"/>
-            </w:pPr>
-            <w:r>
-              <w:t xml:space="preserve">2026-09-13</w:t>
-            </w:r>
-          </w:p>
-        </w:tc>
-        <w:tc>
-          <w:tcPr>
-            <w:shd w:val="clear" w:color="auto" w:fill="F6F8FA"/>
-          </w:tcPr>
-          <w:p>
-            <w:pPr>
-              <w:numPr>
-                <w:ilvl w:val="0"/>
-                <w:numId w:val="1071"/>
-              </w:numPr>
-              <w:jc w:val="left"/>
-            </w:pPr>
-            <w:r>
-              <w:t xml:space="preserve">End-to-end quality review: fixed testbook PDF metadata title, removed stray user DOCX from template dir, fixed round-trip.sh variable typo, updated stale references in AGENTS.md and README.md, committed testbook sample PDFs, set TZ for pandoc cover time consistency, widened pandoc version range.</w:t>
-            </w:r>
-          </w:p>
-        </w:tc>
-      </w:tr>
-      <w:tr>
-        <w:tc>
-          <w:tcPr/>
-          <w:p>
-            <w:pPr>
-              <w:jc w:val="left"/>
-            </w:pPr>
-            <w:r>
-              <w:t xml:space="preserve">3.8.0</w:t>
             </w:r>
           </w:p>
         </w:tc>
@@ -14946,7 +14934,7 @@
               <w:jc w:val="left"/>
             </w:pPr>
             <w:r>
-              <w:t xml:space="preserve">Removed Tips and Tricks chapter (tmux configuration) — required VS Code-specific keybindings that don’t generalize across terminal setups.</w:t>
+              <w:t xml:space="preserve">End-to-end quality review: fixed testbook PDF metadata title, removed stray user DOCX from template dir, fixed round-trip.sh variable typo, updated stale references in AGENTS.md and README.md, committed testbook sample PDFs, set TZ for pandoc cover time consistency, widened pandoc version range.</w:t>
             </w:r>
           </w:p>
         </w:tc>
@@ -14961,7 +14949,7 @@
               <w:jc w:val="left"/>
             </w:pPr>
             <w:r>
-              <w:t xml:space="preserve">3.7.0</w:t>
+              <w:t xml:space="preserve">3.8.0</w:t>
             </w:r>
           </w:p>
         </w:tc>
@@ -14974,7 +14962,7 @@
               <w:jc w:val="left"/>
             </w:pPr>
             <w:r>
-              <w:t xml:space="preserve">2026-09-12</w:t>
+              <w:t xml:space="preserve">2026-09-13</w:t>
             </w:r>
           </w:p>
         </w:tc>
@@ -14991,6 +14979,45 @@
               <w:jc w:val="left"/>
             </w:pPr>
             <w:r>
+              <w:t xml:space="preserve">Removed Tips and Tricks chapter (tmux configuration) — required VS Code-specific keybindings that don’t generalize across terminal setups.</w:t>
+            </w:r>
+          </w:p>
+        </w:tc>
+      </w:tr>
+      <w:tr>
+        <w:tc>
+          <w:tcPr/>
+          <w:p>
+            <w:pPr>
+              <w:jc w:val="left"/>
+            </w:pPr>
+            <w:r>
+              <w:t xml:space="preserve">3.7.0</w:t>
+            </w:r>
+          </w:p>
+        </w:tc>
+        <w:tc>
+          <w:tcPr/>
+          <w:p>
+            <w:pPr>
+              <w:jc w:val="left"/>
+            </w:pPr>
+            <w:r>
+              <w:t xml:space="preserve">2026-09-12</w:t>
+            </w:r>
+          </w:p>
+        </w:tc>
+        <w:tc>
+          <w:tcPr/>
+          <w:p>
+            <w:pPr>
+              <w:numPr>
+                <w:ilvl w:val="0"/>
+                <w:numId w:val="1074"/>
+              </w:numPr>
+              <w:jc w:val="left"/>
+            </w:pPr>
+            <w:r>
               <w:t xml:space="preserve">Added</w:t>
             </w:r>
             <w:r>
@@ -15043,7 +15070,9 @@
       </w:tr>
       <w:tr>
         <w:tc>
-          <w:tcPr/>
+          <w:tcPr>
+            <w:shd w:val="clear" w:color="auto" w:fill="F6F8FA"/>
+          </w:tcPr>
           <w:p>
             <w:pPr>
               <w:jc w:val="left"/>
@@ -15054,7 +15083,9 @@
           </w:p>
         </w:tc>
         <w:tc>
-          <w:tcPr/>
+          <w:tcPr>
+            <w:shd w:val="clear" w:color="auto" w:fill="F6F8FA"/>
+          </w:tcPr>
           <w:p>
             <w:pPr>
               <w:jc w:val="left"/>
@@ -15065,12 +15096,14 @@
           </w:p>
         </w:tc>
         <w:tc>
-          <w:tcPr/>
+          <w:tcPr>
+            <w:shd w:val="clear" w:color="auto" w:fill="F6F8FA"/>
+          </w:tcPr>
           <w:p>
             <w:pPr>
               <w:numPr>
                 <w:ilvl w:val="0"/>
-                <w:numId w:val="1074"/>
+                <w:numId w:val="1075"/>
               </w:numPr>
               <w:jc w:val="left"/>
             </w:pPr>
@@ -15127,9 +15160,7 @@
       </w:tr>
       <w:tr>
         <w:tc>
-          <w:tcPr>
-            <w:shd w:val="clear" w:color="auto" w:fill="F6F8FA"/>
-          </w:tcPr>
+          <w:tcPr/>
           <w:p>
             <w:pPr>
               <w:jc w:val="left"/>
@@ -15140,9 +15171,7 @@
           </w:p>
         </w:tc>
         <w:tc>
-          <w:tcPr>
-            <w:shd w:val="clear" w:color="auto" w:fill="F6F8FA"/>
-          </w:tcPr>
+          <w:tcPr/>
           <w:p>
             <w:pPr>
               <w:jc w:val="left"/>
@@ -15153,14 +15182,12 @@
           </w:p>
         </w:tc>
         <w:tc>
-          <w:tcPr>
-            <w:shd w:val="clear" w:color="auto" w:fill="F6F8FA"/>
-          </w:tcPr>
+          <w:tcPr/>
           <w:p>
             <w:pPr>
               <w:numPr>
                 <w:ilvl w:val="0"/>
-                <w:numId w:val="1075"/>
+                <w:numId w:val="1076"/>
               </w:numPr>
               <w:jc w:val="left"/>
             </w:pPr>
@@ -15238,7 +15265,9 @@
       </w:tr>
       <w:tr>
         <w:tc>
-          <w:tcPr/>
+          <w:tcPr>
+            <w:shd w:val="clear" w:color="auto" w:fill="F6F8FA"/>
+          </w:tcPr>
           <w:p>
             <w:pPr>
               <w:jc w:val="left"/>
@@ -15249,7 +15278,9 @@
           </w:p>
         </w:tc>
         <w:tc>
-          <w:tcPr/>
+          <w:tcPr>
+            <w:shd w:val="clear" w:color="auto" w:fill="F6F8FA"/>
+          </w:tcPr>
           <w:p>
             <w:pPr>
               <w:jc w:val="left"/>
@@ -15260,12 +15291,14 @@
           </w:p>
         </w:tc>
         <w:tc>
-          <w:tcPr/>
+          <w:tcPr>
+            <w:shd w:val="clear" w:color="auto" w:fill="F6F8FA"/>
+          </w:tcPr>
           <w:p>
             <w:pPr>
               <w:numPr>
                 <w:ilvl w:val="0"/>
-                <w:numId w:val="1076"/>
+                <w:numId w:val="1077"/>
               </w:numPr>
               <w:jc w:val="left"/>
             </w:pPr>
@@ -15292,7 +15325,7 @@
             <w:pPr>
               <w:numPr>
                 <w:ilvl w:val="0"/>
-                <w:numId w:val="1076"/>
+                <w:numId w:val="1077"/>
               </w:numPr>
               <w:jc w:val="left"/>
             </w:pPr>
@@ -15334,7 +15367,7 @@
             <w:pPr>
               <w:numPr>
                 <w:ilvl w:val="0"/>
-                <w:numId w:val="1076"/>
+                <w:numId w:val="1077"/>
               </w:numPr>
               <w:jc w:val="left"/>
             </w:pPr>
@@ -15346,9 +15379,7 @@
       </w:tr>
       <w:tr>
         <w:tc>
-          <w:tcPr>
-            <w:shd w:val="clear" w:color="auto" w:fill="F6F8FA"/>
-          </w:tcPr>
+          <w:tcPr/>
           <w:p>
             <w:pPr>
               <w:jc w:val="left"/>
@@ -15359,9 +15390,7 @@
           </w:p>
         </w:tc>
         <w:tc>
-          <w:tcPr>
-            <w:shd w:val="clear" w:color="auto" w:fill="F6F8FA"/>
-          </w:tcPr>
+          <w:tcPr/>
           <w:p>
             <w:pPr>
               <w:jc w:val="left"/>
@@ -15372,14 +15401,12 @@
           </w:p>
         </w:tc>
         <w:tc>
-          <w:tcPr>
-            <w:shd w:val="clear" w:color="auto" w:fill="F6F8FA"/>
-          </w:tcPr>
+          <w:tcPr/>
           <w:p>
             <w:pPr>
               <w:numPr>
                 <w:ilvl w:val="0"/>
-                <w:numId w:val="1077"/>
+                <w:numId w:val="1078"/>
               </w:numPr>
               <w:jc w:val="left"/>
             </w:pPr>
@@ -15406,7 +15433,7 @@
             <w:pPr>
               <w:numPr>
                 <w:ilvl w:val="0"/>
-                <w:numId w:val="1077"/>
+                <w:numId w:val="1078"/>
               </w:numPr>
               <w:jc w:val="left"/>
             </w:pPr>
@@ -15433,7 +15460,7 @@
             <w:pPr>
               <w:numPr>
                 <w:ilvl w:val="0"/>
-                <w:numId w:val="1077"/>
+                <w:numId w:val="1078"/>
               </w:numPr>
               <w:jc w:val="left"/>
             </w:pPr>
@@ -15445,7 +15472,7 @@
             <w:pPr>
               <w:numPr>
                 <w:ilvl w:val="0"/>
-                <w:numId w:val="1077"/>
+                <w:numId w:val="1078"/>
               </w:numPr>
               <w:jc w:val="left"/>
             </w:pPr>
@@ -15469,54 +15496,15 @@
       </w:tr>
       <w:tr>
         <w:tc>
-          <w:tcPr/>
+          <w:tcPr>
+            <w:shd w:val="clear" w:color="auto" w:fill="F6F8FA"/>
+          </w:tcPr>
           <w:p>
             <w:pPr>
               <w:jc w:val="left"/>
             </w:pPr>
             <w:r>
               <w:t xml:space="preserve">3.2.1</w:t>
-            </w:r>
-          </w:p>
-        </w:tc>
-        <w:tc>
-          <w:tcPr/>
-          <w:p>
-            <w:pPr>
-              <w:jc w:val="left"/>
-            </w:pPr>
-            <w:r>
-              <w:t xml:space="preserve">2026-09-11</w:t>
-            </w:r>
-          </w:p>
-        </w:tc>
-        <w:tc>
-          <w:tcPr/>
-          <w:p>
-            <w:pPr>
-              <w:numPr>
-                <w:ilvl w:val="0"/>
-                <w:numId w:val="1078"/>
-              </w:numPr>
-              <w:jc w:val="left"/>
-            </w:pPr>
-            <w:r>
-              <w:t xml:space="preserve">Renamed Chapter 7 from “Clean Up” to “Operations and Maintenance”. Added subsections for updating and uninstalling both the MaaS Gateway and the document templates. Added cloud resource cleanup as an optional subsection.</w:t>
-            </w:r>
-          </w:p>
-        </w:tc>
-      </w:tr>
-      <w:tr>
-        <w:tc>
-          <w:tcPr>
-            <w:shd w:val="clear" w:color="auto" w:fill="F6F8FA"/>
-          </w:tcPr>
-          <w:p>
-            <w:pPr>
-              <w:jc w:val="left"/>
-            </w:pPr>
-            <w:r>
-              <w:t xml:space="preserve">3.2.0</w:t>
             </w:r>
           </w:p>
         </w:tc>
@@ -15546,6 +15534,45 @@
               <w:jc w:val="left"/>
             </w:pPr>
             <w:r>
+              <w:t xml:space="preserve">Renamed Chapter 7 from “Clean Up” to “Operations and Maintenance”. Added subsections for updating and uninstalling both the MaaS Gateway and the document templates. Added cloud resource cleanup as an optional subsection.</w:t>
+            </w:r>
+          </w:p>
+        </w:tc>
+      </w:tr>
+      <w:tr>
+        <w:tc>
+          <w:tcPr/>
+          <w:p>
+            <w:pPr>
+              <w:jc w:val="left"/>
+            </w:pPr>
+            <w:r>
+              <w:t xml:space="preserve">3.2.0</w:t>
+            </w:r>
+          </w:p>
+        </w:tc>
+        <w:tc>
+          <w:tcPr/>
+          <w:p>
+            <w:pPr>
+              <w:jc w:val="left"/>
+            </w:pPr>
+            <w:r>
+              <w:t xml:space="preserve">2026-09-11</w:t>
+            </w:r>
+          </w:p>
+        </w:tc>
+        <w:tc>
+          <w:tcPr/>
+          <w:p>
+            <w:pPr>
+              <w:numPr>
+                <w:ilvl w:val="0"/>
+                <w:numId w:val="1080"/>
+              </w:numPr>
+              <w:jc w:val="left"/>
+            </w:pPr>
+            <w:r>
               <w:t xml:space="preserve">Added</w:t>
             </w:r>
             <w:r>
@@ -15607,7 +15634,7 @@
             <w:pPr>
               <w:numPr>
                 <w:ilvl w:val="0"/>
-                <w:numId w:val="1079"/>
+                <w:numId w:val="1080"/>
               </w:numPr>
               <w:jc w:val="left"/>
             </w:pPr>
@@ -15652,7 +15679,7 @@
             <w:pPr>
               <w:numPr>
                 <w:ilvl w:val="0"/>
-                <w:numId w:val="1079"/>
+                <w:numId w:val="1080"/>
               </w:numPr>
               <w:jc w:val="left"/>
             </w:pPr>
@@ -15664,54 +15691,15 @@
       </w:tr>
       <w:tr>
         <w:tc>
-          <w:tcPr/>
+          <w:tcPr>
+            <w:shd w:val="clear" w:color="auto" w:fill="F6F8FA"/>
+          </w:tcPr>
           <w:p>
             <w:pPr>
               <w:jc w:val="left"/>
             </w:pPr>
             <w:r>
               <w:t xml:space="preserve">3.1.2</w:t>
-            </w:r>
-          </w:p>
-        </w:tc>
-        <w:tc>
-          <w:tcPr/>
-          <w:p>
-            <w:pPr>
-              <w:jc w:val="left"/>
-            </w:pPr>
-            <w:r>
-              <w:t xml:space="preserve">2026-09-11</w:t>
-            </w:r>
-          </w:p>
-        </w:tc>
-        <w:tc>
-          <w:tcPr/>
-          <w:p>
-            <w:pPr>
-              <w:numPr>
-                <w:ilvl w:val="0"/>
-                <w:numId w:val="1080"/>
-              </w:numPr>
-              <w:jc w:val="left"/>
-            </w:pPr>
-            <w:r>
-              <w:t xml:space="preserve">Added output format guide to README.md: comparison table of PDF, Markdown, DOCX, and HTML with purpose, copy-paste quality, and limitations. Recommends Markdown for copy-paste.</w:t>
-            </w:r>
-          </w:p>
-        </w:tc>
-      </w:tr>
-      <w:tr>
-        <w:tc>
-          <w:tcPr>
-            <w:shd w:val="clear" w:color="auto" w:fill="F6F8FA"/>
-          </w:tcPr>
-          <w:p>
-            <w:pPr>
-              <w:jc w:val="left"/>
-            </w:pPr>
-            <w:r>
-              <w:t xml:space="preserve">3.1.1</w:t>
             </w:r>
           </w:p>
         </w:tc>
@@ -15741,6 +15729,45 @@
               <w:jc w:val="left"/>
             </w:pPr>
             <w:r>
+              <w:t xml:space="preserve">Added output format guide to README.md: comparison table of PDF, Markdown, DOCX, and HTML with purpose, copy-paste quality, and limitations. Recommends Markdown for copy-paste.</w:t>
+            </w:r>
+          </w:p>
+        </w:tc>
+      </w:tr>
+      <w:tr>
+        <w:tc>
+          <w:tcPr/>
+          <w:p>
+            <w:pPr>
+              <w:jc w:val="left"/>
+            </w:pPr>
+            <w:r>
+              <w:t xml:space="preserve">3.1.1</w:t>
+            </w:r>
+          </w:p>
+        </w:tc>
+        <w:tc>
+          <w:tcPr/>
+          <w:p>
+            <w:pPr>
+              <w:jc w:val="left"/>
+            </w:pPr>
+            <w:r>
+              <w:t xml:space="preserve">2026-09-11</w:t>
+            </w:r>
+          </w:p>
+        </w:tc>
+        <w:tc>
+          <w:tcPr/>
+          <w:p>
+            <w:pPr>
+              <w:numPr>
+                <w:ilvl w:val="0"/>
+                <w:numId w:val="1082"/>
+              </w:numPr>
+              <w:jc w:val="left"/>
+            </w:pPr>
+            <w:r>
               <w:t xml:space="preserve">Updated MaaS Gateway chapter to v1.10.9: non-interactive mode (</w:t>
             </w:r>
             <w:r>
@@ -15757,7 +15784,7 @@
             <w:pPr>
               <w:numPr>
                 <w:ilvl w:val="0"/>
-                <w:numId w:val="1081"/>
+                <w:numId w:val="1082"/>
               </w:numPr>
               <w:jc w:val="left"/>
             </w:pPr>
@@ -15799,7 +15826,7 @@
             <w:pPr>
               <w:numPr>
                 <w:ilvl w:val="0"/>
-                <w:numId w:val="1081"/>
+                <w:numId w:val="1082"/>
               </w:numPr>
               <w:jc w:val="left"/>
             </w:pPr>
@@ -15811,7 +15838,9 @@
       </w:tr>
       <w:tr>
         <w:tc>
-          <w:tcPr/>
+          <w:tcPr>
+            <w:shd w:val="clear" w:color="auto" w:fill="F6F8FA"/>
+          </w:tcPr>
           <w:p>
             <w:pPr>
               <w:jc w:val="left"/>
@@ -15822,7 +15851,9 @@
           </w:p>
         </w:tc>
         <w:tc>
-          <w:tcPr/>
+          <w:tcPr>
+            <w:shd w:val="clear" w:color="auto" w:fill="F6F8FA"/>
+          </w:tcPr>
           <w:p>
             <w:pPr>
               <w:jc w:val="left"/>
@@ -15833,12 +15864,14 @@
           </w:p>
         </w:tc>
         <w:tc>
-          <w:tcPr/>
+          <w:tcPr>
+            <w:shd w:val="clear" w:color="auto" w:fill="F6F8FA"/>
+          </w:tcPr>
           <w:p>
             <w:pPr>
               <w:numPr>
                 <w:ilvl w:val="0"/>
-                <w:numId w:val="1082"/>
+                <w:numId w:val="1083"/>
               </w:numPr>
               <w:jc w:val="left"/>
             </w:pPr>
@@ -15862,7 +15895,7 @@
             <w:pPr>
               <w:numPr>
                 <w:ilvl w:val="0"/>
-                <w:numId w:val="1082"/>
+                <w:numId w:val="1083"/>
               </w:numPr>
               <w:jc w:val="left"/>
             </w:pPr>
@@ -15904,7 +15937,7 @@
             <w:pPr>
               <w:numPr>
                 <w:ilvl w:val="0"/>
-                <w:numId w:val="1082"/>
+                <w:numId w:val="1083"/>
               </w:numPr>
               <w:jc w:val="left"/>
             </w:pPr>
@@ -15912,63 +15945,6 @@
               <w:t xml:space="preserve">Restructured chapters: moved SSH config and VS Code connection to new Chapter 4 (Install VS Code and Connect via Remote-SSH). Chapters 5—​7 renumbered.</w:t>
             </w:r>
           </w:p>
-          <w:p>
-            <w:pPr>
-              <w:numPr>
-                <w:ilvl w:val="0"/>
-                <w:numId w:val="1082"/>
-              </w:numPr>
-              <w:jc w:val="left"/>
-            </w:pPr>
-            <w:r>
-              <w:t xml:space="preserve">Added verification checklist tables to all 7 chapters.</w:t>
-            </w:r>
-          </w:p>
-          <w:p>
-            <w:pPr>
-              <w:numPr>
-                <w:ilvl w:val="0"/>
-                <w:numId w:val="1082"/>
-              </w:numPr>
-              <w:jc w:val="left"/>
-            </w:pPr>
-            <w:r>
-              <w:t xml:space="preserve">Added mandatory reboot warning in Chapter 2 (SSH port change). Added troubleshooting subsection in Chapter 4 with common SSH connection issues and ncat debugging commands.</w:t>
-            </w:r>
-          </w:p>
-        </w:tc>
-      </w:tr>
-      <w:tr>
-        <w:tc>
-          <w:tcPr>
-            <w:shd w:val="clear" w:color="auto" w:fill="F6F8FA"/>
-          </w:tcPr>
-          <w:p>
-            <w:pPr>
-              <w:jc w:val="left"/>
-            </w:pPr>
-            <w:r>
-              <w:t xml:space="preserve">3.0.1</w:t>
-            </w:r>
-          </w:p>
-        </w:tc>
-        <w:tc>
-          <w:tcPr>
-            <w:shd w:val="clear" w:color="auto" w:fill="F6F8FA"/>
-          </w:tcPr>
-          <w:p>
-            <w:pPr>
-              <w:jc w:val="left"/>
-            </w:pPr>
-            <w:r>
-              <w:t xml:space="preserve">2026-09-10</w:t>
-            </w:r>
-          </w:p>
-        </w:tc>
-        <w:tc>
-          <w:tcPr>
-            <w:shd w:val="clear" w:color="auto" w:fill="F6F8FA"/>
-          </w:tcPr>
           <w:p>
             <w:pPr>
               <w:numPr>
@@ -15978,7 +15954,19 @@
               <w:jc w:val="left"/>
             </w:pPr>
             <w:r>
-              <w:t xml:space="preserve">Minor fixes: test-filter.sh auto-discovery, build.sh help text, Makefile aggregate descriptions, 5-section comment correction, CHANGELOG version gap note, callout-in-code fix, CI font auto-discovery, dofile path comment, test-sync.sh header.</w:t>
+              <w:t xml:space="preserve">Added verification checklist tables to all 7 chapters.</w:t>
+            </w:r>
+          </w:p>
+          <w:p>
+            <w:pPr>
+              <w:numPr>
+                <w:ilvl w:val="0"/>
+                <w:numId w:val="1083"/>
+              </w:numPr>
+              <w:jc w:val="left"/>
+            </w:pPr>
+            <w:r>
+              <w:t xml:space="preserve">Added mandatory reboot warning in Chapter 2 (SSH port change). Added troubleshooting subsection in Chapter 4 with common SSH connection issues and ncat debugging commands.</w:t>
             </w:r>
           </w:p>
         </w:tc>
@@ -15991,18 +15979,18 @@
               <w:jc w:val="left"/>
             </w:pPr>
             <w:r>
-              <w:t xml:space="preserve">3.0.0</w:t>
-            </w:r>
-          </w:p>
-        </w:tc>
-        <w:tc>
-          <w:tcPr/>
-          <w:p>
-            <w:pPr>
-              <w:jc w:val="left"/>
-            </w:pPr>
-            <w:r>
-              <w:t xml:space="preserve">2026-09-09</w:t>
+              <w:t xml:space="preserve">3.0.1</w:t>
+            </w:r>
+          </w:p>
+        </w:tc>
+        <w:tc>
+          <w:tcPr/>
+          <w:p>
+            <w:pPr>
+              <w:jc w:val="left"/>
+            </w:pPr>
+            <w:r>
+              <w:t xml:space="preserve">2026-09-10</w:t>
             </w:r>
           </w:p>
         </w:tc>
@@ -16017,7 +16005,7 @@
               <w:jc w:val="left"/>
             </w:pPr>
             <w:r>
-              <w:t xml:space="preserve">Modular pipeline refactoring: shared Lua filter factory, shared DOCX fix logic, build system auto-discovery, unified format pipeline, GitHub Actions CI.</w:t>
+              <w:t xml:space="preserve">Minor fixes: test-filter.sh auto-discovery, build.sh help text, Makefile aggregate descriptions, 5-section comment correction, CHANGELOG version gap note, callout-in-code fix, CI font auto-discovery, dofile path comment, test-sync.sh header.</w:t>
             </w:r>
           </w:p>
         </w:tc>
@@ -16032,7 +16020,7 @@
               <w:jc w:val="left"/>
             </w:pPr>
             <w:r>
-              <w:t xml:space="preserve">2.16.0</w:t>
+              <w:t xml:space="preserve">3.0.0</w:t>
             </w:r>
           </w:p>
         </w:tc>
@@ -16045,7 +16033,7 @@
               <w:jc w:val="left"/>
             </w:pPr>
             <w:r>
-              <w:t xml:space="preserve">2026-09-05</w:t>
+              <w:t xml:space="preserve">2026-09-09</w:t>
             </w:r>
           </w:p>
         </w:tc>
@@ -16062,7 +16050,7 @@
               <w:jc w:val="left"/>
             </w:pPr>
             <w:r>
-              <w:t xml:space="preserve">Updated to match template v2.16.0 — Lua filter fixes, build system updates, and technical template parity improvements.</w:t>
+              <w:t xml:space="preserve">Modular pipeline refactoring: shared Lua filter factory, shared DOCX fix logic, build system auto-discovery, unified format pipeline, GitHub Actions CI.</w:t>
             </w:r>
           </w:p>
         </w:tc>
@@ -16075,18 +16063,18 @@
               <w:jc w:val="left"/>
             </w:pPr>
             <w:r>
-              <w:t xml:space="preserve">2.13.0</w:t>
-            </w:r>
-          </w:p>
-        </w:tc>
-        <w:tc>
-          <w:tcPr/>
-          <w:p>
-            <w:pPr>
-              <w:jc w:val="left"/>
-            </w:pPr>
-            <w:r>
-              <w:t xml:space="preserve">2026-08-24</w:t>
+              <w:t xml:space="preserve">2.16.0</w:t>
+            </w:r>
+          </w:p>
+        </w:tc>
+        <w:tc>
+          <w:tcPr/>
+          <w:p>
+            <w:pPr>
+              <w:jc w:val="left"/>
+            </w:pPr>
+            <w:r>
+              <w:t xml:space="preserve">2026-09-05</w:t>
             </w:r>
           </w:p>
         </w:tc>
@@ -16101,6 +16089,51 @@
               <w:jc w:val="left"/>
             </w:pPr>
             <w:r>
+              <w:t xml:space="preserve">Updated to match template v2.16.0 — Lua filter fixes, build system updates, and technical template parity improvements.</w:t>
+            </w:r>
+          </w:p>
+        </w:tc>
+      </w:tr>
+      <w:tr>
+        <w:tc>
+          <w:tcPr>
+            <w:shd w:val="clear" w:color="auto" w:fill="F6F8FA"/>
+          </w:tcPr>
+          <w:p>
+            <w:pPr>
+              <w:jc w:val="left"/>
+            </w:pPr>
+            <w:r>
+              <w:t xml:space="preserve">2.13.0</w:t>
+            </w:r>
+          </w:p>
+        </w:tc>
+        <w:tc>
+          <w:tcPr>
+            <w:shd w:val="clear" w:color="auto" w:fill="F6F8FA"/>
+          </w:tcPr>
+          <w:p>
+            <w:pPr>
+              <w:jc w:val="left"/>
+            </w:pPr>
+            <w:r>
+              <w:t xml:space="preserve">2026-08-24</w:t>
+            </w:r>
+          </w:p>
+        </w:tc>
+        <w:tc>
+          <w:tcPr>
+            <w:shd w:val="clear" w:color="auto" w:fill="F6F8FA"/>
+          </w:tcPr>
+          <w:p>
+            <w:pPr>
+              <w:numPr>
+                <w:ilvl w:val="0"/>
+                <w:numId w:val="1087"/>
+              </w:numPr>
+              <w:jc w:val="left"/>
+            </w:pPr>
+            <w:r>
               <w:t xml:space="preserve">Foundation refactoring Phase 4: make DOCX</w:t>
             </w:r>
             <w:r>
@@ -16168,9 +16201,7 @@
       </w:tr>
       <w:tr>
         <w:tc>
-          <w:tcPr>
-            <w:shd w:val="clear" w:color="auto" w:fill="F6F8FA"/>
-          </w:tcPr>
+          <w:tcPr/>
           <w:p>
             <w:pPr>
               <w:jc w:val="left"/>
@@ -16181,9 +16212,7 @@
           </w:p>
         </w:tc>
         <w:tc>
-          <w:tcPr>
-            <w:shd w:val="clear" w:color="auto" w:fill="F6F8FA"/>
-          </w:tcPr>
+          <w:tcPr/>
           <w:p>
             <w:pPr>
               <w:jc w:val="left"/>
@@ -16194,14 +16223,12 @@
           </w:p>
         </w:tc>
         <w:tc>
-          <w:tcPr>
-            <w:shd w:val="clear" w:color="auto" w:fill="F6F8FA"/>
-          </w:tcPr>
+          <w:tcPr/>
           <w:p>
             <w:pPr>
               <w:numPr>
                 <w:ilvl w:val="0"/>
-                <w:numId w:val="1087"/>
+                <w:numId w:val="1088"/>
               </w:numPr>
               <w:jc w:val="left"/>
             </w:pPr>
@@ -16363,7 +16390,9 @@
       </w:tr>
       <w:tr>
         <w:tc>
-          <w:tcPr/>
+          <w:tcPr>
+            <w:shd w:val="clear" w:color="auto" w:fill="F6F8FA"/>
+          </w:tcPr>
           <w:p>
             <w:pPr>
               <w:jc w:val="left"/>
@@ -16374,7 +16403,9 @@
           </w:p>
         </w:tc>
         <w:tc>
-          <w:tcPr/>
+          <w:tcPr>
+            <w:shd w:val="clear" w:color="auto" w:fill="F6F8FA"/>
+          </w:tcPr>
           <w:p>
             <w:pPr>
               <w:jc w:val="left"/>
@@ -16385,12 +16416,14 @@
           </w:p>
         </w:tc>
         <w:tc>
-          <w:tcPr/>
+          <w:tcPr>
+            <w:shd w:val="clear" w:color="auto" w:fill="F6F8FA"/>
+          </w:tcPr>
           <w:p>
             <w:pPr>
               <w:numPr>
                 <w:ilvl w:val="0"/>
-                <w:numId w:val="1088"/>
+                <w:numId w:val="1089"/>
               </w:numPr>
               <w:jc w:val="left"/>
             </w:pPr>
@@ -16456,9 +16489,7 @@
       </w:tr>
       <w:tr>
         <w:tc>
-          <w:tcPr>
-            <w:shd w:val="clear" w:color="auto" w:fill="F6F8FA"/>
-          </w:tcPr>
+          <w:tcPr/>
           <w:p>
             <w:pPr>
               <w:jc w:val="left"/>
@@ -16469,56 +16500,13 @@
           </w:p>
         </w:tc>
         <w:tc>
-          <w:tcPr>
-            <w:shd w:val="clear" w:color="auto" w:fill="F6F8FA"/>
-          </w:tcPr>
+          <w:tcPr/>
           <w:p>
             <w:pPr>
               <w:jc w:val="left"/>
             </w:pPr>
             <w:r>
               <w:t xml:space="preserve">2026-08-24</w:t>
-            </w:r>
-          </w:p>
-        </w:tc>
-        <w:tc>
-          <w:tcPr>
-            <w:shd w:val="clear" w:color="auto" w:fill="F6F8FA"/>
-          </w:tcPr>
-          <w:p>
-            <w:pPr>
-              <w:numPr>
-                <w:ilvl w:val="0"/>
-                <w:numId w:val="1089"/>
-              </w:numPr>
-              <w:jc w:val="left"/>
-            </w:pPr>
-            <w:r>
-              <w:t xml:space="preserve">Foundation refactoring Phase 1: sync cls version to project tag, fix stale doc references (L16 output count, L-range, setup-guide feature claim), add test-sync.sh for version consistency checking.</w:t>
-            </w:r>
-          </w:p>
-        </w:tc>
-      </w:tr>
-      <w:tr>
-        <w:tc>
-          <w:tcPr/>
-          <w:p>
-            <w:pPr>
-              <w:jc w:val="left"/>
-            </w:pPr>
-            <w:r>
-              <w:t xml:space="preserve">2.9.1</w:t>
-            </w:r>
-          </w:p>
-        </w:tc>
-        <w:tc>
-          <w:tcPr/>
-          <w:p>
-            <w:pPr>
-              <w:jc w:val="left"/>
-            </w:pPr>
-            <w:r>
-              <w:t xml:space="preserve">2026-08-23</w:t>
             </w:r>
           </w:p>
         </w:tc>
@@ -16533,6 +16521,51 @@
               <w:jc w:val="left"/>
             </w:pPr>
             <w:r>
+              <w:t xml:space="preserve">Foundation refactoring Phase 1: sync cls version to project tag, fix stale doc references (L16 output count, L-range, setup-guide feature claim), add test-sync.sh for version consistency checking.</w:t>
+            </w:r>
+          </w:p>
+        </w:tc>
+      </w:tr>
+      <w:tr>
+        <w:tc>
+          <w:tcPr>
+            <w:shd w:val="clear" w:color="auto" w:fill="F6F8FA"/>
+          </w:tcPr>
+          <w:p>
+            <w:pPr>
+              <w:jc w:val="left"/>
+            </w:pPr>
+            <w:r>
+              <w:t xml:space="preserve">2.9.1</w:t>
+            </w:r>
+          </w:p>
+        </w:tc>
+        <w:tc>
+          <w:tcPr>
+            <w:shd w:val="clear" w:color="auto" w:fill="F6F8FA"/>
+          </w:tcPr>
+          <w:p>
+            <w:pPr>
+              <w:jc w:val="left"/>
+            </w:pPr>
+            <w:r>
+              <w:t xml:space="preserve">2026-08-23</w:t>
+            </w:r>
+          </w:p>
+        </w:tc>
+        <w:tc>
+          <w:tcPr>
+            <w:shd w:val="clear" w:color="auto" w:fill="F6F8FA"/>
+          </w:tcPr>
+          <w:p>
+            <w:pPr>
+              <w:numPr>
+                <w:ilvl w:val="0"/>
+                <w:numId w:val="1091"/>
+              </w:numPr>
+              <w:jc w:val="left"/>
+            </w:pPr>
+            <w:r>
               <w:t xml:space="preserve">HTML and Markdown outputs now embed images as base64 data URIs. HTML uses pandoc</w:t>
             </w:r>
             <w:r>
@@ -16564,58 +16597,13 @@
       </w:tr>
       <w:tr>
         <w:tc>
-          <w:tcPr>
-            <w:shd w:val="clear" w:color="auto" w:fill="F6F8FA"/>
-          </w:tcPr>
+          <w:tcPr/>
           <w:p>
             <w:pPr>
               <w:jc w:val="left"/>
             </w:pPr>
             <w:r>
               <w:t xml:space="preserve">2.9.0</w:t>
-            </w:r>
-          </w:p>
-        </w:tc>
-        <w:tc>
-          <w:tcPr>
-            <w:shd w:val="clear" w:color="auto" w:fill="F6F8FA"/>
-          </w:tcPr>
-          <w:p>
-            <w:pPr>
-              <w:jc w:val="left"/>
-            </w:pPr>
-            <w:r>
-              <w:t xml:space="preserve">2026-08-23</w:t>
-            </w:r>
-          </w:p>
-        </w:tc>
-        <w:tc>
-          <w:tcPr>
-            <w:shd w:val="clear" w:color="auto" w:fill="F6F8FA"/>
-          </w:tcPr>
-          <w:p>
-            <w:pPr>
-              <w:numPr>
-                <w:ilvl w:val="0"/>
-                <w:numId w:val="1091"/>
-              </w:numPr>
-              <w:jc w:val="left"/>
-            </w:pPr>
-            <w:r>
-              <w:t xml:space="preserve">DOCX: fix content width (8504→9638tw, margins are 2cm not 3cm). Add footer page numbers. Style TOC heading (22pt bold + rule). Add hutable table width + fixed layout.</w:t>
-            </w:r>
-          </w:p>
-        </w:tc>
-      </w:tr>
-      <w:tr>
-        <w:tc>
-          <w:tcPr/>
-          <w:p>
-            <w:pPr>
-              <w:jc w:val="left"/>
-            </w:pPr>
-            <w:r>
-              <w:t xml:space="preserve">2.8.3</w:t>
             </w:r>
           </w:p>
         </w:tc>
@@ -16641,7 +16629,7 @@
               <w:jc w:val="left"/>
             </w:pPr>
             <w:r>
-              <w:t xml:space="preserve">DOCX fix: callout tables now have explicit width (8504tw) and fixed layout. Changelog section heading now uses custom H1 format (56pt number, red border, right tab) instead of pandoc’s default.</w:t>
+              <w:t xml:space="preserve">DOCX: fix content width (8504→9638tw, margins are 2cm not 3cm). Add footer page numbers. Style TOC heading (22pt bold + rule). Add hutable table width + fixed layout.</w:t>
             </w:r>
           </w:p>
         </w:tc>
@@ -16656,7 +16644,7 @@
               <w:jc w:val="left"/>
             </w:pPr>
             <w:r>
-              <w:t xml:space="preserve">2.8.2</w:t>
+              <w:t xml:space="preserve">2.8.3</w:t>
             </w:r>
           </w:p>
         </w:tc>
@@ -16686,7 +16674,7 @@
               <w:jc w:val="left"/>
             </w:pPr>
             <w:r>
-              <w:t xml:space="preserve">DOCX H1 heading: reverted table approach to paragraph with tab stop + red bottom border. Table broke navigation pane and TOC field. Paragraph preserves Heading1 style for navigation while matching PDF layout (number left, title right, red rule below).</w:t>
+              <w:t xml:space="preserve">DOCX fix: callout tables now have explicit width (8504tw) and fixed layout. Changelog section heading now uses custom H1 format (56pt number, red border, right tab) instead of pandoc’s default.</w:t>
             </w:r>
           </w:p>
         </w:tc>
@@ -16699,7 +16687,7 @@
               <w:jc w:val="left"/>
             </w:pPr>
             <w:r>
-              <w:t xml:space="preserve">2.8.1</w:t>
+              <w:t xml:space="preserve">2.8.2</w:t>
             </w:r>
           </w:p>
         </w:tc>
@@ -16725,7 +16713,7 @@
               <w:jc w:val="left"/>
             </w:pPr>
             <w:r>
-              <w:t xml:space="preserve">DOCX heading fix: text color reverted to black (was incorrectly changed to Huawei red in v2.8.0). H1 now uses a two-column table (number left, title right) with red bottom rule. H2-H4 use simple inline format (number + title, no right tab stop).</w:t>
+              <w:t xml:space="preserve">DOCX H1 heading: reverted table approach to paragraph with tab stop + red bottom border. Table broke navigation pane and TOC field. Paragraph preserves Heading1 style for navigation while matching PDF layout (number left, title right, red rule below).</w:t>
             </w:r>
           </w:p>
         </w:tc>
@@ -16740,7 +16728,7 @@
               <w:jc w:val="left"/>
             </w:pPr>
             <w:r>
-              <w:t xml:space="preserve">2.8.0</w:t>
+              <w:t xml:space="preserve">2.8.1</w:t>
             </w:r>
           </w:p>
         </w:tc>
@@ -16770,7 +16758,7 @@
               <w:jc w:val="left"/>
             </w:pPr>
             <w:r>
-              <w:t xml:space="preserve">DOCX output: match PDF styling --- heading colors (Huawei red), H1 number size (56pt), callout borders (left-only) and padding, changelog formatting (rules, bold version, italic date), caption style (9pt bold), badge style (8pt bold white on red), list indentation.</w:t>
+              <w:t xml:space="preserve">DOCX heading fix: text color reverted to black (was incorrectly changed to Huawei red in v2.8.0). H1 now uses a two-column table (number left, title right) with red bottom rule. H2-H4 use simple inline format (number + title, no right tab stop).</w:t>
             </w:r>
           </w:p>
         </w:tc>
@@ -16783,18 +16771,18 @@
               <w:jc w:val="left"/>
             </w:pPr>
             <w:r>
-              <w:t xml:space="preserve">2.7.1</w:t>
-            </w:r>
-          </w:p>
-        </w:tc>
-        <w:tc>
-          <w:tcPr/>
-          <w:p>
-            <w:pPr>
-              <w:jc w:val="left"/>
-            </w:pPr>
-            <w:r>
-              <w:t xml:space="preserve">2026-08-17</w:t>
+              <w:t xml:space="preserve">2.8.0</w:t>
+            </w:r>
+          </w:p>
+        </w:tc>
+        <w:tc>
+          <w:tcPr/>
+          <w:p>
+            <w:pPr>
+              <w:jc w:val="left"/>
+            </w:pPr>
+            <w:r>
+              <w:t xml:space="preserve">2026-08-23</w:t>
             </w:r>
           </w:p>
         </w:tc>
@@ -16809,6 +16797,51 @@
               <w:jc w:val="left"/>
             </w:pPr>
             <w:r>
+              <w:t xml:space="preserve">DOCX output: match PDF styling --- heading colors (Huawei red), H1 number size (56pt), callout borders (left-only) and padding, changelog formatting (rules, bold version, italic date), caption style (9pt bold), badge style (8pt bold white on red), list indentation.</w:t>
+            </w:r>
+          </w:p>
+        </w:tc>
+      </w:tr>
+      <w:tr>
+        <w:tc>
+          <w:tcPr>
+            <w:shd w:val="clear" w:color="auto" w:fill="F6F8FA"/>
+          </w:tcPr>
+          <w:p>
+            <w:pPr>
+              <w:jc w:val="left"/>
+            </w:pPr>
+            <w:r>
+              <w:t xml:space="preserve">2.7.1</w:t>
+            </w:r>
+          </w:p>
+        </w:tc>
+        <w:tc>
+          <w:tcPr>
+            <w:shd w:val="clear" w:color="auto" w:fill="F6F8FA"/>
+          </w:tcPr>
+          <w:p>
+            <w:pPr>
+              <w:jc w:val="left"/>
+            </w:pPr>
+            <w:r>
+              <w:t xml:space="preserve">2026-08-17</w:t>
+            </w:r>
+          </w:p>
+        </w:tc>
+        <w:tc>
+          <w:tcPr>
+            <w:shd w:val="clear" w:color="auto" w:fill="F6F8FA"/>
+          </w:tcPr>
+          <w:p>
+            <w:pPr>
+              <w:numPr>
+                <w:ilvl w:val="0"/>
+                <w:numId w:val="1097"/>
+              </w:numPr>
+              <w:jc w:val="left"/>
+            </w:pPr>
+            <w:r>
               <w:t xml:space="preserve">Rename project repository to all lowercase (</w:t>
             </w:r>
             <w:r>
@@ -16825,9 +16858,7 @@
       </w:tr>
       <w:tr>
         <w:tc>
-          <w:tcPr>
-            <w:shd w:val="clear" w:color="auto" w:fill="F6F8FA"/>
-          </w:tcPr>
+          <w:tcPr/>
           <w:p>
             <w:pPr>
               <w:jc w:val="left"/>
@@ -16838,9 +16869,7 @@
           </w:p>
         </w:tc>
         <w:tc>
-          <w:tcPr>
-            <w:shd w:val="clear" w:color="auto" w:fill="F6F8FA"/>
-          </w:tcPr>
+          <w:tcPr/>
           <w:p>
             <w:pPr>
               <w:jc w:val="left"/>
@@ -16851,14 +16880,12 @@
           </w:p>
         </w:tc>
         <w:tc>
-          <w:tcPr>
-            <w:shd w:val="clear" w:color="auto" w:fill="F6F8FA"/>
-          </w:tcPr>
+          <w:tcPr/>
           <w:p>
             <w:pPr>
               <w:numPr>
                 <w:ilvl w:val="0"/>
-                <w:numId w:val="1097"/>
+                <w:numId w:val="1098"/>
               </w:numPr>
               <w:jc w:val="left"/>
             </w:pPr>
@@ -16900,7 +16927,9 @@
       </w:tr>
       <w:tr>
         <w:tc>
-          <w:tcPr/>
+          <w:tcPr>
+            <w:shd w:val="clear" w:color="auto" w:fill="F6F8FA"/>
+          </w:tcPr>
           <w:p>
             <w:pPr>
               <w:jc w:val="left"/>
@@ -16911,7 +16940,9 @@
           </w:p>
         </w:tc>
         <w:tc>
-          <w:tcPr/>
+          <w:tcPr>
+            <w:shd w:val="clear" w:color="auto" w:fill="F6F8FA"/>
+          </w:tcPr>
           <w:p>
             <w:pPr>
               <w:jc w:val="left"/>
@@ -16922,12 +16953,14 @@
           </w:p>
         </w:tc>
         <w:tc>
-          <w:tcPr/>
+          <w:tcPr>
+            <w:shd w:val="clear" w:color="auto" w:fill="F6F8FA"/>
+          </w:tcPr>
           <w:p>
             <w:pPr>
               <w:numPr>
                 <w:ilvl w:val="0"/>
-                <w:numId w:val="1098"/>
+                <w:numId w:val="1099"/>
               </w:numPr>
               <w:jc w:val="left"/>
             </w:pPr>
@@ -16984,9 +17017,7 @@
       </w:tr>
       <w:tr>
         <w:tc>
-          <w:tcPr>
-            <w:shd w:val="clear" w:color="auto" w:fill="F6F8FA"/>
-          </w:tcPr>
+          <w:tcPr/>
           <w:p>
             <w:pPr>
               <w:jc w:val="left"/>
@@ -16997,9 +17028,7 @@
           </w:p>
         </w:tc>
         <w:tc>
-          <w:tcPr>
-            <w:shd w:val="clear" w:color="auto" w:fill="F6F8FA"/>
-          </w:tcPr>
+          <w:tcPr/>
           <w:p>
             <w:pPr>
               <w:jc w:val="left"/>
@@ -17010,14 +17039,12 @@
           </w:p>
         </w:tc>
         <w:tc>
-          <w:tcPr>
-            <w:shd w:val="clear" w:color="auto" w:fill="F6F8FA"/>
-          </w:tcPr>
+          <w:tcPr/>
           <w:p>
             <w:pPr>
               <w:numPr>
                 <w:ilvl w:val="0"/>
-                <w:numId w:val="1099"/>
+                <w:numId w:val="1100"/>
               </w:numPr>
               <w:jc w:val="left"/>
             </w:pPr>
@@ -17044,7 +17071,7 @@
             <w:pPr>
               <w:numPr>
                 <w:ilvl w:val="0"/>
-                <w:numId w:val="1099"/>
+                <w:numId w:val="1100"/>
               </w:numPr>
               <w:jc w:val="left"/>
             </w:pPr>
@@ -17071,54 +17098,15 @@
       </w:tr>
       <w:tr>
         <w:tc>
-          <w:tcPr/>
+          <w:tcPr>
+            <w:shd w:val="clear" w:color="auto" w:fill="F6F8FA"/>
+          </w:tcPr>
           <w:p>
             <w:pPr>
               <w:jc w:val="left"/>
             </w:pPr>
             <w:r>
               <w:t xml:space="preserve">2.5.1</w:t>
-            </w:r>
-          </w:p>
-        </w:tc>
-        <w:tc>
-          <w:tcPr/>
-          <w:p>
-            <w:pPr>
-              <w:jc w:val="left"/>
-            </w:pPr>
-            <w:r>
-              <w:t xml:space="preserve">2026-08-10</w:t>
-            </w:r>
-          </w:p>
-        </w:tc>
-        <w:tc>
-          <w:tcPr/>
-          <w:p>
-            <w:pPr>
-              <w:numPr>
-                <w:ilvl w:val="0"/>
-                <w:numId w:val="1100"/>
-              </w:numPr>
-              <w:jc w:val="left"/>
-            </w:pPr>
-            <w:r>
-              <w:t xml:space="preserve">H1 section title size reduced from 27pt to 20pt.</w:t>
-            </w:r>
-          </w:p>
-        </w:tc>
-      </w:tr>
-      <w:tr>
-        <w:tc>
-          <w:tcPr>
-            <w:shd w:val="clear" w:color="auto" w:fill="F6F8FA"/>
-          </w:tcPr>
-          <w:p>
-            <w:pPr>
-              <w:jc w:val="left"/>
-            </w:pPr>
-            <w:r>
-              <w:t xml:space="preserve">2.5.0</w:t>
             </w:r>
           </w:p>
         </w:tc>
@@ -17148,13 +17136,7 @@
               <w:jc w:val="left"/>
             </w:pPr>
             <w:r>
-              <w:t xml:space="preserve">Default image size increased: width 65% → 90% of text width,</w:t>
-            </w:r>
-            <w:r>
-              <w:t xml:space="preserve"> </w:t>
-            </w:r>
-            <w:r>
-              <w:t xml:space="preserve">height 40% → 50% of text height.</w:t>
+              <w:t xml:space="preserve">H1 section title size reduced from 27pt to 20pt.</w:t>
             </w:r>
           </w:p>
         </w:tc>
@@ -17167,7 +17149,7 @@
               <w:jc w:val="left"/>
             </w:pPr>
             <w:r>
-              <w:t xml:space="preserve">2.4.0</w:t>
+              <w:t xml:space="preserve">2.5.0</w:t>
             </w:r>
           </w:p>
         </w:tc>
@@ -17193,14 +17175,65 @@
               <w:jc w:val="left"/>
             </w:pPr>
             <w:r>
-              <w:t xml:space="preserve">Enlarged H1 section title (18pt → 27pt, 50% bigger).</w:t>
-            </w:r>
-          </w:p>
+              <w:t xml:space="preserve">Default image size increased: width 65% → 90% of text width,</w:t>
+            </w:r>
+            <w:r>
+              <w:t xml:space="preserve"> </w:t>
+            </w:r>
+            <w:r>
+              <w:t xml:space="preserve">height 40% → 50% of text height.</w:t>
+            </w:r>
+          </w:p>
+        </w:tc>
+      </w:tr>
+      <w:tr>
+        <w:tc>
+          <w:tcPr>
+            <w:shd w:val="clear" w:color="auto" w:fill="F6F8FA"/>
+          </w:tcPr>
+          <w:p>
+            <w:pPr>
+              <w:jc w:val="left"/>
+            </w:pPr>
+            <w:r>
+              <w:t xml:space="preserve">2.4.0</w:t>
+            </w:r>
+          </w:p>
+        </w:tc>
+        <w:tc>
+          <w:tcPr>
+            <w:shd w:val="clear" w:color="auto" w:fill="F6F8FA"/>
+          </w:tcPr>
+          <w:p>
+            <w:pPr>
+              <w:jc w:val="left"/>
+            </w:pPr>
+            <w:r>
+              <w:t xml:space="preserve">2026-08-10</w:t>
+            </w:r>
+          </w:p>
+        </w:tc>
+        <w:tc>
+          <w:tcPr>
+            <w:shd w:val="clear" w:color="auto" w:fill="F6F8FA"/>
+          </w:tcPr>
           <w:p>
             <w:pPr>
               <w:numPr>
                 <w:ilvl w:val="0"/>
-                <w:numId w:val="1102"/>
+                <w:numId w:val="1103"/>
+              </w:numPr>
+              <w:jc w:val="left"/>
+            </w:pPr>
+            <w:r>
+              <w:t xml:space="preserve">Enlarged H1 section title (18pt → 27pt, 50% bigger).</w:t>
+            </w:r>
+          </w:p>
+          <w:p>
+            <w:pPr>
+              <w:numPr>
+                <w:ilvl w:val="0"/>
+                <w:numId w:val="1103"/>
               </w:numPr>
               <w:jc w:val="left"/>
             </w:pPr>
@@ -17227,9 +17260,7 @@
       </w:tr>
       <w:tr>
         <w:tc>
-          <w:tcPr>
-            <w:shd w:val="clear" w:color="auto" w:fill="F6F8FA"/>
-          </w:tcPr>
+          <w:tcPr/>
           <w:p>
             <w:pPr>
               <w:jc w:val="left"/>
@@ -17240,9 +17271,7 @@
           </w:p>
         </w:tc>
         <w:tc>
-          <w:tcPr>
-            <w:shd w:val="clear" w:color="auto" w:fill="F6F8FA"/>
-          </w:tcPr>
+          <w:tcPr/>
           <w:p>
             <w:pPr>
               <w:jc w:val="left"/>
@@ -17253,14 +17282,12 @@
           </w:p>
         </w:tc>
         <w:tc>
-          <w:tcPr>
-            <w:shd w:val="clear" w:color="auto" w:fill="F6F8FA"/>
-          </w:tcPr>
+          <w:tcPr/>
           <w:p>
             <w:pPr>
               <w:numPr>
                 <w:ilvl w:val="0"/>
-                <w:numId w:val="1103"/>
+                <w:numId w:val="1104"/>
               </w:numPr>
               <w:jc w:val="left"/>
             </w:pPr>
@@ -17287,7 +17314,9 @@
       </w:tr>
       <w:tr>
         <w:tc>
-          <w:tcPr/>
+          <w:tcPr>
+            <w:shd w:val="clear" w:color="auto" w:fill="F6F8FA"/>
+          </w:tcPr>
           <w:p>
             <w:pPr>
               <w:jc w:val="left"/>
@@ -17298,7 +17327,9 @@
           </w:p>
         </w:tc>
         <w:tc>
-          <w:tcPr/>
+          <w:tcPr>
+            <w:shd w:val="clear" w:color="auto" w:fill="F6F8FA"/>
+          </w:tcPr>
           <w:p>
             <w:pPr>
               <w:jc w:val="left"/>
@@ -17309,12 +17340,14 @@
           </w:p>
         </w:tc>
         <w:tc>
-          <w:tcPr/>
+          <w:tcPr>
+            <w:shd w:val="clear" w:color="auto" w:fill="F6F8FA"/>
+          </w:tcPr>
           <w:p>
             <w:pPr>
               <w:numPr>
                 <w:ilvl w:val="0"/>
-                <w:numId w:val="1104"/>
+                <w:numId w:val="1105"/>
               </w:numPr>
               <w:jc w:val="left"/>
             </w:pPr>
@@ -17386,9 +17419,7 @@
       </w:tr>
       <w:tr>
         <w:tc>
-          <w:tcPr>
-            <w:shd w:val="clear" w:color="auto" w:fill="F6F8FA"/>
-          </w:tcPr>
+          <w:tcPr/>
           <w:p>
             <w:pPr>
               <w:jc w:val="left"/>
@@ -17399,9 +17430,7 @@
           </w:p>
         </w:tc>
         <w:tc>
-          <w:tcPr>
-            <w:shd w:val="clear" w:color="auto" w:fill="F6F8FA"/>
-          </w:tcPr>
+          <w:tcPr/>
           <w:p>
             <w:pPr>
               <w:jc w:val="left"/>
@@ -17412,14 +17441,12 @@
           </w:p>
         </w:tc>
         <w:tc>
-          <w:tcPr>
-            <w:shd w:val="clear" w:color="auto" w:fill="F6F8FA"/>
-          </w:tcPr>
+          <w:tcPr/>
           <w:p>
             <w:pPr>
               <w:numPr>
                 <w:ilvl w:val="0"/>
-                <w:numId w:val="1105"/>
+                <w:numId w:val="1106"/>
               </w:numPr>
               <w:jc w:val="left"/>
             </w:pPr>
@@ -17476,7 +17503,9 @@
       </w:tr>
       <w:tr>
         <w:tc>
-          <w:tcPr/>
+          <w:tcPr>
+            <w:shd w:val="clear" w:color="auto" w:fill="F6F8FA"/>
+          </w:tcPr>
           <w:p>
             <w:pPr>
               <w:jc w:val="left"/>
@@ -17487,7 +17516,9 @@
           </w:p>
         </w:tc>
         <w:tc>
-          <w:tcPr/>
+          <w:tcPr>
+            <w:shd w:val="clear" w:color="auto" w:fill="F6F8FA"/>
+          </w:tcPr>
           <w:p>
             <w:pPr>
               <w:jc w:val="left"/>
@@ -17498,12 +17529,14 @@
           </w:p>
         </w:tc>
         <w:tc>
-          <w:tcPr/>
+          <w:tcPr>
+            <w:shd w:val="clear" w:color="auto" w:fill="F6F8FA"/>
+          </w:tcPr>
           <w:p>
             <w:pPr>
               <w:numPr>
                 <w:ilvl w:val="0"/>
-                <w:numId w:val="1106"/>
+                <w:numId w:val="1107"/>
               </w:numPr>
               <w:jc w:val="left"/>
             </w:pPr>
@@ -17530,58 +17563,13 @@
       </w:tr>
       <w:tr>
         <w:tc>
-          <w:tcPr>
-            <w:shd w:val="clear" w:color="auto" w:fill="F6F8FA"/>
-          </w:tcPr>
+          <w:tcPr/>
           <w:p>
             <w:pPr>
               <w:jc w:val="left"/>
             </w:pPr>
             <w:r>
               <w:t xml:space="preserve">2.2.2</w:t>
-            </w:r>
-          </w:p>
-        </w:tc>
-        <w:tc>
-          <w:tcPr>
-            <w:shd w:val="clear" w:color="auto" w:fill="F6F8FA"/>
-          </w:tcPr>
-          <w:p>
-            <w:pPr>
-              <w:jc w:val="left"/>
-            </w:pPr>
-            <w:r>
-              <w:t xml:space="preserve">2026-08-08</w:t>
-            </w:r>
-          </w:p>
-        </w:tc>
-        <w:tc>
-          <w:tcPr>
-            <w:shd w:val="clear" w:color="auto" w:fill="F6F8FA"/>
-          </w:tcPr>
-          <w:p>
-            <w:pPr>
-              <w:numPr>
-                <w:ilvl w:val="0"/>
-                <w:numId w:val="1107"/>
-              </w:numPr>
-              <w:jc w:val="left"/>
-            </w:pPr>
-            <w:r>
-              <w:t xml:space="preserve">Fixed chapter reference in prerequisite (Chapter 3 → Chapter 4).</w:t>
-            </w:r>
-          </w:p>
-        </w:tc>
-      </w:tr>
-      <w:tr>
-        <w:tc>
-          <w:tcPr/>
-          <w:p>
-            <w:pPr>
-              <w:jc w:val="left"/>
-            </w:pPr>
-            <w:r>
-              <w:t xml:space="preserve">2.2.1</w:t>
             </w:r>
           </w:p>
         </w:tc>
@@ -17607,7 +17595,7 @@
               <w:jc w:val="left"/>
             </w:pPr>
             <w:r>
-              <w:t xml:space="preserve">Changed table and figure caption labels to black (was Huawei red).</w:t>
+              <w:t xml:space="preserve">Fixed chapter reference in prerequisite (Chapter 3 → Chapter 4).</w:t>
             </w:r>
           </w:p>
         </w:tc>
@@ -17622,7 +17610,7 @@
               <w:jc w:val="left"/>
             </w:pPr>
             <w:r>
-              <w:t xml:space="preserve">2.2.0</w:t>
+              <w:t xml:space="preserve">2.2.1</w:t>
             </w:r>
           </w:p>
         </w:tc>
@@ -17652,13 +17640,7 @@
               <w:jc w:val="left"/>
             </w:pPr>
             <w:r>
-              <w:t xml:space="preserve">Added Huawei-branded table styling: red header bar, alternating row</w:t>
-            </w:r>
-            <w:r>
-              <w:t xml:space="preserve"> </w:t>
-            </w:r>
-            <w:r>
-              <w:t xml:space="preserve">colors, and bordered cells.</w:t>
+              <w:t xml:space="preserve">Changed table and figure caption labels to black (was Huawei red).</w:t>
             </w:r>
           </w:p>
         </w:tc>
@@ -17671,18 +17653,18 @@
               <w:jc w:val="left"/>
             </w:pPr>
             <w:r>
-              <w:t xml:space="preserve">2.1.0</w:t>
-            </w:r>
-          </w:p>
-        </w:tc>
-        <w:tc>
-          <w:tcPr/>
-          <w:p>
-            <w:pPr>
-              <w:jc w:val="left"/>
-            </w:pPr>
-            <w:r>
-              <w:t xml:space="preserve">2026-08-06</w:t>
+              <w:t xml:space="preserve">2.2.0</w:t>
+            </w:r>
+          </w:p>
+        </w:tc>
+        <w:tc>
+          <w:tcPr/>
+          <w:p>
+            <w:pPr>
+              <w:jc w:val="left"/>
+            </w:pPr>
+            <w:r>
+              <w:t xml:space="preserve">2026-08-08</w:t>
             </w:r>
           </w:p>
         </w:tc>
@@ -17697,6 +17679,57 @@
               <w:jc w:val="left"/>
             </w:pPr>
             <w:r>
+              <w:t xml:space="preserve">Added Huawei-branded table styling: red header bar, alternating row</w:t>
+            </w:r>
+            <w:r>
+              <w:t xml:space="preserve"> </w:t>
+            </w:r>
+            <w:r>
+              <w:t xml:space="preserve">colors, and bordered cells.</w:t>
+            </w:r>
+          </w:p>
+        </w:tc>
+      </w:tr>
+      <w:tr>
+        <w:tc>
+          <w:tcPr>
+            <w:shd w:val="clear" w:color="auto" w:fill="F6F8FA"/>
+          </w:tcPr>
+          <w:p>
+            <w:pPr>
+              <w:jc w:val="left"/>
+            </w:pPr>
+            <w:r>
+              <w:t xml:space="preserve">2.1.0</w:t>
+            </w:r>
+          </w:p>
+        </w:tc>
+        <w:tc>
+          <w:tcPr>
+            <w:shd w:val="clear" w:color="auto" w:fill="F6F8FA"/>
+          </w:tcPr>
+          <w:p>
+            <w:pPr>
+              <w:jc w:val="left"/>
+            </w:pPr>
+            <w:r>
+              <w:t xml:space="preserve">2026-08-06</w:t>
+            </w:r>
+          </w:p>
+        </w:tc>
+        <w:tc>
+          <w:tcPr>
+            <w:shd w:val="clear" w:color="auto" w:fill="F6F8FA"/>
+          </w:tcPr>
+          <w:p>
+            <w:pPr>
+              <w:numPr>
+                <w:ilvl w:val="0"/>
+                <w:numId w:val="1111"/>
+              </w:numPr>
+              <w:jc w:val="left"/>
+            </w:pPr>
+            <w:r>
               <w:t xml:space="preserve">Updated ECS flavor to</w:t>
             </w:r>
             <w:r>
@@ -17719,7 +17752,7 @@
             <w:pPr>
               <w:numPr>
                 <w:ilvl w:val="0"/>
-                <w:numId w:val="1110"/>
+                <w:numId w:val="1111"/>
               </w:numPr>
               <w:jc w:val="left"/>
             </w:pPr>
@@ -17731,7 +17764,7 @@
             <w:pPr>
               <w:numPr>
                 <w:ilvl w:val="0"/>
-                <w:numId w:val="1110"/>
+                <w:numId w:val="1111"/>
               </w:numPr>
               <w:jc w:val="left"/>
             </w:pPr>
@@ -17743,7 +17776,7 @@
             <w:pPr>
               <w:numPr>
                 <w:ilvl w:val="0"/>
-                <w:numId w:val="1110"/>
+                <w:numId w:val="1111"/>
               </w:numPr>
               <w:jc w:val="left"/>
             </w:pPr>
@@ -17755,7 +17788,7 @@
             <w:pPr>
               <w:numPr>
                 <w:ilvl w:val="0"/>
-                <w:numId w:val="1110"/>
+                <w:numId w:val="1111"/>
               </w:numPr>
               <w:jc w:val="left"/>
             </w:pPr>
@@ -17767,7 +17800,7 @@
             <w:pPr>
               <w:numPr>
                 <w:ilvl w:val="0"/>
-                <w:numId w:val="1110"/>
+                <w:numId w:val="1111"/>
               </w:numPr>
               <w:jc w:val="left"/>
             </w:pPr>
@@ -17785,7 +17818,7 @@
             <w:pPr>
               <w:numPr>
                 <w:ilvl w:val="0"/>
-                <w:numId w:val="1110"/>
+                <w:numId w:val="1111"/>
               </w:numPr>
               <w:jc w:val="left"/>
             </w:pPr>
@@ -17834,7 +17867,7 @@
             <w:pPr>
               <w:numPr>
                 <w:ilvl w:val="0"/>
-                <w:numId w:val="1110"/>
+                <w:numId w:val="1111"/>
               </w:numPr>
               <w:jc w:val="left"/>
             </w:pPr>
@@ -17846,7 +17879,7 @@
             <w:pPr>
               <w:numPr>
                 <w:ilvl w:val="0"/>
-                <w:numId w:val="1110"/>
+                <w:numId w:val="1111"/>
               </w:numPr>
               <w:jc w:val="left"/>
             </w:pPr>
@@ -17897,7 +17930,7 @@
             <w:pPr>
               <w:numPr>
                 <w:ilvl w:val="0"/>
-                <w:numId w:val="1110"/>
+                <w:numId w:val="1111"/>
               </w:numPr>
               <w:jc w:val="left"/>
             </w:pPr>
@@ -17924,9 +17957,7 @@
       </w:tr>
       <w:tr>
         <w:tc>
-          <w:tcPr>
-            <w:shd w:val="clear" w:color="auto" w:fill="F6F8FA"/>
-          </w:tcPr>
+          <w:tcPr/>
           <w:p>
             <w:pPr>
               <w:jc w:val="left"/>
@@ -17937,9 +17968,7 @@
           </w:p>
         </w:tc>
         <w:tc>
-          <w:tcPr>
-            <w:shd w:val="clear" w:color="auto" w:fill="F6F8FA"/>
-          </w:tcPr>
+          <w:tcPr/>
           <w:p>
             <w:pPr>
               <w:jc w:val="left"/>
@@ -17950,14 +17979,12 @@
           </w:p>
         </w:tc>
         <w:tc>
-          <w:tcPr>
-            <w:shd w:val="clear" w:color="auto" w:fill="F6F8FA"/>
-          </w:tcPr>
+          <w:tcPr/>
           <w:p>
             <w:pPr>
               <w:numPr>
                 <w:ilvl w:val="0"/>
-                <w:numId w:val="1111"/>
+                <w:numId w:val="1112"/>
               </w:numPr>
               <w:jc w:val="left"/>
             </w:pPr>
@@ -17975,7 +18002,7 @@
             <w:pPr>
               <w:numPr>
                 <w:ilvl w:val="0"/>
-                <w:numId w:val="1111"/>
+                <w:numId w:val="1112"/>
               </w:numPr>
               <w:jc w:val="left"/>
             </w:pPr>
@@ -18029,7 +18056,7 @@
             <w:pPr>
               <w:numPr>
                 <w:ilvl w:val="0"/>
-                <w:numId w:val="1111"/>
+                <w:numId w:val="1112"/>
               </w:numPr>
               <w:jc w:val="left"/>
             </w:pPr>
@@ -18077,7 +18104,7 @@
             <w:pPr>
               <w:numPr>
                 <w:ilvl w:val="0"/>
-                <w:numId w:val="1111"/>
+                <w:numId w:val="1112"/>
               </w:numPr>
               <w:jc w:val="left"/>
             </w:pPr>
@@ -18098,7 +18125,9 @@
       </w:tr>
       <w:tr>
         <w:tc>
-          <w:tcPr/>
+          <w:tcPr>
+            <w:shd w:val="clear" w:color="auto" w:fill="F6F8FA"/>
+          </w:tcPr>
           <w:p>
             <w:pPr>
               <w:jc w:val="left"/>
@@ -18109,7 +18138,9 @@
           </w:p>
         </w:tc>
         <w:tc>
-          <w:tcPr/>
+          <w:tcPr>
+            <w:shd w:val="clear" w:color="auto" w:fill="F6F8FA"/>
+          </w:tcPr>
           <w:p>
             <w:pPr>
               <w:jc w:val="left"/>
@@ -18120,12 +18151,14 @@
           </w:p>
         </w:tc>
         <w:tc>
-          <w:tcPr/>
+          <w:tcPr>
+            <w:shd w:val="clear" w:color="auto" w:fill="F6F8FA"/>
+          </w:tcPr>
           <w:p>
             <w:pPr>
               <w:numPr>
                 <w:ilvl w:val="0"/>
-                <w:numId w:val="1112"/>
+                <w:numId w:val="1113"/>
               </w:numPr>
               <w:jc w:val="left"/>
             </w:pPr>
@@ -18137,7 +18170,7 @@
             <w:pPr>
               <w:numPr>
                 <w:ilvl w:val="0"/>
-                <w:numId w:val="1112"/>
+                <w:numId w:val="1113"/>
               </w:numPr>
               <w:jc w:val="left"/>
             </w:pPr>
@@ -18149,7 +18182,7 @@
             <w:pPr>
               <w:numPr>
                 <w:ilvl w:val="0"/>
-                <w:numId w:val="1112"/>
+                <w:numId w:val="1113"/>
               </w:numPr>
               <w:jc w:val="left"/>
             </w:pPr>
@@ -18161,7 +18194,7 @@
             <w:pPr>
               <w:numPr>
                 <w:ilvl w:val="0"/>
-                <w:numId w:val="1112"/>
+                <w:numId w:val="1113"/>
               </w:numPr>
               <w:jc w:val="left"/>
             </w:pPr>
@@ -18179,7 +18212,7 @@
             <w:pPr>
               <w:numPr>
                 <w:ilvl w:val="0"/>
-                <w:numId w:val="1112"/>
+                <w:numId w:val="1113"/>
               </w:numPr>
               <w:jc w:val="left"/>
             </w:pPr>
@@ -18191,7 +18224,7 @@
             <w:pPr>
               <w:numPr>
                 <w:ilvl w:val="0"/>
-                <w:numId w:val="1112"/>
+                <w:numId w:val="1113"/>
               </w:numPr>
               <w:jc w:val="left"/>
             </w:pPr>
@@ -19572,6 +19605,9 @@
     <w:abstractNumId w:val="991"/>
   </w:num>
   <w:num w:numId="1112">
+    <w:abstractNumId w:val="991"/>
+  </w:num>
+  <w:num w:numId="1113">
     <w:abstractNumId w:val="991"/>
   </w:num>
 </w:numbering>

</xml_diff>

<commit_message>
Sync docs, fix TOC alignment, remove dead code (v6.8.2)
- README, AGENTS, and all four SKILL.md now describe the real
  multi-format pipeline (pre-processor + docx_fix --fix + --lang)
- DOCX TOC title right-aligned via TOCHeading (was dead TOCTitle);
  dot-leader tab corrected to 9638 twips
- Signature names render bold (PDF \textbf parity)
- Dead code removed: _add_caption_style, TOCTitle style, .badge CSS
- --template=VALUE and --lang=VALUE equals form accepted
- Stale comments corrected ([PASS] -> [Pass], BADGE_MAX_CX, header)
- poc/SKILL.md evidence heading no longer says "(checkboxes)"
- Bump all templates + setup-guide to v6.8.2; regenerate committed artifacts
</commit_message>
<xml_diff>
--- a/documents/setup-guide/setup-guide.docx
+++ b/documents/setup-guide/setup-guide.docx
@@ -84,7 +84,7 @@
           <w:b/>
           <w:sz w:val="24"/>
         </w:rPr>
-        <w:t xml:space="preserve">v6.8.1</w:t>
+        <w:t xml:space="preserve">v6.8.2</w:t>
       </w:r>
       <w:r>
         <w:rPr>
@@ -96,7 +96,7 @@
         <w:rPr>
           <w:sz w:val="24"/>
         </w:rPr>
-        <w:t xml:space="preserve">— September 20, 2026 20:01</w:t>
+        <w:t xml:space="preserve">— September 20, 2026 20:36</w:t>
       </w:r>
     </w:p>
     <w:sdt>
@@ -13345,7 +13345,7 @@
               <w:jc w:val="left"/>
             </w:pPr>
             <w:r>
-              <w:t xml:space="preserve">6.8.1</w:t>
+              <w:t xml:space="preserve">6.8.2</w:t>
             </w:r>
           </w:p>
         </w:tc>
@@ -13371,7 +13371,7 @@
               <w:jc w:val="left"/>
             </w:pPr>
             <w:r>
-              <w:t xml:space="preserve">Quality-pass fixes for v6.8.0: non-technical covers no longer show a stray Date paragraph (regression from the meta-scan change); the technical cover table is no longer hijacked from the body when :nochangelog: is set (boundary check on the cover-table detection); the Version/Date/Scenario table now renders unconditionally like the PDF (was gated by :nochangelog:); empty cover tables are skipped when no report values are set; corrected the cover-element-order wording in the v6.8.0 changelog.</w:t>
+              <w:t xml:space="preserve">Documentation and cleanup: README, AGENTS, and all four SKILL.md files now describe the real multi-format pipeline (pre-processor + docx_fix --fix + --lang flag) instead of the pre-v6.4 asciidoctor-to-pandoc chain. DOCX TOC title is now right-aligned like the PDF (was targeting a dead style). Signature names render bold like the PDF. Dead code removed (unused Caption style, dead TOCTitle style, dead HTML badge CSS). The --template and --lang flags accept the equals form (--template=guide). Various stale comments corrected.</w:t>
             </w:r>
           </w:p>
         </w:tc>
@@ -13386,7 +13386,7 @@
               <w:jc w:val="left"/>
             </w:pPr>
             <w:r>
-              <w:t xml:space="preserve">6.8.0</w:t>
+              <w:t xml:space="preserve">6.8.1</w:t>
             </w:r>
           </w:p>
         </w:tc>
@@ -13416,7 +13416,7 @@
               <w:jc w:val="left"/>
             </w:pPr>
             <w:r>
-              <w:t xml:space="preserve">Technical report covers now match the PDF in DOCX/MD/HTML: the title uses the PDF’s 24pt size (was 36pt), the report type label appears below the title (the DOCX cover keeps the established title-first order; the PDF has label-then-title), and the Version/Date/Scenario table is rendered with the PDF’s red label column. The cover meta line now shows the report version and its set date (was the document version and the build date). Authors, when set, appear as a table row like the PDF.</w:t>
+              <w:t xml:space="preserve">Quality-pass fixes for v6.8.0: non-technical covers no longer show a stray Date paragraph (regression from the meta-scan change); the technical cover table is no longer hijacked from the body when :nochangelog: is set (boundary check on the cover-table detection); the Version/Date/Scenario table now renders unconditionally like the PDF (was gated by :nochangelog:); empty cover tables are skipped when no report values are set; corrected the cover-element-order wording in the v6.8.0 changelog.</w:t>
             </w:r>
           </w:p>
         </w:tc>
@@ -13429,7 +13429,7 @@
               <w:jc w:val="left"/>
             </w:pPr>
             <w:r>
-              <w:t xml:space="preserve">6.7.0</w:t>
+              <w:t xml:space="preserve">6.8.0</w:t>
             </w:r>
           </w:p>
         </w:tc>
@@ -13455,7 +13455,7 @@
               <w:jc w:val="left"/>
             </w:pPr>
             <w:r>
-              <w:t xml:space="preserve">Badge and language fidelity: DOCX badge pills now render black text like the PDF (was frame-colored), use the correct label case (Pass, not PASS), include the Portuguese POC labels (Atendido, Parcial, Falha, Ignorado), and render at native width per template (testbook badge text no longer shrinks). Portuguese signature greetings now match the PDF (At.te,), the POC classification label matches the full PDF wording, and the secondary-format table headers (stakeholders, closing record, test summary, changelog) are now language-aware. DOCX footers show Página in Portuguese documents. Cover dates no longer zero-pad the day.</w:t>
+              <w:t xml:space="preserve">Technical report covers now match the PDF in DOCX/MD/HTML: the title uses the PDF’s 24pt size (was 36pt), the report type label appears below the title (the DOCX cover keeps the established title-first order; the PDF has label-then-title), and the Version/Date/Scenario table is rendered with the PDF’s red label column. The cover meta line now shows the report version and its set date (was the document version and the build date). Authors, when set, appear as a table row like the PDF.</w:t>
             </w:r>
           </w:p>
         </w:tc>
@@ -13470,7 +13470,7 @@
               <w:jc w:val="left"/>
             </w:pPr>
             <w:r>
-              <w:t xml:space="preserve">6.6.1</w:t>
+              <w:t xml:space="preserve">6.7.0</w:t>
             </w:r>
           </w:p>
         </w:tc>
@@ -13500,7 +13500,7 @@
               <w:jc w:val="left"/>
             </w:pPr>
             <w:r>
-              <w:t xml:space="preserve">Quality-pass fixes for v6.6.0: the TESTCASE-marker strip now covers the entire DOCX fix run (a failure at any stage can no longer leave markers in the output file); the fixer resets its template state between in-process runs (the documented path-sniffing fallback works again); build.sh also cleans temporary files on interrupt signals; fixed a CHANGELOG typo.</w:t>
+              <w:t xml:space="preserve">Badge and language fidelity: DOCX badge pills now render black text like the PDF (was frame-colored), use the correct label case (Pass, not PASS), include the Portuguese POC labels (Atendido, Parcial, Falha, Ignorado), and render at native width per template (testbook badge text no longer shrinks). Portuguese signature greetings now match the PDF (At.te,), the POC classification label matches the full PDF wording, and the secondary-format table headers (stakeholders, closing record, test summary, changelog) are now language-aware. DOCX footers show Página in Portuguese documents. Cover dates no longer zero-pad the day.</w:t>
             </w:r>
           </w:p>
         </w:tc>
@@ -13513,7 +13513,7 @@
               <w:jc w:val="left"/>
             </w:pPr>
             <w:r>
-              <w:t xml:space="preserve">6.6.0</w:t>
+              <w:t xml:space="preserve">6.6.1</w:t>
             </w:r>
           </w:p>
         </w:tc>
@@ -13539,6 +13539,51 @@
               <w:jc w:val="left"/>
             </w:pPr>
             <w:r>
+              <w:t xml:space="preserve">Quality-pass fixes for v6.6.0: the TESTCASE-marker strip now covers the entire DOCX fix run (a failure at any stage can no longer leave markers in the output file); the fixer resets its template state between in-process runs (the documented path-sniffing fallback works again); build.sh also cleans temporary files on interrupt signals; fixed a CHANGELOG typo.</w:t>
+            </w:r>
+          </w:p>
+        </w:tc>
+      </w:tr>
+      <w:tr>
+        <w:tc>
+          <w:tcPr>
+            <w:shd w:val="clear" w:color="auto" w:fill="F6F8FA"/>
+          </w:tcPr>
+          <w:p>
+            <w:pPr>
+              <w:jc w:val="left"/>
+            </w:pPr>
+            <w:r>
+              <w:t xml:space="preserve">6.6.0</w:t>
+            </w:r>
+          </w:p>
+        </w:tc>
+        <w:tc>
+          <w:tcPr>
+            <w:shd w:val="clear" w:color="auto" w:fill="F6F8FA"/>
+          </w:tcPr>
+          <w:p>
+            <w:pPr>
+              <w:jc w:val="left"/>
+            </w:pPr>
+            <w:r>
+              <w:t xml:space="preserve">2026-09-20</w:t>
+            </w:r>
+          </w:p>
+        </w:tc>
+        <w:tc>
+          <w:tcPr>
+            <w:shd w:val="clear" w:color="auto" w:fill="F6F8FA"/>
+          </w:tcPr>
+          <w:p>
+            <w:pPr>
+              <w:numPr>
+                <w:ilvl w:val="0"/>
+                <w:numId w:val="1047"/>
+              </w:numPr>
+              <w:jc w:val="left"/>
+            </w:pPr>
+            <w:r>
               <w:t xml:space="preserve">Pipeline robustness: DOCX post-processing now fails loudly when content styling errors occur (TESTCASE markers can no longer leak into output); the DOCX fixer takes an explicit</w:t>
             </w:r>
             <w:r>
@@ -13561,58 +13606,13 @@
       </w:tr>
       <w:tr>
         <w:tc>
-          <w:tcPr>
-            <w:shd w:val="clear" w:color="auto" w:fill="F6F8FA"/>
-          </w:tcPr>
+          <w:tcPr/>
           <w:p>
             <w:pPr>
               <w:jc w:val="left"/>
             </w:pPr>
             <w:r>
               <w:t xml:space="preserve">6.5.2</w:t>
-            </w:r>
-          </w:p>
-        </w:tc>
-        <w:tc>
-          <w:tcPr>
-            <w:shd w:val="clear" w:color="auto" w:fill="F6F8FA"/>
-          </w:tcPr>
-          <w:p>
-            <w:pPr>
-              <w:jc w:val="left"/>
-            </w:pPr>
-            <w:r>
-              <w:t xml:space="preserve">2026-09-20</w:t>
-            </w:r>
-          </w:p>
-        </w:tc>
-        <w:tc>
-          <w:tcPr>
-            <w:shd w:val="clear" w:color="auto" w:fill="F6F8FA"/>
-          </w:tcPr>
-          <w:p>
-            <w:pPr>
-              <w:numPr>
-                <w:ilvl w:val="0"/>
-                <w:numId w:val="1047"/>
-              </w:numPr>
-              <w:jc w:val="left"/>
-            </w:pPr>
-            <w:r>
-              <w:t xml:space="preserve">Quality-pass fixes for v6.5.1: LaTeX quote conversion now handles only paired quotes (quote characters inside code arguments are no longer corrupted); signature cells containing escaped ampersands are no longer split; round-trip HTML generation guards the asciidoctor-diagram dependency and fails loudly when generation fails; pre-processor unit tests now cover pipe escaping in all five table handlers.</w:t>
-            </w:r>
-          </w:p>
-        </w:tc>
-      </w:tr>
-      <w:tr>
-        <w:tc>
-          <w:tcPr/>
-          <w:p>
-            <w:pPr>
-              <w:jc w:val="left"/>
-            </w:pPr>
-            <w:r>
-              <w:t xml:space="preserve">6.5.1</w:t>
             </w:r>
           </w:p>
         </w:tc>
@@ -13638,7 +13638,7 @@
               <w:jc w:val="left"/>
             </w:pPr>
             <w:r>
-              <w:t xml:space="preserve">Fixed DOCX/MD/HTML output: tables are no longer corrupted when changelog, signature, or summary content contains a pipe character (“|”). Badge text is now preserved in DOCX/MD/HTML — a “Ready” badge renders “Ready” instead of “[NEW]”. Multi-item changelog entries render as bullet lists instead of being joined with a literal “+”. POC documents now include the changelog in DOCX/MD/HTML. The :noanswers: attribute now hides test results and remarks in DOCX/MD/HTML, matching the PDF. Inline LaTeX (monospace text, arrows, LaTeX quotes) no longer leaks from changelog entries. The test suite now exercises the real build pipeline (pre-processor wired into round-trip and DOCX tests), with new pre-processor unit tests.</w:t>
+              <w:t xml:space="preserve">Quality-pass fixes for v6.5.1: LaTeX quote conversion now handles only paired quotes (quote characters inside code arguments are no longer corrupted); signature cells containing escaped ampersands are no longer split; round-trip HTML generation guards the asciidoctor-diagram dependency and fails loudly when generation fails; pre-processor unit tests now cover pipe escaping in all five table handlers.</w:t>
             </w:r>
           </w:p>
         </w:tc>
@@ -13653,7 +13653,7 @@
               <w:jc w:val="left"/>
             </w:pPr>
             <w:r>
-              <w:t xml:space="preserve">6.5.0</w:t>
+              <w:t xml:space="preserve">6.5.1</w:t>
             </w:r>
           </w:p>
         </w:tc>
@@ -13683,7 +13683,7 @@
               <w:jc w:val="left"/>
             </w:pPr>
             <w:r>
-              <w:t xml:space="preserve">Evidence checklist simplified to plain bullets in both PDF and DOCX (checkbox markers removed for compatibility). Planned Activities list in DOCX now uses Word’s native lower-roman numbering (i., ii., iii.) matching the PDF. Badges in DOCX replaced with exact-replica PNG pill images (rounded, colored frame and background, bold text) matching the PDF \ huaweibadge look — assets committed to the repo. Signature blocks in DOCX no longer show literal + symbols (proper hard line breaks).</w:t>
+              <w:t xml:space="preserve">Fixed DOCX/MD/HTML output: tables are no longer corrupted when changelog, signature, or summary content contains a pipe character (“|”). Badge text is now preserved in DOCX/MD/HTML — a “Ready” badge renders “Ready” instead of “[NEW]”. Multi-item changelog entries render as bullet lists instead of being joined with a literal “+”. POC documents now include the changelog in DOCX/MD/HTML. The :noanswers: attribute now hides test results and remarks in DOCX/MD/HTML, matching the PDF. Inline LaTeX (monospace text, arrows, LaTeX quotes) no longer leaks from changelog entries. The test suite now exercises the real build pipeline (pre-processor wired into round-trip and DOCX tests), with new pre-processor unit tests.</w:t>
             </w:r>
           </w:p>
         </w:tc>
@@ -13696,7 +13696,7 @@
               <w:jc w:val="left"/>
             </w:pPr>
             <w:r>
-              <w:t xml:space="preserve">6.4.7</w:t>
+              <w:t xml:space="preserve">6.5.0</w:t>
             </w:r>
           </w:p>
         </w:tc>
@@ -13722,7 +13722,7 @@
               <w:jc w:val="left"/>
             </w:pPr>
             <w:r>
-              <w:t xml:space="preserve">Section titles in DOCX now match the PDF heading design: the big section number (56pt) sits on the left, the title text is pushed to the right edge (a right tab stop mimics the LaTeX \ hfill), and the red rule runs below — previously the title sat left-aligned next to a small number. Applies to all templates.</w:t>
+              <w:t xml:space="preserve">Evidence checklist simplified to plain bullets in both PDF and DOCX (checkbox markers removed for compatibility). Planned Activities list in DOCX now uses Word’s native lower-roman numbering (i., ii., iii.) matching the PDF. Badges in DOCX replaced with exact-replica PNG pill images (rounded, colored frame and background, bold text) matching the PDF \ huaweibadge look — assets committed to the repo. Signature blocks in DOCX no longer show literal + symbols (proper hard line breaks).</w:t>
             </w:r>
           </w:p>
         </w:tc>
@@ -13737,7 +13737,7 @@
               <w:jc w:val="left"/>
             </w:pPr>
             <w:r>
-              <w:t xml:space="preserve">6.4.6</w:t>
+              <w:t xml:space="preserve">6.4.7</w:t>
             </w:r>
           </w:p>
         </w:tc>
@@ -13767,7 +13767,7 @@
               <w:jc w:val="left"/>
             </w:pPr>
             <w:r>
-              <w:t xml:space="preserve">Code blocks inside test cases no longer break the red left rule in DOCX — the code style’s left indent (which jogged the rule) is reset inside test case blocks, and code blocks now show the PDF’s code box (gray background with thin border on top, bottom, and right, red rule continuing on the left).</w:t>
+              <w:t xml:space="preserve">Section titles in DOCX now match the PDF heading design: the big section number (56pt) sits on the left, the title text is pushed to the right edge (a right tab stop mimics the LaTeX \ hfill), and the red rule runs below — previously the title sat left-aligned next to a small number. Applies to all templates.</w:t>
             </w:r>
           </w:p>
         </w:tc>
@@ -13780,7 +13780,7 @@
               <w:jc w:val="left"/>
             </w:pPr>
             <w:r>
-              <w:t xml:space="preserve">6.4.5</w:t>
+              <w:t xml:space="preserve">6.4.6</w:t>
             </w:r>
           </w:p>
         </w:tc>
@@ -13806,7 +13806,7 @@
               <w:jc w:val="left"/>
             </w:pPr>
             <w:r>
-              <w:t xml:space="preserve">DOCX polish pass: all captions centered (matching the PDF), vertical spacing between blocks matched to the LaTeX rhythm (medskip/smallskip around captions, field bars, and steps), and test steps now render as separate paragraphs each with the red bold number (previously merged into one paragraph).</w:t>
+              <w:t xml:space="preserve">Code blocks inside test cases no longer break the red left rule in DOCX — the code style’s left indent (which jogged the rule) is reset inside test case blocks, and code blocks now show the PDF’s code box (gray background with thin border on top, bottom, and right, red rule continuing on the left).</w:t>
             </w:r>
           </w:p>
         </w:tc>
@@ -13821,7 +13821,7 @@
               <w:jc w:val="left"/>
             </w:pPr>
             <w:r>
-              <w:t xml:space="preserve">6.4.4</w:t>
+              <w:t xml:space="preserve">6.4.5</w:t>
             </w:r>
           </w:p>
         </w:tc>
@@ -13851,7 +13851,7 @@
               <w:jc w:val="left"/>
             </w:pPr>
             <w:r>
-              <w:t xml:space="preserve">DOCX covers now show the logo, cover text, and version/date/time meta line like the PDF. Test case blocks in DOCX get the PDF’s visual wrapper: red left rule, red field header bars, and red step numbers. Captions follow the PDF ordering system in DOCX, MD, and HTML (Table/Diagram/Figure/Testcase N: with bold symbol). Portuguese PDFs now label diagrams "Diagrama N:" (was hardcoded English "Diagram"). Markdown and HTML output no longer leaks raw LaTeX from passthrough blocks — the DOCX pre-processor now feeds those pipelines too.</w:t>
+              <w:t xml:space="preserve">DOCX polish pass: all captions centered (matching the PDF), vertical spacing between blocks matched to the LaTeX rhythm (medskip/smallskip around captions, field bars, and steps), and test steps now render as separate paragraphs each with the red bold number (previously merged into one paragraph).</w:t>
             </w:r>
           </w:p>
         </w:tc>
@@ -13864,7 +13864,7 @@
               <w:jc w:val="left"/>
             </w:pPr>
             <w:r>
-              <w:t xml:space="preserve">6.4.3</w:t>
+              <w:t xml:space="preserve">6.4.4</w:t>
             </w:r>
           </w:p>
         </w:tc>
@@ -13890,7 +13890,7 @@
               <w:jc w:val="left"/>
             </w:pPr>
             <w:r>
-              <w:t xml:space="preserve">Testbook and POC DOCX output now matches the PDF much more closely: native table of contents (language-aware, auto-populated), each section starts on a new page, embedded images and diagrams (PlantUML/Graphviz rendered), white-on-red table headers, cover version line under the title, centered test case captions, and plain black rules for signature grids.</w:t>
+              <w:t xml:space="preserve">DOCX covers now show the logo, cover text, and version/date/time meta line like the PDF. Test case blocks in DOCX get the PDF’s visual wrapper: red left rule, red field header bars, and red step numbers. Captions follow the PDF ordering system in DOCX, MD, and HTML (Table/Diagram/Figure/Testcase N: with bold symbol). Portuguese PDFs now label diagrams "Diagrama N:" (was hardcoded English "Diagram"). Markdown and HTML output no longer leaks raw LaTeX from passthrough blocks — the DOCX pre-processor now feeds those pipelines too.</w:t>
             </w:r>
           </w:p>
         </w:tc>
@@ -13905,7 +13905,7 @@
               <w:jc w:val="left"/>
             </w:pPr>
             <w:r>
-              <w:t xml:space="preserve">6.4.2</w:t>
+              <w:t xml:space="preserve">6.4.3</w:t>
             </w:r>
           </w:p>
         </w:tc>
@@ -13935,7 +13935,7 @@
               <w:jc w:val="left"/>
             </w:pPr>
             <w:r>
-              <w:t xml:space="preserve">DOCX output for POC and testbook templates now includes all passthrough content (stakeholders, closing record, signatures, test cases, test summary, changelog) via a new pre-processor. Fixed dropped Test Scope fields in testbook DOCX output.</w:t>
+              <w:t xml:space="preserve">Testbook and POC DOCX output now matches the PDF much more closely: native table of contents (language-aware, auto-populated), each section starts on a new page, embedded images and diagrams (PlantUML/Graphviz rendered), white-on-red table headers, cover version line under the title, centered test case captions, and plain black rules for signature grids.</w:t>
             </w:r>
           </w:p>
         </w:tc>
@@ -13948,7 +13948,7 @@
               <w:jc w:val="left"/>
             </w:pPr>
             <w:r>
-              <w:t xml:space="preserve">6.4.0</w:t>
+              <w:t xml:space="preserve">6.4.2</w:t>
             </w:r>
           </w:p>
         </w:tc>
@@ -13974,6 +13974,51 @@
               <w:jc w:val="left"/>
             </w:pPr>
             <w:r>
+              <w:t xml:space="preserve">DOCX output for POC and testbook templates now includes all passthrough content (stakeholders, closing record, signatures, test cases, test summary, changelog) via a new pre-processor. Fixed dropped Test Scope fields in testbook DOCX output.</w:t>
+            </w:r>
+          </w:p>
+        </w:tc>
+      </w:tr>
+      <w:tr>
+        <w:tc>
+          <w:tcPr>
+            <w:shd w:val="clear" w:color="auto" w:fill="F6F8FA"/>
+          </w:tcPr>
+          <w:p>
+            <w:pPr>
+              <w:jc w:val="left"/>
+            </w:pPr>
+            <w:r>
+              <w:t xml:space="preserve">6.4.0</w:t>
+            </w:r>
+          </w:p>
+        </w:tc>
+        <w:tc>
+          <w:tcPr>
+            <w:shd w:val="clear" w:color="auto" w:fill="F6F8FA"/>
+          </w:tcPr>
+          <w:p>
+            <w:pPr>
+              <w:jc w:val="left"/>
+            </w:pPr>
+            <w:r>
+              <w:t xml:space="preserve">2026-09-20</w:t>
+            </w:r>
+          </w:p>
+        </w:tc>
+        <w:tc>
+          <w:tcPr>
+            <w:shd w:val="clear" w:color="auto" w:fill="F6F8FA"/>
+          </w:tcPr>
+          <w:p>
+            <w:pPr>
+              <w:numPr>
+                <w:ilvl w:val="0"/>
+                <w:numId w:val="1057"/>
+              </w:numPr>
+              <w:jc w:val="left"/>
+            </w:pPr>
+            <w:r>
               <w:t xml:space="preserve">Fixed changelog dates — replaced</w:t>
             </w:r>
             <w:r>
@@ -13996,58 +14041,13 @@
       </w:tr>
       <w:tr>
         <w:tc>
-          <w:tcPr>
-            <w:shd w:val="clear" w:color="auto" w:fill="F6F8FA"/>
-          </w:tcPr>
+          <w:tcPr/>
           <w:p>
             <w:pPr>
               <w:jc w:val="left"/>
             </w:pPr>
             <w:r>
               <w:t xml:space="preserve">5.1.1</w:t>
-            </w:r>
-          </w:p>
-        </w:tc>
-        <w:tc>
-          <w:tcPr>
-            <w:shd w:val="clear" w:color="auto" w:fill="F6F8FA"/>
-          </w:tcPr>
-          <w:p>
-            <w:pPr>
-              <w:jc w:val="left"/>
-            </w:pPr>
-            <w:r>
-              <w:t xml:space="preserve">2026-09-14</w:t>
-            </w:r>
-          </w:p>
-        </w:tc>
-        <w:tc>
-          <w:tcPr>
-            <w:shd w:val="clear" w:color="auto" w:fill="F6F8FA"/>
-          </w:tcPr>
-          <w:p>
-            <w:pPr>
-              <w:numPr>
-                <w:ilvl w:val="0"/>
-                <w:numId w:val="1057"/>
-              </w:numPr>
-              <w:jc w:val="left"/>
-            </w:pPr>
-            <w:r>
-              <w:t xml:space="preserve">Synced callout colors in DOCX/HTML/MD output to match brand palette. Added color palette demo.</w:t>
-            </w:r>
-          </w:p>
-        </w:tc>
-      </w:tr>
-      <w:tr>
-        <w:tc>
-          <w:tcPr/>
-          <w:p>
-            <w:pPr>
-              <w:jc w:val="left"/>
-            </w:pPr>
-            <w:r>
-              <w:t xml:space="preserve">5.1.0</w:t>
             </w:r>
           </w:p>
         </w:tc>
@@ -14073,7 +14073,7 @@
               <w:jc w:val="left"/>
             </w:pPr>
             <w:r>
-              <w:t xml:space="preserve">Adopted brand guidelines auxiliary color palette and monochrome scale. Aligned callout colors to brand specifications.</w:t>
+              <w:t xml:space="preserve">Synced callout colors in DOCX/HTML/MD output to match brand palette. Added color palette demo.</w:t>
             </w:r>
           </w:p>
         </w:tc>
@@ -14088,7 +14088,7 @@
               <w:jc w:val="left"/>
             </w:pPr>
             <w:r>
-              <w:t xml:space="preserve">5.0.3</w:t>
+              <w:t xml:space="preserve">5.1.0</w:t>
             </w:r>
           </w:p>
         </w:tc>
@@ -14118,6 +14118,45 @@
               <w:jc w:val="left"/>
             </w:pPr>
             <w:r>
+              <w:t xml:space="preserve">Adopted brand guidelines auxiliary color palette and monochrome scale. Aligned callout colors to brand specifications.</w:t>
+            </w:r>
+          </w:p>
+        </w:tc>
+      </w:tr>
+      <w:tr>
+        <w:tc>
+          <w:tcPr/>
+          <w:p>
+            <w:pPr>
+              <w:jc w:val="left"/>
+            </w:pPr>
+            <w:r>
+              <w:t xml:space="preserve">5.0.3</w:t>
+            </w:r>
+          </w:p>
+        </w:tc>
+        <w:tc>
+          <w:tcPr/>
+          <w:p>
+            <w:pPr>
+              <w:jc w:val="left"/>
+            </w:pPr>
+            <w:r>
+              <w:t xml:space="preserve">2026-09-14</w:t>
+            </w:r>
+          </w:p>
+        </w:tc>
+        <w:tc>
+          <w:tcPr/>
+          <w:p>
+            <w:pPr>
+              <w:numPr>
+                <w:ilvl w:val="0"/>
+                <w:numId w:val="1060"/>
+              </w:numPr>
+              <w:jc w:val="left"/>
+            </w:pPr>
+            <w:r>
               <w:t xml:space="preserve">Removed non-standard</w:t>
             </w:r>
             <w:r>
@@ -14140,54 +14179,15 @@
       </w:tr>
       <w:tr>
         <w:tc>
-          <w:tcPr/>
+          <w:tcPr>
+            <w:shd w:val="clear" w:color="auto" w:fill="F6F8FA"/>
+          </w:tcPr>
           <w:p>
             <w:pPr>
               <w:jc w:val="left"/>
             </w:pPr>
             <w:r>
               <w:t xml:space="preserve">5.0.2</w:t>
-            </w:r>
-          </w:p>
-        </w:tc>
-        <w:tc>
-          <w:tcPr/>
-          <w:p>
-            <w:pPr>
-              <w:jc w:val="left"/>
-            </w:pPr>
-            <w:r>
-              <w:t xml:space="preserve">2026-09-14</w:t>
-            </w:r>
-          </w:p>
-        </w:tc>
-        <w:tc>
-          <w:tcPr/>
-          <w:p>
-            <w:pPr>
-              <w:numPr>
-                <w:ilvl w:val="0"/>
-                <w:numId w:val="1060"/>
-              </w:numPr>
-              <w:jc w:val="left"/>
-            </w:pPr>
-            <w:r>
-              <w:t xml:space="preserve">Long commands in test steps now render as code blocks instead of inline code.</w:t>
-            </w:r>
-          </w:p>
-        </w:tc>
-      </w:tr>
-      <w:tr>
-        <w:tc>
-          <w:tcPr>
-            <w:shd w:val="clear" w:color="auto" w:fill="F6F8FA"/>
-          </w:tcPr>
-          <w:p>
-            <w:pPr>
-              <w:jc w:val="left"/>
-            </w:pPr>
-            <w:r>
-              <w:t xml:space="preserve">5.0.1</w:t>
             </w:r>
           </w:p>
         </w:tc>
@@ -14217,7 +14217,7 @@
               <w:jc w:val="left"/>
             </w:pPr>
             <w:r>
-              <w:t xml:space="preserve">Testcase caption centered above the block.</w:t>
+              <w:t xml:space="preserve">Long commands in test steps now render as code blocks instead of inline code.</w:t>
             </w:r>
           </w:p>
         </w:tc>
@@ -14230,7 +14230,7 @@
               <w:jc w:val="left"/>
             </w:pPr>
             <w:r>
-              <w:t xml:space="preserve">5.0.0</w:t>
+              <w:t xml:space="preserve">5.0.1</w:t>
             </w:r>
           </w:p>
         </w:tc>
@@ -14256,6 +14256,51 @@
               <w:jc w:val="left"/>
             </w:pPr>
             <w:r>
+              <w:t xml:space="preserve">Testcase caption centered above the block.</w:t>
+            </w:r>
+          </w:p>
+        </w:tc>
+      </w:tr>
+      <w:tr>
+        <w:tc>
+          <w:tcPr>
+            <w:shd w:val="clear" w:color="auto" w:fill="F6F8FA"/>
+          </w:tcPr>
+          <w:p>
+            <w:pPr>
+              <w:jc w:val="left"/>
+            </w:pPr>
+            <w:r>
+              <w:t xml:space="preserve">5.0.0</w:t>
+            </w:r>
+          </w:p>
+        </w:tc>
+        <w:tc>
+          <w:tcPr>
+            <w:shd w:val="clear" w:color="auto" w:fill="F6F8FA"/>
+          </w:tcPr>
+          <w:p>
+            <w:pPr>
+              <w:jc w:val="left"/>
+            </w:pPr>
+            <w:r>
+              <w:t xml:space="preserve">2026-09-14</w:t>
+            </w:r>
+          </w:p>
+        </w:tc>
+        <w:tc>
+          <w:tcPr>
+            <w:shd w:val="clear" w:color="auto" w:fill="F6F8FA"/>
+          </w:tcPr>
+          <w:p>
+            <w:pPr>
+              <w:numPr>
+                <w:ilvl w:val="0"/>
+                <w:numId w:val="1063"/>
+              </w:numPr>
+              <w:jc w:val="left"/>
+            </w:pPr>
+            <w:r>
               <w:t xml:space="preserve">Major refactoring: extracted shared modules (huawei-titles, huawei-toc, huawei-cover), renamed</w:t>
             </w:r>
             <w:r>
@@ -14317,9 +14362,7 @@
       </w:tr>
       <w:tr>
         <w:tc>
-          <w:tcPr>
-            <w:shd w:val="clear" w:color="auto" w:fill="F6F8FA"/>
-          </w:tcPr>
+          <w:tcPr/>
           <w:p>
             <w:pPr>
               <w:jc w:val="left"/>
@@ -14330,56 +14373,13 @@
           </w:p>
         </w:tc>
         <w:tc>
-          <w:tcPr>
-            <w:shd w:val="clear" w:color="auto" w:fill="F6F8FA"/>
-          </w:tcPr>
+          <w:tcPr/>
           <w:p>
             <w:pPr>
               <w:jc w:val="left"/>
             </w:pPr>
             <w:r>
               <w:t xml:space="preserve">2026-09-14</w:t>
-            </w:r>
-          </w:p>
-        </w:tc>
-        <w:tc>
-          <w:tcPr>
-            <w:shd w:val="clear" w:color="auto" w:fill="F6F8FA"/>
-          </w:tcPr>
-          <w:p>
-            <w:pPr>
-              <w:numPr>
-                <w:ilvl w:val="0"/>
-                <w:numId w:val="1063"/>
-              </w:numPr>
-              <w:jc w:val="left"/>
-            </w:pPr>
-            <w:r>
-              <w:t xml:space="preserve">Testcase headings now formatted as captions (like figures/tables): bold “Testcase N:” followed by description. Changed label from “Test Case” to “Testcase”.</w:t>
-            </w:r>
-          </w:p>
-        </w:tc>
-      </w:tr>
-      <w:tr>
-        <w:tc>
-          <w:tcPr/>
-          <w:p>
-            <w:pPr>
-              <w:jc w:val="left"/>
-            </w:pPr>
-            <w:r>
-              <w:t xml:space="preserve">4.6.0</w:t>
-            </w:r>
-          </w:p>
-        </w:tc>
-        <w:tc>
-          <w:tcPr/>
-          <w:p>
-            <w:pPr>
-              <w:jc w:val="left"/>
-            </w:pPr>
-            <w:r>
-              <w:t xml:space="preserve">2026-09-13</w:t>
             </w:r>
           </w:p>
         </w:tc>
@@ -14394,7 +14394,7 @@
               <w:jc w:val="left"/>
             </w:pPr>
             <w:r>
-              <w:t xml:space="preserve">Section restructure: Introduction, Test Cases (with category subsections), Conclusion. Testcases auto-numbered like figures/tables. Changed testcase from subsection to subsubsection.</w:t>
+              <w:t xml:space="preserve">Testcase headings now formatted as captions (like figures/tables): bold “Testcase N:” followed by description. Changed label from “Test Case” to “Testcase”.</w:t>
             </w:r>
           </w:p>
         </w:tc>
@@ -14409,7 +14409,7 @@
               <w:jc w:val="left"/>
             </w:pPr>
             <w:r>
-              <w:t xml:space="preserve">4.5.0</w:t>
+              <w:t xml:space="preserve">4.6.0</w:t>
             </w:r>
           </w:p>
         </w:tc>
@@ -14439,6 +14439,45 @@
               <w:jc w:val="left"/>
             </w:pPr>
             <w:r>
+              <w:t xml:space="preserve">Section restructure: Introduction, Test Cases (with category subsections), Conclusion. Testcases auto-numbered like figures/tables. Changed testcase from subsection to subsubsection.</w:t>
+            </w:r>
+          </w:p>
+        </w:tc>
+      </w:tr>
+      <w:tr>
+        <w:tc>
+          <w:tcPr/>
+          <w:p>
+            <w:pPr>
+              <w:jc w:val="left"/>
+            </w:pPr>
+            <w:r>
+              <w:t xml:space="preserve">4.5.0</w:t>
+            </w:r>
+          </w:p>
+        </w:tc>
+        <w:tc>
+          <w:tcPr/>
+          <w:p>
+            <w:pPr>
+              <w:jc w:val="left"/>
+            </w:pPr>
+            <w:r>
+              <w:t xml:space="preserve">2026-09-13</w:t>
+            </w:r>
+          </w:p>
+        </w:tc>
+        <w:tc>
+          <w:tcPr/>
+          <w:p>
+            <w:pPr>
+              <w:numPr>
+                <w:ilvl w:val="0"/>
+                <w:numId w:val="1066"/>
+              </w:numPr>
+              <w:jc w:val="left"/>
+            </w:pPr>
+            <w:r>
               <w:t xml:space="preserve">Unified field APIs:</w:t>
             </w:r>
             <w:r>
@@ -14503,54 +14542,15 @@
       </w:tr>
       <w:tr>
         <w:tc>
-          <w:tcPr/>
+          <w:tcPr>
+            <w:shd w:val="clear" w:color="auto" w:fill="F6F8FA"/>
+          </w:tcPr>
           <w:p>
             <w:pPr>
               <w:jc w:val="left"/>
             </w:pPr>
             <w:r>
               <w:t xml:space="preserve">4.4.0</w:t>
-            </w:r>
-          </w:p>
-        </w:tc>
-        <w:tc>
-          <w:tcPr/>
-          <w:p>
-            <w:pPr>
-              <w:jc w:val="left"/>
-            </w:pPr>
-            <w:r>
-              <w:t xml:space="preserve">2026-09-13</w:t>
-            </w:r>
-          </w:p>
-        </w:tc>
-        <w:tc>
-          <w:tcPr/>
-          <w:p>
-            <w:pPr>
-              <w:numPr>
-                <w:ilvl w:val="0"/>
-                <w:numId w:val="1066"/>
-              </w:numPr>
-              <w:jc w:val="left"/>
-            </w:pPr>
-            <w:r>
-              <w:t xml:space="preserve">Code review fixes: removed dead labels, badge now uses Huawei brand colors (tipbg/tipfg, huaweired, warningbg/warningfg), Lua filter preserves formatting in DOCX/MD/HTML via parse_latex_blocks, testprocedure handler preserves non-step content (images, code, callouts).</w:t>
-            </w:r>
-          </w:p>
-        </w:tc>
-      </w:tr>
-      <w:tr>
-        <w:tc>
-          <w:tcPr>
-            <w:shd w:val="clear" w:color="auto" w:fill="F6F8FA"/>
-          </w:tcPr>
-          <w:p>
-            <w:pPr>
-              <w:jc w:val="left"/>
-            </w:pPr>
-            <w:r>
-              <w:t xml:space="preserve">4.3.0</w:t>
             </w:r>
           </w:p>
         </w:tc>
@@ -14580,6 +14580,45 @@
               <w:jc w:val="left"/>
             </w:pPr>
             <w:r>
+              <w:t xml:space="preserve">Code review fixes: removed dead labels, badge now uses Huawei brand colors (tipbg/tipfg, huaweired, warningbg/warningfg), Lua filter preserves formatting in DOCX/MD/HTML via parse_latex_blocks, testprocedure handler preserves non-step content (images, code, callouts).</w:t>
+            </w:r>
+          </w:p>
+        </w:tc>
+      </w:tr>
+      <w:tr>
+        <w:tc>
+          <w:tcPr/>
+          <w:p>
+            <w:pPr>
+              <w:jc w:val="left"/>
+            </w:pPr>
+            <w:r>
+              <w:t xml:space="preserve">4.3.0</w:t>
+            </w:r>
+          </w:p>
+        </w:tc>
+        <w:tc>
+          <w:tcPr/>
+          <w:p>
+            <w:pPr>
+              <w:jc w:val="left"/>
+            </w:pPr>
+            <w:r>
+              <w:t xml:space="preserve">2026-09-13</w:t>
+            </w:r>
+          </w:p>
+        </w:tc>
+        <w:tc>
+          <w:tcPr/>
+          <w:p>
+            <w:pPr>
+              <w:numPr>
+                <w:ilvl w:val="0"/>
+                <w:numId w:val="1068"/>
+              </w:numPr>
+              <w:jc w:val="left"/>
+            </w:pPr>
+            <w:r>
               <w:t xml:space="preserve">Added</w:t>
             </w:r>
             <w:r>
@@ -14632,7 +14671,9 @@
       </w:tr>
       <w:tr>
         <w:tc>
-          <w:tcPr/>
+          <w:tcPr>
+            <w:shd w:val="clear" w:color="auto" w:fill="F6F8FA"/>
+          </w:tcPr>
           <w:p>
             <w:pPr>
               <w:jc w:val="left"/>
@@ -14643,7 +14684,9 @@
           </w:p>
         </w:tc>
         <w:tc>
-          <w:tcPr/>
+          <w:tcPr>
+            <w:shd w:val="clear" w:color="auto" w:fill="F6F8FA"/>
+          </w:tcPr>
           <w:p>
             <w:pPr>
               <w:jc w:val="left"/>
@@ -14654,12 +14697,14 @@
           </w:p>
         </w:tc>
         <w:tc>
-          <w:tcPr/>
+          <w:tcPr>
+            <w:shd w:val="clear" w:color="auto" w:fill="F6F8FA"/>
+          </w:tcPr>
           <w:p>
             <w:pPr>
               <w:numPr>
                 <w:ilvl w:val="0"/>
-                <w:numId w:val="1068"/>
+                <w:numId w:val="1069"/>
               </w:numPr>
               <w:jc w:val="left"/>
             </w:pPr>
@@ -14713,9 +14758,7 @@
       </w:tr>
       <w:tr>
         <w:tc>
-          <w:tcPr>
-            <w:shd w:val="clear" w:color="auto" w:fill="F6F8FA"/>
-          </w:tcPr>
+          <w:tcPr/>
           <w:p>
             <w:pPr>
               <w:jc w:val="left"/>
@@ -14726,9 +14769,7 @@
           </w:p>
         </w:tc>
         <w:tc>
-          <w:tcPr>
-            <w:shd w:val="clear" w:color="auto" w:fill="F6F8FA"/>
-          </w:tcPr>
+          <w:tcPr/>
           <w:p>
             <w:pPr>
               <w:jc w:val="left"/>
@@ -14739,14 +14780,12 @@
           </w:p>
         </w:tc>
         <w:tc>
-          <w:tcPr>
-            <w:shd w:val="clear" w:color="auto" w:fill="F6F8FA"/>
-          </w:tcPr>
+          <w:tcPr/>
           <w:p>
             <w:pPr>
               <w:numPr>
                 <w:ilvl w:val="0"/>
-                <w:numId w:val="1069"/>
+                <w:numId w:val="1070"/>
               </w:numPr>
               <w:jc w:val="left"/>
             </w:pPr>
@@ -14773,7 +14812,9 @@
       </w:tr>
       <w:tr>
         <w:tc>
-          <w:tcPr/>
+          <w:tcPr>
+            <w:shd w:val="clear" w:color="auto" w:fill="F6F8FA"/>
+          </w:tcPr>
           <w:p>
             <w:pPr>
               <w:jc w:val="left"/>
@@ -14784,7 +14825,9 @@
           </w:p>
         </w:tc>
         <w:tc>
-          <w:tcPr/>
+          <w:tcPr>
+            <w:shd w:val="clear" w:color="auto" w:fill="F6F8FA"/>
+          </w:tcPr>
           <w:p>
             <w:pPr>
               <w:jc w:val="left"/>
@@ -14795,12 +14838,14 @@
           </w:p>
         </w:tc>
         <w:tc>
-          <w:tcPr/>
+          <w:tcPr>
+            <w:shd w:val="clear" w:color="auto" w:fill="F6F8FA"/>
+          </w:tcPr>
           <w:p>
             <w:pPr>
               <w:numPr>
                 <w:ilvl w:val="0"/>
-                <w:numId w:val="1070"/>
+                <w:numId w:val="1071"/>
               </w:numPr>
               <w:jc w:val="left"/>
             </w:pPr>
@@ -14842,9 +14887,7 @@
       </w:tr>
       <w:tr>
         <w:tc>
-          <w:tcPr>
-            <w:shd w:val="clear" w:color="auto" w:fill="F6F8FA"/>
-          </w:tcPr>
+          <w:tcPr/>
           <w:p>
             <w:pPr>
               <w:jc w:val="left"/>
@@ -14855,9 +14898,7 @@
           </w:p>
         </w:tc>
         <w:tc>
-          <w:tcPr>
-            <w:shd w:val="clear" w:color="auto" w:fill="F6F8FA"/>
-          </w:tcPr>
+          <w:tcPr/>
           <w:p>
             <w:pPr>
               <w:jc w:val="left"/>
@@ -14868,14 +14909,12 @@
           </w:p>
         </w:tc>
         <w:tc>
-          <w:tcPr>
-            <w:shd w:val="clear" w:color="auto" w:fill="F6F8FA"/>
-          </w:tcPr>
+          <w:tcPr/>
           <w:p>
             <w:pPr>
               <w:numPr>
                 <w:ilvl w:val="0"/>
-                <w:numId w:val="1071"/>
+                <w:numId w:val="1072"/>
               </w:numPr>
               <w:jc w:val="left"/>
             </w:pPr>
@@ -14902,54 +14941,15 @@
       </w:tr>
       <w:tr>
         <w:tc>
-          <w:tcPr/>
+          <w:tcPr>
+            <w:shd w:val="clear" w:color="auto" w:fill="F6F8FA"/>
+          </w:tcPr>
           <w:p>
             <w:pPr>
               <w:jc w:val="left"/>
             </w:pPr>
             <w:r>
               <w:t xml:space="preserve">3.8.1</w:t>
-            </w:r>
-          </w:p>
-        </w:tc>
-        <w:tc>
-          <w:tcPr/>
-          <w:p>
-            <w:pPr>
-              <w:jc w:val="left"/>
-            </w:pPr>
-            <w:r>
-              <w:t xml:space="preserve">2026-09-13</w:t>
-            </w:r>
-          </w:p>
-        </w:tc>
-        <w:tc>
-          <w:tcPr/>
-          <w:p>
-            <w:pPr>
-              <w:numPr>
-                <w:ilvl w:val="0"/>
-                <w:numId w:val="1072"/>
-              </w:numPr>
-              <w:jc w:val="left"/>
-            </w:pPr>
-            <w:r>
-              <w:t xml:space="preserve">End-to-end quality review: fixed testbook PDF metadata title, removed stray user DOCX from template dir, fixed round-trip.sh variable typo, updated stale references in AGENTS.md and README.md, committed testbook sample PDFs, set TZ for pandoc cover time consistency, widened pandoc version range.</w:t>
-            </w:r>
-          </w:p>
-        </w:tc>
-      </w:tr>
-      <w:tr>
-        <w:tc>
-          <w:tcPr>
-            <w:shd w:val="clear" w:color="auto" w:fill="F6F8FA"/>
-          </w:tcPr>
-          <w:p>
-            <w:pPr>
-              <w:jc w:val="left"/>
-            </w:pPr>
-            <w:r>
-              <w:t xml:space="preserve">3.8.0</w:t>
             </w:r>
           </w:p>
         </w:tc>
@@ -14979,7 +14979,7 @@
               <w:jc w:val="left"/>
             </w:pPr>
             <w:r>
-              <w:t xml:space="preserve">Removed Tips and Tricks chapter (tmux configuration) — required VS Code-specific keybindings that don’t generalize across terminal setups.</w:t>
+              <w:t xml:space="preserve">End-to-end quality review: fixed testbook PDF metadata title, removed stray user DOCX from template dir, fixed round-trip.sh variable typo, updated stale references in AGENTS.md and README.md, committed testbook sample PDFs, set TZ for pandoc cover time consistency, widened pandoc version range.</w:t>
             </w:r>
           </w:p>
         </w:tc>
@@ -14992,18 +14992,18 @@
               <w:jc w:val="left"/>
             </w:pPr>
             <w:r>
-              <w:t xml:space="preserve">3.7.0</w:t>
-            </w:r>
-          </w:p>
-        </w:tc>
-        <w:tc>
-          <w:tcPr/>
-          <w:p>
-            <w:pPr>
-              <w:jc w:val="left"/>
-            </w:pPr>
-            <w:r>
-              <w:t xml:space="preserve">2026-09-12</w:t>
+              <w:t xml:space="preserve">3.8.0</w:t>
+            </w:r>
+          </w:p>
+        </w:tc>
+        <w:tc>
+          <w:tcPr/>
+          <w:p>
+            <w:pPr>
+              <w:jc w:val="left"/>
+            </w:pPr>
+            <w:r>
+              <w:t xml:space="preserve">2026-09-13</w:t>
             </w:r>
           </w:p>
         </w:tc>
@@ -15018,6 +15018,51 @@
               <w:jc w:val="left"/>
             </w:pPr>
             <w:r>
+              <w:t xml:space="preserve">Removed Tips and Tricks chapter (tmux configuration) — required VS Code-specific keybindings that don’t generalize across terminal setups.</w:t>
+            </w:r>
+          </w:p>
+        </w:tc>
+      </w:tr>
+      <w:tr>
+        <w:tc>
+          <w:tcPr>
+            <w:shd w:val="clear" w:color="auto" w:fill="F6F8FA"/>
+          </w:tcPr>
+          <w:p>
+            <w:pPr>
+              <w:jc w:val="left"/>
+            </w:pPr>
+            <w:r>
+              <w:t xml:space="preserve">3.7.0</w:t>
+            </w:r>
+          </w:p>
+        </w:tc>
+        <w:tc>
+          <w:tcPr>
+            <w:shd w:val="clear" w:color="auto" w:fill="F6F8FA"/>
+          </w:tcPr>
+          <w:p>
+            <w:pPr>
+              <w:jc w:val="left"/>
+            </w:pPr>
+            <w:r>
+              <w:t xml:space="preserve">2026-09-12</w:t>
+            </w:r>
+          </w:p>
+        </w:tc>
+        <w:tc>
+          <w:tcPr>
+            <w:shd w:val="clear" w:color="auto" w:fill="F6F8FA"/>
+          </w:tcPr>
+          <w:p>
+            <w:pPr>
+              <w:numPr>
+                <w:ilvl w:val="0"/>
+                <w:numId w:val="1075"/>
+              </w:numPr>
+              <w:jc w:val="left"/>
+            </w:pPr>
+            <w:r>
               <w:t xml:space="preserve">Added</w:t>
             </w:r>
             <w:r>
@@ -15070,9 +15115,7 @@
       </w:tr>
       <w:tr>
         <w:tc>
-          <w:tcPr>
-            <w:shd w:val="clear" w:color="auto" w:fill="F6F8FA"/>
-          </w:tcPr>
+          <w:tcPr/>
           <w:p>
             <w:pPr>
               <w:jc w:val="left"/>
@@ -15083,9 +15126,7 @@
           </w:p>
         </w:tc>
         <w:tc>
-          <w:tcPr>
-            <w:shd w:val="clear" w:color="auto" w:fill="F6F8FA"/>
-          </w:tcPr>
+          <w:tcPr/>
           <w:p>
             <w:pPr>
               <w:jc w:val="left"/>
@@ -15096,14 +15137,12 @@
           </w:p>
         </w:tc>
         <w:tc>
-          <w:tcPr>
-            <w:shd w:val="clear" w:color="auto" w:fill="F6F8FA"/>
-          </w:tcPr>
+          <w:tcPr/>
           <w:p>
             <w:pPr>
               <w:numPr>
                 <w:ilvl w:val="0"/>
-                <w:numId w:val="1075"/>
+                <w:numId w:val="1076"/>
               </w:numPr>
               <w:jc w:val="left"/>
             </w:pPr>
@@ -15160,7 +15199,9 @@
       </w:tr>
       <w:tr>
         <w:tc>
-          <w:tcPr/>
+          <w:tcPr>
+            <w:shd w:val="clear" w:color="auto" w:fill="F6F8FA"/>
+          </w:tcPr>
           <w:p>
             <w:pPr>
               <w:jc w:val="left"/>
@@ -15171,7 +15212,9 @@
           </w:p>
         </w:tc>
         <w:tc>
-          <w:tcPr/>
+          <w:tcPr>
+            <w:shd w:val="clear" w:color="auto" w:fill="F6F8FA"/>
+          </w:tcPr>
           <w:p>
             <w:pPr>
               <w:jc w:val="left"/>
@@ -15182,12 +15225,14 @@
           </w:p>
         </w:tc>
         <w:tc>
-          <w:tcPr/>
+          <w:tcPr>
+            <w:shd w:val="clear" w:color="auto" w:fill="F6F8FA"/>
+          </w:tcPr>
           <w:p>
             <w:pPr>
               <w:numPr>
                 <w:ilvl w:val="0"/>
-                <w:numId w:val="1076"/>
+                <w:numId w:val="1077"/>
               </w:numPr>
               <w:jc w:val="left"/>
             </w:pPr>
@@ -15265,9 +15310,7 @@
       </w:tr>
       <w:tr>
         <w:tc>
-          <w:tcPr>
-            <w:shd w:val="clear" w:color="auto" w:fill="F6F8FA"/>
-          </w:tcPr>
+          <w:tcPr/>
           <w:p>
             <w:pPr>
               <w:jc w:val="left"/>
@@ -15278,9 +15321,7 @@
           </w:p>
         </w:tc>
         <w:tc>
-          <w:tcPr>
-            <w:shd w:val="clear" w:color="auto" w:fill="F6F8FA"/>
-          </w:tcPr>
+          <w:tcPr/>
           <w:p>
             <w:pPr>
               <w:jc w:val="left"/>
@@ -15291,14 +15332,12 @@
           </w:p>
         </w:tc>
         <w:tc>
-          <w:tcPr>
-            <w:shd w:val="clear" w:color="auto" w:fill="F6F8FA"/>
-          </w:tcPr>
+          <w:tcPr/>
           <w:p>
             <w:pPr>
               <w:numPr>
                 <w:ilvl w:val="0"/>
-                <w:numId w:val="1077"/>
+                <w:numId w:val="1078"/>
               </w:numPr>
               <w:jc w:val="left"/>
             </w:pPr>
@@ -15325,7 +15364,7 @@
             <w:pPr>
               <w:numPr>
                 <w:ilvl w:val="0"/>
-                <w:numId w:val="1077"/>
+                <w:numId w:val="1078"/>
               </w:numPr>
               <w:jc w:val="left"/>
             </w:pPr>
@@ -15367,7 +15406,7 @@
             <w:pPr>
               <w:numPr>
                 <w:ilvl w:val="0"/>
-                <w:numId w:val="1077"/>
+                <w:numId w:val="1078"/>
               </w:numPr>
               <w:jc w:val="left"/>
             </w:pPr>
@@ -15379,7 +15418,9 @@
       </w:tr>
       <w:tr>
         <w:tc>
-          <w:tcPr/>
+          <w:tcPr>
+            <w:shd w:val="clear" w:color="auto" w:fill="F6F8FA"/>
+          </w:tcPr>
           <w:p>
             <w:pPr>
               <w:jc w:val="left"/>
@@ -15390,7 +15431,9 @@
           </w:p>
         </w:tc>
         <w:tc>
-          <w:tcPr/>
+          <w:tcPr>
+            <w:shd w:val="clear" w:color="auto" w:fill="F6F8FA"/>
+          </w:tcPr>
           <w:p>
             <w:pPr>
               <w:jc w:val="left"/>
@@ -15401,12 +15444,14 @@
           </w:p>
         </w:tc>
         <w:tc>
-          <w:tcPr/>
+          <w:tcPr>
+            <w:shd w:val="clear" w:color="auto" w:fill="F6F8FA"/>
+          </w:tcPr>
           <w:p>
             <w:pPr>
               <w:numPr>
                 <w:ilvl w:val="0"/>
-                <w:numId w:val="1078"/>
+                <w:numId w:val="1079"/>
               </w:numPr>
               <w:jc w:val="left"/>
             </w:pPr>
@@ -15433,7 +15478,7 @@
             <w:pPr>
               <w:numPr>
                 <w:ilvl w:val="0"/>
-                <w:numId w:val="1078"/>
+                <w:numId w:val="1079"/>
               </w:numPr>
               <w:jc w:val="left"/>
             </w:pPr>
@@ -15460,7 +15505,7 @@
             <w:pPr>
               <w:numPr>
                 <w:ilvl w:val="0"/>
-                <w:numId w:val="1078"/>
+                <w:numId w:val="1079"/>
               </w:numPr>
               <w:jc w:val="left"/>
             </w:pPr>
@@ -15472,7 +15517,7 @@
             <w:pPr>
               <w:numPr>
                 <w:ilvl w:val="0"/>
-                <w:numId w:val="1078"/>
+                <w:numId w:val="1079"/>
               </w:numPr>
               <w:jc w:val="left"/>
             </w:pPr>
@@ -15496,58 +15541,13 @@
       </w:tr>
       <w:tr>
         <w:tc>
-          <w:tcPr>
-            <w:shd w:val="clear" w:color="auto" w:fill="F6F8FA"/>
-          </w:tcPr>
+          <w:tcPr/>
           <w:p>
             <w:pPr>
               <w:jc w:val="left"/>
             </w:pPr>
             <w:r>
               <w:t xml:space="preserve">3.2.1</w:t>
-            </w:r>
-          </w:p>
-        </w:tc>
-        <w:tc>
-          <w:tcPr>
-            <w:shd w:val="clear" w:color="auto" w:fill="F6F8FA"/>
-          </w:tcPr>
-          <w:p>
-            <w:pPr>
-              <w:jc w:val="left"/>
-            </w:pPr>
-            <w:r>
-              <w:t xml:space="preserve">2026-09-11</w:t>
-            </w:r>
-          </w:p>
-        </w:tc>
-        <w:tc>
-          <w:tcPr>
-            <w:shd w:val="clear" w:color="auto" w:fill="F6F8FA"/>
-          </w:tcPr>
-          <w:p>
-            <w:pPr>
-              <w:numPr>
-                <w:ilvl w:val="0"/>
-                <w:numId w:val="1079"/>
-              </w:numPr>
-              <w:jc w:val="left"/>
-            </w:pPr>
-            <w:r>
-              <w:t xml:space="preserve">Renamed Chapter 7 from “Clean Up” to “Operations and Maintenance”. Added subsections for updating and uninstalling both the MaaS Gateway and the document templates. Added cloud resource cleanup as an optional subsection.</w:t>
-            </w:r>
-          </w:p>
-        </w:tc>
-      </w:tr>
-      <w:tr>
-        <w:tc>
-          <w:tcPr/>
-          <w:p>
-            <w:pPr>
-              <w:jc w:val="left"/>
-            </w:pPr>
-            <w:r>
-              <w:t xml:space="preserve">3.2.0</w:t>
             </w:r>
           </w:p>
         </w:tc>
@@ -15573,6 +15573,51 @@
               <w:jc w:val="left"/>
             </w:pPr>
             <w:r>
+              <w:t xml:space="preserve">Renamed Chapter 7 from “Clean Up” to “Operations and Maintenance”. Added subsections for updating and uninstalling both the MaaS Gateway and the document templates. Added cloud resource cleanup as an optional subsection.</w:t>
+            </w:r>
+          </w:p>
+        </w:tc>
+      </w:tr>
+      <w:tr>
+        <w:tc>
+          <w:tcPr>
+            <w:shd w:val="clear" w:color="auto" w:fill="F6F8FA"/>
+          </w:tcPr>
+          <w:p>
+            <w:pPr>
+              <w:jc w:val="left"/>
+            </w:pPr>
+            <w:r>
+              <w:t xml:space="preserve">3.2.0</w:t>
+            </w:r>
+          </w:p>
+        </w:tc>
+        <w:tc>
+          <w:tcPr>
+            <w:shd w:val="clear" w:color="auto" w:fill="F6F8FA"/>
+          </w:tcPr>
+          <w:p>
+            <w:pPr>
+              <w:jc w:val="left"/>
+            </w:pPr>
+            <w:r>
+              <w:t xml:space="preserve">2026-09-11</w:t>
+            </w:r>
+          </w:p>
+        </w:tc>
+        <w:tc>
+          <w:tcPr>
+            <w:shd w:val="clear" w:color="auto" w:fill="F6F8FA"/>
+          </w:tcPr>
+          <w:p>
+            <w:pPr>
+              <w:numPr>
+                <w:ilvl w:val="0"/>
+                <w:numId w:val="1081"/>
+              </w:numPr>
+              <w:jc w:val="left"/>
+            </w:pPr>
+            <w:r>
               <w:t xml:space="preserve">Added</w:t>
             </w:r>
             <w:r>
@@ -15634,7 +15679,7 @@
             <w:pPr>
               <w:numPr>
                 <w:ilvl w:val="0"/>
-                <w:numId w:val="1080"/>
+                <w:numId w:val="1081"/>
               </w:numPr>
               <w:jc w:val="left"/>
             </w:pPr>
@@ -15679,7 +15724,7 @@
             <w:pPr>
               <w:numPr>
                 <w:ilvl w:val="0"/>
-                <w:numId w:val="1080"/>
+                <w:numId w:val="1081"/>
               </w:numPr>
               <w:jc w:val="left"/>
             </w:pPr>
@@ -15691,58 +15736,13 @@
       </w:tr>
       <w:tr>
         <w:tc>
-          <w:tcPr>
-            <w:shd w:val="clear" w:color="auto" w:fill="F6F8FA"/>
-          </w:tcPr>
+          <w:tcPr/>
           <w:p>
             <w:pPr>
               <w:jc w:val="left"/>
             </w:pPr>
             <w:r>
               <w:t xml:space="preserve">3.1.2</w:t>
-            </w:r>
-          </w:p>
-        </w:tc>
-        <w:tc>
-          <w:tcPr>
-            <w:shd w:val="clear" w:color="auto" w:fill="F6F8FA"/>
-          </w:tcPr>
-          <w:p>
-            <w:pPr>
-              <w:jc w:val="left"/>
-            </w:pPr>
-            <w:r>
-              <w:t xml:space="preserve">2026-09-11</w:t>
-            </w:r>
-          </w:p>
-        </w:tc>
-        <w:tc>
-          <w:tcPr>
-            <w:shd w:val="clear" w:color="auto" w:fill="F6F8FA"/>
-          </w:tcPr>
-          <w:p>
-            <w:pPr>
-              <w:numPr>
-                <w:ilvl w:val="0"/>
-                <w:numId w:val="1081"/>
-              </w:numPr>
-              <w:jc w:val="left"/>
-            </w:pPr>
-            <w:r>
-              <w:t xml:space="preserve">Added output format guide to README.md: comparison table of PDF, Markdown, DOCX, and HTML with purpose, copy-paste quality, and limitations. Recommends Markdown for copy-paste.</w:t>
-            </w:r>
-          </w:p>
-        </w:tc>
-      </w:tr>
-      <w:tr>
-        <w:tc>
-          <w:tcPr/>
-          <w:p>
-            <w:pPr>
-              <w:jc w:val="left"/>
-            </w:pPr>
-            <w:r>
-              <w:t xml:space="preserve">3.1.1</w:t>
             </w:r>
           </w:p>
         </w:tc>
@@ -15768,6 +15768,51 @@
               <w:jc w:val="left"/>
             </w:pPr>
             <w:r>
+              <w:t xml:space="preserve">Added output format guide to README.md: comparison table of PDF, Markdown, DOCX, and HTML with purpose, copy-paste quality, and limitations. Recommends Markdown for copy-paste.</w:t>
+            </w:r>
+          </w:p>
+        </w:tc>
+      </w:tr>
+      <w:tr>
+        <w:tc>
+          <w:tcPr>
+            <w:shd w:val="clear" w:color="auto" w:fill="F6F8FA"/>
+          </w:tcPr>
+          <w:p>
+            <w:pPr>
+              <w:jc w:val="left"/>
+            </w:pPr>
+            <w:r>
+              <w:t xml:space="preserve">3.1.1</w:t>
+            </w:r>
+          </w:p>
+        </w:tc>
+        <w:tc>
+          <w:tcPr>
+            <w:shd w:val="clear" w:color="auto" w:fill="F6F8FA"/>
+          </w:tcPr>
+          <w:p>
+            <w:pPr>
+              <w:jc w:val="left"/>
+            </w:pPr>
+            <w:r>
+              <w:t xml:space="preserve">2026-09-11</w:t>
+            </w:r>
+          </w:p>
+        </w:tc>
+        <w:tc>
+          <w:tcPr>
+            <w:shd w:val="clear" w:color="auto" w:fill="F6F8FA"/>
+          </w:tcPr>
+          <w:p>
+            <w:pPr>
+              <w:numPr>
+                <w:ilvl w:val="0"/>
+                <w:numId w:val="1083"/>
+              </w:numPr>
+              <w:jc w:val="left"/>
+            </w:pPr>
+            <w:r>
               <w:t xml:space="preserve">Updated MaaS Gateway chapter to v1.10.9: non-interactive mode (</w:t>
             </w:r>
             <w:r>
@@ -15784,7 +15829,7 @@
             <w:pPr>
               <w:numPr>
                 <w:ilvl w:val="0"/>
-                <w:numId w:val="1082"/>
+                <w:numId w:val="1083"/>
               </w:numPr>
               <w:jc w:val="left"/>
             </w:pPr>
@@ -15826,7 +15871,7 @@
             <w:pPr>
               <w:numPr>
                 <w:ilvl w:val="0"/>
-                <w:numId w:val="1082"/>
+                <w:numId w:val="1083"/>
               </w:numPr>
               <w:jc w:val="left"/>
             </w:pPr>
@@ -15838,9 +15883,7 @@
       </w:tr>
       <w:tr>
         <w:tc>
-          <w:tcPr>
-            <w:shd w:val="clear" w:color="auto" w:fill="F6F8FA"/>
-          </w:tcPr>
+          <w:tcPr/>
           <w:p>
             <w:pPr>
               <w:jc w:val="left"/>
@@ -15851,9 +15894,7 @@
           </w:p>
         </w:tc>
         <w:tc>
-          <w:tcPr>
-            <w:shd w:val="clear" w:color="auto" w:fill="F6F8FA"/>
-          </w:tcPr>
+          <w:tcPr/>
           <w:p>
             <w:pPr>
               <w:jc w:val="left"/>
@@ -15864,14 +15905,12 @@
           </w:p>
         </w:tc>
         <w:tc>
-          <w:tcPr>
-            <w:shd w:val="clear" w:color="auto" w:fill="F6F8FA"/>
-          </w:tcPr>
+          <w:tcPr/>
           <w:p>
             <w:pPr>
               <w:numPr>
                 <w:ilvl w:val="0"/>
-                <w:numId w:val="1083"/>
+                <w:numId w:val="1084"/>
               </w:numPr>
               <w:jc w:val="left"/>
             </w:pPr>
@@ -15895,7 +15934,7 @@
             <w:pPr>
               <w:numPr>
                 <w:ilvl w:val="0"/>
-                <w:numId w:val="1083"/>
+                <w:numId w:val="1084"/>
               </w:numPr>
               <w:jc w:val="left"/>
             </w:pPr>
@@ -15937,7 +15976,7 @@
             <w:pPr>
               <w:numPr>
                 <w:ilvl w:val="0"/>
-                <w:numId w:val="1083"/>
+                <w:numId w:val="1084"/>
               </w:numPr>
               <w:jc w:val="left"/>
             </w:pPr>
@@ -15945,57 +15984,6 @@
               <w:t xml:space="preserve">Restructured chapters: moved SSH config and VS Code connection to new Chapter 4 (Install VS Code and Connect via Remote-SSH). Chapters 5—​7 renumbered.</w:t>
             </w:r>
           </w:p>
-          <w:p>
-            <w:pPr>
-              <w:numPr>
-                <w:ilvl w:val="0"/>
-                <w:numId w:val="1083"/>
-              </w:numPr>
-              <w:jc w:val="left"/>
-            </w:pPr>
-            <w:r>
-              <w:t xml:space="preserve">Added verification checklist tables to all 7 chapters.</w:t>
-            </w:r>
-          </w:p>
-          <w:p>
-            <w:pPr>
-              <w:numPr>
-                <w:ilvl w:val="0"/>
-                <w:numId w:val="1083"/>
-              </w:numPr>
-              <w:jc w:val="left"/>
-            </w:pPr>
-            <w:r>
-              <w:t xml:space="preserve">Added mandatory reboot warning in Chapter 2 (SSH port change). Added troubleshooting subsection in Chapter 4 with common SSH connection issues and ncat debugging commands.</w:t>
-            </w:r>
-          </w:p>
-        </w:tc>
-      </w:tr>
-      <w:tr>
-        <w:tc>
-          <w:tcPr/>
-          <w:p>
-            <w:pPr>
-              <w:jc w:val="left"/>
-            </w:pPr>
-            <w:r>
-              <w:t xml:space="preserve">3.0.1</w:t>
-            </w:r>
-          </w:p>
-        </w:tc>
-        <w:tc>
-          <w:tcPr/>
-          <w:p>
-            <w:pPr>
-              <w:jc w:val="left"/>
-            </w:pPr>
-            <w:r>
-              <w:t xml:space="preserve">2026-09-10</w:t>
-            </w:r>
-          </w:p>
-        </w:tc>
-        <w:tc>
-          <w:tcPr/>
           <w:p>
             <w:pPr>
               <w:numPr>
@@ -16005,7 +15993,19 @@
               <w:jc w:val="left"/>
             </w:pPr>
             <w:r>
-              <w:t xml:space="preserve">Minor fixes: test-filter.sh auto-discovery, build.sh help text, Makefile aggregate descriptions, 5-section comment correction, CHANGELOG version gap note, callout-in-code fix, CI font auto-discovery, dofile path comment, test-sync.sh header.</w:t>
+              <w:t xml:space="preserve">Added verification checklist tables to all 7 chapters.</w:t>
+            </w:r>
+          </w:p>
+          <w:p>
+            <w:pPr>
+              <w:numPr>
+                <w:ilvl w:val="0"/>
+                <w:numId w:val="1084"/>
+              </w:numPr>
+              <w:jc w:val="left"/>
+            </w:pPr>
+            <w:r>
+              <w:t xml:space="preserve">Added mandatory reboot warning in Chapter 2 (SSH port change). Added troubleshooting subsection in Chapter 4 with common SSH connection issues and ncat debugging commands.</w:t>
             </w:r>
           </w:p>
         </w:tc>
@@ -16020,7 +16020,7 @@
               <w:jc w:val="left"/>
             </w:pPr>
             <w:r>
-              <w:t xml:space="preserve">3.0.0</w:t>
+              <w:t xml:space="preserve">3.0.1</w:t>
             </w:r>
           </w:p>
         </w:tc>
@@ -16033,7 +16033,7 @@
               <w:jc w:val="left"/>
             </w:pPr>
             <w:r>
-              <w:t xml:space="preserve">2026-09-09</w:t>
+              <w:t xml:space="preserve">2026-09-10</w:t>
             </w:r>
           </w:p>
         </w:tc>
@@ -16050,7 +16050,7 @@
               <w:jc w:val="left"/>
             </w:pPr>
             <w:r>
-              <w:t xml:space="preserve">Modular pipeline refactoring: shared Lua filter factory, shared DOCX fix logic, build system auto-discovery, unified format pipeline, GitHub Actions CI.</w:t>
+              <w:t xml:space="preserve">Minor fixes: test-filter.sh auto-discovery, build.sh help text, Makefile aggregate descriptions, 5-section comment correction, CHANGELOG version gap note, callout-in-code fix, CI font auto-discovery, dofile path comment, test-sync.sh header.</w:t>
             </w:r>
           </w:p>
         </w:tc>
@@ -16063,18 +16063,18 @@
               <w:jc w:val="left"/>
             </w:pPr>
             <w:r>
-              <w:t xml:space="preserve">2.16.0</w:t>
-            </w:r>
-          </w:p>
-        </w:tc>
-        <w:tc>
-          <w:tcPr/>
-          <w:p>
-            <w:pPr>
-              <w:jc w:val="left"/>
-            </w:pPr>
-            <w:r>
-              <w:t xml:space="preserve">2026-09-05</w:t>
+              <w:t xml:space="preserve">3.0.0</w:t>
+            </w:r>
+          </w:p>
+        </w:tc>
+        <w:tc>
+          <w:tcPr/>
+          <w:p>
+            <w:pPr>
+              <w:jc w:val="left"/>
+            </w:pPr>
+            <w:r>
+              <w:t xml:space="preserve">2026-09-09</w:t>
             </w:r>
           </w:p>
         </w:tc>
@@ -16089,7 +16089,7 @@
               <w:jc w:val="left"/>
             </w:pPr>
             <w:r>
-              <w:t xml:space="preserve">Updated to match template v2.16.0 — Lua filter fixes, build system updates, and technical template parity improvements.</w:t>
+              <w:t xml:space="preserve">Modular pipeline refactoring: shared Lua filter factory, shared DOCX fix logic, build system auto-discovery, unified format pipeline, GitHub Actions CI.</w:t>
             </w:r>
           </w:p>
         </w:tc>
@@ -16104,7 +16104,7 @@
               <w:jc w:val="left"/>
             </w:pPr>
             <w:r>
-              <w:t xml:space="preserve">2.13.0</w:t>
+              <w:t xml:space="preserve">2.16.0</w:t>
             </w:r>
           </w:p>
         </w:tc>
@@ -16117,7 +16117,7 @@
               <w:jc w:val="left"/>
             </w:pPr>
             <w:r>
-              <w:t xml:space="preserve">2026-08-24</w:t>
+              <w:t xml:space="preserve">2026-09-05</w:t>
             </w:r>
           </w:p>
         </w:tc>
@@ -16134,6 +16134,45 @@
               <w:jc w:val="left"/>
             </w:pPr>
             <w:r>
+              <w:t xml:space="preserve">Updated to match template v2.16.0 — Lua filter fixes, build system updates, and technical template parity improvements.</w:t>
+            </w:r>
+          </w:p>
+        </w:tc>
+      </w:tr>
+      <w:tr>
+        <w:tc>
+          <w:tcPr/>
+          <w:p>
+            <w:pPr>
+              <w:jc w:val="left"/>
+            </w:pPr>
+            <w:r>
+              <w:t xml:space="preserve">2.13.0</w:t>
+            </w:r>
+          </w:p>
+        </w:tc>
+        <w:tc>
+          <w:tcPr/>
+          <w:p>
+            <w:pPr>
+              <w:jc w:val="left"/>
+            </w:pPr>
+            <w:r>
+              <w:t xml:space="preserve">2026-08-24</w:t>
+            </w:r>
+          </w:p>
+        </w:tc>
+        <w:tc>
+          <w:tcPr/>
+          <w:p>
+            <w:pPr>
+              <w:numPr>
+                <w:ilvl w:val="0"/>
+                <w:numId w:val="1088"/>
+              </w:numPr>
+              <w:jc w:val="left"/>
+            </w:pPr>
+            <w:r>
               <w:t xml:space="preserve">Foundation refactoring Phase 4: make DOCX</w:t>
             </w:r>
             <w:r>
@@ -16201,7 +16240,9 @@
       </w:tr>
       <w:tr>
         <w:tc>
-          <w:tcPr/>
+          <w:tcPr>
+            <w:shd w:val="clear" w:color="auto" w:fill="F6F8FA"/>
+          </w:tcPr>
           <w:p>
             <w:pPr>
               <w:jc w:val="left"/>
@@ -16212,7 +16253,9 @@
           </w:p>
         </w:tc>
         <w:tc>
-          <w:tcPr/>
+          <w:tcPr>
+            <w:shd w:val="clear" w:color="auto" w:fill="F6F8FA"/>
+          </w:tcPr>
           <w:p>
             <w:pPr>
               <w:jc w:val="left"/>
@@ -16223,12 +16266,14 @@
           </w:p>
         </w:tc>
         <w:tc>
-          <w:tcPr/>
+          <w:tcPr>
+            <w:shd w:val="clear" w:color="auto" w:fill="F6F8FA"/>
+          </w:tcPr>
           <w:p>
             <w:pPr>
               <w:numPr>
                 <w:ilvl w:val="0"/>
-                <w:numId w:val="1088"/>
+                <w:numId w:val="1089"/>
               </w:numPr>
               <w:jc w:val="left"/>
             </w:pPr>
@@ -16390,9 +16435,7 @@
       </w:tr>
       <w:tr>
         <w:tc>
-          <w:tcPr>
-            <w:shd w:val="clear" w:color="auto" w:fill="F6F8FA"/>
-          </w:tcPr>
+          <w:tcPr/>
           <w:p>
             <w:pPr>
               <w:jc w:val="left"/>
@@ -16403,9 +16446,7 @@
           </w:p>
         </w:tc>
         <w:tc>
-          <w:tcPr>
-            <w:shd w:val="clear" w:color="auto" w:fill="F6F8FA"/>
-          </w:tcPr>
+          <w:tcPr/>
           <w:p>
             <w:pPr>
               <w:jc w:val="left"/>
@@ -16416,14 +16457,12 @@
           </w:p>
         </w:tc>
         <w:tc>
-          <w:tcPr>
-            <w:shd w:val="clear" w:color="auto" w:fill="F6F8FA"/>
-          </w:tcPr>
+          <w:tcPr/>
           <w:p>
             <w:pPr>
               <w:numPr>
                 <w:ilvl w:val="0"/>
-                <w:numId w:val="1089"/>
+                <w:numId w:val="1090"/>
               </w:numPr>
               <w:jc w:val="left"/>
             </w:pPr>
@@ -16489,7 +16528,9 @@
       </w:tr>
       <w:tr>
         <w:tc>
-          <w:tcPr/>
+          <w:tcPr>
+            <w:shd w:val="clear" w:color="auto" w:fill="F6F8FA"/>
+          </w:tcPr>
           <w:p>
             <w:pPr>
               <w:jc w:val="left"/>
@@ -16500,56 +16541,15 @@
           </w:p>
         </w:tc>
         <w:tc>
-          <w:tcPr/>
+          <w:tcPr>
+            <w:shd w:val="clear" w:color="auto" w:fill="F6F8FA"/>
+          </w:tcPr>
           <w:p>
             <w:pPr>
               <w:jc w:val="left"/>
             </w:pPr>
             <w:r>
               <w:t xml:space="preserve">2026-08-24</w:t>
-            </w:r>
-          </w:p>
-        </w:tc>
-        <w:tc>
-          <w:tcPr/>
-          <w:p>
-            <w:pPr>
-              <w:numPr>
-                <w:ilvl w:val="0"/>
-                <w:numId w:val="1090"/>
-              </w:numPr>
-              <w:jc w:val="left"/>
-            </w:pPr>
-            <w:r>
-              <w:t xml:space="preserve">Foundation refactoring Phase 1: sync cls version to project tag, fix stale doc references (L16 output count, L-range, setup-guide feature claim), add test-sync.sh for version consistency checking.</w:t>
-            </w:r>
-          </w:p>
-        </w:tc>
-      </w:tr>
-      <w:tr>
-        <w:tc>
-          <w:tcPr>
-            <w:shd w:val="clear" w:color="auto" w:fill="F6F8FA"/>
-          </w:tcPr>
-          <w:p>
-            <w:pPr>
-              <w:jc w:val="left"/>
-            </w:pPr>
-            <w:r>
-              <w:t xml:space="preserve">2.9.1</w:t>
-            </w:r>
-          </w:p>
-        </w:tc>
-        <w:tc>
-          <w:tcPr>
-            <w:shd w:val="clear" w:color="auto" w:fill="F6F8FA"/>
-          </w:tcPr>
-          <w:p>
-            <w:pPr>
-              <w:jc w:val="left"/>
-            </w:pPr>
-            <w:r>
-              <w:t xml:space="preserve">2026-08-23</w:t>
             </w:r>
           </w:p>
         </w:tc>
@@ -16566,6 +16566,45 @@
               <w:jc w:val="left"/>
             </w:pPr>
             <w:r>
+              <w:t xml:space="preserve">Foundation refactoring Phase 1: sync cls version to project tag, fix stale doc references (L16 output count, L-range, setup-guide feature claim), add test-sync.sh for version consistency checking.</w:t>
+            </w:r>
+          </w:p>
+        </w:tc>
+      </w:tr>
+      <w:tr>
+        <w:tc>
+          <w:tcPr/>
+          <w:p>
+            <w:pPr>
+              <w:jc w:val="left"/>
+            </w:pPr>
+            <w:r>
+              <w:t xml:space="preserve">2.9.1</w:t>
+            </w:r>
+          </w:p>
+        </w:tc>
+        <w:tc>
+          <w:tcPr/>
+          <w:p>
+            <w:pPr>
+              <w:jc w:val="left"/>
+            </w:pPr>
+            <w:r>
+              <w:t xml:space="preserve">2026-08-23</w:t>
+            </w:r>
+          </w:p>
+        </w:tc>
+        <w:tc>
+          <w:tcPr/>
+          <w:p>
+            <w:pPr>
+              <w:numPr>
+                <w:ilvl w:val="0"/>
+                <w:numId w:val="1092"/>
+              </w:numPr>
+              <w:jc w:val="left"/>
+            </w:pPr>
+            <w:r>
               <w:t xml:space="preserve">HTML and Markdown outputs now embed images as base64 data URIs. HTML uses pandoc</w:t>
             </w:r>
             <w:r>
@@ -16597,54 +16636,15 @@
       </w:tr>
       <w:tr>
         <w:tc>
-          <w:tcPr/>
+          <w:tcPr>
+            <w:shd w:val="clear" w:color="auto" w:fill="F6F8FA"/>
+          </w:tcPr>
           <w:p>
             <w:pPr>
               <w:jc w:val="left"/>
             </w:pPr>
             <w:r>
               <w:t xml:space="preserve">2.9.0</w:t>
-            </w:r>
-          </w:p>
-        </w:tc>
-        <w:tc>
-          <w:tcPr/>
-          <w:p>
-            <w:pPr>
-              <w:jc w:val="left"/>
-            </w:pPr>
-            <w:r>
-              <w:t xml:space="preserve">2026-08-23</w:t>
-            </w:r>
-          </w:p>
-        </w:tc>
-        <w:tc>
-          <w:tcPr/>
-          <w:p>
-            <w:pPr>
-              <w:numPr>
-                <w:ilvl w:val="0"/>
-                <w:numId w:val="1092"/>
-              </w:numPr>
-              <w:jc w:val="left"/>
-            </w:pPr>
-            <w:r>
-              <w:t xml:space="preserve">DOCX: fix content width (8504→9638tw, margins are 2cm not 3cm). Add footer page numbers. Style TOC heading (22pt bold + rule). Add hutable table width + fixed layout.</w:t>
-            </w:r>
-          </w:p>
-        </w:tc>
-      </w:tr>
-      <w:tr>
-        <w:tc>
-          <w:tcPr>
-            <w:shd w:val="clear" w:color="auto" w:fill="F6F8FA"/>
-          </w:tcPr>
-          <w:p>
-            <w:pPr>
-              <w:jc w:val="left"/>
-            </w:pPr>
-            <w:r>
-              <w:t xml:space="preserve">2.8.3</w:t>
             </w:r>
           </w:p>
         </w:tc>
@@ -16674,7 +16674,7 @@
               <w:jc w:val="left"/>
             </w:pPr>
             <w:r>
-              <w:t xml:space="preserve">DOCX fix: callout tables now have explicit width (8504tw) and fixed layout. Changelog section heading now uses custom H1 format (56pt number, red border, right tab) instead of pandoc’s default.</w:t>
+              <w:t xml:space="preserve">DOCX: fix content width (8504→9638tw, margins are 2cm not 3cm). Add footer page numbers. Style TOC heading (22pt bold + rule). Add hutable table width + fixed layout.</w:t>
             </w:r>
           </w:p>
         </w:tc>
@@ -16687,7 +16687,7 @@
               <w:jc w:val="left"/>
             </w:pPr>
             <w:r>
-              <w:t xml:space="preserve">2.8.2</w:t>
+              <w:t xml:space="preserve">2.8.3</w:t>
             </w:r>
           </w:p>
         </w:tc>
@@ -16713,7 +16713,7 @@
               <w:jc w:val="left"/>
             </w:pPr>
             <w:r>
-              <w:t xml:space="preserve">DOCX H1 heading: reverted table approach to paragraph with tab stop + red bottom border. Table broke navigation pane and TOC field. Paragraph preserves Heading1 style for navigation while matching PDF layout (number left, title right, red rule below).</w:t>
+              <w:t xml:space="preserve">DOCX fix: callout tables now have explicit width (8504tw) and fixed layout. Changelog section heading now uses custom H1 format (56pt number, red border, right tab) instead of pandoc’s default.</w:t>
             </w:r>
           </w:p>
         </w:tc>
@@ -16728,7 +16728,7 @@
               <w:jc w:val="left"/>
             </w:pPr>
             <w:r>
-              <w:t xml:space="preserve">2.8.1</w:t>
+              <w:t xml:space="preserve">2.8.2</w:t>
             </w:r>
           </w:p>
         </w:tc>
@@ -16758,7 +16758,7 @@
               <w:jc w:val="left"/>
             </w:pPr>
             <w:r>
-              <w:t xml:space="preserve">DOCX heading fix: text color reverted to black (was incorrectly changed to Huawei red in v2.8.0). H1 now uses a two-column table (number left, title right) with red bottom rule. H2-H4 use simple inline format (number + title, no right tab stop).</w:t>
+              <w:t xml:space="preserve">DOCX H1 heading: reverted table approach to paragraph with tab stop + red bottom border. Table broke navigation pane and TOC field. Paragraph preserves Heading1 style for navigation while matching PDF layout (number left, title right, red rule below).</w:t>
             </w:r>
           </w:p>
         </w:tc>
@@ -16771,7 +16771,7 @@
               <w:jc w:val="left"/>
             </w:pPr>
             <w:r>
-              <w:t xml:space="preserve">2.8.0</w:t>
+              <w:t xml:space="preserve">2.8.1</w:t>
             </w:r>
           </w:p>
         </w:tc>
@@ -16797,7 +16797,7 @@
               <w:jc w:val="left"/>
             </w:pPr>
             <w:r>
-              <w:t xml:space="preserve">DOCX output: match PDF styling --- heading colors (Huawei red), H1 number size (56pt), callout borders (left-only) and padding, changelog formatting (rules, bold version, italic date), caption style (9pt bold), badge style (8pt bold white on red), list indentation.</w:t>
+              <w:t xml:space="preserve">DOCX heading fix: text color reverted to black (was incorrectly changed to Huawei red in v2.8.0). H1 now uses a two-column table (number left, title right) with red bottom rule. H2-H4 use simple inline format (number + title, no right tab stop).</w:t>
             </w:r>
           </w:p>
         </w:tc>
@@ -16812,7 +16812,7 @@
               <w:jc w:val="left"/>
             </w:pPr>
             <w:r>
-              <w:t xml:space="preserve">2.7.1</w:t>
+              <w:t xml:space="preserve">2.8.0</w:t>
             </w:r>
           </w:p>
         </w:tc>
@@ -16825,7 +16825,7 @@
               <w:jc w:val="left"/>
             </w:pPr>
             <w:r>
-              <w:t xml:space="preserve">2026-08-17</w:t>
+              <w:t xml:space="preserve">2026-08-23</w:t>
             </w:r>
           </w:p>
         </w:tc>
@@ -16842,6 +16842,45 @@
               <w:jc w:val="left"/>
             </w:pPr>
             <w:r>
+              <w:t xml:space="preserve">DOCX output: match PDF styling --- heading colors (Huawei red), H1 number size (56pt), callout borders (left-only) and padding, changelog formatting (rules, bold version, italic date), caption style (9pt bold), badge style (8pt bold white on red), list indentation.</w:t>
+            </w:r>
+          </w:p>
+        </w:tc>
+      </w:tr>
+      <w:tr>
+        <w:tc>
+          <w:tcPr/>
+          <w:p>
+            <w:pPr>
+              <w:jc w:val="left"/>
+            </w:pPr>
+            <w:r>
+              <w:t xml:space="preserve">2.7.1</w:t>
+            </w:r>
+          </w:p>
+        </w:tc>
+        <w:tc>
+          <w:tcPr/>
+          <w:p>
+            <w:pPr>
+              <w:jc w:val="left"/>
+            </w:pPr>
+            <w:r>
+              <w:t xml:space="preserve">2026-08-17</w:t>
+            </w:r>
+          </w:p>
+        </w:tc>
+        <w:tc>
+          <w:tcPr/>
+          <w:p>
+            <w:pPr>
+              <w:numPr>
+                <w:ilvl w:val="0"/>
+                <w:numId w:val="1098"/>
+              </w:numPr>
+              <w:jc w:val="left"/>
+            </w:pPr>
+            <w:r>
               <w:t xml:space="preserve">Rename project repository to all lowercase (</w:t>
             </w:r>
             <w:r>
@@ -16858,7 +16897,9 @@
       </w:tr>
       <w:tr>
         <w:tc>
-          <w:tcPr/>
+          <w:tcPr>
+            <w:shd w:val="clear" w:color="auto" w:fill="F6F8FA"/>
+          </w:tcPr>
           <w:p>
             <w:pPr>
               <w:jc w:val="left"/>
@@ -16869,7 +16910,9 @@
           </w:p>
         </w:tc>
         <w:tc>
-          <w:tcPr/>
+          <w:tcPr>
+            <w:shd w:val="clear" w:color="auto" w:fill="F6F8FA"/>
+          </w:tcPr>
           <w:p>
             <w:pPr>
               <w:jc w:val="left"/>
@@ -16880,12 +16923,14 @@
           </w:p>
         </w:tc>
         <w:tc>
-          <w:tcPr/>
+          <w:tcPr>
+            <w:shd w:val="clear" w:color="auto" w:fill="F6F8FA"/>
+          </w:tcPr>
           <w:p>
             <w:pPr>
               <w:numPr>
                 <w:ilvl w:val="0"/>
-                <w:numId w:val="1098"/>
+                <w:numId w:val="1099"/>
               </w:numPr>
               <w:jc w:val="left"/>
             </w:pPr>
@@ -16927,9 +16972,7 @@
       </w:tr>
       <w:tr>
         <w:tc>
-          <w:tcPr>
-            <w:shd w:val="clear" w:color="auto" w:fill="F6F8FA"/>
-          </w:tcPr>
+          <w:tcPr/>
           <w:p>
             <w:pPr>
               <w:jc w:val="left"/>
@@ -16940,9 +16983,7 @@
           </w:p>
         </w:tc>
         <w:tc>
-          <w:tcPr>
-            <w:shd w:val="clear" w:color="auto" w:fill="F6F8FA"/>
-          </w:tcPr>
+          <w:tcPr/>
           <w:p>
             <w:pPr>
               <w:jc w:val="left"/>
@@ -16953,14 +16994,12 @@
           </w:p>
         </w:tc>
         <w:tc>
-          <w:tcPr>
-            <w:shd w:val="clear" w:color="auto" w:fill="F6F8FA"/>
-          </w:tcPr>
+          <w:tcPr/>
           <w:p>
             <w:pPr>
               <w:numPr>
                 <w:ilvl w:val="0"/>
-                <w:numId w:val="1099"/>
+                <w:numId w:val="1100"/>
               </w:numPr>
               <w:jc w:val="left"/>
             </w:pPr>
@@ -17017,7 +17056,9 @@
       </w:tr>
       <w:tr>
         <w:tc>
-          <w:tcPr/>
+          <w:tcPr>
+            <w:shd w:val="clear" w:color="auto" w:fill="F6F8FA"/>
+          </w:tcPr>
           <w:p>
             <w:pPr>
               <w:jc w:val="left"/>
@@ -17028,7 +17069,9 @@
           </w:p>
         </w:tc>
         <w:tc>
-          <w:tcPr/>
+          <w:tcPr>
+            <w:shd w:val="clear" w:color="auto" w:fill="F6F8FA"/>
+          </w:tcPr>
           <w:p>
             <w:pPr>
               <w:jc w:val="left"/>
@@ -17039,12 +17082,14 @@
           </w:p>
         </w:tc>
         <w:tc>
-          <w:tcPr/>
+          <w:tcPr>
+            <w:shd w:val="clear" w:color="auto" w:fill="F6F8FA"/>
+          </w:tcPr>
           <w:p>
             <w:pPr>
               <w:numPr>
                 <w:ilvl w:val="0"/>
-                <w:numId w:val="1100"/>
+                <w:numId w:val="1101"/>
               </w:numPr>
               <w:jc w:val="left"/>
             </w:pPr>
@@ -17071,7 +17116,7 @@
             <w:pPr>
               <w:numPr>
                 <w:ilvl w:val="0"/>
-                <w:numId w:val="1100"/>
+                <w:numId w:val="1101"/>
               </w:numPr>
               <w:jc w:val="left"/>
             </w:pPr>
@@ -17098,58 +17143,13 @@
       </w:tr>
       <w:tr>
         <w:tc>
-          <w:tcPr>
-            <w:shd w:val="clear" w:color="auto" w:fill="F6F8FA"/>
-          </w:tcPr>
+          <w:tcPr/>
           <w:p>
             <w:pPr>
               <w:jc w:val="left"/>
             </w:pPr>
             <w:r>
               <w:t xml:space="preserve">2.5.1</w:t>
-            </w:r>
-          </w:p>
-        </w:tc>
-        <w:tc>
-          <w:tcPr>
-            <w:shd w:val="clear" w:color="auto" w:fill="F6F8FA"/>
-          </w:tcPr>
-          <w:p>
-            <w:pPr>
-              <w:jc w:val="left"/>
-            </w:pPr>
-            <w:r>
-              <w:t xml:space="preserve">2026-08-10</w:t>
-            </w:r>
-          </w:p>
-        </w:tc>
-        <w:tc>
-          <w:tcPr>
-            <w:shd w:val="clear" w:color="auto" w:fill="F6F8FA"/>
-          </w:tcPr>
-          <w:p>
-            <w:pPr>
-              <w:numPr>
-                <w:ilvl w:val="0"/>
-                <w:numId w:val="1101"/>
-              </w:numPr>
-              <w:jc w:val="left"/>
-            </w:pPr>
-            <w:r>
-              <w:t xml:space="preserve">H1 section title size reduced from 27pt to 20pt.</w:t>
-            </w:r>
-          </w:p>
-        </w:tc>
-      </w:tr>
-      <w:tr>
-        <w:tc>
-          <w:tcPr/>
-          <w:p>
-            <w:pPr>
-              <w:jc w:val="left"/>
-            </w:pPr>
-            <w:r>
-              <w:t xml:space="preserve">2.5.0</w:t>
             </w:r>
           </w:p>
         </w:tc>
@@ -17175,13 +17175,7 @@
               <w:jc w:val="left"/>
             </w:pPr>
             <w:r>
-              <w:t xml:space="preserve">Default image size increased: width 65% → 90% of text width,</w:t>
-            </w:r>
-            <w:r>
-              <w:t xml:space="preserve"> </w:t>
-            </w:r>
-            <w:r>
-              <w:t xml:space="preserve">height 40% → 50% of text height.</w:t>
+              <w:t xml:space="preserve">H1 section title size reduced from 27pt to 20pt.</w:t>
             </w:r>
           </w:p>
         </w:tc>
@@ -17196,7 +17190,7 @@
               <w:jc w:val="left"/>
             </w:pPr>
             <w:r>
-              <w:t xml:space="preserve">2.4.0</w:t>
+              <w:t xml:space="preserve">2.5.0</w:t>
             </w:r>
           </w:p>
         </w:tc>
@@ -17226,14 +17220,59 @@
               <w:jc w:val="left"/>
             </w:pPr>
             <w:r>
-              <w:t xml:space="preserve">Enlarged H1 section title (18pt → 27pt, 50% bigger).</w:t>
-            </w:r>
-          </w:p>
+              <w:t xml:space="preserve">Default image size increased: width 65% → 90% of text width,</w:t>
+            </w:r>
+            <w:r>
+              <w:t xml:space="preserve"> </w:t>
+            </w:r>
+            <w:r>
+              <w:t xml:space="preserve">height 40% → 50% of text height.</w:t>
+            </w:r>
+          </w:p>
+        </w:tc>
+      </w:tr>
+      <w:tr>
+        <w:tc>
+          <w:tcPr/>
+          <w:p>
+            <w:pPr>
+              <w:jc w:val="left"/>
+            </w:pPr>
+            <w:r>
+              <w:t xml:space="preserve">2.4.0</w:t>
+            </w:r>
+          </w:p>
+        </w:tc>
+        <w:tc>
+          <w:tcPr/>
+          <w:p>
+            <w:pPr>
+              <w:jc w:val="left"/>
+            </w:pPr>
+            <w:r>
+              <w:t xml:space="preserve">2026-08-10</w:t>
+            </w:r>
+          </w:p>
+        </w:tc>
+        <w:tc>
+          <w:tcPr/>
           <w:p>
             <w:pPr>
               <w:numPr>
                 <w:ilvl w:val="0"/>
-                <w:numId w:val="1103"/>
+                <w:numId w:val="1104"/>
+              </w:numPr>
+              <w:jc w:val="left"/>
+            </w:pPr>
+            <w:r>
+              <w:t xml:space="preserve">Enlarged H1 section title (18pt → 27pt, 50% bigger).</w:t>
+            </w:r>
+          </w:p>
+          <w:p>
+            <w:pPr>
+              <w:numPr>
+                <w:ilvl w:val="0"/>
+                <w:numId w:val="1104"/>
               </w:numPr>
               <w:jc w:val="left"/>
             </w:pPr>
@@ -17260,7 +17299,9 @@
       </w:tr>
       <w:tr>
         <w:tc>
-          <w:tcPr/>
+          <w:tcPr>
+            <w:shd w:val="clear" w:color="auto" w:fill="F6F8FA"/>
+          </w:tcPr>
           <w:p>
             <w:pPr>
               <w:jc w:val="left"/>
@@ -17271,7 +17312,9 @@
           </w:p>
         </w:tc>
         <w:tc>
-          <w:tcPr/>
+          <w:tcPr>
+            <w:shd w:val="clear" w:color="auto" w:fill="F6F8FA"/>
+          </w:tcPr>
           <w:p>
             <w:pPr>
               <w:jc w:val="left"/>
@@ -17282,12 +17325,14 @@
           </w:p>
         </w:tc>
         <w:tc>
-          <w:tcPr/>
+          <w:tcPr>
+            <w:shd w:val="clear" w:color="auto" w:fill="F6F8FA"/>
+          </w:tcPr>
           <w:p>
             <w:pPr>
               <w:numPr>
                 <w:ilvl w:val="0"/>
-                <w:numId w:val="1104"/>
+                <w:numId w:val="1105"/>
               </w:numPr>
               <w:jc w:val="left"/>
             </w:pPr>
@@ -17314,9 +17359,7 @@
       </w:tr>
       <w:tr>
         <w:tc>
-          <w:tcPr>
-            <w:shd w:val="clear" w:color="auto" w:fill="F6F8FA"/>
-          </w:tcPr>
+          <w:tcPr/>
           <w:p>
             <w:pPr>
               <w:jc w:val="left"/>
@@ -17327,9 +17370,7 @@
           </w:p>
         </w:tc>
         <w:tc>
-          <w:tcPr>
-            <w:shd w:val="clear" w:color="auto" w:fill="F6F8FA"/>
-          </w:tcPr>
+          <w:tcPr/>
           <w:p>
             <w:pPr>
               <w:jc w:val="left"/>
@@ -17340,14 +17381,12 @@
           </w:p>
         </w:tc>
         <w:tc>
-          <w:tcPr>
-            <w:shd w:val="clear" w:color="auto" w:fill="F6F8FA"/>
-          </w:tcPr>
+          <w:tcPr/>
           <w:p>
             <w:pPr>
               <w:numPr>
                 <w:ilvl w:val="0"/>
-                <w:numId w:val="1105"/>
+                <w:numId w:val="1106"/>
               </w:numPr>
               <w:jc w:val="left"/>
             </w:pPr>
@@ -17419,7 +17458,9 @@
       </w:tr>
       <w:tr>
         <w:tc>
-          <w:tcPr/>
+          <w:tcPr>
+            <w:shd w:val="clear" w:color="auto" w:fill="F6F8FA"/>
+          </w:tcPr>
           <w:p>
             <w:pPr>
               <w:jc w:val="left"/>
@@ -17430,7 +17471,9 @@
           </w:p>
         </w:tc>
         <w:tc>
-          <w:tcPr/>
+          <w:tcPr>
+            <w:shd w:val="clear" w:color="auto" w:fill="F6F8FA"/>
+          </w:tcPr>
           <w:p>
             <w:pPr>
               <w:jc w:val="left"/>
@@ -17441,12 +17484,14 @@
           </w:p>
         </w:tc>
         <w:tc>
-          <w:tcPr/>
+          <w:tcPr>
+            <w:shd w:val="clear" w:color="auto" w:fill="F6F8FA"/>
+          </w:tcPr>
           <w:p>
             <w:pPr>
               <w:numPr>
                 <w:ilvl w:val="0"/>
-                <w:numId w:val="1106"/>
+                <w:numId w:val="1107"/>
               </w:numPr>
               <w:jc w:val="left"/>
             </w:pPr>
@@ -17503,9 +17548,7 @@
       </w:tr>
       <w:tr>
         <w:tc>
-          <w:tcPr>
-            <w:shd w:val="clear" w:color="auto" w:fill="F6F8FA"/>
-          </w:tcPr>
+          <w:tcPr/>
           <w:p>
             <w:pPr>
               <w:jc w:val="left"/>
@@ -17516,9 +17559,7 @@
           </w:p>
         </w:tc>
         <w:tc>
-          <w:tcPr>
-            <w:shd w:val="clear" w:color="auto" w:fill="F6F8FA"/>
-          </w:tcPr>
+          <w:tcPr/>
           <w:p>
             <w:pPr>
               <w:jc w:val="left"/>
@@ -17529,14 +17570,12 @@
           </w:p>
         </w:tc>
         <w:tc>
-          <w:tcPr>
-            <w:shd w:val="clear" w:color="auto" w:fill="F6F8FA"/>
-          </w:tcPr>
+          <w:tcPr/>
           <w:p>
             <w:pPr>
               <w:numPr>
                 <w:ilvl w:val="0"/>
-                <w:numId w:val="1107"/>
+                <w:numId w:val="1108"/>
               </w:numPr>
               <w:jc w:val="left"/>
             </w:pPr>
@@ -17563,54 +17602,15 @@
       </w:tr>
       <w:tr>
         <w:tc>
-          <w:tcPr/>
+          <w:tcPr>
+            <w:shd w:val="clear" w:color="auto" w:fill="F6F8FA"/>
+          </w:tcPr>
           <w:p>
             <w:pPr>
               <w:jc w:val="left"/>
             </w:pPr>
             <w:r>
               <w:t xml:space="preserve">2.2.2</w:t>
-            </w:r>
-          </w:p>
-        </w:tc>
-        <w:tc>
-          <w:tcPr/>
-          <w:p>
-            <w:pPr>
-              <w:jc w:val="left"/>
-            </w:pPr>
-            <w:r>
-              <w:t xml:space="preserve">2026-08-08</w:t>
-            </w:r>
-          </w:p>
-        </w:tc>
-        <w:tc>
-          <w:tcPr/>
-          <w:p>
-            <w:pPr>
-              <w:numPr>
-                <w:ilvl w:val="0"/>
-                <w:numId w:val="1108"/>
-              </w:numPr>
-              <w:jc w:val="left"/>
-            </w:pPr>
-            <w:r>
-              <w:t xml:space="preserve">Fixed chapter reference in prerequisite (Chapter 3 → Chapter 4).</w:t>
-            </w:r>
-          </w:p>
-        </w:tc>
-      </w:tr>
-      <w:tr>
-        <w:tc>
-          <w:tcPr>
-            <w:shd w:val="clear" w:color="auto" w:fill="F6F8FA"/>
-          </w:tcPr>
-          <w:p>
-            <w:pPr>
-              <w:jc w:val="left"/>
-            </w:pPr>
-            <w:r>
-              <w:t xml:space="preserve">2.2.1</w:t>
             </w:r>
           </w:p>
         </w:tc>
@@ -17640,7 +17640,7 @@
               <w:jc w:val="left"/>
             </w:pPr>
             <w:r>
-              <w:t xml:space="preserve">Changed table and figure caption labels to black (was Huawei red).</w:t>
+              <w:t xml:space="preserve">Fixed chapter reference in prerequisite (Chapter 3 → Chapter 4).</w:t>
             </w:r>
           </w:p>
         </w:tc>
@@ -17653,7 +17653,7 @@
               <w:jc w:val="left"/>
             </w:pPr>
             <w:r>
-              <w:t xml:space="preserve">2.2.0</w:t>
+              <w:t xml:space="preserve">2.2.1</w:t>
             </w:r>
           </w:p>
         </w:tc>
@@ -17679,13 +17679,7 @@
               <w:jc w:val="left"/>
             </w:pPr>
             <w:r>
-              <w:t xml:space="preserve">Added Huawei-branded table styling: red header bar, alternating row</w:t>
-            </w:r>
-            <w:r>
-              <w:t xml:space="preserve"> </w:t>
-            </w:r>
-            <w:r>
-              <w:t xml:space="preserve">colors, and bordered cells.</w:t>
+              <w:t xml:space="preserve">Changed table and figure caption labels to black (was Huawei red).</w:t>
             </w:r>
           </w:p>
         </w:tc>
@@ -17700,7 +17694,7 @@
               <w:jc w:val="left"/>
             </w:pPr>
             <w:r>
-              <w:t xml:space="preserve">2.1.0</w:t>
+              <w:t xml:space="preserve">2.2.0</w:t>
             </w:r>
           </w:p>
         </w:tc>
@@ -17713,7 +17707,7 @@
               <w:jc w:val="left"/>
             </w:pPr>
             <w:r>
-              <w:t xml:space="preserve">2026-08-06</w:t>
+              <w:t xml:space="preserve">2026-08-08</w:t>
             </w:r>
           </w:p>
         </w:tc>
@@ -17730,6 +17724,51 @@
               <w:jc w:val="left"/>
             </w:pPr>
             <w:r>
+              <w:t xml:space="preserve">Added Huawei-branded table styling: red header bar, alternating row</w:t>
+            </w:r>
+            <w:r>
+              <w:t xml:space="preserve"> </w:t>
+            </w:r>
+            <w:r>
+              <w:t xml:space="preserve">colors, and bordered cells.</w:t>
+            </w:r>
+          </w:p>
+        </w:tc>
+      </w:tr>
+      <w:tr>
+        <w:tc>
+          <w:tcPr/>
+          <w:p>
+            <w:pPr>
+              <w:jc w:val="left"/>
+            </w:pPr>
+            <w:r>
+              <w:t xml:space="preserve">2.1.0</w:t>
+            </w:r>
+          </w:p>
+        </w:tc>
+        <w:tc>
+          <w:tcPr/>
+          <w:p>
+            <w:pPr>
+              <w:jc w:val="left"/>
+            </w:pPr>
+            <w:r>
+              <w:t xml:space="preserve">2026-08-06</w:t>
+            </w:r>
+          </w:p>
+        </w:tc>
+        <w:tc>
+          <w:tcPr/>
+          <w:p>
+            <w:pPr>
+              <w:numPr>
+                <w:ilvl w:val="0"/>
+                <w:numId w:val="1112"/>
+              </w:numPr>
+              <w:jc w:val="left"/>
+            </w:pPr>
+            <w:r>
               <w:t xml:space="preserve">Updated ECS flavor to</w:t>
             </w:r>
             <w:r>
@@ -17752,7 +17791,7 @@
             <w:pPr>
               <w:numPr>
                 <w:ilvl w:val="0"/>
-                <w:numId w:val="1111"/>
+                <w:numId w:val="1112"/>
               </w:numPr>
               <w:jc w:val="left"/>
             </w:pPr>
@@ -17764,7 +17803,7 @@
             <w:pPr>
               <w:numPr>
                 <w:ilvl w:val="0"/>
-                <w:numId w:val="1111"/>
+                <w:numId w:val="1112"/>
               </w:numPr>
               <w:jc w:val="left"/>
             </w:pPr>
@@ -17776,7 +17815,7 @@
             <w:pPr>
               <w:numPr>
                 <w:ilvl w:val="0"/>
-                <w:numId w:val="1111"/>
+                <w:numId w:val="1112"/>
               </w:numPr>
               <w:jc w:val="left"/>
             </w:pPr>
@@ -17788,7 +17827,7 @@
             <w:pPr>
               <w:numPr>
                 <w:ilvl w:val="0"/>
-                <w:numId w:val="1111"/>
+                <w:numId w:val="1112"/>
               </w:numPr>
               <w:jc w:val="left"/>
             </w:pPr>
@@ -17800,7 +17839,7 @@
             <w:pPr>
               <w:numPr>
                 <w:ilvl w:val="0"/>
-                <w:numId w:val="1111"/>
+                <w:numId w:val="1112"/>
               </w:numPr>
               <w:jc w:val="left"/>
             </w:pPr>
@@ -17818,7 +17857,7 @@
             <w:pPr>
               <w:numPr>
                 <w:ilvl w:val="0"/>
-                <w:numId w:val="1111"/>
+                <w:numId w:val="1112"/>
               </w:numPr>
               <w:jc w:val="left"/>
             </w:pPr>
@@ -17867,7 +17906,7 @@
             <w:pPr>
               <w:numPr>
                 <w:ilvl w:val="0"/>
-                <w:numId w:val="1111"/>
+                <w:numId w:val="1112"/>
               </w:numPr>
               <w:jc w:val="left"/>
             </w:pPr>
@@ -17879,7 +17918,7 @@
             <w:pPr>
               <w:numPr>
                 <w:ilvl w:val="0"/>
-                <w:numId w:val="1111"/>
+                <w:numId w:val="1112"/>
               </w:numPr>
               <w:jc w:val="left"/>
             </w:pPr>
@@ -17930,7 +17969,7 @@
             <w:pPr>
               <w:numPr>
                 <w:ilvl w:val="0"/>
-                <w:numId w:val="1111"/>
+                <w:numId w:val="1112"/>
               </w:numPr>
               <w:jc w:val="left"/>
             </w:pPr>
@@ -17957,7 +17996,9 @@
       </w:tr>
       <w:tr>
         <w:tc>
-          <w:tcPr/>
+          <w:tcPr>
+            <w:shd w:val="clear" w:color="auto" w:fill="F6F8FA"/>
+          </w:tcPr>
           <w:p>
             <w:pPr>
               <w:jc w:val="left"/>
@@ -17968,7 +18009,9 @@
           </w:p>
         </w:tc>
         <w:tc>
-          <w:tcPr/>
+          <w:tcPr>
+            <w:shd w:val="clear" w:color="auto" w:fill="F6F8FA"/>
+          </w:tcPr>
           <w:p>
             <w:pPr>
               <w:jc w:val="left"/>
@@ -17979,12 +18022,14 @@
           </w:p>
         </w:tc>
         <w:tc>
-          <w:tcPr/>
+          <w:tcPr>
+            <w:shd w:val="clear" w:color="auto" w:fill="F6F8FA"/>
+          </w:tcPr>
           <w:p>
             <w:pPr>
               <w:numPr>
                 <w:ilvl w:val="0"/>
-                <w:numId w:val="1112"/>
+                <w:numId w:val="1113"/>
               </w:numPr>
               <w:jc w:val="left"/>
             </w:pPr>
@@ -18002,7 +18047,7 @@
             <w:pPr>
               <w:numPr>
                 <w:ilvl w:val="0"/>
-                <w:numId w:val="1112"/>
+                <w:numId w:val="1113"/>
               </w:numPr>
               <w:jc w:val="left"/>
             </w:pPr>
@@ -18056,7 +18101,7 @@
             <w:pPr>
               <w:numPr>
                 <w:ilvl w:val="0"/>
-                <w:numId w:val="1112"/>
+                <w:numId w:val="1113"/>
               </w:numPr>
               <w:jc w:val="left"/>
             </w:pPr>
@@ -18104,7 +18149,7 @@
             <w:pPr>
               <w:numPr>
                 <w:ilvl w:val="0"/>
-                <w:numId w:val="1112"/>
+                <w:numId w:val="1113"/>
               </w:numPr>
               <w:jc w:val="left"/>
             </w:pPr>
@@ -18125,9 +18170,7 @@
       </w:tr>
       <w:tr>
         <w:tc>
-          <w:tcPr>
-            <w:shd w:val="clear" w:color="auto" w:fill="F6F8FA"/>
-          </w:tcPr>
+          <w:tcPr/>
           <w:p>
             <w:pPr>
               <w:jc w:val="left"/>
@@ -18138,9 +18181,7 @@
           </w:p>
         </w:tc>
         <w:tc>
-          <w:tcPr>
-            <w:shd w:val="clear" w:color="auto" w:fill="F6F8FA"/>
-          </w:tcPr>
+          <w:tcPr/>
           <w:p>
             <w:pPr>
               <w:jc w:val="left"/>
@@ -18151,14 +18192,12 @@
           </w:p>
         </w:tc>
         <w:tc>
-          <w:tcPr>
-            <w:shd w:val="clear" w:color="auto" w:fill="F6F8FA"/>
-          </w:tcPr>
+          <w:tcPr/>
           <w:p>
             <w:pPr>
               <w:numPr>
                 <w:ilvl w:val="0"/>
-                <w:numId w:val="1113"/>
+                <w:numId w:val="1114"/>
               </w:numPr>
               <w:jc w:val="left"/>
             </w:pPr>
@@ -18170,7 +18209,7 @@
             <w:pPr>
               <w:numPr>
                 <w:ilvl w:val="0"/>
-                <w:numId w:val="1113"/>
+                <w:numId w:val="1114"/>
               </w:numPr>
               <w:jc w:val="left"/>
             </w:pPr>
@@ -18182,7 +18221,7 @@
             <w:pPr>
               <w:numPr>
                 <w:ilvl w:val="0"/>
-                <w:numId w:val="1113"/>
+                <w:numId w:val="1114"/>
               </w:numPr>
               <w:jc w:val="left"/>
             </w:pPr>
@@ -18194,7 +18233,7 @@
             <w:pPr>
               <w:numPr>
                 <w:ilvl w:val="0"/>
-                <w:numId w:val="1113"/>
+                <w:numId w:val="1114"/>
               </w:numPr>
               <w:jc w:val="left"/>
             </w:pPr>
@@ -18212,7 +18251,7 @@
             <w:pPr>
               <w:numPr>
                 <w:ilvl w:val="0"/>
-                <w:numId w:val="1113"/>
+                <w:numId w:val="1114"/>
               </w:numPr>
               <w:jc w:val="left"/>
             </w:pPr>
@@ -18224,7 +18263,7 @@
             <w:pPr>
               <w:numPr>
                 <w:ilvl w:val="0"/>
-                <w:numId w:val="1113"/>
+                <w:numId w:val="1114"/>
               </w:numPr>
               <w:jc w:val="left"/>
             </w:pPr>
@@ -19608,6 +19647,9 @@
     <w:abstractNumId w:val="991"/>
   </w:num>
   <w:num w:numId="1113">
+    <w:abstractNumId w:val="991"/>
+  </w:num>
+  <w:num w:numId="1114">
     <w:abstractNumId w:val="991"/>
   </w:num>
 </w:numbering>
@@ -20033,15 +20075,10 @@
     <w:basedOn w:val="Normal"/>
     <w:link w:val="BodyTextChar"/>
     <w:pPr>
-      <w:spacing w:after="120" w:before="120"/>
-      <w:jc w:val="center"/>
+      <w:spacing w:after="120" w:before="0"/>
     </w:pPr>
     <w:rPr>
       <w:i/>
-      <w:rFonts w:ascii="HarmonyOS Sans" w:hAnsi="HarmonyOS Sans"/>
-      <w:b/>
-      <w:sz w:val="18"/>
-      <w:szCs w:val="18"/>
     </w:rPr>
   </w:style>
   <w:style w:customStyle="1" w:styleId="TableCaption" w:type="paragraph">
@@ -20115,6 +20152,7 @@
     <w:pPr>
       <w:spacing w:before="240" w:line="259" w:lineRule="auto"/>
       <w:outlineLvl w:val="9"/>
+      <w:jc w:val="right"/>
       <w:pBdr>
         <w:bottom w:val="single" w:sz="4" w:space="1" w:color="000000"/>
       </w:pBdr>
@@ -20229,7 +20267,6 @@
     <w:name w:val="TOCTitle"/>
     <w:pPr>
       <w:spacing w:after="200" w:before="0"/>
-      <w:jc w:val="right"/>
     </w:pPr>
     <w:rPr>
       <w:rFonts w:ascii="HarmonyOS Sans" w:hAnsi="HarmonyOS Sans"/>
@@ -20560,7 +20597,7 @@
     <w:qFormat/>
     <w:pPr>
       <w:tabs>
-        <w:tab w:val="right" w:leader="dot" w:pos="9000"/>
+        <w:tab w:val="right" w:leader="dot" w:pos="9638"/>
       </w:tabs>
       <w:ind w:left="0"/>
       <w:spacing w:after="40"/>
@@ -20574,7 +20611,7 @@
     <w:qFormat/>
     <w:pPr>
       <w:tabs>
-        <w:tab w:val="right" w:leader="dot" w:pos="9000"/>
+        <w:tab w:val="right" w:leader="dot" w:pos="9638"/>
       </w:tabs>
       <w:ind w:left="420"/>
       <w:spacing w:after="40"/>
@@ -20588,7 +20625,7 @@
     <w:qFormat/>
     <w:pPr>
       <w:tabs>
-        <w:tab w:val="right" w:leader="dot" w:pos="9000"/>
+        <w:tab w:val="right" w:leader="dot" w:pos="9638"/>
       </w:tabs>
       <w:ind w:left="840"/>
       <w:spacing w:after="40"/>

</xml_diff>

<commit_message>
Fix docs pipeline description; drop stale comment (v6.8.3)
- README, AGENTS, and all 4 SKILL.md: separate DOCX/Markdown path
  (pre-processor -> docbook -> pandoc) from HTML path (pre-processor ->
  asciidoctor html5) — the v6.8.2 wording implied HTML went through
  docbook/pandoc too
- docx_fix.py: drop "(matches H1 tab stop)" comment (no H1 tab stop
  exists)
- Bump all templates + setup-guide to v6.8.3; regenerate committed artifacts
</commit_message>
<xml_diff>
--- a/documents/setup-guide/setup-guide.docx
+++ b/documents/setup-guide/setup-guide.docx
@@ -84,7 +84,7 @@
           <w:b/>
           <w:sz w:val="24"/>
         </w:rPr>
-        <w:t xml:space="preserve">v6.8.2</w:t>
+        <w:t xml:space="preserve">v6.8.3</w:t>
       </w:r>
       <w:r>
         <w:rPr>
@@ -96,7 +96,7 @@
         <w:rPr>
           <w:sz w:val="24"/>
         </w:rPr>
-        <w:t xml:space="preserve">— September 20, 2026 20:36</w:t>
+        <w:t xml:space="preserve">— September 20, 2026 20:57</w:t>
       </w:r>
     </w:p>
     <w:sdt>
@@ -13345,7 +13345,7 @@
               <w:jc w:val="left"/>
             </w:pPr>
             <w:r>
-              <w:t xml:space="preserve">6.8.2</w:t>
+              <w:t xml:space="preserve">6.8.3</w:t>
             </w:r>
           </w:p>
         </w:tc>
@@ -13371,7 +13371,7 @@
               <w:jc w:val="left"/>
             </w:pPr>
             <w:r>
-              <w:t xml:space="preserve">Documentation and cleanup: README, AGENTS, and all four SKILL.md files now describe the real multi-format pipeline (pre-processor + docx_fix --fix + --lang flag) instead of the pre-v6.4 asciidoctor-to-pandoc chain. DOCX TOC title is now right-aligned like the PDF (was targeting a dead style). Signature names render bold like the PDF. Dead code removed (unused Caption style, dead TOCTitle style, dead HTML badge CSS). The --template and --lang flags accept the equals form (--template=guide). Various stale comments corrected.</w:t>
+              <w:t xml:space="preserve">Docs accuracy fix: the multi-format pipeline descriptions in README, AGENTS, and all four SKILL.md files now correctly separate the DOCX/Markdown path (pre-processor then docbook then pandoc) from the HTML path (pre-processor then asciidoctor html5) — the previous wording implied HTML also went through docbook and pandoc. Corrected a stale comment in the DOCX fixer.</w:t>
             </w:r>
           </w:p>
         </w:tc>
@@ -13386,7 +13386,7 @@
               <w:jc w:val="left"/>
             </w:pPr>
             <w:r>
-              <w:t xml:space="preserve">6.8.1</w:t>
+              <w:t xml:space="preserve">6.8.2</w:t>
             </w:r>
           </w:p>
         </w:tc>
@@ -13416,7 +13416,7 @@
               <w:jc w:val="left"/>
             </w:pPr>
             <w:r>
-              <w:t xml:space="preserve">Quality-pass fixes for v6.8.0: non-technical covers no longer show a stray Date paragraph (regression from the meta-scan change); the technical cover table is no longer hijacked from the body when :nochangelog: is set (boundary check on the cover-table detection); the Version/Date/Scenario table now renders unconditionally like the PDF (was gated by :nochangelog:); empty cover tables are skipped when no report values are set; corrected the cover-element-order wording in the v6.8.0 changelog.</w:t>
+              <w:t xml:space="preserve">Documentation and cleanup: README, AGENTS, and all four SKILL.md files now describe the real multi-format pipeline (pre-processor + docx_fix --fix + --lang flag) instead of the pre-v6.4 asciidoctor-to-pandoc chain. DOCX TOC title is now right-aligned like the PDF (was targeting a dead style). Signature names render bold like the PDF. Dead code removed (unused Caption style, dead TOCTitle style, dead HTML badge CSS). The --template and --lang flags accept the equals form (--template=guide). Various stale comments corrected.</w:t>
             </w:r>
           </w:p>
         </w:tc>
@@ -13429,7 +13429,7 @@
               <w:jc w:val="left"/>
             </w:pPr>
             <w:r>
-              <w:t xml:space="preserve">6.8.0</w:t>
+              <w:t xml:space="preserve">6.8.1</w:t>
             </w:r>
           </w:p>
         </w:tc>
@@ -13455,7 +13455,7 @@
               <w:jc w:val="left"/>
             </w:pPr>
             <w:r>
-              <w:t xml:space="preserve">Technical report covers now match the PDF in DOCX/MD/HTML: the title uses the PDF’s 24pt size (was 36pt), the report type label appears below the title (the DOCX cover keeps the established title-first order; the PDF has label-then-title), and the Version/Date/Scenario table is rendered with the PDF’s red label column. The cover meta line now shows the report version and its set date (was the document version and the build date). Authors, when set, appear as a table row like the PDF.</w:t>
+              <w:t xml:space="preserve">Quality-pass fixes for v6.8.0: non-technical covers no longer show a stray Date paragraph (regression from the meta-scan change); the technical cover table is no longer hijacked from the body when :nochangelog: is set (boundary check on the cover-table detection); the Version/Date/Scenario table now renders unconditionally like the PDF (was gated by :nochangelog:); empty cover tables are skipped when no report values are set; corrected the cover-element-order wording in the v6.8.0 changelog.</w:t>
             </w:r>
           </w:p>
         </w:tc>
@@ -13470,7 +13470,7 @@
               <w:jc w:val="left"/>
             </w:pPr>
             <w:r>
-              <w:t xml:space="preserve">6.7.0</w:t>
+              <w:t xml:space="preserve">6.8.0</w:t>
             </w:r>
           </w:p>
         </w:tc>
@@ -13500,7 +13500,7 @@
               <w:jc w:val="left"/>
             </w:pPr>
             <w:r>
-              <w:t xml:space="preserve">Badge and language fidelity: DOCX badge pills now render black text like the PDF (was frame-colored), use the correct label case (Pass, not PASS), include the Portuguese POC labels (Atendido, Parcial, Falha, Ignorado), and render at native width per template (testbook badge text no longer shrinks). Portuguese signature greetings now match the PDF (At.te,), the POC classification label matches the full PDF wording, and the secondary-format table headers (stakeholders, closing record, test summary, changelog) are now language-aware. DOCX footers show Página in Portuguese documents. Cover dates no longer zero-pad the day.</w:t>
+              <w:t xml:space="preserve">Technical report covers now match the PDF in DOCX/MD/HTML: the title uses the PDF’s 24pt size (was 36pt), the report type label appears below the title (the DOCX cover keeps the established title-first order; the PDF has label-then-title), and the Version/Date/Scenario table is rendered with the PDF’s red label column. The cover meta line now shows the report version and its set date (was the document version and the build date). Authors, when set, appear as a table row like the PDF.</w:t>
             </w:r>
           </w:p>
         </w:tc>
@@ -13513,7 +13513,7 @@
               <w:jc w:val="left"/>
             </w:pPr>
             <w:r>
-              <w:t xml:space="preserve">6.6.1</w:t>
+              <w:t xml:space="preserve">6.7.0</w:t>
             </w:r>
           </w:p>
         </w:tc>
@@ -13539,7 +13539,7 @@
               <w:jc w:val="left"/>
             </w:pPr>
             <w:r>
-              <w:t xml:space="preserve">Quality-pass fixes for v6.6.0: the TESTCASE-marker strip now covers the entire DOCX fix run (a failure at any stage can no longer leave markers in the output file); the fixer resets its template state between in-process runs (the documented path-sniffing fallback works again); build.sh also cleans temporary files on interrupt signals; fixed a CHANGELOG typo.</w:t>
+              <w:t xml:space="preserve">Badge and language fidelity: DOCX badge pills now render black text like the PDF (was frame-colored), use the correct label case (Pass, not PASS), include the Portuguese POC labels (Atendido, Parcial, Falha, Ignorado), and render at native width per template (testbook badge text no longer shrinks). Portuguese signature greetings now match the PDF (At.te,), the POC classification label matches the full PDF wording, and the secondary-format table headers (stakeholders, closing record, test summary, changelog) are now language-aware. DOCX footers show Página in Portuguese documents. Cover dates no longer zero-pad the day.</w:t>
             </w:r>
           </w:p>
         </w:tc>
@@ -13554,7 +13554,7 @@
               <w:jc w:val="left"/>
             </w:pPr>
             <w:r>
-              <w:t xml:space="preserve">6.6.0</w:t>
+              <w:t xml:space="preserve">6.6.1</w:t>
             </w:r>
           </w:p>
         </w:tc>
@@ -13584,6 +13584,45 @@
               <w:jc w:val="left"/>
             </w:pPr>
             <w:r>
+              <w:t xml:space="preserve">Quality-pass fixes for v6.6.0: the TESTCASE-marker strip now covers the entire DOCX fix run (a failure at any stage can no longer leave markers in the output file); the fixer resets its template state between in-process runs (the documented path-sniffing fallback works again); build.sh also cleans temporary files on interrupt signals; fixed a CHANGELOG typo.</w:t>
+            </w:r>
+          </w:p>
+        </w:tc>
+      </w:tr>
+      <w:tr>
+        <w:tc>
+          <w:tcPr/>
+          <w:p>
+            <w:pPr>
+              <w:jc w:val="left"/>
+            </w:pPr>
+            <w:r>
+              <w:t xml:space="preserve">6.6.0</w:t>
+            </w:r>
+          </w:p>
+        </w:tc>
+        <w:tc>
+          <w:tcPr/>
+          <w:p>
+            <w:pPr>
+              <w:jc w:val="left"/>
+            </w:pPr>
+            <w:r>
+              <w:t xml:space="preserve">2026-09-20</w:t>
+            </w:r>
+          </w:p>
+        </w:tc>
+        <w:tc>
+          <w:tcPr/>
+          <w:p>
+            <w:pPr>
+              <w:numPr>
+                <w:ilvl w:val="0"/>
+                <w:numId w:val="1048"/>
+              </w:numPr>
+              <w:jc w:val="left"/>
+            </w:pPr>
+            <w:r>
               <w:t xml:space="preserve">Pipeline robustness: DOCX post-processing now fails loudly when content styling errors occur (TESTCASE markers can no longer leak into output); the DOCX fixer takes an explicit</w:t>
             </w:r>
             <w:r>
@@ -13606,54 +13645,15 @@
       </w:tr>
       <w:tr>
         <w:tc>
-          <w:tcPr/>
+          <w:tcPr>
+            <w:shd w:val="clear" w:color="auto" w:fill="F6F8FA"/>
+          </w:tcPr>
           <w:p>
             <w:pPr>
               <w:jc w:val="left"/>
             </w:pPr>
             <w:r>
               <w:t xml:space="preserve">6.5.2</w:t>
-            </w:r>
-          </w:p>
-        </w:tc>
-        <w:tc>
-          <w:tcPr/>
-          <w:p>
-            <w:pPr>
-              <w:jc w:val="left"/>
-            </w:pPr>
-            <w:r>
-              <w:t xml:space="preserve">2026-09-20</w:t>
-            </w:r>
-          </w:p>
-        </w:tc>
-        <w:tc>
-          <w:tcPr/>
-          <w:p>
-            <w:pPr>
-              <w:numPr>
-                <w:ilvl w:val="0"/>
-                <w:numId w:val="1048"/>
-              </w:numPr>
-              <w:jc w:val="left"/>
-            </w:pPr>
-            <w:r>
-              <w:t xml:space="preserve">Quality-pass fixes for v6.5.1: LaTeX quote conversion now handles only paired quotes (quote characters inside code arguments are no longer corrupted); signature cells containing escaped ampersands are no longer split; round-trip HTML generation guards the asciidoctor-diagram dependency and fails loudly when generation fails; pre-processor unit tests now cover pipe escaping in all five table handlers.</w:t>
-            </w:r>
-          </w:p>
-        </w:tc>
-      </w:tr>
-      <w:tr>
-        <w:tc>
-          <w:tcPr>
-            <w:shd w:val="clear" w:color="auto" w:fill="F6F8FA"/>
-          </w:tcPr>
-          <w:p>
-            <w:pPr>
-              <w:jc w:val="left"/>
-            </w:pPr>
-            <w:r>
-              <w:t xml:space="preserve">6.5.1</w:t>
             </w:r>
           </w:p>
         </w:tc>
@@ -13683,7 +13683,7 @@
               <w:jc w:val="left"/>
             </w:pPr>
             <w:r>
-              <w:t xml:space="preserve">Fixed DOCX/MD/HTML output: tables are no longer corrupted when changelog, signature, or summary content contains a pipe character (“|”). Badge text is now preserved in DOCX/MD/HTML — a “Ready” badge renders “Ready” instead of “[NEW]”. Multi-item changelog entries render as bullet lists instead of being joined with a literal “+”. POC documents now include the changelog in DOCX/MD/HTML. The :noanswers: attribute now hides test results and remarks in DOCX/MD/HTML, matching the PDF. Inline LaTeX (monospace text, arrows, LaTeX quotes) no longer leaks from changelog entries. The test suite now exercises the real build pipeline (pre-processor wired into round-trip and DOCX tests), with new pre-processor unit tests.</w:t>
+              <w:t xml:space="preserve">Quality-pass fixes for v6.5.1: LaTeX quote conversion now handles only paired quotes (quote characters inside code arguments are no longer corrupted); signature cells containing escaped ampersands are no longer split; round-trip HTML generation guards the asciidoctor-diagram dependency and fails loudly when generation fails; pre-processor unit tests now cover pipe escaping in all five table handlers.</w:t>
             </w:r>
           </w:p>
         </w:tc>
@@ -13696,7 +13696,7 @@
               <w:jc w:val="left"/>
             </w:pPr>
             <w:r>
-              <w:t xml:space="preserve">6.5.0</w:t>
+              <w:t xml:space="preserve">6.5.1</w:t>
             </w:r>
           </w:p>
         </w:tc>
@@ -13722,7 +13722,7 @@
               <w:jc w:val="left"/>
             </w:pPr>
             <w:r>
-              <w:t xml:space="preserve">Evidence checklist simplified to plain bullets in both PDF and DOCX (checkbox markers removed for compatibility). Planned Activities list in DOCX now uses Word’s native lower-roman numbering (i., ii., iii.) matching the PDF. Badges in DOCX replaced with exact-replica PNG pill images (rounded, colored frame and background, bold text) matching the PDF \ huaweibadge look — assets committed to the repo. Signature blocks in DOCX no longer show literal + symbols (proper hard line breaks).</w:t>
+              <w:t xml:space="preserve">Fixed DOCX/MD/HTML output: tables are no longer corrupted when changelog, signature, or summary content contains a pipe character (“|”). Badge text is now preserved in DOCX/MD/HTML — a “Ready” badge renders “Ready” instead of “[NEW]”. Multi-item changelog entries render as bullet lists instead of being joined with a literal “+”. POC documents now include the changelog in DOCX/MD/HTML. The :noanswers: attribute now hides test results and remarks in DOCX/MD/HTML, matching the PDF. Inline LaTeX (monospace text, arrows, LaTeX quotes) no longer leaks from changelog entries. The test suite now exercises the real build pipeline (pre-processor wired into round-trip and DOCX tests), with new pre-processor unit tests.</w:t>
             </w:r>
           </w:p>
         </w:tc>
@@ -13737,7 +13737,7 @@
               <w:jc w:val="left"/>
             </w:pPr>
             <w:r>
-              <w:t xml:space="preserve">6.4.7</w:t>
+              <w:t xml:space="preserve">6.5.0</w:t>
             </w:r>
           </w:p>
         </w:tc>
@@ -13767,7 +13767,7 @@
               <w:jc w:val="left"/>
             </w:pPr>
             <w:r>
-              <w:t xml:space="preserve">Section titles in DOCX now match the PDF heading design: the big section number (56pt) sits on the left, the title text is pushed to the right edge (a right tab stop mimics the LaTeX \ hfill), and the red rule runs below — previously the title sat left-aligned next to a small number. Applies to all templates.</w:t>
+              <w:t xml:space="preserve">Evidence checklist simplified to plain bullets in both PDF and DOCX (checkbox markers removed for compatibility). Planned Activities list in DOCX now uses Word’s native lower-roman numbering (i., ii., iii.) matching the PDF. Badges in DOCX replaced with exact-replica PNG pill images (rounded, colored frame and background, bold text) matching the PDF \ huaweibadge look — assets committed to the repo. Signature blocks in DOCX no longer show literal + symbols (proper hard line breaks).</w:t>
             </w:r>
           </w:p>
         </w:tc>
@@ -13780,7 +13780,7 @@
               <w:jc w:val="left"/>
             </w:pPr>
             <w:r>
-              <w:t xml:space="preserve">6.4.6</w:t>
+              <w:t xml:space="preserve">6.4.7</w:t>
             </w:r>
           </w:p>
         </w:tc>
@@ -13806,7 +13806,7 @@
               <w:jc w:val="left"/>
             </w:pPr>
             <w:r>
-              <w:t xml:space="preserve">Code blocks inside test cases no longer break the red left rule in DOCX — the code style’s left indent (which jogged the rule) is reset inside test case blocks, and code blocks now show the PDF’s code box (gray background with thin border on top, bottom, and right, red rule continuing on the left).</w:t>
+              <w:t xml:space="preserve">Section titles in DOCX now match the PDF heading design: the big section number (56pt) sits on the left, the title text is pushed to the right edge (a right tab stop mimics the LaTeX \ hfill), and the red rule runs below — previously the title sat left-aligned next to a small number. Applies to all templates.</w:t>
             </w:r>
           </w:p>
         </w:tc>
@@ -13821,7 +13821,7 @@
               <w:jc w:val="left"/>
             </w:pPr>
             <w:r>
-              <w:t xml:space="preserve">6.4.5</w:t>
+              <w:t xml:space="preserve">6.4.6</w:t>
             </w:r>
           </w:p>
         </w:tc>
@@ -13851,7 +13851,7 @@
               <w:jc w:val="left"/>
             </w:pPr>
             <w:r>
-              <w:t xml:space="preserve">DOCX polish pass: all captions centered (matching the PDF), vertical spacing between blocks matched to the LaTeX rhythm (medskip/smallskip around captions, field bars, and steps), and test steps now render as separate paragraphs each with the red bold number (previously merged into one paragraph).</w:t>
+              <w:t xml:space="preserve">Code blocks inside test cases no longer break the red left rule in DOCX — the code style’s left indent (which jogged the rule) is reset inside test case blocks, and code blocks now show the PDF’s code box (gray background with thin border on top, bottom, and right, red rule continuing on the left).</w:t>
             </w:r>
           </w:p>
         </w:tc>
@@ -13864,7 +13864,7 @@
               <w:jc w:val="left"/>
             </w:pPr>
             <w:r>
-              <w:t xml:space="preserve">6.4.4</w:t>
+              <w:t xml:space="preserve">6.4.5</w:t>
             </w:r>
           </w:p>
         </w:tc>
@@ -13890,7 +13890,7 @@
               <w:jc w:val="left"/>
             </w:pPr>
             <w:r>
-              <w:t xml:space="preserve">DOCX covers now show the logo, cover text, and version/date/time meta line like the PDF. Test case blocks in DOCX get the PDF’s visual wrapper: red left rule, red field header bars, and red step numbers. Captions follow the PDF ordering system in DOCX, MD, and HTML (Table/Diagram/Figure/Testcase N: with bold symbol). Portuguese PDFs now label diagrams "Diagrama N:" (was hardcoded English "Diagram"). Markdown and HTML output no longer leaks raw LaTeX from passthrough blocks — the DOCX pre-processor now feeds those pipelines too.</w:t>
+              <w:t xml:space="preserve">DOCX polish pass: all captions centered (matching the PDF), vertical spacing between blocks matched to the LaTeX rhythm (medskip/smallskip around captions, field bars, and steps), and test steps now render as separate paragraphs each with the red bold number (previously merged into one paragraph).</w:t>
             </w:r>
           </w:p>
         </w:tc>
@@ -13905,7 +13905,7 @@
               <w:jc w:val="left"/>
             </w:pPr>
             <w:r>
-              <w:t xml:space="preserve">6.4.3</w:t>
+              <w:t xml:space="preserve">6.4.4</w:t>
             </w:r>
           </w:p>
         </w:tc>
@@ -13935,7 +13935,7 @@
               <w:jc w:val="left"/>
             </w:pPr>
             <w:r>
-              <w:t xml:space="preserve">Testbook and POC DOCX output now matches the PDF much more closely: native table of contents (language-aware, auto-populated), each section starts on a new page, embedded images and diagrams (PlantUML/Graphviz rendered), white-on-red table headers, cover version line under the title, centered test case captions, and plain black rules for signature grids.</w:t>
+              <w:t xml:space="preserve">DOCX covers now show the logo, cover text, and version/date/time meta line like the PDF. Test case blocks in DOCX get the PDF’s visual wrapper: red left rule, red field header bars, and red step numbers. Captions follow the PDF ordering system in DOCX, MD, and HTML (Table/Diagram/Figure/Testcase N: with bold symbol). Portuguese PDFs now label diagrams "Diagrama N:" (was hardcoded English "Diagram"). Markdown and HTML output no longer leaks raw LaTeX from passthrough blocks — the DOCX pre-processor now feeds those pipelines too.</w:t>
             </w:r>
           </w:p>
         </w:tc>
@@ -13948,7 +13948,7 @@
               <w:jc w:val="left"/>
             </w:pPr>
             <w:r>
-              <w:t xml:space="preserve">6.4.2</w:t>
+              <w:t xml:space="preserve">6.4.3</w:t>
             </w:r>
           </w:p>
         </w:tc>
@@ -13974,7 +13974,7 @@
               <w:jc w:val="left"/>
             </w:pPr>
             <w:r>
-              <w:t xml:space="preserve">DOCX output for POC and testbook templates now includes all passthrough content (stakeholders, closing record, signatures, test cases, test summary, changelog) via a new pre-processor. Fixed dropped Test Scope fields in testbook DOCX output.</w:t>
+              <w:t xml:space="preserve">Testbook and POC DOCX output now matches the PDF much more closely: native table of contents (language-aware, auto-populated), each section starts on a new page, embedded images and diagrams (PlantUML/Graphviz rendered), white-on-red table headers, cover version line under the title, centered test case captions, and plain black rules for signature grids.</w:t>
             </w:r>
           </w:p>
         </w:tc>
@@ -13989,7 +13989,7 @@
               <w:jc w:val="left"/>
             </w:pPr>
             <w:r>
-              <w:t xml:space="preserve">6.4.0</w:t>
+              <w:t xml:space="preserve">6.4.2</w:t>
             </w:r>
           </w:p>
         </w:tc>
@@ -14019,6 +14019,45 @@
               <w:jc w:val="left"/>
             </w:pPr>
             <w:r>
+              <w:t xml:space="preserve">DOCX output for POC and testbook templates now includes all passthrough content (stakeholders, closing record, signatures, test cases, test summary, changelog) via a new pre-processor. Fixed dropped Test Scope fields in testbook DOCX output.</w:t>
+            </w:r>
+          </w:p>
+        </w:tc>
+      </w:tr>
+      <w:tr>
+        <w:tc>
+          <w:tcPr/>
+          <w:p>
+            <w:pPr>
+              <w:jc w:val="left"/>
+            </w:pPr>
+            <w:r>
+              <w:t xml:space="preserve">6.4.0</w:t>
+            </w:r>
+          </w:p>
+        </w:tc>
+        <w:tc>
+          <w:tcPr/>
+          <w:p>
+            <w:pPr>
+              <w:jc w:val="left"/>
+            </w:pPr>
+            <w:r>
+              <w:t xml:space="preserve">2026-09-20</w:t>
+            </w:r>
+          </w:p>
+        </w:tc>
+        <w:tc>
+          <w:tcPr/>
+          <w:p>
+            <w:pPr>
+              <w:numPr>
+                <w:ilvl w:val="0"/>
+                <w:numId w:val="1058"/>
+              </w:numPr>
+              <w:jc w:val="left"/>
+            </w:pPr>
+            <w:r>
               <w:t xml:space="preserve">Fixed changelog dates — replaced</w:t>
             </w:r>
             <w:r>
@@ -14041,54 +14080,15 @@
       </w:tr>
       <w:tr>
         <w:tc>
-          <w:tcPr/>
+          <w:tcPr>
+            <w:shd w:val="clear" w:color="auto" w:fill="F6F8FA"/>
+          </w:tcPr>
           <w:p>
             <w:pPr>
               <w:jc w:val="left"/>
             </w:pPr>
             <w:r>
               <w:t xml:space="preserve">5.1.1</w:t>
-            </w:r>
-          </w:p>
-        </w:tc>
-        <w:tc>
-          <w:tcPr/>
-          <w:p>
-            <w:pPr>
-              <w:jc w:val="left"/>
-            </w:pPr>
-            <w:r>
-              <w:t xml:space="preserve">2026-09-14</w:t>
-            </w:r>
-          </w:p>
-        </w:tc>
-        <w:tc>
-          <w:tcPr/>
-          <w:p>
-            <w:pPr>
-              <w:numPr>
-                <w:ilvl w:val="0"/>
-                <w:numId w:val="1058"/>
-              </w:numPr>
-              <w:jc w:val="left"/>
-            </w:pPr>
-            <w:r>
-              <w:t xml:space="preserve">Synced callout colors in DOCX/HTML/MD output to match brand palette. Added color palette demo.</w:t>
-            </w:r>
-          </w:p>
-        </w:tc>
-      </w:tr>
-      <w:tr>
-        <w:tc>
-          <w:tcPr>
-            <w:shd w:val="clear" w:color="auto" w:fill="F6F8FA"/>
-          </w:tcPr>
-          <w:p>
-            <w:pPr>
-              <w:jc w:val="left"/>
-            </w:pPr>
-            <w:r>
-              <w:t xml:space="preserve">5.1.0</w:t>
             </w:r>
           </w:p>
         </w:tc>
@@ -14118,7 +14118,7 @@
               <w:jc w:val="left"/>
             </w:pPr>
             <w:r>
-              <w:t xml:space="preserve">Adopted brand guidelines auxiliary color palette and monochrome scale. Aligned callout colors to brand specifications.</w:t>
+              <w:t xml:space="preserve">Synced callout colors in DOCX/HTML/MD output to match brand palette. Added color palette demo.</w:t>
             </w:r>
           </w:p>
         </w:tc>
@@ -14131,7 +14131,7 @@
               <w:jc w:val="left"/>
             </w:pPr>
             <w:r>
-              <w:t xml:space="preserve">5.0.3</w:t>
+              <w:t xml:space="preserve">5.1.0</w:t>
             </w:r>
           </w:p>
         </w:tc>
@@ -14157,6 +14157,51 @@
               <w:jc w:val="left"/>
             </w:pPr>
             <w:r>
+              <w:t xml:space="preserve">Adopted brand guidelines auxiliary color palette and monochrome scale. Aligned callout colors to brand specifications.</w:t>
+            </w:r>
+          </w:p>
+        </w:tc>
+      </w:tr>
+      <w:tr>
+        <w:tc>
+          <w:tcPr>
+            <w:shd w:val="clear" w:color="auto" w:fill="F6F8FA"/>
+          </w:tcPr>
+          <w:p>
+            <w:pPr>
+              <w:jc w:val="left"/>
+            </w:pPr>
+            <w:r>
+              <w:t xml:space="preserve">5.0.3</w:t>
+            </w:r>
+          </w:p>
+        </w:tc>
+        <w:tc>
+          <w:tcPr>
+            <w:shd w:val="clear" w:color="auto" w:fill="F6F8FA"/>
+          </w:tcPr>
+          <w:p>
+            <w:pPr>
+              <w:jc w:val="left"/>
+            </w:pPr>
+            <w:r>
+              <w:t xml:space="preserve">2026-09-14</w:t>
+            </w:r>
+          </w:p>
+        </w:tc>
+        <w:tc>
+          <w:tcPr>
+            <w:shd w:val="clear" w:color="auto" w:fill="F6F8FA"/>
+          </w:tcPr>
+          <w:p>
+            <w:pPr>
+              <w:numPr>
+                <w:ilvl w:val="0"/>
+                <w:numId w:val="1061"/>
+              </w:numPr>
+              <w:jc w:val="left"/>
+            </w:pPr>
+            <w:r>
               <w:t xml:space="preserve">Removed non-standard</w:t>
             </w:r>
             <w:r>
@@ -14179,58 +14224,13 @@
       </w:tr>
       <w:tr>
         <w:tc>
-          <w:tcPr>
-            <w:shd w:val="clear" w:color="auto" w:fill="F6F8FA"/>
-          </w:tcPr>
+          <w:tcPr/>
           <w:p>
             <w:pPr>
               <w:jc w:val="left"/>
             </w:pPr>
             <w:r>
               <w:t xml:space="preserve">5.0.2</w:t>
-            </w:r>
-          </w:p>
-        </w:tc>
-        <w:tc>
-          <w:tcPr>
-            <w:shd w:val="clear" w:color="auto" w:fill="F6F8FA"/>
-          </w:tcPr>
-          <w:p>
-            <w:pPr>
-              <w:jc w:val="left"/>
-            </w:pPr>
-            <w:r>
-              <w:t xml:space="preserve">2026-09-14</w:t>
-            </w:r>
-          </w:p>
-        </w:tc>
-        <w:tc>
-          <w:tcPr>
-            <w:shd w:val="clear" w:color="auto" w:fill="F6F8FA"/>
-          </w:tcPr>
-          <w:p>
-            <w:pPr>
-              <w:numPr>
-                <w:ilvl w:val="0"/>
-                <w:numId w:val="1061"/>
-              </w:numPr>
-              <w:jc w:val="left"/>
-            </w:pPr>
-            <w:r>
-              <w:t xml:space="preserve">Long commands in test steps now render as code blocks instead of inline code.</w:t>
-            </w:r>
-          </w:p>
-        </w:tc>
-      </w:tr>
-      <w:tr>
-        <w:tc>
-          <w:tcPr/>
-          <w:p>
-            <w:pPr>
-              <w:jc w:val="left"/>
-            </w:pPr>
-            <w:r>
-              <w:t xml:space="preserve">5.0.1</w:t>
             </w:r>
           </w:p>
         </w:tc>
@@ -14256,7 +14256,7 @@
               <w:jc w:val="left"/>
             </w:pPr>
             <w:r>
-              <w:t xml:space="preserve">Testcase caption centered above the block.</w:t>
+              <w:t xml:space="preserve">Long commands in test steps now render as code blocks instead of inline code.</w:t>
             </w:r>
           </w:p>
         </w:tc>
@@ -14271,7 +14271,7 @@
               <w:jc w:val="left"/>
             </w:pPr>
             <w:r>
-              <w:t xml:space="preserve">5.0.0</w:t>
+              <w:t xml:space="preserve">5.0.1</w:t>
             </w:r>
           </w:p>
         </w:tc>
@@ -14301,6 +14301,45 @@
               <w:jc w:val="left"/>
             </w:pPr>
             <w:r>
+              <w:t xml:space="preserve">Testcase caption centered above the block.</w:t>
+            </w:r>
+          </w:p>
+        </w:tc>
+      </w:tr>
+      <w:tr>
+        <w:tc>
+          <w:tcPr/>
+          <w:p>
+            <w:pPr>
+              <w:jc w:val="left"/>
+            </w:pPr>
+            <w:r>
+              <w:t xml:space="preserve">5.0.0</w:t>
+            </w:r>
+          </w:p>
+        </w:tc>
+        <w:tc>
+          <w:tcPr/>
+          <w:p>
+            <w:pPr>
+              <w:jc w:val="left"/>
+            </w:pPr>
+            <w:r>
+              <w:t xml:space="preserve">2026-09-14</w:t>
+            </w:r>
+          </w:p>
+        </w:tc>
+        <w:tc>
+          <w:tcPr/>
+          <w:p>
+            <w:pPr>
+              <w:numPr>
+                <w:ilvl w:val="0"/>
+                <w:numId w:val="1064"/>
+              </w:numPr>
+              <w:jc w:val="left"/>
+            </w:pPr>
+            <w:r>
               <w:t xml:space="preserve">Major refactoring: extracted shared modules (huawei-titles, huawei-toc, huawei-cover), renamed</w:t>
             </w:r>
             <w:r>
@@ -14362,7 +14401,9 @@
       </w:tr>
       <w:tr>
         <w:tc>
-          <w:tcPr/>
+          <w:tcPr>
+            <w:shd w:val="clear" w:color="auto" w:fill="F6F8FA"/>
+          </w:tcPr>
           <w:p>
             <w:pPr>
               <w:jc w:val="left"/>
@@ -14373,56 +14414,15 @@
           </w:p>
         </w:tc>
         <w:tc>
-          <w:tcPr/>
+          <w:tcPr>
+            <w:shd w:val="clear" w:color="auto" w:fill="F6F8FA"/>
+          </w:tcPr>
           <w:p>
             <w:pPr>
               <w:jc w:val="left"/>
             </w:pPr>
             <w:r>
               <w:t xml:space="preserve">2026-09-14</w:t>
-            </w:r>
-          </w:p>
-        </w:tc>
-        <w:tc>
-          <w:tcPr/>
-          <w:p>
-            <w:pPr>
-              <w:numPr>
-                <w:ilvl w:val="0"/>
-                <w:numId w:val="1064"/>
-              </w:numPr>
-              <w:jc w:val="left"/>
-            </w:pPr>
-            <w:r>
-              <w:t xml:space="preserve">Testcase headings now formatted as captions (like figures/tables): bold “Testcase N:” followed by description. Changed label from “Test Case” to “Testcase”.</w:t>
-            </w:r>
-          </w:p>
-        </w:tc>
-      </w:tr>
-      <w:tr>
-        <w:tc>
-          <w:tcPr>
-            <w:shd w:val="clear" w:color="auto" w:fill="F6F8FA"/>
-          </w:tcPr>
-          <w:p>
-            <w:pPr>
-              <w:jc w:val="left"/>
-            </w:pPr>
-            <w:r>
-              <w:t xml:space="preserve">4.6.0</w:t>
-            </w:r>
-          </w:p>
-        </w:tc>
-        <w:tc>
-          <w:tcPr>
-            <w:shd w:val="clear" w:color="auto" w:fill="F6F8FA"/>
-          </w:tcPr>
-          <w:p>
-            <w:pPr>
-              <w:jc w:val="left"/>
-            </w:pPr>
-            <w:r>
-              <w:t xml:space="preserve">2026-09-13</w:t>
             </w:r>
           </w:p>
         </w:tc>
@@ -14439,7 +14439,7 @@
               <w:jc w:val="left"/>
             </w:pPr>
             <w:r>
-              <w:t xml:space="preserve">Section restructure: Introduction, Test Cases (with category subsections), Conclusion. Testcases auto-numbered like figures/tables. Changed testcase from subsection to subsubsection.</w:t>
+              <w:t xml:space="preserve">Testcase headings now formatted as captions (like figures/tables): bold “Testcase N:” followed by description. Changed label from “Test Case” to “Testcase”.</w:t>
             </w:r>
           </w:p>
         </w:tc>
@@ -14452,7 +14452,7 @@
               <w:jc w:val="left"/>
             </w:pPr>
             <w:r>
-              <w:t xml:space="preserve">4.5.0</w:t>
+              <w:t xml:space="preserve">4.6.0</w:t>
             </w:r>
           </w:p>
         </w:tc>
@@ -14478,6 +14478,51 @@
               <w:jc w:val="left"/>
             </w:pPr>
             <w:r>
+              <w:t xml:space="preserve">Section restructure: Introduction, Test Cases (with category subsections), Conclusion. Testcases auto-numbered like figures/tables. Changed testcase from subsection to subsubsection.</w:t>
+            </w:r>
+          </w:p>
+        </w:tc>
+      </w:tr>
+      <w:tr>
+        <w:tc>
+          <w:tcPr>
+            <w:shd w:val="clear" w:color="auto" w:fill="F6F8FA"/>
+          </w:tcPr>
+          <w:p>
+            <w:pPr>
+              <w:jc w:val="left"/>
+            </w:pPr>
+            <w:r>
+              <w:t xml:space="preserve">4.5.0</w:t>
+            </w:r>
+          </w:p>
+        </w:tc>
+        <w:tc>
+          <w:tcPr>
+            <w:shd w:val="clear" w:color="auto" w:fill="F6F8FA"/>
+          </w:tcPr>
+          <w:p>
+            <w:pPr>
+              <w:jc w:val="left"/>
+            </w:pPr>
+            <w:r>
+              <w:t xml:space="preserve">2026-09-13</w:t>
+            </w:r>
+          </w:p>
+        </w:tc>
+        <w:tc>
+          <w:tcPr>
+            <w:shd w:val="clear" w:color="auto" w:fill="F6F8FA"/>
+          </w:tcPr>
+          <w:p>
+            <w:pPr>
+              <w:numPr>
+                <w:ilvl w:val="0"/>
+                <w:numId w:val="1067"/>
+              </w:numPr>
+              <w:jc w:val="left"/>
+            </w:pPr>
+            <w:r>
               <w:t xml:space="preserve">Unified field APIs:</w:t>
             </w:r>
             <w:r>
@@ -14542,58 +14587,13 @@
       </w:tr>
       <w:tr>
         <w:tc>
-          <w:tcPr>
-            <w:shd w:val="clear" w:color="auto" w:fill="F6F8FA"/>
-          </w:tcPr>
+          <w:tcPr/>
           <w:p>
             <w:pPr>
               <w:jc w:val="left"/>
             </w:pPr>
             <w:r>
               <w:t xml:space="preserve">4.4.0</w:t>
-            </w:r>
-          </w:p>
-        </w:tc>
-        <w:tc>
-          <w:tcPr>
-            <w:shd w:val="clear" w:color="auto" w:fill="F6F8FA"/>
-          </w:tcPr>
-          <w:p>
-            <w:pPr>
-              <w:jc w:val="left"/>
-            </w:pPr>
-            <w:r>
-              <w:t xml:space="preserve">2026-09-13</w:t>
-            </w:r>
-          </w:p>
-        </w:tc>
-        <w:tc>
-          <w:tcPr>
-            <w:shd w:val="clear" w:color="auto" w:fill="F6F8FA"/>
-          </w:tcPr>
-          <w:p>
-            <w:pPr>
-              <w:numPr>
-                <w:ilvl w:val="0"/>
-                <w:numId w:val="1067"/>
-              </w:numPr>
-              <w:jc w:val="left"/>
-            </w:pPr>
-            <w:r>
-              <w:t xml:space="preserve">Code review fixes: removed dead labels, badge now uses Huawei brand colors (tipbg/tipfg, huaweired, warningbg/warningfg), Lua filter preserves formatting in DOCX/MD/HTML via parse_latex_blocks, testprocedure handler preserves non-step content (images, code, callouts).</w:t>
-            </w:r>
-          </w:p>
-        </w:tc>
-      </w:tr>
-      <w:tr>
-        <w:tc>
-          <w:tcPr/>
-          <w:p>
-            <w:pPr>
-              <w:jc w:val="left"/>
-            </w:pPr>
-            <w:r>
-              <w:t xml:space="preserve">4.3.0</w:t>
             </w:r>
           </w:p>
         </w:tc>
@@ -14619,6 +14619,51 @@
               <w:jc w:val="left"/>
             </w:pPr>
             <w:r>
+              <w:t xml:space="preserve">Code review fixes: removed dead labels, badge now uses Huawei brand colors (tipbg/tipfg, huaweired, warningbg/warningfg), Lua filter preserves formatting in DOCX/MD/HTML via parse_latex_blocks, testprocedure handler preserves non-step content (images, code, callouts).</w:t>
+            </w:r>
+          </w:p>
+        </w:tc>
+      </w:tr>
+      <w:tr>
+        <w:tc>
+          <w:tcPr>
+            <w:shd w:val="clear" w:color="auto" w:fill="F6F8FA"/>
+          </w:tcPr>
+          <w:p>
+            <w:pPr>
+              <w:jc w:val="left"/>
+            </w:pPr>
+            <w:r>
+              <w:t xml:space="preserve">4.3.0</w:t>
+            </w:r>
+          </w:p>
+        </w:tc>
+        <w:tc>
+          <w:tcPr>
+            <w:shd w:val="clear" w:color="auto" w:fill="F6F8FA"/>
+          </w:tcPr>
+          <w:p>
+            <w:pPr>
+              <w:jc w:val="left"/>
+            </w:pPr>
+            <w:r>
+              <w:t xml:space="preserve">2026-09-13</w:t>
+            </w:r>
+          </w:p>
+        </w:tc>
+        <w:tc>
+          <w:tcPr>
+            <w:shd w:val="clear" w:color="auto" w:fill="F6F8FA"/>
+          </w:tcPr>
+          <w:p>
+            <w:pPr>
+              <w:numPr>
+                <w:ilvl w:val="0"/>
+                <w:numId w:val="1069"/>
+              </w:numPr>
+              <w:jc w:val="left"/>
+            </w:pPr>
+            <w:r>
               <w:t xml:space="preserve">Added</w:t>
             </w:r>
             <w:r>
@@ -14671,9 +14716,7 @@
       </w:tr>
       <w:tr>
         <w:tc>
-          <w:tcPr>
-            <w:shd w:val="clear" w:color="auto" w:fill="F6F8FA"/>
-          </w:tcPr>
+          <w:tcPr/>
           <w:p>
             <w:pPr>
               <w:jc w:val="left"/>
@@ -14684,9 +14727,7 @@
           </w:p>
         </w:tc>
         <w:tc>
-          <w:tcPr>
-            <w:shd w:val="clear" w:color="auto" w:fill="F6F8FA"/>
-          </w:tcPr>
+          <w:tcPr/>
           <w:p>
             <w:pPr>
               <w:jc w:val="left"/>
@@ -14697,14 +14738,12 @@
           </w:p>
         </w:tc>
         <w:tc>
-          <w:tcPr>
-            <w:shd w:val="clear" w:color="auto" w:fill="F6F8FA"/>
-          </w:tcPr>
+          <w:tcPr/>
           <w:p>
             <w:pPr>
               <w:numPr>
                 <w:ilvl w:val="0"/>
-                <w:numId w:val="1069"/>
+                <w:numId w:val="1070"/>
               </w:numPr>
               <w:jc w:val="left"/>
             </w:pPr>
@@ -14758,7 +14797,9 @@
       </w:tr>
       <w:tr>
         <w:tc>
-          <w:tcPr/>
+          <w:tcPr>
+            <w:shd w:val="clear" w:color="auto" w:fill="F6F8FA"/>
+          </w:tcPr>
           <w:p>
             <w:pPr>
               <w:jc w:val="left"/>
@@ -14769,7 +14810,9 @@
           </w:p>
         </w:tc>
         <w:tc>
-          <w:tcPr/>
+          <w:tcPr>
+            <w:shd w:val="clear" w:color="auto" w:fill="F6F8FA"/>
+          </w:tcPr>
           <w:p>
             <w:pPr>
               <w:jc w:val="left"/>
@@ -14780,12 +14823,14 @@
           </w:p>
         </w:tc>
         <w:tc>
-          <w:tcPr/>
+          <w:tcPr>
+            <w:shd w:val="clear" w:color="auto" w:fill="F6F8FA"/>
+          </w:tcPr>
           <w:p>
             <w:pPr>
               <w:numPr>
                 <w:ilvl w:val="0"/>
-                <w:numId w:val="1070"/>
+                <w:numId w:val="1071"/>
               </w:numPr>
               <w:jc w:val="left"/>
             </w:pPr>
@@ -14812,9 +14857,7 @@
       </w:tr>
       <w:tr>
         <w:tc>
-          <w:tcPr>
-            <w:shd w:val="clear" w:color="auto" w:fill="F6F8FA"/>
-          </w:tcPr>
+          <w:tcPr/>
           <w:p>
             <w:pPr>
               <w:jc w:val="left"/>
@@ -14825,9 +14868,7 @@
           </w:p>
         </w:tc>
         <w:tc>
-          <w:tcPr>
-            <w:shd w:val="clear" w:color="auto" w:fill="F6F8FA"/>
-          </w:tcPr>
+          <w:tcPr/>
           <w:p>
             <w:pPr>
               <w:jc w:val="left"/>
@@ -14838,14 +14879,12 @@
           </w:p>
         </w:tc>
         <w:tc>
-          <w:tcPr>
-            <w:shd w:val="clear" w:color="auto" w:fill="F6F8FA"/>
-          </w:tcPr>
+          <w:tcPr/>
           <w:p>
             <w:pPr>
               <w:numPr>
                 <w:ilvl w:val="0"/>
-                <w:numId w:val="1071"/>
+                <w:numId w:val="1072"/>
               </w:numPr>
               <w:jc w:val="left"/>
             </w:pPr>
@@ -14887,7 +14926,9 @@
       </w:tr>
       <w:tr>
         <w:tc>
-          <w:tcPr/>
+          <w:tcPr>
+            <w:shd w:val="clear" w:color="auto" w:fill="F6F8FA"/>
+          </w:tcPr>
           <w:p>
             <w:pPr>
               <w:jc w:val="left"/>
@@ -14898,7 +14939,9 @@
           </w:p>
         </w:tc>
         <w:tc>
-          <w:tcPr/>
+          <w:tcPr>
+            <w:shd w:val="clear" w:color="auto" w:fill="F6F8FA"/>
+          </w:tcPr>
           <w:p>
             <w:pPr>
               <w:jc w:val="left"/>
@@ -14909,12 +14952,14 @@
           </w:p>
         </w:tc>
         <w:tc>
-          <w:tcPr/>
+          <w:tcPr>
+            <w:shd w:val="clear" w:color="auto" w:fill="F6F8FA"/>
+          </w:tcPr>
           <w:p>
             <w:pPr>
               <w:numPr>
                 <w:ilvl w:val="0"/>
-                <w:numId w:val="1072"/>
+                <w:numId w:val="1073"/>
               </w:numPr>
               <w:jc w:val="left"/>
             </w:pPr>
@@ -14941,58 +14986,13 @@
       </w:tr>
       <w:tr>
         <w:tc>
-          <w:tcPr>
-            <w:shd w:val="clear" w:color="auto" w:fill="F6F8FA"/>
-          </w:tcPr>
+          <w:tcPr/>
           <w:p>
             <w:pPr>
               <w:jc w:val="left"/>
             </w:pPr>
             <w:r>
               <w:t xml:space="preserve">3.8.1</w:t>
-            </w:r>
-          </w:p>
-        </w:tc>
-        <w:tc>
-          <w:tcPr>
-            <w:shd w:val="clear" w:color="auto" w:fill="F6F8FA"/>
-          </w:tcPr>
-          <w:p>
-            <w:pPr>
-              <w:jc w:val="left"/>
-            </w:pPr>
-            <w:r>
-              <w:t xml:space="preserve">2026-09-13</w:t>
-            </w:r>
-          </w:p>
-        </w:tc>
-        <w:tc>
-          <w:tcPr>
-            <w:shd w:val="clear" w:color="auto" w:fill="F6F8FA"/>
-          </w:tcPr>
-          <w:p>
-            <w:pPr>
-              <w:numPr>
-                <w:ilvl w:val="0"/>
-                <w:numId w:val="1073"/>
-              </w:numPr>
-              <w:jc w:val="left"/>
-            </w:pPr>
-            <w:r>
-              <w:t xml:space="preserve">End-to-end quality review: fixed testbook PDF metadata title, removed stray user DOCX from template dir, fixed round-trip.sh variable typo, updated stale references in AGENTS.md and README.md, committed testbook sample PDFs, set TZ for pandoc cover time consistency, widened pandoc version range.</w:t>
-            </w:r>
-          </w:p>
-        </w:tc>
-      </w:tr>
-      <w:tr>
-        <w:tc>
-          <w:tcPr/>
-          <w:p>
-            <w:pPr>
-              <w:jc w:val="left"/>
-            </w:pPr>
-            <w:r>
-              <w:t xml:space="preserve">3.8.0</w:t>
             </w:r>
           </w:p>
         </w:tc>
@@ -15018,7 +15018,7 @@
               <w:jc w:val="left"/>
             </w:pPr>
             <w:r>
-              <w:t xml:space="preserve">Removed Tips and Tricks chapter (tmux configuration) — required VS Code-specific keybindings that don’t generalize across terminal setups.</w:t>
+              <w:t xml:space="preserve">End-to-end quality review: fixed testbook PDF metadata title, removed stray user DOCX from template dir, fixed round-trip.sh variable typo, updated stale references in AGENTS.md and README.md, committed testbook sample PDFs, set TZ for pandoc cover time consistency, widened pandoc version range.</w:t>
             </w:r>
           </w:p>
         </w:tc>
@@ -15033,7 +15033,7 @@
               <w:jc w:val="left"/>
             </w:pPr>
             <w:r>
-              <w:t xml:space="preserve">3.7.0</w:t>
+              <w:t xml:space="preserve">3.8.0</w:t>
             </w:r>
           </w:p>
         </w:tc>
@@ -15046,7 +15046,7 @@
               <w:jc w:val="left"/>
             </w:pPr>
             <w:r>
-              <w:t xml:space="preserve">2026-09-12</w:t>
+              <w:t xml:space="preserve">2026-09-13</w:t>
             </w:r>
           </w:p>
         </w:tc>
@@ -15063,6 +15063,45 @@
               <w:jc w:val="left"/>
             </w:pPr>
             <w:r>
+              <w:t xml:space="preserve">Removed Tips and Tricks chapter (tmux configuration) — required VS Code-specific keybindings that don’t generalize across terminal setups.</w:t>
+            </w:r>
+          </w:p>
+        </w:tc>
+      </w:tr>
+      <w:tr>
+        <w:tc>
+          <w:tcPr/>
+          <w:p>
+            <w:pPr>
+              <w:jc w:val="left"/>
+            </w:pPr>
+            <w:r>
+              <w:t xml:space="preserve">3.7.0</w:t>
+            </w:r>
+          </w:p>
+        </w:tc>
+        <w:tc>
+          <w:tcPr/>
+          <w:p>
+            <w:pPr>
+              <w:jc w:val="left"/>
+            </w:pPr>
+            <w:r>
+              <w:t xml:space="preserve">2026-09-12</w:t>
+            </w:r>
+          </w:p>
+        </w:tc>
+        <w:tc>
+          <w:tcPr/>
+          <w:p>
+            <w:pPr>
+              <w:numPr>
+                <w:ilvl w:val="0"/>
+                <w:numId w:val="1076"/>
+              </w:numPr>
+              <w:jc w:val="left"/>
+            </w:pPr>
+            <w:r>
               <w:t xml:space="preserve">Added</w:t>
             </w:r>
             <w:r>
@@ -15115,7 +15154,9 @@
       </w:tr>
       <w:tr>
         <w:tc>
-          <w:tcPr/>
+          <w:tcPr>
+            <w:shd w:val="clear" w:color="auto" w:fill="F6F8FA"/>
+          </w:tcPr>
           <w:p>
             <w:pPr>
               <w:jc w:val="left"/>
@@ -15126,7 +15167,9 @@
           </w:p>
         </w:tc>
         <w:tc>
-          <w:tcPr/>
+          <w:tcPr>
+            <w:shd w:val="clear" w:color="auto" w:fill="F6F8FA"/>
+          </w:tcPr>
           <w:p>
             <w:pPr>
               <w:jc w:val="left"/>
@@ -15137,12 +15180,14 @@
           </w:p>
         </w:tc>
         <w:tc>
-          <w:tcPr/>
+          <w:tcPr>
+            <w:shd w:val="clear" w:color="auto" w:fill="F6F8FA"/>
+          </w:tcPr>
           <w:p>
             <w:pPr>
               <w:numPr>
                 <w:ilvl w:val="0"/>
-                <w:numId w:val="1076"/>
+                <w:numId w:val="1077"/>
               </w:numPr>
               <w:jc w:val="left"/>
             </w:pPr>
@@ -15199,9 +15244,7 @@
       </w:tr>
       <w:tr>
         <w:tc>
-          <w:tcPr>
-            <w:shd w:val="clear" w:color="auto" w:fill="F6F8FA"/>
-          </w:tcPr>
+          <w:tcPr/>
           <w:p>
             <w:pPr>
               <w:jc w:val="left"/>
@@ -15212,9 +15255,7 @@
           </w:p>
         </w:tc>
         <w:tc>
-          <w:tcPr>
-            <w:shd w:val="clear" w:color="auto" w:fill="F6F8FA"/>
-          </w:tcPr>
+          <w:tcPr/>
           <w:p>
             <w:pPr>
               <w:jc w:val="left"/>
@@ -15225,14 +15266,12 @@
           </w:p>
         </w:tc>
         <w:tc>
-          <w:tcPr>
-            <w:shd w:val="clear" w:color="auto" w:fill="F6F8FA"/>
-          </w:tcPr>
+          <w:tcPr/>
           <w:p>
             <w:pPr>
               <w:numPr>
                 <w:ilvl w:val="0"/>
-                <w:numId w:val="1077"/>
+                <w:numId w:val="1078"/>
               </w:numPr>
               <w:jc w:val="left"/>
             </w:pPr>
@@ -15310,7 +15349,9 @@
       </w:tr>
       <w:tr>
         <w:tc>
-          <w:tcPr/>
+          <w:tcPr>
+            <w:shd w:val="clear" w:color="auto" w:fill="F6F8FA"/>
+          </w:tcPr>
           <w:p>
             <w:pPr>
               <w:jc w:val="left"/>
@@ -15321,7 +15362,9 @@
           </w:p>
         </w:tc>
         <w:tc>
-          <w:tcPr/>
+          <w:tcPr>
+            <w:shd w:val="clear" w:color="auto" w:fill="F6F8FA"/>
+          </w:tcPr>
           <w:p>
             <w:pPr>
               <w:jc w:val="left"/>
@@ -15332,12 +15375,14 @@
           </w:p>
         </w:tc>
         <w:tc>
-          <w:tcPr/>
+          <w:tcPr>
+            <w:shd w:val="clear" w:color="auto" w:fill="F6F8FA"/>
+          </w:tcPr>
           <w:p>
             <w:pPr>
               <w:numPr>
                 <w:ilvl w:val="0"/>
-                <w:numId w:val="1078"/>
+                <w:numId w:val="1079"/>
               </w:numPr>
               <w:jc w:val="left"/>
             </w:pPr>
@@ -15364,7 +15409,7 @@
             <w:pPr>
               <w:numPr>
                 <w:ilvl w:val="0"/>
-                <w:numId w:val="1078"/>
+                <w:numId w:val="1079"/>
               </w:numPr>
               <w:jc w:val="left"/>
             </w:pPr>
@@ -15406,7 +15451,7 @@
             <w:pPr>
               <w:numPr>
                 <w:ilvl w:val="0"/>
-                <w:numId w:val="1078"/>
+                <w:numId w:val="1079"/>
               </w:numPr>
               <w:jc w:val="left"/>
             </w:pPr>
@@ -15418,9 +15463,7 @@
       </w:tr>
       <w:tr>
         <w:tc>
-          <w:tcPr>
-            <w:shd w:val="clear" w:color="auto" w:fill="F6F8FA"/>
-          </w:tcPr>
+          <w:tcPr/>
           <w:p>
             <w:pPr>
               <w:jc w:val="left"/>
@@ -15431,9 +15474,7 @@
           </w:p>
         </w:tc>
         <w:tc>
-          <w:tcPr>
-            <w:shd w:val="clear" w:color="auto" w:fill="F6F8FA"/>
-          </w:tcPr>
+          <w:tcPr/>
           <w:p>
             <w:pPr>
               <w:jc w:val="left"/>
@@ -15444,14 +15485,12 @@
           </w:p>
         </w:tc>
         <w:tc>
-          <w:tcPr>
-            <w:shd w:val="clear" w:color="auto" w:fill="F6F8FA"/>
-          </w:tcPr>
+          <w:tcPr/>
           <w:p>
             <w:pPr>
               <w:numPr>
                 <w:ilvl w:val="0"/>
-                <w:numId w:val="1079"/>
+                <w:numId w:val="1080"/>
               </w:numPr>
               <w:jc w:val="left"/>
             </w:pPr>
@@ -15478,7 +15517,7 @@
             <w:pPr>
               <w:numPr>
                 <w:ilvl w:val="0"/>
-                <w:numId w:val="1079"/>
+                <w:numId w:val="1080"/>
               </w:numPr>
               <w:jc w:val="left"/>
             </w:pPr>
@@ -15505,7 +15544,7 @@
             <w:pPr>
               <w:numPr>
                 <w:ilvl w:val="0"/>
-                <w:numId w:val="1079"/>
+                <w:numId w:val="1080"/>
               </w:numPr>
               <w:jc w:val="left"/>
             </w:pPr>
@@ -15517,7 +15556,7 @@
             <w:pPr>
               <w:numPr>
                 <w:ilvl w:val="0"/>
-                <w:numId w:val="1079"/>
+                <w:numId w:val="1080"/>
               </w:numPr>
               <w:jc w:val="left"/>
             </w:pPr>
@@ -15541,54 +15580,15 @@
       </w:tr>
       <w:tr>
         <w:tc>
-          <w:tcPr/>
+          <w:tcPr>
+            <w:shd w:val="clear" w:color="auto" w:fill="F6F8FA"/>
+          </w:tcPr>
           <w:p>
             <w:pPr>
               <w:jc w:val="left"/>
             </w:pPr>
             <w:r>
               <w:t xml:space="preserve">3.2.1</w:t>
-            </w:r>
-          </w:p>
-        </w:tc>
-        <w:tc>
-          <w:tcPr/>
-          <w:p>
-            <w:pPr>
-              <w:jc w:val="left"/>
-            </w:pPr>
-            <w:r>
-              <w:t xml:space="preserve">2026-09-11</w:t>
-            </w:r>
-          </w:p>
-        </w:tc>
-        <w:tc>
-          <w:tcPr/>
-          <w:p>
-            <w:pPr>
-              <w:numPr>
-                <w:ilvl w:val="0"/>
-                <w:numId w:val="1080"/>
-              </w:numPr>
-              <w:jc w:val="left"/>
-            </w:pPr>
-            <w:r>
-              <w:t xml:space="preserve">Renamed Chapter 7 from “Clean Up” to “Operations and Maintenance”. Added subsections for updating and uninstalling both the MaaS Gateway and the document templates. Added cloud resource cleanup as an optional subsection.</w:t>
-            </w:r>
-          </w:p>
-        </w:tc>
-      </w:tr>
-      <w:tr>
-        <w:tc>
-          <w:tcPr>
-            <w:shd w:val="clear" w:color="auto" w:fill="F6F8FA"/>
-          </w:tcPr>
-          <w:p>
-            <w:pPr>
-              <w:jc w:val="left"/>
-            </w:pPr>
-            <w:r>
-              <w:t xml:space="preserve">3.2.0</w:t>
             </w:r>
           </w:p>
         </w:tc>
@@ -15618,6 +15618,45 @@
               <w:jc w:val="left"/>
             </w:pPr>
             <w:r>
+              <w:t xml:space="preserve">Renamed Chapter 7 from “Clean Up” to “Operations and Maintenance”. Added subsections for updating and uninstalling both the MaaS Gateway and the document templates. Added cloud resource cleanup as an optional subsection.</w:t>
+            </w:r>
+          </w:p>
+        </w:tc>
+      </w:tr>
+      <w:tr>
+        <w:tc>
+          <w:tcPr/>
+          <w:p>
+            <w:pPr>
+              <w:jc w:val="left"/>
+            </w:pPr>
+            <w:r>
+              <w:t xml:space="preserve">3.2.0</w:t>
+            </w:r>
+          </w:p>
+        </w:tc>
+        <w:tc>
+          <w:tcPr/>
+          <w:p>
+            <w:pPr>
+              <w:jc w:val="left"/>
+            </w:pPr>
+            <w:r>
+              <w:t xml:space="preserve">2026-09-11</w:t>
+            </w:r>
+          </w:p>
+        </w:tc>
+        <w:tc>
+          <w:tcPr/>
+          <w:p>
+            <w:pPr>
+              <w:numPr>
+                <w:ilvl w:val="0"/>
+                <w:numId w:val="1082"/>
+              </w:numPr>
+              <w:jc w:val="left"/>
+            </w:pPr>
+            <w:r>
               <w:t xml:space="preserve">Added</w:t>
             </w:r>
             <w:r>
@@ -15679,7 +15718,7 @@
             <w:pPr>
               <w:numPr>
                 <w:ilvl w:val="0"/>
-                <w:numId w:val="1081"/>
+                <w:numId w:val="1082"/>
               </w:numPr>
               <w:jc w:val="left"/>
             </w:pPr>
@@ -15724,7 +15763,7 @@
             <w:pPr>
               <w:numPr>
                 <w:ilvl w:val="0"/>
-                <w:numId w:val="1081"/>
+                <w:numId w:val="1082"/>
               </w:numPr>
               <w:jc w:val="left"/>
             </w:pPr>
@@ -15736,54 +15775,15 @@
       </w:tr>
       <w:tr>
         <w:tc>
-          <w:tcPr/>
+          <w:tcPr>
+            <w:shd w:val="clear" w:color="auto" w:fill="F6F8FA"/>
+          </w:tcPr>
           <w:p>
             <w:pPr>
               <w:jc w:val="left"/>
             </w:pPr>
             <w:r>
               <w:t xml:space="preserve">3.1.2</w:t>
-            </w:r>
-          </w:p>
-        </w:tc>
-        <w:tc>
-          <w:tcPr/>
-          <w:p>
-            <w:pPr>
-              <w:jc w:val="left"/>
-            </w:pPr>
-            <w:r>
-              <w:t xml:space="preserve">2026-09-11</w:t>
-            </w:r>
-          </w:p>
-        </w:tc>
-        <w:tc>
-          <w:tcPr/>
-          <w:p>
-            <w:pPr>
-              <w:numPr>
-                <w:ilvl w:val="0"/>
-                <w:numId w:val="1082"/>
-              </w:numPr>
-              <w:jc w:val="left"/>
-            </w:pPr>
-            <w:r>
-              <w:t xml:space="preserve">Added output format guide to README.md: comparison table of PDF, Markdown, DOCX, and HTML with purpose, copy-paste quality, and limitations. Recommends Markdown for copy-paste.</w:t>
-            </w:r>
-          </w:p>
-        </w:tc>
-      </w:tr>
-      <w:tr>
-        <w:tc>
-          <w:tcPr>
-            <w:shd w:val="clear" w:color="auto" w:fill="F6F8FA"/>
-          </w:tcPr>
-          <w:p>
-            <w:pPr>
-              <w:jc w:val="left"/>
-            </w:pPr>
-            <w:r>
-              <w:t xml:space="preserve">3.1.1</w:t>
             </w:r>
           </w:p>
         </w:tc>
@@ -15813,6 +15813,45 @@
               <w:jc w:val="left"/>
             </w:pPr>
             <w:r>
+              <w:t xml:space="preserve">Added output format guide to README.md: comparison table of PDF, Markdown, DOCX, and HTML with purpose, copy-paste quality, and limitations. Recommends Markdown for copy-paste.</w:t>
+            </w:r>
+          </w:p>
+        </w:tc>
+      </w:tr>
+      <w:tr>
+        <w:tc>
+          <w:tcPr/>
+          <w:p>
+            <w:pPr>
+              <w:jc w:val="left"/>
+            </w:pPr>
+            <w:r>
+              <w:t xml:space="preserve">3.1.1</w:t>
+            </w:r>
+          </w:p>
+        </w:tc>
+        <w:tc>
+          <w:tcPr/>
+          <w:p>
+            <w:pPr>
+              <w:jc w:val="left"/>
+            </w:pPr>
+            <w:r>
+              <w:t xml:space="preserve">2026-09-11</w:t>
+            </w:r>
+          </w:p>
+        </w:tc>
+        <w:tc>
+          <w:tcPr/>
+          <w:p>
+            <w:pPr>
+              <w:numPr>
+                <w:ilvl w:val="0"/>
+                <w:numId w:val="1084"/>
+              </w:numPr>
+              <w:jc w:val="left"/>
+            </w:pPr>
+            <w:r>
               <w:t xml:space="preserve">Updated MaaS Gateway chapter to v1.10.9: non-interactive mode (</w:t>
             </w:r>
             <w:r>
@@ -15829,7 +15868,7 @@
             <w:pPr>
               <w:numPr>
                 <w:ilvl w:val="0"/>
-                <w:numId w:val="1083"/>
+                <w:numId w:val="1084"/>
               </w:numPr>
               <w:jc w:val="left"/>
             </w:pPr>
@@ -15871,7 +15910,7 @@
             <w:pPr>
               <w:numPr>
                 <w:ilvl w:val="0"/>
-                <w:numId w:val="1083"/>
+                <w:numId w:val="1084"/>
               </w:numPr>
               <w:jc w:val="left"/>
             </w:pPr>
@@ -15883,7 +15922,9 @@
       </w:tr>
       <w:tr>
         <w:tc>
-          <w:tcPr/>
+          <w:tcPr>
+            <w:shd w:val="clear" w:color="auto" w:fill="F6F8FA"/>
+          </w:tcPr>
           <w:p>
             <w:pPr>
               <w:jc w:val="left"/>
@@ -15894,7 +15935,9 @@
           </w:p>
         </w:tc>
         <w:tc>
-          <w:tcPr/>
+          <w:tcPr>
+            <w:shd w:val="clear" w:color="auto" w:fill="F6F8FA"/>
+          </w:tcPr>
           <w:p>
             <w:pPr>
               <w:jc w:val="left"/>
@@ -15905,12 +15948,14 @@
           </w:p>
         </w:tc>
         <w:tc>
-          <w:tcPr/>
+          <w:tcPr>
+            <w:shd w:val="clear" w:color="auto" w:fill="F6F8FA"/>
+          </w:tcPr>
           <w:p>
             <w:pPr>
               <w:numPr>
                 <w:ilvl w:val="0"/>
-                <w:numId w:val="1084"/>
+                <w:numId w:val="1085"/>
               </w:numPr>
               <w:jc w:val="left"/>
             </w:pPr>
@@ -15934,7 +15979,7 @@
             <w:pPr>
               <w:numPr>
                 <w:ilvl w:val="0"/>
-                <w:numId w:val="1084"/>
+                <w:numId w:val="1085"/>
               </w:numPr>
               <w:jc w:val="left"/>
             </w:pPr>
@@ -15976,7 +16021,7 @@
             <w:pPr>
               <w:numPr>
                 <w:ilvl w:val="0"/>
-                <w:numId w:val="1084"/>
+                <w:numId w:val="1085"/>
               </w:numPr>
               <w:jc w:val="left"/>
             </w:pPr>
@@ -15984,63 +16029,6 @@
               <w:t xml:space="preserve">Restructured chapters: moved SSH config and VS Code connection to new Chapter 4 (Install VS Code and Connect via Remote-SSH). Chapters 5—​7 renumbered.</w:t>
             </w:r>
           </w:p>
-          <w:p>
-            <w:pPr>
-              <w:numPr>
-                <w:ilvl w:val="0"/>
-                <w:numId w:val="1084"/>
-              </w:numPr>
-              <w:jc w:val="left"/>
-            </w:pPr>
-            <w:r>
-              <w:t xml:space="preserve">Added verification checklist tables to all 7 chapters.</w:t>
-            </w:r>
-          </w:p>
-          <w:p>
-            <w:pPr>
-              <w:numPr>
-                <w:ilvl w:val="0"/>
-                <w:numId w:val="1084"/>
-              </w:numPr>
-              <w:jc w:val="left"/>
-            </w:pPr>
-            <w:r>
-              <w:t xml:space="preserve">Added mandatory reboot warning in Chapter 2 (SSH port change). Added troubleshooting subsection in Chapter 4 with common SSH connection issues and ncat debugging commands.</w:t>
-            </w:r>
-          </w:p>
-        </w:tc>
-      </w:tr>
-      <w:tr>
-        <w:tc>
-          <w:tcPr>
-            <w:shd w:val="clear" w:color="auto" w:fill="F6F8FA"/>
-          </w:tcPr>
-          <w:p>
-            <w:pPr>
-              <w:jc w:val="left"/>
-            </w:pPr>
-            <w:r>
-              <w:t xml:space="preserve">3.0.1</w:t>
-            </w:r>
-          </w:p>
-        </w:tc>
-        <w:tc>
-          <w:tcPr>
-            <w:shd w:val="clear" w:color="auto" w:fill="F6F8FA"/>
-          </w:tcPr>
-          <w:p>
-            <w:pPr>
-              <w:jc w:val="left"/>
-            </w:pPr>
-            <w:r>
-              <w:t xml:space="preserve">2026-09-10</w:t>
-            </w:r>
-          </w:p>
-        </w:tc>
-        <w:tc>
-          <w:tcPr>
-            <w:shd w:val="clear" w:color="auto" w:fill="F6F8FA"/>
-          </w:tcPr>
           <w:p>
             <w:pPr>
               <w:numPr>
@@ -16050,7 +16038,19 @@
               <w:jc w:val="left"/>
             </w:pPr>
             <w:r>
-              <w:t xml:space="preserve">Minor fixes: test-filter.sh auto-discovery, build.sh help text, Makefile aggregate descriptions, 5-section comment correction, CHANGELOG version gap note, callout-in-code fix, CI font auto-discovery, dofile path comment, test-sync.sh header.</w:t>
+              <w:t xml:space="preserve">Added verification checklist tables to all 7 chapters.</w:t>
+            </w:r>
+          </w:p>
+          <w:p>
+            <w:pPr>
+              <w:numPr>
+                <w:ilvl w:val="0"/>
+                <w:numId w:val="1085"/>
+              </w:numPr>
+              <w:jc w:val="left"/>
+            </w:pPr>
+            <w:r>
+              <w:t xml:space="preserve">Added mandatory reboot warning in Chapter 2 (SSH port change). Added troubleshooting subsection in Chapter 4 with common SSH connection issues and ncat debugging commands.</w:t>
             </w:r>
           </w:p>
         </w:tc>
@@ -16063,18 +16063,18 @@
               <w:jc w:val="left"/>
             </w:pPr>
             <w:r>
-              <w:t xml:space="preserve">3.0.0</w:t>
-            </w:r>
-          </w:p>
-        </w:tc>
-        <w:tc>
-          <w:tcPr/>
-          <w:p>
-            <w:pPr>
-              <w:jc w:val="left"/>
-            </w:pPr>
-            <w:r>
-              <w:t xml:space="preserve">2026-09-09</w:t>
+              <w:t xml:space="preserve">3.0.1</w:t>
+            </w:r>
+          </w:p>
+        </w:tc>
+        <w:tc>
+          <w:tcPr/>
+          <w:p>
+            <w:pPr>
+              <w:jc w:val="left"/>
+            </w:pPr>
+            <w:r>
+              <w:t xml:space="preserve">2026-09-10</w:t>
             </w:r>
           </w:p>
         </w:tc>
@@ -16089,7 +16089,7 @@
               <w:jc w:val="left"/>
             </w:pPr>
             <w:r>
-              <w:t xml:space="preserve">Modular pipeline refactoring: shared Lua filter factory, shared DOCX fix logic, build system auto-discovery, unified format pipeline, GitHub Actions CI.</w:t>
+              <w:t xml:space="preserve">Minor fixes: test-filter.sh auto-discovery, build.sh help text, Makefile aggregate descriptions, 5-section comment correction, CHANGELOG version gap note, callout-in-code fix, CI font auto-discovery, dofile path comment, test-sync.sh header.</w:t>
             </w:r>
           </w:p>
         </w:tc>
@@ -16104,7 +16104,7 @@
               <w:jc w:val="left"/>
             </w:pPr>
             <w:r>
-              <w:t xml:space="preserve">2.16.0</w:t>
+              <w:t xml:space="preserve">3.0.0</w:t>
             </w:r>
           </w:p>
         </w:tc>
@@ -16117,7 +16117,7 @@
               <w:jc w:val="left"/>
             </w:pPr>
             <w:r>
-              <w:t xml:space="preserve">2026-09-05</w:t>
+              <w:t xml:space="preserve">2026-09-09</w:t>
             </w:r>
           </w:p>
         </w:tc>
@@ -16134,7 +16134,7 @@
               <w:jc w:val="left"/>
             </w:pPr>
             <w:r>
-              <w:t xml:space="preserve">Updated to match template v2.16.0 — Lua filter fixes, build system updates, and technical template parity improvements.</w:t>
+              <w:t xml:space="preserve">Modular pipeline refactoring: shared Lua filter factory, shared DOCX fix logic, build system auto-discovery, unified format pipeline, GitHub Actions CI.</w:t>
             </w:r>
           </w:p>
         </w:tc>
@@ -16147,18 +16147,18 @@
               <w:jc w:val="left"/>
             </w:pPr>
             <w:r>
-              <w:t xml:space="preserve">2.13.0</w:t>
-            </w:r>
-          </w:p>
-        </w:tc>
-        <w:tc>
-          <w:tcPr/>
-          <w:p>
-            <w:pPr>
-              <w:jc w:val="left"/>
-            </w:pPr>
-            <w:r>
-              <w:t xml:space="preserve">2026-08-24</w:t>
+              <w:t xml:space="preserve">2.16.0</w:t>
+            </w:r>
+          </w:p>
+        </w:tc>
+        <w:tc>
+          <w:tcPr/>
+          <w:p>
+            <w:pPr>
+              <w:jc w:val="left"/>
+            </w:pPr>
+            <w:r>
+              <w:t xml:space="preserve">2026-09-05</w:t>
             </w:r>
           </w:p>
         </w:tc>
@@ -16173,6 +16173,51 @@
               <w:jc w:val="left"/>
             </w:pPr>
             <w:r>
+              <w:t xml:space="preserve">Updated to match template v2.16.0 — Lua filter fixes, build system updates, and technical template parity improvements.</w:t>
+            </w:r>
+          </w:p>
+        </w:tc>
+      </w:tr>
+      <w:tr>
+        <w:tc>
+          <w:tcPr>
+            <w:shd w:val="clear" w:color="auto" w:fill="F6F8FA"/>
+          </w:tcPr>
+          <w:p>
+            <w:pPr>
+              <w:jc w:val="left"/>
+            </w:pPr>
+            <w:r>
+              <w:t xml:space="preserve">2.13.0</w:t>
+            </w:r>
+          </w:p>
+        </w:tc>
+        <w:tc>
+          <w:tcPr>
+            <w:shd w:val="clear" w:color="auto" w:fill="F6F8FA"/>
+          </w:tcPr>
+          <w:p>
+            <w:pPr>
+              <w:jc w:val="left"/>
+            </w:pPr>
+            <w:r>
+              <w:t xml:space="preserve">2026-08-24</w:t>
+            </w:r>
+          </w:p>
+        </w:tc>
+        <w:tc>
+          <w:tcPr>
+            <w:shd w:val="clear" w:color="auto" w:fill="F6F8FA"/>
+          </w:tcPr>
+          <w:p>
+            <w:pPr>
+              <w:numPr>
+                <w:ilvl w:val="0"/>
+                <w:numId w:val="1089"/>
+              </w:numPr>
+              <w:jc w:val="left"/>
+            </w:pPr>
+            <w:r>
               <w:t xml:space="preserve">Foundation refactoring Phase 4: make DOCX</w:t>
             </w:r>
             <w:r>
@@ -16240,9 +16285,7 @@
       </w:tr>
       <w:tr>
         <w:tc>
-          <w:tcPr>
-            <w:shd w:val="clear" w:color="auto" w:fill="F6F8FA"/>
-          </w:tcPr>
+          <w:tcPr/>
           <w:p>
             <w:pPr>
               <w:jc w:val="left"/>
@@ -16253,9 +16296,7 @@
           </w:p>
         </w:tc>
         <w:tc>
-          <w:tcPr>
-            <w:shd w:val="clear" w:color="auto" w:fill="F6F8FA"/>
-          </w:tcPr>
+          <w:tcPr/>
           <w:p>
             <w:pPr>
               <w:jc w:val="left"/>
@@ -16266,14 +16307,12 @@
           </w:p>
         </w:tc>
         <w:tc>
-          <w:tcPr>
-            <w:shd w:val="clear" w:color="auto" w:fill="F6F8FA"/>
-          </w:tcPr>
+          <w:tcPr/>
           <w:p>
             <w:pPr>
               <w:numPr>
                 <w:ilvl w:val="0"/>
-                <w:numId w:val="1089"/>
+                <w:numId w:val="1090"/>
               </w:numPr>
               <w:jc w:val="left"/>
             </w:pPr>
@@ -16435,7 +16474,9 @@
       </w:tr>
       <w:tr>
         <w:tc>
-          <w:tcPr/>
+          <w:tcPr>
+            <w:shd w:val="clear" w:color="auto" w:fill="F6F8FA"/>
+          </w:tcPr>
           <w:p>
             <w:pPr>
               <w:jc w:val="left"/>
@@ -16446,7 +16487,9 @@
           </w:p>
         </w:tc>
         <w:tc>
-          <w:tcPr/>
+          <w:tcPr>
+            <w:shd w:val="clear" w:color="auto" w:fill="F6F8FA"/>
+          </w:tcPr>
           <w:p>
             <w:pPr>
               <w:jc w:val="left"/>
@@ -16457,12 +16500,14 @@
           </w:p>
         </w:tc>
         <w:tc>
-          <w:tcPr/>
+          <w:tcPr>
+            <w:shd w:val="clear" w:color="auto" w:fill="F6F8FA"/>
+          </w:tcPr>
           <w:p>
             <w:pPr>
               <w:numPr>
                 <w:ilvl w:val="0"/>
-                <w:numId w:val="1090"/>
+                <w:numId w:val="1091"/>
               </w:numPr>
               <w:jc w:val="left"/>
             </w:pPr>
@@ -16528,9 +16573,7 @@
       </w:tr>
       <w:tr>
         <w:tc>
-          <w:tcPr>
-            <w:shd w:val="clear" w:color="auto" w:fill="F6F8FA"/>
-          </w:tcPr>
+          <w:tcPr/>
           <w:p>
             <w:pPr>
               <w:jc w:val="left"/>
@@ -16541,56 +16584,13 @@
           </w:p>
         </w:tc>
         <w:tc>
-          <w:tcPr>
-            <w:shd w:val="clear" w:color="auto" w:fill="F6F8FA"/>
-          </w:tcPr>
+          <w:tcPr/>
           <w:p>
             <w:pPr>
               <w:jc w:val="left"/>
             </w:pPr>
             <w:r>
               <w:t xml:space="preserve">2026-08-24</w:t>
-            </w:r>
-          </w:p>
-        </w:tc>
-        <w:tc>
-          <w:tcPr>
-            <w:shd w:val="clear" w:color="auto" w:fill="F6F8FA"/>
-          </w:tcPr>
-          <w:p>
-            <w:pPr>
-              <w:numPr>
-                <w:ilvl w:val="0"/>
-                <w:numId w:val="1091"/>
-              </w:numPr>
-              <w:jc w:val="left"/>
-            </w:pPr>
-            <w:r>
-              <w:t xml:space="preserve">Foundation refactoring Phase 1: sync cls version to project tag, fix stale doc references (L16 output count, L-range, setup-guide feature claim), add test-sync.sh for version consistency checking.</w:t>
-            </w:r>
-          </w:p>
-        </w:tc>
-      </w:tr>
-      <w:tr>
-        <w:tc>
-          <w:tcPr/>
-          <w:p>
-            <w:pPr>
-              <w:jc w:val="left"/>
-            </w:pPr>
-            <w:r>
-              <w:t xml:space="preserve">2.9.1</w:t>
-            </w:r>
-          </w:p>
-        </w:tc>
-        <w:tc>
-          <w:tcPr/>
-          <w:p>
-            <w:pPr>
-              <w:jc w:val="left"/>
-            </w:pPr>
-            <w:r>
-              <w:t xml:space="preserve">2026-08-23</w:t>
             </w:r>
           </w:p>
         </w:tc>
@@ -16605,6 +16605,51 @@
               <w:jc w:val="left"/>
             </w:pPr>
             <w:r>
+              <w:t xml:space="preserve">Foundation refactoring Phase 1: sync cls version to project tag, fix stale doc references (L16 output count, L-range, setup-guide feature claim), add test-sync.sh for version consistency checking.</w:t>
+            </w:r>
+          </w:p>
+        </w:tc>
+      </w:tr>
+      <w:tr>
+        <w:tc>
+          <w:tcPr>
+            <w:shd w:val="clear" w:color="auto" w:fill="F6F8FA"/>
+          </w:tcPr>
+          <w:p>
+            <w:pPr>
+              <w:jc w:val="left"/>
+            </w:pPr>
+            <w:r>
+              <w:t xml:space="preserve">2.9.1</w:t>
+            </w:r>
+          </w:p>
+        </w:tc>
+        <w:tc>
+          <w:tcPr>
+            <w:shd w:val="clear" w:color="auto" w:fill="F6F8FA"/>
+          </w:tcPr>
+          <w:p>
+            <w:pPr>
+              <w:jc w:val="left"/>
+            </w:pPr>
+            <w:r>
+              <w:t xml:space="preserve">2026-08-23</w:t>
+            </w:r>
+          </w:p>
+        </w:tc>
+        <w:tc>
+          <w:tcPr>
+            <w:shd w:val="clear" w:color="auto" w:fill="F6F8FA"/>
+          </w:tcPr>
+          <w:p>
+            <w:pPr>
+              <w:numPr>
+                <w:ilvl w:val="0"/>
+                <w:numId w:val="1093"/>
+              </w:numPr>
+              <w:jc w:val="left"/>
+            </w:pPr>
+            <w:r>
               <w:t xml:space="preserve">HTML and Markdown outputs now embed images as base64 data URIs. HTML uses pandoc</w:t>
             </w:r>
             <w:r>
@@ -16636,58 +16681,13 @@
       </w:tr>
       <w:tr>
         <w:tc>
-          <w:tcPr>
-            <w:shd w:val="clear" w:color="auto" w:fill="F6F8FA"/>
-          </w:tcPr>
+          <w:tcPr/>
           <w:p>
             <w:pPr>
               <w:jc w:val="left"/>
             </w:pPr>
             <w:r>
               <w:t xml:space="preserve">2.9.0</w:t>
-            </w:r>
-          </w:p>
-        </w:tc>
-        <w:tc>
-          <w:tcPr>
-            <w:shd w:val="clear" w:color="auto" w:fill="F6F8FA"/>
-          </w:tcPr>
-          <w:p>
-            <w:pPr>
-              <w:jc w:val="left"/>
-            </w:pPr>
-            <w:r>
-              <w:t xml:space="preserve">2026-08-23</w:t>
-            </w:r>
-          </w:p>
-        </w:tc>
-        <w:tc>
-          <w:tcPr>
-            <w:shd w:val="clear" w:color="auto" w:fill="F6F8FA"/>
-          </w:tcPr>
-          <w:p>
-            <w:pPr>
-              <w:numPr>
-                <w:ilvl w:val="0"/>
-                <w:numId w:val="1093"/>
-              </w:numPr>
-              <w:jc w:val="left"/>
-            </w:pPr>
-            <w:r>
-              <w:t xml:space="preserve">DOCX: fix content width (8504→9638tw, margins are 2cm not 3cm). Add footer page numbers. Style TOC heading (22pt bold + rule). Add hutable table width + fixed layout.</w:t>
-            </w:r>
-          </w:p>
-        </w:tc>
-      </w:tr>
-      <w:tr>
-        <w:tc>
-          <w:tcPr/>
-          <w:p>
-            <w:pPr>
-              <w:jc w:val="left"/>
-            </w:pPr>
-            <w:r>
-              <w:t xml:space="preserve">2.8.3</w:t>
             </w:r>
           </w:p>
         </w:tc>
@@ -16713,7 +16713,7 @@
               <w:jc w:val="left"/>
             </w:pPr>
             <w:r>
-              <w:t xml:space="preserve">DOCX fix: callout tables now have explicit width (8504tw) and fixed layout. Changelog section heading now uses custom H1 format (56pt number, red border, right tab) instead of pandoc’s default.</w:t>
+              <w:t xml:space="preserve">DOCX: fix content width (8504→9638tw, margins are 2cm not 3cm). Add footer page numbers. Style TOC heading (22pt bold + rule). Add hutable table width + fixed layout.</w:t>
             </w:r>
           </w:p>
         </w:tc>
@@ -16728,7 +16728,7 @@
               <w:jc w:val="left"/>
             </w:pPr>
             <w:r>
-              <w:t xml:space="preserve">2.8.2</w:t>
+              <w:t xml:space="preserve">2.8.3</w:t>
             </w:r>
           </w:p>
         </w:tc>
@@ -16758,7 +16758,7 @@
               <w:jc w:val="left"/>
             </w:pPr>
             <w:r>
-              <w:t xml:space="preserve">DOCX H1 heading: reverted table approach to paragraph with tab stop + red bottom border. Table broke navigation pane and TOC field. Paragraph preserves Heading1 style for navigation while matching PDF layout (number left, title right, red rule below).</w:t>
+              <w:t xml:space="preserve">DOCX fix: callout tables now have explicit width (8504tw) and fixed layout. Changelog section heading now uses custom H1 format (56pt number, red border, right tab) instead of pandoc’s default.</w:t>
             </w:r>
           </w:p>
         </w:tc>
@@ -16771,7 +16771,7 @@
               <w:jc w:val="left"/>
             </w:pPr>
             <w:r>
-              <w:t xml:space="preserve">2.8.1</w:t>
+              <w:t xml:space="preserve">2.8.2</w:t>
             </w:r>
           </w:p>
         </w:tc>
@@ -16797,7 +16797,7 @@
               <w:jc w:val="left"/>
             </w:pPr>
             <w:r>
-              <w:t xml:space="preserve">DOCX heading fix: text color reverted to black (was incorrectly changed to Huawei red in v2.8.0). H1 now uses a two-column table (number left, title right) with red bottom rule. H2-H4 use simple inline format (number + title, no right tab stop).</w:t>
+              <w:t xml:space="preserve">DOCX H1 heading: reverted table approach to paragraph with tab stop + red bottom border. Table broke navigation pane and TOC field. Paragraph preserves Heading1 style for navigation while matching PDF layout (number left, title right, red rule below).</w:t>
             </w:r>
           </w:p>
         </w:tc>
@@ -16812,7 +16812,7 @@
               <w:jc w:val="left"/>
             </w:pPr>
             <w:r>
-              <w:t xml:space="preserve">2.8.0</w:t>
+              <w:t xml:space="preserve">2.8.1</w:t>
             </w:r>
           </w:p>
         </w:tc>
@@ -16842,7 +16842,7 @@
               <w:jc w:val="left"/>
             </w:pPr>
             <w:r>
-              <w:t xml:space="preserve">DOCX output: match PDF styling --- heading colors (Huawei red), H1 number size (56pt), callout borders (left-only) and padding, changelog formatting (rules, bold version, italic date), caption style (9pt bold), badge style (8pt bold white on red), list indentation.</w:t>
+              <w:t xml:space="preserve">DOCX heading fix: text color reverted to black (was incorrectly changed to Huawei red in v2.8.0). H1 now uses a two-column table (number left, title right) with red bottom rule. H2-H4 use simple inline format (number + title, no right tab stop).</w:t>
             </w:r>
           </w:p>
         </w:tc>
@@ -16855,18 +16855,18 @@
               <w:jc w:val="left"/>
             </w:pPr>
             <w:r>
-              <w:t xml:space="preserve">2.7.1</w:t>
-            </w:r>
-          </w:p>
-        </w:tc>
-        <w:tc>
-          <w:tcPr/>
-          <w:p>
-            <w:pPr>
-              <w:jc w:val="left"/>
-            </w:pPr>
-            <w:r>
-              <w:t xml:space="preserve">2026-08-17</w:t>
+              <w:t xml:space="preserve">2.8.0</w:t>
+            </w:r>
+          </w:p>
+        </w:tc>
+        <w:tc>
+          <w:tcPr/>
+          <w:p>
+            <w:pPr>
+              <w:jc w:val="left"/>
+            </w:pPr>
+            <w:r>
+              <w:t xml:space="preserve">2026-08-23</w:t>
             </w:r>
           </w:p>
         </w:tc>
@@ -16881,6 +16881,51 @@
               <w:jc w:val="left"/>
             </w:pPr>
             <w:r>
+              <w:t xml:space="preserve">DOCX output: match PDF styling --- heading colors (Huawei red), H1 number size (56pt), callout borders (left-only) and padding, changelog formatting (rules, bold version, italic date), caption style (9pt bold), badge style (8pt bold white on red), list indentation.</w:t>
+            </w:r>
+          </w:p>
+        </w:tc>
+      </w:tr>
+      <w:tr>
+        <w:tc>
+          <w:tcPr>
+            <w:shd w:val="clear" w:color="auto" w:fill="F6F8FA"/>
+          </w:tcPr>
+          <w:p>
+            <w:pPr>
+              <w:jc w:val="left"/>
+            </w:pPr>
+            <w:r>
+              <w:t xml:space="preserve">2.7.1</w:t>
+            </w:r>
+          </w:p>
+        </w:tc>
+        <w:tc>
+          <w:tcPr>
+            <w:shd w:val="clear" w:color="auto" w:fill="F6F8FA"/>
+          </w:tcPr>
+          <w:p>
+            <w:pPr>
+              <w:jc w:val="left"/>
+            </w:pPr>
+            <w:r>
+              <w:t xml:space="preserve">2026-08-17</w:t>
+            </w:r>
+          </w:p>
+        </w:tc>
+        <w:tc>
+          <w:tcPr>
+            <w:shd w:val="clear" w:color="auto" w:fill="F6F8FA"/>
+          </w:tcPr>
+          <w:p>
+            <w:pPr>
+              <w:numPr>
+                <w:ilvl w:val="0"/>
+                <w:numId w:val="1099"/>
+              </w:numPr>
+              <w:jc w:val="left"/>
+            </w:pPr>
+            <w:r>
               <w:t xml:space="preserve">Rename project repository to all lowercase (</w:t>
             </w:r>
             <w:r>
@@ -16897,9 +16942,7 @@
       </w:tr>
       <w:tr>
         <w:tc>
-          <w:tcPr>
-            <w:shd w:val="clear" w:color="auto" w:fill="F6F8FA"/>
-          </w:tcPr>
+          <w:tcPr/>
           <w:p>
             <w:pPr>
               <w:jc w:val="left"/>
@@ -16910,9 +16953,7 @@
           </w:p>
         </w:tc>
         <w:tc>
-          <w:tcPr>
-            <w:shd w:val="clear" w:color="auto" w:fill="F6F8FA"/>
-          </w:tcPr>
+          <w:tcPr/>
           <w:p>
             <w:pPr>
               <w:jc w:val="left"/>
@@ -16923,14 +16964,12 @@
           </w:p>
         </w:tc>
         <w:tc>
-          <w:tcPr>
-            <w:shd w:val="clear" w:color="auto" w:fill="F6F8FA"/>
-          </w:tcPr>
+          <w:tcPr/>
           <w:p>
             <w:pPr>
               <w:numPr>
                 <w:ilvl w:val="0"/>
-                <w:numId w:val="1099"/>
+                <w:numId w:val="1100"/>
               </w:numPr>
               <w:jc w:val="left"/>
             </w:pPr>
@@ -16972,7 +17011,9 @@
       </w:tr>
       <w:tr>
         <w:tc>
-          <w:tcPr/>
+          <w:tcPr>
+            <w:shd w:val="clear" w:color="auto" w:fill="F6F8FA"/>
+          </w:tcPr>
           <w:p>
             <w:pPr>
               <w:jc w:val="left"/>
@@ -16983,7 +17024,9 @@
           </w:p>
         </w:tc>
         <w:tc>
-          <w:tcPr/>
+          <w:tcPr>
+            <w:shd w:val="clear" w:color="auto" w:fill="F6F8FA"/>
+          </w:tcPr>
           <w:p>
             <w:pPr>
               <w:jc w:val="left"/>
@@ -16994,12 +17037,14 @@
           </w:p>
         </w:tc>
         <w:tc>
-          <w:tcPr/>
+          <w:tcPr>
+            <w:shd w:val="clear" w:color="auto" w:fill="F6F8FA"/>
+          </w:tcPr>
           <w:p>
             <w:pPr>
               <w:numPr>
                 <w:ilvl w:val="0"/>
-                <w:numId w:val="1100"/>
+                <w:numId w:val="1101"/>
               </w:numPr>
               <w:jc w:val="left"/>
             </w:pPr>
@@ -17056,9 +17101,7 @@
       </w:tr>
       <w:tr>
         <w:tc>
-          <w:tcPr>
-            <w:shd w:val="clear" w:color="auto" w:fill="F6F8FA"/>
-          </w:tcPr>
+          <w:tcPr/>
           <w:p>
             <w:pPr>
               <w:jc w:val="left"/>
@@ -17069,9 +17112,7 @@
           </w:p>
         </w:tc>
         <w:tc>
-          <w:tcPr>
-            <w:shd w:val="clear" w:color="auto" w:fill="F6F8FA"/>
-          </w:tcPr>
+          <w:tcPr/>
           <w:p>
             <w:pPr>
               <w:jc w:val="left"/>
@@ -17082,14 +17123,12 @@
           </w:p>
         </w:tc>
         <w:tc>
-          <w:tcPr>
-            <w:shd w:val="clear" w:color="auto" w:fill="F6F8FA"/>
-          </w:tcPr>
+          <w:tcPr/>
           <w:p>
             <w:pPr>
               <w:numPr>
                 <w:ilvl w:val="0"/>
-                <w:numId w:val="1101"/>
+                <w:numId w:val="1102"/>
               </w:numPr>
               <w:jc w:val="left"/>
             </w:pPr>
@@ -17116,7 +17155,7 @@
             <w:pPr>
               <w:numPr>
                 <w:ilvl w:val="0"/>
-                <w:numId w:val="1101"/>
+                <w:numId w:val="1102"/>
               </w:numPr>
               <w:jc w:val="left"/>
             </w:pPr>
@@ -17143,54 +17182,15 @@
       </w:tr>
       <w:tr>
         <w:tc>
-          <w:tcPr/>
+          <w:tcPr>
+            <w:shd w:val="clear" w:color="auto" w:fill="F6F8FA"/>
+          </w:tcPr>
           <w:p>
             <w:pPr>
               <w:jc w:val="left"/>
             </w:pPr>
             <w:r>
               <w:t xml:space="preserve">2.5.1</w:t>
-            </w:r>
-          </w:p>
-        </w:tc>
-        <w:tc>
-          <w:tcPr/>
-          <w:p>
-            <w:pPr>
-              <w:jc w:val="left"/>
-            </w:pPr>
-            <w:r>
-              <w:t xml:space="preserve">2026-08-10</w:t>
-            </w:r>
-          </w:p>
-        </w:tc>
-        <w:tc>
-          <w:tcPr/>
-          <w:p>
-            <w:pPr>
-              <w:numPr>
-                <w:ilvl w:val="0"/>
-                <w:numId w:val="1102"/>
-              </w:numPr>
-              <w:jc w:val="left"/>
-            </w:pPr>
-            <w:r>
-              <w:t xml:space="preserve">H1 section title size reduced from 27pt to 20pt.</w:t>
-            </w:r>
-          </w:p>
-        </w:tc>
-      </w:tr>
-      <w:tr>
-        <w:tc>
-          <w:tcPr>
-            <w:shd w:val="clear" w:color="auto" w:fill="F6F8FA"/>
-          </w:tcPr>
-          <w:p>
-            <w:pPr>
-              <w:jc w:val="left"/>
-            </w:pPr>
-            <w:r>
-              <w:t xml:space="preserve">2.5.0</w:t>
             </w:r>
           </w:p>
         </w:tc>
@@ -17220,13 +17220,7 @@
               <w:jc w:val="left"/>
             </w:pPr>
             <w:r>
-              <w:t xml:space="preserve">Default image size increased: width 65% → 90% of text width,</w:t>
-            </w:r>
-            <w:r>
-              <w:t xml:space="preserve"> </w:t>
-            </w:r>
-            <w:r>
-              <w:t xml:space="preserve">height 40% → 50% of text height.</w:t>
+              <w:t xml:space="preserve">H1 section title size reduced from 27pt to 20pt.</w:t>
             </w:r>
           </w:p>
         </w:tc>
@@ -17239,7 +17233,7 @@
               <w:jc w:val="left"/>
             </w:pPr>
             <w:r>
-              <w:t xml:space="preserve">2.4.0</w:t>
+              <w:t xml:space="preserve">2.5.0</w:t>
             </w:r>
           </w:p>
         </w:tc>
@@ -17265,14 +17259,65 @@
               <w:jc w:val="left"/>
             </w:pPr>
             <w:r>
-              <w:t xml:space="preserve">Enlarged H1 section title (18pt → 27pt, 50% bigger).</w:t>
-            </w:r>
-          </w:p>
+              <w:t xml:space="preserve">Default image size increased: width 65% → 90% of text width,</w:t>
+            </w:r>
+            <w:r>
+              <w:t xml:space="preserve"> </w:t>
+            </w:r>
+            <w:r>
+              <w:t xml:space="preserve">height 40% → 50% of text height.</w:t>
+            </w:r>
+          </w:p>
+        </w:tc>
+      </w:tr>
+      <w:tr>
+        <w:tc>
+          <w:tcPr>
+            <w:shd w:val="clear" w:color="auto" w:fill="F6F8FA"/>
+          </w:tcPr>
+          <w:p>
+            <w:pPr>
+              <w:jc w:val="left"/>
+            </w:pPr>
+            <w:r>
+              <w:t xml:space="preserve">2.4.0</w:t>
+            </w:r>
+          </w:p>
+        </w:tc>
+        <w:tc>
+          <w:tcPr>
+            <w:shd w:val="clear" w:color="auto" w:fill="F6F8FA"/>
+          </w:tcPr>
+          <w:p>
+            <w:pPr>
+              <w:jc w:val="left"/>
+            </w:pPr>
+            <w:r>
+              <w:t xml:space="preserve">2026-08-10</w:t>
+            </w:r>
+          </w:p>
+        </w:tc>
+        <w:tc>
+          <w:tcPr>
+            <w:shd w:val="clear" w:color="auto" w:fill="F6F8FA"/>
+          </w:tcPr>
           <w:p>
             <w:pPr>
               <w:numPr>
                 <w:ilvl w:val="0"/>
-                <w:numId w:val="1104"/>
+                <w:numId w:val="1105"/>
+              </w:numPr>
+              <w:jc w:val="left"/>
+            </w:pPr>
+            <w:r>
+              <w:t xml:space="preserve">Enlarged H1 section title (18pt → 27pt, 50% bigger).</w:t>
+            </w:r>
+          </w:p>
+          <w:p>
+            <w:pPr>
+              <w:numPr>
+                <w:ilvl w:val="0"/>
+                <w:numId w:val="1105"/>
               </w:numPr>
               <w:jc w:val="left"/>
             </w:pPr>
@@ -17299,9 +17344,7 @@
       </w:tr>
       <w:tr>
         <w:tc>
-          <w:tcPr>
-            <w:shd w:val="clear" w:color="auto" w:fill="F6F8FA"/>
-          </w:tcPr>
+          <w:tcPr/>
           <w:p>
             <w:pPr>
               <w:jc w:val="left"/>
@@ -17312,9 +17355,7 @@
           </w:p>
         </w:tc>
         <w:tc>
-          <w:tcPr>
-            <w:shd w:val="clear" w:color="auto" w:fill="F6F8FA"/>
-          </w:tcPr>
+          <w:tcPr/>
           <w:p>
             <w:pPr>
               <w:jc w:val="left"/>
@@ -17325,14 +17366,12 @@
           </w:p>
         </w:tc>
         <w:tc>
-          <w:tcPr>
-            <w:shd w:val="clear" w:color="auto" w:fill="F6F8FA"/>
-          </w:tcPr>
+          <w:tcPr/>
           <w:p>
             <w:pPr>
               <w:numPr>
                 <w:ilvl w:val="0"/>
-                <w:numId w:val="1105"/>
+                <w:numId w:val="1106"/>
               </w:numPr>
               <w:jc w:val="left"/>
             </w:pPr>
@@ -17359,7 +17398,9 @@
       </w:tr>
       <w:tr>
         <w:tc>
-          <w:tcPr/>
+          <w:tcPr>
+            <w:shd w:val="clear" w:color="auto" w:fill="F6F8FA"/>
+          </w:tcPr>
           <w:p>
             <w:pPr>
               <w:jc w:val="left"/>
@@ -17370,7 +17411,9 @@
           </w:p>
         </w:tc>
         <w:tc>
-          <w:tcPr/>
+          <w:tcPr>
+            <w:shd w:val="clear" w:color="auto" w:fill="F6F8FA"/>
+          </w:tcPr>
           <w:p>
             <w:pPr>
               <w:jc w:val="left"/>
@@ -17381,12 +17424,14 @@
           </w:p>
         </w:tc>
         <w:tc>
-          <w:tcPr/>
+          <w:tcPr>
+            <w:shd w:val="clear" w:color="auto" w:fill="F6F8FA"/>
+          </w:tcPr>
           <w:p>
             <w:pPr>
               <w:numPr>
                 <w:ilvl w:val="0"/>
-                <w:numId w:val="1106"/>
+                <w:numId w:val="1107"/>
               </w:numPr>
               <w:jc w:val="left"/>
             </w:pPr>
@@ -17458,9 +17503,7 @@
       </w:tr>
       <w:tr>
         <w:tc>
-          <w:tcPr>
-            <w:shd w:val="clear" w:color="auto" w:fill="F6F8FA"/>
-          </w:tcPr>
+          <w:tcPr/>
           <w:p>
             <w:pPr>
               <w:jc w:val="left"/>
@@ -17471,9 +17514,7 @@
           </w:p>
         </w:tc>
         <w:tc>
-          <w:tcPr>
-            <w:shd w:val="clear" w:color="auto" w:fill="F6F8FA"/>
-          </w:tcPr>
+          <w:tcPr/>
           <w:p>
             <w:pPr>
               <w:jc w:val="left"/>
@@ -17484,14 +17525,12 @@
           </w:p>
         </w:tc>
         <w:tc>
-          <w:tcPr>
-            <w:shd w:val="clear" w:color="auto" w:fill="F6F8FA"/>
-          </w:tcPr>
+          <w:tcPr/>
           <w:p>
             <w:pPr>
               <w:numPr>
                 <w:ilvl w:val="0"/>
-                <w:numId w:val="1107"/>
+                <w:numId w:val="1108"/>
               </w:numPr>
               <w:jc w:val="left"/>
             </w:pPr>
@@ -17548,7 +17587,9 @@
       </w:tr>
       <w:tr>
         <w:tc>
-          <w:tcPr/>
+          <w:tcPr>
+            <w:shd w:val="clear" w:color="auto" w:fill="F6F8FA"/>
+          </w:tcPr>
           <w:p>
             <w:pPr>
               <w:jc w:val="left"/>
@@ -17559,7 +17600,9 @@
           </w:p>
         </w:tc>
         <w:tc>
-          <w:tcPr/>
+          <w:tcPr>
+            <w:shd w:val="clear" w:color="auto" w:fill="F6F8FA"/>
+          </w:tcPr>
           <w:p>
             <w:pPr>
               <w:jc w:val="left"/>
@@ -17570,12 +17613,14 @@
           </w:p>
         </w:tc>
         <w:tc>
-          <w:tcPr/>
+          <w:tcPr>
+            <w:shd w:val="clear" w:color="auto" w:fill="F6F8FA"/>
+          </w:tcPr>
           <w:p>
             <w:pPr>
               <w:numPr>
                 <w:ilvl w:val="0"/>
-                <w:numId w:val="1108"/>
+                <w:numId w:val="1109"/>
               </w:numPr>
               <w:jc w:val="left"/>
             </w:pPr>
@@ -17602,58 +17647,13 @@
       </w:tr>
       <w:tr>
         <w:tc>
-          <w:tcPr>
-            <w:shd w:val="clear" w:color="auto" w:fill="F6F8FA"/>
-          </w:tcPr>
+          <w:tcPr/>
           <w:p>
             <w:pPr>
               <w:jc w:val="left"/>
             </w:pPr>
             <w:r>
               <w:t xml:space="preserve">2.2.2</w:t>
-            </w:r>
-          </w:p>
-        </w:tc>
-        <w:tc>
-          <w:tcPr>
-            <w:shd w:val="clear" w:color="auto" w:fill="F6F8FA"/>
-          </w:tcPr>
-          <w:p>
-            <w:pPr>
-              <w:jc w:val="left"/>
-            </w:pPr>
-            <w:r>
-              <w:t xml:space="preserve">2026-08-08</w:t>
-            </w:r>
-          </w:p>
-        </w:tc>
-        <w:tc>
-          <w:tcPr>
-            <w:shd w:val="clear" w:color="auto" w:fill="F6F8FA"/>
-          </w:tcPr>
-          <w:p>
-            <w:pPr>
-              <w:numPr>
-                <w:ilvl w:val="0"/>
-                <w:numId w:val="1109"/>
-              </w:numPr>
-              <w:jc w:val="left"/>
-            </w:pPr>
-            <w:r>
-              <w:t xml:space="preserve">Fixed chapter reference in prerequisite (Chapter 3 → Chapter 4).</w:t>
-            </w:r>
-          </w:p>
-        </w:tc>
-      </w:tr>
-      <w:tr>
-        <w:tc>
-          <w:tcPr/>
-          <w:p>
-            <w:pPr>
-              <w:jc w:val="left"/>
-            </w:pPr>
-            <w:r>
-              <w:t xml:space="preserve">2.2.1</w:t>
             </w:r>
           </w:p>
         </w:tc>
@@ -17679,7 +17679,7 @@
               <w:jc w:val="left"/>
             </w:pPr>
             <w:r>
-              <w:t xml:space="preserve">Changed table and figure caption labels to black (was Huawei red).</w:t>
+              <w:t xml:space="preserve">Fixed chapter reference in prerequisite (Chapter 3 → Chapter 4).</w:t>
             </w:r>
           </w:p>
         </w:tc>
@@ -17694,7 +17694,7 @@
               <w:jc w:val="left"/>
             </w:pPr>
             <w:r>
-              <w:t xml:space="preserve">2.2.0</w:t>
+              <w:t xml:space="preserve">2.2.1</w:t>
             </w:r>
           </w:p>
         </w:tc>
@@ -17724,13 +17724,7 @@
               <w:jc w:val="left"/>
             </w:pPr>
             <w:r>
-              <w:t xml:space="preserve">Added Huawei-branded table styling: red header bar, alternating row</w:t>
-            </w:r>
-            <w:r>
-              <w:t xml:space="preserve"> </w:t>
-            </w:r>
-            <w:r>
-              <w:t xml:space="preserve">colors, and bordered cells.</w:t>
+              <w:t xml:space="preserve">Changed table and figure caption labels to black (was Huawei red).</w:t>
             </w:r>
           </w:p>
         </w:tc>
@@ -17743,18 +17737,18 @@
               <w:jc w:val="left"/>
             </w:pPr>
             <w:r>
-              <w:t xml:space="preserve">2.1.0</w:t>
-            </w:r>
-          </w:p>
-        </w:tc>
-        <w:tc>
-          <w:tcPr/>
-          <w:p>
-            <w:pPr>
-              <w:jc w:val="left"/>
-            </w:pPr>
-            <w:r>
-              <w:t xml:space="preserve">2026-08-06</w:t>
+              <w:t xml:space="preserve">2.2.0</w:t>
+            </w:r>
+          </w:p>
+        </w:tc>
+        <w:tc>
+          <w:tcPr/>
+          <w:p>
+            <w:pPr>
+              <w:jc w:val="left"/>
+            </w:pPr>
+            <w:r>
+              <w:t xml:space="preserve">2026-08-08</w:t>
             </w:r>
           </w:p>
         </w:tc>
@@ -17769,6 +17763,57 @@
               <w:jc w:val="left"/>
             </w:pPr>
             <w:r>
+              <w:t xml:space="preserve">Added Huawei-branded table styling: red header bar, alternating row</w:t>
+            </w:r>
+            <w:r>
+              <w:t xml:space="preserve"> </w:t>
+            </w:r>
+            <w:r>
+              <w:t xml:space="preserve">colors, and bordered cells.</w:t>
+            </w:r>
+          </w:p>
+        </w:tc>
+      </w:tr>
+      <w:tr>
+        <w:tc>
+          <w:tcPr>
+            <w:shd w:val="clear" w:color="auto" w:fill="F6F8FA"/>
+          </w:tcPr>
+          <w:p>
+            <w:pPr>
+              <w:jc w:val="left"/>
+            </w:pPr>
+            <w:r>
+              <w:t xml:space="preserve">2.1.0</w:t>
+            </w:r>
+          </w:p>
+        </w:tc>
+        <w:tc>
+          <w:tcPr>
+            <w:shd w:val="clear" w:color="auto" w:fill="F6F8FA"/>
+          </w:tcPr>
+          <w:p>
+            <w:pPr>
+              <w:jc w:val="left"/>
+            </w:pPr>
+            <w:r>
+              <w:t xml:space="preserve">2026-08-06</w:t>
+            </w:r>
+          </w:p>
+        </w:tc>
+        <w:tc>
+          <w:tcPr>
+            <w:shd w:val="clear" w:color="auto" w:fill="F6F8FA"/>
+          </w:tcPr>
+          <w:p>
+            <w:pPr>
+              <w:numPr>
+                <w:ilvl w:val="0"/>
+                <w:numId w:val="1113"/>
+              </w:numPr>
+              <w:jc w:val="left"/>
+            </w:pPr>
+            <w:r>
               <w:t xml:space="preserve">Updated ECS flavor to</w:t>
             </w:r>
             <w:r>
@@ -17791,7 +17836,7 @@
             <w:pPr>
               <w:numPr>
                 <w:ilvl w:val="0"/>
-                <w:numId w:val="1112"/>
+                <w:numId w:val="1113"/>
               </w:numPr>
               <w:jc w:val="left"/>
             </w:pPr>
@@ -17803,7 +17848,7 @@
             <w:pPr>
               <w:numPr>
                 <w:ilvl w:val="0"/>
-                <w:numId w:val="1112"/>
+                <w:numId w:val="1113"/>
               </w:numPr>
               <w:jc w:val="left"/>
             </w:pPr>
@@ -17815,7 +17860,7 @@
             <w:pPr>
               <w:numPr>
                 <w:ilvl w:val="0"/>
-                <w:numId w:val="1112"/>
+                <w:numId w:val="1113"/>
               </w:numPr>
               <w:jc w:val="left"/>
             </w:pPr>
@@ -17827,7 +17872,7 @@
             <w:pPr>
               <w:numPr>
                 <w:ilvl w:val="0"/>
-                <w:numId w:val="1112"/>
+                <w:numId w:val="1113"/>
               </w:numPr>
               <w:jc w:val="left"/>
             </w:pPr>
@@ -17839,7 +17884,7 @@
             <w:pPr>
               <w:numPr>
                 <w:ilvl w:val="0"/>
-                <w:numId w:val="1112"/>
+                <w:numId w:val="1113"/>
               </w:numPr>
               <w:jc w:val="left"/>
             </w:pPr>
@@ -17857,7 +17902,7 @@
             <w:pPr>
               <w:numPr>
                 <w:ilvl w:val="0"/>
-                <w:numId w:val="1112"/>
+                <w:numId w:val="1113"/>
               </w:numPr>
               <w:jc w:val="left"/>
             </w:pPr>
@@ -17906,7 +17951,7 @@
             <w:pPr>
               <w:numPr>
                 <w:ilvl w:val="0"/>
-                <w:numId w:val="1112"/>
+                <w:numId w:val="1113"/>
               </w:numPr>
               <w:jc w:val="left"/>
             </w:pPr>
@@ -17918,7 +17963,7 @@
             <w:pPr>
               <w:numPr>
                 <w:ilvl w:val="0"/>
-                <w:numId w:val="1112"/>
+                <w:numId w:val="1113"/>
               </w:numPr>
               <w:jc w:val="left"/>
             </w:pPr>
@@ -17969,7 +18014,7 @@
             <w:pPr>
               <w:numPr>
                 <w:ilvl w:val="0"/>
-                <w:numId w:val="1112"/>
+                <w:numId w:val="1113"/>
               </w:numPr>
               <w:jc w:val="left"/>
             </w:pPr>
@@ -17996,9 +18041,7 @@
       </w:tr>
       <w:tr>
         <w:tc>
-          <w:tcPr>
-            <w:shd w:val="clear" w:color="auto" w:fill="F6F8FA"/>
-          </w:tcPr>
+          <w:tcPr/>
           <w:p>
             <w:pPr>
               <w:jc w:val="left"/>
@@ -18009,9 +18052,7 @@
           </w:p>
         </w:tc>
         <w:tc>
-          <w:tcPr>
-            <w:shd w:val="clear" w:color="auto" w:fill="F6F8FA"/>
-          </w:tcPr>
+          <w:tcPr/>
           <w:p>
             <w:pPr>
               <w:jc w:val="left"/>
@@ -18022,14 +18063,12 @@
           </w:p>
         </w:tc>
         <w:tc>
-          <w:tcPr>
-            <w:shd w:val="clear" w:color="auto" w:fill="F6F8FA"/>
-          </w:tcPr>
+          <w:tcPr/>
           <w:p>
             <w:pPr>
               <w:numPr>
                 <w:ilvl w:val="0"/>
-                <w:numId w:val="1113"/>
+                <w:numId w:val="1114"/>
               </w:numPr>
               <w:jc w:val="left"/>
             </w:pPr>
@@ -18047,7 +18086,7 @@
             <w:pPr>
               <w:numPr>
                 <w:ilvl w:val="0"/>
-                <w:numId w:val="1113"/>
+                <w:numId w:val="1114"/>
               </w:numPr>
               <w:jc w:val="left"/>
             </w:pPr>
@@ -18101,7 +18140,7 @@
             <w:pPr>
               <w:numPr>
                 <w:ilvl w:val="0"/>
-                <w:numId w:val="1113"/>
+                <w:numId w:val="1114"/>
               </w:numPr>
               <w:jc w:val="left"/>
             </w:pPr>
@@ -18149,7 +18188,7 @@
             <w:pPr>
               <w:numPr>
                 <w:ilvl w:val="0"/>
-                <w:numId w:val="1113"/>
+                <w:numId w:val="1114"/>
               </w:numPr>
               <w:jc w:val="left"/>
             </w:pPr>
@@ -18170,7 +18209,9 @@
       </w:tr>
       <w:tr>
         <w:tc>
-          <w:tcPr/>
+          <w:tcPr>
+            <w:shd w:val="clear" w:color="auto" w:fill="F6F8FA"/>
+          </w:tcPr>
           <w:p>
             <w:pPr>
               <w:jc w:val="left"/>
@@ -18181,7 +18222,9 @@
           </w:p>
         </w:tc>
         <w:tc>
-          <w:tcPr/>
+          <w:tcPr>
+            <w:shd w:val="clear" w:color="auto" w:fill="F6F8FA"/>
+          </w:tcPr>
           <w:p>
             <w:pPr>
               <w:jc w:val="left"/>
@@ -18192,12 +18235,14 @@
           </w:p>
         </w:tc>
         <w:tc>
-          <w:tcPr/>
+          <w:tcPr>
+            <w:shd w:val="clear" w:color="auto" w:fill="F6F8FA"/>
+          </w:tcPr>
           <w:p>
             <w:pPr>
               <w:numPr>
                 <w:ilvl w:val="0"/>
-                <w:numId w:val="1114"/>
+                <w:numId w:val="1115"/>
               </w:numPr>
               <w:jc w:val="left"/>
             </w:pPr>
@@ -18209,7 +18254,7 @@
             <w:pPr>
               <w:numPr>
                 <w:ilvl w:val="0"/>
-                <w:numId w:val="1114"/>
+                <w:numId w:val="1115"/>
               </w:numPr>
               <w:jc w:val="left"/>
             </w:pPr>
@@ -18221,7 +18266,7 @@
             <w:pPr>
               <w:numPr>
                 <w:ilvl w:val="0"/>
-                <w:numId w:val="1114"/>
+                <w:numId w:val="1115"/>
               </w:numPr>
               <w:jc w:val="left"/>
             </w:pPr>
@@ -18233,7 +18278,7 @@
             <w:pPr>
               <w:numPr>
                 <w:ilvl w:val="0"/>
-                <w:numId w:val="1114"/>
+                <w:numId w:val="1115"/>
               </w:numPr>
               <w:jc w:val="left"/>
             </w:pPr>
@@ -18251,7 +18296,7 @@
             <w:pPr>
               <w:numPr>
                 <w:ilvl w:val="0"/>
-                <w:numId w:val="1114"/>
+                <w:numId w:val="1115"/>
               </w:numPr>
               <w:jc w:val="left"/>
             </w:pPr>
@@ -18263,7 +18308,7 @@
             <w:pPr>
               <w:numPr>
                 <w:ilvl w:val="0"/>
-                <w:numId w:val="1114"/>
+                <w:numId w:val="1115"/>
               </w:numPr>
               <w:jc w:val="left"/>
             </w:pPr>
@@ -19650,6 +19695,9 @@
     <w:abstractNumId w:val="991"/>
   </w:num>
   <w:num w:numId="1114">
+    <w:abstractNumId w:val="991"/>
+  </w:num>
+  <w:num w:numId="1115">
     <w:abstractNumId w:val="991"/>
   </w:num>
 </w:numbering>

</xml_diff>

<commit_message>
Match PDF TOC styling in DOCX; use Huawei red TOC rule (v6.9.0)
- PDF TOC title rule changed from black (ruleblack) to Huawei red
  (huaweired), matching the H1 heading red rules for brand consistency
- DOCX TOC entries now match PDF: TOC1 bold 12pt, TOC2/TOC3 normal 10pt,
  all HarmonyOS Sans font
- DOCX TOC depth increased from 2 to 3 levels (matching PDF tocdepth=3)
- DOCX TOC heading border changed from black to Huawei red (C7000B)
- Dead TOCTitle style removed from DOCX
- Bump all templates + setup-guide to v6.9.0; regenerate artifacts
</commit_message>
<xml_diff>
--- a/documents/setup-guide/setup-guide.docx
+++ b/documents/setup-guide/setup-guide.docx
@@ -84,7 +84,7 @@
           <w:b/>
           <w:sz w:val="24"/>
         </w:rPr>
-        <w:t xml:space="preserve">v6.8.3</w:t>
+        <w:t xml:space="preserve">v6.9.0</w:t>
       </w:r>
       <w:r>
         <w:rPr>
@@ -96,7 +96,7 @@
         <w:rPr>
           <w:sz w:val="24"/>
         </w:rPr>
-        <w:t xml:space="preserve">— September 20, 2026 20:57</w:t>
+        <w:t xml:space="preserve">— September 20, 2026 21:25</w:t>
       </w:r>
     </w:p>
     <w:sdt>
@@ -118,7 +118,7 @@
         <w:p>
           <w:r>
             <w:fldChar w:fldCharType="begin" w:dirty="true"/>
-            <w:instrText xml:space="preserve">TOC \o "1-2" \h \z \u</w:instrText>
+            <w:instrText xml:space="preserve">TOC \o "1-3" \h \z \u</w:instrText>
             <w:fldChar w:fldCharType="separate"/>
             <w:fldChar w:fldCharType="end"/>
           </w:r>
@@ -13345,18 +13345,18 @@
               <w:jc w:val="left"/>
             </w:pPr>
             <w:r>
-              <w:t xml:space="preserve">6.8.3</w:t>
-            </w:r>
-          </w:p>
-        </w:tc>
-        <w:tc>
-          <w:tcPr/>
-          <w:p>
-            <w:pPr>
-              <w:jc w:val="left"/>
-            </w:pPr>
-            <w:r>
-              <w:t xml:space="preserve">2026-09-20</w:t>
+              <w:t xml:space="preserve">6.9.0</w:t>
+            </w:r>
+          </w:p>
+        </w:tc>
+        <w:tc>
+          <w:tcPr/>
+          <w:p>
+            <w:pPr>
+              <w:jc w:val="left"/>
+            </w:pPr>
+            <w:r>
+              <w:t xml:space="preserve">2026-09-21</w:t>
             </w:r>
           </w:p>
         </w:tc>
@@ -13371,7 +13371,7 @@
               <w:jc w:val="left"/>
             </w:pPr>
             <w:r>
-              <w:t xml:space="preserve">Docs accuracy fix: the multi-format pipeline descriptions in README, AGENTS, and all four SKILL.md files now correctly separate the DOCX/Markdown path (pre-processor then docbook then pandoc) from the HTML path (pre-processor then asciidoctor html5) — the previous wording implied HTML also went through docbook and pandoc. Corrected a stale comment in the DOCX fixer.</w:t>
+              <w:t xml:space="preserve">TOC styling: the table-of-contents title rule is now Huawei red (was black) in both PDF and DOCX, matching the H1 heading red rules. DOCX TOC entries now match the PDF: level 1 bold 12pt, levels 2-3 normal 10pt, HarmonyOS Sans font. DOCX TOC depth increased from 2 to 3 levels (matching PDF tocdepth). Dead TOCTitle style removed from DOCX.</w:t>
             </w:r>
           </w:p>
         </w:tc>
@@ -13386,7 +13386,7 @@
               <w:jc w:val="left"/>
             </w:pPr>
             <w:r>
-              <w:t xml:space="preserve">6.8.2</w:t>
+              <w:t xml:space="preserve">6.8.3</w:t>
             </w:r>
           </w:p>
         </w:tc>
@@ -13416,7 +13416,7 @@
               <w:jc w:val="left"/>
             </w:pPr>
             <w:r>
-              <w:t xml:space="preserve">Documentation and cleanup: README, AGENTS, and all four SKILL.md files now describe the real multi-format pipeline (pre-processor + docx_fix --fix + --lang flag) instead of the pre-v6.4 asciidoctor-to-pandoc chain. DOCX TOC title is now right-aligned like the PDF (was targeting a dead style). Signature names render bold like the PDF. Dead code removed (unused Caption style, dead TOCTitle style, dead HTML badge CSS). The --template and --lang flags accept the equals form (--template=guide). Various stale comments corrected.</w:t>
+              <w:t xml:space="preserve">Docs accuracy fix: the multi-format pipeline descriptions in README, AGENTS, and all four SKILL.md files now correctly separate the DOCX/Markdown path (pre-processor then docbook then pandoc) from the HTML path (pre-processor then asciidoctor html5) — the previous wording implied HTML also went through docbook and pandoc. Corrected a stale comment in the DOCX fixer.</w:t>
             </w:r>
           </w:p>
         </w:tc>
@@ -13429,7 +13429,7 @@
               <w:jc w:val="left"/>
             </w:pPr>
             <w:r>
-              <w:t xml:space="preserve">6.8.1</w:t>
+              <w:t xml:space="preserve">6.8.2</w:t>
             </w:r>
           </w:p>
         </w:tc>
@@ -13455,7 +13455,7 @@
               <w:jc w:val="left"/>
             </w:pPr>
             <w:r>
-              <w:t xml:space="preserve">Quality-pass fixes for v6.8.0: non-technical covers no longer show a stray Date paragraph (regression from the meta-scan change); the technical cover table is no longer hijacked from the body when :nochangelog: is set (boundary check on the cover-table detection); the Version/Date/Scenario table now renders unconditionally like the PDF (was gated by :nochangelog:); empty cover tables are skipped when no report values are set; corrected the cover-element-order wording in the v6.8.0 changelog.</w:t>
+              <w:t xml:space="preserve">Documentation and cleanup: README, AGENTS, and all four SKILL.md files now describe the real multi-format pipeline (pre-processor + docx_fix --fix + --lang flag) instead of the pre-v6.4 asciidoctor-to-pandoc chain. DOCX TOC title is now right-aligned like the PDF (was targeting a dead style). Signature names render bold like the PDF. Dead code removed (unused Caption style, dead TOCTitle style, dead HTML badge CSS). The --template and --lang flags accept the equals form (--template=guide). Various stale comments corrected.</w:t>
             </w:r>
           </w:p>
         </w:tc>
@@ -13470,7 +13470,7 @@
               <w:jc w:val="left"/>
             </w:pPr>
             <w:r>
-              <w:t xml:space="preserve">6.8.0</w:t>
+              <w:t xml:space="preserve">6.8.1</w:t>
             </w:r>
           </w:p>
         </w:tc>
@@ -13500,7 +13500,7 @@
               <w:jc w:val="left"/>
             </w:pPr>
             <w:r>
-              <w:t xml:space="preserve">Technical report covers now match the PDF in DOCX/MD/HTML: the title uses the PDF’s 24pt size (was 36pt), the report type label appears below the title (the DOCX cover keeps the established title-first order; the PDF has label-then-title), and the Version/Date/Scenario table is rendered with the PDF’s red label column. The cover meta line now shows the report version and its set date (was the document version and the build date). Authors, when set, appear as a table row like the PDF.</w:t>
+              <w:t xml:space="preserve">Quality-pass fixes for v6.8.0: non-technical covers no longer show a stray Date paragraph (regression from the meta-scan change); the technical cover table is no longer hijacked from the body when :nochangelog: is set (boundary check on the cover-table detection); the Version/Date/Scenario table now renders unconditionally like the PDF (was gated by :nochangelog:); empty cover tables are skipped when no report values are set; corrected the cover-element-order wording in the v6.8.0 changelog.</w:t>
             </w:r>
           </w:p>
         </w:tc>
@@ -13513,7 +13513,7 @@
               <w:jc w:val="left"/>
             </w:pPr>
             <w:r>
-              <w:t xml:space="preserve">6.7.0</w:t>
+              <w:t xml:space="preserve">6.8.0</w:t>
             </w:r>
           </w:p>
         </w:tc>
@@ -13539,7 +13539,7 @@
               <w:jc w:val="left"/>
             </w:pPr>
             <w:r>
-              <w:t xml:space="preserve">Badge and language fidelity: DOCX badge pills now render black text like the PDF (was frame-colored), use the correct label case (Pass, not PASS), include the Portuguese POC labels (Atendido, Parcial, Falha, Ignorado), and render at native width per template (testbook badge text no longer shrinks). Portuguese signature greetings now match the PDF (At.te,), the POC classification label matches the full PDF wording, and the secondary-format table headers (stakeholders, closing record, test summary, changelog) are now language-aware. DOCX footers show Página in Portuguese documents. Cover dates no longer zero-pad the day.</w:t>
+              <w:t xml:space="preserve">Technical report covers now match the PDF in DOCX/MD/HTML: the title uses the PDF’s 24pt size (was 36pt), the report type label appears below the title (the DOCX cover keeps the established title-first order; the PDF has label-then-title), and the Version/Date/Scenario table is rendered with the PDF’s red label column. The cover meta line now shows the report version and its set date (was the document version and the build date). Authors, when set, appear as a table row like the PDF.</w:t>
             </w:r>
           </w:p>
         </w:tc>
@@ -13554,7 +13554,7 @@
               <w:jc w:val="left"/>
             </w:pPr>
             <w:r>
-              <w:t xml:space="preserve">6.6.1</w:t>
+              <w:t xml:space="preserve">6.7.0</w:t>
             </w:r>
           </w:p>
         </w:tc>
@@ -13584,7 +13584,7 @@
               <w:jc w:val="left"/>
             </w:pPr>
             <w:r>
-              <w:t xml:space="preserve">Quality-pass fixes for v6.6.0: the TESTCASE-marker strip now covers the entire DOCX fix run (a failure at any stage can no longer leave markers in the output file); the fixer resets its template state between in-process runs (the documented path-sniffing fallback works again); build.sh also cleans temporary files on interrupt signals; fixed a CHANGELOG typo.</w:t>
+              <w:t xml:space="preserve">Badge and language fidelity: DOCX badge pills now render black text like the PDF (was frame-colored), use the correct label case (Pass, not PASS), include the Portuguese POC labels (Atendido, Parcial, Falha, Ignorado), and render at native width per template (testbook badge text no longer shrinks). Portuguese signature greetings now match the PDF (At.te,), the POC classification label matches the full PDF wording, and the secondary-format table headers (stakeholders, closing record, test summary, changelog) are now language-aware. DOCX footers show Página in Portuguese documents. Cover dates no longer zero-pad the day.</w:t>
             </w:r>
           </w:p>
         </w:tc>
@@ -13597,7 +13597,7 @@
               <w:jc w:val="left"/>
             </w:pPr>
             <w:r>
-              <w:t xml:space="preserve">6.6.0</w:t>
+              <w:t xml:space="preserve">6.6.1</w:t>
             </w:r>
           </w:p>
         </w:tc>
@@ -13623,6 +13623,51 @@
               <w:jc w:val="left"/>
             </w:pPr>
             <w:r>
+              <w:t xml:space="preserve">Quality-pass fixes for v6.6.0: the TESTCASE-marker strip now covers the entire DOCX fix run (a failure at any stage can no longer leave markers in the output file); the fixer resets its template state between in-process runs (the documented path-sniffing fallback works again); build.sh also cleans temporary files on interrupt signals; fixed a CHANGELOG typo.</w:t>
+            </w:r>
+          </w:p>
+        </w:tc>
+      </w:tr>
+      <w:tr>
+        <w:tc>
+          <w:tcPr>
+            <w:shd w:val="clear" w:color="auto" w:fill="F6F8FA"/>
+          </w:tcPr>
+          <w:p>
+            <w:pPr>
+              <w:jc w:val="left"/>
+            </w:pPr>
+            <w:r>
+              <w:t xml:space="preserve">6.6.0</w:t>
+            </w:r>
+          </w:p>
+        </w:tc>
+        <w:tc>
+          <w:tcPr>
+            <w:shd w:val="clear" w:color="auto" w:fill="F6F8FA"/>
+          </w:tcPr>
+          <w:p>
+            <w:pPr>
+              <w:jc w:val="left"/>
+            </w:pPr>
+            <w:r>
+              <w:t xml:space="preserve">2026-09-20</w:t>
+            </w:r>
+          </w:p>
+        </w:tc>
+        <w:tc>
+          <w:tcPr>
+            <w:shd w:val="clear" w:color="auto" w:fill="F6F8FA"/>
+          </w:tcPr>
+          <w:p>
+            <w:pPr>
+              <w:numPr>
+                <w:ilvl w:val="0"/>
+                <w:numId w:val="1049"/>
+              </w:numPr>
+              <w:jc w:val="left"/>
+            </w:pPr>
+            <w:r>
               <w:t xml:space="preserve">Pipeline robustness: DOCX post-processing now fails loudly when content styling errors occur (TESTCASE markers can no longer leak into output); the DOCX fixer takes an explicit</w:t>
             </w:r>
             <w:r>
@@ -13645,58 +13690,13 @@
       </w:tr>
       <w:tr>
         <w:tc>
-          <w:tcPr>
-            <w:shd w:val="clear" w:color="auto" w:fill="F6F8FA"/>
-          </w:tcPr>
+          <w:tcPr/>
           <w:p>
             <w:pPr>
               <w:jc w:val="left"/>
             </w:pPr>
             <w:r>
               <w:t xml:space="preserve">6.5.2</w:t>
-            </w:r>
-          </w:p>
-        </w:tc>
-        <w:tc>
-          <w:tcPr>
-            <w:shd w:val="clear" w:color="auto" w:fill="F6F8FA"/>
-          </w:tcPr>
-          <w:p>
-            <w:pPr>
-              <w:jc w:val="left"/>
-            </w:pPr>
-            <w:r>
-              <w:t xml:space="preserve">2026-09-20</w:t>
-            </w:r>
-          </w:p>
-        </w:tc>
-        <w:tc>
-          <w:tcPr>
-            <w:shd w:val="clear" w:color="auto" w:fill="F6F8FA"/>
-          </w:tcPr>
-          <w:p>
-            <w:pPr>
-              <w:numPr>
-                <w:ilvl w:val="0"/>
-                <w:numId w:val="1049"/>
-              </w:numPr>
-              <w:jc w:val="left"/>
-            </w:pPr>
-            <w:r>
-              <w:t xml:space="preserve">Quality-pass fixes for v6.5.1: LaTeX quote conversion now handles only paired quotes (quote characters inside code arguments are no longer corrupted); signature cells containing escaped ampersands are no longer split; round-trip HTML generation guards the asciidoctor-diagram dependency and fails loudly when generation fails; pre-processor unit tests now cover pipe escaping in all five table handlers.</w:t>
-            </w:r>
-          </w:p>
-        </w:tc>
-      </w:tr>
-      <w:tr>
-        <w:tc>
-          <w:tcPr/>
-          <w:p>
-            <w:pPr>
-              <w:jc w:val="left"/>
-            </w:pPr>
-            <w:r>
-              <w:t xml:space="preserve">6.5.1</w:t>
             </w:r>
           </w:p>
         </w:tc>
@@ -13722,7 +13722,7 @@
               <w:jc w:val="left"/>
             </w:pPr>
             <w:r>
-              <w:t xml:space="preserve">Fixed DOCX/MD/HTML output: tables are no longer corrupted when changelog, signature, or summary content contains a pipe character (“|”). Badge text is now preserved in DOCX/MD/HTML — a “Ready” badge renders “Ready” instead of “[NEW]”. Multi-item changelog entries render as bullet lists instead of being joined with a literal “+”. POC documents now include the changelog in DOCX/MD/HTML. The :noanswers: attribute now hides test results and remarks in DOCX/MD/HTML, matching the PDF. Inline LaTeX (monospace text, arrows, LaTeX quotes) no longer leaks from changelog entries. The test suite now exercises the real build pipeline (pre-processor wired into round-trip and DOCX tests), with new pre-processor unit tests.</w:t>
+              <w:t xml:space="preserve">Quality-pass fixes for v6.5.1: LaTeX quote conversion now handles only paired quotes (quote characters inside code arguments are no longer corrupted); signature cells containing escaped ampersands are no longer split; round-trip HTML generation guards the asciidoctor-diagram dependency and fails loudly when generation fails; pre-processor unit tests now cover pipe escaping in all five table handlers.</w:t>
             </w:r>
           </w:p>
         </w:tc>
@@ -13737,7 +13737,7 @@
               <w:jc w:val="left"/>
             </w:pPr>
             <w:r>
-              <w:t xml:space="preserve">6.5.0</w:t>
+              <w:t xml:space="preserve">6.5.1</w:t>
             </w:r>
           </w:p>
         </w:tc>
@@ -13767,7 +13767,7 @@
               <w:jc w:val="left"/>
             </w:pPr>
             <w:r>
-              <w:t xml:space="preserve">Evidence checklist simplified to plain bullets in both PDF and DOCX (checkbox markers removed for compatibility). Planned Activities list in DOCX now uses Word’s native lower-roman numbering (i., ii., iii.) matching the PDF. Badges in DOCX replaced with exact-replica PNG pill images (rounded, colored frame and background, bold text) matching the PDF \ huaweibadge look — assets committed to the repo. Signature blocks in DOCX no longer show literal + symbols (proper hard line breaks).</w:t>
+              <w:t xml:space="preserve">Fixed DOCX/MD/HTML output: tables are no longer corrupted when changelog, signature, or summary content contains a pipe character (“|”). Badge text is now preserved in DOCX/MD/HTML — a “Ready” badge renders “Ready” instead of “[NEW]”. Multi-item changelog entries render as bullet lists instead of being joined with a literal “+”. POC documents now include the changelog in DOCX/MD/HTML. The :noanswers: attribute now hides test results and remarks in DOCX/MD/HTML, matching the PDF. Inline LaTeX (monospace text, arrows, LaTeX quotes) no longer leaks from changelog entries. The test suite now exercises the real build pipeline (pre-processor wired into round-trip and DOCX tests), with new pre-processor unit tests.</w:t>
             </w:r>
           </w:p>
         </w:tc>
@@ -13780,7 +13780,7 @@
               <w:jc w:val="left"/>
             </w:pPr>
             <w:r>
-              <w:t xml:space="preserve">6.4.7</w:t>
+              <w:t xml:space="preserve">6.5.0</w:t>
             </w:r>
           </w:p>
         </w:tc>
@@ -13806,7 +13806,7 @@
               <w:jc w:val="left"/>
             </w:pPr>
             <w:r>
-              <w:t xml:space="preserve">Section titles in DOCX now match the PDF heading design: the big section number (56pt) sits on the left, the title text is pushed to the right edge (a right tab stop mimics the LaTeX \ hfill), and the red rule runs below — previously the title sat left-aligned next to a small number. Applies to all templates.</w:t>
+              <w:t xml:space="preserve">Evidence checklist simplified to plain bullets in both PDF and DOCX (checkbox markers removed for compatibility). Planned Activities list in DOCX now uses Word’s native lower-roman numbering (i., ii., iii.) matching the PDF. Badges in DOCX replaced with exact-replica PNG pill images (rounded, colored frame and background, bold text) matching the PDF \ huaweibadge look — assets committed to the repo. Signature blocks in DOCX no longer show literal + symbols (proper hard line breaks).</w:t>
             </w:r>
           </w:p>
         </w:tc>
@@ -13821,7 +13821,7 @@
               <w:jc w:val="left"/>
             </w:pPr>
             <w:r>
-              <w:t xml:space="preserve">6.4.6</w:t>
+              <w:t xml:space="preserve">6.4.7</w:t>
             </w:r>
           </w:p>
         </w:tc>
@@ -13851,7 +13851,7 @@
               <w:jc w:val="left"/>
             </w:pPr>
             <w:r>
-              <w:t xml:space="preserve">Code blocks inside test cases no longer break the red left rule in DOCX — the code style’s left indent (which jogged the rule) is reset inside test case blocks, and code blocks now show the PDF’s code box (gray background with thin border on top, bottom, and right, red rule continuing on the left).</w:t>
+              <w:t xml:space="preserve">Section titles in DOCX now match the PDF heading design: the big section number (56pt) sits on the left, the title text is pushed to the right edge (a right tab stop mimics the LaTeX \ hfill), and the red rule runs below — previously the title sat left-aligned next to a small number. Applies to all templates.</w:t>
             </w:r>
           </w:p>
         </w:tc>
@@ -13864,7 +13864,7 @@
               <w:jc w:val="left"/>
             </w:pPr>
             <w:r>
-              <w:t xml:space="preserve">6.4.5</w:t>
+              <w:t xml:space="preserve">6.4.6</w:t>
             </w:r>
           </w:p>
         </w:tc>
@@ -13890,7 +13890,7 @@
               <w:jc w:val="left"/>
             </w:pPr>
             <w:r>
-              <w:t xml:space="preserve">DOCX polish pass: all captions centered (matching the PDF), vertical spacing between blocks matched to the LaTeX rhythm (medskip/smallskip around captions, field bars, and steps), and test steps now render as separate paragraphs each with the red bold number (previously merged into one paragraph).</w:t>
+              <w:t xml:space="preserve">Code blocks inside test cases no longer break the red left rule in DOCX — the code style’s left indent (which jogged the rule) is reset inside test case blocks, and code blocks now show the PDF’s code box (gray background with thin border on top, bottom, and right, red rule continuing on the left).</w:t>
             </w:r>
           </w:p>
         </w:tc>
@@ -13905,7 +13905,7 @@
               <w:jc w:val="left"/>
             </w:pPr>
             <w:r>
-              <w:t xml:space="preserve">6.4.4</w:t>
+              <w:t xml:space="preserve">6.4.5</w:t>
             </w:r>
           </w:p>
         </w:tc>
@@ -13935,7 +13935,7 @@
               <w:jc w:val="left"/>
             </w:pPr>
             <w:r>
-              <w:t xml:space="preserve">DOCX covers now show the logo, cover text, and version/date/time meta line like the PDF. Test case blocks in DOCX get the PDF’s visual wrapper: red left rule, red field header bars, and red step numbers. Captions follow the PDF ordering system in DOCX, MD, and HTML (Table/Diagram/Figure/Testcase N: with bold symbol). Portuguese PDFs now label diagrams "Diagrama N:" (was hardcoded English "Diagram"). Markdown and HTML output no longer leaks raw LaTeX from passthrough blocks — the DOCX pre-processor now feeds those pipelines too.</w:t>
+              <w:t xml:space="preserve">DOCX polish pass: all captions centered (matching the PDF), vertical spacing between blocks matched to the LaTeX rhythm (medskip/smallskip around captions, field bars, and steps), and test steps now render as separate paragraphs each with the red bold number (previously merged into one paragraph).</w:t>
             </w:r>
           </w:p>
         </w:tc>
@@ -13948,7 +13948,7 @@
               <w:jc w:val="left"/>
             </w:pPr>
             <w:r>
-              <w:t xml:space="preserve">6.4.3</w:t>
+              <w:t xml:space="preserve">6.4.4</w:t>
             </w:r>
           </w:p>
         </w:tc>
@@ -13974,7 +13974,7 @@
               <w:jc w:val="left"/>
             </w:pPr>
             <w:r>
-              <w:t xml:space="preserve">Testbook and POC DOCX output now matches the PDF much more closely: native table of contents (language-aware, auto-populated), each section starts on a new page, embedded images and diagrams (PlantUML/Graphviz rendered), white-on-red table headers, cover version line under the title, centered test case captions, and plain black rules for signature grids.</w:t>
+              <w:t xml:space="preserve">DOCX covers now show the logo, cover text, and version/date/time meta line like the PDF. Test case blocks in DOCX get the PDF’s visual wrapper: red left rule, red field header bars, and red step numbers. Captions follow the PDF ordering system in DOCX, MD, and HTML (Table/Diagram/Figure/Testcase N: with bold symbol). Portuguese PDFs now label diagrams "Diagrama N:" (was hardcoded English "Diagram"). Markdown and HTML output no longer leaks raw LaTeX from passthrough blocks — the DOCX pre-processor now feeds those pipelines too.</w:t>
             </w:r>
           </w:p>
         </w:tc>
@@ -13989,7 +13989,7 @@
               <w:jc w:val="left"/>
             </w:pPr>
             <w:r>
-              <w:t xml:space="preserve">6.4.2</w:t>
+              <w:t xml:space="preserve">6.4.3</w:t>
             </w:r>
           </w:p>
         </w:tc>
@@ -14019,7 +14019,7 @@
               <w:jc w:val="left"/>
             </w:pPr>
             <w:r>
-              <w:t xml:space="preserve">DOCX output for POC and testbook templates now includes all passthrough content (stakeholders, closing record, signatures, test cases, test summary, changelog) via a new pre-processor. Fixed dropped Test Scope fields in testbook DOCX output.</w:t>
+              <w:t xml:space="preserve">Testbook and POC DOCX output now matches the PDF much more closely: native table of contents (language-aware, auto-populated), each section starts on a new page, embedded images and diagrams (PlantUML/Graphviz rendered), white-on-red table headers, cover version line under the title, centered test case captions, and plain black rules for signature grids.</w:t>
             </w:r>
           </w:p>
         </w:tc>
@@ -14032,7 +14032,7 @@
               <w:jc w:val="left"/>
             </w:pPr>
             <w:r>
-              <w:t xml:space="preserve">6.4.0</w:t>
+              <w:t xml:space="preserve">6.4.2</w:t>
             </w:r>
           </w:p>
         </w:tc>
@@ -14058,6 +14058,51 @@
               <w:jc w:val="left"/>
             </w:pPr>
             <w:r>
+              <w:t xml:space="preserve">DOCX output for POC and testbook templates now includes all passthrough content (stakeholders, closing record, signatures, test cases, test summary, changelog) via a new pre-processor. Fixed dropped Test Scope fields in testbook DOCX output.</w:t>
+            </w:r>
+          </w:p>
+        </w:tc>
+      </w:tr>
+      <w:tr>
+        <w:tc>
+          <w:tcPr>
+            <w:shd w:val="clear" w:color="auto" w:fill="F6F8FA"/>
+          </w:tcPr>
+          <w:p>
+            <w:pPr>
+              <w:jc w:val="left"/>
+            </w:pPr>
+            <w:r>
+              <w:t xml:space="preserve">6.4.0</w:t>
+            </w:r>
+          </w:p>
+        </w:tc>
+        <w:tc>
+          <w:tcPr>
+            <w:shd w:val="clear" w:color="auto" w:fill="F6F8FA"/>
+          </w:tcPr>
+          <w:p>
+            <w:pPr>
+              <w:jc w:val="left"/>
+            </w:pPr>
+            <w:r>
+              <w:t xml:space="preserve">2026-09-20</w:t>
+            </w:r>
+          </w:p>
+        </w:tc>
+        <w:tc>
+          <w:tcPr>
+            <w:shd w:val="clear" w:color="auto" w:fill="F6F8FA"/>
+          </w:tcPr>
+          <w:p>
+            <w:pPr>
+              <w:numPr>
+                <w:ilvl w:val="0"/>
+                <w:numId w:val="1059"/>
+              </w:numPr>
+              <w:jc w:val="left"/>
+            </w:pPr>
+            <w:r>
               <w:t xml:space="preserve">Fixed changelog dates — replaced</w:t>
             </w:r>
             <w:r>
@@ -14080,58 +14125,13 @@
       </w:tr>
       <w:tr>
         <w:tc>
-          <w:tcPr>
-            <w:shd w:val="clear" w:color="auto" w:fill="F6F8FA"/>
-          </w:tcPr>
+          <w:tcPr/>
           <w:p>
             <w:pPr>
               <w:jc w:val="left"/>
             </w:pPr>
             <w:r>
               <w:t xml:space="preserve">5.1.1</w:t>
-            </w:r>
-          </w:p>
-        </w:tc>
-        <w:tc>
-          <w:tcPr>
-            <w:shd w:val="clear" w:color="auto" w:fill="F6F8FA"/>
-          </w:tcPr>
-          <w:p>
-            <w:pPr>
-              <w:jc w:val="left"/>
-            </w:pPr>
-            <w:r>
-              <w:t xml:space="preserve">2026-09-14</w:t>
-            </w:r>
-          </w:p>
-        </w:tc>
-        <w:tc>
-          <w:tcPr>
-            <w:shd w:val="clear" w:color="auto" w:fill="F6F8FA"/>
-          </w:tcPr>
-          <w:p>
-            <w:pPr>
-              <w:numPr>
-                <w:ilvl w:val="0"/>
-                <w:numId w:val="1059"/>
-              </w:numPr>
-              <w:jc w:val="left"/>
-            </w:pPr>
-            <w:r>
-              <w:t xml:space="preserve">Synced callout colors in DOCX/HTML/MD output to match brand palette. Added color palette demo.</w:t>
-            </w:r>
-          </w:p>
-        </w:tc>
-      </w:tr>
-      <w:tr>
-        <w:tc>
-          <w:tcPr/>
-          <w:p>
-            <w:pPr>
-              <w:jc w:val="left"/>
-            </w:pPr>
-            <w:r>
-              <w:t xml:space="preserve">5.1.0</w:t>
             </w:r>
           </w:p>
         </w:tc>
@@ -14157,7 +14157,7 @@
               <w:jc w:val="left"/>
             </w:pPr>
             <w:r>
-              <w:t xml:space="preserve">Adopted brand guidelines auxiliary color palette and monochrome scale. Aligned callout colors to brand specifications.</w:t>
+              <w:t xml:space="preserve">Synced callout colors in DOCX/HTML/MD output to match brand palette. Added color palette demo.</w:t>
             </w:r>
           </w:p>
         </w:tc>
@@ -14172,7 +14172,7 @@
               <w:jc w:val="left"/>
             </w:pPr>
             <w:r>
-              <w:t xml:space="preserve">5.0.3</w:t>
+              <w:t xml:space="preserve">5.1.0</w:t>
             </w:r>
           </w:p>
         </w:tc>
@@ -14202,6 +14202,45 @@
               <w:jc w:val="left"/>
             </w:pPr>
             <w:r>
+              <w:t xml:space="preserve">Adopted brand guidelines auxiliary color palette and monochrome scale. Aligned callout colors to brand specifications.</w:t>
+            </w:r>
+          </w:p>
+        </w:tc>
+      </w:tr>
+      <w:tr>
+        <w:tc>
+          <w:tcPr/>
+          <w:p>
+            <w:pPr>
+              <w:jc w:val="left"/>
+            </w:pPr>
+            <w:r>
+              <w:t xml:space="preserve">5.0.3</w:t>
+            </w:r>
+          </w:p>
+        </w:tc>
+        <w:tc>
+          <w:tcPr/>
+          <w:p>
+            <w:pPr>
+              <w:jc w:val="left"/>
+            </w:pPr>
+            <w:r>
+              <w:t xml:space="preserve">2026-09-14</w:t>
+            </w:r>
+          </w:p>
+        </w:tc>
+        <w:tc>
+          <w:tcPr/>
+          <w:p>
+            <w:pPr>
+              <w:numPr>
+                <w:ilvl w:val="0"/>
+                <w:numId w:val="1062"/>
+              </w:numPr>
+              <w:jc w:val="left"/>
+            </w:pPr>
+            <w:r>
               <w:t xml:space="preserve">Removed non-standard</w:t>
             </w:r>
             <w:r>
@@ -14224,54 +14263,15 @@
       </w:tr>
       <w:tr>
         <w:tc>
-          <w:tcPr/>
+          <w:tcPr>
+            <w:shd w:val="clear" w:color="auto" w:fill="F6F8FA"/>
+          </w:tcPr>
           <w:p>
             <w:pPr>
               <w:jc w:val="left"/>
             </w:pPr>
             <w:r>
               <w:t xml:space="preserve">5.0.2</w:t>
-            </w:r>
-          </w:p>
-        </w:tc>
-        <w:tc>
-          <w:tcPr/>
-          <w:p>
-            <w:pPr>
-              <w:jc w:val="left"/>
-            </w:pPr>
-            <w:r>
-              <w:t xml:space="preserve">2026-09-14</w:t>
-            </w:r>
-          </w:p>
-        </w:tc>
-        <w:tc>
-          <w:tcPr/>
-          <w:p>
-            <w:pPr>
-              <w:numPr>
-                <w:ilvl w:val="0"/>
-                <w:numId w:val="1062"/>
-              </w:numPr>
-              <w:jc w:val="left"/>
-            </w:pPr>
-            <w:r>
-              <w:t xml:space="preserve">Long commands in test steps now render as code blocks instead of inline code.</w:t>
-            </w:r>
-          </w:p>
-        </w:tc>
-      </w:tr>
-      <w:tr>
-        <w:tc>
-          <w:tcPr>
-            <w:shd w:val="clear" w:color="auto" w:fill="F6F8FA"/>
-          </w:tcPr>
-          <w:p>
-            <w:pPr>
-              <w:jc w:val="left"/>
-            </w:pPr>
-            <w:r>
-              <w:t xml:space="preserve">5.0.1</w:t>
             </w:r>
           </w:p>
         </w:tc>
@@ -14301,7 +14301,7 @@
               <w:jc w:val="left"/>
             </w:pPr>
             <w:r>
-              <w:t xml:space="preserve">Testcase caption centered above the block.</w:t>
+              <w:t xml:space="preserve">Long commands in test steps now render as code blocks instead of inline code.</w:t>
             </w:r>
           </w:p>
         </w:tc>
@@ -14314,7 +14314,7 @@
               <w:jc w:val="left"/>
             </w:pPr>
             <w:r>
-              <w:t xml:space="preserve">5.0.0</w:t>
+              <w:t xml:space="preserve">5.0.1</w:t>
             </w:r>
           </w:p>
         </w:tc>
@@ -14340,6 +14340,51 @@
               <w:jc w:val="left"/>
             </w:pPr>
             <w:r>
+              <w:t xml:space="preserve">Testcase caption centered above the block.</w:t>
+            </w:r>
+          </w:p>
+        </w:tc>
+      </w:tr>
+      <w:tr>
+        <w:tc>
+          <w:tcPr>
+            <w:shd w:val="clear" w:color="auto" w:fill="F6F8FA"/>
+          </w:tcPr>
+          <w:p>
+            <w:pPr>
+              <w:jc w:val="left"/>
+            </w:pPr>
+            <w:r>
+              <w:t xml:space="preserve">5.0.0</w:t>
+            </w:r>
+          </w:p>
+        </w:tc>
+        <w:tc>
+          <w:tcPr>
+            <w:shd w:val="clear" w:color="auto" w:fill="F6F8FA"/>
+          </w:tcPr>
+          <w:p>
+            <w:pPr>
+              <w:jc w:val="left"/>
+            </w:pPr>
+            <w:r>
+              <w:t xml:space="preserve">2026-09-14</w:t>
+            </w:r>
+          </w:p>
+        </w:tc>
+        <w:tc>
+          <w:tcPr>
+            <w:shd w:val="clear" w:color="auto" w:fill="F6F8FA"/>
+          </w:tcPr>
+          <w:p>
+            <w:pPr>
+              <w:numPr>
+                <w:ilvl w:val="0"/>
+                <w:numId w:val="1065"/>
+              </w:numPr>
+              <w:jc w:val="left"/>
+            </w:pPr>
+            <w:r>
               <w:t xml:space="preserve">Major refactoring: extracted shared modules (huawei-titles, huawei-toc, huawei-cover), renamed</w:t>
             </w:r>
             <w:r>
@@ -14401,9 +14446,7 @@
       </w:tr>
       <w:tr>
         <w:tc>
-          <w:tcPr>
-            <w:shd w:val="clear" w:color="auto" w:fill="F6F8FA"/>
-          </w:tcPr>
+          <w:tcPr/>
           <w:p>
             <w:pPr>
               <w:jc w:val="left"/>
@@ -14414,56 +14457,13 @@
           </w:p>
         </w:tc>
         <w:tc>
-          <w:tcPr>
-            <w:shd w:val="clear" w:color="auto" w:fill="F6F8FA"/>
-          </w:tcPr>
+          <w:tcPr/>
           <w:p>
             <w:pPr>
               <w:jc w:val="left"/>
             </w:pPr>
             <w:r>
               <w:t xml:space="preserve">2026-09-14</w:t>
-            </w:r>
-          </w:p>
-        </w:tc>
-        <w:tc>
-          <w:tcPr>
-            <w:shd w:val="clear" w:color="auto" w:fill="F6F8FA"/>
-          </w:tcPr>
-          <w:p>
-            <w:pPr>
-              <w:numPr>
-                <w:ilvl w:val="0"/>
-                <w:numId w:val="1065"/>
-              </w:numPr>
-              <w:jc w:val="left"/>
-            </w:pPr>
-            <w:r>
-              <w:t xml:space="preserve">Testcase headings now formatted as captions (like figures/tables): bold “Testcase N:” followed by description. Changed label from “Test Case” to “Testcase”.</w:t>
-            </w:r>
-          </w:p>
-        </w:tc>
-      </w:tr>
-      <w:tr>
-        <w:tc>
-          <w:tcPr/>
-          <w:p>
-            <w:pPr>
-              <w:jc w:val="left"/>
-            </w:pPr>
-            <w:r>
-              <w:t xml:space="preserve">4.6.0</w:t>
-            </w:r>
-          </w:p>
-        </w:tc>
-        <w:tc>
-          <w:tcPr/>
-          <w:p>
-            <w:pPr>
-              <w:jc w:val="left"/>
-            </w:pPr>
-            <w:r>
-              <w:t xml:space="preserve">2026-09-13</w:t>
             </w:r>
           </w:p>
         </w:tc>
@@ -14478,7 +14478,7 @@
               <w:jc w:val="left"/>
             </w:pPr>
             <w:r>
-              <w:t xml:space="preserve">Section restructure: Introduction, Test Cases (with category subsections), Conclusion. Testcases auto-numbered like figures/tables. Changed testcase from subsection to subsubsection.</w:t>
+              <w:t xml:space="preserve">Testcase headings now formatted as captions (like figures/tables): bold “Testcase N:” followed by description. Changed label from “Test Case” to “Testcase”.</w:t>
             </w:r>
           </w:p>
         </w:tc>
@@ -14493,7 +14493,7 @@
               <w:jc w:val="left"/>
             </w:pPr>
             <w:r>
-              <w:t xml:space="preserve">4.5.0</w:t>
+              <w:t xml:space="preserve">4.6.0</w:t>
             </w:r>
           </w:p>
         </w:tc>
@@ -14523,6 +14523,45 @@
               <w:jc w:val="left"/>
             </w:pPr>
             <w:r>
+              <w:t xml:space="preserve">Section restructure: Introduction, Test Cases (with category subsections), Conclusion. Testcases auto-numbered like figures/tables. Changed testcase from subsection to subsubsection.</w:t>
+            </w:r>
+          </w:p>
+        </w:tc>
+      </w:tr>
+      <w:tr>
+        <w:tc>
+          <w:tcPr/>
+          <w:p>
+            <w:pPr>
+              <w:jc w:val="left"/>
+            </w:pPr>
+            <w:r>
+              <w:t xml:space="preserve">4.5.0</w:t>
+            </w:r>
+          </w:p>
+        </w:tc>
+        <w:tc>
+          <w:tcPr/>
+          <w:p>
+            <w:pPr>
+              <w:jc w:val="left"/>
+            </w:pPr>
+            <w:r>
+              <w:t xml:space="preserve">2026-09-13</w:t>
+            </w:r>
+          </w:p>
+        </w:tc>
+        <w:tc>
+          <w:tcPr/>
+          <w:p>
+            <w:pPr>
+              <w:numPr>
+                <w:ilvl w:val="0"/>
+                <w:numId w:val="1068"/>
+              </w:numPr>
+              <w:jc w:val="left"/>
+            </w:pPr>
+            <w:r>
               <w:t xml:space="preserve">Unified field APIs:</w:t>
             </w:r>
             <w:r>
@@ -14587,54 +14626,15 @@
       </w:tr>
       <w:tr>
         <w:tc>
-          <w:tcPr/>
+          <w:tcPr>
+            <w:shd w:val="clear" w:color="auto" w:fill="F6F8FA"/>
+          </w:tcPr>
           <w:p>
             <w:pPr>
               <w:jc w:val="left"/>
             </w:pPr>
             <w:r>
               <w:t xml:space="preserve">4.4.0</w:t>
-            </w:r>
-          </w:p>
-        </w:tc>
-        <w:tc>
-          <w:tcPr/>
-          <w:p>
-            <w:pPr>
-              <w:jc w:val="left"/>
-            </w:pPr>
-            <w:r>
-              <w:t xml:space="preserve">2026-09-13</w:t>
-            </w:r>
-          </w:p>
-        </w:tc>
-        <w:tc>
-          <w:tcPr/>
-          <w:p>
-            <w:pPr>
-              <w:numPr>
-                <w:ilvl w:val="0"/>
-                <w:numId w:val="1068"/>
-              </w:numPr>
-              <w:jc w:val="left"/>
-            </w:pPr>
-            <w:r>
-              <w:t xml:space="preserve">Code review fixes: removed dead labels, badge now uses Huawei brand colors (tipbg/tipfg, huaweired, warningbg/warningfg), Lua filter preserves formatting in DOCX/MD/HTML via parse_latex_blocks, testprocedure handler preserves non-step content (images, code, callouts).</w:t>
-            </w:r>
-          </w:p>
-        </w:tc>
-      </w:tr>
-      <w:tr>
-        <w:tc>
-          <w:tcPr>
-            <w:shd w:val="clear" w:color="auto" w:fill="F6F8FA"/>
-          </w:tcPr>
-          <w:p>
-            <w:pPr>
-              <w:jc w:val="left"/>
-            </w:pPr>
-            <w:r>
-              <w:t xml:space="preserve">4.3.0</w:t>
             </w:r>
           </w:p>
         </w:tc>
@@ -14664,6 +14664,45 @@
               <w:jc w:val="left"/>
             </w:pPr>
             <w:r>
+              <w:t xml:space="preserve">Code review fixes: removed dead labels, badge now uses Huawei brand colors (tipbg/tipfg, huaweired, warningbg/warningfg), Lua filter preserves formatting in DOCX/MD/HTML via parse_latex_blocks, testprocedure handler preserves non-step content (images, code, callouts).</w:t>
+            </w:r>
+          </w:p>
+        </w:tc>
+      </w:tr>
+      <w:tr>
+        <w:tc>
+          <w:tcPr/>
+          <w:p>
+            <w:pPr>
+              <w:jc w:val="left"/>
+            </w:pPr>
+            <w:r>
+              <w:t xml:space="preserve">4.3.0</w:t>
+            </w:r>
+          </w:p>
+        </w:tc>
+        <w:tc>
+          <w:tcPr/>
+          <w:p>
+            <w:pPr>
+              <w:jc w:val="left"/>
+            </w:pPr>
+            <w:r>
+              <w:t xml:space="preserve">2026-09-13</w:t>
+            </w:r>
+          </w:p>
+        </w:tc>
+        <w:tc>
+          <w:tcPr/>
+          <w:p>
+            <w:pPr>
+              <w:numPr>
+                <w:ilvl w:val="0"/>
+                <w:numId w:val="1070"/>
+              </w:numPr>
+              <w:jc w:val="left"/>
+            </w:pPr>
+            <w:r>
               <w:t xml:space="preserve">Added</w:t>
             </w:r>
             <w:r>
@@ -14716,7 +14755,9 @@
       </w:tr>
       <w:tr>
         <w:tc>
-          <w:tcPr/>
+          <w:tcPr>
+            <w:shd w:val="clear" w:color="auto" w:fill="F6F8FA"/>
+          </w:tcPr>
           <w:p>
             <w:pPr>
               <w:jc w:val="left"/>
@@ -14727,7 +14768,9 @@
           </w:p>
         </w:tc>
         <w:tc>
-          <w:tcPr/>
+          <w:tcPr>
+            <w:shd w:val="clear" w:color="auto" w:fill="F6F8FA"/>
+          </w:tcPr>
           <w:p>
             <w:pPr>
               <w:jc w:val="left"/>
@@ -14738,12 +14781,14 @@
           </w:p>
         </w:tc>
         <w:tc>
-          <w:tcPr/>
+          <w:tcPr>
+            <w:shd w:val="clear" w:color="auto" w:fill="F6F8FA"/>
+          </w:tcPr>
           <w:p>
             <w:pPr>
               <w:numPr>
                 <w:ilvl w:val="0"/>
-                <w:numId w:val="1070"/>
+                <w:numId w:val="1071"/>
               </w:numPr>
               <w:jc w:val="left"/>
             </w:pPr>
@@ -14797,9 +14842,7 @@
       </w:tr>
       <w:tr>
         <w:tc>
-          <w:tcPr>
-            <w:shd w:val="clear" w:color="auto" w:fill="F6F8FA"/>
-          </w:tcPr>
+          <w:tcPr/>
           <w:p>
             <w:pPr>
               <w:jc w:val="left"/>
@@ -14810,9 +14853,7 @@
           </w:p>
         </w:tc>
         <w:tc>
-          <w:tcPr>
-            <w:shd w:val="clear" w:color="auto" w:fill="F6F8FA"/>
-          </w:tcPr>
+          <w:tcPr/>
           <w:p>
             <w:pPr>
               <w:jc w:val="left"/>
@@ -14823,14 +14864,12 @@
           </w:p>
         </w:tc>
         <w:tc>
-          <w:tcPr>
-            <w:shd w:val="clear" w:color="auto" w:fill="F6F8FA"/>
-          </w:tcPr>
+          <w:tcPr/>
           <w:p>
             <w:pPr>
               <w:numPr>
                 <w:ilvl w:val="0"/>
-                <w:numId w:val="1071"/>
+                <w:numId w:val="1072"/>
               </w:numPr>
               <w:jc w:val="left"/>
             </w:pPr>
@@ -14857,7 +14896,9 @@
       </w:tr>
       <w:tr>
         <w:tc>
-          <w:tcPr/>
+          <w:tcPr>
+            <w:shd w:val="clear" w:color="auto" w:fill="F6F8FA"/>
+          </w:tcPr>
           <w:p>
             <w:pPr>
               <w:jc w:val="left"/>
@@ -14868,7 +14909,9 @@
           </w:p>
         </w:tc>
         <w:tc>
-          <w:tcPr/>
+          <w:tcPr>
+            <w:shd w:val="clear" w:color="auto" w:fill="F6F8FA"/>
+          </w:tcPr>
           <w:p>
             <w:pPr>
               <w:jc w:val="left"/>
@@ -14879,12 +14922,14 @@
           </w:p>
         </w:tc>
         <w:tc>
-          <w:tcPr/>
+          <w:tcPr>
+            <w:shd w:val="clear" w:color="auto" w:fill="F6F8FA"/>
+          </w:tcPr>
           <w:p>
             <w:pPr>
               <w:numPr>
                 <w:ilvl w:val="0"/>
-                <w:numId w:val="1072"/>
+                <w:numId w:val="1073"/>
               </w:numPr>
               <w:jc w:val="left"/>
             </w:pPr>
@@ -14926,9 +14971,7 @@
       </w:tr>
       <w:tr>
         <w:tc>
-          <w:tcPr>
-            <w:shd w:val="clear" w:color="auto" w:fill="F6F8FA"/>
-          </w:tcPr>
+          <w:tcPr/>
           <w:p>
             <w:pPr>
               <w:jc w:val="left"/>
@@ -14939,9 +14982,7 @@
           </w:p>
         </w:tc>
         <w:tc>
-          <w:tcPr>
-            <w:shd w:val="clear" w:color="auto" w:fill="F6F8FA"/>
-          </w:tcPr>
+          <w:tcPr/>
           <w:p>
             <w:pPr>
               <w:jc w:val="left"/>
@@ -14952,14 +14993,12 @@
           </w:p>
         </w:tc>
         <w:tc>
-          <w:tcPr>
-            <w:shd w:val="clear" w:color="auto" w:fill="F6F8FA"/>
-          </w:tcPr>
+          <w:tcPr/>
           <w:p>
             <w:pPr>
               <w:numPr>
                 <w:ilvl w:val="0"/>
-                <w:numId w:val="1073"/>
+                <w:numId w:val="1074"/>
               </w:numPr>
               <w:jc w:val="left"/>
             </w:pPr>
@@ -14986,54 +15025,15 @@
       </w:tr>
       <w:tr>
         <w:tc>
-          <w:tcPr/>
+          <w:tcPr>
+            <w:shd w:val="clear" w:color="auto" w:fill="F6F8FA"/>
+          </w:tcPr>
           <w:p>
             <w:pPr>
               <w:jc w:val="left"/>
             </w:pPr>
             <w:r>
               <w:t xml:space="preserve">3.8.1</w:t>
-            </w:r>
-          </w:p>
-        </w:tc>
-        <w:tc>
-          <w:tcPr/>
-          <w:p>
-            <w:pPr>
-              <w:jc w:val="left"/>
-            </w:pPr>
-            <w:r>
-              <w:t xml:space="preserve">2026-09-13</w:t>
-            </w:r>
-          </w:p>
-        </w:tc>
-        <w:tc>
-          <w:tcPr/>
-          <w:p>
-            <w:pPr>
-              <w:numPr>
-                <w:ilvl w:val="0"/>
-                <w:numId w:val="1074"/>
-              </w:numPr>
-              <w:jc w:val="left"/>
-            </w:pPr>
-            <w:r>
-              <w:t xml:space="preserve">End-to-end quality review: fixed testbook PDF metadata title, removed stray user DOCX from template dir, fixed round-trip.sh variable typo, updated stale references in AGENTS.md and README.md, committed testbook sample PDFs, set TZ for pandoc cover time consistency, widened pandoc version range.</w:t>
-            </w:r>
-          </w:p>
-        </w:tc>
-      </w:tr>
-      <w:tr>
-        <w:tc>
-          <w:tcPr>
-            <w:shd w:val="clear" w:color="auto" w:fill="F6F8FA"/>
-          </w:tcPr>
-          <w:p>
-            <w:pPr>
-              <w:jc w:val="left"/>
-            </w:pPr>
-            <w:r>
-              <w:t xml:space="preserve">3.8.0</w:t>
             </w:r>
           </w:p>
         </w:tc>
@@ -15063,7 +15063,7 @@
               <w:jc w:val="left"/>
             </w:pPr>
             <w:r>
-              <w:t xml:space="preserve">Removed Tips and Tricks chapter (tmux configuration) — required VS Code-specific keybindings that don’t generalize across terminal setups.</w:t>
+              <w:t xml:space="preserve">End-to-end quality review: fixed testbook PDF metadata title, removed stray user DOCX from template dir, fixed round-trip.sh variable typo, updated stale references in AGENTS.md and README.md, committed testbook sample PDFs, set TZ for pandoc cover time consistency, widened pandoc version range.</w:t>
             </w:r>
           </w:p>
         </w:tc>
@@ -15076,18 +15076,18 @@
               <w:jc w:val="left"/>
             </w:pPr>
             <w:r>
-              <w:t xml:space="preserve">3.7.0</w:t>
-            </w:r>
-          </w:p>
-        </w:tc>
-        <w:tc>
-          <w:tcPr/>
-          <w:p>
-            <w:pPr>
-              <w:jc w:val="left"/>
-            </w:pPr>
-            <w:r>
-              <w:t xml:space="preserve">2026-09-12</w:t>
+              <w:t xml:space="preserve">3.8.0</w:t>
+            </w:r>
+          </w:p>
+        </w:tc>
+        <w:tc>
+          <w:tcPr/>
+          <w:p>
+            <w:pPr>
+              <w:jc w:val="left"/>
+            </w:pPr>
+            <w:r>
+              <w:t xml:space="preserve">2026-09-13</w:t>
             </w:r>
           </w:p>
         </w:tc>
@@ -15102,6 +15102,51 @@
               <w:jc w:val="left"/>
             </w:pPr>
             <w:r>
+              <w:t xml:space="preserve">Removed Tips and Tricks chapter (tmux configuration) — required VS Code-specific keybindings that don’t generalize across terminal setups.</w:t>
+            </w:r>
+          </w:p>
+        </w:tc>
+      </w:tr>
+      <w:tr>
+        <w:tc>
+          <w:tcPr>
+            <w:shd w:val="clear" w:color="auto" w:fill="F6F8FA"/>
+          </w:tcPr>
+          <w:p>
+            <w:pPr>
+              <w:jc w:val="left"/>
+            </w:pPr>
+            <w:r>
+              <w:t xml:space="preserve">3.7.0</w:t>
+            </w:r>
+          </w:p>
+        </w:tc>
+        <w:tc>
+          <w:tcPr>
+            <w:shd w:val="clear" w:color="auto" w:fill="F6F8FA"/>
+          </w:tcPr>
+          <w:p>
+            <w:pPr>
+              <w:jc w:val="left"/>
+            </w:pPr>
+            <w:r>
+              <w:t xml:space="preserve">2026-09-12</w:t>
+            </w:r>
+          </w:p>
+        </w:tc>
+        <w:tc>
+          <w:tcPr>
+            <w:shd w:val="clear" w:color="auto" w:fill="F6F8FA"/>
+          </w:tcPr>
+          <w:p>
+            <w:pPr>
+              <w:numPr>
+                <w:ilvl w:val="0"/>
+                <w:numId w:val="1077"/>
+              </w:numPr>
+              <w:jc w:val="left"/>
+            </w:pPr>
+            <w:r>
               <w:t xml:space="preserve">Added</w:t>
             </w:r>
             <w:r>
@@ -15154,9 +15199,7 @@
       </w:tr>
       <w:tr>
         <w:tc>
-          <w:tcPr>
-            <w:shd w:val="clear" w:color="auto" w:fill="F6F8FA"/>
-          </w:tcPr>
+          <w:tcPr/>
           <w:p>
             <w:pPr>
               <w:jc w:val="left"/>
@@ -15167,9 +15210,7 @@
           </w:p>
         </w:tc>
         <w:tc>
-          <w:tcPr>
-            <w:shd w:val="clear" w:color="auto" w:fill="F6F8FA"/>
-          </w:tcPr>
+          <w:tcPr/>
           <w:p>
             <w:pPr>
               <w:jc w:val="left"/>
@@ -15180,14 +15221,12 @@
           </w:p>
         </w:tc>
         <w:tc>
-          <w:tcPr>
-            <w:shd w:val="clear" w:color="auto" w:fill="F6F8FA"/>
-          </w:tcPr>
+          <w:tcPr/>
           <w:p>
             <w:pPr>
               <w:numPr>
                 <w:ilvl w:val="0"/>
-                <w:numId w:val="1077"/>
+                <w:numId w:val="1078"/>
               </w:numPr>
               <w:jc w:val="left"/>
             </w:pPr>
@@ -15244,7 +15283,9 @@
       </w:tr>
       <w:tr>
         <w:tc>
-          <w:tcPr/>
+          <w:tcPr>
+            <w:shd w:val="clear" w:color="auto" w:fill="F6F8FA"/>
+          </w:tcPr>
           <w:p>
             <w:pPr>
               <w:jc w:val="left"/>
@@ -15255,7 +15296,9 @@
           </w:p>
         </w:tc>
         <w:tc>
-          <w:tcPr/>
+          <w:tcPr>
+            <w:shd w:val="clear" w:color="auto" w:fill="F6F8FA"/>
+          </w:tcPr>
           <w:p>
             <w:pPr>
               <w:jc w:val="left"/>
@@ -15266,12 +15309,14 @@
           </w:p>
         </w:tc>
         <w:tc>
-          <w:tcPr/>
+          <w:tcPr>
+            <w:shd w:val="clear" w:color="auto" w:fill="F6F8FA"/>
+          </w:tcPr>
           <w:p>
             <w:pPr>
               <w:numPr>
                 <w:ilvl w:val="0"/>
-                <w:numId w:val="1078"/>
+                <w:numId w:val="1079"/>
               </w:numPr>
               <w:jc w:val="left"/>
             </w:pPr>
@@ -15349,9 +15394,7 @@
       </w:tr>
       <w:tr>
         <w:tc>
-          <w:tcPr>
-            <w:shd w:val="clear" w:color="auto" w:fill="F6F8FA"/>
-          </w:tcPr>
+          <w:tcPr/>
           <w:p>
             <w:pPr>
               <w:jc w:val="left"/>
@@ -15362,9 +15405,7 @@
           </w:p>
         </w:tc>
         <w:tc>
-          <w:tcPr>
-            <w:shd w:val="clear" w:color="auto" w:fill="F6F8FA"/>
-          </w:tcPr>
+          <w:tcPr/>
           <w:p>
             <w:pPr>
               <w:jc w:val="left"/>
@@ -15375,14 +15416,12 @@
           </w:p>
         </w:tc>
         <w:tc>
-          <w:tcPr>
-            <w:shd w:val="clear" w:color="auto" w:fill="F6F8FA"/>
-          </w:tcPr>
+          <w:tcPr/>
           <w:p>
             <w:pPr>
               <w:numPr>
                 <w:ilvl w:val="0"/>
-                <w:numId w:val="1079"/>
+                <w:numId w:val="1080"/>
               </w:numPr>
               <w:jc w:val="left"/>
             </w:pPr>
@@ -15409,7 +15448,7 @@
             <w:pPr>
               <w:numPr>
                 <w:ilvl w:val="0"/>
-                <w:numId w:val="1079"/>
+                <w:numId w:val="1080"/>
               </w:numPr>
               <w:jc w:val="left"/>
             </w:pPr>
@@ -15451,7 +15490,7 @@
             <w:pPr>
               <w:numPr>
                 <w:ilvl w:val="0"/>
-                <w:numId w:val="1079"/>
+                <w:numId w:val="1080"/>
               </w:numPr>
               <w:jc w:val="left"/>
             </w:pPr>
@@ -15463,7 +15502,9 @@
       </w:tr>
       <w:tr>
         <w:tc>
-          <w:tcPr/>
+          <w:tcPr>
+            <w:shd w:val="clear" w:color="auto" w:fill="F6F8FA"/>
+          </w:tcPr>
           <w:p>
             <w:pPr>
               <w:jc w:val="left"/>
@@ -15474,7 +15515,9 @@
           </w:p>
         </w:tc>
         <w:tc>
-          <w:tcPr/>
+          <w:tcPr>
+            <w:shd w:val="clear" w:color="auto" w:fill="F6F8FA"/>
+          </w:tcPr>
           <w:p>
             <w:pPr>
               <w:jc w:val="left"/>
@@ -15485,12 +15528,14 @@
           </w:p>
         </w:tc>
         <w:tc>
-          <w:tcPr/>
+          <w:tcPr>
+            <w:shd w:val="clear" w:color="auto" w:fill="F6F8FA"/>
+          </w:tcPr>
           <w:p>
             <w:pPr>
               <w:numPr>
                 <w:ilvl w:val="0"/>
-                <w:numId w:val="1080"/>
+                <w:numId w:val="1081"/>
               </w:numPr>
               <w:jc w:val="left"/>
             </w:pPr>
@@ -15517,7 +15562,7 @@
             <w:pPr>
               <w:numPr>
                 <w:ilvl w:val="0"/>
-                <w:numId w:val="1080"/>
+                <w:numId w:val="1081"/>
               </w:numPr>
               <w:jc w:val="left"/>
             </w:pPr>
@@ -15544,7 +15589,7 @@
             <w:pPr>
               <w:numPr>
                 <w:ilvl w:val="0"/>
-                <w:numId w:val="1080"/>
+                <w:numId w:val="1081"/>
               </w:numPr>
               <w:jc w:val="left"/>
             </w:pPr>
@@ -15556,7 +15601,7 @@
             <w:pPr>
               <w:numPr>
                 <w:ilvl w:val="0"/>
-                <w:numId w:val="1080"/>
+                <w:numId w:val="1081"/>
               </w:numPr>
               <w:jc w:val="left"/>
             </w:pPr>
@@ -15580,58 +15625,13 @@
       </w:tr>
       <w:tr>
         <w:tc>
-          <w:tcPr>
-            <w:shd w:val="clear" w:color="auto" w:fill="F6F8FA"/>
-          </w:tcPr>
+          <w:tcPr/>
           <w:p>
             <w:pPr>
               <w:jc w:val="left"/>
             </w:pPr>
             <w:r>
               <w:t xml:space="preserve">3.2.1</w:t>
-            </w:r>
-          </w:p>
-        </w:tc>
-        <w:tc>
-          <w:tcPr>
-            <w:shd w:val="clear" w:color="auto" w:fill="F6F8FA"/>
-          </w:tcPr>
-          <w:p>
-            <w:pPr>
-              <w:jc w:val="left"/>
-            </w:pPr>
-            <w:r>
-              <w:t xml:space="preserve">2026-09-11</w:t>
-            </w:r>
-          </w:p>
-        </w:tc>
-        <w:tc>
-          <w:tcPr>
-            <w:shd w:val="clear" w:color="auto" w:fill="F6F8FA"/>
-          </w:tcPr>
-          <w:p>
-            <w:pPr>
-              <w:numPr>
-                <w:ilvl w:val="0"/>
-                <w:numId w:val="1081"/>
-              </w:numPr>
-              <w:jc w:val="left"/>
-            </w:pPr>
-            <w:r>
-              <w:t xml:space="preserve">Renamed Chapter 7 from “Clean Up” to “Operations and Maintenance”. Added subsections for updating and uninstalling both the MaaS Gateway and the document templates. Added cloud resource cleanup as an optional subsection.</w:t>
-            </w:r>
-          </w:p>
-        </w:tc>
-      </w:tr>
-      <w:tr>
-        <w:tc>
-          <w:tcPr/>
-          <w:p>
-            <w:pPr>
-              <w:jc w:val="left"/>
-            </w:pPr>
-            <w:r>
-              <w:t xml:space="preserve">3.2.0</w:t>
             </w:r>
           </w:p>
         </w:tc>
@@ -15657,6 +15657,51 @@
               <w:jc w:val="left"/>
             </w:pPr>
             <w:r>
+              <w:t xml:space="preserve">Renamed Chapter 7 from “Clean Up” to “Operations and Maintenance”. Added subsections for updating and uninstalling both the MaaS Gateway and the document templates. Added cloud resource cleanup as an optional subsection.</w:t>
+            </w:r>
+          </w:p>
+        </w:tc>
+      </w:tr>
+      <w:tr>
+        <w:tc>
+          <w:tcPr>
+            <w:shd w:val="clear" w:color="auto" w:fill="F6F8FA"/>
+          </w:tcPr>
+          <w:p>
+            <w:pPr>
+              <w:jc w:val="left"/>
+            </w:pPr>
+            <w:r>
+              <w:t xml:space="preserve">3.2.0</w:t>
+            </w:r>
+          </w:p>
+        </w:tc>
+        <w:tc>
+          <w:tcPr>
+            <w:shd w:val="clear" w:color="auto" w:fill="F6F8FA"/>
+          </w:tcPr>
+          <w:p>
+            <w:pPr>
+              <w:jc w:val="left"/>
+            </w:pPr>
+            <w:r>
+              <w:t xml:space="preserve">2026-09-11</w:t>
+            </w:r>
+          </w:p>
+        </w:tc>
+        <w:tc>
+          <w:tcPr>
+            <w:shd w:val="clear" w:color="auto" w:fill="F6F8FA"/>
+          </w:tcPr>
+          <w:p>
+            <w:pPr>
+              <w:numPr>
+                <w:ilvl w:val="0"/>
+                <w:numId w:val="1083"/>
+              </w:numPr>
+              <w:jc w:val="left"/>
+            </w:pPr>
+            <w:r>
               <w:t xml:space="preserve">Added</w:t>
             </w:r>
             <w:r>
@@ -15718,7 +15763,7 @@
             <w:pPr>
               <w:numPr>
                 <w:ilvl w:val="0"/>
-                <w:numId w:val="1082"/>
+                <w:numId w:val="1083"/>
               </w:numPr>
               <w:jc w:val="left"/>
             </w:pPr>
@@ -15763,7 +15808,7 @@
             <w:pPr>
               <w:numPr>
                 <w:ilvl w:val="0"/>
-                <w:numId w:val="1082"/>
+                <w:numId w:val="1083"/>
               </w:numPr>
               <w:jc w:val="left"/>
             </w:pPr>
@@ -15775,58 +15820,13 @@
       </w:tr>
       <w:tr>
         <w:tc>
-          <w:tcPr>
-            <w:shd w:val="clear" w:color="auto" w:fill="F6F8FA"/>
-          </w:tcPr>
+          <w:tcPr/>
           <w:p>
             <w:pPr>
               <w:jc w:val="left"/>
             </w:pPr>
             <w:r>
               <w:t xml:space="preserve">3.1.2</w:t>
-            </w:r>
-          </w:p>
-        </w:tc>
-        <w:tc>
-          <w:tcPr>
-            <w:shd w:val="clear" w:color="auto" w:fill="F6F8FA"/>
-          </w:tcPr>
-          <w:p>
-            <w:pPr>
-              <w:jc w:val="left"/>
-            </w:pPr>
-            <w:r>
-              <w:t xml:space="preserve">2026-09-11</w:t>
-            </w:r>
-          </w:p>
-        </w:tc>
-        <w:tc>
-          <w:tcPr>
-            <w:shd w:val="clear" w:color="auto" w:fill="F6F8FA"/>
-          </w:tcPr>
-          <w:p>
-            <w:pPr>
-              <w:numPr>
-                <w:ilvl w:val="0"/>
-                <w:numId w:val="1083"/>
-              </w:numPr>
-              <w:jc w:val="left"/>
-            </w:pPr>
-            <w:r>
-              <w:t xml:space="preserve">Added output format guide to README.md: comparison table of PDF, Markdown, DOCX, and HTML with purpose, copy-paste quality, and limitations. Recommends Markdown for copy-paste.</w:t>
-            </w:r>
-          </w:p>
-        </w:tc>
-      </w:tr>
-      <w:tr>
-        <w:tc>
-          <w:tcPr/>
-          <w:p>
-            <w:pPr>
-              <w:jc w:val="left"/>
-            </w:pPr>
-            <w:r>
-              <w:t xml:space="preserve">3.1.1</w:t>
             </w:r>
           </w:p>
         </w:tc>
@@ -15852,6 +15852,51 @@
               <w:jc w:val="left"/>
             </w:pPr>
             <w:r>
+              <w:t xml:space="preserve">Added output format guide to README.md: comparison table of PDF, Markdown, DOCX, and HTML with purpose, copy-paste quality, and limitations. Recommends Markdown for copy-paste.</w:t>
+            </w:r>
+          </w:p>
+        </w:tc>
+      </w:tr>
+      <w:tr>
+        <w:tc>
+          <w:tcPr>
+            <w:shd w:val="clear" w:color="auto" w:fill="F6F8FA"/>
+          </w:tcPr>
+          <w:p>
+            <w:pPr>
+              <w:jc w:val="left"/>
+            </w:pPr>
+            <w:r>
+              <w:t xml:space="preserve">3.1.1</w:t>
+            </w:r>
+          </w:p>
+        </w:tc>
+        <w:tc>
+          <w:tcPr>
+            <w:shd w:val="clear" w:color="auto" w:fill="F6F8FA"/>
+          </w:tcPr>
+          <w:p>
+            <w:pPr>
+              <w:jc w:val="left"/>
+            </w:pPr>
+            <w:r>
+              <w:t xml:space="preserve">2026-09-11</w:t>
+            </w:r>
+          </w:p>
+        </w:tc>
+        <w:tc>
+          <w:tcPr>
+            <w:shd w:val="clear" w:color="auto" w:fill="F6F8FA"/>
+          </w:tcPr>
+          <w:p>
+            <w:pPr>
+              <w:numPr>
+                <w:ilvl w:val="0"/>
+                <w:numId w:val="1085"/>
+              </w:numPr>
+              <w:jc w:val="left"/>
+            </w:pPr>
+            <w:r>
               <w:t xml:space="preserve">Updated MaaS Gateway chapter to v1.10.9: non-interactive mode (</w:t>
             </w:r>
             <w:r>
@@ -15868,7 +15913,7 @@
             <w:pPr>
               <w:numPr>
                 <w:ilvl w:val="0"/>
-                <w:numId w:val="1084"/>
+                <w:numId w:val="1085"/>
               </w:numPr>
               <w:jc w:val="left"/>
             </w:pPr>
@@ -15910,7 +15955,7 @@
             <w:pPr>
               <w:numPr>
                 <w:ilvl w:val="0"/>
-                <w:numId w:val="1084"/>
+                <w:numId w:val="1085"/>
               </w:numPr>
               <w:jc w:val="left"/>
             </w:pPr>
@@ -15922,9 +15967,7 @@
       </w:tr>
       <w:tr>
         <w:tc>
-          <w:tcPr>
-            <w:shd w:val="clear" w:color="auto" w:fill="F6F8FA"/>
-          </w:tcPr>
+          <w:tcPr/>
           <w:p>
             <w:pPr>
               <w:jc w:val="left"/>
@@ -15935,9 +15978,7 @@
           </w:p>
         </w:tc>
         <w:tc>
-          <w:tcPr>
-            <w:shd w:val="clear" w:color="auto" w:fill="F6F8FA"/>
-          </w:tcPr>
+          <w:tcPr/>
           <w:p>
             <w:pPr>
               <w:jc w:val="left"/>
@@ -15948,14 +15989,12 @@
           </w:p>
         </w:tc>
         <w:tc>
-          <w:tcPr>
-            <w:shd w:val="clear" w:color="auto" w:fill="F6F8FA"/>
-          </w:tcPr>
+          <w:tcPr/>
           <w:p>
             <w:pPr>
               <w:numPr>
                 <w:ilvl w:val="0"/>
-                <w:numId w:val="1085"/>
+                <w:numId w:val="1086"/>
               </w:numPr>
               <w:jc w:val="left"/>
             </w:pPr>
@@ -15979,7 +16018,7 @@
             <w:pPr>
               <w:numPr>
                 <w:ilvl w:val="0"/>
-                <w:numId w:val="1085"/>
+                <w:numId w:val="1086"/>
               </w:numPr>
               <w:jc w:val="left"/>
             </w:pPr>
@@ -16021,7 +16060,7 @@
             <w:pPr>
               <w:numPr>
                 <w:ilvl w:val="0"/>
-                <w:numId w:val="1085"/>
+                <w:numId w:val="1086"/>
               </w:numPr>
               <w:jc w:val="left"/>
             </w:pPr>
@@ -16029,57 +16068,6 @@
               <w:t xml:space="preserve">Restructured chapters: moved SSH config and VS Code connection to new Chapter 4 (Install VS Code and Connect via Remote-SSH). Chapters 5—​7 renumbered.</w:t>
             </w:r>
           </w:p>
-          <w:p>
-            <w:pPr>
-              <w:numPr>
-                <w:ilvl w:val="0"/>
-                <w:numId w:val="1085"/>
-              </w:numPr>
-              <w:jc w:val="left"/>
-            </w:pPr>
-            <w:r>
-              <w:t xml:space="preserve">Added verification checklist tables to all 7 chapters.</w:t>
-            </w:r>
-          </w:p>
-          <w:p>
-            <w:pPr>
-              <w:numPr>
-                <w:ilvl w:val="0"/>
-                <w:numId w:val="1085"/>
-              </w:numPr>
-              <w:jc w:val="left"/>
-            </w:pPr>
-            <w:r>
-              <w:t xml:space="preserve">Added mandatory reboot warning in Chapter 2 (SSH port change). Added troubleshooting subsection in Chapter 4 with common SSH connection issues and ncat debugging commands.</w:t>
-            </w:r>
-          </w:p>
-        </w:tc>
-      </w:tr>
-      <w:tr>
-        <w:tc>
-          <w:tcPr/>
-          <w:p>
-            <w:pPr>
-              <w:jc w:val="left"/>
-            </w:pPr>
-            <w:r>
-              <w:t xml:space="preserve">3.0.1</w:t>
-            </w:r>
-          </w:p>
-        </w:tc>
-        <w:tc>
-          <w:tcPr/>
-          <w:p>
-            <w:pPr>
-              <w:jc w:val="left"/>
-            </w:pPr>
-            <w:r>
-              <w:t xml:space="preserve">2026-09-10</w:t>
-            </w:r>
-          </w:p>
-        </w:tc>
-        <w:tc>
-          <w:tcPr/>
           <w:p>
             <w:pPr>
               <w:numPr>
@@ -16089,7 +16077,19 @@
               <w:jc w:val="left"/>
             </w:pPr>
             <w:r>
-              <w:t xml:space="preserve">Minor fixes: test-filter.sh auto-discovery, build.sh help text, Makefile aggregate descriptions, 5-section comment correction, CHANGELOG version gap note, callout-in-code fix, CI font auto-discovery, dofile path comment, test-sync.sh header.</w:t>
+              <w:t xml:space="preserve">Added verification checklist tables to all 7 chapters.</w:t>
+            </w:r>
+          </w:p>
+          <w:p>
+            <w:pPr>
+              <w:numPr>
+                <w:ilvl w:val="0"/>
+                <w:numId w:val="1086"/>
+              </w:numPr>
+              <w:jc w:val="left"/>
+            </w:pPr>
+            <w:r>
+              <w:t xml:space="preserve">Added mandatory reboot warning in Chapter 2 (SSH port change). Added troubleshooting subsection in Chapter 4 with common SSH connection issues and ncat debugging commands.</w:t>
             </w:r>
           </w:p>
         </w:tc>
@@ -16104,7 +16104,7 @@
               <w:jc w:val="left"/>
             </w:pPr>
             <w:r>
-              <w:t xml:space="preserve">3.0.0</w:t>
+              <w:t xml:space="preserve">3.0.1</w:t>
             </w:r>
           </w:p>
         </w:tc>
@@ -16117,7 +16117,7 @@
               <w:jc w:val="left"/>
             </w:pPr>
             <w:r>
-              <w:t xml:space="preserve">2026-09-09</w:t>
+              <w:t xml:space="preserve">2026-09-10</w:t>
             </w:r>
           </w:p>
         </w:tc>
@@ -16134,7 +16134,7 @@
               <w:jc w:val="left"/>
             </w:pPr>
             <w:r>
-              <w:t xml:space="preserve">Modular pipeline refactoring: shared Lua filter factory, shared DOCX fix logic, build system auto-discovery, unified format pipeline, GitHub Actions CI.</w:t>
+              <w:t xml:space="preserve">Minor fixes: test-filter.sh auto-discovery, build.sh help text, Makefile aggregate descriptions, 5-section comment correction, CHANGELOG version gap note, callout-in-code fix, CI font auto-discovery, dofile path comment, test-sync.sh header.</w:t>
             </w:r>
           </w:p>
         </w:tc>
@@ -16147,18 +16147,18 @@
               <w:jc w:val="left"/>
             </w:pPr>
             <w:r>
-              <w:t xml:space="preserve">2.16.0</w:t>
-            </w:r>
-          </w:p>
-        </w:tc>
-        <w:tc>
-          <w:tcPr/>
-          <w:p>
-            <w:pPr>
-              <w:jc w:val="left"/>
-            </w:pPr>
-            <w:r>
-              <w:t xml:space="preserve">2026-09-05</w:t>
+              <w:t xml:space="preserve">3.0.0</w:t>
+            </w:r>
+          </w:p>
+        </w:tc>
+        <w:tc>
+          <w:tcPr/>
+          <w:p>
+            <w:pPr>
+              <w:jc w:val="left"/>
+            </w:pPr>
+            <w:r>
+              <w:t xml:space="preserve">2026-09-09</w:t>
             </w:r>
           </w:p>
         </w:tc>
@@ -16173,7 +16173,7 @@
               <w:jc w:val="left"/>
             </w:pPr>
             <w:r>
-              <w:t xml:space="preserve">Updated to match template v2.16.0 — Lua filter fixes, build system updates, and technical template parity improvements.</w:t>
+              <w:t xml:space="preserve">Modular pipeline refactoring: shared Lua filter factory, shared DOCX fix logic, build system auto-discovery, unified format pipeline, GitHub Actions CI.</w:t>
             </w:r>
           </w:p>
         </w:tc>
@@ -16188,7 +16188,7 @@
               <w:jc w:val="left"/>
             </w:pPr>
             <w:r>
-              <w:t xml:space="preserve">2.13.0</w:t>
+              <w:t xml:space="preserve">2.16.0</w:t>
             </w:r>
           </w:p>
         </w:tc>
@@ -16201,7 +16201,7 @@
               <w:jc w:val="left"/>
             </w:pPr>
             <w:r>
-              <w:t xml:space="preserve">2026-08-24</w:t>
+              <w:t xml:space="preserve">2026-09-05</w:t>
             </w:r>
           </w:p>
         </w:tc>
@@ -16218,6 +16218,45 @@
               <w:jc w:val="left"/>
             </w:pPr>
             <w:r>
+              <w:t xml:space="preserve">Updated to match template v2.16.0 — Lua filter fixes, build system updates, and technical template parity improvements.</w:t>
+            </w:r>
+          </w:p>
+        </w:tc>
+      </w:tr>
+      <w:tr>
+        <w:tc>
+          <w:tcPr/>
+          <w:p>
+            <w:pPr>
+              <w:jc w:val="left"/>
+            </w:pPr>
+            <w:r>
+              <w:t xml:space="preserve">2.13.0</w:t>
+            </w:r>
+          </w:p>
+        </w:tc>
+        <w:tc>
+          <w:tcPr/>
+          <w:p>
+            <w:pPr>
+              <w:jc w:val="left"/>
+            </w:pPr>
+            <w:r>
+              <w:t xml:space="preserve">2026-08-24</w:t>
+            </w:r>
+          </w:p>
+        </w:tc>
+        <w:tc>
+          <w:tcPr/>
+          <w:p>
+            <w:pPr>
+              <w:numPr>
+                <w:ilvl w:val="0"/>
+                <w:numId w:val="1090"/>
+              </w:numPr>
+              <w:jc w:val="left"/>
+            </w:pPr>
+            <w:r>
               <w:t xml:space="preserve">Foundation refactoring Phase 4: make DOCX</w:t>
             </w:r>
             <w:r>
@@ -16285,7 +16324,9 @@
       </w:tr>
       <w:tr>
         <w:tc>
-          <w:tcPr/>
+          <w:tcPr>
+            <w:shd w:val="clear" w:color="auto" w:fill="F6F8FA"/>
+          </w:tcPr>
           <w:p>
             <w:pPr>
               <w:jc w:val="left"/>
@@ -16296,7 +16337,9 @@
           </w:p>
         </w:tc>
         <w:tc>
-          <w:tcPr/>
+          <w:tcPr>
+            <w:shd w:val="clear" w:color="auto" w:fill="F6F8FA"/>
+          </w:tcPr>
           <w:p>
             <w:pPr>
               <w:jc w:val="left"/>
@@ -16307,12 +16350,14 @@
           </w:p>
         </w:tc>
         <w:tc>
-          <w:tcPr/>
+          <w:tcPr>
+            <w:shd w:val="clear" w:color="auto" w:fill="F6F8FA"/>
+          </w:tcPr>
           <w:p>
             <w:pPr>
               <w:numPr>
                 <w:ilvl w:val="0"/>
-                <w:numId w:val="1090"/>
+                <w:numId w:val="1091"/>
               </w:numPr>
               <w:jc w:val="left"/>
             </w:pPr>
@@ -16474,9 +16519,7 @@
       </w:tr>
       <w:tr>
         <w:tc>
-          <w:tcPr>
-            <w:shd w:val="clear" w:color="auto" w:fill="F6F8FA"/>
-          </w:tcPr>
+          <w:tcPr/>
           <w:p>
             <w:pPr>
               <w:jc w:val="left"/>
@@ -16487,9 +16530,7 @@
           </w:p>
         </w:tc>
         <w:tc>
-          <w:tcPr>
-            <w:shd w:val="clear" w:color="auto" w:fill="F6F8FA"/>
-          </w:tcPr>
+          <w:tcPr/>
           <w:p>
             <w:pPr>
               <w:jc w:val="left"/>
@@ -16500,14 +16541,12 @@
           </w:p>
         </w:tc>
         <w:tc>
-          <w:tcPr>
-            <w:shd w:val="clear" w:color="auto" w:fill="F6F8FA"/>
-          </w:tcPr>
+          <w:tcPr/>
           <w:p>
             <w:pPr>
               <w:numPr>
                 <w:ilvl w:val="0"/>
-                <w:numId w:val="1091"/>
+                <w:numId w:val="1092"/>
               </w:numPr>
               <w:jc w:val="left"/>
             </w:pPr>
@@ -16573,7 +16612,9 @@
       </w:tr>
       <w:tr>
         <w:tc>
-          <w:tcPr/>
+          <w:tcPr>
+            <w:shd w:val="clear" w:color="auto" w:fill="F6F8FA"/>
+          </w:tcPr>
           <w:p>
             <w:pPr>
               <w:jc w:val="left"/>
@@ -16584,56 +16625,15 @@
           </w:p>
         </w:tc>
         <w:tc>
-          <w:tcPr/>
+          <w:tcPr>
+            <w:shd w:val="clear" w:color="auto" w:fill="F6F8FA"/>
+          </w:tcPr>
           <w:p>
             <w:pPr>
               <w:jc w:val="left"/>
             </w:pPr>
             <w:r>
               <w:t xml:space="preserve">2026-08-24</w:t>
-            </w:r>
-          </w:p>
-        </w:tc>
-        <w:tc>
-          <w:tcPr/>
-          <w:p>
-            <w:pPr>
-              <w:numPr>
-                <w:ilvl w:val="0"/>
-                <w:numId w:val="1092"/>
-              </w:numPr>
-              <w:jc w:val="left"/>
-            </w:pPr>
-            <w:r>
-              <w:t xml:space="preserve">Foundation refactoring Phase 1: sync cls version to project tag, fix stale doc references (L16 output count, L-range, setup-guide feature claim), add test-sync.sh for version consistency checking.</w:t>
-            </w:r>
-          </w:p>
-        </w:tc>
-      </w:tr>
-      <w:tr>
-        <w:tc>
-          <w:tcPr>
-            <w:shd w:val="clear" w:color="auto" w:fill="F6F8FA"/>
-          </w:tcPr>
-          <w:p>
-            <w:pPr>
-              <w:jc w:val="left"/>
-            </w:pPr>
-            <w:r>
-              <w:t xml:space="preserve">2.9.1</w:t>
-            </w:r>
-          </w:p>
-        </w:tc>
-        <w:tc>
-          <w:tcPr>
-            <w:shd w:val="clear" w:color="auto" w:fill="F6F8FA"/>
-          </w:tcPr>
-          <w:p>
-            <w:pPr>
-              <w:jc w:val="left"/>
-            </w:pPr>
-            <w:r>
-              <w:t xml:space="preserve">2026-08-23</w:t>
             </w:r>
           </w:p>
         </w:tc>
@@ -16650,6 +16650,45 @@
               <w:jc w:val="left"/>
             </w:pPr>
             <w:r>
+              <w:t xml:space="preserve">Foundation refactoring Phase 1: sync cls version to project tag, fix stale doc references (L16 output count, L-range, setup-guide feature claim), add test-sync.sh for version consistency checking.</w:t>
+            </w:r>
+          </w:p>
+        </w:tc>
+      </w:tr>
+      <w:tr>
+        <w:tc>
+          <w:tcPr/>
+          <w:p>
+            <w:pPr>
+              <w:jc w:val="left"/>
+            </w:pPr>
+            <w:r>
+              <w:t xml:space="preserve">2.9.1</w:t>
+            </w:r>
+          </w:p>
+        </w:tc>
+        <w:tc>
+          <w:tcPr/>
+          <w:p>
+            <w:pPr>
+              <w:jc w:val="left"/>
+            </w:pPr>
+            <w:r>
+              <w:t xml:space="preserve">2026-08-23</w:t>
+            </w:r>
+          </w:p>
+        </w:tc>
+        <w:tc>
+          <w:tcPr/>
+          <w:p>
+            <w:pPr>
+              <w:numPr>
+                <w:ilvl w:val="0"/>
+                <w:numId w:val="1094"/>
+              </w:numPr>
+              <w:jc w:val="left"/>
+            </w:pPr>
+            <w:r>
               <w:t xml:space="preserve">HTML and Markdown outputs now embed images as base64 data URIs. HTML uses pandoc</w:t>
             </w:r>
             <w:r>
@@ -16681,54 +16720,15 @@
       </w:tr>
       <w:tr>
         <w:tc>
-          <w:tcPr/>
+          <w:tcPr>
+            <w:shd w:val="clear" w:color="auto" w:fill="F6F8FA"/>
+          </w:tcPr>
           <w:p>
             <w:pPr>
               <w:jc w:val="left"/>
             </w:pPr>
             <w:r>
               <w:t xml:space="preserve">2.9.0</w:t>
-            </w:r>
-          </w:p>
-        </w:tc>
-        <w:tc>
-          <w:tcPr/>
-          <w:p>
-            <w:pPr>
-              <w:jc w:val="left"/>
-            </w:pPr>
-            <w:r>
-              <w:t xml:space="preserve">2026-08-23</w:t>
-            </w:r>
-          </w:p>
-        </w:tc>
-        <w:tc>
-          <w:tcPr/>
-          <w:p>
-            <w:pPr>
-              <w:numPr>
-                <w:ilvl w:val="0"/>
-                <w:numId w:val="1094"/>
-              </w:numPr>
-              <w:jc w:val="left"/>
-            </w:pPr>
-            <w:r>
-              <w:t xml:space="preserve">DOCX: fix content width (8504→9638tw, margins are 2cm not 3cm). Add footer page numbers. Style TOC heading (22pt bold + rule). Add hutable table width + fixed layout.</w:t>
-            </w:r>
-          </w:p>
-        </w:tc>
-      </w:tr>
-      <w:tr>
-        <w:tc>
-          <w:tcPr>
-            <w:shd w:val="clear" w:color="auto" w:fill="F6F8FA"/>
-          </w:tcPr>
-          <w:p>
-            <w:pPr>
-              <w:jc w:val="left"/>
-            </w:pPr>
-            <w:r>
-              <w:t xml:space="preserve">2.8.3</w:t>
             </w:r>
           </w:p>
         </w:tc>
@@ -16758,7 +16758,7 @@
               <w:jc w:val="left"/>
             </w:pPr>
             <w:r>
-              <w:t xml:space="preserve">DOCX fix: callout tables now have explicit width (8504tw) and fixed layout. Changelog section heading now uses custom H1 format (56pt number, red border, right tab) instead of pandoc’s default.</w:t>
+              <w:t xml:space="preserve">DOCX: fix content width (8504→9638tw, margins are 2cm not 3cm). Add footer page numbers. Style TOC heading (22pt bold + rule). Add hutable table width + fixed layout.</w:t>
             </w:r>
           </w:p>
         </w:tc>
@@ -16771,7 +16771,7 @@
               <w:jc w:val="left"/>
             </w:pPr>
             <w:r>
-              <w:t xml:space="preserve">2.8.2</w:t>
+              <w:t xml:space="preserve">2.8.3</w:t>
             </w:r>
           </w:p>
         </w:tc>
@@ -16797,7 +16797,7 @@
               <w:jc w:val="left"/>
             </w:pPr>
             <w:r>
-              <w:t xml:space="preserve">DOCX H1 heading: reverted table approach to paragraph with tab stop + red bottom border. Table broke navigation pane and TOC field. Paragraph preserves Heading1 style for navigation while matching PDF layout (number left, title right, red rule below).</w:t>
+              <w:t xml:space="preserve">DOCX fix: callout tables now have explicit width (8504tw) and fixed layout. Changelog section heading now uses custom H1 format (56pt number, red border, right tab) instead of pandoc’s default.</w:t>
             </w:r>
           </w:p>
         </w:tc>
@@ -16812,7 +16812,7 @@
               <w:jc w:val="left"/>
             </w:pPr>
             <w:r>
-              <w:t xml:space="preserve">2.8.1</w:t>
+              <w:t xml:space="preserve">2.8.2</w:t>
             </w:r>
           </w:p>
         </w:tc>
@@ -16842,7 +16842,7 @@
               <w:jc w:val="left"/>
             </w:pPr>
             <w:r>
-              <w:t xml:space="preserve">DOCX heading fix: text color reverted to black (was incorrectly changed to Huawei red in v2.8.0). H1 now uses a two-column table (number left, title right) with red bottom rule. H2-H4 use simple inline format (number + title, no right tab stop).</w:t>
+              <w:t xml:space="preserve">DOCX H1 heading: reverted table approach to paragraph with tab stop + red bottom border. Table broke navigation pane and TOC field. Paragraph preserves Heading1 style for navigation while matching PDF layout (number left, title right, red rule below).</w:t>
             </w:r>
           </w:p>
         </w:tc>
@@ -16855,7 +16855,7 @@
               <w:jc w:val="left"/>
             </w:pPr>
             <w:r>
-              <w:t xml:space="preserve">2.8.0</w:t>
+              <w:t xml:space="preserve">2.8.1</w:t>
             </w:r>
           </w:p>
         </w:tc>
@@ -16881,7 +16881,7 @@
               <w:jc w:val="left"/>
             </w:pPr>
             <w:r>
-              <w:t xml:space="preserve">DOCX output: match PDF styling --- heading colors (Huawei red), H1 number size (56pt), callout borders (left-only) and padding, changelog formatting (rules, bold version, italic date), caption style (9pt bold), badge style (8pt bold white on red), list indentation.</w:t>
+              <w:t xml:space="preserve">DOCX heading fix: text color reverted to black (was incorrectly changed to Huawei red in v2.8.0). H1 now uses a two-column table (number left, title right) with red bottom rule. H2-H4 use simple inline format (number + title, no right tab stop).</w:t>
             </w:r>
           </w:p>
         </w:tc>
@@ -16896,7 +16896,7 @@
               <w:jc w:val="left"/>
             </w:pPr>
             <w:r>
-              <w:t xml:space="preserve">2.7.1</w:t>
+              <w:t xml:space="preserve">2.8.0</w:t>
             </w:r>
           </w:p>
         </w:tc>
@@ -16909,7 +16909,7 @@
               <w:jc w:val="left"/>
             </w:pPr>
             <w:r>
-              <w:t xml:space="preserve">2026-08-17</w:t>
+              <w:t xml:space="preserve">2026-08-23</w:t>
             </w:r>
           </w:p>
         </w:tc>
@@ -16926,6 +16926,45 @@
               <w:jc w:val="left"/>
             </w:pPr>
             <w:r>
+              <w:t xml:space="preserve">DOCX output: match PDF styling --- heading colors (Huawei red), H1 number size (56pt), callout borders (left-only) and padding, changelog formatting (rules, bold version, italic date), caption style (9pt bold), badge style (8pt bold white on red), list indentation.</w:t>
+            </w:r>
+          </w:p>
+        </w:tc>
+      </w:tr>
+      <w:tr>
+        <w:tc>
+          <w:tcPr/>
+          <w:p>
+            <w:pPr>
+              <w:jc w:val="left"/>
+            </w:pPr>
+            <w:r>
+              <w:t xml:space="preserve">2.7.1</w:t>
+            </w:r>
+          </w:p>
+        </w:tc>
+        <w:tc>
+          <w:tcPr/>
+          <w:p>
+            <w:pPr>
+              <w:jc w:val="left"/>
+            </w:pPr>
+            <w:r>
+              <w:t xml:space="preserve">2026-08-17</w:t>
+            </w:r>
+          </w:p>
+        </w:tc>
+        <w:tc>
+          <w:tcPr/>
+          <w:p>
+            <w:pPr>
+              <w:numPr>
+                <w:ilvl w:val="0"/>
+                <w:numId w:val="1100"/>
+              </w:numPr>
+              <w:jc w:val="left"/>
+            </w:pPr>
+            <w:r>
               <w:t xml:space="preserve">Rename project repository to all lowercase (</w:t>
             </w:r>
             <w:r>
@@ -16942,7 +16981,9 @@
       </w:tr>
       <w:tr>
         <w:tc>
-          <w:tcPr/>
+          <w:tcPr>
+            <w:shd w:val="clear" w:color="auto" w:fill="F6F8FA"/>
+          </w:tcPr>
           <w:p>
             <w:pPr>
               <w:jc w:val="left"/>
@@ -16953,7 +16994,9 @@
           </w:p>
         </w:tc>
         <w:tc>
-          <w:tcPr/>
+          <w:tcPr>
+            <w:shd w:val="clear" w:color="auto" w:fill="F6F8FA"/>
+          </w:tcPr>
           <w:p>
             <w:pPr>
               <w:jc w:val="left"/>
@@ -16964,12 +17007,14 @@
           </w:p>
         </w:tc>
         <w:tc>
-          <w:tcPr/>
+          <w:tcPr>
+            <w:shd w:val="clear" w:color="auto" w:fill="F6F8FA"/>
+          </w:tcPr>
           <w:p>
             <w:pPr>
               <w:numPr>
                 <w:ilvl w:val="0"/>
-                <w:numId w:val="1100"/>
+                <w:numId w:val="1101"/>
               </w:numPr>
               <w:jc w:val="left"/>
             </w:pPr>
@@ -17011,9 +17056,7 @@
       </w:tr>
       <w:tr>
         <w:tc>
-          <w:tcPr>
-            <w:shd w:val="clear" w:color="auto" w:fill="F6F8FA"/>
-          </w:tcPr>
+          <w:tcPr/>
           <w:p>
             <w:pPr>
               <w:jc w:val="left"/>
@@ -17024,9 +17067,7 @@
           </w:p>
         </w:tc>
         <w:tc>
-          <w:tcPr>
-            <w:shd w:val="clear" w:color="auto" w:fill="F6F8FA"/>
-          </w:tcPr>
+          <w:tcPr/>
           <w:p>
             <w:pPr>
               <w:jc w:val="left"/>
@@ -17037,14 +17078,12 @@
           </w:p>
         </w:tc>
         <w:tc>
-          <w:tcPr>
-            <w:shd w:val="clear" w:color="auto" w:fill="F6F8FA"/>
-          </w:tcPr>
+          <w:tcPr/>
           <w:p>
             <w:pPr>
               <w:numPr>
                 <w:ilvl w:val="0"/>
-                <w:numId w:val="1101"/>
+                <w:numId w:val="1102"/>
               </w:numPr>
               <w:jc w:val="left"/>
             </w:pPr>
@@ -17101,7 +17140,9 @@
       </w:tr>
       <w:tr>
         <w:tc>
-          <w:tcPr/>
+          <w:tcPr>
+            <w:shd w:val="clear" w:color="auto" w:fill="F6F8FA"/>
+          </w:tcPr>
           <w:p>
             <w:pPr>
               <w:jc w:val="left"/>
@@ -17112,7 +17153,9 @@
           </w:p>
         </w:tc>
         <w:tc>
-          <w:tcPr/>
+          <w:tcPr>
+            <w:shd w:val="clear" w:color="auto" w:fill="F6F8FA"/>
+          </w:tcPr>
           <w:p>
             <w:pPr>
               <w:jc w:val="left"/>
@@ -17123,12 +17166,14 @@
           </w:p>
         </w:tc>
         <w:tc>
-          <w:tcPr/>
+          <w:tcPr>
+            <w:shd w:val="clear" w:color="auto" w:fill="F6F8FA"/>
+          </w:tcPr>
           <w:p>
             <w:pPr>
               <w:numPr>
                 <w:ilvl w:val="0"/>
-                <w:numId w:val="1102"/>
+                <w:numId w:val="1103"/>
               </w:numPr>
               <w:jc w:val="left"/>
             </w:pPr>
@@ -17155,7 +17200,7 @@
             <w:pPr>
               <w:numPr>
                 <w:ilvl w:val="0"/>
-                <w:numId w:val="1102"/>
+                <w:numId w:val="1103"/>
               </w:numPr>
               <w:jc w:val="left"/>
             </w:pPr>
@@ -17182,58 +17227,13 @@
       </w:tr>
       <w:tr>
         <w:tc>
-          <w:tcPr>
-            <w:shd w:val="clear" w:color="auto" w:fill="F6F8FA"/>
-          </w:tcPr>
+          <w:tcPr/>
           <w:p>
             <w:pPr>
               <w:jc w:val="left"/>
             </w:pPr>
             <w:r>
               <w:t xml:space="preserve">2.5.1</w:t>
-            </w:r>
-          </w:p>
-        </w:tc>
-        <w:tc>
-          <w:tcPr>
-            <w:shd w:val="clear" w:color="auto" w:fill="F6F8FA"/>
-          </w:tcPr>
-          <w:p>
-            <w:pPr>
-              <w:jc w:val="left"/>
-            </w:pPr>
-            <w:r>
-              <w:t xml:space="preserve">2026-08-10</w:t>
-            </w:r>
-          </w:p>
-        </w:tc>
-        <w:tc>
-          <w:tcPr>
-            <w:shd w:val="clear" w:color="auto" w:fill="F6F8FA"/>
-          </w:tcPr>
-          <w:p>
-            <w:pPr>
-              <w:numPr>
-                <w:ilvl w:val="0"/>
-                <w:numId w:val="1103"/>
-              </w:numPr>
-              <w:jc w:val="left"/>
-            </w:pPr>
-            <w:r>
-              <w:t xml:space="preserve">H1 section title size reduced from 27pt to 20pt.</w:t>
-            </w:r>
-          </w:p>
-        </w:tc>
-      </w:tr>
-      <w:tr>
-        <w:tc>
-          <w:tcPr/>
-          <w:p>
-            <w:pPr>
-              <w:jc w:val="left"/>
-            </w:pPr>
-            <w:r>
-              <w:t xml:space="preserve">2.5.0</w:t>
             </w:r>
           </w:p>
         </w:tc>
@@ -17259,13 +17259,7 @@
               <w:jc w:val="left"/>
             </w:pPr>
             <w:r>
-              <w:t xml:space="preserve">Default image size increased: width 65% → 90% of text width,</w:t>
-            </w:r>
-            <w:r>
-              <w:t xml:space="preserve"> </w:t>
-            </w:r>
-            <w:r>
-              <w:t xml:space="preserve">height 40% → 50% of text height.</w:t>
+              <w:t xml:space="preserve">H1 section title size reduced from 27pt to 20pt.</w:t>
             </w:r>
           </w:p>
         </w:tc>
@@ -17280,7 +17274,7 @@
               <w:jc w:val="left"/>
             </w:pPr>
             <w:r>
-              <w:t xml:space="preserve">2.4.0</w:t>
+              <w:t xml:space="preserve">2.5.0</w:t>
             </w:r>
           </w:p>
         </w:tc>
@@ -17310,14 +17304,59 @@
               <w:jc w:val="left"/>
             </w:pPr>
             <w:r>
-              <w:t xml:space="preserve">Enlarged H1 section title (18pt → 27pt, 50% bigger).</w:t>
-            </w:r>
-          </w:p>
+              <w:t xml:space="preserve">Default image size increased: width 65% → 90% of text width,</w:t>
+            </w:r>
+            <w:r>
+              <w:t xml:space="preserve"> </w:t>
+            </w:r>
+            <w:r>
+              <w:t xml:space="preserve">height 40% → 50% of text height.</w:t>
+            </w:r>
+          </w:p>
+        </w:tc>
+      </w:tr>
+      <w:tr>
+        <w:tc>
+          <w:tcPr/>
+          <w:p>
+            <w:pPr>
+              <w:jc w:val="left"/>
+            </w:pPr>
+            <w:r>
+              <w:t xml:space="preserve">2.4.0</w:t>
+            </w:r>
+          </w:p>
+        </w:tc>
+        <w:tc>
+          <w:tcPr/>
+          <w:p>
+            <w:pPr>
+              <w:jc w:val="left"/>
+            </w:pPr>
+            <w:r>
+              <w:t xml:space="preserve">2026-08-10</w:t>
+            </w:r>
+          </w:p>
+        </w:tc>
+        <w:tc>
+          <w:tcPr/>
           <w:p>
             <w:pPr>
               <w:numPr>
                 <w:ilvl w:val="0"/>
-                <w:numId w:val="1105"/>
+                <w:numId w:val="1106"/>
+              </w:numPr>
+              <w:jc w:val="left"/>
+            </w:pPr>
+            <w:r>
+              <w:t xml:space="preserve">Enlarged H1 section title (18pt → 27pt, 50% bigger).</w:t>
+            </w:r>
+          </w:p>
+          <w:p>
+            <w:pPr>
+              <w:numPr>
+                <w:ilvl w:val="0"/>
+                <w:numId w:val="1106"/>
               </w:numPr>
               <w:jc w:val="left"/>
             </w:pPr>
@@ -17344,7 +17383,9 @@
       </w:tr>
       <w:tr>
         <w:tc>
-          <w:tcPr/>
+          <w:tcPr>
+            <w:shd w:val="clear" w:color="auto" w:fill="F6F8FA"/>
+          </w:tcPr>
           <w:p>
             <w:pPr>
               <w:jc w:val="left"/>
@@ -17355,7 +17396,9 @@
           </w:p>
         </w:tc>
         <w:tc>
-          <w:tcPr/>
+          <w:tcPr>
+            <w:shd w:val="clear" w:color="auto" w:fill="F6F8FA"/>
+          </w:tcPr>
           <w:p>
             <w:pPr>
               <w:jc w:val="left"/>
@@ -17366,12 +17409,14 @@
           </w:p>
         </w:tc>
         <w:tc>
-          <w:tcPr/>
+          <w:tcPr>
+            <w:shd w:val="clear" w:color="auto" w:fill="F6F8FA"/>
+          </w:tcPr>
           <w:p>
             <w:pPr>
               <w:numPr>
                 <w:ilvl w:val="0"/>
-                <w:numId w:val="1106"/>
+                <w:numId w:val="1107"/>
               </w:numPr>
               <w:jc w:val="left"/>
             </w:pPr>
@@ -17398,9 +17443,7 @@
       </w:tr>
       <w:tr>
         <w:tc>
-          <w:tcPr>
-            <w:shd w:val="clear" w:color="auto" w:fill="F6F8FA"/>
-          </w:tcPr>
+          <w:tcPr/>
           <w:p>
             <w:pPr>
               <w:jc w:val="left"/>
@@ -17411,9 +17454,7 @@
           </w:p>
         </w:tc>
         <w:tc>
-          <w:tcPr>
-            <w:shd w:val="clear" w:color="auto" w:fill="F6F8FA"/>
-          </w:tcPr>
+          <w:tcPr/>
           <w:p>
             <w:pPr>
               <w:jc w:val="left"/>
@@ -17424,14 +17465,12 @@
           </w:p>
         </w:tc>
         <w:tc>
-          <w:tcPr>
-            <w:shd w:val="clear" w:color="auto" w:fill="F6F8FA"/>
-          </w:tcPr>
+          <w:tcPr/>
           <w:p>
             <w:pPr>
               <w:numPr>
                 <w:ilvl w:val="0"/>
-                <w:numId w:val="1107"/>
+                <w:numId w:val="1108"/>
               </w:numPr>
               <w:jc w:val="left"/>
             </w:pPr>
@@ -17503,7 +17542,9 @@
       </w:tr>
       <w:tr>
         <w:tc>
-          <w:tcPr/>
+          <w:tcPr>
+            <w:shd w:val="clear" w:color="auto" w:fill="F6F8FA"/>
+          </w:tcPr>
           <w:p>
             <w:pPr>
               <w:jc w:val="left"/>
@@ -17514,7 +17555,9 @@
           </w:p>
         </w:tc>
         <w:tc>
-          <w:tcPr/>
+          <w:tcPr>
+            <w:shd w:val="clear" w:color="auto" w:fill="F6F8FA"/>
+          </w:tcPr>
           <w:p>
             <w:pPr>
               <w:jc w:val="left"/>
@@ -17525,12 +17568,14 @@
           </w:p>
         </w:tc>
         <w:tc>
-          <w:tcPr/>
+          <w:tcPr>
+            <w:shd w:val="clear" w:color="auto" w:fill="F6F8FA"/>
+          </w:tcPr>
           <w:p>
             <w:pPr>
               <w:numPr>
                 <w:ilvl w:val="0"/>
-                <w:numId w:val="1108"/>
+                <w:numId w:val="1109"/>
               </w:numPr>
               <w:jc w:val="left"/>
             </w:pPr>
@@ -17587,9 +17632,7 @@
       </w:tr>
       <w:tr>
         <w:tc>
-          <w:tcPr>
-            <w:shd w:val="clear" w:color="auto" w:fill="F6F8FA"/>
-          </w:tcPr>
+          <w:tcPr/>
           <w:p>
             <w:pPr>
               <w:jc w:val="left"/>
@@ -17600,9 +17643,7 @@
           </w:p>
         </w:tc>
         <w:tc>
-          <w:tcPr>
-            <w:shd w:val="clear" w:color="auto" w:fill="F6F8FA"/>
-          </w:tcPr>
+          <w:tcPr/>
           <w:p>
             <w:pPr>
               <w:jc w:val="left"/>
@@ -17613,14 +17654,12 @@
           </w:p>
         </w:tc>
         <w:tc>
-          <w:tcPr>
-            <w:shd w:val="clear" w:color="auto" w:fill="F6F8FA"/>
-          </w:tcPr>
+          <w:tcPr/>
           <w:p>
             <w:pPr>
               <w:numPr>
                 <w:ilvl w:val="0"/>
-                <w:numId w:val="1109"/>
+                <w:numId w:val="1110"/>
               </w:numPr>
               <w:jc w:val="left"/>
             </w:pPr>
@@ -17647,54 +17686,15 @@
       </w:tr>
       <w:tr>
         <w:tc>
-          <w:tcPr/>
+          <w:tcPr>
+            <w:shd w:val="clear" w:color="auto" w:fill="F6F8FA"/>
+          </w:tcPr>
           <w:p>
             <w:pPr>
               <w:jc w:val="left"/>
             </w:pPr>
             <w:r>
               <w:t xml:space="preserve">2.2.2</w:t>
-            </w:r>
-          </w:p>
-        </w:tc>
-        <w:tc>
-          <w:tcPr/>
-          <w:p>
-            <w:pPr>
-              <w:jc w:val="left"/>
-            </w:pPr>
-            <w:r>
-              <w:t xml:space="preserve">2026-08-08</w:t>
-            </w:r>
-          </w:p>
-        </w:tc>
-        <w:tc>
-          <w:tcPr/>
-          <w:p>
-            <w:pPr>
-              <w:numPr>
-                <w:ilvl w:val="0"/>
-                <w:numId w:val="1110"/>
-              </w:numPr>
-              <w:jc w:val="left"/>
-            </w:pPr>
-            <w:r>
-              <w:t xml:space="preserve">Fixed chapter reference in prerequisite (Chapter 3 → Chapter 4).</w:t>
-            </w:r>
-          </w:p>
-        </w:tc>
-      </w:tr>
-      <w:tr>
-        <w:tc>
-          <w:tcPr>
-            <w:shd w:val="clear" w:color="auto" w:fill="F6F8FA"/>
-          </w:tcPr>
-          <w:p>
-            <w:pPr>
-              <w:jc w:val="left"/>
-            </w:pPr>
-            <w:r>
-              <w:t xml:space="preserve">2.2.1</w:t>
             </w:r>
           </w:p>
         </w:tc>
@@ -17724,7 +17724,7 @@
               <w:jc w:val="left"/>
             </w:pPr>
             <w:r>
-              <w:t xml:space="preserve">Changed table and figure caption labels to black (was Huawei red).</w:t>
+              <w:t xml:space="preserve">Fixed chapter reference in prerequisite (Chapter 3 → Chapter 4).</w:t>
             </w:r>
           </w:p>
         </w:tc>
@@ -17737,7 +17737,7 @@
               <w:jc w:val="left"/>
             </w:pPr>
             <w:r>
-              <w:t xml:space="preserve">2.2.0</w:t>
+              <w:t xml:space="preserve">2.2.1</w:t>
             </w:r>
           </w:p>
         </w:tc>
@@ -17763,13 +17763,7 @@
               <w:jc w:val="left"/>
             </w:pPr>
             <w:r>
-              <w:t xml:space="preserve">Added Huawei-branded table styling: red header bar, alternating row</w:t>
-            </w:r>
-            <w:r>
-              <w:t xml:space="preserve"> </w:t>
-            </w:r>
-            <w:r>
-              <w:t xml:space="preserve">colors, and bordered cells.</w:t>
+              <w:t xml:space="preserve">Changed table and figure caption labels to black (was Huawei red).</w:t>
             </w:r>
           </w:p>
         </w:tc>
@@ -17784,7 +17778,7 @@
               <w:jc w:val="left"/>
             </w:pPr>
             <w:r>
-              <w:t xml:space="preserve">2.1.0</w:t>
+              <w:t xml:space="preserve">2.2.0</w:t>
             </w:r>
           </w:p>
         </w:tc>
@@ -17797,7 +17791,7 @@
               <w:jc w:val="left"/>
             </w:pPr>
             <w:r>
-              <w:t xml:space="preserve">2026-08-06</w:t>
+              <w:t xml:space="preserve">2026-08-08</w:t>
             </w:r>
           </w:p>
         </w:tc>
@@ -17814,6 +17808,51 @@
               <w:jc w:val="left"/>
             </w:pPr>
             <w:r>
+              <w:t xml:space="preserve">Added Huawei-branded table styling: red header bar, alternating row</w:t>
+            </w:r>
+            <w:r>
+              <w:t xml:space="preserve"> </w:t>
+            </w:r>
+            <w:r>
+              <w:t xml:space="preserve">colors, and bordered cells.</w:t>
+            </w:r>
+          </w:p>
+        </w:tc>
+      </w:tr>
+      <w:tr>
+        <w:tc>
+          <w:tcPr/>
+          <w:p>
+            <w:pPr>
+              <w:jc w:val="left"/>
+            </w:pPr>
+            <w:r>
+              <w:t xml:space="preserve">2.1.0</w:t>
+            </w:r>
+          </w:p>
+        </w:tc>
+        <w:tc>
+          <w:tcPr/>
+          <w:p>
+            <w:pPr>
+              <w:jc w:val="left"/>
+            </w:pPr>
+            <w:r>
+              <w:t xml:space="preserve">2026-08-06</w:t>
+            </w:r>
+          </w:p>
+        </w:tc>
+        <w:tc>
+          <w:tcPr/>
+          <w:p>
+            <w:pPr>
+              <w:numPr>
+                <w:ilvl w:val="0"/>
+                <w:numId w:val="1114"/>
+              </w:numPr>
+              <w:jc w:val="left"/>
+            </w:pPr>
+            <w:r>
               <w:t xml:space="preserve">Updated ECS flavor to</w:t>
             </w:r>
             <w:r>
@@ -17836,7 +17875,7 @@
             <w:pPr>
               <w:numPr>
                 <w:ilvl w:val="0"/>
-                <w:numId w:val="1113"/>
+                <w:numId w:val="1114"/>
               </w:numPr>
               <w:jc w:val="left"/>
             </w:pPr>
@@ -17848,7 +17887,7 @@
             <w:pPr>
               <w:numPr>
                 <w:ilvl w:val="0"/>
-                <w:numId w:val="1113"/>
+                <w:numId w:val="1114"/>
               </w:numPr>
               <w:jc w:val="left"/>
             </w:pPr>
@@ -17860,7 +17899,7 @@
             <w:pPr>
               <w:numPr>
                 <w:ilvl w:val="0"/>
-                <w:numId w:val="1113"/>
+                <w:numId w:val="1114"/>
               </w:numPr>
               <w:jc w:val="left"/>
             </w:pPr>
@@ -17872,7 +17911,7 @@
             <w:pPr>
               <w:numPr>
                 <w:ilvl w:val="0"/>
-                <w:numId w:val="1113"/>
+                <w:numId w:val="1114"/>
               </w:numPr>
               <w:jc w:val="left"/>
             </w:pPr>
@@ -17884,7 +17923,7 @@
             <w:pPr>
               <w:numPr>
                 <w:ilvl w:val="0"/>
-                <w:numId w:val="1113"/>
+                <w:numId w:val="1114"/>
               </w:numPr>
               <w:jc w:val="left"/>
             </w:pPr>
@@ -17902,7 +17941,7 @@
             <w:pPr>
               <w:numPr>
                 <w:ilvl w:val="0"/>
-                <w:numId w:val="1113"/>
+                <w:numId w:val="1114"/>
               </w:numPr>
               <w:jc w:val="left"/>
             </w:pPr>
@@ -17951,7 +17990,7 @@
             <w:pPr>
               <w:numPr>
                 <w:ilvl w:val="0"/>
-                <w:numId w:val="1113"/>
+                <w:numId w:val="1114"/>
               </w:numPr>
               <w:jc w:val="left"/>
             </w:pPr>
@@ -17963,7 +18002,7 @@
             <w:pPr>
               <w:numPr>
                 <w:ilvl w:val="0"/>
-                <w:numId w:val="1113"/>
+                <w:numId w:val="1114"/>
               </w:numPr>
               <w:jc w:val="left"/>
             </w:pPr>
@@ -18014,7 +18053,7 @@
             <w:pPr>
               <w:numPr>
                 <w:ilvl w:val="0"/>
-                <w:numId w:val="1113"/>
+                <w:numId w:val="1114"/>
               </w:numPr>
               <w:jc w:val="left"/>
             </w:pPr>
@@ -18041,7 +18080,9 @@
       </w:tr>
       <w:tr>
         <w:tc>
-          <w:tcPr/>
+          <w:tcPr>
+            <w:shd w:val="clear" w:color="auto" w:fill="F6F8FA"/>
+          </w:tcPr>
           <w:p>
             <w:pPr>
               <w:jc w:val="left"/>
@@ -18052,7 +18093,9 @@
           </w:p>
         </w:tc>
         <w:tc>
-          <w:tcPr/>
+          <w:tcPr>
+            <w:shd w:val="clear" w:color="auto" w:fill="F6F8FA"/>
+          </w:tcPr>
           <w:p>
             <w:pPr>
               <w:jc w:val="left"/>
@@ -18063,12 +18106,14 @@
           </w:p>
         </w:tc>
         <w:tc>
-          <w:tcPr/>
+          <w:tcPr>
+            <w:shd w:val="clear" w:color="auto" w:fill="F6F8FA"/>
+          </w:tcPr>
           <w:p>
             <w:pPr>
               <w:numPr>
                 <w:ilvl w:val="0"/>
-                <w:numId w:val="1114"/>
+                <w:numId w:val="1115"/>
               </w:numPr>
               <w:jc w:val="left"/>
             </w:pPr>
@@ -18086,7 +18131,7 @@
             <w:pPr>
               <w:numPr>
                 <w:ilvl w:val="0"/>
-                <w:numId w:val="1114"/>
+                <w:numId w:val="1115"/>
               </w:numPr>
               <w:jc w:val="left"/>
             </w:pPr>
@@ -18140,7 +18185,7 @@
             <w:pPr>
               <w:numPr>
                 <w:ilvl w:val="0"/>
-                <w:numId w:val="1114"/>
+                <w:numId w:val="1115"/>
               </w:numPr>
               <w:jc w:val="left"/>
             </w:pPr>
@@ -18188,7 +18233,7 @@
             <w:pPr>
               <w:numPr>
                 <w:ilvl w:val="0"/>
-                <w:numId w:val="1114"/>
+                <w:numId w:val="1115"/>
               </w:numPr>
               <w:jc w:val="left"/>
             </w:pPr>
@@ -18209,9 +18254,7 @@
       </w:tr>
       <w:tr>
         <w:tc>
-          <w:tcPr>
-            <w:shd w:val="clear" w:color="auto" w:fill="F6F8FA"/>
-          </w:tcPr>
+          <w:tcPr/>
           <w:p>
             <w:pPr>
               <w:jc w:val="left"/>
@@ -18222,9 +18265,7 @@
           </w:p>
         </w:tc>
         <w:tc>
-          <w:tcPr>
-            <w:shd w:val="clear" w:color="auto" w:fill="F6F8FA"/>
-          </w:tcPr>
+          <w:tcPr/>
           <w:p>
             <w:pPr>
               <w:jc w:val="left"/>
@@ -18235,14 +18276,12 @@
           </w:p>
         </w:tc>
         <w:tc>
-          <w:tcPr>
-            <w:shd w:val="clear" w:color="auto" w:fill="F6F8FA"/>
-          </w:tcPr>
+          <w:tcPr/>
           <w:p>
             <w:pPr>
               <w:numPr>
                 <w:ilvl w:val="0"/>
-                <w:numId w:val="1115"/>
+                <w:numId w:val="1116"/>
               </w:numPr>
               <w:jc w:val="left"/>
             </w:pPr>
@@ -18254,7 +18293,7 @@
             <w:pPr>
               <w:numPr>
                 <w:ilvl w:val="0"/>
-                <w:numId w:val="1115"/>
+                <w:numId w:val="1116"/>
               </w:numPr>
               <w:jc w:val="left"/>
             </w:pPr>
@@ -18266,7 +18305,7 @@
             <w:pPr>
               <w:numPr>
                 <w:ilvl w:val="0"/>
-                <w:numId w:val="1115"/>
+                <w:numId w:val="1116"/>
               </w:numPr>
               <w:jc w:val="left"/>
             </w:pPr>
@@ -18278,7 +18317,7 @@
             <w:pPr>
               <w:numPr>
                 <w:ilvl w:val="0"/>
-                <w:numId w:val="1115"/>
+                <w:numId w:val="1116"/>
               </w:numPr>
               <w:jc w:val="left"/>
             </w:pPr>
@@ -18296,7 +18335,7 @@
             <w:pPr>
               <w:numPr>
                 <w:ilvl w:val="0"/>
-                <w:numId w:val="1115"/>
+                <w:numId w:val="1116"/>
               </w:numPr>
               <w:jc w:val="left"/>
             </w:pPr>
@@ -18308,7 +18347,7 @@
             <w:pPr>
               <w:numPr>
                 <w:ilvl w:val="0"/>
-                <w:numId w:val="1115"/>
+                <w:numId w:val="1116"/>
               </w:numPr>
               <w:jc w:val="left"/>
             </w:pPr>
@@ -19698,6 +19737,9 @@
     <w:abstractNumId w:val="991"/>
   </w:num>
   <w:num w:numId="1115">
+    <w:abstractNumId w:val="991"/>
+  </w:num>
+  <w:num w:numId="1116">
     <w:abstractNumId w:val="991"/>
   </w:num>
 </w:numbering>
@@ -20202,7 +20244,7 @@
       <w:outlineLvl w:val="9"/>
       <w:jc w:val="right"/>
       <w:pBdr>
-        <w:bottom w:val="single" w:sz="4" w:space="1" w:color="000000"/>
+        <w:bottom w:val="single" w:sz="4" w:space="1" w:color="C7000B"/>
       </w:pBdr>
     </w:pPr>
     <w:rPr>
@@ -20309,18 +20351,6 @@
       <w:rFonts w:ascii="HarmonyOS Sans" w:hAnsi="HarmonyOS Sans"/>
       <w:color w:val="595959"/>
       <w:sz w:val="24"/>
-    </w:rPr>
-  </w:style>
-  <w:style w:customStyle="1" w:styleId="TOCTitle" w:type="paragraph">
-    <w:name w:val="TOCTitle"/>
-    <w:pPr>
-      <w:spacing w:after="200" w:before="0"/>
-    </w:pPr>
-    <w:rPr>
-      <w:rFonts w:ascii="HarmonyOS Sans" w:hAnsi="HarmonyOS Sans"/>
-      <w:b/>
-      <w:color w:val="1F2328"/>
-      <w:sz w:val="44"/>
     </w:rPr>
   </w:style>
   <w:style w:customStyle="1" w:styleId="ImageBlock" w:type="paragraph">
@@ -20650,6 +20680,14 @@
       <w:ind w:left="0"/>
       <w:spacing w:after="40"/>
     </w:pPr>
+    <w:rPr>
+      <w:rFonts w:ascii="HarmonyOS Sans" w:hAnsi="HarmonyOS Sans"/>
+      <w:b/>
+      <w:bCs/>
+      <w:sz w:val="24"/>
+      <w:szCs w:val="24"/>
+      <w:color w:val="1F2328"/>
+    </w:rPr>
   </w:style>
   <w:style w:type="paragraph" w:styleId="TOC2">
     <w:name w:val="toc2"/>
@@ -20664,6 +20702,12 @@
       <w:ind w:left="420"/>
       <w:spacing w:after="40"/>
     </w:pPr>
+    <w:rPr>
+      <w:rFonts w:ascii="HarmonyOS Sans" w:hAnsi="HarmonyOS Sans"/>
+      <w:sz w:val="20"/>
+      <w:szCs w:val="20"/>
+      <w:color w:val="1F2328"/>
+    </w:rPr>
   </w:style>
   <w:style w:type="paragraph" w:styleId="TOC3">
     <w:name w:val="toc3"/>
@@ -20678,6 +20722,12 @@
       <w:ind w:left="840"/>
       <w:spacing w:after="40"/>
     </w:pPr>
+    <w:rPr>
+      <w:rFonts w:ascii="HarmonyOS Sans" w:hAnsi="HarmonyOS Sans"/>
+      <w:sz w:val="20"/>
+      <w:szCs w:val="20"/>
+      <w:color w:val="1F2328"/>
+    </w:rPr>
   </w:style>
 </w:styles>
 </file>

</xml_diff>

<commit_message>
Fix DOCX subsection number size (v6.9.1)
- H2/H3/H4 section numbers were 56pt (same as H1) instead of
  matching the heading text size (18/16/14pt)
- SectionNumber style cleared; 56pt set directly on H1 number runs only
- Bump all templates + setup-guide to v6.9.1; regenerate artifacts
</commit_message>
<xml_diff>
--- a/documents/setup-guide/setup-guide.docx
+++ b/documents/setup-guide/setup-guide.docx
@@ -84,7 +84,7 @@
           <w:b/>
           <w:sz w:val="24"/>
         </w:rPr>
-        <w:t xml:space="preserve">v6.9.0</w:t>
+        <w:t xml:space="preserve">v6.9.1</w:t>
       </w:r>
       <w:r>
         <w:rPr>
@@ -96,7 +96,7 @@
         <w:rPr>
           <w:sz w:val="24"/>
         </w:rPr>
-        <w:t xml:space="preserve">— September 20, 2026 21:25</w:t>
+        <w:t xml:space="preserve">— September 20, 2026 22:31</w:t>
       </w:r>
     </w:p>
     <w:sdt>
@@ -133,6 +133,7 @@
       <w:r>
         <w:rPr>
           <w:rStyle w:val="SectionNumber"/>
+          <w:sz w:val="112"/>
         </w:rPr>
         <w:t xml:space="preserve">1</w:t>
       </w:r>
@@ -1905,6 +1906,7 @@
       <w:r>
         <w:rPr>
           <w:rStyle w:val="SectionNumber"/>
+          <w:sz w:val="112"/>
         </w:rPr>
         <w:t xml:space="preserve">2</w:t>
       </w:r>
@@ -3172,6 +3174,7 @@
       <w:r>
         <w:rPr>
           <w:rStyle w:val="SectionNumber"/>
+          <w:sz w:val="112"/>
         </w:rPr>
         <w:t xml:space="preserve">3</w:t>
       </w:r>
@@ -4867,6 +4870,7 @@
       <w:r>
         <w:rPr>
           <w:rStyle w:val="SectionNumber"/>
+          <w:sz w:val="112"/>
         </w:rPr>
         <w:t xml:space="preserve">4</w:t>
       </w:r>
@@ -7221,6 +7225,7 @@
       <w:r>
         <w:rPr>
           <w:rStyle w:val="SectionNumber"/>
+          <w:sz w:val="112"/>
         </w:rPr>
         <w:t xml:space="preserve">5</w:t>
       </w:r>
@@ -8846,6 +8851,7 @@
       <w:r>
         <w:rPr>
           <w:rStyle w:val="SectionNumber"/>
+          <w:sz w:val="112"/>
         </w:rPr>
         <w:t xml:space="preserve">6</w:t>
       </w:r>
@@ -10817,6 +10823,7 @@
       <w:r>
         <w:rPr>
           <w:rStyle w:val="SectionNumber"/>
+          <w:sz w:val="112"/>
         </w:rPr>
         <w:t xml:space="preserve">7</w:t>
       </w:r>
@@ -12458,6 +12465,7 @@
       <w:r>
         <w:rPr>
           <w:rStyle w:val="SectionNumber"/>
+          <w:sz w:val="112"/>
         </w:rPr>
         <w:t xml:space="preserve">8</w:t>
       </w:r>
@@ -13248,6 +13256,7 @@
       <w:r>
         <w:rPr>
           <w:rStyle w:val="SectionNumber"/>
+          <w:sz w:val="112"/>
         </w:rPr>
         <w:t xml:space="preserve">9</w:t>
       </w:r>
@@ -13345,7 +13354,7 @@
               <w:jc w:val="left"/>
             </w:pPr>
             <w:r>
-              <w:t xml:space="preserve">6.9.0</w:t>
+              <w:t xml:space="preserve">6.9.1</w:t>
             </w:r>
           </w:p>
         </w:tc>
@@ -13371,7 +13380,7 @@
               <w:jc w:val="left"/>
             </w:pPr>
             <w:r>
-              <w:t xml:space="preserve">TOC styling: the table-of-contents title rule is now Huawei red (was black) in both PDF and DOCX, matching the H1 heading red rules. DOCX TOC entries now match the PDF: level 1 bold 12pt, levels 2-3 normal 10pt, HarmonyOS Sans font. DOCX TOC depth increased from 2 to 3 levels (matching PDF tocdepth). Dead TOCTitle style removed from DOCX.</w:t>
+              <w:t xml:space="preserve">Fix DOCX subsection number size: H2/H3/H4 section numbers were rendered at 56pt (same as H1) instead of matching the heading text size (18/16/14pt). The SectionNumber style is now unstyled (inherits heading size); 56pt is set directly on H1 number runs only.</w:t>
             </w:r>
           </w:p>
         </w:tc>
@@ -13386,7 +13395,7 @@
               <w:jc w:val="left"/>
             </w:pPr>
             <w:r>
-              <w:t xml:space="preserve">6.8.3</w:t>
+              <w:t xml:space="preserve">6.9.0</w:t>
             </w:r>
           </w:p>
         </w:tc>
@@ -13399,7 +13408,7 @@
               <w:jc w:val="left"/>
             </w:pPr>
             <w:r>
-              <w:t xml:space="preserve">2026-09-20</w:t>
+              <w:t xml:space="preserve">2026-09-21</w:t>
             </w:r>
           </w:p>
         </w:tc>
@@ -13416,7 +13425,7 @@
               <w:jc w:val="left"/>
             </w:pPr>
             <w:r>
-              <w:t xml:space="preserve">Docs accuracy fix: the multi-format pipeline descriptions in README, AGENTS, and all four SKILL.md files now correctly separate the DOCX/Markdown path (pre-processor then docbook then pandoc) from the HTML path (pre-processor then asciidoctor html5) — the previous wording implied HTML also went through docbook and pandoc. Corrected a stale comment in the DOCX fixer.</w:t>
+              <w:t xml:space="preserve">TOC styling: the table-of-contents title rule is now Huawei red (was black) in both PDF and DOCX, matching the H1 heading red rules. DOCX TOC entries now match the PDF: level 1 bold 12pt, levels 2-3 normal 10pt, HarmonyOS Sans font. DOCX TOC depth increased from 2 to 3 levels (matching PDF tocdepth). Dead TOCTitle style removed from DOCX.</w:t>
             </w:r>
           </w:p>
         </w:tc>
@@ -13429,7 +13438,7 @@
               <w:jc w:val="left"/>
             </w:pPr>
             <w:r>
-              <w:t xml:space="preserve">6.8.2</w:t>
+              <w:t xml:space="preserve">6.8.3</w:t>
             </w:r>
           </w:p>
         </w:tc>
@@ -13455,7 +13464,7 @@
               <w:jc w:val="left"/>
             </w:pPr>
             <w:r>
-              <w:t xml:space="preserve">Documentation and cleanup: README, AGENTS, and all four SKILL.md files now describe the real multi-format pipeline (pre-processor + docx_fix --fix + --lang flag) instead of the pre-v6.4 asciidoctor-to-pandoc chain. DOCX TOC title is now right-aligned like the PDF (was targeting a dead style). Signature names render bold like the PDF. Dead code removed (unused Caption style, dead TOCTitle style, dead HTML badge CSS). The --template and --lang flags accept the equals form (--template=guide). Various stale comments corrected.</w:t>
+              <w:t xml:space="preserve">Docs accuracy fix: the multi-format pipeline descriptions in README, AGENTS, and all four SKILL.md files now correctly separate the DOCX/Markdown path (pre-processor then docbook then pandoc) from the HTML path (pre-processor then asciidoctor html5) — the previous wording implied HTML also went through docbook and pandoc. Corrected a stale comment in the DOCX fixer.</w:t>
             </w:r>
           </w:p>
         </w:tc>
@@ -13470,7 +13479,7 @@
               <w:jc w:val="left"/>
             </w:pPr>
             <w:r>
-              <w:t xml:space="preserve">6.8.1</w:t>
+              <w:t xml:space="preserve">6.8.2</w:t>
             </w:r>
           </w:p>
         </w:tc>
@@ -13500,7 +13509,7 @@
               <w:jc w:val="left"/>
             </w:pPr>
             <w:r>
-              <w:t xml:space="preserve">Quality-pass fixes for v6.8.0: non-technical covers no longer show a stray Date paragraph (regression from the meta-scan change); the technical cover table is no longer hijacked from the body when :nochangelog: is set (boundary check on the cover-table detection); the Version/Date/Scenario table now renders unconditionally like the PDF (was gated by :nochangelog:); empty cover tables are skipped when no report values are set; corrected the cover-element-order wording in the v6.8.0 changelog.</w:t>
+              <w:t xml:space="preserve">Documentation and cleanup: README, AGENTS, and all four SKILL.md files now describe the real multi-format pipeline (pre-processor + docx_fix --fix + --lang flag) instead of the pre-v6.4 asciidoctor-to-pandoc chain. DOCX TOC title is now right-aligned like the PDF (was targeting a dead style). Signature names render bold like the PDF. Dead code removed (unused Caption style, dead TOCTitle style, dead HTML badge CSS). The --template and --lang flags accept the equals form (--template=guide). Various stale comments corrected.</w:t>
             </w:r>
           </w:p>
         </w:tc>
@@ -13513,7 +13522,7 @@
               <w:jc w:val="left"/>
             </w:pPr>
             <w:r>
-              <w:t xml:space="preserve">6.8.0</w:t>
+              <w:t xml:space="preserve">6.8.1</w:t>
             </w:r>
           </w:p>
         </w:tc>
@@ -13539,7 +13548,7 @@
               <w:jc w:val="left"/>
             </w:pPr>
             <w:r>
-              <w:t xml:space="preserve">Technical report covers now match the PDF in DOCX/MD/HTML: the title uses the PDF’s 24pt size (was 36pt), the report type label appears below the title (the DOCX cover keeps the established title-first order; the PDF has label-then-title), and the Version/Date/Scenario table is rendered with the PDF’s red label column. The cover meta line now shows the report version and its set date (was the document version and the build date). Authors, when set, appear as a table row like the PDF.</w:t>
+              <w:t xml:space="preserve">Quality-pass fixes for v6.8.0: non-technical covers no longer show a stray Date paragraph (regression from the meta-scan change); the technical cover table is no longer hijacked from the body when :nochangelog: is set (boundary check on the cover-table detection); the Version/Date/Scenario table now renders unconditionally like the PDF (was gated by :nochangelog:); empty cover tables are skipped when no report values are set; corrected the cover-element-order wording in the v6.8.0 changelog.</w:t>
             </w:r>
           </w:p>
         </w:tc>
@@ -13554,7 +13563,7 @@
               <w:jc w:val="left"/>
             </w:pPr>
             <w:r>
-              <w:t xml:space="preserve">6.7.0</w:t>
+              <w:t xml:space="preserve">6.8.0</w:t>
             </w:r>
           </w:p>
         </w:tc>
@@ -13584,7 +13593,7 @@
               <w:jc w:val="left"/>
             </w:pPr>
             <w:r>
-              <w:t xml:space="preserve">Badge and language fidelity: DOCX badge pills now render black text like the PDF (was frame-colored), use the correct label case (Pass, not PASS), include the Portuguese POC labels (Atendido, Parcial, Falha, Ignorado), and render at native width per template (testbook badge text no longer shrinks). Portuguese signature greetings now match the PDF (At.te,), the POC classification label matches the full PDF wording, and the secondary-format table headers (stakeholders, closing record, test summary, changelog) are now language-aware. DOCX footers show Página in Portuguese documents. Cover dates no longer zero-pad the day.</w:t>
+              <w:t xml:space="preserve">Technical report covers now match the PDF in DOCX/MD/HTML: the title uses the PDF’s 24pt size (was 36pt), the report type label appears below the title (the DOCX cover keeps the established title-first order; the PDF has label-then-title), and the Version/Date/Scenario table is rendered with the PDF’s red label column. The cover meta line now shows the report version and its set date (was the document version and the build date). Authors, when set, appear as a table row like the PDF.</w:t>
             </w:r>
           </w:p>
         </w:tc>
@@ -13597,7 +13606,7 @@
               <w:jc w:val="left"/>
             </w:pPr>
             <w:r>
-              <w:t xml:space="preserve">6.6.1</w:t>
+              <w:t xml:space="preserve">6.7.0</w:t>
             </w:r>
           </w:p>
         </w:tc>
@@ -13623,7 +13632,7 @@
               <w:jc w:val="left"/>
             </w:pPr>
             <w:r>
-              <w:t xml:space="preserve">Quality-pass fixes for v6.6.0: the TESTCASE-marker strip now covers the entire DOCX fix run (a failure at any stage can no longer leave markers in the output file); the fixer resets its template state between in-process runs (the documented path-sniffing fallback works again); build.sh also cleans temporary files on interrupt signals; fixed a CHANGELOG typo.</w:t>
+              <w:t xml:space="preserve">Badge and language fidelity: DOCX badge pills now render black text like the PDF (was frame-colored), use the correct label case (Pass, not PASS), include the Portuguese POC labels (Atendido, Parcial, Falha, Ignorado), and render at native width per template (testbook badge text no longer shrinks). Portuguese signature greetings now match the PDF (At.te,), the POC classification label matches the full PDF wording, and the secondary-format table headers (stakeholders, closing record, test summary, changelog) are now language-aware. DOCX footers show Página in Portuguese documents. Cover dates no longer zero-pad the day.</w:t>
             </w:r>
           </w:p>
         </w:tc>
@@ -13638,7 +13647,7 @@
               <w:jc w:val="left"/>
             </w:pPr>
             <w:r>
-              <w:t xml:space="preserve">6.6.0</w:t>
+              <w:t xml:space="preserve">6.6.1</w:t>
             </w:r>
           </w:p>
         </w:tc>
@@ -13668,6 +13677,45 @@
               <w:jc w:val="left"/>
             </w:pPr>
             <w:r>
+              <w:t xml:space="preserve">Quality-pass fixes for v6.6.0: the TESTCASE-marker strip now covers the entire DOCX fix run (a failure at any stage can no longer leave markers in the output file); the fixer resets its template state between in-process runs (the documented path-sniffing fallback works again); build.sh also cleans temporary files on interrupt signals; fixed a CHANGELOG typo.</w:t>
+            </w:r>
+          </w:p>
+        </w:tc>
+      </w:tr>
+      <w:tr>
+        <w:tc>
+          <w:tcPr/>
+          <w:p>
+            <w:pPr>
+              <w:jc w:val="left"/>
+            </w:pPr>
+            <w:r>
+              <w:t xml:space="preserve">6.6.0</w:t>
+            </w:r>
+          </w:p>
+        </w:tc>
+        <w:tc>
+          <w:tcPr/>
+          <w:p>
+            <w:pPr>
+              <w:jc w:val="left"/>
+            </w:pPr>
+            <w:r>
+              <w:t xml:space="preserve">2026-09-20</w:t>
+            </w:r>
+          </w:p>
+        </w:tc>
+        <w:tc>
+          <w:tcPr/>
+          <w:p>
+            <w:pPr>
+              <w:numPr>
+                <w:ilvl w:val="0"/>
+                <w:numId w:val="1050"/>
+              </w:numPr>
+              <w:jc w:val="left"/>
+            </w:pPr>
+            <w:r>
               <w:t xml:space="preserve">Pipeline robustness: DOCX post-processing now fails loudly when content styling errors occur (TESTCASE markers can no longer leak into output); the DOCX fixer takes an explicit</w:t>
             </w:r>
             <w:r>
@@ -13690,54 +13738,15 @@
       </w:tr>
       <w:tr>
         <w:tc>
-          <w:tcPr/>
+          <w:tcPr>
+            <w:shd w:val="clear" w:color="auto" w:fill="F6F8FA"/>
+          </w:tcPr>
           <w:p>
             <w:pPr>
               <w:jc w:val="left"/>
             </w:pPr>
             <w:r>
               <w:t xml:space="preserve">6.5.2</w:t>
-            </w:r>
-          </w:p>
-        </w:tc>
-        <w:tc>
-          <w:tcPr/>
-          <w:p>
-            <w:pPr>
-              <w:jc w:val="left"/>
-            </w:pPr>
-            <w:r>
-              <w:t xml:space="preserve">2026-09-20</w:t>
-            </w:r>
-          </w:p>
-        </w:tc>
-        <w:tc>
-          <w:tcPr/>
-          <w:p>
-            <w:pPr>
-              <w:numPr>
-                <w:ilvl w:val="0"/>
-                <w:numId w:val="1050"/>
-              </w:numPr>
-              <w:jc w:val="left"/>
-            </w:pPr>
-            <w:r>
-              <w:t xml:space="preserve">Quality-pass fixes for v6.5.1: LaTeX quote conversion now handles only paired quotes (quote characters inside code arguments are no longer corrupted); signature cells containing escaped ampersands are no longer split; round-trip HTML generation guards the asciidoctor-diagram dependency and fails loudly when generation fails; pre-processor unit tests now cover pipe escaping in all five table handlers.</w:t>
-            </w:r>
-          </w:p>
-        </w:tc>
-      </w:tr>
-      <w:tr>
-        <w:tc>
-          <w:tcPr>
-            <w:shd w:val="clear" w:color="auto" w:fill="F6F8FA"/>
-          </w:tcPr>
-          <w:p>
-            <w:pPr>
-              <w:jc w:val="left"/>
-            </w:pPr>
-            <w:r>
-              <w:t xml:space="preserve">6.5.1</w:t>
             </w:r>
           </w:p>
         </w:tc>
@@ -13767,7 +13776,7 @@
               <w:jc w:val="left"/>
             </w:pPr>
             <w:r>
-              <w:t xml:space="preserve">Fixed DOCX/MD/HTML output: tables are no longer corrupted when changelog, signature, or summary content contains a pipe character (“|”). Badge text is now preserved in DOCX/MD/HTML — a “Ready” badge renders “Ready” instead of “[NEW]”. Multi-item changelog entries render as bullet lists instead of being joined with a literal “+”. POC documents now include the changelog in DOCX/MD/HTML. The :noanswers: attribute now hides test results and remarks in DOCX/MD/HTML, matching the PDF. Inline LaTeX (monospace text, arrows, LaTeX quotes) no longer leaks from changelog entries. The test suite now exercises the real build pipeline (pre-processor wired into round-trip and DOCX tests), with new pre-processor unit tests.</w:t>
+              <w:t xml:space="preserve">Quality-pass fixes for v6.5.1: LaTeX quote conversion now handles only paired quotes (quote characters inside code arguments are no longer corrupted); signature cells containing escaped ampersands are no longer split; round-trip HTML generation guards the asciidoctor-diagram dependency and fails loudly when generation fails; pre-processor unit tests now cover pipe escaping in all five table handlers.</w:t>
             </w:r>
           </w:p>
         </w:tc>
@@ -13780,7 +13789,7 @@
               <w:jc w:val="left"/>
             </w:pPr>
             <w:r>
-              <w:t xml:space="preserve">6.5.0</w:t>
+              <w:t xml:space="preserve">6.5.1</w:t>
             </w:r>
           </w:p>
         </w:tc>
@@ -13806,7 +13815,7 @@
               <w:jc w:val="left"/>
             </w:pPr>
             <w:r>
-              <w:t xml:space="preserve">Evidence checklist simplified to plain bullets in both PDF and DOCX (checkbox markers removed for compatibility). Planned Activities list in DOCX now uses Word’s native lower-roman numbering (i., ii., iii.) matching the PDF. Badges in DOCX replaced with exact-replica PNG pill images (rounded, colored frame and background, bold text) matching the PDF \ huaweibadge look — assets committed to the repo. Signature blocks in DOCX no longer show literal + symbols (proper hard line breaks).</w:t>
+              <w:t xml:space="preserve">Fixed DOCX/MD/HTML output: tables are no longer corrupted when changelog, signature, or summary content contains a pipe character (“|”). Badge text is now preserved in DOCX/MD/HTML — a “Ready” badge renders “Ready” instead of “[NEW]”. Multi-item changelog entries render as bullet lists instead of being joined with a literal “+”. POC documents now include the changelog in DOCX/MD/HTML. The :noanswers: attribute now hides test results and remarks in DOCX/MD/HTML, matching the PDF. Inline LaTeX (monospace text, arrows, LaTeX quotes) no longer leaks from changelog entries. The test suite now exercises the real build pipeline (pre-processor wired into round-trip and DOCX tests), with new pre-processor unit tests.</w:t>
             </w:r>
           </w:p>
         </w:tc>
@@ -13821,7 +13830,7 @@
               <w:jc w:val="left"/>
             </w:pPr>
             <w:r>
-              <w:t xml:space="preserve">6.4.7</w:t>
+              <w:t xml:space="preserve">6.5.0</w:t>
             </w:r>
           </w:p>
         </w:tc>
@@ -13851,7 +13860,7 @@
               <w:jc w:val="left"/>
             </w:pPr>
             <w:r>
-              <w:t xml:space="preserve">Section titles in DOCX now match the PDF heading design: the big section number (56pt) sits on the left, the title text is pushed to the right edge (a right tab stop mimics the LaTeX \ hfill), and the red rule runs below — previously the title sat left-aligned next to a small number. Applies to all templates.</w:t>
+              <w:t xml:space="preserve">Evidence checklist simplified to plain bullets in both PDF and DOCX (checkbox markers removed for compatibility). Planned Activities list in DOCX now uses Word’s native lower-roman numbering (i., ii., iii.) matching the PDF. Badges in DOCX replaced with exact-replica PNG pill images (rounded, colored frame and background, bold text) matching the PDF \ huaweibadge look — assets committed to the repo. Signature blocks in DOCX no longer show literal + symbols (proper hard line breaks).</w:t>
             </w:r>
           </w:p>
         </w:tc>
@@ -13864,7 +13873,7 @@
               <w:jc w:val="left"/>
             </w:pPr>
             <w:r>
-              <w:t xml:space="preserve">6.4.6</w:t>
+              <w:t xml:space="preserve">6.4.7</w:t>
             </w:r>
           </w:p>
         </w:tc>
@@ -13890,7 +13899,7 @@
               <w:jc w:val="left"/>
             </w:pPr>
             <w:r>
-              <w:t xml:space="preserve">Code blocks inside test cases no longer break the red left rule in DOCX — the code style’s left indent (which jogged the rule) is reset inside test case blocks, and code blocks now show the PDF’s code box (gray background with thin border on top, bottom, and right, red rule continuing on the left).</w:t>
+              <w:t xml:space="preserve">Section titles in DOCX now match the PDF heading design: the big section number (56pt) sits on the left, the title text is pushed to the right edge (a right tab stop mimics the LaTeX \ hfill), and the red rule runs below — previously the title sat left-aligned next to a small number. Applies to all templates.</w:t>
             </w:r>
           </w:p>
         </w:tc>
@@ -13905,7 +13914,7 @@
               <w:jc w:val="left"/>
             </w:pPr>
             <w:r>
-              <w:t xml:space="preserve">6.4.5</w:t>
+              <w:t xml:space="preserve">6.4.6</w:t>
             </w:r>
           </w:p>
         </w:tc>
@@ -13935,7 +13944,7 @@
               <w:jc w:val="left"/>
             </w:pPr>
             <w:r>
-              <w:t xml:space="preserve">DOCX polish pass: all captions centered (matching the PDF), vertical spacing between blocks matched to the LaTeX rhythm (medskip/smallskip around captions, field bars, and steps), and test steps now render as separate paragraphs each with the red bold number (previously merged into one paragraph).</w:t>
+              <w:t xml:space="preserve">Code blocks inside test cases no longer break the red left rule in DOCX — the code style’s left indent (which jogged the rule) is reset inside test case blocks, and code blocks now show the PDF’s code box (gray background with thin border on top, bottom, and right, red rule continuing on the left).</w:t>
             </w:r>
           </w:p>
         </w:tc>
@@ -13948,7 +13957,7 @@
               <w:jc w:val="left"/>
             </w:pPr>
             <w:r>
-              <w:t xml:space="preserve">6.4.4</w:t>
+              <w:t xml:space="preserve">6.4.5</w:t>
             </w:r>
           </w:p>
         </w:tc>
@@ -13974,7 +13983,7 @@
               <w:jc w:val="left"/>
             </w:pPr>
             <w:r>
-              <w:t xml:space="preserve">DOCX covers now show the logo, cover text, and version/date/time meta line like the PDF. Test case blocks in DOCX get the PDF’s visual wrapper: red left rule, red field header bars, and red step numbers. Captions follow the PDF ordering system in DOCX, MD, and HTML (Table/Diagram/Figure/Testcase N: with bold symbol). Portuguese PDFs now label diagrams "Diagrama N:" (was hardcoded English "Diagram"). Markdown and HTML output no longer leaks raw LaTeX from passthrough blocks — the DOCX pre-processor now feeds those pipelines too.</w:t>
+              <w:t xml:space="preserve">DOCX polish pass: all captions centered (matching the PDF), vertical spacing between blocks matched to the LaTeX rhythm (medskip/smallskip around captions, field bars, and steps), and test steps now render as separate paragraphs each with the red bold number (previously merged into one paragraph).</w:t>
             </w:r>
           </w:p>
         </w:tc>
@@ -13989,7 +13998,7 @@
               <w:jc w:val="left"/>
             </w:pPr>
             <w:r>
-              <w:t xml:space="preserve">6.4.3</w:t>
+              <w:t xml:space="preserve">6.4.4</w:t>
             </w:r>
           </w:p>
         </w:tc>
@@ -14019,7 +14028,7 @@
               <w:jc w:val="left"/>
             </w:pPr>
             <w:r>
-              <w:t xml:space="preserve">Testbook and POC DOCX output now matches the PDF much more closely: native table of contents (language-aware, auto-populated), each section starts on a new page, embedded images and diagrams (PlantUML/Graphviz rendered), white-on-red table headers, cover version line under the title, centered test case captions, and plain black rules for signature grids.</w:t>
+              <w:t xml:space="preserve">DOCX covers now show the logo, cover text, and version/date/time meta line like the PDF. Test case blocks in DOCX get the PDF’s visual wrapper: red left rule, red field header bars, and red step numbers. Captions follow the PDF ordering system in DOCX, MD, and HTML (Table/Diagram/Figure/Testcase N: with bold symbol). Portuguese PDFs now label diagrams "Diagrama N:" (was hardcoded English "Diagram"). Markdown and HTML output no longer leaks raw LaTeX from passthrough blocks — the DOCX pre-processor now feeds those pipelines too.</w:t>
             </w:r>
           </w:p>
         </w:tc>
@@ -14032,7 +14041,7 @@
               <w:jc w:val="left"/>
             </w:pPr>
             <w:r>
-              <w:t xml:space="preserve">6.4.2</w:t>
+              <w:t xml:space="preserve">6.4.3</w:t>
             </w:r>
           </w:p>
         </w:tc>
@@ -14058,7 +14067,7 @@
               <w:jc w:val="left"/>
             </w:pPr>
             <w:r>
-              <w:t xml:space="preserve">DOCX output for POC and testbook templates now includes all passthrough content (stakeholders, closing record, signatures, test cases, test summary, changelog) via a new pre-processor. Fixed dropped Test Scope fields in testbook DOCX output.</w:t>
+              <w:t xml:space="preserve">Testbook and POC DOCX output now matches the PDF much more closely: native table of contents (language-aware, auto-populated), each section starts on a new page, embedded images and diagrams (PlantUML/Graphviz rendered), white-on-red table headers, cover version line under the title, centered test case captions, and plain black rules for signature grids.</w:t>
             </w:r>
           </w:p>
         </w:tc>
@@ -14073,7 +14082,7 @@
               <w:jc w:val="left"/>
             </w:pPr>
             <w:r>
-              <w:t xml:space="preserve">6.4.0</w:t>
+              <w:t xml:space="preserve">6.4.2</w:t>
             </w:r>
           </w:p>
         </w:tc>
@@ -14103,6 +14112,45 @@
               <w:jc w:val="left"/>
             </w:pPr>
             <w:r>
+              <w:t xml:space="preserve">DOCX output for POC and testbook templates now includes all passthrough content (stakeholders, closing record, signatures, test cases, test summary, changelog) via a new pre-processor. Fixed dropped Test Scope fields in testbook DOCX output.</w:t>
+            </w:r>
+          </w:p>
+        </w:tc>
+      </w:tr>
+      <w:tr>
+        <w:tc>
+          <w:tcPr/>
+          <w:p>
+            <w:pPr>
+              <w:jc w:val="left"/>
+            </w:pPr>
+            <w:r>
+              <w:t xml:space="preserve">6.4.0</w:t>
+            </w:r>
+          </w:p>
+        </w:tc>
+        <w:tc>
+          <w:tcPr/>
+          <w:p>
+            <w:pPr>
+              <w:jc w:val="left"/>
+            </w:pPr>
+            <w:r>
+              <w:t xml:space="preserve">2026-09-20</w:t>
+            </w:r>
+          </w:p>
+        </w:tc>
+        <w:tc>
+          <w:tcPr/>
+          <w:p>
+            <w:pPr>
+              <w:numPr>
+                <w:ilvl w:val="0"/>
+                <w:numId w:val="1060"/>
+              </w:numPr>
+              <w:jc w:val="left"/>
+            </w:pPr>
+            <w:r>
               <w:t xml:space="preserve">Fixed changelog dates — replaced</w:t>
             </w:r>
             <w:r>
@@ -14125,54 +14173,15 @@
       </w:tr>
       <w:tr>
         <w:tc>
-          <w:tcPr/>
+          <w:tcPr>
+            <w:shd w:val="clear" w:color="auto" w:fill="F6F8FA"/>
+          </w:tcPr>
           <w:p>
             <w:pPr>
               <w:jc w:val="left"/>
             </w:pPr>
             <w:r>
               <w:t xml:space="preserve">5.1.1</w:t>
-            </w:r>
-          </w:p>
-        </w:tc>
-        <w:tc>
-          <w:tcPr/>
-          <w:p>
-            <w:pPr>
-              <w:jc w:val="left"/>
-            </w:pPr>
-            <w:r>
-              <w:t xml:space="preserve">2026-09-14</w:t>
-            </w:r>
-          </w:p>
-        </w:tc>
-        <w:tc>
-          <w:tcPr/>
-          <w:p>
-            <w:pPr>
-              <w:numPr>
-                <w:ilvl w:val="0"/>
-                <w:numId w:val="1060"/>
-              </w:numPr>
-              <w:jc w:val="left"/>
-            </w:pPr>
-            <w:r>
-              <w:t xml:space="preserve">Synced callout colors in DOCX/HTML/MD output to match brand palette. Added color palette demo.</w:t>
-            </w:r>
-          </w:p>
-        </w:tc>
-      </w:tr>
-      <w:tr>
-        <w:tc>
-          <w:tcPr>
-            <w:shd w:val="clear" w:color="auto" w:fill="F6F8FA"/>
-          </w:tcPr>
-          <w:p>
-            <w:pPr>
-              <w:jc w:val="left"/>
-            </w:pPr>
-            <w:r>
-              <w:t xml:space="preserve">5.1.0</w:t>
             </w:r>
           </w:p>
         </w:tc>
@@ -14202,7 +14211,7 @@
               <w:jc w:val="left"/>
             </w:pPr>
             <w:r>
-              <w:t xml:space="preserve">Adopted brand guidelines auxiliary color palette and monochrome scale. Aligned callout colors to brand specifications.</w:t>
+              <w:t xml:space="preserve">Synced callout colors in DOCX/HTML/MD output to match brand palette. Added color palette demo.</w:t>
             </w:r>
           </w:p>
         </w:tc>
@@ -14215,7 +14224,7 @@
               <w:jc w:val="left"/>
             </w:pPr>
             <w:r>
-              <w:t xml:space="preserve">5.0.3</w:t>
+              <w:t xml:space="preserve">5.1.0</w:t>
             </w:r>
           </w:p>
         </w:tc>
@@ -14241,6 +14250,51 @@
               <w:jc w:val="left"/>
             </w:pPr>
             <w:r>
+              <w:t xml:space="preserve">Adopted brand guidelines auxiliary color palette and monochrome scale. Aligned callout colors to brand specifications.</w:t>
+            </w:r>
+          </w:p>
+        </w:tc>
+      </w:tr>
+      <w:tr>
+        <w:tc>
+          <w:tcPr>
+            <w:shd w:val="clear" w:color="auto" w:fill="F6F8FA"/>
+          </w:tcPr>
+          <w:p>
+            <w:pPr>
+              <w:jc w:val="left"/>
+            </w:pPr>
+            <w:r>
+              <w:t xml:space="preserve">5.0.3</w:t>
+            </w:r>
+          </w:p>
+        </w:tc>
+        <w:tc>
+          <w:tcPr>
+            <w:shd w:val="clear" w:color="auto" w:fill="F6F8FA"/>
+          </w:tcPr>
+          <w:p>
+            <w:pPr>
+              <w:jc w:val="left"/>
+            </w:pPr>
+            <w:r>
+              <w:t xml:space="preserve">2026-09-14</w:t>
+            </w:r>
+          </w:p>
+        </w:tc>
+        <w:tc>
+          <w:tcPr>
+            <w:shd w:val="clear" w:color="auto" w:fill="F6F8FA"/>
+          </w:tcPr>
+          <w:p>
+            <w:pPr>
+              <w:numPr>
+                <w:ilvl w:val="0"/>
+                <w:numId w:val="1063"/>
+              </w:numPr>
+              <w:jc w:val="left"/>
+            </w:pPr>
+            <w:r>
               <w:t xml:space="preserve">Removed non-standard</w:t>
             </w:r>
             <w:r>
@@ -14263,58 +14317,13 @@
       </w:tr>
       <w:tr>
         <w:tc>
-          <w:tcPr>
-            <w:shd w:val="clear" w:color="auto" w:fill="F6F8FA"/>
-          </w:tcPr>
+          <w:tcPr/>
           <w:p>
             <w:pPr>
               <w:jc w:val="left"/>
             </w:pPr>
             <w:r>
               <w:t xml:space="preserve">5.0.2</w:t>
-            </w:r>
-          </w:p>
-        </w:tc>
-        <w:tc>
-          <w:tcPr>
-            <w:shd w:val="clear" w:color="auto" w:fill="F6F8FA"/>
-          </w:tcPr>
-          <w:p>
-            <w:pPr>
-              <w:jc w:val="left"/>
-            </w:pPr>
-            <w:r>
-              <w:t xml:space="preserve">2026-09-14</w:t>
-            </w:r>
-          </w:p>
-        </w:tc>
-        <w:tc>
-          <w:tcPr>
-            <w:shd w:val="clear" w:color="auto" w:fill="F6F8FA"/>
-          </w:tcPr>
-          <w:p>
-            <w:pPr>
-              <w:numPr>
-                <w:ilvl w:val="0"/>
-                <w:numId w:val="1063"/>
-              </w:numPr>
-              <w:jc w:val="left"/>
-            </w:pPr>
-            <w:r>
-              <w:t xml:space="preserve">Long commands in test steps now render as code blocks instead of inline code.</w:t>
-            </w:r>
-          </w:p>
-        </w:tc>
-      </w:tr>
-      <w:tr>
-        <w:tc>
-          <w:tcPr/>
-          <w:p>
-            <w:pPr>
-              <w:jc w:val="left"/>
-            </w:pPr>
-            <w:r>
-              <w:t xml:space="preserve">5.0.1</w:t>
             </w:r>
           </w:p>
         </w:tc>
@@ -14340,7 +14349,7 @@
               <w:jc w:val="left"/>
             </w:pPr>
             <w:r>
-              <w:t xml:space="preserve">Testcase caption centered above the block.</w:t>
+              <w:t xml:space="preserve">Long commands in test steps now render as code blocks instead of inline code.</w:t>
             </w:r>
           </w:p>
         </w:tc>
@@ -14355,7 +14364,7 @@
               <w:jc w:val="left"/>
             </w:pPr>
             <w:r>
-              <w:t xml:space="preserve">5.0.0</w:t>
+              <w:t xml:space="preserve">5.0.1</w:t>
             </w:r>
           </w:p>
         </w:tc>
@@ -14385,6 +14394,45 @@
               <w:jc w:val="left"/>
             </w:pPr>
             <w:r>
+              <w:t xml:space="preserve">Testcase caption centered above the block.</w:t>
+            </w:r>
+          </w:p>
+        </w:tc>
+      </w:tr>
+      <w:tr>
+        <w:tc>
+          <w:tcPr/>
+          <w:p>
+            <w:pPr>
+              <w:jc w:val="left"/>
+            </w:pPr>
+            <w:r>
+              <w:t xml:space="preserve">5.0.0</w:t>
+            </w:r>
+          </w:p>
+        </w:tc>
+        <w:tc>
+          <w:tcPr/>
+          <w:p>
+            <w:pPr>
+              <w:jc w:val="left"/>
+            </w:pPr>
+            <w:r>
+              <w:t xml:space="preserve">2026-09-14</w:t>
+            </w:r>
+          </w:p>
+        </w:tc>
+        <w:tc>
+          <w:tcPr/>
+          <w:p>
+            <w:pPr>
+              <w:numPr>
+                <w:ilvl w:val="0"/>
+                <w:numId w:val="1066"/>
+              </w:numPr>
+              <w:jc w:val="left"/>
+            </w:pPr>
+            <w:r>
               <w:t xml:space="preserve">Major refactoring: extracted shared modules (huawei-titles, huawei-toc, huawei-cover), renamed</w:t>
             </w:r>
             <w:r>
@@ -14446,7 +14494,9 @@
       </w:tr>
       <w:tr>
         <w:tc>
-          <w:tcPr/>
+          <w:tcPr>
+            <w:shd w:val="clear" w:color="auto" w:fill="F6F8FA"/>
+          </w:tcPr>
           <w:p>
             <w:pPr>
               <w:jc w:val="left"/>
@@ -14457,56 +14507,15 @@
           </w:p>
         </w:tc>
         <w:tc>
-          <w:tcPr/>
+          <w:tcPr>
+            <w:shd w:val="clear" w:color="auto" w:fill="F6F8FA"/>
+          </w:tcPr>
           <w:p>
             <w:pPr>
               <w:jc w:val="left"/>
             </w:pPr>
             <w:r>
               <w:t xml:space="preserve">2026-09-14</w:t>
-            </w:r>
-          </w:p>
-        </w:tc>
-        <w:tc>
-          <w:tcPr/>
-          <w:p>
-            <w:pPr>
-              <w:numPr>
-                <w:ilvl w:val="0"/>
-                <w:numId w:val="1066"/>
-              </w:numPr>
-              <w:jc w:val="left"/>
-            </w:pPr>
-            <w:r>
-              <w:t xml:space="preserve">Testcase headings now formatted as captions (like figures/tables): bold “Testcase N:” followed by description. Changed label from “Test Case” to “Testcase”.</w:t>
-            </w:r>
-          </w:p>
-        </w:tc>
-      </w:tr>
-      <w:tr>
-        <w:tc>
-          <w:tcPr>
-            <w:shd w:val="clear" w:color="auto" w:fill="F6F8FA"/>
-          </w:tcPr>
-          <w:p>
-            <w:pPr>
-              <w:jc w:val="left"/>
-            </w:pPr>
-            <w:r>
-              <w:t xml:space="preserve">4.6.0</w:t>
-            </w:r>
-          </w:p>
-        </w:tc>
-        <w:tc>
-          <w:tcPr>
-            <w:shd w:val="clear" w:color="auto" w:fill="F6F8FA"/>
-          </w:tcPr>
-          <w:p>
-            <w:pPr>
-              <w:jc w:val="left"/>
-            </w:pPr>
-            <w:r>
-              <w:t xml:space="preserve">2026-09-13</w:t>
             </w:r>
           </w:p>
         </w:tc>
@@ -14523,7 +14532,7 @@
               <w:jc w:val="left"/>
             </w:pPr>
             <w:r>
-              <w:t xml:space="preserve">Section restructure: Introduction, Test Cases (with category subsections), Conclusion. Testcases auto-numbered like figures/tables. Changed testcase from subsection to subsubsection.</w:t>
+              <w:t xml:space="preserve">Testcase headings now formatted as captions (like figures/tables): bold “Testcase N:” followed by description. Changed label from “Test Case” to “Testcase”.</w:t>
             </w:r>
           </w:p>
         </w:tc>
@@ -14536,7 +14545,7 @@
               <w:jc w:val="left"/>
             </w:pPr>
             <w:r>
-              <w:t xml:space="preserve">4.5.0</w:t>
+              <w:t xml:space="preserve">4.6.0</w:t>
             </w:r>
           </w:p>
         </w:tc>
@@ -14562,6 +14571,51 @@
               <w:jc w:val="left"/>
             </w:pPr>
             <w:r>
+              <w:t xml:space="preserve">Section restructure: Introduction, Test Cases (with category subsections), Conclusion. Testcases auto-numbered like figures/tables. Changed testcase from subsection to subsubsection.</w:t>
+            </w:r>
+          </w:p>
+        </w:tc>
+      </w:tr>
+      <w:tr>
+        <w:tc>
+          <w:tcPr>
+            <w:shd w:val="clear" w:color="auto" w:fill="F6F8FA"/>
+          </w:tcPr>
+          <w:p>
+            <w:pPr>
+              <w:jc w:val="left"/>
+            </w:pPr>
+            <w:r>
+              <w:t xml:space="preserve">4.5.0</w:t>
+            </w:r>
+          </w:p>
+        </w:tc>
+        <w:tc>
+          <w:tcPr>
+            <w:shd w:val="clear" w:color="auto" w:fill="F6F8FA"/>
+          </w:tcPr>
+          <w:p>
+            <w:pPr>
+              <w:jc w:val="left"/>
+            </w:pPr>
+            <w:r>
+              <w:t xml:space="preserve">2026-09-13</w:t>
+            </w:r>
+          </w:p>
+        </w:tc>
+        <w:tc>
+          <w:tcPr>
+            <w:shd w:val="clear" w:color="auto" w:fill="F6F8FA"/>
+          </w:tcPr>
+          <w:p>
+            <w:pPr>
+              <w:numPr>
+                <w:ilvl w:val="0"/>
+                <w:numId w:val="1069"/>
+              </w:numPr>
+              <w:jc w:val="left"/>
+            </w:pPr>
+            <w:r>
               <w:t xml:space="preserve">Unified field APIs:</w:t>
             </w:r>
             <w:r>
@@ -14626,58 +14680,13 @@
       </w:tr>
       <w:tr>
         <w:tc>
-          <w:tcPr>
-            <w:shd w:val="clear" w:color="auto" w:fill="F6F8FA"/>
-          </w:tcPr>
+          <w:tcPr/>
           <w:p>
             <w:pPr>
               <w:jc w:val="left"/>
             </w:pPr>
             <w:r>
               <w:t xml:space="preserve">4.4.0</w:t>
-            </w:r>
-          </w:p>
-        </w:tc>
-        <w:tc>
-          <w:tcPr>
-            <w:shd w:val="clear" w:color="auto" w:fill="F6F8FA"/>
-          </w:tcPr>
-          <w:p>
-            <w:pPr>
-              <w:jc w:val="left"/>
-            </w:pPr>
-            <w:r>
-              <w:t xml:space="preserve">2026-09-13</w:t>
-            </w:r>
-          </w:p>
-        </w:tc>
-        <w:tc>
-          <w:tcPr>
-            <w:shd w:val="clear" w:color="auto" w:fill="F6F8FA"/>
-          </w:tcPr>
-          <w:p>
-            <w:pPr>
-              <w:numPr>
-                <w:ilvl w:val="0"/>
-                <w:numId w:val="1069"/>
-              </w:numPr>
-              <w:jc w:val="left"/>
-            </w:pPr>
-            <w:r>
-              <w:t xml:space="preserve">Code review fixes: removed dead labels, badge now uses Huawei brand colors (tipbg/tipfg, huaweired, warningbg/warningfg), Lua filter preserves formatting in DOCX/MD/HTML via parse_latex_blocks, testprocedure handler preserves non-step content (images, code, callouts).</w:t>
-            </w:r>
-          </w:p>
-        </w:tc>
-      </w:tr>
-      <w:tr>
-        <w:tc>
-          <w:tcPr/>
-          <w:p>
-            <w:pPr>
-              <w:jc w:val="left"/>
-            </w:pPr>
-            <w:r>
-              <w:t xml:space="preserve">4.3.0</w:t>
             </w:r>
           </w:p>
         </w:tc>
@@ -14703,6 +14712,51 @@
               <w:jc w:val="left"/>
             </w:pPr>
             <w:r>
+              <w:t xml:space="preserve">Code review fixes: removed dead labels, badge now uses Huawei brand colors (tipbg/tipfg, huaweired, warningbg/warningfg), Lua filter preserves formatting in DOCX/MD/HTML via parse_latex_blocks, testprocedure handler preserves non-step content (images, code, callouts).</w:t>
+            </w:r>
+          </w:p>
+        </w:tc>
+      </w:tr>
+      <w:tr>
+        <w:tc>
+          <w:tcPr>
+            <w:shd w:val="clear" w:color="auto" w:fill="F6F8FA"/>
+          </w:tcPr>
+          <w:p>
+            <w:pPr>
+              <w:jc w:val="left"/>
+            </w:pPr>
+            <w:r>
+              <w:t xml:space="preserve">4.3.0</w:t>
+            </w:r>
+          </w:p>
+        </w:tc>
+        <w:tc>
+          <w:tcPr>
+            <w:shd w:val="clear" w:color="auto" w:fill="F6F8FA"/>
+          </w:tcPr>
+          <w:p>
+            <w:pPr>
+              <w:jc w:val="left"/>
+            </w:pPr>
+            <w:r>
+              <w:t xml:space="preserve">2026-09-13</w:t>
+            </w:r>
+          </w:p>
+        </w:tc>
+        <w:tc>
+          <w:tcPr>
+            <w:shd w:val="clear" w:color="auto" w:fill="F6F8FA"/>
+          </w:tcPr>
+          <w:p>
+            <w:pPr>
+              <w:numPr>
+                <w:ilvl w:val="0"/>
+                <w:numId w:val="1071"/>
+              </w:numPr>
+              <w:jc w:val="left"/>
+            </w:pPr>
+            <w:r>
               <w:t xml:space="preserve">Added</w:t>
             </w:r>
             <w:r>
@@ -14755,9 +14809,7 @@
       </w:tr>
       <w:tr>
         <w:tc>
-          <w:tcPr>
-            <w:shd w:val="clear" w:color="auto" w:fill="F6F8FA"/>
-          </w:tcPr>
+          <w:tcPr/>
           <w:p>
             <w:pPr>
               <w:jc w:val="left"/>
@@ -14768,9 +14820,7 @@
           </w:p>
         </w:tc>
         <w:tc>
-          <w:tcPr>
-            <w:shd w:val="clear" w:color="auto" w:fill="F6F8FA"/>
-          </w:tcPr>
+          <w:tcPr/>
           <w:p>
             <w:pPr>
               <w:jc w:val="left"/>
@@ -14781,14 +14831,12 @@
           </w:p>
         </w:tc>
         <w:tc>
-          <w:tcPr>
-            <w:shd w:val="clear" w:color="auto" w:fill="F6F8FA"/>
-          </w:tcPr>
+          <w:tcPr/>
           <w:p>
             <w:pPr>
               <w:numPr>
                 <w:ilvl w:val="0"/>
-                <w:numId w:val="1071"/>
+                <w:numId w:val="1072"/>
               </w:numPr>
               <w:jc w:val="left"/>
             </w:pPr>
@@ -14842,7 +14890,9 @@
       </w:tr>
       <w:tr>
         <w:tc>
-          <w:tcPr/>
+          <w:tcPr>
+            <w:shd w:val="clear" w:color="auto" w:fill="F6F8FA"/>
+          </w:tcPr>
           <w:p>
             <w:pPr>
               <w:jc w:val="left"/>
@@ -14853,7 +14903,9 @@
           </w:p>
         </w:tc>
         <w:tc>
-          <w:tcPr/>
+          <w:tcPr>
+            <w:shd w:val="clear" w:color="auto" w:fill="F6F8FA"/>
+          </w:tcPr>
           <w:p>
             <w:pPr>
               <w:jc w:val="left"/>
@@ -14864,12 +14916,14 @@
           </w:p>
         </w:tc>
         <w:tc>
-          <w:tcPr/>
+          <w:tcPr>
+            <w:shd w:val="clear" w:color="auto" w:fill="F6F8FA"/>
+          </w:tcPr>
           <w:p>
             <w:pPr>
               <w:numPr>
                 <w:ilvl w:val="0"/>
-                <w:numId w:val="1072"/>
+                <w:numId w:val="1073"/>
               </w:numPr>
               <w:jc w:val="left"/>
             </w:pPr>
@@ -14896,9 +14950,7 @@
       </w:tr>
       <w:tr>
         <w:tc>
-          <w:tcPr>
-            <w:shd w:val="clear" w:color="auto" w:fill="F6F8FA"/>
-          </w:tcPr>
+          <w:tcPr/>
           <w:p>
             <w:pPr>
               <w:jc w:val="left"/>
@@ -14909,9 +14961,7 @@
           </w:p>
         </w:tc>
         <w:tc>
-          <w:tcPr>
-            <w:shd w:val="clear" w:color="auto" w:fill="F6F8FA"/>
-          </w:tcPr>
+          <w:tcPr/>
           <w:p>
             <w:pPr>
               <w:jc w:val="left"/>
@@ -14922,14 +14972,12 @@
           </w:p>
         </w:tc>
         <w:tc>
-          <w:tcPr>
-            <w:shd w:val="clear" w:color="auto" w:fill="F6F8FA"/>
-          </w:tcPr>
+          <w:tcPr/>
           <w:p>
             <w:pPr>
               <w:numPr>
                 <w:ilvl w:val="0"/>
-                <w:numId w:val="1073"/>
+                <w:numId w:val="1074"/>
               </w:numPr>
               <w:jc w:val="left"/>
             </w:pPr>
@@ -14971,7 +15019,9 @@
       </w:tr>
       <w:tr>
         <w:tc>
-          <w:tcPr/>
+          <w:tcPr>
+            <w:shd w:val="clear" w:color="auto" w:fill="F6F8FA"/>
+          </w:tcPr>
           <w:p>
             <w:pPr>
               <w:jc w:val="left"/>
@@ -14982,7 +15032,9 @@
           </w:p>
         </w:tc>
         <w:tc>
-          <w:tcPr/>
+          <w:tcPr>
+            <w:shd w:val="clear" w:color="auto" w:fill="F6F8FA"/>
+          </w:tcPr>
           <w:p>
             <w:pPr>
               <w:jc w:val="left"/>
@@ -14993,12 +15045,14 @@
           </w:p>
         </w:tc>
         <w:tc>
-          <w:tcPr/>
+          <w:tcPr>
+            <w:shd w:val="clear" w:color="auto" w:fill="F6F8FA"/>
+          </w:tcPr>
           <w:p>
             <w:pPr>
               <w:numPr>
                 <w:ilvl w:val="0"/>
-                <w:numId w:val="1074"/>
+                <w:numId w:val="1075"/>
               </w:numPr>
               <w:jc w:val="left"/>
             </w:pPr>
@@ -15025,58 +15079,13 @@
       </w:tr>
       <w:tr>
         <w:tc>
-          <w:tcPr>
-            <w:shd w:val="clear" w:color="auto" w:fill="F6F8FA"/>
-          </w:tcPr>
+          <w:tcPr/>
           <w:p>
             <w:pPr>
               <w:jc w:val="left"/>
             </w:pPr>
             <w:r>
               <w:t xml:space="preserve">3.8.1</w:t>
-            </w:r>
-          </w:p>
-        </w:tc>
-        <w:tc>
-          <w:tcPr>
-            <w:shd w:val="clear" w:color="auto" w:fill="F6F8FA"/>
-          </w:tcPr>
-          <w:p>
-            <w:pPr>
-              <w:jc w:val="left"/>
-            </w:pPr>
-            <w:r>
-              <w:t xml:space="preserve">2026-09-13</w:t>
-            </w:r>
-          </w:p>
-        </w:tc>
-        <w:tc>
-          <w:tcPr>
-            <w:shd w:val="clear" w:color="auto" w:fill="F6F8FA"/>
-          </w:tcPr>
-          <w:p>
-            <w:pPr>
-              <w:numPr>
-                <w:ilvl w:val="0"/>
-                <w:numId w:val="1075"/>
-              </w:numPr>
-              <w:jc w:val="left"/>
-            </w:pPr>
-            <w:r>
-              <w:t xml:space="preserve">End-to-end quality review: fixed testbook PDF metadata title, removed stray user DOCX from template dir, fixed round-trip.sh variable typo, updated stale references in AGENTS.md and README.md, committed testbook sample PDFs, set TZ for pandoc cover time consistency, widened pandoc version range.</w:t>
-            </w:r>
-          </w:p>
-        </w:tc>
-      </w:tr>
-      <w:tr>
-        <w:tc>
-          <w:tcPr/>
-          <w:p>
-            <w:pPr>
-              <w:jc w:val="left"/>
-            </w:pPr>
-            <w:r>
-              <w:t xml:space="preserve">3.8.0</w:t>
             </w:r>
           </w:p>
         </w:tc>
@@ -15102,7 +15111,7 @@
               <w:jc w:val="left"/>
             </w:pPr>
             <w:r>
-              <w:t xml:space="preserve">Removed Tips and Tricks chapter (tmux configuration) — required VS Code-specific keybindings that don’t generalize across terminal setups.</w:t>
+              <w:t xml:space="preserve">End-to-end quality review: fixed testbook PDF metadata title, removed stray user DOCX from template dir, fixed round-trip.sh variable typo, updated stale references in AGENTS.md and README.md, committed testbook sample PDFs, set TZ for pandoc cover time consistency, widened pandoc version range.</w:t>
             </w:r>
           </w:p>
         </w:tc>
@@ -15117,7 +15126,7 @@
               <w:jc w:val="left"/>
             </w:pPr>
             <w:r>
-              <w:t xml:space="preserve">3.7.0</w:t>
+              <w:t xml:space="preserve">3.8.0</w:t>
             </w:r>
           </w:p>
         </w:tc>
@@ -15130,7 +15139,7 @@
               <w:jc w:val="left"/>
             </w:pPr>
             <w:r>
-              <w:t xml:space="preserve">2026-09-12</w:t>
+              <w:t xml:space="preserve">2026-09-13</w:t>
             </w:r>
           </w:p>
         </w:tc>
@@ -15147,6 +15156,45 @@
               <w:jc w:val="left"/>
             </w:pPr>
             <w:r>
+              <w:t xml:space="preserve">Removed Tips and Tricks chapter (tmux configuration) — required VS Code-specific keybindings that don’t generalize across terminal setups.</w:t>
+            </w:r>
+          </w:p>
+        </w:tc>
+      </w:tr>
+      <w:tr>
+        <w:tc>
+          <w:tcPr/>
+          <w:p>
+            <w:pPr>
+              <w:jc w:val="left"/>
+            </w:pPr>
+            <w:r>
+              <w:t xml:space="preserve">3.7.0</w:t>
+            </w:r>
+          </w:p>
+        </w:tc>
+        <w:tc>
+          <w:tcPr/>
+          <w:p>
+            <w:pPr>
+              <w:jc w:val="left"/>
+            </w:pPr>
+            <w:r>
+              <w:t xml:space="preserve">2026-09-12</w:t>
+            </w:r>
+          </w:p>
+        </w:tc>
+        <w:tc>
+          <w:tcPr/>
+          <w:p>
+            <w:pPr>
+              <w:numPr>
+                <w:ilvl w:val="0"/>
+                <w:numId w:val="1078"/>
+              </w:numPr>
+              <w:jc w:val="left"/>
+            </w:pPr>
+            <w:r>
               <w:t xml:space="preserve">Added</w:t>
             </w:r>
             <w:r>
@@ -15199,7 +15247,9 @@
       </w:tr>
       <w:tr>
         <w:tc>
-          <w:tcPr/>
+          <w:tcPr>
+            <w:shd w:val="clear" w:color="auto" w:fill="F6F8FA"/>
+          </w:tcPr>
           <w:p>
             <w:pPr>
               <w:jc w:val="left"/>
@@ -15210,7 +15260,9 @@
           </w:p>
         </w:tc>
         <w:tc>
-          <w:tcPr/>
+          <w:tcPr>
+            <w:shd w:val="clear" w:color="auto" w:fill="F6F8FA"/>
+          </w:tcPr>
           <w:p>
             <w:pPr>
               <w:jc w:val="left"/>
@@ -15221,12 +15273,14 @@
           </w:p>
         </w:tc>
         <w:tc>
-          <w:tcPr/>
+          <w:tcPr>
+            <w:shd w:val="clear" w:color="auto" w:fill="F6F8FA"/>
+          </w:tcPr>
           <w:p>
             <w:pPr>
               <w:numPr>
                 <w:ilvl w:val="0"/>
-                <w:numId w:val="1078"/>
+                <w:numId w:val="1079"/>
               </w:numPr>
               <w:jc w:val="left"/>
             </w:pPr>
@@ -15283,9 +15337,7 @@
       </w:tr>
       <w:tr>
         <w:tc>
-          <w:tcPr>
-            <w:shd w:val="clear" w:color="auto" w:fill="F6F8FA"/>
-          </w:tcPr>
+          <w:tcPr/>
           <w:p>
             <w:pPr>
               <w:jc w:val="left"/>
@@ -15296,9 +15348,7 @@
           </w:p>
         </w:tc>
         <w:tc>
-          <w:tcPr>
-            <w:shd w:val="clear" w:color="auto" w:fill="F6F8FA"/>
-          </w:tcPr>
+          <w:tcPr/>
           <w:p>
             <w:pPr>
               <w:jc w:val="left"/>
@@ -15309,14 +15359,12 @@
           </w:p>
         </w:tc>
         <w:tc>
-          <w:tcPr>
-            <w:shd w:val="clear" w:color="auto" w:fill="F6F8FA"/>
-          </w:tcPr>
+          <w:tcPr/>
           <w:p>
             <w:pPr>
               <w:numPr>
                 <w:ilvl w:val="0"/>
-                <w:numId w:val="1079"/>
+                <w:numId w:val="1080"/>
               </w:numPr>
               <w:jc w:val="left"/>
             </w:pPr>
@@ -15394,7 +15442,9 @@
       </w:tr>
       <w:tr>
         <w:tc>
-          <w:tcPr/>
+          <w:tcPr>
+            <w:shd w:val="clear" w:color="auto" w:fill="F6F8FA"/>
+          </w:tcPr>
           <w:p>
             <w:pPr>
               <w:jc w:val="left"/>
@@ -15405,7 +15455,9 @@
           </w:p>
         </w:tc>
         <w:tc>
-          <w:tcPr/>
+          <w:tcPr>
+            <w:shd w:val="clear" w:color="auto" w:fill="F6F8FA"/>
+          </w:tcPr>
           <w:p>
             <w:pPr>
               <w:jc w:val="left"/>
@@ -15416,12 +15468,14 @@
           </w:p>
         </w:tc>
         <w:tc>
-          <w:tcPr/>
+          <w:tcPr>
+            <w:shd w:val="clear" w:color="auto" w:fill="F6F8FA"/>
+          </w:tcPr>
           <w:p>
             <w:pPr>
               <w:numPr>
                 <w:ilvl w:val="0"/>
-                <w:numId w:val="1080"/>
+                <w:numId w:val="1081"/>
               </w:numPr>
               <w:jc w:val="left"/>
             </w:pPr>
@@ -15448,7 +15502,7 @@
             <w:pPr>
               <w:numPr>
                 <w:ilvl w:val="0"/>
-                <w:numId w:val="1080"/>
+                <w:numId w:val="1081"/>
               </w:numPr>
               <w:jc w:val="left"/>
             </w:pPr>
@@ -15490,7 +15544,7 @@
             <w:pPr>
               <w:numPr>
                 <w:ilvl w:val="0"/>
-                <w:numId w:val="1080"/>
+                <w:numId w:val="1081"/>
               </w:numPr>
               <w:jc w:val="left"/>
             </w:pPr>
@@ -15502,9 +15556,7 @@
       </w:tr>
       <w:tr>
         <w:tc>
-          <w:tcPr>
-            <w:shd w:val="clear" w:color="auto" w:fill="F6F8FA"/>
-          </w:tcPr>
+          <w:tcPr/>
           <w:p>
             <w:pPr>
               <w:jc w:val="left"/>
@@ -15515,9 +15567,7 @@
           </w:p>
         </w:tc>
         <w:tc>
-          <w:tcPr>
-            <w:shd w:val="clear" w:color="auto" w:fill="F6F8FA"/>
-          </w:tcPr>
+          <w:tcPr/>
           <w:p>
             <w:pPr>
               <w:jc w:val="left"/>
@@ -15528,14 +15578,12 @@
           </w:p>
         </w:tc>
         <w:tc>
-          <w:tcPr>
-            <w:shd w:val="clear" w:color="auto" w:fill="F6F8FA"/>
-          </w:tcPr>
+          <w:tcPr/>
           <w:p>
             <w:pPr>
               <w:numPr>
                 <w:ilvl w:val="0"/>
-                <w:numId w:val="1081"/>
+                <w:numId w:val="1082"/>
               </w:numPr>
               <w:jc w:val="left"/>
             </w:pPr>
@@ -15562,7 +15610,7 @@
             <w:pPr>
               <w:numPr>
                 <w:ilvl w:val="0"/>
-                <w:numId w:val="1081"/>
+                <w:numId w:val="1082"/>
               </w:numPr>
               <w:jc w:val="left"/>
             </w:pPr>
@@ -15589,7 +15637,7 @@
             <w:pPr>
               <w:numPr>
                 <w:ilvl w:val="0"/>
-                <w:numId w:val="1081"/>
+                <w:numId w:val="1082"/>
               </w:numPr>
               <w:jc w:val="left"/>
             </w:pPr>
@@ -15601,7 +15649,7 @@
             <w:pPr>
               <w:numPr>
                 <w:ilvl w:val="0"/>
-                <w:numId w:val="1081"/>
+                <w:numId w:val="1082"/>
               </w:numPr>
               <w:jc w:val="left"/>
             </w:pPr>
@@ -15625,54 +15673,15 @@
       </w:tr>
       <w:tr>
         <w:tc>
-          <w:tcPr/>
+          <w:tcPr>
+            <w:shd w:val="clear" w:color="auto" w:fill="F6F8FA"/>
+          </w:tcPr>
           <w:p>
             <w:pPr>
               <w:jc w:val="left"/>
             </w:pPr>
             <w:r>
               <w:t xml:space="preserve">3.2.1</w:t>
-            </w:r>
-          </w:p>
-        </w:tc>
-        <w:tc>
-          <w:tcPr/>
-          <w:p>
-            <w:pPr>
-              <w:jc w:val="left"/>
-            </w:pPr>
-            <w:r>
-              <w:t xml:space="preserve">2026-09-11</w:t>
-            </w:r>
-          </w:p>
-        </w:tc>
-        <w:tc>
-          <w:tcPr/>
-          <w:p>
-            <w:pPr>
-              <w:numPr>
-                <w:ilvl w:val="0"/>
-                <w:numId w:val="1082"/>
-              </w:numPr>
-              <w:jc w:val="left"/>
-            </w:pPr>
-            <w:r>
-              <w:t xml:space="preserve">Renamed Chapter 7 from “Clean Up” to “Operations and Maintenance”. Added subsections for updating and uninstalling both the MaaS Gateway and the document templates. Added cloud resource cleanup as an optional subsection.</w:t>
-            </w:r>
-          </w:p>
-        </w:tc>
-      </w:tr>
-      <w:tr>
-        <w:tc>
-          <w:tcPr>
-            <w:shd w:val="clear" w:color="auto" w:fill="F6F8FA"/>
-          </w:tcPr>
-          <w:p>
-            <w:pPr>
-              <w:jc w:val="left"/>
-            </w:pPr>
-            <w:r>
-              <w:t xml:space="preserve">3.2.0</w:t>
             </w:r>
           </w:p>
         </w:tc>
@@ -15702,6 +15711,45 @@
               <w:jc w:val="left"/>
             </w:pPr>
             <w:r>
+              <w:t xml:space="preserve">Renamed Chapter 7 from “Clean Up” to “Operations and Maintenance”. Added subsections for updating and uninstalling both the MaaS Gateway and the document templates. Added cloud resource cleanup as an optional subsection.</w:t>
+            </w:r>
+          </w:p>
+        </w:tc>
+      </w:tr>
+      <w:tr>
+        <w:tc>
+          <w:tcPr/>
+          <w:p>
+            <w:pPr>
+              <w:jc w:val="left"/>
+            </w:pPr>
+            <w:r>
+              <w:t xml:space="preserve">3.2.0</w:t>
+            </w:r>
+          </w:p>
+        </w:tc>
+        <w:tc>
+          <w:tcPr/>
+          <w:p>
+            <w:pPr>
+              <w:jc w:val="left"/>
+            </w:pPr>
+            <w:r>
+              <w:t xml:space="preserve">2026-09-11</w:t>
+            </w:r>
+          </w:p>
+        </w:tc>
+        <w:tc>
+          <w:tcPr/>
+          <w:p>
+            <w:pPr>
+              <w:numPr>
+                <w:ilvl w:val="0"/>
+                <w:numId w:val="1084"/>
+              </w:numPr>
+              <w:jc w:val="left"/>
+            </w:pPr>
+            <w:r>
               <w:t xml:space="preserve">Added</w:t>
             </w:r>
             <w:r>
@@ -15763,7 +15811,7 @@
             <w:pPr>
               <w:numPr>
                 <w:ilvl w:val="0"/>
-                <w:numId w:val="1083"/>
+                <w:numId w:val="1084"/>
               </w:numPr>
               <w:jc w:val="left"/>
             </w:pPr>
@@ -15808,7 +15856,7 @@
             <w:pPr>
               <w:numPr>
                 <w:ilvl w:val="0"/>
-                <w:numId w:val="1083"/>
+                <w:numId w:val="1084"/>
               </w:numPr>
               <w:jc w:val="left"/>
             </w:pPr>
@@ -15820,54 +15868,15 @@
       </w:tr>
       <w:tr>
         <w:tc>
-          <w:tcPr/>
+          <w:tcPr>
+            <w:shd w:val="clear" w:color="auto" w:fill="F6F8FA"/>
+          </w:tcPr>
           <w:p>
             <w:pPr>
               <w:jc w:val="left"/>
             </w:pPr>
             <w:r>
               <w:t xml:space="preserve">3.1.2</w:t>
-            </w:r>
-          </w:p>
-        </w:tc>
-        <w:tc>
-          <w:tcPr/>
-          <w:p>
-            <w:pPr>
-              <w:jc w:val="left"/>
-            </w:pPr>
-            <w:r>
-              <w:t xml:space="preserve">2026-09-11</w:t>
-            </w:r>
-          </w:p>
-        </w:tc>
-        <w:tc>
-          <w:tcPr/>
-          <w:p>
-            <w:pPr>
-              <w:numPr>
-                <w:ilvl w:val="0"/>
-                <w:numId w:val="1084"/>
-              </w:numPr>
-              <w:jc w:val="left"/>
-            </w:pPr>
-            <w:r>
-              <w:t xml:space="preserve">Added output format guide to README.md: comparison table of PDF, Markdown, DOCX, and HTML with purpose, copy-paste quality, and limitations. Recommends Markdown for copy-paste.</w:t>
-            </w:r>
-          </w:p>
-        </w:tc>
-      </w:tr>
-      <w:tr>
-        <w:tc>
-          <w:tcPr>
-            <w:shd w:val="clear" w:color="auto" w:fill="F6F8FA"/>
-          </w:tcPr>
-          <w:p>
-            <w:pPr>
-              <w:jc w:val="left"/>
-            </w:pPr>
-            <w:r>
-              <w:t xml:space="preserve">3.1.1</w:t>
             </w:r>
           </w:p>
         </w:tc>
@@ -15897,6 +15906,45 @@
               <w:jc w:val="left"/>
             </w:pPr>
             <w:r>
+              <w:t xml:space="preserve">Added output format guide to README.md: comparison table of PDF, Markdown, DOCX, and HTML with purpose, copy-paste quality, and limitations. Recommends Markdown for copy-paste.</w:t>
+            </w:r>
+          </w:p>
+        </w:tc>
+      </w:tr>
+      <w:tr>
+        <w:tc>
+          <w:tcPr/>
+          <w:p>
+            <w:pPr>
+              <w:jc w:val="left"/>
+            </w:pPr>
+            <w:r>
+              <w:t xml:space="preserve">3.1.1</w:t>
+            </w:r>
+          </w:p>
+        </w:tc>
+        <w:tc>
+          <w:tcPr/>
+          <w:p>
+            <w:pPr>
+              <w:jc w:val="left"/>
+            </w:pPr>
+            <w:r>
+              <w:t xml:space="preserve">2026-09-11</w:t>
+            </w:r>
+          </w:p>
+        </w:tc>
+        <w:tc>
+          <w:tcPr/>
+          <w:p>
+            <w:pPr>
+              <w:numPr>
+                <w:ilvl w:val="0"/>
+                <w:numId w:val="1086"/>
+              </w:numPr>
+              <w:jc w:val="left"/>
+            </w:pPr>
+            <w:r>
               <w:t xml:space="preserve">Updated MaaS Gateway chapter to v1.10.9: non-interactive mode (</w:t>
             </w:r>
             <w:r>
@@ -15913,7 +15961,7 @@
             <w:pPr>
               <w:numPr>
                 <w:ilvl w:val="0"/>
-                <w:numId w:val="1085"/>
+                <w:numId w:val="1086"/>
               </w:numPr>
               <w:jc w:val="left"/>
             </w:pPr>
@@ -15955,7 +16003,7 @@
             <w:pPr>
               <w:numPr>
                 <w:ilvl w:val="0"/>
-                <w:numId w:val="1085"/>
+                <w:numId w:val="1086"/>
               </w:numPr>
               <w:jc w:val="left"/>
             </w:pPr>
@@ -15967,7 +16015,9 @@
       </w:tr>
       <w:tr>
         <w:tc>
-          <w:tcPr/>
+          <w:tcPr>
+            <w:shd w:val="clear" w:color="auto" w:fill="F6F8FA"/>
+          </w:tcPr>
           <w:p>
             <w:pPr>
               <w:jc w:val="left"/>
@@ -15978,7 +16028,9 @@
           </w:p>
         </w:tc>
         <w:tc>
-          <w:tcPr/>
+          <w:tcPr>
+            <w:shd w:val="clear" w:color="auto" w:fill="F6F8FA"/>
+          </w:tcPr>
           <w:p>
             <w:pPr>
               <w:jc w:val="left"/>
@@ -15989,12 +16041,14 @@
           </w:p>
         </w:tc>
         <w:tc>
-          <w:tcPr/>
+          <w:tcPr>
+            <w:shd w:val="clear" w:color="auto" w:fill="F6F8FA"/>
+          </w:tcPr>
           <w:p>
             <w:pPr>
               <w:numPr>
                 <w:ilvl w:val="0"/>
-                <w:numId w:val="1086"/>
+                <w:numId w:val="1087"/>
               </w:numPr>
               <w:jc w:val="left"/>
             </w:pPr>
@@ -16018,7 +16072,7 @@
             <w:pPr>
               <w:numPr>
                 <w:ilvl w:val="0"/>
-                <w:numId w:val="1086"/>
+                <w:numId w:val="1087"/>
               </w:numPr>
               <w:jc w:val="left"/>
             </w:pPr>
@@ -16060,7 +16114,7 @@
             <w:pPr>
               <w:numPr>
                 <w:ilvl w:val="0"/>
-                <w:numId w:val="1086"/>
+                <w:numId w:val="1087"/>
               </w:numPr>
               <w:jc w:val="left"/>
             </w:pPr>
@@ -16068,63 +16122,6 @@
               <w:t xml:space="preserve">Restructured chapters: moved SSH config and VS Code connection to new Chapter 4 (Install VS Code and Connect via Remote-SSH). Chapters 5—​7 renumbered.</w:t>
             </w:r>
           </w:p>
-          <w:p>
-            <w:pPr>
-              <w:numPr>
-                <w:ilvl w:val="0"/>
-                <w:numId w:val="1086"/>
-              </w:numPr>
-              <w:jc w:val="left"/>
-            </w:pPr>
-            <w:r>
-              <w:t xml:space="preserve">Added verification checklist tables to all 7 chapters.</w:t>
-            </w:r>
-          </w:p>
-          <w:p>
-            <w:pPr>
-              <w:numPr>
-                <w:ilvl w:val="0"/>
-                <w:numId w:val="1086"/>
-              </w:numPr>
-              <w:jc w:val="left"/>
-            </w:pPr>
-            <w:r>
-              <w:t xml:space="preserve">Added mandatory reboot warning in Chapter 2 (SSH port change). Added troubleshooting subsection in Chapter 4 with common SSH connection issues and ncat debugging commands.</w:t>
-            </w:r>
-          </w:p>
-        </w:tc>
-      </w:tr>
-      <w:tr>
-        <w:tc>
-          <w:tcPr>
-            <w:shd w:val="clear" w:color="auto" w:fill="F6F8FA"/>
-          </w:tcPr>
-          <w:p>
-            <w:pPr>
-              <w:jc w:val="left"/>
-            </w:pPr>
-            <w:r>
-              <w:t xml:space="preserve">3.0.1</w:t>
-            </w:r>
-          </w:p>
-        </w:tc>
-        <w:tc>
-          <w:tcPr>
-            <w:shd w:val="clear" w:color="auto" w:fill="F6F8FA"/>
-          </w:tcPr>
-          <w:p>
-            <w:pPr>
-              <w:jc w:val="left"/>
-            </w:pPr>
-            <w:r>
-              <w:t xml:space="preserve">2026-09-10</w:t>
-            </w:r>
-          </w:p>
-        </w:tc>
-        <w:tc>
-          <w:tcPr>
-            <w:shd w:val="clear" w:color="auto" w:fill="F6F8FA"/>
-          </w:tcPr>
           <w:p>
             <w:pPr>
               <w:numPr>
@@ -16134,7 +16131,19 @@
               <w:jc w:val="left"/>
             </w:pPr>
             <w:r>
-              <w:t xml:space="preserve">Minor fixes: test-filter.sh auto-discovery, build.sh help text, Makefile aggregate descriptions, 5-section comment correction, CHANGELOG version gap note, callout-in-code fix, CI font auto-discovery, dofile path comment, test-sync.sh header.</w:t>
+              <w:t xml:space="preserve">Added verification checklist tables to all 7 chapters.</w:t>
+            </w:r>
+          </w:p>
+          <w:p>
+            <w:pPr>
+              <w:numPr>
+                <w:ilvl w:val="0"/>
+                <w:numId w:val="1087"/>
+              </w:numPr>
+              <w:jc w:val="left"/>
+            </w:pPr>
+            <w:r>
+              <w:t xml:space="preserve">Added mandatory reboot warning in Chapter 2 (SSH port change). Added troubleshooting subsection in Chapter 4 with common SSH connection issues and ncat debugging commands.</w:t>
             </w:r>
           </w:p>
         </w:tc>
@@ -16147,18 +16156,18 @@
               <w:jc w:val="left"/>
             </w:pPr>
             <w:r>
-              <w:t xml:space="preserve">3.0.0</w:t>
-            </w:r>
-          </w:p>
-        </w:tc>
-        <w:tc>
-          <w:tcPr/>
-          <w:p>
-            <w:pPr>
-              <w:jc w:val="left"/>
-            </w:pPr>
-            <w:r>
-              <w:t xml:space="preserve">2026-09-09</w:t>
+              <w:t xml:space="preserve">3.0.1</w:t>
+            </w:r>
+          </w:p>
+        </w:tc>
+        <w:tc>
+          <w:tcPr/>
+          <w:p>
+            <w:pPr>
+              <w:jc w:val="left"/>
+            </w:pPr>
+            <w:r>
+              <w:t xml:space="preserve">2026-09-10</w:t>
             </w:r>
           </w:p>
         </w:tc>
@@ -16173,7 +16182,7 @@
               <w:jc w:val="left"/>
             </w:pPr>
             <w:r>
-              <w:t xml:space="preserve">Modular pipeline refactoring: shared Lua filter factory, shared DOCX fix logic, build system auto-discovery, unified format pipeline, GitHub Actions CI.</w:t>
+              <w:t xml:space="preserve">Minor fixes: test-filter.sh auto-discovery, build.sh help text, Makefile aggregate descriptions, 5-section comment correction, CHANGELOG version gap note, callout-in-code fix, CI font auto-discovery, dofile path comment, test-sync.sh header.</w:t>
             </w:r>
           </w:p>
         </w:tc>
@@ -16188,7 +16197,7 @@
               <w:jc w:val="left"/>
             </w:pPr>
             <w:r>
-              <w:t xml:space="preserve">2.16.0</w:t>
+              <w:t xml:space="preserve">3.0.0</w:t>
             </w:r>
           </w:p>
         </w:tc>
@@ -16201,7 +16210,7 @@
               <w:jc w:val="left"/>
             </w:pPr>
             <w:r>
-              <w:t xml:space="preserve">2026-09-05</w:t>
+              <w:t xml:space="preserve">2026-09-09</w:t>
             </w:r>
           </w:p>
         </w:tc>
@@ -16218,7 +16227,7 @@
               <w:jc w:val="left"/>
             </w:pPr>
             <w:r>
-              <w:t xml:space="preserve">Updated to match template v2.16.0 — Lua filter fixes, build system updates, and technical template parity improvements.</w:t>
+              <w:t xml:space="preserve">Modular pipeline refactoring: shared Lua filter factory, shared DOCX fix logic, build system auto-discovery, unified format pipeline, GitHub Actions CI.</w:t>
             </w:r>
           </w:p>
         </w:tc>
@@ -16231,18 +16240,18 @@
               <w:jc w:val="left"/>
             </w:pPr>
             <w:r>
-              <w:t xml:space="preserve">2.13.0</w:t>
-            </w:r>
-          </w:p>
-        </w:tc>
-        <w:tc>
-          <w:tcPr/>
-          <w:p>
-            <w:pPr>
-              <w:jc w:val="left"/>
-            </w:pPr>
-            <w:r>
-              <w:t xml:space="preserve">2026-08-24</w:t>
+              <w:t xml:space="preserve">2.16.0</w:t>
+            </w:r>
+          </w:p>
+        </w:tc>
+        <w:tc>
+          <w:tcPr/>
+          <w:p>
+            <w:pPr>
+              <w:jc w:val="left"/>
+            </w:pPr>
+            <w:r>
+              <w:t xml:space="preserve">2026-09-05</w:t>
             </w:r>
           </w:p>
         </w:tc>
@@ -16257,6 +16266,51 @@
               <w:jc w:val="left"/>
             </w:pPr>
             <w:r>
+              <w:t xml:space="preserve">Updated to match template v2.16.0 — Lua filter fixes, build system updates, and technical template parity improvements.</w:t>
+            </w:r>
+          </w:p>
+        </w:tc>
+      </w:tr>
+      <w:tr>
+        <w:tc>
+          <w:tcPr>
+            <w:shd w:val="clear" w:color="auto" w:fill="F6F8FA"/>
+          </w:tcPr>
+          <w:p>
+            <w:pPr>
+              <w:jc w:val="left"/>
+            </w:pPr>
+            <w:r>
+              <w:t xml:space="preserve">2.13.0</w:t>
+            </w:r>
+          </w:p>
+        </w:tc>
+        <w:tc>
+          <w:tcPr>
+            <w:shd w:val="clear" w:color="auto" w:fill="F6F8FA"/>
+          </w:tcPr>
+          <w:p>
+            <w:pPr>
+              <w:jc w:val="left"/>
+            </w:pPr>
+            <w:r>
+              <w:t xml:space="preserve">2026-08-24</w:t>
+            </w:r>
+          </w:p>
+        </w:tc>
+        <w:tc>
+          <w:tcPr>
+            <w:shd w:val="clear" w:color="auto" w:fill="F6F8FA"/>
+          </w:tcPr>
+          <w:p>
+            <w:pPr>
+              <w:numPr>
+                <w:ilvl w:val="0"/>
+                <w:numId w:val="1091"/>
+              </w:numPr>
+              <w:jc w:val="left"/>
+            </w:pPr>
+            <w:r>
               <w:t xml:space="preserve">Foundation refactoring Phase 4: make DOCX</w:t>
             </w:r>
             <w:r>
@@ -16324,9 +16378,7 @@
       </w:tr>
       <w:tr>
         <w:tc>
-          <w:tcPr>
-            <w:shd w:val="clear" w:color="auto" w:fill="F6F8FA"/>
-          </w:tcPr>
+          <w:tcPr/>
           <w:p>
             <w:pPr>
               <w:jc w:val="left"/>
@@ -16337,9 +16389,7 @@
           </w:p>
         </w:tc>
         <w:tc>
-          <w:tcPr>
-            <w:shd w:val="clear" w:color="auto" w:fill="F6F8FA"/>
-          </w:tcPr>
+          <w:tcPr/>
           <w:p>
             <w:pPr>
               <w:jc w:val="left"/>
@@ -16350,14 +16400,12 @@
           </w:p>
         </w:tc>
         <w:tc>
-          <w:tcPr>
-            <w:shd w:val="clear" w:color="auto" w:fill="F6F8FA"/>
-          </w:tcPr>
+          <w:tcPr/>
           <w:p>
             <w:pPr>
               <w:numPr>
                 <w:ilvl w:val="0"/>
-                <w:numId w:val="1091"/>
+                <w:numId w:val="1092"/>
               </w:numPr>
               <w:jc w:val="left"/>
             </w:pPr>
@@ -16519,7 +16567,9 @@
       </w:tr>
       <w:tr>
         <w:tc>
-          <w:tcPr/>
+          <w:tcPr>
+            <w:shd w:val="clear" w:color="auto" w:fill="F6F8FA"/>
+          </w:tcPr>
           <w:p>
             <w:pPr>
               <w:jc w:val="left"/>
@@ -16530,7 +16580,9 @@
           </w:p>
         </w:tc>
         <w:tc>
-          <w:tcPr/>
+          <w:tcPr>
+            <w:shd w:val="clear" w:color="auto" w:fill="F6F8FA"/>
+          </w:tcPr>
           <w:p>
             <w:pPr>
               <w:jc w:val="left"/>
@@ -16541,12 +16593,14 @@
           </w:p>
         </w:tc>
         <w:tc>
-          <w:tcPr/>
+          <w:tcPr>
+            <w:shd w:val="clear" w:color="auto" w:fill="F6F8FA"/>
+          </w:tcPr>
           <w:p>
             <w:pPr>
               <w:numPr>
                 <w:ilvl w:val="0"/>
-                <w:numId w:val="1092"/>
+                <w:numId w:val="1093"/>
               </w:numPr>
               <w:jc w:val="left"/>
             </w:pPr>
@@ -16612,9 +16666,7 @@
       </w:tr>
       <w:tr>
         <w:tc>
-          <w:tcPr>
-            <w:shd w:val="clear" w:color="auto" w:fill="F6F8FA"/>
-          </w:tcPr>
+          <w:tcPr/>
           <w:p>
             <w:pPr>
               <w:jc w:val="left"/>
@@ -16625,56 +16677,13 @@
           </w:p>
         </w:tc>
         <w:tc>
-          <w:tcPr>
-            <w:shd w:val="clear" w:color="auto" w:fill="F6F8FA"/>
-          </w:tcPr>
+          <w:tcPr/>
           <w:p>
             <w:pPr>
               <w:jc w:val="left"/>
             </w:pPr>
             <w:r>
               <w:t xml:space="preserve">2026-08-24</w:t>
-            </w:r>
-          </w:p>
-        </w:tc>
-        <w:tc>
-          <w:tcPr>
-            <w:shd w:val="clear" w:color="auto" w:fill="F6F8FA"/>
-          </w:tcPr>
-          <w:p>
-            <w:pPr>
-              <w:numPr>
-                <w:ilvl w:val="0"/>
-                <w:numId w:val="1093"/>
-              </w:numPr>
-              <w:jc w:val="left"/>
-            </w:pPr>
-            <w:r>
-              <w:t xml:space="preserve">Foundation refactoring Phase 1: sync cls version to project tag, fix stale doc references (L16 output count, L-range, setup-guide feature claim), add test-sync.sh for version consistency checking.</w:t>
-            </w:r>
-          </w:p>
-        </w:tc>
-      </w:tr>
-      <w:tr>
-        <w:tc>
-          <w:tcPr/>
-          <w:p>
-            <w:pPr>
-              <w:jc w:val="left"/>
-            </w:pPr>
-            <w:r>
-              <w:t xml:space="preserve">2.9.1</w:t>
-            </w:r>
-          </w:p>
-        </w:tc>
-        <w:tc>
-          <w:tcPr/>
-          <w:p>
-            <w:pPr>
-              <w:jc w:val="left"/>
-            </w:pPr>
-            <w:r>
-              <w:t xml:space="preserve">2026-08-23</w:t>
             </w:r>
           </w:p>
         </w:tc>
@@ -16689,6 +16698,51 @@
               <w:jc w:val="left"/>
             </w:pPr>
             <w:r>
+              <w:t xml:space="preserve">Foundation refactoring Phase 1: sync cls version to project tag, fix stale doc references (L16 output count, L-range, setup-guide feature claim), add test-sync.sh for version consistency checking.</w:t>
+            </w:r>
+          </w:p>
+        </w:tc>
+      </w:tr>
+      <w:tr>
+        <w:tc>
+          <w:tcPr>
+            <w:shd w:val="clear" w:color="auto" w:fill="F6F8FA"/>
+          </w:tcPr>
+          <w:p>
+            <w:pPr>
+              <w:jc w:val="left"/>
+            </w:pPr>
+            <w:r>
+              <w:t xml:space="preserve">2.9.1</w:t>
+            </w:r>
+          </w:p>
+        </w:tc>
+        <w:tc>
+          <w:tcPr>
+            <w:shd w:val="clear" w:color="auto" w:fill="F6F8FA"/>
+          </w:tcPr>
+          <w:p>
+            <w:pPr>
+              <w:jc w:val="left"/>
+            </w:pPr>
+            <w:r>
+              <w:t xml:space="preserve">2026-08-23</w:t>
+            </w:r>
+          </w:p>
+        </w:tc>
+        <w:tc>
+          <w:tcPr>
+            <w:shd w:val="clear" w:color="auto" w:fill="F6F8FA"/>
+          </w:tcPr>
+          <w:p>
+            <w:pPr>
+              <w:numPr>
+                <w:ilvl w:val="0"/>
+                <w:numId w:val="1095"/>
+              </w:numPr>
+              <w:jc w:val="left"/>
+            </w:pPr>
+            <w:r>
               <w:t xml:space="preserve">HTML and Markdown outputs now embed images as base64 data URIs. HTML uses pandoc</w:t>
             </w:r>
             <w:r>
@@ -16720,58 +16774,13 @@
       </w:tr>
       <w:tr>
         <w:tc>
-          <w:tcPr>
-            <w:shd w:val="clear" w:color="auto" w:fill="F6F8FA"/>
-          </w:tcPr>
+          <w:tcPr/>
           <w:p>
             <w:pPr>
               <w:jc w:val="left"/>
             </w:pPr>
             <w:r>
               <w:t xml:space="preserve">2.9.0</w:t>
-            </w:r>
-          </w:p>
-        </w:tc>
-        <w:tc>
-          <w:tcPr>
-            <w:shd w:val="clear" w:color="auto" w:fill="F6F8FA"/>
-          </w:tcPr>
-          <w:p>
-            <w:pPr>
-              <w:jc w:val="left"/>
-            </w:pPr>
-            <w:r>
-              <w:t xml:space="preserve">2026-08-23</w:t>
-            </w:r>
-          </w:p>
-        </w:tc>
-        <w:tc>
-          <w:tcPr>
-            <w:shd w:val="clear" w:color="auto" w:fill="F6F8FA"/>
-          </w:tcPr>
-          <w:p>
-            <w:pPr>
-              <w:numPr>
-                <w:ilvl w:val="0"/>
-                <w:numId w:val="1095"/>
-              </w:numPr>
-              <w:jc w:val="left"/>
-            </w:pPr>
-            <w:r>
-              <w:t xml:space="preserve">DOCX: fix content width (8504→9638tw, margins are 2cm not 3cm). Add footer page numbers. Style TOC heading (22pt bold + rule). Add hutable table width + fixed layout.</w:t>
-            </w:r>
-          </w:p>
-        </w:tc>
-      </w:tr>
-      <w:tr>
-        <w:tc>
-          <w:tcPr/>
-          <w:p>
-            <w:pPr>
-              <w:jc w:val="left"/>
-            </w:pPr>
-            <w:r>
-              <w:t xml:space="preserve">2.8.3</w:t>
             </w:r>
           </w:p>
         </w:tc>
@@ -16797,7 +16806,7 @@
               <w:jc w:val="left"/>
             </w:pPr>
             <w:r>
-              <w:t xml:space="preserve">DOCX fix: callout tables now have explicit width (8504tw) and fixed layout. Changelog section heading now uses custom H1 format (56pt number, red border, right tab) instead of pandoc’s default.</w:t>
+              <w:t xml:space="preserve">DOCX: fix content width (8504→9638tw, margins are 2cm not 3cm). Add footer page numbers. Style TOC heading (22pt bold + rule). Add hutable table width + fixed layout.</w:t>
             </w:r>
           </w:p>
         </w:tc>
@@ -16812,7 +16821,7 @@
               <w:jc w:val="left"/>
             </w:pPr>
             <w:r>
-              <w:t xml:space="preserve">2.8.2</w:t>
+              <w:t xml:space="preserve">2.8.3</w:t>
             </w:r>
           </w:p>
         </w:tc>
@@ -16842,7 +16851,7 @@
               <w:jc w:val="left"/>
             </w:pPr>
             <w:r>
-              <w:t xml:space="preserve">DOCX H1 heading: reverted table approach to paragraph with tab stop + red bottom border. Table broke navigation pane and TOC field. Paragraph preserves Heading1 style for navigation while matching PDF layout (number left, title right, red rule below).</w:t>
+              <w:t xml:space="preserve">DOCX fix: callout tables now have explicit width (8504tw) and fixed layout. Changelog section heading now uses custom H1 format (56pt number, red border, right tab) instead of pandoc’s default.</w:t>
             </w:r>
           </w:p>
         </w:tc>
@@ -16855,7 +16864,7 @@
               <w:jc w:val="left"/>
             </w:pPr>
             <w:r>
-              <w:t xml:space="preserve">2.8.1</w:t>
+              <w:t xml:space="preserve">2.8.2</w:t>
             </w:r>
           </w:p>
         </w:tc>
@@ -16881,7 +16890,7 @@
               <w:jc w:val="left"/>
             </w:pPr>
             <w:r>
-              <w:t xml:space="preserve">DOCX heading fix: text color reverted to black (was incorrectly changed to Huawei red in v2.8.0). H1 now uses a two-column table (number left, title right) with red bottom rule. H2-H4 use simple inline format (number + title, no right tab stop).</w:t>
+              <w:t xml:space="preserve">DOCX H1 heading: reverted table approach to paragraph with tab stop + red bottom border. Table broke navigation pane and TOC field. Paragraph preserves Heading1 style for navigation while matching PDF layout (number left, title right, red rule below).</w:t>
             </w:r>
           </w:p>
         </w:tc>
@@ -16896,7 +16905,7 @@
               <w:jc w:val="left"/>
             </w:pPr>
             <w:r>
-              <w:t xml:space="preserve">2.8.0</w:t>
+              <w:t xml:space="preserve">2.8.1</w:t>
             </w:r>
           </w:p>
         </w:tc>
@@ -16926,7 +16935,7 @@
               <w:jc w:val="left"/>
             </w:pPr>
             <w:r>
-              <w:t xml:space="preserve">DOCX output: match PDF styling --- heading colors (Huawei red), H1 number size (56pt), callout borders (left-only) and padding, changelog formatting (rules, bold version, italic date), caption style (9pt bold), badge style (8pt bold white on red), list indentation.</w:t>
+              <w:t xml:space="preserve">DOCX heading fix: text color reverted to black (was incorrectly changed to Huawei red in v2.8.0). H1 now uses a two-column table (number left, title right) with red bottom rule. H2-H4 use simple inline format (number + title, no right tab stop).</w:t>
             </w:r>
           </w:p>
         </w:tc>
@@ -16939,18 +16948,18 @@
               <w:jc w:val="left"/>
             </w:pPr>
             <w:r>
-              <w:t xml:space="preserve">2.7.1</w:t>
-            </w:r>
-          </w:p>
-        </w:tc>
-        <w:tc>
-          <w:tcPr/>
-          <w:p>
-            <w:pPr>
-              <w:jc w:val="left"/>
-            </w:pPr>
-            <w:r>
-              <w:t xml:space="preserve">2026-08-17</w:t>
+              <w:t xml:space="preserve">2.8.0</w:t>
+            </w:r>
+          </w:p>
+        </w:tc>
+        <w:tc>
+          <w:tcPr/>
+          <w:p>
+            <w:pPr>
+              <w:jc w:val="left"/>
+            </w:pPr>
+            <w:r>
+              <w:t xml:space="preserve">2026-08-23</w:t>
             </w:r>
           </w:p>
         </w:tc>
@@ -16965,6 +16974,51 @@
               <w:jc w:val="left"/>
             </w:pPr>
             <w:r>
+              <w:t xml:space="preserve">DOCX output: match PDF styling --- heading colors (Huawei red), H1 number size (56pt), callout borders (left-only) and padding, changelog formatting (rules, bold version, italic date), caption style (9pt bold), badge style (8pt bold white on red), list indentation.</w:t>
+            </w:r>
+          </w:p>
+        </w:tc>
+      </w:tr>
+      <w:tr>
+        <w:tc>
+          <w:tcPr>
+            <w:shd w:val="clear" w:color="auto" w:fill="F6F8FA"/>
+          </w:tcPr>
+          <w:p>
+            <w:pPr>
+              <w:jc w:val="left"/>
+            </w:pPr>
+            <w:r>
+              <w:t xml:space="preserve">2.7.1</w:t>
+            </w:r>
+          </w:p>
+        </w:tc>
+        <w:tc>
+          <w:tcPr>
+            <w:shd w:val="clear" w:color="auto" w:fill="F6F8FA"/>
+          </w:tcPr>
+          <w:p>
+            <w:pPr>
+              <w:jc w:val="left"/>
+            </w:pPr>
+            <w:r>
+              <w:t xml:space="preserve">2026-08-17</w:t>
+            </w:r>
+          </w:p>
+        </w:tc>
+        <w:tc>
+          <w:tcPr>
+            <w:shd w:val="clear" w:color="auto" w:fill="F6F8FA"/>
+          </w:tcPr>
+          <w:p>
+            <w:pPr>
+              <w:numPr>
+                <w:ilvl w:val="0"/>
+                <w:numId w:val="1101"/>
+              </w:numPr>
+              <w:jc w:val="left"/>
+            </w:pPr>
+            <w:r>
               <w:t xml:space="preserve">Rename project repository to all lowercase (</w:t>
             </w:r>
             <w:r>
@@ -16981,9 +17035,7 @@
       </w:tr>
       <w:tr>
         <w:tc>
-          <w:tcPr>
-            <w:shd w:val="clear" w:color="auto" w:fill="F6F8FA"/>
-          </w:tcPr>
+          <w:tcPr/>
           <w:p>
             <w:pPr>
               <w:jc w:val="left"/>
@@ -16994,9 +17046,7 @@
           </w:p>
         </w:tc>
         <w:tc>
-          <w:tcPr>
-            <w:shd w:val="clear" w:color="auto" w:fill="F6F8FA"/>
-          </w:tcPr>
+          <w:tcPr/>
           <w:p>
             <w:pPr>
               <w:jc w:val="left"/>
@@ -17007,14 +17057,12 @@
           </w:p>
         </w:tc>
         <w:tc>
-          <w:tcPr>
-            <w:shd w:val="clear" w:color="auto" w:fill="F6F8FA"/>
-          </w:tcPr>
+          <w:tcPr/>
           <w:p>
             <w:pPr>
               <w:numPr>
                 <w:ilvl w:val="0"/>
-                <w:numId w:val="1101"/>
+                <w:numId w:val="1102"/>
               </w:numPr>
               <w:jc w:val="left"/>
             </w:pPr>
@@ -17056,7 +17104,9 @@
       </w:tr>
       <w:tr>
         <w:tc>
-          <w:tcPr/>
+          <w:tcPr>
+            <w:shd w:val="clear" w:color="auto" w:fill="F6F8FA"/>
+          </w:tcPr>
           <w:p>
             <w:pPr>
               <w:jc w:val="left"/>
@@ -17067,7 +17117,9 @@
           </w:p>
         </w:tc>
         <w:tc>
-          <w:tcPr/>
+          <w:tcPr>
+            <w:shd w:val="clear" w:color="auto" w:fill="F6F8FA"/>
+          </w:tcPr>
           <w:p>
             <w:pPr>
               <w:jc w:val="left"/>
@@ -17078,12 +17130,14 @@
           </w:p>
         </w:tc>
         <w:tc>
-          <w:tcPr/>
+          <w:tcPr>
+            <w:shd w:val="clear" w:color="auto" w:fill="F6F8FA"/>
+          </w:tcPr>
           <w:p>
             <w:pPr>
               <w:numPr>
                 <w:ilvl w:val="0"/>
-                <w:numId w:val="1102"/>
+                <w:numId w:val="1103"/>
               </w:numPr>
               <w:jc w:val="left"/>
             </w:pPr>
@@ -17140,9 +17194,7 @@
       </w:tr>
       <w:tr>
         <w:tc>
-          <w:tcPr>
-            <w:shd w:val="clear" w:color="auto" w:fill="F6F8FA"/>
-          </w:tcPr>
+          <w:tcPr/>
           <w:p>
             <w:pPr>
               <w:jc w:val="left"/>
@@ -17153,9 +17205,7 @@
           </w:p>
         </w:tc>
         <w:tc>
-          <w:tcPr>
-            <w:shd w:val="clear" w:color="auto" w:fill="F6F8FA"/>
-          </w:tcPr>
+          <w:tcPr/>
           <w:p>
             <w:pPr>
               <w:jc w:val="left"/>
@@ -17166,14 +17216,12 @@
           </w:p>
         </w:tc>
         <w:tc>
-          <w:tcPr>
-            <w:shd w:val="clear" w:color="auto" w:fill="F6F8FA"/>
-          </w:tcPr>
+          <w:tcPr/>
           <w:p>
             <w:pPr>
               <w:numPr>
                 <w:ilvl w:val="0"/>
-                <w:numId w:val="1103"/>
+                <w:numId w:val="1104"/>
               </w:numPr>
               <w:jc w:val="left"/>
             </w:pPr>
@@ -17200,7 +17248,7 @@
             <w:pPr>
               <w:numPr>
                 <w:ilvl w:val="0"/>
-                <w:numId w:val="1103"/>
+                <w:numId w:val="1104"/>
               </w:numPr>
               <w:jc w:val="left"/>
             </w:pPr>
@@ -17227,54 +17275,15 @@
       </w:tr>
       <w:tr>
         <w:tc>
-          <w:tcPr/>
+          <w:tcPr>
+            <w:shd w:val="clear" w:color="auto" w:fill="F6F8FA"/>
+          </w:tcPr>
           <w:p>
             <w:pPr>
               <w:jc w:val="left"/>
             </w:pPr>
             <w:r>
               <w:t xml:space="preserve">2.5.1</w:t>
-            </w:r>
-          </w:p>
-        </w:tc>
-        <w:tc>
-          <w:tcPr/>
-          <w:p>
-            <w:pPr>
-              <w:jc w:val="left"/>
-            </w:pPr>
-            <w:r>
-              <w:t xml:space="preserve">2026-08-10</w:t>
-            </w:r>
-          </w:p>
-        </w:tc>
-        <w:tc>
-          <w:tcPr/>
-          <w:p>
-            <w:pPr>
-              <w:numPr>
-                <w:ilvl w:val="0"/>
-                <w:numId w:val="1104"/>
-              </w:numPr>
-              <w:jc w:val="left"/>
-            </w:pPr>
-            <w:r>
-              <w:t xml:space="preserve">H1 section title size reduced from 27pt to 20pt.</w:t>
-            </w:r>
-          </w:p>
-        </w:tc>
-      </w:tr>
-      <w:tr>
-        <w:tc>
-          <w:tcPr>
-            <w:shd w:val="clear" w:color="auto" w:fill="F6F8FA"/>
-          </w:tcPr>
-          <w:p>
-            <w:pPr>
-              <w:jc w:val="left"/>
-            </w:pPr>
-            <w:r>
-              <w:t xml:space="preserve">2.5.0</w:t>
             </w:r>
           </w:p>
         </w:tc>
@@ -17304,13 +17313,7 @@
               <w:jc w:val="left"/>
             </w:pPr>
             <w:r>
-              <w:t xml:space="preserve">Default image size increased: width 65% → 90% of text width,</w:t>
-            </w:r>
-            <w:r>
-              <w:t xml:space="preserve"> </w:t>
-            </w:r>
-            <w:r>
-              <w:t xml:space="preserve">height 40% → 50% of text height.</w:t>
+              <w:t xml:space="preserve">H1 section title size reduced from 27pt to 20pt.</w:t>
             </w:r>
           </w:p>
         </w:tc>
@@ -17323,7 +17326,7 @@
               <w:jc w:val="left"/>
             </w:pPr>
             <w:r>
-              <w:t xml:space="preserve">2.4.0</w:t>
+              <w:t xml:space="preserve">2.5.0</w:t>
             </w:r>
           </w:p>
         </w:tc>
@@ -17349,14 +17352,65 @@
               <w:jc w:val="left"/>
             </w:pPr>
             <w:r>
-              <w:t xml:space="preserve">Enlarged H1 section title (18pt → 27pt, 50% bigger).</w:t>
-            </w:r>
-          </w:p>
+              <w:t xml:space="preserve">Default image size increased: width 65% → 90% of text width,</w:t>
+            </w:r>
+            <w:r>
+              <w:t xml:space="preserve"> </w:t>
+            </w:r>
+            <w:r>
+              <w:t xml:space="preserve">height 40% → 50% of text height.</w:t>
+            </w:r>
+          </w:p>
+        </w:tc>
+      </w:tr>
+      <w:tr>
+        <w:tc>
+          <w:tcPr>
+            <w:shd w:val="clear" w:color="auto" w:fill="F6F8FA"/>
+          </w:tcPr>
+          <w:p>
+            <w:pPr>
+              <w:jc w:val="left"/>
+            </w:pPr>
+            <w:r>
+              <w:t xml:space="preserve">2.4.0</w:t>
+            </w:r>
+          </w:p>
+        </w:tc>
+        <w:tc>
+          <w:tcPr>
+            <w:shd w:val="clear" w:color="auto" w:fill="F6F8FA"/>
+          </w:tcPr>
+          <w:p>
+            <w:pPr>
+              <w:jc w:val="left"/>
+            </w:pPr>
+            <w:r>
+              <w:t xml:space="preserve">2026-08-10</w:t>
+            </w:r>
+          </w:p>
+        </w:tc>
+        <w:tc>
+          <w:tcPr>
+            <w:shd w:val="clear" w:color="auto" w:fill="F6F8FA"/>
+          </w:tcPr>
           <w:p>
             <w:pPr>
               <w:numPr>
                 <w:ilvl w:val="0"/>
-                <w:numId w:val="1106"/>
+                <w:numId w:val="1107"/>
+              </w:numPr>
+              <w:jc w:val="left"/>
+            </w:pPr>
+            <w:r>
+              <w:t xml:space="preserve">Enlarged H1 section title (18pt → 27pt, 50% bigger).</w:t>
+            </w:r>
+          </w:p>
+          <w:p>
+            <w:pPr>
+              <w:numPr>
+                <w:ilvl w:val="0"/>
+                <w:numId w:val="1107"/>
               </w:numPr>
               <w:jc w:val="left"/>
             </w:pPr>
@@ -17383,9 +17437,7 @@
       </w:tr>
       <w:tr>
         <w:tc>
-          <w:tcPr>
-            <w:shd w:val="clear" w:color="auto" w:fill="F6F8FA"/>
-          </w:tcPr>
+          <w:tcPr/>
           <w:p>
             <w:pPr>
               <w:jc w:val="left"/>
@@ -17396,9 +17448,7 @@
           </w:p>
         </w:tc>
         <w:tc>
-          <w:tcPr>
-            <w:shd w:val="clear" w:color="auto" w:fill="F6F8FA"/>
-          </w:tcPr>
+          <w:tcPr/>
           <w:p>
             <w:pPr>
               <w:jc w:val="left"/>
@@ -17409,14 +17459,12 @@
           </w:p>
         </w:tc>
         <w:tc>
-          <w:tcPr>
-            <w:shd w:val="clear" w:color="auto" w:fill="F6F8FA"/>
-          </w:tcPr>
+          <w:tcPr/>
           <w:p>
             <w:pPr>
               <w:numPr>
                 <w:ilvl w:val="0"/>
-                <w:numId w:val="1107"/>
+                <w:numId w:val="1108"/>
               </w:numPr>
               <w:jc w:val="left"/>
             </w:pPr>
@@ -17443,7 +17491,9 @@
       </w:tr>
       <w:tr>
         <w:tc>
-          <w:tcPr/>
+          <w:tcPr>
+            <w:shd w:val="clear" w:color="auto" w:fill="F6F8FA"/>
+          </w:tcPr>
           <w:p>
             <w:pPr>
               <w:jc w:val="left"/>
@@ -17454,7 +17504,9 @@
           </w:p>
         </w:tc>
         <w:tc>
-          <w:tcPr/>
+          <w:tcPr>
+            <w:shd w:val="clear" w:color="auto" w:fill="F6F8FA"/>
+          </w:tcPr>
           <w:p>
             <w:pPr>
               <w:jc w:val="left"/>
@@ -17465,12 +17517,14 @@
           </w:p>
         </w:tc>
         <w:tc>
-          <w:tcPr/>
+          <w:tcPr>
+            <w:shd w:val="clear" w:color="auto" w:fill="F6F8FA"/>
+          </w:tcPr>
           <w:p>
             <w:pPr>
               <w:numPr>
                 <w:ilvl w:val="0"/>
-                <w:numId w:val="1108"/>
+                <w:numId w:val="1109"/>
               </w:numPr>
               <w:jc w:val="left"/>
             </w:pPr>
@@ -17542,9 +17596,7 @@
       </w:tr>
       <w:tr>
         <w:tc>
-          <w:tcPr>
-            <w:shd w:val="clear" w:color="auto" w:fill="F6F8FA"/>
-          </w:tcPr>
+          <w:tcPr/>
           <w:p>
             <w:pPr>
               <w:jc w:val="left"/>
@@ -17555,9 +17607,7 @@
           </w:p>
         </w:tc>
         <w:tc>
-          <w:tcPr>
-            <w:shd w:val="clear" w:color="auto" w:fill="F6F8FA"/>
-          </w:tcPr>
+          <w:tcPr/>
           <w:p>
             <w:pPr>
               <w:jc w:val="left"/>
@@ -17568,14 +17618,12 @@
           </w:p>
         </w:tc>
         <w:tc>
-          <w:tcPr>
-            <w:shd w:val="clear" w:color="auto" w:fill="F6F8FA"/>
-          </w:tcPr>
+          <w:tcPr/>
           <w:p>
             <w:pPr>
               <w:numPr>
                 <w:ilvl w:val="0"/>
-                <w:numId w:val="1109"/>
+                <w:numId w:val="1110"/>
               </w:numPr>
               <w:jc w:val="left"/>
             </w:pPr>
@@ -17632,7 +17680,9 @@
       </w:tr>
       <w:tr>
         <w:tc>
-          <w:tcPr/>
+          <w:tcPr>
+            <w:shd w:val="clear" w:color="auto" w:fill="F6F8FA"/>
+          </w:tcPr>
           <w:p>
             <w:pPr>
               <w:jc w:val="left"/>
@@ -17643,7 +17693,9 @@
           </w:p>
         </w:tc>
         <w:tc>
-          <w:tcPr/>
+          <w:tcPr>
+            <w:shd w:val="clear" w:color="auto" w:fill="F6F8FA"/>
+          </w:tcPr>
           <w:p>
             <w:pPr>
               <w:jc w:val="left"/>
@@ -17654,12 +17706,14 @@
           </w:p>
         </w:tc>
         <w:tc>
-          <w:tcPr/>
+          <w:tcPr>
+            <w:shd w:val="clear" w:color="auto" w:fill="F6F8FA"/>
+          </w:tcPr>
           <w:p>
             <w:pPr>
               <w:numPr>
                 <w:ilvl w:val="0"/>
-                <w:numId w:val="1110"/>
+                <w:numId w:val="1111"/>
               </w:numPr>
               <w:jc w:val="left"/>
             </w:pPr>
@@ -17686,58 +17740,13 @@
       </w:tr>
       <w:tr>
         <w:tc>
-          <w:tcPr>
-            <w:shd w:val="clear" w:color="auto" w:fill="F6F8FA"/>
-          </w:tcPr>
+          <w:tcPr/>
           <w:p>
             <w:pPr>
               <w:jc w:val="left"/>
             </w:pPr>
             <w:r>
               <w:t xml:space="preserve">2.2.2</w:t>
-            </w:r>
-          </w:p>
-        </w:tc>
-        <w:tc>
-          <w:tcPr>
-            <w:shd w:val="clear" w:color="auto" w:fill="F6F8FA"/>
-          </w:tcPr>
-          <w:p>
-            <w:pPr>
-              <w:jc w:val="left"/>
-            </w:pPr>
-            <w:r>
-              <w:t xml:space="preserve">2026-08-08</w:t>
-            </w:r>
-          </w:p>
-        </w:tc>
-        <w:tc>
-          <w:tcPr>
-            <w:shd w:val="clear" w:color="auto" w:fill="F6F8FA"/>
-          </w:tcPr>
-          <w:p>
-            <w:pPr>
-              <w:numPr>
-                <w:ilvl w:val="0"/>
-                <w:numId w:val="1111"/>
-              </w:numPr>
-              <w:jc w:val="left"/>
-            </w:pPr>
-            <w:r>
-              <w:t xml:space="preserve">Fixed chapter reference in prerequisite (Chapter 3 → Chapter 4).</w:t>
-            </w:r>
-          </w:p>
-        </w:tc>
-      </w:tr>
-      <w:tr>
-        <w:tc>
-          <w:tcPr/>
-          <w:p>
-            <w:pPr>
-              <w:jc w:val="left"/>
-            </w:pPr>
-            <w:r>
-              <w:t xml:space="preserve">2.2.1</w:t>
             </w:r>
           </w:p>
         </w:tc>
@@ -17763,7 +17772,7 @@
               <w:jc w:val="left"/>
             </w:pPr>
             <w:r>
-              <w:t xml:space="preserve">Changed table and figure caption labels to black (was Huawei red).</w:t>
+              <w:t xml:space="preserve">Fixed chapter reference in prerequisite (Chapter 3 → Chapter 4).</w:t>
             </w:r>
           </w:p>
         </w:tc>
@@ -17778,7 +17787,7 @@
               <w:jc w:val="left"/>
             </w:pPr>
             <w:r>
-              <w:t xml:space="preserve">2.2.0</w:t>
+              <w:t xml:space="preserve">2.2.1</w:t>
             </w:r>
           </w:p>
         </w:tc>
@@ -17808,13 +17817,7 @@
               <w:jc w:val="left"/>
             </w:pPr>
             <w:r>
-              <w:t xml:space="preserve">Added Huawei-branded table styling: red header bar, alternating row</w:t>
-            </w:r>
-            <w:r>
-              <w:t xml:space="preserve"> </w:t>
-            </w:r>
-            <w:r>
-              <w:t xml:space="preserve">colors, and bordered cells.</w:t>
+              <w:t xml:space="preserve">Changed table and figure caption labels to black (was Huawei red).</w:t>
             </w:r>
           </w:p>
         </w:tc>
@@ -17827,18 +17830,18 @@
               <w:jc w:val="left"/>
             </w:pPr>
             <w:r>
-              <w:t xml:space="preserve">2.1.0</w:t>
-            </w:r>
-          </w:p>
-        </w:tc>
-        <w:tc>
-          <w:tcPr/>
-          <w:p>
-            <w:pPr>
-              <w:jc w:val="left"/>
-            </w:pPr>
-            <w:r>
-              <w:t xml:space="preserve">2026-08-06</w:t>
+              <w:t xml:space="preserve">2.2.0</w:t>
+            </w:r>
+          </w:p>
+        </w:tc>
+        <w:tc>
+          <w:tcPr/>
+          <w:p>
+            <w:pPr>
+              <w:jc w:val="left"/>
+            </w:pPr>
+            <w:r>
+              <w:t xml:space="preserve">2026-08-08</w:t>
             </w:r>
           </w:p>
         </w:tc>
@@ -17853,6 +17856,57 @@
               <w:jc w:val="left"/>
             </w:pPr>
             <w:r>
+              <w:t xml:space="preserve">Added Huawei-branded table styling: red header bar, alternating row</w:t>
+            </w:r>
+            <w:r>
+              <w:t xml:space="preserve"> </w:t>
+            </w:r>
+            <w:r>
+              <w:t xml:space="preserve">colors, and bordered cells.</w:t>
+            </w:r>
+          </w:p>
+        </w:tc>
+      </w:tr>
+      <w:tr>
+        <w:tc>
+          <w:tcPr>
+            <w:shd w:val="clear" w:color="auto" w:fill="F6F8FA"/>
+          </w:tcPr>
+          <w:p>
+            <w:pPr>
+              <w:jc w:val="left"/>
+            </w:pPr>
+            <w:r>
+              <w:t xml:space="preserve">2.1.0</w:t>
+            </w:r>
+          </w:p>
+        </w:tc>
+        <w:tc>
+          <w:tcPr>
+            <w:shd w:val="clear" w:color="auto" w:fill="F6F8FA"/>
+          </w:tcPr>
+          <w:p>
+            <w:pPr>
+              <w:jc w:val="left"/>
+            </w:pPr>
+            <w:r>
+              <w:t xml:space="preserve">2026-08-06</w:t>
+            </w:r>
+          </w:p>
+        </w:tc>
+        <w:tc>
+          <w:tcPr>
+            <w:shd w:val="clear" w:color="auto" w:fill="F6F8FA"/>
+          </w:tcPr>
+          <w:p>
+            <w:pPr>
+              <w:numPr>
+                <w:ilvl w:val="0"/>
+                <w:numId w:val="1115"/>
+              </w:numPr>
+              <w:jc w:val="left"/>
+            </w:pPr>
+            <w:r>
               <w:t xml:space="preserve">Updated ECS flavor to</w:t>
             </w:r>
             <w:r>
@@ -17875,7 +17929,7 @@
             <w:pPr>
               <w:numPr>
                 <w:ilvl w:val="0"/>
-                <w:numId w:val="1114"/>
+                <w:numId w:val="1115"/>
               </w:numPr>
               <w:jc w:val="left"/>
             </w:pPr>
@@ -17887,7 +17941,7 @@
             <w:pPr>
               <w:numPr>
                 <w:ilvl w:val="0"/>
-                <w:numId w:val="1114"/>
+                <w:numId w:val="1115"/>
               </w:numPr>
               <w:jc w:val="left"/>
             </w:pPr>
@@ -17899,7 +17953,7 @@
             <w:pPr>
               <w:numPr>
                 <w:ilvl w:val="0"/>
-                <w:numId w:val="1114"/>
+                <w:numId w:val="1115"/>
               </w:numPr>
               <w:jc w:val="left"/>
             </w:pPr>
@@ -17911,7 +17965,7 @@
             <w:pPr>
               <w:numPr>
                 <w:ilvl w:val="0"/>
-                <w:numId w:val="1114"/>
+                <w:numId w:val="1115"/>
               </w:numPr>
               <w:jc w:val="left"/>
             </w:pPr>
@@ -17923,7 +17977,7 @@
             <w:pPr>
               <w:numPr>
                 <w:ilvl w:val="0"/>
-                <w:numId w:val="1114"/>
+                <w:numId w:val="1115"/>
               </w:numPr>
               <w:jc w:val="left"/>
             </w:pPr>
@@ -17941,7 +17995,7 @@
             <w:pPr>
               <w:numPr>
                 <w:ilvl w:val="0"/>
-                <w:numId w:val="1114"/>
+                <w:numId w:val="1115"/>
               </w:numPr>
               <w:jc w:val="left"/>
             </w:pPr>
@@ -17990,7 +18044,7 @@
             <w:pPr>
               <w:numPr>
                 <w:ilvl w:val="0"/>
-                <w:numId w:val="1114"/>
+                <w:numId w:val="1115"/>
               </w:numPr>
               <w:jc w:val="left"/>
             </w:pPr>
@@ -18002,7 +18056,7 @@
             <w:pPr>
               <w:numPr>
                 <w:ilvl w:val="0"/>
-                <w:numId w:val="1114"/>
+                <w:numId w:val="1115"/>
               </w:numPr>
               <w:jc w:val="left"/>
             </w:pPr>
@@ -18053,7 +18107,7 @@
             <w:pPr>
               <w:numPr>
                 <w:ilvl w:val="0"/>
-                <w:numId w:val="1114"/>
+                <w:numId w:val="1115"/>
               </w:numPr>
               <w:jc w:val="left"/>
             </w:pPr>
@@ -18080,9 +18134,7 @@
       </w:tr>
       <w:tr>
         <w:tc>
-          <w:tcPr>
-            <w:shd w:val="clear" w:color="auto" w:fill="F6F8FA"/>
-          </w:tcPr>
+          <w:tcPr/>
           <w:p>
             <w:pPr>
               <w:jc w:val="left"/>
@@ -18093,9 +18145,7 @@
           </w:p>
         </w:tc>
         <w:tc>
-          <w:tcPr>
-            <w:shd w:val="clear" w:color="auto" w:fill="F6F8FA"/>
-          </w:tcPr>
+          <w:tcPr/>
           <w:p>
             <w:pPr>
               <w:jc w:val="left"/>
@@ -18106,14 +18156,12 @@
           </w:p>
         </w:tc>
         <w:tc>
-          <w:tcPr>
-            <w:shd w:val="clear" w:color="auto" w:fill="F6F8FA"/>
-          </w:tcPr>
+          <w:tcPr/>
           <w:p>
             <w:pPr>
               <w:numPr>
                 <w:ilvl w:val="0"/>
-                <w:numId w:val="1115"/>
+                <w:numId w:val="1116"/>
               </w:numPr>
               <w:jc w:val="left"/>
             </w:pPr>
@@ -18131,7 +18179,7 @@
             <w:pPr>
               <w:numPr>
                 <w:ilvl w:val="0"/>
-                <w:numId w:val="1115"/>
+                <w:numId w:val="1116"/>
               </w:numPr>
               <w:jc w:val="left"/>
             </w:pPr>
@@ -18185,7 +18233,7 @@
             <w:pPr>
               <w:numPr>
                 <w:ilvl w:val="0"/>
-                <w:numId w:val="1115"/>
+                <w:numId w:val="1116"/>
               </w:numPr>
               <w:jc w:val="left"/>
             </w:pPr>
@@ -18233,7 +18281,7 @@
             <w:pPr>
               <w:numPr>
                 <w:ilvl w:val="0"/>
-                <w:numId w:val="1115"/>
+                <w:numId w:val="1116"/>
               </w:numPr>
               <w:jc w:val="left"/>
             </w:pPr>
@@ -18254,7 +18302,9 @@
       </w:tr>
       <w:tr>
         <w:tc>
-          <w:tcPr/>
+          <w:tcPr>
+            <w:shd w:val="clear" w:color="auto" w:fill="F6F8FA"/>
+          </w:tcPr>
           <w:p>
             <w:pPr>
               <w:jc w:val="left"/>
@@ -18265,7 +18315,9 @@
           </w:p>
         </w:tc>
         <w:tc>
-          <w:tcPr/>
+          <w:tcPr>
+            <w:shd w:val="clear" w:color="auto" w:fill="F6F8FA"/>
+          </w:tcPr>
           <w:p>
             <w:pPr>
               <w:jc w:val="left"/>
@@ -18276,12 +18328,14 @@
           </w:p>
         </w:tc>
         <w:tc>
-          <w:tcPr/>
+          <w:tcPr>
+            <w:shd w:val="clear" w:color="auto" w:fill="F6F8FA"/>
+          </w:tcPr>
           <w:p>
             <w:pPr>
               <w:numPr>
                 <w:ilvl w:val="0"/>
-                <w:numId w:val="1116"/>
+                <w:numId w:val="1117"/>
               </w:numPr>
               <w:jc w:val="left"/>
             </w:pPr>
@@ -18293,7 +18347,7 @@
             <w:pPr>
               <w:numPr>
                 <w:ilvl w:val="0"/>
-                <w:numId w:val="1116"/>
+                <w:numId w:val="1117"/>
               </w:numPr>
               <w:jc w:val="left"/>
             </w:pPr>
@@ -18305,7 +18359,7 @@
             <w:pPr>
               <w:numPr>
                 <w:ilvl w:val="0"/>
-                <w:numId w:val="1116"/>
+                <w:numId w:val="1117"/>
               </w:numPr>
               <w:jc w:val="left"/>
             </w:pPr>
@@ -18317,7 +18371,7 @@
             <w:pPr>
               <w:numPr>
                 <w:ilvl w:val="0"/>
-                <w:numId w:val="1116"/>
+                <w:numId w:val="1117"/>
               </w:numPr>
               <w:jc w:val="left"/>
             </w:pPr>
@@ -18335,7 +18389,7 @@
             <w:pPr>
               <w:numPr>
                 <w:ilvl w:val="0"/>
-                <w:numId w:val="1116"/>
+                <w:numId w:val="1117"/>
               </w:numPr>
               <w:jc w:val="left"/>
             </w:pPr>
@@ -18347,7 +18401,7 @@
             <w:pPr>
               <w:numPr>
                 <w:ilvl w:val="0"/>
-                <w:numId w:val="1116"/>
+                <w:numId w:val="1117"/>
               </w:numPr>
               <w:jc w:val="left"/>
             </w:pPr>
@@ -19740,6 +19794,9 @@
     <w:abstractNumId w:val="991"/>
   </w:num>
   <w:num w:numId="1116">
+    <w:abstractNumId w:val="991"/>
+  </w:num>
+  <w:num w:numId="1117">
     <w:abstractNumId w:val="991"/>
   </w:num>
 </w:numbering>
@@ -20211,9 +20268,6 @@
   <w:style w:customStyle="1" w:styleId="SectionNumber" w:type="character">
     <w:name w:val="Section Number"/>
     <w:basedOn w:val="BodyTextChar"/>
-    <w:rPr>
-      <w:sz w:val="112"/>
-    </w:rPr>
   </w:style>
   <w:style w:styleId="FootnoteReference" w:type="character">
     <w:name w:val="Footnote Reference"/>

</xml_diff>

<commit_message>
Fix DOCX body text justification (v6.9.2)
- DOCX body paragraphs are now justified (matching the PDF LaTeX
  default), instead of left-aligned
- Set jc=both on Normal style; BodyText and FirstParagraph inherit
- Bump all templates + setup-guide to v6.9.2; regenerate artifacts
</commit_message>
<xml_diff>
--- a/documents/setup-guide/setup-guide.docx
+++ b/documents/setup-guide/setup-guide.docx
@@ -84,7 +84,7 @@
           <w:b/>
           <w:sz w:val="24"/>
         </w:rPr>
-        <w:t xml:space="preserve">v6.9.1</w:t>
+        <w:t xml:space="preserve">v6.9.2</w:t>
       </w:r>
       <w:r>
         <w:rPr>
@@ -96,7 +96,7 @@
         <w:rPr>
           <w:sz w:val="24"/>
         </w:rPr>
-        <w:t xml:space="preserve">— September 20, 2026 22:31</w:t>
+        <w:t xml:space="preserve">— September 20, 2026 22:58</w:t>
       </w:r>
     </w:p>
     <w:sdt>
@@ -13354,7 +13354,7 @@
               <w:jc w:val="left"/>
             </w:pPr>
             <w:r>
-              <w:t xml:space="preserve">6.9.1</w:t>
+              <w:t xml:space="preserve">6.9.2</w:t>
             </w:r>
           </w:p>
         </w:tc>
@@ -13380,7 +13380,7 @@
               <w:jc w:val="left"/>
             </w:pPr>
             <w:r>
-              <w:t xml:space="preserve">Fix DOCX subsection number size: H2/H3/H4 section numbers were rendered at 56pt (same as H1) instead of matching the heading text size (18/16/14pt). The SectionNumber style is now unstyled (inherits heading size); 56pt is set directly on H1 number runs only.</w:t>
+              <w:t xml:space="preserve">Fix DOCX body text alignment: paragraphs are now justified (matching the PDF LaTeX default), instead of left-aligned.</w:t>
             </w:r>
           </w:p>
         </w:tc>
@@ -13395,7 +13395,7 @@
               <w:jc w:val="left"/>
             </w:pPr>
             <w:r>
-              <w:t xml:space="preserve">6.9.0</w:t>
+              <w:t xml:space="preserve">6.9.1</w:t>
             </w:r>
           </w:p>
         </w:tc>
@@ -13425,7 +13425,7 @@
               <w:jc w:val="left"/>
             </w:pPr>
             <w:r>
-              <w:t xml:space="preserve">TOC styling: the table-of-contents title rule is now Huawei red (was black) in both PDF and DOCX, matching the H1 heading red rules. DOCX TOC entries now match the PDF: level 1 bold 12pt, levels 2-3 normal 10pt, HarmonyOS Sans font. DOCX TOC depth increased from 2 to 3 levels (matching PDF tocdepth). Dead TOCTitle style removed from DOCX.</w:t>
+              <w:t xml:space="preserve">Fix DOCX subsection number size: H2/H3/H4 section numbers were rendered at 56pt (same as H1) instead of matching the heading text size (18/16/14pt). The SectionNumber style is now unstyled (inherits heading size); 56pt is set directly on H1 number runs only.</w:t>
             </w:r>
           </w:p>
         </w:tc>
@@ -13438,18 +13438,18 @@
               <w:jc w:val="left"/>
             </w:pPr>
             <w:r>
-              <w:t xml:space="preserve">6.8.3</w:t>
-            </w:r>
-          </w:p>
-        </w:tc>
-        <w:tc>
-          <w:tcPr/>
-          <w:p>
-            <w:pPr>
-              <w:jc w:val="left"/>
-            </w:pPr>
-            <w:r>
-              <w:t xml:space="preserve">2026-09-20</w:t>
+              <w:t xml:space="preserve">6.9.0</w:t>
+            </w:r>
+          </w:p>
+        </w:tc>
+        <w:tc>
+          <w:tcPr/>
+          <w:p>
+            <w:pPr>
+              <w:jc w:val="left"/>
+            </w:pPr>
+            <w:r>
+              <w:t xml:space="preserve">2026-09-21</w:t>
             </w:r>
           </w:p>
         </w:tc>
@@ -13464,7 +13464,7 @@
               <w:jc w:val="left"/>
             </w:pPr>
             <w:r>
-              <w:t xml:space="preserve">Docs accuracy fix: the multi-format pipeline descriptions in README, AGENTS, and all four SKILL.md files now correctly separate the DOCX/Markdown path (pre-processor then docbook then pandoc) from the HTML path (pre-processor then asciidoctor html5) — the previous wording implied HTML also went through docbook and pandoc. Corrected a stale comment in the DOCX fixer.</w:t>
+              <w:t xml:space="preserve">TOC styling: the table-of-contents title rule is now Huawei red (was black) in both PDF and DOCX, matching the H1 heading red rules. DOCX TOC entries now match the PDF: level 1 bold 12pt, levels 2-3 normal 10pt, HarmonyOS Sans font. DOCX TOC depth increased from 2 to 3 levels (matching PDF tocdepth). Dead TOCTitle style removed from DOCX.</w:t>
             </w:r>
           </w:p>
         </w:tc>
@@ -13479,7 +13479,7 @@
               <w:jc w:val="left"/>
             </w:pPr>
             <w:r>
-              <w:t xml:space="preserve">6.8.2</w:t>
+              <w:t xml:space="preserve">6.8.3</w:t>
             </w:r>
           </w:p>
         </w:tc>
@@ -13509,7 +13509,7 @@
               <w:jc w:val="left"/>
             </w:pPr>
             <w:r>
-              <w:t xml:space="preserve">Documentation and cleanup: README, AGENTS, and all four SKILL.md files now describe the real multi-format pipeline (pre-processor + docx_fix --fix + --lang flag) instead of the pre-v6.4 asciidoctor-to-pandoc chain. DOCX TOC title is now right-aligned like the PDF (was targeting a dead style). Signature names render bold like the PDF. Dead code removed (unused Caption style, dead TOCTitle style, dead HTML badge CSS). The --template and --lang flags accept the equals form (--template=guide). Various stale comments corrected.</w:t>
+              <w:t xml:space="preserve">Docs accuracy fix: the multi-format pipeline descriptions in README, AGENTS, and all four SKILL.md files now correctly separate the DOCX/Markdown path (pre-processor then docbook then pandoc) from the HTML path (pre-processor then asciidoctor html5) — the previous wording implied HTML also went through docbook and pandoc. Corrected a stale comment in the DOCX fixer.</w:t>
             </w:r>
           </w:p>
         </w:tc>
@@ -13522,7 +13522,7 @@
               <w:jc w:val="left"/>
             </w:pPr>
             <w:r>
-              <w:t xml:space="preserve">6.8.1</w:t>
+              <w:t xml:space="preserve">6.8.2</w:t>
             </w:r>
           </w:p>
         </w:tc>
@@ -13548,7 +13548,7 @@
               <w:jc w:val="left"/>
             </w:pPr>
             <w:r>
-              <w:t xml:space="preserve">Quality-pass fixes for v6.8.0: non-technical covers no longer show a stray Date paragraph (regression from the meta-scan change); the technical cover table is no longer hijacked from the body when :nochangelog: is set (boundary check on the cover-table detection); the Version/Date/Scenario table now renders unconditionally like the PDF (was gated by :nochangelog:); empty cover tables are skipped when no report values are set; corrected the cover-element-order wording in the v6.8.0 changelog.</w:t>
+              <w:t xml:space="preserve">Documentation and cleanup: README, AGENTS, and all four SKILL.md files now describe the real multi-format pipeline (pre-processor + docx_fix --fix + --lang flag) instead of the pre-v6.4 asciidoctor-to-pandoc chain. DOCX TOC title is now right-aligned like the PDF (was targeting a dead style). Signature names render bold like the PDF. Dead code removed (unused Caption style, dead TOCTitle style, dead HTML badge CSS). The --template and --lang flags accept the equals form (--template=guide). Various stale comments corrected.</w:t>
             </w:r>
           </w:p>
         </w:tc>
@@ -13563,7 +13563,7 @@
               <w:jc w:val="left"/>
             </w:pPr>
             <w:r>
-              <w:t xml:space="preserve">6.8.0</w:t>
+              <w:t xml:space="preserve">6.8.1</w:t>
             </w:r>
           </w:p>
         </w:tc>
@@ -13593,7 +13593,7 @@
               <w:jc w:val="left"/>
             </w:pPr>
             <w:r>
-              <w:t xml:space="preserve">Technical report covers now match the PDF in DOCX/MD/HTML: the title uses the PDF’s 24pt size (was 36pt), the report type label appears below the title (the DOCX cover keeps the established title-first order; the PDF has label-then-title), and the Version/Date/Scenario table is rendered with the PDF’s red label column. The cover meta line now shows the report version and its set date (was the document version and the build date). Authors, when set, appear as a table row like the PDF.</w:t>
+              <w:t xml:space="preserve">Quality-pass fixes for v6.8.0: non-technical covers no longer show a stray Date paragraph (regression from the meta-scan change); the technical cover table is no longer hijacked from the body when :nochangelog: is set (boundary check on the cover-table detection); the Version/Date/Scenario table now renders unconditionally like the PDF (was gated by :nochangelog:); empty cover tables are skipped when no report values are set; corrected the cover-element-order wording in the v6.8.0 changelog.</w:t>
             </w:r>
           </w:p>
         </w:tc>
@@ -13606,7 +13606,7 @@
               <w:jc w:val="left"/>
             </w:pPr>
             <w:r>
-              <w:t xml:space="preserve">6.7.0</w:t>
+              <w:t xml:space="preserve">6.8.0</w:t>
             </w:r>
           </w:p>
         </w:tc>
@@ -13632,7 +13632,7 @@
               <w:jc w:val="left"/>
             </w:pPr>
             <w:r>
-              <w:t xml:space="preserve">Badge and language fidelity: DOCX badge pills now render black text like the PDF (was frame-colored), use the correct label case (Pass, not PASS), include the Portuguese POC labels (Atendido, Parcial, Falha, Ignorado), and render at native width per template (testbook badge text no longer shrinks). Portuguese signature greetings now match the PDF (At.te,), the POC classification label matches the full PDF wording, and the secondary-format table headers (stakeholders, closing record, test summary, changelog) are now language-aware. DOCX footers show Página in Portuguese documents. Cover dates no longer zero-pad the day.</w:t>
+              <w:t xml:space="preserve">Technical report covers now match the PDF in DOCX/MD/HTML: the title uses the PDF’s 24pt size (was 36pt), the report type label appears below the title (the DOCX cover keeps the established title-first order; the PDF has label-then-title), and the Version/Date/Scenario table is rendered with the PDF’s red label column. The cover meta line now shows the report version and its set date (was the document version and the build date). Authors, when set, appear as a table row like the PDF.</w:t>
             </w:r>
           </w:p>
         </w:tc>
@@ -13647,7 +13647,7 @@
               <w:jc w:val="left"/>
             </w:pPr>
             <w:r>
-              <w:t xml:space="preserve">6.6.1</w:t>
+              <w:t xml:space="preserve">6.7.0</w:t>
             </w:r>
           </w:p>
         </w:tc>
@@ -13677,7 +13677,7 @@
               <w:jc w:val="left"/>
             </w:pPr>
             <w:r>
-              <w:t xml:space="preserve">Quality-pass fixes for v6.6.0: the TESTCASE-marker strip now covers the entire DOCX fix run (a failure at any stage can no longer leave markers in the output file); the fixer resets its template state between in-process runs (the documented path-sniffing fallback works again); build.sh also cleans temporary files on interrupt signals; fixed a CHANGELOG typo.</w:t>
+              <w:t xml:space="preserve">Badge and language fidelity: DOCX badge pills now render black text like the PDF (was frame-colored), use the correct label case (Pass, not PASS), include the Portuguese POC labels (Atendido, Parcial, Falha, Ignorado), and render at native width per template (testbook badge text no longer shrinks). Portuguese signature greetings now match the PDF (At.te,), the POC classification label matches the full PDF wording, and the secondary-format table headers (stakeholders, closing record, test summary, changelog) are now language-aware. DOCX footers show Página in Portuguese documents. Cover dates no longer zero-pad the day.</w:t>
             </w:r>
           </w:p>
         </w:tc>
@@ -13690,7 +13690,7 @@
               <w:jc w:val="left"/>
             </w:pPr>
             <w:r>
-              <w:t xml:space="preserve">6.6.0</w:t>
+              <w:t xml:space="preserve">6.6.1</w:t>
             </w:r>
           </w:p>
         </w:tc>
@@ -13716,6 +13716,51 @@
               <w:jc w:val="left"/>
             </w:pPr>
             <w:r>
+              <w:t xml:space="preserve">Quality-pass fixes for v6.6.0: the TESTCASE-marker strip now covers the entire DOCX fix run (a failure at any stage can no longer leave markers in the output file); the fixer resets its template state between in-process runs (the documented path-sniffing fallback works again); build.sh also cleans temporary files on interrupt signals; fixed a CHANGELOG typo.</w:t>
+            </w:r>
+          </w:p>
+        </w:tc>
+      </w:tr>
+      <w:tr>
+        <w:tc>
+          <w:tcPr>
+            <w:shd w:val="clear" w:color="auto" w:fill="F6F8FA"/>
+          </w:tcPr>
+          <w:p>
+            <w:pPr>
+              <w:jc w:val="left"/>
+            </w:pPr>
+            <w:r>
+              <w:t xml:space="preserve">6.6.0</w:t>
+            </w:r>
+          </w:p>
+        </w:tc>
+        <w:tc>
+          <w:tcPr>
+            <w:shd w:val="clear" w:color="auto" w:fill="F6F8FA"/>
+          </w:tcPr>
+          <w:p>
+            <w:pPr>
+              <w:jc w:val="left"/>
+            </w:pPr>
+            <w:r>
+              <w:t xml:space="preserve">2026-09-20</w:t>
+            </w:r>
+          </w:p>
+        </w:tc>
+        <w:tc>
+          <w:tcPr>
+            <w:shd w:val="clear" w:color="auto" w:fill="F6F8FA"/>
+          </w:tcPr>
+          <w:p>
+            <w:pPr>
+              <w:numPr>
+                <w:ilvl w:val="0"/>
+                <w:numId w:val="1051"/>
+              </w:numPr>
+              <w:jc w:val="left"/>
+            </w:pPr>
+            <w:r>
               <w:t xml:space="preserve">Pipeline robustness: DOCX post-processing now fails loudly when content styling errors occur (TESTCASE markers can no longer leak into output); the DOCX fixer takes an explicit</w:t>
             </w:r>
             <w:r>
@@ -13738,58 +13783,13 @@
       </w:tr>
       <w:tr>
         <w:tc>
-          <w:tcPr>
-            <w:shd w:val="clear" w:color="auto" w:fill="F6F8FA"/>
-          </w:tcPr>
+          <w:tcPr/>
           <w:p>
             <w:pPr>
               <w:jc w:val="left"/>
             </w:pPr>
             <w:r>
               <w:t xml:space="preserve">6.5.2</w:t>
-            </w:r>
-          </w:p>
-        </w:tc>
-        <w:tc>
-          <w:tcPr>
-            <w:shd w:val="clear" w:color="auto" w:fill="F6F8FA"/>
-          </w:tcPr>
-          <w:p>
-            <w:pPr>
-              <w:jc w:val="left"/>
-            </w:pPr>
-            <w:r>
-              <w:t xml:space="preserve">2026-09-20</w:t>
-            </w:r>
-          </w:p>
-        </w:tc>
-        <w:tc>
-          <w:tcPr>
-            <w:shd w:val="clear" w:color="auto" w:fill="F6F8FA"/>
-          </w:tcPr>
-          <w:p>
-            <w:pPr>
-              <w:numPr>
-                <w:ilvl w:val="0"/>
-                <w:numId w:val="1051"/>
-              </w:numPr>
-              <w:jc w:val="left"/>
-            </w:pPr>
-            <w:r>
-              <w:t xml:space="preserve">Quality-pass fixes for v6.5.1: LaTeX quote conversion now handles only paired quotes (quote characters inside code arguments are no longer corrupted); signature cells containing escaped ampersands are no longer split; round-trip HTML generation guards the asciidoctor-diagram dependency and fails loudly when generation fails; pre-processor unit tests now cover pipe escaping in all five table handlers.</w:t>
-            </w:r>
-          </w:p>
-        </w:tc>
-      </w:tr>
-      <w:tr>
-        <w:tc>
-          <w:tcPr/>
-          <w:p>
-            <w:pPr>
-              <w:jc w:val="left"/>
-            </w:pPr>
-            <w:r>
-              <w:t xml:space="preserve">6.5.1</w:t>
             </w:r>
           </w:p>
         </w:tc>
@@ -13815,7 +13815,7 @@
               <w:jc w:val="left"/>
             </w:pPr>
             <w:r>
-              <w:t xml:space="preserve">Fixed DOCX/MD/HTML output: tables are no longer corrupted when changelog, signature, or summary content contains a pipe character (“|”). Badge text is now preserved in DOCX/MD/HTML — a “Ready” badge renders “Ready” instead of “[NEW]”. Multi-item changelog entries render as bullet lists instead of being joined with a literal “+”. POC documents now include the changelog in DOCX/MD/HTML. The :noanswers: attribute now hides test results and remarks in DOCX/MD/HTML, matching the PDF. Inline LaTeX (monospace text, arrows, LaTeX quotes) no longer leaks from changelog entries. The test suite now exercises the real build pipeline (pre-processor wired into round-trip and DOCX tests), with new pre-processor unit tests.</w:t>
+              <w:t xml:space="preserve">Quality-pass fixes for v6.5.1: LaTeX quote conversion now handles only paired quotes (quote characters inside code arguments are no longer corrupted); signature cells containing escaped ampersands are no longer split; round-trip HTML generation guards the asciidoctor-diagram dependency and fails loudly when generation fails; pre-processor unit tests now cover pipe escaping in all five table handlers.</w:t>
             </w:r>
           </w:p>
         </w:tc>
@@ -13830,7 +13830,7 @@
               <w:jc w:val="left"/>
             </w:pPr>
             <w:r>
-              <w:t xml:space="preserve">6.5.0</w:t>
+              <w:t xml:space="preserve">6.5.1</w:t>
             </w:r>
           </w:p>
         </w:tc>
@@ -13860,7 +13860,7 @@
               <w:jc w:val="left"/>
             </w:pPr>
             <w:r>
-              <w:t xml:space="preserve">Evidence checklist simplified to plain bullets in both PDF and DOCX (checkbox markers removed for compatibility). Planned Activities list in DOCX now uses Word’s native lower-roman numbering (i., ii., iii.) matching the PDF. Badges in DOCX replaced with exact-replica PNG pill images (rounded, colored frame and background, bold text) matching the PDF \ huaweibadge look — assets committed to the repo. Signature blocks in DOCX no longer show literal + symbols (proper hard line breaks).</w:t>
+              <w:t xml:space="preserve">Fixed DOCX/MD/HTML output: tables are no longer corrupted when changelog, signature, or summary content contains a pipe character (“|”). Badge text is now preserved in DOCX/MD/HTML — a “Ready” badge renders “Ready” instead of “[NEW]”. Multi-item changelog entries render as bullet lists instead of being joined with a literal “+”. POC documents now include the changelog in DOCX/MD/HTML. The :noanswers: attribute now hides test results and remarks in DOCX/MD/HTML, matching the PDF. Inline LaTeX (monospace text, arrows, LaTeX quotes) no longer leaks from changelog entries. The test suite now exercises the real build pipeline (pre-processor wired into round-trip and DOCX tests), with new pre-processor unit tests.</w:t>
             </w:r>
           </w:p>
         </w:tc>
@@ -13873,7 +13873,7 @@
               <w:jc w:val="left"/>
             </w:pPr>
             <w:r>
-              <w:t xml:space="preserve">6.4.7</w:t>
+              <w:t xml:space="preserve">6.5.0</w:t>
             </w:r>
           </w:p>
         </w:tc>
@@ -13899,7 +13899,7 @@
               <w:jc w:val="left"/>
             </w:pPr>
             <w:r>
-              <w:t xml:space="preserve">Section titles in DOCX now match the PDF heading design: the big section number (56pt) sits on the left, the title text is pushed to the right edge (a right tab stop mimics the LaTeX \ hfill), and the red rule runs below — previously the title sat left-aligned next to a small number. Applies to all templates.</w:t>
+              <w:t xml:space="preserve">Evidence checklist simplified to plain bullets in both PDF and DOCX (checkbox markers removed for compatibility). Planned Activities list in DOCX now uses Word’s native lower-roman numbering (i., ii., iii.) matching the PDF. Badges in DOCX replaced with exact-replica PNG pill images (rounded, colored frame and background, bold text) matching the PDF \ huaweibadge look — assets committed to the repo. Signature blocks in DOCX no longer show literal + symbols (proper hard line breaks).</w:t>
             </w:r>
           </w:p>
         </w:tc>
@@ -13914,7 +13914,7 @@
               <w:jc w:val="left"/>
             </w:pPr>
             <w:r>
-              <w:t xml:space="preserve">6.4.6</w:t>
+              <w:t xml:space="preserve">6.4.7</w:t>
             </w:r>
           </w:p>
         </w:tc>
@@ -13944,7 +13944,7 @@
               <w:jc w:val="left"/>
             </w:pPr>
             <w:r>
-              <w:t xml:space="preserve">Code blocks inside test cases no longer break the red left rule in DOCX — the code style’s left indent (which jogged the rule) is reset inside test case blocks, and code blocks now show the PDF’s code box (gray background with thin border on top, bottom, and right, red rule continuing on the left).</w:t>
+              <w:t xml:space="preserve">Section titles in DOCX now match the PDF heading design: the big section number (56pt) sits on the left, the title text is pushed to the right edge (a right tab stop mimics the LaTeX \ hfill), and the red rule runs below — previously the title sat left-aligned next to a small number. Applies to all templates.</w:t>
             </w:r>
           </w:p>
         </w:tc>
@@ -13957,7 +13957,7 @@
               <w:jc w:val="left"/>
             </w:pPr>
             <w:r>
-              <w:t xml:space="preserve">6.4.5</w:t>
+              <w:t xml:space="preserve">6.4.6</w:t>
             </w:r>
           </w:p>
         </w:tc>
@@ -13983,7 +13983,7 @@
               <w:jc w:val="left"/>
             </w:pPr>
             <w:r>
-              <w:t xml:space="preserve">DOCX polish pass: all captions centered (matching the PDF), vertical spacing between blocks matched to the LaTeX rhythm (medskip/smallskip around captions, field bars, and steps), and test steps now render as separate paragraphs each with the red bold number (previously merged into one paragraph).</w:t>
+              <w:t xml:space="preserve">Code blocks inside test cases no longer break the red left rule in DOCX — the code style’s left indent (which jogged the rule) is reset inside test case blocks, and code blocks now show the PDF’s code box (gray background with thin border on top, bottom, and right, red rule continuing on the left).</w:t>
             </w:r>
           </w:p>
         </w:tc>
@@ -13998,7 +13998,7 @@
               <w:jc w:val="left"/>
             </w:pPr>
             <w:r>
-              <w:t xml:space="preserve">6.4.4</w:t>
+              <w:t xml:space="preserve">6.4.5</w:t>
             </w:r>
           </w:p>
         </w:tc>
@@ -14028,7 +14028,7 @@
               <w:jc w:val="left"/>
             </w:pPr>
             <w:r>
-              <w:t xml:space="preserve">DOCX covers now show the logo, cover text, and version/date/time meta line like the PDF. Test case blocks in DOCX get the PDF’s visual wrapper: red left rule, red field header bars, and red step numbers. Captions follow the PDF ordering system in DOCX, MD, and HTML (Table/Diagram/Figure/Testcase N: with bold symbol). Portuguese PDFs now label diagrams "Diagrama N:" (was hardcoded English "Diagram"). Markdown and HTML output no longer leaks raw LaTeX from passthrough blocks — the DOCX pre-processor now feeds those pipelines too.</w:t>
+              <w:t xml:space="preserve">DOCX polish pass: all captions centered (matching the PDF), vertical spacing between blocks matched to the LaTeX rhythm (medskip/smallskip around captions, field bars, and steps), and test steps now render as separate paragraphs each with the red bold number (previously merged into one paragraph).</w:t>
             </w:r>
           </w:p>
         </w:tc>
@@ -14041,7 +14041,7 @@
               <w:jc w:val="left"/>
             </w:pPr>
             <w:r>
-              <w:t xml:space="preserve">6.4.3</w:t>
+              <w:t xml:space="preserve">6.4.4</w:t>
             </w:r>
           </w:p>
         </w:tc>
@@ -14067,7 +14067,7 @@
               <w:jc w:val="left"/>
             </w:pPr>
             <w:r>
-              <w:t xml:space="preserve">Testbook and POC DOCX output now matches the PDF much more closely: native table of contents (language-aware, auto-populated), each section starts on a new page, embedded images and diagrams (PlantUML/Graphviz rendered), white-on-red table headers, cover version line under the title, centered test case captions, and plain black rules for signature grids.</w:t>
+              <w:t xml:space="preserve">DOCX covers now show the logo, cover text, and version/date/time meta line like the PDF. Test case blocks in DOCX get the PDF’s visual wrapper: red left rule, red field header bars, and red step numbers. Captions follow the PDF ordering system in DOCX, MD, and HTML (Table/Diagram/Figure/Testcase N: with bold symbol). Portuguese PDFs now label diagrams "Diagrama N:" (was hardcoded English "Diagram"). Markdown and HTML output no longer leaks raw LaTeX from passthrough blocks — the DOCX pre-processor now feeds those pipelines too.</w:t>
             </w:r>
           </w:p>
         </w:tc>
@@ -14082,7 +14082,7 @@
               <w:jc w:val="left"/>
             </w:pPr>
             <w:r>
-              <w:t xml:space="preserve">6.4.2</w:t>
+              <w:t xml:space="preserve">6.4.3</w:t>
             </w:r>
           </w:p>
         </w:tc>
@@ -14112,7 +14112,7 @@
               <w:jc w:val="left"/>
             </w:pPr>
             <w:r>
-              <w:t xml:space="preserve">DOCX output for POC and testbook templates now includes all passthrough content (stakeholders, closing record, signatures, test cases, test summary, changelog) via a new pre-processor. Fixed dropped Test Scope fields in testbook DOCX output.</w:t>
+              <w:t xml:space="preserve">Testbook and POC DOCX output now matches the PDF much more closely: native table of contents (language-aware, auto-populated), each section starts on a new page, embedded images and diagrams (PlantUML/Graphviz rendered), white-on-red table headers, cover version line under the title, centered test case captions, and plain black rules for signature grids.</w:t>
             </w:r>
           </w:p>
         </w:tc>
@@ -14125,7 +14125,7 @@
               <w:jc w:val="left"/>
             </w:pPr>
             <w:r>
-              <w:t xml:space="preserve">6.4.0</w:t>
+              <w:t xml:space="preserve">6.4.2</w:t>
             </w:r>
           </w:p>
         </w:tc>
@@ -14151,6 +14151,51 @@
               <w:jc w:val="left"/>
             </w:pPr>
             <w:r>
+              <w:t xml:space="preserve">DOCX output for POC and testbook templates now includes all passthrough content (stakeholders, closing record, signatures, test cases, test summary, changelog) via a new pre-processor. Fixed dropped Test Scope fields in testbook DOCX output.</w:t>
+            </w:r>
+          </w:p>
+        </w:tc>
+      </w:tr>
+      <w:tr>
+        <w:tc>
+          <w:tcPr>
+            <w:shd w:val="clear" w:color="auto" w:fill="F6F8FA"/>
+          </w:tcPr>
+          <w:p>
+            <w:pPr>
+              <w:jc w:val="left"/>
+            </w:pPr>
+            <w:r>
+              <w:t xml:space="preserve">6.4.0</w:t>
+            </w:r>
+          </w:p>
+        </w:tc>
+        <w:tc>
+          <w:tcPr>
+            <w:shd w:val="clear" w:color="auto" w:fill="F6F8FA"/>
+          </w:tcPr>
+          <w:p>
+            <w:pPr>
+              <w:jc w:val="left"/>
+            </w:pPr>
+            <w:r>
+              <w:t xml:space="preserve">2026-09-20</w:t>
+            </w:r>
+          </w:p>
+        </w:tc>
+        <w:tc>
+          <w:tcPr>
+            <w:shd w:val="clear" w:color="auto" w:fill="F6F8FA"/>
+          </w:tcPr>
+          <w:p>
+            <w:pPr>
+              <w:numPr>
+                <w:ilvl w:val="0"/>
+                <w:numId w:val="1061"/>
+              </w:numPr>
+              <w:jc w:val="left"/>
+            </w:pPr>
+            <w:r>
               <w:t xml:space="preserve">Fixed changelog dates — replaced</w:t>
             </w:r>
             <w:r>
@@ -14173,58 +14218,13 @@
       </w:tr>
       <w:tr>
         <w:tc>
-          <w:tcPr>
-            <w:shd w:val="clear" w:color="auto" w:fill="F6F8FA"/>
-          </w:tcPr>
+          <w:tcPr/>
           <w:p>
             <w:pPr>
               <w:jc w:val="left"/>
             </w:pPr>
             <w:r>
               <w:t xml:space="preserve">5.1.1</w:t>
-            </w:r>
-          </w:p>
-        </w:tc>
-        <w:tc>
-          <w:tcPr>
-            <w:shd w:val="clear" w:color="auto" w:fill="F6F8FA"/>
-          </w:tcPr>
-          <w:p>
-            <w:pPr>
-              <w:jc w:val="left"/>
-            </w:pPr>
-            <w:r>
-              <w:t xml:space="preserve">2026-09-14</w:t>
-            </w:r>
-          </w:p>
-        </w:tc>
-        <w:tc>
-          <w:tcPr>
-            <w:shd w:val="clear" w:color="auto" w:fill="F6F8FA"/>
-          </w:tcPr>
-          <w:p>
-            <w:pPr>
-              <w:numPr>
-                <w:ilvl w:val="0"/>
-                <w:numId w:val="1061"/>
-              </w:numPr>
-              <w:jc w:val="left"/>
-            </w:pPr>
-            <w:r>
-              <w:t xml:space="preserve">Synced callout colors in DOCX/HTML/MD output to match brand palette. Added color palette demo.</w:t>
-            </w:r>
-          </w:p>
-        </w:tc>
-      </w:tr>
-      <w:tr>
-        <w:tc>
-          <w:tcPr/>
-          <w:p>
-            <w:pPr>
-              <w:jc w:val="left"/>
-            </w:pPr>
-            <w:r>
-              <w:t xml:space="preserve">5.1.0</w:t>
             </w:r>
           </w:p>
         </w:tc>
@@ -14250,7 +14250,7 @@
               <w:jc w:val="left"/>
             </w:pPr>
             <w:r>
-              <w:t xml:space="preserve">Adopted brand guidelines auxiliary color palette and monochrome scale. Aligned callout colors to brand specifications.</w:t>
+              <w:t xml:space="preserve">Synced callout colors in DOCX/HTML/MD output to match brand palette. Added color palette demo.</w:t>
             </w:r>
           </w:p>
         </w:tc>
@@ -14265,7 +14265,7 @@
               <w:jc w:val="left"/>
             </w:pPr>
             <w:r>
-              <w:t xml:space="preserve">5.0.3</w:t>
+              <w:t xml:space="preserve">5.1.0</w:t>
             </w:r>
           </w:p>
         </w:tc>
@@ -14295,6 +14295,45 @@
               <w:jc w:val="left"/>
             </w:pPr>
             <w:r>
+              <w:t xml:space="preserve">Adopted brand guidelines auxiliary color palette and monochrome scale. Aligned callout colors to brand specifications.</w:t>
+            </w:r>
+          </w:p>
+        </w:tc>
+      </w:tr>
+      <w:tr>
+        <w:tc>
+          <w:tcPr/>
+          <w:p>
+            <w:pPr>
+              <w:jc w:val="left"/>
+            </w:pPr>
+            <w:r>
+              <w:t xml:space="preserve">5.0.3</w:t>
+            </w:r>
+          </w:p>
+        </w:tc>
+        <w:tc>
+          <w:tcPr/>
+          <w:p>
+            <w:pPr>
+              <w:jc w:val="left"/>
+            </w:pPr>
+            <w:r>
+              <w:t xml:space="preserve">2026-09-14</w:t>
+            </w:r>
+          </w:p>
+        </w:tc>
+        <w:tc>
+          <w:tcPr/>
+          <w:p>
+            <w:pPr>
+              <w:numPr>
+                <w:ilvl w:val="0"/>
+                <w:numId w:val="1064"/>
+              </w:numPr>
+              <w:jc w:val="left"/>
+            </w:pPr>
+            <w:r>
               <w:t xml:space="preserve">Removed non-standard</w:t>
             </w:r>
             <w:r>
@@ -14317,54 +14356,15 @@
       </w:tr>
       <w:tr>
         <w:tc>
-          <w:tcPr/>
+          <w:tcPr>
+            <w:shd w:val="clear" w:color="auto" w:fill="F6F8FA"/>
+          </w:tcPr>
           <w:p>
             <w:pPr>
               <w:jc w:val="left"/>
             </w:pPr>
             <w:r>
               <w:t xml:space="preserve">5.0.2</w:t>
-            </w:r>
-          </w:p>
-        </w:tc>
-        <w:tc>
-          <w:tcPr/>
-          <w:p>
-            <w:pPr>
-              <w:jc w:val="left"/>
-            </w:pPr>
-            <w:r>
-              <w:t xml:space="preserve">2026-09-14</w:t>
-            </w:r>
-          </w:p>
-        </w:tc>
-        <w:tc>
-          <w:tcPr/>
-          <w:p>
-            <w:pPr>
-              <w:numPr>
-                <w:ilvl w:val="0"/>
-                <w:numId w:val="1064"/>
-              </w:numPr>
-              <w:jc w:val="left"/>
-            </w:pPr>
-            <w:r>
-              <w:t xml:space="preserve">Long commands in test steps now render as code blocks instead of inline code.</w:t>
-            </w:r>
-          </w:p>
-        </w:tc>
-      </w:tr>
-      <w:tr>
-        <w:tc>
-          <w:tcPr>
-            <w:shd w:val="clear" w:color="auto" w:fill="F6F8FA"/>
-          </w:tcPr>
-          <w:p>
-            <w:pPr>
-              <w:jc w:val="left"/>
-            </w:pPr>
-            <w:r>
-              <w:t xml:space="preserve">5.0.1</w:t>
             </w:r>
           </w:p>
         </w:tc>
@@ -14394,7 +14394,7 @@
               <w:jc w:val="left"/>
             </w:pPr>
             <w:r>
-              <w:t xml:space="preserve">Testcase caption centered above the block.</w:t>
+              <w:t xml:space="preserve">Long commands in test steps now render as code blocks instead of inline code.</w:t>
             </w:r>
           </w:p>
         </w:tc>
@@ -14407,7 +14407,7 @@
               <w:jc w:val="left"/>
             </w:pPr>
             <w:r>
-              <w:t xml:space="preserve">5.0.0</w:t>
+              <w:t xml:space="preserve">5.0.1</w:t>
             </w:r>
           </w:p>
         </w:tc>
@@ -14433,6 +14433,51 @@
               <w:jc w:val="left"/>
             </w:pPr>
             <w:r>
+              <w:t xml:space="preserve">Testcase caption centered above the block.</w:t>
+            </w:r>
+          </w:p>
+        </w:tc>
+      </w:tr>
+      <w:tr>
+        <w:tc>
+          <w:tcPr>
+            <w:shd w:val="clear" w:color="auto" w:fill="F6F8FA"/>
+          </w:tcPr>
+          <w:p>
+            <w:pPr>
+              <w:jc w:val="left"/>
+            </w:pPr>
+            <w:r>
+              <w:t xml:space="preserve">5.0.0</w:t>
+            </w:r>
+          </w:p>
+        </w:tc>
+        <w:tc>
+          <w:tcPr>
+            <w:shd w:val="clear" w:color="auto" w:fill="F6F8FA"/>
+          </w:tcPr>
+          <w:p>
+            <w:pPr>
+              <w:jc w:val="left"/>
+            </w:pPr>
+            <w:r>
+              <w:t xml:space="preserve">2026-09-14</w:t>
+            </w:r>
+          </w:p>
+        </w:tc>
+        <w:tc>
+          <w:tcPr>
+            <w:shd w:val="clear" w:color="auto" w:fill="F6F8FA"/>
+          </w:tcPr>
+          <w:p>
+            <w:pPr>
+              <w:numPr>
+                <w:ilvl w:val="0"/>
+                <w:numId w:val="1067"/>
+              </w:numPr>
+              <w:jc w:val="left"/>
+            </w:pPr>
+            <w:r>
               <w:t xml:space="preserve">Major refactoring: extracted shared modules (huawei-titles, huawei-toc, huawei-cover), renamed</w:t>
             </w:r>
             <w:r>
@@ -14494,9 +14539,7 @@
       </w:tr>
       <w:tr>
         <w:tc>
-          <w:tcPr>
-            <w:shd w:val="clear" w:color="auto" w:fill="F6F8FA"/>
-          </w:tcPr>
+          <w:tcPr/>
           <w:p>
             <w:pPr>
               <w:jc w:val="left"/>
@@ -14507,56 +14550,13 @@
           </w:p>
         </w:tc>
         <w:tc>
-          <w:tcPr>
-            <w:shd w:val="clear" w:color="auto" w:fill="F6F8FA"/>
-          </w:tcPr>
+          <w:tcPr/>
           <w:p>
             <w:pPr>
               <w:jc w:val="left"/>
             </w:pPr>
             <w:r>
               <w:t xml:space="preserve">2026-09-14</w:t>
-            </w:r>
-          </w:p>
-        </w:tc>
-        <w:tc>
-          <w:tcPr>
-            <w:shd w:val="clear" w:color="auto" w:fill="F6F8FA"/>
-          </w:tcPr>
-          <w:p>
-            <w:pPr>
-              <w:numPr>
-                <w:ilvl w:val="0"/>
-                <w:numId w:val="1067"/>
-              </w:numPr>
-              <w:jc w:val="left"/>
-            </w:pPr>
-            <w:r>
-              <w:t xml:space="preserve">Testcase headings now formatted as captions (like figures/tables): bold “Testcase N:” followed by description. Changed label from “Test Case” to “Testcase”.</w:t>
-            </w:r>
-          </w:p>
-        </w:tc>
-      </w:tr>
-      <w:tr>
-        <w:tc>
-          <w:tcPr/>
-          <w:p>
-            <w:pPr>
-              <w:jc w:val="left"/>
-            </w:pPr>
-            <w:r>
-              <w:t xml:space="preserve">4.6.0</w:t>
-            </w:r>
-          </w:p>
-        </w:tc>
-        <w:tc>
-          <w:tcPr/>
-          <w:p>
-            <w:pPr>
-              <w:jc w:val="left"/>
-            </w:pPr>
-            <w:r>
-              <w:t xml:space="preserve">2026-09-13</w:t>
             </w:r>
           </w:p>
         </w:tc>
@@ -14571,7 +14571,7 @@
               <w:jc w:val="left"/>
             </w:pPr>
             <w:r>
-              <w:t xml:space="preserve">Section restructure: Introduction, Test Cases (with category subsections), Conclusion. Testcases auto-numbered like figures/tables. Changed testcase from subsection to subsubsection.</w:t>
+              <w:t xml:space="preserve">Testcase headings now formatted as captions (like figures/tables): bold “Testcase N:” followed by description. Changed label from “Test Case” to “Testcase”.</w:t>
             </w:r>
           </w:p>
         </w:tc>
@@ -14586,7 +14586,7 @@
               <w:jc w:val="left"/>
             </w:pPr>
             <w:r>
-              <w:t xml:space="preserve">4.5.0</w:t>
+              <w:t xml:space="preserve">4.6.0</w:t>
             </w:r>
           </w:p>
         </w:tc>
@@ -14616,6 +14616,45 @@
               <w:jc w:val="left"/>
             </w:pPr>
             <w:r>
+              <w:t xml:space="preserve">Section restructure: Introduction, Test Cases (with category subsections), Conclusion. Testcases auto-numbered like figures/tables. Changed testcase from subsection to subsubsection.</w:t>
+            </w:r>
+          </w:p>
+        </w:tc>
+      </w:tr>
+      <w:tr>
+        <w:tc>
+          <w:tcPr/>
+          <w:p>
+            <w:pPr>
+              <w:jc w:val="left"/>
+            </w:pPr>
+            <w:r>
+              <w:t xml:space="preserve">4.5.0</w:t>
+            </w:r>
+          </w:p>
+        </w:tc>
+        <w:tc>
+          <w:tcPr/>
+          <w:p>
+            <w:pPr>
+              <w:jc w:val="left"/>
+            </w:pPr>
+            <w:r>
+              <w:t xml:space="preserve">2026-09-13</w:t>
+            </w:r>
+          </w:p>
+        </w:tc>
+        <w:tc>
+          <w:tcPr/>
+          <w:p>
+            <w:pPr>
+              <w:numPr>
+                <w:ilvl w:val="0"/>
+                <w:numId w:val="1070"/>
+              </w:numPr>
+              <w:jc w:val="left"/>
+            </w:pPr>
+            <w:r>
               <w:t xml:space="preserve">Unified field APIs:</w:t>
             </w:r>
             <w:r>
@@ -14680,54 +14719,15 @@
       </w:tr>
       <w:tr>
         <w:tc>
-          <w:tcPr/>
+          <w:tcPr>
+            <w:shd w:val="clear" w:color="auto" w:fill="F6F8FA"/>
+          </w:tcPr>
           <w:p>
             <w:pPr>
               <w:jc w:val="left"/>
             </w:pPr>
             <w:r>
               <w:t xml:space="preserve">4.4.0</w:t>
-            </w:r>
-          </w:p>
-        </w:tc>
-        <w:tc>
-          <w:tcPr/>
-          <w:p>
-            <w:pPr>
-              <w:jc w:val="left"/>
-            </w:pPr>
-            <w:r>
-              <w:t xml:space="preserve">2026-09-13</w:t>
-            </w:r>
-          </w:p>
-        </w:tc>
-        <w:tc>
-          <w:tcPr/>
-          <w:p>
-            <w:pPr>
-              <w:numPr>
-                <w:ilvl w:val="0"/>
-                <w:numId w:val="1070"/>
-              </w:numPr>
-              <w:jc w:val="left"/>
-            </w:pPr>
-            <w:r>
-              <w:t xml:space="preserve">Code review fixes: removed dead labels, badge now uses Huawei brand colors (tipbg/tipfg, huaweired, warningbg/warningfg), Lua filter preserves formatting in DOCX/MD/HTML via parse_latex_blocks, testprocedure handler preserves non-step content (images, code, callouts).</w:t>
-            </w:r>
-          </w:p>
-        </w:tc>
-      </w:tr>
-      <w:tr>
-        <w:tc>
-          <w:tcPr>
-            <w:shd w:val="clear" w:color="auto" w:fill="F6F8FA"/>
-          </w:tcPr>
-          <w:p>
-            <w:pPr>
-              <w:jc w:val="left"/>
-            </w:pPr>
-            <w:r>
-              <w:t xml:space="preserve">4.3.0</w:t>
             </w:r>
           </w:p>
         </w:tc>
@@ -14757,6 +14757,45 @@
               <w:jc w:val="left"/>
             </w:pPr>
             <w:r>
+              <w:t xml:space="preserve">Code review fixes: removed dead labels, badge now uses Huawei brand colors (tipbg/tipfg, huaweired, warningbg/warningfg), Lua filter preserves formatting in DOCX/MD/HTML via parse_latex_blocks, testprocedure handler preserves non-step content (images, code, callouts).</w:t>
+            </w:r>
+          </w:p>
+        </w:tc>
+      </w:tr>
+      <w:tr>
+        <w:tc>
+          <w:tcPr/>
+          <w:p>
+            <w:pPr>
+              <w:jc w:val="left"/>
+            </w:pPr>
+            <w:r>
+              <w:t xml:space="preserve">4.3.0</w:t>
+            </w:r>
+          </w:p>
+        </w:tc>
+        <w:tc>
+          <w:tcPr/>
+          <w:p>
+            <w:pPr>
+              <w:jc w:val="left"/>
+            </w:pPr>
+            <w:r>
+              <w:t xml:space="preserve">2026-09-13</w:t>
+            </w:r>
+          </w:p>
+        </w:tc>
+        <w:tc>
+          <w:tcPr/>
+          <w:p>
+            <w:pPr>
+              <w:numPr>
+                <w:ilvl w:val="0"/>
+                <w:numId w:val="1072"/>
+              </w:numPr>
+              <w:jc w:val="left"/>
+            </w:pPr>
+            <w:r>
               <w:t xml:space="preserve">Added</w:t>
             </w:r>
             <w:r>
@@ -14809,7 +14848,9 @@
       </w:tr>
       <w:tr>
         <w:tc>
-          <w:tcPr/>
+          <w:tcPr>
+            <w:shd w:val="clear" w:color="auto" w:fill="F6F8FA"/>
+          </w:tcPr>
           <w:p>
             <w:pPr>
               <w:jc w:val="left"/>
@@ -14820,7 +14861,9 @@
           </w:p>
         </w:tc>
         <w:tc>
-          <w:tcPr/>
+          <w:tcPr>
+            <w:shd w:val="clear" w:color="auto" w:fill="F6F8FA"/>
+          </w:tcPr>
           <w:p>
             <w:pPr>
               <w:jc w:val="left"/>
@@ -14831,12 +14874,14 @@
           </w:p>
         </w:tc>
         <w:tc>
-          <w:tcPr/>
+          <w:tcPr>
+            <w:shd w:val="clear" w:color="auto" w:fill="F6F8FA"/>
+          </w:tcPr>
           <w:p>
             <w:pPr>
               <w:numPr>
                 <w:ilvl w:val="0"/>
-                <w:numId w:val="1072"/>
+                <w:numId w:val="1073"/>
               </w:numPr>
               <w:jc w:val="left"/>
             </w:pPr>
@@ -14890,9 +14935,7 @@
       </w:tr>
       <w:tr>
         <w:tc>
-          <w:tcPr>
-            <w:shd w:val="clear" w:color="auto" w:fill="F6F8FA"/>
-          </w:tcPr>
+          <w:tcPr/>
           <w:p>
             <w:pPr>
               <w:jc w:val="left"/>
@@ -14903,9 +14946,7 @@
           </w:p>
         </w:tc>
         <w:tc>
-          <w:tcPr>
-            <w:shd w:val="clear" w:color="auto" w:fill="F6F8FA"/>
-          </w:tcPr>
+          <w:tcPr/>
           <w:p>
             <w:pPr>
               <w:jc w:val="left"/>
@@ -14916,14 +14957,12 @@
           </w:p>
         </w:tc>
         <w:tc>
-          <w:tcPr>
-            <w:shd w:val="clear" w:color="auto" w:fill="F6F8FA"/>
-          </w:tcPr>
+          <w:tcPr/>
           <w:p>
             <w:pPr>
               <w:numPr>
                 <w:ilvl w:val="0"/>
-                <w:numId w:val="1073"/>
+                <w:numId w:val="1074"/>
               </w:numPr>
               <w:jc w:val="left"/>
             </w:pPr>
@@ -14950,7 +14989,9 @@
       </w:tr>
       <w:tr>
         <w:tc>
-          <w:tcPr/>
+          <w:tcPr>
+            <w:shd w:val="clear" w:color="auto" w:fill="F6F8FA"/>
+          </w:tcPr>
           <w:p>
             <w:pPr>
               <w:jc w:val="left"/>
@@ -14961,7 +15002,9 @@
           </w:p>
         </w:tc>
         <w:tc>
-          <w:tcPr/>
+          <w:tcPr>
+            <w:shd w:val="clear" w:color="auto" w:fill="F6F8FA"/>
+          </w:tcPr>
           <w:p>
             <w:pPr>
               <w:jc w:val="left"/>
@@ -14972,12 +15015,14 @@
           </w:p>
         </w:tc>
         <w:tc>
-          <w:tcPr/>
+          <w:tcPr>
+            <w:shd w:val="clear" w:color="auto" w:fill="F6F8FA"/>
+          </w:tcPr>
           <w:p>
             <w:pPr>
               <w:numPr>
                 <w:ilvl w:val="0"/>
-                <w:numId w:val="1074"/>
+                <w:numId w:val="1075"/>
               </w:numPr>
               <w:jc w:val="left"/>
             </w:pPr>
@@ -15019,9 +15064,7 @@
       </w:tr>
       <w:tr>
         <w:tc>
-          <w:tcPr>
-            <w:shd w:val="clear" w:color="auto" w:fill="F6F8FA"/>
-          </w:tcPr>
+          <w:tcPr/>
           <w:p>
             <w:pPr>
               <w:jc w:val="left"/>
@@ -15032,9 +15075,7 @@
           </w:p>
         </w:tc>
         <w:tc>
-          <w:tcPr>
-            <w:shd w:val="clear" w:color="auto" w:fill="F6F8FA"/>
-          </w:tcPr>
+          <w:tcPr/>
           <w:p>
             <w:pPr>
               <w:jc w:val="left"/>
@@ -15045,14 +15086,12 @@
           </w:p>
         </w:tc>
         <w:tc>
-          <w:tcPr>
-            <w:shd w:val="clear" w:color="auto" w:fill="F6F8FA"/>
-          </w:tcPr>
+          <w:tcPr/>
           <w:p>
             <w:pPr>
               <w:numPr>
                 <w:ilvl w:val="0"/>
-                <w:numId w:val="1075"/>
+                <w:numId w:val="1076"/>
               </w:numPr>
               <w:jc w:val="left"/>
             </w:pPr>
@@ -15079,54 +15118,15 @@
       </w:tr>
       <w:tr>
         <w:tc>
-          <w:tcPr/>
+          <w:tcPr>
+            <w:shd w:val="clear" w:color="auto" w:fill="F6F8FA"/>
+          </w:tcPr>
           <w:p>
             <w:pPr>
               <w:jc w:val="left"/>
             </w:pPr>
             <w:r>
               <w:t xml:space="preserve">3.8.1</w:t>
-            </w:r>
-          </w:p>
-        </w:tc>
-        <w:tc>
-          <w:tcPr/>
-          <w:p>
-            <w:pPr>
-              <w:jc w:val="left"/>
-            </w:pPr>
-            <w:r>
-              <w:t xml:space="preserve">2026-09-13</w:t>
-            </w:r>
-          </w:p>
-        </w:tc>
-        <w:tc>
-          <w:tcPr/>
-          <w:p>
-            <w:pPr>
-              <w:numPr>
-                <w:ilvl w:val="0"/>
-                <w:numId w:val="1076"/>
-              </w:numPr>
-              <w:jc w:val="left"/>
-            </w:pPr>
-            <w:r>
-              <w:t xml:space="preserve">End-to-end quality review: fixed testbook PDF metadata title, removed stray user DOCX from template dir, fixed round-trip.sh variable typo, updated stale references in AGENTS.md and README.md, committed testbook sample PDFs, set TZ for pandoc cover time consistency, widened pandoc version range.</w:t>
-            </w:r>
-          </w:p>
-        </w:tc>
-      </w:tr>
-      <w:tr>
-        <w:tc>
-          <w:tcPr>
-            <w:shd w:val="clear" w:color="auto" w:fill="F6F8FA"/>
-          </w:tcPr>
-          <w:p>
-            <w:pPr>
-              <w:jc w:val="left"/>
-            </w:pPr>
-            <w:r>
-              <w:t xml:space="preserve">3.8.0</w:t>
             </w:r>
           </w:p>
         </w:tc>
@@ -15156,7 +15156,7 @@
               <w:jc w:val="left"/>
             </w:pPr>
             <w:r>
-              <w:t xml:space="preserve">Removed Tips and Tricks chapter (tmux configuration) — required VS Code-specific keybindings that don’t generalize across terminal setups.</w:t>
+              <w:t xml:space="preserve">End-to-end quality review: fixed testbook PDF metadata title, removed stray user DOCX from template dir, fixed round-trip.sh variable typo, updated stale references in AGENTS.md and README.md, committed testbook sample PDFs, set TZ for pandoc cover time consistency, widened pandoc version range.</w:t>
             </w:r>
           </w:p>
         </w:tc>
@@ -15169,18 +15169,18 @@
               <w:jc w:val="left"/>
             </w:pPr>
             <w:r>
-              <w:t xml:space="preserve">3.7.0</w:t>
-            </w:r>
-          </w:p>
-        </w:tc>
-        <w:tc>
-          <w:tcPr/>
-          <w:p>
-            <w:pPr>
-              <w:jc w:val="left"/>
-            </w:pPr>
-            <w:r>
-              <w:t xml:space="preserve">2026-09-12</w:t>
+              <w:t xml:space="preserve">3.8.0</w:t>
+            </w:r>
+          </w:p>
+        </w:tc>
+        <w:tc>
+          <w:tcPr/>
+          <w:p>
+            <w:pPr>
+              <w:jc w:val="left"/>
+            </w:pPr>
+            <w:r>
+              <w:t xml:space="preserve">2026-09-13</w:t>
             </w:r>
           </w:p>
         </w:tc>
@@ -15195,6 +15195,51 @@
               <w:jc w:val="left"/>
             </w:pPr>
             <w:r>
+              <w:t xml:space="preserve">Removed Tips and Tricks chapter (tmux configuration) — required VS Code-specific keybindings that don’t generalize across terminal setups.</w:t>
+            </w:r>
+          </w:p>
+        </w:tc>
+      </w:tr>
+      <w:tr>
+        <w:tc>
+          <w:tcPr>
+            <w:shd w:val="clear" w:color="auto" w:fill="F6F8FA"/>
+          </w:tcPr>
+          <w:p>
+            <w:pPr>
+              <w:jc w:val="left"/>
+            </w:pPr>
+            <w:r>
+              <w:t xml:space="preserve">3.7.0</w:t>
+            </w:r>
+          </w:p>
+        </w:tc>
+        <w:tc>
+          <w:tcPr>
+            <w:shd w:val="clear" w:color="auto" w:fill="F6F8FA"/>
+          </w:tcPr>
+          <w:p>
+            <w:pPr>
+              <w:jc w:val="left"/>
+            </w:pPr>
+            <w:r>
+              <w:t xml:space="preserve">2026-09-12</w:t>
+            </w:r>
+          </w:p>
+        </w:tc>
+        <w:tc>
+          <w:tcPr>
+            <w:shd w:val="clear" w:color="auto" w:fill="F6F8FA"/>
+          </w:tcPr>
+          <w:p>
+            <w:pPr>
+              <w:numPr>
+                <w:ilvl w:val="0"/>
+                <w:numId w:val="1079"/>
+              </w:numPr>
+              <w:jc w:val="left"/>
+            </w:pPr>
+            <w:r>
               <w:t xml:space="preserve">Added</w:t>
             </w:r>
             <w:r>
@@ -15247,9 +15292,7 @@
       </w:tr>
       <w:tr>
         <w:tc>
-          <w:tcPr>
-            <w:shd w:val="clear" w:color="auto" w:fill="F6F8FA"/>
-          </w:tcPr>
+          <w:tcPr/>
           <w:p>
             <w:pPr>
               <w:jc w:val="left"/>
@@ -15260,9 +15303,7 @@
           </w:p>
         </w:tc>
         <w:tc>
-          <w:tcPr>
-            <w:shd w:val="clear" w:color="auto" w:fill="F6F8FA"/>
-          </w:tcPr>
+          <w:tcPr/>
           <w:p>
             <w:pPr>
               <w:jc w:val="left"/>
@@ -15273,14 +15314,12 @@
           </w:p>
         </w:tc>
         <w:tc>
-          <w:tcPr>
-            <w:shd w:val="clear" w:color="auto" w:fill="F6F8FA"/>
-          </w:tcPr>
+          <w:tcPr/>
           <w:p>
             <w:pPr>
               <w:numPr>
                 <w:ilvl w:val="0"/>
-                <w:numId w:val="1079"/>
+                <w:numId w:val="1080"/>
               </w:numPr>
               <w:jc w:val="left"/>
             </w:pPr>
@@ -15337,7 +15376,9 @@
       </w:tr>
       <w:tr>
         <w:tc>
-          <w:tcPr/>
+          <w:tcPr>
+            <w:shd w:val="clear" w:color="auto" w:fill="F6F8FA"/>
+          </w:tcPr>
           <w:p>
             <w:pPr>
               <w:jc w:val="left"/>
@@ -15348,7 +15389,9 @@
           </w:p>
         </w:tc>
         <w:tc>
-          <w:tcPr/>
+          <w:tcPr>
+            <w:shd w:val="clear" w:color="auto" w:fill="F6F8FA"/>
+          </w:tcPr>
           <w:p>
             <w:pPr>
               <w:jc w:val="left"/>
@@ -15359,12 +15402,14 @@
           </w:p>
         </w:tc>
         <w:tc>
-          <w:tcPr/>
+          <w:tcPr>
+            <w:shd w:val="clear" w:color="auto" w:fill="F6F8FA"/>
+          </w:tcPr>
           <w:p>
             <w:pPr>
               <w:numPr>
                 <w:ilvl w:val="0"/>
-                <w:numId w:val="1080"/>
+                <w:numId w:val="1081"/>
               </w:numPr>
               <w:jc w:val="left"/>
             </w:pPr>
@@ -15442,9 +15487,7 @@
       </w:tr>
       <w:tr>
         <w:tc>
-          <w:tcPr>
-            <w:shd w:val="clear" w:color="auto" w:fill="F6F8FA"/>
-          </w:tcPr>
+          <w:tcPr/>
           <w:p>
             <w:pPr>
               <w:jc w:val="left"/>
@@ -15455,9 +15498,7 @@
           </w:p>
         </w:tc>
         <w:tc>
-          <w:tcPr>
-            <w:shd w:val="clear" w:color="auto" w:fill="F6F8FA"/>
-          </w:tcPr>
+          <w:tcPr/>
           <w:p>
             <w:pPr>
               <w:jc w:val="left"/>
@@ -15468,14 +15509,12 @@
           </w:p>
         </w:tc>
         <w:tc>
-          <w:tcPr>
-            <w:shd w:val="clear" w:color="auto" w:fill="F6F8FA"/>
-          </w:tcPr>
+          <w:tcPr/>
           <w:p>
             <w:pPr>
               <w:numPr>
                 <w:ilvl w:val="0"/>
-                <w:numId w:val="1081"/>
+                <w:numId w:val="1082"/>
               </w:numPr>
               <w:jc w:val="left"/>
             </w:pPr>
@@ -15502,7 +15541,7 @@
             <w:pPr>
               <w:numPr>
                 <w:ilvl w:val="0"/>
-                <w:numId w:val="1081"/>
+                <w:numId w:val="1082"/>
               </w:numPr>
               <w:jc w:val="left"/>
             </w:pPr>
@@ -15544,7 +15583,7 @@
             <w:pPr>
               <w:numPr>
                 <w:ilvl w:val="0"/>
-                <w:numId w:val="1081"/>
+                <w:numId w:val="1082"/>
               </w:numPr>
               <w:jc w:val="left"/>
             </w:pPr>
@@ -15556,7 +15595,9 @@
       </w:tr>
       <w:tr>
         <w:tc>
-          <w:tcPr/>
+          <w:tcPr>
+            <w:shd w:val="clear" w:color="auto" w:fill="F6F8FA"/>
+          </w:tcPr>
           <w:p>
             <w:pPr>
               <w:jc w:val="left"/>
@@ -15567,7 +15608,9 @@
           </w:p>
         </w:tc>
         <w:tc>
-          <w:tcPr/>
+          <w:tcPr>
+            <w:shd w:val="clear" w:color="auto" w:fill="F6F8FA"/>
+          </w:tcPr>
           <w:p>
             <w:pPr>
               <w:jc w:val="left"/>
@@ -15578,12 +15621,14 @@
           </w:p>
         </w:tc>
         <w:tc>
-          <w:tcPr/>
+          <w:tcPr>
+            <w:shd w:val="clear" w:color="auto" w:fill="F6F8FA"/>
+          </w:tcPr>
           <w:p>
             <w:pPr>
               <w:numPr>
                 <w:ilvl w:val="0"/>
-                <w:numId w:val="1082"/>
+                <w:numId w:val="1083"/>
               </w:numPr>
               <w:jc w:val="left"/>
             </w:pPr>
@@ -15610,7 +15655,7 @@
             <w:pPr>
               <w:numPr>
                 <w:ilvl w:val="0"/>
-                <w:numId w:val="1082"/>
+                <w:numId w:val="1083"/>
               </w:numPr>
               <w:jc w:val="left"/>
             </w:pPr>
@@ -15637,7 +15682,7 @@
             <w:pPr>
               <w:numPr>
                 <w:ilvl w:val="0"/>
-                <w:numId w:val="1082"/>
+                <w:numId w:val="1083"/>
               </w:numPr>
               <w:jc w:val="left"/>
             </w:pPr>
@@ -15649,7 +15694,7 @@
             <w:pPr>
               <w:numPr>
                 <w:ilvl w:val="0"/>
-                <w:numId w:val="1082"/>
+                <w:numId w:val="1083"/>
               </w:numPr>
               <w:jc w:val="left"/>
             </w:pPr>
@@ -15673,58 +15718,13 @@
       </w:tr>
       <w:tr>
         <w:tc>
-          <w:tcPr>
-            <w:shd w:val="clear" w:color="auto" w:fill="F6F8FA"/>
-          </w:tcPr>
+          <w:tcPr/>
           <w:p>
             <w:pPr>
               <w:jc w:val="left"/>
             </w:pPr>
             <w:r>
               <w:t xml:space="preserve">3.2.1</w:t>
-            </w:r>
-          </w:p>
-        </w:tc>
-        <w:tc>
-          <w:tcPr>
-            <w:shd w:val="clear" w:color="auto" w:fill="F6F8FA"/>
-          </w:tcPr>
-          <w:p>
-            <w:pPr>
-              <w:jc w:val="left"/>
-            </w:pPr>
-            <w:r>
-              <w:t xml:space="preserve">2026-09-11</w:t>
-            </w:r>
-          </w:p>
-        </w:tc>
-        <w:tc>
-          <w:tcPr>
-            <w:shd w:val="clear" w:color="auto" w:fill="F6F8FA"/>
-          </w:tcPr>
-          <w:p>
-            <w:pPr>
-              <w:numPr>
-                <w:ilvl w:val="0"/>
-                <w:numId w:val="1083"/>
-              </w:numPr>
-              <w:jc w:val="left"/>
-            </w:pPr>
-            <w:r>
-              <w:t xml:space="preserve">Renamed Chapter 7 from “Clean Up” to “Operations and Maintenance”. Added subsections for updating and uninstalling both the MaaS Gateway and the document templates. Added cloud resource cleanup as an optional subsection.</w:t>
-            </w:r>
-          </w:p>
-        </w:tc>
-      </w:tr>
-      <w:tr>
-        <w:tc>
-          <w:tcPr/>
-          <w:p>
-            <w:pPr>
-              <w:jc w:val="left"/>
-            </w:pPr>
-            <w:r>
-              <w:t xml:space="preserve">3.2.0</w:t>
             </w:r>
           </w:p>
         </w:tc>
@@ -15750,6 +15750,51 @@
               <w:jc w:val="left"/>
             </w:pPr>
             <w:r>
+              <w:t xml:space="preserve">Renamed Chapter 7 from “Clean Up” to “Operations and Maintenance”. Added subsections for updating and uninstalling both the MaaS Gateway and the document templates. Added cloud resource cleanup as an optional subsection.</w:t>
+            </w:r>
+          </w:p>
+        </w:tc>
+      </w:tr>
+      <w:tr>
+        <w:tc>
+          <w:tcPr>
+            <w:shd w:val="clear" w:color="auto" w:fill="F6F8FA"/>
+          </w:tcPr>
+          <w:p>
+            <w:pPr>
+              <w:jc w:val="left"/>
+            </w:pPr>
+            <w:r>
+              <w:t xml:space="preserve">3.2.0</w:t>
+            </w:r>
+          </w:p>
+        </w:tc>
+        <w:tc>
+          <w:tcPr>
+            <w:shd w:val="clear" w:color="auto" w:fill="F6F8FA"/>
+          </w:tcPr>
+          <w:p>
+            <w:pPr>
+              <w:jc w:val="left"/>
+            </w:pPr>
+            <w:r>
+              <w:t xml:space="preserve">2026-09-11</w:t>
+            </w:r>
+          </w:p>
+        </w:tc>
+        <w:tc>
+          <w:tcPr>
+            <w:shd w:val="clear" w:color="auto" w:fill="F6F8FA"/>
+          </w:tcPr>
+          <w:p>
+            <w:pPr>
+              <w:numPr>
+                <w:ilvl w:val="0"/>
+                <w:numId w:val="1085"/>
+              </w:numPr>
+              <w:jc w:val="left"/>
+            </w:pPr>
+            <w:r>
               <w:t xml:space="preserve">Added</w:t>
             </w:r>
             <w:r>
@@ -15811,7 +15856,7 @@
             <w:pPr>
               <w:numPr>
                 <w:ilvl w:val="0"/>
-                <w:numId w:val="1084"/>
+                <w:numId w:val="1085"/>
               </w:numPr>
               <w:jc w:val="left"/>
             </w:pPr>
@@ -15856,7 +15901,7 @@
             <w:pPr>
               <w:numPr>
                 <w:ilvl w:val="0"/>
-                <w:numId w:val="1084"/>
+                <w:numId w:val="1085"/>
               </w:numPr>
               <w:jc w:val="left"/>
             </w:pPr>
@@ -15868,58 +15913,13 @@
       </w:tr>
       <w:tr>
         <w:tc>
-          <w:tcPr>
-            <w:shd w:val="clear" w:color="auto" w:fill="F6F8FA"/>
-          </w:tcPr>
+          <w:tcPr/>
           <w:p>
             <w:pPr>
               <w:jc w:val="left"/>
             </w:pPr>
             <w:r>
               <w:t xml:space="preserve">3.1.2</w:t>
-            </w:r>
-          </w:p>
-        </w:tc>
-        <w:tc>
-          <w:tcPr>
-            <w:shd w:val="clear" w:color="auto" w:fill="F6F8FA"/>
-          </w:tcPr>
-          <w:p>
-            <w:pPr>
-              <w:jc w:val="left"/>
-            </w:pPr>
-            <w:r>
-              <w:t xml:space="preserve">2026-09-11</w:t>
-            </w:r>
-          </w:p>
-        </w:tc>
-        <w:tc>
-          <w:tcPr>
-            <w:shd w:val="clear" w:color="auto" w:fill="F6F8FA"/>
-          </w:tcPr>
-          <w:p>
-            <w:pPr>
-              <w:numPr>
-                <w:ilvl w:val="0"/>
-                <w:numId w:val="1085"/>
-              </w:numPr>
-              <w:jc w:val="left"/>
-            </w:pPr>
-            <w:r>
-              <w:t xml:space="preserve">Added output format guide to README.md: comparison table of PDF, Markdown, DOCX, and HTML with purpose, copy-paste quality, and limitations. Recommends Markdown for copy-paste.</w:t>
-            </w:r>
-          </w:p>
-        </w:tc>
-      </w:tr>
-      <w:tr>
-        <w:tc>
-          <w:tcPr/>
-          <w:p>
-            <w:pPr>
-              <w:jc w:val="left"/>
-            </w:pPr>
-            <w:r>
-              <w:t xml:space="preserve">3.1.1</w:t>
             </w:r>
           </w:p>
         </w:tc>
@@ -15945,6 +15945,51 @@
               <w:jc w:val="left"/>
             </w:pPr>
             <w:r>
+              <w:t xml:space="preserve">Added output format guide to README.md: comparison table of PDF, Markdown, DOCX, and HTML with purpose, copy-paste quality, and limitations. Recommends Markdown for copy-paste.</w:t>
+            </w:r>
+          </w:p>
+        </w:tc>
+      </w:tr>
+      <w:tr>
+        <w:tc>
+          <w:tcPr>
+            <w:shd w:val="clear" w:color="auto" w:fill="F6F8FA"/>
+          </w:tcPr>
+          <w:p>
+            <w:pPr>
+              <w:jc w:val="left"/>
+            </w:pPr>
+            <w:r>
+              <w:t xml:space="preserve">3.1.1</w:t>
+            </w:r>
+          </w:p>
+        </w:tc>
+        <w:tc>
+          <w:tcPr>
+            <w:shd w:val="clear" w:color="auto" w:fill="F6F8FA"/>
+          </w:tcPr>
+          <w:p>
+            <w:pPr>
+              <w:jc w:val="left"/>
+            </w:pPr>
+            <w:r>
+              <w:t xml:space="preserve">2026-09-11</w:t>
+            </w:r>
+          </w:p>
+        </w:tc>
+        <w:tc>
+          <w:tcPr>
+            <w:shd w:val="clear" w:color="auto" w:fill="F6F8FA"/>
+          </w:tcPr>
+          <w:p>
+            <w:pPr>
+              <w:numPr>
+                <w:ilvl w:val="0"/>
+                <w:numId w:val="1087"/>
+              </w:numPr>
+              <w:jc w:val="left"/>
+            </w:pPr>
+            <w:r>
               <w:t xml:space="preserve">Updated MaaS Gateway chapter to v1.10.9: non-interactive mode (</w:t>
             </w:r>
             <w:r>
@@ -15961,7 +16006,7 @@
             <w:pPr>
               <w:numPr>
                 <w:ilvl w:val="0"/>
-                <w:numId w:val="1086"/>
+                <w:numId w:val="1087"/>
               </w:numPr>
               <w:jc w:val="left"/>
             </w:pPr>
@@ -16003,7 +16048,7 @@
             <w:pPr>
               <w:numPr>
                 <w:ilvl w:val="0"/>
-                <w:numId w:val="1086"/>
+                <w:numId w:val="1087"/>
               </w:numPr>
               <w:jc w:val="left"/>
             </w:pPr>
@@ -16015,9 +16060,7 @@
       </w:tr>
       <w:tr>
         <w:tc>
-          <w:tcPr>
-            <w:shd w:val="clear" w:color="auto" w:fill="F6F8FA"/>
-          </w:tcPr>
+          <w:tcPr/>
           <w:p>
             <w:pPr>
               <w:jc w:val="left"/>
@@ -16028,9 +16071,7 @@
           </w:p>
         </w:tc>
         <w:tc>
-          <w:tcPr>
-            <w:shd w:val="clear" w:color="auto" w:fill="F6F8FA"/>
-          </w:tcPr>
+          <w:tcPr/>
           <w:p>
             <w:pPr>
               <w:jc w:val="left"/>
@@ -16041,14 +16082,12 @@
           </w:p>
         </w:tc>
         <w:tc>
-          <w:tcPr>
-            <w:shd w:val="clear" w:color="auto" w:fill="F6F8FA"/>
-          </w:tcPr>
+          <w:tcPr/>
           <w:p>
             <w:pPr>
               <w:numPr>
                 <w:ilvl w:val="0"/>
-                <w:numId w:val="1087"/>
+                <w:numId w:val="1088"/>
               </w:numPr>
               <w:jc w:val="left"/>
             </w:pPr>
@@ -16072,7 +16111,7 @@
             <w:pPr>
               <w:numPr>
                 <w:ilvl w:val="0"/>
-                <w:numId w:val="1087"/>
+                <w:numId w:val="1088"/>
               </w:numPr>
               <w:jc w:val="left"/>
             </w:pPr>
@@ -16114,7 +16153,7 @@
             <w:pPr>
               <w:numPr>
                 <w:ilvl w:val="0"/>
-                <w:numId w:val="1087"/>
+                <w:numId w:val="1088"/>
               </w:numPr>
               <w:jc w:val="left"/>
             </w:pPr>
@@ -16122,57 +16161,6 @@
               <w:t xml:space="preserve">Restructured chapters: moved SSH config and VS Code connection to new Chapter 4 (Install VS Code and Connect via Remote-SSH). Chapters 5—​7 renumbered.</w:t>
             </w:r>
           </w:p>
-          <w:p>
-            <w:pPr>
-              <w:numPr>
-                <w:ilvl w:val="0"/>
-                <w:numId w:val="1087"/>
-              </w:numPr>
-              <w:jc w:val="left"/>
-            </w:pPr>
-            <w:r>
-              <w:t xml:space="preserve">Added verification checklist tables to all 7 chapters.</w:t>
-            </w:r>
-          </w:p>
-          <w:p>
-            <w:pPr>
-              <w:numPr>
-                <w:ilvl w:val="0"/>
-                <w:numId w:val="1087"/>
-              </w:numPr>
-              <w:jc w:val="left"/>
-            </w:pPr>
-            <w:r>
-              <w:t xml:space="preserve">Added mandatory reboot warning in Chapter 2 (SSH port change). Added troubleshooting subsection in Chapter 4 with common SSH connection issues and ncat debugging commands.</w:t>
-            </w:r>
-          </w:p>
-        </w:tc>
-      </w:tr>
-      <w:tr>
-        <w:tc>
-          <w:tcPr/>
-          <w:p>
-            <w:pPr>
-              <w:jc w:val="left"/>
-            </w:pPr>
-            <w:r>
-              <w:t xml:space="preserve">3.0.1</w:t>
-            </w:r>
-          </w:p>
-        </w:tc>
-        <w:tc>
-          <w:tcPr/>
-          <w:p>
-            <w:pPr>
-              <w:jc w:val="left"/>
-            </w:pPr>
-            <w:r>
-              <w:t xml:space="preserve">2026-09-10</w:t>
-            </w:r>
-          </w:p>
-        </w:tc>
-        <w:tc>
-          <w:tcPr/>
           <w:p>
             <w:pPr>
               <w:numPr>
@@ -16182,7 +16170,19 @@
               <w:jc w:val="left"/>
             </w:pPr>
             <w:r>
-              <w:t xml:space="preserve">Minor fixes: test-filter.sh auto-discovery, build.sh help text, Makefile aggregate descriptions, 5-section comment correction, CHANGELOG version gap note, callout-in-code fix, CI font auto-discovery, dofile path comment, test-sync.sh header.</w:t>
+              <w:t xml:space="preserve">Added verification checklist tables to all 7 chapters.</w:t>
+            </w:r>
+          </w:p>
+          <w:p>
+            <w:pPr>
+              <w:numPr>
+                <w:ilvl w:val="0"/>
+                <w:numId w:val="1088"/>
+              </w:numPr>
+              <w:jc w:val="left"/>
+            </w:pPr>
+            <w:r>
+              <w:t xml:space="preserve">Added mandatory reboot warning in Chapter 2 (SSH port change). Added troubleshooting subsection in Chapter 4 with common SSH connection issues and ncat debugging commands.</w:t>
             </w:r>
           </w:p>
         </w:tc>
@@ -16197,7 +16197,7 @@
               <w:jc w:val="left"/>
             </w:pPr>
             <w:r>
-              <w:t xml:space="preserve">3.0.0</w:t>
+              <w:t xml:space="preserve">3.0.1</w:t>
             </w:r>
           </w:p>
         </w:tc>
@@ -16210,7 +16210,7 @@
               <w:jc w:val="left"/>
             </w:pPr>
             <w:r>
-              <w:t xml:space="preserve">2026-09-09</w:t>
+              <w:t xml:space="preserve">2026-09-10</w:t>
             </w:r>
           </w:p>
         </w:tc>
@@ -16227,7 +16227,7 @@
               <w:jc w:val="left"/>
             </w:pPr>
             <w:r>
-              <w:t xml:space="preserve">Modular pipeline refactoring: shared Lua filter factory, shared DOCX fix logic, build system auto-discovery, unified format pipeline, GitHub Actions CI.</w:t>
+              <w:t xml:space="preserve">Minor fixes: test-filter.sh auto-discovery, build.sh help text, Makefile aggregate descriptions, 5-section comment correction, CHANGELOG version gap note, callout-in-code fix, CI font auto-discovery, dofile path comment, test-sync.sh header.</w:t>
             </w:r>
           </w:p>
         </w:tc>
@@ -16240,18 +16240,18 @@
               <w:jc w:val="left"/>
             </w:pPr>
             <w:r>
-              <w:t xml:space="preserve">2.16.0</w:t>
-            </w:r>
-          </w:p>
-        </w:tc>
-        <w:tc>
-          <w:tcPr/>
-          <w:p>
-            <w:pPr>
-              <w:jc w:val="left"/>
-            </w:pPr>
-            <w:r>
-              <w:t xml:space="preserve">2026-09-05</w:t>
+              <w:t xml:space="preserve">3.0.0</w:t>
+            </w:r>
+          </w:p>
+        </w:tc>
+        <w:tc>
+          <w:tcPr/>
+          <w:p>
+            <w:pPr>
+              <w:jc w:val="left"/>
+            </w:pPr>
+            <w:r>
+              <w:t xml:space="preserve">2026-09-09</w:t>
             </w:r>
           </w:p>
         </w:tc>
@@ -16266,7 +16266,7 @@
               <w:jc w:val="left"/>
             </w:pPr>
             <w:r>
-              <w:t xml:space="preserve">Updated to match template v2.16.0 — Lua filter fixes, build system updates, and technical template parity improvements.</w:t>
+              <w:t xml:space="preserve">Modular pipeline refactoring: shared Lua filter factory, shared DOCX fix logic, build system auto-discovery, unified format pipeline, GitHub Actions CI.</w:t>
             </w:r>
           </w:p>
         </w:tc>
@@ -16281,7 +16281,7 @@
               <w:jc w:val="left"/>
             </w:pPr>
             <w:r>
-              <w:t xml:space="preserve">2.13.0</w:t>
+              <w:t xml:space="preserve">2.16.0</w:t>
             </w:r>
           </w:p>
         </w:tc>
@@ -16294,7 +16294,7 @@
               <w:jc w:val="left"/>
             </w:pPr>
             <w:r>
-              <w:t xml:space="preserve">2026-08-24</w:t>
+              <w:t xml:space="preserve">2026-09-05</w:t>
             </w:r>
           </w:p>
         </w:tc>
@@ -16311,6 +16311,45 @@
               <w:jc w:val="left"/>
             </w:pPr>
             <w:r>
+              <w:t xml:space="preserve">Updated to match template v2.16.0 — Lua filter fixes, build system updates, and technical template parity improvements.</w:t>
+            </w:r>
+          </w:p>
+        </w:tc>
+      </w:tr>
+      <w:tr>
+        <w:tc>
+          <w:tcPr/>
+          <w:p>
+            <w:pPr>
+              <w:jc w:val="left"/>
+            </w:pPr>
+            <w:r>
+              <w:t xml:space="preserve">2.13.0</w:t>
+            </w:r>
+          </w:p>
+        </w:tc>
+        <w:tc>
+          <w:tcPr/>
+          <w:p>
+            <w:pPr>
+              <w:jc w:val="left"/>
+            </w:pPr>
+            <w:r>
+              <w:t xml:space="preserve">2026-08-24</w:t>
+            </w:r>
+          </w:p>
+        </w:tc>
+        <w:tc>
+          <w:tcPr/>
+          <w:p>
+            <w:pPr>
+              <w:numPr>
+                <w:ilvl w:val="0"/>
+                <w:numId w:val="1092"/>
+              </w:numPr>
+              <w:jc w:val="left"/>
+            </w:pPr>
+            <w:r>
               <w:t xml:space="preserve">Foundation refactoring Phase 4: make DOCX</w:t>
             </w:r>
             <w:r>
@@ -16378,7 +16417,9 @@
       </w:tr>
       <w:tr>
         <w:tc>
-          <w:tcPr/>
+          <w:tcPr>
+            <w:shd w:val="clear" w:color="auto" w:fill="F6F8FA"/>
+          </w:tcPr>
           <w:p>
             <w:pPr>
               <w:jc w:val="left"/>
@@ -16389,7 +16430,9 @@
           </w:p>
         </w:tc>
         <w:tc>
-          <w:tcPr/>
+          <w:tcPr>
+            <w:shd w:val="clear" w:color="auto" w:fill="F6F8FA"/>
+          </w:tcPr>
           <w:p>
             <w:pPr>
               <w:jc w:val="left"/>
@@ -16400,12 +16443,14 @@
           </w:p>
         </w:tc>
         <w:tc>
-          <w:tcPr/>
+          <w:tcPr>
+            <w:shd w:val="clear" w:color="auto" w:fill="F6F8FA"/>
+          </w:tcPr>
           <w:p>
             <w:pPr>
               <w:numPr>
                 <w:ilvl w:val="0"/>
-                <w:numId w:val="1092"/>
+                <w:numId w:val="1093"/>
               </w:numPr>
               <w:jc w:val="left"/>
             </w:pPr>
@@ -16567,9 +16612,7 @@
       </w:tr>
       <w:tr>
         <w:tc>
-          <w:tcPr>
-            <w:shd w:val="clear" w:color="auto" w:fill="F6F8FA"/>
-          </w:tcPr>
+          <w:tcPr/>
           <w:p>
             <w:pPr>
               <w:jc w:val="left"/>
@@ -16580,9 +16623,7 @@
           </w:p>
         </w:tc>
         <w:tc>
-          <w:tcPr>
-            <w:shd w:val="clear" w:color="auto" w:fill="F6F8FA"/>
-          </w:tcPr>
+          <w:tcPr/>
           <w:p>
             <w:pPr>
               <w:jc w:val="left"/>
@@ -16593,14 +16634,12 @@
           </w:p>
         </w:tc>
         <w:tc>
-          <w:tcPr>
-            <w:shd w:val="clear" w:color="auto" w:fill="F6F8FA"/>
-          </w:tcPr>
+          <w:tcPr/>
           <w:p>
             <w:pPr>
               <w:numPr>
                 <w:ilvl w:val="0"/>
-                <w:numId w:val="1093"/>
+                <w:numId w:val="1094"/>
               </w:numPr>
               <w:jc w:val="left"/>
             </w:pPr>
@@ -16666,7 +16705,9 @@
       </w:tr>
       <w:tr>
         <w:tc>
-          <w:tcPr/>
+          <w:tcPr>
+            <w:shd w:val="clear" w:color="auto" w:fill="F6F8FA"/>
+          </w:tcPr>
           <w:p>
             <w:pPr>
               <w:jc w:val="left"/>
@@ -16677,56 +16718,15 @@
           </w:p>
         </w:tc>
         <w:tc>
-          <w:tcPr/>
+          <w:tcPr>
+            <w:shd w:val="clear" w:color="auto" w:fill="F6F8FA"/>
+          </w:tcPr>
           <w:p>
             <w:pPr>
               <w:jc w:val="left"/>
             </w:pPr>
             <w:r>
               <w:t xml:space="preserve">2026-08-24</w:t>
-            </w:r>
-          </w:p>
-        </w:tc>
-        <w:tc>
-          <w:tcPr/>
-          <w:p>
-            <w:pPr>
-              <w:numPr>
-                <w:ilvl w:val="0"/>
-                <w:numId w:val="1094"/>
-              </w:numPr>
-              <w:jc w:val="left"/>
-            </w:pPr>
-            <w:r>
-              <w:t xml:space="preserve">Foundation refactoring Phase 1: sync cls version to project tag, fix stale doc references (L16 output count, L-range, setup-guide feature claim), add test-sync.sh for version consistency checking.</w:t>
-            </w:r>
-          </w:p>
-        </w:tc>
-      </w:tr>
-      <w:tr>
-        <w:tc>
-          <w:tcPr>
-            <w:shd w:val="clear" w:color="auto" w:fill="F6F8FA"/>
-          </w:tcPr>
-          <w:p>
-            <w:pPr>
-              <w:jc w:val="left"/>
-            </w:pPr>
-            <w:r>
-              <w:t xml:space="preserve">2.9.1</w:t>
-            </w:r>
-          </w:p>
-        </w:tc>
-        <w:tc>
-          <w:tcPr>
-            <w:shd w:val="clear" w:color="auto" w:fill="F6F8FA"/>
-          </w:tcPr>
-          <w:p>
-            <w:pPr>
-              <w:jc w:val="left"/>
-            </w:pPr>
-            <w:r>
-              <w:t xml:space="preserve">2026-08-23</w:t>
             </w:r>
           </w:p>
         </w:tc>
@@ -16743,6 +16743,45 @@
               <w:jc w:val="left"/>
             </w:pPr>
             <w:r>
+              <w:t xml:space="preserve">Foundation refactoring Phase 1: sync cls version to project tag, fix stale doc references (L16 output count, L-range, setup-guide feature claim), add test-sync.sh for version consistency checking.</w:t>
+            </w:r>
+          </w:p>
+        </w:tc>
+      </w:tr>
+      <w:tr>
+        <w:tc>
+          <w:tcPr/>
+          <w:p>
+            <w:pPr>
+              <w:jc w:val="left"/>
+            </w:pPr>
+            <w:r>
+              <w:t xml:space="preserve">2.9.1</w:t>
+            </w:r>
+          </w:p>
+        </w:tc>
+        <w:tc>
+          <w:tcPr/>
+          <w:p>
+            <w:pPr>
+              <w:jc w:val="left"/>
+            </w:pPr>
+            <w:r>
+              <w:t xml:space="preserve">2026-08-23</w:t>
+            </w:r>
+          </w:p>
+        </w:tc>
+        <w:tc>
+          <w:tcPr/>
+          <w:p>
+            <w:pPr>
+              <w:numPr>
+                <w:ilvl w:val="0"/>
+                <w:numId w:val="1096"/>
+              </w:numPr>
+              <w:jc w:val="left"/>
+            </w:pPr>
+            <w:r>
               <w:t xml:space="preserve">HTML and Markdown outputs now embed images as base64 data URIs. HTML uses pandoc</w:t>
             </w:r>
             <w:r>
@@ -16774,54 +16813,15 @@
       </w:tr>
       <w:tr>
         <w:tc>
-          <w:tcPr/>
+          <w:tcPr>
+            <w:shd w:val="clear" w:color="auto" w:fill="F6F8FA"/>
+          </w:tcPr>
           <w:p>
             <w:pPr>
               <w:jc w:val="left"/>
             </w:pPr>
             <w:r>
               <w:t xml:space="preserve">2.9.0</w:t>
-            </w:r>
-          </w:p>
-        </w:tc>
-        <w:tc>
-          <w:tcPr/>
-          <w:p>
-            <w:pPr>
-              <w:jc w:val="left"/>
-            </w:pPr>
-            <w:r>
-              <w:t xml:space="preserve">2026-08-23</w:t>
-            </w:r>
-          </w:p>
-        </w:tc>
-        <w:tc>
-          <w:tcPr/>
-          <w:p>
-            <w:pPr>
-              <w:numPr>
-                <w:ilvl w:val="0"/>
-                <w:numId w:val="1096"/>
-              </w:numPr>
-              <w:jc w:val="left"/>
-            </w:pPr>
-            <w:r>
-              <w:t xml:space="preserve">DOCX: fix content width (8504→9638tw, margins are 2cm not 3cm). Add footer page numbers. Style TOC heading (22pt bold + rule). Add hutable table width + fixed layout.</w:t>
-            </w:r>
-          </w:p>
-        </w:tc>
-      </w:tr>
-      <w:tr>
-        <w:tc>
-          <w:tcPr>
-            <w:shd w:val="clear" w:color="auto" w:fill="F6F8FA"/>
-          </w:tcPr>
-          <w:p>
-            <w:pPr>
-              <w:jc w:val="left"/>
-            </w:pPr>
-            <w:r>
-              <w:t xml:space="preserve">2.8.3</w:t>
             </w:r>
           </w:p>
         </w:tc>
@@ -16851,7 +16851,7 @@
               <w:jc w:val="left"/>
             </w:pPr>
             <w:r>
-              <w:t xml:space="preserve">DOCX fix: callout tables now have explicit width (8504tw) and fixed layout. Changelog section heading now uses custom H1 format (56pt number, red border, right tab) instead of pandoc’s default.</w:t>
+              <w:t xml:space="preserve">DOCX: fix content width (8504→9638tw, margins are 2cm not 3cm). Add footer page numbers. Style TOC heading (22pt bold + rule). Add hutable table width + fixed layout.</w:t>
             </w:r>
           </w:p>
         </w:tc>
@@ -16864,7 +16864,7 @@
               <w:jc w:val="left"/>
             </w:pPr>
             <w:r>
-              <w:t xml:space="preserve">2.8.2</w:t>
+              <w:t xml:space="preserve">2.8.3</w:t>
             </w:r>
           </w:p>
         </w:tc>
@@ -16890,7 +16890,7 @@
               <w:jc w:val="left"/>
             </w:pPr>
             <w:r>
-              <w:t xml:space="preserve">DOCX H1 heading: reverted table approach to paragraph with tab stop + red bottom border. Table broke navigation pane and TOC field. Paragraph preserves Heading1 style for navigation while matching PDF layout (number left, title right, red rule below).</w:t>
+              <w:t xml:space="preserve">DOCX fix: callout tables now have explicit width (8504tw) and fixed layout. Changelog section heading now uses custom H1 format (56pt number, red border, right tab) instead of pandoc’s default.</w:t>
             </w:r>
           </w:p>
         </w:tc>
@@ -16905,7 +16905,7 @@
               <w:jc w:val="left"/>
             </w:pPr>
             <w:r>
-              <w:t xml:space="preserve">2.8.1</w:t>
+              <w:t xml:space="preserve">2.8.2</w:t>
             </w:r>
           </w:p>
         </w:tc>
@@ -16935,7 +16935,7 @@
               <w:jc w:val="left"/>
             </w:pPr>
             <w:r>
-              <w:t xml:space="preserve">DOCX heading fix: text color reverted to black (was incorrectly changed to Huawei red in v2.8.0). H1 now uses a two-column table (number left, title right) with red bottom rule. H2-H4 use simple inline format (number + title, no right tab stop).</w:t>
+              <w:t xml:space="preserve">DOCX H1 heading: reverted table approach to paragraph with tab stop + red bottom border. Table broke navigation pane and TOC field. Paragraph preserves Heading1 style for navigation while matching PDF layout (number left, title right, red rule below).</w:t>
             </w:r>
           </w:p>
         </w:tc>
@@ -16948,7 +16948,7 @@
               <w:jc w:val="left"/>
             </w:pPr>
             <w:r>
-              <w:t xml:space="preserve">2.8.0</w:t>
+              <w:t xml:space="preserve">2.8.1</w:t>
             </w:r>
           </w:p>
         </w:tc>
@@ -16974,7 +16974,7 @@
               <w:jc w:val="left"/>
             </w:pPr>
             <w:r>
-              <w:t xml:space="preserve">DOCX output: match PDF styling --- heading colors (Huawei red), H1 number size (56pt), callout borders (left-only) and padding, changelog formatting (rules, bold version, italic date), caption style (9pt bold), badge style (8pt bold white on red), list indentation.</w:t>
+              <w:t xml:space="preserve">DOCX heading fix: text color reverted to black (was incorrectly changed to Huawei red in v2.8.0). H1 now uses a two-column table (number left, title right) with red bottom rule. H2-H4 use simple inline format (number + title, no right tab stop).</w:t>
             </w:r>
           </w:p>
         </w:tc>
@@ -16989,7 +16989,7 @@
               <w:jc w:val="left"/>
             </w:pPr>
             <w:r>
-              <w:t xml:space="preserve">2.7.1</w:t>
+              <w:t xml:space="preserve">2.8.0</w:t>
             </w:r>
           </w:p>
         </w:tc>
@@ -17002,7 +17002,7 @@
               <w:jc w:val="left"/>
             </w:pPr>
             <w:r>
-              <w:t xml:space="preserve">2026-08-17</w:t>
+              <w:t xml:space="preserve">2026-08-23</w:t>
             </w:r>
           </w:p>
         </w:tc>
@@ -17019,6 +17019,45 @@
               <w:jc w:val="left"/>
             </w:pPr>
             <w:r>
+              <w:t xml:space="preserve">DOCX output: match PDF styling --- heading colors (Huawei red), H1 number size (56pt), callout borders (left-only) and padding, changelog formatting (rules, bold version, italic date), caption style (9pt bold), badge style (8pt bold white on red), list indentation.</w:t>
+            </w:r>
+          </w:p>
+        </w:tc>
+      </w:tr>
+      <w:tr>
+        <w:tc>
+          <w:tcPr/>
+          <w:p>
+            <w:pPr>
+              <w:jc w:val="left"/>
+            </w:pPr>
+            <w:r>
+              <w:t xml:space="preserve">2.7.1</w:t>
+            </w:r>
+          </w:p>
+        </w:tc>
+        <w:tc>
+          <w:tcPr/>
+          <w:p>
+            <w:pPr>
+              <w:jc w:val="left"/>
+            </w:pPr>
+            <w:r>
+              <w:t xml:space="preserve">2026-08-17</w:t>
+            </w:r>
+          </w:p>
+        </w:tc>
+        <w:tc>
+          <w:tcPr/>
+          <w:p>
+            <w:pPr>
+              <w:numPr>
+                <w:ilvl w:val="0"/>
+                <w:numId w:val="1102"/>
+              </w:numPr>
+              <w:jc w:val="left"/>
+            </w:pPr>
+            <w:r>
               <w:t xml:space="preserve">Rename project repository to all lowercase (</w:t>
             </w:r>
             <w:r>
@@ -17035,7 +17074,9 @@
       </w:tr>
       <w:tr>
         <w:tc>
-          <w:tcPr/>
+          <w:tcPr>
+            <w:shd w:val="clear" w:color="auto" w:fill="F6F8FA"/>
+          </w:tcPr>
           <w:p>
             <w:pPr>
               <w:jc w:val="left"/>
@@ -17046,7 +17087,9 @@
           </w:p>
         </w:tc>
         <w:tc>
-          <w:tcPr/>
+          <w:tcPr>
+            <w:shd w:val="clear" w:color="auto" w:fill="F6F8FA"/>
+          </w:tcPr>
           <w:p>
             <w:pPr>
               <w:jc w:val="left"/>
@@ -17057,12 +17100,14 @@
           </w:p>
         </w:tc>
         <w:tc>
-          <w:tcPr/>
+          <w:tcPr>
+            <w:shd w:val="clear" w:color="auto" w:fill="F6F8FA"/>
+          </w:tcPr>
           <w:p>
             <w:pPr>
               <w:numPr>
                 <w:ilvl w:val="0"/>
-                <w:numId w:val="1102"/>
+                <w:numId w:val="1103"/>
               </w:numPr>
               <w:jc w:val="left"/>
             </w:pPr>
@@ -17104,9 +17149,7 @@
       </w:tr>
       <w:tr>
         <w:tc>
-          <w:tcPr>
-            <w:shd w:val="clear" w:color="auto" w:fill="F6F8FA"/>
-          </w:tcPr>
+          <w:tcPr/>
           <w:p>
             <w:pPr>
               <w:jc w:val="left"/>
@@ -17117,9 +17160,7 @@
           </w:p>
         </w:tc>
         <w:tc>
-          <w:tcPr>
-            <w:shd w:val="clear" w:color="auto" w:fill="F6F8FA"/>
-          </w:tcPr>
+          <w:tcPr/>
           <w:p>
             <w:pPr>
               <w:jc w:val="left"/>
@@ -17130,14 +17171,12 @@
           </w:p>
         </w:tc>
         <w:tc>
-          <w:tcPr>
-            <w:shd w:val="clear" w:color="auto" w:fill="F6F8FA"/>
-          </w:tcPr>
+          <w:tcPr/>
           <w:p>
             <w:pPr>
               <w:numPr>
                 <w:ilvl w:val="0"/>
-                <w:numId w:val="1103"/>
+                <w:numId w:val="1104"/>
               </w:numPr>
               <w:jc w:val="left"/>
             </w:pPr>
@@ -17194,7 +17233,9 @@
       </w:tr>
       <w:tr>
         <w:tc>
-          <w:tcPr/>
+          <w:tcPr>
+            <w:shd w:val="clear" w:color="auto" w:fill="F6F8FA"/>
+          </w:tcPr>
           <w:p>
             <w:pPr>
               <w:jc w:val="left"/>
@@ -17205,7 +17246,9 @@
           </w:p>
         </w:tc>
         <w:tc>
-          <w:tcPr/>
+          <w:tcPr>
+            <w:shd w:val="clear" w:color="auto" w:fill="F6F8FA"/>
+          </w:tcPr>
           <w:p>
             <w:pPr>
               <w:jc w:val="left"/>
@@ -17216,12 +17259,14 @@
           </w:p>
         </w:tc>
         <w:tc>
-          <w:tcPr/>
+          <w:tcPr>
+            <w:shd w:val="clear" w:color="auto" w:fill="F6F8FA"/>
+          </w:tcPr>
           <w:p>
             <w:pPr>
               <w:numPr>
                 <w:ilvl w:val="0"/>
-                <w:numId w:val="1104"/>
+                <w:numId w:val="1105"/>
               </w:numPr>
               <w:jc w:val="left"/>
             </w:pPr>
@@ -17248,7 +17293,7 @@
             <w:pPr>
               <w:numPr>
                 <w:ilvl w:val="0"/>
-                <w:numId w:val="1104"/>
+                <w:numId w:val="1105"/>
               </w:numPr>
               <w:jc w:val="left"/>
             </w:pPr>
@@ -17275,58 +17320,13 @@
       </w:tr>
       <w:tr>
         <w:tc>
-          <w:tcPr>
-            <w:shd w:val="clear" w:color="auto" w:fill="F6F8FA"/>
-          </w:tcPr>
+          <w:tcPr/>
           <w:p>
             <w:pPr>
               <w:jc w:val="left"/>
             </w:pPr>
             <w:r>
               <w:t xml:space="preserve">2.5.1</w:t>
-            </w:r>
-          </w:p>
-        </w:tc>
-        <w:tc>
-          <w:tcPr>
-            <w:shd w:val="clear" w:color="auto" w:fill="F6F8FA"/>
-          </w:tcPr>
-          <w:p>
-            <w:pPr>
-              <w:jc w:val="left"/>
-            </w:pPr>
-            <w:r>
-              <w:t xml:space="preserve">2026-08-10</w:t>
-            </w:r>
-          </w:p>
-        </w:tc>
-        <w:tc>
-          <w:tcPr>
-            <w:shd w:val="clear" w:color="auto" w:fill="F6F8FA"/>
-          </w:tcPr>
-          <w:p>
-            <w:pPr>
-              <w:numPr>
-                <w:ilvl w:val="0"/>
-                <w:numId w:val="1105"/>
-              </w:numPr>
-              <w:jc w:val="left"/>
-            </w:pPr>
-            <w:r>
-              <w:t xml:space="preserve">H1 section title size reduced from 27pt to 20pt.</w:t>
-            </w:r>
-          </w:p>
-        </w:tc>
-      </w:tr>
-      <w:tr>
-        <w:tc>
-          <w:tcPr/>
-          <w:p>
-            <w:pPr>
-              <w:jc w:val="left"/>
-            </w:pPr>
-            <w:r>
-              <w:t xml:space="preserve">2.5.0</w:t>
             </w:r>
           </w:p>
         </w:tc>
@@ -17352,13 +17352,7 @@
               <w:jc w:val="left"/>
             </w:pPr>
             <w:r>
-              <w:t xml:space="preserve">Default image size increased: width 65% → 90% of text width,</w:t>
-            </w:r>
-            <w:r>
-              <w:t xml:space="preserve"> </w:t>
-            </w:r>
-            <w:r>
-              <w:t xml:space="preserve">height 40% → 50% of text height.</w:t>
+              <w:t xml:space="preserve">H1 section title size reduced from 27pt to 20pt.</w:t>
             </w:r>
           </w:p>
         </w:tc>
@@ -17373,7 +17367,7 @@
               <w:jc w:val="left"/>
             </w:pPr>
             <w:r>
-              <w:t xml:space="preserve">2.4.0</w:t>
+              <w:t xml:space="preserve">2.5.0</w:t>
             </w:r>
           </w:p>
         </w:tc>
@@ -17403,14 +17397,59 @@
               <w:jc w:val="left"/>
             </w:pPr>
             <w:r>
-              <w:t xml:space="preserve">Enlarged H1 section title (18pt → 27pt, 50% bigger).</w:t>
-            </w:r>
-          </w:p>
+              <w:t xml:space="preserve">Default image size increased: width 65% → 90% of text width,</w:t>
+            </w:r>
+            <w:r>
+              <w:t xml:space="preserve"> </w:t>
+            </w:r>
+            <w:r>
+              <w:t xml:space="preserve">height 40% → 50% of text height.</w:t>
+            </w:r>
+          </w:p>
+        </w:tc>
+      </w:tr>
+      <w:tr>
+        <w:tc>
+          <w:tcPr/>
+          <w:p>
+            <w:pPr>
+              <w:jc w:val="left"/>
+            </w:pPr>
+            <w:r>
+              <w:t xml:space="preserve">2.4.0</w:t>
+            </w:r>
+          </w:p>
+        </w:tc>
+        <w:tc>
+          <w:tcPr/>
+          <w:p>
+            <w:pPr>
+              <w:jc w:val="left"/>
+            </w:pPr>
+            <w:r>
+              <w:t xml:space="preserve">2026-08-10</w:t>
+            </w:r>
+          </w:p>
+        </w:tc>
+        <w:tc>
+          <w:tcPr/>
           <w:p>
             <w:pPr>
               <w:numPr>
                 <w:ilvl w:val="0"/>
-                <w:numId w:val="1107"/>
+                <w:numId w:val="1108"/>
+              </w:numPr>
+              <w:jc w:val="left"/>
+            </w:pPr>
+            <w:r>
+              <w:t xml:space="preserve">Enlarged H1 section title (18pt → 27pt, 50% bigger).</w:t>
+            </w:r>
+          </w:p>
+          <w:p>
+            <w:pPr>
+              <w:numPr>
+                <w:ilvl w:val="0"/>
+                <w:numId w:val="1108"/>
               </w:numPr>
               <w:jc w:val="left"/>
             </w:pPr>
@@ -17437,7 +17476,9 @@
       </w:tr>
       <w:tr>
         <w:tc>
-          <w:tcPr/>
+          <w:tcPr>
+            <w:shd w:val="clear" w:color="auto" w:fill="F6F8FA"/>
+          </w:tcPr>
           <w:p>
             <w:pPr>
               <w:jc w:val="left"/>
@@ -17448,7 +17489,9 @@
           </w:p>
         </w:tc>
         <w:tc>
-          <w:tcPr/>
+          <w:tcPr>
+            <w:shd w:val="clear" w:color="auto" w:fill="F6F8FA"/>
+          </w:tcPr>
           <w:p>
             <w:pPr>
               <w:jc w:val="left"/>
@@ -17459,12 +17502,14 @@
           </w:p>
         </w:tc>
         <w:tc>
-          <w:tcPr/>
+          <w:tcPr>
+            <w:shd w:val="clear" w:color="auto" w:fill="F6F8FA"/>
+          </w:tcPr>
           <w:p>
             <w:pPr>
               <w:numPr>
                 <w:ilvl w:val="0"/>
-                <w:numId w:val="1108"/>
+                <w:numId w:val="1109"/>
               </w:numPr>
               <w:jc w:val="left"/>
             </w:pPr>
@@ -17491,9 +17536,7 @@
       </w:tr>
       <w:tr>
         <w:tc>
-          <w:tcPr>
-            <w:shd w:val="clear" w:color="auto" w:fill="F6F8FA"/>
-          </w:tcPr>
+          <w:tcPr/>
           <w:p>
             <w:pPr>
               <w:jc w:val="left"/>
@@ -17504,9 +17547,7 @@
           </w:p>
         </w:tc>
         <w:tc>
-          <w:tcPr>
-            <w:shd w:val="clear" w:color="auto" w:fill="F6F8FA"/>
-          </w:tcPr>
+          <w:tcPr/>
           <w:p>
             <w:pPr>
               <w:jc w:val="left"/>
@@ -17517,14 +17558,12 @@
           </w:p>
         </w:tc>
         <w:tc>
-          <w:tcPr>
-            <w:shd w:val="clear" w:color="auto" w:fill="F6F8FA"/>
-          </w:tcPr>
+          <w:tcPr/>
           <w:p>
             <w:pPr>
               <w:numPr>
                 <w:ilvl w:val="0"/>
-                <w:numId w:val="1109"/>
+                <w:numId w:val="1110"/>
               </w:numPr>
               <w:jc w:val="left"/>
             </w:pPr>
@@ -17596,7 +17635,9 @@
       </w:tr>
       <w:tr>
         <w:tc>
-          <w:tcPr/>
+          <w:tcPr>
+            <w:shd w:val="clear" w:color="auto" w:fill="F6F8FA"/>
+          </w:tcPr>
           <w:p>
             <w:pPr>
               <w:jc w:val="left"/>
@@ -17607,7 +17648,9 @@
           </w:p>
         </w:tc>
         <w:tc>
-          <w:tcPr/>
+          <w:tcPr>
+            <w:shd w:val="clear" w:color="auto" w:fill="F6F8FA"/>
+          </w:tcPr>
           <w:p>
             <w:pPr>
               <w:jc w:val="left"/>
@@ -17618,12 +17661,14 @@
           </w:p>
         </w:tc>
         <w:tc>
-          <w:tcPr/>
+          <w:tcPr>
+            <w:shd w:val="clear" w:color="auto" w:fill="F6F8FA"/>
+          </w:tcPr>
           <w:p>
             <w:pPr>
               <w:numPr>
                 <w:ilvl w:val="0"/>
-                <w:numId w:val="1110"/>
+                <w:numId w:val="1111"/>
               </w:numPr>
               <w:jc w:val="left"/>
             </w:pPr>
@@ -17680,9 +17725,7 @@
       </w:tr>
       <w:tr>
         <w:tc>
-          <w:tcPr>
-            <w:shd w:val="clear" w:color="auto" w:fill="F6F8FA"/>
-          </w:tcPr>
+          <w:tcPr/>
           <w:p>
             <w:pPr>
               <w:jc w:val="left"/>
@@ -17693,9 +17736,7 @@
           </w:p>
         </w:tc>
         <w:tc>
-          <w:tcPr>
-            <w:shd w:val="clear" w:color="auto" w:fill="F6F8FA"/>
-          </w:tcPr>
+          <w:tcPr/>
           <w:p>
             <w:pPr>
               <w:jc w:val="left"/>
@@ -17706,14 +17747,12 @@
           </w:p>
         </w:tc>
         <w:tc>
-          <w:tcPr>
-            <w:shd w:val="clear" w:color="auto" w:fill="F6F8FA"/>
-          </w:tcPr>
+          <w:tcPr/>
           <w:p>
             <w:pPr>
               <w:numPr>
                 <w:ilvl w:val="0"/>
-                <w:numId w:val="1111"/>
+                <w:numId w:val="1112"/>
               </w:numPr>
               <w:jc w:val="left"/>
             </w:pPr>
@@ -17740,54 +17779,15 @@
       </w:tr>
       <w:tr>
         <w:tc>
-          <w:tcPr/>
+          <w:tcPr>
+            <w:shd w:val="clear" w:color="auto" w:fill="F6F8FA"/>
+          </w:tcPr>
           <w:p>
             <w:pPr>
               <w:jc w:val="left"/>
             </w:pPr>
             <w:r>
               <w:t xml:space="preserve">2.2.2</w:t>
-            </w:r>
-          </w:p>
-        </w:tc>
-        <w:tc>
-          <w:tcPr/>
-          <w:p>
-            <w:pPr>
-              <w:jc w:val="left"/>
-            </w:pPr>
-            <w:r>
-              <w:t xml:space="preserve">2026-08-08</w:t>
-            </w:r>
-          </w:p>
-        </w:tc>
-        <w:tc>
-          <w:tcPr/>
-          <w:p>
-            <w:pPr>
-              <w:numPr>
-                <w:ilvl w:val="0"/>
-                <w:numId w:val="1112"/>
-              </w:numPr>
-              <w:jc w:val="left"/>
-            </w:pPr>
-            <w:r>
-              <w:t xml:space="preserve">Fixed chapter reference in prerequisite (Chapter 3 → Chapter 4).</w:t>
-            </w:r>
-          </w:p>
-        </w:tc>
-      </w:tr>
-      <w:tr>
-        <w:tc>
-          <w:tcPr>
-            <w:shd w:val="clear" w:color="auto" w:fill="F6F8FA"/>
-          </w:tcPr>
-          <w:p>
-            <w:pPr>
-              <w:jc w:val="left"/>
-            </w:pPr>
-            <w:r>
-              <w:t xml:space="preserve">2.2.1</w:t>
             </w:r>
           </w:p>
         </w:tc>
@@ -17817,7 +17817,7 @@
               <w:jc w:val="left"/>
             </w:pPr>
             <w:r>
-              <w:t xml:space="preserve">Changed table and figure caption labels to black (was Huawei red).</w:t>
+              <w:t xml:space="preserve">Fixed chapter reference in prerequisite (Chapter 3 → Chapter 4).</w:t>
             </w:r>
           </w:p>
         </w:tc>
@@ -17830,7 +17830,7 @@
               <w:jc w:val="left"/>
             </w:pPr>
             <w:r>
-              <w:t xml:space="preserve">2.2.0</w:t>
+              <w:t xml:space="preserve">2.2.1</w:t>
             </w:r>
           </w:p>
         </w:tc>
@@ -17856,13 +17856,7 @@
               <w:jc w:val="left"/>
             </w:pPr>
             <w:r>
-              <w:t xml:space="preserve">Added Huawei-branded table styling: red header bar, alternating row</w:t>
-            </w:r>
-            <w:r>
-              <w:t xml:space="preserve"> </w:t>
-            </w:r>
-            <w:r>
-              <w:t xml:space="preserve">colors, and bordered cells.</w:t>
+              <w:t xml:space="preserve">Changed table and figure caption labels to black (was Huawei red).</w:t>
             </w:r>
           </w:p>
         </w:tc>
@@ -17877,7 +17871,7 @@
               <w:jc w:val="left"/>
             </w:pPr>
             <w:r>
-              <w:t xml:space="preserve">2.1.0</w:t>
+              <w:t xml:space="preserve">2.2.0</w:t>
             </w:r>
           </w:p>
         </w:tc>
@@ -17890,7 +17884,7 @@
               <w:jc w:val="left"/>
             </w:pPr>
             <w:r>
-              <w:t xml:space="preserve">2026-08-06</w:t>
+              <w:t xml:space="preserve">2026-08-08</w:t>
             </w:r>
           </w:p>
         </w:tc>
@@ -17907,6 +17901,51 @@
               <w:jc w:val="left"/>
             </w:pPr>
             <w:r>
+              <w:t xml:space="preserve">Added Huawei-branded table styling: red header bar, alternating row</w:t>
+            </w:r>
+            <w:r>
+              <w:t xml:space="preserve"> </w:t>
+            </w:r>
+            <w:r>
+              <w:t xml:space="preserve">colors, and bordered cells.</w:t>
+            </w:r>
+          </w:p>
+        </w:tc>
+      </w:tr>
+      <w:tr>
+        <w:tc>
+          <w:tcPr/>
+          <w:p>
+            <w:pPr>
+              <w:jc w:val="left"/>
+            </w:pPr>
+            <w:r>
+              <w:t xml:space="preserve">2.1.0</w:t>
+            </w:r>
+          </w:p>
+        </w:tc>
+        <w:tc>
+          <w:tcPr/>
+          <w:p>
+            <w:pPr>
+              <w:jc w:val="left"/>
+            </w:pPr>
+            <w:r>
+              <w:t xml:space="preserve">2026-08-06</w:t>
+            </w:r>
+          </w:p>
+        </w:tc>
+        <w:tc>
+          <w:tcPr/>
+          <w:p>
+            <w:pPr>
+              <w:numPr>
+                <w:ilvl w:val="0"/>
+                <w:numId w:val="1116"/>
+              </w:numPr>
+              <w:jc w:val="left"/>
+            </w:pPr>
+            <w:r>
               <w:t xml:space="preserve">Updated ECS flavor to</w:t>
             </w:r>
             <w:r>
@@ -17929,7 +17968,7 @@
             <w:pPr>
               <w:numPr>
                 <w:ilvl w:val="0"/>
-                <w:numId w:val="1115"/>
+                <w:numId w:val="1116"/>
               </w:numPr>
               <w:jc w:val="left"/>
             </w:pPr>
@@ -17941,7 +17980,7 @@
             <w:pPr>
               <w:numPr>
                 <w:ilvl w:val="0"/>
-                <w:numId w:val="1115"/>
+                <w:numId w:val="1116"/>
               </w:numPr>
               <w:jc w:val="left"/>
             </w:pPr>
@@ -17953,7 +17992,7 @@
             <w:pPr>
               <w:numPr>
                 <w:ilvl w:val="0"/>
-                <w:numId w:val="1115"/>
+                <w:numId w:val="1116"/>
               </w:numPr>
               <w:jc w:val="left"/>
             </w:pPr>
@@ -17965,7 +18004,7 @@
             <w:pPr>
               <w:numPr>
                 <w:ilvl w:val="0"/>
-                <w:numId w:val="1115"/>
+                <w:numId w:val="1116"/>
               </w:numPr>
               <w:jc w:val="left"/>
             </w:pPr>
@@ -17977,7 +18016,7 @@
             <w:pPr>
               <w:numPr>
                 <w:ilvl w:val="0"/>
-                <w:numId w:val="1115"/>
+                <w:numId w:val="1116"/>
               </w:numPr>
               <w:jc w:val="left"/>
             </w:pPr>
@@ -17995,7 +18034,7 @@
             <w:pPr>
               <w:numPr>
                 <w:ilvl w:val="0"/>
-                <w:numId w:val="1115"/>
+                <w:numId w:val="1116"/>
               </w:numPr>
               <w:jc w:val="left"/>
             </w:pPr>
@@ -18044,7 +18083,7 @@
             <w:pPr>
               <w:numPr>
                 <w:ilvl w:val="0"/>
-                <w:numId w:val="1115"/>
+                <w:numId w:val="1116"/>
               </w:numPr>
               <w:jc w:val="left"/>
             </w:pPr>
@@ -18056,7 +18095,7 @@
             <w:pPr>
               <w:numPr>
                 <w:ilvl w:val="0"/>
-                <w:numId w:val="1115"/>
+                <w:numId w:val="1116"/>
               </w:numPr>
               <w:jc w:val="left"/>
             </w:pPr>
@@ -18107,7 +18146,7 @@
             <w:pPr>
               <w:numPr>
                 <w:ilvl w:val="0"/>
-                <w:numId w:val="1115"/>
+                <w:numId w:val="1116"/>
               </w:numPr>
               <w:jc w:val="left"/>
             </w:pPr>
@@ -18134,7 +18173,9 @@
       </w:tr>
       <w:tr>
         <w:tc>
-          <w:tcPr/>
+          <w:tcPr>
+            <w:shd w:val="clear" w:color="auto" w:fill="F6F8FA"/>
+          </w:tcPr>
           <w:p>
             <w:pPr>
               <w:jc w:val="left"/>
@@ -18145,7 +18186,9 @@
           </w:p>
         </w:tc>
         <w:tc>
-          <w:tcPr/>
+          <w:tcPr>
+            <w:shd w:val="clear" w:color="auto" w:fill="F6F8FA"/>
+          </w:tcPr>
           <w:p>
             <w:pPr>
               <w:jc w:val="left"/>
@@ -18156,12 +18199,14 @@
           </w:p>
         </w:tc>
         <w:tc>
-          <w:tcPr/>
+          <w:tcPr>
+            <w:shd w:val="clear" w:color="auto" w:fill="F6F8FA"/>
+          </w:tcPr>
           <w:p>
             <w:pPr>
               <w:numPr>
                 <w:ilvl w:val="0"/>
-                <w:numId w:val="1116"/>
+                <w:numId w:val="1117"/>
               </w:numPr>
               <w:jc w:val="left"/>
             </w:pPr>
@@ -18179,7 +18224,7 @@
             <w:pPr>
               <w:numPr>
                 <w:ilvl w:val="0"/>
-                <w:numId w:val="1116"/>
+                <w:numId w:val="1117"/>
               </w:numPr>
               <w:jc w:val="left"/>
             </w:pPr>
@@ -18233,7 +18278,7 @@
             <w:pPr>
               <w:numPr>
                 <w:ilvl w:val="0"/>
-                <w:numId w:val="1116"/>
+                <w:numId w:val="1117"/>
               </w:numPr>
               <w:jc w:val="left"/>
             </w:pPr>
@@ -18281,7 +18326,7 @@
             <w:pPr>
               <w:numPr>
                 <w:ilvl w:val="0"/>
-                <w:numId w:val="1116"/>
+                <w:numId w:val="1117"/>
               </w:numPr>
               <w:jc w:val="left"/>
             </w:pPr>
@@ -18302,9 +18347,7 @@
       </w:tr>
       <w:tr>
         <w:tc>
-          <w:tcPr>
-            <w:shd w:val="clear" w:color="auto" w:fill="F6F8FA"/>
-          </w:tcPr>
+          <w:tcPr/>
           <w:p>
             <w:pPr>
               <w:jc w:val="left"/>
@@ -18315,9 +18358,7 @@
           </w:p>
         </w:tc>
         <w:tc>
-          <w:tcPr>
-            <w:shd w:val="clear" w:color="auto" w:fill="F6F8FA"/>
-          </w:tcPr>
+          <w:tcPr/>
           <w:p>
             <w:pPr>
               <w:jc w:val="left"/>
@@ -18328,14 +18369,12 @@
           </w:p>
         </w:tc>
         <w:tc>
-          <w:tcPr>
-            <w:shd w:val="clear" w:color="auto" w:fill="F6F8FA"/>
-          </w:tcPr>
+          <w:tcPr/>
           <w:p>
             <w:pPr>
               <w:numPr>
                 <w:ilvl w:val="0"/>
-                <w:numId w:val="1117"/>
+                <w:numId w:val="1118"/>
               </w:numPr>
               <w:jc w:val="left"/>
             </w:pPr>
@@ -18347,7 +18386,7 @@
             <w:pPr>
               <w:numPr>
                 <w:ilvl w:val="0"/>
-                <w:numId w:val="1117"/>
+                <w:numId w:val="1118"/>
               </w:numPr>
               <w:jc w:val="left"/>
             </w:pPr>
@@ -18359,7 +18398,7 @@
             <w:pPr>
               <w:numPr>
                 <w:ilvl w:val="0"/>
-                <w:numId w:val="1117"/>
+                <w:numId w:val="1118"/>
               </w:numPr>
               <w:jc w:val="left"/>
             </w:pPr>
@@ -18371,7 +18410,7 @@
             <w:pPr>
               <w:numPr>
                 <w:ilvl w:val="0"/>
-                <w:numId w:val="1117"/>
+                <w:numId w:val="1118"/>
               </w:numPr>
               <w:jc w:val="left"/>
             </w:pPr>
@@ -18389,7 +18428,7 @@
             <w:pPr>
               <w:numPr>
                 <w:ilvl w:val="0"/>
-                <w:numId w:val="1117"/>
+                <w:numId w:val="1118"/>
               </w:numPr>
               <w:jc w:val="left"/>
             </w:pPr>
@@ -18401,7 +18440,7 @@
             <w:pPr>
               <w:numPr>
                 <w:ilvl w:val="0"/>
-                <w:numId w:val="1117"/>
+                <w:numId w:val="1118"/>
               </w:numPr>
               <w:jc w:val="left"/>
             </w:pPr>
@@ -19799,6 +19838,9 @@
   <w:num w:numId="1117">
     <w:abstractNumId w:val="991"/>
   </w:num>
+  <w:num w:numId="1118">
+    <w:abstractNumId w:val="991"/>
+  </w:num>
 </w:numbering>
 </file>
 
@@ -19829,6 +19871,7 @@
     </w:rPr>
     <w:pPr>
       <w:spacing w:after="80" w:line="280" w:lineRule="atLeast"/>
+      <w:jc w:val="both"/>
     </w:pPr>
   </w:style>
   <w:style w:styleId="BodyText" w:type="paragraph">

</xml_diff>

<commit_message>
Add DOCX header logo, callout boxes, and PDF note labels (v6.10.0)
- DOCX header: Huawei logo in top-left corner (optional, driven by
  :header-logo: attribute, 1.05cm height matching PDF)
- DOCX callouts: admonitions (TIP/NOTE/WARNING/CAUTION/IMPORTANT) now
  render as styled callout boxes with colored backgrounds, left borders,
  and type labels — matching the PDF huawei-callouts.sty
- PDF notes: inline [.note] role now shows language-aware Note:/Nota:
  label (was unlabeled italic text)
- Fix build.sh: grep for :header-logo: no longer exits script when
  attribute is absent (set -e + pipefail fix)
- Bump all templates + setup-guide to v6.10.0; regenerate artifacts
</commit_message>
<xml_diff>
--- a/documents/setup-guide/setup-guide.docx
+++ b/documents/setup-guide/setup-guide.docx
@@ -84,7 +84,7 @@
           <w:b/>
           <w:sz w:val="24"/>
         </w:rPr>
-        <w:t xml:space="preserve">v6.9.2</w:t>
+        <w:t xml:space="preserve">v6.10.0</w:t>
       </w:r>
       <w:r>
         <w:rPr>
@@ -96,7 +96,7 @@
         <w:rPr>
           <w:sz w:val="24"/>
         </w:rPr>
-        <w:t xml:space="preserve">— September 20, 2026 22:58</w:t>
+        <w:t xml:space="preserve">— September 20, 2026 23:55</w:t>
       </w:r>
     </w:p>
     <w:sdt>
@@ -262,7 +262,22 @@
     <w:p>
       <w:pPr>
         <w:pStyle w:val="FirstParagraph"/>
-      </w:pPr>
+        <w:pBdr>
+          <w:left w:val="single" w:sz="24" w:space="4" w:color="30B5C5"/>
+        </w:pBdr>
+        <w:shd w:val="clear" w:fill="E0F7FA"/>
+      </w:pPr>
+      <w:r>
+        <w:rPr>
+          <w:b/>
+          <w:color w:val="30B5C5"/>
+          <w:rFonts w:ascii="HarmonyOS Sans" w:hAnsi="HarmonyOS Sans"/>
+        </w:rPr>
+        <w:t xml:space="preserve">Info: </w:t>
+      </w:r>
+      <w:r>
+        <w:t xml:space="preserve"> </w:t>
+      </w:r>
       <w:r>
         <w:t xml:space="preserve">This guide assumes the</w:t>
       </w:r>
@@ -333,7 +348,22 @@
     <w:p>
       <w:pPr>
         <w:pStyle w:val="BodyText"/>
-      </w:pPr>
+        <w:pBdr>
+          <w:left w:val="single" w:sz="24" w:space="4" w:color="30B5C5"/>
+        </w:pBdr>
+        <w:shd w:val="clear" w:fill="E0F7FA"/>
+      </w:pPr>
+      <w:r>
+        <w:rPr>
+          <w:b/>
+          <w:color w:val="30B5C5"/>
+          <w:rFonts w:ascii="HarmonyOS Sans" w:hAnsi="HarmonyOS Sans"/>
+        </w:rPr>
+        <w:t xml:space="preserve">Info: </w:t>
+      </w:r>
+      <w:r>
+        <w:t xml:space="preserve"> </w:t>
+      </w:r>
       <w:r>
         <w:t xml:space="preserve">We use port</w:t>
       </w:r>
@@ -634,7 +664,22 @@
     <w:p>
       <w:pPr>
         <w:pStyle w:val="FirstParagraph"/>
-      </w:pPr>
+        <w:pBdr>
+          <w:left w:val="single" w:sz="24" w:space="4" w:color="62B230"/>
+        </w:pBdr>
+        <w:shd w:val="clear" w:fill="E8F5E9"/>
+      </w:pPr>
+      <w:r>
+        <w:rPr>
+          <w:b/>
+          <w:color w:val="62B230"/>
+          <w:rFonts w:ascii="HarmonyOS Sans" w:hAnsi="HarmonyOS Sans"/>
+        </w:rPr>
+        <w:t xml:space="preserve">Tip: </w:t>
+      </w:r>
+      <w:r>
+        <w:t xml:space="preserve"> </w:t>
+      </w:r>
       <w:r>
         <w:t xml:space="preserve">Each</w:t>
       </w:r>
@@ -886,7 +931,22 @@
     <w:p>
       <w:pPr>
         <w:pStyle w:val="FirstParagraph"/>
-      </w:pPr>
+        <w:pBdr>
+          <w:left w:val="single" w:sz="24" w:space="4" w:color="62B230"/>
+        </w:pBdr>
+        <w:shd w:val="clear" w:fill="E8F5E9"/>
+      </w:pPr>
+      <w:r>
+        <w:rPr>
+          <w:b/>
+          <w:color w:val="62B230"/>
+          <w:rFonts w:ascii="HarmonyOS Sans" w:hAnsi="HarmonyOS Sans"/>
+        </w:rPr>
+        <w:t xml:space="preserve">Tip: </w:t>
+      </w:r>
+      <w:r>
+        <w:t xml:space="preserve"> </w:t>
+      </w:r>
       <w:r>
         <w:t xml:space="preserve">Pay-per-use bills by the hour with no long-term commitment. You only pay</w:t>
       </w:r>
@@ -952,7 +1012,22 @@
     <w:p>
       <w:pPr>
         <w:pStyle w:val="FirstParagraph"/>
-      </w:pPr>
+        <w:pBdr>
+          <w:left w:val="single" w:sz="24" w:space="4" w:color="30B5C5"/>
+        </w:pBdr>
+        <w:shd w:val="clear" w:fill="E0F7FA"/>
+      </w:pPr>
+      <w:r>
+        <w:rPr>
+          <w:b/>
+          <w:color w:val="30B5C5"/>
+          <w:rFonts w:ascii="HarmonyOS Sans" w:hAnsi="HarmonyOS Sans"/>
+        </w:rPr>
+        <w:t xml:space="preserve">Info: </w:t>
+      </w:r>
+      <w:r>
+        <w:t xml:space="preserve"> </w:t>
+      </w:r>
       <w:r>
         <w:t xml:space="preserve">Flexus X uses a slider for vCPU and memory instead of fixed flavor names.</w:t>
       </w:r>
@@ -1055,7 +1130,22 @@
     <w:p>
       <w:pPr>
         <w:pStyle w:val="FirstParagraph"/>
-      </w:pPr>
+        <w:pBdr>
+          <w:left w:val="single" w:sz="24" w:space="4" w:color="ED6D00"/>
+        </w:pBdr>
+        <w:shd w:val="clear" w:fill="FFF3E0"/>
+      </w:pPr>
+      <w:r>
+        <w:rPr>
+          <w:b/>
+          <w:color w:val="ED6D00"/>
+          <w:rFonts w:ascii="HarmonyOS Sans" w:hAnsi="HarmonyOS Sans"/>
+        </w:rPr>
+        <w:t xml:space="preserve">Important: </w:t>
+      </w:r>
+      <w:r>
+        <w:t xml:space="preserve"> </w:t>
+      </w:r>
       <w:r>
         <w:t xml:space="preserve">The EIP is auto-assigned and configured to be released when the instance is</w:t>
       </w:r>
@@ -1168,7 +1258,22 @@
     <w:p>
       <w:pPr>
         <w:pStyle w:val="FirstParagraph"/>
-      </w:pPr>
+        <w:pBdr>
+          <w:left w:val="single" w:sz="24" w:space="4" w:color="30B5C5"/>
+        </w:pBdr>
+        <w:shd w:val="clear" w:fill="E0F7FA"/>
+      </w:pPr>
+      <w:r>
+        <w:rPr>
+          <w:b/>
+          <w:color w:val="30B5C5"/>
+          <w:rFonts w:ascii="HarmonyOS Sans" w:hAnsi="HarmonyOS Sans"/>
+        </w:rPr>
+        <w:t xml:space="preserve">Info: </w:t>
+      </w:r>
+      <w:r>
+        <w:t xml:space="preserve"> </w:t>
+      </w:r>
       <w:r>
         <w:t xml:space="preserve">Cloud Eye is a monitoring service that provides functions such as real-time</w:t>
       </w:r>
@@ -1303,7 +1408,22 @@
     <w:p>
       <w:pPr>
         <w:pStyle w:val="FirstParagraph"/>
-      </w:pPr>
+        <w:pBdr>
+          <w:left w:val="single" w:sz="24" w:space="4" w:color="30B5C5"/>
+        </w:pBdr>
+        <w:shd w:val="clear" w:fill="E0F7FA"/>
+      </w:pPr>
+      <w:r>
+        <w:rPr>
+          <w:b/>
+          <w:color w:val="30B5C5"/>
+          <w:rFonts w:ascii="HarmonyOS Sans" w:hAnsi="HarmonyOS Sans"/>
+        </w:rPr>
+        <w:t xml:space="preserve">Info: </w:t>
+      </w:r>
+      <w:r>
+        <w:t xml:space="preserve"> </w:t>
+      </w:r>
       <w:r>
         <w:t xml:space="preserve">The key pair is the primary access method. Later, you can set a root</w:t>
       </w:r>
@@ -2230,7 +2350,22 @@
     <w:p>
       <w:pPr>
         <w:pStyle w:val="FirstParagraph"/>
-      </w:pPr>
+        <w:pBdr>
+          <w:left w:val="single" w:sz="24" w:space="4" w:color="ED6D00"/>
+        </w:pBdr>
+        <w:shd w:val="clear" w:fill="FFF3E0"/>
+      </w:pPr>
+      <w:r>
+        <w:rPr>
+          <w:b/>
+          <w:color w:val="ED6D00"/>
+          <w:rFonts w:ascii="HarmonyOS Sans" w:hAnsi="HarmonyOS Sans"/>
+        </w:rPr>
+        <w:t xml:space="preserve">Important: </w:t>
+      </w:r>
+      <w:r>
+        <w:t xml:space="preserve"> </w:t>
+      </w:r>
       <w:r>
         <w:t xml:space="preserve">Choose a strong password (12+ characters, mixed case, digits, symbols).</w:t>
       </w:r>
@@ -2682,16 +2817,26 @@
         <w:t xml:space="preserve"> </w:t>
       </w:r>
       <w:r>
-        <w:t xml:space="preserve">WARNING: The reboot is</w:t>
-      </w:r>
-      <w:r>
-        <w:t xml:space="preserve"> </w:t>
-      </w:r>
-      <w:r>
         <w:rPr>
           <w:bCs/>
           <w:b/>
         </w:rPr>
+        <w:t xml:space="preserve">WARNING‖</w:t>
+      </w:r>
+      <w:r>
+        <w:t xml:space="preserve"> </w:t>
+      </w:r>
+      <w:r>
+        <w:t xml:space="preserve">The reboot is</w:t>
+      </w:r>
+      <w:r>
+        <w:t xml:space="preserve"> </w:t>
+      </w:r>
+      <w:r>
+        <w:rPr>
+          <w:bCs/>
+          <w:b/>
+        </w:rPr>
         <w:t xml:space="preserve">mandatory</w:t>
       </w:r>
       <w:r>
@@ -2743,7 +2888,22 @@
     <w:p>
       <w:pPr>
         <w:pStyle w:val="FirstParagraph"/>
-      </w:pPr>
+        <w:pBdr>
+          <w:left w:val="single" w:sz="24" w:space="4" w:color="30B5C5"/>
+        </w:pBdr>
+        <w:shd w:val="clear" w:fill="E0F7FA"/>
+      </w:pPr>
+      <w:r>
+        <w:rPr>
+          <w:b/>
+          <w:color w:val="30B5C5"/>
+          <w:rFonts w:ascii="HarmonyOS Sans" w:hAnsi="HarmonyOS Sans"/>
+        </w:rPr>
+        <w:t xml:space="preserve">Info: </w:t>
+      </w:r>
+      <w:r>
+        <w:t xml:space="preserve"> </w:t>
+      </w:r>
       <w:r>
         <w:t xml:space="preserve">After this change, SSH connections must use</w:t>
       </w:r>
@@ -3315,7 +3475,22 @@
     <w:p>
       <w:pPr>
         <w:pStyle w:val="FirstParagraph"/>
-      </w:pPr>
+        <w:pBdr>
+          <w:left w:val="single" w:sz="24" w:space="4" w:color="30B5C5"/>
+        </w:pBdr>
+        <w:shd w:val="clear" w:fill="E0F7FA"/>
+      </w:pPr>
+      <w:r>
+        <w:rPr>
+          <w:b/>
+          <w:color w:val="30B5C5"/>
+          <w:rFonts w:ascii="HarmonyOS Sans" w:hAnsi="HarmonyOS Sans"/>
+        </w:rPr>
+        <w:t xml:space="preserve">Info: </w:t>
+      </w:r>
+      <w:r>
+        <w:t xml:space="preserve"> </w:t>
+      </w:r>
       <w:r>
         <w:rPr>
           <w:bCs/>
@@ -3641,7 +3816,22 @@
     <w:p>
       <w:pPr>
         <w:pStyle w:val="BodyText"/>
-      </w:pPr>
+        <w:pBdr>
+          <w:left w:val="single" w:sz="24" w:space="4" w:color="30B5C5"/>
+        </w:pBdr>
+        <w:shd w:val="clear" w:fill="E0F7FA"/>
+      </w:pPr>
+      <w:r>
+        <w:rPr>
+          <w:b/>
+          <w:color w:val="30B5C5"/>
+          <w:rFonts w:ascii="HarmonyOS Sans" w:hAnsi="HarmonyOS Sans"/>
+        </w:rPr>
+        <w:t xml:space="preserve">Info: </w:t>
+      </w:r>
+      <w:r>
+        <w:t xml:space="preserve"> </w:t>
+      </w:r>
       <w:r>
         <w:t xml:space="preserve">The corporate proxy blocks</w:t>
       </w:r>
@@ -3949,7 +4139,22 @@
     <w:p>
       <w:pPr>
         <w:pStyle w:val="FirstParagraph"/>
-      </w:pPr>
+        <w:pBdr>
+          <w:left w:val="single" w:sz="24" w:space="4" w:color="30B5C5"/>
+        </w:pBdr>
+        <w:shd w:val="clear" w:fill="E0F7FA"/>
+      </w:pPr>
+      <w:r>
+        <w:rPr>
+          <w:b/>
+          <w:color w:val="30B5C5"/>
+          <w:rFonts w:ascii="HarmonyOS Sans" w:hAnsi="HarmonyOS Sans"/>
+        </w:rPr>
+        <w:t xml:space="preserve">Info: </w:t>
+      </w:r>
+      <w:r>
+        <w:t xml:space="preserve"> </w:t>
+      </w:r>
       <w:r>
         <w:rPr>
           <w:rStyle w:val="VerbatimChar"/>
@@ -4347,7 +4552,17 @@
         <w:t xml:space="preserve"> </w:t>
       </w:r>
       <w:r>
-        <w:t xml:space="preserve">TIP: Skipping Npcap avoids a kernel driver install and potential reboot.</w:t>
+        <w:rPr>
+          <w:bCs/>
+          <w:b/>
+        </w:rPr>
+        <w:t xml:space="preserve">TIP‖</w:t>
+      </w:r>
+      <w:r>
+        <w:t xml:space="preserve"> </w:t>
+      </w:r>
+      <w:r>
+        <w:t xml:space="preserve">Skipping Npcap avoids a kernel driver install and potential reboot.</w:t>
       </w:r>
       <w:r>
         <w:t xml:space="preserve"> </w:t>
@@ -4461,7 +4676,22 @@
     <w:p>
       <w:pPr>
         <w:pStyle w:val="FirstParagraph"/>
-      </w:pPr>
+        <w:pBdr>
+          <w:left w:val="single" w:sz="24" w:space="4" w:color="ED6D00"/>
+        </w:pBdr>
+        <w:shd w:val="clear" w:fill="FFF3E0"/>
+      </w:pPr>
+      <w:r>
+        <w:rPr>
+          <w:b/>
+          <w:color w:val="ED6D00"/>
+          <w:rFonts w:ascii="HarmonyOS Sans" w:hAnsi="HarmonyOS Sans"/>
+        </w:rPr>
+        <w:t xml:space="preserve">Important: </w:t>
+      </w:r>
+      <w:r>
+        <w:t xml:space="preserve"> </w:t>
+      </w:r>
       <w:r>
         <w:t xml:space="preserve">Nmap is commonly flagged by antivirus software due to port-scanning heuristics.</w:t>
       </w:r>
@@ -5573,7 +5803,22 @@
           <w:ilvl w:val="0"/>
           <w:numId w:val="1000"/>
         </w:numPr>
-      </w:pPr>
+        <w:pBdr>
+          <w:left w:val="single" w:sz="24" w:space="4" w:color="30B5C5"/>
+        </w:pBdr>
+        <w:shd w:val="clear" w:fill="E0F7FA"/>
+      </w:pPr>
+      <w:r>
+        <w:rPr>
+          <w:b/>
+          <w:color w:val="30B5C5"/>
+          <w:rFonts w:ascii="HarmonyOS Sans" w:hAnsi="HarmonyOS Sans"/>
+        </w:rPr>
+        <w:t xml:space="preserve">Info: </w:t>
+      </w:r>
+      <w:r>
+        <w:t xml:space="preserve"> </w:t>
+      </w:r>
       <w:r>
         <w:t xml:space="preserve">The</w:t>
       </w:r>
@@ -5962,7 +6207,22 @@
     <w:p>
       <w:pPr>
         <w:pStyle w:val="BodyText"/>
-      </w:pPr>
+        <w:pBdr>
+          <w:left w:val="single" w:sz="24" w:space="4" w:color="62B230"/>
+        </w:pBdr>
+        <w:shd w:val="clear" w:fill="E8F5E9"/>
+      </w:pPr>
+      <w:r>
+        <w:rPr>
+          <w:b/>
+          <w:color w:val="62B230"/>
+          <w:rFonts w:ascii="HarmonyOS Sans" w:hAnsi="HarmonyOS Sans"/>
+        </w:rPr>
+        <w:t xml:space="preserve">Tip: </w:t>
+      </w:r>
+      <w:r>
+        <w:t xml:space="preserve"> </w:t>
+      </w:r>
       <w:r>
         <w:t xml:space="preserve">The</w:t>
       </w:r>
@@ -6241,7 +6501,22 @@
     <w:p>
       <w:pPr>
         <w:pStyle w:val="FirstParagraph"/>
-      </w:pPr>
+        <w:pBdr>
+          <w:left w:val="single" w:sz="24" w:space="4" w:color="30B5C5"/>
+        </w:pBdr>
+        <w:shd w:val="clear" w:fill="E0F7FA"/>
+      </w:pPr>
+      <w:r>
+        <w:rPr>
+          <w:b/>
+          <w:color w:val="30B5C5"/>
+          <w:rFonts w:ascii="HarmonyOS Sans" w:hAnsi="HarmonyOS Sans"/>
+        </w:rPr>
+        <w:t xml:space="preserve">Info: </w:t>
+      </w:r>
+      <w:r>
+        <w:t xml:space="preserve"> </w:t>
+      </w:r>
       <w:r>
         <w:t xml:space="preserve">VS Code only asks for the platform type the first time you connect to a</w:t>
       </w:r>
@@ -6415,7 +6690,22 @@
     <w:p>
       <w:pPr>
         <w:pStyle w:val="FirstParagraph"/>
-      </w:pPr>
+        <w:pBdr>
+          <w:left w:val="single" w:sz="24" w:space="4" w:color="30B5C5"/>
+        </w:pBdr>
+        <w:shd w:val="clear" w:fill="E0F7FA"/>
+      </w:pPr>
+      <w:r>
+        <w:rPr>
+          <w:b/>
+          <w:color w:val="30B5C5"/>
+          <w:rFonts w:ascii="HarmonyOS Sans" w:hAnsi="HarmonyOS Sans"/>
+        </w:rPr>
+        <w:t xml:space="preserve">Info: </w:t>
+      </w:r>
+      <w:r>
+        <w:t xml:space="preserve"> </w:t>
+      </w:r>
       <w:r>
         <w:t xml:space="preserve">The first connection installs the VS Code Server on the remote instance, which</w:t>
       </w:r>
@@ -6828,7 +7118,22 @@
     <w:p>
       <w:pPr>
         <w:pStyle w:val="FirstParagraph"/>
-      </w:pPr>
+        <w:pBdr>
+          <w:left w:val="single" w:sz="24" w:space="4" w:color="30B5C5"/>
+        </w:pBdr>
+        <w:shd w:val="clear" w:fill="E0F7FA"/>
+      </w:pPr>
+      <w:r>
+        <w:rPr>
+          <w:b/>
+          <w:color w:val="30B5C5"/>
+          <w:rFonts w:ascii="HarmonyOS Sans" w:hAnsi="HarmonyOS Sans"/>
+        </w:rPr>
+        <w:t xml:space="preserve">Info: </w:t>
+      </w:r>
+      <w:r>
+        <w:t xml:space="preserve"> </w:t>
+      </w:r>
       <w:r>
         <w:t xml:space="preserve">To debug the proxy connection, run ncat directly with verbose output:</w:t>
       </w:r>
@@ -7523,7 +7828,22 @@
     <w:p>
       <w:pPr>
         <w:pStyle w:val="FirstParagraph"/>
-      </w:pPr>
+        <w:pBdr>
+          <w:left w:val="single" w:sz="24" w:space="4" w:color="30B5C5"/>
+        </w:pBdr>
+        <w:shd w:val="clear" w:fill="E0F7FA"/>
+      </w:pPr>
+      <w:r>
+        <w:rPr>
+          <w:b/>
+          <w:color w:val="30B5C5"/>
+          <w:rFonts w:ascii="HarmonyOS Sans" w:hAnsi="HarmonyOS Sans"/>
+        </w:rPr>
+        <w:t xml:space="preserve">Info: </w:t>
+      </w:r>
+      <w:r>
+        <w:t xml:space="preserve"> </w:t>
+      </w:r>
       <w:r>
         <w:t xml:space="preserve">The gateway repository is at</w:t>
       </w:r>
@@ -7978,7 +8298,22 @@
     <w:p>
       <w:pPr>
         <w:pStyle w:val="BodyText"/>
-      </w:pPr>
+        <w:pBdr>
+          <w:left w:val="single" w:sz="24" w:space="4" w:color="30B5C5"/>
+        </w:pBdr>
+        <w:shd w:val="clear" w:fill="E0F7FA"/>
+      </w:pPr>
+      <w:r>
+        <w:rPr>
+          <w:b/>
+          <w:color w:val="30B5C5"/>
+          <w:rFonts w:ascii="HarmonyOS Sans" w:hAnsi="HarmonyOS Sans"/>
+        </w:rPr>
+        <w:t xml:space="preserve">Info: </w:t>
+      </w:r>
+      <w:r>
+        <w:t xml:space="preserve"> </w:t>
+      </w:r>
       <w:r>
         <w:t xml:space="preserve">All ports bind to</w:t>
       </w:r>
@@ -8263,7 +8598,22 @@
           <w:ilvl w:val="0"/>
           <w:numId w:val="1000"/>
         </w:numPr>
-      </w:pPr>
+        <w:pBdr>
+          <w:left w:val="single" w:sz="24" w:space="4" w:color="ED6D00"/>
+        </w:pBdr>
+        <w:shd w:val="clear" w:fill="FFF3E0"/>
+      </w:pPr>
+      <w:r>
+        <w:rPr>
+          <w:b/>
+          <w:color w:val="ED6D00"/>
+          <w:rFonts w:ascii="HarmonyOS Sans" w:hAnsi="HarmonyOS Sans"/>
+        </w:rPr>
+        <w:t xml:space="preserve">Important: </w:t>
+      </w:r>
+      <w:r>
+        <w:t xml:space="preserve"> </w:t>
+      </w:r>
       <w:r>
         <w:t xml:space="preserve">Estimated time: ~5 min for a fresh install, ~2 min</w:t>
       </w:r>
@@ -8307,7 +8657,22 @@
     <w:p>
       <w:pPr>
         <w:pStyle w:val="FirstParagraph"/>
-      </w:pPr>
+        <w:pBdr>
+          <w:left w:val="single" w:sz="24" w:space="4" w:color="62B230"/>
+        </w:pBdr>
+        <w:shd w:val="clear" w:fill="E8F5E9"/>
+      </w:pPr>
+      <w:r>
+        <w:rPr>
+          <w:b/>
+          <w:color w:val="62B230"/>
+          <w:rFonts w:ascii="HarmonyOS Sans" w:hAnsi="HarmonyOS Sans"/>
+        </w:rPr>
+        <w:t xml:space="preserve">Tip: </w:t>
+      </w:r>
+      <w:r>
+        <w:t xml:space="preserve"> </w:t>
+      </w:r>
       <w:r>
         <w:t xml:space="preserve">For non-interactive installs (CI/automation), pass the API key directly. The</w:t>
       </w:r>
@@ -8520,7 +8885,22 @@
     <w:p>
       <w:pPr>
         <w:pStyle w:val="FirstParagraph"/>
-      </w:pPr>
+        <w:pBdr>
+          <w:left w:val="single" w:sz="24" w:space="4" w:color="62B230"/>
+        </w:pBdr>
+        <w:shd w:val="clear" w:fill="E8F5E9"/>
+      </w:pPr>
+      <w:r>
+        <w:rPr>
+          <w:b/>
+          <w:color w:val="62B230"/>
+          <w:rFonts w:ascii="HarmonyOS Sans" w:hAnsi="HarmonyOS Sans"/>
+        </w:rPr>
+        <w:t xml:space="preserve">Tip: </w:t>
+      </w:r>
+      <w:r>
+        <w:t xml:space="preserve"> </w:t>
+      </w:r>
       <w:r>
         <w:t xml:space="preserve">To upgrade the gateway later, re-run the same bootstrap command. It detects</w:t>
       </w:r>
@@ -8978,7 +9358,22 @@
     <w:p>
       <w:pPr>
         <w:pStyle w:val="FirstParagraph"/>
-      </w:pPr>
+        <w:pBdr>
+          <w:left w:val="single" w:sz="24" w:space="4" w:color="30B5C5"/>
+        </w:pBdr>
+        <w:shd w:val="clear" w:fill="E0F7FA"/>
+      </w:pPr>
+      <w:r>
+        <w:rPr>
+          <w:b/>
+          <w:color w:val="30B5C5"/>
+          <w:rFonts w:ascii="HarmonyOS Sans" w:hAnsi="HarmonyOS Sans"/>
+        </w:rPr>
+        <w:t xml:space="preserve">Info: </w:t>
+      </w:r>
+      <w:r>
+        <w:t xml:space="preserve"> </w:t>
+      </w:r>
       <w:r>
         <w:t xml:space="preserve">The</w:t>
       </w:r>
@@ -9147,7 +9542,22 @@
           <w:ilvl w:val="0"/>
           <w:numId w:val="1000"/>
         </w:numPr>
-      </w:pPr>
+        <w:pBdr>
+          <w:left w:val="single" w:sz="24" w:space="4" w:color="30B5C5"/>
+        </w:pBdr>
+        <w:shd w:val="clear" w:fill="E0F7FA"/>
+      </w:pPr>
+      <w:r>
+        <w:rPr>
+          <w:b/>
+          <w:color w:val="30B5C5"/>
+          <w:rFonts w:ascii="HarmonyOS Sans" w:hAnsi="HarmonyOS Sans"/>
+        </w:rPr>
+        <w:t xml:space="preserve">Info: </w:t>
+      </w:r>
+      <w:r>
+        <w:t xml:space="preserve"> </w:t>
+      </w:r>
       <w:r>
         <w:t xml:space="preserve">The script installs XeLaTeX, latexmk, fonts (HarmonyOS Sans + Cascadia Code),</w:t>
       </w:r>
@@ -9191,7 +9601,22 @@
           <w:ilvl w:val="0"/>
           <w:numId w:val="1000"/>
         </w:numPr>
-      </w:pPr>
+        <w:pBdr>
+          <w:left w:val="single" w:sz="24" w:space="4" w:color="30B5C5"/>
+        </w:pBdr>
+        <w:shd w:val="clear" w:fill="E0F7FA"/>
+      </w:pPr>
+      <w:r>
+        <w:rPr>
+          <w:b/>
+          <w:color w:val="30B5C5"/>
+          <w:rFonts w:ascii="HarmonyOS Sans" w:hAnsi="HarmonyOS Sans"/>
+        </w:rPr>
+        <w:t xml:space="preserve">Info: </w:t>
+      </w:r>
+      <w:r>
+        <w:t xml:space="preserve"> </w:t>
+      </w:r>
       <w:r>
         <w:t xml:space="preserve">If an existing installation is detected, the one-liner prompts to update:</w:t>
       </w:r>
@@ -9601,7 +10026,22 @@
     <w:p>
       <w:pPr>
         <w:pStyle w:val="FirstParagraph"/>
-      </w:pPr>
+        <w:pBdr>
+          <w:left w:val="single" w:sz="24" w:space="4" w:color="62B230"/>
+        </w:pBdr>
+        <w:shd w:val="clear" w:fill="E8F5E9"/>
+      </w:pPr>
+      <w:r>
+        <w:rPr>
+          <w:b/>
+          <w:color w:val="62B230"/>
+          <w:rFonts w:ascii="HarmonyOS Sans" w:hAnsi="HarmonyOS Sans"/>
+        </w:rPr>
+        <w:t xml:space="preserve">Tip: </w:t>
+      </w:r>
+      <w:r>
+        <w:t xml:space="preserve"> </w:t>
+      </w:r>
       <w:r>
         <w:t xml:space="preserve">To compile a single project, use</w:t>
       </w:r>
@@ -9949,7 +10389,22 @@
     <w:p>
       <w:pPr>
         <w:pStyle w:val="FirstParagraph"/>
-      </w:pPr>
+        <w:pBdr>
+          <w:left w:val="single" w:sz="24" w:space="4" w:color="30B5C5"/>
+        </w:pBdr>
+        <w:shd w:val="clear" w:fill="E0F7FA"/>
+      </w:pPr>
+      <w:r>
+        <w:rPr>
+          <w:b/>
+          <w:color w:val="30B5C5"/>
+          <w:rFonts w:ascii="HarmonyOS Sans" w:hAnsi="HarmonyOS Sans"/>
+        </w:rPr>
+        <w:t xml:space="preserve">Info: </w:t>
+      </w:r>
+      <w:r>
+        <w:t xml:space="preserve"> </w:t>
+      </w:r>
       <w:r>
         <w:t xml:space="preserve">The skill is auto-discovered via</w:t>
       </w:r>
@@ -10370,7 +10825,22 @@
     <w:p>
       <w:pPr>
         <w:pStyle w:val="FirstParagraph"/>
-      </w:pPr>
+        <w:pBdr>
+          <w:left w:val="single" w:sz="24" w:space="4" w:color="30B5C5"/>
+        </w:pBdr>
+        <w:shd w:val="clear" w:fill="E0F7FA"/>
+      </w:pPr>
+      <w:r>
+        <w:rPr>
+          <w:b/>
+          <w:color w:val="30B5C5"/>
+          <w:rFonts w:ascii="HarmonyOS Sans" w:hAnsi="HarmonyOS Sans"/>
+        </w:rPr>
+        <w:t xml:space="preserve">Info: </w:t>
+      </w:r>
+      <w:r>
+        <w:t xml:space="preserve"> </w:t>
+      </w:r>
       <w:r>
         <w:t xml:space="preserve">The project also includes a</w:t>
       </w:r>
@@ -11697,7 +12167,22 @@
           <w:ilvl w:val="0"/>
           <w:numId w:val="1000"/>
         </w:numPr>
-      </w:pPr>
+        <w:pBdr>
+          <w:left w:val="single" w:sz="24" w:space="4" w:color="ED6D00"/>
+        </w:pBdr>
+        <w:shd w:val="clear" w:fill="FFF3E0"/>
+      </w:pPr>
+      <w:r>
+        <w:rPr>
+          <w:b/>
+          <w:color w:val="ED6D00"/>
+          <w:rFonts w:ascii="HarmonyOS Sans" w:hAnsi="HarmonyOS Sans"/>
+        </w:rPr>
+        <w:t xml:space="preserve">Important: </w:t>
+      </w:r>
+      <w:r>
+        <w:t xml:space="preserve"> </w:t>
+      </w:r>
       <w:r>
         <w:t xml:space="preserve">Removing apt packages will break any other LaTeX documents on the instance.</w:t>
       </w:r>
@@ -11946,7 +12431,22 @@
     <w:p>
       <w:pPr>
         <w:pStyle w:val="FirstParagraph"/>
-      </w:pPr>
+        <w:pBdr>
+          <w:left w:val="single" w:sz="24" w:space="4" w:color="ED6D00"/>
+        </w:pBdr>
+        <w:shd w:val="clear" w:fill="FFF3E0"/>
+      </w:pPr>
+      <w:r>
+        <w:rPr>
+          <w:b/>
+          <w:color w:val="ED6D00"/>
+          <w:rFonts w:ascii="HarmonyOS Sans" w:hAnsi="HarmonyOS Sans"/>
+        </w:rPr>
+        <w:t xml:space="preserve">Important: </w:t>
+      </w:r>
+      <w:r>
+        <w:t xml:space="preserve"> </w:t>
+      </w:r>
       <w:r>
         <w:t xml:space="preserve">If you used Terraform to provision the infrastructure, run</w:t>
       </w:r>
@@ -13354,7 +13854,7 @@
               <w:jc w:val="left"/>
             </w:pPr>
             <w:r>
-              <w:t xml:space="preserve">6.9.2</w:t>
+              <w:t xml:space="preserve">6.10.0</w:t>
             </w:r>
           </w:p>
         </w:tc>
@@ -13380,7 +13880,7 @@
               <w:jc w:val="left"/>
             </w:pPr>
             <w:r>
-              <w:t xml:space="preserve">Fix DOCX body text alignment: paragraphs are now justified (matching the PDF LaTeX default), instead of left-aligned.</w:t>
+              <w:t xml:space="preserve">Header logo, callout boxes, and note labels: DOCX header now shows the Huawei logo in the top-left corner (optional, driven by the :header-logo: attribute). DOCX admonitions (TIP, NOTE, WARNING) now render as styled callout boxes with colored backgrounds, left borders, and type labels — matching the PDF. PDF inline notes ([.note] role) now show a language-aware “Note:” label (was unlabeled italic text).</w:t>
             </w:r>
           </w:p>
         </w:tc>
@@ -13395,7 +13895,7 @@
               <w:jc w:val="left"/>
             </w:pPr>
             <w:r>
-              <w:t xml:space="preserve">6.9.1</w:t>
+              <w:t xml:space="preserve">6.9.2</w:t>
             </w:r>
           </w:p>
         </w:tc>
@@ -13425,7 +13925,7 @@
               <w:jc w:val="left"/>
             </w:pPr>
             <w:r>
-              <w:t xml:space="preserve">Fix DOCX subsection number size: H2/H3/H4 section numbers were rendered at 56pt (same as H1) instead of matching the heading text size (18/16/14pt). The SectionNumber style is now unstyled (inherits heading size); 56pt is set directly on H1 number runs only.</w:t>
+              <w:t xml:space="preserve">Fix DOCX body text alignment: paragraphs are now justified (matching the PDF LaTeX default), instead of left-aligned.</w:t>
             </w:r>
           </w:p>
         </w:tc>
@@ -13438,7 +13938,7 @@
               <w:jc w:val="left"/>
             </w:pPr>
             <w:r>
-              <w:t xml:space="preserve">6.9.0</w:t>
+              <w:t xml:space="preserve">6.9.1</w:t>
             </w:r>
           </w:p>
         </w:tc>
@@ -13464,7 +13964,7 @@
               <w:jc w:val="left"/>
             </w:pPr>
             <w:r>
-              <w:t xml:space="preserve">TOC styling: the table-of-contents title rule is now Huawei red (was black) in both PDF and DOCX, matching the H1 heading red rules. DOCX TOC entries now match the PDF: level 1 bold 12pt, levels 2-3 normal 10pt, HarmonyOS Sans font. DOCX TOC depth increased from 2 to 3 levels (matching PDF tocdepth). Dead TOCTitle style removed from DOCX.</w:t>
+              <w:t xml:space="preserve">Fix DOCX subsection number size: H2/H3/H4 section numbers were rendered at 56pt (same as H1) instead of matching the heading text size (18/16/14pt). The SectionNumber style is now unstyled (inherits heading size); 56pt is set directly on H1 number runs only.</w:t>
             </w:r>
           </w:p>
         </w:tc>
@@ -13479,7 +13979,7 @@
               <w:jc w:val="left"/>
             </w:pPr>
             <w:r>
-              <w:t xml:space="preserve">6.8.3</w:t>
+              <w:t xml:space="preserve">6.9.0</w:t>
             </w:r>
           </w:p>
         </w:tc>
@@ -13492,7 +13992,7 @@
               <w:jc w:val="left"/>
             </w:pPr>
             <w:r>
-              <w:t xml:space="preserve">2026-09-20</w:t>
+              <w:t xml:space="preserve">2026-09-21</w:t>
             </w:r>
           </w:p>
         </w:tc>
@@ -13509,7 +14009,7 @@
               <w:jc w:val="left"/>
             </w:pPr>
             <w:r>
-              <w:t xml:space="preserve">Docs accuracy fix: the multi-format pipeline descriptions in README, AGENTS, and all four SKILL.md files now correctly separate the DOCX/Markdown path (pre-processor then docbook then pandoc) from the HTML path (pre-processor then asciidoctor html5) — the previous wording implied HTML also went through docbook and pandoc. Corrected a stale comment in the DOCX fixer.</w:t>
+              <w:t xml:space="preserve">TOC styling: the table-of-contents title rule is now Huawei red (was black) in both PDF and DOCX, matching the H1 heading red rules. DOCX TOC entries now match the PDF: level 1 bold 12pt, levels 2-3 normal 10pt, HarmonyOS Sans font. DOCX TOC depth increased from 2 to 3 levels (matching PDF tocdepth). Dead TOCTitle style removed from DOCX.</w:t>
             </w:r>
           </w:p>
         </w:tc>
@@ -13522,7 +14022,7 @@
               <w:jc w:val="left"/>
             </w:pPr>
             <w:r>
-              <w:t xml:space="preserve">6.8.2</w:t>
+              <w:t xml:space="preserve">6.8.3</w:t>
             </w:r>
           </w:p>
         </w:tc>
@@ -13548,7 +14048,7 @@
               <w:jc w:val="left"/>
             </w:pPr>
             <w:r>
-              <w:t xml:space="preserve">Documentation and cleanup: README, AGENTS, and all four SKILL.md files now describe the real multi-format pipeline (pre-processor + docx_fix --fix + --lang flag) instead of the pre-v6.4 asciidoctor-to-pandoc chain. DOCX TOC title is now right-aligned like the PDF (was targeting a dead style). Signature names render bold like the PDF. Dead code removed (unused Caption style, dead TOCTitle style, dead HTML badge CSS). The --template and --lang flags accept the equals form (--template=guide). Various stale comments corrected.</w:t>
+              <w:t xml:space="preserve">Docs accuracy fix: the multi-format pipeline descriptions in README, AGENTS, and all four SKILL.md files now correctly separate the DOCX/Markdown path (pre-processor then docbook then pandoc) from the HTML path (pre-processor then asciidoctor html5) — the previous wording implied HTML also went through docbook and pandoc. Corrected a stale comment in the DOCX fixer.</w:t>
             </w:r>
           </w:p>
         </w:tc>
@@ -13563,7 +14063,7 @@
               <w:jc w:val="left"/>
             </w:pPr>
             <w:r>
-              <w:t xml:space="preserve">6.8.1</w:t>
+              <w:t xml:space="preserve">6.8.2</w:t>
             </w:r>
           </w:p>
         </w:tc>
@@ -13593,7 +14093,7 @@
               <w:jc w:val="left"/>
             </w:pPr>
             <w:r>
-              <w:t xml:space="preserve">Quality-pass fixes for v6.8.0: non-technical covers no longer show a stray Date paragraph (regression from the meta-scan change); the technical cover table is no longer hijacked from the body when :nochangelog: is set (boundary check on the cover-table detection); the Version/Date/Scenario table now renders unconditionally like the PDF (was gated by :nochangelog:); empty cover tables are skipped when no report values are set; corrected the cover-element-order wording in the v6.8.0 changelog.</w:t>
+              <w:t xml:space="preserve">Documentation and cleanup: README, AGENTS, and all four SKILL.md files now describe the real multi-format pipeline (pre-processor + docx_fix --fix + --lang flag) instead of the pre-v6.4 asciidoctor-to-pandoc chain. DOCX TOC title is now right-aligned like the PDF (was targeting a dead style). Signature names render bold like the PDF. Dead code removed (unused Caption style, dead TOCTitle style, dead HTML badge CSS). The --template and --lang flags accept the equals form (--template=guide). Various stale comments corrected.</w:t>
             </w:r>
           </w:p>
         </w:tc>
@@ -13606,7 +14106,7 @@
               <w:jc w:val="left"/>
             </w:pPr>
             <w:r>
-              <w:t xml:space="preserve">6.8.0</w:t>
+              <w:t xml:space="preserve">6.8.1</w:t>
             </w:r>
           </w:p>
         </w:tc>
@@ -13632,7 +14132,7 @@
               <w:jc w:val="left"/>
             </w:pPr>
             <w:r>
-              <w:t xml:space="preserve">Technical report covers now match the PDF in DOCX/MD/HTML: the title uses the PDF’s 24pt size (was 36pt), the report type label appears below the title (the DOCX cover keeps the established title-first order; the PDF has label-then-title), and the Version/Date/Scenario table is rendered with the PDF’s red label column. The cover meta line now shows the report version and its set date (was the document version and the build date). Authors, when set, appear as a table row like the PDF.</w:t>
+              <w:t xml:space="preserve">Quality-pass fixes for v6.8.0: non-technical covers no longer show a stray Date paragraph (regression from the meta-scan change); the technical cover table is no longer hijacked from the body when :nochangelog: is set (boundary check on the cover-table detection); the Version/Date/Scenario table now renders unconditionally like the PDF (was gated by :nochangelog:); empty cover tables are skipped when no report values are set; corrected the cover-element-order wording in the v6.8.0 changelog.</w:t>
             </w:r>
           </w:p>
         </w:tc>
@@ -13647,7 +14147,7 @@
               <w:jc w:val="left"/>
             </w:pPr>
             <w:r>
-              <w:t xml:space="preserve">6.7.0</w:t>
+              <w:t xml:space="preserve">6.8.0</w:t>
             </w:r>
           </w:p>
         </w:tc>
@@ -13677,7 +14177,7 @@
               <w:jc w:val="left"/>
             </w:pPr>
             <w:r>
-              <w:t xml:space="preserve">Badge and language fidelity: DOCX badge pills now render black text like the PDF (was frame-colored), use the correct label case (Pass, not PASS), include the Portuguese POC labels (Atendido, Parcial, Falha, Ignorado), and render at native width per template (testbook badge text no longer shrinks). Portuguese signature greetings now match the PDF (At.te,), the POC classification label matches the full PDF wording, and the secondary-format table headers (stakeholders, closing record, test summary, changelog) are now language-aware. DOCX footers show Página in Portuguese documents. Cover dates no longer zero-pad the day.</w:t>
+              <w:t xml:space="preserve">Technical report covers now match the PDF in DOCX/MD/HTML: the title uses the PDF’s 24pt size (was 36pt), the report type label appears below the title (the DOCX cover keeps the established title-first order; the PDF has label-then-title), and the Version/Date/Scenario table is rendered with the PDF’s red label column. The cover meta line now shows the report version and its set date (was the document version and the build date). Authors, when set, appear as a table row like the PDF.</w:t>
             </w:r>
           </w:p>
         </w:tc>
@@ -13690,7 +14190,7 @@
               <w:jc w:val="left"/>
             </w:pPr>
             <w:r>
-              <w:t xml:space="preserve">6.6.1</w:t>
+              <w:t xml:space="preserve">6.7.0</w:t>
             </w:r>
           </w:p>
         </w:tc>
@@ -13716,7 +14216,7 @@
               <w:jc w:val="left"/>
             </w:pPr>
             <w:r>
-              <w:t xml:space="preserve">Quality-pass fixes for v6.6.0: the TESTCASE-marker strip now covers the entire DOCX fix run (a failure at any stage can no longer leave markers in the output file); the fixer resets its template state between in-process runs (the documented path-sniffing fallback works again); build.sh also cleans temporary files on interrupt signals; fixed a CHANGELOG typo.</w:t>
+              <w:t xml:space="preserve">Badge and language fidelity: DOCX badge pills now render black text like the PDF (was frame-colored), use the correct label case (Pass, not PASS), include the Portuguese POC labels (Atendido, Parcial, Falha, Ignorado), and render at native width per template (testbook badge text no longer shrinks). Portuguese signature greetings now match the PDF (At.te,), the POC classification label matches the full PDF wording, and the secondary-format table headers (stakeholders, closing record, test summary, changelog) are now language-aware. DOCX footers show Página in Portuguese documents. Cover dates no longer zero-pad the day.</w:t>
             </w:r>
           </w:p>
         </w:tc>
@@ -13731,7 +14231,7 @@
               <w:jc w:val="left"/>
             </w:pPr>
             <w:r>
-              <w:t xml:space="preserve">6.6.0</w:t>
+              <w:t xml:space="preserve">6.6.1</w:t>
             </w:r>
           </w:p>
         </w:tc>
@@ -13761,6 +14261,45 @@
               <w:jc w:val="left"/>
             </w:pPr>
             <w:r>
+              <w:t xml:space="preserve">Quality-pass fixes for v6.6.0: the TESTCASE-marker strip now covers the entire DOCX fix run (a failure at any stage can no longer leave markers in the output file); the fixer resets its template state between in-process runs (the documented path-sniffing fallback works again); build.sh also cleans temporary files on interrupt signals; fixed a CHANGELOG typo.</w:t>
+            </w:r>
+          </w:p>
+        </w:tc>
+      </w:tr>
+      <w:tr>
+        <w:tc>
+          <w:tcPr/>
+          <w:p>
+            <w:pPr>
+              <w:jc w:val="left"/>
+            </w:pPr>
+            <w:r>
+              <w:t xml:space="preserve">6.6.0</w:t>
+            </w:r>
+          </w:p>
+        </w:tc>
+        <w:tc>
+          <w:tcPr/>
+          <w:p>
+            <w:pPr>
+              <w:jc w:val="left"/>
+            </w:pPr>
+            <w:r>
+              <w:t xml:space="preserve">2026-09-20</w:t>
+            </w:r>
+          </w:p>
+        </w:tc>
+        <w:tc>
+          <w:tcPr/>
+          <w:p>
+            <w:pPr>
+              <w:numPr>
+                <w:ilvl w:val="0"/>
+                <w:numId w:val="1052"/>
+              </w:numPr>
+              <w:jc w:val="left"/>
+            </w:pPr>
+            <w:r>
               <w:t xml:space="preserve">Pipeline robustness: DOCX post-processing now fails loudly when content styling errors occur (TESTCASE markers can no longer leak into output); the DOCX fixer takes an explicit</w:t>
             </w:r>
             <w:r>
@@ -13783,54 +14322,15 @@
       </w:tr>
       <w:tr>
         <w:tc>
-          <w:tcPr/>
+          <w:tcPr>
+            <w:shd w:val="clear" w:color="auto" w:fill="F6F8FA"/>
+          </w:tcPr>
           <w:p>
             <w:pPr>
               <w:jc w:val="left"/>
             </w:pPr>
             <w:r>
               <w:t xml:space="preserve">6.5.2</w:t>
-            </w:r>
-          </w:p>
-        </w:tc>
-        <w:tc>
-          <w:tcPr/>
-          <w:p>
-            <w:pPr>
-              <w:jc w:val="left"/>
-            </w:pPr>
-            <w:r>
-              <w:t xml:space="preserve">2026-09-20</w:t>
-            </w:r>
-          </w:p>
-        </w:tc>
-        <w:tc>
-          <w:tcPr/>
-          <w:p>
-            <w:pPr>
-              <w:numPr>
-                <w:ilvl w:val="0"/>
-                <w:numId w:val="1052"/>
-              </w:numPr>
-              <w:jc w:val="left"/>
-            </w:pPr>
-            <w:r>
-              <w:t xml:space="preserve">Quality-pass fixes for v6.5.1: LaTeX quote conversion now handles only paired quotes (quote characters inside code arguments are no longer corrupted); signature cells containing escaped ampersands are no longer split; round-trip HTML generation guards the asciidoctor-diagram dependency and fails loudly when generation fails; pre-processor unit tests now cover pipe escaping in all five table handlers.</w:t>
-            </w:r>
-          </w:p>
-        </w:tc>
-      </w:tr>
-      <w:tr>
-        <w:tc>
-          <w:tcPr>
-            <w:shd w:val="clear" w:color="auto" w:fill="F6F8FA"/>
-          </w:tcPr>
-          <w:p>
-            <w:pPr>
-              <w:jc w:val="left"/>
-            </w:pPr>
-            <w:r>
-              <w:t xml:space="preserve">6.5.1</w:t>
             </w:r>
           </w:p>
         </w:tc>
@@ -13860,7 +14360,7 @@
               <w:jc w:val="left"/>
             </w:pPr>
             <w:r>
-              <w:t xml:space="preserve">Fixed DOCX/MD/HTML output: tables are no longer corrupted when changelog, signature, or summary content contains a pipe character (“|”). Badge text is now preserved in DOCX/MD/HTML — a “Ready” badge renders “Ready” instead of “[NEW]”. Multi-item changelog entries render as bullet lists instead of being joined with a literal “+”. POC documents now include the changelog in DOCX/MD/HTML. The :noanswers: attribute now hides test results and remarks in DOCX/MD/HTML, matching the PDF. Inline LaTeX (monospace text, arrows, LaTeX quotes) no longer leaks from changelog entries. The test suite now exercises the real build pipeline (pre-processor wired into round-trip and DOCX tests), with new pre-processor unit tests.</w:t>
+              <w:t xml:space="preserve">Quality-pass fixes for v6.5.1: LaTeX quote conversion now handles only paired quotes (quote characters inside code arguments are no longer corrupted); signature cells containing escaped ampersands are no longer split; round-trip HTML generation guards the asciidoctor-diagram dependency and fails loudly when generation fails; pre-processor unit tests now cover pipe escaping in all five table handlers.</w:t>
             </w:r>
           </w:p>
         </w:tc>
@@ -13873,7 +14373,7 @@
               <w:jc w:val="left"/>
             </w:pPr>
             <w:r>
-              <w:t xml:space="preserve">6.5.0</w:t>
+              <w:t xml:space="preserve">6.5.1</w:t>
             </w:r>
           </w:p>
         </w:tc>
@@ -13899,7 +14399,7 @@
               <w:jc w:val="left"/>
             </w:pPr>
             <w:r>
-              <w:t xml:space="preserve">Evidence checklist simplified to plain bullets in both PDF and DOCX (checkbox markers removed for compatibility). Planned Activities list in DOCX now uses Word’s native lower-roman numbering (i., ii., iii.) matching the PDF. Badges in DOCX replaced with exact-replica PNG pill images (rounded, colored frame and background, bold text) matching the PDF \ huaweibadge look — assets committed to the repo. Signature blocks in DOCX no longer show literal + symbols (proper hard line breaks).</w:t>
+              <w:t xml:space="preserve">Fixed DOCX/MD/HTML output: tables are no longer corrupted when changelog, signature, or summary content contains a pipe character (“|”). Badge text is now preserved in DOCX/MD/HTML — a “Ready” badge renders “Ready” instead of “[NEW]”. Multi-item changelog entries render as bullet lists instead of being joined with a literal “+”. POC documents now include the changelog in DOCX/MD/HTML. The :noanswers: attribute now hides test results and remarks in DOCX/MD/HTML, matching the PDF. Inline LaTeX (monospace text, arrows, LaTeX quotes) no longer leaks from changelog entries. The test suite now exercises the real build pipeline (pre-processor wired into round-trip and DOCX tests), with new pre-processor unit tests.</w:t>
             </w:r>
           </w:p>
         </w:tc>
@@ -13914,7 +14414,7 @@
               <w:jc w:val="left"/>
             </w:pPr>
             <w:r>
-              <w:t xml:space="preserve">6.4.7</w:t>
+              <w:t xml:space="preserve">6.5.0</w:t>
             </w:r>
           </w:p>
         </w:tc>
@@ -13944,7 +14444,7 @@
               <w:jc w:val="left"/>
             </w:pPr>
             <w:r>
-              <w:t xml:space="preserve">Section titles in DOCX now match the PDF heading design: the big section number (56pt) sits on the left, the title text is pushed to the right edge (a right tab stop mimics the LaTeX \ hfill), and the red rule runs below — previously the title sat left-aligned next to a small number. Applies to all templates.</w:t>
+              <w:t xml:space="preserve">Evidence checklist simplified to plain bullets in both PDF and DOCX (checkbox markers removed for compatibility). Planned Activities list in DOCX now uses Word’s native lower-roman numbering (i., ii., iii.) matching the PDF. Badges in DOCX replaced with exact-replica PNG pill images (rounded, colored frame and background, bold text) matching the PDF \ huaweibadge look — assets committed to the repo. Signature blocks in DOCX no longer show literal + symbols (proper hard line breaks).</w:t>
             </w:r>
           </w:p>
         </w:tc>
@@ -13957,7 +14457,7 @@
               <w:jc w:val="left"/>
             </w:pPr>
             <w:r>
-              <w:t xml:space="preserve">6.4.6</w:t>
+              <w:t xml:space="preserve">6.4.7</w:t>
             </w:r>
           </w:p>
         </w:tc>
@@ -13983,7 +14483,7 @@
               <w:jc w:val="left"/>
             </w:pPr>
             <w:r>
-              <w:t xml:space="preserve">Code blocks inside test cases no longer break the red left rule in DOCX — the code style’s left indent (which jogged the rule) is reset inside test case blocks, and code blocks now show the PDF’s code box (gray background with thin border on top, bottom, and right, red rule continuing on the left).</w:t>
+              <w:t xml:space="preserve">Section titles in DOCX now match the PDF heading design: the big section number (56pt) sits on the left, the title text is pushed to the right edge (a right tab stop mimics the LaTeX \ hfill), and the red rule runs below — previously the title sat left-aligned next to a small number. Applies to all templates.</w:t>
             </w:r>
           </w:p>
         </w:tc>
@@ -13998,7 +14498,7 @@
               <w:jc w:val="left"/>
             </w:pPr>
             <w:r>
-              <w:t xml:space="preserve">6.4.5</w:t>
+              <w:t xml:space="preserve">6.4.6</w:t>
             </w:r>
           </w:p>
         </w:tc>
@@ -14028,7 +14528,7 @@
               <w:jc w:val="left"/>
             </w:pPr>
             <w:r>
-              <w:t xml:space="preserve">DOCX polish pass: all captions centered (matching the PDF), vertical spacing between blocks matched to the LaTeX rhythm (medskip/smallskip around captions, field bars, and steps), and test steps now render as separate paragraphs each with the red bold number (previously merged into one paragraph).</w:t>
+              <w:t xml:space="preserve">Code blocks inside test cases no longer break the red left rule in DOCX — the code style’s left indent (which jogged the rule) is reset inside test case blocks, and code blocks now show the PDF’s code box (gray background with thin border on top, bottom, and right, red rule continuing on the left).</w:t>
             </w:r>
           </w:p>
         </w:tc>
@@ -14041,7 +14541,7 @@
               <w:jc w:val="left"/>
             </w:pPr>
             <w:r>
-              <w:t xml:space="preserve">6.4.4</w:t>
+              <w:t xml:space="preserve">6.4.5</w:t>
             </w:r>
           </w:p>
         </w:tc>
@@ -14067,7 +14567,7 @@
               <w:jc w:val="left"/>
             </w:pPr>
             <w:r>
-              <w:t xml:space="preserve">DOCX covers now show the logo, cover text, and version/date/time meta line like the PDF. Test case blocks in DOCX get the PDF’s visual wrapper: red left rule, red field header bars, and red step numbers. Captions follow the PDF ordering system in DOCX, MD, and HTML (Table/Diagram/Figure/Testcase N: with bold symbol). Portuguese PDFs now label diagrams "Diagrama N:" (was hardcoded English "Diagram"). Markdown and HTML output no longer leaks raw LaTeX from passthrough blocks — the DOCX pre-processor now feeds those pipelines too.</w:t>
+              <w:t xml:space="preserve">DOCX polish pass: all captions centered (matching the PDF), vertical spacing between blocks matched to the LaTeX rhythm (medskip/smallskip around captions, field bars, and steps), and test steps now render as separate paragraphs each with the red bold number (previously merged into one paragraph).</w:t>
             </w:r>
           </w:p>
         </w:tc>
@@ -14082,7 +14582,7 @@
               <w:jc w:val="left"/>
             </w:pPr>
             <w:r>
-              <w:t xml:space="preserve">6.4.3</w:t>
+              <w:t xml:space="preserve">6.4.4</w:t>
             </w:r>
           </w:p>
         </w:tc>
@@ -14112,7 +14612,7 @@
               <w:jc w:val="left"/>
             </w:pPr>
             <w:r>
-              <w:t xml:space="preserve">Testbook and POC DOCX output now matches the PDF much more closely: native table of contents (language-aware, auto-populated), each section starts on a new page, embedded images and diagrams (PlantUML/Graphviz rendered), white-on-red table headers, cover version line under the title, centered test case captions, and plain black rules for signature grids.</w:t>
+              <w:t xml:space="preserve">DOCX covers now show the logo, cover text, and version/date/time meta line like the PDF. Test case blocks in DOCX get the PDF’s visual wrapper: red left rule, red field header bars, and red step numbers. Captions follow the PDF ordering system in DOCX, MD, and HTML (Table/Diagram/Figure/Testcase N: with bold symbol). Portuguese PDFs now label diagrams "Diagrama N:" (was hardcoded English "Diagram"). Markdown and HTML output no longer leaks raw LaTeX from passthrough blocks — the DOCX pre-processor now feeds those pipelines too.</w:t>
             </w:r>
           </w:p>
         </w:tc>
@@ -14125,7 +14625,7 @@
               <w:jc w:val="left"/>
             </w:pPr>
             <w:r>
-              <w:t xml:space="preserve">6.4.2</w:t>
+              <w:t xml:space="preserve">6.4.3</w:t>
             </w:r>
           </w:p>
         </w:tc>
@@ -14151,7 +14651,7 @@
               <w:jc w:val="left"/>
             </w:pPr>
             <w:r>
-              <w:t xml:space="preserve">DOCX output for POC and testbook templates now includes all passthrough content (stakeholders, closing record, signatures, test cases, test summary, changelog) via a new pre-processor. Fixed dropped Test Scope fields in testbook DOCX output.</w:t>
+              <w:t xml:space="preserve">Testbook and POC DOCX output now matches the PDF much more closely: native table of contents (language-aware, auto-populated), each section starts on a new page, embedded images and diagrams (PlantUML/Graphviz rendered), white-on-red table headers, cover version line under the title, centered test case captions, and plain black rules for signature grids.</w:t>
             </w:r>
           </w:p>
         </w:tc>
@@ -14166,7 +14666,7 @@
               <w:jc w:val="left"/>
             </w:pPr>
             <w:r>
-              <w:t xml:space="preserve">6.4.0</w:t>
+              <w:t xml:space="preserve">6.4.2</w:t>
             </w:r>
           </w:p>
         </w:tc>
@@ -14196,6 +14696,45 @@
               <w:jc w:val="left"/>
             </w:pPr>
             <w:r>
+              <w:t xml:space="preserve">DOCX output for POC and testbook templates now includes all passthrough content (stakeholders, closing record, signatures, test cases, test summary, changelog) via a new pre-processor. Fixed dropped Test Scope fields in testbook DOCX output.</w:t>
+            </w:r>
+          </w:p>
+        </w:tc>
+      </w:tr>
+      <w:tr>
+        <w:tc>
+          <w:tcPr/>
+          <w:p>
+            <w:pPr>
+              <w:jc w:val="left"/>
+            </w:pPr>
+            <w:r>
+              <w:t xml:space="preserve">6.4.0</w:t>
+            </w:r>
+          </w:p>
+        </w:tc>
+        <w:tc>
+          <w:tcPr/>
+          <w:p>
+            <w:pPr>
+              <w:jc w:val="left"/>
+            </w:pPr>
+            <w:r>
+              <w:t xml:space="preserve">2026-09-20</w:t>
+            </w:r>
+          </w:p>
+        </w:tc>
+        <w:tc>
+          <w:tcPr/>
+          <w:p>
+            <w:pPr>
+              <w:numPr>
+                <w:ilvl w:val="0"/>
+                <w:numId w:val="1062"/>
+              </w:numPr>
+              <w:jc w:val="left"/>
+            </w:pPr>
+            <w:r>
               <w:t xml:space="preserve">Fixed changelog dates — replaced</w:t>
             </w:r>
             <w:r>
@@ -14218,54 +14757,15 @@
       </w:tr>
       <w:tr>
         <w:tc>
-          <w:tcPr/>
+          <w:tcPr>
+            <w:shd w:val="clear" w:color="auto" w:fill="F6F8FA"/>
+          </w:tcPr>
           <w:p>
             <w:pPr>
               <w:jc w:val="left"/>
             </w:pPr>
             <w:r>
               <w:t xml:space="preserve">5.1.1</w:t>
-            </w:r>
-          </w:p>
-        </w:tc>
-        <w:tc>
-          <w:tcPr/>
-          <w:p>
-            <w:pPr>
-              <w:jc w:val="left"/>
-            </w:pPr>
-            <w:r>
-              <w:t xml:space="preserve">2026-09-14</w:t>
-            </w:r>
-          </w:p>
-        </w:tc>
-        <w:tc>
-          <w:tcPr/>
-          <w:p>
-            <w:pPr>
-              <w:numPr>
-                <w:ilvl w:val="0"/>
-                <w:numId w:val="1062"/>
-              </w:numPr>
-              <w:jc w:val="left"/>
-            </w:pPr>
-            <w:r>
-              <w:t xml:space="preserve">Synced callout colors in DOCX/HTML/MD output to match brand palette. Added color palette demo.</w:t>
-            </w:r>
-          </w:p>
-        </w:tc>
-      </w:tr>
-      <w:tr>
-        <w:tc>
-          <w:tcPr>
-            <w:shd w:val="clear" w:color="auto" w:fill="F6F8FA"/>
-          </w:tcPr>
-          <w:p>
-            <w:pPr>
-              <w:jc w:val="left"/>
-            </w:pPr>
-            <w:r>
-              <w:t xml:space="preserve">5.1.0</w:t>
             </w:r>
           </w:p>
         </w:tc>
@@ -14295,7 +14795,7 @@
               <w:jc w:val="left"/>
             </w:pPr>
             <w:r>
-              <w:t xml:space="preserve">Adopted brand guidelines auxiliary color palette and monochrome scale. Aligned callout colors to brand specifications.</w:t>
+              <w:t xml:space="preserve">Synced callout colors in DOCX/HTML/MD output to match brand palette. Added color palette demo.</w:t>
             </w:r>
           </w:p>
         </w:tc>
@@ -14308,7 +14808,7 @@
               <w:jc w:val="left"/>
             </w:pPr>
             <w:r>
-              <w:t xml:space="preserve">5.0.3</w:t>
+              <w:t xml:space="preserve">5.1.0</w:t>
             </w:r>
           </w:p>
         </w:tc>
@@ -14334,6 +14834,51 @@
               <w:jc w:val="left"/>
             </w:pPr>
             <w:r>
+              <w:t xml:space="preserve">Adopted brand guidelines auxiliary color palette and monochrome scale. Aligned callout colors to brand specifications.</w:t>
+            </w:r>
+          </w:p>
+        </w:tc>
+      </w:tr>
+      <w:tr>
+        <w:tc>
+          <w:tcPr>
+            <w:shd w:val="clear" w:color="auto" w:fill="F6F8FA"/>
+          </w:tcPr>
+          <w:p>
+            <w:pPr>
+              <w:jc w:val="left"/>
+            </w:pPr>
+            <w:r>
+              <w:t xml:space="preserve">5.0.3</w:t>
+            </w:r>
+          </w:p>
+        </w:tc>
+        <w:tc>
+          <w:tcPr>
+            <w:shd w:val="clear" w:color="auto" w:fill="F6F8FA"/>
+          </w:tcPr>
+          <w:p>
+            <w:pPr>
+              <w:jc w:val="left"/>
+            </w:pPr>
+            <w:r>
+              <w:t xml:space="preserve">2026-09-14</w:t>
+            </w:r>
+          </w:p>
+        </w:tc>
+        <w:tc>
+          <w:tcPr>
+            <w:shd w:val="clear" w:color="auto" w:fill="F6F8FA"/>
+          </w:tcPr>
+          <w:p>
+            <w:pPr>
+              <w:numPr>
+                <w:ilvl w:val="0"/>
+                <w:numId w:val="1065"/>
+              </w:numPr>
+              <w:jc w:val="left"/>
+            </w:pPr>
+            <w:r>
               <w:t xml:space="preserve">Removed non-standard</w:t>
             </w:r>
             <w:r>
@@ -14356,58 +14901,13 @@
       </w:tr>
       <w:tr>
         <w:tc>
-          <w:tcPr>
-            <w:shd w:val="clear" w:color="auto" w:fill="F6F8FA"/>
-          </w:tcPr>
+          <w:tcPr/>
           <w:p>
             <w:pPr>
               <w:jc w:val="left"/>
             </w:pPr>
             <w:r>
               <w:t xml:space="preserve">5.0.2</w:t>
-            </w:r>
-          </w:p>
-        </w:tc>
-        <w:tc>
-          <w:tcPr>
-            <w:shd w:val="clear" w:color="auto" w:fill="F6F8FA"/>
-          </w:tcPr>
-          <w:p>
-            <w:pPr>
-              <w:jc w:val="left"/>
-            </w:pPr>
-            <w:r>
-              <w:t xml:space="preserve">2026-09-14</w:t>
-            </w:r>
-          </w:p>
-        </w:tc>
-        <w:tc>
-          <w:tcPr>
-            <w:shd w:val="clear" w:color="auto" w:fill="F6F8FA"/>
-          </w:tcPr>
-          <w:p>
-            <w:pPr>
-              <w:numPr>
-                <w:ilvl w:val="0"/>
-                <w:numId w:val="1065"/>
-              </w:numPr>
-              <w:jc w:val="left"/>
-            </w:pPr>
-            <w:r>
-              <w:t xml:space="preserve">Long commands in test steps now render as code blocks instead of inline code.</w:t>
-            </w:r>
-          </w:p>
-        </w:tc>
-      </w:tr>
-      <w:tr>
-        <w:tc>
-          <w:tcPr/>
-          <w:p>
-            <w:pPr>
-              <w:jc w:val="left"/>
-            </w:pPr>
-            <w:r>
-              <w:t xml:space="preserve">5.0.1</w:t>
             </w:r>
           </w:p>
         </w:tc>
@@ -14433,7 +14933,7 @@
               <w:jc w:val="left"/>
             </w:pPr>
             <w:r>
-              <w:t xml:space="preserve">Testcase caption centered above the block.</w:t>
+              <w:t xml:space="preserve">Long commands in test steps now render as code blocks instead of inline code.</w:t>
             </w:r>
           </w:p>
         </w:tc>
@@ -14448,7 +14948,7 @@
               <w:jc w:val="left"/>
             </w:pPr>
             <w:r>
-              <w:t xml:space="preserve">5.0.0</w:t>
+              <w:t xml:space="preserve">5.0.1</w:t>
             </w:r>
           </w:p>
         </w:tc>
@@ -14478,6 +14978,45 @@
               <w:jc w:val="left"/>
             </w:pPr>
             <w:r>
+              <w:t xml:space="preserve">Testcase caption centered above the block.</w:t>
+            </w:r>
+          </w:p>
+        </w:tc>
+      </w:tr>
+      <w:tr>
+        <w:tc>
+          <w:tcPr/>
+          <w:p>
+            <w:pPr>
+              <w:jc w:val="left"/>
+            </w:pPr>
+            <w:r>
+              <w:t xml:space="preserve">5.0.0</w:t>
+            </w:r>
+          </w:p>
+        </w:tc>
+        <w:tc>
+          <w:tcPr/>
+          <w:p>
+            <w:pPr>
+              <w:jc w:val="left"/>
+            </w:pPr>
+            <w:r>
+              <w:t xml:space="preserve">2026-09-14</w:t>
+            </w:r>
+          </w:p>
+        </w:tc>
+        <w:tc>
+          <w:tcPr/>
+          <w:p>
+            <w:pPr>
+              <w:numPr>
+                <w:ilvl w:val="0"/>
+                <w:numId w:val="1068"/>
+              </w:numPr>
+              <w:jc w:val="left"/>
+            </w:pPr>
+            <w:r>
               <w:t xml:space="preserve">Major refactoring: extracted shared modules (huawei-titles, huawei-toc, huawei-cover), renamed</w:t>
             </w:r>
             <w:r>
@@ -14539,7 +15078,9 @@
       </w:tr>
       <w:tr>
         <w:tc>
-          <w:tcPr/>
+          <w:tcPr>
+            <w:shd w:val="clear" w:color="auto" w:fill="F6F8FA"/>
+          </w:tcPr>
           <w:p>
             <w:pPr>
               <w:jc w:val="left"/>
@@ -14550,56 +15091,15 @@
           </w:p>
         </w:tc>
         <w:tc>
-          <w:tcPr/>
+          <w:tcPr>
+            <w:shd w:val="clear" w:color="auto" w:fill="F6F8FA"/>
+          </w:tcPr>
           <w:p>
             <w:pPr>
               <w:jc w:val="left"/>
             </w:pPr>
             <w:r>
               <w:t xml:space="preserve">2026-09-14</w:t>
-            </w:r>
-          </w:p>
-        </w:tc>
-        <w:tc>
-          <w:tcPr/>
-          <w:p>
-            <w:pPr>
-              <w:numPr>
-                <w:ilvl w:val="0"/>
-                <w:numId w:val="1068"/>
-              </w:numPr>
-              <w:jc w:val="left"/>
-            </w:pPr>
-            <w:r>
-              <w:t xml:space="preserve">Testcase headings now formatted as captions (like figures/tables): bold “Testcase N:” followed by description. Changed label from “Test Case” to “Testcase”.</w:t>
-            </w:r>
-          </w:p>
-        </w:tc>
-      </w:tr>
-      <w:tr>
-        <w:tc>
-          <w:tcPr>
-            <w:shd w:val="clear" w:color="auto" w:fill="F6F8FA"/>
-          </w:tcPr>
-          <w:p>
-            <w:pPr>
-              <w:jc w:val="left"/>
-            </w:pPr>
-            <w:r>
-              <w:t xml:space="preserve">4.6.0</w:t>
-            </w:r>
-          </w:p>
-        </w:tc>
-        <w:tc>
-          <w:tcPr>
-            <w:shd w:val="clear" w:color="auto" w:fill="F6F8FA"/>
-          </w:tcPr>
-          <w:p>
-            <w:pPr>
-              <w:jc w:val="left"/>
-            </w:pPr>
-            <w:r>
-              <w:t xml:space="preserve">2026-09-13</w:t>
             </w:r>
           </w:p>
         </w:tc>
@@ -14616,7 +15116,7 @@
               <w:jc w:val="left"/>
             </w:pPr>
             <w:r>
-              <w:t xml:space="preserve">Section restructure: Introduction, Test Cases (with category subsections), Conclusion. Testcases auto-numbered like figures/tables. Changed testcase from subsection to subsubsection.</w:t>
+              <w:t xml:space="preserve">Testcase headings now formatted as captions (like figures/tables): bold “Testcase N:” followed by description. Changed label from “Test Case” to “Testcase”.</w:t>
             </w:r>
           </w:p>
         </w:tc>
@@ -14629,7 +15129,7 @@
               <w:jc w:val="left"/>
             </w:pPr>
             <w:r>
-              <w:t xml:space="preserve">4.5.0</w:t>
+              <w:t xml:space="preserve">4.6.0</w:t>
             </w:r>
           </w:p>
         </w:tc>
@@ -14655,6 +15155,51 @@
               <w:jc w:val="left"/>
             </w:pPr>
             <w:r>
+              <w:t xml:space="preserve">Section restructure: Introduction, Test Cases (with category subsections), Conclusion. Testcases auto-numbered like figures/tables. Changed testcase from subsection to subsubsection.</w:t>
+            </w:r>
+          </w:p>
+        </w:tc>
+      </w:tr>
+      <w:tr>
+        <w:tc>
+          <w:tcPr>
+            <w:shd w:val="clear" w:color="auto" w:fill="F6F8FA"/>
+          </w:tcPr>
+          <w:p>
+            <w:pPr>
+              <w:jc w:val="left"/>
+            </w:pPr>
+            <w:r>
+              <w:t xml:space="preserve">4.5.0</w:t>
+            </w:r>
+          </w:p>
+        </w:tc>
+        <w:tc>
+          <w:tcPr>
+            <w:shd w:val="clear" w:color="auto" w:fill="F6F8FA"/>
+          </w:tcPr>
+          <w:p>
+            <w:pPr>
+              <w:jc w:val="left"/>
+            </w:pPr>
+            <w:r>
+              <w:t xml:space="preserve">2026-09-13</w:t>
+            </w:r>
+          </w:p>
+        </w:tc>
+        <w:tc>
+          <w:tcPr>
+            <w:shd w:val="clear" w:color="auto" w:fill="F6F8FA"/>
+          </w:tcPr>
+          <w:p>
+            <w:pPr>
+              <w:numPr>
+                <w:ilvl w:val="0"/>
+                <w:numId w:val="1071"/>
+              </w:numPr>
+              <w:jc w:val="left"/>
+            </w:pPr>
+            <w:r>
               <w:t xml:space="preserve">Unified field APIs:</w:t>
             </w:r>
             <w:r>
@@ -14719,58 +15264,13 @@
       </w:tr>
       <w:tr>
         <w:tc>
-          <w:tcPr>
-            <w:shd w:val="clear" w:color="auto" w:fill="F6F8FA"/>
-          </w:tcPr>
+          <w:tcPr/>
           <w:p>
             <w:pPr>
               <w:jc w:val="left"/>
             </w:pPr>
             <w:r>
               <w:t xml:space="preserve">4.4.0</w:t>
-            </w:r>
-          </w:p>
-        </w:tc>
-        <w:tc>
-          <w:tcPr>
-            <w:shd w:val="clear" w:color="auto" w:fill="F6F8FA"/>
-          </w:tcPr>
-          <w:p>
-            <w:pPr>
-              <w:jc w:val="left"/>
-            </w:pPr>
-            <w:r>
-              <w:t xml:space="preserve">2026-09-13</w:t>
-            </w:r>
-          </w:p>
-        </w:tc>
-        <w:tc>
-          <w:tcPr>
-            <w:shd w:val="clear" w:color="auto" w:fill="F6F8FA"/>
-          </w:tcPr>
-          <w:p>
-            <w:pPr>
-              <w:numPr>
-                <w:ilvl w:val="0"/>
-                <w:numId w:val="1071"/>
-              </w:numPr>
-              <w:jc w:val="left"/>
-            </w:pPr>
-            <w:r>
-              <w:t xml:space="preserve">Code review fixes: removed dead labels, badge now uses Huawei brand colors (tipbg/tipfg, huaweired, warningbg/warningfg), Lua filter preserves formatting in DOCX/MD/HTML via parse_latex_blocks, testprocedure handler preserves non-step content (images, code, callouts).</w:t>
-            </w:r>
-          </w:p>
-        </w:tc>
-      </w:tr>
-      <w:tr>
-        <w:tc>
-          <w:tcPr/>
-          <w:p>
-            <w:pPr>
-              <w:jc w:val="left"/>
-            </w:pPr>
-            <w:r>
-              <w:t xml:space="preserve">4.3.0</w:t>
             </w:r>
           </w:p>
         </w:tc>
@@ -14796,6 +15296,51 @@
               <w:jc w:val="left"/>
             </w:pPr>
             <w:r>
+              <w:t xml:space="preserve">Code review fixes: removed dead labels, badge now uses Huawei brand colors (tipbg/tipfg, huaweired, warningbg/warningfg), Lua filter preserves formatting in DOCX/MD/HTML via parse_latex_blocks, testprocedure handler preserves non-step content (images, code, callouts).</w:t>
+            </w:r>
+          </w:p>
+        </w:tc>
+      </w:tr>
+      <w:tr>
+        <w:tc>
+          <w:tcPr>
+            <w:shd w:val="clear" w:color="auto" w:fill="F6F8FA"/>
+          </w:tcPr>
+          <w:p>
+            <w:pPr>
+              <w:jc w:val="left"/>
+            </w:pPr>
+            <w:r>
+              <w:t xml:space="preserve">4.3.0</w:t>
+            </w:r>
+          </w:p>
+        </w:tc>
+        <w:tc>
+          <w:tcPr>
+            <w:shd w:val="clear" w:color="auto" w:fill="F6F8FA"/>
+          </w:tcPr>
+          <w:p>
+            <w:pPr>
+              <w:jc w:val="left"/>
+            </w:pPr>
+            <w:r>
+              <w:t xml:space="preserve">2026-09-13</w:t>
+            </w:r>
+          </w:p>
+        </w:tc>
+        <w:tc>
+          <w:tcPr>
+            <w:shd w:val="clear" w:color="auto" w:fill="F6F8FA"/>
+          </w:tcPr>
+          <w:p>
+            <w:pPr>
+              <w:numPr>
+                <w:ilvl w:val="0"/>
+                <w:numId w:val="1073"/>
+              </w:numPr>
+              <w:jc w:val="left"/>
+            </w:pPr>
+            <w:r>
               <w:t xml:space="preserve">Added</w:t>
             </w:r>
             <w:r>
@@ -14848,9 +15393,7 @@
       </w:tr>
       <w:tr>
         <w:tc>
-          <w:tcPr>
-            <w:shd w:val="clear" w:color="auto" w:fill="F6F8FA"/>
-          </w:tcPr>
+          <w:tcPr/>
           <w:p>
             <w:pPr>
               <w:jc w:val="left"/>
@@ -14861,9 +15404,7 @@
           </w:p>
         </w:tc>
         <w:tc>
-          <w:tcPr>
-            <w:shd w:val="clear" w:color="auto" w:fill="F6F8FA"/>
-          </w:tcPr>
+          <w:tcPr/>
           <w:p>
             <w:pPr>
               <w:jc w:val="left"/>
@@ -14874,14 +15415,12 @@
           </w:p>
         </w:tc>
         <w:tc>
-          <w:tcPr>
-            <w:shd w:val="clear" w:color="auto" w:fill="F6F8FA"/>
-          </w:tcPr>
+          <w:tcPr/>
           <w:p>
             <w:pPr>
               <w:numPr>
                 <w:ilvl w:val="0"/>
-                <w:numId w:val="1073"/>
+                <w:numId w:val="1074"/>
               </w:numPr>
               <w:jc w:val="left"/>
             </w:pPr>
@@ -14935,7 +15474,9 @@
       </w:tr>
       <w:tr>
         <w:tc>
-          <w:tcPr/>
+          <w:tcPr>
+            <w:shd w:val="clear" w:color="auto" w:fill="F6F8FA"/>
+          </w:tcPr>
           <w:p>
             <w:pPr>
               <w:jc w:val="left"/>
@@ -14946,7 +15487,9 @@
           </w:p>
         </w:tc>
         <w:tc>
-          <w:tcPr/>
+          <w:tcPr>
+            <w:shd w:val="clear" w:color="auto" w:fill="F6F8FA"/>
+          </w:tcPr>
           <w:p>
             <w:pPr>
               <w:jc w:val="left"/>
@@ -14957,12 +15500,14 @@
           </w:p>
         </w:tc>
         <w:tc>
-          <w:tcPr/>
+          <w:tcPr>
+            <w:shd w:val="clear" w:color="auto" w:fill="F6F8FA"/>
+          </w:tcPr>
           <w:p>
             <w:pPr>
               <w:numPr>
                 <w:ilvl w:val="0"/>
-                <w:numId w:val="1074"/>
+                <w:numId w:val="1075"/>
               </w:numPr>
               <w:jc w:val="left"/>
             </w:pPr>
@@ -14989,9 +15534,7 @@
       </w:tr>
       <w:tr>
         <w:tc>
-          <w:tcPr>
-            <w:shd w:val="clear" w:color="auto" w:fill="F6F8FA"/>
-          </w:tcPr>
+          <w:tcPr/>
           <w:p>
             <w:pPr>
               <w:jc w:val="left"/>
@@ -15002,9 +15545,7 @@
           </w:p>
         </w:tc>
         <w:tc>
-          <w:tcPr>
-            <w:shd w:val="clear" w:color="auto" w:fill="F6F8FA"/>
-          </w:tcPr>
+          <w:tcPr/>
           <w:p>
             <w:pPr>
               <w:jc w:val="left"/>
@@ -15015,14 +15556,12 @@
           </w:p>
         </w:tc>
         <w:tc>
-          <w:tcPr>
-            <w:shd w:val="clear" w:color="auto" w:fill="F6F8FA"/>
-          </w:tcPr>
+          <w:tcPr/>
           <w:p>
             <w:pPr>
               <w:numPr>
                 <w:ilvl w:val="0"/>
-                <w:numId w:val="1075"/>
+                <w:numId w:val="1076"/>
               </w:numPr>
               <w:jc w:val="left"/>
             </w:pPr>
@@ -15064,7 +15603,9 @@
       </w:tr>
       <w:tr>
         <w:tc>
-          <w:tcPr/>
+          <w:tcPr>
+            <w:shd w:val="clear" w:color="auto" w:fill="F6F8FA"/>
+          </w:tcPr>
           <w:p>
             <w:pPr>
               <w:jc w:val="left"/>
@@ -15075,7 +15616,9 @@
           </w:p>
         </w:tc>
         <w:tc>
-          <w:tcPr/>
+          <w:tcPr>
+            <w:shd w:val="clear" w:color="auto" w:fill="F6F8FA"/>
+          </w:tcPr>
           <w:p>
             <w:pPr>
               <w:jc w:val="left"/>
@@ -15086,12 +15629,14 @@
           </w:p>
         </w:tc>
         <w:tc>
-          <w:tcPr/>
+          <w:tcPr>
+            <w:shd w:val="clear" w:color="auto" w:fill="F6F8FA"/>
+          </w:tcPr>
           <w:p>
             <w:pPr>
               <w:numPr>
                 <w:ilvl w:val="0"/>
-                <w:numId w:val="1076"/>
+                <w:numId w:val="1077"/>
               </w:numPr>
               <w:jc w:val="left"/>
             </w:pPr>
@@ -15118,58 +15663,13 @@
       </w:tr>
       <w:tr>
         <w:tc>
-          <w:tcPr>
-            <w:shd w:val="clear" w:color="auto" w:fill="F6F8FA"/>
-          </w:tcPr>
+          <w:tcPr/>
           <w:p>
             <w:pPr>
               <w:jc w:val="left"/>
             </w:pPr>
             <w:r>
               <w:t xml:space="preserve">3.8.1</w:t>
-            </w:r>
-          </w:p>
-        </w:tc>
-        <w:tc>
-          <w:tcPr>
-            <w:shd w:val="clear" w:color="auto" w:fill="F6F8FA"/>
-          </w:tcPr>
-          <w:p>
-            <w:pPr>
-              <w:jc w:val="left"/>
-            </w:pPr>
-            <w:r>
-              <w:t xml:space="preserve">2026-09-13</w:t>
-            </w:r>
-          </w:p>
-        </w:tc>
-        <w:tc>
-          <w:tcPr>
-            <w:shd w:val="clear" w:color="auto" w:fill="F6F8FA"/>
-          </w:tcPr>
-          <w:p>
-            <w:pPr>
-              <w:numPr>
-                <w:ilvl w:val="0"/>
-                <w:numId w:val="1077"/>
-              </w:numPr>
-              <w:jc w:val="left"/>
-            </w:pPr>
-            <w:r>
-              <w:t xml:space="preserve">End-to-end quality review: fixed testbook PDF metadata title, removed stray user DOCX from template dir, fixed round-trip.sh variable typo, updated stale references in AGENTS.md and README.md, committed testbook sample PDFs, set TZ for pandoc cover time consistency, widened pandoc version range.</w:t>
-            </w:r>
-          </w:p>
-        </w:tc>
-      </w:tr>
-      <w:tr>
-        <w:tc>
-          <w:tcPr/>
-          <w:p>
-            <w:pPr>
-              <w:jc w:val="left"/>
-            </w:pPr>
-            <w:r>
-              <w:t xml:space="preserve">3.8.0</w:t>
             </w:r>
           </w:p>
         </w:tc>
@@ -15195,7 +15695,7 @@
               <w:jc w:val="left"/>
             </w:pPr>
             <w:r>
-              <w:t xml:space="preserve">Removed Tips and Tricks chapter (tmux configuration) — required VS Code-specific keybindings that don’t generalize across terminal setups.</w:t>
+              <w:t xml:space="preserve">End-to-end quality review: fixed testbook PDF metadata title, removed stray user DOCX from template dir, fixed round-trip.sh variable typo, updated stale references in AGENTS.md and README.md, committed testbook sample PDFs, set TZ for pandoc cover time consistency, widened pandoc version range.</w:t>
             </w:r>
           </w:p>
         </w:tc>
@@ -15210,7 +15710,7 @@
               <w:jc w:val="left"/>
             </w:pPr>
             <w:r>
-              <w:t xml:space="preserve">3.7.0</w:t>
+              <w:t xml:space="preserve">3.8.0</w:t>
             </w:r>
           </w:p>
         </w:tc>
@@ -15223,7 +15723,7 @@
               <w:jc w:val="left"/>
             </w:pPr>
             <w:r>
-              <w:t xml:space="preserve">2026-09-12</w:t>
+              <w:t xml:space="preserve">2026-09-13</w:t>
             </w:r>
           </w:p>
         </w:tc>
@@ -15240,6 +15740,45 @@
               <w:jc w:val="left"/>
             </w:pPr>
             <w:r>
+              <w:t xml:space="preserve">Removed Tips and Tricks chapter (tmux configuration) — required VS Code-specific keybindings that don’t generalize across terminal setups.</w:t>
+            </w:r>
+          </w:p>
+        </w:tc>
+      </w:tr>
+      <w:tr>
+        <w:tc>
+          <w:tcPr/>
+          <w:p>
+            <w:pPr>
+              <w:jc w:val="left"/>
+            </w:pPr>
+            <w:r>
+              <w:t xml:space="preserve">3.7.0</w:t>
+            </w:r>
+          </w:p>
+        </w:tc>
+        <w:tc>
+          <w:tcPr/>
+          <w:p>
+            <w:pPr>
+              <w:jc w:val="left"/>
+            </w:pPr>
+            <w:r>
+              <w:t xml:space="preserve">2026-09-12</w:t>
+            </w:r>
+          </w:p>
+        </w:tc>
+        <w:tc>
+          <w:tcPr/>
+          <w:p>
+            <w:pPr>
+              <w:numPr>
+                <w:ilvl w:val="0"/>
+                <w:numId w:val="1080"/>
+              </w:numPr>
+              <w:jc w:val="left"/>
+            </w:pPr>
+            <w:r>
               <w:t xml:space="preserve">Added</w:t>
             </w:r>
             <w:r>
@@ -15292,7 +15831,9 @@
       </w:tr>
       <w:tr>
         <w:tc>
-          <w:tcPr/>
+          <w:tcPr>
+            <w:shd w:val="clear" w:color="auto" w:fill="F6F8FA"/>
+          </w:tcPr>
           <w:p>
             <w:pPr>
               <w:jc w:val="left"/>
@@ -15303,7 +15844,9 @@
           </w:p>
         </w:tc>
         <w:tc>
-          <w:tcPr/>
+          <w:tcPr>
+            <w:shd w:val="clear" w:color="auto" w:fill="F6F8FA"/>
+          </w:tcPr>
           <w:p>
             <w:pPr>
               <w:jc w:val="left"/>
@@ -15314,12 +15857,14 @@
           </w:p>
         </w:tc>
         <w:tc>
-          <w:tcPr/>
+          <w:tcPr>
+            <w:shd w:val="clear" w:color="auto" w:fill="F6F8FA"/>
+          </w:tcPr>
           <w:p>
             <w:pPr>
               <w:numPr>
                 <w:ilvl w:val="0"/>
-                <w:numId w:val="1080"/>
+                <w:numId w:val="1081"/>
               </w:numPr>
               <w:jc w:val="left"/>
             </w:pPr>
@@ -15376,9 +15921,7 @@
       </w:tr>
       <w:tr>
         <w:tc>
-          <w:tcPr>
-            <w:shd w:val="clear" w:color="auto" w:fill="F6F8FA"/>
-          </w:tcPr>
+          <w:tcPr/>
           <w:p>
             <w:pPr>
               <w:jc w:val="left"/>
@@ -15389,9 +15932,7 @@
           </w:p>
         </w:tc>
         <w:tc>
-          <w:tcPr>
-            <w:shd w:val="clear" w:color="auto" w:fill="F6F8FA"/>
-          </w:tcPr>
+          <w:tcPr/>
           <w:p>
             <w:pPr>
               <w:jc w:val="left"/>
@@ -15402,14 +15943,12 @@
           </w:p>
         </w:tc>
         <w:tc>
-          <w:tcPr>
-            <w:shd w:val="clear" w:color="auto" w:fill="F6F8FA"/>
-          </w:tcPr>
+          <w:tcPr/>
           <w:p>
             <w:pPr>
               <w:numPr>
                 <w:ilvl w:val="0"/>
-                <w:numId w:val="1081"/>
+                <w:numId w:val="1082"/>
               </w:numPr>
               <w:jc w:val="left"/>
             </w:pPr>
@@ -15487,7 +16026,9 @@
       </w:tr>
       <w:tr>
         <w:tc>
-          <w:tcPr/>
+          <w:tcPr>
+            <w:shd w:val="clear" w:color="auto" w:fill="F6F8FA"/>
+          </w:tcPr>
           <w:p>
             <w:pPr>
               <w:jc w:val="left"/>
@@ -15498,7 +16039,9 @@
           </w:p>
         </w:tc>
         <w:tc>
-          <w:tcPr/>
+          <w:tcPr>
+            <w:shd w:val="clear" w:color="auto" w:fill="F6F8FA"/>
+          </w:tcPr>
           <w:p>
             <w:pPr>
               <w:jc w:val="left"/>
@@ -15509,12 +16052,14 @@
           </w:p>
         </w:tc>
         <w:tc>
-          <w:tcPr/>
+          <w:tcPr>
+            <w:shd w:val="clear" w:color="auto" w:fill="F6F8FA"/>
+          </w:tcPr>
           <w:p>
             <w:pPr>
               <w:numPr>
                 <w:ilvl w:val="0"/>
-                <w:numId w:val="1082"/>
+                <w:numId w:val="1083"/>
               </w:numPr>
               <w:jc w:val="left"/>
             </w:pPr>
@@ -15541,7 +16086,7 @@
             <w:pPr>
               <w:numPr>
                 <w:ilvl w:val="0"/>
-                <w:numId w:val="1082"/>
+                <w:numId w:val="1083"/>
               </w:numPr>
               <w:jc w:val="left"/>
             </w:pPr>
@@ -15583,7 +16128,7 @@
             <w:pPr>
               <w:numPr>
                 <w:ilvl w:val="0"/>
-                <w:numId w:val="1082"/>
+                <w:numId w:val="1083"/>
               </w:numPr>
               <w:jc w:val="left"/>
             </w:pPr>
@@ -15595,9 +16140,7 @@
       </w:tr>
       <w:tr>
         <w:tc>
-          <w:tcPr>
-            <w:shd w:val="clear" w:color="auto" w:fill="F6F8FA"/>
-          </w:tcPr>
+          <w:tcPr/>
           <w:p>
             <w:pPr>
               <w:jc w:val="left"/>
@@ -15608,9 +16151,7 @@
           </w:p>
         </w:tc>
         <w:tc>
-          <w:tcPr>
-            <w:shd w:val="clear" w:color="auto" w:fill="F6F8FA"/>
-          </w:tcPr>
+          <w:tcPr/>
           <w:p>
             <w:pPr>
               <w:jc w:val="left"/>
@@ -15621,14 +16162,12 @@
           </w:p>
         </w:tc>
         <w:tc>
-          <w:tcPr>
-            <w:shd w:val="clear" w:color="auto" w:fill="F6F8FA"/>
-          </w:tcPr>
+          <w:tcPr/>
           <w:p>
             <w:pPr>
               <w:numPr>
                 <w:ilvl w:val="0"/>
-                <w:numId w:val="1083"/>
+                <w:numId w:val="1084"/>
               </w:numPr>
               <w:jc w:val="left"/>
             </w:pPr>
@@ -15655,7 +16194,7 @@
             <w:pPr>
               <w:numPr>
                 <w:ilvl w:val="0"/>
-                <w:numId w:val="1083"/>
+                <w:numId w:val="1084"/>
               </w:numPr>
               <w:jc w:val="left"/>
             </w:pPr>
@@ -15682,7 +16221,7 @@
             <w:pPr>
               <w:numPr>
                 <w:ilvl w:val="0"/>
-                <w:numId w:val="1083"/>
+                <w:numId w:val="1084"/>
               </w:numPr>
               <w:jc w:val="left"/>
             </w:pPr>
@@ -15694,7 +16233,7 @@
             <w:pPr>
               <w:numPr>
                 <w:ilvl w:val="0"/>
-                <w:numId w:val="1083"/>
+                <w:numId w:val="1084"/>
               </w:numPr>
               <w:jc w:val="left"/>
             </w:pPr>
@@ -15718,54 +16257,15 @@
       </w:tr>
       <w:tr>
         <w:tc>
-          <w:tcPr/>
+          <w:tcPr>
+            <w:shd w:val="clear" w:color="auto" w:fill="F6F8FA"/>
+          </w:tcPr>
           <w:p>
             <w:pPr>
               <w:jc w:val="left"/>
             </w:pPr>
             <w:r>
               <w:t xml:space="preserve">3.2.1</w:t>
-            </w:r>
-          </w:p>
-        </w:tc>
-        <w:tc>
-          <w:tcPr/>
-          <w:p>
-            <w:pPr>
-              <w:jc w:val="left"/>
-            </w:pPr>
-            <w:r>
-              <w:t xml:space="preserve">2026-09-11</w:t>
-            </w:r>
-          </w:p>
-        </w:tc>
-        <w:tc>
-          <w:tcPr/>
-          <w:p>
-            <w:pPr>
-              <w:numPr>
-                <w:ilvl w:val="0"/>
-                <w:numId w:val="1084"/>
-              </w:numPr>
-              <w:jc w:val="left"/>
-            </w:pPr>
-            <w:r>
-              <w:t xml:space="preserve">Renamed Chapter 7 from “Clean Up” to “Operations and Maintenance”. Added subsections for updating and uninstalling both the MaaS Gateway and the document templates. Added cloud resource cleanup as an optional subsection.</w:t>
-            </w:r>
-          </w:p>
-        </w:tc>
-      </w:tr>
-      <w:tr>
-        <w:tc>
-          <w:tcPr>
-            <w:shd w:val="clear" w:color="auto" w:fill="F6F8FA"/>
-          </w:tcPr>
-          <w:p>
-            <w:pPr>
-              <w:jc w:val="left"/>
-            </w:pPr>
-            <w:r>
-              <w:t xml:space="preserve">3.2.0</w:t>
             </w:r>
           </w:p>
         </w:tc>
@@ -15795,6 +16295,45 @@
               <w:jc w:val="left"/>
             </w:pPr>
             <w:r>
+              <w:t xml:space="preserve">Renamed Chapter 7 from “Clean Up” to “Operations and Maintenance”. Added subsections for updating and uninstalling both the MaaS Gateway and the document templates. Added cloud resource cleanup as an optional subsection.</w:t>
+            </w:r>
+          </w:p>
+        </w:tc>
+      </w:tr>
+      <w:tr>
+        <w:tc>
+          <w:tcPr/>
+          <w:p>
+            <w:pPr>
+              <w:jc w:val="left"/>
+            </w:pPr>
+            <w:r>
+              <w:t xml:space="preserve">3.2.0</w:t>
+            </w:r>
+          </w:p>
+        </w:tc>
+        <w:tc>
+          <w:tcPr/>
+          <w:p>
+            <w:pPr>
+              <w:jc w:val="left"/>
+            </w:pPr>
+            <w:r>
+              <w:t xml:space="preserve">2026-09-11</w:t>
+            </w:r>
+          </w:p>
+        </w:tc>
+        <w:tc>
+          <w:tcPr/>
+          <w:p>
+            <w:pPr>
+              <w:numPr>
+                <w:ilvl w:val="0"/>
+                <w:numId w:val="1086"/>
+              </w:numPr>
+              <w:jc w:val="left"/>
+            </w:pPr>
+            <w:r>
               <w:t xml:space="preserve">Added</w:t>
             </w:r>
             <w:r>
@@ -15856,7 +16395,7 @@
             <w:pPr>
               <w:numPr>
                 <w:ilvl w:val="0"/>
-                <w:numId w:val="1085"/>
+                <w:numId w:val="1086"/>
               </w:numPr>
               <w:jc w:val="left"/>
             </w:pPr>
@@ -15901,7 +16440,7 @@
             <w:pPr>
               <w:numPr>
                 <w:ilvl w:val="0"/>
-                <w:numId w:val="1085"/>
+                <w:numId w:val="1086"/>
               </w:numPr>
               <w:jc w:val="left"/>
             </w:pPr>
@@ -15913,54 +16452,15 @@
       </w:tr>
       <w:tr>
         <w:tc>
-          <w:tcPr/>
+          <w:tcPr>
+            <w:shd w:val="clear" w:color="auto" w:fill="F6F8FA"/>
+          </w:tcPr>
           <w:p>
             <w:pPr>
               <w:jc w:val="left"/>
             </w:pPr>
             <w:r>
               <w:t xml:space="preserve">3.1.2</w:t>
-            </w:r>
-          </w:p>
-        </w:tc>
-        <w:tc>
-          <w:tcPr/>
-          <w:p>
-            <w:pPr>
-              <w:jc w:val="left"/>
-            </w:pPr>
-            <w:r>
-              <w:t xml:space="preserve">2026-09-11</w:t>
-            </w:r>
-          </w:p>
-        </w:tc>
-        <w:tc>
-          <w:tcPr/>
-          <w:p>
-            <w:pPr>
-              <w:numPr>
-                <w:ilvl w:val="0"/>
-                <w:numId w:val="1086"/>
-              </w:numPr>
-              <w:jc w:val="left"/>
-            </w:pPr>
-            <w:r>
-              <w:t xml:space="preserve">Added output format guide to README.md: comparison table of PDF, Markdown, DOCX, and HTML with purpose, copy-paste quality, and limitations. Recommends Markdown for copy-paste.</w:t>
-            </w:r>
-          </w:p>
-        </w:tc>
-      </w:tr>
-      <w:tr>
-        <w:tc>
-          <w:tcPr>
-            <w:shd w:val="clear" w:color="auto" w:fill="F6F8FA"/>
-          </w:tcPr>
-          <w:p>
-            <w:pPr>
-              <w:jc w:val="left"/>
-            </w:pPr>
-            <w:r>
-              <w:t xml:space="preserve">3.1.1</w:t>
             </w:r>
           </w:p>
         </w:tc>
@@ -15990,6 +16490,45 @@
               <w:jc w:val="left"/>
             </w:pPr>
             <w:r>
+              <w:t xml:space="preserve">Added output format guide to README.md: comparison table of PDF, Markdown, DOCX, and HTML with purpose, copy-paste quality, and limitations. Recommends Markdown for copy-paste.</w:t>
+            </w:r>
+          </w:p>
+        </w:tc>
+      </w:tr>
+      <w:tr>
+        <w:tc>
+          <w:tcPr/>
+          <w:p>
+            <w:pPr>
+              <w:jc w:val="left"/>
+            </w:pPr>
+            <w:r>
+              <w:t xml:space="preserve">3.1.1</w:t>
+            </w:r>
+          </w:p>
+        </w:tc>
+        <w:tc>
+          <w:tcPr/>
+          <w:p>
+            <w:pPr>
+              <w:jc w:val="left"/>
+            </w:pPr>
+            <w:r>
+              <w:t xml:space="preserve">2026-09-11</w:t>
+            </w:r>
+          </w:p>
+        </w:tc>
+        <w:tc>
+          <w:tcPr/>
+          <w:p>
+            <w:pPr>
+              <w:numPr>
+                <w:ilvl w:val="0"/>
+                <w:numId w:val="1088"/>
+              </w:numPr>
+              <w:jc w:val="left"/>
+            </w:pPr>
+            <w:r>
               <w:t xml:space="preserve">Updated MaaS Gateway chapter to v1.10.9: non-interactive mode (</w:t>
             </w:r>
             <w:r>
@@ -16006,7 +16545,7 @@
             <w:pPr>
               <w:numPr>
                 <w:ilvl w:val="0"/>
-                <w:numId w:val="1087"/>
+                <w:numId w:val="1088"/>
               </w:numPr>
               <w:jc w:val="left"/>
             </w:pPr>
@@ -16048,7 +16587,7 @@
             <w:pPr>
               <w:numPr>
                 <w:ilvl w:val="0"/>
-                <w:numId w:val="1087"/>
+                <w:numId w:val="1088"/>
               </w:numPr>
               <w:jc w:val="left"/>
             </w:pPr>
@@ -16060,7 +16599,9 @@
       </w:tr>
       <w:tr>
         <w:tc>
-          <w:tcPr/>
+          <w:tcPr>
+            <w:shd w:val="clear" w:color="auto" w:fill="F6F8FA"/>
+          </w:tcPr>
           <w:p>
             <w:pPr>
               <w:jc w:val="left"/>
@@ -16071,7 +16612,9 @@
           </w:p>
         </w:tc>
         <w:tc>
-          <w:tcPr/>
+          <w:tcPr>
+            <w:shd w:val="clear" w:color="auto" w:fill="F6F8FA"/>
+          </w:tcPr>
           <w:p>
             <w:pPr>
               <w:jc w:val="left"/>
@@ -16082,12 +16625,14 @@
           </w:p>
         </w:tc>
         <w:tc>
-          <w:tcPr/>
+          <w:tcPr>
+            <w:shd w:val="clear" w:color="auto" w:fill="F6F8FA"/>
+          </w:tcPr>
           <w:p>
             <w:pPr>
               <w:numPr>
                 <w:ilvl w:val="0"/>
-                <w:numId w:val="1088"/>
+                <w:numId w:val="1089"/>
               </w:numPr>
               <w:jc w:val="left"/>
             </w:pPr>
@@ -16111,7 +16656,7 @@
             <w:pPr>
               <w:numPr>
                 <w:ilvl w:val="0"/>
-                <w:numId w:val="1088"/>
+                <w:numId w:val="1089"/>
               </w:numPr>
               <w:jc w:val="left"/>
             </w:pPr>
@@ -16153,7 +16698,7 @@
             <w:pPr>
               <w:numPr>
                 <w:ilvl w:val="0"/>
-                <w:numId w:val="1088"/>
+                <w:numId w:val="1089"/>
               </w:numPr>
               <w:jc w:val="left"/>
             </w:pPr>
@@ -16161,63 +16706,6 @@
               <w:t xml:space="preserve">Restructured chapters: moved SSH config and VS Code connection to new Chapter 4 (Install VS Code and Connect via Remote-SSH). Chapters 5—​7 renumbered.</w:t>
             </w:r>
           </w:p>
-          <w:p>
-            <w:pPr>
-              <w:numPr>
-                <w:ilvl w:val="0"/>
-                <w:numId w:val="1088"/>
-              </w:numPr>
-              <w:jc w:val="left"/>
-            </w:pPr>
-            <w:r>
-              <w:t xml:space="preserve">Added verification checklist tables to all 7 chapters.</w:t>
-            </w:r>
-          </w:p>
-          <w:p>
-            <w:pPr>
-              <w:numPr>
-                <w:ilvl w:val="0"/>
-                <w:numId w:val="1088"/>
-              </w:numPr>
-              <w:jc w:val="left"/>
-            </w:pPr>
-            <w:r>
-              <w:t xml:space="preserve">Added mandatory reboot warning in Chapter 2 (SSH port change). Added troubleshooting subsection in Chapter 4 with common SSH connection issues and ncat debugging commands.</w:t>
-            </w:r>
-          </w:p>
-        </w:tc>
-      </w:tr>
-      <w:tr>
-        <w:tc>
-          <w:tcPr>
-            <w:shd w:val="clear" w:color="auto" w:fill="F6F8FA"/>
-          </w:tcPr>
-          <w:p>
-            <w:pPr>
-              <w:jc w:val="left"/>
-            </w:pPr>
-            <w:r>
-              <w:t xml:space="preserve">3.0.1</w:t>
-            </w:r>
-          </w:p>
-        </w:tc>
-        <w:tc>
-          <w:tcPr>
-            <w:shd w:val="clear" w:color="auto" w:fill="F6F8FA"/>
-          </w:tcPr>
-          <w:p>
-            <w:pPr>
-              <w:jc w:val="left"/>
-            </w:pPr>
-            <w:r>
-              <w:t xml:space="preserve">2026-09-10</w:t>
-            </w:r>
-          </w:p>
-        </w:tc>
-        <w:tc>
-          <w:tcPr>
-            <w:shd w:val="clear" w:color="auto" w:fill="F6F8FA"/>
-          </w:tcPr>
           <w:p>
             <w:pPr>
               <w:numPr>
@@ -16227,7 +16715,19 @@
               <w:jc w:val="left"/>
             </w:pPr>
             <w:r>
-              <w:t xml:space="preserve">Minor fixes: test-filter.sh auto-discovery, build.sh help text, Makefile aggregate descriptions, 5-section comment correction, CHANGELOG version gap note, callout-in-code fix, CI font auto-discovery, dofile path comment, test-sync.sh header.</w:t>
+              <w:t xml:space="preserve">Added verification checklist tables to all 7 chapters.</w:t>
+            </w:r>
+          </w:p>
+          <w:p>
+            <w:pPr>
+              <w:numPr>
+                <w:ilvl w:val="0"/>
+                <w:numId w:val="1089"/>
+              </w:numPr>
+              <w:jc w:val="left"/>
+            </w:pPr>
+            <w:r>
+              <w:t xml:space="preserve">Added mandatory reboot warning in Chapter 2 (SSH port change). Added troubleshooting subsection in Chapter 4 with common SSH connection issues and ncat debugging commands.</w:t>
             </w:r>
           </w:p>
         </w:tc>
@@ -16240,18 +16740,18 @@
               <w:jc w:val="left"/>
             </w:pPr>
             <w:r>
-              <w:t xml:space="preserve">3.0.0</w:t>
-            </w:r>
-          </w:p>
-        </w:tc>
-        <w:tc>
-          <w:tcPr/>
-          <w:p>
-            <w:pPr>
-              <w:jc w:val="left"/>
-            </w:pPr>
-            <w:r>
-              <w:t xml:space="preserve">2026-09-09</w:t>
+              <w:t xml:space="preserve">3.0.1</w:t>
+            </w:r>
+          </w:p>
+        </w:tc>
+        <w:tc>
+          <w:tcPr/>
+          <w:p>
+            <w:pPr>
+              <w:jc w:val="left"/>
+            </w:pPr>
+            <w:r>
+              <w:t xml:space="preserve">2026-09-10</w:t>
             </w:r>
           </w:p>
         </w:tc>
@@ -16266,7 +16766,7 @@
               <w:jc w:val="left"/>
             </w:pPr>
             <w:r>
-              <w:t xml:space="preserve">Modular pipeline refactoring: shared Lua filter factory, shared DOCX fix logic, build system auto-discovery, unified format pipeline, GitHub Actions CI.</w:t>
+              <w:t xml:space="preserve">Minor fixes: test-filter.sh auto-discovery, build.sh help text, Makefile aggregate descriptions, 5-section comment correction, CHANGELOG version gap note, callout-in-code fix, CI font auto-discovery, dofile path comment, test-sync.sh header.</w:t>
             </w:r>
           </w:p>
         </w:tc>
@@ -16281,7 +16781,7 @@
               <w:jc w:val="left"/>
             </w:pPr>
             <w:r>
-              <w:t xml:space="preserve">2.16.0</w:t>
+              <w:t xml:space="preserve">3.0.0</w:t>
             </w:r>
           </w:p>
         </w:tc>
@@ -16294,7 +16794,7 @@
               <w:jc w:val="left"/>
             </w:pPr>
             <w:r>
-              <w:t xml:space="preserve">2026-09-05</w:t>
+              <w:t xml:space="preserve">2026-09-09</w:t>
             </w:r>
           </w:p>
         </w:tc>
@@ -16311,7 +16811,7 @@
               <w:jc w:val="left"/>
             </w:pPr>
             <w:r>
-              <w:t xml:space="preserve">Updated to match template v2.16.0 — Lua filter fixes, build system updates, and technical template parity improvements.</w:t>
+              <w:t xml:space="preserve">Modular pipeline refactoring: shared Lua filter factory, shared DOCX fix logic, build system auto-discovery, unified format pipeline, GitHub Actions CI.</w:t>
             </w:r>
           </w:p>
         </w:tc>
@@ -16324,18 +16824,18 @@
               <w:jc w:val="left"/>
             </w:pPr>
             <w:r>
-              <w:t xml:space="preserve">2.13.0</w:t>
-            </w:r>
-          </w:p>
-        </w:tc>
-        <w:tc>
-          <w:tcPr/>
-          <w:p>
-            <w:pPr>
-              <w:jc w:val="left"/>
-            </w:pPr>
-            <w:r>
-              <w:t xml:space="preserve">2026-08-24</w:t>
+              <w:t xml:space="preserve">2.16.0</w:t>
+            </w:r>
+          </w:p>
+        </w:tc>
+        <w:tc>
+          <w:tcPr/>
+          <w:p>
+            <w:pPr>
+              <w:jc w:val="left"/>
+            </w:pPr>
+            <w:r>
+              <w:t xml:space="preserve">2026-09-05</w:t>
             </w:r>
           </w:p>
         </w:tc>
@@ -16350,6 +16850,51 @@
               <w:jc w:val="left"/>
             </w:pPr>
             <w:r>
+              <w:t xml:space="preserve">Updated to match template v2.16.0 — Lua filter fixes, build system updates, and technical template parity improvements.</w:t>
+            </w:r>
+          </w:p>
+        </w:tc>
+      </w:tr>
+      <w:tr>
+        <w:tc>
+          <w:tcPr>
+            <w:shd w:val="clear" w:color="auto" w:fill="F6F8FA"/>
+          </w:tcPr>
+          <w:p>
+            <w:pPr>
+              <w:jc w:val="left"/>
+            </w:pPr>
+            <w:r>
+              <w:t xml:space="preserve">2.13.0</w:t>
+            </w:r>
+          </w:p>
+        </w:tc>
+        <w:tc>
+          <w:tcPr>
+            <w:shd w:val="clear" w:color="auto" w:fill="F6F8FA"/>
+          </w:tcPr>
+          <w:p>
+            <w:pPr>
+              <w:jc w:val="left"/>
+            </w:pPr>
+            <w:r>
+              <w:t xml:space="preserve">2026-08-24</w:t>
+            </w:r>
+          </w:p>
+        </w:tc>
+        <w:tc>
+          <w:tcPr>
+            <w:shd w:val="clear" w:color="auto" w:fill="F6F8FA"/>
+          </w:tcPr>
+          <w:p>
+            <w:pPr>
+              <w:numPr>
+                <w:ilvl w:val="0"/>
+                <w:numId w:val="1093"/>
+              </w:numPr>
+              <w:jc w:val="left"/>
+            </w:pPr>
+            <w:r>
               <w:t xml:space="preserve">Foundation refactoring Phase 4: make DOCX</w:t>
             </w:r>
             <w:r>
@@ -16417,9 +16962,7 @@
       </w:tr>
       <w:tr>
         <w:tc>
-          <w:tcPr>
-            <w:shd w:val="clear" w:color="auto" w:fill="F6F8FA"/>
-          </w:tcPr>
+          <w:tcPr/>
           <w:p>
             <w:pPr>
               <w:jc w:val="left"/>
@@ -16430,9 +16973,7 @@
           </w:p>
         </w:tc>
         <w:tc>
-          <w:tcPr>
-            <w:shd w:val="clear" w:color="auto" w:fill="F6F8FA"/>
-          </w:tcPr>
+          <w:tcPr/>
           <w:p>
             <w:pPr>
               <w:jc w:val="left"/>
@@ -16443,14 +16984,12 @@
           </w:p>
         </w:tc>
         <w:tc>
-          <w:tcPr>
-            <w:shd w:val="clear" w:color="auto" w:fill="F6F8FA"/>
-          </w:tcPr>
+          <w:tcPr/>
           <w:p>
             <w:pPr>
               <w:numPr>
                 <w:ilvl w:val="0"/>
-                <w:numId w:val="1093"/>
+                <w:numId w:val="1094"/>
               </w:numPr>
               <w:jc w:val="left"/>
             </w:pPr>
@@ -16612,7 +17151,9 @@
       </w:tr>
       <w:tr>
         <w:tc>
-          <w:tcPr/>
+          <w:tcPr>
+            <w:shd w:val="clear" w:color="auto" w:fill="F6F8FA"/>
+          </w:tcPr>
           <w:p>
             <w:pPr>
               <w:jc w:val="left"/>
@@ -16623,7 +17164,9 @@
           </w:p>
         </w:tc>
         <w:tc>
-          <w:tcPr/>
+          <w:tcPr>
+            <w:shd w:val="clear" w:color="auto" w:fill="F6F8FA"/>
+          </w:tcPr>
           <w:p>
             <w:pPr>
               <w:jc w:val="left"/>
@@ -16634,12 +17177,14 @@
           </w:p>
         </w:tc>
         <w:tc>
-          <w:tcPr/>
+          <w:tcPr>
+            <w:shd w:val="clear" w:color="auto" w:fill="F6F8FA"/>
+          </w:tcPr>
           <w:p>
             <w:pPr>
               <w:numPr>
                 <w:ilvl w:val="0"/>
-                <w:numId w:val="1094"/>
+                <w:numId w:val="1095"/>
               </w:numPr>
               <w:jc w:val="left"/>
             </w:pPr>
@@ -16705,9 +17250,7 @@
       </w:tr>
       <w:tr>
         <w:tc>
-          <w:tcPr>
-            <w:shd w:val="clear" w:color="auto" w:fill="F6F8FA"/>
-          </w:tcPr>
+          <w:tcPr/>
           <w:p>
             <w:pPr>
               <w:jc w:val="left"/>
@@ -16718,56 +17261,13 @@
           </w:p>
         </w:tc>
         <w:tc>
-          <w:tcPr>
-            <w:shd w:val="clear" w:color="auto" w:fill="F6F8FA"/>
-          </w:tcPr>
+          <w:tcPr/>
           <w:p>
             <w:pPr>
               <w:jc w:val="left"/>
             </w:pPr>
             <w:r>
               <w:t xml:space="preserve">2026-08-24</w:t>
-            </w:r>
-          </w:p>
-        </w:tc>
-        <w:tc>
-          <w:tcPr>
-            <w:shd w:val="clear" w:color="auto" w:fill="F6F8FA"/>
-          </w:tcPr>
-          <w:p>
-            <w:pPr>
-              <w:numPr>
-                <w:ilvl w:val="0"/>
-                <w:numId w:val="1095"/>
-              </w:numPr>
-              <w:jc w:val="left"/>
-            </w:pPr>
-            <w:r>
-              <w:t xml:space="preserve">Foundation refactoring Phase 1: sync cls version to project tag, fix stale doc references (L16 output count, L-range, setup-guide feature claim), add test-sync.sh for version consistency checking.</w:t>
-            </w:r>
-          </w:p>
-        </w:tc>
-      </w:tr>
-      <w:tr>
-        <w:tc>
-          <w:tcPr/>
-          <w:p>
-            <w:pPr>
-              <w:jc w:val="left"/>
-            </w:pPr>
-            <w:r>
-              <w:t xml:space="preserve">2.9.1</w:t>
-            </w:r>
-          </w:p>
-        </w:tc>
-        <w:tc>
-          <w:tcPr/>
-          <w:p>
-            <w:pPr>
-              <w:jc w:val="left"/>
-            </w:pPr>
-            <w:r>
-              <w:t xml:space="preserve">2026-08-23</w:t>
             </w:r>
           </w:p>
         </w:tc>
@@ -16782,6 +17282,51 @@
               <w:jc w:val="left"/>
             </w:pPr>
             <w:r>
+              <w:t xml:space="preserve">Foundation refactoring Phase 1: sync cls version to project tag, fix stale doc references (L16 output count, L-range, setup-guide feature claim), add test-sync.sh for version consistency checking.</w:t>
+            </w:r>
+          </w:p>
+        </w:tc>
+      </w:tr>
+      <w:tr>
+        <w:tc>
+          <w:tcPr>
+            <w:shd w:val="clear" w:color="auto" w:fill="F6F8FA"/>
+          </w:tcPr>
+          <w:p>
+            <w:pPr>
+              <w:jc w:val="left"/>
+            </w:pPr>
+            <w:r>
+              <w:t xml:space="preserve">2.9.1</w:t>
+            </w:r>
+          </w:p>
+        </w:tc>
+        <w:tc>
+          <w:tcPr>
+            <w:shd w:val="clear" w:color="auto" w:fill="F6F8FA"/>
+          </w:tcPr>
+          <w:p>
+            <w:pPr>
+              <w:jc w:val="left"/>
+            </w:pPr>
+            <w:r>
+              <w:t xml:space="preserve">2026-08-23</w:t>
+            </w:r>
+          </w:p>
+        </w:tc>
+        <w:tc>
+          <w:tcPr>
+            <w:shd w:val="clear" w:color="auto" w:fill="F6F8FA"/>
+          </w:tcPr>
+          <w:p>
+            <w:pPr>
+              <w:numPr>
+                <w:ilvl w:val="0"/>
+                <w:numId w:val="1097"/>
+              </w:numPr>
+              <w:jc w:val="left"/>
+            </w:pPr>
+            <w:r>
               <w:t xml:space="preserve">HTML and Markdown outputs now embed images as base64 data URIs. HTML uses pandoc</w:t>
             </w:r>
             <w:r>
@@ -16813,58 +17358,13 @@
       </w:tr>
       <w:tr>
         <w:tc>
-          <w:tcPr>
-            <w:shd w:val="clear" w:color="auto" w:fill="F6F8FA"/>
-          </w:tcPr>
+          <w:tcPr/>
           <w:p>
             <w:pPr>
               <w:jc w:val="left"/>
             </w:pPr>
             <w:r>
               <w:t xml:space="preserve">2.9.0</w:t>
-            </w:r>
-          </w:p>
-        </w:tc>
-        <w:tc>
-          <w:tcPr>
-            <w:shd w:val="clear" w:color="auto" w:fill="F6F8FA"/>
-          </w:tcPr>
-          <w:p>
-            <w:pPr>
-              <w:jc w:val="left"/>
-            </w:pPr>
-            <w:r>
-              <w:t xml:space="preserve">2026-08-23</w:t>
-            </w:r>
-          </w:p>
-        </w:tc>
-        <w:tc>
-          <w:tcPr>
-            <w:shd w:val="clear" w:color="auto" w:fill="F6F8FA"/>
-          </w:tcPr>
-          <w:p>
-            <w:pPr>
-              <w:numPr>
-                <w:ilvl w:val="0"/>
-                <w:numId w:val="1097"/>
-              </w:numPr>
-              <w:jc w:val="left"/>
-            </w:pPr>
-            <w:r>
-              <w:t xml:space="preserve">DOCX: fix content width (8504→9638tw, margins are 2cm not 3cm). Add footer page numbers. Style TOC heading (22pt bold + rule). Add hutable table width + fixed layout.</w:t>
-            </w:r>
-          </w:p>
-        </w:tc>
-      </w:tr>
-      <w:tr>
-        <w:tc>
-          <w:tcPr/>
-          <w:p>
-            <w:pPr>
-              <w:jc w:val="left"/>
-            </w:pPr>
-            <w:r>
-              <w:t xml:space="preserve">2.8.3</w:t>
             </w:r>
           </w:p>
         </w:tc>
@@ -16890,7 +17390,7 @@
               <w:jc w:val="left"/>
             </w:pPr>
             <w:r>
-              <w:t xml:space="preserve">DOCX fix: callout tables now have explicit width (8504tw) and fixed layout. Changelog section heading now uses custom H1 format (56pt number, red border, right tab) instead of pandoc’s default.</w:t>
+              <w:t xml:space="preserve">DOCX: fix content width (8504→9638tw, margins are 2cm not 3cm). Add footer page numbers. Style TOC heading (22pt bold + rule). Add hutable table width + fixed layout.</w:t>
             </w:r>
           </w:p>
         </w:tc>
@@ -16905,7 +17405,7 @@
               <w:jc w:val="left"/>
             </w:pPr>
             <w:r>
-              <w:t xml:space="preserve">2.8.2</w:t>
+              <w:t xml:space="preserve">2.8.3</w:t>
             </w:r>
           </w:p>
         </w:tc>
@@ -16935,7 +17435,7 @@
               <w:jc w:val="left"/>
             </w:pPr>
             <w:r>
-              <w:t xml:space="preserve">DOCX H1 heading: reverted table approach to paragraph with tab stop + red bottom border. Table broke navigation pane and TOC field. Paragraph preserves Heading1 style for navigation while matching PDF layout (number left, title right, red rule below).</w:t>
+              <w:t xml:space="preserve">DOCX fix: callout tables now have explicit width (8504tw) and fixed layout. Changelog section heading now uses custom H1 format (56pt number, red border, right tab) instead of pandoc’s default.</w:t>
             </w:r>
           </w:p>
         </w:tc>
@@ -16948,7 +17448,7 @@
               <w:jc w:val="left"/>
             </w:pPr>
             <w:r>
-              <w:t xml:space="preserve">2.8.1</w:t>
+              <w:t xml:space="preserve">2.8.2</w:t>
             </w:r>
           </w:p>
         </w:tc>
@@ -16974,7 +17474,7 @@
               <w:jc w:val="left"/>
             </w:pPr>
             <w:r>
-              <w:t xml:space="preserve">DOCX heading fix: text color reverted to black (was incorrectly changed to Huawei red in v2.8.0). H1 now uses a two-column table (number left, title right) with red bottom rule. H2-H4 use simple inline format (number + title, no right tab stop).</w:t>
+              <w:t xml:space="preserve">DOCX H1 heading: reverted table approach to paragraph with tab stop + red bottom border. Table broke navigation pane and TOC field. Paragraph preserves Heading1 style for navigation while matching PDF layout (number left, title right, red rule below).</w:t>
             </w:r>
           </w:p>
         </w:tc>
@@ -16989,7 +17489,7 @@
               <w:jc w:val="left"/>
             </w:pPr>
             <w:r>
-              <w:t xml:space="preserve">2.8.0</w:t>
+              <w:t xml:space="preserve">2.8.1</w:t>
             </w:r>
           </w:p>
         </w:tc>
@@ -17019,7 +17519,7 @@
               <w:jc w:val="left"/>
             </w:pPr>
             <w:r>
-              <w:t xml:space="preserve">DOCX output: match PDF styling --- heading colors (Huawei red), H1 number size (56pt), callout borders (left-only) and padding, changelog formatting (rules, bold version, italic date), caption style (9pt bold), badge style (8pt bold white on red), list indentation.</w:t>
+              <w:t xml:space="preserve">DOCX heading fix: text color reverted to black (was incorrectly changed to Huawei red in v2.8.0). H1 now uses a two-column table (number left, title right) with red bottom rule. H2-H4 use simple inline format (number + title, no right tab stop).</w:t>
             </w:r>
           </w:p>
         </w:tc>
@@ -17032,18 +17532,18 @@
               <w:jc w:val="left"/>
             </w:pPr>
             <w:r>
-              <w:t xml:space="preserve">2.7.1</w:t>
-            </w:r>
-          </w:p>
-        </w:tc>
-        <w:tc>
-          <w:tcPr/>
-          <w:p>
-            <w:pPr>
-              <w:jc w:val="left"/>
-            </w:pPr>
-            <w:r>
-              <w:t xml:space="preserve">2026-08-17</w:t>
+              <w:t xml:space="preserve">2.8.0</w:t>
+            </w:r>
+          </w:p>
+        </w:tc>
+        <w:tc>
+          <w:tcPr/>
+          <w:p>
+            <w:pPr>
+              <w:jc w:val="left"/>
+            </w:pPr>
+            <w:r>
+              <w:t xml:space="preserve">2026-08-23</w:t>
             </w:r>
           </w:p>
         </w:tc>
@@ -17058,6 +17558,51 @@
               <w:jc w:val="left"/>
             </w:pPr>
             <w:r>
+              <w:t xml:space="preserve">DOCX output: match PDF styling --- heading colors (Huawei red), H1 number size (56pt), callout borders (left-only) and padding, changelog formatting (rules, bold version, italic date), caption style (9pt bold), badge style (8pt bold white on red), list indentation.</w:t>
+            </w:r>
+          </w:p>
+        </w:tc>
+      </w:tr>
+      <w:tr>
+        <w:tc>
+          <w:tcPr>
+            <w:shd w:val="clear" w:color="auto" w:fill="F6F8FA"/>
+          </w:tcPr>
+          <w:p>
+            <w:pPr>
+              <w:jc w:val="left"/>
+            </w:pPr>
+            <w:r>
+              <w:t xml:space="preserve">2.7.1</w:t>
+            </w:r>
+          </w:p>
+        </w:tc>
+        <w:tc>
+          <w:tcPr>
+            <w:shd w:val="clear" w:color="auto" w:fill="F6F8FA"/>
+          </w:tcPr>
+          <w:p>
+            <w:pPr>
+              <w:jc w:val="left"/>
+            </w:pPr>
+            <w:r>
+              <w:t xml:space="preserve">2026-08-17</w:t>
+            </w:r>
+          </w:p>
+        </w:tc>
+        <w:tc>
+          <w:tcPr>
+            <w:shd w:val="clear" w:color="auto" w:fill="F6F8FA"/>
+          </w:tcPr>
+          <w:p>
+            <w:pPr>
+              <w:numPr>
+                <w:ilvl w:val="0"/>
+                <w:numId w:val="1103"/>
+              </w:numPr>
+              <w:jc w:val="left"/>
+            </w:pPr>
+            <w:r>
               <w:t xml:space="preserve">Rename project repository to all lowercase (</w:t>
             </w:r>
             <w:r>
@@ -17074,9 +17619,7 @@
       </w:tr>
       <w:tr>
         <w:tc>
-          <w:tcPr>
-            <w:shd w:val="clear" w:color="auto" w:fill="F6F8FA"/>
-          </w:tcPr>
+          <w:tcPr/>
           <w:p>
             <w:pPr>
               <w:jc w:val="left"/>
@@ -17087,9 +17630,7 @@
           </w:p>
         </w:tc>
         <w:tc>
-          <w:tcPr>
-            <w:shd w:val="clear" w:color="auto" w:fill="F6F8FA"/>
-          </w:tcPr>
+          <w:tcPr/>
           <w:p>
             <w:pPr>
               <w:jc w:val="left"/>
@@ -17100,14 +17641,12 @@
           </w:p>
         </w:tc>
         <w:tc>
-          <w:tcPr>
-            <w:shd w:val="clear" w:color="auto" w:fill="F6F8FA"/>
-          </w:tcPr>
+          <w:tcPr/>
           <w:p>
             <w:pPr>
               <w:numPr>
                 <w:ilvl w:val="0"/>
-                <w:numId w:val="1103"/>
+                <w:numId w:val="1104"/>
               </w:numPr>
               <w:jc w:val="left"/>
             </w:pPr>
@@ -17149,7 +17688,9 @@
       </w:tr>
       <w:tr>
         <w:tc>
-          <w:tcPr/>
+          <w:tcPr>
+            <w:shd w:val="clear" w:color="auto" w:fill="F6F8FA"/>
+          </w:tcPr>
           <w:p>
             <w:pPr>
               <w:jc w:val="left"/>
@@ -17160,7 +17701,9 @@
           </w:p>
         </w:tc>
         <w:tc>
-          <w:tcPr/>
+          <w:tcPr>
+            <w:shd w:val="clear" w:color="auto" w:fill="F6F8FA"/>
+          </w:tcPr>
           <w:p>
             <w:pPr>
               <w:jc w:val="left"/>
@@ -17171,12 +17714,14 @@
           </w:p>
         </w:tc>
         <w:tc>
-          <w:tcPr/>
+          <w:tcPr>
+            <w:shd w:val="clear" w:color="auto" w:fill="F6F8FA"/>
+          </w:tcPr>
           <w:p>
             <w:pPr>
               <w:numPr>
                 <w:ilvl w:val="0"/>
-                <w:numId w:val="1104"/>
+                <w:numId w:val="1105"/>
               </w:numPr>
               <w:jc w:val="left"/>
             </w:pPr>
@@ -17233,9 +17778,7 @@
       </w:tr>
       <w:tr>
         <w:tc>
-          <w:tcPr>
-            <w:shd w:val="clear" w:color="auto" w:fill="F6F8FA"/>
-          </w:tcPr>
+          <w:tcPr/>
           <w:p>
             <w:pPr>
               <w:jc w:val="left"/>
@@ -17246,9 +17789,7 @@
           </w:p>
         </w:tc>
         <w:tc>
-          <w:tcPr>
-            <w:shd w:val="clear" w:color="auto" w:fill="F6F8FA"/>
-          </w:tcPr>
+          <w:tcPr/>
           <w:p>
             <w:pPr>
               <w:jc w:val="left"/>
@@ -17259,14 +17800,12 @@
           </w:p>
         </w:tc>
         <w:tc>
-          <w:tcPr>
-            <w:shd w:val="clear" w:color="auto" w:fill="F6F8FA"/>
-          </w:tcPr>
+          <w:tcPr/>
           <w:p>
             <w:pPr>
               <w:numPr>
                 <w:ilvl w:val="0"/>
-                <w:numId w:val="1105"/>
+                <w:numId w:val="1106"/>
               </w:numPr>
               <w:jc w:val="left"/>
             </w:pPr>
@@ -17293,7 +17832,7 @@
             <w:pPr>
               <w:numPr>
                 <w:ilvl w:val="0"/>
-                <w:numId w:val="1105"/>
+                <w:numId w:val="1106"/>
               </w:numPr>
               <w:jc w:val="left"/>
             </w:pPr>
@@ -17320,54 +17859,15 @@
       </w:tr>
       <w:tr>
         <w:tc>
-          <w:tcPr/>
+          <w:tcPr>
+            <w:shd w:val="clear" w:color="auto" w:fill="F6F8FA"/>
+          </w:tcPr>
           <w:p>
             <w:pPr>
               <w:jc w:val="left"/>
             </w:pPr>
             <w:r>
               <w:t xml:space="preserve">2.5.1</w:t>
-            </w:r>
-          </w:p>
-        </w:tc>
-        <w:tc>
-          <w:tcPr/>
-          <w:p>
-            <w:pPr>
-              <w:jc w:val="left"/>
-            </w:pPr>
-            <w:r>
-              <w:t xml:space="preserve">2026-08-10</w:t>
-            </w:r>
-          </w:p>
-        </w:tc>
-        <w:tc>
-          <w:tcPr/>
-          <w:p>
-            <w:pPr>
-              <w:numPr>
-                <w:ilvl w:val="0"/>
-                <w:numId w:val="1106"/>
-              </w:numPr>
-              <w:jc w:val="left"/>
-            </w:pPr>
-            <w:r>
-              <w:t xml:space="preserve">H1 section title size reduced from 27pt to 20pt.</w:t>
-            </w:r>
-          </w:p>
-        </w:tc>
-      </w:tr>
-      <w:tr>
-        <w:tc>
-          <w:tcPr>
-            <w:shd w:val="clear" w:color="auto" w:fill="F6F8FA"/>
-          </w:tcPr>
-          <w:p>
-            <w:pPr>
-              <w:jc w:val="left"/>
-            </w:pPr>
-            <w:r>
-              <w:t xml:space="preserve">2.5.0</w:t>
             </w:r>
           </w:p>
         </w:tc>
@@ -17397,13 +17897,7 @@
               <w:jc w:val="left"/>
             </w:pPr>
             <w:r>
-              <w:t xml:space="preserve">Default image size increased: width 65% → 90% of text width,</w:t>
-            </w:r>
-            <w:r>
-              <w:t xml:space="preserve"> </w:t>
-            </w:r>
-            <w:r>
-              <w:t xml:space="preserve">height 40% → 50% of text height.</w:t>
+              <w:t xml:space="preserve">H1 section title size reduced from 27pt to 20pt.</w:t>
             </w:r>
           </w:p>
         </w:tc>
@@ -17416,7 +17910,7 @@
               <w:jc w:val="left"/>
             </w:pPr>
             <w:r>
-              <w:t xml:space="preserve">2.4.0</w:t>
+              <w:t xml:space="preserve">2.5.0</w:t>
             </w:r>
           </w:p>
         </w:tc>
@@ -17442,14 +17936,65 @@
               <w:jc w:val="left"/>
             </w:pPr>
             <w:r>
-              <w:t xml:space="preserve">Enlarged H1 section title (18pt → 27pt, 50% bigger).</w:t>
-            </w:r>
-          </w:p>
+              <w:t xml:space="preserve">Default image size increased: width 65% → 90% of text width,</w:t>
+            </w:r>
+            <w:r>
+              <w:t xml:space="preserve"> </w:t>
+            </w:r>
+            <w:r>
+              <w:t xml:space="preserve">height 40% → 50% of text height.</w:t>
+            </w:r>
+          </w:p>
+        </w:tc>
+      </w:tr>
+      <w:tr>
+        <w:tc>
+          <w:tcPr>
+            <w:shd w:val="clear" w:color="auto" w:fill="F6F8FA"/>
+          </w:tcPr>
+          <w:p>
+            <w:pPr>
+              <w:jc w:val="left"/>
+            </w:pPr>
+            <w:r>
+              <w:t xml:space="preserve">2.4.0</w:t>
+            </w:r>
+          </w:p>
+        </w:tc>
+        <w:tc>
+          <w:tcPr>
+            <w:shd w:val="clear" w:color="auto" w:fill="F6F8FA"/>
+          </w:tcPr>
+          <w:p>
+            <w:pPr>
+              <w:jc w:val="left"/>
+            </w:pPr>
+            <w:r>
+              <w:t xml:space="preserve">2026-08-10</w:t>
+            </w:r>
+          </w:p>
+        </w:tc>
+        <w:tc>
+          <w:tcPr>
+            <w:shd w:val="clear" w:color="auto" w:fill="F6F8FA"/>
+          </w:tcPr>
           <w:p>
             <w:pPr>
               <w:numPr>
                 <w:ilvl w:val="0"/>
-                <w:numId w:val="1108"/>
+                <w:numId w:val="1109"/>
+              </w:numPr>
+              <w:jc w:val="left"/>
+            </w:pPr>
+            <w:r>
+              <w:t xml:space="preserve">Enlarged H1 section title (18pt → 27pt, 50% bigger).</w:t>
+            </w:r>
+          </w:p>
+          <w:p>
+            <w:pPr>
+              <w:numPr>
+                <w:ilvl w:val="0"/>
+                <w:numId w:val="1109"/>
               </w:numPr>
               <w:jc w:val="left"/>
             </w:pPr>
@@ -17476,9 +18021,7 @@
       </w:tr>
       <w:tr>
         <w:tc>
-          <w:tcPr>
-            <w:shd w:val="clear" w:color="auto" w:fill="F6F8FA"/>
-          </w:tcPr>
+          <w:tcPr/>
           <w:p>
             <w:pPr>
               <w:jc w:val="left"/>
@@ -17489,9 +18032,7 @@
           </w:p>
         </w:tc>
         <w:tc>
-          <w:tcPr>
-            <w:shd w:val="clear" w:color="auto" w:fill="F6F8FA"/>
-          </w:tcPr>
+          <w:tcPr/>
           <w:p>
             <w:pPr>
               <w:jc w:val="left"/>
@@ -17502,14 +18043,12 @@
           </w:p>
         </w:tc>
         <w:tc>
-          <w:tcPr>
-            <w:shd w:val="clear" w:color="auto" w:fill="F6F8FA"/>
-          </w:tcPr>
+          <w:tcPr/>
           <w:p>
             <w:pPr>
               <w:numPr>
                 <w:ilvl w:val="0"/>
-                <w:numId w:val="1109"/>
+                <w:numId w:val="1110"/>
               </w:numPr>
               <w:jc w:val="left"/>
             </w:pPr>
@@ -17536,7 +18075,9 @@
       </w:tr>
       <w:tr>
         <w:tc>
-          <w:tcPr/>
+          <w:tcPr>
+            <w:shd w:val="clear" w:color="auto" w:fill="F6F8FA"/>
+          </w:tcPr>
           <w:p>
             <w:pPr>
               <w:jc w:val="left"/>
@@ -17547,7 +18088,9 @@
           </w:p>
         </w:tc>
         <w:tc>
-          <w:tcPr/>
+          <w:tcPr>
+            <w:shd w:val="clear" w:color="auto" w:fill="F6F8FA"/>
+          </w:tcPr>
           <w:p>
             <w:pPr>
               <w:jc w:val="left"/>
@@ -17558,12 +18101,14 @@
           </w:p>
         </w:tc>
         <w:tc>
-          <w:tcPr/>
+          <w:tcPr>
+            <w:shd w:val="clear" w:color="auto" w:fill="F6F8FA"/>
+          </w:tcPr>
           <w:p>
             <w:pPr>
               <w:numPr>
                 <w:ilvl w:val="0"/>
-                <w:numId w:val="1110"/>
+                <w:numId w:val="1111"/>
               </w:numPr>
               <w:jc w:val="left"/>
             </w:pPr>
@@ -17635,9 +18180,7 @@
       </w:tr>
       <w:tr>
         <w:tc>
-          <w:tcPr>
-            <w:shd w:val="clear" w:color="auto" w:fill="F6F8FA"/>
-          </w:tcPr>
+          <w:tcPr/>
           <w:p>
             <w:pPr>
               <w:jc w:val="left"/>
@@ -17648,9 +18191,7 @@
           </w:p>
         </w:tc>
         <w:tc>
-          <w:tcPr>
-            <w:shd w:val="clear" w:color="auto" w:fill="F6F8FA"/>
-          </w:tcPr>
+          <w:tcPr/>
           <w:p>
             <w:pPr>
               <w:jc w:val="left"/>
@@ -17661,14 +18202,12 @@
           </w:p>
         </w:tc>
         <w:tc>
-          <w:tcPr>
-            <w:shd w:val="clear" w:color="auto" w:fill="F6F8FA"/>
-          </w:tcPr>
+          <w:tcPr/>
           <w:p>
             <w:pPr>
               <w:numPr>
                 <w:ilvl w:val="0"/>
-                <w:numId w:val="1111"/>
+                <w:numId w:val="1112"/>
               </w:numPr>
               <w:jc w:val="left"/>
             </w:pPr>
@@ -17725,7 +18264,9 @@
       </w:tr>
       <w:tr>
         <w:tc>
-          <w:tcPr/>
+          <w:tcPr>
+            <w:shd w:val="clear" w:color="auto" w:fill="F6F8FA"/>
+          </w:tcPr>
           <w:p>
             <w:pPr>
               <w:jc w:val="left"/>
@@ -17736,7 +18277,9 @@
           </w:p>
         </w:tc>
         <w:tc>
-          <w:tcPr/>
+          <w:tcPr>
+            <w:shd w:val="clear" w:color="auto" w:fill="F6F8FA"/>
+          </w:tcPr>
           <w:p>
             <w:pPr>
               <w:jc w:val="left"/>
@@ -17747,12 +18290,14 @@
           </w:p>
         </w:tc>
         <w:tc>
-          <w:tcPr/>
+          <w:tcPr>
+            <w:shd w:val="clear" w:color="auto" w:fill="F6F8FA"/>
+          </w:tcPr>
           <w:p>
             <w:pPr>
               <w:numPr>
                 <w:ilvl w:val="0"/>
-                <w:numId w:val="1112"/>
+                <w:numId w:val="1113"/>
               </w:numPr>
               <w:jc w:val="left"/>
             </w:pPr>
@@ -17779,58 +18324,13 @@
       </w:tr>
       <w:tr>
         <w:tc>
-          <w:tcPr>
-            <w:shd w:val="clear" w:color="auto" w:fill="F6F8FA"/>
-          </w:tcPr>
+          <w:tcPr/>
           <w:p>
             <w:pPr>
               <w:jc w:val="left"/>
             </w:pPr>
             <w:r>
               <w:t xml:space="preserve">2.2.2</w:t>
-            </w:r>
-          </w:p>
-        </w:tc>
-        <w:tc>
-          <w:tcPr>
-            <w:shd w:val="clear" w:color="auto" w:fill="F6F8FA"/>
-          </w:tcPr>
-          <w:p>
-            <w:pPr>
-              <w:jc w:val="left"/>
-            </w:pPr>
-            <w:r>
-              <w:t xml:space="preserve">2026-08-08</w:t>
-            </w:r>
-          </w:p>
-        </w:tc>
-        <w:tc>
-          <w:tcPr>
-            <w:shd w:val="clear" w:color="auto" w:fill="F6F8FA"/>
-          </w:tcPr>
-          <w:p>
-            <w:pPr>
-              <w:numPr>
-                <w:ilvl w:val="0"/>
-                <w:numId w:val="1113"/>
-              </w:numPr>
-              <w:jc w:val="left"/>
-            </w:pPr>
-            <w:r>
-              <w:t xml:space="preserve">Fixed chapter reference in prerequisite (Chapter 3 → Chapter 4).</w:t>
-            </w:r>
-          </w:p>
-        </w:tc>
-      </w:tr>
-      <w:tr>
-        <w:tc>
-          <w:tcPr/>
-          <w:p>
-            <w:pPr>
-              <w:jc w:val="left"/>
-            </w:pPr>
-            <w:r>
-              <w:t xml:space="preserve">2.2.1</w:t>
             </w:r>
           </w:p>
         </w:tc>
@@ -17856,7 +18356,7 @@
               <w:jc w:val="left"/>
             </w:pPr>
             <w:r>
-              <w:t xml:space="preserve">Changed table and figure caption labels to black (was Huawei red).</w:t>
+              <w:t xml:space="preserve">Fixed chapter reference in prerequisite (Chapter 3 → Chapter 4).</w:t>
             </w:r>
           </w:p>
         </w:tc>
@@ -17871,7 +18371,7 @@
               <w:jc w:val="left"/>
             </w:pPr>
             <w:r>
-              <w:t xml:space="preserve">2.2.0</w:t>
+              <w:t xml:space="preserve">2.2.1</w:t>
             </w:r>
           </w:p>
         </w:tc>
@@ -17901,13 +18401,7 @@
               <w:jc w:val="left"/>
             </w:pPr>
             <w:r>
-              <w:t xml:space="preserve">Added Huawei-branded table styling: red header bar, alternating row</w:t>
-            </w:r>
-            <w:r>
-              <w:t xml:space="preserve"> </w:t>
-            </w:r>
-            <w:r>
-              <w:t xml:space="preserve">colors, and bordered cells.</w:t>
+              <w:t xml:space="preserve">Changed table and figure caption labels to black (was Huawei red).</w:t>
             </w:r>
           </w:p>
         </w:tc>
@@ -17920,18 +18414,18 @@
               <w:jc w:val="left"/>
             </w:pPr>
             <w:r>
-              <w:t xml:space="preserve">2.1.0</w:t>
-            </w:r>
-          </w:p>
-        </w:tc>
-        <w:tc>
-          <w:tcPr/>
-          <w:p>
-            <w:pPr>
-              <w:jc w:val="left"/>
-            </w:pPr>
-            <w:r>
-              <w:t xml:space="preserve">2026-08-06</w:t>
+              <w:t xml:space="preserve">2.2.0</w:t>
+            </w:r>
+          </w:p>
+        </w:tc>
+        <w:tc>
+          <w:tcPr/>
+          <w:p>
+            <w:pPr>
+              <w:jc w:val="left"/>
+            </w:pPr>
+            <w:r>
+              <w:t xml:space="preserve">2026-08-08</w:t>
             </w:r>
           </w:p>
         </w:tc>
@@ -17946,6 +18440,57 @@
               <w:jc w:val="left"/>
             </w:pPr>
             <w:r>
+              <w:t xml:space="preserve">Added Huawei-branded table styling: red header bar, alternating row</w:t>
+            </w:r>
+            <w:r>
+              <w:t xml:space="preserve"> </w:t>
+            </w:r>
+            <w:r>
+              <w:t xml:space="preserve">colors, and bordered cells.</w:t>
+            </w:r>
+          </w:p>
+        </w:tc>
+      </w:tr>
+      <w:tr>
+        <w:tc>
+          <w:tcPr>
+            <w:shd w:val="clear" w:color="auto" w:fill="F6F8FA"/>
+          </w:tcPr>
+          <w:p>
+            <w:pPr>
+              <w:jc w:val="left"/>
+            </w:pPr>
+            <w:r>
+              <w:t xml:space="preserve">2.1.0</w:t>
+            </w:r>
+          </w:p>
+        </w:tc>
+        <w:tc>
+          <w:tcPr>
+            <w:shd w:val="clear" w:color="auto" w:fill="F6F8FA"/>
+          </w:tcPr>
+          <w:p>
+            <w:pPr>
+              <w:jc w:val="left"/>
+            </w:pPr>
+            <w:r>
+              <w:t xml:space="preserve">2026-08-06</w:t>
+            </w:r>
+          </w:p>
+        </w:tc>
+        <w:tc>
+          <w:tcPr>
+            <w:shd w:val="clear" w:color="auto" w:fill="F6F8FA"/>
+          </w:tcPr>
+          <w:p>
+            <w:pPr>
+              <w:numPr>
+                <w:ilvl w:val="0"/>
+                <w:numId w:val="1117"/>
+              </w:numPr>
+              <w:jc w:val="left"/>
+            </w:pPr>
+            <w:r>
               <w:t xml:space="preserve">Updated ECS flavor to</w:t>
             </w:r>
             <w:r>
@@ -17968,7 +18513,7 @@
             <w:pPr>
               <w:numPr>
                 <w:ilvl w:val="0"/>
-                <w:numId w:val="1116"/>
+                <w:numId w:val="1117"/>
               </w:numPr>
               <w:jc w:val="left"/>
             </w:pPr>
@@ -17980,7 +18525,7 @@
             <w:pPr>
               <w:numPr>
                 <w:ilvl w:val="0"/>
-                <w:numId w:val="1116"/>
+                <w:numId w:val="1117"/>
               </w:numPr>
               <w:jc w:val="left"/>
             </w:pPr>
@@ -17992,7 +18537,7 @@
             <w:pPr>
               <w:numPr>
                 <w:ilvl w:val="0"/>
-                <w:numId w:val="1116"/>
+                <w:numId w:val="1117"/>
               </w:numPr>
               <w:jc w:val="left"/>
             </w:pPr>
@@ -18004,7 +18549,7 @@
             <w:pPr>
               <w:numPr>
                 <w:ilvl w:val="0"/>
-                <w:numId w:val="1116"/>
+                <w:numId w:val="1117"/>
               </w:numPr>
               <w:jc w:val="left"/>
             </w:pPr>
@@ -18016,7 +18561,7 @@
             <w:pPr>
               <w:numPr>
                 <w:ilvl w:val="0"/>
-                <w:numId w:val="1116"/>
+                <w:numId w:val="1117"/>
               </w:numPr>
               <w:jc w:val="left"/>
             </w:pPr>
@@ -18034,7 +18579,7 @@
             <w:pPr>
               <w:numPr>
                 <w:ilvl w:val="0"/>
-                <w:numId w:val="1116"/>
+                <w:numId w:val="1117"/>
               </w:numPr>
               <w:jc w:val="left"/>
             </w:pPr>
@@ -18083,7 +18628,7 @@
             <w:pPr>
               <w:numPr>
                 <w:ilvl w:val="0"/>
-                <w:numId w:val="1116"/>
+                <w:numId w:val="1117"/>
               </w:numPr>
               <w:jc w:val="left"/>
             </w:pPr>
@@ -18095,7 +18640,7 @@
             <w:pPr>
               <w:numPr>
                 <w:ilvl w:val="0"/>
-                <w:numId w:val="1116"/>
+                <w:numId w:val="1117"/>
               </w:numPr>
               <w:jc w:val="left"/>
             </w:pPr>
@@ -18146,7 +18691,7 @@
             <w:pPr>
               <w:numPr>
                 <w:ilvl w:val="0"/>
-                <w:numId w:val="1116"/>
+                <w:numId w:val="1117"/>
               </w:numPr>
               <w:jc w:val="left"/>
             </w:pPr>
@@ -18173,9 +18718,7 @@
       </w:tr>
       <w:tr>
         <w:tc>
-          <w:tcPr>
-            <w:shd w:val="clear" w:color="auto" w:fill="F6F8FA"/>
-          </w:tcPr>
+          <w:tcPr/>
           <w:p>
             <w:pPr>
               <w:jc w:val="left"/>
@@ -18186,9 +18729,7 @@
           </w:p>
         </w:tc>
         <w:tc>
-          <w:tcPr>
-            <w:shd w:val="clear" w:color="auto" w:fill="F6F8FA"/>
-          </w:tcPr>
+          <w:tcPr/>
           <w:p>
             <w:pPr>
               <w:jc w:val="left"/>
@@ -18199,14 +18740,12 @@
           </w:p>
         </w:tc>
         <w:tc>
-          <w:tcPr>
-            <w:shd w:val="clear" w:color="auto" w:fill="F6F8FA"/>
-          </w:tcPr>
+          <w:tcPr/>
           <w:p>
             <w:pPr>
               <w:numPr>
                 <w:ilvl w:val="0"/>
-                <w:numId w:val="1117"/>
+                <w:numId w:val="1118"/>
               </w:numPr>
               <w:jc w:val="left"/>
             </w:pPr>
@@ -18224,7 +18763,7 @@
             <w:pPr>
               <w:numPr>
                 <w:ilvl w:val="0"/>
-                <w:numId w:val="1117"/>
+                <w:numId w:val="1118"/>
               </w:numPr>
               <w:jc w:val="left"/>
             </w:pPr>
@@ -18278,7 +18817,7 @@
             <w:pPr>
               <w:numPr>
                 <w:ilvl w:val="0"/>
-                <w:numId w:val="1117"/>
+                <w:numId w:val="1118"/>
               </w:numPr>
               <w:jc w:val="left"/>
             </w:pPr>
@@ -18326,7 +18865,7 @@
             <w:pPr>
               <w:numPr>
                 <w:ilvl w:val="0"/>
-                <w:numId w:val="1117"/>
+                <w:numId w:val="1118"/>
               </w:numPr>
               <w:jc w:val="left"/>
             </w:pPr>
@@ -18347,7 +18886,9 @@
       </w:tr>
       <w:tr>
         <w:tc>
-          <w:tcPr/>
+          <w:tcPr>
+            <w:shd w:val="clear" w:color="auto" w:fill="F6F8FA"/>
+          </w:tcPr>
           <w:p>
             <w:pPr>
               <w:jc w:val="left"/>
@@ -18358,7 +18899,9 @@
           </w:p>
         </w:tc>
         <w:tc>
-          <w:tcPr/>
+          <w:tcPr>
+            <w:shd w:val="clear" w:color="auto" w:fill="F6F8FA"/>
+          </w:tcPr>
           <w:p>
             <w:pPr>
               <w:jc w:val="left"/>
@@ -18369,12 +18912,14 @@
           </w:p>
         </w:tc>
         <w:tc>
-          <w:tcPr/>
+          <w:tcPr>
+            <w:shd w:val="clear" w:color="auto" w:fill="F6F8FA"/>
+          </w:tcPr>
           <w:p>
             <w:pPr>
               <w:numPr>
                 <w:ilvl w:val="0"/>
-                <w:numId w:val="1118"/>
+                <w:numId w:val="1119"/>
               </w:numPr>
               <w:jc w:val="left"/>
             </w:pPr>
@@ -18386,7 +18931,7 @@
             <w:pPr>
               <w:numPr>
                 <w:ilvl w:val="0"/>
-                <w:numId w:val="1118"/>
+                <w:numId w:val="1119"/>
               </w:numPr>
               <w:jc w:val="left"/>
             </w:pPr>
@@ -18398,7 +18943,7 @@
             <w:pPr>
               <w:numPr>
                 <w:ilvl w:val="0"/>
-                <w:numId w:val="1118"/>
+                <w:numId w:val="1119"/>
               </w:numPr>
               <w:jc w:val="left"/>
             </w:pPr>
@@ -18410,7 +18955,7 @@
             <w:pPr>
               <w:numPr>
                 <w:ilvl w:val="0"/>
-                <w:numId w:val="1118"/>
+                <w:numId w:val="1119"/>
               </w:numPr>
               <w:jc w:val="left"/>
             </w:pPr>
@@ -18428,7 +18973,7 @@
             <w:pPr>
               <w:numPr>
                 <w:ilvl w:val="0"/>
-                <w:numId w:val="1118"/>
+                <w:numId w:val="1119"/>
               </w:numPr>
               <w:jc w:val="left"/>
             </w:pPr>
@@ -18440,7 +18985,7 @@
             <w:pPr>
               <w:numPr>
                 <w:ilvl w:val="0"/>
-                <w:numId w:val="1118"/>
+                <w:numId w:val="1119"/>
               </w:numPr>
               <w:jc w:val="left"/>
             </w:pPr>
@@ -19839,6 +20384,9 @@
     <w:abstractNumId w:val="991"/>
   </w:num>
   <w:num w:numId="1118">
+    <w:abstractNumId w:val="991"/>
+  </w:num>
+  <w:num w:numId="1119">
     <w:abstractNumId w:val="991"/>
   </w:num>
 </w:numbering>

</xml_diff>

<commit_message>
Clarify document lifecycle: no git for user documents (v6.11.1)
- All 4 SKILL.mds: new "Document lifecycle" section — documents are
  standalone deliverables; git never used for individual documents;
  :version: + changelog are the document's version control; documents
  under documents/ are gitignored, not repo content
- SKILL.md context lists: AGENTS.md git workflow scoped to template
  repo development only, never to the user's document
- AGENTS.md: new Scope section (template repo vs user documents);
  Workflow commit/push note; L17 clarified (template releases only)
</commit_message>
<xml_diff>
--- a/documents/setup-guide/setup-guide.docx
+++ b/documents/setup-guide/setup-guide.docx
@@ -84,7 +84,7 @@
           <w:b/>
           <w:sz w:val="24"/>
         </w:rPr>
-        <w:t xml:space="preserve">v6.11.0</w:t>
+        <w:t xml:space="preserve">v6.11.1</w:t>
       </w:r>
       <w:r>
         <w:rPr>
@@ -96,7 +96,7 @@
         <w:rPr>
           <w:sz w:val="24"/>
         </w:rPr>
-        <w:t xml:space="preserve">— September 21, 2026 14:35</w:t>
+        <w:t xml:space="preserve">— September 21, 2026 15:55</w:t>
       </w:r>
     </w:p>
     <w:sdt>
@@ -13854,7 +13854,7 @@
               <w:jc w:val="left"/>
             </w:pPr>
             <w:r>
-              <w:t xml:space="preserve">6.11.0</w:t>
+              <w:t xml:space="preserve">6.11.1</w:t>
             </w:r>
           </w:p>
         </w:tc>
@@ -13880,7 +13880,7 @@
               <w:jc w:val="left"/>
             </w:pPr>
             <w:r>
-              <w:t xml:space="preserve">Project-wide audit: converter robustness and cross-format consistency. Objectives roles now work in all forms — inline ([.general-objective] and [.objective]) and block (inside [.objectives]) — rendering language-aware labels (the block form previously crashed the build; the inline form silently dropped the label). The [.prerequisites] and [.stepbystep] roles attached to lists no longer drop items. Multi-author documents now list all authors. Conversion errors print a clean file:line message instead of a Ruby object dump. Unknown code languages (go, java, rust, terraform, …​) fall back to plain verbatim with a compile warning (was a hard error). DOCX/MD/HTML: codefile blocks ([.codefile,file=…​]) now inline the file content like the PDF, and admonition labels no longer corrupt NOTE:/TIP: lines inside code blocks. DOCX Fail/Falha badge backgrounds and plain-table borders now match the PDF colors. Shared class boilerplate extracted into the new huawei-base.cls base class (rendering unchanged). Watch mode survives compile errors; install reports failures instead of silent success; the /etc/LatexMk write is opt-in; build diagnostics are kept on failure; asciidoctor warnings now fail the build; a missing header logo warns instead of erroring. New test-pdf-compile.sh replaces the legacy test-filter stub; round-trip now validates the production build pipeline. Documentation corrected across README, AGENTS, and all SKILL files (objectives syntax, codefile example, supported languages, longhutable restriction, install requirements, pandoc range, security note).</w:t>
+              <w:t xml:space="preserve">Documentation: document lifecycle clarified. Documents created via the skills are standalone deliverables — git is never used for individual documents; the :version: attribute and changelog block are the document’s own version control. All four SKILL.md files gained a “Document lifecycle” section and now scope AGENTS.md’s git workflow to template repository development only. AGENTS.md gained a Scope section stating user documents are gitignored and never repository content, and L17 is clarified to apply to template releases only.</w:t>
             </w:r>
           </w:p>
         </w:tc>
@@ -13895,7 +13895,7 @@
               <w:jc w:val="left"/>
             </w:pPr>
             <w:r>
-              <w:t xml:space="preserve">6.10.0</w:t>
+              <w:t xml:space="preserve">6.11.0</w:t>
             </w:r>
           </w:p>
         </w:tc>
@@ -13908,7 +13908,7 @@
               <w:jc w:val="left"/>
             </w:pPr>
             <w:r>
-              <w:t xml:space="preserve">2026-09-21</w:t>
+              <w:t xml:space="preserve">2026-09-22</w:t>
             </w:r>
           </w:p>
         </w:tc>
@@ -13925,7 +13925,7 @@
               <w:jc w:val="left"/>
             </w:pPr>
             <w:r>
-              <w:t xml:space="preserve">Header logo, callout boxes, and note labels: DOCX header now shows the Huawei logo in the top-left corner (optional, driven by the :header-logo: attribute). DOCX admonitions (TIP, NOTE, WARNING) now render as styled callout boxes with colored backgrounds, left borders, and type labels — matching the PDF. PDF inline notes ([.note] role) now show a language-aware “Note:” label (was unlabeled italic text).</w:t>
+              <w:t xml:space="preserve">Project-wide audit: converter robustness and cross-format consistency. Objectives roles now work in all forms — inline ([.general-objective] and [.objective]) and block (inside [.objectives]) — rendering language-aware labels (the block form previously crashed the build; the inline form silently dropped the label). The [.prerequisites] and [.stepbystep] roles attached to lists no longer drop items. Multi-author documents now list all authors. Conversion errors print a clean file:line message instead of a Ruby object dump. Unknown code languages (go, java, rust, terraform, …​) fall back to plain verbatim with a compile warning (was a hard error). DOCX/MD/HTML: codefile blocks ([.codefile,file=…​]) now inline the file content like the PDF, and admonition labels no longer corrupt NOTE:/TIP: lines inside code blocks. DOCX Fail/Falha badge backgrounds and plain-table borders now match the PDF colors. Shared class boilerplate extracted into the new huawei-base.cls base class (rendering unchanged). Watch mode survives compile errors; install reports failures instead of silent success; the /etc/LatexMk write is opt-in; build diagnostics are kept on failure; asciidoctor warnings now fail the build; a missing header logo warns instead of erroring. New test-pdf-compile.sh replaces the legacy test-filter stub; round-trip now validates the production build pipeline. Documentation corrected across README, AGENTS, and all SKILL files (objectives syntax, codefile example, supported languages, longhutable restriction, install requirements, pandoc range, security note).</w:t>
             </w:r>
           </w:p>
         </w:tc>
@@ -13938,7 +13938,7 @@
               <w:jc w:val="left"/>
             </w:pPr>
             <w:r>
-              <w:t xml:space="preserve">6.9.2</w:t>
+              <w:t xml:space="preserve">6.10.0</w:t>
             </w:r>
           </w:p>
         </w:tc>
@@ -13964,7 +13964,7 @@
               <w:jc w:val="left"/>
             </w:pPr>
             <w:r>
-              <w:t xml:space="preserve">Fix DOCX body text alignment: paragraphs are now justified (matching the PDF LaTeX default), instead of left-aligned.</w:t>
+              <w:t xml:space="preserve">Header logo, callout boxes, and note labels: DOCX header now shows the Huawei logo in the top-left corner (optional, driven by the :header-logo: attribute). DOCX admonitions (TIP, NOTE, WARNING) now render as styled callout boxes with colored backgrounds, left borders, and type labels — matching the PDF. PDF inline notes ([.note] role) now show a language-aware “Note:” label (was unlabeled italic text).</w:t>
             </w:r>
           </w:p>
         </w:tc>
@@ -13979,7 +13979,7 @@
               <w:jc w:val="left"/>
             </w:pPr>
             <w:r>
-              <w:t xml:space="preserve">6.9.1</w:t>
+              <w:t xml:space="preserve">6.9.2</w:t>
             </w:r>
           </w:p>
         </w:tc>
@@ -14009,7 +14009,7 @@
               <w:jc w:val="left"/>
             </w:pPr>
             <w:r>
-              <w:t xml:space="preserve">Fix DOCX subsection number size: H2/H3/H4 section numbers were rendered at 56pt (same as H1) instead of matching the heading text size (18/16/14pt). The SectionNumber style is now unstyled (inherits heading size); 56pt is set directly on H1 number runs only.</w:t>
+              <w:t xml:space="preserve">Fix DOCX body text alignment: paragraphs are now justified (matching the PDF LaTeX default), instead of left-aligned.</w:t>
             </w:r>
           </w:p>
         </w:tc>
@@ -14022,7 +14022,7 @@
               <w:jc w:val="left"/>
             </w:pPr>
             <w:r>
-              <w:t xml:space="preserve">6.9.0</w:t>
+              <w:t xml:space="preserve">6.9.1</w:t>
             </w:r>
           </w:p>
         </w:tc>
@@ -14048,7 +14048,7 @@
               <w:jc w:val="left"/>
             </w:pPr>
             <w:r>
-              <w:t xml:space="preserve">TOC styling: the table-of-contents title rule is now Huawei red (was black) in both PDF and DOCX, matching the H1 heading red rules. DOCX TOC entries now match the PDF: level 1 bold 12pt, levels 2-3 normal 10pt, HarmonyOS Sans font. DOCX TOC depth increased from 2 to 3 levels (matching PDF tocdepth). Dead TOCTitle style removed from DOCX.</w:t>
+              <w:t xml:space="preserve">Fix DOCX subsection number size: H2/H3/H4 section numbers were rendered at 56pt (same as H1) instead of matching the heading text size (18/16/14pt). The SectionNumber style is now unstyled (inherits heading size); 56pt is set directly on H1 number runs only.</w:t>
             </w:r>
           </w:p>
         </w:tc>
@@ -14063,7 +14063,7 @@
               <w:jc w:val="left"/>
             </w:pPr>
             <w:r>
-              <w:t xml:space="preserve">6.8.3</w:t>
+              <w:t xml:space="preserve">6.9.0</w:t>
             </w:r>
           </w:p>
         </w:tc>
@@ -14076,7 +14076,7 @@
               <w:jc w:val="left"/>
             </w:pPr>
             <w:r>
-              <w:t xml:space="preserve">2026-09-20</w:t>
+              <w:t xml:space="preserve">2026-09-21</w:t>
             </w:r>
           </w:p>
         </w:tc>
@@ -14093,7 +14093,7 @@
               <w:jc w:val="left"/>
             </w:pPr>
             <w:r>
-              <w:t xml:space="preserve">Docs accuracy fix: the multi-format pipeline descriptions in README, AGENTS, and all four SKILL.md files now correctly separate the DOCX/Markdown path (pre-processor then docbook then pandoc) from the HTML path (pre-processor then asciidoctor html5) — the previous wording implied HTML also went through docbook and pandoc. Corrected a stale comment in the DOCX fixer.</w:t>
+              <w:t xml:space="preserve">TOC styling: the table-of-contents title rule is now Huawei red (was black) in both PDF and DOCX, matching the H1 heading red rules. DOCX TOC entries now match the PDF: level 1 bold 12pt, levels 2-3 normal 10pt, HarmonyOS Sans font. DOCX TOC depth increased from 2 to 3 levels (matching PDF tocdepth). Dead TOCTitle style removed from DOCX.</w:t>
             </w:r>
           </w:p>
         </w:tc>
@@ -14106,7 +14106,7 @@
               <w:jc w:val="left"/>
             </w:pPr>
             <w:r>
-              <w:t xml:space="preserve">6.8.2</w:t>
+              <w:t xml:space="preserve">6.8.3</w:t>
             </w:r>
           </w:p>
         </w:tc>
@@ -14132,7 +14132,7 @@
               <w:jc w:val="left"/>
             </w:pPr>
             <w:r>
-              <w:t xml:space="preserve">Documentation and cleanup: README, AGENTS, and all four SKILL.md files now describe the real multi-format pipeline (pre-processor + docx_fix --fix + --lang flag) instead of the pre-v6.4 asciidoctor-to-pandoc chain. DOCX TOC title is now right-aligned like the PDF (was targeting a dead style). Signature names render bold like the PDF. Dead code removed (unused Caption style, dead TOCTitle style, dead HTML badge CSS). The --template and --lang flags accept the equals form (--template=guide). Various stale comments corrected.</w:t>
+              <w:t xml:space="preserve">Docs accuracy fix: the multi-format pipeline descriptions in README, AGENTS, and all four SKILL.md files now correctly separate the DOCX/Markdown path (pre-processor then docbook then pandoc) from the HTML path (pre-processor then asciidoctor html5) — the previous wording implied HTML also went through docbook and pandoc. Corrected a stale comment in the DOCX fixer.</w:t>
             </w:r>
           </w:p>
         </w:tc>
@@ -14147,7 +14147,7 @@
               <w:jc w:val="left"/>
             </w:pPr>
             <w:r>
-              <w:t xml:space="preserve">6.8.1</w:t>
+              <w:t xml:space="preserve">6.8.2</w:t>
             </w:r>
           </w:p>
         </w:tc>
@@ -14177,7 +14177,7 @@
               <w:jc w:val="left"/>
             </w:pPr>
             <w:r>
-              <w:t xml:space="preserve">Quality-pass fixes for v6.8.0: non-technical covers no longer show a stray Date paragraph (regression from the meta-scan change); the technical cover table is no longer hijacked from the body when :nochangelog: is set (boundary check on the cover-table detection); the Version/Date/Scenario table now renders unconditionally like the PDF (was gated by :nochangelog:); empty cover tables are skipped when no report values are set; corrected the cover-element-order wording in the v6.8.0 changelog.</w:t>
+              <w:t xml:space="preserve">Documentation and cleanup: README, AGENTS, and all four SKILL.md files now describe the real multi-format pipeline (pre-processor + docx_fix --fix + --lang flag) instead of the pre-v6.4 asciidoctor-to-pandoc chain. DOCX TOC title is now right-aligned like the PDF (was targeting a dead style). Signature names render bold like the PDF. Dead code removed (unused Caption style, dead TOCTitle style, dead HTML badge CSS). The --template and --lang flags accept the equals form (--template=guide). Various stale comments corrected.</w:t>
             </w:r>
           </w:p>
         </w:tc>
@@ -14190,7 +14190,7 @@
               <w:jc w:val="left"/>
             </w:pPr>
             <w:r>
-              <w:t xml:space="preserve">6.8.0</w:t>
+              <w:t xml:space="preserve">6.8.1</w:t>
             </w:r>
           </w:p>
         </w:tc>
@@ -14216,7 +14216,7 @@
               <w:jc w:val="left"/>
             </w:pPr>
             <w:r>
-              <w:t xml:space="preserve">Technical report covers now match the PDF in DOCX/MD/HTML: the title uses the PDF’s 24pt size (was 36pt), the report type label appears below the title (the DOCX cover keeps the established title-first order; the PDF has label-then-title), and the Version/Date/Scenario table is rendered with the PDF’s red label column. The cover meta line now shows the report version and its set date (was the document version and the build date). Authors, when set, appear as a table row like the PDF.</w:t>
+              <w:t xml:space="preserve">Quality-pass fixes for v6.8.0: non-technical covers no longer show a stray Date paragraph (regression from the meta-scan change); the technical cover table is no longer hijacked from the body when :nochangelog: is set (boundary check on the cover-table detection); the Version/Date/Scenario table now renders unconditionally like the PDF (was gated by :nochangelog:); empty cover tables are skipped when no report values are set; corrected the cover-element-order wording in the v6.8.0 changelog.</w:t>
             </w:r>
           </w:p>
         </w:tc>
@@ -14231,7 +14231,7 @@
               <w:jc w:val="left"/>
             </w:pPr>
             <w:r>
-              <w:t xml:space="preserve">6.7.0</w:t>
+              <w:t xml:space="preserve">6.8.0</w:t>
             </w:r>
           </w:p>
         </w:tc>
@@ -14261,7 +14261,7 @@
               <w:jc w:val="left"/>
             </w:pPr>
             <w:r>
-              <w:t xml:space="preserve">Badge and language fidelity: DOCX badge pills now render black text like the PDF (was frame-colored), use the correct label case (Pass, not PASS), include the Portuguese POC labels (Atendido, Parcial, Falha, Ignorado), and render at native width per template (testbook badge text no longer shrinks). Portuguese signature greetings now match the PDF (At.te,), the POC classification label matches the full PDF wording, and the secondary-format table headers (stakeholders, closing record, test summary, changelog) are now language-aware. DOCX footers show Página in Portuguese documents. Cover dates no longer zero-pad the day.</w:t>
+              <w:t xml:space="preserve">Technical report covers now match the PDF in DOCX/MD/HTML: the title uses the PDF’s 24pt size (was 36pt), the report type label appears below the title (the DOCX cover keeps the established title-first order; the PDF has label-then-title), and the Version/Date/Scenario table is rendered with the PDF’s red label column. The cover meta line now shows the report version and its set date (was the document version and the build date). Authors, when set, appear as a table row like the PDF.</w:t>
             </w:r>
           </w:p>
         </w:tc>
@@ -14274,7 +14274,7 @@
               <w:jc w:val="left"/>
             </w:pPr>
             <w:r>
-              <w:t xml:space="preserve">6.6.1</w:t>
+              <w:t xml:space="preserve">6.7.0</w:t>
             </w:r>
           </w:p>
         </w:tc>
@@ -14300,7 +14300,7 @@
               <w:jc w:val="left"/>
             </w:pPr>
             <w:r>
-              <w:t xml:space="preserve">Quality-pass fixes for v6.6.0: the TESTCASE-marker strip now covers the entire DOCX fix run (a failure at any stage can no longer leave markers in the output file); the fixer resets its template state between in-process runs (the documented path-sniffing fallback works again); build.sh also cleans temporary files on interrupt signals; fixed a CHANGELOG typo.</w:t>
+              <w:t xml:space="preserve">Badge and language fidelity: DOCX badge pills now render black text like the PDF (was frame-colored), use the correct label case (Pass, not PASS), include the Portuguese POC labels (Atendido, Parcial, Falha, Ignorado), and render at native width per template (testbook badge text no longer shrinks). Portuguese signature greetings now match the PDF (At.te,), the POC classification label matches the full PDF wording, and the secondary-format table headers (stakeholders, closing record, test summary, changelog) are now language-aware. DOCX footers show Página in Portuguese documents. Cover dates no longer zero-pad the day.</w:t>
             </w:r>
           </w:p>
         </w:tc>
@@ -14315,7 +14315,7 @@
               <w:jc w:val="left"/>
             </w:pPr>
             <w:r>
-              <w:t xml:space="preserve">6.6.0</w:t>
+              <w:t xml:space="preserve">6.6.1</w:t>
             </w:r>
           </w:p>
         </w:tc>
@@ -14345,6 +14345,45 @@
               <w:jc w:val="left"/>
             </w:pPr>
             <w:r>
+              <w:t xml:space="preserve">Quality-pass fixes for v6.6.0: the TESTCASE-marker strip now covers the entire DOCX fix run (a failure at any stage can no longer leave markers in the output file); the fixer resets its template state between in-process runs (the documented path-sniffing fallback works again); build.sh also cleans temporary files on interrupt signals; fixed a CHANGELOG typo.</w:t>
+            </w:r>
+          </w:p>
+        </w:tc>
+      </w:tr>
+      <w:tr>
+        <w:tc>
+          <w:tcPr/>
+          <w:p>
+            <w:pPr>
+              <w:jc w:val="left"/>
+            </w:pPr>
+            <w:r>
+              <w:t xml:space="preserve">6.6.0</w:t>
+            </w:r>
+          </w:p>
+        </w:tc>
+        <w:tc>
+          <w:tcPr/>
+          <w:p>
+            <w:pPr>
+              <w:jc w:val="left"/>
+            </w:pPr>
+            <w:r>
+              <w:t xml:space="preserve">2026-09-20</w:t>
+            </w:r>
+          </w:p>
+        </w:tc>
+        <w:tc>
+          <w:tcPr/>
+          <w:p>
+            <w:pPr>
+              <w:numPr>
+                <w:ilvl w:val="0"/>
+                <w:numId w:val="1054"/>
+              </w:numPr>
+              <w:jc w:val="left"/>
+            </w:pPr>
+            <w:r>
               <w:t xml:space="preserve">Pipeline robustness: DOCX post-processing now fails loudly when content styling errors occur (TESTCASE markers can no longer leak into output); the DOCX fixer takes an explicit</w:t>
             </w:r>
             <w:r>
@@ -14367,54 +14406,15 @@
       </w:tr>
       <w:tr>
         <w:tc>
-          <w:tcPr/>
+          <w:tcPr>
+            <w:shd w:val="clear" w:color="auto" w:fill="F6F8FA"/>
+          </w:tcPr>
           <w:p>
             <w:pPr>
               <w:jc w:val="left"/>
             </w:pPr>
             <w:r>
               <w:t xml:space="preserve">6.5.2</w:t>
-            </w:r>
-          </w:p>
-        </w:tc>
-        <w:tc>
-          <w:tcPr/>
-          <w:p>
-            <w:pPr>
-              <w:jc w:val="left"/>
-            </w:pPr>
-            <w:r>
-              <w:t xml:space="preserve">2026-09-20</w:t>
-            </w:r>
-          </w:p>
-        </w:tc>
-        <w:tc>
-          <w:tcPr/>
-          <w:p>
-            <w:pPr>
-              <w:numPr>
-                <w:ilvl w:val="0"/>
-                <w:numId w:val="1054"/>
-              </w:numPr>
-              <w:jc w:val="left"/>
-            </w:pPr>
-            <w:r>
-              <w:t xml:space="preserve">Quality-pass fixes for v6.5.1: LaTeX quote conversion now handles only paired quotes (quote characters inside code arguments are no longer corrupted); signature cells containing escaped ampersands are no longer split; round-trip HTML generation guards the asciidoctor-diagram dependency and fails loudly when generation fails; pre-processor unit tests now cover pipe escaping in all five table handlers.</w:t>
-            </w:r>
-          </w:p>
-        </w:tc>
-      </w:tr>
-      <w:tr>
-        <w:tc>
-          <w:tcPr>
-            <w:shd w:val="clear" w:color="auto" w:fill="F6F8FA"/>
-          </w:tcPr>
-          <w:p>
-            <w:pPr>
-              <w:jc w:val="left"/>
-            </w:pPr>
-            <w:r>
-              <w:t xml:space="preserve">6.5.1</w:t>
             </w:r>
           </w:p>
         </w:tc>
@@ -14444,7 +14444,7 @@
               <w:jc w:val="left"/>
             </w:pPr>
             <w:r>
-              <w:t xml:space="preserve">Fixed DOCX/MD/HTML output: tables are no longer corrupted when changelog, signature, or summary content contains a pipe character (“|”). Badge text is now preserved in DOCX/MD/HTML — a “Ready” badge renders “Ready” instead of “[NEW]”. Multi-item changelog entries render as bullet lists instead of being joined with a literal “+”. POC documents now include the changelog in DOCX/MD/HTML. The :noanswers: attribute now hides test results and remarks in DOCX/MD/HTML, matching the PDF. Inline LaTeX (monospace text, arrows, LaTeX quotes) no longer leaks from changelog entries. The test suite now exercises the real build pipeline (pre-processor wired into round-trip and DOCX tests), with new pre-processor unit tests.</w:t>
+              <w:t xml:space="preserve">Quality-pass fixes for v6.5.1: LaTeX quote conversion now handles only paired quotes (quote characters inside code arguments are no longer corrupted); signature cells containing escaped ampersands are no longer split; round-trip HTML generation guards the asciidoctor-diagram dependency and fails loudly when generation fails; pre-processor unit tests now cover pipe escaping in all five table handlers.</w:t>
             </w:r>
           </w:p>
         </w:tc>
@@ -14457,7 +14457,7 @@
               <w:jc w:val="left"/>
             </w:pPr>
             <w:r>
-              <w:t xml:space="preserve">6.5.0</w:t>
+              <w:t xml:space="preserve">6.5.1</w:t>
             </w:r>
           </w:p>
         </w:tc>
@@ -14483,7 +14483,7 @@
               <w:jc w:val="left"/>
             </w:pPr>
             <w:r>
-              <w:t xml:space="preserve">Evidence checklist simplified to plain bullets in both PDF and DOCX (checkbox markers removed for compatibility). Planned Activities list in DOCX now uses Word’s native lower-roman numbering (i., ii., iii.) matching the PDF. Badges in DOCX replaced with exact-replica PNG pill images (rounded, colored frame and background, bold text) matching the PDF \ huaweibadge look — assets committed to the repo. Signature blocks in DOCX no longer show literal + symbols (proper hard line breaks).</w:t>
+              <w:t xml:space="preserve">Fixed DOCX/MD/HTML output: tables are no longer corrupted when changelog, signature, or summary content contains a pipe character (“|”). Badge text is now preserved in DOCX/MD/HTML — a “Ready” badge renders “Ready” instead of “[NEW]”. Multi-item changelog entries render as bullet lists instead of being joined with a literal “+”. POC documents now include the changelog in DOCX/MD/HTML. The :noanswers: attribute now hides test results and remarks in DOCX/MD/HTML, matching the PDF. Inline LaTeX (monospace text, arrows, LaTeX quotes) no longer leaks from changelog entries. The test suite now exercises the real build pipeline (pre-processor wired into round-trip and DOCX tests), with new pre-processor unit tests.</w:t>
             </w:r>
           </w:p>
         </w:tc>
@@ -14498,7 +14498,7 @@
               <w:jc w:val="left"/>
             </w:pPr>
             <w:r>
-              <w:t xml:space="preserve">6.4.7</w:t>
+              <w:t xml:space="preserve">6.5.0</w:t>
             </w:r>
           </w:p>
         </w:tc>
@@ -14528,7 +14528,7 @@
               <w:jc w:val="left"/>
             </w:pPr>
             <w:r>
-              <w:t xml:space="preserve">Section titles in DOCX now match the PDF heading design: the big section number (56pt) sits on the left, the title text is pushed to the right edge (a right tab stop mimics the LaTeX \ hfill), and the red rule runs below — previously the title sat left-aligned next to a small number. Applies to all templates.</w:t>
+              <w:t xml:space="preserve">Evidence checklist simplified to plain bullets in both PDF and DOCX (checkbox markers removed for compatibility). Planned Activities list in DOCX now uses Word’s native lower-roman numbering (i., ii., iii.) matching the PDF. Badges in DOCX replaced with exact-replica PNG pill images (rounded, colored frame and background, bold text) matching the PDF \ huaweibadge look — assets committed to the repo. Signature blocks in DOCX no longer show literal + symbols (proper hard line breaks).</w:t>
             </w:r>
           </w:p>
         </w:tc>
@@ -14541,7 +14541,7 @@
               <w:jc w:val="left"/>
             </w:pPr>
             <w:r>
-              <w:t xml:space="preserve">6.4.6</w:t>
+              <w:t xml:space="preserve">6.4.7</w:t>
             </w:r>
           </w:p>
         </w:tc>
@@ -14567,7 +14567,7 @@
               <w:jc w:val="left"/>
             </w:pPr>
             <w:r>
-              <w:t xml:space="preserve">Code blocks inside test cases no longer break the red left rule in DOCX — the code style’s left indent (which jogged the rule) is reset inside test case blocks, and code blocks now show the PDF’s code box (gray background with thin border on top, bottom, and right, red rule continuing on the left).</w:t>
+              <w:t xml:space="preserve">Section titles in DOCX now match the PDF heading design: the big section number (56pt) sits on the left, the title text is pushed to the right edge (a right tab stop mimics the LaTeX \ hfill), and the red rule runs below — previously the title sat left-aligned next to a small number. Applies to all templates.</w:t>
             </w:r>
           </w:p>
         </w:tc>
@@ -14582,7 +14582,7 @@
               <w:jc w:val="left"/>
             </w:pPr>
             <w:r>
-              <w:t xml:space="preserve">6.4.5</w:t>
+              <w:t xml:space="preserve">6.4.6</w:t>
             </w:r>
           </w:p>
         </w:tc>
@@ -14612,7 +14612,7 @@
               <w:jc w:val="left"/>
             </w:pPr>
             <w:r>
-              <w:t xml:space="preserve">DOCX polish pass: all captions centered (matching the PDF), vertical spacing between blocks matched to the LaTeX rhythm (medskip/smallskip around captions, field bars, and steps), and test steps now render as separate paragraphs each with the red bold number (previously merged into one paragraph).</w:t>
+              <w:t xml:space="preserve">Code blocks inside test cases no longer break the red left rule in DOCX — the code style’s left indent (which jogged the rule) is reset inside test case blocks, and code blocks now show the PDF’s code box (gray background with thin border on top, bottom, and right, red rule continuing on the left).</w:t>
             </w:r>
           </w:p>
         </w:tc>
@@ -14625,7 +14625,7 @@
               <w:jc w:val="left"/>
             </w:pPr>
             <w:r>
-              <w:t xml:space="preserve">6.4.4</w:t>
+              <w:t xml:space="preserve">6.4.5</w:t>
             </w:r>
           </w:p>
         </w:tc>
@@ -14651,7 +14651,7 @@
               <w:jc w:val="left"/>
             </w:pPr>
             <w:r>
-              <w:t xml:space="preserve">DOCX covers now show the logo, cover text, and version/date/time meta line like the PDF. Test case blocks in DOCX get the PDF’s visual wrapper: red left rule, red field header bars, and red step numbers. Captions follow the PDF ordering system in DOCX, MD, and HTML (Table/Diagram/Figure/Testcase N: with bold symbol). Portuguese PDFs now label diagrams "Diagrama N:" (was hardcoded English "Diagram"). Markdown and HTML output no longer leaks raw LaTeX from passthrough blocks — the DOCX pre-processor now feeds those pipelines too.</w:t>
+              <w:t xml:space="preserve">DOCX polish pass: all captions centered (matching the PDF), vertical spacing between blocks matched to the LaTeX rhythm (medskip/smallskip around captions, field bars, and steps), and test steps now render as separate paragraphs each with the red bold number (previously merged into one paragraph).</w:t>
             </w:r>
           </w:p>
         </w:tc>
@@ -14666,7 +14666,7 @@
               <w:jc w:val="left"/>
             </w:pPr>
             <w:r>
-              <w:t xml:space="preserve">6.4.3</w:t>
+              <w:t xml:space="preserve">6.4.4</w:t>
             </w:r>
           </w:p>
         </w:tc>
@@ -14696,7 +14696,7 @@
               <w:jc w:val="left"/>
             </w:pPr>
             <w:r>
-              <w:t xml:space="preserve">Testbook and POC DOCX output now matches the PDF much more closely: native table of contents (language-aware, auto-populated), each section starts on a new page, embedded images and diagrams (PlantUML/Graphviz rendered), white-on-red table headers, cover version line under the title, centered test case captions, and plain black rules for signature grids.</w:t>
+              <w:t xml:space="preserve">DOCX covers now show the logo, cover text, and version/date/time meta line like the PDF. Test case blocks in DOCX get the PDF’s visual wrapper: red left rule, red field header bars, and red step numbers. Captions follow the PDF ordering system in DOCX, MD, and HTML (Table/Diagram/Figure/Testcase N: with bold symbol). Portuguese PDFs now label diagrams "Diagrama N:" (was hardcoded English "Diagram"). Markdown and HTML output no longer leaks raw LaTeX from passthrough blocks — the DOCX pre-processor now feeds those pipelines too.</w:t>
             </w:r>
           </w:p>
         </w:tc>
@@ -14709,7 +14709,7 @@
               <w:jc w:val="left"/>
             </w:pPr>
             <w:r>
-              <w:t xml:space="preserve">6.4.2</w:t>
+              <w:t xml:space="preserve">6.4.3</w:t>
             </w:r>
           </w:p>
         </w:tc>
@@ -14735,7 +14735,7 @@
               <w:jc w:val="left"/>
             </w:pPr>
             <w:r>
-              <w:t xml:space="preserve">DOCX output for POC and testbook templates now includes all passthrough content (stakeholders, closing record, signatures, test cases, test summary, changelog) via a new pre-processor. Fixed dropped Test Scope fields in testbook DOCX output.</w:t>
+              <w:t xml:space="preserve">Testbook and POC DOCX output now matches the PDF much more closely: native table of contents (language-aware, auto-populated), each section starts on a new page, embedded images and diagrams (PlantUML/Graphviz rendered), white-on-red table headers, cover version line under the title, centered test case captions, and plain black rules for signature grids.</w:t>
             </w:r>
           </w:p>
         </w:tc>
@@ -14750,7 +14750,7 @@
               <w:jc w:val="left"/>
             </w:pPr>
             <w:r>
-              <w:t xml:space="preserve">6.4.0</w:t>
+              <w:t xml:space="preserve">6.4.2</w:t>
             </w:r>
           </w:p>
         </w:tc>
@@ -14780,6 +14780,45 @@
               <w:jc w:val="left"/>
             </w:pPr>
             <w:r>
+              <w:t xml:space="preserve">DOCX output for POC and testbook templates now includes all passthrough content (stakeholders, closing record, signatures, test cases, test summary, changelog) via a new pre-processor. Fixed dropped Test Scope fields in testbook DOCX output.</w:t>
+            </w:r>
+          </w:p>
+        </w:tc>
+      </w:tr>
+      <w:tr>
+        <w:tc>
+          <w:tcPr/>
+          <w:p>
+            <w:pPr>
+              <w:jc w:val="left"/>
+            </w:pPr>
+            <w:r>
+              <w:t xml:space="preserve">6.4.0</w:t>
+            </w:r>
+          </w:p>
+        </w:tc>
+        <w:tc>
+          <w:tcPr/>
+          <w:p>
+            <w:pPr>
+              <w:jc w:val="left"/>
+            </w:pPr>
+            <w:r>
+              <w:t xml:space="preserve">2026-09-20</w:t>
+            </w:r>
+          </w:p>
+        </w:tc>
+        <w:tc>
+          <w:tcPr/>
+          <w:p>
+            <w:pPr>
+              <w:numPr>
+                <w:ilvl w:val="0"/>
+                <w:numId w:val="1064"/>
+              </w:numPr>
+              <w:jc w:val="left"/>
+            </w:pPr>
+            <w:r>
               <w:t xml:space="preserve">Fixed changelog dates — replaced</w:t>
             </w:r>
             <w:r>
@@ -14802,54 +14841,15 @@
       </w:tr>
       <w:tr>
         <w:tc>
-          <w:tcPr/>
+          <w:tcPr>
+            <w:shd w:val="clear" w:color="auto" w:fill="F6F8FA"/>
+          </w:tcPr>
           <w:p>
             <w:pPr>
               <w:jc w:val="left"/>
             </w:pPr>
             <w:r>
               <w:t xml:space="preserve">5.1.1</w:t>
-            </w:r>
-          </w:p>
-        </w:tc>
-        <w:tc>
-          <w:tcPr/>
-          <w:p>
-            <w:pPr>
-              <w:jc w:val="left"/>
-            </w:pPr>
-            <w:r>
-              <w:t xml:space="preserve">2026-09-14</w:t>
-            </w:r>
-          </w:p>
-        </w:tc>
-        <w:tc>
-          <w:tcPr/>
-          <w:p>
-            <w:pPr>
-              <w:numPr>
-                <w:ilvl w:val="0"/>
-                <w:numId w:val="1064"/>
-              </w:numPr>
-              <w:jc w:val="left"/>
-            </w:pPr>
-            <w:r>
-              <w:t xml:space="preserve">Synced callout colors in DOCX/HTML/MD output to match brand palette. Added color palette demo.</w:t>
-            </w:r>
-          </w:p>
-        </w:tc>
-      </w:tr>
-      <w:tr>
-        <w:tc>
-          <w:tcPr>
-            <w:shd w:val="clear" w:color="auto" w:fill="F6F8FA"/>
-          </w:tcPr>
-          <w:p>
-            <w:pPr>
-              <w:jc w:val="left"/>
-            </w:pPr>
-            <w:r>
-              <w:t xml:space="preserve">5.1.0</w:t>
             </w:r>
           </w:p>
         </w:tc>
@@ -14879,7 +14879,7 @@
               <w:jc w:val="left"/>
             </w:pPr>
             <w:r>
-              <w:t xml:space="preserve">Adopted brand guidelines auxiliary color palette and monochrome scale. Aligned callout colors to brand specifications.</w:t>
+              <w:t xml:space="preserve">Synced callout colors in DOCX/HTML/MD output to match brand palette. Added color palette demo.</w:t>
             </w:r>
           </w:p>
         </w:tc>
@@ -14892,7 +14892,7 @@
               <w:jc w:val="left"/>
             </w:pPr>
             <w:r>
-              <w:t xml:space="preserve">5.0.3</w:t>
+              <w:t xml:space="preserve">5.1.0</w:t>
             </w:r>
           </w:p>
         </w:tc>
@@ -14918,6 +14918,51 @@
               <w:jc w:val="left"/>
             </w:pPr>
             <w:r>
+              <w:t xml:space="preserve">Adopted brand guidelines auxiliary color palette and monochrome scale. Aligned callout colors to brand specifications.</w:t>
+            </w:r>
+          </w:p>
+        </w:tc>
+      </w:tr>
+      <w:tr>
+        <w:tc>
+          <w:tcPr>
+            <w:shd w:val="clear" w:color="auto" w:fill="F6F8FA"/>
+          </w:tcPr>
+          <w:p>
+            <w:pPr>
+              <w:jc w:val="left"/>
+            </w:pPr>
+            <w:r>
+              <w:t xml:space="preserve">5.0.3</w:t>
+            </w:r>
+          </w:p>
+        </w:tc>
+        <w:tc>
+          <w:tcPr>
+            <w:shd w:val="clear" w:color="auto" w:fill="F6F8FA"/>
+          </w:tcPr>
+          <w:p>
+            <w:pPr>
+              <w:jc w:val="left"/>
+            </w:pPr>
+            <w:r>
+              <w:t xml:space="preserve">2026-09-14</w:t>
+            </w:r>
+          </w:p>
+        </w:tc>
+        <w:tc>
+          <w:tcPr>
+            <w:shd w:val="clear" w:color="auto" w:fill="F6F8FA"/>
+          </w:tcPr>
+          <w:p>
+            <w:pPr>
+              <w:numPr>
+                <w:ilvl w:val="0"/>
+                <w:numId w:val="1067"/>
+              </w:numPr>
+              <w:jc w:val="left"/>
+            </w:pPr>
+            <w:r>
               <w:t xml:space="preserve">Removed non-standard</w:t>
             </w:r>
             <w:r>
@@ -14940,58 +14985,13 @@
       </w:tr>
       <w:tr>
         <w:tc>
-          <w:tcPr>
-            <w:shd w:val="clear" w:color="auto" w:fill="F6F8FA"/>
-          </w:tcPr>
+          <w:tcPr/>
           <w:p>
             <w:pPr>
               <w:jc w:val="left"/>
             </w:pPr>
             <w:r>
               <w:t xml:space="preserve">5.0.2</w:t>
-            </w:r>
-          </w:p>
-        </w:tc>
-        <w:tc>
-          <w:tcPr>
-            <w:shd w:val="clear" w:color="auto" w:fill="F6F8FA"/>
-          </w:tcPr>
-          <w:p>
-            <w:pPr>
-              <w:jc w:val="left"/>
-            </w:pPr>
-            <w:r>
-              <w:t xml:space="preserve">2026-09-14</w:t>
-            </w:r>
-          </w:p>
-        </w:tc>
-        <w:tc>
-          <w:tcPr>
-            <w:shd w:val="clear" w:color="auto" w:fill="F6F8FA"/>
-          </w:tcPr>
-          <w:p>
-            <w:pPr>
-              <w:numPr>
-                <w:ilvl w:val="0"/>
-                <w:numId w:val="1067"/>
-              </w:numPr>
-              <w:jc w:val="left"/>
-            </w:pPr>
-            <w:r>
-              <w:t xml:space="preserve">Long commands in test steps now render as code blocks instead of inline code.</w:t>
-            </w:r>
-          </w:p>
-        </w:tc>
-      </w:tr>
-      <w:tr>
-        <w:tc>
-          <w:tcPr/>
-          <w:p>
-            <w:pPr>
-              <w:jc w:val="left"/>
-            </w:pPr>
-            <w:r>
-              <w:t xml:space="preserve">5.0.1</w:t>
             </w:r>
           </w:p>
         </w:tc>
@@ -15017,7 +15017,7 @@
               <w:jc w:val="left"/>
             </w:pPr>
             <w:r>
-              <w:t xml:space="preserve">Testcase caption centered above the block.</w:t>
+              <w:t xml:space="preserve">Long commands in test steps now render as code blocks instead of inline code.</w:t>
             </w:r>
           </w:p>
         </w:tc>
@@ -15032,7 +15032,7 @@
               <w:jc w:val="left"/>
             </w:pPr>
             <w:r>
-              <w:t xml:space="preserve">5.0.0</w:t>
+              <w:t xml:space="preserve">5.0.1</w:t>
             </w:r>
           </w:p>
         </w:tc>
@@ -15062,6 +15062,45 @@
               <w:jc w:val="left"/>
             </w:pPr>
             <w:r>
+              <w:t xml:space="preserve">Testcase caption centered above the block.</w:t>
+            </w:r>
+          </w:p>
+        </w:tc>
+      </w:tr>
+      <w:tr>
+        <w:tc>
+          <w:tcPr/>
+          <w:p>
+            <w:pPr>
+              <w:jc w:val="left"/>
+            </w:pPr>
+            <w:r>
+              <w:t xml:space="preserve">5.0.0</w:t>
+            </w:r>
+          </w:p>
+        </w:tc>
+        <w:tc>
+          <w:tcPr/>
+          <w:p>
+            <w:pPr>
+              <w:jc w:val="left"/>
+            </w:pPr>
+            <w:r>
+              <w:t xml:space="preserve">2026-09-14</w:t>
+            </w:r>
+          </w:p>
+        </w:tc>
+        <w:tc>
+          <w:tcPr/>
+          <w:p>
+            <w:pPr>
+              <w:numPr>
+                <w:ilvl w:val="0"/>
+                <w:numId w:val="1070"/>
+              </w:numPr>
+              <w:jc w:val="left"/>
+            </w:pPr>
+            <w:r>
               <w:t xml:space="preserve">Major refactoring: extracted shared modules (huawei-titles, huawei-toc, huawei-cover), renamed</w:t>
             </w:r>
             <w:r>
@@ -15123,7 +15162,9 @@
       </w:tr>
       <w:tr>
         <w:tc>
-          <w:tcPr/>
+          <w:tcPr>
+            <w:shd w:val="clear" w:color="auto" w:fill="F6F8FA"/>
+          </w:tcPr>
           <w:p>
             <w:pPr>
               <w:jc w:val="left"/>
@@ -15134,56 +15175,15 @@
           </w:p>
         </w:tc>
         <w:tc>
-          <w:tcPr/>
+          <w:tcPr>
+            <w:shd w:val="clear" w:color="auto" w:fill="F6F8FA"/>
+          </w:tcPr>
           <w:p>
             <w:pPr>
               <w:jc w:val="left"/>
             </w:pPr>
             <w:r>
               <w:t xml:space="preserve">2026-09-14</w:t>
-            </w:r>
-          </w:p>
-        </w:tc>
-        <w:tc>
-          <w:tcPr/>
-          <w:p>
-            <w:pPr>
-              <w:numPr>
-                <w:ilvl w:val="0"/>
-                <w:numId w:val="1070"/>
-              </w:numPr>
-              <w:jc w:val="left"/>
-            </w:pPr>
-            <w:r>
-              <w:t xml:space="preserve">Testcase headings now formatted as captions (like figures/tables): bold “Testcase N:” followed by description. Changed label from “Test Case” to “Testcase”.</w:t>
-            </w:r>
-          </w:p>
-        </w:tc>
-      </w:tr>
-      <w:tr>
-        <w:tc>
-          <w:tcPr>
-            <w:shd w:val="clear" w:color="auto" w:fill="F6F8FA"/>
-          </w:tcPr>
-          <w:p>
-            <w:pPr>
-              <w:jc w:val="left"/>
-            </w:pPr>
-            <w:r>
-              <w:t xml:space="preserve">4.6.0</w:t>
-            </w:r>
-          </w:p>
-        </w:tc>
-        <w:tc>
-          <w:tcPr>
-            <w:shd w:val="clear" w:color="auto" w:fill="F6F8FA"/>
-          </w:tcPr>
-          <w:p>
-            <w:pPr>
-              <w:jc w:val="left"/>
-            </w:pPr>
-            <w:r>
-              <w:t xml:space="preserve">2026-09-13</w:t>
             </w:r>
           </w:p>
         </w:tc>
@@ -15200,7 +15200,7 @@
               <w:jc w:val="left"/>
             </w:pPr>
             <w:r>
-              <w:t xml:space="preserve">Section restructure: Introduction, Test Cases (with category subsections), Conclusion. Testcases auto-numbered like figures/tables. Changed testcase from subsection to subsubsection.</w:t>
+              <w:t xml:space="preserve">Testcase headings now formatted as captions (like figures/tables): bold “Testcase N:” followed by description. Changed label from “Test Case” to “Testcase”.</w:t>
             </w:r>
           </w:p>
         </w:tc>
@@ -15213,7 +15213,7 @@
               <w:jc w:val="left"/>
             </w:pPr>
             <w:r>
-              <w:t xml:space="preserve">4.5.0</w:t>
+              <w:t xml:space="preserve">4.6.0</w:t>
             </w:r>
           </w:p>
         </w:tc>
@@ -15239,6 +15239,51 @@
               <w:jc w:val="left"/>
             </w:pPr>
             <w:r>
+              <w:t xml:space="preserve">Section restructure: Introduction, Test Cases (with category subsections), Conclusion. Testcases auto-numbered like figures/tables. Changed testcase from subsection to subsubsection.</w:t>
+            </w:r>
+          </w:p>
+        </w:tc>
+      </w:tr>
+      <w:tr>
+        <w:tc>
+          <w:tcPr>
+            <w:shd w:val="clear" w:color="auto" w:fill="F6F8FA"/>
+          </w:tcPr>
+          <w:p>
+            <w:pPr>
+              <w:jc w:val="left"/>
+            </w:pPr>
+            <w:r>
+              <w:t xml:space="preserve">4.5.0</w:t>
+            </w:r>
+          </w:p>
+        </w:tc>
+        <w:tc>
+          <w:tcPr>
+            <w:shd w:val="clear" w:color="auto" w:fill="F6F8FA"/>
+          </w:tcPr>
+          <w:p>
+            <w:pPr>
+              <w:jc w:val="left"/>
+            </w:pPr>
+            <w:r>
+              <w:t xml:space="preserve">2026-09-13</w:t>
+            </w:r>
+          </w:p>
+        </w:tc>
+        <w:tc>
+          <w:tcPr>
+            <w:shd w:val="clear" w:color="auto" w:fill="F6F8FA"/>
+          </w:tcPr>
+          <w:p>
+            <w:pPr>
+              <w:numPr>
+                <w:ilvl w:val="0"/>
+                <w:numId w:val="1073"/>
+              </w:numPr>
+              <w:jc w:val="left"/>
+            </w:pPr>
+            <w:r>
               <w:t xml:space="preserve">Unified field APIs:</w:t>
             </w:r>
             <w:r>
@@ -15303,58 +15348,13 @@
       </w:tr>
       <w:tr>
         <w:tc>
-          <w:tcPr>
-            <w:shd w:val="clear" w:color="auto" w:fill="F6F8FA"/>
-          </w:tcPr>
+          <w:tcPr/>
           <w:p>
             <w:pPr>
               <w:jc w:val="left"/>
             </w:pPr>
             <w:r>
               <w:t xml:space="preserve">4.4.0</w:t>
-            </w:r>
-          </w:p>
-        </w:tc>
-        <w:tc>
-          <w:tcPr>
-            <w:shd w:val="clear" w:color="auto" w:fill="F6F8FA"/>
-          </w:tcPr>
-          <w:p>
-            <w:pPr>
-              <w:jc w:val="left"/>
-            </w:pPr>
-            <w:r>
-              <w:t xml:space="preserve">2026-09-13</w:t>
-            </w:r>
-          </w:p>
-        </w:tc>
-        <w:tc>
-          <w:tcPr>
-            <w:shd w:val="clear" w:color="auto" w:fill="F6F8FA"/>
-          </w:tcPr>
-          <w:p>
-            <w:pPr>
-              <w:numPr>
-                <w:ilvl w:val="0"/>
-                <w:numId w:val="1073"/>
-              </w:numPr>
-              <w:jc w:val="left"/>
-            </w:pPr>
-            <w:r>
-              <w:t xml:space="preserve">Code review fixes: removed dead labels, badge now uses Huawei brand colors (tipbg/tipfg, huaweired, warningbg/warningfg), Lua filter preserves formatting in DOCX/MD/HTML via parse_latex_blocks, testprocedure handler preserves non-step content (images, code, callouts).</w:t>
-            </w:r>
-          </w:p>
-        </w:tc>
-      </w:tr>
-      <w:tr>
-        <w:tc>
-          <w:tcPr/>
-          <w:p>
-            <w:pPr>
-              <w:jc w:val="left"/>
-            </w:pPr>
-            <w:r>
-              <w:t xml:space="preserve">4.3.0</w:t>
             </w:r>
           </w:p>
         </w:tc>
@@ -15380,6 +15380,51 @@
               <w:jc w:val="left"/>
             </w:pPr>
             <w:r>
+              <w:t xml:space="preserve">Code review fixes: removed dead labels, badge now uses Huawei brand colors (tipbg/tipfg, huaweired, warningbg/warningfg), Lua filter preserves formatting in DOCX/MD/HTML via parse_latex_blocks, testprocedure handler preserves non-step content (images, code, callouts).</w:t>
+            </w:r>
+          </w:p>
+        </w:tc>
+      </w:tr>
+      <w:tr>
+        <w:tc>
+          <w:tcPr>
+            <w:shd w:val="clear" w:color="auto" w:fill="F6F8FA"/>
+          </w:tcPr>
+          <w:p>
+            <w:pPr>
+              <w:jc w:val="left"/>
+            </w:pPr>
+            <w:r>
+              <w:t xml:space="preserve">4.3.0</w:t>
+            </w:r>
+          </w:p>
+        </w:tc>
+        <w:tc>
+          <w:tcPr>
+            <w:shd w:val="clear" w:color="auto" w:fill="F6F8FA"/>
+          </w:tcPr>
+          <w:p>
+            <w:pPr>
+              <w:jc w:val="left"/>
+            </w:pPr>
+            <w:r>
+              <w:t xml:space="preserve">2026-09-13</w:t>
+            </w:r>
+          </w:p>
+        </w:tc>
+        <w:tc>
+          <w:tcPr>
+            <w:shd w:val="clear" w:color="auto" w:fill="F6F8FA"/>
+          </w:tcPr>
+          <w:p>
+            <w:pPr>
+              <w:numPr>
+                <w:ilvl w:val="0"/>
+                <w:numId w:val="1075"/>
+              </w:numPr>
+              <w:jc w:val="left"/>
+            </w:pPr>
+            <w:r>
               <w:t xml:space="preserve">Added</w:t>
             </w:r>
             <w:r>
@@ -15432,9 +15477,7 @@
       </w:tr>
       <w:tr>
         <w:tc>
-          <w:tcPr>
-            <w:shd w:val="clear" w:color="auto" w:fill="F6F8FA"/>
-          </w:tcPr>
+          <w:tcPr/>
           <w:p>
             <w:pPr>
               <w:jc w:val="left"/>
@@ -15445,9 +15488,7 @@
           </w:p>
         </w:tc>
         <w:tc>
-          <w:tcPr>
-            <w:shd w:val="clear" w:color="auto" w:fill="F6F8FA"/>
-          </w:tcPr>
+          <w:tcPr/>
           <w:p>
             <w:pPr>
               <w:jc w:val="left"/>
@@ -15458,14 +15499,12 @@
           </w:p>
         </w:tc>
         <w:tc>
-          <w:tcPr>
-            <w:shd w:val="clear" w:color="auto" w:fill="F6F8FA"/>
-          </w:tcPr>
+          <w:tcPr/>
           <w:p>
             <w:pPr>
               <w:numPr>
                 <w:ilvl w:val="0"/>
-                <w:numId w:val="1075"/>
+                <w:numId w:val="1076"/>
               </w:numPr>
               <w:jc w:val="left"/>
             </w:pPr>
@@ -15519,7 +15558,9 @@
       </w:tr>
       <w:tr>
         <w:tc>
-          <w:tcPr/>
+          <w:tcPr>
+            <w:shd w:val="clear" w:color="auto" w:fill="F6F8FA"/>
+          </w:tcPr>
           <w:p>
             <w:pPr>
               <w:jc w:val="left"/>
@@ -15530,7 +15571,9 @@
           </w:p>
         </w:tc>
         <w:tc>
-          <w:tcPr/>
+          <w:tcPr>
+            <w:shd w:val="clear" w:color="auto" w:fill="F6F8FA"/>
+          </w:tcPr>
           <w:p>
             <w:pPr>
               <w:jc w:val="left"/>
@@ -15541,12 +15584,14 @@
           </w:p>
         </w:tc>
         <w:tc>
-          <w:tcPr/>
+          <w:tcPr>
+            <w:shd w:val="clear" w:color="auto" w:fill="F6F8FA"/>
+          </w:tcPr>
           <w:p>
             <w:pPr>
               <w:numPr>
                 <w:ilvl w:val="0"/>
-                <w:numId w:val="1076"/>
+                <w:numId w:val="1077"/>
               </w:numPr>
               <w:jc w:val="left"/>
             </w:pPr>
@@ -15573,9 +15618,7 @@
       </w:tr>
       <w:tr>
         <w:tc>
-          <w:tcPr>
-            <w:shd w:val="clear" w:color="auto" w:fill="F6F8FA"/>
-          </w:tcPr>
+          <w:tcPr/>
           <w:p>
             <w:pPr>
               <w:jc w:val="left"/>
@@ -15586,9 +15629,7 @@
           </w:p>
         </w:tc>
         <w:tc>
-          <w:tcPr>
-            <w:shd w:val="clear" w:color="auto" w:fill="F6F8FA"/>
-          </w:tcPr>
+          <w:tcPr/>
           <w:p>
             <w:pPr>
               <w:jc w:val="left"/>
@@ -15599,14 +15640,12 @@
           </w:p>
         </w:tc>
         <w:tc>
-          <w:tcPr>
-            <w:shd w:val="clear" w:color="auto" w:fill="F6F8FA"/>
-          </w:tcPr>
+          <w:tcPr/>
           <w:p>
             <w:pPr>
               <w:numPr>
                 <w:ilvl w:val="0"/>
-                <w:numId w:val="1077"/>
+                <w:numId w:val="1078"/>
               </w:numPr>
               <w:jc w:val="left"/>
             </w:pPr>
@@ -15648,7 +15687,9 @@
       </w:tr>
       <w:tr>
         <w:tc>
-          <w:tcPr/>
+          <w:tcPr>
+            <w:shd w:val="clear" w:color="auto" w:fill="F6F8FA"/>
+          </w:tcPr>
           <w:p>
             <w:pPr>
               <w:jc w:val="left"/>
@@ -15659,7 +15700,9 @@
           </w:p>
         </w:tc>
         <w:tc>
-          <w:tcPr/>
+          <w:tcPr>
+            <w:shd w:val="clear" w:color="auto" w:fill="F6F8FA"/>
+          </w:tcPr>
           <w:p>
             <w:pPr>
               <w:jc w:val="left"/>
@@ -15670,12 +15713,14 @@
           </w:p>
         </w:tc>
         <w:tc>
-          <w:tcPr/>
+          <w:tcPr>
+            <w:shd w:val="clear" w:color="auto" w:fill="F6F8FA"/>
+          </w:tcPr>
           <w:p>
             <w:pPr>
               <w:numPr>
                 <w:ilvl w:val="0"/>
-                <w:numId w:val="1078"/>
+                <w:numId w:val="1079"/>
               </w:numPr>
               <w:jc w:val="left"/>
             </w:pPr>
@@ -15702,58 +15747,13 @@
       </w:tr>
       <w:tr>
         <w:tc>
-          <w:tcPr>
-            <w:shd w:val="clear" w:color="auto" w:fill="F6F8FA"/>
-          </w:tcPr>
+          <w:tcPr/>
           <w:p>
             <w:pPr>
               <w:jc w:val="left"/>
             </w:pPr>
             <w:r>
               <w:t xml:space="preserve">3.8.1</w:t>
-            </w:r>
-          </w:p>
-        </w:tc>
-        <w:tc>
-          <w:tcPr>
-            <w:shd w:val="clear" w:color="auto" w:fill="F6F8FA"/>
-          </w:tcPr>
-          <w:p>
-            <w:pPr>
-              <w:jc w:val="left"/>
-            </w:pPr>
-            <w:r>
-              <w:t xml:space="preserve">2026-09-13</w:t>
-            </w:r>
-          </w:p>
-        </w:tc>
-        <w:tc>
-          <w:tcPr>
-            <w:shd w:val="clear" w:color="auto" w:fill="F6F8FA"/>
-          </w:tcPr>
-          <w:p>
-            <w:pPr>
-              <w:numPr>
-                <w:ilvl w:val="0"/>
-                <w:numId w:val="1079"/>
-              </w:numPr>
-              <w:jc w:val="left"/>
-            </w:pPr>
-            <w:r>
-              <w:t xml:space="preserve">End-to-end quality review: fixed testbook PDF metadata title, removed stray user DOCX from template dir, fixed round-trip.sh variable typo, updated stale references in AGENTS.md and README.md, committed testbook sample PDFs, set TZ for pandoc cover time consistency, widened pandoc version range.</w:t>
-            </w:r>
-          </w:p>
-        </w:tc>
-      </w:tr>
-      <w:tr>
-        <w:tc>
-          <w:tcPr/>
-          <w:p>
-            <w:pPr>
-              <w:jc w:val="left"/>
-            </w:pPr>
-            <w:r>
-              <w:t xml:space="preserve">3.8.0</w:t>
             </w:r>
           </w:p>
         </w:tc>
@@ -15779,7 +15779,7 @@
               <w:jc w:val="left"/>
             </w:pPr>
             <w:r>
-              <w:t xml:space="preserve">Removed Tips and Tricks chapter (tmux configuration) — required VS Code-specific keybindings that don’t generalize across terminal setups.</w:t>
+              <w:t xml:space="preserve">End-to-end quality review: fixed testbook PDF metadata title, removed stray user DOCX from template dir, fixed round-trip.sh variable typo, updated stale references in AGENTS.md and README.md, committed testbook sample PDFs, set TZ for pandoc cover time consistency, widened pandoc version range.</w:t>
             </w:r>
           </w:p>
         </w:tc>
@@ -15794,7 +15794,7 @@
               <w:jc w:val="left"/>
             </w:pPr>
             <w:r>
-              <w:t xml:space="preserve">3.7.0</w:t>
+              <w:t xml:space="preserve">3.8.0</w:t>
             </w:r>
           </w:p>
         </w:tc>
@@ -15807,7 +15807,7 @@
               <w:jc w:val="left"/>
             </w:pPr>
             <w:r>
-              <w:t xml:space="preserve">2026-09-12</w:t>
+              <w:t xml:space="preserve">2026-09-13</w:t>
             </w:r>
           </w:p>
         </w:tc>
@@ -15824,6 +15824,45 @@
               <w:jc w:val="left"/>
             </w:pPr>
             <w:r>
+              <w:t xml:space="preserve">Removed Tips and Tricks chapter (tmux configuration) — required VS Code-specific keybindings that don’t generalize across terminal setups.</w:t>
+            </w:r>
+          </w:p>
+        </w:tc>
+      </w:tr>
+      <w:tr>
+        <w:tc>
+          <w:tcPr/>
+          <w:p>
+            <w:pPr>
+              <w:jc w:val="left"/>
+            </w:pPr>
+            <w:r>
+              <w:t xml:space="preserve">3.7.0</w:t>
+            </w:r>
+          </w:p>
+        </w:tc>
+        <w:tc>
+          <w:tcPr/>
+          <w:p>
+            <w:pPr>
+              <w:jc w:val="left"/>
+            </w:pPr>
+            <w:r>
+              <w:t xml:space="preserve">2026-09-12</w:t>
+            </w:r>
+          </w:p>
+        </w:tc>
+        <w:tc>
+          <w:tcPr/>
+          <w:p>
+            <w:pPr>
+              <w:numPr>
+                <w:ilvl w:val="0"/>
+                <w:numId w:val="1082"/>
+              </w:numPr>
+              <w:jc w:val="left"/>
+            </w:pPr>
+            <w:r>
               <w:t xml:space="preserve">Added</w:t>
             </w:r>
             <w:r>
@@ -15876,7 +15915,9 @@
       </w:tr>
       <w:tr>
         <w:tc>
-          <w:tcPr/>
+          <w:tcPr>
+            <w:shd w:val="clear" w:color="auto" w:fill="F6F8FA"/>
+          </w:tcPr>
           <w:p>
             <w:pPr>
               <w:jc w:val="left"/>
@@ -15887,7 +15928,9 @@
           </w:p>
         </w:tc>
         <w:tc>
-          <w:tcPr/>
+          <w:tcPr>
+            <w:shd w:val="clear" w:color="auto" w:fill="F6F8FA"/>
+          </w:tcPr>
           <w:p>
             <w:pPr>
               <w:jc w:val="left"/>
@@ -15898,12 +15941,14 @@
           </w:p>
         </w:tc>
         <w:tc>
-          <w:tcPr/>
+          <w:tcPr>
+            <w:shd w:val="clear" w:color="auto" w:fill="F6F8FA"/>
+          </w:tcPr>
           <w:p>
             <w:pPr>
               <w:numPr>
                 <w:ilvl w:val="0"/>
-                <w:numId w:val="1082"/>
+                <w:numId w:val="1083"/>
               </w:numPr>
               <w:jc w:val="left"/>
             </w:pPr>
@@ -15960,9 +16005,7 @@
       </w:tr>
       <w:tr>
         <w:tc>
-          <w:tcPr>
-            <w:shd w:val="clear" w:color="auto" w:fill="F6F8FA"/>
-          </w:tcPr>
+          <w:tcPr/>
           <w:p>
             <w:pPr>
               <w:jc w:val="left"/>
@@ -15973,9 +16016,7 @@
           </w:p>
         </w:tc>
         <w:tc>
-          <w:tcPr>
-            <w:shd w:val="clear" w:color="auto" w:fill="F6F8FA"/>
-          </w:tcPr>
+          <w:tcPr/>
           <w:p>
             <w:pPr>
               <w:jc w:val="left"/>
@@ -15986,14 +16027,12 @@
           </w:p>
         </w:tc>
         <w:tc>
-          <w:tcPr>
-            <w:shd w:val="clear" w:color="auto" w:fill="F6F8FA"/>
-          </w:tcPr>
+          <w:tcPr/>
           <w:p>
             <w:pPr>
               <w:numPr>
                 <w:ilvl w:val="0"/>
-                <w:numId w:val="1083"/>
+                <w:numId w:val="1084"/>
               </w:numPr>
               <w:jc w:val="left"/>
             </w:pPr>
@@ -16071,7 +16110,9 @@
       </w:tr>
       <w:tr>
         <w:tc>
-          <w:tcPr/>
+          <w:tcPr>
+            <w:shd w:val="clear" w:color="auto" w:fill="F6F8FA"/>
+          </w:tcPr>
           <w:p>
             <w:pPr>
               <w:jc w:val="left"/>
@@ -16082,7 +16123,9 @@
           </w:p>
         </w:tc>
         <w:tc>
-          <w:tcPr/>
+          <w:tcPr>
+            <w:shd w:val="clear" w:color="auto" w:fill="F6F8FA"/>
+          </w:tcPr>
           <w:p>
             <w:pPr>
               <w:jc w:val="left"/>
@@ -16093,12 +16136,14 @@
           </w:p>
         </w:tc>
         <w:tc>
-          <w:tcPr/>
+          <w:tcPr>
+            <w:shd w:val="clear" w:color="auto" w:fill="F6F8FA"/>
+          </w:tcPr>
           <w:p>
             <w:pPr>
               <w:numPr>
                 <w:ilvl w:val="0"/>
-                <w:numId w:val="1084"/>
+                <w:numId w:val="1085"/>
               </w:numPr>
               <w:jc w:val="left"/>
             </w:pPr>
@@ -16125,7 +16170,7 @@
             <w:pPr>
               <w:numPr>
                 <w:ilvl w:val="0"/>
-                <w:numId w:val="1084"/>
+                <w:numId w:val="1085"/>
               </w:numPr>
               <w:jc w:val="left"/>
             </w:pPr>
@@ -16167,7 +16212,7 @@
             <w:pPr>
               <w:numPr>
                 <w:ilvl w:val="0"/>
-                <w:numId w:val="1084"/>
+                <w:numId w:val="1085"/>
               </w:numPr>
               <w:jc w:val="left"/>
             </w:pPr>
@@ -16179,9 +16224,7 @@
       </w:tr>
       <w:tr>
         <w:tc>
-          <w:tcPr>
-            <w:shd w:val="clear" w:color="auto" w:fill="F6F8FA"/>
-          </w:tcPr>
+          <w:tcPr/>
           <w:p>
             <w:pPr>
               <w:jc w:val="left"/>
@@ -16192,9 +16235,7 @@
           </w:p>
         </w:tc>
         <w:tc>
-          <w:tcPr>
-            <w:shd w:val="clear" w:color="auto" w:fill="F6F8FA"/>
-          </w:tcPr>
+          <w:tcPr/>
           <w:p>
             <w:pPr>
               <w:jc w:val="left"/>
@@ -16205,14 +16246,12 @@
           </w:p>
         </w:tc>
         <w:tc>
-          <w:tcPr>
-            <w:shd w:val="clear" w:color="auto" w:fill="F6F8FA"/>
-          </w:tcPr>
+          <w:tcPr/>
           <w:p>
             <w:pPr>
               <w:numPr>
                 <w:ilvl w:val="0"/>
-                <w:numId w:val="1085"/>
+                <w:numId w:val="1086"/>
               </w:numPr>
               <w:jc w:val="left"/>
             </w:pPr>
@@ -16239,7 +16278,7 @@
             <w:pPr>
               <w:numPr>
                 <w:ilvl w:val="0"/>
-                <w:numId w:val="1085"/>
+                <w:numId w:val="1086"/>
               </w:numPr>
               <w:jc w:val="left"/>
             </w:pPr>
@@ -16266,7 +16305,7 @@
             <w:pPr>
               <w:numPr>
                 <w:ilvl w:val="0"/>
-                <w:numId w:val="1085"/>
+                <w:numId w:val="1086"/>
               </w:numPr>
               <w:jc w:val="left"/>
             </w:pPr>
@@ -16278,7 +16317,7 @@
             <w:pPr>
               <w:numPr>
                 <w:ilvl w:val="0"/>
-                <w:numId w:val="1085"/>
+                <w:numId w:val="1086"/>
               </w:numPr>
               <w:jc w:val="left"/>
             </w:pPr>
@@ -16302,54 +16341,15 @@
       </w:tr>
       <w:tr>
         <w:tc>
-          <w:tcPr/>
+          <w:tcPr>
+            <w:shd w:val="clear" w:color="auto" w:fill="F6F8FA"/>
+          </w:tcPr>
           <w:p>
             <w:pPr>
               <w:jc w:val="left"/>
             </w:pPr>
             <w:r>
               <w:t xml:space="preserve">3.2.1</w:t>
-            </w:r>
-          </w:p>
-        </w:tc>
-        <w:tc>
-          <w:tcPr/>
-          <w:p>
-            <w:pPr>
-              <w:jc w:val="left"/>
-            </w:pPr>
-            <w:r>
-              <w:t xml:space="preserve">2026-09-11</w:t>
-            </w:r>
-          </w:p>
-        </w:tc>
-        <w:tc>
-          <w:tcPr/>
-          <w:p>
-            <w:pPr>
-              <w:numPr>
-                <w:ilvl w:val="0"/>
-                <w:numId w:val="1086"/>
-              </w:numPr>
-              <w:jc w:val="left"/>
-            </w:pPr>
-            <w:r>
-              <w:t xml:space="preserve">Renamed Chapter 7 from “Clean Up” to “Operations and Maintenance”. Added subsections for updating and uninstalling both the MaaS Gateway and the document templates. Added cloud resource cleanup as an optional subsection.</w:t>
-            </w:r>
-          </w:p>
-        </w:tc>
-      </w:tr>
-      <w:tr>
-        <w:tc>
-          <w:tcPr>
-            <w:shd w:val="clear" w:color="auto" w:fill="F6F8FA"/>
-          </w:tcPr>
-          <w:p>
-            <w:pPr>
-              <w:jc w:val="left"/>
-            </w:pPr>
-            <w:r>
-              <w:t xml:space="preserve">3.2.0</w:t>
             </w:r>
           </w:p>
         </w:tc>
@@ -16379,6 +16379,45 @@
               <w:jc w:val="left"/>
             </w:pPr>
             <w:r>
+              <w:t xml:space="preserve">Renamed Chapter 7 from “Clean Up” to “Operations and Maintenance”. Added subsections for updating and uninstalling both the MaaS Gateway and the document templates. Added cloud resource cleanup as an optional subsection.</w:t>
+            </w:r>
+          </w:p>
+        </w:tc>
+      </w:tr>
+      <w:tr>
+        <w:tc>
+          <w:tcPr/>
+          <w:p>
+            <w:pPr>
+              <w:jc w:val="left"/>
+            </w:pPr>
+            <w:r>
+              <w:t xml:space="preserve">3.2.0</w:t>
+            </w:r>
+          </w:p>
+        </w:tc>
+        <w:tc>
+          <w:tcPr/>
+          <w:p>
+            <w:pPr>
+              <w:jc w:val="left"/>
+            </w:pPr>
+            <w:r>
+              <w:t xml:space="preserve">2026-09-11</w:t>
+            </w:r>
+          </w:p>
+        </w:tc>
+        <w:tc>
+          <w:tcPr/>
+          <w:p>
+            <w:pPr>
+              <w:numPr>
+                <w:ilvl w:val="0"/>
+                <w:numId w:val="1088"/>
+              </w:numPr>
+              <w:jc w:val="left"/>
+            </w:pPr>
+            <w:r>
               <w:t xml:space="preserve">Added</w:t>
             </w:r>
             <w:r>
@@ -16440,7 +16479,7 @@
             <w:pPr>
               <w:numPr>
                 <w:ilvl w:val="0"/>
-                <w:numId w:val="1087"/>
+                <w:numId w:val="1088"/>
               </w:numPr>
               <w:jc w:val="left"/>
             </w:pPr>
@@ -16485,7 +16524,7 @@
             <w:pPr>
               <w:numPr>
                 <w:ilvl w:val="0"/>
-                <w:numId w:val="1087"/>
+                <w:numId w:val="1088"/>
               </w:numPr>
               <w:jc w:val="left"/>
             </w:pPr>
@@ -16497,54 +16536,15 @@
       </w:tr>
       <w:tr>
         <w:tc>
-          <w:tcPr/>
+          <w:tcPr>
+            <w:shd w:val="clear" w:color="auto" w:fill="F6F8FA"/>
+          </w:tcPr>
           <w:p>
             <w:pPr>
               <w:jc w:val="left"/>
             </w:pPr>
             <w:r>
               <w:t xml:space="preserve">3.1.2</w:t>
-            </w:r>
-          </w:p>
-        </w:tc>
-        <w:tc>
-          <w:tcPr/>
-          <w:p>
-            <w:pPr>
-              <w:jc w:val="left"/>
-            </w:pPr>
-            <w:r>
-              <w:t xml:space="preserve">2026-09-11</w:t>
-            </w:r>
-          </w:p>
-        </w:tc>
-        <w:tc>
-          <w:tcPr/>
-          <w:p>
-            <w:pPr>
-              <w:numPr>
-                <w:ilvl w:val="0"/>
-                <w:numId w:val="1088"/>
-              </w:numPr>
-              <w:jc w:val="left"/>
-            </w:pPr>
-            <w:r>
-              <w:t xml:space="preserve">Added output format guide to README.md: comparison table of PDF, Markdown, DOCX, and HTML with purpose, copy-paste quality, and limitations. Recommends Markdown for copy-paste.</w:t>
-            </w:r>
-          </w:p>
-        </w:tc>
-      </w:tr>
-      <w:tr>
-        <w:tc>
-          <w:tcPr>
-            <w:shd w:val="clear" w:color="auto" w:fill="F6F8FA"/>
-          </w:tcPr>
-          <w:p>
-            <w:pPr>
-              <w:jc w:val="left"/>
-            </w:pPr>
-            <w:r>
-              <w:t xml:space="preserve">3.1.1</w:t>
             </w:r>
           </w:p>
         </w:tc>
@@ -16574,6 +16574,45 @@
               <w:jc w:val="left"/>
             </w:pPr>
             <w:r>
+              <w:t xml:space="preserve">Added output format guide to README.md: comparison table of PDF, Markdown, DOCX, and HTML with purpose, copy-paste quality, and limitations. Recommends Markdown for copy-paste.</w:t>
+            </w:r>
+          </w:p>
+        </w:tc>
+      </w:tr>
+      <w:tr>
+        <w:tc>
+          <w:tcPr/>
+          <w:p>
+            <w:pPr>
+              <w:jc w:val="left"/>
+            </w:pPr>
+            <w:r>
+              <w:t xml:space="preserve">3.1.1</w:t>
+            </w:r>
+          </w:p>
+        </w:tc>
+        <w:tc>
+          <w:tcPr/>
+          <w:p>
+            <w:pPr>
+              <w:jc w:val="left"/>
+            </w:pPr>
+            <w:r>
+              <w:t xml:space="preserve">2026-09-11</w:t>
+            </w:r>
+          </w:p>
+        </w:tc>
+        <w:tc>
+          <w:tcPr/>
+          <w:p>
+            <w:pPr>
+              <w:numPr>
+                <w:ilvl w:val="0"/>
+                <w:numId w:val="1090"/>
+              </w:numPr>
+              <w:jc w:val="left"/>
+            </w:pPr>
+            <w:r>
               <w:t xml:space="preserve">Updated MaaS Gateway chapter to v1.10.9: non-interactive mode (</w:t>
             </w:r>
             <w:r>
@@ -16590,7 +16629,7 @@
             <w:pPr>
               <w:numPr>
                 <w:ilvl w:val="0"/>
-                <w:numId w:val="1089"/>
+                <w:numId w:val="1090"/>
               </w:numPr>
               <w:jc w:val="left"/>
             </w:pPr>
@@ -16632,7 +16671,7 @@
             <w:pPr>
               <w:numPr>
                 <w:ilvl w:val="0"/>
-                <w:numId w:val="1089"/>
+                <w:numId w:val="1090"/>
               </w:numPr>
               <w:jc w:val="left"/>
             </w:pPr>
@@ -16644,7 +16683,9 @@
       </w:tr>
       <w:tr>
         <w:tc>
-          <w:tcPr/>
+          <w:tcPr>
+            <w:shd w:val="clear" w:color="auto" w:fill="F6F8FA"/>
+          </w:tcPr>
           <w:p>
             <w:pPr>
               <w:jc w:val="left"/>
@@ -16655,7 +16696,9 @@
           </w:p>
         </w:tc>
         <w:tc>
-          <w:tcPr/>
+          <w:tcPr>
+            <w:shd w:val="clear" w:color="auto" w:fill="F6F8FA"/>
+          </w:tcPr>
           <w:p>
             <w:pPr>
               <w:jc w:val="left"/>
@@ -16666,12 +16709,14 @@
           </w:p>
         </w:tc>
         <w:tc>
-          <w:tcPr/>
+          <w:tcPr>
+            <w:shd w:val="clear" w:color="auto" w:fill="F6F8FA"/>
+          </w:tcPr>
           <w:p>
             <w:pPr>
               <w:numPr>
                 <w:ilvl w:val="0"/>
-                <w:numId w:val="1090"/>
+                <w:numId w:val="1091"/>
               </w:numPr>
               <w:jc w:val="left"/>
             </w:pPr>
@@ -16695,7 +16740,7 @@
             <w:pPr>
               <w:numPr>
                 <w:ilvl w:val="0"/>
-                <w:numId w:val="1090"/>
+                <w:numId w:val="1091"/>
               </w:numPr>
               <w:jc w:val="left"/>
             </w:pPr>
@@ -16737,7 +16782,7 @@
             <w:pPr>
               <w:numPr>
                 <w:ilvl w:val="0"/>
-                <w:numId w:val="1090"/>
+                <w:numId w:val="1091"/>
               </w:numPr>
               <w:jc w:val="left"/>
             </w:pPr>
@@ -16745,63 +16790,6 @@
               <w:t xml:space="preserve">Restructured chapters: moved SSH config and VS Code connection to new Chapter 4 (Install VS Code and Connect via Remote-SSH). Chapters 5—​7 renumbered.</w:t>
             </w:r>
           </w:p>
-          <w:p>
-            <w:pPr>
-              <w:numPr>
-                <w:ilvl w:val="0"/>
-                <w:numId w:val="1090"/>
-              </w:numPr>
-              <w:jc w:val="left"/>
-            </w:pPr>
-            <w:r>
-              <w:t xml:space="preserve">Added verification checklist tables to all 7 chapters.</w:t>
-            </w:r>
-          </w:p>
-          <w:p>
-            <w:pPr>
-              <w:numPr>
-                <w:ilvl w:val="0"/>
-                <w:numId w:val="1090"/>
-              </w:numPr>
-              <w:jc w:val="left"/>
-            </w:pPr>
-            <w:r>
-              <w:t xml:space="preserve">Added mandatory reboot warning in Chapter 2 (SSH port change). Added troubleshooting subsection in Chapter 4 with common SSH connection issues and ncat debugging commands.</w:t>
-            </w:r>
-          </w:p>
-        </w:tc>
-      </w:tr>
-      <w:tr>
-        <w:tc>
-          <w:tcPr>
-            <w:shd w:val="clear" w:color="auto" w:fill="F6F8FA"/>
-          </w:tcPr>
-          <w:p>
-            <w:pPr>
-              <w:jc w:val="left"/>
-            </w:pPr>
-            <w:r>
-              <w:t xml:space="preserve">3.0.1</w:t>
-            </w:r>
-          </w:p>
-        </w:tc>
-        <w:tc>
-          <w:tcPr>
-            <w:shd w:val="clear" w:color="auto" w:fill="F6F8FA"/>
-          </w:tcPr>
-          <w:p>
-            <w:pPr>
-              <w:jc w:val="left"/>
-            </w:pPr>
-            <w:r>
-              <w:t xml:space="preserve">2026-09-10</w:t>
-            </w:r>
-          </w:p>
-        </w:tc>
-        <w:tc>
-          <w:tcPr>
-            <w:shd w:val="clear" w:color="auto" w:fill="F6F8FA"/>
-          </w:tcPr>
           <w:p>
             <w:pPr>
               <w:numPr>
@@ -16811,7 +16799,19 @@
               <w:jc w:val="left"/>
             </w:pPr>
             <w:r>
-              <w:t xml:space="preserve">Minor fixes: test-filter.sh auto-discovery, build.sh help text, Makefile aggregate descriptions, 5-section comment correction, CHANGELOG version gap note, callout-in-code fix, CI font auto-discovery, dofile path comment, test-sync.sh header.</w:t>
+              <w:t xml:space="preserve">Added verification checklist tables to all 7 chapters.</w:t>
+            </w:r>
+          </w:p>
+          <w:p>
+            <w:pPr>
+              <w:numPr>
+                <w:ilvl w:val="0"/>
+                <w:numId w:val="1091"/>
+              </w:numPr>
+              <w:jc w:val="left"/>
+            </w:pPr>
+            <w:r>
+              <w:t xml:space="preserve">Added mandatory reboot warning in Chapter 2 (SSH port change). Added troubleshooting subsection in Chapter 4 with common SSH connection issues and ncat debugging commands.</w:t>
             </w:r>
           </w:p>
         </w:tc>
@@ -16824,18 +16824,18 @@
               <w:jc w:val="left"/>
             </w:pPr>
             <w:r>
-              <w:t xml:space="preserve">3.0.0</w:t>
-            </w:r>
-          </w:p>
-        </w:tc>
-        <w:tc>
-          <w:tcPr/>
-          <w:p>
-            <w:pPr>
-              <w:jc w:val="left"/>
-            </w:pPr>
-            <w:r>
-              <w:t xml:space="preserve">2026-09-09</w:t>
+              <w:t xml:space="preserve">3.0.1</w:t>
+            </w:r>
+          </w:p>
+        </w:tc>
+        <w:tc>
+          <w:tcPr/>
+          <w:p>
+            <w:pPr>
+              <w:jc w:val="left"/>
+            </w:pPr>
+            <w:r>
+              <w:t xml:space="preserve">2026-09-10</w:t>
             </w:r>
           </w:p>
         </w:tc>
@@ -16850,7 +16850,7 @@
               <w:jc w:val="left"/>
             </w:pPr>
             <w:r>
-              <w:t xml:space="preserve">Modular pipeline refactoring: shared Lua filter factory, shared DOCX fix logic, build system auto-discovery, unified format pipeline, GitHub Actions CI.</w:t>
+              <w:t xml:space="preserve">Minor fixes: test-filter.sh auto-discovery, build.sh help text, Makefile aggregate descriptions, 5-section comment correction, CHANGELOG version gap note, callout-in-code fix, CI font auto-discovery, dofile path comment, test-sync.sh header.</w:t>
             </w:r>
           </w:p>
         </w:tc>
@@ -16865,7 +16865,7 @@
               <w:jc w:val="left"/>
             </w:pPr>
             <w:r>
-              <w:t xml:space="preserve">2.16.0</w:t>
+              <w:t xml:space="preserve">3.0.0</w:t>
             </w:r>
           </w:p>
         </w:tc>
@@ -16878,7 +16878,7 @@
               <w:jc w:val="left"/>
             </w:pPr>
             <w:r>
-              <w:t xml:space="preserve">2026-09-05</w:t>
+              <w:t xml:space="preserve">2026-09-09</w:t>
             </w:r>
           </w:p>
         </w:tc>
@@ -16895,7 +16895,7 @@
               <w:jc w:val="left"/>
             </w:pPr>
             <w:r>
-              <w:t xml:space="preserve">Updated to match template v2.16.0 — Lua filter fixes, build system updates, and technical template parity improvements.</w:t>
+              <w:t xml:space="preserve">Modular pipeline refactoring: shared Lua filter factory, shared DOCX fix logic, build system auto-discovery, unified format pipeline, GitHub Actions CI.</w:t>
             </w:r>
           </w:p>
         </w:tc>
@@ -16908,18 +16908,18 @@
               <w:jc w:val="left"/>
             </w:pPr>
             <w:r>
-              <w:t xml:space="preserve">2.13.0</w:t>
-            </w:r>
-          </w:p>
-        </w:tc>
-        <w:tc>
-          <w:tcPr/>
-          <w:p>
-            <w:pPr>
-              <w:jc w:val="left"/>
-            </w:pPr>
-            <w:r>
-              <w:t xml:space="preserve">2026-08-24</w:t>
+              <w:t xml:space="preserve">2.16.0</w:t>
+            </w:r>
+          </w:p>
+        </w:tc>
+        <w:tc>
+          <w:tcPr/>
+          <w:p>
+            <w:pPr>
+              <w:jc w:val="left"/>
+            </w:pPr>
+            <w:r>
+              <w:t xml:space="preserve">2026-09-05</w:t>
             </w:r>
           </w:p>
         </w:tc>
@@ -16934,6 +16934,51 @@
               <w:jc w:val="left"/>
             </w:pPr>
             <w:r>
+              <w:t xml:space="preserve">Updated to match template v2.16.0 — Lua filter fixes, build system updates, and technical template parity improvements.</w:t>
+            </w:r>
+          </w:p>
+        </w:tc>
+      </w:tr>
+      <w:tr>
+        <w:tc>
+          <w:tcPr>
+            <w:shd w:val="clear" w:color="auto" w:fill="F6F8FA"/>
+          </w:tcPr>
+          <w:p>
+            <w:pPr>
+              <w:jc w:val="left"/>
+            </w:pPr>
+            <w:r>
+              <w:t xml:space="preserve">2.13.0</w:t>
+            </w:r>
+          </w:p>
+        </w:tc>
+        <w:tc>
+          <w:tcPr>
+            <w:shd w:val="clear" w:color="auto" w:fill="F6F8FA"/>
+          </w:tcPr>
+          <w:p>
+            <w:pPr>
+              <w:jc w:val="left"/>
+            </w:pPr>
+            <w:r>
+              <w:t xml:space="preserve">2026-08-24</w:t>
+            </w:r>
+          </w:p>
+        </w:tc>
+        <w:tc>
+          <w:tcPr>
+            <w:shd w:val="clear" w:color="auto" w:fill="F6F8FA"/>
+          </w:tcPr>
+          <w:p>
+            <w:pPr>
+              <w:numPr>
+                <w:ilvl w:val="0"/>
+                <w:numId w:val="1095"/>
+              </w:numPr>
+              <w:jc w:val="left"/>
+            </w:pPr>
+            <w:r>
               <w:t xml:space="preserve">Foundation refactoring Phase 4: make DOCX</w:t>
             </w:r>
             <w:r>
@@ -17001,9 +17046,7 @@
       </w:tr>
       <w:tr>
         <w:tc>
-          <w:tcPr>
-            <w:shd w:val="clear" w:color="auto" w:fill="F6F8FA"/>
-          </w:tcPr>
+          <w:tcPr/>
           <w:p>
             <w:pPr>
               <w:jc w:val="left"/>
@@ -17014,9 +17057,7 @@
           </w:p>
         </w:tc>
         <w:tc>
-          <w:tcPr>
-            <w:shd w:val="clear" w:color="auto" w:fill="F6F8FA"/>
-          </w:tcPr>
+          <w:tcPr/>
           <w:p>
             <w:pPr>
               <w:jc w:val="left"/>
@@ -17027,14 +17068,12 @@
           </w:p>
         </w:tc>
         <w:tc>
-          <w:tcPr>
-            <w:shd w:val="clear" w:color="auto" w:fill="F6F8FA"/>
-          </w:tcPr>
+          <w:tcPr/>
           <w:p>
             <w:pPr>
               <w:numPr>
                 <w:ilvl w:val="0"/>
-                <w:numId w:val="1095"/>
+                <w:numId w:val="1096"/>
               </w:numPr>
               <w:jc w:val="left"/>
             </w:pPr>
@@ -17196,7 +17235,9 @@
       </w:tr>
       <w:tr>
         <w:tc>
-          <w:tcPr/>
+          <w:tcPr>
+            <w:shd w:val="clear" w:color="auto" w:fill="F6F8FA"/>
+          </w:tcPr>
           <w:p>
             <w:pPr>
               <w:jc w:val="left"/>
@@ -17207,7 +17248,9 @@
           </w:p>
         </w:tc>
         <w:tc>
-          <w:tcPr/>
+          <w:tcPr>
+            <w:shd w:val="clear" w:color="auto" w:fill="F6F8FA"/>
+          </w:tcPr>
           <w:p>
             <w:pPr>
               <w:jc w:val="left"/>
@@ -17218,12 +17261,14 @@
           </w:p>
         </w:tc>
         <w:tc>
-          <w:tcPr/>
+          <w:tcPr>
+            <w:shd w:val="clear" w:color="auto" w:fill="F6F8FA"/>
+          </w:tcPr>
           <w:p>
             <w:pPr>
               <w:numPr>
                 <w:ilvl w:val="0"/>
-                <w:numId w:val="1096"/>
+                <w:numId w:val="1097"/>
               </w:numPr>
               <w:jc w:val="left"/>
             </w:pPr>
@@ -17289,9 +17334,7 @@
       </w:tr>
       <w:tr>
         <w:tc>
-          <w:tcPr>
-            <w:shd w:val="clear" w:color="auto" w:fill="F6F8FA"/>
-          </w:tcPr>
+          <w:tcPr/>
           <w:p>
             <w:pPr>
               <w:jc w:val="left"/>
@@ -17302,56 +17345,13 @@
           </w:p>
         </w:tc>
         <w:tc>
-          <w:tcPr>
-            <w:shd w:val="clear" w:color="auto" w:fill="F6F8FA"/>
-          </w:tcPr>
+          <w:tcPr/>
           <w:p>
             <w:pPr>
               <w:jc w:val="left"/>
             </w:pPr>
             <w:r>
               <w:t xml:space="preserve">2026-08-24</w:t>
-            </w:r>
-          </w:p>
-        </w:tc>
-        <w:tc>
-          <w:tcPr>
-            <w:shd w:val="clear" w:color="auto" w:fill="F6F8FA"/>
-          </w:tcPr>
-          <w:p>
-            <w:pPr>
-              <w:numPr>
-                <w:ilvl w:val="0"/>
-                <w:numId w:val="1097"/>
-              </w:numPr>
-              <w:jc w:val="left"/>
-            </w:pPr>
-            <w:r>
-              <w:t xml:space="preserve">Foundation refactoring Phase 1: sync cls version to project tag, fix stale doc references (L16 output count, L-range, setup-guide feature claim), add test-sync.sh for version consistency checking.</w:t>
-            </w:r>
-          </w:p>
-        </w:tc>
-      </w:tr>
-      <w:tr>
-        <w:tc>
-          <w:tcPr/>
-          <w:p>
-            <w:pPr>
-              <w:jc w:val="left"/>
-            </w:pPr>
-            <w:r>
-              <w:t xml:space="preserve">2.9.1</w:t>
-            </w:r>
-          </w:p>
-        </w:tc>
-        <w:tc>
-          <w:tcPr/>
-          <w:p>
-            <w:pPr>
-              <w:jc w:val="left"/>
-            </w:pPr>
-            <w:r>
-              <w:t xml:space="preserve">2026-08-23</w:t>
             </w:r>
           </w:p>
         </w:tc>
@@ -17366,6 +17366,51 @@
               <w:jc w:val="left"/>
             </w:pPr>
             <w:r>
+              <w:t xml:space="preserve">Foundation refactoring Phase 1: sync cls version to project tag, fix stale doc references (L16 output count, L-range, setup-guide feature claim), add test-sync.sh for version consistency checking.</w:t>
+            </w:r>
+          </w:p>
+        </w:tc>
+      </w:tr>
+      <w:tr>
+        <w:tc>
+          <w:tcPr>
+            <w:shd w:val="clear" w:color="auto" w:fill="F6F8FA"/>
+          </w:tcPr>
+          <w:p>
+            <w:pPr>
+              <w:jc w:val="left"/>
+            </w:pPr>
+            <w:r>
+              <w:t xml:space="preserve">2.9.1</w:t>
+            </w:r>
+          </w:p>
+        </w:tc>
+        <w:tc>
+          <w:tcPr>
+            <w:shd w:val="clear" w:color="auto" w:fill="F6F8FA"/>
+          </w:tcPr>
+          <w:p>
+            <w:pPr>
+              <w:jc w:val="left"/>
+            </w:pPr>
+            <w:r>
+              <w:t xml:space="preserve">2026-08-23</w:t>
+            </w:r>
+          </w:p>
+        </w:tc>
+        <w:tc>
+          <w:tcPr>
+            <w:shd w:val="clear" w:color="auto" w:fill="F6F8FA"/>
+          </w:tcPr>
+          <w:p>
+            <w:pPr>
+              <w:numPr>
+                <w:ilvl w:val="0"/>
+                <w:numId w:val="1099"/>
+              </w:numPr>
+              <w:jc w:val="left"/>
+            </w:pPr>
+            <w:r>
               <w:t xml:space="preserve">HTML and Markdown outputs now embed images as base64 data URIs. HTML uses pandoc</w:t>
             </w:r>
             <w:r>
@@ -17397,58 +17442,13 @@
       </w:tr>
       <w:tr>
         <w:tc>
-          <w:tcPr>
-            <w:shd w:val="clear" w:color="auto" w:fill="F6F8FA"/>
-          </w:tcPr>
+          <w:tcPr/>
           <w:p>
             <w:pPr>
               <w:jc w:val="left"/>
             </w:pPr>
             <w:r>
               <w:t xml:space="preserve">2.9.0</w:t>
-            </w:r>
-          </w:p>
-        </w:tc>
-        <w:tc>
-          <w:tcPr>
-            <w:shd w:val="clear" w:color="auto" w:fill="F6F8FA"/>
-          </w:tcPr>
-          <w:p>
-            <w:pPr>
-              <w:jc w:val="left"/>
-            </w:pPr>
-            <w:r>
-              <w:t xml:space="preserve">2026-08-23</w:t>
-            </w:r>
-          </w:p>
-        </w:tc>
-        <w:tc>
-          <w:tcPr>
-            <w:shd w:val="clear" w:color="auto" w:fill="F6F8FA"/>
-          </w:tcPr>
-          <w:p>
-            <w:pPr>
-              <w:numPr>
-                <w:ilvl w:val="0"/>
-                <w:numId w:val="1099"/>
-              </w:numPr>
-              <w:jc w:val="left"/>
-            </w:pPr>
-            <w:r>
-              <w:t xml:space="preserve">DOCX: fix content width (8504→9638tw, margins are 2cm not 3cm). Add footer page numbers. Style TOC heading (22pt bold + rule). Add hutable table width + fixed layout.</w:t>
-            </w:r>
-          </w:p>
-        </w:tc>
-      </w:tr>
-      <w:tr>
-        <w:tc>
-          <w:tcPr/>
-          <w:p>
-            <w:pPr>
-              <w:jc w:val="left"/>
-            </w:pPr>
-            <w:r>
-              <w:t xml:space="preserve">2.8.3</w:t>
             </w:r>
           </w:p>
         </w:tc>
@@ -17474,7 +17474,7 @@
               <w:jc w:val="left"/>
             </w:pPr>
             <w:r>
-              <w:t xml:space="preserve">DOCX fix: callout tables now have explicit width (8504tw) and fixed layout. Changelog section heading now uses custom H1 format (56pt number, red border, right tab) instead of pandoc’s default.</w:t>
+              <w:t xml:space="preserve">DOCX: fix content width (8504→9638tw, margins are 2cm not 3cm). Add footer page numbers. Style TOC heading (22pt bold + rule). Add hutable table width + fixed layout.</w:t>
             </w:r>
           </w:p>
         </w:tc>
@@ -17489,7 +17489,7 @@
               <w:jc w:val="left"/>
             </w:pPr>
             <w:r>
-              <w:t xml:space="preserve">2.8.2</w:t>
+              <w:t xml:space="preserve">2.8.3</w:t>
             </w:r>
           </w:p>
         </w:tc>
@@ -17519,7 +17519,7 @@
               <w:jc w:val="left"/>
             </w:pPr>
             <w:r>
-              <w:t xml:space="preserve">DOCX H1 heading: reverted table approach to paragraph with tab stop + red bottom border. Table broke navigation pane and TOC field. Paragraph preserves Heading1 style for navigation while matching PDF layout (number left, title right, red rule below).</w:t>
+              <w:t xml:space="preserve">DOCX fix: callout tables now have explicit width (8504tw) and fixed layout. Changelog section heading now uses custom H1 format (56pt number, red border, right tab) instead of pandoc’s default.</w:t>
             </w:r>
           </w:p>
         </w:tc>
@@ -17532,7 +17532,7 @@
               <w:jc w:val="left"/>
             </w:pPr>
             <w:r>
-              <w:t xml:space="preserve">2.8.1</w:t>
+              <w:t xml:space="preserve">2.8.2</w:t>
             </w:r>
           </w:p>
         </w:tc>
@@ -17558,7 +17558,7 @@
               <w:jc w:val="left"/>
             </w:pPr>
             <w:r>
-              <w:t xml:space="preserve">DOCX heading fix: text color reverted to black (was incorrectly changed to Huawei red in v2.8.0). H1 now uses a two-column table (number left, title right) with red bottom rule. H2-H4 use simple inline format (number + title, no right tab stop).</w:t>
+              <w:t xml:space="preserve">DOCX H1 heading: reverted table approach to paragraph with tab stop + red bottom border. Table broke navigation pane and TOC field. Paragraph preserves Heading1 style for navigation while matching PDF layout (number left, title right, red rule below).</w:t>
             </w:r>
           </w:p>
         </w:tc>
@@ -17573,7 +17573,7 @@
               <w:jc w:val="left"/>
             </w:pPr>
             <w:r>
-              <w:t xml:space="preserve">2.8.0</w:t>
+              <w:t xml:space="preserve">2.8.1</w:t>
             </w:r>
           </w:p>
         </w:tc>
@@ -17603,7 +17603,7 @@
               <w:jc w:val="left"/>
             </w:pPr>
             <w:r>
-              <w:t xml:space="preserve">DOCX output: match PDF styling --- heading colors (Huawei red), H1 number size (56pt), callout borders (left-only) and padding, changelog formatting (rules, bold version, italic date), caption style (9pt bold), badge style (8pt bold white on red), list indentation.</w:t>
+              <w:t xml:space="preserve">DOCX heading fix: text color reverted to black (was incorrectly changed to Huawei red in v2.8.0). H1 now uses a two-column table (number left, title right) with red bottom rule. H2-H4 use simple inline format (number + title, no right tab stop).</w:t>
             </w:r>
           </w:p>
         </w:tc>
@@ -17616,18 +17616,18 @@
               <w:jc w:val="left"/>
             </w:pPr>
             <w:r>
-              <w:t xml:space="preserve">2.7.1</w:t>
-            </w:r>
-          </w:p>
-        </w:tc>
-        <w:tc>
-          <w:tcPr/>
-          <w:p>
-            <w:pPr>
-              <w:jc w:val="left"/>
-            </w:pPr>
-            <w:r>
-              <w:t xml:space="preserve">2026-08-17</w:t>
+              <w:t xml:space="preserve">2.8.0</w:t>
+            </w:r>
+          </w:p>
+        </w:tc>
+        <w:tc>
+          <w:tcPr/>
+          <w:p>
+            <w:pPr>
+              <w:jc w:val="left"/>
+            </w:pPr>
+            <w:r>
+              <w:t xml:space="preserve">2026-08-23</w:t>
             </w:r>
           </w:p>
         </w:tc>
@@ -17642,6 +17642,51 @@
               <w:jc w:val="left"/>
             </w:pPr>
             <w:r>
+              <w:t xml:space="preserve">DOCX output: match PDF styling --- heading colors (Huawei red), H1 number size (56pt), callout borders (left-only) and padding, changelog formatting (rules, bold version, italic date), caption style (9pt bold), badge style (8pt bold white on red), list indentation.</w:t>
+            </w:r>
+          </w:p>
+        </w:tc>
+      </w:tr>
+      <w:tr>
+        <w:tc>
+          <w:tcPr>
+            <w:shd w:val="clear" w:color="auto" w:fill="F6F8FA"/>
+          </w:tcPr>
+          <w:p>
+            <w:pPr>
+              <w:jc w:val="left"/>
+            </w:pPr>
+            <w:r>
+              <w:t xml:space="preserve">2.7.1</w:t>
+            </w:r>
+          </w:p>
+        </w:tc>
+        <w:tc>
+          <w:tcPr>
+            <w:shd w:val="clear" w:color="auto" w:fill="F6F8FA"/>
+          </w:tcPr>
+          <w:p>
+            <w:pPr>
+              <w:jc w:val="left"/>
+            </w:pPr>
+            <w:r>
+              <w:t xml:space="preserve">2026-08-17</w:t>
+            </w:r>
+          </w:p>
+        </w:tc>
+        <w:tc>
+          <w:tcPr>
+            <w:shd w:val="clear" w:color="auto" w:fill="F6F8FA"/>
+          </w:tcPr>
+          <w:p>
+            <w:pPr>
+              <w:numPr>
+                <w:ilvl w:val="0"/>
+                <w:numId w:val="1105"/>
+              </w:numPr>
+              <w:jc w:val="left"/>
+            </w:pPr>
+            <w:r>
               <w:t xml:space="preserve">Rename project repository to all lowercase (</w:t>
             </w:r>
             <w:r>
@@ -17658,9 +17703,7 @@
       </w:tr>
       <w:tr>
         <w:tc>
-          <w:tcPr>
-            <w:shd w:val="clear" w:color="auto" w:fill="F6F8FA"/>
-          </w:tcPr>
+          <w:tcPr/>
           <w:p>
             <w:pPr>
               <w:jc w:val="left"/>
@@ -17671,9 +17714,7 @@
           </w:p>
         </w:tc>
         <w:tc>
-          <w:tcPr>
-            <w:shd w:val="clear" w:color="auto" w:fill="F6F8FA"/>
-          </w:tcPr>
+          <w:tcPr/>
           <w:p>
             <w:pPr>
               <w:jc w:val="left"/>
@@ -17684,14 +17725,12 @@
           </w:p>
         </w:tc>
         <w:tc>
-          <w:tcPr>
-            <w:shd w:val="clear" w:color="auto" w:fill="F6F8FA"/>
-          </w:tcPr>
+          <w:tcPr/>
           <w:p>
             <w:pPr>
               <w:numPr>
                 <w:ilvl w:val="0"/>
-                <w:numId w:val="1105"/>
+                <w:numId w:val="1106"/>
               </w:numPr>
               <w:jc w:val="left"/>
             </w:pPr>
@@ -17733,7 +17772,9 @@
       </w:tr>
       <w:tr>
         <w:tc>
-          <w:tcPr/>
+          <w:tcPr>
+            <w:shd w:val="clear" w:color="auto" w:fill="F6F8FA"/>
+          </w:tcPr>
           <w:p>
             <w:pPr>
               <w:jc w:val="left"/>
@@ -17744,7 +17785,9 @@
           </w:p>
         </w:tc>
         <w:tc>
-          <w:tcPr/>
+          <w:tcPr>
+            <w:shd w:val="clear" w:color="auto" w:fill="F6F8FA"/>
+          </w:tcPr>
           <w:p>
             <w:pPr>
               <w:jc w:val="left"/>
@@ -17755,12 +17798,14 @@
           </w:p>
         </w:tc>
         <w:tc>
-          <w:tcPr/>
+          <w:tcPr>
+            <w:shd w:val="clear" w:color="auto" w:fill="F6F8FA"/>
+          </w:tcPr>
           <w:p>
             <w:pPr>
               <w:numPr>
                 <w:ilvl w:val="0"/>
-                <w:numId w:val="1106"/>
+                <w:numId w:val="1107"/>
               </w:numPr>
               <w:jc w:val="left"/>
             </w:pPr>
@@ -17817,9 +17862,7 @@
       </w:tr>
       <w:tr>
         <w:tc>
-          <w:tcPr>
-            <w:shd w:val="clear" w:color="auto" w:fill="F6F8FA"/>
-          </w:tcPr>
+          <w:tcPr/>
           <w:p>
             <w:pPr>
               <w:jc w:val="left"/>
@@ -17830,9 +17873,7 @@
           </w:p>
         </w:tc>
         <w:tc>
-          <w:tcPr>
-            <w:shd w:val="clear" w:color="auto" w:fill="F6F8FA"/>
-          </w:tcPr>
+          <w:tcPr/>
           <w:p>
             <w:pPr>
               <w:jc w:val="left"/>
@@ -17843,14 +17884,12 @@
           </w:p>
         </w:tc>
         <w:tc>
-          <w:tcPr>
-            <w:shd w:val="clear" w:color="auto" w:fill="F6F8FA"/>
-          </w:tcPr>
+          <w:tcPr/>
           <w:p>
             <w:pPr>
               <w:numPr>
                 <w:ilvl w:val="0"/>
-                <w:numId w:val="1107"/>
+                <w:numId w:val="1108"/>
               </w:numPr>
               <w:jc w:val="left"/>
             </w:pPr>
@@ -17877,7 +17916,7 @@
             <w:pPr>
               <w:numPr>
                 <w:ilvl w:val="0"/>
-                <w:numId w:val="1107"/>
+                <w:numId w:val="1108"/>
               </w:numPr>
               <w:jc w:val="left"/>
             </w:pPr>
@@ -17904,54 +17943,15 @@
       </w:tr>
       <w:tr>
         <w:tc>
-          <w:tcPr/>
+          <w:tcPr>
+            <w:shd w:val="clear" w:color="auto" w:fill="F6F8FA"/>
+          </w:tcPr>
           <w:p>
             <w:pPr>
               <w:jc w:val="left"/>
             </w:pPr>
             <w:r>
               <w:t xml:space="preserve">2.5.1</w:t>
-            </w:r>
-          </w:p>
-        </w:tc>
-        <w:tc>
-          <w:tcPr/>
-          <w:p>
-            <w:pPr>
-              <w:jc w:val="left"/>
-            </w:pPr>
-            <w:r>
-              <w:t xml:space="preserve">2026-08-10</w:t>
-            </w:r>
-          </w:p>
-        </w:tc>
-        <w:tc>
-          <w:tcPr/>
-          <w:p>
-            <w:pPr>
-              <w:numPr>
-                <w:ilvl w:val="0"/>
-                <w:numId w:val="1108"/>
-              </w:numPr>
-              <w:jc w:val="left"/>
-            </w:pPr>
-            <w:r>
-              <w:t xml:space="preserve">H1 section title size reduced from 27pt to 20pt.</w:t>
-            </w:r>
-          </w:p>
-        </w:tc>
-      </w:tr>
-      <w:tr>
-        <w:tc>
-          <w:tcPr>
-            <w:shd w:val="clear" w:color="auto" w:fill="F6F8FA"/>
-          </w:tcPr>
-          <w:p>
-            <w:pPr>
-              <w:jc w:val="left"/>
-            </w:pPr>
-            <w:r>
-              <w:t xml:space="preserve">2.5.0</w:t>
             </w:r>
           </w:p>
         </w:tc>
@@ -17981,13 +17981,7 @@
               <w:jc w:val="left"/>
             </w:pPr>
             <w:r>
-              <w:t xml:space="preserve">Default image size increased: width 65% → 90% of text width,</w:t>
-            </w:r>
-            <w:r>
-              <w:t xml:space="preserve"> </w:t>
-            </w:r>
-            <w:r>
-              <w:t xml:space="preserve">height 40% → 50% of text height.</w:t>
+              <w:t xml:space="preserve">H1 section title size reduced from 27pt to 20pt.</w:t>
             </w:r>
           </w:p>
         </w:tc>
@@ -18000,7 +17994,7 @@
               <w:jc w:val="left"/>
             </w:pPr>
             <w:r>
-              <w:t xml:space="preserve">2.4.0</w:t>
+              <w:t xml:space="preserve">2.5.0</w:t>
             </w:r>
           </w:p>
         </w:tc>
@@ -18026,14 +18020,65 @@
               <w:jc w:val="left"/>
             </w:pPr>
             <w:r>
-              <w:t xml:space="preserve">Enlarged H1 section title (18pt → 27pt, 50% bigger).</w:t>
-            </w:r>
-          </w:p>
+              <w:t xml:space="preserve">Default image size increased: width 65% → 90% of text width,</w:t>
+            </w:r>
+            <w:r>
+              <w:t xml:space="preserve"> </w:t>
+            </w:r>
+            <w:r>
+              <w:t xml:space="preserve">height 40% → 50% of text height.</w:t>
+            </w:r>
+          </w:p>
+        </w:tc>
+      </w:tr>
+      <w:tr>
+        <w:tc>
+          <w:tcPr>
+            <w:shd w:val="clear" w:color="auto" w:fill="F6F8FA"/>
+          </w:tcPr>
+          <w:p>
+            <w:pPr>
+              <w:jc w:val="left"/>
+            </w:pPr>
+            <w:r>
+              <w:t xml:space="preserve">2.4.0</w:t>
+            </w:r>
+          </w:p>
+        </w:tc>
+        <w:tc>
+          <w:tcPr>
+            <w:shd w:val="clear" w:color="auto" w:fill="F6F8FA"/>
+          </w:tcPr>
+          <w:p>
+            <w:pPr>
+              <w:jc w:val="left"/>
+            </w:pPr>
+            <w:r>
+              <w:t xml:space="preserve">2026-08-10</w:t>
+            </w:r>
+          </w:p>
+        </w:tc>
+        <w:tc>
+          <w:tcPr>
+            <w:shd w:val="clear" w:color="auto" w:fill="F6F8FA"/>
+          </w:tcPr>
           <w:p>
             <w:pPr>
               <w:numPr>
                 <w:ilvl w:val="0"/>
-                <w:numId w:val="1110"/>
+                <w:numId w:val="1111"/>
+              </w:numPr>
+              <w:jc w:val="left"/>
+            </w:pPr>
+            <w:r>
+              <w:t xml:space="preserve">Enlarged H1 section title (18pt → 27pt, 50% bigger).</w:t>
+            </w:r>
+          </w:p>
+          <w:p>
+            <w:pPr>
+              <w:numPr>
+                <w:ilvl w:val="0"/>
+                <w:numId w:val="1111"/>
               </w:numPr>
               <w:jc w:val="left"/>
             </w:pPr>
@@ -18060,9 +18105,7 @@
       </w:tr>
       <w:tr>
         <w:tc>
-          <w:tcPr>
-            <w:shd w:val="clear" w:color="auto" w:fill="F6F8FA"/>
-          </w:tcPr>
+          <w:tcPr/>
           <w:p>
             <w:pPr>
               <w:jc w:val="left"/>
@@ -18073,9 +18116,7 @@
           </w:p>
         </w:tc>
         <w:tc>
-          <w:tcPr>
-            <w:shd w:val="clear" w:color="auto" w:fill="F6F8FA"/>
-          </w:tcPr>
+          <w:tcPr/>
           <w:p>
             <w:pPr>
               <w:jc w:val="left"/>
@@ -18086,14 +18127,12 @@
           </w:p>
         </w:tc>
         <w:tc>
-          <w:tcPr>
-            <w:shd w:val="clear" w:color="auto" w:fill="F6F8FA"/>
-          </w:tcPr>
+          <w:tcPr/>
           <w:p>
             <w:pPr>
               <w:numPr>
                 <w:ilvl w:val="0"/>
-                <w:numId w:val="1111"/>
+                <w:numId w:val="1112"/>
               </w:numPr>
               <w:jc w:val="left"/>
             </w:pPr>
@@ -18120,7 +18159,9 @@
       </w:tr>
       <w:tr>
         <w:tc>
-          <w:tcPr/>
+          <w:tcPr>
+            <w:shd w:val="clear" w:color="auto" w:fill="F6F8FA"/>
+          </w:tcPr>
           <w:p>
             <w:pPr>
               <w:jc w:val="left"/>
@@ -18131,7 +18172,9 @@
           </w:p>
         </w:tc>
         <w:tc>
-          <w:tcPr/>
+          <w:tcPr>
+            <w:shd w:val="clear" w:color="auto" w:fill="F6F8FA"/>
+          </w:tcPr>
           <w:p>
             <w:pPr>
               <w:jc w:val="left"/>
@@ -18142,12 +18185,14 @@
           </w:p>
         </w:tc>
         <w:tc>
-          <w:tcPr/>
+          <w:tcPr>
+            <w:shd w:val="clear" w:color="auto" w:fill="F6F8FA"/>
+          </w:tcPr>
           <w:p>
             <w:pPr>
               <w:numPr>
                 <w:ilvl w:val="0"/>
-                <w:numId w:val="1112"/>
+                <w:numId w:val="1113"/>
               </w:numPr>
               <w:jc w:val="left"/>
             </w:pPr>
@@ -18219,9 +18264,7 @@
       </w:tr>
       <w:tr>
         <w:tc>
-          <w:tcPr>
-            <w:shd w:val="clear" w:color="auto" w:fill="F6F8FA"/>
-          </w:tcPr>
+          <w:tcPr/>
           <w:p>
             <w:pPr>
               <w:jc w:val="left"/>
@@ -18232,9 +18275,7 @@
           </w:p>
         </w:tc>
         <w:tc>
-          <w:tcPr>
-            <w:shd w:val="clear" w:color="auto" w:fill="F6F8FA"/>
-          </w:tcPr>
+          <w:tcPr/>
           <w:p>
             <w:pPr>
               <w:jc w:val="left"/>
@@ -18245,14 +18286,12 @@
           </w:p>
         </w:tc>
         <w:tc>
-          <w:tcPr>
-            <w:shd w:val="clear" w:color="auto" w:fill="F6F8FA"/>
-          </w:tcPr>
+          <w:tcPr/>
           <w:p>
             <w:pPr>
               <w:numPr>
                 <w:ilvl w:val="0"/>
-                <w:numId w:val="1113"/>
+                <w:numId w:val="1114"/>
               </w:numPr>
               <w:jc w:val="left"/>
             </w:pPr>
@@ -18309,7 +18348,9 @@
       </w:tr>
       <w:tr>
         <w:tc>
-          <w:tcPr/>
+          <w:tcPr>
+            <w:shd w:val="clear" w:color="auto" w:fill="F6F8FA"/>
+          </w:tcPr>
           <w:p>
             <w:pPr>
               <w:jc w:val="left"/>
@@ -18320,7 +18361,9 @@
           </w:p>
         </w:tc>
         <w:tc>
-          <w:tcPr/>
+          <w:tcPr>
+            <w:shd w:val="clear" w:color="auto" w:fill="F6F8FA"/>
+          </w:tcPr>
           <w:p>
             <w:pPr>
               <w:jc w:val="left"/>
@@ -18331,12 +18374,14 @@
           </w:p>
         </w:tc>
         <w:tc>
-          <w:tcPr/>
+          <w:tcPr>
+            <w:shd w:val="clear" w:color="auto" w:fill="F6F8FA"/>
+          </w:tcPr>
           <w:p>
             <w:pPr>
               <w:numPr>
                 <w:ilvl w:val="0"/>
-                <w:numId w:val="1114"/>
+                <w:numId w:val="1115"/>
               </w:numPr>
               <w:jc w:val="left"/>
             </w:pPr>
@@ -18363,58 +18408,13 @@
       </w:tr>
       <w:tr>
         <w:tc>
-          <w:tcPr>
-            <w:shd w:val="clear" w:color="auto" w:fill="F6F8FA"/>
-          </w:tcPr>
+          <w:tcPr/>
           <w:p>
             <w:pPr>
               <w:jc w:val="left"/>
             </w:pPr>
             <w:r>
               <w:t xml:space="preserve">2.2.2</w:t>
-            </w:r>
-          </w:p>
-        </w:tc>
-        <w:tc>
-          <w:tcPr>
-            <w:shd w:val="clear" w:color="auto" w:fill="F6F8FA"/>
-          </w:tcPr>
-          <w:p>
-            <w:pPr>
-              <w:jc w:val="left"/>
-            </w:pPr>
-            <w:r>
-              <w:t xml:space="preserve">2026-08-08</w:t>
-            </w:r>
-          </w:p>
-        </w:tc>
-        <w:tc>
-          <w:tcPr>
-            <w:shd w:val="clear" w:color="auto" w:fill="F6F8FA"/>
-          </w:tcPr>
-          <w:p>
-            <w:pPr>
-              <w:numPr>
-                <w:ilvl w:val="0"/>
-                <w:numId w:val="1115"/>
-              </w:numPr>
-              <w:jc w:val="left"/>
-            </w:pPr>
-            <w:r>
-              <w:t xml:space="preserve">Fixed chapter reference in prerequisite (Chapter 3 → Chapter 4).</w:t>
-            </w:r>
-          </w:p>
-        </w:tc>
-      </w:tr>
-      <w:tr>
-        <w:tc>
-          <w:tcPr/>
-          <w:p>
-            <w:pPr>
-              <w:jc w:val="left"/>
-            </w:pPr>
-            <w:r>
-              <w:t xml:space="preserve">2.2.1</w:t>
             </w:r>
           </w:p>
         </w:tc>
@@ -18440,7 +18440,7 @@
               <w:jc w:val="left"/>
             </w:pPr>
             <w:r>
-              <w:t xml:space="preserve">Changed table and figure caption labels to black (was Huawei red).</w:t>
+              <w:t xml:space="preserve">Fixed chapter reference in prerequisite (Chapter 3 → Chapter 4).</w:t>
             </w:r>
           </w:p>
         </w:tc>
@@ -18455,7 +18455,7 @@
               <w:jc w:val="left"/>
             </w:pPr>
             <w:r>
-              <w:t xml:space="preserve">2.2.0</w:t>
+              <w:t xml:space="preserve">2.2.1</w:t>
             </w:r>
           </w:p>
         </w:tc>
@@ -18485,13 +18485,7 @@
               <w:jc w:val="left"/>
             </w:pPr>
             <w:r>
-              <w:t xml:space="preserve">Added Huawei-branded table styling: red header bar, alternating row</w:t>
-            </w:r>
-            <w:r>
-              <w:t xml:space="preserve"> </w:t>
-            </w:r>
-            <w:r>
-              <w:t xml:space="preserve">colors, and bordered cells.</w:t>
+              <w:t xml:space="preserve">Changed table and figure caption labels to black (was Huawei red).</w:t>
             </w:r>
           </w:p>
         </w:tc>
@@ -18504,18 +18498,18 @@
               <w:jc w:val="left"/>
             </w:pPr>
             <w:r>
-              <w:t xml:space="preserve">2.1.0</w:t>
-            </w:r>
-          </w:p>
-        </w:tc>
-        <w:tc>
-          <w:tcPr/>
-          <w:p>
-            <w:pPr>
-              <w:jc w:val="left"/>
-            </w:pPr>
-            <w:r>
-              <w:t xml:space="preserve">2026-08-06</w:t>
+              <w:t xml:space="preserve">2.2.0</w:t>
+            </w:r>
+          </w:p>
+        </w:tc>
+        <w:tc>
+          <w:tcPr/>
+          <w:p>
+            <w:pPr>
+              <w:jc w:val="left"/>
+            </w:pPr>
+            <w:r>
+              <w:t xml:space="preserve">2026-08-08</w:t>
             </w:r>
           </w:p>
         </w:tc>
@@ -18530,6 +18524,57 @@
               <w:jc w:val="left"/>
             </w:pPr>
             <w:r>
+              <w:t xml:space="preserve">Added Huawei-branded table styling: red header bar, alternating row</w:t>
+            </w:r>
+            <w:r>
+              <w:t xml:space="preserve"> </w:t>
+            </w:r>
+            <w:r>
+              <w:t xml:space="preserve">colors, and bordered cells.</w:t>
+            </w:r>
+          </w:p>
+        </w:tc>
+      </w:tr>
+      <w:tr>
+        <w:tc>
+          <w:tcPr>
+            <w:shd w:val="clear" w:color="auto" w:fill="F6F8FA"/>
+          </w:tcPr>
+          <w:p>
+            <w:pPr>
+              <w:jc w:val="left"/>
+            </w:pPr>
+            <w:r>
+              <w:t xml:space="preserve">2.1.0</w:t>
+            </w:r>
+          </w:p>
+        </w:tc>
+        <w:tc>
+          <w:tcPr>
+            <w:shd w:val="clear" w:color="auto" w:fill="F6F8FA"/>
+          </w:tcPr>
+          <w:p>
+            <w:pPr>
+              <w:jc w:val="left"/>
+            </w:pPr>
+            <w:r>
+              <w:t xml:space="preserve">2026-08-06</w:t>
+            </w:r>
+          </w:p>
+        </w:tc>
+        <w:tc>
+          <w:tcPr>
+            <w:shd w:val="clear" w:color="auto" w:fill="F6F8FA"/>
+          </w:tcPr>
+          <w:p>
+            <w:pPr>
+              <w:numPr>
+                <w:ilvl w:val="0"/>
+                <w:numId w:val="1119"/>
+              </w:numPr>
+              <w:jc w:val="left"/>
+            </w:pPr>
+            <w:r>
               <w:t xml:space="preserve">Updated ECS flavor to</w:t>
             </w:r>
             <w:r>
@@ -18552,7 +18597,7 @@
             <w:pPr>
               <w:numPr>
                 <w:ilvl w:val="0"/>
-                <w:numId w:val="1118"/>
+                <w:numId w:val="1119"/>
               </w:numPr>
               <w:jc w:val="left"/>
             </w:pPr>
@@ -18564,7 +18609,7 @@
             <w:pPr>
               <w:numPr>
                 <w:ilvl w:val="0"/>
-                <w:numId w:val="1118"/>
+                <w:numId w:val="1119"/>
               </w:numPr>
               <w:jc w:val="left"/>
             </w:pPr>
@@ -18576,7 +18621,7 @@
             <w:pPr>
               <w:numPr>
                 <w:ilvl w:val="0"/>
-                <w:numId w:val="1118"/>
+                <w:numId w:val="1119"/>
               </w:numPr>
               <w:jc w:val="left"/>
             </w:pPr>
@@ -18588,7 +18633,7 @@
             <w:pPr>
               <w:numPr>
                 <w:ilvl w:val="0"/>
-                <w:numId w:val="1118"/>
+                <w:numId w:val="1119"/>
               </w:numPr>
               <w:jc w:val="left"/>
             </w:pPr>
@@ -18600,7 +18645,7 @@
             <w:pPr>
               <w:numPr>
                 <w:ilvl w:val="0"/>
-                <w:numId w:val="1118"/>
+                <w:numId w:val="1119"/>
               </w:numPr>
               <w:jc w:val="left"/>
             </w:pPr>
@@ -18618,7 +18663,7 @@
             <w:pPr>
               <w:numPr>
                 <w:ilvl w:val="0"/>
-                <w:numId w:val="1118"/>
+                <w:numId w:val="1119"/>
               </w:numPr>
               <w:jc w:val="left"/>
             </w:pPr>
@@ -18667,7 +18712,7 @@
             <w:pPr>
               <w:numPr>
                 <w:ilvl w:val="0"/>
-                <w:numId w:val="1118"/>
+                <w:numId w:val="1119"/>
               </w:numPr>
               <w:jc w:val="left"/>
             </w:pPr>
@@ -18679,7 +18724,7 @@
             <w:pPr>
               <w:numPr>
                 <w:ilvl w:val="0"/>
-                <w:numId w:val="1118"/>
+                <w:numId w:val="1119"/>
               </w:numPr>
               <w:jc w:val="left"/>
             </w:pPr>
@@ -18730,7 +18775,7 @@
             <w:pPr>
               <w:numPr>
                 <w:ilvl w:val="0"/>
-                <w:numId w:val="1118"/>
+                <w:numId w:val="1119"/>
               </w:numPr>
               <w:jc w:val="left"/>
             </w:pPr>
@@ -18757,9 +18802,7 @@
       </w:tr>
       <w:tr>
         <w:tc>
-          <w:tcPr>
-            <w:shd w:val="clear" w:color="auto" w:fill="F6F8FA"/>
-          </w:tcPr>
+          <w:tcPr/>
           <w:p>
             <w:pPr>
               <w:jc w:val="left"/>
@@ -18770,9 +18813,7 @@
           </w:p>
         </w:tc>
         <w:tc>
-          <w:tcPr>
-            <w:shd w:val="clear" w:color="auto" w:fill="F6F8FA"/>
-          </w:tcPr>
+          <w:tcPr/>
           <w:p>
             <w:pPr>
               <w:jc w:val="left"/>
@@ -18783,14 +18824,12 @@
           </w:p>
         </w:tc>
         <w:tc>
-          <w:tcPr>
-            <w:shd w:val="clear" w:color="auto" w:fill="F6F8FA"/>
-          </w:tcPr>
+          <w:tcPr/>
           <w:p>
             <w:pPr>
               <w:numPr>
                 <w:ilvl w:val="0"/>
-                <w:numId w:val="1119"/>
+                <w:numId w:val="1120"/>
               </w:numPr>
               <w:jc w:val="left"/>
             </w:pPr>
@@ -18808,7 +18847,7 @@
             <w:pPr>
               <w:numPr>
                 <w:ilvl w:val="0"/>
-                <w:numId w:val="1119"/>
+                <w:numId w:val="1120"/>
               </w:numPr>
               <w:jc w:val="left"/>
             </w:pPr>
@@ -18862,7 +18901,7 @@
             <w:pPr>
               <w:numPr>
                 <w:ilvl w:val="0"/>
-                <w:numId w:val="1119"/>
+                <w:numId w:val="1120"/>
               </w:numPr>
               <w:jc w:val="left"/>
             </w:pPr>
@@ -18910,7 +18949,7 @@
             <w:pPr>
               <w:numPr>
                 <w:ilvl w:val="0"/>
-                <w:numId w:val="1119"/>
+                <w:numId w:val="1120"/>
               </w:numPr>
               <w:jc w:val="left"/>
             </w:pPr>
@@ -18931,7 +18970,9 @@
       </w:tr>
       <w:tr>
         <w:tc>
-          <w:tcPr/>
+          <w:tcPr>
+            <w:shd w:val="clear" w:color="auto" w:fill="F6F8FA"/>
+          </w:tcPr>
           <w:p>
             <w:pPr>
               <w:jc w:val="left"/>
@@ -18942,7 +18983,9 @@
           </w:p>
         </w:tc>
         <w:tc>
-          <w:tcPr/>
+          <w:tcPr>
+            <w:shd w:val="clear" w:color="auto" w:fill="F6F8FA"/>
+          </w:tcPr>
           <w:p>
             <w:pPr>
               <w:jc w:val="left"/>
@@ -18953,12 +18996,14 @@
           </w:p>
         </w:tc>
         <w:tc>
-          <w:tcPr/>
+          <w:tcPr>
+            <w:shd w:val="clear" w:color="auto" w:fill="F6F8FA"/>
+          </w:tcPr>
           <w:p>
             <w:pPr>
               <w:numPr>
                 <w:ilvl w:val="0"/>
-                <w:numId w:val="1120"/>
+                <w:numId w:val="1121"/>
               </w:numPr>
               <w:jc w:val="left"/>
             </w:pPr>
@@ -18970,7 +19015,7 @@
             <w:pPr>
               <w:numPr>
                 <w:ilvl w:val="0"/>
-                <w:numId w:val="1120"/>
+                <w:numId w:val="1121"/>
               </w:numPr>
               <w:jc w:val="left"/>
             </w:pPr>
@@ -18982,7 +19027,7 @@
             <w:pPr>
               <w:numPr>
                 <w:ilvl w:val="0"/>
-                <w:numId w:val="1120"/>
+                <w:numId w:val="1121"/>
               </w:numPr>
               <w:jc w:val="left"/>
             </w:pPr>
@@ -18994,7 +19039,7 @@
             <w:pPr>
               <w:numPr>
                 <w:ilvl w:val="0"/>
-                <w:numId w:val="1120"/>
+                <w:numId w:val="1121"/>
               </w:numPr>
               <w:jc w:val="left"/>
             </w:pPr>
@@ -19012,7 +19057,7 @@
             <w:pPr>
               <w:numPr>
                 <w:ilvl w:val="0"/>
-                <w:numId w:val="1120"/>
+                <w:numId w:val="1121"/>
               </w:numPr>
               <w:jc w:val="left"/>
             </w:pPr>
@@ -19024,7 +19069,7 @@
             <w:pPr>
               <w:numPr>
                 <w:ilvl w:val="0"/>
-                <w:numId w:val="1120"/>
+                <w:numId w:val="1121"/>
               </w:numPr>
               <w:jc w:val="left"/>
             </w:pPr>
@@ -20429,6 +20474,9 @@
     <w:abstractNumId w:val="991"/>
   </w:num>
   <w:num w:numId="1120">
+    <w:abstractNumId w:val="991"/>
+  </w:num>
+  <w:num w:numId="1121">
     <w:abstractNumId w:val="991"/>
   </w:num>
 </w:numbering>

</xml_diff>

<commit_message>
Fix language leaks: PT labels for all formats (v6.12.0)
- Technical cover, testbook badges, callouts, captions, section
  headings, General Objective, E-mail, image placeholder all
  language-aware under :lang: pt
- CSS: 6 EN strings aligned with PDF; html[lang="pt"] selectors
- Badge PNGs auto-sized to fit text; embed at natural 1:1 width
- Samples: Cor/Amostra, Infraestrutura como Código, provedor
- Tests: +43 cases (preprocessor 108, docx-fix 73)
</commit_message>
<xml_diff>
--- a/documents/setup-guide/setup-guide.docx
+++ b/documents/setup-guide/setup-guide.docx
@@ -84,7 +84,7 @@
           <w:b/>
           <w:sz w:val="24"/>
         </w:rPr>
-        <w:t xml:space="preserve">v6.11.1</w:t>
+        <w:t xml:space="preserve">v6.12.0</w:t>
       </w:r>
       <w:r>
         <w:rPr>
@@ -96,7 +96,7 @@
         <w:rPr>
           <w:sz w:val="24"/>
         </w:rPr>
-        <w:t xml:space="preserve">— September 21, 2026 15:55</w:t>
+        <w:t xml:space="preserve">— September 22, 2026 13:26</w:t>
       </w:r>
     </w:p>
     <w:sdt>
@@ -13854,18 +13854,18 @@
               <w:jc w:val="left"/>
             </w:pPr>
             <w:r>
-              <w:t xml:space="preserve">6.11.1</w:t>
-            </w:r>
-          </w:p>
-        </w:tc>
-        <w:tc>
-          <w:tcPr/>
-          <w:p>
-            <w:pPr>
-              <w:jc w:val="left"/>
-            </w:pPr>
-            <w:r>
-              <w:t xml:space="preserve">2026-09-22</w:t>
+              <w:t xml:space="preserve">6.12.0</w:t>
+            </w:r>
+          </w:p>
+        </w:tc>
+        <w:tc>
+          <w:tcPr/>
+          <w:p>
+            <w:pPr>
+              <w:jc w:val="left"/>
+            </w:pPr>
+            <w:r>
+              <w:t xml:space="preserve">2026-09-23</w:t>
             </w:r>
           </w:p>
         </w:tc>
@@ -13880,7 +13880,7 @@
               <w:jc w:val="left"/>
             </w:pPr>
             <w:r>
-              <w:t xml:space="preserve">Documentation: document lifecycle clarified. Documents created via the skills are standalone deliverables — git is never used for individual documents; the :version: attribute and changelog block are the document’s own version control. All four SKILL.md files gained a “Document lifecycle” section and now scope AGENTS.md’s git workflow to template repository development only. AGENTS.md gained a Scope section stating user documents are gitignored and never repository content, and L17 is clarified to apply to template releases only.</w:t>
+              <w:t xml:space="preserve">Language audit: Portuguese documents no longer show English labels. Technical cover labels (Versão/Data/Cenário/Autor), testbook badges (Aprovado/Reprovado/Bloqueado/Não testado), HTML admonition titles and captions, DOCX callout labels, General Objective, E-mail, and image placeholder are now language-aware under :lang: pt. CSS technical section headings gained PT selectors; 6 CSS strings aligned with PDF. Badge PNGs auto-sized to fit text. Sample wording fixed: Cor/Amostra table headers, Infraestrutura como Código, provedor heading.</w:t>
             </w:r>
           </w:p>
         </w:tc>
@@ -13895,7 +13895,7 @@
               <w:jc w:val="left"/>
             </w:pPr>
             <w:r>
-              <w:t xml:space="preserve">6.11.0</w:t>
+              <w:t xml:space="preserve">6.11.1</w:t>
             </w:r>
           </w:p>
         </w:tc>
@@ -13925,7 +13925,7 @@
               <w:jc w:val="left"/>
             </w:pPr>
             <w:r>
-              <w:t xml:space="preserve">Project-wide audit: converter robustness and cross-format consistency. Objectives roles now work in all forms — inline ([.general-objective] and [.objective]) and block (inside [.objectives]) — rendering language-aware labels (the block form previously crashed the build; the inline form silently dropped the label). The [.prerequisites] and [.stepbystep] roles attached to lists no longer drop items. Multi-author documents now list all authors. Conversion errors print a clean file:line message instead of a Ruby object dump. Unknown code languages (go, java, rust, terraform, …​) fall back to plain verbatim with a compile warning (was a hard error). DOCX/MD/HTML: codefile blocks ([.codefile,file=…​]) now inline the file content like the PDF, and admonition labels no longer corrupt NOTE:/TIP: lines inside code blocks. DOCX Fail/Falha badge backgrounds and plain-table borders now match the PDF colors. Shared class boilerplate extracted into the new huawei-base.cls base class (rendering unchanged). Watch mode survives compile errors; install reports failures instead of silent success; the /etc/LatexMk write is opt-in; build diagnostics are kept on failure; asciidoctor warnings now fail the build; a missing header logo warns instead of erroring. New test-pdf-compile.sh replaces the legacy test-filter stub; round-trip now validates the production build pipeline. Documentation corrected across README, AGENTS, and all SKILL files (objectives syntax, codefile example, supported languages, longhutable restriction, install requirements, pandoc range, security note).</w:t>
+              <w:t xml:space="preserve">Documentation: document lifecycle clarified. Documents created via the skills are standalone deliverables — git is never used for individual documents; the :version: attribute and changelog block are the document’s own version control. All four SKILL.md files gained a “Document lifecycle” section and now scope AGENTS.md’s git workflow to template repository development only. AGENTS.md gained a Scope section stating user documents are gitignored and never repository content, and L17 is clarified to apply to template releases only.</w:t>
             </w:r>
           </w:p>
         </w:tc>
@@ -13938,18 +13938,18 @@
               <w:jc w:val="left"/>
             </w:pPr>
             <w:r>
-              <w:t xml:space="preserve">6.10.0</w:t>
-            </w:r>
-          </w:p>
-        </w:tc>
-        <w:tc>
-          <w:tcPr/>
-          <w:p>
-            <w:pPr>
-              <w:jc w:val="left"/>
-            </w:pPr>
-            <w:r>
-              <w:t xml:space="preserve">2026-09-21</w:t>
+              <w:t xml:space="preserve">6.11.0</w:t>
+            </w:r>
+          </w:p>
+        </w:tc>
+        <w:tc>
+          <w:tcPr/>
+          <w:p>
+            <w:pPr>
+              <w:jc w:val="left"/>
+            </w:pPr>
+            <w:r>
+              <w:t xml:space="preserve">2026-09-22</w:t>
             </w:r>
           </w:p>
         </w:tc>
@@ -13964,7 +13964,7 @@
               <w:jc w:val="left"/>
             </w:pPr>
             <w:r>
-              <w:t xml:space="preserve">Header logo, callout boxes, and note labels: DOCX header now shows the Huawei logo in the top-left corner (optional, driven by the :header-logo: attribute). DOCX admonitions (TIP, NOTE, WARNING) now render as styled callout boxes with colored backgrounds, left borders, and type labels — matching the PDF. PDF inline notes ([.note] role) now show a language-aware “Note:” label (was unlabeled italic text).</w:t>
+              <w:t xml:space="preserve">Project-wide audit: converter robustness and cross-format consistency. Objectives roles now work in all forms — inline ([.general-objective] and [.objective]) and block (inside [.objectives]) — rendering language-aware labels (the block form previously crashed the build; the inline form silently dropped the label). The [.prerequisites] and [.stepbystep] roles attached to lists no longer drop items. Multi-author documents now list all authors. Conversion errors print a clean file:line message instead of a Ruby object dump. Unknown code languages (go, java, rust, terraform, …​) fall back to plain verbatim with a compile warning (was a hard error). DOCX/MD/HTML: codefile blocks ([.codefile,file=…​]) now inline the file content like the PDF, and admonition labels no longer corrupt NOTE:/TIP: lines inside code blocks. DOCX Fail/Falha badge backgrounds and plain-table borders now match the PDF colors. Shared class boilerplate extracted into the new huawei-base.cls base class (rendering unchanged). Watch mode survives compile errors; install reports failures instead of silent success; the /etc/LatexMk write is opt-in; build diagnostics are kept on failure; asciidoctor warnings now fail the build; a missing header logo warns instead of erroring. New test-pdf-compile.sh replaces the legacy test-filter stub; round-trip now validates the production build pipeline. Documentation corrected across README, AGENTS, and all SKILL files (objectives syntax, codefile example, supported languages, longhutable restriction, install requirements, pandoc range, security note).</w:t>
             </w:r>
           </w:p>
         </w:tc>
@@ -13979,7 +13979,7 @@
               <w:jc w:val="left"/>
             </w:pPr>
             <w:r>
-              <w:t xml:space="preserve">6.9.2</w:t>
+              <w:t xml:space="preserve">6.10.0</w:t>
             </w:r>
           </w:p>
         </w:tc>
@@ -14009,7 +14009,7 @@
               <w:jc w:val="left"/>
             </w:pPr>
             <w:r>
-              <w:t xml:space="preserve">Fix DOCX body text alignment: paragraphs are now justified (matching the PDF LaTeX default), instead of left-aligned.</w:t>
+              <w:t xml:space="preserve">Header logo, callout boxes, and note labels: DOCX header now shows the Huawei logo in the top-left corner (optional, driven by the :header-logo: attribute). DOCX admonitions (TIP, NOTE, WARNING) now render as styled callout boxes with colored backgrounds, left borders, and type labels — matching the PDF. PDF inline notes ([.note] role) now show a language-aware “Note:” label (was unlabeled italic text).</w:t>
             </w:r>
           </w:p>
         </w:tc>
@@ -14022,7 +14022,7 @@
               <w:jc w:val="left"/>
             </w:pPr>
             <w:r>
-              <w:t xml:space="preserve">6.9.1</w:t>
+              <w:t xml:space="preserve">6.9.2</w:t>
             </w:r>
           </w:p>
         </w:tc>
@@ -14048,7 +14048,7 @@
               <w:jc w:val="left"/>
             </w:pPr>
             <w:r>
-              <w:t xml:space="preserve">Fix DOCX subsection number size: H2/H3/H4 section numbers were rendered at 56pt (same as H1) instead of matching the heading text size (18/16/14pt). The SectionNumber style is now unstyled (inherits heading size); 56pt is set directly on H1 number runs only.</w:t>
+              <w:t xml:space="preserve">Fix DOCX body text alignment: paragraphs are now justified (matching the PDF LaTeX default), instead of left-aligned.</w:t>
             </w:r>
           </w:p>
         </w:tc>
@@ -14063,7 +14063,7 @@
               <w:jc w:val="left"/>
             </w:pPr>
             <w:r>
-              <w:t xml:space="preserve">6.9.0</w:t>
+              <w:t xml:space="preserve">6.9.1</w:t>
             </w:r>
           </w:p>
         </w:tc>
@@ -14093,7 +14093,7 @@
               <w:jc w:val="left"/>
             </w:pPr>
             <w:r>
-              <w:t xml:space="preserve">TOC styling: the table-of-contents title rule is now Huawei red (was black) in both PDF and DOCX, matching the H1 heading red rules. DOCX TOC entries now match the PDF: level 1 bold 12pt, levels 2-3 normal 10pt, HarmonyOS Sans font. DOCX TOC depth increased from 2 to 3 levels (matching PDF tocdepth). Dead TOCTitle style removed from DOCX.</w:t>
+              <w:t xml:space="preserve">Fix DOCX subsection number size: H2/H3/H4 section numbers were rendered at 56pt (same as H1) instead of matching the heading text size (18/16/14pt). The SectionNumber style is now unstyled (inherits heading size); 56pt is set directly on H1 number runs only.</w:t>
             </w:r>
           </w:p>
         </w:tc>
@@ -14106,18 +14106,18 @@
               <w:jc w:val="left"/>
             </w:pPr>
             <w:r>
-              <w:t xml:space="preserve">6.8.3</w:t>
-            </w:r>
-          </w:p>
-        </w:tc>
-        <w:tc>
-          <w:tcPr/>
-          <w:p>
-            <w:pPr>
-              <w:jc w:val="left"/>
-            </w:pPr>
-            <w:r>
-              <w:t xml:space="preserve">2026-09-20</w:t>
+              <w:t xml:space="preserve">6.9.0</w:t>
+            </w:r>
+          </w:p>
+        </w:tc>
+        <w:tc>
+          <w:tcPr/>
+          <w:p>
+            <w:pPr>
+              <w:jc w:val="left"/>
+            </w:pPr>
+            <w:r>
+              <w:t xml:space="preserve">2026-09-21</w:t>
             </w:r>
           </w:p>
         </w:tc>
@@ -14132,7 +14132,7 @@
               <w:jc w:val="left"/>
             </w:pPr>
             <w:r>
-              <w:t xml:space="preserve">Docs accuracy fix: the multi-format pipeline descriptions in README, AGENTS, and all four SKILL.md files now correctly separate the DOCX/Markdown path (pre-processor then docbook then pandoc) from the HTML path (pre-processor then asciidoctor html5) — the previous wording implied HTML also went through docbook and pandoc. Corrected a stale comment in the DOCX fixer.</w:t>
+              <w:t xml:space="preserve">TOC styling: the table-of-contents title rule is now Huawei red (was black) in both PDF and DOCX, matching the H1 heading red rules. DOCX TOC entries now match the PDF: level 1 bold 12pt, levels 2-3 normal 10pt, HarmonyOS Sans font. DOCX TOC depth increased from 2 to 3 levels (matching PDF tocdepth). Dead TOCTitle style removed from DOCX.</w:t>
             </w:r>
           </w:p>
         </w:tc>
@@ -14147,7 +14147,7 @@
               <w:jc w:val="left"/>
             </w:pPr>
             <w:r>
-              <w:t xml:space="preserve">6.8.2</w:t>
+              <w:t xml:space="preserve">6.8.3</w:t>
             </w:r>
           </w:p>
         </w:tc>
@@ -14177,7 +14177,7 @@
               <w:jc w:val="left"/>
             </w:pPr>
             <w:r>
-              <w:t xml:space="preserve">Documentation and cleanup: README, AGENTS, and all four SKILL.md files now describe the real multi-format pipeline (pre-processor + docx_fix --fix + --lang flag) instead of the pre-v6.4 asciidoctor-to-pandoc chain. DOCX TOC title is now right-aligned like the PDF (was targeting a dead style). Signature names render bold like the PDF. Dead code removed (unused Caption style, dead TOCTitle style, dead HTML badge CSS). The --template and --lang flags accept the equals form (--template=guide). Various stale comments corrected.</w:t>
+              <w:t xml:space="preserve">Docs accuracy fix: the multi-format pipeline descriptions in README, AGENTS, and all four SKILL.md files now correctly separate the DOCX/Markdown path (pre-processor then docbook then pandoc) from the HTML path (pre-processor then asciidoctor html5) — the previous wording implied HTML also went through docbook and pandoc. Corrected a stale comment in the DOCX fixer.</w:t>
             </w:r>
           </w:p>
         </w:tc>
@@ -14190,7 +14190,7 @@
               <w:jc w:val="left"/>
             </w:pPr>
             <w:r>
-              <w:t xml:space="preserve">6.8.1</w:t>
+              <w:t xml:space="preserve">6.8.2</w:t>
             </w:r>
           </w:p>
         </w:tc>
@@ -14216,7 +14216,7 @@
               <w:jc w:val="left"/>
             </w:pPr>
             <w:r>
-              <w:t xml:space="preserve">Quality-pass fixes for v6.8.0: non-technical covers no longer show a stray Date paragraph (regression from the meta-scan change); the technical cover table is no longer hijacked from the body when :nochangelog: is set (boundary check on the cover-table detection); the Version/Date/Scenario table now renders unconditionally like the PDF (was gated by :nochangelog:); empty cover tables are skipped when no report values are set; corrected the cover-element-order wording in the v6.8.0 changelog.</w:t>
+              <w:t xml:space="preserve">Documentation and cleanup: README, AGENTS, and all four SKILL.md files now describe the real multi-format pipeline (pre-processor + docx_fix --fix + --lang flag) instead of the pre-v6.4 asciidoctor-to-pandoc chain. DOCX TOC title is now right-aligned like the PDF (was targeting a dead style). Signature names render bold like the PDF. Dead code removed (unused Caption style, dead TOCTitle style, dead HTML badge CSS). The --template and --lang flags accept the equals form (--template=guide). Various stale comments corrected.</w:t>
             </w:r>
           </w:p>
         </w:tc>
@@ -14231,7 +14231,7 @@
               <w:jc w:val="left"/>
             </w:pPr>
             <w:r>
-              <w:t xml:space="preserve">6.8.0</w:t>
+              <w:t xml:space="preserve">6.8.1</w:t>
             </w:r>
           </w:p>
         </w:tc>
@@ -14261,7 +14261,7 @@
               <w:jc w:val="left"/>
             </w:pPr>
             <w:r>
-              <w:t xml:space="preserve">Technical report covers now match the PDF in DOCX/MD/HTML: the title uses the PDF’s 24pt size (was 36pt), the report type label appears below the title (the DOCX cover keeps the established title-first order; the PDF has label-then-title), and the Version/Date/Scenario table is rendered with the PDF’s red label column. The cover meta line now shows the report version and its set date (was the document version and the build date). Authors, when set, appear as a table row like the PDF.</w:t>
+              <w:t xml:space="preserve">Quality-pass fixes for v6.8.0: non-technical covers no longer show a stray Date paragraph (regression from the meta-scan change); the technical cover table is no longer hijacked from the body when :nochangelog: is set (boundary check on the cover-table detection); the Version/Date/Scenario table now renders unconditionally like the PDF (was gated by :nochangelog:); empty cover tables are skipped when no report values are set; corrected the cover-element-order wording in the v6.8.0 changelog.</w:t>
             </w:r>
           </w:p>
         </w:tc>
@@ -14274,7 +14274,7 @@
               <w:jc w:val="left"/>
             </w:pPr>
             <w:r>
-              <w:t xml:space="preserve">6.7.0</w:t>
+              <w:t xml:space="preserve">6.8.0</w:t>
             </w:r>
           </w:p>
         </w:tc>
@@ -14300,7 +14300,7 @@
               <w:jc w:val="left"/>
             </w:pPr>
             <w:r>
-              <w:t xml:space="preserve">Badge and language fidelity: DOCX badge pills now render black text like the PDF (was frame-colored), use the correct label case (Pass, not PASS), include the Portuguese POC labels (Atendido, Parcial, Falha, Ignorado), and render at native width per template (testbook badge text no longer shrinks). Portuguese signature greetings now match the PDF (At.te,), the POC classification label matches the full PDF wording, and the secondary-format table headers (stakeholders, closing record, test summary, changelog) are now language-aware. DOCX footers show Página in Portuguese documents. Cover dates no longer zero-pad the day.</w:t>
+              <w:t xml:space="preserve">Technical report covers now match the PDF in DOCX/MD/HTML: the title uses the PDF’s 24pt size (was 36pt), the report type label appears below the title (the DOCX cover keeps the established title-first order; the PDF has label-then-title), and the Version/Date/Scenario table is rendered with the PDF’s red label column. The cover meta line now shows the report version and its set date (was the document version and the build date). Authors, when set, appear as a table row like the PDF.</w:t>
             </w:r>
           </w:p>
         </w:tc>
@@ -14315,7 +14315,7 @@
               <w:jc w:val="left"/>
             </w:pPr>
             <w:r>
-              <w:t xml:space="preserve">6.6.1</w:t>
+              <w:t xml:space="preserve">6.7.0</w:t>
             </w:r>
           </w:p>
         </w:tc>
@@ -14345,7 +14345,7 @@
               <w:jc w:val="left"/>
             </w:pPr>
             <w:r>
-              <w:t xml:space="preserve">Quality-pass fixes for v6.6.0: the TESTCASE-marker strip now covers the entire DOCX fix run (a failure at any stage can no longer leave markers in the output file); the fixer resets its template state between in-process runs (the documented path-sniffing fallback works again); build.sh also cleans temporary files on interrupt signals; fixed a CHANGELOG typo.</w:t>
+              <w:t xml:space="preserve">Badge and language fidelity: DOCX badge pills now render black text like the PDF (was frame-colored), use the correct label case (Pass, not PASS), include the Portuguese POC labels (Atendido, Parcial, Falha, Ignorado), and render at native width per template (testbook badge text no longer shrinks). Portuguese signature greetings now match the PDF (At.te,), the POC classification label matches the full PDF wording, and the secondary-format table headers (stakeholders, closing record, test summary, changelog) are now language-aware. DOCX footers show Página in Portuguese documents. Cover dates no longer zero-pad the day.</w:t>
             </w:r>
           </w:p>
         </w:tc>
@@ -14358,7 +14358,7 @@
               <w:jc w:val="left"/>
             </w:pPr>
             <w:r>
-              <w:t xml:space="preserve">6.6.0</w:t>
+              <w:t xml:space="preserve">6.6.1</w:t>
             </w:r>
           </w:p>
         </w:tc>
@@ -14384,6 +14384,51 @@
               <w:jc w:val="left"/>
             </w:pPr>
             <w:r>
+              <w:t xml:space="preserve">Quality-pass fixes for v6.6.0: the TESTCASE-marker strip now covers the entire DOCX fix run (a failure at any stage can no longer leave markers in the output file); the fixer resets its template state between in-process runs (the documented path-sniffing fallback works again); build.sh also cleans temporary files on interrupt signals; fixed a CHANGELOG typo.</w:t>
+            </w:r>
+          </w:p>
+        </w:tc>
+      </w:tr>
+      <w:tr>
+        <w:tc>
+          <w:tcPr>
+            <w:shd w:val="clear" w:color="auto" w:fill="F6F8FA"/>
+          </w:tcPr>
+          <w:p>
+            <w:pPr>
+              <w:jc w:val="left"/>
+            </w:pPr>
+            <w:r>
+              <w:t xml:space="preserve">6.6.0</w:t>
+            </w:r>
+          </w:p>
+        </w:tc>
+        <w:tc>
+          <w:tcPr>
+            <w:shd w:val="clear" w:color="auto" w:fill="F6F8FA"/>
+          </w:tcPr>
+          <w:p>
+            <w:pPr>
+              <w:jc w:val="left"/>
+            </w:pPr>
+            <w:r>
+              <w:t xml:space="preserve">2026-09-20</w:t>
+            </w:r>
+          </w:p>
+        </w:tc>
+        <w:tc>
+          <w:tcPr>
+            <w:shd w:val="clear" w:color="auto" w:fill="F6F8FA"/>
+          </w:tcPr>
+          <w:p>
+            <w:pPr>
+              <w:numPr>
+                <w:ilvl w:val="0"/>
+                <w:numId w:val="1055"/>
+              </w:numPr>
+              <w:jc w:val="left"/>
+            </w:pPr>
+            <w:r>
               <w:t xml:space="preserve">Pipeline robustness: DOCX post-processing now fails loudly when content styling errors occur (TESTCASE markers can no longer leak into output); the DOCX fixer takes an explicit</w:t>
             </w:r>
             <w:r>
@@ -14406,58 +14451,13 @@
       </w:tr>
       <w:tr>
         <w:tc>
-          <w:tcPr>
-            <w:shd w:val="clear" w:color="auto" w:fill="F6F8FA"/>
-          </w:tcPr>
+          <w:tcPr/>
           <w:p>
             <w:pPr>
               <w:jc w:val="left"/>
             </w:pPr>
             <w:r>
               <w:t xml:space="preserve">6.5.2</w:t>
-            </w:r>
-          </w:p>
-        </w:tc>
-        <w:tc>
-          <w:tcPr>
-            <w:shd w:val="clear" w:color="auto" w:fill="F6F8FA"/>
-          </w:tcPr>
-          <w:p>
-            <w:pPr>
-              <w:jc w:val="left"/>
-            </w:pPr>
-            <w:r>
-              <w:t xml:space="preserve">2026-09-20</w:t>
-            </w:r>
-          </w:p>
-        </w:tc>
-        <w:tc>
-          <w:tcPr>
-            <w:shd w:val="clear" w:color="auto" w:fill="F6F8FA"/>
-          </w:tcPr>
-          <w:p>
-            <w:pPr>
-              <w:numPr>
-                <w:ilvl w:val="0"/>
-                <w:numId w:val="1055"/>
-              </w:numPr>
-              <w:jc w:val="left"/>
-            </w:pPr>
-            <w:r>
-              <w:t xml:space="preserve">Quality-pass fixes for v6.5.1: LaTeX quote conversion now handles only paired quotes (quote characters inside code arguments are no longer corrupted); signature cells containing escaped ampersands are no longer split; round-trip HTML generation guards the asciidoctor-diagram dependency and fails loudly when generation fails; pre-processor unit tests now cover pipe escaping in all five table handlers.</w:t>
-            </w:r>
-          </w:p>
-        </w:tc>
-      </w:tr>
-      <w:tr>
-        <w:tc>
-          <w:tcPr/>
-          <w:p>
-            <w:pPr>
-              <w:jc w:val="left"/>
-            </w:pPr>
-            <w:r>
-              <w:t xml:space="preserve">6.5.1</w:t>
             </w:r>
           </w:p>
         </w:tc>
@@ -14483,7 +14483,7 @@
               <w:jc w:val="left"/>
             </w:pPr>
             <w:r>
-              <w:t xml:space="preserve">Fixed DOCX/MD/HTML output: tables are no longer corrupted when changelog, signature, or summary content contains a pipe character (“|”). Badge text is now preserved in DOCX/MD/HTML — a “Ready” badge renders “Ready” instead of “[NEW]”. Multi-item changelog entries render as bullet lists instead of being joined with a literal “+”. POC documents now include the changelog in DOCX/MD/HTML. The :noanswers: attribute now hides test results and remarks in DOCX/MD/HTML, matching the PDF. Inline LaTeX (monospace text, arrows, LaTeX quotes) no longer leaks from changelog entries. The test suite now exercises the real build pipeline (pre-processor wired into round-trip and DOCX tests), with new pre-processor unit tests.</w:t>
+              <w:t xml:space="preserve">Quality-pass fixes for v6.5.1: LaTeX quote conversion now handles only paired quotes (quote characters inside code arguments are no longer corrupted); signature cells containing escaped ampersands are no longer split; round-trip HTML generation guards the asciidoctor-diagram dependency and fails loudly when generation fails; pre-processor unit tests now cover pipe escaping in all five table handlers.</w:t>
             </w:r>
           </w:p>
         </w:tc>
@@ -14498,7 +14498,7 @@
               <w:jc w:val="left"/>
             </w:pPr>
             <w:r>
-              <w:t xml:space="preserve">6.5.0</w:t>
+              <w:t xml:space="preserve">6.5.1</w:t>
             </w:r>
           </w:p>
         </w:tc>
@@ -14528,7 +14528,7 @@
               <w:jc w:val="left"/>
             </w:pPr>
             <w:r>
-              <w:t xml:space="preserve">Evidence checklist simplified to plain bullets in both PDF and DOCX (checkbox markers removed for compatibility). Planned Activities list in DOCX now uses Word’s native lower-roman numbering (i., ii., iii.) matching the PDF. Badges in DOCX replaced with exact-replica PNG pill images (rounded, colored frame and background, bold text) matching the PDF \ huaweibadge look — assets committed to the repo. Signature blocks in DOCX no longer show literal + symbols (proper hard line breaks).</w:t>
+              <w:t xml:space="preserve">Fixed DOCX/MD/HTML output: tables are no longer corrupted when changelog, signature, or summary content contains a pipe character (“|”). Badge text is now preserved in DOCX/MD/HTML — a “Ready” badge renders “Ready” instead of “[NEW]”. Multi-item changelog entries render as bullet lists instead of being joined with a literal “+”. POC documents now include the changelog in DOCX/MD/HTML. The :noanswers: attribute now hides test results and remarks in DOCX/MD/HTML, matching the PDF. Inline LaTeX (monospace text, arrows, LaTeX quotes) no longer leaks from changelog entries. The test suite now exercises the real build pipeline (pre-processor wired into round-trip and DOCX tests), with new pre-processor unit tests.</w:t>
             </w:r>
           </w:p>
         </w:tc>
@@ -14541,7 +14541,7 @@
               <w:jc w:val="left"/>
             </w:pPr>
             <w:r>
-              <w:t xml:space="preserve">6.4.7</w:t>
+              <w:t xml:space="preserve">6.5.0</w:t>
             </w:r>
           </w:p>
         </w:tc>
@@ -14567,7 +14567,7 @@
               <w:jc w:val="left"/>
             </w:pPr>
             <w:r>
-              <w:t xml:space="preserve">Section titles in DOCX now match the PDF heading design: the big section number (56pt) sits on the left, the title text is pushed to the right edge (a right tab stop mimics the LaTeX \ hfill), and the red rule runs below — previously the title sat left-aligned next to a small number. Applies to all templates.</w:t>
+              <w:t xml:space="preserve">Evidence checklist simplified to plain bullets in both PDF and DOCX (checkbox markers removed for compatibility). Planned Activities list in DOCX now uses Word’s native lower-roman numbering (i., ii., iii.) matching the PDF. Badges in DOCX replaced with exact-replica PNG pill images (rounded, colored frame and background, bold text) matching the PDF \ huaweibadge look — assets committed to the repo. Signature blocks in DOCX no longer show literal + symbols (proper hard line breaks).</w:t>
             </w:r>
           </w:p>
         </w:tc>
@@ -14582,7 +14582,7 @@
               <w:jc w:val="left"/>
             </w:pPr>
             <w:r>
-              <w:t xml:space="preserve">6.4.6</w:t>
+              <w:t xml:space="preserve">6.4.7</w:t>
             </w:r>
           </w:p>
         </w:tc>
@@ -14612,7 +14612,7 @@
               <w:jc w:val="left"/>
             </w:pPr>
             <w:r>
-              <w:t xml:space="preserve">Code blocks inside test cases no longer break the red left rule in DOCX — the code style’s left indent (which jogged the rule) is reset inside test case blocks, and code blocks now show the PDF’s code box (gray background with thin border on top, bottom, and right, red rule continuing on the left).</w:t>
+              <w:t xml:space="preserve">Section titles in DOCX now match the PDF heading design: the big section number (56pt) sits on the left, the title text is pushed to the right edge (a right tab stop mimics the LaTeX \ hfill), and the red rule runs below — previously the title sat left-aligned next to a small number. Applies to all templates.</w:t>
             </w:r>
           </w:p>
         </w:tc>
@@ -14625,7 +14625,7 @@
               <w:jc w:val="left"/>
             </w:pPr>
             <w:r>
-              <w:t xml:space="preserve">6.4.5</w:t>
+              <w:t xml:space="preserve">6.4.6</w:t>
             </w:r>
           </w:p>
         </w:tc>
@@ -14651,7 +14651,7 @@
               <w:jc w:val="left"/>
             </w:pPr>
             <w:r>
-              <w:t xml:space="preserve">DOCX polish pass: all captions centered (matching the PDF), vertical spacing between blocks matched to the LaTeX rhythm (medskip/smallskip around captions, field bars, and steps), and test steps now render as separate paragraphs each with the red bold number (previously merged into one paragraph).</w:t>
+              <w:t xml:space="preserve">Code blocks inside test cases no longer break the red left rule in DOCX — the code style’s left indent (which jogged the rule) is reset inside test case blocks, and code blocks now show the PDF’s code box (gray background with thin border on top, bottom, and right, red rule continuing on the left).</w:t>
             </w:r>
           </w:p>
         </w:tc>
@@ -14666,7 +14666,7 @@
               <w:jc w:val="left"/>
             </w:pPr>
             <w:r>
-              <w:t xml:space="preserve">6.4.4</w:t>
+              <w:t xml:space="preserve">6.4.5</w:t>
             </w:r>
           </w:p>
         </w:tc>
@@ -14696,7 +14696,7 @@
               <w:jc w:val="left"/>
             </w:pPr>
             <w:r>
-              <w:t xml:space="preserve">DOCX covers now show the logo, cover text, and version/date/time meta line like the PDF. Test case blocks in DOCX get the PDF’s visual wrapper: red left rule, red field header bars, and red step numbers. Captions follow the PDF ordering system in DOCX, MD, and HTML (Table/Diagram/Figure/Testcase N: with bold symbol). Portuguese PDFs now label diagrams "Diagrama N:" (was hardcoded English "Diagram"). Markdown and HTML output no longer leaks raw LaTeX from passthrough blocks — the DOCX pre-processor now feeds those pipelines too.</w:t>
+              <w:t xml:space="preserve">DOCX polish pass: all captions centered (matching the PDF), vertical spacing between blocks matched to the LaTeX rhythm (medskip/smallskip around captions, field bars, and steps), and test steps now render as separate paragraphs each with the red bold number (previously merged into one paragraph).</w:t>
             </w:r>
           </w:p>
         </w:tc>
@@ -14709,7 +14709,7 @@
               <w:jc w:val="left"/>
             </w:pPr>
             <w:r>
-              <w:t xml:space="preserve">6.4.3</w:t>
+              <w:t xml:space="preserve">6.4.4</w:t>
             </w:r>
           </w:p>
         </w:tc>
@@ -14735,7 +14735,7 @@
               <w:jc w:val="left"/>
             </w:pPr>
             <w:r>
-              <w:t xml:space="preserve">Testbook and POC DOCX output now matches the PDF much more closely: native table of contents (language-aware, auto-populated), each section starts on a new page, embedded images and diagrams (PlantUML/Graphviz rendered), white-on-red table headers, cover version line under the title, centered test case captions, and plain black rules for signature grids.</w:t>
+              <w:t xml:space="preserve">DOCX covers now show the logo, cover text, and version/date/time meta line like the PDF. Test case blocks in DOCX get the PDF’s visual wrapper: red left rule, red field header bars, and red step numbers. Captions follow the PDF ordering system in DOCX, MD, and HTML (Table/Diagram/Figure/Testcase N: with bold symbol). Portuguese PDFs now label diagrams "Diagrama N:" (was hardcoded English "Diagram"). Markdown and HTML output no longer leaks raw LaTeX from passthrough blocks — the DOCX pre-processor now feeds those pipelines too.</w:t>
             </w:r>
           </w:p>
         </w:tc>
@@ -14750,7 +14750,7 @@
               <w:jc w:val="left"/>
             </w:pPr>
             <w:r>
-              <w:t xml:space="preserve">6.4.2</w:t>
+              <w:t xml:space="preserve">6.4.3</w:t>
             </w:r>
           </w:p>
         </w:tc>
@@ -14780,7 +14780,7 @@
               <w:jc w:val="left"/>
             </w:pPr>
             <w:r>
-              <w:t xml:space="preserve">DOCX output for POC and testbook templates now includes all passthrough content (stakeholders, closing record, signatures, test cases, test summary, changelog) via a new pre-processor. Fixed dropped Test Scope fields in testbook DOCX output.</w:t>
+              <w:t xml:space="preserve">Testbook and POC DOCX output now matches the PDF much more closely: native table of contents (language-aware, auto-populated), each section starts on a new page, embedded images and diagrams (PlantUML/Graphviz rendered), white-on-red table headers, cover version line under the title, centered test case captions, and plain black rules for signature grids.</w:t>
             </w:r>
           </w:p>
         </w:tc>
@@ -14793,7 +14793,7 @@
               <w:jc w:val="left"/>
             </w:pPr>
             <w:r>
-              <w:t xml:space="preserve">6.4.0</w:t>
+              <w:t xml:space="preserve">6.4.2</w:t>
             </w:r>
           </w:p>
         </w:tc>
@@ -14819,6 +14819,51 @@
               <w:jc w:val="left"/>
             </w:pPr>
             <w:r>
+              <w:t xml:space="preserve">DOCX output for POC and testbook templates now includes all passthrough content (stakeholders, closing record, signatures, test cases, test summary, changelog) via a new pre-processor. Fixed dropped Test Scope fields in testbook DOCX output.</w:t>
+            </w:r>
+          </w:p>
+        </w:tc>
+      </w:tr>
+      <w:tr>
+        <w:tc>
+          <w:tcPr>
+            <w:shd w:val="clear" w:color="auto" w:fill="F6F8FA"/>
+          </w:tcPr>
+          <w:p>
+            <w:pPr>
+              <w:jc w:val="left"/>
+            </w:pPr>
+            <w:r>
+              <w:t xml:space="preserve">6.4.0</w:t>
+            </w:r>
+          </w:p>
+        </w:tc>
+        <w:tc>
+          <w:tcPr>
+            <w:shd w:val="clear" w:color="auto" w:fill="F6F8FA"/>
+          </w:tcPr>
+          <w:p>
+            <w:pPr>
+              <w:jc w:val="left"/>
+            </w:pPr>
+            <w:r>
+              <w:t xml:space="preserve">2026-09-20</w:t>
+            </w:r>
+          </w:p>
+        </w:tc>
+        <w:tc>
+          <w:tcPr>
+            <w:shd w:val="clear" w:color="auto" w:fill="F6F8FA"/>
+          </w:tcPr>
+          <w:p>
+            <w:pPr>
+              <w:numPr>
+                <w:ilvl w:val="0"/>
+                <w:numId w:val="1065"/>
+              </w:numPr>
+              <w:jc w:val="left"/>
+            </w:pPr>
+            <w:r>
               <w:t xml:space="preserve">Fixed changelog dates — replaced</w:t>
             </w:r>
             <w:r>
@@ -14841,58 +14886,13 @@
       </w:tr>
       <w:tr>
         <w:tc>
-          <w:tcPr>
-            <w:shd w:val="clear" w:color="auto" w:fill="F6F8FA"/>
-          </w:tcPr>
+          <w:tcPr/>
           <w:p>
             <w:pPr>
               <w:jc w:val="left"/>
             </w:pPr>
             <w:r>
               <w:t xml:space="preserve">5.1.1</w:t>
-            </w:r>
-          </w:p>
-        </w:tc>
-        <w:tc>
-          <w:tcPr>
-            <w:shd w:val="clear" w:color="auto" w:fill="F6F8FA"/>
-          </w:tcPr>
-          <w:p>
-            <w:pPr>
-              <w:jc w:val="left"/>
-            </w:pPr>
-            <w:r>
-              <w:t xml:space="preserve">2026-09-14</w:t>
-            </w:r>
-          </w:p>
-        </w:tc>
-        <w:tc>
-          <w:tcPr>
-            <w:shd w:val="clear" w:color="auto" w:fill="F6F8FA"/>
-          </w:tcPr>
-          <w:p>
-            <w:pPr>
-              <w:numPr>
-                <w:ilvl w:val="0"/>
-                <w:numId w:val="1065"/>
-              </w:numPr>
-              <w:jc w:val="left"/>
-            </w:pPr>
-            <w:r>
-              <w:t xml:space="preserve">Synced callout colors in DOCX/HTML/MD output to match brand palette. Added color palette demo.</w:t>
-            </w:r>
-          </w:p>
-        </w:tc>
-      </w:tr>
-      <w:tr>
-        <w:tc>
-          <w:tcPr/>
-          <w:p>
-            <w:pPr>
-              <w:jc w:val="left"/>
-            </w:pPr>
-            <w:r>
-              <w:t xml:space="preserve">5.1.0</w:t>
             </w:r>
           </w:p>
         </w:tc>
@@ -14918,7 +14918,7 @@
               <w:jc w:val="left"/>
             </w:pPr>
             <w:r>
-              <w:t xml:space="preserve">Adopted brand guidelines auxiliary color palette and monochrome scale. Aligned callout colors to brand specifications.</w:t>
+              <w:t xml:space="preserve">Synced callout colors in DOCX/HTML/MD output to match brand palette. Added color palette demo.</w:t>
             </w:r>
           </w:p>
         </w:tc>
@@ -14933,7 +14933,7 @@
               <w:jc w:val="left"/>
             </w:pPr>
             <w:r>
-              <w:t xml:space="preserve">5.0.3</w:t>
+              <w:t xml:space="preserve">5.1.0</w:t>
             </w:r>
           </w:p>
         </w:tc>
@@ -14963,6 +14963,45 @@
               <w:jc w:val="left"/>
             </w:pPr>
             <w:r>
+              <w:t xml:space="preserve">Adopted brand guidelines auxiliary color palette and monochrome scale. Aligned callout colors to brand specifications.</w:t>
+            </w:r>
+          </w:p>
+        </w:tc>
+      </w:tr>
+      <w:tr>
+        <w:tc>
+          <w:tcPr/>
+          <w:p>
+            <w:pPr>
+              <w:jc w:val="left"/>
+            </w:pPr>
+            <w:r>
+              <w:t xml:space="preserve">5.0.3</w:t>
+            </w:r>
+          </w:p>
+        </w:tc>
+        <w:tc>
+          <w:tcPr/>
+          <w:p>
+            <w:pPr>
+              <w:jc w:val="left"/>
+            </w:pPr>
+            <w:r>
+              <w:t xml:space="preserve">2026-09-14</w:t>
+            </w:r>
+          </w:p>
+        </w:tc>
+        <w:tc>
+          <w:tcPr/>
+          <w:p>
+            <w:pPr>
+              <w:numPr>
+                <w:ilvl w:val="0"/>
+                <w:numId w:val="1068"/>
+              </w:numPr>
+              <w:jc w:val="left"/>
+            </w:pPr>
+            <w:r>
               <w:t xml:space="preserve">Removed non-standard</w:t>
             </w:r>
             <w:r>
@@ -14985,54 +15024,15 @@
       </w:tr>
       <w:tr>
         <w:tc>
-          <w:tcPr/>
+          <w:tcPr>
+            <w:shd w:val="clear" w:color="auto" w:fill="F6F8FA"/>
+          </w:tcPr>
           <w:p>
             <w:pPr>
               <w:jc w:val="left"/>
             </w:pPr>
             <w:r>
               <w:t xml:space="preserve">5.0.2</w:t>
-            </w:r>
-          </w:p>
-        </w:tc>
-        <w:tc>
-          <w:tcPr/>
-          <w:p>
-            <w:pPr>
-              <w:jc w:val="left"/>
-            </w:pPr>
-            <w:r>
-              <w:t xml:space="preserve">2026-09-14</w:t>
-            </w:r>
-          </w:p>
-        </w:tc>
-        <w:tc>
-          <w:tcPr/>
-          <w:p>
-            <w:pPr>
-              <w:numPr>
-                <w:ilvl w:val="0"/>
-                <w:numId w:val="1068"/>
-              </w:numPr>
-              <w:jc w:val="left"/>
-            </w:pPr>
-            <w:r>
-              <w:t xml:space="preserve">Long commands in test steps now render as code blocks instead of inline code.</w:t>
-            </w:r>
-          </w:p>
-        </w:tc>
-      </w:tr>
-      <w:tr>
-        <w:tc>
-          <w:tcPr>
-            <w:shd w:val="clear" w:color="auto" w:fill="F6F8FA"/>
-          </w:tcPr>
-          <w:p>
-            <w:pPr>
-              <w:jc w:val="left"/>
-            </w:pPr>
-            <w:r>
-              <w:t xml:space="preserve">5.0.1</w:t>
             </w:r>
           </w:p>
         </w:tc>
@@ -15062,7 +15062,7 @@
               <w:jc w:val="left"/>
             </w:pPr>
             <w:r>
-              <w:t xml:space="preserve">Testcase caption centered above the block.</w:t>
+              <w:t xml:space="preserve">Long commands in test steps now render as code blocks instead of inline code.</w:t>
             </w:r>
           </w:p>
         </w:tc>
@@ -15075,7 +15075,7 @@
               <w:jc w:val="left"/>
             </w:pPr>
             <w:r>
-              <w:t xml:space="preserve">5.0.0</w:t>
+              <w:t xml:space="preserve">5.0.1</w:t>
             </w:r>
           </w:p>
         </w:tc>
@@ -15101,6 +15101,51 @@
               <w:jc w:val="left"/>
             </w:pPr>
             <w:r>
+              <w:t xml:space="preserve">Testcase caption centered above the block.</w:t>
+            </w:r>
+          </w:p>
+        </w:tc>
+      </w:tr>
+      <w:tr>
+        <w:tc>
+          <w:tcPr>
+            <w:shd w:val="clear" w:color="auto" w:fill="F6F8FA"/>
+          </w:tcPr>
+          <w:p>
+            <w:pPr>
+              <w:jc w:val="left"/>
+            </w:pPr>
+            <w:r>
+              <w:t xml:space="preserve">5.0.0</w:t>
+            </w:r>
+          </w:p>
+        </w:tc>
+        <w:tc>
+          <w:tcPr>
+            <w:shd w:val="clear" w:color="auto" w:fill="F6F8FA"/>
+          </w:tcPr>
+          <w:p>
+            <w:pPr>
+              <w:jc w:val="left"/>
+            </w:pPr>
+            <w:r>
+              <w:t xml:space="preserve">2026-09-14</w:t>
+            </w:r>
+          </w:p>
+        </w:tc>
+        <w:tc>
+          <w:tcPr>
+            <w:shd w:val="clear" w:color="auto" w:fill="F6F8FA"/>
+          </w:tcPr>
+          <w:p>
+            <w:pPr>
+              <w:numPr>
+                <w:ilvl w:val="0"/>
+                <w:numId w:val="1071"/>
+              </w:numPr>
+              <w:jc w:val="left"/>
+            </w:pPr>
+            <w:r>
               <w:t xml:space="preserve">Major refactoring: extracted shared modules (huawei-titles, huawei-toc, huawei-cover), renamed</w:t>
             </w:r>
             <w:r>
@@ -15162,9 +15207,7 @@
       </w:tr>
       <w:tr>
         <w:tc>
-          <w:tcPr>
-            <w:shd w:val="clear" w:color="auto" w:fill="F6F8FA"/>
-          </w:tcPr>
+          <w:tcPr/>
           <w:p>
             <w:pPr>
               <w:jc w:val="left"/>
@@ -15175,56 +15218,13 @@
           </w:p>
         </w:tc>
         <w:tc>
-          <w:tcPr>
-            <w:shd w:val="clear" w:color="auto" w:fill="F6F8FA"/>
-          </w:tcPr>
+          <w:tcPr/>
           <w:p>
             <w:pPr>
               <w:jc w:val="left"/>
             </w:pPr>
             <w:r>
               <w:t xml:space="preserve">2026-09-14</w:t>
-            </w:r>
-          </w:p>
-        </w:tc>
-        <w:tc>
-          <w:tcPr>
-            <w:shd w:val="clear" w:color="auto" w:fill="F6F8FA"/>
-          </w:tcPr>
-          <w:p>
-            <w:pPr>
-              <w:numPr>
-                <w:ilvl w:val="0"/>
-                <w:numId w:val="1071"/>
-              </w:numPr>
-              <w:jc w:val="left"/>
-            </w:pPr>
-            <w:r>
-              <w:t xml:space="preserve">Testcase headings now formatted as captions (like figures/tables): bold “Testcase N:” followed by description. Changed label from “Test Case” to “Testcase”.</w:t>
-            </w:r>
-          </w:p>
-        </w:tc>
-      </w:tr>
-      <w:tr>
-        <w:tc>
-          <w:tcPr/>
-          <w:p>
-            <w:pPr>
-              <w:jc w:val="left"/>
-            </w:pPr>
-            <w:r>
-              <w:t xml:space="preserve">4.6.0</w:t>
-            </w:r>
-          </w:p>
-        </w:tc>
-        <w:tc>
-          <w:tcPr/>
-          <w:p>
-            <w:pPr>
-              <w:jc w:val="left"/>
-            </w:pPr>
-            <w:r>
-              <w:t xml:space="preserve">2026-09-13</w:t>
             </w:r>
           </w:p>
         </w:tc>
@@ -15239,7 +15239,7 @@
               <w:jc w:val="left"/>
             </w:pPr>
             <w:r>
-              <w:t xml:space="preserve">Section restructure: Introduction, Test Cases (with category subsections), Conclusion. Testcases auto-numbered like figures/tables. Changed testcase from subsection to subsubsection.</w:t>
+              <w:t xml:space="preserve">Testcase headings now formatted as captions (like figures/tables): bold “Testcase N:” followed by description. Changed label from “Test Case” to “Testcase”.</w:t>
             </w:r>
           </w:p>
         </w:tc>
@@ -15254,7 +15254,7 @@
               <w:jc w:val="left"/>
             </w:pPr>
             <w:r>
-              <w:t xml:space="preserve">4.5.0</w:t>
+              <w:t xml:space="preserve">4.6.0</w:t>
             </w:r>
           </w:p>
         </w:tc>
@@ -15284,6 +15284,45 @@
               <w:jc w:val="left"/>
             </w:pPr>
             <w:r>
+              <w:t xml:space="preserve">Section restructure: Introduction, Test Cases (with category subsections), Conclusion. Testcases auto-numbered like figures/tables. Changed testcase from subsection to subsubsection.</w:t>
+            </w:r>
+          </w:p>
+        </w:tc>
+      </w:tr>
+      <w:tr>
+        <w:tc>
+          <w:tcPr/>
+          <w:p>
+            <w:pPr>
+              <w:jc w:val="left"/>
+            </w:pPr>
+            <w:r>
+              <w:t xml:space="preserve">4.5.0</w:t>
+            </w:r>
+          </w:p>
+        </w:tc>
+        <w:tc>
+          <w:tcPr/>
+          <w:p>
+            <w:pPr>
+              <w:jc w:val="left"/>
+            </w:pPr>
+            <w:r>
+              <w:t xml:space="preserve">2026-09-13</w:t>
+            </w:r>
+          </w:p>
+        </w:tc>
+        <w:tc>
+          <w:tcPr/>
+          <w:p>
+            <w:pPr>
+              <w:numPr>
+                <w:ilvl w:val="0"/>
+                <w:numId w:val="1074"/>
+              </w:numPr>
+              <w:jc w:val="left"/>
+            </w:pPr>
+            <w:r>
               <w:t xml:space="preserve">Unified field APIs:</w:t>
             </w:r>
             <w:r>
@@ -15348,54 +15387,15 @@
       </w:tr>
       <w:tr>
         <w:tc>
-          <w:tcPr/>
+          <w:tcPr>
+            <w:shd w:val="clear" w:color="auto" w:fill="F6F8FA"/>
+          </w:tcPr>
           <w:p>
             <w:pPr>
               <w:jc w:val="left"/>
             </w:pPr>
             <w:r>
               <w:t xml:space="preserve">4.4.0</w:t>
-            </w:r>
-          </w:p>
-        </w:tc>
-        <w:tc>
-          <w:tcPr/>
-          <w:p>
-            <w:pPr>
-              <w:jc w:val="left"/>
-            </w:pPr>
-            <w:r>
-              <w:t xml:space="preserve">2026-09-13</w:t>
-            </w:r>
-          </w:p>
-        </w:tc>
-        <w:tc>
-          <w:tcPr/>
-          <w:p>
-            <w:pPr>
-              <w:numPr>
-                <w:ilvl w:val="0"/>
-                <w:numId w:val="1074"/>
-              </w:numPr>
-              <w:jc w:val="left"/>
-            </w:pPr>
-            <w:r>
-              <w:t xml:space="preserve">Code review fixes: removed dead labels, badge now uses Huawei brand colors (tipbg/tipfg, huaweired, warningbg/warningfg), Lua filter preserves formatting in DOCX/MD/HTML via parse_latex_blocks, testprocedure handler preserves non-step content (images, code, callouts).</w:t>
-            </w:r>
-          </w:p>
-        </w:tc>
-      </w:tr>
-      <w:tr>
-        <w:tc>
-          <w:tcPr>
-            <w:shd w:val="clear" w:color="auto" w:fill="F6F8FA"/>
-          </w:tcPr>
-          <w:p>
-            <w:pPr>
-              <w:jc w:val="left"/>
-            </w:pPr>
-            <w:r>
-              <w:t xml:space="preserve">4.3.0</w:t>
             </w:r>
           </w:p>
         </w:tc>
@@ -15425,6 +15425,45 @@
               <w:jc w:val="left"/>
             </w:pPr>
             <w:r>
+              <w:t xml:space="preserve">Code review fixes: removed dead labels, badge now uses Huawei brand colors (tipbg/tipfg, huaweired, warningbg/warningfg), Lua filter preserves formatting in DOCX/MD/HTML via parse_latex_blocks, testprocedure handler preserves non-step content (images, code, callouts).</w:t>
+            </w:r>
+          </w:p>
+        </w:tc>
+      </w:tr>
+      <w:tr>
+        <w:tc>
+          <w:tcPr/>
+          <w:p>
+            <w:pPr>
+              <w:jc w:val="left"/>
+            </w:pPr>
+            <w:r>
+              <w:t xml:space="preserve">4.3.0</w:t>
+            </w:r>
+          </w:p>
+        </w:tc>
+        <w:tc>
+          <w:tcPr/>
+          <w:p>
+            <w:pPr>
+              <w:jc w:val="left"/>
+            </w:pPr>
+            <w:r>
+              <w:t xml:space="preserve">2026-09-13</w:t>
+            </w:r>
+          </w:p>
+        </w:tc>
+        <w:tc>
+          <w:tcPr/>
+          <w:p>
+            <w:pPr>
+              <w:numPr>
+                <w:ilvl w:val="0"/>
+                <w:numId w:val="1076"/>
+              </w:numPr>
+              <w:jc w:val="left"/>
+            </w:pPr>
+            <w:r>
               <w:t xml:space="preserve">Added</w:t>
             </w:r>
             <w:r>
@@ -15477,7 +15516,9 @@
       </w:tr>
       <w:tr>
         <w:tc>
-          <w:tcPr/>
+          <w:tcPr>
+            <w:shd w:val="clear" w:color="auto" w:fill="F6F8FA"/>
+          </w:tcPr>
           <w:p>
             <w:pPr>
               <w:jc w:val="left"/>
@@ -15488,7 +15529,9 @@
           </w:p>
         </w:tc>
         <w:tc>
-          <w:tcPr/>
+          <w:tcPr>
+            <w:shd w:val="clear" w:color="auto" w:fill="F6F8FA"/>
+          </w:tcPr>
           <w:p>
             <w:pPr>
               <w:jc w:val="left"/>
@@ -15499,12 +15542,14 @@
           </w:p>
         </w:tc>
         <w:tc>
-          <w:tcPr/>
+          <w:tcPr>
+            <w:shd w:val="clear" w:color="auto" w:fill="F6F8FA"/>
+          </w:tcPr>
           <w:p>
             <w:pPr>
               <w:numPr>
                 <w:ilvl w:val="0"/>
-                <w:numId w:val="1076"/>
+                <w:numId w:val="1077"/>
               </w:numPr>
               <w:jc w:val="left"/>
             </w:pPr>
@@ -15558,9 +15603,7 @@
       </w:tr>
       <w:tr>
         <w:tc>
-          <w:tcPr>
-            <w:shd w:val="clear" w:color="auto" w:fill="F6F8FA"/>
-          </w:tcPr>
+          <w:tcPr/>
           <w:p>
             <w:pPr>
               <w:jc w:val="left"/>
@@ -15571,9 +15614,7 @@
           </w:p>
         </w:tc>
         <w:tc>
-          <w:tcPr>
-            <w:shd w:val="clear" w:color="auto" w:fill="F6F8FA"/>
-          </w:tcPr>
+          <w:tcPr/>
           <w:p>
             <w:pPr>
               <w:jc w:val="left"/>
@@ -15584,14 +15625,12 @@
           </w:p>
         </w:tc>
         <w:tc>
-          <w:tcPr>
-            <w:shd w:val="clear" w:color="auto" w:fill="F6F8FA"/>
-          </w:tcPr>
+          <w:tcPr/>
           <w:p>
             <w:pPr>
               <w:numPr>
                 <w:ilvl w:val="0"/>
-                <w:numId w:val="1077"/>
+                <w:numId w:val="1078"/>
               </w:numPr>
               <w:jc w:val="left"/>
             </w:pPr>
@@ -15618,7 +15657,9 @@
       </w:tr>
       <w:tr>
         <w:tc>
-          <w:tcPr/>
+          <w:tcPr>
+            <w:shd w:val="clear" w:color="auto" w:fill="F6F8FA"/>
+          </w:tcPr>
           <w:p>
             <w:pPr>
               <w:jc w:val="left"/>
@@ -15629,7 +15670,9 @@
           </w:p>
         </w:tc>
         <w:tc>
-          <w:tcPr/>
+          <w:tcPr>
+            <w:shd w:val="clear" w:color="auto" w:fill="F6F8FA"/>
+          </w:tcPr>
           <w:p>
             <w:pPr>
               <w:jc w:val="left"/>
@@ -15640,12 +15683,14 @@
           </w:p>
         </w:tc>
         <w:tc>
-          <w:tcPr/>
+          <w:tcPr>
+            <w:shd w:val="clear" w:color="auto" w:fill="F6F8FA"/>
+          </w:tcPr>
           <w:p>
             <w:pPr>
               <w:numPr>
                 <w:ilvl w:val="0"/>
-                <w:numId w:val="1078"/>
+                <w:numId w:val="1079"/>
               </w:numPr>
               <w:jc w:val="left"/>
             </w:pPr>
@@ -15687,9 +15732,7 @@
       </w:tr>
       <w:tr>
         <w:tc>
-          <w:tcPr>
-            <w:shd w:val="clear" w:color="auto" w:fill="F6F8FA"/>
-          </w:tcPr>
+          <w:tcPr/>
           <w:p>
             <w:pPr>
               <w:jc w:val="left"/>
@@ -15700,9 +15743,7 @@
           </w:p>
         </w:tc>
         <w:tc>
-          <w:tcPr>
-            <w:shd w:val="clear" w:color="auto" w:fill="F6F8FA"/>
-          </w:tcPr>
+          <w:tcPr/>
           <w:p>
             <w:pPr>
               <w:jc w:val="left"/>
@@ -15713,14 +15754,12 @@
           </w:p>
         </w:tc>
         <w:tc>
-          <w:tcPr>
-            <w:shd w:val="clear" w:color="auto" w:fill="F6F8FA"/>
-          </w:tcPr>
+          <w:tcPr/>
           <w:p>
             <w:pPr>
               <w:numPr>
                 <w:ilvl w:val="0"/>
-                <w:numId w:val="1079"/>
+                <w:numId w:val="1080"/>
               </w:numPr>
               <w:jc w:val="left"/>
             </w:pPr>
@@ -15747,54 +15786,15 @@
       </w:tr>
       <w:tr>
         <w:tc>
-          <w:tcPr/>
+          <w:tcPr>
+            <w:shd w:val="clear" w:color="auto" w:fill="F6F8FA"/>
+          </w:tcPr>
           <w:p>
             <w:pPr>
               <w:jc w:val="left"/>
             </w:pPr>
             <w:r>
               <w:t xml:space="preserve">3.8.1</w:t>
-            </w:r>
-          </w:p>
-        </w:tc>
-        <w:tc>
-          <w:tcPr/>
-          <w:p>
-            <w:pPr>
-              <w:jc w:val="left"/>
-            </w:pPr>
-            <w:r>
-              <w:t xml:space="preserve">2026-09-13</w:t>
-            </w:r>
-          </w:p>
-        </w:tc>
-        <w:tc>
-          <w:tcPr/>
-          <w:p>
-            <w:pPr>
-              <w:numPr>
-                <w:ilvl w:val="0"/>
-                <w:numId w:val="1080"/>
-              </w:numPr>
-              <w:jc w:val="left"/>
-            </w:pPr>
-            <w:r>
-              <w:t xml:space="preserve">End-to-end quality review: fixed testbook PDF metadata title, removed stray user DOCX from template dir, fixed round-trip.sh variable typo, updated stale references in AGENTS.md and README.md, committed testbook sample PDFs, set TZ for pandoc cover time consistency, widened pandoc version range.</w:t>
-            </w:r>
-          </w:p>
-        </w:tc>
-      </w:tr>
-      <w:tr>
-        <w:tc>
-          <w:tcPr>
-            <w:shd w:val="clear" w:color="auto" w:fill="F6F8FA"/>
-          </w:tcPr>
-          <w:p>
-            <w:pPr>
-              <w:jc w:val="left"/>
-            </w:pPr>
-            <w:r>
-              <w:t xml:space="preserve">3.8.0</w:t>
             </w:r>
           </w:p>
         </w:tc>
@@ -15824,7 +15824,7 @@
               <w:jc w:val="left"/>
             </w:pPr>
             <w:r>
-              <w:t xml:space="preserve">Removed Tips and Tricks chapter (tmux configuration) — required VS Code-specific keybindings that don’t generalize across terminal setups.</w:t>
+              <w:t xml:space="preserve">End-to-end quality review: fixed testbook PDF metadata title, removed stray user DOCX from template dir, fixed round-trip.sh variable typo, updated stale references in AGENTS.md and README.md, committed testbook sample PDFs, set TZ for pandoc cover time consistency, widened pandoc version range.</w:t>
             </w:r>
           </w:p>
         </w:tc>
@@ -15837,18 +15837,18 @@
               <w:jc w:val="left"/>
             </w:pPr>
             <w:r>
-              <w:t xml:space="preserve">3.7.0</w:t>
-            </w:r>
-          </w:p>
-        </w:tc>
-        <w:tc>
-          <w:tcPr/>
-          <w:p>
-            <w:pPr>
-              <w:jc w:val="left"/>
-            </w:pPr>
-            <w:r>
-              <w:t xml:space="preserve">2026-09-12</w:t>
+              <w:t xml:space="preserve">3.8.0</w:t>
+            </w:r>
+          </w:p>
+        </w:tc>
+        <w:tc>
+          <w:tcPr/>
+          <w:p>
+            <w:pPr>
+              <w:jc w:val="left"/>
+            </w:pPr>
+            <w:r>
+              <w:t xml:space="preserve">2026-09-13</w:t>
             </w:r>
           </w:p>
         </w:tc>
@@ -15863,6 +15863,51 @@
               <w:jc w:val="left"/>
             </w:pPr>
             <w:r>
+              <w:t xml:space="preserve">Removed Tips and Tricks chapter (tmux configuration) — required VS Code-specific keybindings that don’t generalize across terminal setups.</w:t>
+            </w:r>
+          </w:p>
+        </w:tc>
+      </w:tr>
+      <w:tr>
+        <w:tc>
+          <w:tcPr>
+            <w:shd w:val="clear" w:color="auto" w:fill="F6F8FA"/>
+          </w:tcPr>
+          <w:p>
+            <w:pPr>
+              <w:jc w:val="left"/>
+            </w:pPr>
+            <w:r>
+              <w:t xml:space="preserve">3.7.0</w:t>
+            </w:r>
+          </w:p>
+        </w:tc>
+        <w:tc>
+          <w:tcPr>
+            <w:shd w:val="clear" w:color="auto" w:fill="F6F8FA"/>
+          </w:tcPr>
+          <w:p>
+            <w:pPr>
+              <w:jc w:val="left"/>
+            </w:pPr>
+            <w:r>
+              <w:t xml:space="preserve">2026-09-12</w:t>
+            </w:r>
+          </w:p>
+        </w:tc>
+        <w:tc>
+          <w:tcPr>
+            <w:shd w:val="clear" w:color="auto" w:fill="F6F8FA"/>
+          </w:tcPr>
+          <w:p>
+            <w:pPr>
+              <w:numPr>
+                <w:ilvl w:val="0"/>
+                <w:numId w:val="1083"/>
+              </w:numPr>
+              <w:jc w:val="left"/>
+            </w:pPr>
+            <w:r>
               <w:t xml:space="preserve">Added</w:t>
             </w:r>
             <w:r>
@@ -15915,9 +15960,7 @@
       </w:tr>
       <w:tr>
         <w:tc>
-          <w:tcPr>
-            <w:shd w:val="clear" w:color="auto" w:fill="F6F8FA"/>
-          </w:tcPr>
+          <w:tcPr/>
           <w:p>
             <w:pPr>
               <w:jc w:val="left"/>
@@ -15928,9 +15971,7 @@
           </w:p>
         </w:tc>
         <w:tc>
-          <w:tcPr>
-            <w:shd w:val="clear" w:color="auto" w:fill="F6F8FA"/>
-          </w:tcPr>
+          <w:tcPr/>
           <w:p>
             <w:pPr>
               <w:jc w:val="left"/>
@@ -15941,14 +15982,12 @@
           </w:p>
         </w:tc>
         <w:tc>
-          <w:tcPr>
-            <w:shd w:val="clear" w:color="auto" w:fill="F6F8FA"/>
-          </w:tcPr>
+          <w:tcPr/>
           <w:p>
             <w:pPr>
               <w:numPr>
                 <w:ilvl w:val="0"/>
-                <w:numId w:val="1083"/>
+                <w:numId w:val="1084"/>
               </w:numPr>
               <w:jc w:val="left"/>
             </w:pPr>
@@ -16005,7 +16044,9 @@
       </w:tr>
       <w:tr>
         <w:tc>
-          <w:tcPr/>
+          <w:tcPr>
+            <w:shd w:val="clear" w:color="auto" w:fill="F6F8FA"/>
+          </w:tcPr>
           <w:p>
             <w:pPr>
               <w:jc w:val="left"/>
@@ -16016,7 +16057,9 @@
           </w:p>
         </w:tc>
         <w:tc>
-          <w:tcPr/>
+          <w:tcPr>
+            <w:shd w:val="clear" w:color="auto" w:fill="F6F8FA"/>
+          </w:tcPr>
           <w:p>
             <w:pPr>
               <w:jc w:val="left"/>
@@ -16027,12 +16070,14 @@
           </w:p>
         </w:tc>
         <w:tc>
-          <w:tcPr/>
+          <w:tcPr>
+            <w:shd w:val="clear" w:color="auto" w:fill="F6F8FA"/>
+          </w:tcPr>
           <w:p>
             <w:pPr>
               <w:numPr>
                 <w:ilvl w:val="0"/>
-                <w:numId w:val="1084"/>
+                <w:numId w:val="1085"/>
               </w:numPr>
               <w:jc w:val="left"/>
             </w:pPr>
@@ -16110,9 +16155,7 @@
       </w:tr>
       <w:tr>
         <w:tc>
-          <w:tcPr>
-            <w:shd w:val="clear" w:color="auto" w:fill="F6F8FA"/>
-          </w:tcPr>
+          <w:tcPr/>
           <w:p>
             <w:pPr>
               <w:jc w:val="left"/>
@@ -16123,9 +16166,7 @@
           </w:p>
         </w:tc>
         <w:tc>
-          <w:tcPr>
-            <w:shd w:val="clear" w:color="auto" w:fill="F6F8FA"/>
-          </w:tcPr>
+          <w:tcPr/>
           <w:p>
             <w:pPr>
               <w:jc w:val="left"/>
@@ -16136,14 +16177,12 @@
           </w:p>
         </w:tc>
         <w:tc>
-          <w:tcPr>
-            <w:shd w:val="clear" w:color="auto" w:fill="F6F8FA"/>
-          </w:tcPr>
+          <w:tcPr/>
           <w:p>
             <w:pPr>
               <w:numPr>
                 <w:ilvl w:val="0"/>
-                <w:numId w:val="1085"/>
+                <w:numId w:val="1086"/>
               </w:numPr>
               <w:jc w:val="left"/>
             </w:pPr>
@@ -16170,7 +16209,7 @@
             <w:pPr>
               <w:numPr>
                 <w:ilvl w:val="0"/>
-                <w:numId w:val="1085"/>
+                <w:numId w:val="1086"/>
               </w:numPr>
               <w:jc w:val="left"/>
             </w:pPr>
@@ -16212,7 +16251,7 @@
             <w:pPr>
               <w:numPr>
                 <w:ilvl w:val="0"/>
-                <w:numId w:val="1085"/>
+                <w:numId w:val="1086"/>
               </w:numPr>
               <w:jc w:val="left"/>
             </w:pPr>
@@ -16224,7 +16263,9 @@
       </w:tr>
       <w:tr>
         <w:tc>
-          <w:tcPr/>
+          <w:tcPr>
+            <w:shd w:val="clear" w:color="auto" w:fill="F6F8FA"/>
+          </w:tcPr>
           <w:p>
             <w:pPr>
               <w:jc w:val="left"/>
@@ -16235,7 +16276,9 @@
           </w:p>
         </w:tc>
         <w:tc>
-          <w:tcPr/>
+          <w:tcPr>
+            <w:shd w:val="clear" w:color="auto" w:fill="F6F8FA"/>
+          </w:tcPr>
           <w:p>
             <w:pPr>
               <w:jc w:val="left"/>
@@ -16246,12 +16289,14 @@
           </w:p>
         </w:tc>
         <w:tc>
-          <w:tcPr/>
+          <w:tcPr>
+            <w:shd w:val="clear" w:color="auto" w:fill="F6F8FA"/>
+          </w:tcPr>
           <w:p>
             <w:pPr>
               <w:numPr>
                 <w:ilvl w:val="0"/>
-                <w:numId w:val="1086"/>
+                <w:numId w:val="1087"/>
               </w:numPr>
               <w:jc w:val="left"/>
             </w:pPr>
@@ -16278,7 +16323,7 @@
             <w:pPr>
               <w:numPr>
                 <w:ilvl w:val="0"/>
-                <w:numId w:val="1086"/>
+                <w:numId w:val="1087"/>
               </w:numPr>
               <w:jc w:val="left"/>
             </w:pPr>
@@ -16305,7 +16350,7 @@
             <w:pPr>
               <w:numPr>
                 <w:ilvl w:val="0"/>
-                <w:numId w:val="1086"/>
+                <w:numId w:val="1087"/>
               </w:numPr>
               <w:jc w:val="left"/>
             </w:pPr>
@@ -16317,7 +16362,7 @@
             <w:pPr>
               <w:numPr>
                 <w:ilvl w:val="0"/>
-                <w:numId w:val="1086"/>
+                <w:numId w:val="1087"/>
               </w:numPr>
               <w:jc w:val="left"/>
             </w:pPr>
@@ -16341,58 +16386,13 @@
       </w:tr>
       <w:tr>
         <w:tc>
-          <w:tcPr>
-            <w:shd w:val="clear" w:color="auto" w:fill="F6F8FA"/>
-          </w:tcPr>
+          <w:tcPr/>
           <w:p>
             <w:pPr>
               <w:jc w:val="left"/>
             </w:pPr>
             <w:r>
               <w:t xml:space="preserve">3.2.1</w:t>
-            </w:r>
-          </w:p>
-        </w:tc>
-        <w:tc>
-          <w:tcPr>
-            <w:shd w:val="clear" w:color="auto" w:fill="F6F8FA"/>
-          </w:tcPr>
-          <w:p>
-            <w:pPr>
-              <w:jc w:val="left"/>
-            </w:pPr>
-            <w:r>
-              <w:t xml:space="preserve">2026-09-11</w:t>
-            </w:r>
-          </w:p>
-        </w:tc>
-        <w:tc>
-          <w:tcPr>
-            <w:shd w:val="clear" w:color="auto" w:fill="F6F8FA"/>
-          </w:tcPr>
-          <w:p>
-            <w:pPr>
-              <w:numPr>
-                <w:ilvl w:val="0"/>
-                <w:numId w:val="1087"/>
-              </w:numPr>
-              <w:jc w:val="left"/>
-            </w:pPr>
-            <w:r>
-              <w:t xml:space="preserve">Renamed Chapter 7 from “Clean Up” to “Operations and Maintenance”. Added subsections for updating and uninstalling both the MaaS Gateway and the document templates. Added cloud resource cleanup as an optional subsection.</w:t>
-            </w:r>
-          </w:p>
-        </w:tc>
-      </w:tr>
-      <w:tr>
-        <w:tc>
-          <w:tcPr/>
-          <w:p>
-            <w:pPr>
-              <w:jc w:val="left"/>
-            </w:pPr>
-            <w:r>
-              <w:t xml:space="preserve">3.2.0</w:t>
             </w:r>
           </w:p>
         </w:tc>
@@ -16418,6 +16418,51 @@
               <w:jc w:val="left"/>
             </w:pPr>
             <w:r>
+              <w:t xml:space="preserve">Renamed Chapter 7 from “Clean Up” to “Operations and Maintenance”. Added subsections for updating and uninstalling both the MaaS Gateway and the document templates. Added cloud resource cleanup as an optional subsection.</w:t>
+            </w:r>
+          </w:p>
+        </w:tc>
+      </w:tr>
+      <w:tr>
+        <w:tc>
+          <w:tcPr>
+            <w:shd w:val="clear" w:color="auto" w:fill="F6F8FA"/>
+          </w:tcPr>
+          <w:p>
+            <w:pPr>
+              <w:jc w:val="left"/>
+            </w:pPr>
+            <w:r>
+              <w:t xml:space="preserve">3.2.0</w:t>
+            </w:r>
+          </w:p>
+        </w:tc>
+        <w:tc>
+          <w:tcPr>
+            <w:shd w:val="clear" w:color="auto" w:fill="F6F8FA"/>
+          </w:tcPr>
+          <w:p>
+            <w:pPr>
+              <w:jc w:val="left"/>
+            </w:pPr>
+            <w:r>
+              <w:t xml:space="preserve">2026-09-11</w:t>
+            </w:r>
+          </w:p>
+        </w:tc>
+        <w:tc>
+          <w:tcPr>
+            <w:shd w:val="clear" w:color="auto" w:fill="F6F8FA"/>
+          </w:tcPr>
+          <w:p>
+            <w:pPr>
+              <w:numPr>
+                <w:ilvl w:val="0"/>
+                <w:numId w:val="1089"/>
+              </w:numPr>
+              <w:jc w:val="left"/>
+            </w:pPr>
+            <w:r>
               <w:t xml:space="preserve">Added</w:t>
             </w:r>
             <w:r>
@@ -16479,7 +16524,7 @@
             <w:pPr>
               <w:numPr>
                 <w:ilvl w:val="0"/>
-                <w:numId w:val="1088"/>
+                <w:numId w:val="1089"/>
               </w:numPr>
               <w:jc w:val="left"/>
             </w:pPr>
@@ -16524,7 +16569,7 @@
             <w:pPr>
               <w:numPr>
                 <w:ilvl w:val="0"/>
-                <w:numId w:val="1088"/>
+                <w:numId w:val="1089"/>
               </w:numPr>
               <w:jc w:val="left"/>
             </w:pPr>
@@ -16536,58 +16581,13 @@
       </w:tr>
       <w:tr>
         <w:tc>
-          <w:tcPr>
-            <w:shd w:val="clear" w:color="auto" w:fill="F6F8FA"/>
-          </w:tcPr>
+          <w:tcPr/>
           <w:p>
             <w:pPr>
               <w:jc w:val="left"/>
             </w:pPr>
             <w:r>
               <w:t xml:space="preserve">3.1.2</w:t>
-            </w:r>
-          </w:p>
-        </w:tc>
-        <w:tc>
-          <w:tcPr>
-            <w:shd w:val="clear" w:color="auto" w:fill="F6F8FA"/>
-          </w:tcPr>
-          <w:p>
-            <w:pPr>
-              <w:jc w:val="left"/>
-            </w:pPr>
-            <w:r>
-              <w:t xml:space="preserve">2026-09-11</w:t>
-            </w:r>
-          </w:p>
-        </w:tc>
-        <w:tc>
-          <w:tcPr>
-            <w:shd w:val="clear" w:color="auto" w:fill="F6F8FA"/>
-          </w:tcPr>
-          <w:p>
-            <w:pPr>
-              <w:numPr>
-                <w:ilvl w:val="0"/>
-                <w:numId w:val="1089"/>
-              </w:numPr>
-              <w:jc w:val="left"/>
-            </w:pPr>
-            <w:r>
-              <w:t xml:space="preserve">Added output format guide to README.md: comparison table of PDF, Markdown, DOCX, and HTML with purpose, copy-paste quality, and limitations. Recommends Markdown for copy-paste.</w:t>
-            </w:r>
-          </w:p>
-        </w:tc>
-      </w:tr>
-      <w:tr>
-        <w:tc>
-          <w:tcPr/>
-          <w:p>
-            <w:pPr>
-              <w:jc w:val="left"/>
-            </w:pPr>
-            <w:r>
-              <w:t xml:space="preserve">3.1.1</w:t>
             </w:r>
           </w:p>
         </w:tc>
@@ -16613,6 +16613,51 @@
               <w:jc w:val="left"/>
             </w:pPr>
             <w:r>
+              <w:t xml:space="preserve">Added output format guide to README.md: comparison table of PDF, Markdown, DOCX, and HTML with purpose, copy-paste quality, and limitations. Recommends Markdown for copy-paste.</w:t>
+            </w:r>
+          </w:p>
+        </w:tc>
+      </w:tr>
+      <w:tr>
+        <w:tc>
+          <w:tcPr>
+            <w:shd w:val="clear" w:color="auto" w:fill="F6F8FA"/>
+          </w:tcPr>
+          <w:p>
+            <w:pPr>
+              <w:jc w:val="left"/>
+            </w:pPr>
+            <w:r>
+              <w:t xml:space="preserve">3.1.1</w:t>
+            </w:r>
+          </w:p>
+        </w:tc>
+        <w:tc>
+          <w:tcPr>
+            <w:shd w:val="clear" w:color="auto" w:fill="F6F8FA"/>
+          </w:tcPr>
+          <w:p>
+            <w:pPr>
+              <w:jc w:val="left"/>
+            </w:pPr>
+            <w:r>
+              <w:t xml:space="preserve">2026-09-11</w:t>
+            </w:r>
+          </w:p>
+        </w:tc>
+        <w:tc>
+          <w:tcPr>
+            <w:shd w:val="clear" w:color="auto" w:fill="F6F8FA"/>
+          </w:tcPr>
+          <w:p>
+            <w:pPr>
+              <w:numPr>
+                <w:ilvl w:val="0"/>
+                <w:numId w:val="1091"/>
+              </w:numPr>
+              <w:jc w:val="left"/>
+            </w:pPr>
+            <w:r>
               <w:t xml:space="preserve">Updated MaaS Gateway chapter to v1.10.9: non-interactive mode (</w:t>
             </w:r>
             <w:r>
@@ -16629,7 +16674,7 @@
             <w:pPr>
               <w:numPr>
                 <w:ilvl w:val="0"/>
-                <w:numId w:val="1090"/>
+                <w:numId w:val="1091"/>
               </w:numPr>
               <w:jc w:val="left"/>
             </w:pPr>
@@ -16671,7 +16716,7 @@
             <w:pPr>
               <w:numPr>
                 <w:ilvl w:val="0"/>
-                <w:numId w:val="1090"/>
+                <w:numId w:val="1091"/>
               </w:numPr>
               <w:jc w:val="left"/>
             </w:pPr>
@@ -16683,9 +16728,7 @@
       </w:tr>
       <w:tr>
         <w:tc>
-          <w:tcPr>
-            <w:shd w:val="clear" w:color="auto" w:fill="F6F8FA"/>
-          </w:tcPr>
+          <w:tcPr/>
           <w:p>
             <w:pPr>
               <w:jc w:val="left"/>
@@ -16696,9 +16739,7 @@
           </w:p>
         </w:tc>
         <w:tc>
-          <w:tcPr>
-            <w:shd w:val="clear" w:color="auto" w:fill="F6F8FA"/>
-          </w:tcPr>
+          <w:tcPr/>
           <w:p>
             <w:pPr>
               <w:jc w:val="left"/>
@@ -16709,14 +16750,12 @@
           </w:p>
         </w:tc>
         <w:tc>
-          <w:tcPr>
-            <w:shd w:val="clear" w:color="auto" w:fill="F6F8FA"/>
-          </w:tcPr>
+          <w:tcPr/>
           <w:p>
             <w:pPr>
               <w:numPr>
                 <w:ilvl w:val="0"/>
-                <w:numId w:val="1091"/>
+                <w:numId w:val="1092"/>
               </w:numPr>
               <w:jc w:val="left"/>
             </w:pPr>
@@ -16740,7 +16779,7 @@
             <w:pPr>
               <w:numPr>
                 <w:ilvl w:val="0"/>
-                <w:numId w:val="1091"/>
+                <w:numId w:val="1092"/>
               </w:numPr>
               <w:jc w:val="left"/>
             </w:pPr>
@@ -16782,7 +16821,7 @@
             <w:pPr>
               <w:numPr>
                 <w:ilvl w:val="0"/>
-                <w:numId w:val="1091"/>
+                <w:numId w:val="1092"/>
               </w:numPr>
               <w:jc w:val="left"/>
             </w:pPr>
@@ -16790,57 +16829,6 @@
               <w:t xml:space="preserve">Restructured chapters: moved SSH config and VS Code connection to new Chapter 4 (Install VS Code and Connect via Remote-SSH). Chapters 5—​7 renumbered.</w:t>
             </w:r>
           </w:p>
-          <w:p>
-            <w:pPr>
-              <w:numPr>
-                <w:ilvl w:val="0"/>
-                <w:numId w:val="1091"/>
-              </w:numPr>
-              <w:jc w:val="left"/>
-            </w:pPr>
-            <w:r>
-              <w:t xml:space="preserve">Added verification checklist tables to all 7 chapters.</w:t>
-            </w:r>
-          </w:p>
-          <w:p>
-            <w:pPr>
-              <w:numPr>
-                <w:ilvl w:val="0"/>
-                <w:numId w:val="1091"/>
-              </w:numPr>
-              <w:jc w:val="left"/>
-            </w:pPr>
-            <w:r>
-              <w:t xml:space="preserve">Added mandatory reboot warning in Chapter 2 (SSH port change). Added troubleshooting subsection in Chapter 4 with common SSH connection issues and ncat debugging commands.</w:t>
-            </w:r>
-          </w:p>
-        </w:tc>
-      </w:tr>
-      <w:tr>
-        <w:tc>
-          <w:tcPr/>
-          <w:p>
-            <w:pPr>
-              <w:jc w:val="left"/>
-            </w:pPr>
-            <w:r>
-              <w:t xml:space="preserve">3.0.1</w:t>
-            </w:r>
-          </w:p>
-        </w:tc>
-        <w:tc>
-          <w:tcPr/>
-          <w:p>
-            <w:pPr>
-              <w:jc w:val="left"/>
-            </w:pPr>
-            <w:r>
-              <w:t xml:space="preserve">2026-09-10</w:t>
-            </w:r>
-          </w:p>
-        </w:tc>
-        <w:tc>
-          <w:tcPr/>
           <w:p>
             <w:pPr>
               <w:numPr>
@@ -16850,7 +16838,19 @@
               <w:jc w:val="left"/>
             </w:pPr>
             <w:r>
-              <w:t xml:space="preserve">Minor fixes: test-filter.sh auto-discovery, build.sh help text, Makefile aggregate descriptions, 5-section comment correction, CHANGELOG version gap note, callout-in-code fix, CI font auto-discovery, dofile path comment, test-sync.sh header.</w:t>
+              <w:t xml:space="preserve">Added verification checklist tables to all 7 chapters.</w:t>
+            </w:r>
+          </w:p>
+          <w:p>
+            <w:pPr>
+              <w:numPr>
+                <w:ilvl w:val="0"/>
+                <w:numId w:val="1092"/>
+              </w:numPr>
+              <w:jc w:val="left"/>
+            </w:pPr>
+            <w:r>
+              <w:t xml:space="preserve">Added mandatory reboot warning in Chapter 2 (SSH port change). Added troubleshooting subsection in Chapter 4 with common SSH connection issues and ncat debugging commands.</w:t>
             </w:r>
           </w:p>
         </w:tc>
@@ -16865,7 +16865,7 @@
               <w:jc w:val="left"/>
             </w:pPr>
             <w:r>
-              <w:t xml:space="preserve">3.0.0</w:t>
+              <w:t xml:space="preserve">3.0.1</w:t>
             </w:r>
           </w:p>
         </w:tc>
@@ -16878,7 +16878,7 @@
               <w:jc w:val="left"/>
             </w:pPr>
             <w:r>
-              <w:t xml:space="preserve">2026-09-09</w:t>
+              <w:t xml:space="preserve">2026-09-10</w:t>
             </w:r>
           </w:p>
         </w:tc>
@@ -16895,7 +16895,7 @@
               <w:jc w:val="left"/>
             </w:pPr>
             <w:r>
-              <w:t xml:space="preserve">Modular pipeline refactoring: shared Lua filter factory, shared DOCX fix logic, build system auto-discovery, unified format pipeline, GitHub Actions CI.</w:t>
+              <w:t xml:space="preserve">Minor fixes: test-filter.sh auto-discovery, build.sh help text, Makefile aggregate descriptions, 5-section comment correction, CHANGELOG version gap note, callout-in-code fix, CI font auto-discovery, dofile path comment, test-sync.sh header.</w:t>
             </w:r>
           </w:p>
         </w:tc>
@@ -16908,18 +16908,18 @@
               <w:jc w:val="left"/>
             </w:pPr>
             <w:r>
-              <w:t xml:space="preserve">2.16.0</w:t>
-            </w:r>
-          </w:p>
-        </w:tc>
-        <w:tc>
-          <w:tcPr/>
-          <w:p>
-            <w:pPr>
-              <w:jc w:val="left"/>
-            </w:pPr>
-            <w:r>
-              <w:t xml:space="preserve">2026-09-05</w:t>
+              <w:t xml:space="preserve">3.0.0</w:t>
+            </w:r>
+          </w:p>
+        </w:tc>
+        <w:tc>
+          <w:tcPr/>
+          <w:p>
+            <w:pPr>
+              <w:jc w:val="left"/>
+            </w:pPr>
+            <w:r>
+              <w:t xml:space="preserve">2026-09-09</w:t>
             </w:r>
           </w:p>
         </w:tc>
@@ -16934,7 +16934,7 @@
               <w:jc w:val="left"/>
             </w:pPr>
             <w:r>
-              <w:t xml:space="preserve">Updated to match template v2.16.0 — Lua filter fixes, build system updates, and technical template parity improvements.</w:t>
+              <w:t xml:space="preserve">Modular pipeline refactoring: shared Lua filter factory, shared DOCX fix logic, build system auto-discovery, unified format pipeline, GitHub Actions CI.</w:t>
             </w:r>
           </w:p>
         </w:tc>
@@ -16949,7 +16949,7 @@
               <w:jc w:val="left"/>
             </w:pPr>
             <w:r>
-              <w:t xml:space="preserve">2.13.0</w:t>
+              <w:t xml:space="preserve">2.16.0</w:t>
             </w:r>
           </w:p>
         </w:tc>
@@ -16962,7 +16962,7 @@
               <w:jc w:val="left"/>
             </w:pPr>
             <w:r>
-              <w:t xml:space="preserve">2026-08-24</w:t>
+              <w:t xml:space="preserve">2026-09-05</w:t>
             </w:r>
           </w:p>
         </w:tc>
@@ -16979,6 +16979,45 @@
               <w:jc w:val="left"/>
             </w:pPr>
             <w:r>
+              <w:t xml:space="preserve">Updated to match template v2.16.0 — Lua filter fixes, build system updates, and technical template parity improvements.</w:t>
+            </w:r>
+          </w:p>
+        </w:tc>
+      </w:tr>
+      <w:tr>
+        <w:tc>
+          <w:tcPr/>
+          <w:p>
+            <w:pPr>
+              <w:jc w:val="left"/>
+            </w:pPr>
+            <w:r>
+              <w:t xml:space="preserve">2.13.0</w:t>
+            </w:r>
+          </w:p>
+        </w:tc>
+        <w:tc>
+          <w:tcPr/>
+          <w:p>
+            <w:pPr>
+              <w:jc w:val="left"/>
+            </w:pPr>
+            <w:r>
+              <w:t xml:space="preserve">2026-08-24</w:t>
+            </w:r>
+          </w:p>
+        </w:tc>
+        <w:tc>
+          <w:tcPr/>
+          <w:p>
+            <w:pPr>
+              <w:numPr>
+                <w:ilvl w:val="0"/>
+                <w:numId w:val="1096"/>
+              </w:numPr>
+              <w:jc w:val="left"/>
+            </w:pPr>
+            <w:r>
               <w:t xml:space="preserve">Foundation refactoring Phase 4: make DOCX</w:t>
             </w:r>
             <w:r>
@@ -17046,7 +17085,9 @@
       </w:tr>
       <w:tr>
         <w:tc>
-          <w:tcPr/>
+          <w:tcPr>
+            <w:shd w:val="clear" w:color="auto" w:fill="F6F8FA"/>
+          </w:tcPr>
           <w:p>
             <w:pPr>
               <w:jc w:val="left"/>
@@ -17057,7 +17098,9 @@
           </w:p>
         </w:tc>
         <w:tc>
-          <w:tcPr/>
+          <w:tcPr>
+            <w:shd w:val="clear" w:color="auto" w:fill="F6F8FA"/>
+          </w:tcPr>
           <w:p>
             <w:pPr>
               <w:jc w:val="left"/>
@@ -17068,12 +17111,14 @@
           </w:p>
         </w:tc>
         <w:tc>
-          <w:tcPr/>
+          <w:tcPr>
+            <w:shd w:val="clear" w:color="auto" w:fill="F6F8FA"/>
+          </w:tcPr>
           <w:p>
             <w:pPr>
               <w:numPr>
                 <w:ilvl w:val="0"/>
-                <w:numId w:val="1096"/>
+                <w:numId w:val="1097"/>
               </w:numPr>
               <w:jc w:val="left"/>
             </w:pPr>
@@ -17235,9 +17280,7 @@
       </w:tr>
       <w:tr>
         <w:tc>
-          <w:tcPr>
-            <w:shd w:val="clear" w:color="auto" w:fill="F6F8FA"/>
-          </w:tcPr>
+          <w:tcPr/>
           <w:p>
             <w:pPr>
               <w:jc w:val="left"/>
@@ -17248,9 +17291,7 @@
           </w:p>
         </w:tc>
         <w:tc>
-          <w:tcPr>
-            <w:shd w:val="clear" w:color="auto" w:fill="F6F8FA"/>
-          </w:tcPr>
+          <w:tcPr/>
           <w:p>
             <w:pPr>
               <w:jc w:val="left"/>
@@ -17261,14 +17302,12 @@
           </w:p>
         </w:tc>
         <w:tc>
-          <w:tcPr>
-            <w:shd w:val="clear" w:color="auto" w:fill="F6F8FA"/>
-          </w:tcPr>
+          <w:tcPr/>
           <w:p>
             <w:pPr>
               <w:numPr>
                 <w:ilvl w:val="0"/>
-                <w:numId w:val="1097"/>
+                <w:numId w:val="1098"/>
               </w:numPr>
               <w:jc w:val="left"/>
             </w:pPr>
@@ -17334,7 +17373,9 @@
       </w:tr>
       <w:tr>
         <w:tc>
-          <w:tcPr/>
+          <w:tcPr>
+            <w:shd w:val="clear" w:color="auto" w:fill="F6F8FA"/>
+          </w:tcPr>
           <w:p>
             <w:pPr>
               <w:jc w:val="left"/>
@@ -17345,56 +17386,15 @@
           </w:p>
         </w:tc>
         <w:tc>
-          <w:tcPr/>
+          <w:tcPr>
+            <w:shd w:val="clear" w:color="auto" w:fill="F6F8FA"/>
+          </w:tcPr>
           <w:p>
             <w:pPr>
               <w:jc w:val="left"/>
             </w:pPr>
             <w:r>
               <w:t xml:space="preserve">2026-08-24</w:t>
-            </w:r>
-          </w:p>
-        </w:tc>
-        <w:tc>
-          <w:tcPr/>
-          <w:p>
-            <w:pPr>
-              <w:numPr>
-                <w:ilvl w:val="0"/>
-                <w:numId w:val="1098"/>
-              </w:numPr>
-              <w:jc w:val="left"/>
-            </w:pPr>
-            <w:r>
-              <w:t xml:space="preserve">Foundation refactoring Phase 1: sync cls version to project tag, fix stale doc references (L16 output count, L-range, setup-guide feature claim), add test-sync.sh for version consistency checking.</w:t>
-            </w:r>
-          </w:p>
-        </w:tc>
-      </w:tr>
-      <w:tr>
-        <w:tc>
-          <w:tcPr>
-            <w:shd w:val="clear" w:color="auto" w:fill="F6F8FA"/>
-          </w:tcPr>
-          <w:p>
-            <w:pPr>
-              <w:jc w:val="left"/>
-            </w:pPr>
-            <w:r>
-              <w:t xml:space="preserve">2.9.1</w:t>
-            </w:r>
-          </w:p>
-        </w:tc>
-        <w:tc>
-          <w:tcPr>
-            <w:shd w:val="clear" w:color="auto" w:fill="F6F8FA"/>
-          </w:tcPr>
-          <w:p>
-            <w:pPr>
-              <w:jc w:val="left"/>
-            </w:pPr>
-            <w:r>
-              <w:t xml:space="preserve">2026-08-23</w:t>
             </w:r>
           </w:p>
         </w:tc>
@@ -17411,6 +17411,45 @@
               <w:jc w:val="left"/>
             </w:pPr>
             <w:r>
+              <w:t xml:space="preserve">Foundation refactoring Phase 1: sync cls version to project tag, fix stale doc references (L16 output count, L-range, setup-guide feature claim), add test-sync.sh for version consistency checking.</w:t>
+            </w:r>
+          </w:p>
+        </w:tc>
+      </w:tr>
+      <w:tr>
+        <w:tc>
+          <w:tcPr/>
+          <w:p>
+            <w:pPr>
+              <w:jc w:val="left"/>
+            </w:pPr>
+            <w:r>
+              <w:t xml:space="preserve">2.9.1</w:t>
+            </w:r>
+          </w:p>
+        </w:tc>
+        <w:tc>
+          <w:tcPr/>
+          <w:p>
+            <w:pPr>
+              <w:jc w:val="left"/>
+            </w:pPr>
+            <w:r>
+              <w:t xml:space="preserve">2026-08-23</w:t>
+            </w:r>
+          </w:p>
+        </w:tc>
+        <w:tc>
+          <w:tcPr/>
+          <w:p>
+            <w:pPr>
+              <w:numPr>
+                <w:ilvl w:val="0"/>
+                <w:numId w:val="1100"/>
+              </w:numPr>
+              <w:jc w:val="left"/>
+            </w:pPr>
+            <w:r>
               <w:t xml:space="preserve">HTML and Markdown outputs now embed images as base64 data URIs. HTML uses pandoc</w:t>
             </w:r>
             <w:r>
@@ -17442,54 +17481,15 @@
       </w:tr>
       <w:tr>
         <w:tc>
-          <w:tcPr/>
+          <w:tcPr>
+            <w:shd w:val="clear" w:color="auto" w:fill="F6F8FA"/>
+          </w:tcPr>
           <w:p>
             <w:pPr>
               <w:jc w:val="left"/>
             </w:pPr>
             <w:r>
               <w:t xml:space="preserve">2.9.0</w:t>
-            </w:r>
-          </w:p>
-        </w:tc>
-        <w:tc>
-          <w:tcPr/>
-          <w:p>
-            <w:pPr>
-              <w:jc w:val="left"/>
-            </w:pPr>
-            <w:r>
-              <w:t xml:space="preserve">2026-08-23</w:t>
-            </w:r>
-          </w:p>
-        </w:tc>
-        <w:tc>
-          <w:tcPr/>
-          <w:p>
-            <w:pPr>
-              <w:numPr>
-                <w:ilvl w:val="0"/>
-                <w:numId w:val="1100"/>
-              </w:numPr>
-              <w:jc w:val="left"/>
-            </w:pPr>
-            <w:r>
-              <w:t xml:space="preserve">DOCX: fix content width (8504→9638tw, margins are 2cm not 3cm). Add footer page numbers. Style TOC heading (22pt bold + rule). Add hutable table width + fixed layout.</w:t>
-            </w:r>
-          </w:p>
-        </w:tc>
-      </w:tr>
-      <w:tr>
-        <w:tc>
-          <w:tcPr>
-            <w:shd w:val="clear" w:color="auto" w:fill="F6F8FA"/>
-          </w:tcPr>
-          <w:p>
-            <w:pPr>
-              <w:jc w:val="left"/>
-            </w:pPr>
-            <w:r>
-              <w:t xml:space="preserve">2.8.3</w:t>
             </w:r>
           </w:p>
         </w:tc>
@@ -17519,7 +17519,7 @@
               <w:jc w:val="left"/>
             </w:pPr>
             <w:r>
-              <w:t xml:space="preserve">DOCX fix: callout tables now have explicit width (8504tw) and fixed layout. Changelog section heading now uses custom H1 format (56pt number, red border, right tab) instead of pandoc’s default.</w:t>
+              <w:t xml:space="preserve">DOCX: fix content width (8504→9638tw, margins are 2cm not 3cm). Add footer page numbers. Style TOC heading (22pt bold + rule). Add hutable table width + fixed layout.</w:t>
             </w:r>
           </w:p>
         </w:tc>
@@ -17532,7 +17532,7 @@
               <w:jc w:val="left"/>
             </w:pPr>
             <w:r>
-              <w:t xml:space="preserve">2.8.2</w:t>
+              <w:t xml:space="preserve">2.8.3</w:t>
             </w:r>
           </w:p>
         </w:tc>
@@ -17558,7 +17558,7 @@
               <w:jc w:val="left"/>
             </w:pPr>
             <w:r>
-              <w:t xml:space="preserve">DOCX H1 heading: reverted table approach to paragraph with tab stop + red bottom border. Table broke navigation pane and TOC field. Paragraph preserves Heading1 style for navigation while matching PDF layout (number left, title right, red rule below).</w:t>
+              <w:t xml:space="preserve">DOCX fix: callout tables now have explicit width (8504tw) and fixed layout. Changelog section heading now uses custom H1 format (56pt number, red border, right tab) instead of pandoc’s default.</w:t>
             </w:r>
           </w:p>
         </w:tc>
@@ -17573,7 +17573,7 @@
               <w:jc w:val="left"/>
             </w:pPr>
             <w:r>
-              <w:t xml:space="preserve">2.8.1</w:t>
+              <w:t xml:space="preserve">2.8.2</w:t>
             </w:r>
           </w:p>
         </w:tc>
@@ -17603,7 +17603,7 @@
               <w:jc w:val="left"/>
             </w:pPr>
             <w:r>
-              <w:t xml:space="preserve">DOCX heading fix: text color reverted to black (was incorrectly changed to Huawei red in v2.8.0). H1 now uses a two-column table (number left, title right) with red bottom rule. H2-H4 use simple inline format (number + title, no right tab stop).</w:t>
+              <w:t xml:space="preserve">DOCX H1 heading: reverted table approach to paragraph with tab stop + red bottom border. Table broke navigation pane and TOC field. Paragraph preserves Heading1 style for navigation while matching PDF layout (number left, title right, red rule below).</w:t>
             </w:r>
           </w:p>
         </w:tc>
@@ -17616,7 +17616,7 @@
               <w:jc w:val="left"/>
             </w:pPr>
             <w:r>
-              <w:t xml:space="preserve">2.8.0</w:t>
+              <w:t xml:space="preserve">2.8.1</w:t>
             </w:r>
           </w:p>
         </w:tc>
@@ -17642,7 +17642,7 @@
               <w:jc w:val="left"/>
             </w:pPr>
             <w:r>
-              <w:t xml:space="preserve">DOCX output: match PDF styling --- heading colors (Huawei red), H1 number size (56pt), callout borders (left-only) and padding, changelog formatting (rules, bold version, italic date), caption style (9pt bold), badge style (8pt bold white on red), list indentation.</w:t>
+              <w:t xml:space="preserve">DOCX heading fix: text color reverted to black (was incorrectly changed to Huawei red in v2.8.0). H1 now uses a two-column table (number left, title right) with red bottom rule. H2-H4 use simple inline format (number + title, no right tab stop).</w:t>
             </w:r>
           </w:p>
         </w:tc>
@@ -17657,7 +17657,7 @@
               <w:jc w:val="left"/>
             </w:pPr>
             <w:r>
-              <w:t xml:space="preserve">2.7.1</w:t>
+              <w:t xml:space="preserve">2.8.0</w:t>
             </w:r>
           </w:p>
         </w:tc>
@@ -17670,7 +17670,7 @@
               <w:jc w:val="left"/>
             </w:pPr>
             <w:r>
-              <w:t xml:space="preserve">2026-08-17</w:t>
+              <w:t xml:space="preserve">2026-08-23</w:t>
             </w:r>
           </w:p>
         </w:tc>
@@ -17687,6 +17687,45 @@
               <w:jc w:val="left"/>
             </w:pPr>
             <w:r>
+              <w:t xml:space="preserve">DOCX output: match PDF styling --- heading colors (Huawei red), H1 number size (56pt), callout borders (left-only) and padding, changelog formatting (rules, bold version, italic date), caption style (9pt bold), badge style (8pt bold white on red), list indentation.</w:t>
+            </w:r>
+          </w:p>
+        </w:tc>
+      </w:tr>
+      <w:tr>
+        <w:tc>
+          <w:tcPr/>
+          <w:p>
+            <w:pPr>
+              <w:jc w:val="left"/>
+            </w:pPr>
+            <w:r>
+              <w:t xml:space="preserve">2.7.1</w:t>
+            </w:r>
+          </w:p>
+        </w:tc>
+        <w:tc>
+          <w:tcPr/>
+          <w:p>
+            <w:pPr>
+              <w:jc w:val="left"/>
+            </w:pPr>
+            <w:r>
+              <w:t xml:space="preserve">2026-08-17</w:t>
+            </w:r>
+          </w:p>
+        </w:tc>
+        <w:tc>
+          <w:tcPr/>
+          <w:p>
+            <w:pPr>
+              <w:numPr>
+                <w:ilvl w:val="0"/>
+                <w:numId w:val="1106"/>
+              </w:numPr>
+              <w:jc w:val="left"/>
+            </w:pPr>
+            <w:r>
               <w:t xml:space="preserve">Rename project repository to all lowercase (</w:t>
             </w:r>
             <w:r>
@@ -17703,7 +17742,9 @@
       </w:tr>
       <w:tr>
         <w:tc>
-          <w:tcPr/>
+          <w:tcPr>
+            <w:shd w:val="clear" w:color="auto" w:fill="F6F8FA"/>
+          </w:tcPr>
           <w:p>
             <w:pPr>
               <w:jc w:val="left"/>
@@ -17714,7 +17755,9 @@
           </w:p>
         </w:tc>
         <w:tc>
-          <w:tcPr/>
+          <w:tcPr>
+            <w:shd w:val="clear" w:color="auto" w:fill="F6F8FA"/>
+          </w:tcPr>
           <w:p>
             <w:pPr>
               <w:jc w:val="left"/>
@@ -17725,12 +17768,14 @@
           </w:p>
         </w:tc>
         <w:tc>
-          <w:tcPr/>
+          <w:tcPr>
+            <w:shd w:val="clear" w:color="auto" w:fill="F6F8FA"/>
+          </w:tcPr>
           <w:p>
             <w:pPr>
               <w:numPr>
                 <w:ilvl w:val="0"/>
-                <w:numId w:val="1106"/>
+                <w:numId w:val="1107"/>
               </w:numPr>
               <w:jc w:val="left"/>
             </w:pPr>
@@ -17772,9 +17817,7 @@
       </w:tr>
       <w:tr>
         <w:tc>
-          <w:tcPr>
-            <w:shd w:val="clear" w:color="auto" w:fill="F6F8FA"/>
-          </w:tcPr>
+          <w:tcPr/>
           <w:p>
             <w:pPr>
               <w:jc w:val="left"/>
@@ -17785,9 +17828,7 @@
           </w:p>
         </w:tc>
         <w:tc>
-          <w:tcPr>
-            <w:shd w:val="clear" w:color="auto" w:fill="F6F8FA"/>
-          </w:tcPr>
+          <w:tcPr/>
           <w:p>
             <w:pPr>
               <w:jc w:val="left"/>
@@ -17798,14 +17839,12 @@
           </w:p>
         </w:tc>
         <w:tc>
-          <w:tcPr>
-            <w:shd w:val="clear" w:color="auto" w:fill="F6F8FA"/>
-          </w:tcPr>
+          <w:tcPr/>
           <w:p>
             <w:pPr>
               <w:numPr>
                 <w:ilvl w:val="0"/>
-                <w:numId w:val="1107"/>
+                <w:numId w:val="1108"/>
               </w:numPr>
               <w:jc w:val="left"/>
             </w:pPr>
@@ -17862,7 +17901,9 @@
       </w:tr>
       <w:tr>
         <w:tc>
-          <w:tcPr/>
+          <w:tcPr>
+            <w:shd w:val="clear" w:color="auto" w:fill="F6F8FA"/>
+          </w:tcPr>
           <w:p>
             <w:pPr>
               <w:jc w:val="left"/>
@@ -17873,7 +17914,9 @@
           </w:p>
         </w:tc>
         <w:tc>
-          <w:tcPr/>
+          <w:tcPr>
+            <w:shd w:val="clear" w:color="auto" w:fill="F6F8FA"/>
+          </w:tcPr>
           <w:p>
             <w:pPr>
               <w:jc w:val="left"/>
@@ -17884,12 +17927,14 @@
           </w:p>
         </w:tc>
         <w:tc>
-          <w:tcPr/>
+          <w:tcPr>
+            <w:shd w:val="clear" w:color="auto" w:fill="F6F8FA"/>
+          </w:tcPr>
           <w:p>
             <w:pPr>
               <w:numPr>
                 <w:ilvl w:val="0"/>
-                <w:numId w:val="1108"/>
+                <w:numId w:val="1109"/>
               </w:numPr>
               <w:jc w:val="left"/>
             </w:pPr>
@@ -17916,7 +17961,7 @@
             <w:pPr>
               <w:numPr>
                 <w:ilvl w:val="0"/>
-                <w:numId w:val="1108"/>
+                <w:numId w:val="1109"/>
               </w:numPr>
               <w:jc w:val="left"/>
             </w:pPr>
@@ -17943,58 +17988,13 @@
       </w:tr>
       <w:tr>
         <w:tc>
-          <w:tcPr>
-            <w:shd w:val="clear" w:color="auto" w:fill="F6F8FA"/>
-          </w:tcPr>
+          <w:tcPr/>
           <w:p>
             <w:pPr>
               <w:jc w:val="left"/>
             </w:pPr>
             <w:r>
               <w:t xml:space="preserve">2.5.1</w:t>
-            </w:r>
-          </w:p>
-        </w:tc>
-        <w:tc>
-          <w:tcPr>
-            <w:shd w:val="clear" w:color="auto" w:fill="F6F8FA"/>
-          </w:tcPr>
-          <w:p>
-            <w:pPr>
-              <w:jc w:val="left"/>
-            </w:pPr>
-            <w:r>
-              <w:t xml:space="preserve">2026-08-10</w:t>
-            </w:r>
-          </w:p>
-        </w:tc>
-        <w:tc>
-          <w:tcPr>
-            <w:shd w:val="clear" w:color="auto" w:fill="F6F8FA"/>
-          </w:tcPr>
-          <w:p>
-            <w:pPr>
-              <w:numPr>
-                <w:ilvl w:val="0"/>
-                <w:numId w:val="1109"/>
-              </w:numPr>
-              <w:jc w:val="left"/>
-            </w:pPr>
-            <w:r>
-              <w:t xml:space="preserve">H1 section title size reduced from 27pt to 20pt.</w:t>
-            </w:r>
-          </w:p>
-        </w:tc>
-      </w:tr>
-      <w:tr>
-        <w:tc>
-          <w:tcPr/>
-          <w:p>
-            <w:pPr>
-              <w:jc w:val="left"/>
-            </w:pPr>
-            <w:r>
-              <w:t xml:space="preserve">2.5.0</w:t>
             </w:r>
           </w:p>
         </w:tc>
@@ -18020,13 +18020,7 @@
               <w:jc w:val="left"/>
             </w:pPr>
             <w:r>
-              <w:t xml:space="preserve">Default image size increased: width 65% → 90% of text width,</w:t>
-            </w:r>
-            <w:r>
-              <w:t xml:space="preserve"> </w:t>
-            </w:r>
-            <w:r>
-              <w:t xml:space="preserve">height 40% → 50% of text height.</w:t>
+              <w:t xml:space="preserve">H1 section title size reduced from 27pt to 20pt.</w:t>
             </w:r>
           </w:p>
         </w:tc>
@@ -18041,7 +18035,7 @@
               <w:jc w:val="left"/>
             </w:pPr>
             <w:r>
-              <w:t xml:space="preserve">2.4.0</w:t>
+              <w:t xml:space="preserve">2.5.0</w:t>
             </w:r>
           </w:p>
         </w:tc>
@@ -18071,14 +18065,59 @@
               <w:jc w:val="left"/>
             </w:pPr>
             <w:r>
-              <w:t xml:space="preserve">Enlarged H1 section title (18pt → 27pt, 50% bigger).</w:t>
-            </w:r>
-          </w:p>
+              <w:t xml:space="preserve">Default image size increased: width 65% → 90% of text width,</w:t>
+            </w:r>
+            <w:r>
+              <w:t xml:space="preserve"> </w:t>
+            </w:r>
+            <w:r>
+              <w:t xml:space="preserve">height 40% → 50% of text height.</w:t>
+            </w:r>
+          </w:p>
+        </w:tc>
+      </w:tr>
+      <w:tr>
+        <w:tc>
+          <w:tcPr/>
+          <w:p>
+            <w:pPr>
+              <w:jc w:val="left"/>
+            </w:pPr>
+            <w:r>
+              <w:t xml:space="preserve">2.4.0</w:t>
+            </w:r>
+          </w:p>
+        </w:tc>
+        <w:tc>
+          <w:tcPr/>
+          <w:p>
+            <w:pPr>
+              <w:jc w:val="left"/>
+            </w:pPr>
+            <w:r>
+              <w:t xml:space="preserve">2026-08-10</w:t>
+            </w:r>
+          </w:p>
+        </w:tc>
+        <w:tc>
+          <w:tcPr/>
           <w:p>
             <w:pPr>
               <w:numPr>
                 <w:ilvl w:val="0"/>
-                <w:numId w:val="1111"/>
+                <w:numId w:val="1112"/>
+              </w:numPr>
+              <w:jc w:val="left"/>
+            </w:pPr>
+            <w:r>
+              <w:t xml:space="preserve">Enlarged H1 section title (18pt → 27pt, 50% bigger).</w:t>
+            </w:r>
+          </w:p>
+          <w:p>
+            <w:pPr>
+              <w:numPr>
+                <w:ilvl w:val="0"/>
+                <w:numId w:val="1112"/>
               </w:numPr>
               <w:jc w:val="left"/>
             </w:pPr>
@@ -18105,7 +18144,9 @@
       </w:tr>
       <w:tr>
         <w:tc>
-          <w:tcPr/>
+          <w:tcPr>
+            <w:shd w:val="clear" w:color="auto" w:fill="F6F8FA"/>
+          </w:tcPr>
           <w:p>
             <w:pPr>
               <w:jc w:val="left"/>
@@ -18116,7 +18157,9 @@
           </w:p>
         </w:tc>
         <w:tc>
-          <w:tcPr/>
+          <w:tcPr>
+            <w:shd w:val="clear" w:color="auto" w:fill="F6F8FA"/>
+          </w:tcPr>
           <w:p>
             <w:pPr>
               <w:jc w:val="left"/>
@@ -18127,12 +18170,14 @@
           </w:p>
         </w:tc>
         <w:tc>
-          <w:tcPr/>
+          <w:tcPr>
+            <w:shd w:val="clear" w:color="auto" w:fill="F6F8FA"/>
+          </w:tcPr>
           <w:p>
             <w:pPr>
               <w:numPr>
                 <w:ilvl w:val="0"/>
-                <w:numId w:val="1112"/>
+                <w:numId w:val="1113"/>
               </w:numPr>
               <w:jc w:val="left"/>
             </w:pPr>
@@ -18159,9 +18204,7 @@
       </w:tr>
       <w:tr>
         <w:tc>
-          <w:tcPr>
-            <w:shd w:val="clear" w:color="auto" w:fill="F6F8FA"/>
-          </w:tcPr>
+          <w:tcPr/>
           <w:p>
             <w:pPr>
               <w:jc w:val="left"/>
@@ -18172,9 +18215,7 @@
           </w:p>
         </w:tc>
         <w:tc>
-          <w:tcPr>
-            <w:shd w:val="clear" w:color="auto" w:fill="F6F8FA"/>
-          </w:tcPr>
+          <w:tcPr/>
           <w:p>
             <w:pPr>
               <w:jc w:val="left"/>
@@ -18185,14 +18226,12 @@
           </w:p>
         </w:tc>
         <w:tc>
-          <w:tcPr>
-            <w:shd w:val="clear" w:color="auto" w:fill="F6F8FA"/>
-          </w:tcPr>
+          <w:tcPr/>
           <w:p>
             <w:pPr>
               <w:numPr>
                 <w:ilvl w:val="0"/>
-                <w:numId w:val="1113"/>
+                <w:numId w:val="1114"/>
               </w:numPr>
               <w:jc w:val="left"/>
             </w:pPr>
@@ -18264,7 +18303,9 @@
       </w:tr>
       <w:tr>
         <w:tc>
-          <w:tcPr/>
+          <w:tcPr>
+            <w:shd w:val="clear" w:color="auto" w:fill="F6F8FA"/>
+          </w:tcPr>
           <w:p>
             <w:pPr>
               <w:jc w:val="left"/>
@@ -18275,7 +18316,9 @@
           </w:p>
         </w:tc>
         <w:tc>
-          <w:tcPr/>
+          <w:tcPr>
+            <w:shd w:val="clear" w:color="auto" w:fill="F6F8FA"/>
+          </w:tcPr>
           <w:p>
             <w:pPr>
               <w:jc w:val="left"/>
@@ -18286,12 +18329,14 @@
           </w:p>
         </w:tc>
         <w:tc>
-          <w:tcPr/>
+          <w:tcPr>
+            <w:shd w:val="clear" w:color="auto" w:fill="F6F8FA"/>
+          </w:tcPr>
           <w:p>
             <w:pPr>
               <w:numPr>
                 <w:ilvl w:val="0"/>
-                <w:numId w:val="1114"/>
+                <w:numId w:val="1115"/>
               </w:numPr>
               <w:jc w:val="left"/>
             </w:pPr>
@@ -18348,9 +18393,7 @@
       </w:tr>
       <w:tr>
         <w:tc>
-          <w:tcPr>
-            <w:shd w:val="clear" w:color="auto" w:fill="F6F8FA"/>
-          </w:tcPr>
+          <w:tcPr/>
           <w:p>
             <w:pPr>
               <w:jc w:val="left"/>
@@ -18361,9 +18404,7 @@
           </w:p>
         </w:tc>
         <w:tc>
-          <w:tcPr>
-            <w:shd w:val="clear" w:color="auto" w:fill="F6F8FA"/>
-          </w:tcPr>
+          <w:tcPr/>
           <w:p>
             <w:pPr>
               <w:jc w:val="left"/>
@@ -18374,14 +18415,12 @@
           </w:p>
         </w:tc>
         <w:tc>
-          <w:tcPr>
-            <w:shd w:val="clear" w:color="auto" w:fill="F6F8FA"/>
-          </w:tcPr>
+          <w:tcPr/>
           <w:p>
             <w:pPr>
               <w:numPr>
                 <w:ilvl w:val="0"/>
-                <w:numId w:val="1115"/>
+                <w:numId w:val="1116"/>
               </w:numPr>
               <w:jc w:val="left"/>
             </w:pPr>
@@ -18408,54 +18447,15 @@
       </w:tr>
       <w:tr>
         <w:tc>
-          <w:tcPr/>
+          <w:tcPr>
+            <w:shd w:val="clear" w:color="auto" w:fill="F6F8FA"/>
+          </w:tcPr>
           <w:p>
             <w:pPr>
               <w:jc w:val="left"/>
             </w:pPr>
             <w:r>
               <w:t xml:space="preserve">2.2.2</w:t>
-            </w:r>
-          </w:p>
-        </w:tc>
-        <w:tc>
-          <w:tcPr/>
-          <w:p>
-            <w:pPr>
-              <w:jc w:val="left"/>
-            </w:pPr>
-            <w:r>
-              <w:t xml:space="preserve">2026-08-08</w:t>
-            </w:r>
-          </w:p>
-        </w:tc>
-        <w:tc>
-          <w:tcPr/>
-          <w:p>
-            <w:pPr>
-              <w:numPr>
-                <w:ilvl w:val="0"/>
-                <w:numId w:val="1116"/>
-              </w:numPr>
-              <w:jc w:val="left"/>
-            </w:pPr>
-            <w:r>
-              <w:t xml:space="preserve">Fixed chapter reference in prerequisite (Chapter 3 → Chapter 4).</w:t>
-            </w:r>
-          </w:p>
-        </w:tc>
-      </w:tr>
-      <w:tr>
-        <w:tc>
-          <w:tcPr>
-            <w:shd w:val="clear" w:color="auto" w:fill="F6F8FA"/>
-          </w:tcPr>
-          <w:p>
-            <w:pPr>
-              <w:jc w:val="left"/>
-            </w:pPr>
-            <w:r>
-              <w:t xml:space="preserve">2.2.1</w:t>
             </w:r>
           </w:p>
         </w:tc>
@@ -18485,7 +18485,7 @@
               <w:jc w:val="left"/>
             </w:pPr>
             <w:r>
-              <w:t xml:space="preserve">Changed table and figure caption labels to black (was Huawei red).</w:t>
+              <w:t xml:space="preserve">Fixed chapter reference in prerequisite (Chapter 3 → Chapter 4).</w:t>
             </w:r>
           </w:p>
         </w:tc>
@@ -18498,7 +18498,7 @@
               <w:jc w:val="left"/>
             </w:pPr>
             <w:r>
-              <w:t xml:space="preserve">2.2.0</w:t>
+              <w:t xml:space="preserve">2.2.1</w:t>
             </w:r>
           </w:p>
         </w:tc>
@@ -18524,13 +18524,7 @@
               <w:jc w:val="left"/>
             </w:pPr>
             <w:r>
-              <w:t xml:space="preserve">Added Huawei-branded table styling: red header bar, alternating row</w:t>
-            </w:r>
-            <w:r>
-              <w:t xml:space="preserve"> </w:t>
-            </w:r>
-            <w:r>
-              <w:t xml:space="preserve">colors, and bordered cells.</w:t>
+              <w:t xml:space="preserve">Changed table and figure caption labels to black (was Huawei red).</w:t>
             </w:r>
           </w:p>
         </w:tc>
@@ -18545,7 +18539,7 @@
               <w:jc w:val="left"/>
             </w:pPr>
             <w:r>
-              <w:t xml:space="preserve">2.1.0</w:t>
+              <w:t xml:space="preserve">2.2.0</w:t>
             </w:r>
           </w:p>
         </w:tc>
@@ -18558,7 +18552,7 @@
               <w:jc w:val="left"/>
             </w:pPr>
             <w:r>
-              <w:t xml:space="preserve">2026-08-06</w:t>
+              <w:t xml:space="preserve">2026-08-08</w:t>
             </w:r>
           </w:p>
         </w:tc>
@@ -18575,6 +18569,51 @@
               <w:jc w:val="left"/>
             </w:pPr>
             <w:r>
+              <w:t xml:space="preserve">Added Huawei-branded table styling: red header bar, alternating row</w:t>
+            </w:r>
+            <w:r>
+              <w:t xml:space="preserve"> </w:t>
+            </w:r>
+            <w:r>
+              <w:t xml:space="preserve">colors, and bordered cells.</w:t>
+            </w:r>
+          </w:p>
+        </w:tc>
+      </w:tr>
+      <w:tr>
+        <w:tc>
+          <w:tcPr/>
+          <w:p>
+            <w:pPr>
+              <w:jc w:val="left"/>
+            </w:pPr>
+            <w:r>
+              <w:t xml:space="preserve">2.1.0</w:t>
+            </w:r>
+          </w:p>
+        </w:tc>
+        <w:tc>
+          <w:tcPr/>
+          <w:p>
+            <w:pPr>
+              <w:jc w:val="left"/>
+            </w:pPr>
+            <w:r>
+              <w:t xml:space="preserve">2026-08-06</w:t>
+            </w:r>
+          </w:p>
+        </w:tc>
+        <w:tc>
+          <w:tcPr/>
+          <w:p>
+            <w:pPr>
+              <w:numPr>
+                <w:ilvl w:val="0"/>
+                <w:numId w:val="1120"/>
+              </w:numPr>
+              <w:jc w:val="left"/>
+            </w:pPr>
+            <w:r>
               <w:t xml:space="preserve">Updated ECS flavor to</w:t>
             </w:r>
             <w:r>
@@ -18597,7 +18636,7 @@
             <w:pPr>
               <w:numPr>
                 <w:ilvl w:val="0"/>
-                <w:numId w:val="1119"/>
+                <w:numId w:val="1120"/>
               </w:numPr>
               <w:jc w:val="left"/>
             </w:pPr>
@@ -18609,7 +18648,7 @@
             <w:pPr>
               <w:numPr>
                 <w:ilvl w:val="0"/>
-                <w:numId w:val="1119"/>
+                <w:numId w:val="1120"/>
               </w:numPr>
               <w:jc w:val="left"/>
             </w:pPr>
@@ -18621,7 +18660,7 @@
             <w:pPr>
               <w:numPr>
                 <w:ilvl w:val="0"/>
-                <w:numId w:val="1119"/>
+                <w:numId w:val="1120"/>
               </w:numPr>
               <w:jc w:val="left"/>
             </w:pPr>
@@ -18633,7 +18672,7 @@
             <w:pPr>
               <w:numPr>
                 <w:ilvl w:val="0"/>
-                <w:numId w:val="1119"/>
+                <w:numId w:val="1120"/>
               </w:numPr>
               <w:jc w:val="left"/>
             </w:pPr>
@@ -18645,7 +18684,7 @@
             <w:pPr>
               <w:numPr>
                 <w:ilvl w:val="0"/>
-                <w:numId w:val="1119"/>
+                <w:numId w:val="1120"/>
               </w:numPr>
               <w:jc w:val="left"/>
             </w:pPr>
@@ -18663,7 +18702,7 @@
             <w:pPr>
               <w:numPr>
                 <w:ilvl w:val="0"/>
-                <w:numId w:val="1119"/>
+                <w:numId w:val="1120"/>
               </w:numPr>
               <w:jc w:val="left"/>
             </w:pPr>
@@ -18712,7 +18751,7 @@
             <w:pPr>
               <w:numPr>
                 <w:ilvl w:val="0"/>
-                <w:numId w:val="1119"/>
+                <w:numId w:val="1120"/>
               </w:numPr>
               <w:jc w:val="left"/>
             </w:pPr>
@@ -18724,7 +18763,7 @@
             <w:pPr>
               <w:numPr>
                 <w:ilvl w:val="0"/>
-                <w:numId w:val="1119"/>
+                <w:numId w:val="1120"/>
               </w:numPr>
               <w:jc w:val="left"/>
             </w:pPr>
@@ -18775,7 +18814,7 @@
             <w:pPr>
               <w:numPr>
                 <w:ilvl w:val="0"/>
-                <w:numId w:val="1119"/>
+                <w:numId w:val="1120"/>
               </w:numPr>
               <w:jc w:val="left"/>
             </w:pPr>
@@ -18802,7 +18841,9 @@
       </w:tr>
       <w:tr>
         <w:tc>
-          <w:tcPr/>
+          <w:tcPr>
+            <w:shd w:val="clear" w:color="auto" w:fill="F6F8FA"/>
+          </w:tcPr>
           <w:p>
             <w:pPr>
               <w:jc w:val="left"/>
@@ -18813,7 +18854,9 @@
           </w:p>
         </w:tc>
         <w:tc>
-          <w:tcPr/>
+          <w:tcPr>
+            <w:shd w:val="clear" w:color="auto" w:fill="F6F8FA"/>
+          </w:tcPr>
           <w:p>
             <w:pPr>
               <w:jc w:val="left"/>
@@ -18824,12 +18867,14 @@
           </w:p>
         </w:tc>
         <w:tc>
-          <w:tcPr/>
+          <w:tcPr>
+            <w:shd w:val="clear" w:color="auto" w:fill="F6F8FA"/>
+          </w:tcPr>
           <w:p>
             <w:pPr>
               <w:numPr>
                 <w:ilvl w:val="0"/>
-                <w:numId w:val="1120"/>
+                <w:numId w:val="1121"/>
               </w:numPr>
               <w:jc w:val="left"/>
             </w:pPr>
@@ -18847,7 +18892,7 @@
             <w:pPr>
               <w:numPr>
                 <w:ilvl w:val="0"/>
-                <w:numId w:val="1120"/>
+                <w:numId w:val="1121"/>
               </w:numPr>
               <w:jc w:val="left"/>
             </w:pPr>
@@ -18901,7 +18946,7 @@
             <w:pPr>
               <w:numPr>
                 <w:ilvl w:val="0"/>
-                <w:numId w:val="1120"/>
+                <w:numId w:val="1121"/>
               </w:numPr>
               <w:jc w:val="left"/>
             </w:pPr>
@@ -18949,7 +18994,7 @@
             <w:pPr>
               <w:numPr>
                 <w:ilvl w:val="0"/>
-                <w:numId w:val="1120"/>
+                <w:numId w:val="1121"/>
               </w:numPr>
               <w:jc w:val="left"/>
             </w:pPr>
@@ -18970,9 +19015,7 @@
       </w:tr>
       <w:tr>
         <w:tc>
-          <w:tcPr>
-            <w:shd w:val="clear" w:color="auto" w:fill="F6F8FA"/>
-          </w:tcPr>
+          <w:tcPr/>
           <w:p>
             <w:pPr>
               <w:jc w:val="left"/>
@@ -18983,9 +19026,7 @@
           </w:p>
         </w:tc>
         <w:tc>
-          <w:tcPr>
-            <w:shd w:val="clear" w:color="auto" w:fill="F6F8FA"/>
-          </w:tcPr>
+          <w:tcPr/>
           <w:p>
             <w:pPr>
               <w:jc w:val="left"/>
@@ -18996,14 +19037,12 @@
           </w:p>
         </w:tc>
         <w:tc>
-          <w:tcPr>
-            <w:shd w:val="clear" w:color="auto" w:fill="F6F8FA"/>
-          </w:tcPr>
+          <w:tcPr/>
           <w:p>
             <w:pPr>
               <w:numPr>
                 <w:ilvl w:val="0"/>
-                <w:numId w:val="1121"/>
+                <w:numId w:val="1122"/>
               </w:numPr>
               <w:jc w:val="left"/>
             </w:pPr>
@@ -19015,7 +19054,7 @@
             <w:pPr>
               <w:numPr>
                 <w:ilvl w:val="0"/>
-                <w:numId w:val="1121"/>
+                <w:numId w:val="1122"/>
               </w:numPr>
               <w:jc w:val="left"/>
             </w:pPr>
@@ -19027,7 +19066,7 @@
             <w:pPr>
               <w:numPr>
                 <w:ilvl w:val="0"/>
-                <w:numId w:val="1121"/>
+                <w:numId w:val="1122"/>
               </w:numPr>
               <w:jc w:val="left"/>
             </w:pPr>
@@ -19039,7 +19078,7 @@
             <w:pPr>
               <w:numPr>
                 <w:ilvl w:val="0"/>
-                <w:numId w:val="1121"/>
+                <w:numId w:val="1122"/>
               </w:numPr>
               <w:jc w:val="left"/>
             </w:pPr>
@@ -19057,7 +19096,7 @@
             <w:pPr>
               <w:numPr>
                 <w:ilvl w:val="0"/>
-                <w:numId w:val="1121"/>
+                <w:numId w:val="1122"/>
               </w:numPr>
               <w:jc w:val="left"/>
             </w:pPr>
@@ -19069,7 +19108,7 @@
             <w:pPr>
               <w:numPr>
                 <w:ilvl w:val="0"/>
-                <w:numId w:val="1121"/>
+                <w:numId w:val="1122"/>
               </w:numPr>
               <w:jc w:val="left"/>
             </w:pPr>
@@ -20477,6 +20516,9 @@
     <w:abstractNumId w:val="991"/>
   </w:num>
   <w:num w:numId="1121">
+    <w:abstractNumId w:val="991"/>
+  </w:num>
+  <w:num w:numId="1122">
     <w:abstractNumId w:val="991"/>
   </w:num>
 </w:numbering>

</xml_diff>

<commit_message>
Unify PT test-result vocabulary (v6.13.0)
- PT badges now Atende / Atende com ressalvas / Não atende / Não testado
  in both testbook and POC (was Aprovado/Reprovado/Bloqueado/Não testado
  and Atendido/Parcial/Falha/Ignorado)
- Testbook gains Partial (orange pill); Blocked dropped (legacy docs
  render the neutral fallback pill)
- EN display and source enum values unchanged
- Badge PNGs: shared PT set, auto-sized; round-trip badge exclusion
  now height-based
- Samples: testbook-pt 2.2.0, testbook-en 2.2.0, poc-pt 1.1.0
</commit_message>
<xml_diff>
--- a/documents/setup-guide/setup-guide.docx
+++ b/documents/setup-guide/setup-guide.docx
@@ -84,7 +84,7 @@
           <w:b/>
           <w:sz w:val="24"/>
         </w:rPr>
-        <w:t xml:space="preserve">v6.12.0</w:t>
+        <w:t xml:space="preserve">v6.13.0</w:t>
       </w:r>
       <w:r>
         <w:rPr>
@@ -96,7 +96,7 @@
         <w:rPr>
           <w:sz w:val="24"/>
         </w:rPr>
-        <w:t xml:space="preserve">— September 22, 2026 13:26</w:t>
+        <w:t xml:space="preserve">— September 22, 2026 17:49</w:t>
       </w:r>
     </w:p>
     <w:sdt>
@@ -13854,7 +13854,7 @@
               <w:jc w:val="left"/>
             </w:pPr>
             <w:r>
-              <w:t xml:space="preserve">6.12.0</w:t>
+              <w:t xml:space="preserve">6.13.0</w:t>
             </w:r>
           </w:p>
         </w:tc>
@@ -13880,7 +13880,7 @@
               <w:jc w:val="left"/>
             </w:pPr>
             <w:r>
-              <w:t xml:space="preserve">Language audit: Portuguese documents no longer show English labels. Technical cover labels (Versão/Data/Cenário/Autor), testbook badges (Aprovado/Reprovado/Bloqueado/Não testado), HTML admonition titles and captions, DOCX callout labels, General Objective, E-mail, and image placeholder are now language-aware under :lang: pt. CSS technical section headings gained PT selectors; 6 CSS strings aligned with PDF. Badge PNGs auto-sized to fit text. Sample wording fixed: Cor/Amostra table headers, Infraestrutura como Código, provedor heading.</w:t>
+              <w:t xml:space="preserve">Test-result vocabulary unified: Portuguese badges now read Atende / Atende com ressalvas / Não atende / Não testado in both testbook and POC (was Aprovado/Reprovado/Bloqueado/Não testado and Atendido/Parcial/Falha/Ignorado). Testbook gains the Partial result (Atende com ressalvas, orange pill); Blocked was dropped (legacy documents render the neutral fallback pill). English display and source enum values unchanged. Existing PT documents render the new names on recompile.</w:t>
             </w:r>
           </w:p>
         </w:tc>
@@ -13895,7 +13895,7 @@
               <w:jc w:val="left"/>
             </w:pPr>
             <w:r>
-              <w:t xml:space="preserve">6.11.1</w:t>
+              <w:t xml:space="preserve">6.12.0</w:t>
             </w:r>
           </w:p>
         </w:tc>
@@ -13908,7 +13908,7 @@
               <w:jc w:val="left"/>
             </w:pPr>
             <w:r>
-              <w:t xml:space="preserve">2026-09-22</w:t>
+              <w:t xml:space="preserve">2026-09-23</w:t>
             </w:r>
           </w:p>
         </w:tc>
@@ -13925,7 +13925,7 @@
               <w:jc w:val="left"/>
             </w:pPr>
             <w:r>
-              <w:t xml:space="preserve">Documentation: document lifecycle clarified. Documents created via the skills are standalone deliverables — git is never used for individual documents; the :version: attribute and changelog block are the document’s own version control. All four SKILL.md files gained a “Document lifecycle” section and now scope AGENTS.md’s git workflow to template repository development only. AGENTS.md gained a Scope section stating user documents are gitignored and never repository content, and L17 is clarified to apply to template releases only.</w:t>
+              <w:t xml:space="preserve">Language audit: Portuguese documents no longer show English labels. Technical cover labels (Versão/Data/Cenário/Autor), testbook badges (Aprovado/Reprovado/Bloqueado/Não testado), HTML admonition titles and captions, DOCX callout labels, General Objective, E-mail, and image placeholder are now language-aware under :lang: pt. CSS technical section headings gained PT selectors; 6 CSS strings aligned with PDF. Badge PNGs auto-sized to fit text. Sample wording fixed: Cor/Amostra table headers, Infraestrutura como Código, provedor heading.</w:t>
             </w:r>
           </w:p>
         </w:tc>
@@ -13938,7 +13938,7 @@
               <w:jc w:val="left"/>
             </w:pPr>
             <w:r>
-              <w:t xml:space="preserve">6.11.0</w:t>
+              <w:t xml:space="preserve">6.11.1</w:t>
             </w:r>
           </w:p>
         </w:tc>
@@ -13964,7 +13964,7 @@
               <w:jc w:val="left"/>
             </w:pPr>
             <w:r>
-              <w:t xml:space="preserve">Project-wide audit: converter robustness and cross-format consistency. Objectives roles now work in all forms — inline ([.general-objective] and [.objective]) and block (inside [.objectives]) — rendering language-aware labels (the block form previously crashed the build; the inline form silently dropped the label). The [.prerequisites] and [.stepbystep] roles attached to lists no longer drop items. Multi-author documents now list all authors. Conversion errors print a clean file:line message instead of a Ruby object dump. Unknown code languages (go, java, rust, terraform, …​) fall back to plain verbatim with a compile warning (was a hard error). DOCX/MD/HTML: codefile blocks ([.codefile,file=…​]) now inline the file content like the PDF, and admonition labels no longer corrupt NOTE:/TIP: lines inside code blocks. DOCX Fail/Falha badge backgrounds and plain-table borders now match the PDF colors. Shared class boilerplate extracted into the new huawei-base.cls base class (rendering unchanged). Watch mode survives compile errors; install reports failures instead of silent success; the /etc/LatexMk write is opt-in; build diagnostics are kept on failure; asciidoctor warnings now fail the build; a missing header logo warns instead of erroring. New test-pdf-compile.sh replaces the legacy test-filter stub; round-trip now validates the production build pipeline. Documentation corrected across README, AGENTS, and all SKILL files (objectives syntax, codefile example, supported languages, longhutable restriction, install requirements, pandoc range, security note).</w:t>
+              <w:t xml:space="preserve">Documentation: document lifecycle clarified. Documents created via the skills are standalone deliverables — git is never used for individual documents; the :version: attribute and changelog block are the document’s own version control. All four SKILL.md files gained a “Document lifecycle” section and now scope AGENTS.md’s git workflow to template repository development only. AGENTS.md gained a Scope section stating user documents are gitignored and never repository content, and L17 is clarified to apply to template releases only.</w:t>
             </w:r>
           </w:p>
         </w:tc>
@@ -13979,7 +13979,7 @@
               <w:jc w:val="left"/>
             </w:pPr>
             <w:r>
-              <w:t xml:space="preserve">6.10.0</w:t>
+              <w:t xml:space="preserve">6.11.0</w:t>
             </w:r>
           </w:p>
         </w:tc>
@@ -13992,7 +13992,7 @@
               <w:jc w:val="left"/>
             </w:pPr>
             <w:r>
-              <w:t xml:space="preserve">2026-09-21</w:t>
+              <w:t xml:space="preserve">2026-09-22</w:t>
             </w:r>
           </w:p>
         </w:tc>
@@ -14009,7 +14009,7 @@
               <w:jc w:val="left"/>
             </w:pPr>
             <w:r>
-              <w:t xml:space="preserve">Header logo, callout boxes, and note labels: DOCX header now shows the Huawei logo in the top-left corner (optional, driven by the :header-logo: attribute). DOCX admonitions (TIP, NOTE, WARNING) now render as styled callout boxes with colored backgrounds, left borders, and type labels — matching the PDF. PDF inline notes ([.note] role) now show a language-aware “Note:” label (was unlabeled italic text).</w:t>
+              <w:t xml:space="preserve">Project-wide audit: converter robustness and cross-format consistency. Objectives roles now work in all forms — inline ([.general-objective] and [.objective]) and block (inside [.objectives]) — rendering language-aware labels (the block form previously crashed the build; the inline form silently dropped the label). The [.prerequisites] and [.stepbystep] roles attached to lists no longer drop items. Multi-author documents now list all authors. Conversion errors print a clean file:line message instead of a Ruby object dump. Unknown code languages (go, java, rust, terraform, …​) fall back to plain verbatim with a compile warning (was a hard error). DOCX/MD/HTML: codefile blocks ([.codefile,file=…​]) now inline the file content like the PDF, and admonition labels no longer corrupt NOTE:/TIP: lines inside code blocks. DOCX Fail/Falha badge backgrounds and plain-table borders now match the PDF colors. Shared class boilerplate extracted into the new huawei-base.cls base class (rendering unchanged). Watch mode survives compile errors; install reports failures instead of silent success; the /etc/LatexMk write is opt-in; build diagnostics are kept on failure; asciidoctor warnings now fail the build; a missing header logo warns instead of erroring. New test-pdf-compile.sh replaces the legacy test-filter stub; round-trip now validates the production build pipeline. Documentation corrected across README, AGENTS, and all SKILL files (objectives syntax, codefile example, supported languages, longhutable restriction, install requirements, pandoc range, security note).</w:t>
             </w:r>
           </w:p>
         </w:tc>
@@ -14022,7 +14022,7 @@
               <w:jc w:val="left"/>
             </w:pPr>
             <w:r>
-              <w:t xml:space="preserve">6.9.2</w:t>
+              <w:t xml:space="preserve">6.10.0</w:t>
             </w:r>
           </w:p>
         </w:tc>
@@ -14048,7 +14048,7 @@
               <w:jc w:val="left"/>
             </w:pPr>
             <w:r>
-              <w:t xml:space="preserve">Fix DOCX body text alignment: paragraphs are now justified (matching the PDF LaTeX default), instead of left-aligned.</w:t>
+              <w:t xml:space="preserve">Header logo, callout boxes, and note labels: DOCX header now shows the Huawei logo in the top-left corner (optional, driven by the :header-logo: attribute). DOCX admonitions (TIP, NOTE, WARNING) now render as styled callout boxes with colored backgrounds, left borders, and type labels — matching the PDF. PDF inline notes ([.note] role) now show a language-aware “Note:” label (was unlabeled italic text).</w:t>
             </w:r>
           </w:p>
         </w:tc>
@@ -14063,7 +14063,7 @@
               <w:jc w:val="left"/>
             </w:pPr>
             <w:r>
-              <w:t xml:space="preserve">6.9.1</w:t>
+              <w:t xml:space="preserve">6.9.2</w:t>
             </w:r>
           </w:p>
         </w:tc>
@@ -14093,7 +14093,7 @@
               <w:jc w:val="left"/>
             </w:pPr>
             <w:r>
-              <w:t xml:space="preserve">Fix DOCX subsection number size: H2/H3/H4 section numbers were rendered at 56pt (same as H1) instead of matching the heading text size (18/16/14pt). The SectionNumber style is now unstyled (inherits heading size); 56pt is set directly on H1 number runs only.</w:t>
+              <w:t xml:space="preserve">Fix DOCX body text alignment: paragraphs are now justified (matching the PDF LaTeX default), instead of left-aligned.</w:t>
             </w:r>
           </w:p>
         </w:tc>
@@ -14106,7 +14106,7 @@
               <w:jc w:val="left"/>
             </w:pPr>
             <w:r>
-              <w:t xml:space="preserve">6.9.0</w:t>
+              <w:t xml:space="preserve">6.9.1</w:t>
             </w:r>
           </w:p>
         </w:tc>
@@ -14132,7 +14132,7 @@
               <w:jc w:val="left"/>
             </w:pPr>
             <w:r>
-              <w:t xml:space="preserve">TOC styling: the table-of-contents title rule is now Huawei red (was black) in both PDF and DOCX, matching the H1 heading red rules. DOCX TOC entries now match the PDF: level 1 bold 12pt, levels 2-3 normal 10pt, HarmonyOS Sans font. DOCX TOC depth increased from 2 to 3 levels (matching PDF tocdepth). Dead TOCTitle style removed from DOCX.</w:t>
+              <w:t xml:space="preserve">Fix DOCX subsection number size: H2/H3/H4 section numbers were rendered at 56pt (same as H1) instead of matching the heading text size (18/16/14pt). The SectionNumber style is now unstyled (inherits heading size); 56pt is set directly on H1 number runs only.</w:t>
             </w:r>
           </w:p>
         </w:tc>
@@ -14147,7 +14147,7 @@
               <w:jc w:val="left"/>
             </w:pPr>
             <w:r>
-              <w:t xml:space="preserve">6.8.3</w:t>
+              <w:t xml:space="preserve">6.9.0</w:t>
             </w:r>
           </w:p>
         </w:tc>
@@ -14160,7 +14160,7 @@
               <w:jc w:val="left"/>
             </w:pPr>
             <w:r>
-              <w:t xml:space="preserve">2026-09-20</w:t>
+              <w:t xml:space="preserve">2026-09-21</w:t>
             </w:r>
           </w:p>
         </w:tc>
@@ -14177,7 +14177,7 @@
               <w:jc w:val="left"/>
             </w:pPr>
             <w:r>
-              <w:t xml:space="preserve">Docs accuracy fix: the multi-format pipeline descriptions in README, AGENTS, and all four SKILL.md files now correctly separate the DOCX/Markdown path (pre-processor then docbook then pandoc) from the HTML path (pre-processor then asciidoctor html5) — the previous wording implied HTML also went through docbook and pandoc. Corrected a stale comment in the DOCX fixer.</w:t>
+              <w:t xml:space="preserve">TOC styling: the table-of-contents title rule is now Huawei red (was black) in both PDF and DOCX, matching the H1 heading red rules. DOCX TOC entries now match the PDF: level 1 bold 12pt, levels 2-3 normal 10pt, HarmonyOS Sans font. DOCX TOC depth increased from 2 to 3 levels (matching PDF tocdepth). Dead TOCTitle style removed from DOCX.</w:t>
             </w:r>
           </w:p>
         </w:tc>
@@ -14190,7 +14190,7 @@
               <w:jc w:val="left"/>
             </w:pPr>
             <w:r>
-              <w:t xml:space="preserve">6.8.2</w:t>
+              <w:t xml:space="preserve">6.8.3</w:t>
             </w:r>
           </w:p>
         </w:tc>
@@ -14216,7 +14216,7 @@
               <w:jc w:val="left"/>
             </w:pPr>
             <w:r>
-              <w:t xml:space="preserve">Documentation and cleanup: README, AGENTS, and all four SKILL.md files now describe the real multi-format pipeline (pre-processor + docx_fix --fix + --lang flag) instead of the pre-v6.4 asciidoctor-to-pandoc chain. DOCX TOC title is now right-aligned like the PDF (was targeting a dead style). Signature names render bold like the PDF. Dead code removed (unused Caption style, dead TOCTitle style, dead HTML badge CSS). The --template and --lang flags accept the equals form (--template=guide). Various stale comments corrected.</w:t>
+              <w:t xml:space="preserve">Docs accuracy fix: the multi-format pipeline descriptions in README, AGENTS, and all four SKILL.md files now correctly separate the DOCX/Markdown path (pre-processor then docbook then pandoc) from the HTML path (pre-processor then asciidoctor html5) — the previous wording implied HTML also went through docbook and pandoc. Corrected a stale comment in the DOCX fixer.</w:t>
             </w:r>
           </w:p>
         </w:tc>
@@ -14231,7 +14231,7 @@
               <w:jc w:val="left"/>
             </w:pPr>
             <w:r>
-              <w:t xml:space="preserve">6.8.1</w:t>
+              <w:t xml:space="preserve">6.8.2</w:t>
             </w:r>
           </w:p>
         </w:tc>
@@ -14261,7 +14261,7 @@
               <w:jc w:val="left"/>
             </w:pPr>
             <w:r>
-              <w:t xml:space="preserve">Quality-pass fixes for v6.8.0: non-technical covers no longer show a stray Date paragraph (regression from the meta-scan change); the technical cover table is no longer hijacked from the body when :nochangelog: is set (boundary check on the cover-table detection); the Version/Date/Scenario table now renders unconditionally like the PDF (was gated by :nochangelog:); empty cover tables are skipped when no report values are set; corrected the cover-element-order wording in the v6.8.0 changelog.</w:t>
+              <w:t xml:space="preserve">Documentation and cleanup: README, AGENTS, and all four SKILL.md files now describe the real multi-format pipeline (pre-processor + docx_fix --fix + --lang flag) instead of the pre-v6.4 asciidoctor-to-pandoc chain. DOCX TOC title is now right-aligned like the PDF (was targeting a dead style). Signature names render bold like the PDF. Dead code removed (unused Caption style, dead TOCTitle style, dead HTML badge CSS). The --template and --lang flags accept the equals form (--template=guide). Various stale comments corrected.</w:t>
             </w:r>
           </w:p>
         </w:tc>
@@ -14274,7 +14274,7 @@
               <w:jc w:val="left"/>
             </w:pPr>
             <w:r>
-              <w:t xml:space="preserve">6.8.0</w:t>
+              <w:t xml:space="preserve">6.8.1</w:t>
             </w:r>
           </w:p>
         </w:tc>
@@ -14300,7 +14300,7 @@
               <w:jc w:val="left"/>
             </w:pPr>
             <w:r>
-              <w:t xml:space="preserve">Technical report covers now match the PDF in DOCX/MD/HTML: the title uses the PDF’s 24pt size (was 36pt), the report type label appears below the title (the DOCX cover keeps the established title-first order; the PDF has label-then-title), and the Version/Date/Scenario table is rendered with the PDF’s red label column. The cover meta line now shows the report version and its set date (was the document version and the build date). Authors, when set, appear as a table row like the PDF.</w:t>
+              <w:t xml:space="preserve">Quality-pass fixes for v6.8.0: non-technical covers no longer show a stray Date paragraph (regression from the meta-scan change); the technical cover table is no longer hijacked from the body when :nochangelog: is set (boundary check on the cover-table detection); the Version/Date/Scenario table now renders unconditionally like the PDF (was gated by :nochangelog:); empty cover tables are skipped when no report values are set; corrected the cover-element-order wording in the v6.8.0 changelog.</w:t>
             </w:r>
           </w:p>
         </w:tc>
@@ -14315,7 +14315,7 @@
               <w:jc w:val="left"/>
             </w:pPr>
             <w:r>
-              <w:t xml:space="preserve">6.7.0</w:t>
+              <w:t xml:space="preserve">6.8.0</w:t>
             </w:r>
           </w:p>
         </w:tc>
@@ -14345,7 +14345,7 @@
               <w:jc w:val="left"/>
             </w:pPr>
             <w:r>
-              <w:t xml:space="preserve">Badge and language fidelity: DOCX badge pills now render black text like the PDF (was frame-colored), use the correct label case (Pass, not PASS), include the Portuguese POC labels (Atendido, Parcial, Falha, Ignorado), and render at native width per template (testbook badge text no longer shrinks). Portuguese signature greetings now match the PDF (At.te,), the POC classification label matches the full PDF wording, and the secondary-format table headers (stakeholders, closing record, test summary, changelog) are now language-aware. DOCX footers show Página in Portuguese documents. Cover dates no longer zero-pad the day.</w:t>
+              <w:t xml:space="preserve">Technical report covers now match the PDF in DOCX/MD/HTML: the title uses the PDF’s 24pt size (was 36pt), the report type label appears below the title (the DOCX cover keeps the established title-first order; the PDF has label-then-title), and the Version/Date/Scenario table is rendered with the PDF’s red label column. The cover meta line now shows the report version and its set date (was the document version and the build date). Authors, when set, appear as a table row like the PDF.</w:t>
             </w:r>
           </w:p>
         </w:tc>
@@ -14358,7 +14358,7 @@
               <w:jc w:val="left"/>
             </w:pPr>
             <w:r>
-              <w:t xml:space="preserve">6.6.1</w:t>
+              <w:t xml:space="preserve">6.7.0</w:t>
             </w:r>
           </w:p>
         </w:tc>
@@ -14384,7 +14384,7 @@
               <w:jc w:val="left"/>
             </w:pPr>
             <w:r>
-              <w:t xml:space="preserve">Quality-pass fixes for v6.6.0: the TESTCASE-marker strip now covers the entire DOCX fix run (a failure at any stage can no longer leave markers in the output file); the fixer resets its template state between in-process runs (the documented path-sniffing fallback works again); build.sh also cleans temporary files on interrupt signals; fixed a CHANGELOG typo.</w:t>
+              <w:t xml:space="preserve">Badge and language fidelity: DOCX badge pills now render black text like the PDF (was frame-colored), use the correct label case (Pass, not PASS), include the Portuguese POC labels (Atendido, Parcial, Falha, Ignorado), and render at native width per template (testbook badge text no longer shrinks). Portuguese signature greetings now match the PDF (At.te,), the POC classification label matches the full PDF wording, and the secondary-format table headers (stakeholders, closing record, test summary, changelog) are now language-aware. DOCX footers show Página in Portuguese documents. Cover dates no longer zero-pad the day.</w:t>
             </w:r>
           </w:p>
         </w:tc>
@@ -14399,7 +14399,7 @@
               <w:jc w:val="left"/>
             </w:pPr>
             <w:r>
-              <w:t xml:space="preserve">6.6.0</w:t>
+              <w:t xml:space="preserve">6.6.1</w:t>
             </w:r>
           </w:p>
         </w:tc>
@@ -14429,6 +14429,45 @@
               <w:jc w:val="left"/>
             </w:pPr>
             <w:r>
+              <w:t xml:space="preserve">Quality-pass fixes for v6.6.0: the TESTCASE-marker strip now covers the entire DOCX fix run (a failure at any stage can no longer leave markers in the output file); the fixer resets its template state between in-process runs (the documented path-sniffing fallback works again); build.sh also cleans temporary files on interrupt signals; fixed a CHANGELOG typo.</w:t>
+            </w:r>
+          </w:p>
+        </w:tc>
+      </w:tr>
+      <w:tr>
+        <w:tc>
+          <w:tcPr/>
+          <w:p>
+            <w:pPr>
+              <w:jc w:val="left"/>
+            </w:pPr>
+            <w:r>
+              <w:t xml:space="preserve">6.6.0</w:t>
+            </w:r>
+          </w:p>
+        </w:tc>
+        <w:tc>
+          <w:tcPr/>
+          <w:p>
+            <w:pPr>
+              <w:jc w:val="left"/>
+            </w:pPr>
+            <w:r>
+              <w:t xml:space="preserve">2026-09-20</w:t>
+            </w:r>
+          </w:p>
+        </w:tc>
+        <w:tc>
+          <w:tcPr/>
+          <w:p>
+            <w:pPr>
+              <w:numPr>
+                <w:ilvl w:val="0"/>
+                <w:numId w:val="1056"/>
+              </w:numPr>
+              <w:jc w:val="left"/>
+            </w:pPr>
+            <w:r>
               <w:t xml:space="preserve">Pipeline robustness: DOCX post-processing now fails loudly when content styling errors occur (TESTCASE markers can no longer leak into output); the DOCX fixer takes an explicit</w:t>
             </w:r>
             <w:r>
@@ -14451,54 +14490,15 @@
       </w:tr>
       <w:tr>
         <w:tc>
-          <w:tcPr/>
+          <w:tcPr>
+            <w:shd w:val="clear" w:color="auto" w:fill="F6F8FA"/>
+          </w:tcPr>
           <w:p>
             <w:pPr>
               <w:jc w:val="left"/>
             </w:pPr>
             <w:r>
               <w:t xml:space="preserve">6.5.2</w:t>
-            </w:r>
-          </w:p>
-        </w:tc>
-        <w:tc>
-          <w:tcPr/>
-          <w:p>
-            <w:pPr>
-              <w:jc w:val="left"/>
-            </w:pPr>
-            <w:r>
-              <w:t xml:space="preserve">2026-09-20</w:t>
-            </w:r>
-          </w:p>
-        </w:tc>
-        <w:tc>
-          <w:tcPr/>
-          <w:p>
-            <w:pPr>
-              <w:numPr>
-                <w:ilvl w:val="0"/>
-                <w:numId w:val="1056"/>
-              </w:numPr>
-              <w:jc w:val="left"/>
-            </w:pPr>
-            <w:r>
-              <w:t xml:space="preserve">Quality-pass fixes for v6.5.1: LaTeX quote conversion now handles only paired quotes (quote characters inside code arguments are no longer corrupted); signature cells containing escaped ampersands are no longer split; round-trip HTML generation guards the asciidoctor-diagram dependency and fails loudly when generation fails; pre-processor unit tests now cover pipe escaping in all five table handlers.</w:t>
-            </w:r>
-          </w:p>
-        </w:tc>
-      </w:tr>
-      <w:tr>
-        <w:tc>
-          <w:tcPr>
-            <w:shd w:val="clear" w:color="auto" w:fill="F6F8FA"/>
-          </w:tcPr>
-          <w:p>
-            <w:pPr>
-              <w:jc w:val="left"/>
-            </w:pPr>
-            <w:r>
-              <w:t xml:space="preserve">6.5.1</w:t>
             </w:r>
           </w:p>
         </w:tc>
@@ -14528,7 +14528,7 @@
               <w:jc w:val="left"/>
             </w:pPr>
             <w:r>
-              <w:t xml:space="preserve">Fixed DOCX/MD/HTML output: tables are no longer corrupted when changelog, signature, or summary content contains a pipe character (“|”). Badge text is now preserved in DOCX/MD/HTML — a “Ready” badge renders “Ready” instead of “[NEW]”. Multi-item changelog entries render as bullet lists instead of being joined with a literal “+”. POC documents now include the changelog in DOCX/MD/HTML. The :noanswers: attribute now hides test results and remarks in DOCX/MD/HTML, matching the PDF. Inline LaTeX (monospace text, arrows, LaTeX quotes) no longer leaks from changelog entries. The test suite now exercises the real build pipeline (pre-processor wired into round-trip and DOCX tests), with new pre-processor unit tests.</w:t>
+              <w:t xml:space="preserve">Quality-pass fixes for v6.5.1: LaTeX quote conversion now handles only paired quotes (quote characters inside code arguments are no longer corrupted); signature cells containing escaped ampersands are no longer split; round-trip HTML generation guards the asciidoctor-diagram dependency and fails loudly when generation fails; pre-processor unit tests now cover pipe escaping in all five table handlers.</w:t>
             </w:r>
           </w:p>
         </w:tc>
@@ -14541,7 +14541,7 @@
               <w:jc w:val="left"/>
             </w:pPr>
             <w:r>
-              <w:t xml:space="preserve">6.5.0</w:t>
+              <w:t xml:space="preserve">6.5.1</w:t>
             </w:r>
           </w:p>
         </w:tc>
@@ -14567,7 +14567,7 @@
               <w:jc w:val="left"/>
             </w:pPr>
             <w:r>
-              <w:t xml:space="preserve">Evidence checklist simplified to plain bullets in both PDF and DOCX (checkbox markers removed for compatibility). Planned Activities list in DOCX now uses Word’s native lower-roman numbering (i., ii., iii.) matching the PDF. Badges in DOCX replaced with exact-replica PNG pill images (rounded, colored frame and background, bold text) matching the PDF \ huaweibadge look — assets committed to the repo. Signature blocks in DOCX no longer show literal + symbols (proper hard line breaks).</w:t>
+              <w:t xml:space="preserve">Fixed DOCX/MD/HTML output: tables are no longer corrupted when changelog, signature, or summary content contains a pipe character (“|”). Badge text is now preserved in DOCX/MD/HTML — a “Ready” badge renders “Ready” instead of “[NEW]”. Multi-item changelog entries render as bullet lists instead of being joined with a literal “+”. POC documents now include the changelog in DOCX/MD/HTML. The :noanswers: attribute now hides test results and remarks in DOCX/MD/HTML, matching the PDF. Inline LaTeX (monospace text, arrows, LaTeX quotes) no longer leaks from changelog entries. The test suite now exercises the real build pipeline (pre-processor wired into round-trip and DOCX tests), with new pre-processor unit tests.</w:t>
             </w:r>
           </w:p>
         </w:tc>
@@ -14582,7 +14582,7 @@
               <w:jc w:val="left"/>
             </w:pPr>
             <w:r>
-              <w:t xml:space="preserve">6.4.7</w:t>
+              <w:t xml:space="preserve">6.5.0</w:t>
             </w:r>
           </w:p>
         </w:tc>
@@ -14612,7 +14612,7 @@
               <w:jc w:val="left"/>
             </w:pPr>
             <w:r>
-              <w:t xml:space="preserve">Section titles in DOCX now match the PDF heading design: the big section number (56pt) sits on the left, the title text is pushed to the right edge (a right tab stop mimics the LaTeX \ hfill), and the red rule runs below — previously the title sat left-aligned next to a small number. Applies to all templates.</w:t>
+              <w:t xml:space="preserve">Evidence checklist simplified to plain bullets in both PDF and DOCX (checkbox markers removed for compatibility). Planned Activities list in DOCX now uses Word’s native lower-roman numbering (i., ii., iii.) matching the PDF. Badges in DOCX replaced with exact-replica PNG pill images (rounded, colored frame and background, bold text) matching the PDF \ huaweibadge look — assets committed to the repo. Signature blocks in DOCX no longer show literal + symbols (proper hard line breaks).</w:t>
             </w:r>
           </w:p>
         </w:tc>
@@ -14625,7 +14625,7 @@
               <w:jc w:val="left"/>
             </w:pPr>
             <w:r>
-              <w:t xml:space="preserve">6.4.6</w:t>
+              <w:t xml:space="preserve">6.4.7</w:t>
             </w:r>
           </w:p>
         </w:tc>
@@ -14651,7 +14651,7 @@
               <w:jc w:val="left"/>
             </w:pPr>
             <w:r>
-              <w:t xml:space="preserve">Code blocks inside test cases no longer break the red left rule in DOCX — the code style’s left indent (which jogged the rule) is reset inside test case blocks, and code blocks now show the PDF’s code box (gray background with thin border on top, bottom, and right, red rule continuing on the left).</w:t>
+              <w:t xml:space="preserve">Section titles in DOCX now match the PDF heading design: the big section number (56pt) sits on the left, the title text is pushed to the right edge (a right tab stop mimics the LaTeX \ hfill), and the red rule runs below — previously the title sat left-aligned next to a small number. Applies to all templates.</w:t>
             </w:r>
           </w:p>
         </w:tc>
@@ -14666,7 +14666,7 @@
               <w:jc w:val="left"/>
             </w:pPr>
             <w:r>
-              <w:t xml:space="preserve">6.4.5</w:t>
+              <w:t xml:space="preserve">6.4.6</w:t>
             </w:r>
           </w:p>
         </w:tc>
@@ -14696,7 +14696,7 @@
               <w:jc w:val="left"/>
             </w:pPr>
             <w:r>
-              <w:t xml:space="preserve">DOCX polish pass: all captions centered (matching the PDF), vertical spacing between blocks matched to the LaTeX rhythm (medskip/smallskip around captions, field bars, and steps), and test steps now render as separate paragraphs each with the red bold number (previously merged into one paragraph).</w:t>
+              <w:t xml:space="preserve">Code blocks inside test cases no longer break the red left rule in DOCX — the code style’s left indent (which jogged the rule) is reset inside test case blocks, and code blocks now show the PDF’s code box (gray background with thin border on top, bottom, and right, red rule continuing on the left).</w:t>
             </w:r>
           </w:p>
         </w:tc>
@@ -14709,7 +14709,7 @@
               <w:jc w:val="left"/>
             </w:pPr>
             <w:r>
-              <w:t xml:space="preserve">6.4.4</w:t>
+              <w:t xml:space="preserve">6.4.5</w:t>
             </w:r>
           </w:p>
         </w:tc>
@@ -14735,7 +14735,7 @@
               <w:jc w:val="left"/>
             </w:pPr>
             <w:r>
-              <w:t xml:space="preserve">DOCX covers now show the logo, cover text, and version/date/time meta line like the PDF. Test case blocks in DOCX get the PDF’s visual wrapper: red left rule, red field header bars, and red step numbers. Captions follow the PDF ordering system in DOCX, MD, and HTML (Table/Diagram/Figure/Testcase N: with bold symbol). Portuguese PDFs now label diagrams "Diagrama N:" (was hardcoded English "Diagram"). Markdown and HTML output no longer leaks raw LaTeX from passthrough blocks — the DOCX pre-processor now feeds those pipelines too.</w:t>
+              <w:t xml:space="preserve">DOCX polish pass: all captions centered (matching the PDF), vertical spacing between blocks matched to the LaTeX rhythm (medskip/smallskip around captions, field bars, and steps), and test steps now render as separate paragraphs each with the red bold number (previously merged into one paragraph).</w:t>
             </w:r>
           </w:p>
         </w:tc>
@@ -14750,7 +14750,7 @@
               <w:jc w:val="left"/>
             </w:pPr>
             <w:r>
-              <w:t xml:space="preserve">6.4.3</w:t>
+              <w:t xml:space="preserve">6.4.4</w:t>
             </w:r>
           </w:p>
         </w:tc>
@@ -14780,7 +14780,7 @@
               <w:jc w:val="left"/>
             </w:pPr>
             <w:r>
-              <w:t xml:space="preserve">Testbook and POC DOCX output now matches the PDF much more closely: native table of contents (language-aware, auto-populated), each section starts on a new page, embedded images and diagrams (PlantUML/Graphviz rendered), white-on-red table headers, cover version line under the title, centered test case captions, and plain black rules for signature grids.</w:t>
+              <w:t xml:space="preserve">DOCX covers now show the logo, cover text, and version/date/time meta line like the PDF. Test case blocks in DOCX get the PDF’s visual wrapper: red left rule, red field header bars, and red step numbers. Captions follow the PDF ordering system in DOCX, MD, and HTML (Table/Diagram/Figure/Testcase N: with bold symbol). Portuguese PDFs now label diagrams "Diagrama N:" (was hardcoded English "Diagram"). Markdown and HTML output no longer leaks raw LaTeX from passthrough blocks — the DOCX pre-processor now feeds those pipelines too.</w:t>
             </w:r>
           </w:p>
         </w:tc>
@@ -14793,7 +14793,7 @@
               <w:jc w:val="left"/>
             </w:pPr>
             <w:r>
-              <w:t xml:space="preserve">6.4.2</w:t>
+              <w:t xml:space="preserve">6.4.3</w:t>
             </w:r>
           </w:p>
         </w:tc>
@@ -14819,7 +14819,7 @@
               <w:jc w:val="left"/>
             </w:pPr>
             <w:r>
-              <w:t xml:space="preserve">DOCX output for POC and testbook templates now includes all passthrough content (stakeholders, closing record, signatures, test cases, test summary, changelog) via a new pre-processor. Fixed dropped Test Scope fields in testbook DOCX output.</w:t>
+              <w:t xml:space="preserve">Testbook and POC DOCX output now matches the PDF much more closely: native table of contents (language-aware, auto-populated), each section starts on a new page, embedded images and diagrams (PlantUML/Graphviz rendered), white-on-red table headers, cover version line under the title, centered test case captions, and plain black rules for signature grids.</w:t>
             </w:r>
           </w:p>
         </w:tc>
@@ -14834,7 +14834,7 @@
               <w:jc w:val="left"/>
             </w:pPr>
             <w:r>
-              <w:t xml:space="preserve">6.4.0</w:t>
+              <w:t xml:space="preserve">6.4.2</w:t>
             </w:r>
           </w:p>
         </w:tc>
@@ -14864,6 +14864,45 @@
               <w:jc w:val="left"/>
             </w:pPr>
             <w:r>
+              <w:t xml:space="preserve">DOCX output for POC and testbook templates now includes all passthrough content (stakeholders, closing record, signatures, test cases, test summary, changelog) via a new pre-processor. Fixed dropped Test Scope fields in testbook DOCX output.</w:t>
+            </w:r>
+          </w:p>
+        </w:tc>
+      </w:tr>
+      <w:tr>
+        <w:tc>
+          <w:tcPr/>
+          <w:p>
+            <w:pPr>
+              <w:jc w:val="left"/>
+            </w:pPr>
+            <w:r>
+              <w:t xml:space="preserve">6.4.0</w:t>
+            </w:r>
+          </w:p>
+        </w:tc>
+        <w:tc>
+          <w:tcPr/>
+          <w:p>
+            <w:pPr>
+              <w:jc w:val="left"/>
+            </w:pPr>
+            <w:r>
+              <w:t xml:space="preserve">2026-09-20</w:t>
+            </w:r>
+          </w:p>
+        </w:tc>
+        <w:tc>
+          <w:tcPr/>
+          <w:p>
+            <w:pPr>
+              <w:numPr>
+                <w:ilvl w:val="0"/>
+                <w:numId w:val="1066"/>
+              </w:numPr>
+              <w:jc w:val="left"/>
+            </w:pPr>
+            <w:r>
               <w:t xml:space="preserve">Fixed changelog dates — replaced</w:t>
             </w:r>
             <w:r>
@@ -14886,54 +14925,15 @@
       </w:tr>
       <w:tr>
         <w:tc>
-          <w:tcPr/>
+          <w:tcPr>
+            <w:shd w:val="clear" w:color="auto" w:fill="F6F8FA"/>
+          </w:tcPr>
           <w:p>
             <w:pPr>
               <w:jc w:val="left"/>
             </w:pPr>
             <w:r>
               <w:t xml:space="preserve">5.1.1</w:t>
-            </w:r>
-          </w:p>
-        </w:tc>
-        <w:tc>
-          <w:tcPr/>
-          <w:p>
-            <w:pPr>
-              <w:jc w:val="left"/>
-            </w:pPr>
-            <w:r>
-              <w:t xml:space="preserve">2026-09-14</w:t>
-            </w:r>
-          </w:p>
-        </w:tc>
-        <w:tc>
-          <w:tcPr/>
-          <w:p>
-            <w:pPr>
-              <w:numPr>
-                <w:ilvl w:val="0"/>
-                <w:numId w:val="1066"/>
-              </w:numPr>
-              <w:jc w:val="left"/>
-            </w:pPr>
-            <w:r>
-              <w:t xml:space="preserve">Synced callout colors in DOCX/HTML/MD output to match brand palette. Added color palette demo.</w:t>
-            </w:r>
-          </w:p>
-        </w:tc>
-      </w:tr>
-      <w:tr>
-        <w:tc>
-          <w:tcPr>
-            <w:shd w:val="clear" w:color="auto" w:fill="F6F8FA"/>
-          </w:tcPr>
-          <w:p>
-            <w:pPr>
-              <w:jc w:val="left"/>
-            </w:pPr>
-            <w:r>
-              <w:t xml:space="preserve">5.1.0</w:t>
             </w:r>
           </w:p>
         </w:tc>
@@ -14963,7 +14963,7 @@
               <w:jc w:val="left"/>
             </w:pPr>
             <w:r>
-              <w:t xml:space="preserve">Adopted brand guidelines auxiliary color palette and monochrome scale. Aligned callout colors to brand specifications.</w:t>
+              <w:t xml:space="preserve">Synced callout colors in DOCX/HTML/MD output to match brand palette. Added color palette demo.</w:t>
             </w:r>
           </w:p>
         </w:tc>
@@ -14976,7 +14976,7 @@
               <w:jc w:val="left"/>
             </w:pPr>
             <w:r>
-              <w:t xml:space="preserve">5.0.3</w:t>
+              <w:t xml:space="preserve">5.1.0</w:t>
             </w:r>
           </w:p>
         </w:tc>
@@ -15002,6 +15002,51 @@
               <w:jc w:val="left"/>
             </w:pPr>
             <w:r>
+              <w:t xml:space="preserve">Adopted brand guidelines auxiliary color palette and monochrome scale. Aligned callout colors to brand specifications.</w:t>
+            </w:r>
+          </w:p>
+        </w:tc>
+      </w:tr>
+      <w:tr>
+        <w:tc>
+          <w:tcPr>
+            <w:shd w:val="clear" w:color="auto" w:fill="F6F8FA"/>
+          </w:tcPr>
+          <w:p>
+            <w:pPr>
+              <w:jc w:val="left"/>
+            </w:pPr>
+            <w:r>
+              <w:t xml:space="preserve">5.0.3</w:t>
+            </w:r>
+          </w:p>
+        </w:tc>
+        <w:tc>
+          <w:tcPr>
+            <w:shd w:val="clear" w:color="auto" w:fill="F6F8FA"/>
+          </w:tcPr>
+          <w:p>
+            <w:pPr>
+              <w:jc w:val="left"/>
+            </w:pPr>
+            <w:r>
+              <w:t xml:space="preserve">2026-09-14</w:t>
+            </w:r>
+          </w:p>
+        </w:tc>
+        <w:tc>
+          <w:tcPr>
+            <w:shd w:val="clear" w:color="auto" w:fill="F6F8FA"/>
+          </w:tcPr>
+          <w:p>
+            <w:pPr>
+              <w:numPr>
+                <w:ilvl w:val="0"/>
+                <w:numId w:val="1069"/>
+              </w:numPr>
+              <w:jc w:val="left"/>
+            </w:pPr>
+            <w:r>
               <w:t xml:space="preserve">Removed non-standard</w:t>
             </w:r>
             <w:r>
@@ -15024,58 +15069,13 @@
       </w:tr>
       <w:tr>
         <w:tc>
-          <w:tcPr>
-            <w:shd w:val="clear" w:color="auto" w:fill="F6F8FA"/>
-          </w:tcPr>
+          <w:tcPr/>
           <w:p>
             <w:pPr>
               <w:jc w:val="left"/>
             </w:pPr>
             <w:r>
               <w:t xml:space="preserve">5.0.2</w:t>
-            </w:r>
-          </w:p>
-        </w:tc>
-        <w:tc>
-          <w:tcPr>
-            <w:shd w:val="clear" w:color="auto" w:fill="F6F8FA"/>
-          </w:tcPr>
-          <w:p>
-            <w:pPr>
-              <w:jc w:val="left"/>
-            </w:pPr>
-            <w:r>
-              <w:t xml:space="preserve">2026-09-14</w:t>
-            </w:r>
-          </w:p>
-        </w:tc>
-        <w:tc>
-          <w:tcPr>
-            <w:shd w:val="clear" w:color="auto" w:fill="F6F8FA"/>
-          </w:tcPr>
-          <w:p>
-            <w:pPr>
-              <w:numPr>
-                <w:ilvl w:val="0"/>
-                <w:numId w:val="1069"/>
-              </w:numPr>
-              <w:jc w:val="left"/>
-            </w:pPr>
-            <w:r>
-              <w:t xml:space="preserve">Long commands in test steps now render as code blocks instead of inline code.</w:t>
-            </w:r>
-          </w:p>
-        </w:tc>
-      </w:tr>
-      <w:tr>
-        <w:tc>
-          <w:tcPr/>
-          <w:p>
-            <w:pPr>
-              <w:jc w:val="left"/>
-            </w:pPr>
-            <w:r>
-              <w:t xml:space="preserve">5.0.1</w:t>
             </w:r>
           </w:p>
         </w:tc>
@@ -15101,7 +15101,7 @@
               <w:jc w:val="left"/>
             </w:pPr>
             <w:r>
-              <w:t xml:space="preserve">Testcase caption centered above the block.</w:t>
+              <w:t xml:space="preserve">Long commands in test steps now render as code blocks instead of inline code.</w:t>
             </w:r>
           </w:p>
         </w:tc>
@@ -15116,7 +15116,7 @@
               <w:jc w:val="left"/>
             </w:pPr>
             <w:r>
-              <w:t xml:space="preserve">5.0.0</w:t>
+              <w:t xml:space="preserve">5.0.1</w:t>
             </w:r>
           </w:p>
         </w:tc>
@@ -15146,6 +15146,45 @@
               <w:jc w:val="left"/>
             </w:pPr>
             <w:r>
+              <w:t xml:space="preserve">Testcase caption centered above the block.</w:t>
+            </w:r>
+          </w:p>
+        </w:tc>
+      </w:tr>
+      <w:tr>
+        <w:tc>
+          <w:tcPr/>
+          <w:p>
+            <w:pPr>
+              <w:jc w:val="left"/>
+            </w:pPr>
+            <w:r>
+              <w:t xml:space="preserve">5.0.0</w:t>
+            </w:r>
+          </w:p>
+        </w:tc>
+        <w:tc>
+          <w:tcPr/>
+          <w:p>
+            <w:pPr>
+              <w:jc w:val="left"/>
+            </w:pPr>
+            <w:r>
+              <w:t xml:space="preserve">2026-09-14</w:t>
+            </w:r>
+          </w:p>
+        </w:tc>
+        <w:tc>
+          <w:tcPr/>
+          <w:p>
+            <w:pPr>
+              <w:numPr>
+                <w:ilvl w:val="0"/>
+                <w:numId w:val="1072"/>
+              </w:numPr>
+              <w:jc w:val="left"/>
+            </w:pPr>
+            <w:r>
               <w:t xml:space="preserve">Major refactoring: extracted shared modules (huawei-titles, huawei-toc, huawei-cover), renamed</w:t>
             </w:r>
             <w:r>
@@ -15207,7 +15246,9 @@
       </w:tr>
       <w:tr>
         <w:tc>
-          <w:tcPr/>
+          <w:tcPr>
+            <w:shd w:val="clear" w:color="auto" w:fill="F6F8FA"/>
+          </w:tcPr>
           <w:p>
             <w:pPr>
               <w:jc w:val="left"/>
@@ -15218,56 +15259,15 @@
           </w:p>
         </w:tc>
         <w:tc>
-          <w:tcPr/>
+          <w:tcPr>
+            <w:shd w:val="clear" w:color="auto" w:fill="F6F8FA"/>
+          </w:tcPr>
           <w:p>
             <w:pPr>
               <w:jc w:val="left"/>
             </w:pPr>
             <w:r>
               <w:t xml:space="preserve">2026-09-14</w:t>
-            </w:r>
-          </w:p>
-        </w:tc>
-        <w:tc>
-          <w:tcPr/>
-          <w:p>
-            <w:pPr>
-              <w:numPr>
-                <w:ilvl w:val="0"/>
-                <w:numId w:val="1072"/>
-              </w:numPr>
-              <w:jc w:val="left"/>
-            </w:pPr>
-            <w:r>
-              <w:t xml:space="preserve">Testcase headings now formatted as captions (like figures/tables): bold “Testcase N:” followed by description. Changed label from “Test Case” to “Testcase”.</w:t>
-            </w:r>
-          </w:p>
-        </w:tc>
-      </w:tr>
-      <w:tr>
-        <w:tc>
-          <w:tcPr>
-            <w:shd w:val="clear" w:color="auto" w:fill="F6F8FA"/>
-          </w:tcPr>
-          <w:p>
-            <w:pPr>
-              <w:jc w:val="left"/>
-            </w:pPr>
-            <w:r>
-              <w:t xml:space="preserve">4.6.0</w:t>
-            </w:r>
-          </w:p>
-        </w:tc>
-        <w:tc>
-          <w:tcPr>
-            <w:shd w:val="clear" w:color="auto" w:fill="F6F8FA"/>
-          </w:tcPr>
-          <w:p>
-            <w:pPr>
-              <w:jc w:val="left"/>
-            </w:pPr>
-            <w:r>
-              <w:t xml:space="preserve">2026-09-13</w:t>
             </w:r>
           </w:p>
         </w:tc>
@@ -15284,7 +15284,7 @@
               <w:jc w:val="left"/>
             </w:pPr>
             <w:r>
-              <w:t xml:space="preserve">Section restructure: Introduction, Test Cases (with category subsections), Conclusion. Testcases auto-numbered like figures/tables. Changed testcase from subsection to subsubsection.</w:t>
+              <w:t xml:space="preserve">Testcase headings now formatted as captions (like figures/tables): bold “Testcase N:” followed by description. Changed label from “Test Case” to “Testcase”.</w:t>
             </w:r>
           </w:p>
         </w:tc>
@@ -15297,7 +15297,7 @@
               <w:jc w:val="left"/>
             </w:pPr>
             <w:r>
-              <w:t xml:space="preserve">4.5.0</w:t>
+              <w:t xml:space="preserve">4.6.0</w:t>
             </w:r>
           </w:p>
         </w:tc>
@@ -15323,6 +15323,51 @@
               <w:jc w:val="left"/>
             </w:pPr>
             <w:r>
+              <w:t xml:space="preserve">Section restructure: Introduction, Test Cases (with category subsections), Conclusion. Testcases auto-numbered like figures/tables. Changed testcase from subsection to subsubsection.</w:t>
+            </w:r>
+          </w:p>
+        </w:tc>
+      </w:tr>
+      <w:tr>
+        <w:tc>
+          <w:tcPr>
+            <w:shd w:val="clear" w:color="auto" w:fill="F6F8FA"/>
+          </w:tcPr>
+          <w:p>
+            <w:pPr>
+              <w:jc w:val="left"/>
+            </w:pPr>
+            <w:r>
+              <w:t xml:space="preserve">4.5.0</w:t>
+            </w:r>
+          </w:p>
+        </w:tc>
+        <w:tc>
+          <w:tcPr>
+            <w:shd w:val="clear" w:color="auto" w:fill="F6F8FA"/>
+          </w:tcPr>
+          <w:p>
+            <w:pPr>
+              <w:jc w:val="left"/>
+            </w:pPr>
+            <w:r>
+              <w:t xml:space="preserve">2026-09-13</w:t>
+            </w:r>
+          </w:p>
+        </w:tc>
+        <w:tc>
+          <w:tcPr>
+            <w:shd w:val="clear" w:color="auto" w:fill="F6F8FA"/>
+          </w:tcPr>
+          <w:p>
+            <w:pPr>
+              <w:numPr>
+                <w:ilvl w:val="0"/>
+                <w:numId w:val="1075"/>
+              </w:numPr>
+              <w:jc w:val="left"/>
+            </w:pPr>
+            <w:r>
               <w:t xml:space="preserve">Unified field APIs:</w:t>
             </w:r>
             <w:r>
@@ -15387,58 +15432,13 @@
       </w:tr>
       <w:tr>
         <w:tc>
-          <w:tcPr>
-            <w:shd w:val="clear" w:color="auto" w:fill="F6F8FA"/>
-          </w:tcPr>
+          <w:tcPr/>
           <w:p>
             <w:pPr>
               <w:jc w:val="left"/>
             </w:pPr>
             <w:r>
               <w:t xml:space="preserve">4.4.0</w:t>
-            </w:r>
-          </w:p>
-        </w:tc>
-        <w:tc>
-          <w:tcPr>
-            <w:shd w:val="clear" w:color="auto" w:fill="F6F8FA"/>
-          </w:tcPr>
-          <w:p>
-            <w:pPr>
-              <w:jc w:val="left"/>
-            </w:pPr>
-            <w:r>
-              <w:t xml:space="preserve">2026-09-13</w:t>
-            </w:r>
-          </w:p>
-        </w:tc>
-        <w:tc>
-          <w:tcPr>
-            <w:shd w:val="clear" w:color="auto" w:fill="F6F8FA"/>
-          </w:tcPr>
-          <w:p>
-            <w:pPr>
-              <w:numPr>
-                <w:ilvl w:val="0"/>
-                <w:numId w:val="1075"/>
-              </w:numPr>
-              <w:jc w:val="left"/>
-            </w:pPr>
-            <w:r>
-              <w:t xml:space="preserve">Code review fixes: removed dead labels, badge now uses Huawei brand colors (tipbg/tipfg, huaweired, warningbg/warningfg), Lua filter preserves formatting in DOCX/MD/HTML via parse_latex_blocks, testprocedure handler preserves non-step content (images, code, callouts).</w:t>
-            </w:r>
-          </w:p>
-        </w:tc>
-      </w:tr>
-      <w:tr>
-        <w:tc>
-          <w:tcPr/>
-          <w:p>
-            <w:pPr>
-              <w:jc w:val="left"/>
-            </w:pPr>
-            <w:r>
-              <w:t xml:space="preserve">4.3.0</w:t>
             </w:r>
           </w:p>
         </w:tc>
@@ -15464,6 +15464,51 @@
               <w:jc w:val="left"/>
             </w:pPr>
             <w:r>
+              <w:t xml:space="preserve">Code review fixes: removed dead labels, badge now uses Huawei brand colors (tipbg/tipfg, huaweired, warningbg/warningfg), Lua filter preserves formatting in DOCX/MD/HTML via parse_latex_blocks, testprocedure handler preserves non-step content (images, code, callouts).</w:t>
+            </w:r>
+          </w:p>
+        </w:tc>
+      </w:tr>
+      <w:tr>
+        <w:tc>
+          <w:tcPr>
+            <w:shd w:val="clear" w:color="auto" w:fill="F6F8FA"/>
+          </w:tcPr>
+          <w:p>
+            <w:pPr>
+              <w:jc w:val="left"/>
+            </w:pPr>
+            <w:r>
+              <w:t xml:space="preserve">4.3.0</w:t>
+            </w:r>
+          </w:p>
+        </w:tc>
+        <w:tc>
+          <w:tcPr>
+            <w:shd w:val="clear" w:color="auto" w:fill="F6F8FA"/>
+          </w:tcPr>
+          <w:p>
+            <w:pPr>
+              <w:jc w:val="left"/>
+            </w:pPr>
+            <w:r>
+              <w:t xml:space="preserve">2026-09-13</w:t>
+            </w:r>
+          </w:p>
+        </w:tc>
+        <w:tc>
+          <w:tcPr>
+            <w:shd w:val="clear" w:color="auto" w:fill="F6F8FA"/>
+          </w:tcPr>
+          <w:p>
+            <w:pPr>
+              <w:numPr>
+                <w:ilvl w:val="0"/>
+                <w:numId w:val="1077"/>
+              </w:numPr>
+              <w:jc w:val="left"/>
+            </w:pPr>
+            <w:r>
               <w:t xml:space="preserve">Added</w:t>
             </w:r>
             <w:r>
@@ -15516,9 +15561,7 @@
       </w:tr>
       <w:tr>
         <w:tc>
-          <w:tcPr>
-            <w:shd w:val="clear" w:color="auto" w:fill="F6F8FA"/>
-          </w:tcPr>
+          <w:tcPr/>
           <w:p>
             <w:pPr>
               <w:jc w:val="left"/>
@@ -15529,9 +15572,7 @@
           </w:p>
         </w:tc>
         <w:tc>
-          <w:tcPr>
-            <w:shd w:val="clear" w:color="auto" w:fill="F6F8FA"/>
-          </w:tcPr>
+          <w:tcPr/>
           <w:p>
             <w:pPr>
               <w:jc w:val="left"/>
@@ -15542,14 +15583,12 @@
           </w:p>
         </w:tc>
         <w:tc>
-          <w:tcPr>
-            <w:shd w:val="clear" w:color="auto" w:fill="F6F8FA"/>
-          </w:tcPr>
+          <w:tcPr/>
           <w:p>
             <w:pPr>
               <w:numPr>
                 <w:ilvl w:val="0"/>
-                <w:numId w:val="1077"/>
+                <w:numId w:val="1078"/>
               </w:numPr>
               <w:jc w:val="left"/>
             </w:pPr>
@@ -15603,7 +15642,9 @@
       </w:tr>
       <w:tr>
         <w:tc>
-          <w:tcPr/>
+          <w:tcPr>
+            <w:shd w:val="clear" w:color="auto" w:fill="F6F8FA"/>
+          </w:tcPr>
           <w:p>
             <w:pPr>
               <w:jc w:val="left"/>
@@ -15614,7 +15655,9 @@
           </w:p>
         </w:tc>
         <w:tc>
-          <w:tcPr/>
+          <w:tcPr>
+            <w:shd w:val="clear" w:color="auto" w:fill="F6F8FA"/>
+          </w:tcPr>
           <w:p>
             <w:pPr>
               <w:jc w:val="left"/>
@@ -15625,12 +15668,14 @@
           </w:p>
         </w:tc>
         <w:tc>
-          <w:tcPr/>
+          <w:tcPr>
+            <w:shd w:val="clear" w:color="auto" w:fill="F6F8FA"/>
+          </w:tcPr>
           <w:p>
             <w:pPr>
               <w:numPr>
                 <w:ilvl w:val="0"/>
-                <w:numId w:val="1078"/>
+                <w:numId w:val="1079"/>
               </w:numPr>
               <w:jc w:val="left"/>
             </w:pPr>
@@ -15657,9 +15702,7 @@
       </w:tr>
       <w:tr>
         <w:tc>
-          <w:tcPr>
-            <w:shd w:val="clear" w:color="auto" w:fill="F6F8FA"/>
-          </w:tcPr>
+          <w:tcPr/>
           <w:p>
             <w:pPr>
               <w:jc w:val="left"/>
@@ -15670,9 +15713,7 @@
           </w:p>
         </w:tc>
         <w:tc>
-          <w:tcPr>
-            <w:shd w:val="clear" w:color="auto" w:fill="F6F8FA"/>
-          </w:tcPr>
+          <w:tcPr/>
           <w:p>
             <w:pPr>
               <w:jc w:val="left"/>
@@ -15683,14 +15724,12 @@
           </w:p>
         </w:tc>
         <w:tc>
-          <w:tcPr>
-            <w:shd w:val="clear" w:color="auto" w:fill="F6F8FA"/>
-          </w:tcPr>
+          <w:tcPr/>
           <w:p>
             <w:pPr>
               <w:numPr>
                 <w:ilvl w:val="0"/>
-                <w:numId w:val="1079"/>
+                <w:numId w:val="1080"/>
               </w:numPr>
               <w:jc w:val="left"/>
             </w:pPr>
@@ -15732,7 +15771,9 @@
       </w:tr>
       <w:tr>
         <w:tc>
-          <w:tcPr/>
+          <w:tcPr>
+            <w:shd w:val="clear" w:color="auto" w:fill="F6F8FA"/>
+          </w:tcPr>
           <w:p>
             <w:pPr>
               <w:jc w:val="left"/>
@@ -15743,7 +15784,9 @@
           </w:p>
         </w:tc>
         <w:tc>
-          <w:tcPr/>
+          <w:tcPr>
+            <w:shd w:val="clear" w:color="auto" w:fill="F6F8FA"/>
+          </w:tcPr>
           <w:p>
             <w:pPr>
               <w:jc w:val="left"/>
@@ -15754,12 +15797,14 @@
           </w:p>
         </w:tc>
         <w:tc>
-          <w:tcPr/>
+          <w:tcPr>
+            <w:shd w:val="clear" w:color="auto" w:fill="F6F8FA"/>
+          </w:tcPr>
           <w:p>
             <w:pPr>
               <w:numPr>
                 <w:ilvl w:val="0"/>
-                <w:numId w:val="1080"/>
+                <w:numId w:val="1081"/>
               </w:numPr>
               <w:jc w:val="left"/>
             </w:pPr>
@@ -15786,58 +15831,13 @@
       </w:tr>
       <w:tr>
         <w:tc>
-          <w:tcPr>
-            <w:shd w:val="clear" w:color="auto" w:fill="F6F8FA"/>
-          </w:tcPr>
+          <w:tcPr/>
           <w:p>
             <w:pPr>
               <w:jc w:val="left"/>
             </w:pPr>
             <w:r>
               <w:t xml:space="preserve">3.8.1</w:t>
-            </w:r>
-          </w:p>
-        </w:tc>
-        <w:tc>
-          <w:tcPr>
-            <w:shd w:val="clear" w:color="auto" w:fill="F6F8FA"/>
-          </w:tcPr>
-          <w:p>
-            <w:pPr>
-              <w:jc w:val="left"/>
-            </w:pPr>
-            <w:r>
-              <w:t xml:space="preserve">2026-09-13</w:t>
-            </w:r>
-          </w:p>
-        </w:tc>
-        <w:tc>
-          <w:tcPr>
-            <w:shd w:val="clear" w:color="auto" w:fill="F6F8FA"/>
-          </w:tcPr>
-          <w:p>
-            <w:pPr>
-              <w:numPr>
-                <w:ilvl w:val="0"/>
-                <w:numId w:val="1081"/>
-              </w:numPr>
-              <w:jc w:val="left"/>
-            </w:pPr>
-            <w:r>
-              <w:t xml:space="preserve">End-to-end quality review: fixed testbook PDF metadata title, removed stray user DOCX from template dir, fixed round-trip.sh variable typo, updated stale references in AGENTS.md and README.md, committed testbook sample PDFs, set TZ for pandoc cover time consistency, widened pandoc version range.</w:t>
-            </w:r>
-          </w:p>
-        </w:tc>
-      </w:tr>
-      <w:tr>
-        <w:tc>
-          <w:tcPr/>
-          <w:p>
-            <w:pPr>
-              <w:jc w:val="left"/>
-            </w:pPr>
-            <w:r>
-              <w:t xml:space="preserve">3.8.0</w:t>
             </w:r>
           </w:p>
         </w:tc>
@@ -15863,7 +15863,7 @@
               <w:jc w:val="left"/>
             </w:pPr>
             <w:r>
-              <w:t xml:space="preserve">Removed Tips and Tricks chapter (tmux configuration) — required VS Code-specific keybindings that don’t generalize across terminal setups.</w:t>
+              <w:t xml:space="preserve">End-to-end quality review: fixed testbook PDF metadata title, removed stray user DOCX from template dir, fixed round-trip.sh variable typo, updated stale references in AGENTS.md and README.md, committed testbook sample PDFs, set TZ for pandoc cover time consistency, widened pandoc version range.</w:t>
             </w:r>
           </w:p>
         </w:tc>
@@ -15878,7 +15878,7 @@
               <w:jc w:val="left"/>
             </w:pPr>
             <w:r>
-              <w:t xml:space="preserve">3.7.0</w:t>
+              <w:t xml:space="preserve">3.8.0</w:t>
             </w:r>
           </w:p>
         </w:tc>
@@ -15891,7 +15891,7 @@
               <w:jc w:val="left"/>
             </w:pPr>
             <w:r>
-              <w:t xml:space="preserve">2026-09-12</w:t>
+              <w:t xml:space="preserve">2026-09-13</w:t>
             </w:r>
           </w:p>
         </w:tc>
@@ -15908,6 +15908,45 @@
               <w:jc w:val="left"/>
             </w:pPr>
             <w:r>
+              <w:t xml:space="preserve">Removed Tips and Tricks chapter (tmux configuration) — required VS Code-specific keybindings that don’t generalize across terminal setups.</w:t>
+            </w:r>
+          </w:p>
+        </w:tc>
+      </w:tr>
+      <w:tr>
+        <w:tc>
+          <w:tcPr/>
+          <w:p>
+            <w:pPr>
+              <w:jc w:val="left"/>
+            </w:pPr>
+            <w:r>
+              <w:t xml:space="preserve">3.7.0</w:t>
+            </w:r>
+          </w:p>
+        </w:tc>
+        <w:tc>
+          <w:tcPr/>
+          <w:p>
+            <w:pPr>
+              <w:jc w:val="left"/>
+            </w:pPr>
+            <w:r>
+              <w:t xml:space="preserve">2026-09-12</w:t>
+            </w:r>
+          </w:p>
+        </w:tc>
+        <w:tc>
+          <w:tcPr/>
+          <w:p>
+            <w:pPr>
+              <w:numPr>
+                <w:ilvl w:val="0"/>
+                <w:numId w:val="1084"/>
+              </w:numPr>
+              <w:jc w:val="left"/>
+            </w:pPr>
+            <w:r>
               <w:t xml:space="preserve">Added</w:t>
             </w:r>
             <w:r>
@@ -15960,7 +15999,9 @@
       </w:tr>
       <w:tr>
         <w:tc>
-          <w:tcPr/>
+          <w:tcPr>
+            <w:shd w:val="clear" w:color="auto" w:fill="F6F8FA"/>
+          </w:tcPr>
           <w:p>
             <w:pPr>
               <w:jc w:val="left"/>
@@ -15971,7 +16012,9 @@
           </w:p>
         </w:tc>
         <w:tc>
-          <w:tcPr/>
+          <w:tcPr>
+            <w:shd w:val="clear" w:color="auto" w:fill="F6F8FA"/>
+          </w:tcPr>
           <w:p>
             <w:pPr>
               <w:jc w:val="left"/>
@@ -15982,12 +16025,14 @@
           </w:p>
         </w:tc>
         <w:tc>
-          <w:tcPr/>
+          <w:tcPr>
+            <w:shd w:val="clear" w:color="auto" w:fill="F6F8FA"/>
+          </w:tcPr>
           <w:p>
             <w:pPr>
               <w:numPr>
                 <w:ilvl w:val="0"/>
-                <w:numId w:val="1084"/>
+                <w:numId w:val="1085"/>
               </w:numPr>
               <w:jc w:val="left"/>
             </w:pPr>
@@ -16044,9 +16089,7 @@
       </w:tr>
       <w:tr>
         <w:tc>
-          <w:tcPr>
-            <w:shd w:val="clear" w:color="auto" w:fill="F6F8FA"/>
-          </w:tcPr>
+          <w:tcPr/>
           <w:p>
             <w:pPr>
               <w:jc w:val="left"/>
@@ -16057,9 +16100,7 @@
           </w:p>
         </w:tc>
         <w:tc>
-          <w:tcPr>
-            <w:shd w:val="clear" w:color="auto" w:fill="F6F8FA"/>
-          </w:tcPr>
+          <w:tcPr/>
           <w:p>
             <w:pPr>
               <w:jc w:val="left"/>
@@ -16070,14 +16111,12 @@
           </w:p>
         </w:tc>
         <w:tc>
-          <w:tcPr>
-            <w:shd w:val="clear" w:color="auto" w:fill="F6F8FA"/>
-          </w:tcPr>
+          <w:tcPr/>
           <w:p>
             <w:pPr>
               <w:numPr>
                 <w:ilvl w:val="0"/>
-                <w:numId w:val="1085"/>
+                <w:numId w:val="1086"/>
               </w:numPr>
               <w:jc w:val="left"/>
             </w:pPr>
@@ -16155,7 +16194,9 @@
       </w:tr>
       <w:tr>
         <w:tc>
-          <w:tcPr/>
+          <w:tcPr>
+            <w:shd w:val="clear" w:color="auto" w:fill="F6F8FA"/>
+          </w:tcPr>
           <w:p>
             <w:pPr>
               <w:jc w:val="left"/>
@@ -16166,7 +16207,9 @@
           </w:p>
         </w:tc>
         <w:tc>
-          <w:tcPr/>
+          <w:tcPr>
+            <w:shd w:val="clear" w:color="auto" w:fill="F6F8FA"/>
+          </w:tcPr>
           <w:p>
             <w:pPr>
               <w:jc w:val="left"/>
@@ -16177,12 +16220,14 @@
           </w:p>
         </w:tc>
         <w:tc>
-          <w:tcPr/>
+          <w:tcPr>
+            <w:shd w:val="clear" w:color="auto" w:fill="F6F8FA"/>
+          </w:tcPr>
           <w:p>
             <w:pPr>
               <w:numPr>
                 <w:ilvl w:val="0"/>
-                <w:numId w:val="1086"/>
+                <w:numId w:val="1087"/>
               </w:numPr>
               <w:jc w:val="left"/>
             </w:pPr>
@@ -16209,7 +16254,7 @@
             <w:pPr>
               <w:numPr>
                 <w:ilvl w:val="0"/>
-                <w:numId w:val="1086"/>
+                <w:numId w:val="1087"/>
               </w:numPr>
               <w:jc w:val="left"/>
             </w:pPr>
@@ -16251,7 +16296,7 @@
             <w:pPr>
               <w:numPr>
                 <w:ilvl w:val="0"/>
-                <w:numId w:val="1086"/>
+                <w:numId w:val="1087"/>
               </w:numPr>
               <w:jc w:val="left"/>
             </w:pPr>
@@ -16263,9 +16308,7 @@
       </w:tr>
       <w:tr>
         <w:tc>
-          <w:tcPr>
-            <w:shd w:val="clear" w:color="auto" w:fill="F6F8FA"/>
-          </w:tcPr>
+          <w:tcPr/>
           <w:p>
             <w:pPr>
               <w:jc w:val="left"/>
@@ -16276,9 +16319,7 @@
           </w:p>
         </w:tc>
         <w:tc>
-          <w:tcPr>
-            <w:shd w:val="clear" w:color="auto" w:fill="F6F8FA"/>
-          </w:tcPr>
+          <w:tcPr/>
           <w:p>
             <w:pPr>
               <w:jc w:val="left"/>
@@ -16289,14 +16330,12 @@
           </w:p>
         </w:tc>
         <w:tc>
-          <w:tcPr>
-            <w:shd w:val="clear" w:color="auto" w:fill="F6F8FA"/>
-          </w:tcPr>
+          <w:tcPr/>
           <w:p>
             <w:pPr>
               <w:numPr>
                 <w:ilvl w:val="0"/>
-                <w:numId w:val="1087"/>
+                <w:numId w:val="1088"/>
               </w:numPr>
               <w:jc w:val="left"/>
             </w:pPr>
@@ -16323,7 +16362,7 @@
             <w:pPr>
               <w:numPr>
                 <w:ilvl w:val="0"/>
-                <w:numId w:val="1087"/>
+                <w:numId w:val="1088"/>
               </w:numPr>
               <w:jc w:val="left"/>
             </w:pPr>
@@ -16350,7 +16389,7 @@
             <w:pPr>
               <w:numPr>
                 <w:ilvl w:val="0"/>
-                <w:numId w:val="1087"/>
+                <w:numId w:val="1088"/>
               </w:numPr>
               <w:jc w:val="left"/>
             </w:pPr>
@@ -16362,7 +16401,7 @@
             <w:pPr>
               <w:numPr>
                 <w:ilvl w:val="0"/>
-                <w:numId w:val="1087"/>
+                <w:numId w:val="1088"/>
               </w:numPr>
               <w:jc w:val="left"/>
             </w:pPr>
@@ -16386,54 +16425,15 @@
       </w:tr>
       <w:tr>
         <w:tc>
-          <w:tcPr/>
+          <w:tcPr>
+            <w:shd w:val="clear" w:color="auto" w:fill="F6F8FA"/>
+          </w:tcPr>
           <w:p>
             <w:pPr>
               <w:jc w:val="left"/>
             </w:pPr>
             <w:r>
               <w:t xml:space="preserve">3.2.1</w:t>
-            </w:r>
-          </w:p>
-        </w:tc>
-        <w:tc>
-          <w:tcPr/>
-          <w:p>
-            <w:pPr>
-              <w:jc w:val="left"/>
-            </w:pPr>
-            <w:r>
-              <w:t xml:space="preserve">2026-09-11</w:t>
-            </w:r>
-          </w:p>
-        </w:tc>
-        <w:tc>
-          <w:tcPr/>
-          <w:p>
-            <w:pPr>
-              <w:numPr>
-                <w:ilvl w:val="0"/>
-                <w:numId w:val="1088"/>
-              </w:numPr>
-              <w:jc w:val="left"/>
-            </w:pPr>
-            <w:r>
-              <w:t xml:space="preserve">Renamed Chapter 7 from “Clean Up” to “Operations and Maintenance”. Added subsections for updating and uninstalling both the MaaS Gateway and the document templates. Added cloud resource cleanup as an optional subsection.</w:t>
-            </w:r>
-          </w:p>
-        </w:tc>
-      </w:tr>
-      <w:tr>
-        <w:tc>
-          <w:tcPr>
-            <w:shd w:val="clear" w:color="auto" w:fill="F6F8FA"/>
-          </w:tcPr>
-          <w:p>
-            <w:pPr>
-              <w:jc w:val="left"/>
-            </w:pPr>
-            <w:r>
-              <w:t xml:space="preserve">3.2.0</w:t>
             </w:r>
           </w:p>
         </w:tc>
@@ -16463,6 +16463,45 @@
               <w:jc w:val="left"/>
             </w:pPr>
             <w:r>
+              <w:t xml:space="preserve">Renamed Chapter 7 from “Clean Up” to “Operations and Maintenance”. Added subsections for updating and uninstalling both the MaaS Gateway and the document templates. Added cloud resource cleanup as an optional subsection.</w:t>
+            </w:r>
+          </w:p>
+        </w:tc>
+      </w:tr>
+      <w:tr>
+        <w:tc>
+          <w:tcPr/>
+          <w:p>
+            <w:pPr>
+              <w:jc w:val="left"/>
+            </w:pPr>
+            <w:r>
+              <w:t xml:space="preserve">3.2.0</w:t>
+            </w:r>
+          </w:p>
+        </w:tc>
+        <w:tc>
+          <w:tcPr/>
+          <w:p>
+            <w:pPr>
+              <w:jc w:val="left"/>
+            </w:pPr>
+            <w:r>
+              <w:t xml:space="preserve">2026-09-11</w:t>
+            </w:r>
+          </w:p>
+        </w:tc>
+        <w:tc>
+          <w:tcPr/>
+          <w:p>
+            <w:pPr>
+              <w:numPr>
+                <w:ilvl w:val="0"/>
+                <w:numId w:val="1090"/>
+              </w:numPr>
+              <w:jc w:val="left"/>
+            </w:pPr>
+            <w:r>
               <w:t xml:space="preserve">Added</w:t>
             </w:r>
             <w:r>
@@ -16524,7 +16563,7 @@
             <w:pPr>
               <w:numPr>
                 <w:ilvl w:val="0"/>
-                <w:numId w:val="1089"/>
+                <w:numId w:val="1090"/>
               </w:numPr>
               <w:jc w:val="left"/>
             </w:pPr>
@@ -16569,7 +16608,7 @@
             <w:pPr>
               <w:numPr>
                 <w:ilvl w:val="0"/>
-                <w:numId w:val="1089"/>
+                <w:numId w:val="1090"/>
               </w:numPr>
               <w:jc w:val="left"/>
             </w:pPr>
@@ -16581,54 +16620,15 @@
       </w:tr>
       <w:tr>
         <w:tc>
-          <w:tcPr/>
+          <w:tcPr>
+            <w:shd w:val="clear" w:color="auto" w:fill="F6F8FA"/>
+          </w:tcPr>
           <w:p>
             <w:pPr>
               <w:jc w:val="left"/>
             </w:pPr>
             <w:r>
               <w:t xml:space="preserve">3.1.2</w:t>
-            </w:r>
-          </w:p>
-        </w:tc>
-        <w:tc>
-          <w:tcPr/>
-          <w:p>
-            <w:pPr>
-              <w:jc w:val="left"/>
-            </w:pPr>
-            <w:r>
-              <w:t xml:space="preserve">2026-09-11</w:t>
-            </w:r>
-          </w:p>
-        </w:tc>
-        <w:tc>
-          <w:tcPr/>
-          <w:p>
-            <w:pPr>
-              <w:numPr>
-                <w:ilvl w:val="0"/>
-                <w:numId w:val="1090"/>
-              </w:numPr>
-              <w:jc w:val="left"/>
-            </w:pPr>
-            <w:r>
-              <w:t xml:space="preserve">Added output format guide to README.md: comparison table of PDF, Markdown, DOCX, and HTML with purpose, copy-paste quality, and limitations. Recommends Markdown for copy-paste.</w:t>
-            </w:r>
-          </w:p>
-        </w:tc>
-      </w:tr>
-      <w:tr>
-        <w:tc>
-          <w:tcPr>
-            <w:shd w:val="clear" w:color="auto" w:fill="F6F8FA"/>
-          </w:tcPr>
-          <w:p>
-            <w:pPr>
-              <w:jc w:val="left"/>
-            </w:pPr>
-            <w:r>
-              <w:t xml:space="preserve">3.1.1</w:t>
             </w:r>
           </w:p>
         </w:tc>
@@ -16658,6 +16658,45 @@
               <w:jc w:val="left"/>
             </w:pPr>
             <w:r>
+              <w:t xml:space="preserve">Added output format guide to README.md: comparison table of PDF, Markdown, DOCX, and HTML with purpose, copy-paste quality, and limitations. Recommends Markdown for copy-paste.</w:t>
+            </w:r>
+          </w:p>
+        </w:tc>
+      </w:tr>
+      <w:tr>
+        <w:tc>
+          <w:tcPr/>
+          <w:p>
+            <w:pPr>
+              <w:jc w:val="left"/>
+            </w:pPr>
+            <w:r>
+              <w:t xml:space="preserve">3.1.1</w:t>
+            </w:r>
+          </w:p>
+        </w:tc>
+        <w:tc>
+          <w:tcPr/>
+          <w:p>
+            <w:pPr>
+              <w:jc w:val="left"/>
+            </w:pPr>
+            <w:r>
+              <w:t xml:space="preserve">2026-09-11</w:t>
+            </w:r>
+          </w:p>
+        </w:tc>
+        <w:tc>
+          <w:tcPr/>
+          <w:p>
+            <w:pPr>
+              <w:numPr>
+                <w:ilvl w:val="0"/>
+                <w:numId w:val="1092"/>
+              </w:numPr>
+              <w:jc w:val="left"/>
+            </w:pPr>
+            <w:r>
               <w:t xml:space="preserve">Updated MaaS Gateway chapter to v1.10.9: non-interactive mode (</w:t>
             </w:r>
             <w:r>
@@ -16674,7 +16713,7 @@
             <w:pPr>
               <w:numPr>
                 <w:ilvl w:val="0"/>
-                <w:numId w:val="1091"/>
+                <w:numId w:val="1092"/>
               </w:numPr>
               <w:jc w:val="left"/>
             </w:pPr>
@@ -16716,7 +16755,7 @@
             <w:pPr>
               <w:numPr>
                 <w:ilvl w:val="0"/>
-                <w:numId w:val="1091"/>
+                <w:numId w:val="1092"/>
               </w:numPr>
               <w:jc w:val="left"/>
             </w:pPr>
@@ -16728,7 +16767,9 @@
       </w:tr>
       <w:tr>
         <w:tc>
-          <w:tcPr/>
+          <w:tcPr>
+            <w:shd w:val="clear" w:color="auto" w:fill="F6F8FA"/>
+          </w:tcPr>
           <w:p>
             <w:pPr>
               <w:jc w:val="left"/>
@@ -16739,7 +16780,9 @@
           </w:p>
         </w:tc>
         <w:tc>
-          <w:tcPr/>
+          <w:tcPr>
+            <w:shd w:val="clear" w:color="auto" w:fill="F6F8FA"/>
+          </w:tcPr>
           <w:p>
             <w:pPr>
               <w:jc w:val="left"/>
@@ -16750,12 +16793,14 @@
           </w:p>
         </w:tc>
         <w:tc>
-          <w:tcPr/>
+          <w:tcPr>
+            <w:shd w:val="clear" w:color="auto" w:fill="F6F8FA"/>
+          </w:tcPr>
           <w:p>
             <w:pPr>
               <w:numPr>
                 <w:ilvl w:val="0"/>
-                <w:numId w:val="1092"/>
+                <w:numId w:val="1093"/>
               </w:numPr>
               <w:jc w:val="left"/>
             </w:pPr>
@@ -16779,7 +16824,7 @@
             <w:pPr>
               <w:numPr>
                 <w:ilvl w:val="0"/>
-                <w:numId w:val="1092"/>
+                <w:numId w:val="1093"/>
               </w:numPr>
               <w:jc w:val="left"/>
             </w:pPr>
@@ -16821,7 +16866,7 @@
             <w:pPr>
               <w:numPr>
                 <w:ilvl w:val="0"/>
-                <w:numId w:val="1092"/>
+                <w:numId w:val="1093"/>
               </w:numPr>
               <w:jc w:val="left"/>
             </w:pPr>
@@ -16829,63 +16874,6 @@
               <w:t xml:space="preserve">Restructured chapters: moved SSH config and VS Code connection to new Chapter 4 (Install VS Code and Connect via Remote-SSH). Chapters 5—​7 renumbered.</w:t>
             </w:r>
           </w:p>
-          <w:p>
-            <w:pPr>
-              <w:numPr>
-                <w:ilvl w:val="0"/>
-                <w:numId w:val="1092"/>
-              </w:numPr>
-              <w:jc w:val="left"/>
-            </w:pPr>
-            <w:r>
-              <w:t xml:space="preserve">Added verification checklist tables to all 7 chapters.</w:t>
-            </w:r>
-          </w:p>
-          <w:p>
-            <w:pPr>
-              <w:numPr>
-                <w:ilvl w:val="0"/>
-                <w:numId w:val="1092"/>
-              </w:numPr>
-              <w:jc w:val="left"/>
-            </w:pPr>
-            <w:r>
-              <w:t xml:space="preserve">Added mandatory reboot warning in Chapter 2 (SSH port change). Added troubleshooting subsection in Chapter 4 with common SSH connection issues and ncat debugging commands.</w:t>
-            </w:r>
-          </w:p>
-        </w:tc>
-      </w:tr>
-      <w:tr>
-        <w:tc>
-          <w:tcPr>
-            <w:shd w:val="clear" w:color="auto" w:fill="F6F8FA"/>
-          </w:tcPr>
-          <w:p>
-            <w:pPr>
-              <w:jc w:val="left"/>
-            </w:pPr>
-            <w:r>
-              <w:t xml:space="preserve">3.0.1</w:t>
-            </w:r>
-          </w:p>
-        </w:tc>
-        <w:tc>
-          <w:tcPr>
-            <w:shd w:val="clear" w:color="auto" w:fill="F6F8FA"/>
-          </w:tcPr>
-          <w:p>
-            <w:pPr>
-              <w:jc w:val="left"/>
-            </w:pPr>
-            <w:r>
-              <w:t xml:space="preserve">2026-09-10</w:t>
-            </w:r>
-          </w:p>
-        </w:tc>
-        <w:tc>
-          <w:tcPr>
-            <w:shd w:val="clear" w:color="auto" w:fill="F6F8FA"/>
-          </w:tcPr>
           <w:p>
             <w:pPr>
               <w:numPr>
@@ -16895,7 +16883,19 @@
               <w:jc w:val="left"/>
             </w:pPr>
             <w:r>
-              <w:t xml:space="preserve">Minor fixes: test-filter.sh auto-discovery, build.sh help text, Makefile aggregate descriptions, 5-section comment correction, CHANGELOG version gap note, callout-in-code fix, CI font auto-discovery, dofile path comment, test-sync.sh header.</w:t>
+              <w:t xml:space="preserve">Added verification checklist tables to all 7 chapters.</w:t>
+            </w:r>
+          </w:p>
+          <w:p>
+            <w:pPr>
+              <w:numPr>
+                <w:ilvl w:val="0"/>
+                <w:numId w:val="1093"/>
+              </w:numPr>
+              <w:jc w:val="left"/>
+            </w:pPr>
+            <w:r>
+              <w:t xml:space="preserve">Added mandatory reboot warning in Chapter 2 (SSH port change). Added troubleshooting subsection in Chapter 4 with common SSH connection issues and ncat debugging commands.</w:t>
             </w:r>
           </w:p>
         </w:tc>
@@ -16908,18 +16908,18 @@
               <w:jc w:val="left"/>
             </w:pPr>
             <w:r>
-              <w:t xml:space="preserve">3.0.0</w:t>
-            </w:r>
-          </w:p>
-        </w:tc>
-        <w:tc>
-          <w:tcPr/>
-          <w:p>
-            <w:pPr>
-              <w:jc w:val="left"/>
-            </w:pPr>
-            <w:r>
-              <w:t xml:space="preserve">2026-09-09</w:t>
+              <w:t xml:space="preserve">3.0.1</w:t>
+            </w:r>
+          </w:p>
+        </w:tc>
+        <w:tc>
+          <w:tcPr/>
+          <w:p>
+            <w:pPr>
+              <w:jc w:val="left"/>
+            </w:pPr>
+            <w:r>
+              <w:t xml:space="preserve">2026-09-10</w:t>
             </w:r>
           </w:p>
         </w:tc>
@@ -16934,7 +16934,7 @@
               <w:jc w:val="left"/>
             </w:pPr>
             <w:r>
-              <w:t xml:space="preserve">Modular pipeline refactoring: shared Lua filter factory, shared DOCX fix logic, build system auto-discovery, unified format pipeline, GitHub Actions CI.</w:t>
+              <w:t xml:space="preserve">Minor fixes: test-filter.sh auto-discovery, build.sh help text, Makefile aggregate descriptions, 5-section comment correction, CHANGELOG version gap note, callout-in-code fix, CI font auto-discovery, dofile path comment, test-sync.sh header.</w:t>
             </w:r>
           </w:p>
         </w:tc>
@@ -16949,7 +16949,7 @@
               <w:jc w:val="left"/>
             </w:pPr>
             <w:r>
-              <w:t xml:space="preserve">2.16.0</w:t>
+              <w:t xml:space="preserve">3.0.0</w:t>
             </w:r>
           </w:p>
         </w:tc>
@@ -16962,7 +16962,7 @@
               <w:jc w:val="left"/>
             </w:pPr>
             <w:r>
-              <w:t xml:space="preserve">2026-09-05</w:t>
+              <w:t xml:space="preserve">2026-09-09</w:t>
             </w:r>
           </w:p>
         </w:tc>
@@ -16979,7 +16979,7 @@
               <w:jc w:val="left"/>
             </w:pPr>
             <w:r>
-              <w:t xml:space="preserve">Updated to match template v2.16.0 — Lua filter fixes, build system updates, and technical template parity improvements.</w:t>
+              <w:t xml:space="preserve">Modular pipeline refactoring: shared Lua filter factory, shared DOCX fix logic, build system auto-discovery, unified format pipeline, GitHub Actions CI.</w:t>
             </w:r>
           </w:p>
         </w:tc>
@@ -16992,18 +16992,18 @@
               <w:jc w:val="left"/>
             </w:pPr>
             <w:r>
-              <w:t xml:space="preserve">2.13.0</w:t>
-            </w:r>
-          </w:p>
-        </w:tc>
-        <w:tc>
-          <w:tcPr/>
-          <w:p>
-            <w:pPr>
-              <w:jc w:val="left"/>
-            </w:pPr>
-            <w:r>
-              <w:t xml:space="preserve">2026-08-24</w:t>
+              <w:t xml:space="preserve">2.16.0</w:t>
+            </w:r>
+          </w:p>
+        </w:tc>
+        <w:tc>
+          <w:tcPr/>
+          <w:p>
+            <w:pPr>
+              <w:jc w:val="left"/>
+            </w:pPr>
+            <w:r>
+              <w:t xml:space="preserve">2026-09-05</w:t>
             </w:r>
           </w:p>
         </w:tc>
@@ -17018,6 +17018,51 @@
               <w:jc w:val="left"/>
             </w:pPr>
             <w:r>
+              <w:t xml:space="preserve">Updated to match template v2.16.0 — Lua filter fixes, build system updates, and technical template parity improvements.</w:t>
+            </w:r>
+          </w:p>
+        </w:tc>
+      </w:tr>
+      <w:tr>
+        <w:tc>
+          <w:tcPr>
+            <w:shd w:val="clear" w:color="auto" w:fill="F6F8FA"/>
+          </w:tcPr>
+          <w:p>
+            <w:pPr>
+              <w:jc w:val="left"/>
+            </w:pPr>
+            <w:r>
+              <w:t xml:space="preserve">2.13.0</w:t>
+            </w:r>
+          </w:p>
+        </w:tc>
+        <w:tc>
+          <w:tcPr>
+            <w:shd w:val="clear" w:color="auto" w:fill="F6F8FA"/>
+          </w:tcPr>
+          <w:p>
+            <w:pPr>
+              <w:jc w:val="left"/>
+            </w:pPr>
+            <w:r>
+              <w:t xml:space="preserve">2026-08-24</w:t>
+            </w:r>
+          </w:p>
+        </w:tc>
+        <w:tc>
+          <w:tcPr>
+            <w:shd w:val="clear" w:color="auto" w:fill="F6F8FA"/>
+          </w:tcPr>
+          <w:p>
+            <w:pPr>
+              <w:numPr>
+                <w:ilvl w:val="0"/>
+                <w:numId w:val="1097"/>
+              </w:numPr>
+              <w:jc w:val="left"/>
+            </w:pPr>
+            <w:r>
               <w:t xml:space="preserve">Foundation refactoring Phase 4: make DOCX</w:t>
             </w:r>
             <w:r>
@@ -17085,9 +17130,7 @@
       </w:tr>
       <w:tr>
         <w:tc>
-          <w:tcPr>
-            <w:shd w:val="clear" w:color="auto" w:fill="F6F8FA"/>
-          </w:tcPr>
+          <w:tcPr/>
           <w:p>
             <w:pPr>
               <w:jc w:val="left"/>
@@ -17098,9 +17141,7 @@
           </w:p>
         </w:tc>
         <w:tc>
-          <w:tcPr>
-            <w:shd w:val="clear" w:color="auto" w:fill="F6F8FA"/>
-          </w:tcPr>
+          <w:tcPr/>
           <w:p>
             <w:pPr>
               <w:jc w:val="left"/>
@@ -17111,14 +17152,12 @@
           </w:p>
         </w:tc>
         <w:tc>
-          <w:tcPr>
-            <w:shd w:val="clear" w:color="auto" w:fill="F6F8FA"/>
-          </w:tcPr>
+          <w:tcPr/>
           <w:p>
             <w:pPr>
               <w:numPr>
                 <w:ilvl w:val="0"/>
-                <w:numId w:val="1097"/>
+                <w:numId w:val="1098"/>
               </w:numPr>
               <w:jc w:val="left"/>
             </w:pPr>
@@ -17280,7 +17319,9 @@
       </w:tr>
       <w:tr>
         <w:tc>
-          <w:tcPr/>
+          <w:tcPr>
+            <w:shd w:val="clear" w:color="auto" w:fill="F6F8FA"/>
+          </w:tcPr>
           <w:p>
             <w:pPr>
               <w:jc w:val="left"/>
@@ -17291,7 +17332,9 @@
           </w:p>
         </w:tc>
         <w:tc>
-          <w:tcPr/>
+          <w:tcPr>
+            <w:shd w:val="clear" w:color="auto" w:fill="F6F8FA"/>
+          </w:tcPr>
           <w:p>
             <w:pPr>
               <w:jc w:val="left"/>
@@ -17302,12 +17345,14 @@
           </w:p>
         </w:tc>
         <w:tc>
-          <w:tcPr/>
+          <w:tcPr>
+            <w:shd w:val="clear" w:color="auto" w:fill="F6F8FA"/>
+          </w:tcPr>
           <w:p>
             <w:pPr>
               <w:numPr>
                 <w:ilvl w:val="0"/>
-                <w:numId w:val="1098"/>
+                <w:numId w:val="1099"/>
               </w:numPr>
               <w:jc w:val="left"/>
             </w:pPr>
@@ -17373,9 +17418,7 @@
       </w:tr>
       <w:tr>
         <w:tc>
-          <w:tcPr>
-            <w:shd w:val="clear" w:color="auto" w:fill="F6F8FA"/>
-          </w:tcPr>
+          <w:tcPr/>
           <w:p>
             <w:pPr>
               <w:jc w:val="left"/>
@@ -17386,56 +17429,13 @@
           </w:p>
         </w:tc>
         <w:tc>
-          <w:tcPr>
-            <w:shd w:val="clear" w:color="auto" w:fill="F6F8FA"/>
-          </w:tcPr>
+          <w:tcPr/>
           <w:p>
             <w:pPr>
               <w:jc w:val="left"/>
             </w:pPr>
             <w:r>
               <w:t xml:space="preserve">2026-08-24</w:t>
-            </w:r>
-          </w:p>
-        </w:tc>
-        <w:tc>
-          <w:tcPr>
-            <w:shd w:val="clear" w:color="auto" w:fill="F6F8FA"/>
-          </w:tcPr>
-          <w:p>
-            <w:pPr>
-              <w:numPr>
-                <w:ilvl w:val="0"/>
-                <w:numId w:val="1099"/>
-              </w:numPr>
-              <w:jc w:val="left"/>
-            </w:pPr>
-            <w:r>
-              <w:t xml:space="preserve">Foundation refactoring Phase 1: sync cls version to project tag, fix stale doc references (L16 output count, L-range, setup-guide feature claim), add test-sync.sh for version consistency checking.</w:t>
-            </w:r>
-          </w:p>
-        </w:tc>
-      </w:tr>
-      <w:tr>
-        <w:tc>
-          <w:tcPr/>
-          <w:p>
-            <w:pPr>
-              <w:jc w:val="left"/>
-            </w:pPr>
-            <w:r>
-              <w:t xml:space="preserve">2.9.1</w:t>
-            </w:r>
-          </w:p>
-        </w:tc>
-        <w:tc>
-          <w:tcPr/>
-          <w:p>
-            <w:pPr>
-              <w:jc w:val="left"/>
-            </w:pPr>
-            <w:r>
-              <w:t xml:space="preserve">2026-08-23</w:t>
             </w:r>
           </w:p>
         </w:tc>
@@ -17450,6 +17450,51 @@
               <w:jc w:val="left"/>
             </w:pPr>
             <w:r>
+              <w:t xml:space="preserve">Foundation refactoring Phase 1: sync cls version to project tag, fix stale doc references (L16 output count, L-range, setup-guide feature claim), add test-sync.sh for version consistency checking.</w:t>
+            </w:r>
+          </w:p>
+        </w:tc>
+      </w:tr>
+      <w:tr>
+        <w:tc>
+          <w:tcPr>
+            <w:shd w:val="clear" w:color="auto" w:fill="F6F8FA"/>
+          </w:tcPr>
+          <w:p>
+            <w:pPr>
+              <w:jc w:val="left"/>
+            </w:pPr>
+            <w:r>
+              <w:t xml:space="preserve">2.9.1</w:t>
+            </w:r>
+          </w:p>
+        </w:tc>
+        <w:tc>
+          <w:tcPr>
+            <w:shd w:val="clear" w:color="auto" w:fill="F6F8FA"/>
+          </w:tcPr>
+          <w:p>
+            <w:pPr>
+              <w:jc w:val="left"/>
+            </w:pPr>
+            <w:r>
+              <w:t xml:space="preserve">2026-08-23</w:t>
+            </w:r>
+          </w:p>
+        </w:tc>
+        <w:tc>
+          <w:tcPr>
+            <w:shd w:val="clear" w:color="auto" w:fill="F6F8FA"/>
+          </w:tcPr>
+          <w:p>
+            <w:pPr>
+              <w:numPr>
+                <w:ilvl w:val="0"/>
+                <w:numId w:val="1101"/>
+              </w:numPr>
+              <w:jc w:val="left"/>
+            </w:pPr>
+            <w:r>
               <w:t xml:space="preserve">HTML and Markdown outputs now embed images as base64 data URIs. HTML uses pandoc</w:t>
             </w:r>
             <w:r>
@@ -17481,58 +17526,13 @@
       </w:tr>
       <w:tr>
         <w:tc>
-          <w:tcPr>
-            <w:shd w:val="clear" w:color="auto" w:fill="F6F8FA"/>
-          </w:tcPr>
+          <w:tcPr/>
           <w:p>
             <w:pPr>
               <w:jc w:val="left"/>
             </w:pPr>
             <w:r>
               <w:t xml:space="preserve">2.9.0</w:t>
-            </w:r>
-          </w:p>
-        </w:tc>
-        <w:tc>
-          <w:tcPr>
-            <w:shd w:val="clear" w:color="auto" w:fill="F6F8FA"/>
-          </w:tcPr>
-          <w:p>
-            <w:pPr>
-              <w:jc w:val="left"/>
-            </w:pPr>
-            <w:r>
-              <w:t xml:space="preserve">2026-08-23</w:t>
-            </w:r>
-          </w:p>
-        </w:tc>
-        <w:tc>
-          <w:tcPr>
-            <w:shd w:val="clear" w:color="auto" w:fill="F6F8FA"/>
-          </w:tcPr>
-          <w:p>
-            <w:pPr>
-              <w:numPr>
-                <w:ilvl w:val="0"/>
-                <w:numId w:val="1101"/>
-              </w:numPr>
-              <w:jc w:val="left"/>
-            </w:pPr>
-            <w:r>
-              <w:t xml:space="preserve">DOCX: fix content width (8504→9638tw, margins are 2cm not 3cm). Add footer page numbers. Style TOC heading (22pt bold + rule). Add hutable table width + fixed layout.</w:t>
-            </w:r>
-          </w:p>
-        </w:tc>
-      </w:tr>
-      <w:tr>
-        <w:tc>
-          <w:tcPr/>
-          <w:p>
-            <w:pPr>
-              <w:jc w:val="left"/>
-            </w:pPr>
-            <w:r>
-              <w:t xml:space="preserve">2.8.3</w:t>
             </w:r>
           </w:p>
         </w:tc>
@@ -17558,7 +17558,7 @@
               <w:jc w:val="left"/>
             </w:pPr>
             <w:r>
-              <w:t xml:space="preserve">DOCX fix: callout tables now have explicit width (8504tw) and fixed layout. Changelog section heading now uses custom H1 format (56pt number, red border, right tab) instead of pandoc’s default.</w:t>
+              <w:t xml:space="preserve">DOCX: fix content width (8504→9638tw, margins are 2cm not 3cm). Add footer page numbers. Style TOC heading (22pt bold + rule). Add hutable table width + fixed layout.</w:t>
             </w:r>
           </w:p>
         </w:tc>
@@ -17573,7 +17573,7 @@
               <w:jc w:val="left"/>
             </w:pPr>
             <w:r>
-              <w:t xml:space="preserve">2.8.2</w:t>
+              <w:t xml:space="preserve">2.8.3</w:t>
             </w:r>
           </w:p>
         </w:tc>
@@ -17603,7 +17603,7 @@
               <w:jc w:val="left"/>
             </w:pPr>
             <w:r>
-              <w:t xml:space="preserve">DOCX H1 heading: reverted table approach to paragraph with tab stop + red bottom border. Table broke navigation pane and TOC field. Paragraph preserves Heading1 style for navigation while matching PDF layout (number left, title right, red rule below).</w:t>
+              <w:t xml:space="preserve">DOCX fix: callout tables now have explicit width (8504tw) and fixed layout. Changelog section heading now uses custom H1 format (56pt number, red border, right tab) instead of pandoc’s default.</w:t>
             </w:r>
           </w:p>
         </w:tc>
@@ -17616,7 +17616,7 @@
               <w:jc w:val="left"/>
             </w:pPr>
             <w:r>
-              <w:t xml:space="preserve">2.8.1</w:t>
+              <w:t xml:space="preserve">2.8.2</w:t>
             </w:r>
           </w:p>
         </w:tc>
@@ -17642,7 +17642,7 @@
               <w:jc w:val="left"/>
             </w:pPr>
             <w:r>
-              <w:t xml:space="preserve">DOCX heading fix: text color reverted to black (was incorrectly changed to Huawei red in v2.8.0). H1 now uses a two-column table (number left, title right) with red bottom rule. H2-H4 use simple inline format (number + title, no right tab stop).</w:t>
+              <w:t xml:space="preserve">DOCX H1 heading: reverted table approach to paragraph with tab stop + red bottom border. Table broke navigation pane and TOC field. Paragraph preserves Heading1 style for navigation while matching PDF layout (number left, title right, red rule below).</w:t>
             </w:r>
           </w:p>
         </w:tc>
@@ -17657,7 +17657,7 @@
               <w:jc w:val="left"/>
             </w:pPr>
             <w:r>
-              <w:t xml:space="preserve">2.8.0</w:t>
+              <w:t xml:space="preserve">2.8.1</w:t>
             </w:r>
           </w:p>
         </w:tc>
@@ -17687,7 +17687,7 @@
               <w:jc w:val="left"/>
             </w:pPr>
             <w:r>
-              <w:t xml:space="preserve">DOCX output: match PDF styling --- heading colors (Huawei red), H1 number size (56pt), callout borders (left-only) and padding, changelog formatting (rules, bold version, italic date), caption style (9pt bold), badge style (8pt bold white on red), list indentation.</w:t>
+              <w:t xml:space="preserve">DOCX heading fix: text color reverted to black (was incorrectly changed to Huawei red in v2.8.0). H1 now uses a two-column table (number left, title right) with red bottom rule. H2-H4 use simple inline format (number + title, no right tab stop).</w:t>
             </w:r>
           </w:p>
         </w:tc>
@@ -17700,18 +17700,18 @@
               <w:jc w:val="left"/>
             </w:pPr>
             <w:r>
-              <w:t xml:space="preserve">2.7.1</w:t>
-            </w:r>
-          </w:p>
-        </w:tc>
-        <w:tc>
-          <w:tcPr/>
-          <w:p>
-            <w:pPr>
-              <w:jc w:val="left"/>
-            </w:pPr>
-            <w:r>
-              <w:t xml:space="preserve">2026-08-17</w:t>
+              <w:t xml:space="preserve">2.8.0</w:t>
+            </w:r>
+          </w:p>
+        </w:tc>
+        <w:tc>
+          <w:tcPr/>
+          <w:p>
+            <w:pPr>
+              <w:jc w:val="left"/>
+            </w:pPr>
+            <w:r>
+              <w:t xml:space="preserve">2026-08-23</w:t>
             </w:r>
           </w:p>
         </w:tc>
@@ -17726,6 +17726,51 @@
               <w:jc w:val="left"/>
             </w:pPr>
             <w:r>
+              <w:t xml:space="preserve">DOCX output: match PDF styling --- heading colors (Huawei red), H1 number size (56pt), callout borders (left-only) and padding, changelog formatting (rules, bold version, italic date), caption style (9pt bold), badge style (8pt bold white on red), list indentation.</w:t>
+            </w:r>
+          </w:p>
+        </w:tc>
+      </w:tr>
+      <w:tr>
+        <w:tc>
+          <w:tcPr>
+            <w:shd w:val="clear" w:color="auto" w:fill="F6F8FA"/>
+          </w:tcPr>
+          <w:p>
+            <w:pPr>
+              <w:jc w:val="left"/>
+            </w:pPr>
+            <w:r>
+              <w:t xml:space="preserve">2.7.1</w:t>
+            </w:r>
+          </w:p>
+        </w:tc>
+        <w:tc>
+          <w:tcPr>
+            <w:shd w:val="clear" w:color="auto" w:fill="F6F8FA"/>
+          </w:tcPr>
+          <w:p>
+            <w:pPr>
+              <w:jc w:val="left"/>
+            </w:pPr>
+            <w:r>
+              <w:t xml:space="preserve">2026-08-17</w:t>
+            </w:r>
+          </w:p>
+        </w:tc>
+        <w:tc>
+          <w:tcPr>
+            <w:shd w:val="clear" w:color="auto" w:fill="F6F8FA"/>
+          </w:tcPr>
+          <w:p>
+            <w:pPr>
+              <w:numPr>
+                <w:ilvl w:val="0"/>
+                <w:numId w:val="1107"/>
+              </w:numPr>
+              <w:jc w:val="left"/>
+            </w:pPr>
+            <w:r>
               <w:t xml:space="preserve">Rename project repository to all lowercase (</w:t>
             </w:r>
             <w:r>
@@ -17742,9 +17787,7 @@
       </w:tr>
       <w:tr>
         <w:tc>
-          <w:tcPr>
-            <w:shd w:val="clear" w:color="auto" w:fill="F6F8FA"/>
-          </w:tcPr>
+          <w:tcPr/>
           <w:p>
             <w:pPr>
               <w:jc w:val="left"/>
@@ -17755,9 +17798,7 @@
           </w:p>
         </w:tc>
         <w:tc>
-          <w:tcPr>
-            <w:shd w:val="clear" w:color="auto" w:fill="F6F8FA"/>
-          </w:tcPr>
+          <w:tcPr/>
           <w:p>
             <w:pPr>
               <w:jc w:val="left"/>
@@ -17768,14 +17809,12 @@
           </w:p>
         </w:tc>
         <w:tc>
-          <w:tcPr>
-            <w:shd w:val="clear" w:color="auto" w:fill="F6F8FA"/>
-          </w:tcPr>
+          <w:tcPr/>
           <w:p>
             <w:pPr>
               <w:numPr>
                 <w:ilvl w:val="0"/>
-                <w:numId w:val="1107"/>
+                <w:numId w:val="1108"/>
               </w:numPr>
               <w:jc w:val="left"/>
             </w:pPr>
@@ -17817,7 +17856,9 @@
       </w:tr>
       <w:tr>
         <w:tc>
-          <w:tcPr/>
+          <w:tcPr>
+            <w:shd w:val="clear" w:color="auto" w:fill="F6F8FA"/>
+          </w:tcPr>
           <w:p>
             <w:pPr>
               <w:jc w:val="left"/>
@@ -17828,7 +17869,9 @@
           </w:p>
         </w:tc>
         <w:tc>
-          <w:tcPr/>
+          <w:tcPr>
+            <w:shd w:val="clear" w:color="auto" w:fill="F6F8FA"/>
+          </w:tcPr>
           <w:p>
             <w:pPr>
               <w:jc w:val="left"/>
@@ -17839,12 +17882,14 @@
           </w:p>
         </w:tc>
         <w:tc>
-          <w:tcPr/>
+          <w:tcPr>
+            <w:shd w:val="clear" w:color="auto" w:fill="F6F8FA"/>
+          </w:tcPr>
           <w:p>
             <w:pPr>
               <w:numPr>
                 <w:ilvl w:val="0"/>
-                <w:numId w:val="1108"/>
+                <w:numId w:val="1109"/>
               </w:numPr>
               <w:jc w:val="left"/>
             </w:pPr>
@@ -17901,9 +17946,7 @@
       </w:tr>
       <w:tr>
         <w:tc>
-          <w:tcPr>
-            <w:shd w:val="clear" w:color="auto" w:fill="F6F8FA"/>
-          </w:tcPr>
+          <w:tcPr/>
           <w:p>
             <w:pPr>
               <w:jc w:val="left"/>
@@ -17914,9 +17957,7 @@
           </w:p>
         </w:tc>
         <w:tc>
-          <w:tcPr>
-            <w:shd w:val="clear" w:color="auto" w:fill="F6F8FA"/>
-          </w:tcPr>
+          <w:tcPr/>
           <w:p>
             <w:pPr>
               <w:jc w:val="left"/>
@@ -17927,14 +17968,12 @@
           </w:p>
         </w:tc>
         <w:tc>
-          <w:tcPr>
-            <w:shd w:val="clear" w:color="auto" w:fill="F6F8FA"/>
-          </w:tcPr>
+          <w:tcPr/>
           <w:p>
             <w:pPr>
               <w:numPr>
                 <w:ilvl w:val="0"/>
-                <w:numId w:val="1109"/>
+                <w:numId w:val="1110"/>
               </w:numPr>
               <w:jc w:val="left"/>
             </w:pPr>
@@ -17961,7 +18000,7 @@
             <w:pPr>
               <w:numPr>
                 <w:ilvl w:val="0"/>
-                <w:numId w:val="1109"/>
+                <w:numId w:val="1110"/>
               </w:numPr>
               <w:jc w:val="left"/>
             </w:pPr>
@@ -17988,54 +18027,15 @@
       </w:tr>
       <w:tr>
         <w:tc>
-          <w:tcPr/>
+          <w:tcPr>
+            <w:shd w:val="clear" w:color="auto" w:fill="F6F8FA"/>
+          </w:tcPr>
           <w:p>
             <w:pPr>
               <w:jc w:val="left"/>
             </w:pPr>
             <w:r>
               <w:t xml:space="preserve">2.5.1</w:t>
-            </w:r>
-          </w:p>
-        </w:tc>
-        <w:tc>
-          <w:tcPr/>
-          <w:p>
-            <w:pPr>
-              <w:jc w:val="left"/>
-            </w:pPr>
-            <w:r>
-              <w:t xml:space="preserve">2026-08-10</w:t>
-            </w:r>
-          </w:p>
-        </w:tc>
-        <w:tc>
-          <w:tcPr/>
-          <w:p>
-            <w:pPr>
-              <w:numPr>
-                <w:ilvl w:val="0"/>
-                <w:numId w:val="1110"/>
-              </w:numPr>
-              <w:jc w:val="left"/>
-            </w:pPr>
-            <w:r>
-              <w:t xml:space="preserve">H1 section title size reduced from 27pt to 20pt.</w:t>
-            </w:r>
-          </w:p>
-        </w:tc>
-      </w:tr>
-      <w:tr>
-        <w:tc>
-          <w:tcPr>
-            <w:shd w:val="clear" w:color="auto" w:fill="F6F8FA"/>
-          </w:tcPr>
-          <w:p>
-            <w:pPr>
-              <w:jc w:val="left"/>
-            </w:pPr>
-            <w:r>
-              <w:t xml:space="preserve">2.5.0</w:t>
             </w:r>
           </w:p>
         </w:tc>
@@ -18065,13 +18065,7 @@
               <w:jc w:val="left"/>
             </w:pPr>
             <w:r>
-              <w:t xml:space="preserve">Default image size increased: width 65% → 90% of text width,</w:t>
-            </w:r>
-            <w:r>
-              <w:t xml:space="preserve"> </w:t>
-            </w:r>
-            <w:r>
-              <w:t xml:space="preserve">height 40% → 50% of text height.</w:t>
+              <w:t xml:space="preserve">H1 section title size reduced from 27pt to 20pt.</w:t>
             </w:r>
           </w:p>
         </w:tc>
@@ -18084,7 +18078,7 @@
               <w:jc w:val="left"/>
             </w:pPr>
             <w:r>
-              <w:t xml:space="preserve">2.4.0</w:t>
+              <w:t xml:space="preserve">2.5.0</w:t>
             </w:r>
           </w:p>
         </w:tc>
@@ -18110,14 +18104,65 @@
               <w:jc w:val="left"/>
             </w:pPr>
             <w:r>
-              <w:t xml:space="preserve">Enlarged H1 section title (18pt → 27pt, 50% bigger).</w:t>
-            </w:r>
-          </w:p>
+              <w:t xml:space="preserve">Default image size increased: width 65% → 90% of text width,</w:t>
+            </w:r>
+            <w:r>
+              <w:t xml:space="preserve"> </w:t>
+            </w:r>
+            <w:r>
+              <w:t xml:space="preserve">height 40% → 50% of text height.</w:t>
+            </w:r>
+          </w:p>
+        </w:tc>
+      </w:tr>
+      <w:tr>
+        <w:tc>
+          <w:tcPr>
+            <w:shd w:val="clear" w:color="auto" w:fill="F6F8FA"/>
+          </w:tcPr>
+          <w:p>
+            <w:pPr>
+              <w:jc w:val="left"/>
+            </w:pPr>
+            <w:r>
+              <w:t xml:space="preserve">2.4.0</w:t>
+            </w:r>
+          </w:p>
+        </w:tc>
+        <w:tc>
+          <w:tcPr>
+            <w:shd w:val="clear" w:color="auto" w:fill="F6F8FA"/>
+          </w:tcPr>
+          <w:p>
+            <w:pPr>
+              <w:jc w:val="left"/>
+            </w:pPr>
+            <w:r>
+              <w:t xml:space="preserve">2026-08-10</w:t>
+            </w:r>
+          </w:p>
+        </w:tc>
+        <w:tc>
+          <w:tcPr>
+            <w:shd w:val="clear" w:color="auto" w:fill="F6F8FA"/>
+          </w:tcPr>
           <w:p>
             <w:pPr>
               <w:numPr>
                 <w:ilvl w:val="0"/>
-                <w:numId w:val="1112"/>
+                <w:numId w:val="1113"/>
+              </w:numPr>
+              <w:jc w:val="left"/>
+            </w:pPr>
+            <w:r>
+              <w:t xml:space="preserve">Enlarged H1 section title (18pt → 27pt, 50% bigger).</w:t>
+            </w:r>
+          </w:p>
+          <w:p>
+            <w:pPr>
+              <w:numPr>
+                <w:ilvl w:val="0"/>
+                <w:numId w:val="1113"/>
               </w:numPr>
               <w:jc w:val="left"/>
             </w:pPr>
@@ -18144,9 +18189,7 @@
       </w:tr>
       <w:tr>
         <w:tc>
-          <w:tcPr>
-            <w:shd w:val="clear" w:color="auto" w:fill="F6F8FA"/>
-          </w:tcPr>
+          <w:tcPr/>
           <w:p>
             <w:pPr>
               <w:jc w:val="left"/>
@@ -18157,9 +18200,7 @@
           </w:p>
         </w:tc>
         <w:tc>
-          <w:tcPr>
-            <w:shd w:val="clear" w:color="auto" w:fill="F6F8FA"/>
-          </w:tcPr>
+          <w:tcPr/>
           <w:p>
             <w:pPr>
               <w:jc w:val="left"/>
@@ -18170,14 +18211,12 @@
           </w:p>
         </w:tc>
         <w:tc>
-          <w:tcPr>
-            <w:shd w:val="clear" w:color="auto" w:fill="F6F8FA"/>
-          </w:tcPr>
+          <w:tcPr/>
           <w:p>
             <w:pPr>
               <w:numPr>
                 <w:ilvl w:val="0"/>
-                <w:numId w:val="1113"/>
+                <w:numId w:val="1114"/>
               </w:numPr>
               <w:jc w:val="left"/>
             </w:pPr>
@@ -18204,7 +18243,9 @@
       </w:tr>
       <w:tr>
         <w:tc>
-          <w:tcPr/>
+          <w:tcPr>
+            <w:shd w:val="clear" w:color="auto" w:fill="F6F8FA"/>
+          </w:tcPr>
           <w:p>
             <w:pPr>
               <w:jc w:val="left"/>
@@ -18215,7 +18256,9 @@
           </w:p>
         </w:tc>
         <w:tc>
-          <w:tcPr/>
+          <w:tcPr>
+            <w:shd w:val="clear" w:color="auto" w:fill="F6F8FA"/>
+          </w:tcPr>
           <w:p>
             <w:pPr>
               <w:jc w:val="left"/>
@@ -18226,12 +18269,14 @@
           </w:p>
         </w:tc>
         <w:tc>
-          <w:tcPr/>
+          <w:tcPr>
+            <w:shd w:val="clear" w:color="auto" w:fill="F6F8FA"/>
+          </w:tcPr>
           <w:p>
             <w:pPr>
               <w:numPr>
                 <w:ilvl w:val="0"/>
-                <w:numId w:val="1114"/>
+                <w:numId w:val="1115"/>
               </w:numPr>
               <w:jc w:val="left"/>
             </w:pPr>
@@ -18303,9 +18348,7 @@
       </w:tr>
       <w:tr>
         <w:tc>
-          <w:tcPr>
-            <w:shd w:val="clear" w:color="auto" w:fill="F6F8FA"/>
-          </w:tcPr>
+          <w:tcPr/>
           <w:p>
             <w:pPr>
               <w:jc w:val="left"/>
@@ -18316,9 +18359,7 @@
           </w:p>
         </w:tc>
         <w:tc>
-          <w:tcPr>
-            <w:shd w:val="clear" w:color="auto" w:fill="F6F8FA"/>
-          </w:tcPr>
+          <w:tcPr/>
           <w:p>
             <w:pPr>
               <w:jc w:val="left"/>
@@ -18329,14 +18370,12 @@
           </w:p>
         </w:tc>
         <w:tc>
-          <w:tcPr>
-            <w:shd w:val="clear" w:color="auto" w:fill="F6F8FA"/>
-          </w:tcPr>
+          <w:tcPr/>
           <w:p>
             <w:pPr>
               <w:numPr>
                 <w:ilvl w:val="0"/>
-                <w:numId w:val="1115"/>
+                <w:numId w:val="1116"/>
               </w:numPr>
               <w:jc w:val="left"/>
             </w:pPr>
@@ -18393,7 +18432,9 @@
       </w:tr>
       <w:tr>
         <w:tc>
-          <w:tcPr/>
+          <w:tcPr>
+            <w:shd w:val="clear" w:color="auto" w:fill="F6F8FA"/>
+          </w:tcPr>
           <w:p>
             <w:pPr>
               <w:jc w:val="left"/>
@@ -18404,7 +18445,9 @@
           </w:p>
         </w:tc>
         <w:tc>
-          <w:tcPr/>
+          <w:tcPr>
+            <w:shd w:val="clear" w:color="auto" w:fill="F6F8FA"/>
+          </w:tcPr>
           <w:p>
             <w:pPr>
               <w:jc w:val="left"/>
@@ -18415,12 +18458,14 @@
           </w:p>
         </w:tc>
         <w:tc>
-          <w:tcPr/>
+          <w:tcPr>
+            <w:shd w:val="clear" w:color="auto" w:fill="F6F8FA"/>
+          </w:tcPr>
           <w:p>
             <w:pPr>
               <w:numPr>
                 <w:ilvl w:val="0"/>
-                <w:numId w:val="1116"/>
+                <w:numId w:val="1117"/>
               </w:numPr>
               <w:jc w:val="left"/>
             </w:pPr>
@@ -18447,58 +18492,13 @@
       </w:tr>
       <w:tr>
         <w:tc>
-          <w:tcPr>
-            <w:shd w:val="clear" w:color="auto" w:fill="F6F8FA"/>
-          </w:tcPr>
+          <w:tcPr/>
           <w:p>
             <w:pPr>
               <w:jc w:val="left"/>
             </w:pPr>
             <w:r>
               <w:t xml:space="preserve">2.2.2</w:t>
-            </w:r>
-          </w:p>
-        </w:tc>
-        <w:tc>
-          <w:tcPr>
-            <w:shd w:val="clear" w:color="auto" w:fill="F6F8FA"/>
-          </w:tcPr>
-          <w:p>
-            <w:pPr>
-              <w:jc w:val="left"/>
-            </w:pPr>
-            <w:r>
-              <w:t xml:space="preserve">2026-08-08</w:t>
-            </w:r>
-          </w:p>
-        </w:tc>
-        <w:tc>
-          <w:tcPr>
-            <w:shd w:val="clear" w:color="auto" w:fill="F6F8FA"/>
-          </w:tcPr>
-          <w:p>
-            <w:pPr>
-              <w:numPr>
-                <w:ilvl w:val="0"/>
-                <w:numId w:val="1117"/>
-              </w:numPr>
-              <w:jc w:val="left"/>
-            </w:pPr>
-            <w:r>
-              <w:t xml:space="preserve">Fixed chapter reference in prerequisite (Chapter 3 → Chapter 4).</w:t>
-            </w:r>
-          </w:p>
-        </w:tc>
-      </w:tr>
-      <w:tr>
-        <w:tc>
-          <w:tcPr/>
-          <w:p>
-            <w:pPr>
-              <w:jc w:val="left"/>
-            </w:pPr>
-            <w:r>
-              <w:t xml:space="preserve">2.2.1</w:t>
             </w:r>
           </w:p>
         </w:tc>
@@ -18524,7 +18524,7 @@
               <w:jc w:val="left"/>
             </w:pPr>
             <w:r>
-              <w:t xml:space="preserve">Changed table and figure caption labels to black (was Huawei red).</w:t>
+              <w:t xml:space="preserve">Fixed chapter reference in prerequisite (Chapter 3 → Chapter 4).</w:t>
             </w:r>
           </w:p>
         </w:tc>
@@ -18539,7 +18539,7 @@
               <w:jc w:val="left"/>
             </w:pPr>
             <w:r>
-              <w:t xml:space="preserve">2.2.0</w:t>
+              <w:t xml:space="preserve">2.2.1</w:t>
             </w:r>
           </w:p>
         </w:tc>
@@ -18569,13 +18569,7 @@
               <w:jc w:val="left"/>
             </w:pPr>
             <w:r>
-              <w:t xml:space="preserve">Added Huawei-branded table styling: red header bar, alternating row</w:t>
-            </w:r>
-            <w:r>
-              <w:t xml:space="preserve"> </w:t>
-            </w:r>
-            <w:r>
-              <w:t xml:space="preserve">colors, and bordered cells.</w:t>
+              <w:t xml:space="preserve">Changed table and figure caption labels to black (was Huawei red).</w:t>
             </w:r>
           </w:p>
         </w:tc>
@@ -18588,18 +18582,18 @@
               <w:jc w:val="left"/>
             </w:pPr>
             <w:r>
-              <w:t xml:space="preserve">2.1.0</w:t>
-            </w:r>
-          </w:p>
-        </w:tc>
-        <w:tc>
-          <w:tcPr/>
-          <w:p>
-            <w:pPr>
-              <w:jc w:val="left"/>
-            </w:pPr>
-            <w:r>
-              <w:t xml:space="preserve">2026-08-06</w:t>
+              <w:t xml:space="preserve">2.2.0</w:t>
+            </w:r>
+          </w:p>
+        </w:tc>
+        <w:tc>
+          <w:tcPr/>
+          <w:p>
+            <w:pPr>
+              <w:jc w:val="left"/>
+            </w:pPr>
+            <w:r>
+              <w:t xml:space="preserve">2026-08-08</w:t>
             </w:r>
           </w:p>
         </w:tc>
@@ -18614,6 +18608,57 @@
               <w:jc w:val="left"/>
             </w:pPr>
             <w:r>
+              <w:t xml:space="preserve">Added Huawei-branded table styling: red header bar, alternating row</w:t>
+            </w:r>
+            <w:r>
+              <w:t xml:space="preserve"> </w:t>
+            </w:r>
+            <w:r>
+              <w:t xml:space="preserve">colors, and bordered cells.</w:t>
+            </w:r>
+          </w:p>
+        </w:tc>
+      </w:tr>
+      <w:tr>
+        <w:tc>
+          <w:tcPr>
+            <w:shd w:val="clear" w:color="auto" w:fill="F6F8FA"/>
+          </w:tcPr>
+          <w:p>
+            <w:pPr>
+              <w:jc w:val="left"/>
+            </w:pPr>
+            <w:r>
+              <w:t xml:space="preserve">2.1.0</w:t>
+            </w:r>
+          </w:p>
+        </w:tc>
+        <w:tc>
+          <w:tcPr>
+            <w:shd w:val="clear" w:color="auto" w:fill="F6F8FA"/>
+          </w:tcPr>
+          <w:p>
+            <w:pPr>
+              <w:jc w:val="left"/>
+            </w:pPr>
+            <w:r>
+              <w:t xml:space="preserve">2026-08-06</w:t>
+            </w:r>
+          </w:p>
+        </w:tc>
+        <w:tc>
+          <w:tcPr>
+            <w:shd w:val="clear" w:color="auto" w:fill="F6F8FA"/>
+          </w:tcPr>
+          <w:p>
+            <w:pPr>
+              <w:numPr>
+                <w:ilvl w:val="0"/>
+                <w:numId w:val="1121"/>
+              </w:numPr>
+              <w:jc w:val="left"/>
+            </w:pPr>
+            <w:r>
               <w:t xml:space="preserve">Updated ECS flavor to</w:t>
             </w:r>
             <w:r>
@@ -18636,7 +18681,7 @@
             <w:pPr>
               <w:numPr>
                 <w:ilvl w:val="0"/>
-                <w:numId w:val="1120"/>
+                <w:numId w:val="1121"/>
               </w:numPr>
               <w:jc w:val="left"/>
             </w:pPr>
@@ -18648,7 +18693,7 @@
             <w:pPr>
               <w:numPr>
                 <w:ilvl w:val="0"/>
-                <w:numId w:val="1120"/>
+                <w:numId w:val="1121"/>
               </w:numPr>
               <w:jc w:val="left"/>
             </w:pPr>
@@ -18660,7 +18705,7 @@
             <w:pPr>
               <w:numPr>
                 <w:ilvl w:val="0"/>
-                <w:numId w:val="1120"/>
+                <w:numId w:val="1121"/>
               </w:numPr>
               <w:jc w:val="left"/>
             </w:pPr>
@@ -18672,7 +18717,7 @@
             <w:pPr>
               <w:numPr>
                 <w:ilvl w:val="0"/>
-                <w:numId w:val="1120"/>
+                <w:numId w:val="1121"/>
               </w:numPr>
               <w:jc w:val="left"/>
             </w:pPr>
@@ -18684,7 +18729,7 @@
             <w:pPr>
               <w:numPr>
                 <w:ilvl w:val="0"/>
-                <w:numId w:val="1120"/>
+                <w:numId w:val="1121"/>
               </w:numPr>
               <w:jc w:val="left"/>
             </w:pPr>
@@ -18702,7 +18747,7 @@
             <w:pPr>
               <w:numPr>
                 <w:ilvl w:val="0"/>
-                <w:numId w:val="1120"/>
+                <w:numId w:val="1121"/>
               </w:numPr>
               <w:jc w:val="left"/>
             </w:pPr>
@@ -18751,7 +18796,7 @@
             <w:pPr>
               <w:numPr>
                 <w:ilvl w:val="0"/>
-                <w:numId w:val="1120"/>
+                <w:numId w:val="1121"/>
               </w:numPr>
               <w:jc w:val="left"/>
             </w:pPr>
@@ -18763,7 +18808,7 @@
             <w:pPr>
               <w:numPr>
                 <w:ilvl w:val="0"/>
-                <w:numId w:val="1120"/>
+                <w:numId w:val="1121"/>
               </w:numPr>
               <w:jc w:val="left"/>
             </w:pPr>
@@ -18814,7 +18859,7 @@
             <w:pPr>
               <w:numPr>
                 <w:ilvl w:val="0"/>
-                <w:numId w:val="1120"/>
+                <w:numId w:val="1121"/>
               </w:numPr>
               <w:jc w:val="left"/>
             </w:pPr>
@@ -18841,9 +18886,7 @@
       </w:tr>
       <w:tr>
         <w:tc>
-          <w:tcPr>
-            <w:shd w:val="clear" w:color="auto" w:fill="F6F8FA"/>
-          </w:tcPr>
+          <w:tcPr/>
           <w:p>
             <w:pPr>
               <w:jc w:val="left"/>
@@ -18854,9 +18897,7 @@
           </w:p>
         </w:tc>
         <w:tc>
-          <w:tcPr>
-            <w:shd w:val="clear" w:color="auto" w:fill="F6F8FA"/>
-          </w:tcPr>
+          <w:tcPr/>
           <w:p>
             <w:pPr>
               <w:jc w:val="left"/>
@@ -18867,14 +18908,12 @@
           </w:p>
         </w:tc>
         <w:tc>
-          <w:tcPr>
-            <w:shd w:val="clear" w:color="auto" w:fill="F6F8FA"/>
-          </w:tcPr>
+          <w:tcPr/>
           <w:p>
             <w:pPr>
               <w:numPr>
                 <w:ilvl w:val="0"/>
-                <w:numId w:val="1121"/>
+                <w:numId w:val="1122"/>
               </w:numPr>
               <w:jc w:val="left"/>
             </w:pPr>
@@ -18892,7 +18931,7 @@
             <w:pPr>
               <w:numPr>
                 <w:ilvl w:val="0"/>
-                <w:numId w:val="1121"/>
+                <w:numId w:val="1122"/>
               </w:numPr>
               <w:jc w:val="left"/>
             </w:pPr>
@@ -18946,7 +18985,7 @@
             <w:pPr>
               <w:numPr>
                 <w:ilvl w:val="0"/>
-                <w:numId w:val="1121"/>
+                <w:numId w:val="1122"/>
               </w:numPr>
               <w:jc w:val="left"/>
             </w:pPr>
@@ -18994,7 +19033,7 @@
             <w:pPr>
               <w:numPr>
                 <w:ilvl w:val="0"/>
-                <w:numId w:val="1121"/>
+                <w:numId w:val="1122"/>
               </w:numPr>
               <w:jc w:val="left"/>
             </w:pPr>
@@ -19015,7 +19054,9 @@
       </w:tr>
       <w:tr>
         <w:tc>
-          <w:tcPr/>
+          <w:tcPr>
+            <w:shd w:val="clear" w:color="auto" w:fill="F6F8FA"/>
+          </w:tcPr>
           <w:p>
             <w:pPr>
               <w:jc w:val="left"/>
@@ -19026,7 +19067,9 @@
           </w:p>
         </w:tc>
         <w:tc>
-          <w:tcPr/>
+          <w:tcPr>
+            <w:shd w:val="clear" w:color="auto" w:fill="F6F8FA"/>
+          </w:tcPr>
           <w:p>
             <w:pPr>
               <w:jc w:val="left"/>
@@ -19037,12 +19080,14 @@
           </w:p>
         </w:tc>
         <w:tc>
-          <w:tcPr/>
+          <w:tcPr>
+            <w:shd w:val="clear" w:color="auto" w:fill="F6F8FA"/>
+          </w:tcPr>
           <w:p>
             <w:pPr>
               <w:numPr>
                 <w:ilvl w:val="0"/>
-                <w:numId w:val="1122"/>
+                <w:numId w:val="1123"/>
               </w:numPr>
               <w:jc w:val="left"/>
             </w:pPr>
@@ -19054,7 +19099,7 @@
             <w:pPr>
               <w:numPr>
                 <w:ilvl w:val="0"/>
-                <w:numId w:val="1122"/>
+                <w:numId w:val="1123"/>
               </w:numPr>
               <w:jc w:val="left"/>
             </w:pPr>
@@ -19066,7 +19111,7 @@
             <w:pPr>
               <w:numPr>
                 <w:ilvl w:val="0"/>
-                <w:numId w:val="1122"/>
+                <w:numId w:val="1123"/>
               </w:numPr>
               <w:jc w:val="left"/>
             </w:pPr>
@@ -19078,7 +19123,7 @@
             <w:pPr>
               <w:numPr>
                 <w:ilvl w:val="0"/>
-                <w:numId w:val="1122"/>
+                <w:numId w:val="1123"/>
               </w:numPr>
               <w:jc w:val="left"/>
             </w:pPr>
@@ -19096,7 +19141,7 @@
             <w:pPr>
               <w:numPr>
                 <w:ilvl w:val="0"/>
-                <w:numId w:val="1122"/>
+                <w:numId w:val="1123"/>
               </w:numPr>
               <w:jc w:val="left"/>
             </w:pPr>
@@ -19108,7 +19153,7 @@
             <w:pPr>
               <w:numPr>
                 <w:ilvl w:val="0"/>
-                <w:numId w:val="1122"/>
+                <w:numId w:val="1123"/>
               </w:numPr>
               <w:jc w:val="left"/>
             </w:pPr>
@@ -20519,6 +20564,9 @@
     <w:abstractNumId w:val="991"/>
   </w:num>
   <w:num w:numId="1122">
+    <w:abstractNumId w:val="991"/>
+  </w:num>
+  <w:num w:numId="1123">
     <w:abstractNumId w:val="991"/>
   </w:num>
 </w:numbering>
@@ -21420,18 +21468,6 @@
       <w:szCs w:val="16"/>
     </w:rPr>
   </w:style>
-  <w:style w:type="character" w:styleId="BadgeBlocked">
-    <w:name w:val="BadgeBlocked"/>
-    <w:uiPriority w:val="99"/>
-    <w:rPr>
-      <w:rFonts w:ascii="HarmonyOS Sans" w:hAnsi="HarmonyOS Sans"/>
-      <w:b/>
-      <w:color w:val="000000"/>
-      <w:shd w:val="clear" w:color="auto" w:fill="FFF3E0"/>
-      <w:sz w:val="16"/>
-      <w:szCs w:val="16"/>
-    </w:rPr>
-  </w:style>
   <w:style w:type="character" w:styleId="BadgeUntested">
     <w:name w:val="BadgeUntested"/>
     <w:uiPriority w:val="99"/>

</xml_diff>

<commit_message>
Fix converter content loss, restore covers, align HTML (v6.14.0)
- Converter: compound admonitions, dlist definitions, colspan
  (\multicolumn), block anchors, technical cover setters hoisted
- LaTeX: \ifdefempty replaces broken \ifx empty tests (10 sites)
- HTML: double captions eliminated; EN admonition titles match PDF;
  technical sections as language-aware headings in DOCX/MD/HTML
- Build: font-fallback grep fixed; install.sh installs
  asciidoctor-diagram + warns on missing mermaid-cli
- Round-trip: exact like-for-like heading checks (72 -> 99 checks)
- Samples: guide-pt/en 3.7.0 demonstrate colspan; SKILL.mds document
  span support
- Tests: converter 201, preprocessor 173
</commit_message>
<xml_diff>
--- a/documents/setup-guide/setup-guide.docx
+++ b/documents/setup-guide/setup-guide.docx
@@ -84,7 +84,7 @@
           <w:b/>
           <w:sz w:val="24"/>
         </w:rPr>
-        <w:t xml:space="preserve">v6.13.0</w:t>
+        <w:t xml:space="preserve">v6.14.0</w:t>
       </w:r>
       <w:r>
         <w:rPr>
@@ -96,7 +96,7 @@
         <w:rPr>
           <w:sz w:val="24"/>
         </w:rPr>
-        <w:t xml:space="preserve">— September 22, 2026 17:49</w:t>
+        <w:t xml:space="preserve">— September 23, 2026 11:10</w:t>
       </w:r>
     </w:p>
     <w:sdt>
@@ -13854,7 +13854,7 @@
               <w:jc w:val="left"/>
             </w:pPr>
             <w:r>
-              <w:t xml:space="preserve">6.13.0</w:t>
+              <w:t xml:space="preserve">6.14.0</w:t>
             </w:r>
           </w:p>
         </w:tc>
@@ -13880,7 +13880,7 @@
               <w:jc w:val="left"/>
             </w:pPr>
             <w:r>
-              <w:t xml:space="preserve">Test-result vocabulary unified: Portuguese badges now read Atende / Atende com ressalvas / Não atende / Não testado in both testbook and POC (was Aprovado/Reprovado/Bloqueado/Não testado and Atendido/Parcial/Falha/Ignorado). Testbook gains the Partial result (Atende com ressalvas, orange pill); Blocked was dropped (legacy documents render the neutral fallback pill). English display and source enum values unchanged. Existing PT documents render the new names on recompile.</w:t>
+              <w:t xml:space="preserve">Converter content-loss fixes: compound admonitions no longer corrupt nested tables and code, definition lists keep their definitions, colspan is supported (rowspan warns), block anchors on tables/images fix dead cross-references, and technical cover values (the setreport commands) now render on the PDF cover. Empty-macro tests fixed with etoolbox’s ifdefempty (covermeta shows the version; phantom Author row gone). HTML: double captions eliminated, EN admonition titles match the PDF (Info/Important/Tip), and technical sections render as language-aware headings in DOCX/MD/HTML. Build: font-fallback detection fixed (was dead code); install.sh now installs asciidoctor-diagram so fresh installs no longer lose diagrams silently. Round-trip heading checks are now exact.</w:t>
             </w:r>
           </w:p>
         </w:tc>
@@ -13895,7 +13895,7 @@
               <w:jc w:val="left"/>
             </w:pPr>
             <w:r>
-              <w:t xml:space="preserve">6.12.0</w:t>
+              <w:t xml:space="preserve">6.13.0</w:t>
             </w:r>
           </w:p>
         </w:tc>
@@ -13925,7 +13925,7 @@
               <w:jc w:val="left"/>
             </w:pPr>
             <w:r>
-              <w:t xml:space="preserve">Language audit: Portuguese documents no longer show English labels. Technical cover labels (Versão/Data/Cenário/Autor), testbook badges (Aprovado/Reprovado/Bloqueado/Não testado), HTML admonition titles and captions, DOCX callout labels, General Objective, E-mail, and image placeholder are now language-aware under :lang: pt. CSS technical section headings gained PT selectors; 6 CSS strings aligned with PDF. Badge PNGs auto-sized to fit text. Sample wording fixed: Cor/Amostra table headers, Infraestrutura como Código, provedor heading.</w:t>
+              <w:t xml:space="preserve">Test-result vocabulary unified: Portuguese badges now read Atende / Atende com ressalvas / Não atende / Não testado in both testbook and POC (was Aprovado/Reprovado/Bloqueado/Não testado and Atendido/Parcial/Falha/Ignorado). Testbook gains the Partial result (Atende com ressalvas, orange pill); Blocked was dropped (legacy documents render the neutral fallback pill). English display and source enum values unchanged. Existing PT documents render the new names on recompile.</w:t>
             </w:r>
           </w:p>
         </w:tc>
@@ -13938,18 +13938,18 @@
               <w:jc w:val="left"/>
             </w:pPr>
             <w:r>
-              <w:t xml:space="preserve">6.11.1</w:t>
-            </w:r>
-          </w:p>
-        </w:tc>
-        <w:tc>
-          <w:tcPr/>
-          <w:p>
-            <w:pPr>
-              <w:jc w:val="left"/>
-            </w:pPr>
-            <w:r>
-              <w:t xml:space="preserve">2026-09-22</w:t>
+              <w:t xml:space="preserve">6.12.0</w:t>
+            </w:r>
+          </w:p>
+        </w:tc>
+        <w:tc>
+          <w:tcPr/>
+          <w:p>
+            <w:pPr>
+              <w:jc w:val="left"/>
+            </w:pPr>
+            <w:r>
+              <w:t xml:space="preserve">2026-09-23</w:t>
             </w:r>
           </w:p>
         </w:tc>
@@ -13964,7 +13964,7 @@
               <w:jc w:val="left"/>
             </w:pPr>
             <w:r>
-              <w:t xml:space="preserve">Documentation: document lifecycle clarified. Documents created via the skills are standalone deliverables — git is never used for individual documents; the :version: attribute and changelog block are the document’s own version control. All four SKILL.md files gained a “Document lifecycle” section and now scope AGENTS.md’s git workflow to template repository development only. AGENTS.md gained a Scope section stating user documents are gitignored and never repository content, and L17 is clarified to apply to template releases only.</w:t>
+              <w:t xml:space="preserve">Language audit: Portuguese documents no longer show English labels. Technical cover labels (Versão/Data/Cenário/Autor), testbook badges (Aprovado/Reprovado/Bloqueado/Não testado), HTML admonition titles and captions, DOCX callout labels, General Objective, E-mail, and image placeholder are now language-aware under :lang: pt. CSS technical section headings gained PT selectors; 6 CSS strings aligned with PDF. Badge PNGs auto-sized to fit text. Sample wording fixed: Cor/Amostra table headers, Infraestrutura como Código, provedor heading.</w:t>
             </w:r>
           </w:p>
         </w:tc>
@@ -13979,7 +13979,7 @@
               <w:jc w:val="left"/>
             </w:pPr>
             <w:r>
-              <w:t xml:space="preserve">6.11.0</w:t>
+              <w:t xml:space="preserve">6.11.1</w:t>
             </w:r>
           </w:p>
         </w:tc>
@@ -14009,7 +14009,7 @@
               <w:jc w:val="left"/>
             </w:pPr>
             <w:r>
-              <w:t xml:space="preserve">Project-wide audit: converter robustness and cross-format consistency. Objectives roles now work in all forms — inline ([.general-objective] and [.objective]) and block (inside [.objectives]) — rendering language-aware labels (the block form previously crashed the build; the inline form silently dropped the label). The [.prerequisites] and [.stepbystep] roles attached to lists no longer drop items. Multi-author documents now list all authors. Conversion errors print a clean file:line message instead of a Ruby object dump. Unknown code languages (go, java, rust, terraform, …​) fall back to plain verbatim with a compile warning (was a hard error). DOCX/MD/HTML: codefile blocks ([.codefile,file=…​]) now inline the file content like the PDF, and admonition labels no longer corrupt NOTE:/TIP: lines inside code blocks. DOCX Fail/Falha badge backgrounds and plain-table borders now match the PDF colors. Shared class boilerplate extracted into the new huawei-base.cls base class (rendering unchanged). Watch mode survives compile errors; install reports failures instead of silent success; the /etc/LatexMk write is opt-in; build diagnostics are kept on failure; asciidoctor warnings now fail the build; a missing header logo warns instead of erroring. New test-pdf-compile.sh replaces the legacy test-filter stub; round-trip now validates the production build pipeline. Documentation corrected across README, AGENTS, and all SKILL files (objectives syntax, codefile example, supported languages, longhutable restriction, install requirements, pandoc range, security note).</w:t>
+              <w:t xml:space="preserve">Documentation: document lifecycle clarified. Documents created via the skills are standalone deliverables — git is never used for individual documents; the :version: attribute and changelog block are the document’s own version control. All four SKILL.md files gained a “Document lifecycle” section and now scope AGENTS.md’s git workflow to template repository development only. AGENTS.md gained a Scope section stating user documents are gitignored and never repository content, and L17 is clarified to apply to template releases only.</w:t>
             </w:r>
           </w:p>
         </w:tc>
@@ -14022,18 +14022,18 @@
               <w:jc w:val="left"/>
             </w:pPr>
             <w:r>
-              <w:t xml:space="preserve">6.10.0</w:t>
-            </w:r>
-          </w:p>
-        </w:tc>
-        <w:tc>
-          <w:tcPr/>
-          <w:p>
-            <w:pPr>
-              <w:jc w:val="left"/>
-            </w:pPr>
-            <w:r>
-              <w:t xml:space="preserve">2026-09-21</w:t>
+              <w:t xml:space="preserve">6.11.0</w:t>
+            </w:r>
+          </w:p>
+        </w:tc>
+        <w:tc>
+          <w:tcPr/>
+          <w:p>
+            <w:pPr>
+              <w:jc w:val="left"/>
+            </w:pPr>
+            <w:r>
+              <w:t xml:space="preserve">2026-09-22</w:t>
             </w:r>
           </w:p>
         </w:tc>
@@ -14048,7 +14048,7 @@
               <w:jc w:val="left"/>
             </w:pPr>
             <w:r>
-              <w:t xml:space="preserve">Header logo, callout boxes, and note labels: DOCX header now shows the Huawei logo in the top-left corner (optional, driven by the :header-logo: attribute). DOCX admonitions (TIP, NOTE, WARNING) now render as styled callout boxes with colored backgrounds, left borders, and type labels — matching the PDF. PDF inline notes ([.note] role) now show a language-aware “Note:” label (was unlabeled italic text).</w:t>
+              <w:t xml:space="preserve">Project-wide audit: converter robustness and cross-format consistency. Objectives roles now work in all forms — inline ([.general-objective] and [.objective]) and block (inside [.objectives]) — rendering language-aware labels (the block form previously crashed the build; the inline form silently dropped the label). The [.prerequisites] and [.stepbystep] roles attached to lists no longer drop items. Multi-author documents now list all authors. Conversion errors print a clean file:line message instead of a Ruby object dump. Unknown code languages (go, java, rust, terraform, …​) fall back to plain verbatim with a compile warning (was a hard error). DOCX/MD/HTML: codefile blocks ([.codefile,file=…​]) now inline the file content like the PDF, and admonition labels no longer corrupt NOTE:/TIP: lines inside code blocks. DOCX Fail/Falha badge backgrounds and plain-table borders now match the PDF colors. Shared class boilerplate extracted into the new huawei-base.cls base class (rendering unchanged). Watch mode survives compile errors; install reports failures instead of silent success; the /etc/LatexMk write is opt-in; build diagnostics are kept on failure; asciidoctor warnings now fail the build; a missing header logo warns instead of erroring. New test-pdf-compile.sh replaces the legacy test-filter stub; round-trip now validates the production build pipeline. Documentation corrected across README, AGENTS, and all SKILL files (objectives syntax, codefile example, supported languages, longhutable restriction, install requirements, pandoc range, security note).</w:t>
             </w:r>
           </w:p>
         </w:tc>
@@ -14063,7 +14063,7 @@
               <w:jc w:val="left"/>
             </w:pPr>
             <w:r>
-              <w:t xml:space="preserve">6.9.2</w:t>
+              <w:t xml:space="preserve">6.10.0</w:t>
             </w:r>
           </w:p>
         </w:tc>
@@ -14093,7 +14093,7 @@
               <w:jc w:val="left"/>
             </w:pPr>
             <w:r>
-              <w:t xml:space="preserve">Fix DOCX body text alignment: paragraphs are now justified (matching the PDF LaTeX default), instead of left-aligned.</w:t>
+              <w:t xml:space="preserve">Header logo, callout boxes, and note labels: DOCX header now shows the Huawei logo in the top-left corner (optional, driven by the :header-logo: attribute). DOCX admonitions (TIP, NOTE, WARNING) now render as styled callout boxes with colored backgrounds, left borders, and type labels — matching the PDF. PDF inline notes ([.note] role) now show a language-aware “Note:” label (was unlabeled italic text).</w:t>
             </w:r>
           </w:p>
         </w:tc>
@@ -14106,7 +14106,7 @@
               <w:jc w:val="left"/>
             </w:pPr>
             <w:r>
-              <w:t xml:space="preserve">6.9.1</w:t>
+              <w:t xml:space="preserve">6.9.2</w:t>
             </w:r>
           </w:p>
         </w:tc>
@@ -14132,7 +14132,7 @@
               <w:jc w:val="left"/>
             </w:pPr>
             <w:r>
-              <w:t xml:space="preserve">Fix DOCX subsection number size: H2/H3/H4 section numbers were rendered at 56pt (same as H1) instead of matching the heading text size (18/16/14pt). The SectionNumber style is now unstyled (inherits heading size); 56pt is set directly on H1 number runs only.</w:t>
+              <w:t xml:space="preserve">Fix DOCX body text alignment: paragraphs are now justified (matching the PDF LaTeX default), instead of left-aligned.</w:t>
             </w:r>
           </w:p>
         </w:tc>
@@ -14147,7 +14147,7 @@
               <w:jc w:val="left"/>
             </w:pPr>
             <w:r>
-              <w:t xml:space="preserve">6.9.0</w:t>
+              <w:t xml:space="preserve">6.9.1</w:t>
             </w:r>
           </w:p>
         </w:tc>
@@ -14177,7 +14177,7 @@
               <w:jc w:val="left"/>
             </w:pPr>
             <w:r>
-              <w:t xml:space="preserve">TOC styling: the table-of-contents title rule is now Huawei red (was black) in both PDF and DOCX, matching the H1 heading red rules. DOCX TOC entries now match the PDF: level 1 bold 12pt, levels 2-3 normal 10pt, HarmonyOS Sans font. DOCX TOC depth increased from 2 to 3 levels (matching PDF tocdepth). Dead TOCTitle style removed from DOCX.</w:t>
+              <w:t xml:space="preserve">Fix DOCX subsection number size: H2/H3/H4 section numbers were rendered at 56pt (same as H1) instead of matching the heading text size (18/16/14pt). The SectionNumber style is now unstyled (inherits heading size); 56pt is set directly on H1 number runs only.</w:t>
             </w:r>
           </w:p>
         </w:tc>
@@ -14190,18 +14190,18 @@
               <w:jc w:val="left"/>
             </w:pPr>
             <w:r>
-              <w:t xml:space="preserve">6.8.3</w:t>
-            </w:r>
-          </w:p>
-        </w:tc>
-        <w:tc>
-          <w:tcPr/>
-          <w:p>
-            <w:pPr>
-              <w:jc w:val="left"/>
-            </w:pPr>
-            <w:r>
-              <w:t xml:space="preserve">2026-09-20</w:t>
+              <w:t xml:space="preserve">6.9.0</w:t>
+            </w:r>
+          </w:p>
+        </w:tc>
+        <w:tc>
+          <w:tcPr/>
+          <w:p>
+            <w:pPr>
+              <w:jc w:val="left"/>
+            </w:pPr>
+            <w:r>
+              <w:t xml:space="preserve">2026-09-21</w:t>
             </w:r>
           </w:p>
         </w:tc>
@@ -14216,7 +14216,7 @@
               <w:jc w:val="left"/>
             </w:pPr>
             <w:r>
-              <w:t xml:space="preserve">Docs accuracy fix: the multi-format pipeline descriptions in README, AGENTS, and all four SKILL.md files now correctly separate the DOCX/Markdown path (pre-processor then docbook then pandoc) from the HTML path (pre-processor then asciidoctor html5) — the previous wording implied HTML also went through docbook and pandoc. Corrected a stale comment in the DOCX fixer.</w:t>
+              <w:t xml:space="preserve">TOC styling: the table-of-contents title rule is now Huawei red (was black) in both PDF and DOCX, matching the H1 heading red rules. DOCX TOC entries now match the PDF: level 1 bold 12pt, levels 2-3 normal 10pt, HarmonyOS Sans font. DOCX TOC depth increased from 2 to 3 levels (matching PDF tocdepth). Dead TOCTitle style removed from DOCX.</w:t>
             </w:r>
           </w:p>
         </w:tc>
@@ -14231,7 +14231,7 @@
               <w:jc w:val="left"/>
             </w:pPr>
             <w:r>
-              <w:t xml:space="preserve">6.8.2</w:t>
+              <w:t xml:space="preserve">6.8.3</w:t>
             </w:r>
           </w:p>
         </w:tc>
@@ -14261,7 +14261,7 @@
               <w:jc w:val="left"/>
             </w:pPr>
             <w:r>
-              <w:t xml:space="preserve">Documentation and cleanup: README, AGENTS, and all four SKILL.md files now describe the real multi-format pipeline (pre-processor + docx_fix --fix + --lang flag) instead of the pre-v6.4 asciidoctor-to-pandoc chain. DOCX TOC title is now right-aligned like the PDF (was targeting a dead style). Signature names render bold like the PDF. Dead code removed (unused Caption style, dead TOCTitle style, dead HTML badge CSS). The --template and --lang flags accept the equals form (--template=guide). Various stale comments corrected.</w:t>
+              <w:t xml:space="preserve">Docs accuracy fix: the multi-format pipeline descriptions in README, AGENTS, and all four SKILL.md files now correctly separate the DOCX/Markdown path (pre-processor then docbook then pandoc) from the HTML path (pre-processor then asciidoctor html5) — the previous wording implied HTML also went through docbook and pandoc. Corrected a stale comment in the DOCX fixer.</w:t>
             </w:r>
           </w:p>
         </w:tc>
@@ -14274,7 +14274,7 @@
               <w:jc w:val="left"/>
             </w:pPr>
             <w:r>
-              <w:t xml:space="preserve">6.8.1</w:t>
+              <w:t xml:space="preserve">6.8.2</w:t>
             </w:r>
           </w:p>
         </w:tc>
@@ -14300,7 +14300,7 @@
               <w:jc w:val="left"/>
             </w:pPr>
             <w:r>
-              <w:t xml:space="preserve">Quality-pass fixes for v6.8.0: non-technical covers no longer show a stray Date paragraph (regression from the meta-scan change); the technical cover table is no longer hijacked from the body when :nochangelog: is set (boundary check on the cover-table detection); the Version/Date/Scenario table now renders unconditionally like the PDF (was gated by :nochangelog:); empty cover tables are skipped when no report values are set; corrected the cover-element-order wording in the v6.8.0 changelog.</w:t>
+              <w:t xml:space="preserve">Documentation and cleanup: README, AGENTS, and all four SKILL.md files now describe the real multi-format pipeline (pre-processor + docx_fix --fix + --lang flag) instead of the pre-v6.4 asciidoctor-to-pandoc chain. DOCX TOC title is now right-aligned like the PDF (was targeting a dead style). Signature names render bold like the PDF. Dead code removed (unused Caption style, dead TOCTitle style, dead HTML badge CSS). The --template and --lang flags accept the equals form (--template=guide). Various stale comments corrected.</w:t>
             </w:r>
           </w:p>
         </w:tc>
@@ -14315,7 +14315,7 @@
               <w:jc w:val="left"/>
             </w:pPr>
             <w:r>
-              <w:t xml:space="preserve">6.8.0</w:t>
+              <w:t xml:space="preserve">6.8.1</w:t>
             </w:r>
           </w:p>
         </w:tc>
@@ -14345,7 +14345,7 @@
               <w:jc w:val="left"/>
             </w:pPr>
             <w:r>
-              <w:t xml:space="preserve">Technical report covers now match the PDF in DOCX/MD/HTML: the title uses the PDF’s 24pt size (was 36pt), the report type label appears below the title (the DOCX cover keeps the established title-first order; the PDF has label-then-title), and the Version/Date/Scenario table is rendered with the PDF’s red label column. The cover meta line now shows the report version and its set date (was the document version and the build date). Authors, when set, appear as a table row like the PDF.</w:t>
+              <w:t xml:space="preserve">Quality-pass fixes for v6.8.0: non-technical covers no longer show a stray Date paragraph (regression from the meta-scan change); the technical cover table is no longer hijacked from the body when :nochangelog: is set (boundary check on the cover-table detection); the Version/Date/Scenario table now renders unconditionally like the PDF (was gated by :nochangelog:); empty cover tables are skipped when no report values are set; corrected the cover-element-order wording in the v6.8.0 changelog.</w:t>
             </w:r>
           </w:p>
         </w:tc>
@@ -14358,7 +14358,7 @@
               <w:jc w:val="left"/>
             </w:pPr>
             <w:r>
-              <w:t xml:space="preserve">6.7.0</w:t>
+              <w:t xml:space="preserve">6.8.0</w:t>
             </w:r>
           </w:p>
         </w:tc>
@@ -14384,7 +14384,7 @@
               <w:jc w:val="left"/>
             </w:pPr>
             <w:r>
-              <w:t xml:space="preserve">Badge and language fidelity: DOCX badge pills now render black text like the PDF (was frame-colored), use the correct label case (Pass, not PASS), include the Portuguese POC labels (Atendido, Parcial, Falha, Ignorado), and render at native width per template (testbook badge text no longer shrinks). Portuguese signature greetings now match the PDF (At.te,), the POC classification label matches the full PDF wording, and the secondary-format table headers (stakeholders, closing record, test summary, changelog) are now language-aware. DOCX footers show Página in Portuguese documents. Cover dates no longer zero-pad the day.</w:t>
+              <w:t xml:space="preserve">Technical report covers now match the PDF in DOCX/MD/HTML: the title uses the PDF’s 24pt size (was 36pt), the report type label appears below the title (the DOCX cover keeps the established title-first order; the PDF has label-then-title), and the Version/Date/Scenario table is rendered with the PDF’s red label column. The cover meta line now shows the report version and its set date (was the document version and the build date). Authors, when set, appear as a table row like the PDF.</w:t>
             </w:r>
           </w:p>
         </w:tc>
@@ -14399,7 +14399,7 @@
               <w:jc w:val="left"/>
             </w:pPr>
             <w:r>
-              <w:t xml:space="preserve">6.6.1</w:t>
+              <w:t xml:space="preserve">6.7.0</w:t>
             </w:r>
           </w:p>
         </w:tc>
@@ -14429,7 +14429,7 @@
               <w:jc w:val="left"/>
             </w:pPr>
             <w:r>
-              <w:t xml:space="preserve">Quality-pass fixes for v6.6.0: the TESTCASE-marker strip now covers the entire DOCX fix run (a failure at any stage can no longer leave markers in the output file); the fixer resets its template state between in-process runs (the documented path-sniffing fallback works again); build.sh also cleans temporary files on interrupt signals; fixed a CHANGELOG typo.</w:t>
+              <w:t xml:space="preserve">Badge and language fidelity: DOCX badge pills now render black text like the PDF (was frame-colored), use the correct label case (Pass, not PASS), include the Portuguese POC labels (Atendido, Parcial, Falha, Ignorado), and render at native width per template (testbook badge text no longer shrinks). Portuguese signature greetings now match the PDF (At.te,), the POC classification label matches the full PDF wording, and the secondary-format table headers (stakeholders, closing record, test summary, changelog) are now language-aware. DOCX footers show Página in Portuguese documents. Cover dates no longer zero-pad the day.</w:t>
             </w:r>
           </w:p>
         </w:tc>
@@ -14442,7 +14442,7 @@
               <w:jc w:val="left"/>
             </w:pPr>
             <w:r>
-              <w:t xml:space="preserve">6.6.0</w:t>
+              <w:t xml:space="preserve">6.6.1</w:t>
             </w:r>
           </w:p>
         </w:tc>
@@ -14468,6 +14468,51 @@
               <w:jc w:val="left"/>
             </w:pPr>
             <w:r>
+              <w:t xml:space="preserve">Quality-pass fixes for v6.6.0: the TESTCASE-marker strip now covers the entire DOCX fix run (a failure at any stage can no longer leave markers in the output file); the fixer resets its template state between in-process runs (the documented path-sniffing fallback works again); build.sh also cleans temporary files on interrupt signals; fixed a CHANGELOG typo.</w:t>
+            </w:r>
+          </w:p>
+        </w:tc>
+      </w:tr>
+      <w:tr>
+        <w:tc>
+          <w:tcPr>
+            <w:shd w:val="clear" w:color="auto" w:fill="F6F8FA"/>
+          </w:tcPr>
+          <w:p>
+            <w:pPr>
+              <w:jc w:val="left"/>
+            </w:pPr>
+            <w:r>
+              <w:t xml:space="preserve">6.6.0</w:t>
+            </w:r>
+          </w:p>
+        </w:tc>
+        <w:tc>
+          <w:tcPr>
+            <w:shd w:val="clear" w:color="auto" w:fill="F6F8FA"/>
+          </w:tcPr>
+          <w:p>
+            <w:pPr>
+              <w:jc w:val="left"/>
+            </w:pPr>
+            <w:r>
+              <w:t xml:space="preserve">2026-09-20</w:t>
+            </w:r>
+          </w:p>
+        </w:tc>
+        <w:tc>
+          <w:tcPr>
+            <w:shd w:val="clear" w:color="auto" w:fill="F6F8FA"/>
+          </w:tcPr>
+          <w:p>
+            <w:pPr>
+              <w:numPr>
+                <w:ilvl w:val="0"/>
+                <w:numId w:val="1057"/>
+              </w:numPr>
+              <w:jc w:val="left"/>
+            </w:pPr>
+            <w:r>
               <w:t xml:space="preserve">Pipeline robustness: DOCX post-processing now fails loudly when content styling errors occur (TESTCASE markers can no longer leak into output); the DOCX fixer takes an explicit</w:t>
             </w:r>
             <w:r>
@@ -14490,58 +14535,13 @@
       </w:tr>
       <w:tr>
         <w:tc>
-          <w:tcPr>
-            <w:shd w:val="clear" w:color="auto" w:fill="F6F8FA"/>
-          </w:tcPr>
+          <w:tcPr/>
           <w:p>
             <w:pPr>
               <w:jc w:val="left"/>
             </w:pPr>
             <w:r>
               <w:t xml:space="preserve">6.5.2</w:t>
-            </w:r>
-          </w:p>
-        </w:tc>
-        <w:tc>
-          <w:tcPr>
-            <w:shd w:val="clear" w:color="auto" w:fill="F6F8FA"/>
-          </w:tcPr>
-          <w:p>
-            <w:pPr>
-              <w:jc w:val="left"/>
-            </w:pPr>
-            <w:r>
-              <w:t xml:space="preserve">2026-09-20</w:t>
-            </w:r>
-          </w:p>
-        </w:tc>
-        <w:tc>
-          <w:tcPr>
-            <w:shd w:val="clear" w:color="auto" w:fill="F6F8FA"/>
-          </w:tcPr>
-          <w:p>
-            <w:pPr>
-              <w:numPr>
-                <w:ilvl w:val="0"/>
-                <w:numId w:val="1057"/>
-              </w:numPr>
-              <w:jc w:val="left"/>
-            </w:pPr>
-            <w:r>
-              <w:t xml:space="preserve">Quality-pass fixes for v6.5.1: LaTeX quote conversion now handles only paired quotes (quote characters inside code arguments are no longer corrupted); signature cells containing escaped ampersands are no longer split; round-trip HTML generation guards the asciidoctor-diagram dependency and fails loudly when generation fails; pre-processor unit tests now cover pipe escaping in all five table handlers.</w:t>
-            </w:r>
-          </w:p>
-        </w:tc>
-      </w:tr>
-      <w:tr>
-        <w:tc>
-          <w:tcPr/>
-          <w:p>
-            <w:pPr>
-              <w:jc w:val="left"/>
-            </w:pPr>
-            <w:r>
-              <w:t xml:space="preserve">6.5.1</w:t>
             </w:r>
           </w:p>
         </w:tc>
@@ -14567,7 +14567,7 @@
               <w:jc w:val="left"/>
             </w:pPr>
             <w:r>
-              <w:t xml:space="preserve">Fixed DOCX/MD/HTML output: tables are no longer corrupted when changelog, signature, or summary content contains a pipe character (“|”). Badge text is now preserved in DOCX/MD/HTML — a “Ready” badge renders “Ready” instead of “[NEW]”. Multi-item changelog entries render as bullet lists instead of being joined with a literal “+”. POC documents now include the changelog in DOCX/MD/HTML. The :noanswers: attribute now hides test results and remarks in DOCX/MD/HTML, matching the PDF. Inline LaTeX (monospace text, arrows, LaTeX quotes) no longer leaks from changelog entries. The test suite now exercises the real build pipeline (pre-processor wired into round-trip and DOCX tests), with new pre-processor unit tests.</w:t>
+              <w:t xml:space="preserve">Quality-pass fixes for v6.5.1: LaTeX quote conversion now handles only paired quotes (quote characters inside code arguments are no longer corrupted); signature cells containing escaped ampersands are no longer split; round-trip HTML generation guards the asciidoctor-diagram dependency and fails loudly when generation fails; pre-processor unit tests now cover pipe escaping in all five table handlers.</w:t>
             </w:r>
           </w:p>
         </w:tc>
@@ -14582,7 +14582,7 @@
               <w:jc w:val="left"/>
             </w:pPr>
             <w:r>
-              <w:t xml:space="preserve">6.5.0</w:t>
+              <w:t xml:space="preserve">6.5.1</w:t>
             </w:r>
           </w:p>
         </w:tc>
@@ -14612,7 +14612,7 @@
               <w:jc w:val="left"/>
             </w:pPr>
             <w:r>
-              <w:t xml:space="preserve">Evidence checklist simplified to plain bullets in both PDF and DOCX (checkbox markers removed for compatibility). Planned Activities list in DOCX now uses Word’s native lower-roman numbering (i., ii., iii.) matching the PDF. Badges in DOCX replaced with exact-replica PNG pill images (rounded, colored frame and background, bold text) matching the PDF \ huaweibadge look — assets committed to the repo. Signature blocks in DOCX no longer show literal + symbols (proper hard line breaks).</w:t>
+              <w:t xml:space="preserve">Fixed DOCX/MD/HTML output: tables are no longer corrupted when changelog, signature, or summary content contains a pipe character (“|”). Badge text is now preserved in DOCX/MD/HTML — a “Ready” badge renders “Ready” instead of “[NEW]”. Multi-item changelog entries render as bullet lists instead of being joined with a literal “+”. POC documents now include the changelog in DOCX/MD/HTML. The :noanswers: attribute now hides test results and remarks in DOCX/MD/HTML, matching the PDF. Inline LaTeX (monospace text, arrows, LaTeX quotes) no longer leaks from changelog entries. The test suite now exercises the real build pipeline (pre-processor wired into round-trip and DOCX tests), with new pre-processor unit tests.</w:t>
             </w:r>
           </w:p>
         </w:tc>
@@ -14625,7 +14625,7 @@
               <w:jc w:val="left"/>
             </w:pPr>
             <w:r>
-              <w:t xml:space="preserve">6.4.7</w:t>
+              <w:t xml:space="preserve">6.5.0</w:t>
             </w:r>
           </w:p>
         </w:tc>
@@ -14651,7 +14651,7 @@
               <w:jc w:val="left"/>
             </w:pPr>
             <w:r>
-              <w:t xml:space="preserve">Section titles in DOCX now match the PDF heading design: the big section number (56pt) sits on the left, the title text is pushed to the right edge (a right tab stop mimics the LaTeX \ hfill), and the red rule runs below — previously the title sat left-aligned next to a small number. Applies to all templates.</w:t>
+              <w:t xml:space="preserve">Evidence checklist simplified to plain bullets in both PDF and DOCX (checkbox markers removed for compatibility). Planned Activities list in DOCX now uses Word’s native lower-roman numbering (i., ii., iii.) matching the PDF. Badges in DOCX replaced with exact-replica PNG pill images (rounded, colored frame and background, bold text) matching the PDF \ huaweibadge look — assets committed to the repo. Signature blocks in DOCX no longer show literal + symbols (proper hard line breaks).</w:t>
             </w:r>
           </w:p>
         </w:tc>
@@ -14666,7 +14666,7 @@
               <w:jc w:val="left"/>
             </w:pPr>
             <w:r>
-              <w:t xml:space="preserve">6.4.6</w:t>
+              <w:t xml:space="preserve">6.4.7</w:t>
             </w:r>
           </w:p>
         </w:tc>
@@ -14696,7 +14696,7 @@
               <w:jc w:val="left"/>
             </w:pPr>
             <w:r>
-              <w:t xml:space="preserve">Code blocks inside test cases no longer break the red left rule in DOCX — the code style’s left indent (which jogged the rule) is reset inside test case blocks, and code blocks now show the PDF’s code box (gray background with thin border on top, bottom, and right, red rule continuing on the left).</w:t>
+              <w:t xml:space="preserve">Section titles in DOCX now match the PDF heading design: the big section number (56pt) sits on the left, the title text is pushed to the right edge (a right tab stop mimics the LaTeX \ hfill), and the red rule runs below — previously the title sat left-aligned next to a small number. Applies to all templates.</w:t>
             </w:r>
           </w:p>
         </w:tc>
@@ -14709,7 +14709,7 @@
               <w:jc w:val="left"/>
             </w:pPr>
             <w:r>
-              <w:t xml:space="preserve">6.4.5</w:t>
+              <w:t xml:space="preserve">6.4.6</w:t>
             </w:r>
           </w:p>
         </w:tc>
@@ -14735,7 +14735,7 @@
               <w:jc w:val="left"/>
             </w:pPr>
             <w:r>
-              <w:t xml:space="preserve">DOCX polish pass: all captions centered (matching the PDF), vertical spacing between blocks matched to the LaTeX rhythm (medskip/smallskip around captions, field bars, and steps), and test steps now render as separate paragraphs each with the red bold number (previously merged into one paragraph).</w:t>
+              <w:t xml:space="preserve">Code blocks inside test cases no longer break the red left rule in DOCX — the code style’s left indent (which jogged the rule) is reset inside test case blocks, and code blocks now show the PDF’s code box (gray background with thin border on top, bottom, and right, red rule continuing on the left).</w:t>
             </w:r>
           </w:p>
         </w:tc>
@@ -14750,7 +14750,7 @@
               <w:jc w:val="left"/>
             </w:pPr>
             <w:r>
-              <w:t xml:space="preserve">6.4.4</w:t>
+              <w:t xml:space="preserve">6.4.5</w:t>
             </w:r>
           </w:p>
         </w:tc>
@@ -14780,7 +14780,7 @@
               <w:jc w:val="left"/>
             </w:pPr>
             <w:r>
-              <w:t xml:space="preserve">DOCX covers now show the logo, cover text, and version/date/time meta line like the PDF. Test case blocks in DOCX get the PDF’s visual wrapper: red left rule, red field header bars, and red step numbers. Captions follow the PDF ordering system in DOCX, MD, and HTML (Table/Diagram/Figure/Testcase N: with bold symbol). Portuguese PDFs now label diagrams "Diagrama N:" (was hardcoded English "Diagram"). Markdown and HTML output no longer leaks raw LaTeX from passthrough blocks — the DOCX pre-processor now feeds those pipelines too.</w:t>
+              <w:t xml:space="preserve">DOCX polish pass: all captions centered (matching the PDF), vertical spacing between blocks matched to the LaTeX rhythm (medskip/smallskip around captions, field bars, and steps), and test steps now render as separate paragraphs each with the red bold number (previously merged into one paragraph).</w:t>
             </w:r>
           </w:p>
         </w:tc>
@@ -14793,7 +14793,7 @@
               <w:jc w:val="left"/>
             </w:pPr>
             <w:r>
-              <w:t xml:space="preserve">6.4.3</w:t>
+              <w:t xml:space="preserve">6.4.4</w:t>
             </w:r>
           </w:p>
         </w:tc>
@@ -14819,7 +14819,7 @@
               <w:jc w:val="left"/>
             </w:pPr>
             <w:r>
-              <w:t xml:space="preserve">Testbook and POC DOCX output now matches the PDF much more closely: native table of contents (language-aware, auto-populated), each section starts on a new page, embedded images and diagrams (PlantUML/Graphviz rendered), white-on-red table headers, cover version line under the title, centered test case captions, and plain black rules for signature grids.</w:t>
+              <w:t xml:space="preserve">DOCX covers now show the logo, cover text, and version/date/time meta line like the PDF. Test case blocks in DOCX get the PDF’s visual wrapper: red left rule, red field header bars, and red step numbers. Captions follow the PDF ordering system in DOCX, MD, and HTML (Table/Diagram/Figure/Testcase N: with bold symbol). Portuguese PDFs now label diagrams "Diagrama N:" (was hardcoded English "Diagram"). Markdown and HTML output no longer leaks raw LaTeX from passthrough blocks — the DOCX pre-processor now feeds those pipelines too.</w:t>
             </w:r>
           </w:p>
         </w:tc>
@@ -14834,7 +14834,7 @@
               <w:jc w:val="left"/>
             </w:pPr>
             <w:r>
-              <w:t xml:space="preserve">6.4.2</w:t>
+              <w:t xml:space="preserve">6.4.3</w:t>
             </w:r>
           </w:p>
         </w:tc>
@@ -14864,7 +14864,7 @@
               <w:jc w:val="left"/>
             </w:pPr>
             <w:r>
-              <w:t xml:space="preserve">DOCX output for POC and testbook templates now includes all passthrough content (stakeholders, closing record, signatures, test cases, test summary, changelog) via a new pre-processor. Fixed dropped Test Scope fields in testbook DOCX output.</w:t>
+              <w:t xml:space="preserve">Testbook and POC DOCX output now matches the PDF much more closely: native table of contents (language-aware, auto-populated), each section starts on a new page, embedded images and diagrams (PlantUML/Graphviz rendered), white-on-red table headers, cover version line under the title, centered test case captions, and plain black rules for signature grids.</w:t>
             </w:r>
           </w:p>
         </w:tc>
@@ -14877,7 +14877,7 @@
               <w:jc w:val="left"/>
             </w:pPr>
             <w:r>
-              <w:t xml:space="preserve">6.4.0</w:t>
+              <w:t xml:space="preserve">6.4.2</w:t>
             </w:r>
           </w:p>
         </w:tc>
@@ -14903,6 +14903,51 @@
               <w:jc w:val="left"/>
             </w:pPr>
             <w:r>
+              <w:t xml:space="preserve">DOCX output for POC and testbook templates now includes all passthrough content (stakeholders, closing record, signatures, test cases, test summary, changelog) via a new pre-processor. Fixed dropped Test Scope fields in testbook DOCX output.</w:t>
+            </w:r>
+          </w:p>
+        </w:tc>
+      </w:tr>
+      <w:tr>
+        <w:tc>
+          <w:tcPr>
+            <w:shd w:val="clear" w:color="auto" w:fill="F6F8FA"/>
+          </w:tcPr>
+          <w:p>
+            <w:pPr>
+              <w:jc w:val="left"/>
+            </w:pPr>
+            <w:r>
+              <w:t xml:space="preserve">6.4.0</w:t>
+            </w:r>
+          </w:p>
+        </w:tc>
+        <w:tc>
+          <w:tcPr>
+            <w:shd w:val="clear" w:color="auto" w:fill="F6F8FA"/>
+          </w:tcPr>
+          <w:p>
+            <w:pPr>
+              <w:jc w:val="left"/>
+            </w:pPr>
+            <w:r>
+              <w:t xml:space="preserve">2026-09-20</w:t>
+            </w:r>
+          </w:p>
+        </w:tc>
+        <w:tc>
+          <w:tcPr>
+            <w:shd w:val="clear" w:color="auto" w:fill="F6F8FA"/>
+          </w:tcPr>
+          <w:p>
+            <w:pPr>
+              <w:numPr>
+                <w:ilvl w:val="0"/>
+                <w:numId w:val="1067"/>
+              </w:numPr>
+              <w:jc w:val="left"/>
+            </w:pPr>
+            <w:r>
               <w:t xml:space="preserve">Fixed changelog dates — replaced</w:t>
             </w:r>
             <w:r>
@@ -14925,58 +14970,13 @@
       </w:tr>
       <w:tr>
         <w:tc>
-          <w:tcPr>
-            <w:shd w:val="clear" w:color="auto" w:fill="F6F8FA"/>
-          </w:tcPr>
+          <w:tcPr/>
           <w:p>
             <w:pPr>
               <w:jc w:val="left"/>
             </w:pPr>
             <w:r>
               <w:t xml:space="preserve">5.1.1</w:t>
-            </w:r>
-          </w:p>
-        </w:tc>
-        <w:tc>
-          <w:tcPr>
-            <w:shd w:val="clear" w:color="auto" w:fill="F6F8FA"/>
-          </w:tcPr>
-          <w:p>
-            <w:pPr>
-              <w:jc w:val="left"/>
-            </w:pPr>
-            <w:r>
-              <w:t xml:space="preserve">2026-09-14</w:t>
-            </w:r>
-          </w:p>
-        </w:tc>
-        <w:tc>
-          <w:tcPr>
-            <w:shd w:val="clear" w:color="auto" w:fill="F6F8FA"/>
-          </w:tcPr>
-          <w:p>
-            <w:pPr>
-              <w:numPr>
-                <w:ilvl w:val="0"/>
-                <w:numId w:val="1067"/>
-              </w:numPr>
-              <w:jc w:val="left"/>
-            </w:pPr>
-            <w:r>
-              <w:t xml:space="preserve">Synced callout colors in DOCX/HTML/MD output to match brand palette. Added color palette demo.</w:t>
-            </w:r>
-          </w:p>
-        </w:tc>
-      </w:tr>
-      <w:tr>
-        <w:tc>
-          <w:tcPr/>
-          <w:p>
-            <w:pPr>
-              <w:jc w:val="left"/>
-            </w:pPr>
-            <w:r>
-              <w:t xml:space="preserve">5.1.0</w:t>
             </w:r>
           </w:p>
         </w:tc>
@@ -15002,7 +15002,7 @@
               <w:jc w:val="left"/>
             </w:pPr>
             <w:r>
-              <w:t xml:space="preserve">Adopted brand guidelines auxiliary color palette and monochrome scale. Aligned callout colors to brand specifications.</w:t>
+              <w:t xml:space="preserve">Synced callout colors in DOCX/HTML/MD output to match brand palette. Added color palette demo.</w:t>
             </w:r>
           </w:p>
         </w:tc>
@@ -15017,7 +15017,7 @@
               <w:jc w:val="left"/>
             </w:pPr>
             <w:r>
-              <w:t xml:space="preserve">5.0.3</w:t>
+              <w:t xml:space="preserve">5.1.0</w:t>
             </w:r>
           </w:p>
         </w:tc>
@@ -15047,6 +15047,45 @@
               <w:jc w:val="left"/>
             </w:pPr>
             <w:r>
+              <w:t xml:space="preserve">Adopted brand guidelines auxiliary color palette and monochrome scale. Aligned callout colors to brand specifications.</w:t>
+            </w:r>
+          </w:p>
+        </w:tc>
+      </w:tr>
+      <w:tr>
+        <w:tc>
+          <w:tcPr/>
+          <w:p>
+            <w:pPr>
+              <w:jc w:val="left"/>
+            </w:pPr>
+            <w:r>
+              <w:t xml:space="preserve">5.0.3</w:t>
+            </w:r>
+          </w:p>
+        </w:tc>
+        <w:tc>
+          <w:tcPr/>
+          <w:p>
+            <w:pPr>
+              <w:jc w:val="left"/>
+            </w:pPr>
+            <w:r>
+              <w:t xml:space="preserve">2026-09-14</w:t>
+            </w:r>
+          </w:p>
+        </w:tc>
+        <w:tc>
+          <w:tcPr/>
+          <w:p>
+            <w:pPr>
+              <w:numPr>
+                <w:ilvl w:val="0"/>
+                <w:numId w:val="1070"/>
+              </w:numPr>
+              <w:jc w:val="left"/>
+            </w:pPr>
+            <w:r>
               <w:t xml:space="preserve">Removed non-standard</w:t>
             </w:r>
             <w:r>
@@ -15069,54 +15108,15 @@
       </w:tr>
       <w:tr>
         <w:tc>
-          <w:tcPr/>
+          <w:tcPr>
+            <w:shd w:val="clear" w:color="auto" w:fill="F6F8FA"/>
+          </w:tcPr>
           <w:p>
             <w:pPr>
               <w:jc w:val="left"/>
             </w:pPr>
             <w:r>
               <w:t xml:space="preserve">5.0.2</w:t>
-            </w:r>
-          </w:p>
-        </w:tc>
-        <w:tc>
-          <w:tcPr/>
-          <w:p>
-            <w:pPr>
-              <w:jc w:val="left"/>
-            </w:pPr>
-            <w:r>
-              <w:t xml:space="preserve">2026-09-14</w:t>
-            </w:r>
-          </w:p>
-        </w:tc>
-        <w:tc>
-          <w:tcPr/>
-          <w:p>
-            <w:pPr>
-              <w:numPr>
-                <w:ilvl w:val="0"/>
-                <w:numId w:val="1070"/>
-              </w:numPr>
-              <w:jc w:val="left"/>
-            </w:pPr>
-            <w:r>
-              <w:t xml:space="preserve">Long commands in test steps now render as code blocks instead of inline code.</w:t>
-            </w:r>
-          </w:p>
-        </w:tc>
-      </w:tr>
-      <w:tr>
-        <w:tc>
-          <w:tcPr>
-            <w:shd w:val="clear" w:color="auto" w:fill="F6F8FA"/>
-          </w:tcPr>
-          <w:p>
-            <w:pPr>
-              <w:jc w:val="left"/>
-            </w:pPr>
-            <w:r>
-              <w:t xml:space="preserve">5.0.1</w:t>
             </w:r>
           </w:p>
         </w:tc>
@@ -15146,7 +15146,7 @@
               <w:jc w:val="left"/>
             </w:pPr>
             <w:r>
-              <w:t xml:space="preserve">Testcase caption centered above the block.</w:t>
+              <w:t xml:space="preserve">Long commands in test steps now render as code blocks instead of inline code.</w:t>
             </w:r>
           </w:p>
         </w:tc>
@@ -15159,7 +15159,7 @@
               <w:jc w:val="left"/>
             </w:pPr>
             <w:r>
-              <w:t xml:space="preserve">5.0.0</w:t>
+              <w:t xml:space="preserve">5.0.1</w:t>
             </w:r>
           </w:p>
         </w:tc>
@@ -15185,6 +15185,51 @@
               <w:jc w:val="left"/>
             </w:pPr>
             <w:r>
+              <w:t xml:space="preserve">Testcase caption centered above the block.</w:t>
+            </w:r>
+          </w:p>
+        </w:tc>
+      </w:tr>
+      <w:tr>
+        <w:tc>
+          <w:tcPr>
+            <w:shd w:val="clear" w:color="auto" w:fill="F6F8FA"/>
+          </w:tcPr>
+          <w:p>
+            <w:pPr>
+              <w:jc w:val="left"/>
+            </w:pPr>
+            <w:r>
+              <w:t xml:space="preserve">5.0.0</w:t>
+            </w:r>
+          </w:p>
+        </w:tc>
+        <w:tc>
+          <w:tcPr>
+            <w:shd w:val="clear" w:color="auto" w:fill="F6F8FA"/>
+          </w:tcPr>
+          <w:p>
+            <w:pPr>
+              <w:jc w:val="left"/>
+            </w:pPr>
+            <w:r>
+              <w:t xml:space="preserve">2026-09-14</w:t>
+            </w:r>
+          </w:p>
+        </w:tc>
+        <w:tc>
+          <w:tcPr>
+            <w:shd w:val="clear" w:color="auto" w:fill="F6F8FA"/>
+          </w:tcPr>
+          <w:p>
+            <w:pPr>
+              <w:numPr>
+                <w:ilvl w:val="0"/>
+                <w:numId w:val="1073"/>
+              </w:numPr>
+              <w:jc w:val="left"/>
+            </w:pPr>
+            <w:r>
               <w:t xml:space="preserve">Major refactoring: extracted shared modules (huawei-titles, huawei-toc, huawei-cover), renamed</w:t>
             </w:r>
             <w:r>
@@ -15246,9 +15291,7 @@
       </w:tr>
       <w:tr>
         <w:tc>
-          <w:tcPr>
-            <w:shd w:val="clear" w:color="auto" w:fill="F6F8FA"/>
-          </w:tcPr>
+          <w:tcPr/>
           <w:p>
             <w:pPr>
               <w:jc w:val="left"/>
@@ -15259,56 +15302,13 @@
           </w:p>
         </w:tc>
         <w:tc>
-          <w:tcPr>
-            <w:shd w:val="clear" w:color="auto" w:fill="F6F8FA"/>
-          </w:tcPr>
+          <w:tcPr/>
           <w:p>
             <w:pPr>
               <w:jc w:val="left"/>
             </w:pPr>
             <w:r>
               <w:t xml:space="preserve">2026-09-14</w:t>
-            </w:r>
-          </w:p>
-        </w:tc>
-        <w:tc>
-          <w:tcPr>
-            <w:shd w:val="clear" w:color="auto" w:fill="F6F8FA"/>
-          </w:tcPr>
-          <w:p>
-            <w:pPr>
-              <w:numPr>
-                <w:ilvl w:val="0"/>
-                <w:numId w:val="1073"/>
-              </w:numPr>
-              <w:jc w:val="left"/>
-            </w:pPr>
-            <w:r>
-              <w:t xml:space="preserve">Testcase headings now formatted as captions (like figures/tables): bold “Testcase N:” followed by description. Changed label from “Test Case” to “Testcase”.</w:t>
-            </w:r>
-          </w:p>
-        </w:tc>
-      </w:tr>
-      <w:tr>
-        <w:tc>
-          <w:tcPr/>
-          <w:p>
-            <w:pPr>
-              <w:jc w:val="left"/>
-            </w:pPr>
-            <w:r>
-              <w:t xml:space="preserve">4.6.0</w:t>
-            </w:r>
-          </w:p>
-        </w:tc>
-        <w:tc>
-          <w:tcPr/>
-          <w:p>
-            <w:pPr>
-              <w:jc w:val="left"/>
-            </w:pPr>
-            <w:r>
-              <w:t xml:space="preserve">2026-09-13</w:t>
             </w:r>
           </w:p>
         </w:tc>
@@ -15323,7 +15323,7 @@
               <w:jc w:val="left"/>
             </w:pPr>
             <w:r>
-              <w:t xml:space="preserve">Section restructure: Introduction, Test Cases (with category subsections), Conclusion. Testcases auto-numbered like figures/tables. Changed testcase from subsection to subsubsection.</w:t>
+              <w:t xml:space="preserve">Testcase headings now formatted as captions (like figures/tables): bold “Testcase N:” followed by description. Changed label from “Test Case” to “Testcase”.</w:t>
             </w:r>
           </w:p>
         </w:tc>
@@ -15338,7 +15338,7 @@
               <w:jc w:val="left"/>
             </w:pPr>
             <w:r>
-              <w:t xml:space="preserve">4.5.0</w:t>
+              <w:t xml:space="preserve">4.6.0</w:t>
             </w:r>
           </w:p>
         </w:tc>
@@ -15368,6 +15368,45 @@
               <w:jc w:val="left"/>
             </w:pPr>
             <w:r>
+              <w:t xml:space="preserve">Section restructure: Introduction, Test Cases (with category subsections), Conclusion. Testcases auto-numbered like figures/tables. Changed testcase from subsection to subsubsection.</w:t>
+            </w:r>
+          </w:p>
+        </w:tc>
+      </w:tr>
+      <w:tr>
+        <w:tc>
+          <w:tcPr/>
+          <w:p>
+            <w:pPr>
+              <w:jc w:val="left"/>
+            </w:pPr>
+            <w:r>
+              <w:t xml:space="preserve">4.5.0</w:t>
+            </w:r>
+          </w:p>
+        </w:tc>
+        <w:tc>
+          <w:tcPr/>
+          <w:p>
+            <w:pPr>
+              <w:jc w:val="left"/>
+            </w:pPr>
+            <w:r>
+              <w:t xml:space="preserve">2026-09-13</w:t>
+            </w:r>
+          </w:p>
+        </w:tc>
+        <w:tc>
+          <w:tcPr/>
+          <w:p>
+            <w:pPr>
+              <w:numPr>
+                <w:ilvl w:val="0"/>
+                <w:numId w:val="1076"/>
+              </w:numPr>
+              <w:jc w:val="left"/>
+            </w:pPr>
+            <w:r>
               <w:t xml:space="preserve">Unified field APIs:</w:t>
             </w:r>
             <w:r>
@@ -15432,54 +15471,15 @@
       </w:tr>
       <w:tr>
         <w:tc>
-          <w:tcPr/>
+          <w:tcPr>
+            <w:shd w:val="clear" w:color="auto" w:fill="F6F8FA"/>
+          </w:tcPr>
           <w:p>
             <w:pPr>
               <w:jc w:val="left"/>
             </w:pPr>
             <w:r>
               <w:t xml:space="preserve">4.4.0</w:t>
-            </w:r>
-          </w:p>
-        </w:tc>
-        <w:tc>
-          <w:tcPr/>
-          <w:p>
-            <w:pPr>
-              <w:jc w:val="left"/>
-            </w:pPr>
-            <w:r>
-              <w:t xml:space="preserve">2026-09-13</w:t>
-            </w:r>
-          </w:p>
-        </w:tc>
-        <w:tc>
-          <w:tcPr/>
-          <w:p>
-            <w:pPr>
-              <w:numPr>
-                <w:ilvl w:val="0"/>
-                <w:numId w:val="1076"/>
-              </w:numPr>
-              <w:jc w:val="left"/>
-            </w:pPr>
-            <w:r>
-              <w:t xml:space="preserve">Code review fixes: removed dead labels, badge now uses Huawei brand colors (tipbg/tipfg, huaweired, warningbg/warningfg), Lua filter preserves formatting in DOCX/MD/HTML via parse_latex_blocks, testprocedure handler preserves non-step content (images, code, callouts).</w:t>
-            </w:r>
-          </w:p>
-        </w:tc>
-      </w:tr>
-      <w:tr>
-        <w:tc>
-          <w:tcPr>
-            <w:shd w:val="clear" w:color="auto" w:fill="F6F8FA"/>
-          </w:tcPr>
-          <w:p>
-            <w:pPr>
-              <w:jc w:val="left"/>
-            </w:pPr>
-            <w:r>
-              <w:t xml:space="preserve">4.3.0</w:t>
             </w:r>
           </w:p>
         </w:tc>
@@ -15509,6 +15509,45 @@
               <w:jc w:val="left"/>
             </w:pPr>
             <w:r>
+              <w:t xml:space="preserve">Code review fixes: removed dead labels, badge now uses Huawei brand colors (tipbg/tipfg, huaweired, warningbg/warningfg), Lua filter preserves formatting in DOCX/MD/HTML via parse_latex_blocks, testprocedure handler preserves non-step content (images, code, callouts).</w:t>
+            </w:r>
+          </w:p>
+        </w:tc>
+      </w:tr>
+      <w:tr>
+        <w:tc>
+          <w:tcPr/>
+          <w:p>
+            <w:pPr>
+              <w:jc w:val="left"/>
+            </w:pPr>
+            <w:r>
+              <w:t xml:space="preserve">4.3.0</w:t>
+            </w:r>
+          </w:p>
+        </w:tc>
+        <w:tc>
+          <w:tcPr/>
+          <w:p>
+            <w:pPr>
+              <w:jc w:val="left"/>
+            </w:pPr>
+            <w:r>
+              <w:t xml:space="preserve">2026-09-13</w:t>
+            </w:r>
+          </w:p>
+        </w:tc>
+        <w:tc>
+          <w:tcPr/>
+          <w:p>
+            <w:pPr>
+              <w:numPr>
+                <w:ilvl w:val="0"/>
+                <w:numId w:val="1078"/>
+              </w:numPr>
+              <w:jc w:val="left"/>
+            </w:pPr>
+            <w:r>
               <w:t xml:space="preserve">Added</w:t>
             </w:r>
             <w:r>
@@ -15561,7 +15600,9 @@
       </w:tr>
       <w:tr>
         <w:tc>
-          <w:tcPr/>
+          <w:tcPr>
+            <w:shd w:val="clear" w:color="auto" w:fill="F6F8FA"/>
+          </w:tcPr>
           <w:p>
             <w:pPr>
               <w:jc w:val="left"/>
@@ -15572,7 +15613,9 @@
           </w:p>
         </w:tc>
         <w:tc>
-          <w:tcPr/>
+          <w:tcPr>
+            <w:shd w:val="clear" w:color="auto" w:fill="F6F8FA"/>
+          </w:tcPr>
           <w:p>
             <w:pPr>
               <w:jc w:val="left"/>
@@ -15583,12 +15626,14 @@
           </w:p>
         </w:tc>
         <w:tc>
-          <w:tcPr/>
+          <w:tcPr>
+            <w:shd w:val="clear" w:color="auto" w:fill="F6F8FA"/>
+          </w:tcPr>
           <w:p>
             <w:pPr>
               <w:numPr>
                 <w:ilvl w:val="0"/>
-                <w:numId w:val="1078"/>
+                <w:numId w:val="1079"/>
               </w:numPr>
               <w:jc w:val="left"/>
             </w:pPr>
@@ -15642,9 +15687,7 @@
       </w:tr>
       <w:tr>
         <w:tc>
-          <w:tcPr>
-            <w:shd w:val="clear" w:color="auto" w:fill="F6F8FA"/>
-          </w:tcPr>
+          <w:tcPr/>
           <w:p>
             <w:pPr>
               <w:jc w:val="left"/>
@@ -15655,9 +15698,7 @@
           </w:p>
         </w:tc>
         <w:tc>
-          <w:tcPr>
-            <w:shd w:val="clear" w:color="auto" w:fill="F6F8FA"/>
-          </w:tcPr>
+          <w:tcPr/>
           <w:p>
             <w:pPr>
               <w:jc w:val="left"/>
@@ -15668,14 +15709,12 @@
           </w:p>
         </w:tc>
         <w:tc>
-          <w:tcPr>
-            <w:shd w:val="clear" w:color="auto" w:fill="F6F8FA"/>
-          </w:tcPr>
+          <w:tcPr/>
           <w:p>
             <w:pPr>
               <w:numPr>
                 <w:ilvl w:val="0"/>
-                <w:numId w:val="1079"/>
+                <w:numId w:val="1080"/>
               </w:numPr>
               <w:jc w:val="left"/>
             </w:pPr>
@@ -15702,7 +15741,9 @@
       </w:tr>
       <w:tr>
         <w:tc>
-          <w:tcPr/>
+          <w:tcPr>
+            <w:shd w:val="clear" w:color="auto" w:fill="F6F8FA"/>
+          </w:tcPr>
           <w:p>
             <w:pPr>
               <w:jc w:val="left"/>
@@ -15713,7 +15754,9 @@
           </w:p>
         </w:tc>
         <w:tc>
-          <w:tcPr/>
+          <w:tcPr>
+            <w:shd w:val="clear" w:color="auto" w:fill="F6F8FA"/>
+          </w:tcPr>
           <w:p>
             <w:pPr>
               <w:jc w:val="left"/>
@@ -15724,12 +15767,14 @@
           </w:p>
         </w:tc>
         <w:tc>
-          <w:tcPr/>
+          <w:tcPr>
+            <w:shd w:val="clear" w:color="auto" w:fill="F6F8FA"/>
+          </w:tcPr>
           <w:p>
             <w:pPr>
               <w:numPr>
                 <w:ilvl w:val="0"/>
-                <w:numId w:val="1080"/>
+                <w:numId w:val="1081"/>
               </w:numPr>
               <w:jc w:val="left"/>
             </w:pPr>
@@ -15771,9 +15816,7 @@
       </w:tr>
       <w:tr>
         <w:tc>
-          <w:tcPr>
-            <w:shd w:val="clear" w:color="auto" w:fill="F6F8FA"/>
-          </w:tcPr>
+          <w:tcPr/>
           <w:p>
             <w:pPr>
               <w:jc w:val="left"/>
@@ -15784,9 +15827,7 @@
           </w:p>
         </w:tc>
         <w:tc>
-          <w:tcPr>
-            <w:shd w:val="clear" w:color="auto" w:fill="F6F8FA"/>
-          </w:tcPr>
+          <w:tcPr/>
           <w:p>
             <w:pPr>
               <w:jc w:val="left"/>
@@ -15797,14 +15838,12 @@
           </w:p>
         </w:tc>
         <w:tc>
-          <w:tcPr>
-            <w:shd w:val="clear" w:color="auto" w:fill="F6F8FA"/>
-          </w:tcPr>
+          <w:tcPr/>
           <w:p>
             <w:pPr>
               <w:numPr>
                 <w:ilvl w:val="0"/>
-                <w:numId w:val="1081"/>
+                <w:numId w:val="1082"/>
               </w:numPr>
               <w:jc w:val="left"/>
             </w:pPr>
@@ -15831,54 +15870,15 @@
       </w:tr>
       <w:tr>
         <w:tc>
-          <w:tcPr/>
+          <w:tcPr>
+            <w:shd w:val="clear" w:color="auto" w:fill="F6F8FA"/>
+          </w:tcPr>
           <w:p>
             <w:pPr>
               <w:jc w:val="left"/>
             </w:pPr>
             <w:r>
               <w:t xml:space="preserve">3.8.1</w:t>
-            </w:r>
-          </w:p>
-        </w:tc>
-        <w:tc>
-          <w:tcPr/>
-          <w:p>
-            <w:pPr>
-              <w:jc w:val="left"/>
-            </w:pPr>
-            <w:r>
-              <w:t xml:space="preserve">2026-09-13</w:t>
-            </w:r>
-          </w:p>
-        </w:tc>
-        <w:tc>
-          <w:tcPr/>
-          <w:p>
-            <w:pPr>
-              <w:numPr>
-                <w:ilvl w:val="0"/>
-                <w:numId w:val="1082"/>
-              </w:numPr>
-              <w:jc w:val="left"/>
-            </w:pPr>
-            <w:r>
-              <w:t xml:space="preserve">End-to-end quality review: fixed testbook PDF metadata title, removed stray user DOCX from template dir, fixed round-trip.sh variable typo, updated stale references in AGENTS.md and README.md, committed testbook sample PDFs, set TZ for pandoc cover time consistency, widened pandoc version range.</w:t>
-            </w:r>
-          </w:p>
-        </w:tc>
-      </w:tr>
-      <w:tr>
-        <w:tc>
-          <w:tcPr>
-            <w:shd w:val="clear" w:color="auto" w:fill="F6F8FA"/>
-          </w:tcPr>
-          <w:p>
-            <w:pPr>
-              <w:jc w:val="left"/>
-            </w:pPr>
-            <w:r>
-              <w:t xml:space="preserve">3.8.0</w:t>
             </w:r>
           </w:p>
         </w:tc>
@@ -15908,7 +15908,7 @@
               <w:jc w:val="left"/>
             </w:pPr>
             <w:r>
-              <w:t xml:space="preserve">Removed Tips and Tricks chapter (tmux configuration) — required VS Code-specific keybindings that don’t generalize across terminal setups.</w:t>
+              <w:t xml:space="preserve">End-to-end quality review: fixed testbook PDF metadata title, removed stray user DOCX from template dir, fixed round-trip.sh variable typo, updated stale references in AGENTS.md and README.md, committed testbook sample PDFs, set TZ for pandoc cover time consistency, widened pandoc version range.</w:t>
             </w:r>
           </w:p>
         </w:tc>
@@ -15921,18 +15921,18 @@
               <w:jc w:val="left"/>
             </w:pPr>
             <w:r>
-              <w:t xml:space="preserve">3.7.0</w:t>
-            </w:r>
-          </w:p>
-        </w:tc>
-        <w:tc>
-          <w:tcPr/>
-          <w:p>
-            <w:pPr>
-              <w:jc w:val="left"/>
-            </w:pPr>
-            <w:r>
-              <w:t xml:space="preserve">2026-09-12</w:t>
+              <w:t xml:space="preserve">3.8.0</w:t>
+            </w:r>
+          </w:p>
+        </w:tc>
+        <w:tc>
+          <w:tcPr/>
+          <w:p>
+            <w:pPr>
+              <w:jc w:val="left"/>
+            </w:pPr>
+            <w:r>
+              <w:t xml:space="preserve">2026-09-13</w:t>
             </w:r>
           </w:p>
         </w:tc>
@@ -15947,6 +15947,51 @@
               <w:jc w:val="left"/>
             </w:pPr>
             <w:r>
+              <w:t xml:space="preserve">Removed Tips and Tricks chapter (tmux configuration) — required VS Code-specific keybindings that don’t generalize across terminal setups.</w:t>
+            </w:r>
+          </w:p>
+        </w:tc>
+      </w:tr>
+      <w:tr>
+        <w:tc>
+          <w:tcPr>
+            <w:shd w:val="clear" w:color="auto" w:fill="F6F8FA"/>
+          </w:tcPr>
+          <w:p>
+            <w:pPr>
+              <w:jc w:val="left"/>
+            </w:pPr>
+            <w:r>
+              <w:t xml:space="preserve">3.7.0</w:t>
+            </w:r>
+          </w:p>
+        </w:tc>
+        <w:tc>
+          <w:tcPr>
+            <w:shd w:val="clear" w:color="auto" w:fill="F6F8FA"/>
+          </w:tcPr>
+          <w:p>
+            <w:pPr>
+              <w:jc w:val="left"/>
+            </w:pPr>
+            <w:r>
+              <w:t xml:space="preserve">2026-09-12</w:t>
+            </w:r>
+          </w:p>
+        </w:tc>
+        <w:tc>
+          <w:tcPr>
+            <w:shd w:val="clear" w:color="auto" w:fill="F6F8FA"/>
+          </w:tcPr>
+          <w:p>
+            <w:pPr>
+              <w:numPr>
+                <w:ilvl w:val="0"/>
+                <w:numId w:val="1085"/>
+              </w:numPr>
+              <w:jc w:val="left"/>
+            </w:pPr>
+            <w:r>
               <w:t xml:space="preserve">Added</w:t>
             </w:r>
             <w:r>
@@ -15999,9 +16044,7 @@
       </w:tr>
       <w:tr>
         <w:tc>
-          <w:tcPr>
-            <w:shd w:val="clear" w:color="auto" w:fill="F6F8FA"/>
-          </w:tcPr>
+          <w:tcPr/>
           <w:p>
             <w:pPr>
               <w:jc w:val="left"/>
@@ -16012,9 +16055,7 @@
           </w:p>
         </w:tc>
         <w:tc>
-          <w:tcPr>
-            <w:shd w:val="clear" w:color="auto" w:fill="F6F8FA"/>
-          </w:tcPr>
+          <w:tcPr/>
           <w:p>
             <w:pPr>
               <w:jc w:val="left"/>
@@ -16025,14 +16066,12 @@
           </w:p>
         </w:tc>
         <w:tc>
-          <w:tcPr>
-            <w:shd w:val="clear" w:color="auto" w:fill="F6F8FA"/>
-          </w:tcPr>
+          <w:tcPr/>
           <w:p>
             <w:pPr>
               <w:numPr>
                 <w:ilvl w:val="0"/>
-                <w:numId w:val="1085"/>
+                <w:numId w:val="1086"/>
               </w:numPr>
               <w:jc w:val="left"/>
             </w:pPr>
@@ -16089,7 +16128,9 @@
       </w:tr>
       <w:tr>
         <w:tc>
-          <w:tcPr/>
+          <w:tcPr>
+            <w:shd w:val="clear" w:color="auto" w:fill="F6F8FA"/>
+          </w:tcPr>
           <w:p>
             <w:pPr>
               <w:jc w:val="left"/>
@@ -16100,7 +16141,9 @@
           </w:p>
         </w:tc>
         <w:tc>
-          <w:tcPr/>
+          <w:tcPr>
+            <w:shd w:val="clear" w:color="auto" w:fill="F6F8FA"/>
+          </w:tcPr>
           <w:p>
             <w:pPr>
               <w:jc w:val="left"/>
@@ -16111,12 +16154,14 @@
           </w:p>
         </w:tc>
         <w:tc>
-          <w:tcPr/>
+          <w:tcPr>
+            <w:shd w:val="clear" w:color="auto" w:fill="F6F8FA"/>
+          </w:tcPr>
           <w:p>
             <w:pPr>
               <w:numPr>
                 <w:ilvl w:val="0"/>
-                <w:numId w:val="1086"/>
+                <w:numId w:val="1087"/>
               </w:numPr>
               <w:jc w:val="left"/>
             </w:pPr>
@@ -16194,9 +16239,7 @@
       </w:tr>
       <w:tr>
         <w:tc>
-          <w:tcPr>
-            <w:shd w:val="clear" w:color="auto" w:fill="F6F8FA"/>
-          </w:tcPr>
+          <w:tcPr/>
           <w:p>
             <w:pPr>
               <w:jc w:val="left"/>
@@ -16207,9 +16250,7 @@
           </w:p>
         </w:tc>
         <w:tc>
-          <w:tcPr>
-            <w:shd w:val="clear" w:color="auto" w:fill="F6F8FA"/>
-          </w:tcPr>
+          <w:tcPr/>
           <w:p>
             <w:pPr>
               <w:jc w:val="left"/>
@@ -16220,14 +16261,12 @@
           </w:p>
         </w:tc>
         <w:tc>
-          <w:tcPr>
-            <w:shd w:val="clear" w:color="auto" w:fill="F6F8FA"/>
-          </w:tcPr>
+          <w:tcPr/>
           <w:p>
             <w:pPr>
               <w:numPr>
                 <w:ilvl w:val="0"/>
-                <w:numId w:val="1087"/>
+                <w:numId w:val="1088"/>
               </w:numPr>
               <w:jc w:val="left"/>
             </w:pPr>
@@ -16254,7 +16293,7 @@
             <w:pPr>
               <w:numPr>
                 <w:ilvl w:val="0"/>
-                <w:numId w:val="1087"/>
+                <w:numId w:val="1088"/>
               </w:numPr>
               <w:jc w:val="left"/>
             </w:pPr>
@@ -16296,7 +16335,7 @@
             <w:pPr>
               <w:numPr>
                 <w:ilvl w:val="0"/>
-                <w:numId w:val="1087"/>
+                <w:numId w:val="1088"/>
               </w:numPr>
               <w:jc w:val="left"/>
             </w:pPr>
@@ -16308,7 +16347,9 @@
       </w:tr>
       <w:tr>
         <w:tc>
-          <w:tcPr/>
+          <w:tcPr>
+            <w:shd w:val="clear" w:color="auto" w:fill="F6F8FA"/>
+          </w:tcPr>
           <w:p>
             <w:pPr>
               <w:jc w:val="left"/>
@@ -16319,7 +16360,9 @@
           </w:p>
         </w:tc>
         <w:tc>
-          <w:tcPr/>
+          <w:tcPr>
+            <w:shd w:val="clear" w:color="auto" w:fill="F6F8FA"/>
+          </w:tcPr>
           <w:p>
             <w:pPr>
               <w:jc w:val="left"/>
@@ -16330,12 +16373,14 @@
           </w:p>
         </w:tc>
         <w:tc>
-          <w:tcPr/>
+          <w:tcPr>
+            <w:shd w:val="clear" w:color="auto" w:fill="F6F8FA"/>
+          </w:tcPr>
           <w:p>
             <w:pPr>
               <w:numPr>
                 <w:ilvl w:val="0"/>
-                <w:numId w:val="1088"/>
+                <w:numId w:val="1089"/>
               </w:numPr>
               <w:jc w:val="left"/>
             </w:pPr>
@@ -16362,7 +16407,7 @@
             <w:pPr>
               <w:numPr>
                 <w:ilvl w:val="0"/>
-                <w:numId w:val="1088"/>
+                <w:numId w:val="1089"/>
               </w:numPr>
               <w:jc w:val="left"/>
             </w:pPr>
@@ -16389,7 +16434,7 @@
             <w:pPr>
               <w:numPr>
                 <w:ilvl w:val="0"/>
-                <w:numId w:val="1088"/>
+                <w:numId w:val="1089"/>
               </w:numPr>
               <w:jc w:val="left"/>
             </w:pPr>
@@ -16401,7 +16446,7 @@
             <w:pPr>
               <w:numPr>
                 <w:ilvl w:val="0"/>
-                <w:numId w:val="1088"/>
+                <w:numId w:val="1089"/>
               </w:numPr>
               <w:jc w:val="left"/>
             </w:pPr>
@@ -16425,58 +16470,13 @@
       </w:tr>
       <w:tr>
         <w:tc>
-          <w:tcPr>
-            <w:shd w:val="clear" w:color="auto" w:fill="F6F8FA"/>
-          </w:tcPr>
+          <w:tcPr/>
           <w:p>
             <w:pPr>
               <w:jc w:val="left"/>
             </w:pPr>
             <w:r>
               <w:t xml:space="preserve">3.2.1</w:t>
-            </w:r>
-          </w:p>
-        </w:tc>
-        <w:tc>
-          <w:tcPr>
-            <w:shd w:val="clear" w:color="auto" w:fill="F6F8FA"/>
-          </w:tcPr>
-          <w:p>
-            <w:pPr>
-              <w:jc w:val="left"/>
-            </w:pPr>
-            <w:r>
-              <w:t xml:space="preserve">2026-09-11</w:t>
-            </w:r>
-          </w:p>
-        </w:tc>
-        <w:tc>
-          <w:tcPr>
-            <w:shd w:val="clear" w:color="auto" w:fill="F6F8FA"/>
-          </w:tcPr>
-          <w:p>
-            <w:pPr>
-              <w:numPr>
-                <w:ilvl w:val="0"/>
-                <w:numId w:val="1089"/>
-              </w:numPr>
-              <w:jc w:val="left"/>
-            </w:pPr>
-            <w:r>
-              <w:t xml:space="preserve">Renamed Chapter 7 from “Clean Up” to “Operations and Maintenance”. Added subsections for updating and uninstalling both the MaaS Gateway and the document templates. Added cloud resource cleanup as an optional subsection.</w:t>
-            </w:r>
-          </w:p>
-        </w:tc>
-      </w:tr>
-      <w:tr>
-        <w:tc>
-          <w:tcPr/>
-          <w:p>
-            <w:pPr>
-              <w:jc w:val="left"/>
-            </w:pPr>
-            <w:r>
-              <w:t xml:space="preserve">3.2.0</w:t>
             </w:r>
           </w:p>
         </w:tc>
@@ -16502,6 +16502,51 @@
               <w:jc w:val="left"/>
             </w:pPr>
             <w:r>
+              <w:t xml:space="preserve">Renamed Chapter 7 from “Clean Up” to “Operations and Maintenance”. Added subsections for updating and uninstalling both the MaaS Gateway and the document templates. Added cloud resource cleanup as an optional subsection.</w:t>
+            </w:r>
+          </w:p>
+        </w:tc>
+      </w:tr>
+      <w:tr>
+        <w:tc>
+          <w:tcPr>
+            <w:shd w:val="clear" w:color="auto" w:fill="F6F8FA"/>
+          </w:tcPr>
+          <w:p>
+            <w:pPr>
+              <w:jc w:val="left"/>
+            </w:pPr>
+            <w:r>
+              <w:t xml:space="preserve">3.2.0</w:t>
+            </w:r>
+          </w:p>
+        </w:tc>
+        <w:tc>
+          <w:tcPr>
+            <w:shd w:val="clear" w:color="auto" w:fill="F6F8FA"/>
+          </w:tcPr>
+          <w:p>
+            <w:pPr>
+              <w:jc w:val="left"/>
+            </w:pPr>
+            <w:r>
+              <w:t xml:space="preserve">2026-09-11</w:t>
+            </w:r>
+          </w:p>
+        </w:tc>
+        <w:tc>
+          <w:tcPr>
+            <w:shd w:val="clear" w:color="auto" w:fill="F6F8FA"/>
+          </w:tcPr>
+          <w:p>
+            <w:pPr>
+              <w:numPr>
+                <w:ilvl w:val="0"/>
+                <w:numId w:val="1091"/>
+              </w:numPr>
+              <w:jc w:val="left"/>
+            </w:pPr>
+            <w:r>
               <w:t xml:space="preserve">Added</w:t>
             </w:r>
             <w:r>
@@ -16563,7 +16608,7 @@
             <w:pPr>
               <w:numPr>
                 <w:ilvl w:val="0"/>
-                <w:numId w:val="1090"/>
+                <w:numId w:val="1091"/>
               </w:numPr>
               <w:jc w:val="left"/>
             </w:pPr>
@@ -16608,7 +16653,7 @@
             <w:pPr>
               <w:numPr>
                 <w:ilvl w:val="0"/>
-                <w:numId w:val="1090"/>
+                <w:numId w:val="1091"/>
               </w:numPr>
               <w:jc w:val="left"/>
             </w:pPr>
@@ -16620,58 +16665,13 @@
       </w:tr>
       <w:tr>
         <w:tc>
-          <w:tcPr>
-            <w:shd w:val="clear" w:color="auto" w:fill="F6F8FA"/>
-          </w:tcPr>
+          <w:tcPr/>
           <w:p>
             <w:pPr>
               <w:jc w:val="left"/>
             </w:pPr>
             <w:r>
               <w:t xml:space="preserve">3.1.2</w:t>
-            </w:r>
-          </w:p>
-        </w:tc>
-        <w:tc>
-          <w:tcPr>
-            <w:shd w:val="clear" w:color="auto" w:fill="F6F8FA"/>
-          </w:tcPr>
-          <w:p>
-            <w:pPr>
-              <w:jc w:val="left"/>
-            </w:pPr>
-            <w:r>
-              <w:t xml:space="preserve">2026-09-11</w:t>
-            </w:r>
-          </w:p>
-        </w:tc>
-        <w:tc>
-          <w:tcPr>
-            <w:shd w:val="clear" w:color="auto" w:fill="F6F8FA"/>
-          </w:tcPr>
-          <w:p>
-            <w:pPr>
-              <w:numPr>
-                <w:ilvl w:val="0"/>
-                <w:numId w:val="1091"/>
-              </w:numPr>
-              <w:jc w:val="left"/>
-            </w:pPr>
-            <w:r>
-              <w:t xml:space="preserve">Added output format guide to README.md: comparison table of PDF, Markdown, DOCX, and HTML with purpose, copy-paste quality, and limitations. Recommends Markdown for copy-paste.</w:t>
-            </w:r>
-          </w:p>
-        </w:tc>
-      </w:tr>
-      <w:tr>
-        <w:tc>
-          <w:tcPr/>
-          <w:p>
-            <w:pPr>
-              <w:jc w:val="left"/>
-            </w:pPr>
-            <w:r>
-              <w:t xml:space="preserve">3.1.1</w:t>
             </w:r>
           </w:p>
         </w:tc>
@@ -16697,6 +16697,51 @@
               <w:jc w:val="left"/>
             </w:pPr>
             <w:r>
+              <w:t xml:space="preserve">Added output format guide to README.md: comparison table of PDF, Markdown, DOCX, and HTML with purpose, copy-paste quality, and limitations. Recommends Markdown for copy-paste.</w:t>
+            </w:r>
+          </w:p>
+        </w:tc>
+      </w:tr>
+      <w:tr>
+        <w:tc>
+          <w:tcPr>
+            <w:shd w:val="clear" w:color="auto" w:fill="F6F8FA"/>
+          </w:tcPr>
+          <w:p>
+            <w:pPr>
+              <w:jc w:val="left"/>
+            </w:pPr>
+            <w:r>
+              <w:t xml:space="preserve">3.1.1</w:t>
+            </w:r>
+          </w:p>
+        </w:tc>
+        <w:tc>
+          <w:tcPr>
+            <w:shd w:val="clear" w:color="auto" w:fill="F6F8FA"/>
+          </w:tcPr>
+          <w:p>
+            <w:pPr>
+              <w:jc w:val="left"/>
+            </w:pPr>
+            <w:r>
+              <w:t xml:space="preserve">2026-09-11</w:t>
+            </w:r>
+          </w:p>
+        </w:tc>
+        <w:tc>
+          <w:tcPr>
+            <w:shd w:val="clear" w:color="auto" w:fill="F6F8FA"/>
+          </w:tcPr>
+          <w:p>
+            <w:pPr>
+              <w:numPr>
+                <w:ilvl w:val="0"/>
+                <w:numId w:val="1093"/>
+              </w:numPr>
+              <w:jc w:val="left"/>
+            </w:pPr>
+            <w:r>
               <w:t xml:space="preserve">Updated MaaS Gateway chapter to v1.10.9: non-interactive mode (</w:t>
             </w:r>
             <w:r>
@@ -16713,7 +16758,7 @@
             <w:pPr>
               <w:numPr>
                 <w:ilvl w:val="0"/>
-                <w:numId w:val="1092"/>
+                <w:numId w:val="1093"/>
               </w:numPr>
               <w:jc w:val="left"/>
             </w:pPr>
@@ -16755,7 +16800,7 @@
             <w:pPr>
               <w:numPr>
                 <w:ilvl w:val="0"/>
-                <w:numId w:val="1092"/>
+                <w:numId w:val="1093"/>
               </w:numPr>
               <w:jc w:val="left"/>
             </w:pPr>
@@ -16767,9 +16812,7 @@
       </w:tr>
       <w:tr>
         <w:tc>
-          <w:tcPr>
-            <w:shd w:val="clear" w:color="auto" w:fill="F6F8FA"/>
-          </w:tcPr>
+          <w:tcPr/>
           <w:p>
             <w:pPr>
               <w:jc w:val="left"/>
@@ -16780,9 +16823,7 @@
           </w:p>
         </w:tc>
         <w:tc>
-          <w:tcPr>
-            <w:shd w:val="clear" w:color="auto" w:fill="F6F8FA"/>
-          </w:tcPr>
+          <w:tcPr/>
           <w:p>
             <w:pPr>
               <w:jc w:val="left"/>
@@ -16793,14 +16834,12 @@
           </w:p>
         </w:tc>
         <w:tc>
-          <w:tcPr>
-            <w:shd w:val="clear" w:color="auto" w:fill="F6F8FA"/>
-          </w:tcPr>
+          <w:tcPr/>
           <w:p>
             <w:pPr>
               <w:numPr>
                 <w:ilvl w:val="0"/>
-                <w:numId w:val="1093"/>
+                <w:numId w:val="1094"/>
               </w:numPr>
               <w:jc w:val="left"/>
             </w:pPr>
@@ -16824,7 +16863,7 @@
             <w:pPr>
               <w:numPr>
                 <w:ilvl w:val="0"/>
-                <w:numId w:val="1093"/>
+                <w:numId w:val="1094"/>
               </w:numPr>
               <w:jc w:val="left"/>
             </w:pPr>
@@ -16866,7 +16905,7 @@
             <w:pPr>
               <w:numPr>
                 <w:ilvl w:val="0"/>
-                <w:numId w:val="1093"/>
+                <w:numId w:val="1094"/>
               </w:numPr>
               <w:jc w:val="left"/>
             </w:pPr>
@@ -16874,57 +16913,6 @@
               <w:t xml:space="preserve">Restructured chapters: moved SSH config and VS Code connection to new Chapter 4 (Install VS Code and Connect via Remote-SSH). Chapters 5—​7 renumbered.</w:t>
             </w:r>
           </w:p>
-          <w:p>
-            <w:pPr>
-              <w:numPr>
-                <w:ilvl w:val="0"/>
-                <w:numId w:val="1093"/>
-              </w:numPr>
-              <w:jc w:val="left"/>
-            </w:pPr>
-            <w:r>
-              <w:t xml:space="preserve">Added verification checklist tables to all 7 chapters.</w:t>
-            </w:r>
-          </w:p>
-          <w:p>
-            <w:pPr>
-              <w:numPr>
-                <w:ilvl w:val="0"/>
-                <w:numId w:val="1093"/>
-              </w:numPr>
-              <w:jc w:val="left"/>
-            </w:pPr>
-            <w:r>
-              <w:t xml:space="preserve">Added mandatory reboot warning in Chapter 2 (SSH port change). Added troubleshooting subsection in Chapter 4 with common SSH connection issues and ncat debugging commands.</w:t>
-            </w:r>
-          </w:p>
-        </w:tc>
-      </w:tr>
-      <w:tr>
-        <w:tc>
-          <w:tcPr/>
-          <w:p>
-            <w:pPr>
-              <w:jc w:val="left"/>
-            </w:pPr>
-            <w:r>
-              <w:t xml:space="preserve">3.0.1</w:t>
-            </w:r>
-          </w:p>
-        </w:tc>
-        <w:tc>
-          <w:tcPr/>
-          <w:p>
-            <w:pPr>
-              <w:jc w:val="left"/>
-            </w:pPr>
-            <w:r>
-              <w:t xml:space="preserve">2026-09-10</w:t>
-            </w:r>
-          </w:p>
-        </w:tc>
-        <w:tc>
-          <w:tcPr/>
           <w:p>
             <w:pPr>
               <w:numPr>
@@ -16934,7 +16922,19 @@
               <w:jc w:val="left"/>
             </w:pPr>
             <w:r>
-              <w:t xml:space="preserve">Minor fixes: test-filter.sh auto-discovery, build.sh help text, Makefile aggregate descriptions, 5-section comment correction, CHANGELOG version gap note, callout-in-code fix, CI font auto-discovery, dofile path comment, test-sync.sh header.</w:t>
+              <w:t xml:space="preserve">Added verification checklist tables to all 7 chapters.</w:t>
+            </w:r>
+          </w:p>
+          <w:p>
+            <w:pPr>
+              <w:numPr>
+                <w:ilvl w:val="0"/>
+                <w:numId w:val="1094"/>
+              </w:numPr>
+              <w:jc w:val="left"/>
+            </w:pPr>
+            <w:r>
+              <w:t xml:space="preserve">Added mandatory reboot warning in Chapter 2 (SSH port change). Added troubleshooting subsection in Chapter 4 with common SSH connection issues and ncat debugging commands.</w:t>
             </w:r>
           </w:p>
         </w:tc>
@@ -16949,7 +16949,7 @@
               <w:jc w:val="left"/>
             </w:pPr>
             <w:r>
-              <w:t xml:space="preserve">3.0.0</w:t>
+              <w:t xml:space="preserve">3.0.1</w:t>
             </w:r>
           </w:p>
         </w:tc>
@@ -16962,7 +16962,7 @@
               <w:jc w:val="left"/>
             </w:pPr>
             <w:r>
-              <w:t xml:space="preserve">2026-09-09</w:t>
+              <w:t xml:space="preserve">2026-09-10</w:t>
             </w:r>
           </w:p>
         </w:tc>
@@ -16979,7 +16979,7 @@
               <w:jc w:val="left"/>
             </w:pPr>
             <w:r>
-              <w:t xml:space="preserve">Modular pipeline refactoring: shared Lua filter factory, shared DOCX fix logic, build system auto-discovery, unified format pipeline, GitHub Actions CI.</w:t>
+              <w:t xml:space="preserve">Minor fixes: test-filter.sh auto-discovery, build.sh help text, Makefile aggregate descriptions, 5-section comment correction, CHANGELOG version gap note, callout-in-code fix, CI font auto-discovery, dofile path comment, test-sync.sh header.</w:t>
             </w:r>
           </w:p>
         </w:tc>
@@ -16992,18 +16992,18 @@
               <w:jc w:val="left"/>
             </w:pPr>
             <w:r>
-              <w:t xml:space="preserve">2.16.0</w:t>
-            </w:r>
-          </w:p>
-        </w:tc>
-        <w:tc>
-          <w:tcPr/>
-          <w:p>
-            <w:pPr>
-              <w:jc w:val="left"/>
-            </w:pPr>
-            <w:r>
-              <w:t xml:space="preserve">2026-09-05</w:t>
+              <w:t xml:space="preserve">3.0.0</w:t>
+            </w:r>
+          </w:p>
+        </w:tc>
+        <w:tc>
+          <w:tcPr/>
+          <w:p>
+            <w:pPr>
+              <w:jc w:val="left"/>
+            </w:pPr>
+            <w:r>
+              <w:t xml:space="preserve">2026-09-09</w:t>
             </w:r>
           </w:p>
         </w:tc>
@@ -17018,7 +17018,7 @@
               <w:jc w:val="left"/>
             </w:pPr>
             <w:r>
-              <w:t xml:space="preserve">Updated to match template v2.16.0 — Lua filter fixes, build system updates, and technical template parity improvements.</w:t>
+              <w:t xml:space="preserve">Modular pipeline refactoring: shared Lua filter factory, shared DOCX fix logic, build system auto-discovery, unified format pipeline, GitHub Actions CI.</w:t>
             </w:r>
           </w:p>
         </w:tc>
@@ -17033,7 +17033,7 @@
               <w:jc w:val="left"/>
             </w:pPr>
             <w:r>
-              <w:t xml:space="preserve">2.13.0</w:t>
+              <w:t xml:space="preserve">2.16.0</w:t>
             </w:r>
           </w:p>
         </w:tc>
@@ -17046,7 +17046,7 @@
               <w:jc w:val="left"/>
             </w:pPr>
             <w:r>
-              <w:t xml:space="preserve">2026-08-24</w:t>
+              <w:t xml:space="preserve">2026-09-05</w:t>
             </w:r>
           </w:p>
         </w:tc>
@@ -17063,6 +17063,45 @@
               <w:jc w:val="left"/>
             </w:pPr>
             <w:r>
+              <w:t xml:space="preserve">Updated to match template v2.16.0 — Lua filter fixes, build system updates, and technical template parity improvements.</w:t>
+            </w:r>
+          </w:p>
+        </w:tc>
+      </w:tr>
+      <w:tr>
+        <w:tc>
+          <w:tcPr/>
+          <w:p>
+            <w:pPr>
+              <w:jc w:val="left"/>
+            </w:pPr>
+            <w:r>
+              <w:t xml:space="preserve">2.13.0</w:t>
+            </w:r>
+          </w:p>
+        </w:tc>
+        <w:tc>
+          <w:tcPr/>
+          <w:p>
+            <w:pPr>
+              <w:jc w:val="left"/>
+            </w:pPr>
+            <w:r>
+              <w:t xml:space="preserve">2026-08-24</w:t>
+            </w:r>
+          </w:p>
+        </w:tc>
+        <w:tc>
+          <w:tcPr/>
+          <w:p>
+            <w:pPr>
+              <w:numPr>
+                <w:ilvl w:val="0"/>
+                <w:numId w:val="1098"/>
+              </w:numPr>
+              <w:jc w:val="left"/>
+            </w:pPr>
+            <w:r>
               <w:t xml:space="preserve">Foundation refactoring Phase 4: make DOCX</w:t>
             </w:r>
             <w:r>
@@ -17130,7 +17169,9 @@
       </w:tr>
       <w:tr>
         <w:tc>
-          <w:tcPr/>
+          <w:tcPr>
+            <w:shd w:val="clear" w:color="auto" w:fill="F6F8FA"/>
+          </w:tcPr>
           <w:p>
             <w:pPr>
               <w:jc w:val="left"/>
@@ -17141,7 +17182,9 @@
           </w:p>
         </w:tc>
         <w:tc>
-          <w:tcPr/>
+          <w:tcPr>
+            <w:shd w:val="clear" w:color="auto" w:fill="F6F8FA"/>
+          </w:tcPr>
           <w:p>
             <w:pPr>
               <w:jc w:val="left"/>
@@ -17152,12 +17195,14 @@
           </w:p>
         </w:tc>
         <w:tc>
-          <w:tcPr/>
+          <w:tcPr>
+            <w:shd w:val="clear" w:color="auto" w:fill="F6F8FA"/>
+          </w:tcPr>
           <w:p>
             <w:pPr>
               <w:numPr>
                 <w:ilvl w:val="0"/>
-                <w:numId w:val="1098"/>
+                <w:numId w:val="1099"/>
               </w:numPr>
               <w:jc w:val="left"/>
             </w:pPr>
@@ -17319,9 +17364,7 @@
       </w:tr>
       <w:tr>
         <w:tc>
-          <w:tcPr>
-            <w:shd w:val="clear" w:color="auto" w:fill="F6F8FA"/>
-          </w:tcPr>
+          <w:tcPr/>
           <w:p>
             <w:pPr>
               <w:jc w:val="left"/>
@@ -17332,9 +17375,7 @@
           </w:p>
         </w:tc>
         <w:tc>
-          <w:tcPr>
-            <w:shd w:val="clear" w:color="auto" w:fill="F6F8FA"/>
-          </w:tcPr>
+          <w:tcPr/>
           <w:p>
             <w:pPr>
               <w:jc w:val="left"/>
@@ -17345,14 +17386,12 @@
           </w:p>
         </w:tc>
         <w:tc>
-          <w:tcPr>
-            <w:shd w:val="clear" w:color="auto" w:fill="F6F8FA"/>
-          </w:tcPr>
+          <w:tcPr/>
           <w:p>
             <w:pPr>
               <w:numPr>
                 <w:ilvl w:val="0"/>
-                <w:numId w:val="1099"/>
+                <w:numId w:val="1100"/>
               </w:numPr>
               <w:jc w:val="left"/>
             </w:pPr>
@@ -17418,7 +17457,9 @@
       </w:tr>
       <w:tr>
         <w:tc>
-          <w:tcPr/>
+          <w:tcPr>
+            <w:shd w:val="clear" w:color="auto" w:fill="F6F8FA"/>
+          </w:tcPr>
           <w:p>
             <w:pPr>
               <w:jc w:val="left"/>
@@ -17429,56 +17470,15 @@
           </w:p>
         </w:tc>
         <w:tc>
-          <w:tcPr/>
+          <w:tcPr>
+            <w:shd w:val="clear" w:color="auto" w:fill="F6F8FA"/>
+          </w:tcPr>
           <w:p>
             <w:pPr>
               <w:jc w:val="left"/>
             </w:pPr>
             <w:r>
               <w:t xml:space="preserve">2026-08-24</w:t>
-            </w:r>
-          </w:p>
-        </w:tc>
-        <w:tc>
-          <w:tcPr/>
-          <w:p>
-            <w:pPr>
-              <w:numPr>
-                <w:ilvl w:val="0"/>
-                <w:numId w:val="1100"/>
-              </w:numPr>
-              <w:jc w:val="left"/>
-            </w:pPr>
-            <w:r>
-              <w:t xml:space="preserve">Foundation refactoring Phase 1: sync cls version to project tag, fix stale doc references (L16 output count, L-range, setup-guide feature claim), add test-sync.sh for version consistency checking.</w:t>
-            </w:r>
-          </w:p>
-        </w:tc>
-      </w:tr>
-      <w:tr>
-        <w:tc>
-          <w:tcPr>
-            <w:shd w:val="clear" w:color="auto" w:fill="F6F8FA"/>
-          </w:tcPr>
-          <w:p>
-            <w:pPr>
-              <w:jc w:val="left"/>
-            </w:pPr>
-            <w:r>
-              <w:t xml:space="preserve">2.9.1</w:t>
-            </w:r>
-          </w:p>
-        </w:tc>
-        <w:tc>
-          <w:tcPr>
-            <w:shd w:val="clear" w:color="auto" w:fill="F6F8FA"/>
-          </w:tcPr>
-          <w:p>
-            <w:pPr>
-              <w:jc w:val="left"/>
-            </w:pPr>
-            <w:r>
-              <w:t xml:space="preserve">2026-08-23</w:t>
             </w:r>
           </w:p>
         </w:tc>
@@ -17495,6 +17495,45 @@
               <w:jc w:val="left"/>
             </w:pPr>
             <w:r>
+              <w:t xml:space="preserve">Foundation refactoring Phase 1: sync cls version to project tag, fix stale doc references (L16 output count, L-range, setup-guide feature claim), add test-sync.sh for version consistency checking.</w:t>
+            </w:r>
+          </w:p>
+        </w:tc>
+      </w:tr>
+      <w:tr>
+        <w:tc>
+          <w:tcPr/>
+          <w:p>
+            <w:pPr>
+              <w:jc w:val="left"/>
+            </w:pPr>
+            <w:r>
+              <w:t xml:space="preserve">2.9.1</w:t>
+            </w:r>
+          </w:p>
+        </w:tc>
+        <w:tc>
+          <w:tcPr/>
+          <w:p>
+            <w:pPr>
+              <w:jc w:val="left"/>
+            </w:pPr>
+            <w:r>
+              <w:t xml:space="preserve">2026-08-23</w:t>
+            </w:r>
+          </w:p>
+        </w:tc>
+        <w:tc>
+          <w:tcPr/>
+          <w:p>
+            <w:pPr>
+              <w:numPr>
+                <w:ilvl w:val="0"/>
+                <w:numId w:val="1102"/>
+              </w:numPr>
+              <w:jc w:val="left"/>
+            </w:pPr>
+            <w:r>
               <w:t xml:space="preserve">HTML and Markdown outputs now embed images as base64 data URIs. HTML uses pandoc</w:t>
             </w:r>
             <w:r>
@@ -17526,54 +17565,15 @@
       </w:tr>
       <w:tr>
         <w:tc>
-          <w:tcPr/>
+          <w:tcPr>
+            <w:shd w:val="clear" w:color="auto" w:fill="F6F8FA"/>
+          </w:tcPr>
           <w:p>
             <w:pPr>
               <w:jc w:val="left"/>
             </w:pPr>
             <w:r>
               <w:t xml:space="preserve">2.9.0</w:t>
-            </w:r>
-          </w:p>
-        </w:tc>
-        <w:tc>
-          <w:tcPr/>
-          <w:p>
-            <w:pPr>
-              <w:jc w:val="left"/>
-            </w:pPr>
-            <w:r>
-              <w:t xml:space="preserve">2026-08-23</w:t>
-            </w:r>
-          </w:p>
-        </w:tc>
-        <w:tc>
-          <w:tcPr/>
-          <w:p>
-            <w:pPr>
-              <w:numPr>
-                <w:ilvl w:val="0"/>
-                <w:numId w:val="1102"/>
-              </w:numPr>
-              <w:jc w:val="left"/>
-            </w:pPr>
-            <w:r>
-              <w:t xml:space="preserve">DOCX: fix content width (8504→9638tw, margins are 2cm not 3cm). Add footer page numbers. Style TOC heading (22pt bold + rule). Add hutable table width + fixed layout.</w:t>
-            </w:r>
-          </w:p>
-        </w:tc>
-      </w:tr>
-      <w:tr>
-        <w:tc>
-          <w:tcPr>
-            <w:shd w:val="clear" w:color="auto" w:fill="F6F8FA"/>
-          </w:tcPr>
-          <w:p>
-            <w:pPr>
-              <w:jc w:val="left"/>
-            </w:pPr>
-            <w:r>
-              <w:t xml:space="preserve">2.8.3</w:t>
             </w:r>
           </w:p>
         </w:tc>
@@ -17603,7 +17603,7 @@
               <w:jc w:val="left"/>
             </w:pPr>
             <w:r>
-              <w:t xml:space="preserve">DOCX fix: callout tables now have explicit width (8504tw) and fixed layout. Changelog section heading now uses custom H1 format (56pt number, red border, right tab) instead of pandoc’s default.</w:t>
+              <w:t xml:space="preserve">DOCX: fix content width (8504→9638tw, margins are 2cm not 3cm). Add footer page numbers. Style TOC heading (22pt bold + rule). Add hutable table width + fixed layout.</w:t>
             </w:r>
           </w:p>
         </w:tc>
@@ -17616,7 +17616,7 @@
               <w:jc w:val="left"/>
             </w:pPr>
             <w:r>
-              <w:t xml:space="preserve">2.8.2</w:t>
+              <w:t xml:space="preserve">2.8.3</w:t>
             </w:r>
           </w:p>
         </w:tc>
@@ -17642,7 +17642,7 @@
               <w:jc w:val="left"/>
             </w:pPr>
             <w:r>
-              <w:t xml:space="preserve">DOCX H1 heading: reverted table approach to paragraph with tab stop + red bottom border. Table broke navigation pane and TOC field. Paragraph preserves Heading1 style for navigation while matching PDF layout (number left, title right, red rule below).</w:t>
+              <w:t xml:space="preserve">DOCX fix: callout tables now have explicit width (8504tw) and fixed layout. Changelog section heading now uses custom H1 format (56pt number, red border, right tab) instead of pandoc’s default.</w:t>
             </w:r>
           </w:p>
         </w:tc>
@@ -17657,7 +17657,7 @@
               <w:jc w:val="left"/>
             </w:pPr>
             <w:r>
-              <w:t xml:space="preserve">2.8.1</w:t>
+              <w:t xml:space="preserve">2.8.2</w:t>
             </w:r>
           </w:p>
         </w:tc>
@@ -17687,7 +17687,7 @@
               <w:jc w:val="left"/>
             </w:pPr>
             <w:r>
-              <w:t xml:space="preserve">DOCX heading fix: text color reverted to black (was incorrectly changed to Huawei red in v2.8.0). H1 now uses a two-column table (number left, title right) with red bottom rule. H2-H4 use simple inline format (number + title, no right tab stop).</w:t>
+              <w:t xml:space="preserve">DOCX H1 heading: reverted table approach to paragraph with tab stop + red bottom border. Table broke navigation pane and TOC field. Paragraph preserves Heading1 style for navigation while matching PDF layout (number left, title right, red rule below).</w:t>
             </w:r>
           </w:p>
         </w:tc>
@@ -17700,7 +17700,7 @@
               <w:jc w:val="left"/>
             </w:pPr>
             <w:r>
-              <w:t xml:space="preserve">2.8.0</w:t>
+              <w:t xml:space="preserve">2.8.1</w:t>
             </w:r>
           </w:p>
         </w:tc>
@@ -17726,7 +17726,7 @@
               <w:jc w:val="left"/>
             </w:pPr>
             <w:r>
-              <w:t xml:space="preserve">DOCX output: match PDF styling --- heading colors (Huawei red), H1 number size (56pt), callout borders (left-only) and padding, changelog formatting (rules, bold version, italic date), caption style (9pt bold), badge style (8pt bold white on red), list indentation.</w:t>
+              <w:t xml:space="preserve">DOCX heading fix: text color reverted to black (was incorrectly changed to Huawei red in v2.8.0). H1 now uses a two-column table (number left, title right) with red bottom rule. H2-H4 use simple inline format (number + title, no right tab stop).</w:t>
             </w:r>
           </w:p>
         </w:tc>
@@ -17741,7 +17741,7 @@
               <w:jc w:val="left"/>
             </w:pPr>
             <w:r>
-              <w:t xml:space="preserve">2.7.1</w:t>
+              <w:t xml:space="preserve">2.8.0</w:t>
             </w:r>
           </w:p>
         </w:tc>
@@ -17754,7 +17754,7 @@
               <w:jc w:val="left"/>
             </w:pPr>
             <w:r>
-              <w:t xml:space="preserve">2026-08-17</w:t>
+              <w:t xml:space="preserve">2026-08-23</w:t>
             </w:r>
           </w:p>
         </w:tc>
@@ -17771,6 +17771,45 @@
               <w:jc w:val="left"/>
             </w:pPr>
             <w:r>
+              <w:t xml:space="preserve">DOCX output: match PDF styling --- heading colors (Huawei red), H1 number size (56pt), callout borders (left-only) and padding, changelog formatting (rules, bold version, italic date), caption style (9pt bold), badge style (8pt bold white on red), list indentation.</w:t>
+            </w:r>
+          </w:p>
+        </w:tc>
+      </w:tr>
+      <w:tr>
+        <w:tc>
+          <w:tcPr/>
+          <w:p>
+            <w:pPr>
+              <w:jc w:val="left"/>
+            </w:pPr>
+            <w:r>
+              <w:t xml:space="preserve">2.7.1</w:t>
+            </w:r>
+          </w:p>
+        </w:tc>
+        <w:tc>
+          <w:tcPr/>
+          <w:p>
+            <w:pPr>
+              <w:jc w:val="left"/>
+            </w:pPr>
+            <w:r>
+              <w:t xml:space="preserve">2026-08-17</w:t>
+            </w:r>
+          </w:p>
+        </w:tc>
+        <w:tc>
+          <w:tcPr/>
+          <w:p>
+            <w:pPr>
+              <w:numPr>
+                <w:ilvl w:val="0"/>
+                <w:numId w:val="1108"/>
+              </w:numPr>
+              <w:jc w:val="left"/>
+            </w:pPr>
+            <w:r>
               <w:t xml:space="preserve">Rename project repository to all lowercase (</w:t>
             </w:r>
             <w:r>
@@ -17787,7 +17826,9 @@
       </w:tr>
       <w:tr>
         <w:tc>
-          <w:tcPr/>
+          <w:tcPr>
+            <w:shd w:val="clear" w:color="auto" w:fill="F6F8FA"/>
+          </w:tcPr>
           <w:p>
             <w:pPr>
               <w:jc w:val="left"/>
@@ -17798,7 +17839,9 @@
           </w:p>
         </w:tc>
         <w:tc>
-          <w:tcPr/>
+          <w:tcPr>
+            <w:shd w:val="clear" w:color="auto" w:fill="F6F8FA"/>
+          </w:tcPr>
           <w:p>
             <w:pPr>
               <w:jc w:val="left"/>
@@ -17809,12 +17852,14 @@
           </w:p>
         </w:tc>
         <w:tc>
-          <w:tcPr/>
+          <w:tcPr>
+            <w:shd w:val="clear" w:color="auto" w:fill="F6F8FA"/>
+          </w:tcPr>
           <w:p>
             <w:pPr>
               <w:numPr>
                 <w:ilvl w:val="0"/>
-                <w:numId w:val="1108"/>
+                <w:numId w:val="1109"/>
               </w:numPr>
               <w:jc w:val="left"/>
             </w:pPr>
@@ -17856,9 +17901,7 @@
       </w:tr>
       <w:tr>
         <w:tc>
-          <w:tcPr>
-            <w:shd w:val="clear" w:color="auto" w:fill="F6F8FA"/>
-          </w:tcPr>
+          <w:tcPr/>
           <w:p>
             <w:pPr>
               <w:jc w:val="left"/>
@@ -17869,9 +17912,7 @@
           </w:p>
         </w:tc>
         <w:tc>
-          <w:tcPr>
-            <w:shd w:val="clear" w:color="auto" w:fill="F6F8FA"/>
-          </w:tcPr>
+          <w:tcPr/>
           <w:p>
             <w:pPr>
               <w:jc w:val="left"/>
@@ -17882,14 +17923,12 @@
           </w:p>
         </w:tc>
         <w:tc>
-          <w:tcPr>
-            <w:shd w:val="clear" w:color="auto" w:fill="F6F8FA"/>
-          </w:tcPr>
+          <w:tcPr/>
           <w:p>
             <w:pPr>
               <w:numPr>
                 <w:ilvl w:val="0"/>
-                <w:numId w:val="1109"/>
+                <w:numId w:val="1110"/>
               </w:numPr>
               <w:jc w:val="left"/>
             </w:pPr>
@@ -17946,7 +17985,9 @@
       </w:tr>
       <w:tr>
         <w:tc>
-          <w:tcPr/>
+          <w:tcPr>
+            <w:shd w:val="clear" w:color="auto" w:fill="F6F8FA"/>
+          </w:tcPr>
           <w:p>
             <w:pPr>
               <w:jc w:val="left"/>
@@ -17957,7 +17998,9 @@
           </w:p>
         </w:tc>
         <w:tc>
-          <w:tcPr/>
+          <w:tcPr>
+            <w:shd w:val="clear" w:color="auto" w:fill="F6F8FA"/>
+          </w:tcPr>
           <w:p>
             <w:pPr>
               <w:jc w:val="left"/>
@@ -17968,12 +18011,14 @@
           </w:p>
         </w:tc>
         <w:tc>
-          <w:tcPr/>
+          <w:tcPr>
+            <w:shd w:val="clear" w:color="auto" w:fill="F6F8FA"/>
+          </w:tcPr>
           <w:p>
             <w:pPr>
               <w:numPr>
                 <w:ilvl w:val="0"/>
-                <w:numId w:val="1110"/>
+                <w:numId w:val="1111"/>
               </w:numPr>
               <w:jc w:val="left"/>
             </w:pPr>
@@ -18000,7 +18045,7 @@
             <w:pPr>
               <w:numPr>
                 <w:ilvl w:val="0"/>
-                <w:numId w:val="1110"/>
+                <w:numId w:val="1111"/>
               </w:numPr>
               <w:jc w:val="left"/>
             </w:pPr>
@@ -18027,58 +18072,13 @@
       </w:tr>
       <w:tr>
         <w:tc>
-          <w:tcPr>
-            <w:shd w:val="clear" w:color="auto" w:fill="F6F8FA"/>
-          </w:tcPr>
+          <w:tcPr/>
           <w:p>
             <w:pPr>
               <w:jc w:val="left"/>
             </w:pPr>
             <w:r>
               <w:t xml:space="preserve">2.5.1</w:t>
-            </w:r>
-          </w:p>
-        </w:tc>
-        <w:tc>
-          <w:tcPr>
-            <w:shd w:val="clear" w:color="auto" w:fill="F6F8FA"/>
-          </w:tcPr>
-          <w:p>
-            <w:pPr>
-              <w:jc w:val="left"/>
-            </w:pPr>
-            <w:r>
-              <w:t xml:space="preserve">2026-08-10</w:t>
-            </w:r>
-          </w:p>
-        </w:tc>
-        <w:tc>
-          <w:tcPr>
-            <w:shd w:val="clear" w:color="auto" w:fill="F6F8FA"/>
-          </w:tcPr>
-          <w:p>
-            <w:pPr>
-              <w:numPr>
-                <w:ilvl w:val="0"/>
-                <w:numId w:val="1111"/>
-              </w:numPr>
-              <w:jc w:val="left"/>
-            </w:pPr>
-            <w:r>
-              <w:t xml:space="preserve">H1 section title size reduced from 27pt to 20pt.</w:t>
-            </w:r>
-          </w:p>
-        </w:tc>
-      </w:tr>
-      <w:tr>
-        <w:tc>
-          <w:tcPr/>
-          <w:p>
-            <w:pPr>
-              <w:jc w:val="left"/>
-            </w:pPr>
-            <w:r>
-              <w:t xml:space="preserve">2.5.0</w:t>
             </w:r>
           </w:p>
         </w:tc>
@@ -18104,13 +18104,7 @@
               <w:jc w:val="left"/>
             </w:pPr>
             <w:r>
-              <w:t xml:space="preserve">Default image size increased: width 65% → 90% of text width,</w:t>
-            </w:r>
-            <w:r>
-              <w:t xml:space="preserve"> </w:t>
-            </w:r>
-            <w:r>
-              <w:t xml:space="preserve">height 40% → 50% of text height.</w:t>
+              <w:t xml:space="preserve">H1 section title size reduced from 27pt to 20pt.</w:t>
             </w:r>
           </w:p>
         </w:tc>
@@ -18125,7 +18119,7 @@
               <w:jc w:val="left"/>
             </w:pPr>
             <w:r>
-              <w:t xml:space="preserve">2.4.0</w:t>
+              <w:t xml:space="preserve">2.5.0</w:t>
             </w:r>
           </w:p>
         </w:tc>
@@ -18155,14 +18149,59 @@
               <w:jc w:val="left"/>
             </w:pPr>
             <w:r>
-              <w:t xml:space="preserve">Enlarged H1 section title (18pt → 27pt, 50% bigger).</w:t>
-            </w:r>
-          </w:p>
+              <w:t xml:space="preserve">Default image size increased: width 65% → 90% of text width,</w:t>
+            </w:r>
+            <w:r>
+              <w:t xml:space="preserve"> </w:t>
+            </w:r>
+            <w:r>
+              <w:t xml:space="preserve">height 40% → 50% of text height.</w:t>
+            </w:r>
+          </w:p>
+        </w:tc>
+      </w:tr>
+      <w:tr>
+        <w:tc>
+          <w:tcPr/>
+          <w:p>
+            <w:pPr>
+              <w:jc w:val="left"/>
+            </w:pPr>
+            <w:r>
+              <w:t xml:space="preserve">2.4.0</w:t>
+            </w:r>
+          </w:p>
+        </w:tc>
+        <w:tc>
+          <w:tcPr/>
+          <w:p>
+            <w:pPr>
+              <w:jc w:val="left"/>
+            </w:pPr>
+            <w:r>
+              <w:t xml:space="preserve">2026-08-10</w:t>
+            </w:r>
+          </w:p>
+        </w:tc>
+        <w:tc>
+          <w:tcPr/>
           <w:p>
             <w:pPr>
               <w:numPr>
                 <w:ilvl w:val="0"/>
-                <w:numId w:val="1113"/>
+                <w:numId w:val="1114"/>
+              </w:numPr>
+              <w:jc w:val="left"/>
+            </w:pPr>
+            <w:r>
+              <w:t xml:space="preserve">Enlarged H1 section title (18pt → 27pt, 50% bigger).</w:t>
+            </w:r>
+          </w:p>
+          <w:p>
+            <w:pPr>
+              <w:numPr>
+                <w:ilvl w:val="0"/>
+                <w:numId w:val="1114"/>
               </w:numPr>
               <w:jc w:val="left"/>
             </w:pPr>
@@ -18189,7 +18228,9 @@
       </w:tr>
       <w:tr>
         <w:tc>
-          <w:tcPr/>
+          <w:tcPr>
+            <w:shd w:val="clear" w:color="auto" w:fill="F6F8FA"/>
+          </w:tcPr>
           <w:p>
             <w:pPr>
               <w:jc w:val="left"/>
@@ -18200,7 +18241,9 @@
           </w:p>
         </w:tc>
         <w:tc>
-          <w:tcPr/>
+          <w:tcPr>
+            <w:shd w:val="clear" w:color="auto" w:fill="F6F8FA"/>
+          </w:tcPr>
           <w:p>
             <w:pPr>
               <w:jc w:val="left"/>
@@ -18211,12 +18254,14 @@
           </w:p>
         </w:tc>
         <w:tc>
-          <w:tcPr/>
+          <w:tcPr>
+            <w:shd w:val="clear" w:color="auto" w:fill="F6F8FA"/>
+          </w:tcPr>
           <w:p>
             <w:pPr>
               <w:numPr>
                 <w:ilvl w:val="0"/>
-                <w:numId w:val="1114"/>
+                <w:numId w:val="1115"/>
               </w:numPr>
               <w:jc w:val="left"/>
             </w:pPr>
@@ -18243,9 +18288,7 @@
       </w:tr>
       <w:tr>
         <w:tc>
-          <w:tcPr>
-            <w:shd w:val="clear" w:color="auto" w:fill="F6F8FA"/>
-          </w:tcPr>
+          <w:tcPr/>
           <w:p>
             <w:pPr>
               <w:jc w:val="left"/>
@@ -18256,9 +18299,7 @@
           </w:p>
         </w:tc>
         <w:tc>
-          <w:tcPr>
-            <w:shd w:val="clear" w:color="auto" w:fill="F6F8FA"/>
-          </w:tcPr>
+          <w:tcPr/>
           <w:p>
             <w:pPr>
               <w:jc w:val="left"/>
@@ -18269,14 +18310,12 @@
           </w:p>
         </w:tc>
         <w:tc>
-          <w:tcPr>
-            <w:shd w:val="clear" w:color="auto" w:fill="F6F8FA"/>
-          </w:tcPr>
+          <w:tcPr/>
           <w:p>
             <w:pPr>
               <w:numPr>
                 <w:ilvl w:val="0"/>
-                <w:numId w:val="1115"/>
+                <w:numId w:val="1116"/>
               </w:numPr>
               <w:jc w:val="left"/>
             </w:pPr>
@@ -18348,7 +18387,9 @@
       </w:tr>
       <w:tr>
         <w:tc>
-          <w:tcPr/>
+          <w:tcPr>
+            <w:shd w:val="clear" w:color="auto" w:fill="F6F8FA"/>
+          </w:tcPr>
           <w:p>
             <w:pPr>
               <w:jc w:val="left"/>
@@ -18359,7 +18400,9 @@
           </w:p>
         </w:tc>
         <w:tc>
-          <w:tcPr/>
+          <w:tcPr>
+            <w:shd w:val="clear" w:color="auto" w:fill="F6F8FA"/>
+          </w:tcPr>
           <w:p>
             <w:pPr>
               <w:jc w:val="left"/>
@@ -18370,12 +18413,14 @@
           </w:p>
         </w:tc>
         <w:tc>
-          <w:tcPr/>
+          <w:tcPr>
+            <w:shd w:val="clear" w:color="auto" w:fill="F6F8FA"/>
+          </w:tcPr>
           <w:p>
             <w:pPr>
               <w:numPr>
                 <w:ilvl w:val="0"/>
-                <w:numId w:val="1116"/>
+                <w:numId w:val="1117"/>
               </w:numPr>
               <w:jc w:val="left"/>
             </w:pPr>
@@ -18432,9 +18477,7 @@
       </w:tr>
       <w:tr>
         <w:tc>
-          <w:tcPr>
-            <w:shd w:val="clear" w:color="auto" w:fill="F6F8FA"/>
-          </w:tcPr>
+          <w:tcPr/>
           <w:p>
             <w:pPr>
               <w:jc w:val="left"/>
@@ -18445,9 +18488,7 @@
           </w:p>
         </w:tc>
         <w:tc>
-          <w:tcPr>
-            <w:shd w:val="clear" w:color="auto" w:fill="F6F8FA"/>
-          </w:tcPr>
+          <w:tcPr/>
           <w:p>
             <w:pPr>
               <w:jc w:val="left"/>
@@ -18458,14 +18499,12 @@
           </w:p>
         </w:tc>
         <w:tc>
-          <w:tcPr>
-            <w:shd w:val="clear" w:color="auto" w:fill="F6F8FA"/>
-          </w:tcPr>
+          <w:tcPr/>
           <w:p>
             <w:pPr>
               <w:numPr>
                 <w:ilvl w:val="0"/>
-                <w:numId w:val="1117"/>
+                <w:numId w:val="1118"/>
               </w:numPr>
               <w:jc w:val="left"/>
             </w:pPr>
@@ -18492,54 +18531,15 @@
       </w:tr>
       <w:tr>
         <w:tc>
-          <w:tcPr/>
+          <w:tcPr>
+            <w:shd w:val="clear" w:color="auto" w:fill="F6F8FA"/>
+          </w:tcPr>
           <w:p>
             <w:pPr>
               <w:jc w:val="left"/>
             </w:pPr>
             <w:r>
               <w:t xml:space="preserve">2.2.2</w:t>
-            </w:r>
-          </w:p>
-        </w:tc>
-        <w:tc>
-          <w:tcPr/>
-          <w:p>
-            <w:pPr>
-              <w:jc w:val="left"/>
-            </w:pPr>
-            <w:r>
-              <w:t xml:space="preserve">2026-08-08</w:t>
-            </w:r>
-          </w:p>
-        </w:tc>
-        <w:tc>
-          <w:tcPr/>
-          <w:p>
-            <w:pPr>
-              <w:numPr>
-                <w:ilvl w:val="0"/>
-                <w:numId w:val="1118"/>
-              </w:numPr>
-              <w:jc w:val="left"/>
-            </w:pPr>
-            <w:r>
-              <w:t xml:space="preserve">Fixed chapter reference in prerequisite (Chapter 3 → Chapter 4).</w:t>
-            </w:r>
-          </w:p>
-        </w:tc>
-      </w:tr>
-      <w:tr>
-        <w:tc>
-          <w:tcPr>
-            <w:shd w:val="clear" w:color="auto" w:fill="F6F8FA"/>
-          </w:tcPr>
-          <w:p>
-            <w:pPr>
-              <w:jc w:val="left"/>
-            </w:pPr>
-            <w:r>
-              <w:t xml:space="preserve">2.2.1</w:t>
             </w:r>
           </w:p>
         </w:tc>
@@ -18569,7 +18569,7 @@
               <w:jc w:val="left"/>
             </w:pPr>
             <w:r>
-              <w:t xml:space="preserve">Changed table and figure caption labels to black (was Huawei red).</w:t>
+              <w:t xml:space="preserve">Fixed chapter reference in prerequisite (Chapter 3 → Chapter 4).</w:t>
             </w:r>
           </w:p>
         </w:tc>
@@ -18582,7 +18582,7 @@
               <w:jc w:val="left"/>
             </w:pPr>
             <w:r>
-              <w:t xml:space="preserve">2.2.0</w:t>
+              <w:t xml:space="preserve">2.2.1</w:t>
             </w:r>
           </w:p>
         </w:tc>
@@ -18608,13 +18608,7 @@
               <w:jc w:val="left"/>
             </w:pPr>
             <w:r>
-              <w:t xml:space="preserve">Added Huawei-branded table styling: red header bar, alternating row</w:t>
-            </w:r>
-            <w:r>
-              <w:t xml:space="preserve"> </w:t>
-            </w:r>
-            <w:r>
-              <w:t xml:space="preserve">colors, and bordered cells.</w:t>
+              <w:t xml:space="preserve">Changed table and figure caption labels to black (was Huawei red).</w:t>
             </w:r>
           </w:p>
         </w:tc>
@@ -18629,7 +18623,7 @@
               <w:jc w:val="left"/>
             </w:pPr>
             <w:r>
-              <w:t xml:space="preserve">2.1.0</w:t>
+              <w:t xml:space="preserve">2.2.0</w:t>
             </w:r>
           </w:p>
         </w:tc>
@@ -18642,7 +18636,7 @@
               <w:jc w:val="left"/>
             </w:pPr>
             <w:r>
-              <w:t xml:space="preserve">2026-08-06</w:t>
+              <w:t xml:space="preserve">2026-08-08</w:t>
             </w:r>
           </w:p>
         </w:tc>
@@ -18659,6 +18653,51 @@
               <w:jc w:val="left"/>
             </w:pPr>
             <w:r>
+              <w:t xml:space="preserve">Added Huawei-branded table styling: red header bar, alternating row</w:t>
+            </w:r>
+            <w:r>
+              <w:t xml:space="preserve"> </w:t>
+            </w:r>
+            <w:r>
+              <w:t xml:space="preserve">colors, and bordered cells.</w:t>
+            </w:r>
+          </w:p>
+        </w:tc>
+      </w:tr>
+      <w:tr>
+        <w:tc>
+          <w:tcPr/>
+          <w:p>
+            <w:pPr>
+              <w:jc w:val="left"/>
+            </w:pPr>
+            <w:r>
+              <w:t xml:space="preserve">2.1.0</w:t>
+            </w:r>
+          </w:p>
+        </w:tc>
+        <w:tc>
+          <w:tcPr/>
+          <w:p>
+            <w:pPr>
+              <w:jc w:val="left"/>
+            </w:pPr>
+            <w:r>
+              <w:t xml:space="preserve">2026-08-06</w:t>
+            </w:r>
+          </w:p>
+        </w:tc>
+        <w:tc>
+          <w:tcPr/>
+          <w:p>
+            <w:pPr>
+              <w:numPr>
+                <w:ilvl w:val="0"/>
+                <w:numId w:val="1122"/>
+              </w:numPr>
+              <w:jc w:val="left"/>
+            </w:pPr>
+            <w:r>
               <w:t xml:space="preserve">Updated ECS flavor to</w:t>
             </w:r>
             <w:r>
@@ -18681,7 +18720,7 @@
             <w:pPr>
               <w:numPr>
                 <w:ilvl w:val="0"/>
-                <w:numId w:val="1121"/>
+                <w:numId w:val="1122"/>
               </w:numPr>
               <w:jc w:val="left"/>
             </w:pPr>
@@ -18693,7 +18732,7 @@
             <w:pPr>
               <w:numPr>
                 <w:ilvl w:val="0"/>
-                <w:numId w:val="1121"/>
+                <w:numId w:val="1122"/>
               </w:numPr>
               <w:jc w:val="left"/>
             </w:pPr>
@@ -18705,7 +18744,7 @@
             <w:pPr>
               <w:numPr>
                 <w:ilvl w:val="0"/>
-                <w:numId w:val="1121"/>
+                <w:numId w:val="1122"/>
               </w:numPr>
               <w:jc w:val="left"/>
             </w:pPr>
@@ -18717,7 +18756,7 @@
             <w:pPr>
               <w:numPr>
                 <w:ilvl w:val="0"/>
-                <w:numId w:val="1121"/>
+                <w:numId w:val="1122"/>
               </w:numPr>
               <w:jc w:val="left"/>
             </w:pPr>
@@ -18729,7 +18768,7 @@
             <w:pPr>
               <w:numPr>
                 <w:ilvl w:val="0"/>
-                <w:numId w:val="1121"/>
+                <w:numId w:val="1122"/>
               </w:numPr>
               <w:jc w:val="left"/>
             </w:pPr>
@@ -18747,7 +18786,7 @@
             <w:pPr>
               <w:numPr>
                 <w:ilvl w:val="0"/>
-                <w:numId w:val="1121"/>
+                <w:numId w:val="1122"/>
               </w:numPr>
               <w:jc w:val="left"/>
             </w:pPr>
@@ -18796,7 +18835,7 @@
             <w:pPr>
               <w:numPr>
                 <w:ilvl w:val="0"/>
-                <w:numId w:val="1121"/>
+                <w:numId w:val="1122"/>
               </w:numPr>
               <w:jc w:val="left"/>
             </w:pPr>
@@ -18808,7 +18847,7 @@
             <w:pPr>
               <w:numPr>
                 <w:ilvl w:val="0"/>
-                <w:numId w:val="1121"/>
+                <w:numId w:val="1122"/>
               </w:numPr>
               <w:jc w:val="left"/>
             </w:pPr>
@@ -18859,7 +18898,7 @@
             <w:pPr>
               <w:numPr>
                 <w:ilvl w:val="0"/>
-                <w:numId w:val="1121"/>
+                <w:numId w:val="1122"/>
               </w:numPr>
               <w:jc w:val="left"/>
             </w:pPr>
@@ -18886,7 +18925,9 @@
       </w:tr>
       <w:tr>
         <w:tc>
-          <w:tcPr/>
+          <w:tcPr>
+            <w:shd w:val="clear" w:color="auto" w:fill="F6F8FA"/>
+          </w:tcPr>
           <w:p>
             <w:pPr>
               <w:jc w:val="left"/>
@@ -18897,7 +18938,9 @@
           </w:p>
         </w:tc>
         <w:tc>
-          <w:tcPr/>
+          <w:tcPr>
+            <w:shd w:val="clear" w:color="auto" w:fill="F6F8FA"/>
+          </w:tcPr>
           <w:p>
             <w:pPr>
               <w:jc w:val="left"/>
@@ -18908,12 +18951,14 @@
           </w:p>
         </w:tc>
         <w:tc>
-          <w:tcPr/>
+          <w:tcPr>
+            <w:shd w:val="clear" w:color="auto" w:fill="F6F8FA"/>
+          </w:tcPr>
           <w:p>
             <w:pPr>
               <w:numPr>
                 <w:ilvl w:val="0"/>
-                <w:numId w:val="1122"/>
+                <w:numId w:val="1123"/>
               </w:numPr>
               <w:jc w:val="left"/>
             </w:pPr>
@@ -18931,7 +18976,7 @@
             <w:pPr>
               <w:numPr>
                 <w:ilvl w:val="0"/>
-                <w:numId w:val="1122"/>
+                <w:numId w:val="1123"/>
               </w:numPr>
               <w:jc w:val="left"/>
             </w:pPr>
@@ -18985,7 +19030,7 @@
             <w:pPr>
               <w:numPr>
                 <w:ilvl w:val="0"/>
-                <w:numId w:val="1122"/>
+                <w:numId w:val="1123"/>
               </w:numPr>
               <w:jc w:val="left"/>
             </w:pPr>
@@ -19033,7 +19078,7 @@
             <w:pPr>
               <w:numPr>
                 <w:ilvl w:val="0"/>
-                <w:numId w:val="1122"/>
+                <w:numId w:val="1123"/>
               </w:numPr>
               <w:jc w:val="left"/>
             </w:pPr>
@@ -19054,9 +19099,7 @@
       </w:tr>
       <w:tr>
         <w:tc>
-          <w:tcPr>
-            <w:shd w:val="clear" w:color="auto" w:fill="F6F8FA"/>
-          </w:tcPr>
+          <w:tcPr/>
           <w:p>
             <w:pPr>
               <w:jc w:val="left"/>
@@ -19067,9 +19110,7 @@
           </w:p>
         </w:tc>
         <w:tc>
-          <w:tcPr>
-            <w:shd w:val="clear" w:color="auto" w:fill="F6F8FA"/>
-          </w:tcPr>
+          <w:tcPr/>
           <w:p>
             <w:pPr>
               <w:jc w:val="left"/>
@@ -19080,14 +19121,12 @@
           </w:p>
         </w:tc>
         <w:tc>
-          <w:tcPr>
-            <w:shd w:val="clear" w:color="auto" w:fill="F6F8FA"/>
-          </w:tcPr>
+          <w:tcPr/>
           <w:p>
             <w:pPr>
               <w:numPr>
                 <w:ilvl w:val="0"/>
-                <w:numId w:val="1123"/>
+                <w:numId w:val="1124"/>
               </w:numPr>
               <w:jc w:val="left"/>
             </w:pPr>
@@ -19099,7 +19138,7 @@
             <w:pPr>
               <w:numPr>
                 <w:ilvl w:val="0"/>
-                <w:numId w:val="1123"/>
+                <w:numId w:val="1124"/>
               </w:numPr>
               <w:jc w:val="left"/>
             </w:pPr>
@@ -19111,7 +19150,7 @@
             <w:pPr>
               <w:numPr>
                 <w:ilvl w:val="0"/>
-                <w:numId w:val="1123"/>
+                <w:numId w:val="1124"/>
               </w:numPr>
               <w:jc w:val="left"/>
             </w:pPr>
@@ -19123,7 +19162,7 @@
             <w:pPr>
               <w:numPr>
                 <w:ilvl w:val="0"/>
-                <w:numId w:val="1123"/>
+                <w:numId w:val="1124"/>
               </w:numPr>
               <w:jc w:val="left"/>
             </w:pPr>
@@ -19141,7 +19180,7 @@
             <w:pPr>
               <w:numPr>
                 <w:ilvl w:val="0"/>
-                <w:numId w:val="1123"/>
+                <w:numId w:val="1124"/>
               </w:numPr>
               <w:jc w:val="left"/>
             </w:pPr>
@@ -19153,7 +19192,7 @@
             <w:pPr>
               <w:numPr>
                 <w:ilvl w:val="0"/>
-                <w:numId w:val="1123"/>
+                <w:numId w:val="1124"/>
               </w:numPr>
               <w:jc w:val="left"/>
             </w:pPr>
@@ -20567,6 +20606,9 @@
     <w:abstractNumId w:val="991"/>
   </w:num>
   <w:num w:numId="1123">
+    <w:abstractNumId w:val="991"/>
+  </w:num>
+  <w:num w:numId="1124">
     <w:abstractNumId w:val="991"/>
   </w:num>
 </w:numbering>

</xml_diff>

<commit_message>
Fix badge pill overflow, widen testsummary result column (v6.14.1)
- huawei-badges.sty: \huaweibadge optional width is now a MINIMUM width
  (measured content centers at nominal; wider content expands the pill
  instead of overflowing the frame) — PT "Atende com ressalvas" (4.32cm)
  no longer spills past its 2cm/1.5cm frame; PDF matches DOCX PNG behavior
- testbook.cls: testsummary result column fits measured pill widths —
  4.5cm under portuguese, 2.7cm EN (removes all badge-row Overfull warnings)
- generate-badges.py: docstring PDF-reference note updated
- Version bump to v6.14.1 across cls files + setup-guide + CHANGELOG
</commit_message>
<xml_diff>
--- a/documents/setup-guide/setup-guide.docx
+++ b/documents/setup-guide/setup-guide.docx
@@ -84,7 +84,7 @@
           <w:b/>
           <w:sz w:val="24"/>
         </w:rPr>
-        <w:t xml:space="preserve">v6.14.0</w:t>
+        <w:t xml:space="preserve">v6.14.1</w:t>
       </w:r>
       <w:r>
         <w:rPr>
@@ -96,7 +96,7 @@
         <w:rPr>
           <w:sz w:val="24"/>
         </w:rPr>
-        <w:t xml:space="preserve">— September 23, 2026 11:10</w:t>
+        <w:t xml:space="preserve">— September 25, 2026 15:14</w:t>
       </w:r>
     </w:p>
     <w:sdt>
@@ -13854,18 +13854,18 @@
               <w:jc w:val="left"/>
             </w:pPr>
             <w:r>
-              <w:t xml:space="preserve">6.14.0</w:t>
-            </w:r>
-          </w:p>
-        </w:tc>
-        <w:tc>
-          <w:tcPr/>
-          <w:p>
-            <w:pPr>
-              <w:jc w:val="left"/>
-            </w:pPr>
-            <w:r>
-              <w:t xml:space="preserve">2026-09-23</w:t>
+              <w:t xml:space="preserve">6.14.1</w:t>
+            </w:r>
+          </w:p>
+        </w:tc>
+        <w:tc>
+          <w:tcPr/>
+          <w:p>
+            <w:pPr>
+              <w:jc w:val="left"/>
+            </w:pPr>
+            <w:r>
+              <w:t xml:space="preserve">2026-09-26</w:t>
             </w:r>
           </w:p>
         </w:tc>
@@ -13880,7 +13880,7 @@
               <w:jc w:val="left"/>
             </w:pPr>
             <w:r>
-              <w:t xml:space="preserve">Converter content-loss fixes: compound admonitions no longer corrupt nested tables and code, definition lists keep their definitions, colspan is supported (rowspan warns), block anchors on tables/images fix dead cross-references, and technical cover values (the setreport commands) now render on the PDF cover. Empty-macro tests fixed with etoolbox’s ifdefempty (covermeta shows the version; phantom Author row gone). HTML: double captions eliminated, EN admonition titles match the PDF (Info/Important/Tip), and technical sections render as language-aware headings in DOCX/MD/HTML. Build: font-fallback detection fixed (was dead code); install.sh now installs asciidoctor-diagram so fresh installs no longer lose diagrams silently. Round-trip heading checks are now exact.</w:t>
+              <w:t xml:space="preserve">Badge pills no longer overflow their frames: \ huaweibadge now auto-expands for labels wider than the nominal width (matching the DOCX PNG min-width behavior), and the testbook testsummary result column widens to the measured pill widths (4.5cm PT, 2.7cm EN), eliminating the badge-row Overfull warnings.</w:t>
             </w:r>
           </w:p>
         </w:tc>
@@ -13895,7 +13895,7 @@
               <w:jc w:val="left"/>
             </w:pPr>
             <w:r>
-              <w:t xml:space="preserve">6.13.0</w:t>
+              <w:t xml:space="preserve">6.14.1</w:t>
             </w:r>
           </w:p>
         </w:tc>
@@ -13908,7 +13908,7 @@
               <w:jc w:val="left"/>
             </w:pPr>
             <w:r>
-              <w:t xml:space="preserve">2026-09-23</w:t>
+              <w:t xml:space="preserve">2026-09-26</w:t>
             </w:r>
           </w:p>
         </w:tc>
@@ -13925,7 +13925,7 @@
               <w:jc w:val="left"/>
             </w:pPr>
             <w:r>
-              <w:t xml:space="preserve">Test-result vocabulary unified: Portuguese badges now read Atende / Atende com ressalvas / Não atende / Não testado in both testbook and POC (was Aprovado/Reprovado/Bloqueado/Não testado and Atendido/Parcial/Falha/Ignorado). Testbook gains the Partial result (Atende com ressalvas, orange pill); Blocked was dropped (legacy documents render the neutral fallback pill). English display and source enum values unchanged. Existing PT documents render the new names on recompile.</w:t>
+              <w:t xml:space="preserve">Badge pills no longer overflow their frames: \ huaweibadge now auto-expands for labels wider than the nominal width (matching the DOCX PNG min-width behavior), and the testbook testsummary result column widens to the measured pill widths (4.5cm PT, 2.7cm EN), eliminating the badge-row Overfull warnings.</w:t>
             </w:r>
           </w:p>
         </w:tc>
@@ -13938,18 +13938,18 @@
               <w:jc w:val="left"/>
             </w:pPr>
             <w:r>
-              <w:t xml:space="preserve">6.12.0</w:t>
-            </w:r>
-          </w:p>
-        </w:tc>
-        <w:tc>
-          <w:tcPr/>
-          <w:p>
-            <w:pPr>
-              <w:jc w:val="left"/>
-            </w:pPr>
-            <w:r>
-              <w:t xml:space="preserve">2026-09-23</w:t>
+              <w:t xml:space="preserve">6.14.1</w:t>
+            </w:r>
+          </w:p>
+        </w:tc>
+        <w:tc>
+          <w:tcPr/>
+          <w:p>
+            <w:pPr>
+              <w:jc w:val="left"/>
+            </w:pPr>
+            <w:r>
+              <w:t xml:space="preserve">2026-09-26</w:t>
             </w:r>
           </w:p>
         </w:tc>
@@ -13964,7 +13964,7 @@
               <w:jc w:val="left"/>
             </w:pPr>
             <w:r>
-              <w:t xml:space="preserve">Language audit: Portuguese documents no longer show English labels. Technical cover labels (Versão/Data/Cenário/Autor), testbook badges (Aprovado/Reprovado/Bloqueado/Não testado), HTML admonition titles and captions, DOCX callout labels, General Objective, E-mail, and image placeholder are now language-aware under :lang: pt. CSS technical section headings gained PT selectors; 6 CSS strings aligned with PDF. Badge PNGs auto-sized to fit text. Sample wording fixed: Cor/Amostra table headers, Infraestrutura como Código, provedor heading.</w:t>
+              <w:t xml:space="preserve">Badge pills no longer overflow their frames: \ huaweibadge now auto-expands for labels wider than the nominal width (matching the DOCX PNG min-width behavior), and the testbook testsummary result column widens to the measured pill widths (4.5cm PT, 2.7cm EN), eliminating the badge-row Overfull warnings.</w:t>
             </w:r>
           </w:p>
         </w:tc>
@@ -13979,7 +13979,7 @@
               <w:jc w:val="left"/>
             </w:pPr>
             <w:r>
-              <w:t xml:space="preserve">6.11.1</w:t>
+              <w:t xml:space="preserve">6.14.0</w:t>
             </w:r>
           </w:p>
         </w:tc>
@@ -13992,7 +13992,7 @@
               <w:jc w:val="left"/>
             </w:pPr>
             <w:r>
-              <w:t xml:space="preserve">2026-09-22</w:t>
+              <w:t xml:space="preserve">2026-09-23</w:t>
             </w:r>
           </w:p>
         </w:tc>
@@ -14009,7 +14009,7 @@
               <w:jc w:val="left"/>
             </w:pPr>
             <w:r>
-              <w:t xml:space="preserve">Documentation: document lifecycle clarified. Documents created via the skills are standalone deliverables — git is never used for individual documents; the :version: attribute and changelog block are the document’s own version control. All four SKILL.md files gained a “Document lifecycle” section and now scope AGENTS.md’s git workflow to template repository development only. AGENTS.md gained a Scope section stating user documents are gitignored and never repository content, and L17 is clarified to apply to template releases only.</w:t>
+              <w:t xml:space="preserve">Converter content-loss fixes: compound admonitions no longer corrupt nested tables and code, definition lists keep their definitions, colspan is supported (rowspan warns), block anchors on tables/images fix dead cross-references, and technical cover values (the setreport commands) now render on the PDF cover. Empty-macro tests fixed with etoolbox’s ifdefempty (covermeta shows the version; phantom Author row gone). HTML: double captions eliminated, EN admonition titles match the PDF (Info/Important/Tip), and technical sections render as language-aware headings in DOCX/MD/HTML. Build: font-fallback detection fixed (was dead code); install.sh now installs asciidoctor-diagram so fresh installs no longer lose diagrams silently. Round-trip heading checks are now exact.</w:t>
             </w:r>
           </w:p>
         </w:tc>
@@ -14022,18 +14022,18 @@
               <w:jc w:val="left"/>
             </w:pPr>
             <w:r>
-              <w:t xml:space="preserve">6.11.0</w:t>
-            </w:r>
-          </w:p>
-        </w:tc>
-        <w:tc>
-          <w:tcPr/>
-          <w:p>
-            <w:pPr>
-              <w:jc w:val="left"/>
-            </w:pPr>
-            <w:r>
-              <w:t xml:space="preserve">2026-09-22</w:t>
+              <w:t xml:space="preserve">6.13.0</w:t>
+            </w:r>
+          </w:p>
+        </w:tc>
+        <w:tc>
+          <w:tcPr/>
+          <w:p>
+            <w:pPr>
+              <w:jc w:val="left"/>
+            </w:pPr>
+            <w:r>
+              <w:t xml:space="preserve">2026-09-23</w:t>
             </w:r>
           </w:p>
         </w:tc>
@@ -14048,7 +14048,7 @@
               <w:jc w:val="left"/>
             </w:pPr>
             <w:r>
-              <w:t xml:space="preserve">Project-wide audit: converter robustness and cross-format consistency. Objectives roles now work in all forms — inline ([.general-objective] and [.objective]) and block (inside [.objectives]) — rendering language-aware labels (the block form previously crashed the build; the inline form silently dropped the label). The [.prerequisites] and [.stepbystep] roles attached to lists no longer drop items. Multi-author documents now list all authors. Conversion errors print a clean file:line message instead of a Ruby object dump. Unknown code languages (go, java, rust, terraform, …​) fall back to plain verbatim with a compile warning (was a hard error). DOCX/MD/HTML: codefile blocks ([.codefile,file=…​]) now inline the file content like the PDF, and admonition labels no longer corrupt NOTE:/TIP: lines inside code blocks. DOCX Fail/Falha badge backgrounds and plain-table borders now match the PDF colors. Shared class boilerplate extracted into the new huawei-base.cls base class (rendering unchanged). Watch mode survives compile errors; install reports failures instead of silent success; the /etc/LatexMk write is opt-in; build diagnostics are kept on failure; asciidoctor warnings now fail the build; a missing header logo warns instead of erroring. New test-pdf-compile.sh replaces the legacy test-filter stub; round-trip now validates the production build pipeline. Documentation corrected across README, AGENTS, and all SKILL files (objectives syntax, codefile example, supported languages, longhutable restriction, install requirements, pandoc range, security note).</w:t>
+              <w:t xml:space="preserve">Test-result vocabulary unified: Portuguese badges now read Atende / Atende com ressalvas / Não atende / Não testado in both testbook and POC (was Aprovado/Reprovado/Bloqueado/Não testado and Atendido/Parcial/Falha/Ignorado). Testbook gains the Partial result (Atende com ressalvas, orange pill); Blocked was dropped (legacy documents render the neutral fallback pill). English display and source enum values unchanged. Existing PT documents render the new names on recompile.</w:t>
             </w:r>
           </w:p>
         </w:tc>
@@ -14063,7 +14063,7 @@
               <w:jc w:val="left"/>
             </w:pPr>
             <w:r>
-              <w:t xml:space="preserve">6.10.0</w:t>
+              <w:t xml:space="preserve">6.12.0</w:t>
             </w:r>
           </w:p>
         </w:tc>
@@ -14076,7 +14076,7 @@
               <w:jc w:val="left"/>
             </w:pPr>
             <w:r>
-              <w:t xml:space="preserve">2026-09-21</w:t>
+              <w:t xml:space="preserve">2026-09-23</w:t>
             </w:r>
           </w:p>
         </w:tc>
@@ -14093,7 +14093,7 @@
               <w:jc w:val="left"/>
             </w:pPr>
             <w:r>
-              <w:t xml:space="preserve">Header logo, callout boxes, and note labels: DOCX header now shows the Huawei logo in the top-left corner (optional, driven by the :header-logo: attribute). DOCX admonitions (TIP, NOTE, WARNING) now render as styled callout boxes with colored backgrounds, left borders, and type labels — matching the PDF. PDF inline notes ([.note] role) now show a language-aware “Note:” label (was unlabeled italic text).</w:t>
+              <w:t xml:space="preserve">Language audit: Portuguese documents no longer show English labels. Technical cover labels (Versão/Data/Cenário/Autor), testbook badges (Aprovado/Reprovado/Bloqueado/Não testado), HTML admonition titles and captions, DOCX callout labels, General Objective, E-mail, and image placeholder are now language-aware under :lang: pt. CSS technical section headings gained PT selectors; 6 CSS strings aligned with PDF. Badge PNGs auto-sized to fit text. Sample wording fixed: Cor/Amostra table headers, Infraestrutura como Código, provedor heading.</w:t>
             </w:r>
           </w:p>
         </w:tc>
@@ -14106,18 +14106,18 @@
               <w:jc w:val="left"/>
             </w:pPr>
             <w:r>
-              <w:t xml:space="preserve">6.9.2</w:t>
-            </w:r>
-          </w:p>
-        </w:tc>
-        <w:tc>
-          <w:tcPr/>
-          <w:p>
-            <w:pPr>
-              <w:jc w:val="left"/>
-            </w:pPr>
-            <w:r>
-              <w:t xml:space="preserve">2026-09-21</w:t>
+              <w:t xml:space="preserve">6.11.1</w:t>
+            </w:r>
+          </w:p>
+        </w:tc>
+        <w:tc>
+          <w:tcPr/>
+          <w:p>
+            <w:pPr>
+              <w:jc w:val="left"/>
+            </w:pPr>
+            <w:r>
+              <w:t xml:space="preserve">2026-09-22</w:t>
             </w:r>
           </w:p>
         </w:tc>
@@ -14132,7 +14132,7 @@
               <w:jc w:val="left"/>
             </w:pPr>
             <w:r>
-              <w:t xml:space="preserve">Fix DOCX body text alignment: paragraphs are now justified (matching the PDF LaTeX default), instead of left-aligned.</w:t>
+              <w:t xml:space="preserve">Documentation: document lifecycle clarified. Documents created via the skills are standalone deliverables — git is never used for individual documents; the :version: attribute and changelog block are the document’s own version control. All four SKILL.md files gained a “Document lifecycle” section and now scope AGENTS.md’s git workflow to template repository development only. AGENTS.md gained a Scope section stating user documents are gitignored and never repository content, and L17 is clarified to apply to template releases only.</w:t>
             </w:r>
           </w:p>
         </w:tc>
@@ -14147,7 +14147,7 @@
               <w:jc w:val="left"/>
             </w:pPr>
             <w:r>
-              <w:t xml:space="preserve">6.9.1</w:t>
+              <w:t xml:space="preserve">6.11.0</w:t>
             </w:r>
           </w:p>
         </w:tc>
@@ -14160,7 +14160,7 @@
               <w:jc w:val="left"/>
             </w:pPr>
             <w:r>
-              <w:t xml:space="preserve">2026-09-21</w:t>
+              <w:t xml:space="preserve">2026-09-22</w:t>
             </w:r>
           </w:p>
         </w:tc>
@@ -14177,7 +14177,7 @@
               <w:jc w:val="left"/>
             </w:pPr>
             <w:r>
-              <w:t xml:space="preserve">Fix DOCX subsection number size: H2/H3/H4 section numbers were rendered at 56pt (same as H1) instead of matching the heading text size (18/16/14pt). The SectionNumber style is now unstyled (inherits heading size); 56pt is set directly on H1 number runs only.</w:t>
+              <w:t xml:space="preserve">Project-wide audit: converter robustness and cross-format consistency. Objectives roles now work in all forms — inline ([.general-objective] and [.objective]) and block (inside [.objectives]) — rendering language-aware labels (the block form previously crashed the build; the inline form silently dropped the label). The [.prerequisites] and [.stepbystep] roles attached to lists no longer drop items. Multi-author documents now list all authors. Conversion errors print a clean file:line message instead of a Ruby object dump. Unknown code languages (go, java, rust, terraform, …​) fall back to plain verbatim with a compile warning (was a hard error). DOCX/MD/HTML: codefile blocks ([.codefile,file=…​]) now inline the file content like the PDF, and admonition labels no longer corrupt NOTE:/TIP: lines inside code blocks. DOCX Fail/Falha badge backgrounds and plain-table borders now match the PDF colors. Shared class boilerplate extracted into the new huawei-base.cls base class (rendering unchanged). Watch mode survives compile errors; install reports failures instead of silent success; the /etc/LatexMk write is opt-in; build diagnostics are kept on failure; asciidoctor warnings now fail the build; a missing header logo warns instead of erroring. New test-pdf-compile.sh replaces the legacy test-filter stub; round-trip now validates the production build pipeline. Documentation corrected across README, AGENTS, and all SKILL files (objectives syntax, codefile example, supported languages, longhutable restriction, install requirements, pandoc range, security note).</w:t>
             </w:r>
           </w:p>
         </w:tc>
@@ -14190,7 +14190,7 @@
               <w:jc w:val="left"/>
             </w:pPr>
             <w:r>
-              <w:t xml:space="preserve">6.9.0</w:t>
+              <w:t xml:space="preserve">6.10.0</w:t>
             </w:r>
           </w:p>
         </w:tc>
@@ -14216,7 +14216,7 @@
               <w:jc w:val="left"/>
             </w:pPr>
             <w:r>
-              <w:t xml:space="preserve">TOC styling: the table-of-contents title rule is now Huawei red (was black) in both PDF and DOCX, matching the H1 heading red rules. DOCX TOC entries now match the PDF: level 1 bold 12pt, levels 2-3 normal 10pt, HarmonyOS Sans font. DOCX TOC depth increased from 2 to 3 levels (matching PDF tocdepth). Dead TOCTitle style removed from DOCX.</w:t>
+              <w:t xml:space="preserve">Header logo, callout boxes, and note labels: DOCX header now shows the Huawei logo in the top-left corner (optional, driven by the :header-logo: attribute). DOCX admonitions (TIP, NOTE, WARNING) now render as styled callout boxes with colored backgrounds, left borders, and type labels — matching the PDF. PDF inline notes ([.note] role) now show a language-aware “Note:” label (was unlabeled italic text).</w:t>
             </w:r>
           </w:p>
         </w:tc>
@@ -14231,7 +14231,7 @@
               <w:jc w:val="left"/>
             </w:pPr>
             <w:r>
-              <w:t xml:space="preserve">6.8.3</w:t>
+              <w:t xml:space="preserve">6.9.2</w:t>
             </w:r>
           </w:p>
         </w:tc>
@@ -14244,7 +14244,7 @@
               <w:jc w:val="left"/>
             </w:pPr>
             <w:r>
-              <w:t xml:space="preserve">2026-09-20</w:t>
+              <w:t xml:space="preserve">2026-09-21</w:t>
             </w:r>
           </w:p>
         </w:tc>
@@ -14261,7 +14261,7 @@
               <w:jc w:val="left"/>
             </w:pPr>
             <w:r>
-              <w:t xml:space="preserve">Docs accuracy fix: the multi-format pipeline descriptions in README, AGENTS, and all four SKILL.md files now correctly separate the DOCX/Markdown path (pre-processor then docbook then pandoc) from the HTML path (pre-processor then asciidoctor html5) — the previous wording implied HTML also went through docbook and pandoc. Corrected a stale comment in the DOCX fixer.</w:t>
+              <w:t xml:space="preserve">Fix DOCX body text alignment: paragraphs are now justified (matching the PDF LaTeX default), instead of left-aligned.</w:t>
             </w:r>
           </w:p>
         </w:tc>
@@ -14274,18 +14274,18 @@
               <w:jc w:val="left"/>
             </w:pPr>
             <w:r>
-              <w:t xml:space="preserve">6.8.2</w:t>
-            </w:r>
-          </w:p>
-        </w:tc>
-        <w:tc>
-          <w:tcPr/>
-          <w:p>
-            <w:pPr>
-              <w:jc w:val="left"/>
-            </w:pPr>
-            <w:r>
-              <w:t xml:space="preserve">2026-09-20</w:t>
+              <w:t xml:space="preserve">6.9.1</w:t>
+            </w:r>
+          </w:p>
+        </w:tc>
+        <w:tc>
+          <w:tcPr/>
+          <w:p>
+            <w:pPr>
+              <w:jc w:val="left"/>
+            </w:pPr>
+            <w:r>
+              <w:t xml:space="preserve">2026-09-21</w:t>
             </w:r>
           </w:p>
         </w:tc>
@@ -14300,7 +14300,7 @@
               <w:jc w:val="left"/>
             </w:pPr>
             <w:r>
-              <w:t xml:space="preserve">Documentation and cleanup: README, AGENTS, and all four SKILL.md files now describe the real multi-format pipeline (pre-processor + docx_fix --fix + --lang flag) instead of the pre-v6.4 asciidoctor-to-pandoc chain. DOCX TOC title is now right-aligned like the PDF (was targeting a dead style). Signature names render bold like the PDF. Dead code removed (unused Caption style, dead TOCTitle style, dead HTML badge CSS). The --template and --lang flags accept the equals form (--template=guide). Various stale comments corrected.</w:t>
+              <w:t xml:space="preserve">Fix DOCX subsection number size: H2/H3/H4 section numbers were rendered at 56pt (same as H1) instead of matching the heading text size (18/16/14pt). The SectionNumber style is now unstyled (inherits heading size); 56pt is set directly on H1 number runs only.</w:t>
             </w:r>
           </w:p>
         </w:tc>
@@ -14315,7 +14315,7 @@
               <w:jc w:val="left"/>
             </w:pPr>
             <w:r>
-              <w:t xml:space="preserve">6.8.1</w:t>
+              <w:t xml:space="preserve">6.9.0</w:t>
             </w:r>
           </w:p>
         </w:tc>
@@ -14328,7 +14328,7 @@
               <w:jc w:val="left"/>
             </w:pPr>
             <w:r>
-              <w:t xml:space="preserve">2026-09-20</w:t>
+              <w:t xml:space="preserve">2026-09-21</w:t>
             </w:r>
           </w:p>
         </w:tc>
@@ -14345,7 +14345,7 @@
               <w:jc w:val="left"/>
             </w:pPr>
             <w:r>
-              <w:t xml:space="preserve">Quality-pass fixes for v6.8.0: non-technical covers no longer show a stray Date paragraph (regression from the meta-scan change); the technical cover table is no longer hijacked from the body when :nochangelog: is set (boundary check on the cover-table detection); the Version/Date/Scenario table now renders unconditionally like the PDF (was gated by :nochangelog:); empty cover tables are skipped when no report values are set; corrected the cover-element-order wording in the v6.8.0 changelog.</w:t>
+              <w:t xml:space="preserve">TOC styling: the table-of-contents title rule is now Huawei red (was black) in both PDF and DOCX, matching the H1 heading red rules. DOCX TOC entries now match the PDF: level 1 bold 12pt, levels 2-3 normal 10pt, HarmonyOS Sans font. DOCX TOC depth increased from 2 to 3 levels (matching PDF tocdepth). Dead TOCTitle style removed from DOCX.</w:t>
             </w:r>
           </w:p>
         </w:tc>
@@ -14358,7 +14358,7 @@
               <w:jc w:val="left"/>
             </w:pPr>
             <w:r>
-              <w:t xml:space="preserve">6.8.0</w:t>
+              <w:t xml:space="preserve">6.8.3</w:t>
             </w:r>
           </w:p>
         </w:tc>
@@ -14384,7 +14384,7 @@
               <w:jc w:val="left"/>
             </w:pPr>
             <w:r>
-              <w:t xml:space="preserve">Technical report covers now match the PDF in DOCX/MD/HTML: the title uses the PDF’s 24pt size (was 36pt), the report type label appears below the title (the DOCX cover keeps the established title-first order; the PDF has label-then-title), and the Version/Date/Scenario table is rendered with the PDF’s red label column. The cover meta line now shows the report version and its set date (was the document version and the build date). Authors, when set, appear as a table row like the PDF.</w:t>
+              <w:t xml:space="preserve">Docs accuracy fix: the multi-format pipeline descriptions in README, AGENTS, and all four SKILL.md files now correctly separate the DOCX/Markdown path (pre-processor then docbook then pandoc) from the HTML path (pre-processor then asciidoctor html5) — the previous wording implied HTML also went through docbook and pandoc. Corrected a stale comment in the DOCX fixer.</w:t>
             </w:r>
           </w:p>
         </w:tc>
@@ -14399,7 +14399,7 @@
               <w:jc w:val="left"/>
             </w:pPr>
             <w:r>
-              <w:t xml:space="preserve">6.7.0</w:t>
+              <w:t xml:space="preserve">6.8.2</w:t>
             </w:r>
           </w:p>
         </w:tc>
@@ -14429,7 +14429,7 @@
               <w:jc w:val="left"/>
             </w:pPr>
             <w:r>
-              <w:t xml:space="preserve">Badge and language fidelity: DOCX badge pills now render black text like the PDF (was frame-colored), use the correct label case (Pass, not PASS), include the Portuguese POC labels (Atendido, Parcial, Falha, Ignorado), and render at native width per template (testbook badge text no longer shrinks). Portuguese signature greetings now match the PDF (At.te,), the POC classification label matches the full PDF wording, and the secondary-format table headers (stakeholders, closing record, test summary, changelog) are now language-aware. DOCX footers show Página in Portuguese documents. Cover dates no longer zero-pad the day.</w:t>
+              <w:t xml:space="preserve">Documentation and cleanup: README, AGENTS, and all four SKILL.md files now describe the real multi-format pipeline (pre-processor + docx_fix --fix + --lang flag) instead of the pre-v6.4 asciidoctor-to-pandoc chain. DOCX TOC title is now right-aligned like the PDF (was targeting a dead style). Signature names render bold like the PDF. Dead code removed (unused Caption style, dead TOCTitle style, dead HTML badge CSS). The --template and --lang flags accept the equals form (--template=guide). Various stale comments corrected.</w:t>
             </w:r>
           </w:p>
         </w:tc>
@@ -14442,7 +14442,7 @@
               <w:jc w:val="left"/>
             </w:pPr>
             <w:r>
-              <w:t xml:space="preserve">6.6.1</w:t>
+              <w:t xml:space="preserve">6.8.1</w:t>
             </w:r>
           </w:p>
         </w:tc>
@@ -14468,7 +14468,7 @@
               <w:jc w:val="left"/>
             </w:pPr>
             <w:r>
-              <w:t xml:space="preserve">Quality-pass fixes for v6.6.0: the TESTCASE-marker strip now covers the entire DOCX fix run (a failure at any stage can no longer leave markers in the output file); the fixer resets its template state between in-process runs (the documented path-sniffing fallback works again); build.sh also cleans temporary files on interrupt signals; fixed a CHANGELOG typo.</w:t>
+              <w:t xml:space="preserve">Quality-pass fixes for v6.8.0: non-technical covers no longer show a stray Date paragraph (regression from the meta-scan change); the technical cover table is no longer hijacked from the body when :nochangelog: is set (boundary check on the cover-table detection); the Version/Date/Scenario table now renders unconditionally like the PDF (was gated by :nochangelog:); empty cover tables are skipped when no report values are set; corrected the cover-element-order wording in the v6.8.0 changelog.</w:t>
             </w:r>
           </w:p>
         </w:tc>
@@ -14483,7 +14483,7 @@
               <w:jc w:val="left"/>
             </w:pPr>
             <w:r>
-              <w:t xml:space="preserve">6.6.0</w:t>
+              <w:t xml:space="preserve">6.8.0</w:t>
             </w:r>
           </w:p>
         </w:tc>
@@ -14513,6 +14513,129 @@
               <w:jc w:val="left"/>
             </w:pPr>
             <w:r>
+              <w:t xml:space="preserve">Technical report covers now match the PDF in DOCX/MD/HTML: the title uses the PDF’s 24pt size (was 36pt), the report type label appears below the title (the DOCX cover keeps the established title-first order; the PDF has label-then-title), and the Version/Date/Scenario table is rendered with the PDF’s red label column. The cover meta line now shows the report version and its set date (was the document version and the build date). Authors, when set, appear as a table row like the PDF.</w:t>
+            </w:r>
+          </w:p>
+        </w:tc>
+      </w:tr>
+      <w:tr>
+        <w:tc>
+          <w:tcPr/>
+          <w:p>
+            <w:pPr>
+              <w:jc w:val="left"/>
+            </w:pPr>
+            <w:r>
+              <w:t xml:space="preserve">6.7.0</w:t>
+            </w:r>
+          </w:p>
+        </w:tc>
+        <w:tc>
+          <w:tcPr/>
+          <w:p>
+            <w:pPr>
+              <w:jc w:val="left"/>
+            </w:pPr>
+            <w:r>
+              <w:t xml:space="preserve">2026-09-20</w:t>
+            </w:r>
+          </w:p>
+        </w:tc>
+        <w:tc>
+          <w:tcPr/>
+          <w:p>
+            <w:pPr>
+              <w:numPr>
+                <w:ilvl w:val="0"/>
+                <w:numId w:val="1058"/>
+              </w:numPr>
+              <w:jc w:val="left"/>
+            </w:pPr>
+            <w:r>
+              <w:t xml:space="preserve">Badge and language fidelity: DOCX badge pills now render black text like the PDF (was frame-colored), use the correct label case (Pass, not PASS), include the Portuguese POC labels (Atendido, Parcial, Falha, Ignorado), and render at native width per template (testbook badge text no longer shrinks). Portuguese signature greetings now match the PDF (At.te,), the POC classification label matches the full PDF wording, and the secondary-format table headers (stakeholders, closing record, test summary, changelog) are now language-aware. DOCX footers show Página in Portuguese documents. Cover dates no longer zero-pad the day.</w:t>
+            </w:r>
+          </w:p>
+        </w:tc>
+      </w:tr>
+      <w:tr>
+        <w:tc>
+          <w:tcPr>
+            <w:shd w:val="clear" w:color="auto" w:fill="F6F8FA"/>
+          </w:tcPr>
+          <w:p>
+            <w:pPr>
+              <w:jc w:val="left"/>
+            </w:pPr>
+            <w:r>
+              <w:t xml:space="preserve">6.6.1</w:t>
+            </w:r>
+          </w:p>
+        </w:tc>
+        <w:tc>
+          <w:tcPr>
+            <w:shd w:val="clear" w:color="auto" w:fill="F6F8FA"/>
+          </w:tcPr>
+          <w:p>
+            <w:pPr>
+              <w:jc w:val="left"/>
+            </w:pPr>
+            <w:r>
+              <w:t xml:space="preserve">2026-09-20</w:t>
+            </w:r>
+          </w:p>
+        </w:tc>
+        <w:tc>
+          <w:tcPr>
+            <w:shd w:val="clear" w:color="auto" w:fill="F6F8FA"/>
+          </w:tcPr>
+          <w:p>
+            <w:pPr>
+              <w:numPr>
+                <w:ilvl w:val="0"/>
+                <w:numId w:val="1059"/>
+              </w:numPr>
+              <w:jc w:val="left"/>
+            </w:pPr>
+            <w:r>
+              <w:t xml:space="preserve">Quality-pass fixes for v6.6.0: the TESTCASE-marker strip now covers the entire DOCX fix run (a failure at any stage can no longer leave markers in the output file); the fixer resets its template state between in-process runs (the documented path-sniffing fallback works again); build.sh also cleans temporary files on interrupt signals; fixed a CHANGELOG typo.</w:t>
+            </w:r>
+          </w:p>
+        </w:tc>
+      </w:tr>
+      <w:tr>
+        <w:tc>
+          <w:tcPr/>
+          <w:p>
+            <w:pPr>
+              <w:jc w:val="left"/>
+            </w:pPr>
+            <w:r>
+              <w:t xml:space="preserve">6.6.0</w:t>
+            </w:r>
+          </w:p>
+        </w:tc>
+        <w:tc>
+          <w:tcPr/>
+          <w:p>
+            <w:pPr>
+              <w:jc w:val="left"/>
+            </w:pPr>
+            <w:r>
+              <w:t xml:space="preserve">2026-09-20</w:t>
+            </w:r>
+          </w:p>
+        </w:tc>
+        <w:tc>
+          <w:tcPr/>
+          <w:p>
+            <w:pPr>
+              <w:numPr>
+                <w:ilvl w:val="0"/>
+                <w:numId w:val="1060"/>
+              </w:numPr>
+              <w:jc w:val="left"/>
+            </w:pPr>
+            <w:r>
               <w:t xml:space="preserve">Pipeline robustness: DOCX post-processing now fails loudly when content styling errors occur (TESTCASE markers can no longer leak into output); the DOCX fixer takes an explicit</w:t>
             </w:r>
             <w:r>
@@ -14535,138 +14658,15 @@
       </w:tr>
       <w:tr>
         <w:tc>
-          <w:tcPr/>
+          <w:tcPr>
+            <w:shd w:val="clear" w:color="auto" w:fill="F6F8FA"/>
+          </w:tcPr>
           <w:p>
             <w:pPr>
               <w:jc w:val="left"/>
             </w:pPr>
             <w:r>
               <w:t xml:space="preserve">6.5.2</w:t>
-            </w:r>
-          </w:p>
-        </w:tc>
-        <w:tc>
-          <w:tcPr/>
-          <w:p>
-            <w:pPr>
-              <w:jc w:val="left"/>
-            </w:pPr>
-            <w:r>
-              <w:t xml:space="preserve">2026-09-20</w:t>
-            </w:r>
-          </w:p>
-        </w:tc>
-        <w:tc>
-          <w:tcPr/>
-          <w:p>
-            <w:pPr>
-              <w:numPr>
-                <w:ilvl w:val="0"/>
-                <w:numId w:val="1058"/>
-              </w:numPr>
-              <w:jc w:val="left"/>
-            </w:pPr>
-            <w:r>
-              <w:t xml:space="preserve">Quality-pass fixes for v6.5.1: LaTeX quote conversion now handles only paired quotes (quote characters inside code arguments are no longer corrupted); signature cells containing escaped ampersands are no longer split; round-trip HTML generation guards the asciidoctor-diagram dependency and fails loudly when generation fails; pre-processor unit tests now cover pipe escaping in all five table handlers.</w:t>
-            </w:r>
-          </w:p>
-        </w:tc>
-      </w:tr>
-      <w:tr>
-        <w:tc>
-          <w:tcPr>
-            <w:shd w:val="clear" w:color="auto" w:fill="F6F8FA"/>
-          </w:tcPr>
-          <w:p>
-            <w:pPr>
-              <w:jc w:val="left"/>
-            </w:pPr>
-            <w:r>
-              <w:t xml:space="preserve">6.5.1</w:t>
-            </w:r>
-          </w:p>
-        </w:tc>
-        <w:tc>
-          <w:tcPr>
-            <w:shd w:val="clear" w:color="auto" w:fill="F6F8FA"/>
-          </w:tcPr>
-          <w:p>
-            <w:pPr>
-              <w:jc w:val="left"/>
-            </w:pPr>
-            <w:r>
-              <w:t xml:space="preserve">2026-09-20</w:t>
-            </w:r>
-          </w:p>
-        </w:tc>
-        <w:tc>
-          <w:tcPr>
-            <w:shd w:val="clear" w:color="auto" w:fill="F6F8FA"/>
-          </w:tcPr>
-          <w:p>
-            <w:pPr>
-              <w:numPr>
-                <w:ilvl w:val="0"/>
-                <w:numId w:val="1059"/>
-              </w:numPr>
-              <w:jc w:val="left"/>
-            </w:pPr>
-            <w:r>
-              <w:t xml:space="preserve">Fixed DOCX/MD/HTML output: tables are no longer corrupted when changelog, signature, or summary content contains a pipe character (“|”). Badge text is now preserved in DOCX/MD/HTML — a “Ready” badge renders “Ready” instead of “[NEW]”. Multi-item changelog entries render as bullet lists instead of being joined with a literal “+”. POC documents now include the changelog in DOCX/MD/HTML. The :noanswers: attribute now hides test results and remarks in DOCX/MD/HTML, matching the PDF. Inline LaTeX (monospace text, arrows, LaTeX quotes) no longer leaks from changelog entries. The test suite now exercises the real build pipeline (pre-processor wired into round-trip and DOCX tests), with new pre-processor unit tests.</w:t>
-            </w:r>
-          </w:p>
-        </w:tc>
-      </w:tr>
-      <w:tr>
-        <w:tc>
-          <w:tcPr/>
-          <w:p>
-            <w:pPr>
-              <w:jc w:val="left"/>
-            </w:pPr>
-            <w:r>
-              <w:t xml:space="preserve">6.5.0</w:t>
-            </w:r>
-          </w:p>
-        </w:tc>
-        <w:tc>
-          <w:tcPr/>
-          <w:p>
-            <w:pPr>
-              <w:jc w:val="left"/>
-            </w:pPr>
-            <w:r>
-              <w:t xml:space="preserve">2026-09-20</w:t>
-            </w:r>
-          </w:p>
-        </w:tc>
-        <w:tc>
-          <w:tcPr/>
-          <w:p>
-            <w:pPr>
-              <w:numPr>
-                <w:ilvl w:val="0"/>
-                <w:numId w:val="1060"/>
-              </w:numPr>
-              <w:jc w:val="left"/>
-            </w:pPr>
-            <w:r>
-              <w:t xml:space="preserve">Evidence checklist simplified to plain bullets in both PDF and DOCX (checkbox markers removed for compatibility). Planned Activities list in DOCX now uses Word’s native lower-roman numbering (i., ii., iii.) matching the PDF. Badges in DOCX replaced with exact-replica PNG pill images (rounded, colored frame and background, bold text) matching the PDF \ huaweibadge look — assets committed to the repo. Signature blocks in DOCX no longer show literal + symbols (proper hard line breaks).</w:t>
-            </w:r>
-          </w:p>
-        </w:tc>
-      </w:tr>
-      <w:tr>
-        <w:tc>
-          <w:tcPr>
-            <w:shd w:val="clear" w:color="auto" w:fill="F6F8FA"/>
-          </w:tcPr>
-          <w:p>
-            <w:pPr>
-              <w:jc w:val="left"/>
-            </w:pPr>
-            <w:r>
-              <w:t xml:space="preserve">6.4.7</w:t>
             </w:r>
           </w:p>
         </w:tc>
@@ -14696,7 +14696,7 @@
               <w:jc w:val="left"/>
             </w:pPr>
             <w:r>
-              <w:t xml:space="preserve">Section titles in DOCX now match the PDF heading design: the big section number (56pt) sits on the left, the title text is pushed to the right edge (a right tab stop mimics the LaTeX \ hfill), and the red rule runs below — previously the title sat left-aligned next to a small number. Applies to all templates.</w:t>
+              <w:t xml:space="preserve">Quality-pass fixes for v6.5.1: LaTeX quote conversion now handles only paired quotes (quote characters inside code arguments are no longer corrupted); signature cells containing escaped ampersands are no longer split; round-trip HTML generation guards the asciidoctor-diagram dependency and fails loudly when generation fails; pre-processor unit tests now cover pipe escaping in all five table handlers.</w:t>
             </w:r>
           </w:p>
         </w:tc>
@@ -14709,7 +14709,7 @@
               <w:jc w:val="left"/>
             </w:pPr>
             <w:r>
-              <w:t xml:space="preserve">6.4.6</w:t>
+              <w:t xml:space="preserve">6.5.1</w:t>
             </w:r>
           </w:p>
         </w:tc>
@@ -14735,7 +14735,7 @@
               <w:jc w:val="left"/>
             </w:pPr>
             <w:r>
-              <w:t xml:space="preserve">Code blocks inside test cases no longer break the red left rule in DOCX — the code style’s left indent (which jogged the rule) is reset inside test case blocks, and code blocks now show the PDF’s code box (gray background with thin border on top, bottom, and right, red rule continuing on the left).</w:t>
+              <w:t xml:space="preserve">Fixed DOCX/MD/HTML output: tables are no longer corrupted when changelog, signature, or summary content contains a pipe character (“|”). Badge text is now preserved in DOCX/MD/HTML — a “Ready” badge renders “Ready” instead of “[NEW]”. Multi-item changelog entries render as bullet lists instead of being joined with a literal “+”. POC documents now include the changelog in DOCX/MD/HTML. The :noanswers: attribute now hides test results and remarks in DOCX/MD/HTML, matching the PDF. Inline LaTeX (monospace text, arrows, LaTeX quotes) no longer leaks from changelog entries. The test suite now exercises the real build pipeline (pre-processor wired into round-trip and DOCX tests), with new pre-processor unit tests.</w:t>
             </w:r>
           </w:p>
         </w:tc>
@@ -14750,7 +14750,7 @@
               <w:jc w:val="left"/>
             </w:pPr>
             <w:r>
-              <w:t xml:space="preserve">6.4.5</w:t>
+              <w:t xml:space="preserve">6.5.0</w:t>
             </w:r>
           </w:p>
         </w:tc>
@@ -14780,7 +14780,7 @@
               <w:jc w:val="left"/>
             </w:pPr>
             <w:r>
-              <w:t xml:space="preserve">DOCX polish pass: all captions centered (matching the PDF), vertical spacing between blocks matched to the LaTeX rhythm (medskip/smallskip around captions, field bars, and steps), and test steps now render as separate paragraphs each with the red bold number (previously merged into one paragraph).</w:t>
+              <w:t xml:space="preserve">Evidence checklist simplified to plain bullets in both PDF and DOCX (checkbox markers removed for compatibility). Planned Activities list in DOCX now uses Word’s native lower-roman numbering (i., ii., iii.) matching the PDF. Badges in DOCX replaced with exact-replica PNG pill images (rounded, colored frame and background, bold text) matching the PDF \ huaweibadge look — assets committed to the repo. Signature blocks in DOCX no longer show literal + symbols (proper hard line breaks).</w:t>
             </w:r>
           </w:p>
         </w:tc>
@@ -14793,7 +14793,7 @@
               <w:jc w:val="left"/>
             </w:pPr>
             <w:r>
-              <w:t xml:space="preserve">6.4.4</w:t>
+              <w:t xml:space="preserve">6.4.7</w:t>
             </w:r>
           </w:p>
         </w:tc>
@@ -14819,7 +14819,7 @@
               <w:jc w:val="left"/>
             </w:pPr>
             <w:r>
-              <w:t xml:space="preserve">DOCX covers now show the logo, cover text, and version/date/time meta line like the PDF. Test case blocks in DOCX get the PDF’s visual wrapper: red left rule, red field header bars, and red step numbers. Captions follow the PDF ordering system in DOCX, MD, and HTML (Table/Diagram/Figure/Testcase N: with bold symbol). Portuguese PDFs now label diagrams "Diagrama N:" (was hardcoded English "Diagram"). Markdown and HTML output no longer leaks raw LaTeX from passthrough blocks — the DOCX pre-processor now feeds those pipelines too.</w:t>
+              <w:t xml:space="preserve">Section titles in DOCX now match the PDF heading design: the big section number (56pt) sits on the left, the title text is pushed to the right edge (a right tab stop mimics the LaTeX \ hfill), and the red rule runs below — previously the title sat left-aligned next to a small number. Applies to all templates.</w:t>
             </w:r>
           </w:p>
         </w:tc>
@@ -14834,7 +14834,7 @@
               <w:jc w:val="left"/>
             </w:pPr>
             <w:r>
-              <w:t xml:space="preserve">6.4.3</w:t>
+              <w:t xml:space="preserve">6.4.6</w:t>
             </w:r>
           </w:p>
         </w:tc>
@@ -14864,7 +14864,7 @@
               <w:jc w:val="left"/>
             </w:pPr>
             <w:r>
-              <w:t xml:space="preserve">Testbook and POC DOCX output now matches the PDF much more closely: native table of contents (language-aware, auto-populated), each section starts on a new page, embedded images and diagrams (PlantUML/Graphviz rendered), white-on-red table headers, cover version line under the title, centered test case captions, and plain black rules for signature grids.</w:t>
+              <w:t xml:space="preserve">Code blocks inside test cases no longer break the red left rule in DOCX — the code style’s left indent (which jogged the rule) is reset inside test case blocks, and code blocks now show the PDF’s code box (gray background with thin border on top, bottom, and right, red rule continuing on the left).</w:t>
             </w:r>
           </w:p>
         </w:tc>
@@ -14877,7 +14877,7 @@
               <w:jc w:val="left"/>
             </w:pPr>
             <w:r>
-              <w:t xml:space="preserve">6.4.2</w:t>
+              <w:t xml:space="preserve">6.4.5</w:t>
             </w:r>
           </w:p>
         </w:tc>
@@ -14903,7 +14903,7 @@
               <w:jc w:val="left"/>
             </w:pPr>
             <w:r>
-              <w:t xml:space="preserve">DOCX output for POC and testbook templates now includes all passthrough content (stakeholders, closing record, signatures, test cases, test summary, changelog) via a new pre-processor. Fixed dropped Test Scope fields in testbook DOCX output.</w:t>
+              <w:t xml:space="preserve">DOCX polish pass: all captions centered (matching the PDF), vertical spacing between blocks matched to the LaTeX rhythm (medskip/smallskip around captions, field bars, and steps), and test steps now render as separate paragraphs each with the red bold number (previously merged into one paragraph).</w:t>
             </w:r>
           </w:p>
         </w:tc>
@@ -14918,7 +14918,7 @@
               <w:jc w:val="left"/>
             </w:pPr>
             <w:r>
-              <w:t xml:space="preserve">6.4.0</w:t>
+              <w:t xml:space="preserve">6.4.4</w:t>
             </w:r>
           </w:p>
         </w:tc>
@@ -14948,6 +14948,129 @@
               <w:jc w:val="left"/>
             </w:pPr>
             <w:r>
+              <w:t xml:space="preserve">DOCX covers now show the logo, cover text, and version/date/time meta line like the PDF. Test case blocks in DOCX get the PDF’s visual wrapper: red left rule, red field header bars, and red step numbers. Captions follow the PDF ordering system in DOCX, MD, and HTML (Table/Diagram/Figure/Testcase N: with bold symbol). Portuguese PDFs now label diagrams "Diagrama N:" (was hardcoded English "Diagram"). Markdown and HTML output no longer leaks raw LaTeX from passthrough blocks — the DOCX pre-processor now feeds those pipelines too.</w:t>
+            </w:r>
+          </w:p>
+        </w:tc>
+      </w:tr>
+      <w:tr>
+        <w:tc>
+          <w:tcPr/>
+          <w:p>
+            <w:pPr>
+              <w:jc w:val="left"/>
+            </w:pPr>
+            <w:r>
+              <w:t xml:space="preserve">6.4.3</w:t>
+            </w:r>
+          </w:p>
+        </w:tc>
+        <w:tc>
+          <w:tcPr/>
+          <w:p>
+            <w:pPr>
+              <w:jc w:val="left"/>
+            </w:pPr>
+            <w:r>
+              <w:t xml:space="preserve">2026-09-20</w:t>
+            </w:r>
+          </w:p>
+        </w:tc>
+        <w:tc>
+          <w:tcPr/>
+          <w:p>
+            <w:pPr>
+              <w:numPr>
+                <w:ilvl w:val="0"/>
+                <w:numId w:val="1068"/>
+              </w:numPr>
+              <w:jc w:val="left"/>
+            </w:pPr>
+            <w:r>
+              <w:t xml:space="preserve">Testbook and POC DOCX output now matches the PDF much more closely: native table of contents (language-aware, auto-populated), each section starts on a new page, embedded images and diagrams (PlantUML/Graphviz rendered), white-on-red table headers, cover version line under the title, centered test case captions, and plain black rules for signature grids.</w:t>
+            </w:r>
+          </w:p>
+        </w:tc>
+      </w:tr>
+      <w:tr>
+        <w:tc>
+          <w:tcPr>
+            <w:shd w:val="clear" w:color="auto" w:fill="F6F8FA"/>
+          </w:tcPr>
+          <w:p>
+            <w:pPr>
+              <w:jc w:val="left"/>
+            </w:pPr>
+            <w:r>
+              <w:t xml:space="preserve">6.4.2</w:t>
+            </w:r>
+          </w:p>
+        </w:tc>
+        <w:tc>
+          <w:tcPr>
+            <w:shd w:val="clear" w:color="auto" w:fill="F6F8FA"/>
+          </w:tcPr>
+          <w:p>
+            <w:pPr>
+              <w:jc w:val="left"/>
+            </w:pPr>
+            <w:r>
+              <w:t xml:space="preserve">2026-09-20</w:t>
+            </w:r>
+          </w:p>
+        </w:tc>
+        <w:tc>
+          <w:tcPr>
+            <w:shd w:val="clear" w:color="auto" w:fill="F6F8FA"/>
+          </w:tcPr>
+          <w:p>
+            <w:pPr>
+              <w:numPr>
+                <w:ilvl w:val="0"/>
+                <w:numId w:val="1069"/>
+              </w:numPr>
+              <w:jc w:val="left"/>
+            </w:pPr>
+            <w:r>
+              <w:t xml:space="preserve">DOCX output for POC and testbook templates now includes all passthrough content (stakeholders, closing record, signatures, test cases, test summary, changelog) via a new pre-processor. Fixed dropped Test Scope fields in testbook DOCX output.</w:t>
+            </w:r>
+          </w:p>
+        </w:tc>
+      </w:tr>
+      <w:tr>
+        <w:tc>
+          <w:tcPr/>
+          <w:p>
+            <w:pPr>
+              <w:jc w:val="left"/>
+            </w:pPr>
+            <w:r>
+              <w:t xml:space="preserve">6.4.0</w:t>
+            </w:r>
+          </w:p>
+        </w:tc>
+        <w:tc>
+          <w:tcPr/>
+          <w:p>
+            <w:pPr>
+              <w:jc w:val="left"/>
+            </w:pPr>
+            <w:r>
+              <w:t xml:space="preserve">2026-09-20</w:t>
+            </w:r>
+          </w:p>
+        </w:tc>
+        <w:tc>
+          <w:tcPr/>
+          <w:p>
+            <w:pPr>
+              <w:numPr>
+                <w:ilvl w:val="0"/>
+                <w:numId w:val="1070"/>
+              </w:numPr>
+              <w:jc w:val="left"/>
+            </w:pPr>
+            <w:r>
               <w:t xml:space="preserve">Fixed changelog dates — replaced</w:t>
             </w:r>
             <w:r>
@@ -14970,7 +15093,9 @@
       </w:tr>
       <w:tr>
         <w:tc>
-          <w:tcPr/>
+          <w:tcPr>
+            <w:shd w:val="clear" w:color="auto" w:fill="F6F8FA"/>
+          </w:tcPr>
           <w:p>
             <w:pPr>
               <w:jc w:val="left"/>
@@ -14981,7 +15106,9 @@
           </w:p>
         </w:tc>
         <w:tc>
-          <w:tcPr/>
+          <w:tcPr>
+            <w:shd w:val="clear" w:color="auto" w:fill="F6F8FA"/>
+          </w:tcPr>
           <w:p>
             <w:pPr>
               <w:jc w:val="left"/>
@@ -14992,12 +15119,14 @@
           </w:p>
         </w:tc>
         <w:tc>
-          <w:tcPr/>
+          <w:tcPr>
+            <w:shd w:val="clear" w:color="auto" w:fill="F6F8FA"/>
+          </w:tcPr>
           <w:p>
             <w:pPr>
               <w:numPr>
                 <w:ilvl w:val="0"/>
-                <w:numId w:val="1068"/>
+                <w:numId w:val="1071"/>
               </w:numPr>
               <w:jc w:val="left"/>
             </w:pPr>
@@ -15009,9 +15138,7 @@
       </w:tr>
       <w:tr>
         <w:tc>
-          <w:tcPr>
-            <w:shd w:val="clear" w:color="auto" w:fill="F6F8FA"/>
-          </w:tcPr>
+          <w:tcPr/>
           <w:p>
             <w:pPr>
               <w:jc w:val="left"/>
@@ -15022,9 +15149,7 @@
           </w:p>
         </w:tc>
         <w:tc>
-          <w:tcPr>
-            <w:shd w:val="clear" w:color="auto" w:fill="F6F8FA"/>
-          </w:tcPr>
+          <w:tcPr/>
           <w:p>
             <w:pPr>
               <w:jc w:val="left"/>
@@ -15035,14 +15160,12 @@
           </w:p>
         </w:tc>
         <w:tc>
-          <w:tcPr>
-            <w:shd w:val="clear" w:color="auto" w:fill="F6F8FA"/>
-          </w:tcPr>
+          <w:tcPr/>
           <w:p>
             <w:pPr>
               <w:numPr>
                 <w:ilvl w:val="0"/>
-                <w:numId w:val="1069"/>
+                <w:numId w:val="1072"/>
               </w:numPr>
               <w:jc w:val="left"/>
             </w:pPr>
@@ -15054,7 +15177,9 @@
       </w:tr>
       <w:tr>
         <w:tc>
-          <w:tcPr/>
+          <w:tcPr>
+            <w:shd w:val="clear" w:color="auto" w:fill="F6F8FA"/>
+          </w:tcPr>
           <w:p>
             <w:pPr>
               <w:jc w:val="left"/>
@@ -15065,7 +15190,9 @@
           </w:p>
         </w:tc>
         <w:tc>
-          <w:tcPr/>
+          <w:tcPr>
+            <w:shd w:val="clear" w:color="auto" w:fill="F6F8FA"/>
+          </w:tcPr>
           <w:p>
             <w:pPr>
               <w:jc w:val="left"/>
@@ -15076,12 +15203,14 @@
           </w:p>
         </w:tc>
         <w:tc>
-          <w:tcPr/>
+          <w:tcPr>
+            <w:shd w:val="clear" w:color="auto" w:fill="F6F8FA"/>
+          </w:tcPr>
           <w:p>
             <w:pPr>
               <w:numPr>
                 <w:ilvl w:val="0"/>
-                <w:numId w:val="1070"/>
+                <w:numId w:val="1073"/>
               </w:numPr>
               <w:jc w:val="left"/>
             </w:pPr>
@@ -15108,9 +15237,7 @@
       </w:tr>
       <w:tr>
         <w:tc>
-          <w:tcPr>
-            <w:shd w:val="clear" w:color="auto" w:fill="F6F8FA"/>
-          </w:tcPr>
+          <w:tcPr/>
           <w:p>
             <w:pPr>
               <w:jc w:val="left"/>
@@ -15121,9 +15248,7 @@
           </w:p>
         </w:tc>
         <w:tc>
-          <w:tcPr>
-            <w:shd w:val="clear" w:color="auto" w:fill="F6F8FA"/>
-          </w:tcPr>
+          <w:tcPr/>
           <w:p>
             <w:pPr>
               <w:jc w:val="left"/>
@@ -15134,14 +15259,12 @@
           </w:p>
         </w:tc>
         <w:tc>
-          <w:tcPr>
-            <w:shd w:val="clear" w:color="auto" w:fill="F6F8FA"/>
-          </w:tcPr>
+          <w:tcPr/>
           <w:p>
             <w:pPr>
               <w:numPr>
                 <w:ilvl w:val="0"/>
-                <w:numId w:val="1071"/>
+                <w:numId w:val="1074"/>
               </w:numPr>
               <w:jc w:val="left"/>
             </w:pPr>
@@ -15153,7 +15276,9 @@
       </w:tr>
       <w:tr>
         <w:tc>
-          <w:tcPr/>
+          <w:tcPr>
+            <w:shd w:val="clear" w:color="auto" w:fill="F6F8FA"/>
+          </w:tcPr>
           <w:p>
             <w:pPr>
               <w:jc w:val="left"/>
@@ -15164,7 +15289,9 @@
           </w:p>
         </w:tc>
         <w:tc>
-          <w:tcPr/>
+          <w:tcPr>
+            <w:shd w:val="clear" w:color="auto" w:fill="F6F8FA"/>
+          </w:tcPr>
           <w:p>
             <w:pPr>
               <w:jc w:val="left"/>
@@ -15175,12 +15302,14 @@
           </w:p>
         </w:tc>
         <w:tc>
-          <w:tcPr/>
+          <w:tcPr>
+            <w:shd w:val="clear" w:color="auto" w:fill="F6F8FA"/>
+          </w:tcPr>
           <w:p>
             <w:pPr>
               <w:numPr>
                 <w:ilvl w:val="0"/>
-                <w:numId w:val="1072"/>
+                <w:numId w:val="1075"/>
               </w:numPr>
               <w:jc w:val="left"/>
             </w:pPr>
@@ -15192,9 +15321,7 @@
       </w:tr>
       <w:tr>
         <w:tc>
-          <w:tcPr>
-            <w:shd w:val="clear" w:color="auto" w:fill="F6F8FA"/>
-          </w:tcPr>
+          <w:tcPr/>
           <w:p>
             <w:pPr>
               <w:jc w:val="left"/>
@@ -15205,9 +15332,7 @@
           </w:p>
         </w:tc>
         <w:tc>
-          <w:tcPr>
-            <w:shd w:val="clear" w:color="auto" w:fill="F6F8FA"/>
-          </w:tcPr>
+          <w:tcPr/>
           <w:p>
             <w:pPr>
               <w:jc w:val="left"/>
@@ -15218,14 +15343,12 @@
           </w:p>
         </w:tc>
         <w:tc>
-          <w:tcPr>
-            <w:shd w:val="clear" w:color="auto" w:fill="F6F8FA"/>
-          </w:tcPr>
+          <w:tcPr/>
           <w:p>
             <w:pPr>
               <w:numPr>
                 <w:ilvl w:val="0"/>
-                <w:numId w:val="1073"/>
+                <w:numId w:val="1076"/>
               </w:numPr>
               <w:jc w:val="left"/>
             </w:pPr>
@@ -15291,7 +15414,9 @@
       </w:tr>
       <w:tr>
         <w:tc>
-          <w:tcPr/>
+          <w:tcPr>
+            <w:shd w:val="clear" w:color="auto" w:fill="F6F8FA"/>
+          </w:tcPr>
           <w:p>
             <w:pPr>
               <w:jc w:val="left"/>
@@ -15302,7 +15427,9 @@
           </w:p>
         </w:tc>
         <w:tc>
-          <w:tcPr/>
+          <w:tcPr>
+            <w:shd w:val="clear" w:color="auto" w:fill="F6F8FA"/>
+          </w:tcPr>
           <w:p>
             <w:pPr>
               <w:jc w:val="left"/>
@@ -15313,12 +15440,14 @@
           </w:p>
         </w:tc>
         <w:tc>
-          <w:tcPr/>
+          <w:tcPr>
+            <w:shd w:val="clear" w:color="auto" w:fill="F6F8FA"/>
+          </w:tcPr>
           <w:p>
             <w:pPr>
               <w:numPr>
                 <w:ilvl w:val="0"/>
-                <w:numId w:val="1074"/>
+                <w:numId w:val="1077"/>
               </w:numPr>
               <w:jc w:val="left"/>
             </w:pPr>
@@ -15330,9 +15459,7 @@
       </w:tr>
       <w:tr>
         <w:tc>
-          <w:tcPr>
-            <w:shd w:val="clear" w:color="auto" w:fill="F6F8FA"/>
-          </w:tcPr>
+          <w:tcPr/>
           <w:p>
             <w:pPr>
               <w:jc w:val="left"/>
@@ -15343,9 +15470,7 @@
           </w:p>
         </w:tc>
         <w:tc>
-          <w:tcPr>
-            <w:shd w:val="clear" w:color="auto" w:fill="F6F8FA"/>
-          </w:tcPr>
+          <w:tcPr/>
           <w:p>
             <w:pPr>
               <w:jc w:val="left"/>
@@ -15356,14 +15481,12 @@
           </w:p>
         </w:tc>
         <w:tc>
-          <w:tcPr>
-            <w:shd w:val="clear" w:color="auto" w:fill="F6F8FA"/>
-          </w:tcPr>
+          <w:tcPr/>
           <w:p>
             <w:pPr>
               <w:numPr>
                 <w:ilvl w:val="0"/>
-                <w:numId w:val="1075"/>
+                <w:numId w:val="1078"/>
               </w:numPr>
               <w:jc w:val="left"/>
             </w:pPr>
@@ -15375,7 +15498,9 @@
       </w:tr>
       <w:tr>
         <w:tc>
-          <w:tcPr/>
+          <w:tcPr>
+            <w:shd w:val="clear" w:color="auto" w:fill="F6F8FA"/>
+          </w:tcPr>
           <w:p>
             <w:pPr>
               <w:jc w:val="left"/>
@@ -15386,7 +15511,9 @@
           </w:p>
         </w:tc>
         <w:tc>
-          <w:tcPr/>
+          <w:tcPr>
+            <w:shd w:val="clear" w:color="auto" w:fill="F6F8FA"/>
+          </w:tcPr>
           <w:p>
             <w:pPr>
               <w:jc w:val="left"/>
@@ -15397,12 +15524,14 @@
           </w:p>
         </w:tc>
         <w:tc>
-          <w:tcPr/>
+          <w:tcPr>
+            <w:shd w:val="clear" w:color="auto" w:fill="F6F8FA"/>
+          </w:tcPr>
           <w:p>
             <w:pPr>
               <w:numPr>
                 <w:ilvl w:val="0"/>
-                <w:numId w:val="1076"/>
+                <w:numId w:val="1079"/>
               </w:numPr>
               <w:jc w:val="left"/>
             </w:pPr>
@@ -15471,9 +15600,7 @@
       </w:tr>
       <w:tr>
         <w:tc>
-          <w:tcPr>
-            <w:shd w:val="clear" w:color="auto" w:fill="F6F8FA"/>
-          </w:tcPr>
+          <w:tcPr/>
           <w:p>
             <w:pPr>
               <w:jc w:val="left"/>
@@ -15484,9 +15611,7 @@
           </w:p>
         </w:tc>
         <w:tc>
-          <w:tcPr>
-            <w:shd w:val="clear" w:color="auto" w:fill="F6F8FA"/>
-          </w:tcPr>
+          <w:tcPr/>
           <w:p>
             <w:pPr>
               <w:jc w:val="left"/>
@@ -15497,14 +15622,12 @@
           </w:p>
         </w:tc>
         <w:tc>
-          <w:tcPr>
-            <w:shd w:val="clear" w:color="auto" w:fill="F6F8FA"/>
-          </w:tcPr>
+          <w:tcPr/>
           <w:p>
             <w:pPr>
               <w:numPr>
                 <w:ilvl w:val="0"/>
-                <w:numId w:val="1077"/>
+                <w:numId w:val="1080"/>
               </w:numPr>
               <w:jc w:val="left"/>
             </w:pPr>
@@ -15516,7 +15639,9 @@
       </w:tr>
       <w:tr>
         <w:tc>
-          <w:tcPr/>
+          <w:tcPr>
+            <w:shd w:val="clear" w:color="auto" w:fill="F6F8FA"/>
+          </w:tcPr>
           <w:p>
             <w:pPr>
               <w:jc w:val="left"/>
@@ -15527,7 +15652,9 @@
           </w:p>
         </w:tc>
         <w:tc>
-          <w:tcPr/>
+          <w:tcPr>
+            <w:shd w:val="clear" w:color="auto" w:fill="F6F8FA"/>
+          </w:tcPr>
           <w:p>
             <w:pPr>
               <w:jc w:val="left"/>
@@ -15538,12 +15665,14 @@
           </w:p>
         </w:tc>
         <w:tc>
-          <w:tcPr/>
+          <w:tcPr>
+            <w:shd w:val="clear" w:color="auto" w:fill="F6F8FA"/>
+          </w:tcPr>
           <w:p>
             <w:pPr>
               <w:numPr>
                 <w:ilvl w:val="0"/>
-                <w:numId w:val="1078"/>
+                <w:numId w:val="1081"/>
               </w:numPr>
               <w:jc w:val="left"/>
             </w:pPr>
@@ -15600,9 +15729,7 @@
       </w:tr>
       <w:tr>
         <w:tc>
-          <w:tcPr>
-            <w:shd w:val="clear" w:color="auto" w:fill="F6F8FA"/>
-          </w:tcPr>
+          <w:tcPr/>
           <w:p>
             <w:pPr>
               <w:jc w:val="left"/>
@@ -15613,9 +15740,7 @@
           </w:p>
         </w:tc>
         <w:tc>
-          <w:tcPr>
-            <w:shd w:val="clear" w:color="auto" w:fill="F6F8FA"/>
-          </w:tcPr>
+          <w:tcPr/>
           <w:p>
             <w:pPr>
               <w:jc w:val="left"/>
@@ -15626,14 +15751,12 @@
           </w:p>
         </w:tc>
         <w:tc>
-          <w:tcPr>
-            <w:shd w:val="clear" w:color="auto" w:fill="F6F8FA"/>
-          </w:tcPr>
+          <w:tcPr/>
           <w:p>
             <w:pPr>
               <w:numPr>
                 <w:ilvl w:val="0"/>
-                <w:numId w:val="1079"/>
+                <w:numId w:val="1082"/>
               </w:numPr>
               <w:jc w:val="left"/>
             </w:pPr>
@@ -15687,7 +15810,9 @@
       </w:tr>
       <w:tr>
         <w:tc>
-          <w:tcPr/>
+          <w:tcPr>
+            <w:shd w:val="clear" w:color="auto" w:fill="F6F8FA"/>
+          </w:tcPr>
           <w:p>
             <w:pPr>
               <w:jc w:val="left"/>
@@ -15698,7 +15823,9 @@
           </w:p>
         </w:tc>
         <w:tc>
-          <w:tcPr/>
+          <w:tcPr>
+            <w:shd w:val="clear" w:color="auto" w:fill="F6F8FA"/>
+          </w:tcPr>
           <w:p>
             <w:pPr>
               <w:jc w:val="left"/>
@@ -15709,12 +15836,14 @@
           </w:p>
         </w:tc>
         <w:tc>
-          <w:tcPr/>
+          <w:tcPr>
+            <w:shd w:val="clear" w:color="auto" w:fill="F6F8FA"/>
+          </w:tcPr>
           <w:p>
             <w:pPr>
               <w:numPr>
                 <w:ilvl w:val="0"/>
-                <w:numId w:val="1080"/>
+                <w:numId w:val="1083"/>
               </w:numPr>
               <w:jc w:val="left"/>
             </w:pPr>
@@ -15741,9 +15870,7 @@
       </w:tr>
       <w:tr>
         <w:tc>
-          <w:tcPr>
-            <w:shd w:val="clear" w:color="auto" w:fill="F6F8FA"/>
-          </w:tcPr>
+          <w:tcPr/>
           <w:p>
             <w:pPr>
               <w:jc w:val="left"/>
@@ -15754,9 +15881,7 @@
           </w:p>
         </w:tc>
         <w:tc>
-          <w:tcPr>
-            <w:shd w:val="clear" w:color="auto" w:fill="F6F8FA"/>
-          </w:tcPr>
+          <w:tcPr/>
           <w:p>
             <w:pPr>
               <w:jc w:val="left"/>
@@ -15767,14 +15892,12 @@
           </w:p>
         </w:tc>
         <w:tc>
-          <w:tcPr>
-            <w:shd w:val="clear" w:color="auto" w:fill="F6F8FA"/>
-          </w:tcPr>
+          <w:tcPr/>
           <w:p>
             <w:pPr>
               <w:numPr>
                 <w:ilvl w:val="0"/>
-                <w:numId w:val="1081"/>
+                <w:numId w:val="1084"/>
               </w:numPr>
               <w:jc w:val="left"/>
             </w:pPr>
@@ -15816,7 +15939,9 @@
       </w:tr>
       <w:tr>
         <w:tc>
-          <w:tcPr/>
+          <w:tcPr>
+            <w:shd w:val="clear" w:color="auto" w:fill="F6F8FA"/>
+          </w:tcPr>
           <w:p>
             <w:pPr>
               <w:jc w:val="left"/>
@@ -15827,7 +15952,9 @@
           </w:p>
         </w:tc>
         <w:tc>
-          <w:tcPr/>
+          <w:tcPr>
+            <w:shd w:val="clear" w:color="auto" w:fill="F6F8FA"/>
+          </w:tcPr>
           <w:p>
             <w:pPr>
               <w:jc w:val="left"/>
@@ -15838,12 +15965,14 @@
           </w:p>
         </w:tc>
         <w:tc>
-          <w:tcPr/>
+          <w:tcPr>
+            <w:shd w:val="clear" w:color="auto" w:fill="F6F8FA"/>
+          </w:tcPr>
           <w:p>
             <w:pPr>
               <w:numPr>
                 <w:ilvl w:val="0"/>
-                <w:numId w:val="1082"/>
+                <w:numId w:val="1085"/>
               </w:numPr>
               <w:jc w:val="left"/>
             </w:pPr>
@@ -15870,9 +15999,7 @@
       </w:tr>
       <w:tr>
         <w:tc>
-          <w:tcPr>
-            <w:shd w:val="clear" w:color="auto" w:fill="F6F8FA"/>
-          </w:tcPr>
+          <w:tcPr/>
           <w:p>
             <w:pPr>
               <w:jc w:val="left"/>
@@ -15883,9 +16010,7 @@
           </w:p>
         </w:tc>
         <w:tc>
-          <w:tcPr>
-            <w:shd w:val="clear" w:color="auto" w:fill="F6F8FA"/>
-          </w:tcPr>
+          <w:tcPr/>
           <w:p>
             <w:pPr>
               <w:jc w:val="left"/>
@@ -15896,14 +16021,12 @@
           </w:p>
         </w:tc>
         <w:tc>
-          <w:tcPr>
-            <w:shd w:val="clear" w:color="auto" w:fill="F6F8FA"/>
-          </w:tcPr>
+          <w:tcPr/>
           <w:p>
             <w:pPr>
               <w:numPr>
                 <w:ilvl w:val="0"/>
-                <w:numId w:val="1083"/>
+                <w:numId w:val="1086"/>
               </w:numPr>
               <w:jc w:val="left"/>
             </w:pPr>
@@ -15915,7 +16038,9 @@
       </w:tr>
       <w:tr>
         <w:tc>
-          <w:tcPr/>
+          <w:tcPr>
+            <w:shd w:val="clear" w:color="auto" w:fill="F6F8FA"/>
+          </w:tcPr>
           <w:p>
             <w:pPr>
               <w:jc w:val="left"/>
@@ -15926,7 +16051,9 @@
           </w:p>
         </w:tc>
         <w:tc>
-          <w:tcPr/>
+          <w:tcPr>
+            <w:shd w:val="clear" w:color="auto" w:fill="F6F8FA"/>
+          </w:tcPr>
           <w:p>
             <w:pPr>
               <w:jc w:val="left"/>
@@ -15937,12 +16064,14 @@
           </w:p>
         </w:tc>
         <w:tc>
-          <w:tcPr/>
+          <w:tcPr>
+            <w:shd w:val="clear" w:color="auto" w:fill="F6F8FA"/>
+          </w:tcPr>
           <w:p>
             <w:pPr>
               <w:numPr>
                 <w:ilvl w:val="0"/>
-                <w:numId w:val="1084"/>
+                <w:numId w:val="1087"/>
               </w:numPr>
               <w:jc w:val="left"/>
             </w:pPr>
@@ -15954,9 +16083,7 @@
       </w:tr>
       <w:tr>
         <w:tc>
-          <w:tcPr>
-            <w:shd w:val="clear" w:color="auto" w:fill="F6F8FA"/>
-          </w:tcPr>
+          <w:tcPr/>
           <w:p>
             <w:pPr>
               <w:jc w:val="left"/>
@@ -15967,9 +16094,7 @@
           </w:p>
         </w:tc>
         <w:tc>
-          <w:tcPr>
-            <w:shd w:val="clear" w:color="auto" w:fill="F6F8FA"/>
-          </w:tcPr>
+          <w:tcPr/>
           <w:p>
             <w:pPr>
               <w:jc w:val="left"/>
@@ -15980,14 +16105,12 @@
           </w:p>
         </w:tc>
         <w:tc>
-          <w:tcPr>
-            <w:shd w:val="clear" w:color="auto" w:fill="F6F8FA"/>
-          </w:tcPr>
+          <w:tcPr/>
           <w:p>
             <w:pPr>
               <w:numPr>
                 <w:ilvl w:val="0"/>
-                <w:numId w:val="1085"/>
+                <w:numId w:val="1088"/>
               </w:numPr>
               <w:jc w:val="left"/>
             </w:pPr>
@@ -16044,7 +16167,9 @@
       </w:tr>
       <w:tr>
         <w:tc>
-          <w:tcPr/>
+          <w:tcPr>
+            <w:shd w:val="clear" w:color="auto" w:fill="F6F8FA"/>
+          </w:tcPr>
           <w:p>
             <w:pPr>
               <w:jc w:val="left"/>
@@ -16055,7 +16180,9 @@
           </w:p>
         </w:tc>
         <w:tc>
-          <w:tcPr/>
+          <w:tcPr>
+            <w:shd w:val="clear" w:color="auto" w:fill="F6F8FA"/>
+          </w:tcPr>
           <w:p>
             <w:pPr>
               <w:jc w:val="left"/>
@@ -16066,12 +16193,14 @@
           </w:p>
         </w:tc>
         <w:tc>
-          <w:tcPr/>
+          <w:tcPr>
+            <w:shd w:val="clear" w:color="auto" w:fill="F6F8FA"/>
+          </w:tcPr>
           <w:p>
             <w:pPr>
               <w:numPr>
                 <w:ilvl w:val="0"/>
-                <w:numId w:val="1086"/>
+                <w:numId w:val="1089"/>
               </w:numPr>
               <w:jc w:val="left"/>
             </w:pPr>
@@ -16128,9 +16257,7 @@
       </w:tr>
       <w:tr>
         <w:tc>
-          <w:tcPr>
-            <w:shd w:val="clear" w:color="auto" w:fill="F6F8FA"/>
-          </w:tcPr>
+          <w:tcPr/>
           <w:p>
             <w:pPr>
               <w:jc w:val="left"/>
@@ -16141,9 +16268,7 @@
           </w:p>
         </w:tc>
         <w:tc>
-          <w:tcPr>
-            <w:shd w:val="clear" w:color="auto" w:fill="F6F8FA"/>
-          </w:tcPr>
+          <w:tcPr/>
           <w:p>
             <w:pPr>
               <w:jc w:val="left"/>
@@ -16154,14 +16279,12 @@
           </w:p>
         </w:tc>
         <w:tc>
-          <w:tcPr>
-            <w:shd w:val="clear" w:color="auto" w:fill="F6F8FA"/>
-          </w:tcPr>
+          <w:tcPr/>
           <w:p>
             <w:pPr>
               <w:numPr>
                 <w:ilvl w:val="0"/>
-                <w:numId w:val="1087"/>
+                <w:numId w:val="1090"/>
               </w:numPr>
               <w:jc w:val="left"/>
             </w:pPr>
@@ -16239,7 +16362,9 @@
       </w:tr>
       <w:tr>
         <w:tc>
-          <w:tcPr/>
+          <w:tcPr>
+            <w:shd w:val="clear" w:color="auto" w:fill="F6F8FA"/>
+          </w:tcPr>
           <w:p>
             <w:pPr>
               <w:jc w:val="left"/>
@@ -16250,7 +16375,9 @@
           </w:p>
         </w:tc>
         <w:tc>
-          <w:tcPr/>
+          <w:tcPr>
+            <w:shd w:val="clear" w:color="auto" w:fill="F6F8FA"/>
+          </w:tcPr>
           <w:p>
             <w:pPr>
               <w:jc w:val="left"/>
@@ -16261,12 +16388,14 @@
           </w:p>
         </w:tc>
         <w:tc>
-          <w:tcPr/>
+          <w:tcPr>
+            <w:shd w:val="clear" w:color="auto" w:fill="F6F8FA"/>
+          </w:tcPr>
           <w:p>
             <w:pPr>
               <w:numPr>
                 <w:ilvl w:val="0"/>
-                <w:numId w:val="1088"/>
+                <w:numId w:val="1091"/>
               </w:numPr>
               <w:jc w:val="left"/>
             </w:pPr>
@@ -16293,7 +16422,7 @@
             <w:pPr>
               <w:numPr>
                 <w:ilvl w:val="0"/>
-                <w:numId w:val="1088"/>
+                <w:numId w:val="1091"/>
               </w:numPr>
               <w:jc w:val="left"/>
             </w:pPr>
@@ -16335,7 +16464,7 @@
             <w:pPr>
               <w:numPr>
                 <w:ilvl w:val="0"/>
-                <w:numId w:val="1088"/>
+                <w:numId w:val="1091"/>
               </w:numPr>
               <w:jc w:val="left"/>
             </w:pPr>
@@ -16347,9 +16476,7 @@
       </w:tr>
       <w:tr>
         <w:tc>
-          <w:tcPr>
-          